<commit_message>
style(buch): luftigeres Layout -- mehr Abstand + Bloecke statt quetschen umbrechen
Auf Wunsch (Layout wirkte gedrungen, Inhalte gequetscht):
- Zeilenabstand ~1,3 (LINE) + groessere Absatz-Nachabstaende (Text 180, Listen 100).
- Ueberschriften (h1/chapter/h2) + Befehlsname/Syntax + "Beispiel"-Label mit
  keepNext/keepLines -> sie bleiben mit dem Folgetext zusammen; passt etwas nicht
  mehr aufs Blatt, rutscht der ganze Block auf die naechste Seite (lieber Weissraum
  unten als Quetschen). Seiten sind nicht limitiert.
- Code-Block: mehr before/after + eigener Zeilenabstand. Kaesten (tip/note/warn):
  cantSplit (kein Seitenumbruch mitten im Kasten) + Abstandshalter davor/danach.
- Figuren: Bild + Bildunterschrift bleiben zusammen.
16 -> 19 Seiten. Per LibreOffice-Render geprueft.

Co-Authored-By: Claude Opus 4.8 (1M context) <noreply@anthropic.com>
</commit_message>
<xml_diff>
--- a/buch-referenz/buch/GameBasic-Lehrbuch.docx
+++ b/buch-referenz/buch/GameBasic-Lehrbuch.docx
@@ -110,7 +110,7 @@
           <w:sz w:val="24"/>
           <w:szCs w:val="24"/>
         </w:rPr>
-        <w:t xml:space="preserve">	4</w:t>
+        <w:t xml:space="preserve">	5</w:t>
       </w:r>
     </w:p>
     <w:p>
@@ -137,7 +137,7 @@
           <w:sz w:val="22"/>
           <w:szCs w:val="22"/>
         </w:rPr>
-        <w:t xml:space="preserve">	5</w:t>
+        <w:t xml:space="preserve">	6</w:t>
       </w:r>
     </w:p>
     <w:p>
@@ -164,7 +164,7 @@
           <w:sz w:val="22"/>
           <w:szCs w:val="22"/>
         </w:rPr>
-        <w:t xml:space="preserve">	6</w:t>
+        <w:t xml:space="preserve">	7</w:t>
       </w:r>
     </w:p>
     <w:p>
@@ -191,7 +191,7 @@
           <w:sz w:val="22"/>
           <w:szCs w:val="22"/>
         </w:rPr>
-        <w:t xml:space="preserve">	7</w:t>
+        <w:t xml:space="preserve">	8</w:t>
       </w:r>
     </w:p>
     <w:p>
@@ -218,7 +218,7 @@
           <w:sz w:val="22"/>
           <w:szCs w:val="22"/>
         </w:rPr>
-        <w:t xml:space="preserve">	8</w:t>
+        <w:t xml:space="preserve">	10</w:t>
       </w:r>
     </w:p>
     <w:p>
@@ -245,7 +245,7 @@
           <w:sz w:val="24"/>
           <w:szCs w:val="24"/>
         </w:rPr>
-        <w:t xml:space="preserve">	10</w:t>
+        <w:t xml:space="preserve">	12</w:t>
       </w:r>
     </w:p>
     <w:p>
@@ -272,7 +272,7 @@
           <w:sz w:val="22"/>
           <w:szCs w:val="22"/>
         </w:rPr>
-        <w:t xml:space="preserve">	11</w:t>
+        <w:t xml:space="preserve">	13</w:t>
       </w:r>
     </w:p>
     <w:p>
@@ -299,7 +299,7 @@
           <w:sz w:val="22"/>
           <w:szCs w:val="22"/>
         </w:rPr>
-        <w:t xml:space="preserve">	14</w:t>
+        <w:t xml:space="preserve">	16</w:t>
       </w:r>
     </w:p>
     <w:p>
@@ -310,10 +310,12 @@
     <w:p>
       <w:pPr>
         <w:pStyle w:val="Heading1"/>
+        <w:keepNext/>
+        <w:keepLines/>
         <w:pBdr>
           <w:bottom w:val="single" w:color="1B6CA8" w:sz="12" w:space="4"/>
         </w:pBdr>
-        <w:spacing w:after="80" w:before="320"/>
+        <w:spacing w:after="140" w:before="400"/>
       </w:pPr>
       <w:r>
         <w:t xml:space="preserve">Vorwort</w:t>
@@ -321,7 +323,7 @@
     </w:p>
     <w:p>
       <w:pPr>
-        <w:spacing w:after="140"/>
+        <w:spacing w:after="180" w:line="312" w:lineRule="auto"/>
       </w:pPr>
       <w:r>
         <w:rPr>
@@ -333,7 +335,7 @@
     </w:p>
     <w:p>
       <w:pPr>
-        <w:spacing w:after="140"/>
+        <w:spacing w:after="180" w:line="312" w:lineRule="auto"/>
       </w:pPr>
       <w:r>
         <w:rPr>
@@ -345,7 +347,7 @@
     </w:p>
     <w:p>
       <w:pPr>
-        <w:spacing w:after="140"/>
+        <w:spacing w:after="180" w:line="312" w:lineRule="auto"/>
       </w:pPr>
       <w:r>
         <w:rPr>
@@ -357,7 +359,7 @@
     </w:p>
     <w:p>
       <w:pPr>
-        <w:spacing w:after="140"/>
+        <w:spacing w:after="180" w:line="312" w:lineRule="auto"/>
       </w:pPr>
       <w:r>
         <w:rPr>
@@ -385,10 +387,12 @@
     <w:p>
       <w:pPr>
         <w:pStyle w:val="Heading1"/>
+        <w:keepNext/>
+        <w:keepLines/>
         <w:pBdr>
           <w:bottom w:val="single" w:color="1B6CA8" w:sz="12" w:space="4"/>
         </w:pBdr>
-        <w:spacing w:after="80" w:before="320"/>
+        <w:spacing w:after="140" w:before="400"/>
       </w:pPr>
       <w:r>
         <w:t xml:space="preserve">Wie du dieses Buch liest</w:t>
@@ -396,7 +400,7 @@
     </w:p>
     <w:p>
       <w:pPr>
-        <w:spacing w:after="140"/>
+        <w:spacing w:after="180" w:line="312" w:lineRule="auto"/>
       </w:pPr>
       <w:r>
         <w:rPr>
@@ -413,7 +417,7 @@
           <w:ilvl w:val="0"/>
           <w:numId w:val="2"/>
         </w:numPr>
-        <w:spacing w:after="60"/>
+        <w:spacing w:after="100" w:line="312" w:lineRule="auto"/>
       </w:pPr>
       <w:r>
         <w:rPr>
@@ -439,7 +443,7 @@
           <w:ilvl w:val="0"/>
           <w:numId w:val="2"/>
         </w:numPr>
-        <w:spacing w:after="60"/>
+        <w:spacing w:after="100" w:line="312" w:lineRule="auto"/>
       </w:pPr>
       <w:r>
         <w:rPr>
@@ -465,7 +469,7 @@
           <w:ilvl w:val="0"/>
           <w:numId w:val="2"/>
         </w:numPr>
-        <w:spacing w:after="60"/>
+        <w:spacing w:after="100" w:line="312" w:lineRule="auto"/>
       </w:pPr>
       <w:r>
         <w:rPr>
@@ -486,7 +490,7 @@
     </w:p>
     <w:p>
       <w:pPr>
-        <w:spacing w:after="140"/>
+        <w:spacing w:after="180" w:line="312" w:lineRule="auto"/>
       </w:pPr>
       <w:r>
         <w:rPr>
@@ -503,8 +507,8 @@
           <w:left w:val="single" w:color="1B6CA8" w:sz="18" w:space="6"/>
         </w:pBdr>
         <w:shd w:fill="F4F4F4" w:val="clear"/>
-        <w:spacing w:after="160" w:before="80"/>
-        <w:ind w:left="120"/>
+        <w:spacing w:after="200" w:before="100" w:line="264" w:lineRule="auto"/>
+        <w:ind w:left="140"/>
       </w:pPr>
       <w:r>
         <w:rPr>
@@ -531,8 +535,8 @@
           <w:left w:val="single" w:color="9AC79A" w:sz="18" w:space="6"/>
         </w:pBdr>
         <w:shd w:fill="EAF4EA" w:val="clear"/>
-        <w:spacing w:after="160" w:before="80"/>
-        <w:ind w:left="120"/>
+        <w:spacing w:after="200" w:before="100" w:line="264" w:lineRule="auto"/>
+        <w:ind w:left="140"/>
       </w:pPr>
       <w:r>
         <w:rPr>
@@ -551,6 +555,11 @@
         <w:br/>
         <w:t xml:space="preserve">7</w:t>
       </w:r>
+    </w:p>
+    <w:p>
+      <w:pPr>
+        <w:spacing w:before="60"/>
+      </w:pPr>
     </w:p>
     <w:tbl>
       <w:tblPr>
@@ -568,6 +577,9 @@
         <w:gridCol w:w="9360"/>
       </w:tblGrid>
       <w:tr>
+        <w:trPr>
+          <w:cantSplit/>
+        </w:trPr>
         <w:tc>
           <w:tcPr>
             <w:tcW w:type="dxa" w:w="9360"/>
@@ -579,10 +591,10 @@
             </w:tcBorders>
             <w:shd w:fill="E7F2FA" w:val="clear"/>
             <w:tcMar>
-              <w:top w:type="dxa" w:w="120"/>
-              <w:left w:type="dxa" w:w="160"/>
-              <w:bottom w:type="dxa" w:w="120"/>
-              <w:right w:type="dxa" w:w="160"/>
+              <w:top w:type="dxa" w:w="140"/>
+              <w:left w:type="dxa" w:w="180"/>
+              <w:bottom w:type="dxa" w:w="140"/>
+              <w:right w:type="dxa" w:w="180"/>
             </w:tcMar>
           </w:tcPr>
           <w:p>
@@ -601,6 +613,9 @@
             </w:r>
           </w:p>
           <w:p>
+            <w:pPr>
+              <w:spacing w:after="0" w:line="312" w:lineRule="auto"/>
+            </w:pPr>
             <w:r>
               <w:rPr>
                 <w:sz w:val="22"/>
@@ -614,6 +629,11 @@
     </w:tbl>
     <w:p>
       <w:pPr>
+        <w:spacing w:after="160"/>
+      </w:pPr>
+    </w:p>
+    <w:p>
+      <w:pPr>
         <w:pageBreakBefore/>
         <w:spacing w:after="200" w:before="2600"/>
         <w:jc w:val="center"/>
@@ -632,11 +652,13 @@
     <w:p>
       <w:pPr>
         <w:pStyle w:val="Heading1"/>
+        <w:keepNext/>
+        <w:keepLines/>
         <w:pageBreakBefore/>
         <w:pBdr>
           <w:bottom w:val="single" w:color="1B6CA8" w:sz="12" w:space="4"/>
         </w:pBdr>
-        <w:spacing w:after="80" w:before="0"/>
+        <w:spacing w:after="160" w:before="0"/>
       </w:pPr>
       <w:r>
         <w:t xml:space="preserve">Was ist GameBasic?</w:t>
@@ -644,7 +666,7 @@
     </w:p>
     <w:p>
       <w:pPr>
-        <w:spacing w:after="140"/>
+        <w:spacing w:after="180" w:line="312" w:lineRule="auto"/>
       </w:pPr>
       <w:r>
         <w:rPr>
@@ -656,7 +678,7 @@
     </w:p>
     <w:p>
       <w:pPr>
-        <w:spacing w:after="140"/>
+        <w:spacing w:after="180" w:line="312" w:lineRule="auto"/>
       </w:pPr>
       <w:r>
         <w:rPr>
@@ -669,6 +691,9 @@
     <w:p>
       <w:pPr>
         <w:pStyle w:val="Heading2"/>
+        <w:keepNext/>
+        <w:keepLines/>
+        <w:spacing w:after="120" w:before="280"/>
       </w:pPr>
       <w:r>
         <w:t xml:space="preserve">Was GameBasic besonders macht</w:t>
@@ -681,7 +706,7 @@
           <w:ilvl w:val="0"/>
           <w:numId w:val="2"/>
         </w:numPr>
-        <w:spacing w:after="60"/>
+        <w:spacing w:after="100" w:line="312" w:lineRule="auto"/>
       </w:pPr>
       <w:r>
         <w:rPr>
@@ -707,7 +732,7 @@
           <w:ilvl w:val="0"/>
           <w:numId w:val="2"/>
         </w:numPr>
-        <w:spacing w:after="60"/>
+        <w:spacing w:after="100" w:line="312" w:lineRule="auto"/>
       </w:pPr>
       <w:r>
         <w:rPr>
@@ -733,7 +758,7 @@
           <w:ilvl w:val="0"/>
           <w:numId w:val="2"/>
         </w:numPr>
-        <w:spacing w:after="60"/>
+        <w:spacing w:after="100" w:line="312" w:lineRule="auto"/>
       </w:pPr>
       <w:r>
         <w:rPr>
@@ -759,7 +784,7 @@
           <w:ilvl w:val="0"/>
           <w:numId w:val="2"/>
         </w:numPr>
-        <w:spacing w:after="60"/>
+        <w:spacing w:after="100" w:line="312" w:lineRule="auto"/>
       </w:pPr>
       <w:r>
         <w:rPr>
@@ -780,7 +805,7 @@
     </w:p>
     <w:p>
       <w:pPr>
-        <w:spacing w:after="140"/>
+        <w:spacing w:after="180" w:line="312" w:lineRule="auto"/>
       </w:pPr>
       <w:r>
         <w:rPr>
@@ -797,8 +822,8 @@
           <w:left w:val="single" w:color="1B6CA8" w:sz="18" w:space="6"/>
         </w:pBdr>
         <w:shd w:fill="F4F4F4" w:val="clear"/>
-        <w:spacing w:after="160" w:before="80"/>
-        <w:ind w:left="120"/>
+        <w:spacing w:after="200" w:before="100" w:line="264" w:lineRule="auto"/>
+        <w:ind w:left="140"/>
       </w:pPr>
       <w:r>
         <w:rPr>
@@ -838,7 +863,7 @@
     </w:p>
     <w:p>
       <w:pPr>
-        <w:spacing w:after="140"/>
+        <w:spacing w:after="180" w:line="312" w:lineRule="auto"/>
       </w:pPr>
       <w:r>
         <w:rPr>
@@ -851,11 +876,13 @@
     <w:p>
       <w:pPr>
         <w:pStyle w:val="Heading1"/>
+        <w:keepNext/>
+        <w:keepLines/>
         <w:pageBreakBefore/>
         <w:pBdr>
           <w:bottom w:val="single" w:color="1B6CA8" w:sz="12" w:space="4"/>
         </w:pBdr>
-        <w:spacing w:after="80" w:before="0"/>
+        <w:spacing w:after="160" w:before="0"/>
       </w:pPr>
       <w:r>
         <w:t xml:space="preserve">Was kann GameBasic alles?</w:t>
@@ -863,7 +890,7 @@
     </w:p>
     <w:p>
       <w:pPr>
-        <w:spacing w:after="140"/>
+        <w:spacing w:after="180" w:line="312" w:lineRule="auto"/>
       </w:pPr>
       <w:r>
         <w:rPr>
@@ -880,7 +907,7 @@
           <w:ilvl w:val="0"/>
           <w:numId w:val="2"/>
         </w:numPr>
-        <w:spacing w:after="60"/>
+        <w:spacing w:after="100" w:line="312" w:lineRule="auto"/>
       </w:pPr>
       <w:r>
         <w:rPr>
@@ -906,7 +933,7 @@
           <w:ilvl w:val="0"/>
           <w:numId w:val="2"/>
         </w:numPr>
-        <w:spacing w:after="60"/>
+        <w:spacing w:after="100" w:line="312" w:lineRule="auto"/>
       </w:pPr>
       <w:r>
         <w:rPr>
@@ -932,7 +959,7 @@
           <w:ilvl w:val="0"/>
           <w:numId w:val="2"/>
         </w:numPr>
-        <w:spacing w:after="60"/>
+        <w:spacing w:after="100" w:line="312" w:lineRule="auto"/>
       </w:pPr>
       <w:r>
         <w:rPr>
@@ -958,7 +985,7 @@
           <w:ilvl w:val="0"/>
           <w:numId w:val="2"/>
         </w:numPr>
-        <w:spacing w:after="60"/>
+        <w:spacing w:after="100" w:line="312" w:lineRule="auto"/>
       </w:pPr>
       <w:r>
         <w:rPr>
@@ -984,7 +1011,7 @@
           <w:ilvl w:val="0"/>
           <w:numId w:val="2"/>
         </w:numPr>
-        <w:spacing w:after="60"/>
+        <w:spacing w:after="100" w:line="312" w:lineRule="auto"/>
       </w:pPr>
       <w:r>
         <w:rPr>
@@ -1005,7 +1032,7 @@
     </w:p>
     <w:p>
       <w:pPr>
-        <w:spacing w:after="140"/>
+        <w:spacing w:after="180" w:line="312" w:lineRule="auto"/>
       </w:pPr>
       <w:r>
         <w:rPr>
@@ -1018,11 +1045,13 @@
     <w:p>
       <w:pPr>
         <w:pStyle w:val="Heading1"/>
+        <w:keepNext/>
+        <w:keepLines/>
         <w:pageBreakBefore/>
         <w:pBdr>
           <w:bottom w:val="single" w:color="1B6CA8" w:sz="12" w:space="4"/>
         </w:pBdr>
-        <w:spacing w:after="80" w:before="0"/>
+        <w:spacing w:after="160" w:before="0"/>
       </w:pPr>
       <w:r>
         <w:t xml:space="preserve">Installation, Editor &amp; Programme starten</w:t>
@@ -1030,7 +1059,7 @@
     </w:p>
     <w:p>
       <w:pPr>
-        <w:spacing w:after="140"/>
+        <w:spacing w:after="180" w:line="312" w:lineRule="auto"/>
       </w:pPr>
       <w:r>
         <w:rPr>
@@ -1043,6 +1072,9 @@
     <w:p>
       <w:pPr>
         <w:pStyle w:val="Heading2"/>
+        <w:keepNext/>
+        <w:keepLines/>
+        <w:spacing w:after="120" w:before="280"/>
       </w:pPr>
       <w:r>
         <w:t xml:space="preserve">Was du brauchst</w:t>
@@ -1050,7 +1082,7 @@
     </w:p>
     <w:p>
       <w:pPr>
-        <w:spacing w:after="140"/>
+        <w:spacing w:after="180" w:line="312" w:lineRule="auto"/>
       </w:pPr>
       <w:r>
         <w:rPr>
@@ -1063,6 +1095,9 @@
     <w:p>
       <w:pPr>
         <w:pStyle w:val="Heading2"/>
+        <w:keepNext/>
+        <w:keepLines/>
+        <w:spacing w:after="120" w:before="280"/>
       </w:pPr>
       <w:r>
         <w:t xml:space="preserve">Der Code-Editor</w:t>
@@ -1070,7 +1105,7 @@
     </w:p>
     <w:p>
       <w:pPr>
-        <w:spacing w:after="140"/>
+        <w:spacing w:after="180" w:line="312" w:lineRule="auto"/>
       </w:pPr>
       <w:r>
         <w:rPr>
@@ -1087,7 +1122,7 @@
           <w:ilvl w:val="0"/>
           <w:numId w:val="2"/>
         </w:numPr>
-        <w:spacing w:after="60"/>
+        <w:spacing w:after="100" w:line="312" w:lineRule="auto"/>
       </w:pPr>
       <w:r>
         <w:rPr>
@@ -1113,7 +1148,7 @@
           <w:ilvl w:val="0"/>
           <w:numId w:val="2"/>
         </w:numPr>
-        <w:spacing w:after="60"/>
+        <w:spacing w:after="100" w:line="312" w:lineRule="auto"/>
       </w:pPr>
       <w:r>
         <w:rPr>
@@ -1139,7 +1174,7 @@
           <w:ilvl w:val="0"/>
           <w:numId w:val="2"/>
         </w:numPr>
-        <w:spacing w:after="60"/>
+        <w:spacing w:after="100" w:line="312" w:lineRule="auto"/>
       </w:pPr>
       <w:r>
         <w:rPr>
@@ -1161,6 +1196,9 @@
     <w:p>
       <w:pPr>
         <w:pStyle w:val="Heading2"/>
+        <w:keepNext/>
+        <w:keepLines/>
+        <w:spacing w:after="120" w:before="280"/>
       </w:pPr>
       <w:r>
         <w:t xml:space="preserve">Ein Programm von Hand starten</w:t>
@@ -1168,7 +1206,7 @@
     </w:p>
     <w:p>
       <w:pPr>
-        <w:spacing w:after="140"/>
+        <w:spacing w:after="180" w:line="312" w:lineRule="auto"/>
       </w:pPr>
       <w:r>
         <w:rPr>
@@ -1185,8 +1223,8 @@
           <w:left w:val="single" w:color="1B6CA8" w:sz="18" w:space="6"/>
         </w:pBdr>
         <w:shd w:fill="F4F4F4" w:val="clear"/>
-        <w:spacing w:after="160" w:before="80"/>
-        <w:ind w:left="120"/>
+        <w:spacing w:after="200" w:before="100" w:line="264" w:lineRule="auto"/>
+        <w:ind w:left="140"/>
       </w:pPr>
       <w:r>
         <w:rPr>
@@ -1199,7 +1237,7 @@
     </w:p>
     <w:p>
       <w:pPr>
-        <w:spacing w:after="140"/>
+        <w:spacing w:after="180" w:line="312" w:lineRule="auto"/>
       </w:pPr>
       <w:r>
         <w:rPr>
@@ -1216,8 +1254,8 @@
           <w:left w:val="single" w:color="1B6CA8" w:sz="18" w:space="6"/>
         </w:pBdr>
         <w:shd w:fill="F4F4F4" w:val="clear"/>
-        <w:spacing w:after="160" w:before="80"/>
-        <w:ind w:left="120"/>
+        <w:spacing w:after="200" w:before="100" w:line="264" w:lineRule="auto"/>
+        <w:ind w:left="140"/>
       </w:pPr>
       <w:r>
         <w:rPr>
@@ -1231,6 +1269,9 @@
     <w:p>
       <w:pPr>
         <w:pStyle w:val="Heading2"/>
+        <w:keepNext/>
+        <w:keepLines/>
+        <w:spacing w:after="120" w:before="280"/>
       </w:pPr>
       <w:r>
         <w:t xml:space="preserve">Konsole oder Fenster?</w:t>
@@ -1238,7 +1279,7 @@
     </w:p>
     <w:p>
       <w:pPr>
-        <w:spacing w:after="140"/>
+        <w:spacing w:after="180" w:line="312" w:lineRule="auto"/>
       </w:pPr>
       <w:r>
         <w:rPr>
@@ -1247,6 +1288,11 @@
         </w:rPr>
         <w:t xml:space="preserve">GameBasic-Programme gibt es in zwei Geschmacksrichtungen. Solange du nur mit PRINT Text ausgibst und mit INPUT etwas einliest, läuft alles in der Konsole – einem schlichten Textfenster. Sobald du den Befehl SCREEN benutzt, öffnet sich ein echtes Grafikfenster, in dem du zeichnen, Tasten abfragen und Töne abspielen kannst. Beide Welten lernst du in diesem Buch kennen, und wir fangen ganz bewusst mit der Konsole an: Sie lenkt nicht ab und zeigt das Wesentliche.</w:t>
       </w:r>
+    </w:p>
+    <w:p>
+      <w:pPr>
+        <w:spacing w:before="60"/>
+      </w:pPr>
     </w:p>
     <w:tbl>
       <w:tblPr>
@@ -1264,6 +1310,9 @@
         <w:gridCol w:w="9360"/>
       </w:tblGrid>
       <w:tr>
+        <w:trPr>
+          <w:cantSplit/>
+        </w:trPr>
         <w:tc>
           <w:tcPr>
             <w:tcW w:type="dxa" w:w="9360"/>
@@ -1275,10 +1324,10 @@
             </w:tcBorders>
             <w:shd w:fill="FDF3E0" w:val="clear"/>
             <w:tcMar>
-              <w:top w:type="dxa" w:w="120"/>
-              <w:left w:type="dxa" w:w="160"/>
-              <w:bottom w:type="dxa" w:w="120"/>
-              <w:right w:type="dxa" w:w="160"/>
+              <w:top w:type="dxa" w:w="140"/>
+              <w:left w:type="dxa" w:w="180"/>
+              <w:bottom w:type="dxa" w:w="140"/>
+              <w:right w:type="dxa" w:w="180"/>
             </w:tcMar>
           </w:tcPr>
           <w:p>
@@ -1297,6 +1346,9 @@
             </w:r>
           </w:p>
           <w:p>
+            <w:pPr>
+              <w:spacing w:after="0" w:line="312" w:lineRule="auto"/>
+            </w:pPr>
             <w:r>
               <w:rPr>
                 <w:sz w:val="22"/>
@@ -1310,12 +1362,19 @@
     </w:tbl>
     <w:p>
       <w:pPr>
+        <w:spacing w:after="160"/>
+      </w:pPr>
+    </w:p>
+    <w:p>
+      <w:pPr>
         <w:pStyle w:val="Heading1"/>
+        <w:keepNext/>
+        <w:keepLines/>
         <w:pageBreakBefore/>
         <w:pBdr>
           <w:bottom w:val="single" w:color="1B6CA8" w:sz="12" w:space="4"/>
         </w:pBdr>
-        <w:spacing w:after="80" w:before="0"/>
+        <w:spacing w:after="160" w:before="0"/>
       </w:pPr>
       <w:r>
         <w:t xml:space="preserve">Dein erstes Programm</w:t>
@@ -1323,7 +1382,7 @@
     </w:p>
     <w:p>
       <w:pPr>
-        <w:spacing w:after="140"/>
+        <w:spacing w:after="180" w:line="312" w:lineRule="auto"/>
       </w:pPr>
       <w:r>
         <w:rPr>
@@ -1340,8 +1399,8 @@
           <w:left w:val="single" w:color="1B6CA8" w:sz="18" w:space="6"/>
         </w:pBdr>
         <w:shd w:fill="F4F4F4" w:val="clear"/>
-        <w:spacing w:after="160" w:before="80"/>
-        <w:ind w:left="120"/>
+        <w:spacing w:after="200" w:before="100" w:line="264" w:lineRule="auto"/>
+        <w:ind w:left="140"/>
       </w:pPr>
       <w:r>
         <w:rPr>
@@ -1354,7 +1413,7 @@
     </w:p>
     <w:p>
       <w:pPr>
-        <w:spacing w:after="140"/>
+        <w:spacing w:after="180" w:line="312" w:lineRule="auto"/>
       </w:pPr>
       <w:r>
         <w:rPr>
@@ -1371,8 +1430,8 @@
           <w:left w:val="single" w:color="9AC79A" w:sz="18" w:space="6"/>
         </w:pBdr>
         <w:shd w:fill="EAF4EA" w:val="clear"/>
-        <w:spacing w:after="160" w:before="80"/>
-        <w:ind w:left="120"/>
+        <w:spacing w:after="200" w:before="100" w:line="264" w:lineRule="auto"/>
+        <w:ind w:left="140"/>
       </w:pPr>
       <w:r>
         <w:rPr>
@@ -1385,7 +1444,7 @@
     </w:p>
     <w:p>
       <w:pPr>
-        <w:spacing w:after="140"/>
+        <w:spacing w:after="180" w:line="312" w:lineRule="auto"/>
       </w:pPr>
       <w:r>
         <w:rPr>
@@ -1398,6 +1457,9 @@
     <w:p>
       <w:pPr>
         <w:pStyle w:val="Heading2"/>
+        <w:keepNext/>
+        <w:keepLines/>
+        <w:spacing w:after="120" w:before="280"/>
       </w:pPr>
       <w:r>
         <w:t xml:space="preserve">Mehrere Zeilen</w:t>
@@ -1405,7 +1467,7 @@
     </w:p>
     <w:p>
       <w:pPr>
-        <w:spacing w:after="140"/>
+        <w:spacing w:after="180" w:line="312" w:lineRule="auto"/>
       </w:pPr>
       <w:r>
         <w:rPr>
@@ -1422,8 +1484,8 @@
           <w:left w:val="single" w:color="1B6CA8" w:sz="18" w:space="6"/>
         </w:pBdr>
         <w:shd w:fill="F4F4F4" w:val="clear"/>
-        <w:spacing w:after="160" w:before="80"/>
-        <w:ind w:left="120"/>
+        <w:spacing w:after="200" w:before="100" w:line="264" w:lineRule="auto"/>
+        <w:ind w:left="140"/>
       </w:pPr>
       <w:r>
         <w:rPr>
@@ -1459,8 +1521,8 @@
           <w:left w:val="single" w:color="9AC79A" w:sz="18" w:space="6"/>
         </w:pBdr>
         <w:shd w:fill="EAF4EA" w:val="clear"/>
-        <w:spacing w:after="160" w:before="80"/>
-        <w:ind w:left="120"/>
+        <w:spacing w:after="200" w:before="100" w:line="264" w:lineRule="auto"/>
+        <w:ind w:left="140"/>
       </w:pPr>
       <w:r>
         <w:rPr>
@@ -1492,6 +1554,9 @@
     <w:p>
       <w:pPr>
         <w:pStyle w:val="Heading2"/>
+        <w:keepNext/>
+        <w:keepLines/>
+        <w:spacing w:after="120" w:before="280"/>
       </w:pPr>
       <w:r>
         <w:t xml:space="preserve">Rechnen mit PRINT</w:t>
@@ -1499,7 +1564,7 @@
     </w:p>
     <w:p>
       <w:pPr>
-        <w:spacing w:after="140"/>
+        <w:spacing w:after="180" w:line="312" w:lineRule="auto"/>
       </w:pPr>
       <w:r>
         <w:rPr>
@@ -1516,8 +1581,8 @@
           <w:left w:val="single" w:color="1B6CA8" w:sz="18" w:space="6"/>
         </w:pBdr>
         <w:shd w:fill="F4F4F4" w:val="clear"/>
-        <w:spacing w:after="160" w:before="80"/>
-        <w:ind w:left="120"/>
+        <w:spacing w:after="200" w:before="100" w:line="264" w:lineRule="auto"/>
+        <w:ind w:left="140"/>
       </w:pPr>
       <w:r>
         <w:rPr>
@@ -1553,8 +1618,8 @@
           <w:left w:val="single" w:color="9AC79A" w:sz="18" w:space="6"/>
         </w:pBdr>
         <w:shd w:fill="EAF4EA" w:val="clear"/>
-        <w:spacing w:after="160" w:before="80"/>
-        <w:ind w:left="120"/>
+        <w:spacing w:after="200" w:before="100" w:line="264" w:lineRule="auto"/>
+        <w:ind w:left="140"/>
       </w:pPr>
       <w:r>
         <w:rPr>
@@ -1585,7 +1650,7 @@
     </w:p>
     <w:p>
       <w:pPr>
-        <w:spacing w:after="140"/>
+        <w:spacing w:after="180" w:line="312" w:lineRule="auto"/>
       </w:pPr>
       <w:r>
         <w:rPr>
@@ -1630,6 +1695,9 @@
     <w:p>
       <w:pPr>
         <w:pStyle w:val="Heading2"/>
+        <w:keepNext/>
+        <w:keepLines/>
+        <w:spacing w:after="120" w:before="280"/>
       </w:pPr>
       <w:r>
         <w:t xml:space="preserve">Text und Zahl zusammen</w:t>
@@ -1637,7 +1705,7 @@
     </w:p>
     <w:p>
       <w:pPr>
-        <w:spacing w:after="140"/>
+        <w:spacing w:after="180" w:line="312" w:lineRule="auto"/>
       </w:pPr>
       <w:r>
         <w:rPr>
@@ -1654,8 +1722,8 @@
           <w:left w:val="single" w:color="1B6CA8" w:sz="18" w:space="6"/>
         </w:pBdr>
         <w:shd w:fill="F4F4F4" w:val="clear"/>
-        <w:spacing w:after="160" w:before="80"/>
-        <w:ind w:left="120"/>
+        <w:spacing w:after="200" w:before="100" w:line="264" w:lineRule="auto"/>
+        <w:ind w:left="140"/>
       </w:pPr>
       <w:r>
         <w:rPr>
@@ -1673,8 +1741,8 @@
           <w:left w:val="single" w:color="9AC79A" w:sz="18" w:space="6"/>
         </w:pBdr>
         <w:shd w:fill="EAF4EA" w:val="clear"/>
-        <w:spacing w:after="160" w:before="80"/>
-        <w:ind w:left="120"/>
+        <w:spacing w:after="200" w:before="100" w:line="264" w:lineRule="auto"/>
+        <w:ind w:left="140"/>
       </w:pPr>
       <w:r>
         <w:rPr>
@@ -1688,6 +1756,9 @@
     <w:p>
       <w:pPr>
         <w:pStyle w:val="Heading2"/>
+        <w:keepNext/>
+        <w:keepLines/>
+        <w:spacing w:after="120" w:before="280"/>
       </w:pPr>
       <w:r>
         <w:t xml:space="preserve">Kommentare</w:t>
@@ -1695,7 +1766,7 @@
     </w:p>
     <w:p>
       <w:pPr>
-        <w:spacing w:after="140"/>
+        <w:spacing w:after="180" w:line="312" w:lineRule="auto"/>
       </w:pPr>
       <w:r>
         <w:rPr>
@@ -1712,8 +1783,8 @@
           <w:left w:val="single" w:color="1B6CA8" w:sz="18" w:space="6"/>
         </w:pBdr>
         <w:shd w:fill="F4F4F4" w:val="clear"/>
-        <w:spacing w:after="160" w:before="80"/>
-        <w:ind w:left="120"/>
+        <w:spacing w:after="200" w:before="100" w:line="264" w:lineRule="auto"/>
+        <w:ind w:left="140"/>
       </w:pPr>
       <w:r>
         <w:rPr>
@@ -1749,8 +1820,8 @@
           <w:left w:val="single" w:color="9AC79A" w:sz="18" w:space="6"/>
         </w:pBdr>
         <w:shd w:fill="EAF4EA" w:val="clear"/>
-        <w:spacing w:after="160" w:before="80"/>
-        <w:ind w:left="120"/>
+        <w:spacing w:after="200" w:before="100" w:line="264" w:lineRule="auto"/>
+        <w:ind w:left="140"/>
       </w:pPr>
       <w:r>
         <w:rPr>
@@ -1760,6 +1831,11 @@
         </w:rPr>
         <w:t xml:space="preserve">Hallo!</w:t>
       </w:r>
+    </w:p>
+    <w:p>
+      <w:pPr>
+        <w:spacing w:before="60"/>
+      </w:pPr>
     </w:p>
     <w:tbl>
       <w:tblPr>
@@ -1777,6 +1853,9 @@
         <w:gridCol w:w="9360"/>
       </w:tblGrid>
       <w:tr>
+        <w:trPr>
+          <w:cantSplit/>
+        </w:trPr>
         <w:tc>
           <w:tcPr>
             <w:tcW w:type="dxa" w:w="9360"/>
@@ -1788,10 +1867,10 @@
             </w:tcBorders>
             <w:shd w:fill="FDF3E0" w:val="clear"/>
             <w:tcMar>
-              <w:top w:type="dxa" w:w="120"/>
-              <w:left w:type="dxa" w:w="160"/>
-              <w:bottom w:type="dxa" w:w="120"/>
-              <w:right w:type="dxa" w:w="160"/>
+              <w:top w:type="dxa" w:w="140"/>
+              <w:left w:type="dxa" w:w="180"/>
+              <w:bottom w:type="dxa" w:w="140"/>
+              <w:right w:type="dxa" w:w="180"/>
             </w:tcMar>
           </w:tcPr>
           <w:p>
@@ -1810,6 +1889,9 @@
             </w:r>
           </w:p>
           <w:p>
+            <w:pPr>
+              <w:spacing w:after="0" w:line="312" w:lineRule="auto"/>
+            </w:pPr>
             <w:r>
               <w:rPr>
                 <w:sz w:val="22"/>
@@ -1823,7 +1905,15 @@
     </w:tbl>
     <w:p>
       <w:pPr>
+        <w:spacing w:after="160"/>
+      </w:pPr>
+    </w:p>
+    <w:p>
+      <w:pPr>
         <w:pStyle w:val="Heading2"/>
+        <w:keepNext/>
+        <w:keepLines/>
+        <w:spacing w:after="120" w:before="280"/>
       </w:pPr>
       <w:r>
         <w:t xml:space="preserve">Ein erster Blick auf Grafik</w:t>
@@ -1831,7 +1921,7 @@
     </w:p>
     <w:p>
       <w:pPr>
-        <w:spacing w:after="140"/>
+        <w:spacing w:after="180" w:line="312" w:lineRule="auto"/>
       </w:pPr>
       <w:r>
         <w:rPr>
@@ -1848,8 +1938,8 @@
           <w:left w:val="single" w:color="1B6CA8" w:sz="18" w:space="6"/>
         </w:pBdr>
         <w:shd w:fill="F4F4F4" w:val="clear"/>
-        <w:spacing w:after="160" w:before="80"/>
-        <w:ind w:left="120"/>
+        <w:spacing w:after="200" w:before="100" w:line="264" w:lineRule="auto"/>
+        <w:ind w:left="140"/>
       </w:pPr>
       <w:r>
         <w:rPr>
@@ -1898,7 +1988,7 @@
     </w:p>
     <w:p>
       <w:pPr>
-        <w:spacing w:after="140"/>
+        <w:spacing w:after="180" w:line="312" w:lineRule="auto"/>
       </w:pPr>
       <w:r>
         <w:rPr>
@@ -1928,11 +2018,13 @@
     <w:p>
       <w:pPr>
         <w:pStyle w:val="Heading1"/>
+        <w:keepNext/>
+        <w:keepLines/>
         <w:pageBreakBefore/>
         <w:pBdr>
           <w:bottom w:val="single" w:color="1B6CA8" w:sz="12" w:space="4"/>
         </w:pBdr>
-        <w:spacing w:after="80" w:before="0"/>
+        <w:spacing w:after="160" w:before="0"/>
       </w:pPr>
       <w:r>
         <w:t xml:space="preserve">Variablen &amp; Datentypen</w:t>
@@ -1940,7 +2032,7 @@
     </w:p>
     <w:p>
       <w:pPr>
-        <w:spacing w:after="140"/>
+        <w:spacing w:after="180" w:line="312" w:lineRule="auto"/>
       </w:pPr>
       <w:r>
         <w:rPr>
@@ -1953,6 +2045,9 @@
     <w:p>
       <w:pPr>
         <w:pStyle w:val="Heading2"/>
+        <w:keepNext/>
+        <w:keepLines/>
+        <w:spacing w:after="120" w:before="280"/>
       </w:pPr>
       <w:r>
         <w:t xml:space="preserve">Eine Variable anlegen: DIM</w:t>
@@ -1960,7 +2055,7 @@
     </w:p>
     <w:p>
       <w:pPr>
-        <w:spacing w:after="140"/>
+        <w:spacing w:after="180" w:line="312" w:lineRule="auto"/>
       </w:pPr>
       <w:r>
         <w:rPr>
@@ -1977,8 +2072,8 @@
           <w:left w:val="single" w:color="1B6CA8" w:sz="18" w:space="6"/>
         </w:pBdr>
         <w:shd w:fill="F4F4F4" w:val="clear"/>
-        <w:spacing w:after="160" w:before="80"/>
-        <w:ind w:left="120"/>
+        <w:spacing w:after="200" w:before="100" w:line="264" w:lineRule="auto"/>
+        <w:ind w:left="140"/>
       </w:pPr>
       <w:r>
         <w:rPr>
@@ -2014,8 +2109,8 @@
           <w:left w:val="single" w:color="9AC79A" w:sz="18" w:space="6"/>
         </w:pBdr>
         <w:shd w:fill="EAF4EA" w:val="clear"/>
-        <w:spacing w:after="160" w:before="80"/>
-        <w:ind w:left="120"/>
+        <w:spacing w:after="200" w:before="100" w:line="264" w:lineRule="auto"/>
+        <w:ind w:left="140"/>
       </w:pPr>
       <w:r>
         <w:rPr>
@@ -2028,7 +2123,7 @@
     </w:p>
     <w:p>
       <w:pPr>
-        <w:spacing w:after="140"/>
+        <w:spacing w:after="180" w:line="312" w:lineRule="auto"/>
       </w:pPr>
       <w:r>
         <w:rPr>
@@ -2037,6 +2132,11 @@
         </w:rPr>
         <w:t xml:space="preserve">Die erste Zeile legt die Schublade „punkte“ an, die nur ganze Zahlen aufnimmt. Die zweite legt die Zahl 100 hinein – das Gleichheitszeichen heißt hier „bekommt den Wert“, nicht „ist gleich“ im mathematischen Sinn. Die dritte holt den Wert heraus und gibt ihn aus.</w:t>
       </w:r>
+    </w:p>
+    <w:p>
+      <w:pPr>
+        <w:spacing w:before="60"/>
+      </w:pPr>
     </w:p>
     <w:tbl>
       <w:tblPr>
@@ -2054,6 +2154,9 @@
         <w:gridCol w:w="9360"/>
       </w:tblGrid>
       <w:tr>
+        <w:trPr>
+          <w:cantSplit/>
+        </w:trPr>
         <w:tc>
           <w:tcPr>
             <w:tcW w:type="dxa" w:w="9360"/>
@@ -2065,10 +2168,10 @@
             </w:tcBorders>
             <w:shd w:fill="FDF3E0" w:val="clear"/>
             <w:tcMar>
-              <w:top w:type="dxa" w:w="120"/>
-              <w:left w:type="dxa" w:w="160"/>
-              <w:bottom w:type="dxa" w:w="120"/>
-              <w:right w:type="dxa" w:w="160"/>
+              <w:top w:type="dxa" w:w="140"/>
+              <w:left w:type="dxa" w:w="180"/>
+              <w:bottom w:type="dxa" w:w="140"/>
+              <w:right w:type="dxa" w:w="180"/>
             </w:tcMar>
           </w:tcPr>
           <w:p>
@@ -2087,6 +2190,9 @@
             </w:r>
           </w:p>
           <w:p>
+            <w:pPr>
+              <w:spacing w:after="0" w:line="312" w:lineRule="auto"/>
+            </w:pPr>
             <w:r>
               <w:rPr>
                 <w:sz w:val="22"/>
@@ -2100,7 +2206,15 @@
     </w:tbl>
     <w:p>
       <w:pPr>
+        <w:spacing w:after="160"/>
+      </w:pPr>
+    </w:p>
+    <w:p>
+      <w:pPr>
         <w:pStyle w:val="Heading2"/>
+        <w:keepNext/>
+        <w:keepLines/>
+        <w:spacing w:after="120" w:before="280"/>
       </w:pPr>
       <w:r>
         <w:t xml:space="preserve">Die vier Grundtypen</w:t>
@@ -2108,7 +2222,7 @@
     </w:p>
     <w:p>
       <w:pPr>
-        <w:spacing w:after="140"/>
+        <w:spacing w:after="180" w:line="312" w:lineRule="auto"/>
       </w:pPr>
       <w:r>
         <w:rPr>
@@ -2121,10 +2235,11 @@
     <w:p>
       <w:pPr>
         <w:keepNext/>
+        <w:keepLines/>
         <w:pBdr>
           <w:bottom w:val="single" w:color="DDD0C0" w:sz="4" w:space="2"/>
         </w:pBdr>
-        <w:spacing w:after="30" w:before="220"/>
+        <w:spacing w:after="40" w:before="360"/>
       </w:pPr>
       <w:r>
         <w:rPr>
@@ -2140,7 +2255,8 @@
     </w:p>
     <w:p>
       <w:pPr>
-        <w:spacing w:after="80"/>
+        <w:keepNext/>
+        <w:spacing w:after="120"/>
       </w:pPr>
       <w:r>
         <w:rPr>
@@ -2164,7 +2280,7 @@
     </w:p>
     <w:p>
       <w:pPr>
-        <w:spacing w:after="140"/>
+        <w:spacing w:after="180" w:line="312" w:lineRule="auto"/>
       </w:pPr>
       <w:r>
         <w:rPr>
@@ -2176,7 +2292,8 @@
     </w:p>
     <w:p>
       <w:pPr>
-        <w:spacing w:after="20" w:before="40"/>
+        <w:keepNext/>
+        <w:spacing w:after="30" w:before="120"/>
       </w:pPr>
       <w:r>
         <w:rPr>
@@ -2198,8 +2315,8 @@
           <w:left w:val="single" w:color="1B6CA8" w:sz="18" w:space="6"/>
         </w:pBdr>
         <w:shd w:fill="F4F4F4" w:val="clear"/>
-        <w:spacing w:after="160" w:before="80"/>
-        <w:ind w:left="120"/>
+        <w:spacing w:after="200" w:before="100" w:line="264" w:lineRule="auto"/>
+        <w:ind w:left="140"/>
       </w:pPr>
       <w:r>
         <w:rPr>
@@ -2239,7 +2356,8 @@
     </w:p>
     <w:p>
       <w:pPr>
-        <w:spacing w:after="20" w:before="40"/>
+        <w:keepNext/>
+        <w:spacing w:after="30" w:before="120"/>
       </w:pPr>
       <w:r>
         <w:rPr>
@@ -2261,8 +2379,8 @@
           <w:left w:val="single" w:color="9AC79A" w:sz="18" w:space="6"/>
         </w:pBdr>
         <w:shd w:fill="EAF4EA" w:val="clear"/>
-        <w:spacing w:after="160" w:before="80"/>
-        <w:ind w:left="120"/>
+        <w:spacing w:after="200" w:before="100" w:line="264" w:lineRule="auto"/>
+        <w:ind w:left="140"/>
       </w:pPr>
       <w:r>
         <w:rPr>
@@ -2276,10 +2394,11 @@
     <w:p>
       <w:pPr>
         <w:keepNext/>
+        <w:keepLines/>
         <w:pBdr>
           <w:bottom w:val="single" w:color="DDD0C0" w:sz="4" w:space="2"/>
         </w:pBdr>
-        <w:spacing w:after="30" w:before="220"/>
+        <w:spacing w:after="40" w:before="360"/>
       </w:pPr>
       <w:r>
         <w:rPr>
@@ -2295,7 +2414,8 @@
     </w:p>
     <w:p>
       <w:pPr>
-        <w:spacing w:after="80"/>
+        <w:keepNext/>
+        <w:spacing w:after="120"/>
       </w:pPr>
       <w:r>
         <w:rPr>
@@ -2319,7 +2439,7 @@
     </w:p>
     <w:p>
       <w:pPr>
-        <w:spacing w:after="140"/>
+        <w:spacing w:after="180" w:line="312" w:lineRule="auto"/>
       </w:pPr>
       <w:r>
         <w:rPr>
@@ -2331,7 +2451,8 @@
     </w:p>
     <w:p>
       <w:pPr>
-        <w:spacing w:after="20" w:before="40"/>
+        <w:keepNext/>
+        <w:spacing w:after="30" w:before="120"/>
       </w:pPr>
       <w:r>
         <w:rPr>
@@ -2353,8 +2474,8 @@
           <w:left w:val="single" w:color="1B6CA8" w:sz="18" w:space="6"/>
         </w:pBdr>
         <w:shd w:fill="F4F4F4" w:val="clear"/>
-        <w:spacing w:after="160" w:before="80"/>
-        <w:ind w:left="120"/>
+        <w:spacing w:after="200" w:before="100" w:line="264" w:lineRule="auto"/>
+        <w:ind w:left="140"/>
       </w:pPr>
       <w:r>
         <w:rPr>
@@ -2385,7 +2506,8 @@
     </w:p>
     <w:p>
       <w:pPr>
-        <w:spacing w:after="20" w:before="40"/>
+        <w:keepNext/>
+        <w:spacing w:after="30" w:before="120"/>
       </w:pPr>
       <w:r>
         <w:rPr>
@@ -2407,8 +2529,8 @@
           <w:left w:val="single" w:color="9AC79A" w:sz="18" w:space="6"/>
         </w:pBdr>
         <w:shd w:fill="EAF4EA" w:val="clear"/>
-        <w:spacing w:after="160" w:before="80"/>
-        <w:ind w:left="120"/>
+        <w:spacing w:after="200" w:before="100" w:line="264" w:lineRule="auto"/>
+        <w:ind w:left="140"/>
       </w:pPr>
       <w:r>
         <w:rPr>
@@ -2422,10 +2544,11 @@
     <w:p>
       <w:pPr>
         <w:keepNext/>
+        <w:keepLines/>
         <w:pBdr>
           <w:bottom w:val="single" w:color="DDD0C0" w:sz="4" w:space="2"/>
         </w:pBdr>
-        <w:spacing w:after="30" w:before="220"/>
+        <w:spacing w:after="40" w:before="360"/>
       </w:pPr>
       <w:r>
         <w:rPr>
@@ -2441,7 +2564,8 @@
     </w:p>
     <w:p>
       <w:pPr>
-        <w:spacing w:after="80"/>
+        <w:keepNext/>
+        <w:spacing w:after="120"/>
       </w:pPr>
       <w:r>
         <w:rPr>
@@ -2465,7 +2589,7 @@
     </w:p>
     <w:p>
       <w:pPr>
-        <w:spacing w:after="140"/>
+        <w:spacing w:after="180" w:line="312" w:lineRule="auto"/>
       </w:pPr>
       <w:r>
         <w:rPr>
@@ -2477,7 +2601,8 @@
     </w:p>
     <w:p>
       <w:pPr>
-        <w:spacing w:after="20" w:before="40"/>
+        <w:keepNext/>
+        <w:spacing w:after="30" w:before="120"/>
       </w:pPr>
       <w:r>
         <w:rPr>
@@ -2499,8 +2624,8 @@
           <w:left w:val="single" w:color="1B6CA8" w:sz="18" w:space="6"/>
         </w:pBdr>
         <w:shd w:fill="F4F4F4" w:val="clear"/>
-        <w:spacing w:after="160" w:before="80"/>
-        <w:ind w:left="120"/>
+        <w:spacing w:after="200" w:before="100" w:line="264" w:lineRule="auto"/>
+        <w:ind w:left="140"/>
       </w:pPr>
       <w:r>
         <w:rPr>
@@ -2531,7 +2656,8 @@
     </w:p>
     <w:p>
       <w:pPr>
-        <w:spacing w:after="20" w:before="40"/>
+        <w:keepNext/>
+        <w:spacing w:after="30" w:before="120"/>
       </w:pPr>
       <w:r>
         <w:rPr>
@@ -2553,8 +2679,8 @@
           <w:left w:val="single" w:color="9AC79A" w:sz="18" w:space="6"/>
         </w:pBdr>
         <w:shd w:fill="EAF4EA" w:val="clear"/>
-        <w:spacing w:after="160" w:before="80"/>
-        <w:ind w:left="120"/>
+        <w:spacing w:after="200" w:before="100" w:line="264" w:lineRule="auto"/>
+        <w:ind w:left="140"/>
       </w:pPr>
       <w:r>
         <w:rPr>
@@ -2568,10 +2694,11 @@
     <w:p>
       <w:pPr>
         <w:keepNext/>
+        <w:keepLines/>
         <w:pBdr>
           <w:bottom w:val="single" w:color="DDD0C0" w:sz="4" w:space="2"/>
         </w:pBdr>
-        <w:spacing w:after="30" w:before="220"/>
+        <w:spacing w:after="40" w:before="360"/>
       </w:pPr>
       <w:r>
         <w:rPr>
@@ -2587,7 +2714,8 @@
     </w:p>
     <w:p>
       <w:pPr>
-        <w:spacing w:after="80"/>
+        <w:keepNext/>
+        <w:spacing w:after="120"/>
       </w:pPr>
       <w:r>
         <w:rPr>
@@ -2611,7 +2739,7 @@
     </w:p>
     <w:p>
       <w:pPr>
-        <w:spacing w:after="140"/>
+        <w:spacing w:after="180" w:line="312" w:lineRule="auto"/>
       </w:pPr>
       <w:r>
         <w:rPr>
@@ -2623,7 +2751,8 @@
     </w:p>
     <w:p>
       <w:pPr>
-        <w:spacing w:after="20" w:before="40"/>
+        <w:keepNext/>
+        <w:spacing w:after="30" w:before="120"/>
       </w:pPr>
       <w:r>
         <w:rPr>
@@ -2645,8 +2774,8 @@
           <w:left w:val="single" w:color="1B6CA8" w:sz="18" w:space="6"/>
         </w:pBdr>
         <w:shd w:fill="F4F4F4" w:val="clear"/>
-        <w:spacing w:after="160" w:before="80"/>
-        <w:ind w:left="120"/>
+        <w:spacing w:after="200" w:before="100" w:line="264" w:lineRule="auto"/>
+        <w:ind w:left="140"/>
       </w:pPr>
       <w:r>
         <w:rPr>
@@ -2677,7 +2806,8 @@
     </w:p>
     <w:p>
       <w:pPr>
-        <w:spacing w:after="20" w:before="40"/>
+        <w:keepNext/>
+        <w:spacing w:after="30" w:before="120"/>
       </w:pPr>
       <w:r>
         <w:rPr>
@@ -2699,8 +2829,8 @@
           <w:left w:val="single" w:color="9AC79A" w:sz="18" w:space="6"/>
         </w:pBdr>
         <w:shd w:fill="EAF4EA" w:val="clear"/>
-        <w:spacing w:after="160" w:before="80"/>
-        <w:ind w:left="120"/>
+        <w:spacing w:after="200" w:before="100" w:line="264" w:lineRule="auto"/>
+        <w:ind w:left="140"/>
       </w:pPr>
       <w:r>
         <w:rPr>
@@ -2714,6 +2844,9 @@
     <w:p>
       <w:pPr>
         <w:pStyle w:val="Heading2"/>
+        <w:keepNext/>
+        <w:keepLines/>
+        <w:spacing w:after="120" w:before="280"/>
       </w:pPr>
       <w:r>
         <w:t xml:space="preserve">Typen passen aufeinander auf</w:t>
@@ -2721,7 +2854,7 @@
     </w:p>
     <w:p>
       <w:pPr>
-        <w:spacing w:after="140"/>
+        <w:spacing w:after="180" w:line="312" w:lineRule="auto"/>
       </w:pPr>
       <w:r>
         <w:rPr>
@@ -2733,7 +2866,7 @@
     </w:p>
     <w:p>
       <w:pPr>
-        <w:spacing w:after="140"/>
+        <w:spacing w:after="180" w:line="312" w:lineRule="auto"/>
       </w:pPr>
       <w:r>
         <w:rPr>
@@ -2794,6 +2927,9 @@
     <w:p>
       <w:pPr>
         <w:pStyle w:val="Heading2"/>
+        <w:keepNext/>
+        <w:keepLines/>
+        <w:spacing w:after="120" w:before="280"/>
       </w:pPr>
       <w:r>
         <w:t xml:space="preserve">Konstanten: CONST</w:t>
@@ -2801,7 +2937,7 @@
     </w:p>
     <w:p>
       <w:pPr>
-        <w:spacing w:after="140"/>
+        <w:spacing w:after="180" w:line="312" w:lineRule="auto"/>
       </w:pPr>
       <w:r>
         <w:rPr>
@@ -2818,8 +2954,8 @@
           <w:left w:val="single" w:color="1B6CA8" w:sz="18" w:space="6"/>
         </w:pBdr>
         <w:shd w:fill="F4F4F4" w:val="clear"/>
-        <w:spacing w:after="160" w:before="80"/>
-        <w:ind w:left="120"/>
+        <w:spacing w:after="200" w:before="100" w:line="264" w:lineRule="auto"/>
+        <w:ind w:left="140"/>
       </w:pPr>
       <w:r>
         <w:rPr>
@@ -2864,8 +3000,8 @@
           <w:left w:val="single" w:color="9AC79A" w:sz="18" w:space="6"/>
         </w:pBdr>
         <w:shd w:fill="EAF4EA" w:val="clear"/>
-        <w:spacing w:after="160" w:before="80"/>
-        <w:ind w:left="120"/>
+        <w:spacing w:after="200" w:before="100" w:line="264" w:lineRule="auto"/>
+        <w:ind w:left="140"/>
       </w:pPr>
       <w:r>
         <w:rPr>
@@ -2884,6 +3020,11 @@
         <w:br/>
         <w:t xml:space="preserve">Leben: 3</w:t>
       </w:r>
+    </w:p>
+    <w:p>
+      <w:pPr>
+        <w:spacing w:before="60"/>
+      </w:pPr>
     </w:p>
     <w:tbl>
       <w:tblPr>
@@ -2901,6 +3042,9 @@
         <w:gridCol w:w="9360"/>
       </w:tblGrid>
       <w:tr>
+        <w:trPr>
+          <w:cantSplit/>
+        </w:trPr>
         <w:tc>
           <w:tcPr>
             <w:tcW w:type="dxa" w:w="9360"/>
@@ -2912,10 +3056,10 @@
             </w:tcBorders>
             <w:shd w:fill="E7F2FA" w:val="clear"/>
             <w:tcMar>
-              <w:top w:type="dxa" w:w="120"/>
-              <w:left w:type="dxa" w:w="160"/>
-              <w:bottom w:type="dxa" w:w="120"/>
-              <w:right w:type="dxa" w:w="160"/>
+              <w:top w:type="dxa" w:w="140"/>
+              <w:left w:type="dxa" w:w="180"/>
+              <w:bottom w:type="dxa" w:w="140"/>
+              <w:right w:type="dxa" w:w="180"/>
             </w:tcMar>
           </w:tcPr>
           <w:p>
@@ -2934,6 +3078,9 @@
             </w:r>
           </w:p>
           <w:p>
+            <w:pPr>
+              <w:spacing w:after="0" w:line="312" w:lineRule="auto"/>
+            </w:pPr>
             <w:r>
               <w:rPr>
                 <w:sz w:val="22"/>
@@ -2947,7 +3094,15 @@
     </w:tbl>
     <w:p>
       <w:pPr>
+        <w:spacing w:after="160"/>
+      </w:pPr>
+    </w:p>
+    <w:p>
+      <w:pPr>
         <w:pStyle w:val="Heading2"/>
+        <w:keepNext/>
+        <w:keepLines/>
+        <w:spacing w:after="120" w:before="280"/>
       </w:pPr>
       <w:r>
         <w:t xml:space="preserve">Gute Namen</w:t>
@@ -2955,7 +3110,7 @@
     </w:p>
     <w:p>
       <w:pPr>
-        <w:spacing w:after="140"/>
+        <w:spacing w:after="180" w:line="312" w:lineRule="auto"/>
       </w:pPr>
       <w:r>
         <w:rPr>
@@ -2964,6 +3119,11 @@
         </w:rPr>
         <w:t xml:space="preserve">Variablennamen beginnen mit einem Buchstaben und dürfen Buchstaben, Ziffern und Unterstriche enthalten. Groß-/Kleinschreibung wird unterschieden? In GameBasic sind Namen unkompliziert – wähle sie vor allem sprechend. „punkte“ sagt mehr als „p“, und „spieler_x“ mehr als „sx“. Dein zukünftiges Ich wird es dir danken.</w:t>
       </w:r>
+    </w:p>
+    <w:p>
+      <w:pPr>
+        <w:spacing w:before="60"/>
+      </w:pPr>
     </w:p>
     <w:tbl>
       <w:tblPr>
@@ -2981,6 +3141,9 @@
         <w:gridCol w:w="9360"/>
       </w:tblGrid>
       <w:tr>
+        <w:trPr>
+          <w:cantSplit/>
+        </w:trPr>
         <w:tc>
           <w:tcPr>
             <w:tcW w:type="dxa" w:w="9360"/>
@@ -2992,10 +3155,10 @@
             </w:tcBorders>
             <w:shd w:fill="FBEAEA" w:val="clear"/>
             <w:tcMar>
-              <w:top w:type="dxa" w:w="120"/>
-              <w:left w:type="dxa" w:w="160"/>
-              <w:bottom w:type="dxa" w:w="120"/>
-              <w:right w:type="dxa" w:w="160"/>
+              <w:top w:type="dxa" w:w="140"/>
+              <w:left w:type="dxa" w:w="180"/>
+              <w:bottom w:type="dxa" w:w="140"/>
+              <w:right w:type="dxa" w:w="180"/>
             </w:tcMar>
           </w:tcPr>
           <w:p>
@@ -3014,6 +3177,9 @@
             </w:r>
           </w:p>
           <w:p>
+            <w:pPr>
+              <w:spacing w:after="0" w:line="312" w:lineRule="auto"/>
+            </w:pPr>
             <w:r>
               <w:rPr>
                 <w:sz w:val="22"/>
@@ -3027,12 +3193,19 @@
     </w:tbl>
     <w:p>
       <w:pPr>
+        <w:spacing w:after="160"/>
+      </w:pPr>
+    </w:p>
+    <w:p>
+      <w:pPr>
         <w:pStyle w:val="Heading1"/>
+        <w:keepNext/>
+        <w:keepLines/>
         <w:pageBreakBefore/>
         <w:pBdr>
           <w:bottom w:val="single" w:color="1B6CA8" w:sz="12" w:space="4"/>
         </w:pBdr>
-        <w:spacing w:after="80" w:before="0"/>
+        <w:spacing w:after="160" w:before="0"/>
       </w:pPr>
       <w:r>
         <w:t xml:space="preserve">Operatoren &amp; Ausdrücke</w:t>
@@ -3040,7 +3213,7 @@
     </w:p>
     <w:p>
       <w:pPr>
-        <w:spacing w:after="140"/>
+        <w:spacing w:after="180" w:line="312" w:lineRule="auto"/>
       </w:pPr>
       <w:r>
         <w:rPr>
@@ -3053,6 +3226,9 @@
     <w:p>
       <w:pPr>
         <w:pStyle w:val="Heading2"/>
+        <w:keepNext/>
+        <w:keepLines/>
+        <w:spacing w:after="120" w:before="280"/>
       </w:pPr>
       <w:r>
         <w:t xml:space="preserve">Rechnen mit Zahlen</w:t>
@@ -3060,7 +3236,7 @@
     </w:p>
     <w:p>
       <w:pPr>
-        <w:spacing w:after="140"/>
+        <w:spacing w:after="180" w:line="312" w:lineRule="auto"/>
       </w:pPr>
       <w:r>
         <w:rPr>
@@ -3073,10 +3249,11 @@
     <w:p>
       <w:pPr>
         <w:keepNext/>
+        <w:keepLines/>
         <w:pBdr>
           <w:bottom w:val="single" w:color="DDD0C0" w:sz="4" w:space="2"/>
         </w:pBdr>
-        <w:spacing w:after="30" w:before="220"/>
+        <w:spacing w:after="40" w:before="360"/>
       </w:pPr>
       <w:r>
         <w:rPr>
@@ -3092,7 +3269,8 @@
     </w:p>
     <w:p>
       <w:pPr>
-        <w:spacing w:after="80"/>
+        <w:keepNext/>
+        <w:spacing w:after="120"/>
       </w:pPr>
       <w:r>
         <w:rPr>
@@ -3116,7 +3294,7 @@
     </w:p>
     <w:p>
       <w:pPr>
-        <w:spacing w:after="140"/>
+        <w:spacing w:after="180" w:line="312" w:lineRule="auto"/>
       </w:pPr>
       <w:r>
         <w:rPr>
@@ -3128,7 +3306,8 @@
     </w:p>
     <w:p>
       <w:pPr>
-        <w:spacing w:after="20" w:before="40"/>
+        <w:keepNext/>
+        <w:spacing w:after="30" w:before="120"/>
       </w:pPr>
       <w:r>
         <w:rPr>
@@ -3150,8 +3329,8 @@
           <w:left w:val="single" w:color="1B6CA8" w:sz="18" w:space="6"/>
         </w:pBdr>
         <w:shd w:fill="F4F4F4" w:val="clear"/>
-        <w:spacing w:after="160" w:before="80"/>
-        <w:ind w:left="120"/>
+        <w:spacing w:after="200" w:before="100" w:line="264" w:lineRule="auto"/>
+        <w:ind w:left="140"/>
       </w:pPr>
       <w:r>
         <w:rPr>
@@ -3191,7 +3370,8 @@
     </w:p>
     <w:p>
       <w:pPr>
-        <w:spacing w:after="20" w:before="40"/>
+        <w:keepNext/>
+        <w:spacing w:after="30" w:before="120"/>
       </w:pPr>
       <w:r>
         <w:rPr>
@@ -3213,8 +3393,8 @@
           <w:left w:val="single" w:color="9AC79A" w:sz="18" w:space="6"/>
         </w:pBdr>
         <w:shd w:fill="EAF4EA" w:val="clear"/>
-        <w:spacing w:after="160" w:before="80"/>
-        <w:ind w:left="120"/>
+        <w:spacing w:after="200" w:before="100" w:line="264" w:lineRule="auto"/>
+        <w:ind w:left="140"/>
       </w:pPr>
       <w:r>
         <w:rPr>
@@ -3255,10 +3435,11 @@
     <w:p>
       <w:pPr>
         <w:keepNext/>
+        <w:keepLines/>
         <w:pBdr>
           <w:bottom w:val="single" w:color="DDD0C0" w:sz="4" w:space="2"/>
         </w:pBdr>
-        <w:spacing w:after="30" w:before="220"/>
+        <w:spacing w:after="40" w:before="360"/>
       </w:pPr>
       <w:r>
         <w:rPr>
@@ -3274,7 +3455,8 @@
     </w:p>
     <w:p>
       <w:pPr>
-        <w:spacing w:after="80"/>
+        <w:keepNext/>
+        <w:spacing w:after="120"/>
       </w:pPr>
       <w:r>
         <w:rPr>
@@ -3298,7 +3480,7 @@
     </w:p>
     <w:p>
       <w:pPr>
-        <w:spacing w:after="140"/>
+        <w:spacing w:after="180" w:line="312" w:lineRule="auto"/>
       </w:pPr>
       <w:r>
         <w:rPr>
@@ -3310,7 +3492,8 @@
     </w:p>
     <w:p>
       <w:pPr>
-        <w:spacing w:after="20" w:before="40"/>
+        <w:keepNext/>
+        <w:spacing w:after="30" w:before="120"/>
       </w:pPr>
       <w:r>
         <w:rPr>
@@ -3332,8 +3515,8 @@
           <w:left w:val="single" w:color="1B6CA8" w:sz="18" w:space="6"/>
         </w:pBdr>
         <w:shd w:fill="F4F4F4" w:val="clear"/>
-        <w:spacing w:after="160" w:before="80"/>
-        <w:ind w:left="120"/>
+        <w:spacing w:after="200" w:before="100" w:line="264" w:lineRule="auto"/>
+        <w:ind w:left="140"/>
       </w:pPr>
       <w:r>
         <w:rPr>
@@ -3355,7 +3538,8 @@
     </w:p>
     <w:p>
       <w:pPr>
-        <w:spacing w:after="20" w:before="40"/>
+        <w:keepNext/>
+        <w:spacing w:after="30" w:before="120"/>
       </w:pPr>
       <w:r>
         <w:rPr>
@@ -3377,8 +3561,8 @@
           <w:left w:val="single" w:color="9AC79A" w:sz="18" w:space="6"/>
         </w:pBdr>
         <w:shd w:fill="EAF4EA" w:val="clear"/>
-        <w:spacing w:after="160" w:before="80"/>
-        <w:ind w:left="120"/>
+        <w:spacing w:after="200" w:before="100" w:line="264" w:lineRule="auto"/>
+        <w:ind w:left="140"/>
       </w:pPr>
       <w:r>
         <w:rPr>
@@ -3401,10 +3585,11 @@
     <w:p>
       <w:pPr>
         <w:keepNext/>
+        <w:keepLines/>
         <w:pBdr>
           <w:bottom w:val="single" w:color="DDD0C0" w:sz="4" w:space="2"/>
         </w:pBdr>
-        <w:spacing w:after="30" w:before="220"/>
+        <w:spacing w:after="40" w:before="360"/>
       </w:pPr>
       <w:r>
         <w:rPr>
@@ -3420,7 +3605,8 @@
     </w:p>
     <w:p>
       <w:pPr>
-        <w:spacing w:after="80"/>
+        <w:keepNext/>
+        <w:spacing w:after="120"/>
       </w:pPr>
       <w:r>
         <w:rPr>
@@ -3444,7 +3630,7 @@
     </w:p>
     <w:p>
       <w:pPr>
-        <w:spacing w:after="140"/>
+        <w:spacing w:after="180" w:line="312" w:lineRule="auto"/>
       </w:pPr>
       <w:r>
         <w:rPr>
@@ -3456,7 +3642,8 @@
     </w:p>
     <w:p>
       <w:pPr>
-        <w:spacing w:after="20" w:before="40"/>
+        <w:keepNext/>
+        <w:spacing w:after="30" w:before="120"/>
       </w:pPr>
       <w:r>
         <w:rPr>
@@ -3478,8 +3665,8 @@
           <w:left w:val="single" w:color="1B6CA8" w:sz="18" w:space="6"/>
         </w:pBdr>
         <w:shd w:fill="F4F4F4" w:val="clear"/>
-        <w:spacing w:after="160" w:before="80"/>
-        <w:ind w:left="120"/>
+        <w:spacing w:after="200" w:before="100" w:line="264" w:lineRule="auto"/>
+        <w:ind w:left="140"/>
       </w:pPr>
       <w:r>
         <w:rPr>
@@ -3501,7 +3688,8 @@
     </w:p>
     <w:p>
       <w:pPr>
-        <w:spacing w:after="20" w:before="40"/>
+        <w:keepNext/>
+        <w:spacing w:after="30" w:before="120"/>
       </w:pPr>
       <w:r>
         <w:rPr>
@@ -3523,8 +3711,8 @@
           <w:left w:val="single" w:color="9AC79A" w:sz="18" w:space="6"/>
         </w:pBdr>
         <w:shd w:fill="EAF4EA" w:val="clear"/>
-        <w:spacing w:after="160" w:before="80"/>
-        <w:ind w:left="120"/>
+        <w:spacing w:after="200" w:before="100" w:line="264" w:lineRule="auto"/>
+        <w:ind w:left="140"/>
       </w:pPr>
       <w:r>
         <w:rPr>
@@ -3547,6 +3735,9 @@
     <w:p>
       <w:pPr>
         <w:pStyle w:val="Heading2"/>
+        <w:keepNext/>
+        <w:keepLines/>
+        <w:spacing w:after="120" w:before="280"/>
       </w:pPr>
       <w:r>
         <w:t xml:space="preserve">Texte verketten</w:t>
@@ -3554,7 +3745,7 @@
     </w:p>
     <w:p>
       <w:pPr>
-        <w:spacing w:after="140"/>
+        <w:spacing w:after="180" w:line="312" w:lineRule="auto"/>
       </w:pPr>
       <w:r>
         <w:rPr>
@@ -3571,8 +3762,8 @@
           <w:left w:val="single" w:color="1B6CA8" w:sz="18" w:space="6"/>
         </w:pBdr>
         <w:shd w:fill="F4F4F4" w:val="clear"/>
-        <w:spacing w:after="160" w:before="80"/>
-        <w:ind w:left="120"/>
+        <w:spacing w:after="200" w:before="100" w:line="264" w:lineRule="auto"/>
+        <w:ind w:left="140"/>
       </w:pPr>
       <w:r>
         <w:rPr>
@@ -3608,8 +3799,8 @@
           <w:left w:val="single" w:color="9AC79A" w:sz="18" w:space="6"/>
         </w:pBdr>
         <w:shd w:fill="EAF4EA" w:val="clear"/>
-        <w:spacing w:after="160" w:before="80"/>
-        <w:ind w:left="120"/>
+        <w:spacing w:after="200" w:before="100" w:line="264" w:lineRule="auto"/>
+        <w:ind w:left="140"/>
       </w:pPr>
       <w:r>
         <w:rPr>
@@ -3623,6 +3814,9 @@
     <w:p>
       <w:pPr>
         <w:pStyle w:val="Heading2"/>
+        <w:keepNext/>
+        <w:keepLines/>
+        <w:spacing w:after="120" w:before="280"/>
       </w:pPr>
       <w:r>
         <w:t xml:space="preserve">Vergleichen</w:t>
@@ -3630,7 +3824,7 @@
     </w:p>
     <w:p>
       <w:pPr>
-        <w:spacing w:after="140"/>
+        <w:spacing w:after="180" w:line="312" w:lineRule="auto"/>
       </w:pPr>
       <w:r>
         <w:rPr>
@@ -3647,7 +3841,7 @@
           <w:ilvl w:val="0"/>
           <w:numId w:val="2"/>
         </w:numPr>
-        <w:spacing w:after="60"/>
+        <w:spacing w:after="100" w:line="312" w:lineRule="auto"/>
       </w:pPr>
       <w:r>
         <w:rPr>
@@ -3673,7 +3867,7 @@
           <w:ilvl w:val="0"/>
           <w:numId w:val="2"/>
         </w:numPr>
-        <w:spacing w:after="60"/>
+        <w:spacing w:after="100" w:line="312" w:lineRule="auto"/>
       </w:pPr>
       <w:r>
         <w:rPr>
@@ -3699,7 +3893,7 @@
           <w:ilvl w:val="0"/>
           <w:numId w:val="2"/>
         </w:numPr>
-        <w:spacing w:after="60"/>
+        <w:spacing w:after="100" w:line="312" w:lineRule="auto"/>
       </w:pPr>
       <w:r>
         <w:rPr>
@@ -3725,8 +3919,8 @@
           <w:left w:val="single" w:color="1B6CA8" w:sz="18" w:space="6"/>
         </w:pBdr>
         <w:shd w:fill="F4F4F4" w:val="clear"/>
-        <w:spacing w:after="160" w:before="80"/>
-        <w:ind w:left="120"/>
+        <w:spacing w:after="200" w:before="100" w:line="264" w:lineRule="auto"/>
+        <w:ind w:left="140"/>
       </w:pPr>
       <w:r>
         <w:rPr>
@@ -3771,8 +3965,8 @@
           <w:left w:val="single" w:color="9AC79A" w:sz="18" w:space="6"/>
         </w:pBdr>
         <w:shd w:fill="EAF4EA" w:val="clear"/>
-        <w:spacing w:after="160" w:before="80"/>
-        <w:ind w:left="120"/>
+        <w:spacing w:after="200" w:before="100" w:line="264" w:lineRule="auto"/>
+        <w:ind w:left="140"/>
       </w:pPr>
       <w:r>
         <w:rPr>
@@ -3809,6 +4003,11 @@
         <w:br/>
         <w:t xml:space="preserve">TRUE</w:t>
       </w:r>
+    </w:p>
+    <w:p>
+      <w:pPr>
+        <w:spacing w:before="60"/>
+      </w:pPr>
     </w:p>
     <w:tbl>
       <w:tblPr>
@@ -3826,6 +4025,9 @@
         <w:gridCol w:w="9360"/>
       </w:tblGrid>
       <w:tr>
+        <w:trPr>
+          <w:cantSplit/>
+        </w:trPr>
         <w:tc>
           <w:tcPr>
             <w:tcW w:type="dxa" w:w="9360"/>
@@ -3837,10 +4039,10 @@
             </w:tcBorders>
             <w:shd w:fill="FDF3E0" w:val="clear"/>
             <w:tcMar>
-              <w:top w:type="dxa" w:w="120"/>
-              <w:left w:type="dxa" w:w="160"/>
-              <w:bottom w:type="dxa" w:w="120"/>
-              <w:right w:type="dxa" w:w="160"/>
+              <w:top w:type="dxa" w:w="140"/>
+              <w:left w:type="dxa" w:w="180"/>
+              <w:bottom w:type="dxa" w:w="140"/>
+              <w:right w:type="dxa" w:w="180"/>
             </w:tcMar>
           </w:tcPr>
           <w:p>
@@ -3859,6 +4061,9 @@
             </w:r>
           </w:p>
           <w:p>
+            <w:pPr>
+              <w:spacing w:after="0" w:line="312" w:lineRule="auto"/>
+            </w:pPr>
             <w:r>
               <w:rPr>
                 <w:sz w:val="22"/>
@@ -3872,7 +4077,15 @@
     </w:tbl>
     <w:p>
       <w:pPr>
+        <w:spacing w:after="160"/>
+      </w:pPr>
+    </w:p>
+    <w:p>
+      <w:pPr>
         <w:pStyle w:val="Heading2"/>
+        <w:keepNext/>
+        <w:keepLines/>
+        <w:spacing w:after="120" w:before="280"/>
       </w:pPr>
       <w:r>
         <w:t xml:space="preserve">Logik verknüpfen: AND, OR, NOT</w:t>
@@ -3880,7 +4093,7 @@
     </w:p>
     <w:p>
       <w:pPr>
-        <w:spacing w:after="140"/>
+        <w:spacing w:after="180" w:line="312" w:lineRule="auto"/>
       </w:pPr>
       <w:r>
         <w:rPr>
@@ -3897,8 +4110,8 @@
           <w:left w:val="single" w:color="1B6CA8" w:sz="18" w:space="6"/>
         </w:pBdr>
         <w:shd w:fill="F4F4F4" w:val="clear"/>
-        <w:spacing w:after="160" w:before="80"/>
-        <w:ind w:left="120"/>
+        <w:spacing w:after="200" w:before="100" w:line="264" w:lineRule="auto"/>
+        <w:ind w:left="140"/>
       </w:pPr>
       <w:r>
         <w:rPr>
@@ -3943,8 +4156,8 @@
           <w:left w:val="single" w:color="9AC79A" w:sz="18" w:space="6"/>
         </w:pBdr>
         <w:shd w:fill="EAF4EA" w:val="clear"/>
-        <w:spacing w:after="160" w:before="80"/>
-        <w:ind w:left="120"/>
+        <w:spacing w:after="200" w:before="100" w:line="264" w:lineRule="auto"/>
+        <w:ind w:left="140"/>
       </w:pPr>
       <w:r>
         <w:rPr>
@@ -3985,6 +4198,9 @@
     <w:p>
       <w:pPr>
         <w:pStyle w:val="Heading2"/>
+        <w:keepNext/>
+        <w:keepLines/>
+        <w:spacing w:after="120" w:before="280"/>
       </w:pPr>
       <w:r>
         <w:t xml:space="preserve">Punkt vor Strich – und Klammern</w:t>
@@ -3992,7 +4208,7 @@
     </w:p>
     <w:p>
       <w:pPr>
-        <w:spacing w:after="140"/>
+        <w:spacing w:after="180" w:line="312" w:lineRule="auto"/>
       </w:pPr>
       <w:r>
         <w:rPr>
@@ -4009,8 +4225,8 @@
           <w:left w:val="single" w:color="1B6CA8" w:sz="18" w:space="6"/>
         </w:pBdr>
         <w:shd w:fill="F4F4F4" w:val="clear"/>
-        <w:spacing w:after="160" w:before="80"/>
-        <w:ind w:left="120"/>
+        <w:spacing w:after="200" w:before="100" w:line="264" w:lineRule="auto"/>
+        <w:ind w:left="140"/>
       </w:pPr>
       <w:r>
         <w:rPr>
@@ -4037,8 +4253,8 @@
           <w:left w:val="single" w:color="9AC79A" w:sz="18" w:space="6"/>
         </w:pBdr>
         <w:shd w:fill="EAF4EA" w:val="clear"/>
-        <w:spacing w:after="160" w:before="80"/>
-        <w:ind w:left="120"/>
+        <w:spacing w:after="200" w:before="100" w:line="264" w:lineRule="auto"/>
+        <w:ind w:left="140"/>
       </w:pPr>
       <w:r>
         <w:rPr>
@@ -4061,6 +4277,9 @@
     <w:p>
       <w:pPr>
         <w:pStyle w:val="Heading2"/>
+        <w:keepNext/>
+        <w:keepLines/>
+        <w:spacing w:after="120" w:before="280"/>
       </w:pPr>
       <w:r>
         <w:t xml:space="preserve">Bit-Operatoren (für Fortgeschrittene)</w:t>
@@ -4068,7 +4287,7 @@
     </w:p>
     <w:p>
       <w:pPr>
-        <w:spacing w:after="140"/>
+        <w:spacing w:after="180" w:line="312" w:lineRule="auto"/>
       </w:pPr>
       <w:r>
         <w:rPr>
@@ -4081,10 +4300,11 @@
     <w:p>
       <w:pPr>
         <w:keepNext/>
+        <w:keepLines/>
         <w:pBdr>
           <w:bottom w:val="single" w:color="DDD0C0" w:sz="4" w:space="2"/>
         </w:pBdr>
-        <w:spacing w:after="30" w:before="220"/>
+        <w:spacing w:after="40" w:before="360"/>
       </w:pPr>
       <w:r>
         <w:rPr>
@@ -4100,7 +4320,8 @@
     </w:p>
     <w:p>
       <w:pPr>
-        <w:spacing w:after="80"/>
+        <w:keepNext/>
+        <w:spacing w:after="120"/>
       </w:pPr>
       <w:r>
         <w:rPr>
@@ -4124,7 +4345,7 @@
     </w:p>
     <w:p>
       <w:pPr>
-        <w:spacing w:after="140"/>
+        <w:spacing w:after="180" w:line="312" w:lineRule="auto"/>
       </w:pPr>
       <w:r>
         <w:rPr>
@@ -4136,7 +4357,8 @@
     </w:p>
     <w:p>
       <w:pPr>
-        <w:spacing w:after="20" w:before="40"/>
+        <w:keepNext/>
+        <w:spacing w:after="30" w:before="120"/>
       </w:pPr>
       <w:r>
         <w:rPr>
@@ -4158,8 +4380,8 @@
           <w:left w:val="single" w:color="1B6CA8" w:sz="18" w:space="6"/>
         </w:pBdr>
         <w:shd w:fill="F4F4F4" w:val="clear"/>
-        <w:spacing w:after="160" w:before="80"/>
-        <w:ind w:left="120"/>
+        <w:spacing w:after="200" w:before="100" w:line="264" w:lineRule="auto"/>
+        <w:ind w:left="140"/>
       </w:pPr>
       <w:r>
         <w:rPr>
@@ -4181,7 +4403,8 @@
     </w:p>
     <w:p>
       <w:pPr>
-        <w:spacing w:after="20" w:before="40"/>
+        <w:keepNext/>
+        <w:spacing w:after="30" w:before="120"/>
       </w:pPr>
       <w:r>
         <w:rPr>
@@ -4203,8 +4426,8 @@
           <w:left w:val="single" w:color="9AC79A" w:sz="18" w:space="6"/>
         </w:pBdr>
         <w:shd w:fill="EAF4EA" w:val="clear"/>
-        <w:spacing w:after="160" w:before="80"/>
-        <w:ind w:left="120"/>
+        <w:spacing w:after="200" w:before="100" w:line="264" w:lineRule="auto"/>
+        <w:ind w:left="140"/>
       </w:pPr>
       <w:r>
         <w:rPr>

</xml_diff>

<commit_message>
docs(buch): Lehrbuch Kap 12 -- Ein-/Ausgabe (PRINT/INPUT/f-Strings/FORMAT$)
PRINT mit Komma/Semikolon-Trennern + Zeilenumbruch-Unterdrueckung, INPUT
mit Typ-Coercion + Prompt, f-Strings inkl. {{}}-Escape + Format-Specs,
FORMAT$. Alle Beispiel-Ausgaben gegen gbrt verifiziert.

Co-Authored-By: Claude Opus 4.8 (1M context) <noreply@anthropic.com>
</commit_message>
<xml_diff>
--- a/buch-referenz/buch/GameBasic-Lehrbuch.docx
+++ b/buch-referenz/buch/GameBasic-Lehrbuch.docx
@@ -300,6 +300,33 @@
           <w:szCs w:val="22"/>
         </w:rPr>
         <w:t xml:space="preserve">	16</w:t>
+      </w:r>
+    </w:p>
+    <w:p>
+      <w:pPr>
+        <w:tabs>
+          <w:tab w:val="right" w:pos="9200" w:leader="dot"/>
+        </w:tabs>
+        <w:spacing w:after="20" w:before="0"/>
+        <w:ind w:left="280"/>
+      </w:pPr>
+      <w:r>
+        <w:rPr>
+          <w:b w:val="false"/>
+          <w:bCs w:val="false"/>
+          <w:color w:val="222222"/>
+          <w:sz w:val="22"/>
+          <w:szCs w:val="22"/>
+        </w:rPr>
+        <w:t xml:space="preserve">Ein- und Ausgabe</w:t>
+      </w:r>
+      <w:r>
+        <w:rPr>
+          <w:color w:val="555555"/>
+          <w:sz w:val="22"/>
+          <w:szCs w:val="22"/>
+        </w:rPr>
+        <w:t xml:space="preserve">	20</w:t>
       </w:r>
     </w:p>
     <w:p>
@@ -4446,6 +4473,1391 @@
         <w:br/>
         <w:t xml:space="preserve">16</w:t>
       </w:r>
+    </w:p>
+    <w:p>
+      <w:pPr>
+        <w:pStyle w:val="Heading1"/>
+        <w:keepNext/>
+        <w:keepLines/>
+        <w:pageBreakBefore/>
+        <w:pBdr>
+          <w:bottom w:val="single" w:color="1B6CA8" w:sz="12" w:space="4"/>
+        </w:pBdr>
+        <w:spacing w:after="160" w:before="0"/>
+      </w:pPr>
+      <w:r>
+        <w:t xml:space="preserve">Ein- und Ausgabe</w:t>
+      </w:r>
+    </w:p>
+    <w:p>
+      <w:pPr>
+        <w:spacing w:after="180" w:line="312" w:lineRule="auto"/>
+      </w:pPr>
+      <w:r>
+        <w:rPr>
+          <w:sz w:val="22"/>
+          <w:szCs w:val="22"/>
+        </w:rPr>
+        <w:t xml:space="preserve">Ein Programm, das nichts anzeigt und nichts erfragt, wäre eine stille Sache. In diesem Kapitel lernst du die beiden Befehle kennen, mit denen dein Programm mit dem Menschen davor spricht: PRINT schreibt etwas auf den Bildschirm, INPUT liest etwas von der Tastatur. Zum Schluss kommen die f-Strings dazu – eine elegante Art, Text und Werte zu einem Satz zu verweben.</w:t>
+      </w:r>
+    </w:p>
+    <w:p>
+      <w:pPr>
+        <w:pStyle w:val="Heading2"/>
+        <w:keepNext/>
+        <w:keepLines/>
+        <w:spacing w:after="120" w:before="280"/>
+      </w:pPr>
+      <w:r>
+        <w:t xml:space="preserve">Ausgeben mit PRINT</w:t>
+      </w:r>
+    </w:p>
+    <w:p>
+      <w:pPr>
+        <w:spacing w:after="180" w:line="312" w:lineRule="auto"/>
+      </w:pPr>
+      <w:r>
+        <w:rPr>
+          <w:sz w:val="22"/>
+          <w:szCs w:val="22"/>
+        </w:rPr>
+        <w:t xml:space="preserve">PRINT kennst du schon aus den ersten Kapiteln. Es gibt einen oder mehrere Werte aus und springt anschließend in die nächste Zeile. Werte zählst du auf, indem du sie mit einem Trennzeichen aneinanderreihst – und genau dieses Trennzeichen entscheidet über das Aussehen der Ausgabe.</w:t>
+      </w:r>
+    </w:p>
+    <w:p>
+      <w:pPr>
+        <w:keepNext/>
+        <w:keepLines/>
+        <w:pBdr>
+          <w:bottom w:val="single" w:color="DDD0C0" w:sz="4" w:space="2"/>
+        </w:pBdr>
+        <w:spacing w:after="40" w:before="360"/>
+      </w:pPr>
+      <w:r>
+        <w:rPr>
+          <w:rFonts w:ascii="Consolas" w:cs="Consolas" w:eastAsia="Consolas" w:hAnsi="Consolas"/>
+          <w:b/>
+          <w:bCs/>
+          <w:color w:val="9A3412"/>
+          <w:sz w:val="24"/>
+          <w:szCs w:val="24"/>
+        </w:rPr>
+        <w:t xml:space="preserve">PRINT</w:t>
+      </w:r>
+    </w:p>
+    <w:p>
+      <w:pPr>
+        <w:keepNext/>
+        <w:spacing w:after="120"/>
+      </w:pPr>
+      <w:r>
+        <w:rPr>
+          <w:b/>
+          <w:bCs/>
+          <w:color w:val="6A6A6A"/>
+          <w:sz w:val="18"/>
+          <w:szCs w:val="18"/>
+        </w:rPr>
+        <w:t xml:space="preserve">Syntax:  </w:t>
+      </w:r>
+      <w:r>
+        <w:rPr>
+          <w:rFonts w:ascii="Consolas" w:cs="Consolas" w:eastAsia="Consolas" w:hAnsi="Consolas"/>
+          <w:color w:val="335577"/>
+          <w:sz w:val="19"/>
+          <w:szCs w:val="19"/>
+        </w:rPr>
+        <w:t xml:space="preserve">PRINT wert1 [, wert2 ...]   ' oder mit ;</w:t>
+      </w:r>
+    </w:p>
+    <w:p>
+      <w:pPr>
+        <w:spacing w:after="180" w:line="312" w:lineRule="auto"/>
+      </w:pPr>
+      <w:r>
+        <w:rPr>
+          <w:sz w:val="22"/>
+          <w:szCs w:val="22"/>
+        </w:rPr>
+        <w:t xml:space="preserve">Gibt die Werte aus und beginnt danach eine neue Zeile. Mehrere Werte trennst du mit Komma oder Semikolon – siehe unten. PRINT ganz ohne Argument gibt eine leere Zeile aus.</w:t>
+      </w:r>
+    </w:p>
+    <w:p>
+      <w:pPr>
+        <w:keepNext/>
+        <w:spacing w:after="30" w:before="120"/>
+      </w:pPr>
+      <w:r>
+        <w:rPr>
+          <w:b/>
+          <w:bCs/>
+          <w:i/>
+          <w:iCs/>
+          <w:color w:val="6A6A6A"/>
+          <w:sz w:val="18"/>
+          <w:szCs w:val="18"/>
+        </w:rPr>
+        <w:t xml:space="preserve">Beispiel</w:t>
+      </w:r>
+    </w:p>
+    <w:p>
+      <w:pPr>
+        <w:keepLines/>
+        <w:pBdr>
+          <w:left w:val="single" w:color="1B6CA8" w:sz="18" w:space="6"/>
+        </w:pBdr>
+        <w:shd w:fill="F4F4F4" w:val="clear"/>
+        <w:spacing w:after="200" w:before="100" w:line="264" w:lineRule="auto"/>
+        <w:ind w:left="140"/>
+      </w:pPr>
+      <w:r>
+        <w:rPr>
+          <w:rFonts w:ascii="Consolas" w:cs="Consolas" w:eastAsia="Consolas" w:hAnsi="Consolas"/>
+          <w:sz w:val="19"/>
+          <w:szCs w:val="19"/>
+        </w:rPr>
+        <w:t xml:space="preserve">PRINT "Hallo!"</w:t>
+      </w:r>
+      <w:r>
+        <w:rPr>
+          <w:rFonts w:ascii="Consolas" w:cs="Consolas" w:eastAsia="Consolas" w:hAnsi="Consolas"/>
+          <w:sz w:val="19"/>
+          <w:szCs w:val="19"/>
+        </w:rPr>
+        <w:br/>
+        <w:t xml:space="preserve">PRINT 2 + 3</w:t>
+      </w:r>
+      <w:r>
+        <w:rPr>
+          <w:rFonts w:ascii="Consolas" w:cs="Consolas" w:eastAsia="Consolas" w:hAnsi="Consolas"/>
+          <w:sz w:val="19"/>
+          <w:szCs w:val="19"/>
+        </w:rPr>
+        <w:br/>
+        <w:t xml:space="preserve">PRINT</w:t>
+      </w:r>
+    </w:p>
+    <w:p>
+      <w:pPr>
+        <w:keepNext/>
+        <w:spacing w:after="30" w:before="120"/>
+      </w:pPr>
+      <w:r>
+        <w:rPr>
+          <w:b/>
+          <w:bCs/>
+          <w:i/>
+          <w:iCs/>
+          <w:color w:val="6A6A6A"/>
+          <w:sz w:val="18"/>
+          <w:szCs w:val="18"/>
+        </w:rPr>
+        <w:t xml:space="preserve">Ausgabe</w:t>
+      </w:r>
+    </w:p>
+    <w:p>
+      <w:pPr>
+        <w:keepLines/>
+        <w:pBdr>
+          <w:left w:val="single" w:color="9AC79A" w:sz="18" w:space="6"/>
+        </w:pBdr>
+        <w:shd w:fill="EAF4EA" w:val="clear"/>
+        <w:spacing w:after="200" w:before="100" w:line="264" w:lineRule="auto"/>
+        <w:ind w:left="140"/>
+      </w:pPr>
+      <w:r>
+        <w:rPr>
+          <w:rFonts w:ascii="Consolas" w:cs="Consolas" w:eastAsia="Consolas" w:hAnsi="Consolas"/>
+          <w:sz w:val="19"/>
+          <w:szCs w:val="19"/>
+        </w:rPr>
+        <w:t xml:space="preserve">Hallo!</w:t>
+      </w:r>
+      <w:r>
+        <w:rPr>
+          <w:rFonts w:ascii="Consolas" w:cs="Consolas" w:eastAsia="Consolas" w:hAnsi="Consolas"/>
+          <w:sz w:val="19"/>
+          <w:szCs w:val="19"/>
+        </w:rPr>
+        <w:br/>
+        <w:t xml:space="preserve">5</w:t>
+      </w:r>
+      <w:r>
+        <w:rPr>
+          <w:rFonts w:ascii="Consolas" w:cs="Consolas" w:eastAsia="Consolas" w:hAnsi="Consolas"/>
+          <w:sz w:val="19"/>
+          <w:szCs w:val="19"/>
+        </w:rPr>
+        <w:br/>
+        <w:t xml:space="preserve"/>
+      </w:r>
+    </w:p>
+    <w:p>
+      <w:pPr>
+        <w:pStyle w:val="Heading2"/>
+        <w:keepNext/>
+        <w:keepLines/>
+        <w:spacing w:after="120" w:before="280"/>
+      </w:pPr>
+      <w:r>
+        <w:t xml:space="preserve">Komma oder Semikolon – der feine Unterschied</w:t>
+      </w:r>
+    </w:p>
+    <w:p>
+      <w:pPr>
+        <w:spacing w:after="180" w:line="312" w:lineRule="auto"/>
+      </w:pPr>
+      <w:r>
+        <w:rPr>
+          <w:sz w:val="22"/>
+          <w:szCs w:val="22"/>
+        </w:rPr>
+        <w:t xml:space="preserve">Beide Trennzeichen hängen die Werte hintereinander – aber das Komma setzt ein Leerzeichen dazwischen, das Semikolon nicht. So hast du die Ausgabe genau in der Hand:</w:t>
+      </w:r>
+    </w:p>
+    <w:p>
+      <w:pPr>
+        <w:pStyle w:val="ListParagraph"/>
+        <w:numPr>
+          <w:ilvl w:val="0"/>
+          <w:numId w:val="2"/>
+        </w:numPr>
+        <w:spacing w:after="100" w:line="312" w:lineRule="auto"/>
+      </w:pPr>
+      <w:r>
+        <w:rPr>
+          <w:b/>
+          <w:bCs/>
+          <w:sz w:val="22"/>
+          <w:szCs w:val="22"/>
+        </w:rPr>
+        <w:t xml:space="preserve">Komma  ,  </w:t>
+      </w:r>
+      <w:r>
+        <w:rPr>
+          <w:sz w:val="22"/>
+          <w:szCs w:val="22"/>
+        </w:rPr>
+        <w:t xml:space="preserve">trennt mit einem Leerzeichen.</w:t>
+      </w:r>
+    </w:p>
+    <w:p>
+      <w:pPr>
+        <w:pStyle w:val="ListParagraph"/>
+        <w:numPr>
+          <w:ilvl w:val="0"/>
+          <w:numId w:val="2"/>
+        </w:numPr>
+        <w:spacing w:after="100" w:line="312" w:lineRule="auto"/>
+      </w:pPr>
+      <w:r>
+        <w:rPr>
+          <w:b/>
+          <w:bCs/>
+          <w:sz w:val="22"/>
+          <w:szCs w:val="22"/>
+        </w:rPr>
+        <w:t xml:space="preserve">Semikolon  ;  </w:t>
+      </w:r>
+      <w:r>
+        <w:rPr>
+          <w:sz w:val="22"/>
+          <w:szCs w:val="22"/>
+        </w:rPr>
+        <w:t xml:space="preserve">trennt ohne Zwischenraum – die Werte kleben aneinander.</w:t>
+      </w:r>
+    </w:p>
+    <w:p>
+      <w:pPr>
+        <w:keepLines/>
+        <w:pBdr>
+          <w:left w:val="single" w:color="1B6CA8" w:sz="18" w:space="6"/>
+        </w:pBdr>
+        <w:shd w:fill="F4F4F4" w:val="clear"/>
+        <w:spacing w:after="200" w:before="100" w:line="264" w:lineRule="auto"/>
+        <w:ind w:left="140"/>
+      </w:pPr>
+      <w:r>
+        <w:rPr>
+          <w:rFonts w:ascii="Consolas" w:cs="Consolas" w:eastAsia="Consolas" w:hAnsi="Consolas"/>
+          <w:sz w:val="19"/>
+          <w:szCs w:val="19"/>
+        </w:rPr>
+        <w:t xml:space="preserve">PRINT "a", "b", "c"</w:t>
+      </w:r>
+      <w:r>
+        <w:rPr>
+          <w:rFonts w:ascii="Consolas" w:cs="Consolas" w:eastAsia="Consolas" w:hAnsi="Consolas"/>
+          <w:sz w:val="19"/>
+          <w:szCs w:val="19"/>
+        </w:rPr>
+        <w:br/>
+        <w:t xml:space="preserve">PRINT "a"; "b"; "c"</w:t>
+      </w:r>
+      <w:r>
+        <w:rPr>
+          <w:rFonts w:ascii="Consolas" w:cs="Consolas" w:eastAsia="Consolas" w:hAnsi="Consolas"/>
+          <w:sz w:val="19"/>
+          <w:szCs w:val="19"/>
+        </w:rPr>
+        <w:br/>
+        <w:t xml:space="preserve">PRINT "Punkte: "; 42</w:t>
+      </w:r>
+    </w:p>
+    <w:p>
+      <w:pPr>
+        <w:keepLines/>
+        <w:pBdr>
+          <w:left w:val="single" w:color="9AC79A" w:sz="18" w:space="6"/>
+        </w:pBdr>
+        <w:shd w:fill="EAF4EA" w:val="clear"/>
+        <w:spacing w:after="200" w:before="100" w:line="264" w:lineRule="auto"/>
+        <w:ind w:left="140"/>
+      </w:pPr>
+      <w:r>
+        <w:rPr>
+          <w:rFonts w:ascii="Consolas" w:cs="Consolas" w:eastAsia="Consolas" w:hAnsi="Consolas"/>
+          <w:sz w:val="19"/>
+          <w:szCs w:val="19"/>
+        </w:rPr>
+        <w:t xml:space="preserve">a b c</w:t>
+      </w:r>
+      <w:r>
+        <w:rPr>
+          <w:rFonts w:ascii="Consolas" w:cs="Consolas" w:eastAsia="Consolas" w:hAnsi="Consolas"/>
+          <w:sz w:val="19"/>
+          <w:szCs w:val="19"/>
+        </w:rPr>
+        <w:br/>
+        <w:t xml:space="preserve">abc</w:t>
+      </w:r>
+      <w:r>
+        <w:rPr>
+          <w:rFonts w:ascii="Consolas" w:cs="Consolas" w:eastAsia="Consolas" w:hAnsi="Consolas"/>
+          <w:sz w:val="19"/>
+          <w:szCs w:val="19"/>
+        </w:rPr>
+        <w:br/>
+        <w:t xml:space="preserve">Punkte: 42</w:t>
+      </w:r>
+    </w:p>
+    <w:p>
+      <w:pPr>
+        <w:spacing w:after="180" w:line="312" w:lineRule="auto"/>
+      </w:pPr>
+      <w:r>
+        <w:rPr>
+          <w:sz w:val="22"/>
+          <w:szCs w:val="22"/>
+        </w:rPr>
+        <w:t xml:space="preserve">Ein Semikolon am Zeilenende hat noch einen Spezialeffekt: Es unterdrückt den Zeilenumbruch. Der nächste PRINT schließt dann direkt an – praktisch, um eine Zeile in mehreren Schritten aufzubauen.</w:t>
+      </w:r>
+    </w:p>
+    <w:p>
+      <w:pPr>
+        <w:keepLines/>
+        <w:pBdr>
+          <w:left w:val="single" w:color="1B6CA8" w:sz="18" w:space="6"/>
+        </w:pBdr>
+        <w:shd w:fill="F4F4F4" w:val="clear"/>
+        <w:spacing w:after="200" w:before="100" w:line="264" w:lineRule="auto"/>
+        <w:ind w:left="140"/>
+      </w:pPr>
+      <w:r>
+        <w:rPr>
+          <w:rFonts w:ascii="Consolas" w:cs="Consolas" w:eastAsia="Consolas" w:hAnsi="Consolas"/>
+          <w:sz w:val="19"/>
+          <w:szCs w:val="19"/>
+        </w:rPr>
+        <w:t xml:space="preserve">PRINT "Lade";</w:t>
+      </w:r>
+      <w:r>
+        <w:rPr>
+          <w:rFonts w:ascii="Consolas" w:cs="Consolas" w:eastAsia="Consolas" w:hAnsi="Consolas"/>
+          <w:sz w:val="19"/>
+          <w:szCs w:val="19"/>
+        </w:rPr>
+        <w:br/>
+        <w:t xml:space="preserve">PRINT "...";</w:t>
+      </w:r>
+      <w:r>
+        <w:rPr>
+          <w:rFonts w:ascii="Consolas" w:cs="Consolas" w:eastAsia="Consolas" w:hAnsi="Consolas"/>
+          <w:sz w:val="19"/>
+          <w:szCs w:val="19"/>
+        </w:rPr>
+        <w:br/>
+        <w:t xml:space="preserve">PRINT "fertig"</w:t>
+      </w:r>
+    </w:p>
+    <w:p>
+      <w:pPr>
+        <w:keepLines/>
+        <w:pBdr>
+          <w:left w:val="single" w:color="9AC79A" w:sz="18" w:space="6"/>
+        </w:pBdr>
+        <w:shd w:fill="EAF4EA" w:val="clear"/>
+        <w:spacing w:after="200" w:before="100" w:line="264" w:lineRule="auto"/>
+        <w:ind w:left="140"/>
+      </w:pPr>
+      <w:r>
+        <w:rPr>
+          <w:rFonts w:ascii="Consolas" w:cs="Consolas" w:eastAsia="Consolas" w:hAnsi="Consolas"/>
+          <w:sz w:val="19"/>
+          <w:szCs w:val="19"/>
+        </w:rPr>
+        <w:t xml:space="preserve">Lade...fertig</w:t>
+      </w:r>
+    </w:p>
+    <w:p>
+      <w:pPr>
+        <w:pStyle w:val="Heading2"/>
+        <w:keepNext/>
+        <w:keepLines/>
+        <w:spacing w:after="120" w:before="280"/>
+      </w:pPr>
+      <w:r>
+        <w:t xml:space="preserve">Eingeben mit INPUT</w:t>
+      </w:r>
+    </w:p>
+    <w:p>
+      <w:pPr>
+        <w:spacing w:after="180" w:line="312" w:lineRule="auto"/>
+      </w:pPr>
+      <w:r>
+        <w:rPr>
+          <w:sz w:val="22"/>
+          <w:szCs w:val="22"/>
+        </w:rPr>
+        <w:t xml:space="preserve">INPUT hält das Programm an, wartet auf eine Eingabe des Benutzers (abgeschlossen mit der Eingabetaste) und legt das Getippte in einer Variablen ab. Der Clou: GameBasic wandelt die Eingabe automatisch in den Typ der Variablen um. Steht dort eine INTEGER-Variable, wird aus dem getippten Text eine Zahl; bei STRING bleibt es Text.</w:t>
+      </w:r>
+    </w:p>
+    <w:p>
+      <w:pPr>
+        <w:keepNext/>
+        <w:keepLines/>
+        <w:pBdr>
+          <w:bottom w:val="single" w:color="DDD0C0" w:sz="4" w:space="2"/>
+        </w:pBdr>
+        <w:spacing w:after="40" w:before="360"/>
+      </w:pPr>
+      <w:r>
+        <w:rPr>
+          <w:rFonts w:ascii="Consolas" w:cs="Consolas" w:eastAsia="Consolas" w:hAnsi="Consolas"/>
+          <w:b/>
+          <w:bCs/>
+          <w:color w:val="9A3412"/>
+          <w:sz w:val="24"/>
+          <w:szCs w:val="24"/>
+        </w:rPr>
+        <w:t xml:space="preserve">INPUT</w:t>
+      </w:r>
+    </w:p>
+    <w:p>
+      <w:pPr>
+        <w:keepNext/>
+        <w:spacing w:after="120"/>
+      </w:pPr>
+      <w:r>
+        <w:rPr>
+          <w:b/>
+          <w:bCs/>
+          <w:color w:val="6A6A6A"/>
+          <w:sz w:val="18"/>
+          <w:szCs w:val="18"/>
+        </w:rPr>
+        <w:t xml:space="preserve">Syntax:  </w:t>
+      </w:r>
+      <w:r>
+        <w:rPr>
+          <w:rFonts w:ascii="Consolas" w:cs="Consolas" w:eastAsia="Consolas" w:hAnsi="Consolas"/>
+          <w:color w:val="335577"/>
+          <w:sz w:val="19"/>
+          <w:szCs w:val="19"/>
+        </w:rPr>
+        <w:t xml:space="preserve">INPUT variable
+INPUT "Frage", variable</w:t>
+      </w:r>
+    </w:p>
+    <w:p>
+      <w:pPr>
+        <w:spacing w:after="180" w:line="312" w:lineRule="auto"/>
+      </w:pPr>
+      <w:r>
+        <w:rPr>
+          <w:sz w:val="22"/>
+          <w:szCs w:val="22"/>
+        </w:rPr>
+        <w:t xml:space="preserve">Liest eine Zeile von der Tastatur in die angegebene Variable. Optional stellst du einen Text als Frage voran – dann erscheint dieser vor dem Eingabe-Cursor. Ohne eigenen Text zeigt GameBasic schlicht „? “ an. Die Variable muss vorher mit DIM angelegt sein.</w:t>
+      </w:r>
+    </w:p>
+    <w:p>
+      <w:pPr>
+        <w:keepNext/>
+        <w:spacing w:after="30" w:before="120"/>
+      </w:pPr>
+      <w:r>
+        <w:rPr>
+          <w:b/>
+          <w:bCs/>
+          <w:i/>
+          <w:iCs/>
+          <w:color w:val="6A6A6A"/>
+          <w:sz w:val="18"/>
+          <w:szCs w:val="18"/>
+        </w:rPr>
+        <w:t xml:space="preserve">Beispiel</w:t>
+      </w:r>
+    </w:p>
+    <w:p>
+      <w:pPr>
+        <w:keepLines/>
+        <w:pBdr>
+          <w:left w:val="single" w:color="1B6CA8" w:sz="18" w:space="6"/>
+        </w:pBdr>
+        <w:shd w:fill="F4F4F4" w:val="clear"/>
+        <w:spacing w:after="200" w:before="100" w:line="264" w:lineRule="auto"/>
+        <w:ind w:left="140"/>
+      </w:pPr>
+      <w:r>
+        <w:rPr>
+          <w:rFonts w:ascii="Consolas" w:cs="Consolas" w:eastAsia="Consolas" w:hAnsi="Consolas"/>
+          <w:sz w:val="19"/>
+          <w:szCs w:val="19"/>
+        </w:rPr>
+        <w:t xml:space="preserve">DIM name AS STRING</w:t>
+      </w:r>
+      <w:r>
+        <w:rPr>
+          <w:rFonts w:ascii="Consolas" w:cs="Consolas" w:eastAsia="Consolas" w:hAnsi="Consolas"/>
+          <w:sz w:val="19"/>
+          <w:szCs w:val="19"/>
+        </w:rPr>
+        <w:br/>
+        <w:t xml:space="preserve">INPUT "Wie heißt du? ", name</w:t>
+      </w:r>
+      <w:r>
+        <w:rPr>
+          <w:rFonts w:ascii="Consolas" w:cs="Consolas" w:eastAsia="Consolas" w:hAnsi="Consolas"/>
+          <w:sz w:val="19"/>
+          <w:szCs w:val="19"/>
+        </w:rPr>
+        <w:br/>
+        <w:t xml:space="preserve">PRINT "Hallo, " + name + "!"</w:t>
+      </w:r>
+    </w:p>
+    <w:p>
+      <w:pPr>
+        <w:spacing w:after="180" w:line="312" w:lineRule="auto"/>
+      </w:pPr>
+      <w:r>
+        <w:rPr>
+          <w:sz w:val="22"/>
+          <w:szCs w:val="22"/>
+        </w:rPr>
+        <w:t xml:space="preserve">Weil die Variable den Typ vorgibt, kannst du direkt mit Zahlen weiterrechnen, wenn du eine Zahl-Variable benutzt:</w:t>
+      </w:r>
+    </w:p>
+    <w:p>
+      <w:pPr>
+        <w:keepLines/>
+        <w:pBdr>
+          <w:left w:val="single" w:color="1B6CA8" w:sz="18" w:space="6"/>
+        </w:pBdr>
+        <w:shd w:fill="F4F4F4" w:val="clear"/>
+        <w:spacing w:after="200" w:before="100" w:line="264" w:lineRule="auto"/>
+        <w:ind w:left="140"/>
+      </w:pPr>
+      <w:r>
+        <w:rPr>
+          <w:rFonts w:ascii="Consolas" w:cs="Consolas" w:eastAsia="Consolas" w:hAnsi="Consolas"/>
+          <w:sz w:val="19"/>
+          <w:szCs w:val="19"/>
+        </w:rPr>
+        <w:t xml:space="preserve">DIM alter AS INTEGER</w:t>
+      </w:r>
+      <w:r>
+        <w:rPr>
+          <w:rFonts w:ascii="Consolas" w:cs="Consolas" w:eastAsia="Consolas" w:hAnsi="Consolas"/>
+          <w:sz w:val="19"/>
+          <w:szCs w:val="19"/>
+        </w:rPr>
+        <w:br/>
+        <w:t xml:space="preserve">INPUT "Dein Alter: ", alter</w:t>
+      </w:r>
+      <w:r>
+        <w:rPr>
+          <w:rFonts w:ascii="Consolas" w:cs="Consolas" w:eastAsia="Consolas" w:hAnsi="Consolas"/>
+          <w:sz w:val="19"/>
+          <w:szCs w:val="19"/>
+        </w:rPr>
+        <w:br/>
+        <w:t xml:space="preserve">PRINT "Nächstes Jahr bist du "; alter + 1</w:t>
+      </w:r>
+    </w:p>
+    <w:p>
+      <w:pPr>
+        <w:spacing w:before="60"/>
+      </w:pPr>
+    </w:p>
+    <w:tbl>
+      <w:tblPr>
+        <w:tblW w:type="dxa" w:w="9360"/>
+        <w:tblBorders>
+          <w:top w:val="single" w:color="auto" w:sz="4"/>
+          <w:left w:val="single" w:color="auto" w:sz="4"/>
+          <w:bottom w:val="single" w:color="auto" w:sz="4"/>
+          <w:right w:val="single" w:color="auto" w:sz="4"/>
+          <w:insideH w:val="single" w:color="auto" w:sz="4"/>
+          <w:insideV w:val="single" w:color="auto" w:sz="4"/>
+        </w:tblBorders>
+      </w:tblPr>
+      <w:tblGrid>
+        <w:gridCol w:w="9360"/>
+      </w:tblGrid>
+      <w:tr>
+        <w:trPr>
+          <w:cantSplit/>
+        </w:trPr>
+        <w:tc>
+          <w:tcPr>
+            <w:tcW w:type="dxa" w:w="9360"/>
+            <w:tcBorders>
+              <w:top w:val="single" w:color="E0B96A" w:sz="6"/>
+              <w:left w:val="single" w:color="E0B96A" w:sz="6"/>
+              <w:bottom w:val="single" w:color="E0B96A" w:sz="6"/>
+              <w:right w:val="single" w:color="E0B96A" w:sz="6"/>
+            </w:tcBorders>
+            <w:shd w:fill="FDF3E0" w:val="clear"/>
+            <w:tcMar>
+              <w:top w:type="dxa" w:w="140"/>
+              <w:left w:type="dxa" w:w="180"/>
+              <w:bottom w:type="dxa" w:w="140"/>
+              <w:right w:type="dxa" w:w="180"/>
+            </w:tcMar>
+          </w:tcPr>
+          <w:p>
+            <w:pPr>
+              <w:spacing w:after="40"/>
+            </w:pPr>
+            <w:r>
+              <w:rPr>
+                <w:b/>
+                <w:bCs/>
+                <w:color w:val="9A6A1E"/>
+                <w:sz w:val="22"/>
+                <w:szCs w:val="22"/>
+              </w:rPr>
+              <w:t xml:space="preserve">Merke</w:t>
+            </w:r>
+          </w:p>
+          <w:p>
+            <w:pPr>
+              <w:spacing w:after="0" w:line="312" w:lineRule="auto"/>
+            </w:pPr>
+            <w:r>
+              <w:rPr>
+                <w:sz w:val="22"/>
+                <w:szCs w:val="22"/>
+              </w:rPr>
+              <w:t xml:space="preserve">Tippt der Benutzer bei einer INTEGER- oder FLOAT-Variablen etwas ein, das keine Zahl ist (z. B. „hallo“), meldet GameBasic einen Fehler. Willst du das abfangen, lies stattdessen in eine STRING-Variable ein und wandle den Text behutsam mit TRYVAL um – dort kannst du einen Ersatzwert angeben.</w:t>
+            </w:r>
+          </w:p>
+        </w:tc>
+      </w:tr>
+    </w:tbl>
+    <w:p>
+      <w:pPr>
+        <w:spacing w:after="160"/>
+      </w:pPr>
+    </w:p>
+    <w:p>
+      <w:pPr>
+        <w:spacing w:before="60"/>
+      </w:pPr>
+    </w:p>
+    <w:tbl>
+      <w:tblPr>
+        <w:tblW w:type="dxa" w:w="9360"/>
+        <w:tblBorders>
+          <w:top w:val="single" w:color="auto" w:sz="4"/>
+          <w:left w:val="single" w:color="auto" w:sz="4"/>
+          <w:bottom w:val="single" w:color="auto" w:sz="4"/>
+          <w:right w:val="single" w:color="auto" w:sz="4"/>
+          <w:insideH w:val="single" w:color="auto" w:sz="4"/>
+          <w:insideV w:val="single" w:color="auto" w:sz="4"/>
+        </w:tblBorders>
+      </w:tblPr>
+      <w:tblGrid>
+        <w:gridCol w:w="9360"/>
+      </w:tblGrid>
+      <w:tr>
+        <w:trPr>
+          <w:cantSplit/>
+        </w:trPr>
+        <w:tc>
+          <w:tcPr>
+            <w:tcW w:type="dxa" w:w="9360"/>
+            <w:tcBorders>
+              <w:top w:val="single" w:color="E0B96A" w:sz="6"/>
+              <w:left w:val="single" w:color="E0B96A" w:sz="6"/>
+              <w:bottom w:val="single" w:color="E0B96A" w:sz="6"/>
+              <w:right w:val="single" w:color="E0B96A" w:sz="6"/>
+            </w:tcBorders>
+            <w:shd w:fill="FDF3E0" w:val="clear"/>
+            <w:tcMar>
+              <w:top w:type="dxa" w:w="140"/>
+              <w:left w:type="dxa" w:w="180"/>
+              <w:bottom w:type="dxa" w:w="140"/>
+              <w:right w:type="dxa" w:w="180"/>
+            </w:tcMar>
+          </w:tcPr>
+          <w:p>
+            <w:pPr>
+              <w:spacing w:after="40"/>
+            </w:pPr>
+            <w:r>
+              <w:rPr>
+                <w:b/>
+                <w:bCs/>
+                <w:color w:val="9A6A1E"/>
+                <w:sz w:val="22"/>
+                <w:szCs w:val="22"/>
+              </w:rPr>
+              <w:t xml:space="preserve">Merke</w:t>
+            </w:r>
+          </w:p>
+          <w:p>
+            <w:pPr>
+              <w:spacing w:after="0" w:line="312" w:lineRule="auto"/>
+            </w:pPr>
+            <w:r>
+              <w:rPr>
+                <w:sz w:val="22"/>
+                <w:szCs w:val="22"/>
+              </w:rPr>
+              <w:t xml:space="preserve">INPUT ist für Konsolen-Programme gedacht. In einem Grafik-Spiel mit eigenem Fenster fragst du Eingaben nicht mit INPUT ab, sondern liest Tastatur und Maus pro Bild aus – das lernst du in Teil IV (Kapitel „Eingabe“).</w:t>
+            </w:r>
+          </w:p>
+        </w:tc>
+      </w:tr>
+    </w:tbl>
+    <w:p>
+      <w:pPr>
+        <w:spacing w:after="160"/>
+      </w:pPr>
+    </w:p>
+    <w:p>
+      <w:pPr>
+        <w:pStyle w:val="Heading2"/>
+        <w:keepNext/>
+        <w:keepLines/>
+        <w:spacing w:after="120" w:before="280"/>
+      </w:pPr>
+      <w:r>
+        <w:t xml:space="preserve">f-Strings: Text und Werte verweben</w:t>
+      </w:r>
+    </w:p>
+    <w:p>
+      <w:pPr>
+        <w:spacing w:after="180" w:line="312" w:lineRule="auto"/>
+      </w:pPr>
+      <w:r>
+        <w:rPr>
+          <w:sz w:val="22"/>
+          <w:szCs w:val="22"/>
+        </w:rPr>
+        <w:t xml:space="preserve">Sätze aus Bausteinen mit + zusammenzusetzen funktioniert, wird aber schnell unübersichtlich – überall Anführungszeichen, Pluszeichen und STR$-Umwandlungen. Schöner geht es mit einem f-String: Du schreibst ein kleines f direkt vor das öffnende Anführungszeichen und setzt die Werte in geschweifte Klammern { } mitten in den Text. GameBasic füllt sie beim Ausgeben automatisch ein.</w:t>
+      </w:r>
+    </w:p>
+    <w:p>
+      <w:pPr>
+        <w:keepNext/>
+        <w:keepLines/>
+        <w:pBdr>
+          <w:bottom w:val="single" w:color="DDD0C0" w:sz="4" w:space="2"/>
+        </w:pBdr>
+        <w:spacing w:after="40" w:before="360"/>
+      </w:pPr>
+      <w:r>
+        <w:rPr>
+          <w:rFonts w:ascii="Consolas" w:cs="Consolas" w:eastAsia="Consolas" w:hAnsi="Consolas"/>
+          <w:b/>
+          <w:bCs/>
+          <w:color w:val="9A3412"/>
+          <w:sz w:val="24"/>
+          <w:szCs w:val="24"/>
+        </w:rPr>
+        <w:t xml:space="preserve">f"..."</w:t>
+      </w:r>
+    </w:p>
+    <w:p>
+      <w:pPr>
+        <w:keepNext/>
+        <w:spacing w:after="120"/>
+      </w:pPr>
+      <w:r>
+        <w:rPr>
+          <w:b/>
+          <w:bCs/>
+          <w:color w:val="6A6A6A"/>
+          <w:sz w:val="18"/>
+          <w:szCs w:val="18"/>
+        </w:rPr>
+        <w:t xml:space="preserve">Syntax:  </w:t>
+      </w:r>
+      <w:r>
+        <w:rPr>
+          <w:rFonts w:ascii="Consolas" w:cs="Consolas" w:eastAsia="Consolas" w:hAnsi="Consolas"/>
+          <w:color w:val="335577"/>
+          <w:sz w:val="19"/>
+          <w:szCs w:val="19"/>
+        </w:rPr>
+        <w:t xml:space="preserve">f"text {ausdruck} text ..."</w:t>
+      </w:r>
+    </w:p>
+    <w:p>
+      <w:pPr>
+        <w:spacing w:after="180" w:line="312" w:lineRule="auto"/>
+      </w:pPr>
+      <w:r>
+        <w:rPr>
+          <w:sz w:val="22"/>
+          <w:szCs w:val="22"/>
+        </w:rPr>
+        <w:t xml:space="preserve">Ein String mit Platzhaltern. Was in geschweiften Klammern steht, wird als Ausdruck berechnet und an dieser Stelle eingesetzt. Drin darf alles stehen: Variablen, Rechnungen, sogar Funktionsaufrufe.</w:t>
+      </w:r>
+    </w:p>
+    <w:p>
+      <w:pPr>
+        <w:keepNext/>
+        <w:spacing w:after="30" w:before="120"/>
+      </w:pPr>
+      <w:r>
+        <w:rPr>
+          <w:b/>
+          <w:bCs/>
+          <w:i/>
+          <w:iCs/>
+          <w:color w:val="6A6A6A"/>
+          <w:sz w:val="18"/>
+          <w:szCs w:val="18"/>
+        </w:rPr>
+        <w:t xml:space="preserve">Beispiel</w:t>
+      </w:r>
+    </w:p>
+    <w:p>
+      <w:pPr>
+        <w:keepLines/>
+        <w:pBdr>
+          <w:left w:val="single" w:color="1B6CA8" w:sz="18" w:space="6"/>
+        </w:pBdr>
+        <w:shd w:fill="F4F4F4" w:val="clear"/>
+        <w:spacing w:after="200" w:before="100" w:line="264" w:lineRule="auto"/>
+        <w:ind w:left="140"/>
+      </w:pPr>
+      <w:r>
+        <w:rPr>
+          <w:rFonts w:ascii="Consolas" w:cs="Consolas" w:eastAsia="Consolas" w:hAnsi="Consolas"/>
+          <w:sz w:val="19"/>
+          <w:szCs w:val="19"/>
+        </w:rPr>
+        <w:t xml:space="preserve">DIM name AS STRING</w:t>
+      </w:r>
+      <w:r>
+        <w:rPr>
+          <w:rFonts w:ascii="Consolas" w:cs="Consolas" w:eastAsia="Consolas" w:hAnsi="Consolas"/>
+          <w:sz w:val="19"/>
+          <w:szCs w:val="19"/>
+        </w:rPr>
+        <w:br/>
+        <w:t xml:space="preserve">DIM hp AS INTEGER</w:t>
+      </w:r>
+      <w:r>
+        <w:rPr>
+          <w:rFonts w:ascii="Consolas" w:cs="Consolas" w:eastAsia="Consolas" w:hAnsi="Consolas"/>
+          <w:sz w:val="19"/>
+          <w:szCs w:val="19"/>
+        </w:rPr>
+        <w:br/>
+        <w:t xml:space="preserve">name = "Anna"</w:t>
+      </w:r>
+      <w:r>
+        <w:rPr>
+          <w:rFonts w:ascii="Consolas" w:cs="Consolas" w:eastAsia="Consolas" w:hAnsi="Consolas"/>
+          <w:sz w:val="19"/>
+          <w:szCs w:val="19"/>
+        </w:rPr>
+        <w:br/>
+        <w:t xml:space="preserve">hp = 75</w:t>
+      </w:r>
+      <w:r>
+        <w:rPr>
+          <w:rFonts w:ascii="Consolas" w:cs="Consolas" w:eastAsia="Consolas" w:hAnsi="Consolas"/>
+          <w:sz w:val="19"/>
+          <w:szCs w:val="19"/>
+        </w:rPr>
+        <w:br/>
+        <w:t xml:space="preserve">PRINT f"{name} hat {hp} HP"</w:t>
+      </w:r>
+      <w:r>
+        <w:rPr>
+          <w:rFonts w:ascii="Consolas" w:cs="Consolas" w:eastAsia="Consolas" w:hAnsi="Consolas"/>
+          <w:sz w:val="19"/>
+          <w:szCs w:val="19"/>
+        </w:rPr>
+        <w:br/>
+        <w:t xml:space="preserve">PRINT f"In Summe: {7 + 5}"</w:t>
+      </w:r>
+    </w:p>
+    <w:p>
+      <w:pPr>
+        <w:keepNext/>
+        <w:spacing w:after="30" w:before="120"/>
+      </w:pPr>
+      <w:r>
+        <w:rPr>
+          <w:b/>
+          <w:bCs/>
+          <w:i/>
+          <w:iCs/>
+          <w:color w:val="6A6A6A"/>
+          <w:sz w:val="18"/>
+          <w:szCs w:val="18"/>
+        </w:rPr>
+        <w:t xml:space="preserve">Ausgabe</w:t>
+      </w:r>
+    </w:p>
+    <w:p>
+      <w:pPr>
+        <w:keepLines/>
+        <w:pBdr>
+          <w:left w:val="single" w:color="9AC79A" w:sz="18" w:space="6"/>
+        </w:pBdr>
+        <w:shd w:fill="EAF4EA" w:val="clear"/>
+        <w:spacing w:after="200" w:before="100" w:line="264" w:lineRule="auto"/>
+        <w:ind w:left="140"/>
+      </w:pPr>
+      <w:r>
+        <w:rPr>
+          <w:rFonts w:ascii="Consolas" w:cs="Consolas" w:eastAsia="Consolas" w:hAnsi="Consolas"/>
+          <w:sz w:val="19"/>
+          <w:szCs w:val="19"/>
+        </w:rPr>
+        <w:t xml:space="preserve">Anna hat 75 HP</w:t>
+      </w:r>
+      <w:r>
+        <w:rPr>
+          <w:rFonts w:ascii="Consolas" w:cs="Consolas" w:eastAsia="Consolas" w:hAnsi="Consolas"/>
+          <w:sz w:val="19"/>
+          <w:szCs w:val="19"/>
+        </w:rPr>
+        <w:br/>
+        <w:t xml:space="preserve">In Summe: 12</w:t>
+      </w:r>
+    </w:p>
+    <w:p>
+      <w:pPr>
+        <w:spacing w:after="180" w:line="312" w:lineRule="auto"/>
+      </w:pPr>
+      <w:r>
+        <w:rPr>
+          <w:sz w:val="22"/>
+          <w:szCs w:val="22"/>
+        </w:rPr>
+        <w:t xml:space="preserve">Brauchst du eine echte geschweifte Klammer im Text, schreibst du sie doppelt – {{ und }} werden zu einer einzelnen Klammer und nicht als Platzhalter gedeutet:</w:t>
+      </w:r>
+    </w:p>
+    <w:p>
+      <w:pPr>
+        <w:keepLines/>
+        <w:pBdr>
+          <w:left w:val="single" w:color="1B6CA8" w:sz="18" w:space="6"/>
+        </w:pBdr>
+        <w:shd w:fill="F4F4F4" w:val="clear"/>
+        <w:spacing w:after="200" w:before="100" w:line="264" w:lineRule="auto"/>
+        <w:ind w:left="140"/>
+      </w:pPr>
+      <w:r>
+        <w:rPr>
+          <w:rFonts w:ascii="Consolas" w:cs="Consolas" w:eastAsia="Consolas" w:hAnsi="Consolas"/>
+          <w:sz w:val="19"/>
+          <w:szCs w:val="19"/>
+        </w:rPr>
+        <w:t xml:space="preserve">DIM hp AS INTEGER</w:t>
+      </w:r>
+      <w:r>
+        <w:rPr>
+          <w:rFonts w:ascii="Consolas" w:cs="Consolas" w:eastAsia="Consolas" w:hAnsi="Consolas"/>
+          <w:sz w:val="19"/>
+          <w:szCs w:val="19"/>
+        </w:rPr>
+        <w:br/>
+        <w:t xml:space="preserve">hp = 75</w:t>
+      </w:r>
+      <w:r>
+        <w:rPr>
+          <w:rFonts w:ascii="Consolas" w:cs="Consolas" w:eastAsia="Consolas" w:hAnsi="Consolas"/>
+          <w:sz w:val="19"/>
+          <w:szCs w:val="19"/>
+        </w:rPr>
+        <w:br/>
+        <w:t xml:space="preserve">PRINT f"literal {{Klammern}}, aber {hp}"</w:t>
+      </w:r>
+    </w:p>
+    <w:p>
+      <w:pPr>
+        <w:keepLines/>
+        <w:pBdr>
+          <w:left w:val="single" w:color="9AC79A" w:sz="18" w:space="6"/>
+        </w:pBdr>
+        <w:shd w:fill="EAF4EA" w:val="clear"/>
+        <w:spacing w:after="200" w:before="100" w:line="264" w:lineRule="auto"/>
+        <w:ind w:left="140"/>
+      </w:pPr>
+      <w:r>
+        <w:rPr>
+          <w:rFonts w:ascii="Consolas" w:cs="Consolas" w:eastAsia="Consolas" w:hAnsi="Consolas"/>
+          <w:sz w:val="19"/>
+          <w:szCs w:val="19"/>
+        </w:rPr>
+        <w:t xml:space="preserve">literal {Klammern}, aber 75</w:t>
+      </w:r>
+    </w:p>
+    <w:p>
+      <w:pPr>
+        <w:pStyle w:val="Heading2"/>
+        <w:keepNext/>
+        <w:keepLines/>
+        <w:spacing w:after="120" w:before="280"/>
+      </w:pPr>
+      <w:r>
+        <w:t xml:space="preserve">Zahlen hübsch formatieren</w:t>
+      </w:r>
+    </w:p>
+    <w:p>
+      <w:pPr>
+        <w:spacing w:after="180" w:line="312" w:lineRule="auto"/>
+      </w:pPr>
+      <w:r>
+        <w:rPr>
+          <w:sz w:val="22"/>
+          <w:szCs w:val="22"/>
+        </w:rPr>
+        <w:t xml:space="preserve">Manchmal soll eine Zahl in einer bestimmten Form erscheinen: eine Kommazahl mit genau einer Nachkommastelle, oder eine Punktzahl mit führenden Nullen. Dafür hängst du im Platzhalter einen Doppelpunkt und eine Format-Angabe an – im selben Stil wie das gleich vorgestellte FORMAT$.</w:t>
+      </w:r>
+    </w:p>
+    <w:p>
+      <w:pPr>
+        <w:keepLines/>
+        <w:pBdr>
+          <w:left w:val="single" w:color="1B6CA8" w:sz="18" w:space="6"/>
+        </w:pBdr>
+        <w:shd w:fill="F4F4F4" w:val="clear"/>
+        <w:spacing w:after="200" w:before="100" w:line="264" w:lineRule="auto"/>
+        <w:ind w:left="140"/>
+      </w:pPr>
+      <w:r>
+        <w:rPr>
+          <w:rFonts w:ascii="Consolas" w:cs="Consolas" w:eastAsia="Consolas" w:hAnsi="Consolas"/>
+          <w:sz w:val="19"/>
+          <w:szCs w:val="19"/>
+        </w:rPr>
+        <w:t xml:space="preserve">DIM fps AS FLOAT</w:t>
+      </w:r>
+      <w:r>
+        <w:rPr>
+          <w:rFonts w:ascii="Consolas" w:cs="Consolas" w:eastAsia="Consolas" w:hAnsi="Consolas"/>
+          <w:sz w:val="19"/>
+          <w:szCs w:val="19"/>
+        </w:rPr>
+        <w:br/>
+        <w:t xml:space="preserve">DIM punkte AS INTEGER</w:t>
+      </w:r>
+      <w:r>
+        <w:rPr>
+          <w:rFonts w:ascii="Consolas" w:cs="Consolas" w:eastAsia="Consolas" w:hAnsi="Consolas"/>
+          <w:sz w:val="19"/>
+          <w:szCs w:val="19"/>
+        </w:rPr>
+        <w:br/>
+        <w:t xml:space="preserve">fps = 59.7</w:t>
+      </w:r>
+      <w:r>
+        <w:rPr>
+          <w:rFonts w:ascii="Consolas" w:cs="Consolas" w:eastAsia="Consolas" w:hAnsi="Consolas"/>
+          <w:sz w:val="19"/>
+          <w:szCs w:val="19"/>
+        </w:rPr>
+        <w:br/>
+        <w:t xml:space="preserve">punkte = 75</w:t>
+      </w:r>
+      <w:r>
+        <w:rPr>
+          <w:rFonts w:ascii="Consolas" w:cs="Consolas" w:eastAsia="Consolas" w:hAnsi="Consolas"/>
+          <w:sz w:val="19"/>
+          <w:szCs w:val="19"/>
+        </w:rPr>
+        <w:br/>
+        <w:t xml:space="preserve">PRINT f"FPS {fps:.1f}  Punkte {punkte:05d}"</w:t>
+      </w:r>
+    </w:p>
+    <w:p>
+      <w:pPr>
+        <w:keepLines/>
+        <w:pBdr>
+          <w:left w:val="single" w:color="9AC79A" w:sz="18" w:space="6"/>
+        </w:pBdr>
+        <w:shd w:fill="EAF4EA" w:val="clear"/>
+        <w:spacing w:after="200" w:before="100" w:line="264" w:lineRule="auto"/>
+        <w:ind w:left="140"/>
+      </w:pPr>
+      <w:r>
+        <w:rPr>
+          <w:rFonts w:ascii="Consolas" w:cs="Consolas" w:eastAsia="Consolas" w:hAnsi="Consolas"/>
+          <w:sz w:val="19"/>
+          <w:szCs w:val="19"/>
+        </w:rPr>
+        <w:t xml:space="preserve">FPS 59.7  Punkte 00075</w:t>
+      </w:r>
+    </w:p>
+    <w:p>
+      <w:pPr>
+        <w:spacing w:after="180" w:line="312" w:lineRule="auto"/>
+      </w:pPr>
+      <w:r>
+        <w:rPr>
+          <w:sz w:val="22"/>
+          <w:szCs w:val="22"/>
+        </w:rPr>
+        <w:t xml:space="preserve">Dabei bedeutet .1f „Kommazahl mit einer Nachkommastelle“ und 05d „ganze Zahl, mindestens 5 Stellen, vorn mit Nullen aufgefüllt“. Dieselben Angaben kennt auch der Befehl FORMAT$, falls du außerhalb eines f-Strings formatieren willst:</w:t>
+      </w:r>
+    </w:p>
+    <w:p>
+      <w:pPr>
+        <w:keepNext/>
+        <w:keepLines/>
+        <w:pBdr>
+          <w:bottom w:val="single" w:color="DDD0C0" w:sz="4" w:space="2"/>
+        </w:pBdr>
+        <w:spacing w:after="40" w:before="360"/>
+      </w:pPr>
+      <w:r>
+        <w:rPr>
+          <w:rFonts w:ascii="Consolas" w:cs="Consolas" w:eastAsia="Consolas" w:hAnsi="Consolas"/>
+          <w:b/>
+          <w:bCs/>
+          <w:color w:val="9A3412"/>
+          <w:sz w:val="24"/>
+          <w:szCs w:val="24"/>
+        </w:rPr>
+        <w:t xml:space="preserve">FORMAT$</w:t>
+      </w:r>
+    </w:p>
+    <w:p>
+      <w:pPr>
+        <w:keepNext/>
+        <w:spacing w:after="120"/>
+      </w:pPr>
+      <w:r>
+        <w:rPr>
+          <w:b/>
+          <w:bCs/>
+          <w:color w:val="6A6A6A"/>
+          <w:sz w:val="18"/>
+          <w:szCs w:val="18"/>
+        </w:rPr>
+        <w:t xml:space="preserve">Syntax:  </w:t>
+      </w:r>
+      <w:r>
+        <w:rPr>
+          <w:rFonts w:ascii="Consolas" w:cs="Consolas" w:eastAsia="Consolas" w:hAnsi="Consolas"/>
+          <w:color w:val="335577"/>
+          <w:sz w:val="19"/>
+          <w:szCs w:val="19"/>
+        </w:rPr>
+        <w:t xml:space="preserve">FORMAT$(wert, format$)</w:t>
+      </w:r>
+    </w:p>
+    <w:p>
+      <w:pPr>
+        <w:spacing w:after="180" w:line="312" w:lineRule="auto"/>
+      </w:pPr>
+      <w:r>
+        <w:rPr>
+          <w:sz w:val="22"/>
+          <w:szCs w:val="22"/>
+        </w:rPr>
+        <w:t xml:space="preserve">Formatiert einen Wert nach einer Format-Angabe im C-Stil und liefert einen String zurück. Typische Angaben: "%.2f" (zwei Nachkommastellen), "%05d" (Zahl mit führenden Nullen), "%x" (hexadezimal).</w:t>
+      </w:r>
+    </w:p>
+    <w:p>
+      <w:pPr>
+        <w:keepNext/>
+        <w:spacing w:after="30" w:before="120"/>
+      </w:pPr>
+      <w:r>
+        <w:rPr>
+          <w:b/>
+          <w:bCs/>
+          <w:i/>
+          <w:iCs/>
+          <w:color w:val="6A6A6A"/>
+          <w:sz w:val="18"/>
+          <w:szCs w:val="18"/>
+        </w:rPr>
+        <w:t xml:space="preserve">Beispiel</w:t>
+      </w:r>
+    </w:p>
+    <w:p>
+      <w:pPr>
+        <w:keepLines/>
+        <w:pBdr>
+          <w:left w:val="single" w:color="1B6CA8" w:sz="18" w:space="6"/>
+        </w:pBdr>
+        <w:shd w:fill="F4F4F4" w:val="clear"/>
+        <w:spacing w:after="200" w:before="100" w:line="264" w:lineRule="auto"/>
+        <w:ind w:left="140"/>
+      </w:pPr>
+      <w:r>
+        <w:rPr>
+          <w:rFonts w:ascii="Consolas" w:cs="Consolas" w:eastAsia="Consolas" w:hAnsi="Consolas"/>
+          <w:sz w:val="19"/>
+          <w:szCs w:val="19"/>
+        </w:rPr>
+        <w:t xml:space="preserve">PRINT FORMAT$(3.14159, "%.2f")</w:t>
+      </w:r>
+      <w:r>
+        <w:rPr>
+          <w:rFonts w:ascii="Consolas" w:cs="Consolas" w:eastAsia="Consolas" w:hAnsi="Consolas"/>
+          <w:sz w:val="19"/>
+          <w:szCs w:val="19"/>
+        </w:rPr>
+        <w:br/>
+        <w:t xml:space="preserve">PRINT FORMAT$(42, "%05d")</w:t>
+      </w:r>
+    </w:p>
+    <w:p>
+      <w:pPr>
+        <w:keepNext/>
+        <w:spacing w:after="30" w:before="120"/>
+      </w:pPr>
+      <w:r>
+        <w:rPr>
+          <w:b/>
+          <w:bCs/>
+          <w:i/>
+          <w:iCs/>
+          <w:color w:val="6A6A6A"/>
+          <w:sz w:val="18"/>
+          <w:szCs w:val="18"/>
+        </w:rPr>
+        <w:t xml:space="preserve">Ausgabe</w:t>
+      </w:r>
+    </w:p>
+    <w:p>
+      <w:pPr>
+        <w:keepLines/>
+        <w:pBdr>
+          <w:left w:val="single" w:color="9AC79A" w:sz="18" w:space="6"/>
+        </w:pBdr>
+        <w:shd w:fill="EAF4EA" w:val="clear"/>
+        <w:spacing w:after="200" w:before="100" w:line="264" w:lineRule="auto"/>
+        <w:ind w:left="140"/>
+      </w:pPr>
+      <w:r>
+        <w:rPr>
+          <w:rFonts w:ascii="Consolas" w:cs="Consolas" w:eastAsia="Consolas" w:hAnsi="Consolas"/>
+          <w:sz w:val="19"/>
+          <w:szCs w:val="19"/>
+        </w:rPr>
+        <w:t xml:space="preserve">3.14</w:t>
+      </w:r>
+      <w:r>
+        <w:rPr>
+          <w:rFonts w:ascii="Consolas" w:cs="Consolas" w:eastAsia="Consolas" w:hAnsi="Consolas"/>
+          <w:sz w:val="19"/>
+          <w:szCs w:val="19"/>
+        </w:rPr>
+        <w:br/>
+        <w:t xml:space="preserve">00042</w:t>
+      </w:r>
+    </w:p>
+    <w:p>
+      <w:pPr>
+        <w:spacing w:before="60"/>
+      </w:pPr>
+    </w:p>
+    <w:tbl>
+      <w:tblPr>
+        <w:tblW w:type="dxa" w:w="9360"/>
+        <w:tblBorders>
+          <w:top w:val="single" w:color="auto" w:sz="4"/>
+          <w:left w:val="single" w:color="auto" w:sz="4"/>
+          <w:bottom w:val="single" w:color="auto" w:sz="4"/>
+          <w:right w:val="single" w:color="auto" w:sz="4"/>
+          <w:insideH w:val="single" w:color="auto" w:sz="4"/>
+          <w:insideV w:val="single" w:color="auto" w:sz="4"/>
+        </w:tblBorders>
+      </w:tblPr>
+      <w:tblGrid>
+        <w:gridCol w:w="9360"/>
+      </w:tblGrid>
+      <w:tr>
+        <w:trPr>
+          <w:cantSplit/>
+        </w:trPr>
+        <w:tc>
+          <w:tcPr>
+            <w:tcW w:type="dxa" w:w="9360"/>
+            <w:tcBorders>
+              <w:top w:val="single" w:color="9CC8E6" w:sz="6"/>
+              <w:left w:val="single" w:color="9CC8E6" w:sz="6"/>
+              <w:bottom w:val="single" w:color="9CC8E6" w:sz="6"/>
+              <w:right w:val="single" w:color="9CC8E6" w:sz="6"/>
+            </w:tcBorders>
+            <w:shd w:fill="E7F2FA" w:val="clear"/>
+            <w:tcMar>
+              <w:top w:type="dxa" w:w="140"/>
+              <w:left w:type="dxa" w:w="180"/>
+              <w:bottom w:type="dxa" w:w="140"/>
+              <w:right w:type="dxa" w:w="180"/>
+            </w:tcMar>
+          </w:tcPr>
+          <w:p>
+            <w:pPr>
+              <w:spacing w:after="40"/>
+            </w:pPr>
+            <w:r>
+              <w:rPr>
+                <w:b/>
+                <w:bCs/>
+                <w:color w:val="1B6CA8"/>
+                <w:sz w:val="22"/>
+                <w:szCs w:val="22"/>
+              </w:rPr>
+              <w:t xml:space="preserve">Faustregel</w:t>
+            </w:r>
+          </w:p>
+          <w:p>
+            <w:pPr>
+              <w:spacing w:after="0" w:line="312" w:lineRule="auto"/>
+            </w:pPr>
+            <w:r>
+              <w:rPr>
+                <w:sz w:val="22"/>
+                <w:szCs w:val="22"/>
+              </w:rPr>
+              <w:t xml:space="preserve">Für die meiste Ausgabe sind f-Strings die angenehmste Wahl – sie lesen sich fast wie der fertige Satz. Greife nur dann zu PRINT mit Komma/Semikolon zurück, wenn du das Trennverhalten ganz genau steuern willst.</w:t>
+            </w:r>
+          </w:p>
+        </w:tc>
+      </w:tr>
+    </w:tbl>
+    <w:p>
+      <w:pPr>
+        <w:spacing w:after="160"/>
+      </w:pPr>
     </w:p>
     <w:sectPr>
       <w:footerReference w:type="default" r:id="rId7"/>

</xml_diff>

<commit_message>
docs(buch): Lehrbuch Kap 13 -- Verzweigungen (IF/ELSEIF/ELSE, SELECT CASE, IIF)
IF/THEN/ELSE/ELSEIF (mehrzeilig + einzeilig), SELECT CASE mit Werteliste,
TO-Bereich, IS-Vergleich und WHERE-Guard, sowie IIF als Ausdruck.
Alle Beispiel-Ausgaben gegen gbrt verifiziert.

Co-Authored-By: Claude Opus 4.8 (1M context) <noreply@anthropic.com>
</commit_message>
<xml_diff>
--- a/buch-referenz/buch/GameBasic-Lehrbuch.docx
+++ b/buch-referenz/buch/GameBasic-Lehrbuch.docx
@@ -327,6 +327,33 @@
           <w:szCs w:val="22"/>
         </w:rPr>
         <w:t xml:space="preserve">	20</w:t>
+      </w:r>
+    </w:p>
+    <w:p>
+      <w:pPr>
+        <w:tabs>
+          <w:tab w:val="right" w:pos="9200" w:leader="dot"/>
+        </w:tabs>
+        <w:spacing w:after="20" w:before="0"/>
+        <w:ind w:left="280"/>
+      </w:pPr>
+      <w:r>
+        <w:rPr>
+          <w:b w:val="false"/>
+          <w:bCs w:val="false"/>
+          <w:color w:val="222222"/>
+          <w:sz w:val="22"/>
+          <w:szCs w:val="22"/>
+        </w:rPr>
+        <w:t xml:space="preserve">Verzweigungen</w:t>
+      </w:r>
+      <w:r>
+        <w:rPr>
+          <w:color w:val="555555"/>
+          <w:sz w:val="22"/>
+          <w:szCs w:val="22"/>
+        </w:rPr>
+        <w:t xml:space="preserve">	14</w:t>
       </w:r>
     </w:p>
     <w:p>
@@ -5849,6 +5876,1793 @@
                 <w:szCs w:val="22"/>
               </w:rPr>
               <w:t xml:space="preserve">Für die meiste Ausgabe sind f-Strings die angenehmste Wahl – sie lesen sich fast wie der fertige Satz. Greife nur dann zu PRINT mit Komma/Semikolon zurück, wenn du das Trennverhalten ganz genau steuern willst.</w:t>
+            </w:r>
+          </w:p>
+        </w:tc>
+      </w:tr>
+    </w:tbl>
+    <w:p>
+      <w:pPr>
+        <w:spacing w:after="160"/>
+      </w:pPr>
+    </w:p>
+    <w:p>
+      <w:pPr>
+        <w:pStyle w:val="Heading1"/>
+        <w:keepNext/>
+        <w:keepLines/>
+        <w:pageBreakBefore/>
+        <w:pBdr>
+          <w:bottom w:val="single" w:color="1B6CA8" w:sz="12" w:space="4"/>
+        </w:pBdr>
+        <w:spacing w:after="160" w:before="0"/>
+      </w:pPr>
+      <w:r>
+        <w:t xml:space="preserve">Verzweigungen</w:t>
+      </w:r>
+    </w:p>
+    <w:p>
+      <w:pPr>
+        <w:spacing w:after="180" w:line="312" w:lineRule="auto"/>
+      </w:pPr>
+      <w:r>
+        <w:rPr>
+          <w:sz w:val="22"/>
+          <w:szCs w:val="22"/>
+        </w:rPr>
+        <w:t xml:space="preserve">Bisher liefen unsere Programme stur von oben nach unten – Zeile für Zeile. Spannend wird es, wenn ein Programm Entscheidungen trifft: „Wenn die Lebenspunkte null sind, ist das Spiel vorbei.“ Genau dafür gibt es Verzweigungen. Sie prüfen eine Bedingung und führen je nach Ergebnis unterschiedliche Befehle aus. In diesem Kapitel lernst du IF, SELECT CASE und den kompakten Einzeiler IIF kennen.</w:t>
+      </w:r>
+    </w:p>
+    <w:p>
+      <w:pPr>
+        <w:pStyle w:val="Heading2"/>
+        <w:keepNext/>
+        <w:keepLines/>
+        <w:spacing w:after="120" w:before="280"/>
+      </w:pPr>
+      <w:r>
+        <w:t xml:space="preserve">Die einfachste Entscheidung: IF ... THEN</w:t>
+      </w:r>
+    </w:p>
+    <w:p>
+      <w:pPr>
+        <w:spacing w:after="180" w:line="312" w:lineRule="auto"/>
+      </w:pPr>
+      <w:r>
+        <w:rPr>
+          <w:sz w:val="22"/>
+          <w:szCs w:val="22"/>
+        </w:rPr>
+        <w:t xml:space="preserve">Ein IF prüft eine Bedingung – einen Ausdruck, der TRUE oder FALSE ergibt (du erinnerst dich an die Vergleichs-Operatoren aus dem letzten Kapitel). Ist sie wahr, läuft der Block zwischen THEN und END IF; ist sie falsch, wird er übersprungen.</w:t>
+      </w:r>
+    </w:p>
+    <w:p>
+      <w:pPr>
+        <w:keepNext/>
+        <w:keepLines/>
+        <w:pBdr>
+          <w:bottom w:val="single" w:color="DDD0C0" w:sz="4" w:space="2"/>
+        </w:pBdr>
+        <w:spacing w:after="40" w:before="360"/>
+      </w:pPr>
+      <w:r>
+        <w:rPr>
+          <w:rFonts w:ascii="Consolas" w:cs="Consolas" w:eastAsia="Consolas" w:hAnsi="Consolas"/>
+          <w:b/>
+          <w:bCs/>
+          <w:color w:val="9A3412"/>
+          <w:sz w:val="24"/>
+          <w:szCs w:val="24"/>
+        </w:rPr>
+        <w:t xml:space="preserve">IF ... THEN ... END IF</w:t>
+      </w:r>
+    </w:p>
+    <w:p>
+      <w:pPr>
+        <w:keepNext/>
+        <w:spacing w:after="120"/>
+      </w:pPr>
+      <w:r>
+        <w:rPr>
+          <w:b/>
+          <w:bCs/>
+          <w:color w:val="6A6A6A"/>
+          <w:sz w:val="18"/>
+          <w:szCs w:val="18"/>
+        </w:rPr>
+        <w:t xml:space="preserve">Syntax:  </w:t>
+      </w:r>
+      <w:r>
+        <w:rPr>
+          <w:rFonts w:ascii="Consolas" w:cs="Consolas" w:eastAsia="Consolas" w:hAnsi="Consolas"/>
+          <w:color w:val="335577"/>
+          <w:sz w:val="19"/>
+          <w:szCs w:val="19"/>
+        </w:rPr>
+        <w:t xml:space="preserve">IF bedingung THEN
+    ...
+END IF</w:t>
+      </w:r>
+    </w:p>
+    <w:p>
+      <w:pPr>
+        <w:spacing w:after="180" w:line="312" w:lineRule="auto"/>
+      </w:pPr>
+      <w:r>
+        <w:rPr>
+          <w:sz w:val="22"/>
+          <w:szCs w:val="22"/>
+        </w:rPr>
+        <w:t xml:space="preserve">Führt den eingerückten Block nur aus, wenn die Bedingung wahr ist. Das THEN steht am Ende der IF-Zeile, das END IF schließt den Block ab.</w:t>
+      </w:r>
+    </w:p>
+    <w:p>
+      <w:pPr>
+        <w:keepNext/>
+        <w:spacing w:after="30" w:before="120"/>
+      </w:pPr>
+      <w:r>
+        <w:rPr>
+          <w:b/>
+          <w:bCs/>
+          <w:i/>
+          <w:iCs/>
+          <w:color w:val="6A6A6A"/>
+          <w:sz w:val="18"/>
+          <w:szCs w:val="18"/>
+        </w:rPr>
+        <w:t xml:space="preserve">Beispiel</w:t>
+      </w:r>
+    </w:p>
+    <w:p>
+      <w:pPr>
+        <w:keepLines/>
+        <w:pBdr>
+          <w:left w:val="single" w:color="1B6CA8" w:sz="18" w:space="6"/>
+        </w:pBdr>
+        <w:shd w:fill="F4F4F4" w:val="clear"/>
+        <w:spacing w:after="200" w:before="100" w:line="264" w:lineRule="auto"/>
+        <w:ind w:left="140"/>
+      </w:pPr>
+      <w:r>
+        <w:rPr>
+          <w:rFonts w:ascii="Consolas" w:cs="Consolas" w:eastAsia="Consolas" w:hAnsi="Consolas"/>
+          <w:sz w:val="19"/>
+          <w:szCs w:val="19"/>
+        </w:rPr>
+        <w:t xml:space="preserve">DIM leben AS INTEGER</w:t>
+      </w:r>
+      <w:r>
+        <w:rPr>
+          <w:rFonts w:ascii="Consolas" w:cs="Consolas" w:eastAsia="Consolas" w:hAnsi="Consolas"/>
+          <w:sz w:val="19"/>
+          <w:szCs w:val="19"/>
+        </w:rPr>
+        <w:br/>
+        <w:t xml:space="preserve">leben = 0</w:t>
+      </w:r>
+      <w:r>
+        <w:rPr>
+          <w:rFonts w:ascii="Consolas" w:cs="Consolas" w:eastAsia="Consolas" w:hAnsi="Consolas"/>
+          <w:sz w:val="19"/>
+          <w:szCs w:val="19"/>
+        </w:rPr>
+        <w:br/>
+        <w:t xml:space="preserve">IF leben &lt;= 0 THEN</w:t>
+      </w:r>
+      <w:r>
+        <w:rPr>
+          <w:rFonts w:ascii="Consolas" w:cs="Consolas" w:eastAsia="Consolas" w:hAnsi="Consolas"/>
+          <w:sz w:val="19"/>
+          <w:szCs w:val="19"/>
+        </w:rPr>
+        <w:br/>
+        <w:t xml:space="preserve">    PRINT "Game Over"</w:t>
+      </w:r>
+      <w:r>
+        <w:rPr>
+          <w:rFonts w:ascii="Consolas" w:cs="Consolas" w:eastAsia="Consolas" w:hAnsi="Consolas"/>
+          <w:sz w:val="19"/>
+          <w:szCs w:val="19"/>
+        </w:rPr>
+        <w:br/>
+        <w:t xml:space="preserve">END IF</w:t>
+      </w:r>
+    </w:p>
+    <w:p>
+      <w:pPr>
+        <w:keepNext/>
+        <w:spacing w:after="30" w:before="120"/>
+      </w:pPr>
+      <w:r>
+        <w:rPr>
+          <w:b/>
+          <w:bCs/>
+          <w:i/>
+          <w:iCs/>
+          <w:color w:val="6A6A6A"/>
+          <w:sz w:val="18"/>
+          <w:szCs w:val="18"/>
+        </w:rPr>
+        <w:t xml:space="preserve">Ausgabe</w:t>
+      </w:r>
+    </w:p>
+    <w:p>
+      <w:pPr>
+        <w:keepLines/>
+        <w:pBdr>
+          <w:left w:val="single" w:color="9AC79A" w:sz="18" w:space="6"/>
+        </w:pBdr>
+        <w:shd w:fill="EAF4EA" w:val="clear"/>
+        <w:spacing w:after="200" w:before="100" w:line="264" w:lineRule="auto"/>
+        <w:ind w:left="140"/>
+      </w:pPr>
+      <w:r>
+        <w:rPr>
+          <w:rFonts w:ascii="Consolas" w:cs="Consolas" w:eastAsia="Consolas" w:hAnsi="Consolas"/>
+          <w:sz w:val="19"/>
+          <w:szCs w:val="19"/>
+        </w:rPr>
+        <w:t xml:space="preserve">Game Over</w:t>
+      </w:r>
+    </w:p>
+    <w:p>
+      <w:pPr>
+        <w:pStyle w:val="Heading2"/>
+        <w:keepNext/>
+        <w:keepLines/>
+        <w:spacing w:after="120" w:before="280"/>
+      </w:pPr>
+      <w:r>
+        <w:t xml:space="preserve">Eine Alternative: ELSE</w:t>
+      </w:r>
+    </w:p>
+    <w:p>
+      <w:pPr>
+        <w:spacing w:after="180" w:line="312" w:lineRule="auto"/>
+      </w:pPr>
+      <w:r>
+        <w:rPr>
+          <w:sz w:val="22"/>
+          <w:szCs w:val="22"/>
+        </w:rPr>
+        <w:t xml:space="preserve">Oft willst du das eine ODER das andere tun. Mit ELSE gibst du einen zweiten Block an, der genau dann läuft, wenn die Bedingung falsch ist:</w:t>
+      </w:r>
+    </w:p>
+    <w:p>
+      <w:pPr>
+        <w:keepLines/>
+        <w:pBdr>
+          <w:left w:val="single" w:color="1B6CA8" w:sz="18" w:space="6"/>
+        </w:pBdr>
+        <w:shd w:fill="F4F4F4" w:val="clear"/>
+        <w:spacing w:after="200" w:before="100" w:line="264" w:lineRule="auto"/>
+        <w:ind w:left="140"/>
+      </w:pPr>
+      <w:r>
+        <w:rPr>
+          <w:rFonts w:ascii="Consolas" w:cs="Consolas" w:eastAsia="Consolas" w:hAnsi="Consolas"/>
+          <w:sz w:val="19"/>
+          <w:szCs w:val="19"/>
+        </w:rPr>
+        <w:t xml:space="preserve">DIM alter AS INTEGER</w:t>
+      </w:r>
+      <w:r>
+        <w:rPr>
+          <w:rFonts w:ascii="Consolas" w:cs="Consolas" w:eastAsia="Consolas" w:hAnsi="Consolas"/>
+          <w:sz w:val="19"/>
+          <w:szCs w:val="19"/>
+        </w:rPr>
+        <w:br/>
+        <w:t xml:space="preserve">alter = 16</w:t>
+      </w:r>
+      <w:r>
+        <w:rPr>
+          <w:rFonts w:ascii="Consolas" w:cs="Consolas" w:eastAsia="Consolas" w:hAnsi="Consolas"/>
+          <w:sz w:val="19"/>
+          <w:szCs w:val="19"/>
+        </w:rPr>
+        <w:br/>
+        <w:t xml:space="preserve">IF alter &gt;= 18 THEN</w:t>
+      </w:r>
+      <w:r>
+        <w:rPr>
+          <w:rFonts w:ascii="Consolas" w:cs="Consolas" w:eastAsia="Consolas" w:hAnsi="Consolas"/>
+          <w:sz w:val="19"/>
+          <w:szCs w:val="19"/>
+        </w:rPr>
+        <w:br/>
+        <w:t xml:space="preserve">    PRINT "volljährig"</w:t>
+      </w:r>
+      <w:r>
+        <w:rPr>
+          <w:rFonts w:ascii="Consolas" w:cs="Consolas" w:eastAsia="Consolas" w:hAnsi="Consolas"/>
+          <w:sz w:val="19"/>
+          <w:szCs w:val="19"/>
+        </w:rPr>
+        <w:br/>
+        <w:t xml:space="preserve">ELSE</w:t>
+      </w:r>
+      <w:r>
+        <w:rPr>
+          <w:rFonts w:ascii="Consolas" w:cs="Consolas" w:eastAsia="Consolas" w:hAnsi="Consolas"/>
+          <w:sz w:val="19"/>
+          <w:szCs w:val="19"/>
+        </w:rPr>
+        <w:br/>
+        <w:t xml:space="preserve">    PRINT "noch minderjährig"</w:t>
+      </w:r>
+      <w:r>
+        <w:rPr>
+          <w:rFonts w:ascii="Consolas" w:cs="Consolas" w:eastAsia="Consolas" w:hAnsi="Consolas"/>
+          <w:sz w:val="19"/>
+          <w:szCs w:val="19"/>
+        </w:rPr>
+        <w:br/>
+        <w:t xml:space="preserve">END IF</w:t>
+      </w:r>
+    </w:p>
+    <w:p>
+      <w:pPr>
+        <w:keepLines/>
+        <w:pBdr>
+          <w:left w:val="single" w:color="9AC79A" w:sz="18" w:space="6"/>
+        </w:pBdr>
+        <w:shd w:fill="EAF4EA" w:val="clear"/>
+        <w:spacing w:after="200" w:before="100" w:line="264" w:lineRule="auto"/>
+        <w:ind w:left="140"/>
+      </w:pPr>
+      <w:r>
+        <w:rPr>
+          <w:rFonts w:ascii="Consolas" w:cs="Consolas" w:eastAsia="Consolas" w:hAnsi="Consolas"/>
+          <w:sz w:val="19"/>
+          <w:szCs w:val="19"/>
+        </w:rPr>
+        <w:t xml:space="preserve">noch minderjährig</w:t>
+      </w:r>
+    </w:p>
+    <w:p>
+      <w:pPr>
+        <w:pStyle w:val="Heading2"/>
+        <w:keepNext/>
+        <w:keepLines/>
+        <w:spacing w:after="120" w:before="280"/>
+      </w:pPr>
+      <w:r>
+        <w:t xml:space="preserve">Mehrere Fälle: ELSEIF</w:t>
+      </w:r>
+    </w:p>
+    <w:p>
+      <w:pPr>
+        <w:spacing w:after="180" w:line="312" w:lineRule="auto"/>
+      </w:pPr>
+      <w:r>
+        <w:rPr>
+          <w:sz w:val="22"/>
+          <w:szCs w:val="22"/>
+        </w:rPr>
+        <w:t xml:space="preserve">Manchmal gibt es nicht nur zwei Möglichkeiten, sondern eine ganze Treppe von Fällen. Mit ELSEIF hängst du weitere Bedingungen an. GameBasic prüft sie von oben nach unten und nimmt den ersten Block, dessen Bedingung zutrifft – die übrigen werden übersprungen. Ein abschließendes ELSE fängt alles ab, was bis dahin nicht gepasst hat.</w:t>
+      </w:r>
+    </w:p>
+    <w:p>
+      <w:pPr>
+        <w:keepNext/>
+        <w:keepLines/>
+        <w:pBdr>
+          <w:bottom w:val="single" w:color="DDD0C0" w:sz="4" w:space="2"/>
+        </w:pBdr>
+        <w:spacing w:after="40" w:before="360"/>
+      </w:pPr>
+      <w:r>
+        <w:rPr>
+          <w:rFonts w:ascii="Consolas" w:cs="Consolas" w:eastAsia="Consolas" w:hAnsi="Consolas"/>
+          <w:b/>
+          <w:bCs/>
+          <w:color w:val="9A3412"/>
+          <w:sz w:val="24"/>
+          <w:szCs w:val="24"/>
+        </w:rPr>
+        <w:t xml:space="preserve">IF / ELSEIF / ELSE</w:t>
+      </w:r>
+    </w:p>
+    <w:p>
+      <w:pPr>
+        <w:keepNext/>
+        <w:spacing w:after="120"/>
+      </w:pPr>
+      <w:r>
+        <w:rPr>
+          <w:b/>
+          <w:bCs/>
+          <w:color w:val="6A6A6A"/>
+          <w:sz w:val="18"/>
+          <w:szCs w:val="18"/>
+        </w:rPr>
+        <w:t xml:space="preserve">Syntax:  </w:t>
+      </w:r>
+      <w:r>
+        <w:rPr>
+          <w:rFonts w:ascii="Consolas" w:cs="Consolas" w:eastAsia="Consolas" w:hAnsi="Consolas"/>
+          <w:color w:val="335577"/>
+          <w:sz w:val="19"/>
+          <w:szCs w:val="19"/>
+        </w:rPr>
+        <w:t xml:space="preserve">IF a THEN ... ELSEIF b THEN ... ELSE ... END IF</w:t>
+      </w:r>
+    </w:p>
+    <w:p>
+      <w:pPr>
+        <w:spacing w:after="180" w:line="312" w:lineRule="auto"/>
+      </w:pPr>
+      <w:r>
+        <w:rPr>
+          <w:sz w:val="22"/>
+          <w:szCs w:val="22"/>
+        </w:rPr>
+        <w:t xml:space="preserve">Eine Kette von Bedingungen. Der erste passende Zweig gewinnt; ELSE ist der Auffang-Zweig für alle übrigen Fälle. (ELIF ist eine erlaubte Kurzschreibweise für ELSEIF.)</w:t>
+      </w:r>
+    </w:p>
+    <w:p>
+      <w:pPr>
+        <w:keepNext/>
+        <w:spacing w:after="30" w:before="120"/>
+      </w:pPr>
+      <w:r>
+        <w:rPr>
+          <w:b/>
+          <w:bCs/>
+          <w:i/>
+          <w:iCs/>
+          <w:color w:val="6A6A6A"/>
+          <w:sz w:val="18"/>
+          <w:szCs w:val="18"/>
+        </w:rPr>
+        <w:t xml:space="preserve">Beispiel</w:t>
+      </w:r>
+    </w:p>
+    <w:p>
+      <w:pPr>
+        <w:keepLines/>
+        <w:pBdr>
+          <w:left w:val="single" w:color="1B6CA8" w:sz="18" w:space="6"/>
+        </w:pBdr>
+        <w:shd w:fill="F4F4F4" w:val="clear"/>
+        <w:spacing w:after="200" w:before="100" w:line="264" w:lineRule="auto"/>
+        <w:ind w:left="140"/>
+      </w:pPr>
+      <w:r>
+        <w:rPr>
+          <w:rFonts w:ascii="Consolas" w:cs="Consolas" w:eastAsia="Consolas" w:hAnsi="Consolas"/>
+          <w:sz w:val="19"/>
+          <w:szCs w:val="19"/>
+        </w:rPr>
+        <w:t xml:space="preserve">DIM punkte AS INTEGER</w:t>
+      </w:r>
+      <w:r>
+        <w:rPr>
+          <w:rFonts w:ascii="Consolas" w:cs="Consolas" w:eastAsia="Consolas" w:hAnsi="Consolas"/>
+          <w:sz w:val="19"/>
+          <w:szCs w:val="19"/>
+        </w:rPr>
+        <w:br/>
+        <w:t xml:space="preserve">punkte = 75</w:t>
+      </w:r>
+      <w:r>
+        <w:rPr>
+          <w:rFonts w:ascii="Consolas" w:cs="Consolas" w:eastAsia="Consolas" w:hAnsi="Consolas"/>
+          <w:sz w:val="19"/>
+          <w:szCs w:val="19"/>
+        </w:rPr>
+        <w:br/>
+        <w:t xml:space="preserve">IF punkte &gt;= 90 THEN</w:t>
+      </w:r>
+      <w:r>
+        <w:rPr>
+          <w:rFonts w:ascii="Consolas" w:cs="Consolas" w:eastAsia="Consolas" w:hAnsi="Consolas"/>
+          <w:sz w:val="19"/>
+          <w:szCs w:val="19"/>
+        </w:rPr>
+        <w:br/>
+        <w:t xml:space="preserve">    PRINT "Note 1"</w:t>
+      </w:r>
+      <w:r>
+        <w:rPr>
+          <w:rFonts w:ascii="Consolas" w:cs="Consolas" w:eastAsia="Consolas" w:hAnsi="Consolas"/>
+          <w:sz w:val="19"/>
+          <w:szCs w:val="19"/>
+        </w:rPr>
+        <w:br/>
+        <w:t xml:space="preserve">ELSEIF punkte &gt;= 75 THEN</w:t>
+      </w:r>
+      <w:r>
+        <w:rPr>
+          <w:rFonts w:ascii="Consolas" w:cs="Consolas" w:eastAsia="Consolas" w:hAnsi="Consolas"/>
+          <w:sz w:val="19"/>
+          <w:szCs w:val="19"/>
+        </w:rPr>
+        <w:br/>
+        <w:t xml:space="preserve">    PRINT "Note 2"</w:t>
+      </w:r>
+      <w:r>
+        <w:rPr>
+          <w:rFonts w:ascii="Consolas" w:cs="Consolas" w:eastAsia="Consolas" w:hAnsi="Consolas"/>
+          <w:sz w:val="19"/>
+          <w:szCs w:val="19"/>
+        </w:rPr>
+        <w:br/>
+        <w:t xml:space="preserve">ELSEIF punkte &gt;= 50 THEN</w:t>
+      </w:r>
+      <w:r>
+        <w:rPr>
+          <w:rFonts w:ascii="Consolas" w:cs="Consolas" w:eastAsia="Consolas" w:hAnsi="Consolas"/>
+          <w:sz w:val="19"/>
+          <w:szCs w:val="19"/>
+        </w:rPr>
+        <w:br/>
+        <w:t xml:space="preserve">    PRINT "Note 3"</w:t>
+      </w:r>
+      <w:r>
+        <w:rPr>
+          <w:rFonts w:ascii="Consolas" w:cs="Consolas" w:eastAsia="Consolas" w:hAnsi="Consolas"/>
+          <w:sz w:val="19"/>
+          <w:szCs w:val="19"/>
+        </w:rPr>
+        <w:br/>
+        <w:t xml:space="preserve">ELSE</w:t>
+      </w:r>
+      <w:r>
+        <w:rPr>
+          <w:rFonts w:ascii="Consolas" w:cs="Consolas" w:eastAsia="Consolas" w:hAnsi="Consolas"/>
+          <w:sz w:val="19"/>
+          <w:szCs w:val="19"/>
+        </w:rPr>
+        <w:br/>
+        <w:t xml:space="preserve">    PRINT "durchgefallen"</w:t>
+      </w:r>
+      <w:r>
+        <w:rPr>
+          <w:rFonts w:ascii="Consolas" w:cs="Consolas" w:eastAsia="Consolas" w:hAnsi="Consolas"/>
+          <w:sz w:val="19"/>
+          <w:szCs w:val="19"/>
+        </w:rPr>
+        <w:br/>
+        <w:t xml:space="preserve">END IF</w:t>
+      </w:r>
+    </w:p>
+    <w:p>
+      <w:pPr>
+        <w:keepNext/>
+        <w:spacing w:after="30" w:before="120"/>
+      </w:pPr>
+      <w:r>
+        <w:rPr>
+          <w:b/>
+          <w:bCs/>
+          <w:i/>
+          <w:iCs/>
+          <w:color w:val="6A6A6A"/>
+          <w:sz w:val="18"/>
+          <w:szCs w:val="18"/>
+        </w:rPr>
+        <w:t xml:space="preserve">Ausgabe</w:t>
+      </w:r>
+    </w:p>
+    <w:p>
+      <w:pPr>
+        <w:keepLines/>
+        <w:pBdr>
+          <w:left w:val="single" w:color="9AC79A" w:sz="18" w:space="6"/>
+        </w:pBdr>
+        <w:shd w:fill="EAF4EA" w:val="clear"/>
+        <w:spacing w:after="200" w:before="100" w:line="264" w:lineRule="auto"/>
+        <w:ind w:left="140"/>
+      </w:pPr>
+      <w:r>
+        <w:rPr>
+          <w:rFonts w:ascii="Consolas" w:cs="Consolas" w:eastAsia="Consolas" w:hAnsi="Consolas"/>
+          <w:sz w:val="19"/>
+          <w:szCs w:val="19"/>
+        </w:rPr>
+        <w:t xml:space="preserve">Note 2</w:t>
+      </w:r>
+    </w:p>
+    <w:p>
+      <w:pPr>
+        <w:spacing w:before="60"/>
+      </w:pPr>
+    </w:p>
+    <w:tbl>
+      <w:tblPr>
+        <w:tblW w:type="dxa" w:w="9360"/>
+        <w:tblBorders>
+          <w:top w:val="single" w:color="auto" w:sz="4"/>
+          <w:left w:val="single" w:color="auto" w:sz="4"/>
+          <w:bottom w:val="single" w:color="auto" w:sz="4"/>
+          <w:right w:val="single" w:color="auto" w:sz="4"/>
+          <w:insideH w:val="single" w:color="auto" w:sz="4"/>
+          <w:insideV w:val="single" w:color="auto" w:sz="4"/>
+        </w:tblBorders>
+      </w:tblPr>
+      <w:tblGrid>
+        <w:gridCol w:w="9360"/>
+      </w:tblGrid>
+      <w:tr>
+        <w:trPr>
+          <w:cantSplit/>
+        </w:trPr>
+        <w:tc>
+          <w:tcPr>
+            <w:tcW w:type="dxa" w:w="9360"/>
+            <w:tcBorders>
+              <w:top w:val="single" w:color="E0B96A" w:sz="6"/>
+              <w:left w:val="single" w:color="E0B96A" w:sz="6"/>
+              <w:bottom w:val="single" w:color="E0B96A" w:sz="6"/>
+              <w:right w:val="single" w:color="E0B96A" w:sz="6"/>
+            </w:tcBorders>
+            <w:shd w:fill="FDF3E0" w:val="clear"/>
+            <w:tcMar>
+              <w:top w:type="dxa" w:w="140"/>
+              <w:left w:type="dxa" w:w="180"/>
+              <w:bottom w:type="dxa" w:w="140"/>
+              <w:right w:type="dxa" w:w="180"/>
+            </w:tcMar>
+          </w:tcPr>
+          <w:p>
+            <w:pPr>
+              <w:spacing w:after="40"/>
+            </w:pPr>
+            <w:r>
+              <w:rPr>
+                <w:b/>
+                <w:bCs/>
+                <w:color w:val="9A6A1E"/>
+                <w:sz w:val="22"/>
+                <w:szCs w:val="22"/>
+              </w:rPr>
+              <w:t xml:space="preserve">Merke</w:t>
+            </w:r>
+          </w:p>
+          <w:p>
+            <w:pPr>
+              <w:spacing w:after="0" w:line="312" w:lineRule="auto"/>
+            </w:pPr>
+            <w:r>
+              <w:rPr>
+                <w:sz w:val="22"/>
+                <w:szCs w:val="22"/>
+              </w:rPr>
+              <w:t xml:space="preserve">Die Reihenfolge zählt! Hier passt sowohl „&gt;= 75“ als auch „&gt;= 50“ – aber weil 75 zuerst geprüft wird, gewinnt „Note 2“. Ordne deine Bedingungen also vom Speziellsten zum Allgemeinsten.</w:t>
+            </w:r>
+          </w:p>
+        </w:tc>
+      </w:tr>
+    </w:tbl>
+    <w:p>
+      <w:pPr>
+        <w:spacing w:after="160"/>
+      </w:pPr>
+    </w:p>
+    <w:p>
+      <w:pPr>
+        <w:pStyle w:val="Heading2"/>
+        <w:keepNext/>
+        <w:keepLines/>
+        <w:spacing w:after="120" w:before="280"/>
+      </w:pPr>
+      <w:r>
+        <w:t xml:space="preserve">Alles in einer Zeile</w:t>
+      </w:r>
+    </w:p>
+    <w:p>
+      <w:pPr>
+        <w:spacing w:after="180" w:line="312" w:lineRule="auto"/>
+      </w:pPr>
+      <w:r>
+        <w:rPr>
+          <w:sz w:val="22"/>
+          <w:szCs w:val="22"/>
+        </w:rPr>
+        <w:t xml:space="preserve">Geht es nur um einen einzigen Befehl, darfst du IF auch komplett in eine Zeile schreiben – ohne END IF. Das hält kurze Prüfungen knapp und lesbar:</w:t>
+      </w:r>
+    </w:p>
+    <w:p>
+      <w:pPr>
+        <w:keepLines/>
+        <w:pBdr>
+          <w:left w:val="single" w:color="1B6CA8" w:sz="18" w:space="6"/>
+        </w:pBdr>
+        <w:shd w:fill="F4F4F4" w:val="clear"/>
+        <w:spacing w:after="200" w:before="100" w:line="264" w:lineRule="auto"/>
+        <w:ind w:left="140"/>
+      </w:pPr>
+      <w:r>
+        <w:rPr>
+          <w:rFonts w:ascii="Consolas" w:cs="Consolas" w:eastAsia="Consolas" w:hAnsi="Consolas"/>
+          <w:sz w:val="19"/>
+          <w:szCs w:val="19"/>
+        </w:rPr>
+        <w:t xml:space="preserve">DIM leben AS INTEGER</w:t>
+      </w:r>
+      <w:r>
+        <w:rPr>
+          <w:rFonts w:ascii="Consolas" w:cs="Consolas" w:eastAsia="Consolas" w:hAnsi="Consolas"/>
+          <w:sz w:val="19"/>
+          <w:szCs w:val="19"/>
+        </w:rPr>
+        <w:br/>
+        <w:t xml:space="preserve">leben = 0</w:t>
+      </w:r>
+      <w:r>
+        <w:rPr>
+          <w:rFonts w:ascii="Consolas" w:cs="Consolas" w:eastAsia="Consolas" w:hAnsi="Consolas"/>
+          <w:sz w:val="19"/>
+          <w:szCs w:val="19"/>
+        </w:rPr>
+        <w:br/>
+        <w:t xml:space="preserve">IF leben &lt;= 0 THEN PRINT "Game Over"</w:t>
+      </w:r>
+    </w:p>
+    <w:p>
+      <w:pPr>
+        <w:keepLines/>
+        <w:pBdr>
+          <w:left w:val="single" w:color="9AC79A" w:sz="18" w:space="6"/>
+        </w:pBdr>
+        <w:shd w:fill="EAF4EA" w:val="clear"/>
+        <w:spacing w:after="200" w:before="100" w:line="264" w:lineRule="auto"/>
+        <w:ind w:left="140"/>
+      </w:pPr>
+      <w:r>
+        <w:rPr>
+          <w:rFonts w:ascii="Consolas" w:cs="Consolas" w:eastAsia="Consolas" w:hAnsi="Consolas"/>
+          <w:sz w:val="19"/>
+          <w:szCs w:val="19"/>
+        </w:rPr>
+        <w:t xml:space="preserve">Game Over</w:t>
+      </w:r>
+    </w:p>
+    <w:p>
+      <w:pPr>
+        <w:spacing w:before="60"/>
+      </w:pPr>
+    </w:p>
+    <w:tbl>
+      <w:tblPr>
+        <w:tblW w:type="dxa" w:w="9360"/>
+        <w:tblBorders>
+          <w:top w:val="single" w:color="auto" w:sz="4"/>
+          <w:left w:val="single" w:color="auto" w:sz="4"/>
+          <w:bottom w:val="single" w:color="auto" w:sz="4"/>
+          <w:right w:val="single" w:color="auto" w:sz="4"/>
+          <w:insideH w:val="single" w:color="auto" w:sz="4"/>
+          <w:insideV w:val="single" w:color="auto" w:sz="4"/>
+        </w:tblBorders>
+      </w:tblPr>
+      <w:tblGrid>
+        <w:gridCol w:w="9360"/>
+      </w:tblGrid>
+      <w:tr>
+        <w:trPr>
+          <w:cantSplit/>
+        </w:trPr>
+        <w:tc>
+          <w:tcPr>
+            <w:tcW w:type="dxa" w:w="9360"/>
+            <w:tcBorders>
+              <w:top w:val="single" w:color="E0A0A0" w:sz="6"/>
+              <w:left w:val="single" w:color="E0A0A0" w:sz="6"/>
+              <w:bottom w:val="single" w:color="E0A0A0" w:sz="6"/>
+              <w:right w:val="single" w:color="E0A0A0" w:sz="6"/>
+            </w:tcBorders>
+            <w:shd w:fill="FBEAEA" w:val="clear"/>
+            <w:tcMar>
+              <w:top w:type="dxa" w:w="140"/>
+              <w:left w:type="dxa" w:w="180"/>
+              <w:bottom w:type="dxa" w:w="140"/>
+              <w:right w:type="dxa" w:w="180"/>
+            </w:tcMar>
+          </w:tcPr>
+          <w:p>
+            <w:pPr>
+              <w:spacing w:after="40"/>
+            </w:pPr>
+            <w:r>
+              <w:rPr>
+                <w:b/>
+                <w:bCs/>
+                <w:color w:val="B23030"/>
+                <w:sz w:val="22"/>
+                <w:szCs w:val="22"/>
+              </w:rPr>
+              <w:t xml:space="preserve">Achtung</w:t>
+            </w:r>
+          </w:p>
+          <w:p>
+            <w:pPr>
+              <w:spacing w:after="0" w:line="312" w:lineRule="auto"/>
+            </w:pPr>
+            <w:r>
+              <w:rPr>
+                <w:sz w:val="22"/>
+                <w:szCs w:val="22"/>
+              </w:rPr>
+              <w:t xml:space="preserve">Beim einzeiligen IF folgt direkt nach THEN der auszuführende Befehl – und es gibt KEIN END IF. Sobald du mehrere Zeilen oder einen ELSE-Zweig brauchst, nimm die ausführliche Form mit END IF.</w:t>
+            </w:r>
+          </w:p>
+        </w:tc>
+      </w:tr>
+    </w:tbl>
+    <w:p>
+      <w:pPr>
+        <w:spacing w:after="160"/>
+      </w:pPr>
+    </w:p>
+    <w:p>
+      <w:pPr>
+        <w:pStyle w:val="Heading2"/>
+        <w:keepNext/>
+        <w:keepLines/>
+        <w:spacing w:after="120" w:before="280"/>
+      </w:pPr>
+      <w:r>
+        <w:t xml:space="preserve">Viele Fälle übersichtlich: SELECT CASE</w:t>
+      </w:r>
+    </w:p>
+    <w:p>
+      <w:pPr>
+        <w:spacing w:after="180" w:line="312" w:lineRule="auto"/>
+      </w:pPr>
+      <w:r>
+        <w:rPr>
+          <w:sz w:val="22"/>
+          <w:szCs w:val="22"/>
+        </w:rPr>
+        <w:t xml:space="preserve">Wenn du ein und denselben Wert gegen viele Möglichkeiten prüfst, wird eine lange IF-ELSEIF-Treppe schnell unübersichtlich. SELECT CASE ist dafür gemacht: Du nennst den zu prüfenden Wert einmal, und listest darunter die Fälle auf. Der erste passende CASE gewinnt; CASE ELSE fängt den Rest.</w:t>
+      </w:r>
+    </w:p>
+    <w:p>
+      <w:pPr>
+        <w:keepNext/>
+        <w:keepLines/>
+        <w:pBdr>
+          <w:bottom w:val="single" w:color="DDD0C0" w:sz="4" w:space="2"/>
+        </w:pBdr>
+        <w:spacing w:after="40" w:before="360"/>
+      </w:pPr>
+      <w:r>
+        <w:rPr>
+          <w:rFonts w:ascii="Consolas" w:cs="Consolas" w:eastAsia="Consolas" w:hAnsi="Consolas"/>
+          <w:b/>
+          <w:bCs/>
+          <w:color w:val="9A3412"/>
+          <w:sz w:val="24"/>
+          <w:szCs w:val="24"/>
+        </w:rPr>
+        <w:t xml:space="preserve">SELECT CASE</w:t>
+      </w:r>
+    </w:p>
+    <w:p>
+      <w:pPr>
+        <w:keepNext/>
+        <w:spacing w:after="120"/>
+      </w:pPr>
+      <w:r>
+        <w:rPr>
+          <w:b/>
+          <w:bCs/>
+          <w:color w:val="6A6A6A"/>
+          <w:sz w:val="18"/>
+          <w:szCs w:val="18"/>
+        </w:rPr>
+        <w:t xml:space="preserve">Syntax:  </w:t>
+      </w:r>
+      <w:r>
+        <w:rPr>
+          <w:rFonts w:ascii="Consolas" w:cs="Consolas" w:eastAsia="Consolas" w:hAnsi="Consolas"/>
+          <w:color w:val="335577"/>
+          <w:sz w:val="19"/>
+          <w:szCs w:val="19"/>
+        </w:rPr>
+        <w:t xml:space="preserve">SELECT CASE wert
+    CASE muster
+        ...
+    CASE ELSE
+        ...
+END SELECT</w:t>
+      </w:r>
+    </w:p>
+    <w:p>
+      <w:pPr>
+        <w:spacing w:after="180" w:line="312" w:lineRule="auto"/>
+      </w:pPr>
+      <w:r>
+        <w:rPr>
+          <w:sz w:val="22"/>
+          <w:szCs w:val="22"/>
+        </w:rPr>
+        <w:t xml:space="preserve">Wertet den Ausdruck einmal aus und vergleicht ihn der Reihe nach mit den CASE-Mustern. Ein CASE kann ein einzelner Wert, eine kommagetrennte Liste oder ein Bereich sein.</w:t>
+      </w:r>
+    </w:p>
+    <w:p>
+      <w:pPr>
+        <w:keepNext/>
+        <w:spacing w:after="30" w:before="120"/>
+      </w:pPr>
+      <w:r>
+        <w:rPr>
+          <w:b/>
+          <w:bCs/>
+          <w:i/>
+          <w:iCs/>
+          <w:color w:val="6A6A6A"/>
+          <w:sz w:val="18"/>
+          <w:szCs w:val="18"/>
+        </w:rPr>
+        <w:t xml:space="preserve">Beispiel</w:t>
+      </w:r>
+    </w:p>
+    <w:p>
+      <w:pPr>
+        <w:keepLines/>
+        <w:pBdr>
+          <w:left w:val="single" w:color="1B6CA8" w:sz="18" w:space="6"/>
+        </w:pBdr>
+        <w:shd w:fill="F4F4F4" w:val="clear"/>
+        <w:spacing w:after="200" w:before="100" w:line="264" w:lineRule="auto"/>
+        <w:ind w:left="140"/>
+      </w:pPr>
+      <w:r>
+        <w:rPr>
+          <w:rFonts w:ascii="Consolas" w:cs="Consolas" w:eastAsia="Consolas" w:hAnsi="Consolas"/>
+          <w:sz w:val="19"/>
+          <w:szCs w:val="19"/>
+        </w:rPr>
+        <w:t xml:space="preserve">DIM tag AS INTEGER</w:t>
+      </w:r>
+      <w:r>
+        <w:rPr>
+          <w:rFonts w:ascii="Consolas" w:cs="Consolas" w:eastAsia="Consolas" w:hAnsi="Consolas"/>
+          <w:sz w:val="19"/>
+          <w:szCs w:val="19"/>
+        </w:rPr>
+        <w:br/>
+        <w:t xml:space="preserve">tag = 6</w:t>
+      </w:r>
+      <w:r>
+        <w:rPr>
+          <w:rFonts w:ascii="Consolas" w:cs="Consolas" w:eastAsia="Consolas" w:hAnsi="Consolas"/>
+          <w:sz w:val="19"/>
+          <w:szCs w:val="19"/>
+        </w:rPr>
+        <w:br/>
+        <w:t xml:space="preserve">SELECT CASE tag</w:t>
+      </w:r>
+      <w:r>
+        <w:rPr>
+          <w:rFonts w:ascii="Consolas" w:cs="Consolas" w:eastAsia="Consolas" w:hAnsi="Consolas"/>
+          <w:sz w:val="19"/>
+          <w:szCs w:val="19"/>
+        </w:rPr>
+        <w:br/>
+        <w:t xml:space="preserve">    CASE 1, 2, 3, 4, 5</w:t>
+      </w:r>
+      <w:r>
+        <w:rPr>
+          <w:rFonts w:ascii="Consolas" w:cs="Consolas" w:eastAsia="Consolas" w:hAnsi="Consolas"/>
+          <w:sz w:val="19"/>
+          <w:szCs w:val="19"/>
+        </w:rPr>
+        <w:br/>
+        <w:t xml:space="preserve">        PRINT "Wochentag"</w:t>
+      </w:r>
+      <w:r>
+        <w:rPr>
+          <w:rFonts w:ascii="Consolas" w:cs="Consolas" w:eastAsia="Consolas" w:hAnsi="Consolas"/>
+          <w:sz w:val="19"/>
+          <w:szCs w:val="19"/>
+        </w:rPr>
+        <w:br/>
+        <w:t xml:space="preserve">    CASE 6, 7</w:t>
+      </w:r>
+      <w:r>
+        <w:rPr>
+          <w:rFonts w:ascii="Consolas" w:cs="Consolas" w:eastAsia="Consolas" w:hAnsi="Consolas"/>
+          <w:sz w:val="19"/>
+          <w:szCs w:val="19"/>
+        </w:rPr>
+        <w:br/>
+        <w:t xml:space="preserve">        PRINT "Wochenende"</w:t>
+      </w:r>
+      <w:r>
+        <w:rPr>
+          <w:rFonts w:ascii="Consolas" w:cs="Consolas" w:eastAsia="Consolas" w:hAnsi="Consolas"/>
+          <w:sz w:val="19"/>
+          <w:szCs w:val="19"/>
+        </w:rPr>
+        <w:br/>
+        <w:t xml:space="preserve">END SELECT</w:t>
+      </w:r>
+    </w:p>
+    <w:p>
+      <w:pPr>
+        <w:keepNext/>
+        <w:spacing w:after="30" w:before="120"/>
+      </w:pPr>
+      <w:r>
+        <w:rPr>
+          <w:b/>
+          <w:bCs/>
+          <w:i/>
+          <w:iCs/>
+          <w:color w:val="6A6A6A"/>
+          <w:sz w:val="18"/>
+          <w:szCs w:val="18"/>
+        </w:rPr>
+        <w:t xml:space="preserve">Ausgabe</w:t>
+      </w:r>
+    </w:p>
+    <w:p>
+      <w:pPr>
+        <w:keepLines/>
+        <w:pBdr>
+          <w:left w:val="single" w:color="9AC79A" w:sz="18" w:space="6"/>
+        </w:pBdr>
+        <w:shd w:fill="EAF4EA" w:val="clear"/>
+        <w:spacing w:after="200" w:before="100" w:line="264" w:lineRule="auto"/>
+        <w:ind w:left="140"/>
+      </w:pPr>
+      <w:r>
+        <w:rPr>
+          <w:rFonts w:ascii="Consolas" w:cs="Consolas" w:eastAsia="Consolas" w:hAnsi="Consolas"/>
+          <w:sz w:val="19"/>
+          <w:szCs w:val="19"/>
+        </w:rPr>
+        <w:t xml:space="preserve">Wochenende</w:t>
+      </w:r>
+    </w:p>
+    <w:p>
+      <w:pPr>
+        <w:pStyle w:val="Heading2"/>
+        <w:keepNext/>
+        <w:keepLines/>
+        <w:spacing w:after="120" w:before="280"/>
+      </w:pPr>
+      <w:r>
+        <w:t xml:space="preserve">Bereiche und Vergleiche im CASE</w:t>
+      </w:r>
+    </w:p>
+    <w:p>
+      <w:pPr>
+        <w:spacing w:after="180" w:line="312" w:lineRule="auto"/>
+      </w:pPr>
+      <w:r>
+        <w:rPr>
+          <w:sz w:val="22"/>
+          <w:szCs w:val="22"/>
+        </w:rPr>
+        <w:t xml:space="preserve">Ein CASE muss nicht auf exakte Werte warten. Mit TO gibst du einen Bereich an (beide Grenzen zählen mit), mit IS einen Vergleich. Alle Formen lassen sich auch mischen, etwa CASE 1, 5 TO 8, IS &gt; 100.</w:t>
+      </w:r>
+    </w:p>
+    <w:p>
+      <w:pPr>
+        <w:pStyle w:val="ListParagraph"/>
+        <w:numPr>
+          <w:ilvl w:val="0"/>
+          <w:numId w:val="2"/>
+        </w:numPr>
+        <w:spacing w:after="100" w:line="312" w:lineRule="auto"/>
+      </w:pPr>
+      <w:r>
+        <w:rPr>
+          <w:b/>
+          <w:bCs/>
+          <w:sz w:val="22"/>
+          <w:szCs w:val="22"/>
+        </w:rPr>
+        <w:t xml:space="preserve">CASE 1, 2, 3   </w:t>
+      </w:r>
+      <w:r>
+        <w:rPr>
+          <w:sz w:val="22"/>
+          <w:szCs w:val="22"/>
+        </w:rPr>
+        <w:t xml:space="preserve">– eine Liste einzelner Werte</w:t>
+      </w:r>
+    </w:p>
+    <w:p>
+      <w:pPr>
+        <w:pStyle w:val="ListParagraph"/>
+        <w:numPr>
+          <w:ilvl w:val="0"/>
+          <w:numId w:val="2"/>
+        </w:numPr>
+        <w:spacing w:after="100" w:line="312" w:lineRule="auto"/>
+      </w:pPr>
+      <w:r>
+        <w:rPr>
+          <w:b/>
+          <w:bCs/>
+          <w:sz w:val="22"/>
+          <w:szCs w:val="22"/>
+        </w:rPr>
+        <w:t xml:space="preserve">CASE 10 TO 20   </w:t>
+      </w:r>
+      <w:r>
+        <w:rPr>
+          <w:sz w:val="22"/>
+          <w:szCs w:val="22"/>
+        </w:rPr>
+        <w:t xml:space="preserve">– ein Bereich von 10 bis 20 (einschließlich)</w:t>
+      </w:r>
+    </w:p>
+    <w:p>
+      <w:pPr>
+        <w:pStyle w:val="ListParagraph"/>
+        <w:numPr>
+          <w:ilvl w:val="0"/>
+          <w:numId w:val="2"/>
+        </w:numPr>
+        <w:spacing w:after="100" w:line="312" w:lineRule="auto"/>
+      </w:pPr>
+      <w:r>
+        <w:rPr>
+          <w:b/>
+          <w:bCs/>
+          <w:sz w:val="22"/>
+          <w:szCs w:val="22"/>
+        </w:rPr>
+        <w:t xml:space="preserve">CASE IS &gt; 100   </w:t>
+      </w:r>
+      <w:r>
+        <w:rPr>
+          <w:sz w:val="22"/>
+          <w:szCs w:val="22"/>
+        </w:rPr>
+        <w:t xml:space="preserve">– ein Vergleich (=, &lt;&gt;, &lt;, &gt;, &lt;=, &gt;=)</w:t>
+      </w:r>
+    </w:p>
+    <w:p>
+      <w:pPr>
+        <w:keepLines/>
+        <w:pBdr>
+          <w:left w:val="single" w:color="1B6CA8" w:sz="18" w:space="6"/>
+        </w:pBdr>
+        <w:shd w:fill="F4F4F4" w:val="clear"/>
+        <w:spacing w:after="200" w:before="100" w:line="264" w:lineRule="auto"/>
+        <w:ind w:left="140"/>
+      </w:pPr>
+      <w:r>
+        <w:rPr>
+          <w:rFonts w:ascii="Consolas" w:cs="Consolas" w:eastAsia="Consolas" w:hAnsi="Consolas"/>
+          <w:sz w:val="19"/>
+          <w:szCs w:val="19"/>
+        </w:rPr>
+        <w:t xml:space="preserve">DIM x AS INTEGER</w:t>
+      </w:r>
+      <w:r>
+        <w:rPr>
+          <w:rFonts w:ascii="Consolas" w:cs="Consolas" w:eastAsia="Consolas" w:hAnsi="Consolas"/>
+          <w:sz w:val="19"/>
+          <w:szCs w:val="19"/>
+        </w:rPr>
+        <w:br/>
+        <w:t xml:space="preserve">x = 150</w:t>
+      </w:r>
+      <w:r>
+        <w:rPr>
+          <w:rFonts w:ascii="Consolas" w:cs="Consolas" w:eastAsia="Consolas" w:hAnsi="Consolas"/>
+          <w:sz w:val="19"/>
+          <w:szCs w:val="19"/>
+        </w:rPr>
+        <w:br/>
+        <w:t xml:space="preserve">SELECT CASE x</w:t>
+      </w:r>
+      <w:r>
+        <w:rPr>
+          <w:rFonts w:ascii="Consolas" w:cs="Consolas" w:eastAsia="Consolas" w:hAnsi="Consolas"/>
+          <w:sz w:val="19"/>
+          <w:szCs w:val="19"/>
+        </w:rPr>
+        <w:br/>
+        <w:t xml:space="preserve">    CASE IS &lt;= 0</w:t>
+      </w:r>
+      <w:r>
+        <w:rPr>
+          <w:rFonts w:ascii="Consolas" w:cs="Consolas" w:eastAsia="Consolas" w:hAnsi="Consolas"/>
+          <w:sz w:val="19"/>
+          <w:szCs w:val="19"/>
+        </w:rPr>
+        <w:br/>
+        <w:t xml:space="preserve">        PRINT "null oder negativ"</w:t>
+      </w:r>
+      <w:r>
+        <w:rPr>
+          <w:rFonts w:ascii="Consolas" w:cs="Consolas" w:eastAsia="Consolas" w:hAnsi="Consolas"/>
+          <w:sz w:val="19"/>
+          <w:szCs w:val="19"/>
+        </w:rPr>
+        <w:br/>
+        <w:t xml:space="preserve">    CASE 1 TO 100</w:t>
+      </w:r>
+      <w:r>
+        <w:rPr>
+          <w:rFonts w:ascii="Consolas" w:cs="Consolas" w:eastAsia="Consolas" w:hAnsi="Consolas"/>
+          <w:sz w:val="19"/>
+          <w:szCs w:val="19"/>
+        </w:rPr>
+        <w:br/>
+        <w:t xml:space="preserve">        PRINT "klein"</w:t>
+      </w:r>
+      <w:r>
+        <w:rPr>
+          <w:rFonts w:ascii="Consolas" w:cs="Consolas" w:eastAsia="Consolas" w:hAnsi="Consolas"/>
+          <w:sz w:val="19"/>
+          <w:szCs w:val="19"/>
+        </w:rPr>
+        <w:br/>
+        <w:t xml:space="preserve">    CASE IS &gt; 100</w:t>
+      </w:r>
+      <w:r>
+        <w:rPr>
+          <w:rFonts w:ascii="Consolas" w:cs="Consolas" w:eastAsia="Consolas" w:hAnsi="Consolas"/>
+          <w:sz w:val="19"/>
+          <w:szCs w:val="19"/>
+        </w:rPr>
+        <w:br/>
+        <w:t xml:space="preserve">        PRINT "gross"</w:t>
+      </w:r>
+      <w:r>
+        <w:rPr>
+          <w:rFonts w:ascii="Consolas" w:cs="Consolas" w:eastAsia="Consolas" w:hAnsi="Consolas"/>
+          <w:sz w:val="19"/>
+          <w:szCs w:val="19"/>
+        </w:rPr>
+        <w:br/>
+        <w:t xml:space="preserve">END SELECT</w:t>
+      </w:r>
+    </w:p>
+    <w:p>
+      <w:pPr>
+        <w:keepLines/>
+        <w:pBdr>
+          <w:left w:val="single" w:color="9AC79A" w:sz="18" w:space="6"/>
+        </w:pBdr>
+        <w:shd w:fill="EAF4EA" w:val="clear"/>
+        <w:spacing w:after="200" w:before="100" w:line="264" w:lineRule="auto"/>
+        <w:ind w:left="140"/>
+      </w:pPr>
+      <w:r>
+        <w:rPr>
+          <w:rFonts w:ascii="Consolas" w:cs="Consolas" w:eastAsia="Consolas" w:hAnsi="Consolas"/>
+          <w:sz w:val="19"/>
+          <w:szCs w:val="19"/>
+        </w:rPr>
+        <w:t xml:space="preserve">gross</w:t>
+      </w:r>
+    </w:p>
+    <w:p>
+      <w:pPr>
+        <w:spacing w:before="60"/>
+      </w:pPr>
+    </w:p>
+    <w:tbl>
+      <w:tblPr>
+        <w:tblW w:type="dxa" w:w="9360"/>
+        <w:tblBorders>
+          <w:top w:val="single" w:color="auto" w:sz="4"/>
+          <w:left w:val="single" w:color="auto" w:sz="4"/>
+          <w:bottom w:val="single" w:color="auto" w:sz="4"/>
+          <w:right w:val="single" w:color="auto" w:sz="4"/>
+          <w:insideH w:val="single" w:color="auto" w:sz="4"/>
+          <w:insideV w:val="single" w:color="auto" w:sz="4"/>
+        </w:tblBorders>
+      </w:tblPr>
+      <w:tblGrid>
+        <w:gridCol w:w="9360"/>
+      </w:tblGrid>
+      <w:tr>
+        <w:trPr>
+          <w:cantSplit/>
+        </w:trPr>
+        <w:tc>
+          <w:tcPr>
+            <w:tcW w:type="dxa" w:w="9360"/>
+            <w:tcBorders>
+              <w:top w:val="single" w:color="E0B96A" w:sz="6"/>
+              <w:left w:val="single" w:color="E0B96A" w:sz="6"/>
+              <w:bottom w:val="single" w:color="E0B96A" w:sz="6"/>
+              <w:right w:val="single" w:color="E0B96A" w:sz="6"/>
+            </w:tcBorders>
+            <w:shd w:fill="FDF3E0" w:val="clear"/>
+            <w:tcMar>
+              <w:top w:type="dxa" w:w="140"/>
+              <w:left w:type="dxa" w:w="180"/>
+              <w:bottom w:type="dxa" w:w="140"/>
+              <w:right w:type="dxa" w:w="180"/>
+            </w:tcMar>
+          </w:tcPr>
+          <w:p>
+            <w:pPr>
+              <w:spacing w:after="40"/>
+            </w:pPr>
+            <w:r>
+              <w:rPr>
+                <w:b/>
+                <w:bCs/>
+                <w:color w:val="9A6A1E"/>
+                <w:sz w:val="22"/>
+                <w:szCs w:val="22"/>
+              </w:rPr>
+              <w:t xml:space="preserve">Merke</w:t>
+            </w:r>
+          </w:p>
+          <w:p>
+            <w:pPr>
+              <w:spacing w:after="0" w:line="312" w:lineRule="auto"/>
+            </w:pPr>
+            <w:r>
+              <w:rPr>
+                <w:sz w:val="22"/>
+                <w:szCs w:val="22"/>
+              </w:rPr>
+              <w:t xml:space="preserve">Der zu prüfende Wert wird nur ein einziges Mal berechnet – selbst wenn dort ein aufwändiger Funktionsaufruf steht. Das ist ein Vorteil gegenüber einer IF-Treppe, in der du den Ausdruck bei jeder Prüfung wiederholen müsstest.</w:t>
+            </w:r>
+          </w:p>
+        </w:tc>
+      </w:tr>
+    </w:tbl>
+    <w:p>
+      <w:pPr>
+        <w:spacing w:after="160"/>
+      </w:pPr>
+    </w:p>
+    <w:p>
+      <w:pPr>
+        <w:pStyle w:val="Heading2"/>
+        <w:keepNext/>
+        <w:keepLines/>
+        <w:spacing w:after="120" w:before="280"/>
+      </w:pPr>
+      <w:r>
+        <w:t xml:space="preserve">Zusätzliche Bedingung: CASE ... WHERE</w:t>
+      </w:r>
+    </w:p>
+    <w:p>
+      <w:pPr>
+        <w:spacing w:after="180" w:line="312" w:lineRule="auto"/>
+      </w:pPr>
+      <w:r>
+        <w:rPr>
+          <w:sz w:val="22"/>
+          <w:szCs w:val="22"/>
+        </w:rPr>
+        <w:t xml:space="preserve">Manchmal soll ein CASE nur greifen, wenn zusätzlich eine weitere Bedingung erfüllt ist. Dafür hängst du WHERE an. Passt das Muster, der WHERE-Ausdruck ist aber falsch, probiert GameBasic den nächsten CASE. So kombinierst du den Wert mit beliebigem Zusatzwissen:</w:t>
+      </w:r>
+    </w:p>
+    <w:p>
+      <w:pPr>
+        <w:keepLines/>
+        <w:pBdr>
+          <w:left w:val="single" w:color="1B6CA8" w:sz="18" w:space="6"/>
+        </w:pBdr>
+        <w:shd w:fill="F4F4F4" w:val="clear"/>
+        <w:spacing w:after="200" w:before="100" w:line="264" w:lineRule="auto"/>
+        <w:ind w:left="140"/>
+      </w:pPr>
+      <w:r>
+        <w:rPr>
+          <w:rFonts w:ascii="Consolas" w:cs="Consolas" w:eastAsia="Consolas" w:hAnsi="Consolas"/>
+          <w:sz w:val="19"/>
+          <w:szCs w:val="19"/>
+        </w:rPr>
+        <w:t xml:space="preserve">DIM hp AS INTEGER</w:t>
+      </w:r>
+      <w:r>
+        <w:rPr>
+          <w:rFonts w:ascii="Consolas" w:cs="Consolas" w:eastAsia="Consolas" w:hAnsi="Consolas"/>
+          <w:sz w:val="19"/>
+          <w:szCs w:val="19"/>
+        </w:rPr>
+        <w:br/>
+        <w:t xml:space="preserve">DIM trank AS BOOLEAN</w:t>
+      </w:r>
+      <w:r>
+        <w:rPr>
+          <w:rFonts w:ascii="Consolas" w:cs="Consolas" w:eastAsia="Consolas" w:hAnsi="Consolas"/>
+          <w:sz w:val="19"/>
+          <w:szCs w:val="19"/>
+        </w:rPr>
+        <w:br/>
+        <w:t xml:space="preserve">hp = 20</w:t>
+      </w:r>
+      <w:r>
+        <w:rPr>
+          <w:rFonts w:ascii="Consolas" w:cs="Consolas" w:eastAsia="Consolas" w:hAnsi="Consolas"/>
+          <w:sz w:val="19"/>
+          <w:szCs w:val="19"/>
+        </w:rPr>
+        <w:br/>
+        <w:t xml:space="preserve">trank = TRUE</w:t>
+      </w:r>
+      <w:r>
+        <w:rPr>
+          <w:rFonts w:ascii="Consolas" w:cs="Consolas" w:eastAsia="Consolas" w:hAnsi="Consolas"/>
+          <w:sz w:val="19"/>
+          <w:szCs w:val="19"/>
+        </w:rPr>
+        <w:br/>
+        <w:t xml:space="preserve">SELECT CASE hp</w:t>
+      </w:r>
+      <w:r>
+        <w:rPr>
+          <w:rFonts w:ascii="Consolas" w:cs="Consolas" w:eastAsia="Consolas" w:hAnsi="Consolas"/>
+          <w:sz w:val="19"/>
+          <w:szCs w:val="19"/>
+        </w:rPr>
+        <w:br/>
+        <w:t xml:space="preserve">    CASE IS &lt;= 0</w:t>
+      </w:r>
+      <w:r>
+        <w:rPr>
+          <w:rFonts w:ascii="Consolas" w:cs="Consolas" w:eastAsia="Consolas" w:hAnsi="Consolas"/>
+          <w:sz w:val="19"/>
+          <w:szCs w:val="19"/>
+        </w:rPr>
+        <w:br/>
+        <w:t xml:space="preserve">        PRINT "tot"</w:t>
+      </w:r>
+      <w:r>
+        <w:rPr>
+          <w:rFonts w:ascii="Consolas" w:cs="Consolas" w:eastAsia="Consolas" w:hAnsi="Consolas"/>
+          <w:sz w:val="19"/>
+          <w:szCs w:val="19"/>
+        </w:rPr>
+        <w:br/>
+        <w:t xml:space="preserve">    CASE IS &lt;= 30 WHERE trank</w:t>
+      </w:r>
+      <w:r>
+        <w:rPr>
+          <w:rFonts w:ascii="Consolas" w:cs="Consolas" w:eastAsia="Consolas" w:hAnsi="Consolas"/>
+          <w:sz w:val="19"/>
+          <w:szCs w:val="19"/>
+        </w:rPr>
+        <w:br/>
+        <w:t xml:space="preserve">        PRINT "heilen"</w:t>
+      </w:r>
+      <w:r>
+        <w:rPr>
+          <w:rFonts w:ascii="Consolas" w:cs="Consolas" w:eastAsia="Consolas" w:hAnsi="Consolas"/>
+          <w:sz w:val="19"/>
+          <w:szCs w:val="19"/>
+        </w:rPr>
+        <w:br/>
+        <w:t xml:space="preserve">    CASE IS &lt;= 30</w:t>
+      </w:r>
+      <w:r>
+        <w:rPr>
+          <w:rFonts w:ascii="Consolas" w:cs="Consolas" w:eastAsia="Consolas" w:hAnsi="Consolas"/>
+          <w:sz w:val="19"/>
+          <w:szCs w:val="19"/>
+        </w:rPr>
+        <w:br/>
+        <w:t xml:space="preserve">        PRINT "fliehen"</w:t>
+      </w:r>
+      <w:r>
+        <w:rPr>
+          <w:rFonts w:ascii="Consolas" w:cs="Consolas" w:eastAsia="Consolas" w:hAnsi="Consolas"/>
+          <w:sz w:val="19"/>
+          <w:szCs w:val="19"/>
+        </w:rPr>
+        <w:br/>
+        <w:t xml:space="preserve">    CASE ELSE</w:t>
+      </w:r>
+      <w:r>
+        <w:rPr>
+          <w:rFonts w:ascii="Consolas" w:cs="Consolas" w:eastAsia="Consolas" w:hAnsi="Consolas"/>
+          <w:sz w:val="19"/>
+          <w:szCs w:val="19"/>
+        </w:rPr>
+        <w:br/>
+        <w:t xml:space="preserve">        PRINT "ok"</w:t>
+      </w:r>
+      <w:r>
+        <w:rPr>
+          <w:rFonts w:ascii="Consolas" w:cs="Consolas" w:eastAsia="Consolas" w:hAnsi="Consolas"/>
+          <w:sz w:val="19"/>
+          <w:szCs w:val="19"/>
+        </w:rPr>
+        <w:br/>
+        <w:t xml:space="preserve">END SELECT</w:t>
+      </w:r>
+    </w:p>
+    <w:p>
+      <w:pPr>
+        <w:keepLines/>
+        <w:pBdr>
+          <w:left w:val="single" w:color="9AC79A" w:sz="18" w:space="6"/>
+        </w:pBdr>
+        <w:shd w:fill="EAF4EA" w:val="clear"/>
+        <w:spacing w:after="200" w:before="100" w:line="264" w:lineRule="auto"/>
+        <w:ind w:left="140"/>
+      </w:pPr>
+      <w:r>
+        <w:rPr>
+          <w:rFonts w:ascii="Consolas" w:cs="Consolas" w:eastAsia="Consolas" w:hAnsi="Consolas"/>
+          <w:sz w:val="19"/>
+          <w:szCs w:val="19"/>
+        </w:rPr>
+        <w:t xml:space="preserve">heilen</w:t>
+      </w:r>
+    </w:p>
+    <w:p>
+      <w:pPr>
+        <w:spacing w:after="180" w:line="312" w:lineRule="auto"/>
+      </w:pPr>
+      <w:r>
+        <w:rPr>
+          <w:sz w:val="22"/>
+          <w:szCs w:val="22"/>
+        </w:rPr>
+        <w:t xml:space="preserve">Wäre trank hier FALSE, würde der „heilen“-Fall nicht greifen und der nächste passende CASE („fliehen“) übernehmen.</w:t>
+      </w:r>
+    </w:p>
+    <w:p>
+      <w:pPr>
+        <w:pStyle w:val="Heading2"/>
+        <w:keepNext/>
+        <w:keepLines/>
+        <w:spacing w:after="120" w:before="280"/>
+      </w:pPr>
+      <w:r>
+        <w:t xml:space="preserve">Die Entscheidung als Ausdruck: IIF</w:t>
+      </w:r>
+    </w:p>
+    <w:p>
+      <w:pPr>
+        <w:spacing w:after="180" w:line="312" w:lineRule="auto"/>
+      </w:pPr>
+      <w:r>
+        <w:rPr>
+          <w:sz w:val="22"/>
+          <w:szCs w:val="22"/>
+        </w:rPr>
+        <w:t xml:space="preserve">Bisher waren Verzweigungen ganze Anweisungs-Blöcke. Manchmal willst du aber nur zwischen zwei Werten wählen – etwa eine Richtung, einen Text, eine Farbe. Dafür gibt es IIF („inline if“): Es nimmt eine Bedingung und zwei Werte und liefert je nach Bedingung den einen oder den anderen zurück. IIF passt mitten in eine Zuweisung oder einen PRINT.</w:t>
+      </w:r>
+    </w:p>
+    <w:p>
+      <w:pPr>
+        <w:keepNext/>
+        <w:keepLines/>
+        <w:pBdr>
+          <w:bottom w:val="single" w:color="DDD0C0" w:sz="4" w:space="2"/>
+        </w:pBdr>
+        <w:spacing w:after="40" w:before="360"/>
+      </w:pPr>
+      <w:r>
+        <w:rPr>
+          <w:rFonts w:ascii="Consolas" w:cs="Consolas" w:eastAsia="Consolas" w:hAnsi="Consolas"/>
+          <w:b/>
+          <w:bCs/>
+          <w:color w:val="9A3412"/>
+          <w:sz w:val="24"/>
+          <w:szCs w:val="24"/>
+        </w:rPr>
+        <w:t xml:space="preserve">IIF</w:t>
+      </w:r>
+    </w:p>
+    <w:p>
+      <w:pPr>
+        <w:keepNext/>
+        <w:spacing w:after="120"/>
+      </w:pPr>
+      <w:r>
+        <w:rPr>
+          <w:b/>
+          <w:bCs/>
+          <w:color w:val="6A6A6A"/>
+          <w:sz w:val="18"/>
+          <w:szCs w:val="18"/>
+        </w:rPr>
+        <w:t xml:space="preserve">Syntax:  </w:t>
+      </w:r>
+      <w:r>
+        <w:rPr>
+          <w:rFonts w:ascii="Consolas" w:cs="Consolas" w:eastAsia="Consolas" w:hAnsi="Consolas"/>
+          <w:color w:val="335577"/>
+          <w:sz w:val="19"/>
+          <w:szCs w:val="19"/>
+        </w:rPr>
+        <w:t xml:space="preserve">IIF(bedingung, dann, sonst)</w:t>
+      </w:r>
+    </w:p>
+    <w:p>
+      <w:pPr>
+        <w:spacing w:after="180" w:line="312" w:lineRule="auto"/>
+      </w:pPr>
+      <w:r>
+        <w:rPr>
+          <w:sz w:val="22"/>
+          <w:szCs w:val="22"/>
+        </w:rPr>
+        <w:t xml:space="preserve">Liefert den zweiten Wert, wenn die Bedingung wahr ist, sonst den dritten. Nur der jeweils gewählte Zweig wird ausgewertet – die andere Seite wird gar nicht erst berechnet (kein Division-durch-Null-Unfall im ungenutzten Zweig).</w:t>
+      </w:r>
+    </w:p>
+    <w:p>
+      <w:pPr>
+        <w:keepNext/>
+        <w:spacing w:after="30" w:before="120"/>
+      </w:pPr>
+      <w:r>
+        <w:rPr>
+          <w:b/>
+          <w:bCs/>
+          <w:i/>
+          <w:iCs/>
+          <w:color w:val="6A6A6A"/>
+          <w:sz w:val="18"/>
+          <w:szCs w:val="18"/>
+        </w:rPr>
+        <w:t xml:space="preserve">Beispiel</w:t>
+      </w:r>
+    </w:p>
+    <w:p>
+      <w:pPr>
+        <w:keepLines/>
+        <w:pBdr>
+          <w:left w:val="single" w:color="1B6CA8" w:sz="18" w:space="6"/>
+        </w:pBdr>
+        <w:shd w:fill="F4F4F4" w:val="clear"/>
+        <w:spacing w:after="200" w:before="100" w:line="264" w:lineRule="auto"/>
+        <w:ind w:left="140"/>
+      </w:pPr>
+      <w:r>
+        <w:rPr>
+          <w:rFonts w:ascii="Consolas" w:cs="Consolas" w:eastAsia="Consolas" w:hAnsi="Consolas"/>
+          <w:sz w:val="19"/>
+          <w:szCs w:val="19"/>
+        </w:rPr>
+        <w:t xml:space="preserve">DIM richtung AS INTEGER</w:t>
+      </w:r>
+      <w:r>
+        <w:rPr>
+          <w:rFonts w:ascii="Consolas" w:cs="Consolas" w:eastAsia="Consolas" w:hAnsi="Consolas"/>
+          <w:sz w:val="19"/>
+          <w:szCs w:val="19"/>
+        </w:rPr>
+        <w:br/>
+        <w:t xml:space="preserve">richtung = -1</w:t>
+      </w:r>
+      <w:r>
+        <w:rPr>
+          <w:rFonts w:ascii="Consolas" w:cs="Consolas" w:eastAsia="Consolas" w:hAnsi="Consolas"/>
+          <w:sz w:val="19"/>
+          <w:szCs w:val="19"/>
+        </w:rPr>
+        <w:br/>
+        <w:t xml:space="preserve">PRINT IIF(richtung &lt; 0, "links", "rechts")</w:t>
+      </w:r>
+      <w:r>
+        <w:rPr>
+          <w:rFonts w:ascii="Consolas" w:cs="Consolas" w:eastAsia="Consolas" w:hAnsi="Consolas"/>
+          <w:sz w:val="19"/>
+          <w:szCs w:val="19"/>
+        </w:rPr>
+        <w:br/>
+        <w:t xml:space="preserve">PRINT IIF(5 &gt; 3, 100, 200)</w:t>
+      </w:r>
+    </w:p>
+    <w:p>
+      <w:pPr>
+        <w:keepNext/>
+        <w:spacing w:after="30" w:before="120"/>
+      </w:pPr>
+      <w:r>
+        <w:rPr>
+          <w:b/>
+          <w:bCs/>
+          <w:i/>
+          <w:iCs/>
+          <w:color w:val="6A6A6A"/>
+          <w:sz w:val="18"/>
+          <w:szCs w:val="18"/>
+        </w:rPr>
+        <w:t xml:space="preserve">Ausgabe</w:t>
+      </w:r>
+    </w:p>
+    <w:p>
+      <w:pPr>
+        <w:keepLines/>
+        <w:pBdr>
+          <w:left w:val="single" w:color="9AC79A" w:sz="18" w:space="6"/>
+        </w:pBdr>
+        <w:shd w:fill="EAF4EA" w:val="clear"/>
+        <w:spacing w:after="200" w:before="100" w:line="264" w:lineRule="auto"/>
+        <w:ind w:left="140"/>
+      </w:pPr>
+      <w:r>
+        <w:rPr>
+          <w:rFonts w:ascii="Consolas" w:cs="Consolas" w:eastAsia="Consolas" w:hAnsi="Consolas"/>
+          <w:sz w:val="19"/>
+          <w:szCs w:val="19"/>
+        </w:rPr>
+        <w:t xml:space="preserve">links</w:t>
+      </w:r>
+      <w:r>
+        <w:rPr>
+          <w:rFonts w:ascii="Consolas" w:cs="Consolas" w:eastAsia="Consolas" w:hAnsi="Consolas"/>
+          <w:sz w:val="19"/>
+          <w:szCs w:val="19"/>
+        </w:rPr>
+        <w:br/>
+        <w:t xml:space="preserve">100</w:t>
+      </w:r>
+    </w:p>
+    <w:p>
+      <w:pPr>
+        <w:spacing w:before="60"/>
+      </w:pPr>
+    </w:p>
+    <w:tbl>
+      <w:tblPr>
+        <w:tblW w:type="dxa" w:w="9360"/>
+        <w:tblBorders>
+          <w:top w:val="single" w:color="auto" w:sz="4"/>
+          <w:left w:val="single" w:color="auto" w:sz="4"/>
+          <w:bottom w:val="single" w:color="auto" w:sz="4"/>
+          <w:right w:val="single" w:color="auto" w:sz="4"/>
+          <w:insideH w:val="single" w:color="auto" w:sz="4"/>
+          <w:insideV w:val="single" w:color="auto" w:sz="4"/>
+        </w:tblBorders>
+      </w:tblPr>
+      <w:tblGrid>
+        <w:gridCol w:w="9360"/>
+      </w:tblGrid>
+      <w:tr>
+        <w:trPr>
+          <w:cantSplit/>
+        </w:trPr>
+        <w:tc>
+          <w:tcPr>
+            <w:tcW w:type="dxa" w:w="9360"/>
+            <w:tcBorders>
+              <w:top w:val="single" w:color="9CC8E6" w:sz="6"/>
+              <w:left w:val="single" w:color="9CC8E6" w:sz="6"/>
+              <w:bottom w:val="single" w:color="9CC8E6" w:sz="6"/>
+              <w:right w:val="single" w:color="9CC8E6" w:sz="6"/>
+            </w:tcBorders>
+            <w:shd w:fill="E7F2FA" w:val="clear"/>
+            <w:tcMar>
+              <w:top w:type="dxa" w:w="140"/>
+              <w:left w:type="dxa" w:w="180"/>
+              <w:bottom w:type="dxa" w:w="140"/>
+              <w:right w:type="dxa" w:w="180"/>
+            </w:tcMar>
+          </w:tcPr>
+          <w:p>
+            <w:pPr>
+              <w:spacing w:after="40"/>
+            </w:pPr>
+            <w:r>
+              <w:rPr>
+                <w:b/>
+                <w:bCs/>
+                <w:color w:val="1B6CA8"/>
+                <w:sz w:val="22"/>
+                <w:szCs w:val="22"/>
+              </w:rPr>
+              <w:t xml:space="preserve">Wann IIF, wann IF?</w:t>
+            </w:r>
+          </w:p>
+          <w:p>
+            <w:pPr>
+              <w:spacing w:after="0" w:line="312" w:lineRule="auto"/>
+            </w:pPr>
+            <w:r>
+              <w:rPr>
+                <w:sz w:val="22"/>
+                <w:szCs w:val="22"/>
+              </w:rPr>
+              <w:t xml:space="preserve">Nimm IIF, wenn du genau einen Wert auswählst und ihn sofort verwenden willst (dx = IIF(links, -speed, speed)). Sobald je Zweig mehrere Befehle laufen sollen, ist das ausführliche IF ... END IF die klarere Wahl.</w:t>
             </w:r>
           </w:p>
         </w:tc>

</xml_diff>

<commit_message>
docs(buch): Lehrbuch Kap 14 -- Schleifen (FOR/WHILE/REPEAT/FOR EACH/BREAK/CONTINUE)
FOR...NEXT mit STEP, WHILE...WEND (Pre-Test), REPEAT...UNTIL (Post-Test),
FOR EACH ueber Sammlungen, BREAK/CONTINUE in allen Schleifenarten,
Verschachtelung. Alle Beispiel-Ausgaben gegen gbrt verifiziert.

Co-Authored-By: Claude Opus 4.8 (1M context) <noreply@anthropic.com>
</commit_message>
<xml_diff>
--- a/buch-referenz/buch/GameBasic-Lehrbuch.docx
+++ b/buch-referenz/buch/GameBasic-Lehrbuch.docx
@@ -354,6 +354,33 @@
           <w:szCs w:val="22"/>
         </w:rPr>
         <w:t xml:space="preserve">	14</w:t>
+      </w:r>
+    </w:p>
+    <w:p>
+      <w:pPr>
+        <w:tabs>
+          <w:tab w:val="right" w:pos="9200" w:leader="dot"/>
+        </w:tabs>
+        <w:spacing w:after="20" w:before="0"/>
+        <w:ind w:left="280"/>
+      </w:pPr>
+      <w:r>
+        <w:rPr>
+          <w:b w:val="false"/>
+          <w:bCs w:val="false"/>
+          <w:color w:val="222222"/>
+          <w:sz w:val="22"/>
+          <w:szCs w:val="22"/>
+        </w:rPr>
+        <w:t xml:space="preserve">Schleifen</w:t>
+      </w:r>
+      <w:r>
+        <w:rPr>
+          <w:color w:val="555555"/>
+          <w:sz w:val="22"/>
+          <w:szCs w:val="22"/>
+        </w:rPr>
+        <w:t xml:space="preserve">	3</w:t>
       </w:r>
     </w:p>
     <w:p>
@@ -7663,6 +7690,1599 @@
                 <w:szCs w:val="22"/>
               </w:rPr>
               <w:t xml:space="preserve">Nimm IIF, wenn du genau einen Wert auswählst und ihn sofort verwenden willst (dx = IIF(links, -speed, speed)). Sobald je Zweig mehrere Befehle laufen sollen, ist das ausführliche IF ... END IF die klarere Wahl.</w:t>
+            </w:r>
+          </w:p>
+        </w:tc>
+      </w:tr>
+    </w:tbl>
+    <w:p>
+      <w:pPr>
+        <w:spacing w:after="160"/>
+      </w:pPr>
+    </w:p>
+    <w:p>
+      <w:pPr>
+        <w:pStyle w:val="Heading1"/>
+        <w:keepNext/>
+        <w:keepLines/>
+        <w:pageBreakBefore/>
+        <w:pBdr>
+          <w:bottom w:val="single" w:color="1B6CA8" w:sz="12" w:space="4"/>
+        </w:pBdr>
+        <w:spacing w:after="160" w:before="0"/>
+      </w:pPr>
+      <w:r>
+        <w:t xml:space="preserve">Schleifen</w:t>
+      </w:r>
+    </w:p>
+    <w:p>
+      <w:pPr>
+        <w:spacing w:after="180" w:line="312" w:lineRule="auto"/>
+      </w:pPr>
+      <w:r>
+        <w:rPr>
+          <w:sz w:val="22"/>
+          <w:szCs w:val="22"/>
+        </w:rPr>
+        <w:t xml:space="preserve">Computer sind unermüdlich – und genau das machen wir uns mit Schleifen zunutze. Eine Schleife wiederholt einen Block von Befehlen, bis eine bestimmte Bedingung erfüllt ist. Ob du von 1 bis 100 zählst, alle Gegner eines Spiels aktualisierst oder so lange würfelst, bis eine Sechs fällt: Schleifen sind das Herz fast jedes Programms. GameBasic kennt mehrere Sorten, jede für eine andere Situation.</w:t>
+      </w:r>
+    </w:p>
+    <w:p>
+      <w:pPr>
+        <w:pStyle w:val="Heading2"/>
+        <w:keepNext/>
+        <w:keepLines/>
+        <w:spacing w:after="120" w:before="280"/>
+      </w:pPr>
+      <w:r>
+        <w:t xml:space="preserve">Eine feste Anzahl: FOR ... NEXT</w:t>
+      </w:r>
+    </w:p>
+    <w:p>
+      <w:pPr>
+        <w:spacing w:after="180" w:line="312" w:lineRule="auto"/>
+      </w:pPr>
+      <w:r>
+        <w:rPr>
+          <w:sz w:val="22"/>
+          <w:szCs w:val="22"/>
+        </w:rPr>
+        <w:t xml:space="preserve">Die FOR-Schleife zählt eine Variable von einem Startwert bis zu einem Endwert hoch und führt für jeden Wert den Block aus. Das NEXT markiert das Ende des Blocks – dort springt GameBasic zurück und erhöht die Zählvariable.</w:t>
+      </w:r>
+    </w:p>
+    <w:p>
+      <w:pPr>
+        <w:keepNext/>
+        <w:keepLines/>
+        <w:pBdr>
+          <w:bottom w:val="single" w:color="DDD0C0" w:sz="4" w:space="2"/>
+        </w:pBdr>
+        <w:spacing w:after="40" w:before="360"/>
+      </w:pPr>
+      <w:r>
+        <w:rPr>
+          <w:rFonts w:ascii="Consolas" w:cs="Consolas" w:eastAsia="Consolas" w:hAnsi="Consolas"/>
+          <w:b/>
+          <w:bCs/>
+          <w:color w:val="9A3412"/>
+          <w:sz w:val="24"/>
+          <w:szCs w:val="24"/>
+        </w:rPr>
+        <w:t xml:space="preserve">FOR ... NEXT</w:t>
+      </w:r>
+    </w:p>
+    <w:p>
+      <w:pPr>
+        <w:keepNext/>
+        <w:spacing w:after="120"/>
+      </w:pPr>
+      <w:r>
+        <w:rPr>
+          <w:b/>
+          <w:bCs/>
+          <w:color w:val="6A6A6A"/>
+          <w:sz w:val="18"/>
+          <w:szCs w:val="18"/>
+        </w:rPr>
+        <w:t xml:space="preserve">Syntax:  </w:t>
+      </w:r>
+      <w:r>
+        <w:rPr>
+          <w:rFonts w:ascii="Consolas" w:cs="Consolas" w:eastAsia="Consolas" w:hAnsi="Consolas"/>
+          <w:color w:val="335577"/>
+          <w:sz w:val="19"/>
+          <w:szCs w:val="19"/>
+        </w:rPr>
+        <w:t xml:space="preserve">FOR var = start TO ende
+    ...
+NEXT</w:t>
+      </w:r>
+    </w:p>
+    <w:p>
+      <w:pPr>
+        <w:spacing w:after="180" w:line="312" w:lineRule="auto"/>
+      </w:pPr>
+      <w:r>
+        <w:rPr>
+          <w:sz w:val="22"/>
+          <w:szCs w:val="22"/>
+        </w:rPr>
+        <w:t xml:space="preserve">Wiederholt den Block, während die Zählvariable von start bis ende läuft (beide Grenzen eingeschlossen). Nach jedem Durchlauf wird die Variable um 1 erhöht. Die Zählvariable muss vorher mit DIM angelegt sein.</w:t>
+      </w:r>
+    </w:p>
+    <w:p>
+      <w:pPr>
+        <w:keepNext/>
+        <w:spacing w:after="30" w:before="120"/>
+      </w:pPr>
+      <w:r>
+        <w:rPr>
+          <w:b/>
+          <w:bCs/>
+          <w:i/>
+          <w:iCs/>
+          <w:color w:val="6A6A6A"/>
+          <w:sz w:val="18"/>
+          <w:szCs w:val="18"/>
+        </w:rPr>
+        <w:t xml:space="preserve">Beispiel</w:t>
+      </w:r>
+    </w:p>
+    <w:p>
+      <w:pPr>
+        <w:keepLines/>
+        <w:pBdr>
+          <w:left w:val="single" w:color="1B6CA8" w:sz="18" w:space="6"/>
+        </w:pBdr>
+        <w:shd w:fill="F4F4F4" w:val="clear"/>
+        <w:spacing w:after="200" w:before="100" w:line="264" w:lineRule="auto"/>
+        <w:ind w:left="140"/>
+      </w:pPr>
+      <w:r>
+        <w:rPr>
+          <w:rFonts w:ascii="Consolas" w:cs="Consolas" w:eastAsia="Consolas" w:hAnsi="Consolas"/>
+          <w:sz w:val="19"/>
+          <w:szCs w:val="19"/>
+        </w:rPr>
+        <w:t xml:space="preserve">DIM i AS INTEGER</w:t>
+      </w:r>
+      <w:r>
+        <w:rPr>
+          <w:rFonts w:ascii="Consolas" w:cs="Consolas" w:eastAsia="Consolas" w:hAnsi="Consolas"/>
+          <w:sz w:val="19"/>
+          <w:szCs w:val="19"/>
+        </w:rPr>
+        <w:br/>
+        <w:t xml:space="preserve">FOR i = 1 TO 5</w:t>
+      </w:r>
+      <w:r>
+        <w:rPr>
+          <w:rFonts w:ascii="Consolas" w:cs="Consolas" w:eastAsia="Consolas" w:hAnsi="Consolas"/>
+          <w:sz w:val="19"/>
+          <w:szCs w:val="19"/>
+        </w:rPr>
+        <w:br/>
+        <w:t xml:space="preserve">    PRINT i</w:t>
+      </w:r>
+      <w:r>
+        <w:rPr>
+          <w:rFonts w:ascii="Consolas" w:cs="Consolas" w:eastAsia="Consolas" w:hAnsi="Consolas"/>
+          <w:sz w:val="19"/>
+          <w:szCs w:val="19"/>
+        </w:rPr>
+        <w:br/>
+        <w:t xml:space="preserve">NEXT</w:t>
+      </w:r>
+    </w:p>
+    <w:p>
+      <w:pPr>
+        <w:keepNext/>
+        <w:spacing w:after="30" w:before="120"/>
+      </w:pPr>
+      <w:r>
+        <w:rPr>
+          <w:b/>
+          <w:bCs/>
+          <w:i/>
+          <w:iCs/>
+          <w:color w:val="6A6A6A"/>
+          <w:sz w:val="18"/>
+          <w:szCs w:val="18"/>
+        </w:rPr>
+        <w:t xml:space="preserve">Ausgabe</w:t>
+      </w:r>
+    </w:p>
+    <w:p>
+      <w:pPr>
+        <w:keepLines/>
+        <w:pBdr>
+          <w:left w:val="single" w:color="9AC79A" w:sz="18" w:space="6"/>
+        </w:pBdr>
+        <w:shd w:fill="EAF4EA" w:val="clear"/>
+        <w:spacing w:after="200" w:before="100" w:line="264" w:lineRule="auto"/>
+        <w:ind w:left="140"/>
+      </w:pPr>
+      <w:r>
+        <w:rPr>
+          <w:rFonts w:ascii="Consolas" w:cs="Consolas" w:eastAsia="Consolas" w:hAnsi="Consolas"/>
+          <w:sz w:val="19"/>
+          <w:szCs w:val="19"/>
+        </w:rPr>
+        <w:t xml:space="preserve">1</w:t>
+      </w:r>
+      <w:r>
+        <w:rPr>
+          <w:rFonts w:ascii="Consolas" w:cs="Consolas" w:eastAsia="Consolas" w:hAnsi="Consolas"/>
+          <w:sz w:val="19"/>
+          <w:szCs w:val="19"/>
+        </w:rPr>
+        <w:br/>
+        <w:t xml:space="preserve">2</w:t>
+      </w:r>
+      <w:r>
+        <w:rPr>
+          <w:rFonts w:ascii="Consolas" w:cs="Consolas" w:eastAsia="Consolas" w:hAnsi="Consolas"/>
+          <w:sz w:val="19"/>
+          <w:szCs w:val="19"/>
+        </w:rPr>
+        <w:br/>
+        <w:t xml:space="preserve">3</w:t>
+      </w:r>
+      <w:r>
+        <w:rPr>
+          <w:rFonts w:ascii="Consolas" w:cs="Consolas" w:eastAsia="Consolas" w:hAnsi="Consolas"/>
+          <w:sz w:val="19"/>
+          <w:szCs w:val="19"/>
+        </w:rPr>
+        <w:br/>
+        <w:t xml:space="preserve">4</w:t>
+      </w:r>
+      <w:r>
+        <w:rPr>
+          <w:rFonts w:ascii="Consolas" w:cs="Consolas" w:eastAsia="Consolas" w:hAnsi="Consolas"/>
+          <w:sz w:val="19"/>
+          <w:szCs w:val="19"/>
+        </w:rPr>
+        <w:br/>
+        <w:t xml:space="preserve">5</w:t>
+      </w:r>
+    </w:p>
+    <w:p>
+      <w:pPr>
+        <w:pStyle w:val="Heading2"/>
+        <w:keepNext/>
+        <w:keepLines/>
+        <w:spacing w:after="120" w:before="280"/>
+      </w:pPr>
+      <w:r>
+        <w:t xml:space="preserve">In Schritten zählen: STEP</w:t>
+      </w:r>
+    </w:p>
+    <w:p>
+      <w:pPr>
+        <w:spacing w:after="180" w:line="312" w:lineRule="auto"/>
+      </w:pPr>
+      <w:r>
+        <w:rPr>
+          <w:sz w:val="22"/>
+          <w:szCs w:val="22"/>
+        </w:rPr>
+        <w:t xml:space="preserve">Standardmäßig zählt FOR in Einerschritten aufwärts. Mit STEP gibst du eine andere Schrittweite an – auch eine negative, um rückwärts zu zählen:</w:t>
+      </w:r>
+    </w:p>
+    <w:p>
+      <w:pPr>
+        <w:keepLines/>
+        <w:pBdr>
+          <w:left w:val="single" w:color="1B6CA8" w:sz="18" w:space="6"/>
+        </w:pBdr>
+        <w:shd w:fill="F4F4F4" w:val="clear"/>
+        <w:spacing w:after="200" w:before="100" w:line="264" w:lineRule="auto"/>
+        <w:ind w:left="140"/>
+      </w:pPr>
+      <w:r>
+        <w:rPr>
+          <w:rFonts w:ascii="Consolas" w:cs="Consolas" w:eastAsia="Consolas" w:hAnsi="Consolas"/>
+          <w:sz w:val="19"/>
+          <w:szCs w:val="19"/>
+        </w:rPr>
+        <w:t xml:space="preserve">DIM i AS INTEGER</w:t>
+      </w:r>
+      <w:r>
+        <w:rPr>
+          <w:rFonts w:ascii="Consolas" w:cs="Consolas" w:eastAsia="Consolas" w:hAnsi="Consolas"/>
+          <w:sz w:val="19"/>
+          <w:szCs w:val="19"/>
+        </w:rPr>
+        <w:br/>
+        <w:t xml:space="preserve">FOR i = 10 TO 0 STEP -2</w:t>
+      </w:r>
+      <w:r>
+        <w:rPr>
+          <w:rFonts w:ascii="Consolas" w:cs="Consolas" w:eastAsia="Consolas" w:hAnsi="Consolas"/>
+          <w:sz w:val="19"/>
+          <w:szCs w:val="19"/>
+        </w:rPr>
+        <w:br/>
+        <w:t xml:space="preserve">    PRINT i;</w:t>
+      </w:r>
+      <w:r>
+        <w:rPr>
+          <w:rFonts w:ascii="Consolas" w:cs="Consolas" w:eastAsia="Consolas" w:hAnsi="Consolas"/>
+          <w:sz w:val="19"/>
+          <w:szCs w:val="19"/>
+        </w:rPr>
+        <w:br/>
+        <w:t xml:space="preserve">    PRINT " ";</w:t>
+      </w:r>
+      <w:r>
+        <w:rPr>
+          <w:rFonts w:ascii="Consolas" w:cs="Consolas" w:eastAsia="Consolas" w:hAnsi="Consolas"/>
+          <w:sz w:val="19"/>
+          <w:szCs w:val="19"/>
+        </w:rPr>
+        <w:br/>
+        <w:t xml:space="preserve">NEXT</w:t>
+      </w:r>
+    </w:p>
+    <w:p>
+      <w:pPr>
+        <w:keepLines/>
+        <w:pBdr>
+          <w:left w:val="single" w:color="9AC79A" w:sz="18" w:space="6"/>
+        </w:pBdr>
+        <w:shd w:fill="EAF4EA" w:val="clear"/>
+        <w:spacing w:after="200" w:before="100" w:line="264" w:lineRule="auto"/>
+        <w:ind w:left="140"/>
+      </w:pPr>
+      <w:r>
+        <w:rPr>
+          <w:rFonts w:ascii="Consolas" w:cs="Consolas" w:eastAsia="Consolas" w:hAnsi="Consolas"/>
+          <w:sz w:val="19"/>
+          <w:szCs w:val="19"/>
+        </w:rPr>
+        <w:t xml:space="preserve">10 8 6 4 2 0</w:t>
+      </w:r>
+    </w:p>
+    <w:p>
+      <w:pPr>
+        <w:spacing w:before="60"/>
+      </w:pPr>
+    </w:p>
+    <w:tbl>
+      <w:tblPr>
+        <w:tblW w:type="dxa" w:w="9360"/>
+        <w:tblBorders>
+          <w:top w:val="single" w:color="auto" w:sz="4"/>
+          <w:left w:val="single" w:color="auto" w:sz="4"/>
+          <w:bottom w:val="single" w:color="auto" w:sz="4"/>
+          <w:right w:val="single" w:color="auto" w:sz="4"/>
+          <w:insideH w:val="single" w:color="auto" w:sz="4"/>
+          <w:insideV w:val="single" w:color="auto" w:sz="4"/>
+        </w:tblBorders>
+      </w:tblPr>
+      <w:tblGrid>
+        <w:gridCol w:w="9360"/>
+      </w:tblGrid>
+      <w:tr>
+        <w:trPr>
+          <w:cantSplit/>
+        </w:trPr>
+        <w:tc>
+          <w:tcPr>
+            <w:tcW w:type="dxa" w:w="9360"/>
+            <w:tcBorders>
+              <w:top w:val="single" w:color="E0A0A0" w:sz="6"/>
+              <w:left w:val="single" w:color="E0A0A0" w:sz="6"/>
+              <w:bottom w:val="single" w:color="E0A0A0" w:sz="6"/>
+              <w:right w:val="single" w:color="E0A0A0" w:sz="6"/>
+            </w:tcBorders>
+            <w:shd w:fill="FBEAEA" w:val="clear"/>
+            <w:tcMar>
+              <w:top w:type="dxa" w:w="140"/>
+              <w:left w:type="dxa" w:w="180"/>
+              <w:bottom w:type="dxa" w:w="140"/>
+              <w:right w:type="dxa" w:w="180"/>
+            </w:tcMar>
+          </w:tcPr>
+          <w:p>
+            <w:pPr>
+              <w:spacing w:after="40"/>
+            </w:pPr>
+            <w:r>
+              <w:rPr>
+                <w:b/>
+                <w:bCs/>
+                <w:color w:val="B23030"/>
+                <w:sz w:val="22"/>
+                <w:szCs w:val="22"/>
+              </w:rPr>
+              <w:t xml:space="preserve">Achtung</w:t>
+            </w:r>
+          </w:p>
+          <w:p>
+            <w:pPr>
+              <w:spacing w:after="0" w:line="312" w:lineRule="auto"/>
+            </w:pPr>
+            <w:r>
+              <w:rPr>
+                <w:sz w:val="22"/>
+                <w:szCs w:val="22"/>
+              </w:rPr>
+              <w:t xml:space="preserve">STEP ist ein Schlüsselwort. Nenne deine Zählvariable also nicht „step“ – nimm i, j, zaehler oder etwas Aussagekräftiges.</w:t>
+            </w:r>
+          </w:p>
+        </w:tc>
+      </w:tr>
+    </w:tbl>
+    <w:p>
+      <w:pPr>
+        <w:spacing w:after="160"/>
+      </w:pPr>
+    </w:p>
+    <w:p>
+      <w:pPr>
+        <w:pStyle w:val="Heading2"/>
+        <w:keepNext/>
+        <w:keepLines/>
+        <w:spacing w:after="120" w:before="280"/>
+      </w:pPr>
+      <w:r>
+        <w:t xml:space="preserve">Solange eine Bedingung gilt: WHILE ... WEND</w:t>
+      </w:r>
+    </w:p>
+    <w:p>
+      <w:pPr>
+        <w:spacing w:after="180" w:line="312" w:lineRule="auto"/>
+      </w:pPr>
+      <w:r>
+        <w:rPr>
+          <w:sz w:val="22"/>
+          <w:szCs w:val="22"/>
+        </w:rPr>
+        <w:t xml:space="preserve">Manchmal weißt du vorher nicht, wie oft etwas wiederholt werden muss – nur, unter welcher Bedingung. Die WHILE-Schleife prüft ihre Bedingung VOR jedem Durchlauf und läuft, solange sie wahr ist. Ist sie schon zu Beginn falsch, läuft der Block kein einziges Mal.</w:t>
+      </w:r>
+    </w:p>
+    <w:p>
+      <w:pPr>
+        <w:keepNext/>
+        <w:keepLines/>
+        <w:pBdr>
+          <w:bottom w:val="single" w:color="DDD0C0" w:sz="4" w:space="2"/>
+        </w:pBdr>
+        <w:spacing w:after="40" w:before="360"/>
+      </w:pPr>
+      <w:r>
+        <w:rPr>
+          <w:rFonts w:ascii="Consolas" w:cs="Consolas" w:eastAsia="Consolas" w:hAnsi="Consolas"/>
+          <w:b/>
+          <w:bCs/>
+          <w:color w:val="9A3412"/>
+          <w:sz w:val="24"/>
+          <w:szCs w:val="24"/>
+        </w:rPr>
+        <w:t xml:space="preserve">WHILE ... WEND</w:t>
+      </w:r>
+    </w:p>
+    <w:p>
+      <w:pPr>
+        <w:keepNext/>
+        <w:spacing w:after="120"/>
+      </w:pPr>
+      <w:r>
+        <w:rPr>
+          <w:b/>
+          <w:bCs/>
+          <w:color w:val="6A6A6A"/>
+          <w:sz w:val="18"/>
+          <w:szCs w:val="18"/>
+        </w:rPr>
+        <w:t xml:space="preserve">Syntax:  </w:t>
+      </w:r>
+      <w:r>
+        <w:rPr>
+          <w:rFonts w:ascii="Consolas" w:cs="Consolas" w:eastAsia="Consolas" w:hAnsi="Consolas"/>
+          <w:color w:val="335577"/>
+          <w:sz w:val="19"/>
+          <w:szCs w:val="19"/>
+        </w:rPr>
+        <w:t xml:space="preserve">WHILE bedingung
+    ...
+WEND</w:t>
+      </w:r>
+    </w:p>
+    <w:p>
+      <w:pPr>
+        <w:spacing w:after="180" w:line="312" w:lineRule="auto"/>
+      </w:pPr>
+      <w:r>
+        <w:rPr>
+          <w:sz w:val="22"/>
+          <w:szCs w:val="22"/>
+        </w:rPr>
+        <w:t xml:space="preserve">Wiederholt den Block, solange die Bedingung wahr ist. Die Prüfung erfolgt am Anfang jedes Durchlaufs. WEND schließt die Schleife ab.</w:t>
+      </w:r>
+    </w:p>
+    <w:p>
+      <w:pPr>
+        <w:keepNext/>
+        <w:spacing w:after="30" w:before="120"/>
+      </w:pPr>
+      <w:r>
+        <w:rPr>
+          <w:b/>
+          <w:bCs/>
+          <w:i/>
+          <w:iCs/>
+          <w:color w:val="6A6A6A"/>
+          <w:sz w:val="18"/>
+          <w:szCs w:val="18"/>
+        </w:rPr>
+        <w:t xml:space="preserve">Beispiel</w:t>
+      </w:r>
+    </w:p>
+    <w:p>
+      <w:pPr>
+        <w:keepLines/>
+        <w:pBdr>
+          <w:left w:val="single" w:color="1B6CA8" w:sz="18" w:space="6"/>
+        </w:pBdr>
+        <w:shd w:fill="F4F4F4" w:val="clear"/>
+        <w:spacing w:after="200" w:before="100" w:line="264" w:lineRule="auto"/>
+        <w:ind w:left="140"/>
+      </w:pPr>
+      <w:r>
+        <w:rPr>
+          <w:rFonts w:ascii="Consolas" w:cs="Consolas" w:eastAsia="Consolas" w:hAnsi="Consolas"/>
+          <w:sz w:val="19"/>
+          <w:szCs w:val="19"/>
+        </w:rPr>
+        <w:t xml:space="preserve">DIM n AS INTEGER</w:t>
+      </w:r>
+      <w:r>
+        <w:rPr>
+          <w:rFonts w:ascii="Consolas" w:cs="Consolas" w:eastAsia="Consolas" w:hAnsi="Consolas"/>
+          <w:sz w:val="19"/>
+          <w:szCs w:val="19"/>
+        </w:rPr>
+        <w:br/>
+        <w:t xml:space="preserve">n = 1</w:t>
+      </w:r>
+      <w:r>
+        <w:rPr>
+          <w:rFonts w:ascii="Consolas" w:cs="Consolas" w:eastAsia="Consolas" w:hAnsi="Consolas"/>
+          <w:sz w:val="19"/>
+          <w:szCs w:val="19"/>
+        </w:rPr>
+        <w:br/>
+        <w:t xml:space="preserve">WHILE n &lt;= 100</w:t>
+      </w:r>
+      <w:r>
+        <w:rPr>
+          <w:rFonts w:ascii="Consolas" w:cs="Consolas" w:eastAsia="Consolas" w:hAnsi="Consolas"/>
+          <w:sz w:val="19"/>
+          <w:szCs w:val="19"/>
+        </w:rPr>
+        <w:br/>
+        <w:t xml:space="preserve">    n = n * 2</w:t>
+      </w:r>
+      <w:r>
+        <w:rPr>
+          <w:rFonts w:ascii="Consolas" w:cs="Consolas" w:eastAsia="Consolas" w:hAnsi="Consolas"/>
+          <w:sz w:val="19"/>
+          <w:szCs w:val="19"/>
+        </w:rPr>
+        <w:br/>
+        <w:t xml:space="preserve">WEND</w:t>
+      </w:r>
+      <w:r>
+        <w:rPr>
+          <w:rFonts w:ascii="Consolas" w:cs="Consolas" w:eastAsia="Consolas" w:hAnsi="Consolas"/>
+          <w:sz w:val="19"/>
+          <w:szCs w:val="19"/>
+        </w:rPr>
+        <w:br/>
+        <w:t xml:space="preserve">PRINT n</w:t>
+      </w:r>
+    </w:p>
+    <w:p>
+      <w:pPr>
+        <w:keepNext/>
+        <w:spacing w:after="30" w:before="120"/>
+      </w:pPr>
+      <w:r>
+        <w:rPr>
+          <w:b/>
+          <w:bCs/>
+          <w:i/>
+          <w:iCs/>
+          <w:color w:val="6A6A6A"/>
+          <w:sz w:val="18"/>
+          <w:szCs w:val="18"/>
+        </w:rPr>
+        <w:t xml:space="preserve">Ausgabe</w:t>
+      </w:r>
+    </w:p>
+    <w:p>
+      <w:pPr>
+        <w:keepLines/>
+        <w:pBdr>
+          <w:left w:val="single" w:color="9AC79A" w:sz="18" w:space="6"/>
+        </w:pBdr>
+        <w:shd w:fill="EAF4EA" w:val="clear"/>
+        <w:spacing w:after="200" w:before="100" w:line="264" w:lineRule="auto"/>
+        <w:ind w:left="140"/>
+      </w:pPr>
+      <w:r>
+        <w:rPr>
+          <w:rFonts w:ascii="Consolas" w:cs="Consolas" w:eastAsia="Consolas" w:hAnsi="Consolas"/>
+          <w:sz w:val="19"/>
+          <w:szCs w:val="19"/>
+        </w:rPr>
+        <w:t xml:space="preserve">128</w:t>
+      </w:r>
+    </w:p>
+    <w:p>
+      <w:pPr>
+        <w:spacing w:before="60"/>
+      </w:pPr>
+    </w:p>
+    <w:tbl>
+      <w:tblPr>
+        <w:tblW w:type="dxa" w:w="9360"/>
+        <w:tblBorders>
+          <w:top w:val="single" w:color="auto" w:sz="4"/>
+          <w:left w:val="single" w:color="auto" w:sz="4"/>
+          <w:bottom w:val="single" w:color="auto" w:sz="4"/>
+          <w:right w:val="single" w:color="auto" w:sz="4"/>
+          <w:insideH w:val="single" w:color="auto" w:sz="4"/>
+          <w:insideV w:val="single" w:color="auto" w:sz="4"/>
+        </w:tblBorders>
+      </w:tblPr>
+      <w:tblGrid>
+        <w:gridCol w:w="9360"/>
+      </w:tblGrid>
+      <w:tr>
+        <w:trPr>
+          <w:cantSplit/>
+        </w:trPr>
+        <w:tc>
+          <w:tcPr>
+            <w:tcW w:type="dxa" w:w="9360"/>
+            <w:tcBorders>
+              <w:top w:val="single" w:color="E0A0A0" w:sz="6"/>
+              <w:left w:val="single" w:color="E0A0A0" w:sz="6"/>
+              <w:bottom w:val="single" w:color="E0A0A0" w:sz="6"/>
+              <w:right w:val="single" w:color="E0A0A0" w:sz="6"/>
+            </w:tcBorders>
+            <w:shd w:fill="FBEAEA" w:val="clear"/>
+            <w:tcMar>
+              <w:top w:type="dxa" w:w="140"/>
+              <w:left w:type="dxa" w:w="180"/>
+              <w:bottom w:type="dxa" w:w="140"/>
+              <w:right w:type="dxa" w:w="180"/>
+            </w:tcMar>
+          </w:tcPr>
+          <w:p>
+            <w:pPr>
+              <w:spacing w:after="40"/>
+            </w:pPr>
+            <w:r>
+              <w:rPr>
+                <w:b/>
+                <w:bCs/>
+                <w:color w:val="B23030"/>
+                <w:sz w:val="22"/>
+                <w:szCs w:val="22"/>
+              </w:rPr>
+              <w:t xml:space="preserve">Achtung</w:t>
+            </w:r>
+          </w:p>
+          <w:p>
+            <w:pPr>
+              <w:spacing w:after="0" w:line="312" w:lineRule="auto"/>
+            </w:pPr>
+            <w:r>
+              <w:rPr>
+                <w:sz w:val="22"/>
+                <w:szCs w:val="22"/>
+              </w:rPr>
+              <w:t xml:space="preserve">Achte darauf, dass sich in der Schleife etwas verändert, das die Bedingung irgendwann falsch macht – sonst läuft die Schleife endlos und dein Programm hängt. Im Beispiel verdoppelt n sich jedes Mal und überschreitet schließlich 100.</w:t>
+            </w:r>
+          </w:p>
+        </w:tc>
+      </w:tr>
+    </w:tbl>
+    <w:p>
+      <w:pPr>
+        <w:spacing w:after="160"/>
+      </w:pPr>
+    </w:p>
+    <w:p>
+      <w:pPr>
+        <w:pStyle w:val="Heading2"/>
+        <w:keepNext/>
+        <w:keepLines/>
+        <w:spacing w:after="120" w:before="280"/>
+      </w:pPr>
+      <w:r>
+        <w:t xml:space="preserve">Mindestens einmal: REPEAT ... UNTIL</w:t>
+      </w:r>
+    </w:p>
+    <w:p>
+      <w:pPr>
+        <w:spacing w:after="180" w:line="312" w:lineRule="auto"/>
+      </w:pPr>
+      <w:r>
+        <w:rPr>
+          <w:sz w:val="22"/>
+          <w:szCs w:val="22"/>
+        </w:rPr>
+        <w:t xml:space="preserve">Die REPEAT-Schleife ist das Gegenstück zu WHILE: Sie prüft ihre Bedingung erst am ENDE. Dadurch läuft der Block garantiert mindestens einmal – ideal, wenn du etwas zuerst tun und dann erst entscheiden willst, ob du es wiederholst (etwa „würfeln, bis eine Drei fällt“).</w:t>
+      </w:r>
+    </w:p>
+    <w:p>
+      <w:pPr>
+        <w:keepNext/>
+        <w:keepLines/>
+        <w:pBdr>
+          <w:bottom w:val="single" w:color="DDD0C0" w:sz="4" w:space="2"/>
+        </w:pBdr>
+        <w:spacing w:after="40" w:before="360"/>
+      </w:pPr>
+      <w:r>
+        <w:rPr>
+          <w:rFonts w:ascii="Consolas" w:cs="Consolas" w:eastAsia="Consolas" w:hAnsi="Consolas"/>
+          <w:b/>
+          <w:bCs/>
+          <w:color w:val="9A3412"/>
+          <w:sz w:val="24"/>
+          <w:szCs w:val="24"/>
+        </w:rPr>
+        <w:t xml:space="preserve">REPEAT ... UNTIL</w:t>
+      </w:r>
+    </w:p>
+    <w:p>
+      <w:pPr>
+        <w:keepNext/>
+        <w:spacing w:after="120"/>
+      </w:pPr>
+      <w:r>
+        <w:rPr>
+          <w:b/>
+          <w:bCs/>
+          <w:color w:val="6A6A6A"/>
+          <w:sz w:val="18"/>
+          <w:szCs w:val="18"/>
+        </w:rPr>
+        <w:t xml:space="preserve">Syntax:  </w:t>
+      </w:r>
+      <w:r>
+        <w:rPr>
+          <w:rFonts w:ascii="Consolas" w:cs="Consolas" w:eastAsia="Consolas" w:hAnsi="Consolas"/>
+          <w:color w:val="335577"/>
+          <w:sz w:val="19"/>
+          <w:szCs w:val="19"/>
+        </w:rPr>
+        <w:t xml:space="preserve">REPEAT
+    ...
+UNTIL bedingung</w:t>
+      </w:r>
+    </w:p>
+    <w:p>
+      <w:pPr>
+        <w:spacing w:after="180" w:line="312" w:lineRule="auto"/>
+      </w:pPr>
+      <w:r>
+        <w:rPr>
+          <w:sz w:val="22"/>
+          <w:szCs w:val="22"/>
+        </w:rPr>
+        <w:t xml:space="preserve">Wiederholt den Block, bis die Bedingung wahr wird. Die Prüfung erfolgt am Ende – der Block läuft also immer mindestens einmal.</w:t>
+      </w:r>
+    </w:p>
+    <w:p>
+      <w:pPr>
+        <w:keepNext/>
+        <w:spacing w:after="30" w:before="120"/>
+      </w:pPr>
+      <w:r>
+        <w:rPr>
+          <w:b/>
+          <w:bCs/>
+          <w:i/>
+          <w:iCs/>
+          <w:color w:val="6A6A6A"/>
+          <w:sz w:val="18"/>
+          <w:szCs w:val="18"/>
+        </w:rPr>
+        <w:t xml:space="preserve">Beispiel</w:t>
+      </w:r>
+    </w:p>
+    <w:p>
+      <w:pPr>
+        <w:keepLines/>
+        <w:pBdr>
+          <w:left w:val="single" w:color="1B6CA8" w:sz="18" w:space="6"/>
+        </w:pBdr>
+        <w:shd w:fill="F4F4F4" w:val="clear"/>
+        <w:spacing w:after="200" w:before="100" w:line="264" w:lineRule="auto"/>
+        <w:ind w:left="140"/>
+      </w:pPr>
+      <w:r>
+        <w:rPr>
+          <w:rFonts w:ascii="Consolas" w:cs="Consolas" w:eastAsia="Consolas" w:hAnsi="Consolas"/>
+          <w:sz w:val="19"/>
+          <w:szCs w:val="19"/>
+        </w:rPr>
+        <w:t xml:space="preserve">DIM wurf AS INTEGER</w:t>
+      </w:r>
+      <w:r>
+        <w:rPr>
+          <w:rFonts w:ascii="Consolas" w:cs="Consolas" w:eastAsia="Consolas" w:hAnsi="Consolas"/>
+          <w:sz w:val="19"/>
+          <w:szCs w:val="19"/>
+        </w:rPr>
+        <w:br/>
+        <w:t xml:space="preserve">wurf = 0</w:t>
+      </w:r>
+      <w:r>
+        <w:rPr>
+          <w:rFonts w:ascii="Consolas" w:cs="Consolas" w:eastAsia="Consolas" w:hAnsi="Consolas"/>
+          <w:sz w:val="19"/>
+          <w:szCs w:val="19"/>
+        </w:rPr>
+        <w:br/>
+        <w:t xml:space="preserve">REPEAT</w:t>
+      </w:r>
+      <w:r>
+        <w:rPr>
+          <w:rFonts w:ascii="Consolas" w:cs="Consolas" w:eastAsia="Consolas" w:hAnsi="Consolas"/>
+          <w:sz w:val="19"/>
+          <w:szCs w:val="19"/>
+        </w:rPr>
+        <w:br/>
+        <w:t xml:space="preserve">    wurf = wurf + 1</w:t>
+      </w:r>
+      <w:r>
+        <w:rPr>
+          <w:rFonts w:ascii="Consolas" w:cs="Consolas" w:eastAsia="Consolas" w:hAnsi="Consolas"/>
+          <w:sz w:val="19"/>
+          <w:szCs w:val="19"/>
+        </w:rPr>
+        <w:br/>
+        <w:t xml:space="preserve">UNTIL wurf &gt;= 3</w:t>
+      </w:r>
+      <w:r>
+        <w:rPr>
+          <w:rFonts w:ascii="Consolas" w:cs="Consolas" w:eastAsia="Consolas" w:hAnsi="Consolas"/>
+          <w:sz w:val="19"/>
+          <w:szCs w:val="19"/>
+        </w:rPr>
+        <w:br/>
+        <w:t xml:space="preserve">PRINT "Würfe: "; wurf</w:t>
+      </w:r>
+    </w:p>
+    <w:p>
+      <w:pPr>
+        <w:keepNext/>
+        <w:spacing w:after="30" w:before="120"/>
+      </w:pPr>
+      <w:r>
+        <w:rPr>
+          <w:b/>
+          <w:bCs/>
+          <w:i/>
+          <w:iCs/>
+          <w:color w:val="6A6A6A"/>
+          <w:sz w:val="18"/>
+          <w:szCs w:val="18"/>
+        </w:rPr>
+        <w:t xml:space="preserve">Ausgabe</w:t>
+      </w:r>
+    </w:p>
+    <w:p>
+      <w:pPr>
+        <w:keepLines/>
+        <w:pBdr>
+          <w:left w:val="single" w:color="9AC79A" w:sz="18" w:space="6"/>
+        </w:pBdr>
+        <w:shd w:fill="EAF4EA" w:val="clear"/>
+        <w:spacing w:after="200" w:before="100" w:line="264" w:lineRule="auto"/>
+        <w:ind w:left="140"/>
+      </w:pPr>
+      <w:r>
+        <w:rPr>
+          <w:rFonts w:ascii="Consolas" w:cs="Consolas" w:eastAsia="Consolas" w:hAnsi="Consolas"/>
+          <w:sz w:val="19"/>
+          <w:szCs w:val="19"/>
+        </w:rPr>
+        <w:t xml:space="preserve">Würfe: 3</w:t>
+      </w:r>
+    </w:p>
+    <w:p>
+      <w:pPr>
+        <w:spacing w:before="60"/>
+      </w:pPr>
+    </w:p>
+    <w:tbl>
+      <w:tblPr>
+        <w:tblW w:type="dxa" w:w="9360"/>
+        <w:tblBorders>
+          <w:top w:val="single" w:color="auto" w:sz="4"/>
+          <w:left w:val="single" w:color="auto" w:sz="4"/>
+          <w:bottom w:val="single" w:color="auto" w:sz="4"/>
+          <w:right w:val="single" w:color="auto" w:sz="4"/>
+          <w:insideH w:val="single" w:color="auto" w:sz="4"/>
+          <w:insideV w:val="single" w:color="auto" w:sz="4"/>
+        </w:tblBorders>
+      </w:tblPr>
+      <w:tblGrid>
+        <w:gridCol w:w="9360"/>
+      </w:tblGrid>
+      <w:tr>
+        <w:trPr>
+          <w:cantSplit/>
+        </w:trPr>
+        <w:tc>
+          <w:tcPr>
+            <w:tcW w:type="dxa" w:w="9360"/>
+            <w:tcBorders>
+              <w:top w:val="single" w:color="E0B96A" w:sz="6"/>
+              <w:left w:val="single" w:color="E0B96A" w:sz="6"/>
+              <w:bottom w:val="single" w:color="E0B96A" w:sz="6"/>
+              <w:right w:val="single" w:color="E0B96A" w:sz="6"/>
+            </w:tcBorders>
+            <w:shd w:fill="FDF3E0" w:val="clear"/>
+            <w:tcMar>
+              <w:top w:type="dxa" w:w="140"/>
+              <w:left w:type="dxa" w:w="180"/>
+              <w:bottom w:type="dxa" w:w="140"/>
+              <w:right w:type="dxa" w:w="180"/>
+            </w:tcMar>
+          </w:tcPr>
+          <w:p>
+            <w:pPr>
+              <w:spacing w:after="40"/>
+            </w:pPr>
+            <w:r>
+              <w:rPr>
+                <w:b/>
+                <w:bCs/>
+                <w:color w:val="9A6A1E"/>
+                <w:sz w:val="22"/>
+                <w:szCs w:val="22"/>
+              </w:rPr>
+              <w:t xml:space="preserve">Merke</w:t>
+            </w:r>
+          </w:p>
+          <w:p>
+            <w:pPr>
+              <w:spacing w:after="0" w:line="312" w:lineRule="auto"/>
+            </w:pPr>
+            <w:r>
+              <w:rPr>
+                <w:sz w:val="22"/>
+                <w:szCs w:val="22"/>
+              </w:rPr>
+              <w:t xml:space="preserve">Der Unterschied auf einen Blick: WHILE prüft VORHER (läuft evtl. nie), REPEAT prüft NACHHER (läuft mindestens einmal). Und Vorsicht beim Wort: WHILE läuft, solange die Bedingung WAHR ist – REPEAT läuft, BIS sie wahr wird.</w:t>
+            </w:r>
+          </w:p>
+        </w:tc>
+      </w:tr>
+    </w:tbl>
+    <w:p>
+      <w:pPr>
+        <w:spacing w:after="160"/>
+      </w:pPr>
+    </w:p>
+    <w:p>
+      <w:pPr>
+        <w:pStyle w:val="Heading2"/>
+        <w:keepNext/>
+        <w:keepLines/>
+        <w:spacing w:after="120" w:before="280"/>
+      </w:pPr>
+      <w:r>
+        <w:t xml:space="preserve">Über eine Sammlung: FOR EACH</w:t>
+      </w:r>
+    </w:p>
+    <w:p>
+      <w:pPr>
+        <w:spacing w:after="180" w:line="312" w:lineRule="auto"/>
+      </w:pPr>
+      <w:r>
+        <w:rPr>
+          <w:sz w:val="22"/>
+          <w:szCs w:val="22"/>
+        </w:rPr>
+        <w:t xml:space="preserve">Sehr oft willst du nicht Zahlen hochzählen, sondern jedes Element einer Sammlung der Reihe nach bearbeiten – alle Namen in einer Liste, alle Buchstaben eines Wortes, alle Gegner im Spiel. Dafür ist FOR EACH gemacht: Es reicht dir bei jedem Durchlauf direkt das nächste Element.</w:t>
+      </w:r>
+    </w:p>
+    <w:p>
+      <w:pPr>
+        <w:keepNext/>
+        <w:keepLines/>
+        <w:pBdr>
+          <w:bottom w:val="single" w:color="DDD0C0" w:sz="4" w:space="2"/>
+        </w:pBdr>
+        <w:spacing w:after="40" w:before="360"/>
+      </w:pPr>
+      <w:r>
+        <w:rPr>
+          <w:rFonts w:ascii="Consolas" w:cs="Consolas" w:eastAsia="Consolas" w:hAnsi="Consolas"/>
+          <w:b/>
+          <w:bCs/>
+          <w:color w:val="9A3412"/>
+          <w:sz w:val="24"/>
+          <w:szCs w:val="24"/>
+        </w:rPr>
+        <w:t xml:space="preserve">FOR EACH ... NEXT</w:t>
+      </w:r>
+    </w:p>
+    <w:p>
+      <w:pPr>
+        <w:keepNext/>
+        <w:spacing w:after="120"/>
+      </w:pPr>
+      <w:r>
+        <w:rPr>
+          <w:b/>
+          <w:bCs/>
+          <w:color w:val="6A6A6A"/>
+          <w:sz w:val="18"/>
+          <w:szCs w:val="18"/>
+        </w:rPr>
+        <w:t xml:space="preserve">Syntax:  </w:t>
+      </w:r>
+      <w:r>
+        <w:rPr>
+          <w:rFonts w:ascii="Consolas" w:cs="Consolas" w:eastAsia="Consolas" w:hAnsi="Consolas"/>
+          <w:color w:val="335577"/>
+          <w:sz w:val="19"/>
+          <w:szCs w:val="19"/>
+        </w:rPr>
+        <w:t xml:space="preserve">FOR EACH var IN sammlung
+    ...
+NEXT</w:t>
+      </w:r>
+    </w:p>
+    <w:p>
+      <w:pPr>
+        <w:spacing w:after="180" w:line="312" w:lineRule="auto"/>
+      </w:pPr>
+      <w:r>
+        <w:rPr>
+          <w:sz w:val="22"/>
+          <w:szCs w:val="22"/>
+        </w:rPr>
+        <w:t xml:space="preserve">Durchläuft jedes Element der Sammlung und legt es nacheinander in var ab. Funktioniert mit Tupeln, Arrays, den Zeichen eines Strings und den Schlüsseln einer Map (diese Sammlungen lernst du in den folgenden Kapiteln kennen).</w:t>
+      </w:r>
+    </w:p>
+    <w:p>
+      <w:pPr>
+        <w:keepNext/>
+        <w:spacing w:after="30" w:before="120"/>
+      </w:pPr>
+      <w:r>
+        <w:rPr>
+          <w:b/>
+          <w:bCs/>
+          <w:i/>
+          <w:iCs/>
+          <w:color w:val="6A6A6A"/>
+          <w:sz w:val="18"/>
+          <w:szCs w:val="18"/>
+        </w:rPr>
+        <w:t xml:space="preserve">Beispiel</w:t>
+      </w:r>
+    </w:p>
+    <w:p>
+      <w:pPr>
+        <w:keepLines/>
+        <w:pBdr>
+          <w:left w:val="single" w:color="1B6CA8" w:sz="18" w:space="6"/>
+        </w:pBdr>
+        <w:shd w:fill="F4F4F4" w:val="clear"/>
+        <w:spacing w:after="200" w:before="100" w:line="264" w:lineRule="auto"/>
+        <w:ind w:left="140"/>
+      </w:pPr>
+      <w:r>
+        <w:rPr>
+          <w:rFonts w:ascii="Consolas" w:cs="Consolas" w:eastAsia="Consolas" w:hAnsi="Consolas"/>
+          <w:sz w:val="19"/>
+          <w:szCs w:val="19"/>
+        </w:rPr>
+        <w:t xml:space="preserve">DIM namen AS TUPLE</w:t>
+      </w:r>
+      <w:r>
+        <w:rPr>
+          <w:rFonts w:ascii="Consolas" w:cs="Consolas" w:eastAsia="Consolas" w:hAnsi="Consolas"/>
+          <w:sz w:val="19"/>
+          <w:szCs w:val="19"/>
+        </w:rPr>
+        <w:br/>
+        <w:t xml:space="preserve">namen = ("Anna", "Bert", "Cilly")</w:t>
+      </w:r>
+      <w:r>
+        <w:rPr>
+          <w:rFonts w:ascii="Consolas" w:cs="Consolas" w:eastAsia="Consolas" w:hAnsi="Consolas"/>
+          <w:sz w:val="19"/>
+          <w:szCs w:val="19"/>
+        </w:rPr>
+        <w:br/>
+        <w:t xml:space="preserve">FOR EACH name IN namen</w:t>
+      </w:r>
+      <w:r>
+        <w:rPr>
+          <w:rFonts w:ascii="Consolas" w:cs="Consolas" w:eastAsia="Consolas" w:hAnsi="Consolas"/>
+          <w:sz w:val="19"/>
+          <w:szCs w:val="19"/>
+        </w:rPr>
+        <w:br/>
+        <w:t xml:space="preserve">    PRINT name</w:t>
+      </w:r>
+      <w:r>
+        <w:rPr>
+          <w:rFonts w:ascii="Consolas" w:cs="Consolas" w:eastAsia="Consolas" w:hAnsi="Consolas"/>
+          <w:sz w:val="19"/>
+          <w:szCs w:val="19"/>
+        </w:rPr>
+        <w:br/>
+        <w:t xml:space="preserve">NEXT</w:t>
+      </w:r>
+    </w:p>
+    <w:p>
+      <w:pPr>
+        <w:keepNext/>
+        <w:spacing w:after="30" w:before="120"/>
+      </w:pPr>
+      <w:r>
+        <w:rPr>
+          <w:b/>
+          <w:bCs/>
+          <w:i/>
+          <w:iCs/>
+          <w:color w:val="6A6A6A"/>
+          <w:sz w:val="18"/>
+          <w:szCs w:val="18"/>
+        </w:rPr>
+        <w:t xml:space="preserve">Ausgabe</w:t>
+      </w:r>
+    </w:p>
+    <w:p>
+      <w:pPr>
+        <w:keepLines/>
+        <w:pBdr>
+          <w:left w:val="single" w:color="9AC79A" w:sz="18" w:space="6"/>
+        </w:pBdr>
+        <w:shd w:fill="EAF4EA" w:val="clear"/>
+        <w:spacing w:after="200" w:before="100" w:line="264" w:lineRule="auto"/>
+        <w:ind w:left="140"/>
+      </w:pPr>
+      <w:r>
+        <w:rPr>
+          <w:rFonts w:ascii="Consolas" w:cs="Consolas" w:eastAsia="Consolas" w:hAnsi="Consolas"/>
+          <w:sz w:val="19"/>
+          <w:szCs w:val="19"/>
+        </w:rPr>
+        <w:t xml:space="preserve">Anna</w:t>
+      </w:r>
+      <w:r>
+        <w:rPr>
+          <w:rFonts w:ascii="Consolas" w:cs="Consolas" w:eastAsia="Consolas" w:hAnsi="Consolas"/>
+          <w:sz w:val="19"/>
+          <w:szCs w:val="19"/>
+        </w:rPr>
+        <w:br/>
+        <w:t xml:space="preserve">Bert</w:t>
+      </w:r>
+      <w:r>
+        <w:rPr>
+          <w:rFonts w:ascii="Consolas" w:cs="Consolas" w:eastAsia="Consolas" w:hAnsi="Consolas"/>
+          <w:sz w:val="19"/>
+          <w:szCs w:val="19"/>
+        </w:rPr>
+        <w:br/>
+        <w:t xml:space="preserve">Cilly</w:t>
+      </w:r>
+    </w:p>
+    <w:p>
+      <w:pPr>
+        <w:pStyle w:val="Heading2"/>
+        <w:keepNext/>
+        <w:keepLines/>
+        <w:spacing w:after="120" w:before="280"/>
+      </w:pPr>
+      <w:r>
+        <w:t xml:space="preserve">Eingreifen: BREAK und CONTINUE</w:t>
+      </w:r>
+    </w:p>
+    <w:p>
+      <w:pPr>
+        <w:spacing w:after="180" w:line="312" w:lineRule="auto"/>
+      </w:pPr>
+      <w:r>
+        <w:rPr>
+          <w:sz w:val="22"/>
+          <w:szCs w:val="22"/>
+        </w:rPr>
+        <w:t xml:space="preserve">Zwei kleine Befehle geben dir mitten in einer Schleife die Kontrolle zurück. Sie funktionieren in allen vier Schleifenarten:</w:t>
+      </w:r>
+    </w:p>
+    <w:p>
+      <w:pPr>
+        <w:pStyle w:val="ListParagraph"/>
+        <w:numPr>
+          <w:ilvl w:val="0"/>
+          <w:numId w:val="2"/>
+        </w:numPr>
+        <w:spacing w:after="100" w:line="312" w:lineRule="auto"/>
+      </w:pPr>
+      <w:r>
+        <w:rPr>
+          <w:b/>
+          <w:bCs/>
+          <w:sz w:val="22"/>
+          <w:szCs w:val="22"/>
+        </w:rPr>
+        <w:t xml:space="preserve">BREAK   </w:t>
+      </w:r>
+      <w:r>
+        <w:rPr>
+          <w:sz w:val="22"/>
+          <w:szCs w:val="22"/>
+        </w:rPr>
+        <w:t xml:space="preserve">bricht die Schleife sofort ganz ab und springt hinter das NEXT bzw. WEND.</w:t>
+      </w:r>
+    </w:p>
+    <w:p>
+      <w:pPr>
+        <w:pStyle w:val="ListParagraph"/>
+        <w:numPr>
+          <w:ilvl w:val="0"/>
+          <w:numId w:val="2"/>
+        </w:numPr>
+        <w:spacing w:after="100" w:line="312" w:lineRule="auto"/>
+      </w:pPr>
+      <w:r>
+        <w:rPr>
+          <w:b/>
+          <w:bCs/>
+          <w:sz w:val="22"/>
+          <w:szCs w:val="22"/>
+        </w:rPr>
+        <w:t xml:space="preserve">CONTINUE   </w:t>
+      </w:r>
+      <w:r>
+        <w:rPr>
+          <w:sz w:val="22"/>
+          <w:szCs w:val="22"/>
+        </w:rPr>
+        <w:t xml:space="preserve">überspringt den Rest des aktuellen Durchlaufs und macht sofort mit dem nächsten weiter.</w:t>
+      </w:r>
+    </w:p>
+    <w:p>
+      <w:pPr>
+        <w:keepLines/>
+        <w:pBdr>
+          <w:left w:val="single" w:color="1B6CA8" w:sz="18" w:space="6"/>
+        </w:pBdr>
+        <w:shd w:fill="F4F4F4" w:val="clear"/>
+        <w:spacing w:after="200" w:before="100" w:line="264" w:lineRule="auto"/>
+        <w:ind w:left="140"/>
+      </w:pPr>
+      <w:r>
+        <w:rPr>
+          <w:rFonts w:ascii="Consolas" w:cs="Consolas" w:eastAsia="Consolas" w:hAnsi="Consolas"/>
+          <w:sz w:val="19"/>
+          <w:szCs w:val="19"/>
+        </w:rPr>
+        <w:t xml:space="preserve">DIM i AS INTEGER</w:t>
+      </w:r>
+      <w:r>
+        <w:rPr>
+          <w:rFonts w:ascii="Consolas" w:cs="Consolas" w:eastAsia="Consolas" w:hAnsi="Consolas"/>
+          <w:sz w:val="19"/>
+          <w:szCs w:val="19"/>
+        </w:rPr>
+        <w:br/>
+        <w:t xml:space="preserve">FOR i = 1 TO 10</w:t>
+      </w:r>
+      <w:r>
+        <w:rPr>
+          <w:rFonts w:ascii="Consolas" w:cs="Consolas" w:eastAsia="Consolas" w:hAnsi="Consolas"/>
+          <w:sz w:val="19"/>
+          <w:szCs w:val="19"/>
+        </w:rPr>
+        <w:br/>
+        <w:t xml:space="preserve">    IF i MOD 2 = 0 THEN CONTINUE</w:t>
+      </w:r>
+      <w:r>
+        <w:rPr>
+          <w:rFonts w:ascii="Consolas" w:cs="Consolas" w:eastAsia="Consolas" w:hAnsi="Consolas"/>
+          <w:sz w:val="19"/>
+          <w:szCs w:val="19"/>
+        </w:rPr>
+        <w:br/>
+        <w:t xml:space="preserve">    IF i &gt; 7 THEN BREAK</w:t>
+      </w:r>
+      <w:r>
+        <w:rPr>
+          <w:rFonts w:ascii="Consolas" w:cs="Consolas" w:eastAsia="Consolas" w:hAnsi="Consolas"/>
+          <w:sz w:val="19"/>
+          <w:szCs w:val="19"/>
+        </w:rPr>
+        <w:br/>
+        <w:t xml:space="preserve">    PRINT i;</w:t>
+      </w:r>
+      <w:r>
+        <w:rPr>
+          <w:rFonts w:ascii="Consolas" w:cs="Consolas" w:eastAsia="Consolas" w:hAnsi="Consolas"/>
+          <w:sz w:val="19"/>
+          <w:szCs w:val="19"/>
+        </w:rPr>
+        <w:br/>
+        <w:t xml:space="preserve">    PRINT " ";</w:t>
+      </w:r>
+      <w:r>
+        <w:rPr>
+          <w:rFonts w:ascii="Consolas" w:cs="Consolas" w:eastAsia="Consolas" w:hAnsi="Consolas"/>
+          <w:sz w:val="19"/>
+          <w:szCs w:val="19"/>
+        </w:rPr>
+        <w:br/>
+        <w:t xml:space="preserve">NEXT</w:t>
+      </w:r>
+    </w:p>
+    <w:p>
+      <w:pPr>
+        <w:keepLines/>
+        <w:pBdr>
+          <w:left w:val="single" w:color="9AC79A" w:sz="18" w:space="6"/>
+        </w:pBdr>
+        <w:shd w:fill="EAF4EA" w:val="clear"/>
+        <w:spacing w:after="200" w:before="100" w:line="264" w:lineRule="auto"/>
+        <w:ind w:left="140"/>
+      </w:pPr>
+      <w:r>
+        <w:rPr>
+          <w:rFonts w:ascii="Consolas" w:cs="Consolas" w:eastAsia="Consolas" w:hAnsi="Consolas"/>
+          <w:sz w:val="19"/>
+          <w:szCs w:val="19"/>
+        </w:rPr>
+        <w:t xml:space="preserve">1 3 5 7</w:t>
+      </w:r>
+    </w:p>
+    <w:p>
+      <w:pPr>
+        <w:spacing w:after="180" w:line="312" w:lineRule="auto"/>
+      </w:pPr>
+      <w:r>
+        <w:rPr>
+          <w:sz w:val="22"/>
+          <w:szCs w:val="22"/>
+        </w:rPr>
+        <w:t xml:space="preserve">Hier überspringt CONTINUE alle geraden Zahlen, und sobald i über 7 steigt, beendet BREAK die Schleife – ausgegeben werden also nur die ungeraden Zahlen bis 7.</w:t>
+      </w:r>
+    </w:p>
+    <w:p>
+      <w:pPr>
+        <w:pStyle w:val="Heading2"/>
+        <w:keepNext/>
+        <w:keepLines/>
+        <w:spacing w:after="120" w:before="280"/>
+      </w:pPr>
+      <w:r>
+        <w:t xml:space="preserve">Schleifen verschachteln</w:t>
+      </w:r>
+    </w:p>
+    <w:p>
+      <w:pPr>
+        <w:spacing w:after="180" w:line="312" w:lineRule="auto"/>
+      </w:pPr>
+      <w:r>
+        <w:rPr>
+          <w:sz w:val="22"/>
+          <w:szCs w:val="22"/>
+        </w:rPr>
+        <w:t xml:space="preserve">Du darfst Schleifen ineinander setzen. Für jeden Durchlauf der äußeren Schleife läuft die innere komplett durch. So baust du zum Beispiel ein Gitter, ein kleines Einmaleins oder zeichnest später eine Kachelkarte Reihe für Reihe:</w:t>
+      </w:r>
+    </w:p>
+    <w:p>
+      <w:pPr>
+        <w:keepLines/>
+        <w:pBdr>
+          <w:left w:val="single" w:color="1B6CA8" w:sz="18" w:space="6"/>
+        </w:pBdr>
+        <w:shd w:fill="F4F4F4" w:val="clear"/>
+        <w:spacing w:after="200" w:before="100" w:line="264" w:lineRule="auto"/>
+        <w:ind w:left="140"/>
+      </w:pPr>
+      <w:r>
+        <w:rPr>
+          <w:rFonts w:ascii="Consolas" w:cs="Consolas" w:eastAsia="Consolas" w:hAnsi="Consolas"/>
+          <w:sz w:val="19"/>
+          <w:szCs w:val="19"/>
+        </w:rPr>
+        <w:t xml:space="preserve">DIM zeile AS INTEGER</w:t>
+      </w:r>
+      <w:r>
+        <w:rPr>
+          <w:rFonts w:ascii="Consolas" w:cs="Consolas" w:eastAsia="Consolas" w:hAnsi="Consolas"/>
+          <w:sz w:val="19"/>
+          <w:szCs w:val="19"/>
+        </w:rPr>
+        <w:br/>
+        <w:t xml:space="preserve">DIM spalte AS INTEGER</w:t>
+      </w:r>
+      <w:r>
+        <w:rPr>
+          <w:rFonts w:ascii="Consolas" w:cs="Consolas" w:eastAsia="Consolas" w:hAnsi="Consolas"/>
+          <w:sz w:val="19"/>
+          <w:szCs w:val="19"/>
+        </w:rPr>
+        <w:br/>
+        <w:t xml:space="preserve">FOR zeile = 1 TO 3</w:t>
+      </w:r>
+      <w:r>
+        <w:rPr>
+          <w:rFonts w:ascii="Consolas" w:cs="Consolas" w:eastAsia="Consolas" w:hAnsi="Consolas"/>
+          <w:sz w:val="19"/>
+          <w:szCs w:val="19"/>
+        </w:rPr>
+        <w:br/>
+        <w:t xml:space="preserve">    FOR spalte = 1 TO 3</w:t>
+      </w:r>
+      <w:r>
+        <w:rPr>
+          <w:rFonts w:ascii="Consolas" w:cs="Consolas" w:eastAsia="Consolas" w:hAnsi="Consolas"/>
+          <w:sz w:val="19"/>
+          <w:szCs w:val="19"/>
+        </w:rPr>
+        <w:br/>
+        <w:t xml:space="preserve">        PRINT zeile * spalte;</w:t>
+      </w:r>
+      <w:r>
+        <w:rPr>
+          <w:rFonts w:ascii="Consolas" w:cs="Consolas" w:eastAsia="Consolas" w:hAnsi="Consolas"/>
+          <w:sz w:val="19"/>
+          <w:szCs w:val="19"/>
+        </w:rPr>
+        <w:br/>
+        <w:t xml:space="preserve">        PRINT " ";</w:t>
+      </w:r>
+      <w:r>
+        <w:rPr>
+          <w:rFonts w:ascii="Consolas" w:cs="Consolas" w:eastAsia="Consolas" w:hAnsi="Consolas"/>
+          <w:sz w:val="19"/>
+          <w:szCs w:val="19"/>
+        </w:rPr>
+        <w:br/>
+        <w:t xml:space="preserve">    NEXT</w:t>
+      </w:r>
+      <w:r>
+        <w:rPr>
+          <w:rFonts w:ascii="Consolas" w:cs="Consolas" w:eastAsia="Consolas" w:hAnsi="Consolas"/>
+          <w:sz w:val="19"/>
+          <w:szCs w:val="19"/>
+        </w:rPr>
+        <w:br/>
+        <w:t xml:space="preserve">    PRINT</w:t>
+      </w:r>
+      <w:r>
+        <w:rPr>
+          <w:rFonts w:ascii="Consolas" w:cs="Consolas" w:eastAsia="Consolas" w:hAnsi="Consolas"/>
+          <w:sz w:val="19"/>
+          <w:szCs w:val="19"/>
+        </w:rPr>
+        <w:br/>
+        <w:t xml:space="preserve">NEXT</w:t>
+      </w:r>
+    </w:p>
+    <w:p>
+      <w:pPr>
+        <w:keepLines/>
+        <w:pBdr>
+          <w:left w:val="single" w:color="9AC79A" w:sz="18" w:space="6"/>
+        </w:pBdr>
+        <w:shd w:fill="EAF4EA" w:val="clear"/>
+        <w:spacing w:after="200" w:before="100" w:line="264" w:lineRule="auto"/>
+        <w:ind w:left="140"/>
+      </w:pPr>
+      <w:r>
+        <w:rPr>
+          <w:rFonts w:ascii="Consolas" w:cs="Consolas" w:eastAsia="Consolas" w:hAnsi="Consolas"/>
+          <w:sz w:val="19"/>
+          <w:szCs w:val="19"/>
+        </w:rPr>
+        <w:t xml:space="preserve">1 2 3</w:t>
+      </w:r>
+      <w:r>
+        <w:rPr>
+          <w:rFonts w:ascii="Consolas" w:cs="Consolas" w:eastAsia="Consolas" w:hAnsi="Consolas"/>
+          <w:sz w:val="19"/>
+          <w:szCs w:val="19"/>
+        </w:rPr>
+        <w:br/>
+        <w:t xml:space="preserve">2 4 6</w:t>
+      </w:r>
+      <w:r>
+        <w:rPr>
+          <w:rFonts w:ascii="Consolas" w:cs="Consolas" w:eastAsia="Consolas" w:hAnsi="Consolas"/>
+          <w:sz w:val="19"/>
+          <w:szCs w:val="19"/>
+        </w:rPr>
+        <w:br/>
+        <w:t xml:space="preserve">3 6 9</w:t>
+      </w:r>
+    </w:p>
+    <w:p>
+      <w:pPr>
+        <w:spacing w:before="60"/>
+      </w:pPr>
+    </w:p>
+    <w:tbl>
+      <w:tblPr>
+        <w:tblW w:type="dxa" w:w="9360"/>
+        <w:tblBorders>
+          <w:top w:val="single" w:color="auto" w:sz="4"/>
+          <w:left w:val="single" w:color="auto" w:sz="4"/>
+          <w:bottom w:val="single" w:color="auto" w:sz="4"/>
+          <w:right w:val="single" w:color="auto" w:sz="4"/>
+          <w:insideH w:val="single" w:color="auto" w:sz="4"/>
+          <w:insideV w:val="single" w:color="auto" w:sz="4"/>
+        </w:tblBorders>
+      </w:tblPr>
+      <w:tblGrid>
+        <w:gridCol w:w="9360"/>
+      </w:tblGrid>
+      <w:tr>
+        <w:trPr>
+          <w:cantSplit/>
+        </w:trPr>
+        <w:tc>
+          <w:tcPr>
+            <w:tcW w:type="dxa" w:w="9360"/>
+            <w:tcBorders>
+              <w:top w:val="single" w:color="9CC8E6" w:sz="6"/>
+              <w:left w:val="single" w:color="9CC8E6" w:sz="6"/>
+              <w:bottom w:val="single" w:color="9CC8E6" w:sz="6"/>
+              <w:right w:val="single" w:color="9CC8E6" w:sz="6"/>
+            </w:tcBorders>
+            <w:shd w:fill="E7F2FA" w:val="clear"/>
+            <w:tcMar>
+              <w:top w:type="dxa" w:w="140"/>
+              <w:left w:type="dxa" w:w="180"/>
+              <w:bottom w:type="dxa" w:w="140"/>
+              <w:right w:type="dxa" w:w="180"/>
+            </w:tcMar>
+          </w:tcPr>
+          <w:p>
+            <w:pPr>
+              <w:spacing w:after="40"/>
+            </w:pPr>
+            <w:r>
+              <w:rPr>
+                <w:b/>
+                <w:bCs/>
+                <w:color w:val="1B6CA8"/>
+                <w:sz w:val="22"/>
+                <w:szCs w:val="22"/>
+              </w:rPr>
+              <w:t xml:space="preserve">Welche Schleife wann?</w:t>
+            </w:r>
+          </w:p>
+          <w:p>
+            <w:pPr>
+              <w:spacing w:after="0" w:line="312" w:lineRule="auto"/>
+            </w:pPr>
+            <w:r>
+              <w:rPr>
+                <w:sz w:val="22"/>
+                <w:szCs w:val="22"/>
+              </w:rPr>
+              <w:t xml:space="preserve">Kennst du die Anzahl der Durchläufe im Voraus, nimm FOR. Hast du eine Sammlung, nimm FOR EACH. Hängt die Wiederholung an einer Bedingung, nimm WHILE (Prüfung vorher) oder REPEAT (mindestens ein Durchlauf).</w:t>
             </w:r>
           </w:p>
         </w:tc>

</xml_diff>

<commit_message>
docs(buch): Lehrbuch Kap 15 -- Funktionen & SUBs
FUNCTION/RETURN, SUB, mehrere Parameter, BYREF, Vorgabewerte, benannte
Argumente, variadische ...-Parameter, FUNCREF und Rekursion (mit
Abbruchfall). Alle Beispiel-Ausgaben gegen gbrt verifiziert.

Co-Authored-By: Claude Opus 4.8 (1M context) <noreply@anthropic.com>
</commit_message>
<xml_diff>
--- a/buch-referenz/buch/GameBasic-Lehrbuch.docx
+++ b/buch-referenz/buch/GameBasic-Lehrbuch.docx
@@ -381,6 +381,33 @@
           <w:szCs w:val="22"/>
         </w:rPr>
         <w:t xml:space="preserve">	3</w:t>
+      </w:r>
+    </w:p>
+    <w:p>
+      <w:pPr>
+        <w:tabs>
+          <w:tab w:val="right" w:pos="9200" w:leader="dot"/>
+        </w:tabs>
+        <w:spacing w:after="20" w:before="0"/>
+        <w:ind w:left="280"/>
+      </w:pPr>
+      <w:r>
+        <w:rPr>
+          <w:b w:val="false"/>
+          <w:bCs w:val="false"/>
+          <w:color w:val="222222"/>
+          <w:sz w:val="22"/>
+          <w:szCs w:val="22"/>
+        </w:rPr>
+        <w:t xml:space="preserve">Funktionen &amp; SUBs</w:t>
+      </w:r>
+      <w:r>
+        <w:rPr>
+          <w:color w:val="555555"/>
+          <w:sz w:val="22"/>
+          <w:szCs w:val="22"/>
+        </w:rPr>
+        <w:t xml:space="preserve">	34</w:t>
       </w:r>
     </w:p>
     <w:p>
@@ -9283,6 +9310,1848 @@
                 <w:szCs w:val="22"/>
               </w:rPr>
               <w:t xml:space="preserve">Kennst du die Anzahl der Durchläufe im Voraus, nimm FOR. Hast du eine Sammlung, nimm FOR EACH. Hängt die Wiederholung an einer Bedingung, nimm WHILE (Prüfung vorher) oder REPEAT (mindestens ein Durchlauf).</w:t>
+            </w:r>
+          </w:p>
+        </w:tc>
+      </w:tr>
+    </w:tbl>
+    <w:p>
+      <w:pPr>
+        <w:spacing w:after="160"/>
+      </w:pPr>
+    </w:p>
+    <w:p>
+      <w:pPr>
+        <w:pStyle w:val="Heading1"/>
+        <w:keepNext/>
+        <w:keepLines/>
+        <w:pageBreakBefore/>
+        <w:pBdr>
+          <w:bottom w:val="single" w:color="1B6CA8" w:sz="12" w:space="4"/>
+        </w:pBdr>
+        <w:spacing w:after="160" w:before="0"/>
+      </w:pPr>
+      <w:r>
+        <w:t xml:space="preserve">Funktionen &amp; SUBs</w:t>
+      </w:r>
+    </w:p>
+    <w:p>
+      <w:pPr>
+        <w:spacing w:after="180" w:line="312" w:lineRule="auto"/>
+      </w:pPr>
+      <w:r>
+        <w:rPr>
+          <w:sz w:val="22"/>
+          <w:szCs w:val="22"/>
+        </w:rPr>
+        <w:t xml:space="preserve">Sobald ein Programm wächst, willst du dieselbe Aufgabe nicht zehnmal hinschreiben. Funktionen und SUBs sind benannte Bausteine: Du verpackst ein Stück Arbeit einmal, gibst ihm einen Namen – und rufst es danach beliebig oft auf. Das macht Programme kürzer, lesbarer und leichter zu reparieren, denn jede Logik wohnt an genau einer Stelle. Dieses Kapitel zeigt alles, was GameBasic dir dabei in die Hand gibt.</w:t>
+      </w:r>
+    </w:p>
+    <w:p>
+      <w:pPr>
+        <w:pStyle w:val="Heading2"/>
+        <w:keepNext/>
+        <w:keepLines/>
+        <w:spacing w:after="120" w:before="280"/>
+      </w:pPr>
+      <w:r>
+        <w:t xml:space="preserve">FUNCTION: ein Ergebnis berechnen</w:t>
+      </w:r>
+    </w:p>
+    <w:p>
+      <w:pPr>
+        <w:spacing w:after="180" w:line="312" w:lineRule="auto"/>
+      </w:pPr>
+      <w:r>
+        <w:rPr>
+          <w:sz w:val="22"/>
+          <w:szCs w:val="22"/>
+        </w:rPr>
+        <w:t xml:space="preserve">Eine FUNCTION nimmt Werte entgegen, rechnet etwas aus und gibt mit RETURN ein Ergebnis zurück. Hinter AS steht der Typ des Rückgabewerts. Aufgerufen wird sie wie ein eingebauter Befehl – das Ergebnis kannst du direkt weiterverwenden.</w:t>
+      </w:r>
+    </w:p>
+    <w:p>
+      <w:pPr>
+        <w:keepNext/>
+        <w:keepLines/>
+        <w:pBdr>
+          <w:bottom w:val="single" w:color="DDD0C0" w:sz="4" w:space="2"/>
+        </w:pBdr>
+        <w:spacing w:after="40" w:before="360"/>
+      </w:pPr>
+      <w:r>
+        <w:rPr>
+          <w:rFonts w:ascii="Consolas" w:cs="Consolas" w:eastAsia="Consolas" w:hAnsi="Consolas"/>
+          <w:b/>
+          <w:bCs/>
+          <w:color w:val="9A3412"/>
+          <w:sz w:val="24"/>
+          <w:szCs w:val="24"/>
+        </w:rPr>
+        <w:t xml:space="preserve">FUNCTION ... RETURN</w:t>
+      </w:r>
+    </w:p>
+    <w:p>
+      <w:pPr>
+        <w:keepNext/>
+        <w:spacing w:after="120"/>
+      </w:pPr>
+      <w:r>
+        <w:rPr>
+          <w:b/>
+          <w:bCs/>
+          <w:color w:val="6A6A6A"/>
+          <w:sz w:val="18"/>
+          <w:szCs w:val="18"/>
+        </w:rPr>
+        <w:t xml:space="preserve">Syntax:  </w:t>
+      </w:r>
+      <w:r>
+        <w:rPr>
+          <w:rFonts w:ascii="Consolas" w:cs="Consolas" w:eastAsia="Consolas" w:hAnsi="Consolas"/>
+          <w:color w:val="335577"/>
+          <w:sz w:val="19"/>
+          <w:szCs w:val="19"/>
+        </w:rPr>
+        <w:t xml:space="preserve">FUNCTION name(param AS Typ) AS Rückgabetyp
+    RETURN wert
+END FUNCTION</w:t>
+      </w:r>
+    </w:p>
+    <w:p>
+      <w:pPr>
+        <w:spacing w:after="180" w:line="312" w:lineRule="auto"/>
+      </w:pPr>
+      <w:r>
+        <w:rPr>
+          <w:sz w:val="22"/>
+          <w:szCs w:val="22"/>
+        </w:rPr>
+        <w:t xml:space="preserve">Definiert eine Funktion mit Parametern und einem Rückgabetyp. RETURN liefert das Ergebnis und beendet die Funktion sofort. Der Aufruf name(...) wird zum berechneten Wert.</w:t>
+      </w:r>
+    </w:p>
+    <w:p>
+      <w:pPr>
+        <w:keepNext/>
+        <w:spacing w:after="30" w:before="120"/>
+      </w:pPr>
+      <w:r>
+        <w:rPr>
+          <w:b/>
+          <w:bCs/>
+          <w:i/>
+          <w:iCs/>
+          <w:color w:val="6A6A6A"/>
+          <w:sz w:val="18"/>
+          <w:szCs w:val="18"/>
+        </w:rPr>
+        <w:t xml:space="preserve">Beispiel</w:t>
+      </w:r>
+    </w:p>
+    <w:p>
+      <w:pPr>
+        <w:keepLines/>
+        <w:pBdr>
+          <w:left w:val="single" w:color="1B6CA8" w:sz="18" w:space="6"/>
+        </w:pBdr>
+        <w:shd w:fill="F4F4F4" w:val="clear"/>
+        <w:spacing w:after="200" w:before="100" w:line="264" w:lineRule="auto"/>
+        <w:ind w:left="140"/>
+      </w:pPr>
+      <w:r>
+        <w:rPr>
+          <w:rFonts w:ascii="Consolas" w:cs="Consolas" w:eastAsia="Consolas" w:hAnsi="Consolas"/>
+          <w:sz w:val="19"/>
+          <w:szCs w:val="19"/>
+        </w:rPr>
+        <w:t xml:space="preserve">FUNCTION quadrat(x AS INTEGER) AS INTEGER</w:t>
+      </w:r>
+      <w:r>
+        <w:rPr>
+          <w:rFonts w:ascii="Consolas" w:cs="Consolas" w:eastAsia="Consolas" w:hAnsi="Consolas"/>
+          <w:sz w:val="19"/>
+          <w:szCs w:val="19"/>
+        </w:rPr>
+        <w:br/>
+        <w:t xml:space="preserve">    RETURN x * x</w:t>
+      </w:r>
+      <w:r>
+        <w:rPr>
+          <w:rFonts w:ascii="Consolas" w:cs="Consolas" w:eastAsia="Consolas" w:hAnsi="Consolas"/>
+          <w:sz w:val="19"/>
+          <w:szCs w:val="19"/>
+        </w:rPr>
+        <w:br/>
+        <w:t xml:space="preserve">END FUNCTION</w:t>
+      </w:r>
+      <w:r>
+        <w:rPr>
+          <w:rFonts w:ascii="Consolas" w:cs="Consolas" w:eastAsia="Consolas" w:hAnsi="Consolas"/>
+          <w:sz w:val="19"/>
+          <w:szCs w:val="19"/>
+        </w:rPr>
+        <w:br/>
+        <w:t xml:space="preserve"/>
+      </w:r>
+      <w:r>
+        <w:rPr>
+          <w:rFonts w:ascii="Consolas" w:cs="Consolas" w:eastAsia="Consolas" w:hAnsi="Consolas"/>
+          <w:sz w:val="19"/>
+          <w:szCs w:val="19"/>
+        </w:rPr>
+        <w:br/>
+        <w:t xml:space="preserve">PRINT quadrat(5)</w:t>
+      </w:r>
+    </w:p>
+    <w:p>
+      <w:pPr>
+        <w:keepNext/>
+        <w:spacing w:after="30" w:before="120"/>
+      </w:pPr>
+      <w:r>
+        <w:rPr>
+          <w:b/>
+          <w:bCs/>
+          <w:i/>
+          <w:iCs/>
+          <w:color w:val="6A6A6A"/>
+          <w:sz w:val="18"/>
+          <w:szCs w:val="18"/>
+        </w:rPr>
+        <w:t xml:space="preserve">Ausgabe</w:t>
+      </w:r>
+    </w:p>
+    <w:p>
+      <w:pPr>
+        <w:keepLines/>
+        <w:pBdr>
+          <w:left w:val="single" w:color="9AC79A" w:sz="18" w:space="6"/>
+        </w:pBdr>
+        <w:shd w:fill="EAF4EA" w:val="clear"/>
+        <w:spacing w:after="200" w:before="100" w:line="264" w:lineRule="auto"/>
+        <w:ind w:left="140"/>
+      </w:pPr>
+      <w:r>
+        <w:rPr>
+          <w:rFonts w:ascii="Consolas" w:cs="Consolas" w:eastAsia="Consolas" w:hAnsi="Consolas"/>
+          <w:sz w:val="19"/>
+          <w:szCs w:val="19"/>
+        </w:rPr>
+        <w:t xml:space="preserve">25</w:t>
+      </w:r>
+    </w:p>
+    <w:p>
+      <w:pPr>
+        <w:pStyle w:val="Heading2"/>
+        <w:keepNext/>
+        <w:keepLines/>
+        <w:spacing w:after="120" w:before="280"/>
+      </w:pPr>
+      <w:r>
+        <w:t xml:space="preserve">SUB: etwas erledigen</w:t>
+      </w:r>
+    </w:p>
+    <w:p>
+      <w:pPr>
+        <w:spacing w:after="180" w:line="312" w:lineRule="auto"/>
+      </w:pPr>
+      <w:r>
+        <w:rPr>
+          <w:sz w:val="22"/>
+          <w:szCs w:val="22"/>
+        </w:rPr>
+        <w:t xml:space="preserve">Eine SUB ist eine Funktion ohne Rückgabewert. Sie erledigt eine Aufgabe – etwas ausgeben, einen Zustand ändern, eine Datei schreiben – aber sie liefert kein Ergebnis zum Weiterrechnen. Du rufst sie als eigenständige Anweisung auf.</w:t>
+      </w:r>
+    </w:p>
+    <w:p>
+      <w:pPr>
+        <w:keepNext/>
+        <w:keepLines/>
+        <w:pBdr>
+          <w:bottom w:val="single" w:color="DDD0C0" w:sz="4" w:space="2"/>
+        </w:pBdr>
+        <w:spacing w:after="40" w:before="360"/>
+      </w:pPr>
+      <w:r>
+        <w:rPr>
+          <w:rFonts w:ascii="Consolas" w:cs="Consolas" w:eastAsia="Consolas" w:hAnsi="Consolas"/>
+          <w:b/>
+          <w:bCs/>
+          <w:color w:val="9A3412"/>
+          <w:sz w:val="24"/>
+          <w:szCs w:val="24"/>
+        </w:rPr>
+        <w:t xml:space="preserve">SUB ... END SUB</w:t>
+      </w:r>
+    </w:p>
+    <w:p>
+      <w:pPr>
+        <w:keepNext/>
+        <w:spacing w:after="120"/>
+      </w:pPr>
+      <w:r>
+        <w:rPr>
+          <w:b/>
+          <w:bCs/>
+          <w:color w:val="6A6A6A"/>
+          <w:sz w:val="18"/>
+          <w:szCs w:val="18"/>
+        </w:rPr>
+        <w:t xml:space="preserve">Syntax:  </w:t>
+      </w:r>
+      <w:r>
+        <w:rPr>
+          <w:rFonts w:ascii="Consolas" w:cs="Consolas" w:eastAsia="Consolas" w:hAnsi="Consolas"/>
+          <w:color w:val="335577"/>
+          <w:sz w:val="19"/>
+          <w:szCs w:val="19"/>
+        </w:rPr>
+        <w:t xml:space="preserve">SUB name(param AS Typ)
+    ...
+END SUB</w:t>
+      </w:r>
+    </w:p>
+    <w:p>
+      <w:pPr>
+        <w:spacing w:after="180" w:line="312" w:lineRule="auto"/>
+      </w:pPr>
+      <w:r>
+        <w:rPr>
+          <w:sz w:val="22"/>
+          <w:szCs w:val="22"/>
+        </w:rPr>
+        <w:t xml:space="preserve">Definiert einen benannten Befehlsblock ohne Rückgabewert. Aufgerufen wird er als eigene Anweisung. Ein RETURN ohne Wert kann eine SUB vorzeitig verlassen.</w:t>
+      </w:r>
+    </w:p>
+    <w:p>
+      <w:pPr>
+        <w:keepNext/>
+        <w:spacing w:after="30" w:before="120"/>
+      </w:pPr>
+      <w:r>
+        <w:rPr>
+          <w:b/>
+          <w:bCs/>
+          <w:i/>
+          <w:iCs/>
+          <w:color w:val="6A6A6A"/>
+          <w:sz w:val="18"/>
+          <w:szCs w:val="18"/>
+        </w:rPr>
+        <w:t xml:space="preserve">Beispiel</w:t>
+      </w:r>
+    </w:p>
+    <w:p>
+      <w:pPr>
+        <w:keepLines/>
+        <w:pBdr>
+          <w:left w:val="single" w:color="1B6CA8" w:sz="18" w:space="6"/>
+        </w:pBdr>
+        <w:shd w:fill="F4F4F4" w:val="clear"/>
+        <w:spacing w:after="200" w:before="100" w:line="264" w:lineRule="auto"/>
+        <w:ind w:left="140"/>
+      </w:pPr>
+      <w:r>
+        <w:rPr>
+          <w:rFonts w:ascii="Consolas" w:cs="Consolas" w:eastAsia="Consolas" w:hAnsi="Consolas"/>
+          <w:sz w:val="19"/>
+          <w:szCs w:val="19"/>
+        </w:rPr>
+        <w:t xml:space="preserve">SUB gruesse(name AS STRING)</w:t>
+      </w:r>
+      <w:r>
+        <w:rPr>
+          <w:rFonts w:ascii="Consolas" w:cs="Consolas" w:eastAsia="Consolas" w:hAnsi="Consolas"/>
+          <w:sz w:val="19"/>
+          <w:szCs w:val="19"/>
+        </w:rPr>
+        <w:br/>
+        <w:t xml:space="preserve">    PRINT "Hallo, " + name + "!"</w:t>
+      </w:r>
+      <w:r>
+        <w:rPr>
+          <w:rFonts w:ascii="Consolas" w:cs="Consolas" w:eastAsia="Consolas" w:hAnsi="Consolas"/>
+          <w:sz w:val="19"/>
+          <w:szCs w:val="19"/>
+        </w:rPr>
+        <w:br/>
+        <w:t xml:space="preserve">END SUB</w:t>
+      </w:r>
+      <w:r>
+        <w:rPr>
+          <w:rFonts w:ascii="Consolas" w:cs="Consolas" w:eastAsia="Consolas" w:hAnsi="Consolas"/>
+          <w:sz w:val="19"/>
+          <w:szCs w:val="19"/>
+        </w:rPr>
+        <w:br/>
+        <w:t xml:space="preserve"/>
+      </w:r>
+      <w:r>
+        <w:rPr>
+          <w:rFonts w:ascii="Consolas" w:cs="Consolas" w:eastAsia="Consolas" w:hAnsi="Consolas"/>
+          <w:sz w:val="19"/>
+          <w:szCs w:val="19"/>
+        </w:rPr>
+        <w:br/>
+        <w:t xml:space="preserve">gruesse("Mario")</w:t>
+      </w:r>
+    </w:p>
+    <w:p>
+      <w:pPr>
+        <w:keepNext/>
+        <w:spacing w:after="30" w:before="120"/>
+      </w:pPr>
+      <w:r>
+        <w:rPr>
+          <w:b/>
+          <w:bCs/>
+          <w:i/>
+          <w:iCs/>
+          <w:color w:val="6A6A6A"/>
+          <w:sz w:val="18"/>
+          <w:szCs w:val="18"/>
+        </w:rPr>
+        <w:t xml:space="preserve">Ausgabe</w:t>
+      </w:r>
+    </w:p>
+    <w:p>
+      <w:pPr>
+        <w:keepLines/>
+        <w:pBdr>
+          <w:left w:val="single" w:color="9AC79A" w:sz="18" w:space="6"/>
+        </w:pBdr>
+        <w:shd w:fill="EAF4EA" w:val="clear"/>
+        <w:spacing w:after="200" w:before="100" w:line="264" w:lineRule="auto"/>
+        <w:ind w:left="140"/>
+      </w:pPr>
+      <w:r>
+        <w:rPr>
+          <w:rFonts w:ascii="Consolas" w:cs="Consolas" w:eastAsia="Consolas" w:hAnsi="Consolas"/>
+          <w:sz w:val="19"/>
+          <w:szCs w:val="19"/>
+        </w:rPr>
+        <w:t xml:space="preserve">Hallo, Mario!</w:t>
+      </w:r>
+    </w:p>
+    <w:p>
+      <w:pPr>
+        <w:spacing w:before="60"/>
+      </w:pPr>
+    </w:p>
+    <w:tbl>
+      <w:tblPr>
+        <w:tblW w:type="dxa" w:w="9360"/>
+        <w:tblBorders>
+          <w:top w:val="single" w:color="auto" w:sz="4"/>
+          <w:left w:val="single" w:color="auto" w:sz="4"/>
+          <w:bottom w:val="single" w:color="auto" w:sz="4"/>
+          <w:right w:val="single" w:color="auto" w:sz="4"/>
+          <w:insideH w:val="single" w:color="auto" w:sz="4"/>
+          <w:insideV w:val="single" w:color="auto" w:sz="4"/>
+        </w:tblBorders>
+      </w:tblPr>
+      <w:tblGrid>
+        <w:gridCol w:w="9360"/>
+      </w:tblGrid>
+      <w:tr>
+        <w:trPr>
+          <w:cantSplit/>
+        </w:trPr>
+        <w:tc>
+          <w:tcPr>
+            <w:tcW w:type="dxa" w:w="9360"/>
+            <w:tcBorders>
+              <w:top w:val="single" w:color="E0B96A" w:sz="6"/>
+              <w:left w:val="single" w:color="E0B96A" w:sz="6"/>
+              <w:bottom w:val="single" w:color="E0B96A" w:sz="6"/>
+              <w:right w:val="single" w:color="E0B96A" w:sz="6"/>
+            </w:tcBorders>
+            <w:shd w:fill="FDF3E0" w:val="clear"/>
+            <w:tcMar>
+              <w:top w:type="dxa" w:w="140"/>
+              <w:left w:type="dxa" w:w="180"/>
+              <w:bottom w:type="dxa" w:w="140"/>
+              <w:right w:type="dxa" w:w="180"/>
+            </w:tcMar>
+          </w:tcPr>
+          <w:p>
+            <w:pPr>
+              <w:spacing w:after="40"/>
+            </w:pPr>
+            <w:r>
+              <w:rPr>
+                <w:b/>
+                <w:bCs/>
+                <w:color w:val="9A6A1E"/>
+                <w:sz w:val="22"/>
+                <w:szCs w:val="22"/>
+              </w:rPr>
+              <w:t xml:space="preserve">Merke</w:t>
+            </w:r>
+          </w:p>
+          <w:p>
+            <w:pPr>
+              <w:spacing w:after="0" w:line="312" w:lineRule="auto"/>
+            </w:pPr>
+            <w:r>
+              <w:rPr>
+                <w:sz w:val="22"/>
+                <w:szCs w:val="22"/>
+              </w:rPr>
+              <w:t xml:space="preserve">Faustregel: Liefert der Baustein einen Wert, den du weiterverwendest, nimm FUNCTION. Tut er einfach etwas, nimm SUB.</w:t>
+            </w:r>
+          </w:p>
+        </w:tc>
+      </w:tr>
+    </w:tbl>
+    <w:p>
+      <w:pPr>
+        <w:spacing w:after="160"/>
+      </w:pPr>
+    </w:p>
+    <w:p>
+      <w:pPr>
+        <w:pStyle w:val="Heading2"/>
+        <w:keepNext/>
+        <w:keepLines/>
+        <w:spacing w:after="120" w:before="280"/>
+      </w:pPr>
+      <w:r>
+        <w:t xml:space="preserve">Mehrere Parameter</w:t>
+      </w:r>
+    </w:p>
+    <w:p>
+      <w:pPr>
+        <w:spacing w:after="180" w:line="312" w:lineRule="auto"/>
+      </w:pPr>
+      <w:r>
+        <w:rPr>
+          <w:sz w:val="22"/>
+          <w:szCs w:val="22"/>
+        </w:rPr>
+        <w:t xml:space="preserve">Du kannst beliebig viele Parameter angeben – durch Kommas getrennt, jeder mit eigenem Typ. Beim Aufruf gibst du die Werte in derselben Reihenfolge an. Diese Werte heißen Argumente.</w:t>
+      </w:r>
+    </w:p>
+    <w:p>
+      <w:pPr>
+        <w:keepLines/>
+        <w:pBdr>
+          <w:left w:val="single" w:color="1B6CA8" w:sz="18" w:space="6"/>
+        </w:pBdr>
+        <w:shd w:fill="F4F4F4" w:val="clear"/>
+        <w:spacing w:after="200" w:before="100" w:line="264" w:lineRule="auto"/>
+        <w:ind w:left="140"/>
+      </w:pPr>
+      <w:r>
+        <w:rPr>
+          <w:rFonts w:ascii="Consolas" w:cs="Consolas" w:eastAsia="Consolas" w:hAnsi="Consolas"/>
+          <w:sz w:val="19"/>
+          <w:szCs w:val="19"/>
+        </w:rPr>
+        <w:t xml:space="preserve">FUNCTION addiere(a AS INTEGER, b AS INTEGER) AS INTEGER</w:t>
+      </w:r>
+      <w:r>
+        <w:rPr>
+          <w:rFonts w:ascii="Consolas" w:cs="Consolas" w:eastAsia="Consolas" w:hAnsi="Consolas"/>
+          <w:sz w:val="19"/>
+          <w:szCs w:val="19"/>
+        </w:rPr>
+        <w:br/>
+        <w:t xml:space="preserve">    RETURN a + b</w:t>
+      </w:r>
+      <w:r>
+        <w:rPr>
+          <w:rFonts w:ascii="Consolas" w:cs="Consolas" w:eastAsia="Consolas" w:hAnsi="Consolas"/>
+          <w:sz w:val="19"/>
+          <w:szCs w:val="19"/>
+        </w:rPr>
+        <w:br/>
+        <w:t xml:space="preserve">END FUNCTION</w:t>
+      </w:r>
+      <w:r>
+        <w:rPr>
+          <w:rFonts w:ascii="Consolas" w:cs="Consolas" w:eastAsia="Consolas" w:hAnsi="Consolas"/>
+          <w:sz w:val="19"/>
+          <w:szCs w:val="19"/>
+        </w:rPr>
+        <w:br/>
+        <w:t xml:space="preserve"/>
+      </w:r>
+      <w:r>
+        <w:rPr>
+          <w:rFonts w:ascii="Consolas" w:cs="Consolas" w:eastAsia="Consolas" w:hAnsi="Consolas"/>
+          <w:sz w:val="19"/>
+          <w:szCs w:val="19"/>
+        </w:rPr>
+        <w:br/>
+        <w:t xml:space="preserve">PRINT addiere(3, 4)</w:t>
+      </w:r>
+    </w:p>
+    <w:p>
+      <w:pPr>
+        <w:keepLines/>
+        <w:pBdr>
+          <w:left w:val="single" w:color="9AC79A" w:sz="18" w:space="6"/>
+        </w:pBdr>
+        <w:shd w:fill="EAF4EA" w:val="clear"/>
+        <w:spacing w:after="200" w:before="100" w:line="264" w:lineRule="auto"/>
+        <w:ind w:left="140"/>
+      </w:pPr>
+      <w:r>
+        <w:rPr>
+          <w:rFonts w:ascii="Consolas" w:cs="Consolas" w:eastAsia="Consolas" w:hAnsi="Consolas"/>
+          <w:sz w:val="19"/>
+          <w:szCs w:val="19"/>
+        </w:rPr>
+        <w:t xml:space="preserve">7</w:t>
+      </w:r>
+    </w:p>
+    <w:p>
+      <w:pPr>
+        <w:spacing w:before="60"/>
+      </w:pPr>
+    </w:p>
+    <w:tbl>
+      <w:tblPr>
+        <w:tblW w:type="dxa" w:w="9360"/>
+        <w:tblBorders>
+          <w:top w:val="single" w:color="auto" w:sz="4"/>
+          <w:left w:val="single" w:color="auto" w:sz="4"/>
+          <w:bottom w:val="single" w:color="auto" w:sz="4"/>
+          <w:right w:val="single" w:color="auto" w:sz="4"/>
+          <w:insideH w:val="single" w:color="auto" w:sz="4"/>
+          <w:insideV w:val="single" w:color="auto" w:sz="4"/>
+        </w:tblBorders>
+      </w:tblPr>
+      <w:tblGrid>
+        <w:gridCol w:w="9360"/>
+      </w:tblGrid>
+      <w:tr>
+        <w:trPr>
+          <w:cantSplit/>
+        </w:trPr>
+        <w:tc>
+          <w:tcPr>
+            <w:tcW w:type="dxa" w:w="9360"/>
+            <w:tcBorders>
+              <w:top w:val="single" w:color="E0B96A" w:sz="6"/>
+              <w:left w:val="single" w:color="E0B96A" w:sz="6"/>
+              <w:bottom w:val="single" w:color="E0B96A" w:sz="6"/>
+              <w:right w:val="single" w:color="E0B96A" w:sz="6"/>
+            </w:tcBorders>
+            <w:shd w:fill="FDF3E0" w:val="clear"/>
+            <w:tcMar>
+              <w:top w:type="dxa" w:w="140"/>
+              <w:left w:type="dxa" w:w="180"/>
+              <w:bottom w:type="dxa" w:w="140"/>
+              <w:right w:type="dxa" w:w="180"/>
+            </w:tcMar>
+          </w:tcPr>
+          <w:p>
+            <w:pPr>
+              <w:spacing w:after="40"/>
+            </w:pPr>
+            <w:r>
+              <w:rPr>
+                <w:b/>
+                <w:bCs/>
+                <w:color w:val="9A6A1E"/>
+                <w:sz w:val="22"/>
+                <w:szCs w:val="22"/>
+              </w:rPr>
+              <w:t xml:space="preserve">Merke</w:t>
+            </w:r>
+          </w:p>
+          <w:p>
+            <w:pPr>
+              <w:spacing w:after="0" w:line="312" w:lineRule="auto"/>
+            </w:pPr>
+            <w:r>
+              <w:rPr>
+                <w:sz w:val="22"/>
+                <w:szCs w:val="22"/>
+              </w:rPr>
+              <w:t xml:space="preserve">Parameter sind lokal: Sie existieren nur innerhalb der Funktion. Änderst du sie dort, bleibt der Wert draußen unberührt (außer bei BYREF – gleich mehr dazu). Funktionen sehen außerdem keine lokalen Variablen des Aufrufers; was sie brauchen, bekommen sie als Parameter.</w:t>
+            </w:r>
+          </w:p>
+        </w:tc>
+      </w:tr>
+    </w:tbl>
+    <w:p>
+      <w:pPr>
+        <w:spacing w:after="160"/>
+      </w:pPr>
+    </w:p>
+    <w:p>
+      <w:pPr>
+        <w:pStyle w:val="Heading2"/>
+        <w:keepNext/>
+        <w:keepLines/>
+        <w:spacing w:after="120" w:before="280"/>
+      </w:pPr>
+      <w:r>
+        <w:t xml:space="preserve">Werte verändern: BYREF</w:t>
+      </w:r>
+    </w:p>
+    <w:p>
+      <w:pPr>
+        <w:spacing w:after="180" w:line="312" w:lineRule="auto"/>
+      </w:pPr>
+      <w:r>
+        <w:rPr>
+          <w:sz w:val="22"/>
+          <w:szCs w:val="22"/>
+        </w:rPr>
+        <w:t xml:space="preserve">Normalerweise bekommt eine Funktion eine Kopie ihrer Argumente – Änderungen daran bleiben innen. Stellst du einem Parameter BYREF voran, arbeitet die Funktion direkt auf der übergebenen Variablen. Eine Zuweisung wirkt dann auch außerhalb. So gibst du Werte zurück, ohne RETURN zu benutzen.</w:t>
+      </w:r>
+    </w:p>
+    <w:p>
+      <w:pPr>
+        <w:keepNext/>
+        <w:keepLines/>
+        <w:pBdr>
+          <w:bottom w:val="single" w:color="DDD0C0" w:sz="4" w:space="2"/>
+        </w:pBdr>
+        <w:spacing w:after="40" w:before="360"/>
+      </w:pPr>
+      <w:r>
+        <w:rPr>
+          <w:rFonts w:ascii="Consolas" w:cs="Consolas" w:eastAsia="Consolas" w:hAnsi="Consolas"/>
+          <w:b/>
+          <w:bCs/>
+          <w:color w:val="9A3412"/>
+          <w:sz w:val="24"/>
+          <w:szCs w:val="24"/>
+        </w:rPr>
+        <w:t xml:space="preserve">BYREF</w:t>
+      </w:r>
+    </w:p>
+    <w:p>
+      <w:pPr>
+        <w:keepNext/>
+        <w:spacing w:after="120"/>
+      </w:pPr>
+      <w:r>
+        <w:rPr>
+          <w:b/>
+          <w:bCs/>
+          <w:color w:val="6A6A6A"/>
+          <w:sz w:val="18"/>
+          <w:szCs w:val="18"/>
+        </w:rPr>
+        <w:t xml:space="preserve">Syntax:  </w:t>
+      </w:r>
+      <w:r>
+        <w:rPr>
+          <w:rFonts w:ascii="Consolas" w:cs="Consolas" w:eastAsia="Consolas" w:hAnsi="Consolas"/>
+          <w:color w:val="335577"/>
+          <w:sz w:val="19"/>
+          <w:szCs w:val="19"/>
+        </w:rPr>
+        <w:t xml:space="preserve">SUB name(BYREF param AS Typ)</w:t>
+      </w:r>
+    </w:p>
+    <w:p>
+      <w:pPr>
+        <w:spacing w:after="180" w:line="312" w:lineRule="auto"/>
+      </w:pPr>
+      <w:r>
+        <w:rPr>
+          <w:sz w:val="22"/>
+          <w:szCs w:val="22"/>
+        </w:rPr>
+        <w:t xml:space="preserve">Übergibt die Variable selbst statt einer Kopie. Schreibzugriffe in der Funktion verändern die Variable des Aufrufers. Nur echte Variablen lassen sich per BYREF übergeben, keine festen Werte wie 5.</w:t>
+      </w:r>
+    </w:p>
+    <w:p>
+      <w:pPr>
+        <w:keepNext/>
+        <w:spacing w:after="30" w:before="120"/>
+      </w:pPr>
+      <w:r>
+        <w:rPr>
+          <w:b/>
+          <w:bCs/>
+          <w:i/>
+          <w:iCs/>
+          <w:color w:val="6A6A6A"/>
+          <w:sz w:val="18"/>
+          <w:szCs w:val="18"/>
+        </w:rPr>
+        <w:t xml:space="preserve">Beispiel</w:t>
+      </w:r>
+    </w:p>
+    <w:p>
+      <w:pPr>
+        <w:keepLines/>
+        <w:pBdr>
+          <w:left w:val="single" w:color="1B6CA8" w:sz="18" w:space="6"/>
+        </w:pBdr>
+        <w:shd w:fill="F4F4F4" w:val="clear"/>
+        <w:spacing w:after="200" w:before="100" w:line="264" w:lineRule="auto"/>
+        <w:ind w:left="140"/>
+      </w:pPr>
+      <w:r>
+        <w:rPr>
+          <w:rFonts w:ascii="Consolas" w:cs="Consolas" w:eastAsia="Consolas" w:hAnsi="Consolas"/>
+          <w:sz w:val="19"/>
+          <w:szCs w:val="19"/>
+        </w:rPr>
+        <w:t xml:space="preserve">SUB verdopple(BYREF n AS INTEGER)</w:t>
+      </w:r>
+      <w:r>
+        <w:rPr>
+          <w:rFonts w:ascii="Consolas" w:cs="Consolas" w:eastAsia="Consolas" w:hAnsi="Consolas"/>
+          <w:sz w:val="19"/>
+          <w:szCs w:val="19"/>
+        </w:rPr>
+        <w:br/>
+        <w:t xml:space="preserve">    n = n * 2</w:t>
+      </w:r>
+      <w:r>
+        <w:rPr>
+          <w:rFonts w:ascii="Consolas" w:cs="Consolas" w:eastAsia="Consolas" w:hAnsi="Consolas"/>
+          <w:sz w:val="19"/>
+          <w:szCs w:val="19"/>
+        </w:rPr>
+        <w:br/>
+        <w:t xml:space="preserve">END SUB</w:t>
+      </w:r>
+      <w:r>
+        <w:rPr>
+          <w:rFonts w:ascii="Consolas" w:cs="Consolas" w:eastAsia="Consolas" w:hAnsi="Consolas"/>
+          <w:sz w:val="19"/>
+          <w:szCs w:val="19"/>
+        </w:rPr>
+        <w:br/>
+        <w:t xml:space="preserve"/>
+      </w:r>
+      <w:r>
+        <w:rPr>
+          <w:rFonts w:ascii="Consolas" w:cs="Consolas" w:eastAsia="Consolas" w:hAnsi="Consolas"/>
+          <w:sz w:val="19"/>
+          <w:szCs w:val="19"/>
+        </w:rPr>
+        <w:br/>
+        <w:t xml:space="preserve">DIM wert AS INTEGER</w:t>
+      </w:r>
+      <w:r>
+        <w:rPr>
+          <w:rFonts w:ascii="Consolas" w:cs="Consolas" w:eastAsia="Consolas" w:hAnsi="Consolas"/>
+          <w:sz w:val="19"/>
+          <w:szCs w:val="19"/>
+        </w:rPr>
+        <w:br/>
+        <w:t xml:space="preserve">wert = 21</w:t>
+      </w:r>
+      <w:r>
+        <w:rPr>
+          <w:rFonts w:ascii="Consolas" w:cs="Consolas" w:eastAsia="Consolas" w:hAnsi="Consolas"/>
+          <w:sz w:val="19"/>
+          <w:szCs w:val="19"/>
+        </w:rPr>
+        <w:br/>
+        <w:t xml:space="preserve">verdopple(wert)</w:t>
+      </w:r>
+      <w:r>
+        <w:rPr>
+          <w:rFonts w:ascii="Consolas" w:cs="Consolas" w:eastAsia="Consolas" w:hAnsi="Consolas"/>
+          <w:sz w:val="19"/>
+          <w:szCs w:val="19"/>
+        </w:rPr>
+        <w:br/>
+        <w:t xml:space="preserve">PRINT wert</w:t>
+      </w:r>
+    </w:p>
+    <w:p>
+      <w:pPr>
+        <w:keepNext/>
+        <w:spacing w:after="30" w:before="120"/>
+      </w:pPr>
+      <w:r>
+        <w:rPr>
+          <w:b/>
+          <w:bCs/>
+          <w:i/>
+          <w:iCs/>
+          <w:color w:val="6A6A6A"/>
+          <w:sz w:val="18"/>
+          <w:szCs w:val="18"/>
+        </w:rPr>
+        <w:t xml:space="preserve">Ausgabe</w:t>
+      </w:r>
+    </w:p>
+    <w:p>
+      <w:pPr>
+        <w:keepLines/>
+        <w:pBdr>
+          <w:left w:val="single" w:color="9AC79A" w:sz="18" w:space="6"/>
+        </w:pBdr>
+        <w:shd w:fill="EAF4EA" w:val="clear"/>
+        <w:spacing w:after="200" w:before="100" w:line="264" w:lineRule="auto"/>
+        <w:ind w:left="140"/>
+      </w:pPr>
+      <w:r>
+        <w:rPr>
+          <w:rFonts w:ascii="Consolas" w:cs="Consolas" w:eastAsia="Consolas" w:hAnsi="Consolas"/>
+          <w:sz w:val="19"/>
+          <w:szCs w:val="19"/>
+        </w:rPr>
+        <w:t xml:space="preserve">42</w:t>
+      </w:r>
+    </w:p>
+    <w:p>
+      <w:pPr>
+        <w:spacing w:before="60"/>
+      </w:pPr>
+    </w:p>
+    <w:tbl>
+      <w:tblPr>
+        <w:tblW w:type="dxa" w:w="9360"/>
+        <w:tblBorders>
+          <w:top w:val="single" w:color="auto" w:sz="4"/>
+          <w:left w:val="single" w:color="auto" w:sz="4"/>
+          <w:bottom w:val="single" w:color="auto" w:sz="4"/>
+          <w:right w:val="single" w:color="auto" w:sz="4"/>
+          <w:insideH w:val="single" w:color="auto" w:sz="4"/>
+          <w:insideV w:val="single" w:color="auto" w:sz="4"/>
+        </w:tblBorders>
+      </w:tblPr>
+      <w:tblGrid>
+        <w:gridCol w:w="9360"/>
+      </w:tblGrid>
+      <w:tr>
+        <w:trPr>
+          <w:cantSplit/>
+        </w:trPr>
+        <w:tc>
+          <w:tcPr>
+            <w:tcW w:type="dxa" w:w="9360"/>
+            <w:tcBorders>
+              <w:top w:val="single" w:color="9CC8E6" w:sz="6"/>
+              <w:left w:val="single" w:color="9CC8E6" w:sz="6"/>
+              <w:bottom w:val="single" w:color="9CC8E6" w:sz="6"/>
+              <w:right w:val="single" w:color="9CC8E6" w:sz="6"/>
+            </w:tcBorders>
+            <w:shd w:fill="E7F2FA" w:val="clear"/>
+            <w:tcMar>
+              <w:top w:type="dxa" w:w="140"/>
+              <w:left w:type="dxa" w:w="180"/>
+              <w:bottom w:type="dxa" w:w="140"/>
+              <w:right w:type="dxa" w:w="180"/>
+            </w:tcMar>
+          </w:tcPr>
+          <w:p>
+            <w:pPr>
+              <w:spacing w:after="40"/>
+            </w:pPr>
+            <w:r>
+              <w:rPr>
+                <w:b/>
+                <w:bCs/>
+                <w:color w:val="1B6CA8"/>
+                <w:sz w:val="22"/>
+                <w:szCs w:val="22"/>
+              </w:rPr>
+              <w:t xml:space="preserve">Mehrere Ergebnisse?</w:t>
+            </w:r>
+          </w:p>
+          <w:p>
+            <w:pPr>
+              <w:spacing w:after="0" w:line="312" w:lineRule="auto"/>
+            </w:pPr>
+            <w:r>
+              <w:rPr>
+                <w:sz w:val="22"/>
+                <w:szCs w:val="22"/>
+              </w:rPr>
+              <w:t xml:space="preserve">Wenn du mehr als einen Wert zurückgeben willst, gibt es neben BYREF eine elegantere Möglichkeit: ein Tupel zurückgeben und es beim Aufruf zerlegen. Das lernst du im Kapitel „Tupel &amp; Destructuring“.</w:t>
+            </w:r>
+          </w:p>
+        </w:tc>
+      </w:tr>
+    </w:tbl>
+    <w:p>
+      <w:pPr>
+        <w:spacing w:after="160"/>
+      </w:pPr>
+    </w:p>
+    <w:p>
+      <w:pPr>
+        <w:pStyle w:val="Heading2"/>
+        <w:keepNext/>
+        <w:keepLines/>
+        <w:spacing w:after="120" w:before="280"/>
+      </w:pPr>
+      <w:r>
+        <w:t xml:space="preserve">Vorgabewerte (Defaults)</w:t>
+      </w:r>
+    </w:p>
+    <w:p>
+      <w:pPr>
+        <w:spacing w:after="180" w:line="312" w:lineRule="auto"/>
+      </w:pPr>
+      <w:r>
+        <w:rPr>
+          <w:sz w:val="22"/>
+          <w:szCs w:val="22"/>
+        </w:rPr>
+        <w:t xml:space="preserve">Einem Parameter kannst du einen Standardwert mitgeben. Lässt der Aufrufer dieses Argument weg, springt der Vorgabewert ein. Praktisch für Optionen, die meistens gleich sind. Parameter mit Vorgabewert stehen am Ende der Liste.</w:t>
+      </w:r>
+    </w:p>
+    <w:p>
+      <w:pPr>
+        <w:keepLines/>
+        <w:pBdr>
+          <w:left w:val="single" w:color="1B6CA8" w:sz="18" w:space="6"/>
+        </w:pBdr>
+        <w:shd w:fill="F4F4F4" w:val="clear"/>
+        <w:spacing w:after="200" w:before="100" w:line="264" w:lineRule="auto"/>
+        <w:ind w:left="140"/>
+      </w:pPr>
+      <w:r>
+        <w:rPr>
+          <w:rFonts w:ascii="Consolas" w:cs="Consolas" w:eastAsia="Consolas" w:hAnsi="Consolas"/>
+          <w:sz w:val="19"/>
+          <w:szCs w:val="19"/>
+        </w:rPr>
+        <w:t xml:space="preserve">FUNCTION potenz(basis AS INTEGER, exp AS INTEGER = 2) AS INTEGER</w:t>
+      </w:r>
+      <w:r>
+        <w:rPr>
+          <w:rFonts w:ascii="Consolas" w:cs="Consolas" w:eastAsia="Consolas" w:hAnsi="Consolas"/>
+          <w:sz w:val="19"/>
+          <w:szCs w:val="19"/>
+        </w:rPr>
+        <w:br/>
+        <w:t xml:space="preserve">    DIM r AS INTEGER</w:t>
+      </w:r>
+      <w:r>
+        <w:rPr>
+          <w:rFonts w:ascii="Consolas" w:cs="Consolas" w:eastAsia="Consolas" w:hAnsi="Consolas"/>
+          <w:sz w:val="19"/>
+          <w:szCs w:val="19"/>
+        </w:rPr>
+        <w:br/>
+        <w:t xml:space="preserve">    DIM j AS INTEGER</w:t>
+      </w:r>
+      <w:r>
+        <w:rPr>
+          <w:rFonts w:ascii="Consolas" w:cs="Consolas" w:eastAsia="Consolas" w:hAnsi="Consolas"/>
+          <w:sz w:val="19"/>
+          <w:szCs w:val="19"/>
+        </w:rPr>
+        <w:br/>
+        <w:t xml:space="preserve">    r = 1</w:t>
+      </w:r>
+      <w:r>
+        <w:rPr>
+          <w:rFonts w:ascii="Consolas" w:cs="Consolas" w:eastAsia="Consolas" w:hAnsi="Consolas"/>
+          <w:sz w:val="19"/>
+          <w:szCs w:val="19"/>
+        </w:rPr>
+        <w:br/>
+        <w:t xml:space="preserve">    FOR j = 1 TO exp</w:t>
+      </w:r>
+      <w:r>
+        <w:rPr>
+          <w:rFonts w:ascii="Consolas" w:cs="Consolas" w:eastAsia="Consolas" w:hAnsi="Consolas"/>
+          <w:sz w:val="19"/>
+          <w:szCs w:val="19"/>
+        </w:rPr>
+        <w:br/>
+        <w:t xml:space="preserve">        r = r * basis</w:t>
+      </w:r>
+      <w:r>
+        <w:rPr>
+          <w:rFonts w:ascii="Consolas" w:cs="Consolas" w:eastAsia="Consolas" w:hAnsi="Consolas"/>
+          <w:sz w:val="19"/>
+          <w:szCs w:val="19"/>
+        </w:rPr>
+        <w:br/>
+        <w:t xml:space="preserve">    NEXT</w:t>
+      </w:r>
+      <w:r>
+        <w:rPr>
+          <w:rFonts w:ascii="Consolas" w:cs="Consolas" w:eastAsia="Consolas" w:hAnsi="Consolas"/>
+          <w:sz w:val="19"/>
+          <w:szCs w:val="19"/>
+        </w:rPr>
+        <w:br/>
+        <w:t xml:space="preserve">    RETURN r</w:t>
+      </w:r>
+      <w:r>
+        <w:rPr>
+          <w:rFonts w:ascii="Consolas" w:cs="Consolas" w:eastAsia="Consolas" w:hAnsi="Consolas"/>
+          <w:sz w:val="19"/>
+          <w:szCs w:val="19"/>
+        </w:rPr>
+        <w:br/>
+        <w:t xml:space="preserve">END FUNCTION</w:t>
+      </w:r>
+      <w:r>
+        <w:rPr>
+          <w:rFonts w:ascii="Consolas" w:cs="Consolas" w:eastAsia="Consolas" w:hAnsi="Consolas"/>
+          <w:sz w:val="19"/>
+          <w:szCs w:val="19"/>
+        </w:rPr>
+        <w:br/>
+        <w:t xml:space="preserve"/>
+      </w:r>
+      <w:r>
+        <w:rPr>
+          <w:rFonts w:ascii="Consolas" w:cs="Consolas" w:eastAsia="Consolas" w:hAnsi="Consolas"/>
+          <w:sz w:val="19"/>
+          <w:szCs w:val="19"/>
+        </w:rPr>
+        <w:br/>
+        <w:t xml:space="preserve">PRINT potenz(5)        ' exp ist standardmäßig 2</w:t>
+      </w:r>
+      <w:r>
+        <w:rPr>
+          <w:rFonts w:ascii="Consolas" w:cs="Consolas" w:eastAsia="Consolas" w:hAnsi="Consolas"/>
+          <w:sz w:val="19"/>
+          <w:szCs w:val="19"/>
+        </w:rPr>
+        <w:br/>
+        <w:t xml:space="preserve">PRINT potenz(2, 10)</w:t>
+      </w:r>
+    </w:p>
+    <w:p>
+      <w:pPr>
+        <w:keepLines/>
+        <w:pBdr>
+          <w:left w:val="single" w:color="9AC79A" w:sz="18" w:space="6"/>
+        </w:pBdr>
+        <w:shd w:fill="EAF4EA" w:val="clear"/>
+        <w:spacing w:after="200" w:before="100" w:line="264" w:lineRule="auto"/>
+        <w:ind w:left="140"/>
+      </w:pPr>
+      <w:r>
+        <w:rPr>
+          <w:rFonts w:ascii="Consolas" w:cs="Consolas" w:eastAsia="Consolas" w:hAnsi="Consolas"/>
+          <w:sz w:val="19"/>
+          <w:szCs w:val="19"/>
+        </w:rPr>
+        <w:t xml:space="preserve">25</w:t>
+      </w:r>
+      <w:r>
+        <w:rPr>
+          <w:rFonts w:ascii="Consolas" w:cs="Consolas" w:eastAsia="Consolas" w:hAnsi="Consolas"/>
+          <w:sz w:val="19"/>
+          <w:szCs w:val="19"/>
+        </w:rPr>
+        <w:br/>
+        <w:t xml:space="preserve">1024</w:t>
+      </w:r>
+    </w:p>
+    <w:p>
+      <w:pPr>
+        <w:pStyle w:val="Heading2"/>
+        <w:keepNext/>
+        <w:keepLines/>
+        <w:spacing w:after="120" w:before="280"/>
+      </w:pPr>
+      <w:r>
+        <w:t xml:space="preserve">Argumente benennen</w:t>
+      </w:r>
+    </w:p>
+    <w:p>
+      <w:pPr>
+        <w:spacing w:after="180" w:line="312" w:lineRule="auto"/>
+      </w:pPr>
+      <w:r>
+        <w:rPr>
+          <w:sz w:val="22"/>
+          <w:szCs w:val="22"/>
+        </w:rPr>
+        <w:t xml:space="preserve">Bei vielen oder ähnlichen Parametern verliert man leicht den Überblick, welcher Wert wohin gehört. Du darfst Argumente beim Aufruf auch beim Namen nennen – dann ist die Reihenfolge egal und der Aufruf liest sich selbsterklärend.</w:t>
+      </w:r>
+    </w:p>
+    <w:p>
+      <w:pPr>
+        <w:keepLines/>
+        <w:pBdr>
+          <w:left w:val="single" w:color="1B6CA8" w:sz="18" w:space="6"/>
+        </w:pBdr>
+        <w:shd w:fill="F4F4F4" w:val="clear"/>
+        <w:spacing w:after="200" w:before="100" w:line="264" w:lineRule="auto"/>
+        <w:ind w:left="140"/>
+      </w:pPr>
+      <w:r>
+        <w:rPr>
+          <w:rFonts w:ascii="Consolas" w:cs="Consolas" w:eastAsia="Consolas" w:hAnsi="Consolas"/>
+          <w:sz w:val="19"/>
+          <w:szCs w:val="19"/>
+        </w:rPr>
+        <w:t xml:space="preserve">SUB info(name AS STRING, alter AS INTEGER)</w:t>
+      </w:r>
+      <w:r>
+        <w:rPr>
+          <w:rFonts w:ascii="Consolas" w:cs="Consolas" w:eastAsia="Consolas" w:hAnsi="Consolas"/>
+          <w:sz w:val="19"/>
+          <w:szCs w:val="19"/>
+        </w:rPr>
+        <w:br/>
+        <w:t xml:space="preserve">    PRINT name + " ist " + STR$(alter)</w:t>
+      </w:r>
+      <w:r>
+        <w:rPr>
+          <w:rFonts w:ascii="Consolas" w:cs="Consolas" w:eastAsia="Consolas" w:hAnsi="Consolas"/>
+          <w:sz w:val="19"/>
+          <w:szCs w:val="19"/>
+        </w:rPr>
+        <w:br/>
+        <w:t xml:space="preserve">END SUB</w:t>
+      </w:r>
+      <w:r>
+        <w:rPr>
+          <w:rFonts w:ascii="Consolas" w:cs="Consolas" w:eastAsia="Consolas" w:hAnsi="Consolas"/>
+          <w:sz w:val="19"/>
+          <w:szCs w:val="19"/>
+        </w:rPr>
+        <w:br/>
+        <w:t xml:space="preserve"/>
+      </w:r>
+      <w:r>
+        <w:rPr>
+          <w:rFonts w:ascii="Consolas" w:cs="Consolas" w:eastAsia="Consolas" w:hAnsi="Consolas"/>
+          <w:sz w:val="19"/>
+          <w:szCs w:val="19"/>
+        </w:rPr>
+        <w:br/>
+        <w:t xml:space="preserve">info(alter: 30, name: "Anna")</w:t>
+      </w:r>
+    </w:p>
+    <w:p>
+      <w:pPr>
+        <w:keepLines/>
+        <w:pBdr>
+          <w:left w:val="single" w:color="9AC79A" w:sz="18" w:space="6"/>
+        </w:pBdr>
+        <w:shd w:fill="EAF4EA" w:val="clear"/>
+        <w:spacing w:after="200" w:before="100" w:line="264" w:lineRule="auto"/>
+        <w:ind w:left="140"/>
+      </w:pPr>
+      <w:r>
+        <w:rPr>
+          <w:rFonts w:ascii="Consolas" w:cs="Consolas" w:eastAsia="Consolas" w:hAnsi="Consolas"/>
+          <w:sz w:val="19"/>
+          <w:szCs w:val="19"/>
+        </w:rPr>
+        <w:t xml:space="preserve">Anna ist 30</w:t>
+      </w:r>
+    </w:p>
+    <w:p>
+      <w:pPr>
+        <w:pStyle w:val="Heading2"/>
+        <w:keepNext/>
+        <w:keepLines/>
+        <w:spacing w:after="120" w:before="280"/>
+      </w:pPr>
+      <w:r>
+        <w:t xml:space="preserve">Beliebig viele Argumente: ...</w:t>
+      </w:r>
+    </w:p>
+    <w:p>
+      <w:pPr>
+        <w:spacing w:after="180" w:line="312" w:lineRule="auto"/>
+      </w:pPr>
+      <w:r>
+        <w:rPr>
+          <w:sz w:val="22"/>
+          <w:szCs w:val="22"/>
+        </w:rPr>
+        <w:t xml:space="preserve">Manchmal weißt du nicht im Voraus, wie viele Werte übergeben werden. Ein Parameter mit drei Punkten davor sammelt alle übrigen Argumente in einem Tupel. Er muss der letzte sein.</w:t>
+      </w:r>
+    </w:p>
+    <w:p>
+      <w:pPr>
+        <w:keepLines/>
+        <w:pBdr>
+          <w:left w:val="single" w:color="1B6CA8" w:sz="18" w:space="6"/>
+        </w:pBdr>
+        <w:shd w:fill="F4F4F4" w:val="clear"/>
+        <w:spacing w:after="200" w:before="100" w:line="264" w:lineRule="auto"/>
+        <w:ind w:left="140"/>
+      </w:pPr>
+      <w:r>
+        <w:rPr>
+          <w:rFonts w:ascii="Consolas" w:cs="Consolas" w:eastAsia="Consolas" w:hAnsi="Consolas"/>
+          <w:sz w:val="19"/>
+          <w:szCs w:val="19"/>
+        </w:rPr>
+        <w:t xml:space="preserve">FUNCTION summe(...zahlen) AS INTEGER</w:t>
+      </w:r>
+      <w:r>
+        <w:rPr>
+          <w:rFonts w:ascii="Consolas" w:cs="Consolas" w:eastAsia="Consolas" w:hAnsi="Consolas"/>
+          <w:sz w:val="19"/>
+          <w:szCs w:val="19"/>
+        </w:rPr>
+        <w:br/>
+        <w:t xml:space="preserve">    DIM s AS INTEGER</w:t>
+      </w:r>
+      <w:r>
+        <w:rPr>
+          <w:rFonts w:ascii="Consolas" w:cs="Consolas" w:eastAsia="Consolas" w:hAnsi="Consolas"/>
+          <w:sz w:val="19"/>
+          <w:szCs w:val="19"/>
+        </w:rPr>
+        <w:br/>
+        <w:t xml:space="preserve">    DIM j AS INTEGER</w:t>
+      </w:r>
+      <w:r>
+        <w:rPr>
+          <w:rFonts w:ascii="Consolas" w:cs="Consolas" w:eastAsia="Consolas" w:hAnsi="Consolas"/>
+          <w:sz w:val="19"/>
+          <w:szCs w:val="19"/>
+        </w:rPr>
+        <w:br/>
+        <w:t xml:space="preserve">    s = 0</w:t>
+      </w:r>
+      <w:r>
+        <w:rPr>
+          <w:rFonts w:ascii="Consolas" w:cs="Consolas" w:eastAsia="Consolas" w:hAnsi="Consolas"/>
+          <w:sz w:val="19"/>
+          <w:szCs w:val="19"/>
+        </w:rPr>
+        <w:br/>
+        <w:t xml:space="preserve">    FOR j = 0 TO zahlen.length() - 1</w:t>
+      </w:r>
+      <w:r>
+        <w:rPr>
+          <w:rFonts w:ascii="Consolas" w:cs="Consolas" w:eastAsia="Consolas" w:hAnsi="Consolas"/>
+          <w:sz w:val="19"/>
+          <w:szCs w:val="19"/>
+        </w:rPr>
+        <w:br/>
+        <w:t xml:space="preserve">        s = s + zahlen[j]</w:t>
+      </w:r>
+      <w:r>
+        <w:rPr>
+          <w:rFonts w:ascii="Consolas" w:cs="Consolas" w:eastAsia="Consolas" w:hAnsi="Consolas"/>
+          <w:sz w:val="19"/>
+          <w:szCs w:val="19"/>
+        </w:rPr>
+        <w:br/>
+        <w:t xml:space="preserve">    NEXT</w:t>
+      </w:r>
+      <w:r>
+        <w:rPr>
+          <w:rFonts w:ascii="Consolas" w:cs="Consolas" w:eastAsia="Consolas" w:hAnsi="Consolas"/>
+          <w:sz w:val="19"/>
+          <w:szCs w:val="19"/>
+        </w:rPr>
+        <w:br/>
+        <w:t xml:space="preserve">    RETURN s</w:t>
+      </w:r>
+      <w:r>
+        <w:rPr>
+          <w:rFonts w:ascii="Consolas" w:cs="Consolas" w:eastAsia="Consolas" w:hAnsi="Consolas"/>
+          <w:sz w:val="19"/>
+          <w:szCs w:val="19"/>
+        </w:rPr>
+        <w:br/>
+        <w:t xml:space="preserve">END FUNCTION</w:t>
+      </w:r>
+      <w:r>
+        <w:rPr>
+          <w:rFonts w:ascii="Consolas" w:cs="Consolas" w:eastAsia="Consolas" w:hAnsi="Consolas"/>
+          <w:sz w:val="19"/>
+          <w:szCs w:val="19"/>
+        </w:rPr>
+        <w:br/>
+        <w:t xml:space="preserve"/>
+      </w:r>
+      <w:r>
+        <w:rPr>
+          <w:rFonts w:ascii="Consolas" w:cs="Consolas" w:eastAsia="Consolas" w:hAnsi="Consolas"/>
+          <w:sz w:val="19"/>
+          <w:szCs w:val="19"/>
+        </w:rPr>
+        <w:br/>
+        <w:t xml:space="preserve">PRINT summe(1, 2, 3, 4, 5)</w:t>
+      </w:r>
+    </w:p>
+    <w:p>
+      <w:pPr>
+        <w:keepLines/>
+        <w:pBdr>
+          <w:left w:val="single" w:color="9AC79A" w:sz="18" w:space="6"/>
+        </w:pBdr>
+        <w:shd w:fill="EAF4EA" w:val="clear"/>
+        <w:spacing w:after="200" w:before="100" w:line="264" w:lineRule="auto"/>
+        <w:ind w:left="140"/>
+      </w:pPr>
+      <w:r>
+        <w:rPr>
+          <w:rFonts w:ascii="Consolas" w:cs="Consolas" w:eastAsia="Consolas" w:hAnsi="Consolas"/>
+          <w:sz w:val="19"/>
+          <w:szCs w:val="19"/>
+        </w:rPr>
+        <w:t xml:space="preserve">15</w:t>
+      </w:r>
+    </w:p>
+    <w:p>
+      <w:pPr>
+        <w:pStyle w:val="Heading2"/>
+        <w:keepNext/>
+        <w:keepLines/>
+        <w:spacing w:after="120" w:before="280"/>
+      </w:pPr>
+      <w:r>
+        <w:t xml:space="preserve">Funktionen als Werte: FUNCREF</w:t>
+      </w:r>
+    </w:p>
+    <w:p>
+      <w:pPr>
+        <w:spacing w:after="180" w:line="312" w:lineRule="auto"/>
+      </w:pPr>
+      <w:r>
+        <w:rPr>
+          <w:sz w:val="22"/>
+          <w:szCs w:val="22"/>
+        </w:rPr>
+        <w:t xml:space="preserve">In GameBasic ist eine Funktion selbst ein Wert, den du in einer Variablen vom Typ FUNCREF ablegen und später aufrufen kannst. So übergibst du „was zu tun ist“ als Argument – etwa eine Vergleichsfunktion zum Sortieren oder einen Rückruf für ein Ereignis.</w:t>
+      </w:r>
+    </w:p>
+    <w:p>
+      <w:pPr>
+        <w:keepNext/>
+        <w:keepLines/>
+        <w:pBdr>
+          <w:bottom w:val="single" w:color="DDD0C0" w:sz="4" w:space="2"/>
+        </w:pBdr>
+        <w:spacing w:after="40" w:before="360"/>
+      </w:pPr>
+      <w:r>
+        <w:rPr>
+          <w:rFonts w:ascii="Consolas" w:cs="Consolas" w:eastAsia="Consolas" w:hAnsi="Consolas"/>
+          <w:b/>
+          <w:bCs/>
+          <w:color w:val="9A3412"/>
+          <w:sz w:val="24"/>
+          <w:szCs w:val="24"/>
+        </w:rPr>
+        <w:t xml:space="preserve">FUNCREF</w:t>
+      </w:r>
+    </w:p>
+    <w:p>
+      <w:pPr>
+        <w:keepNext/>
+        <w:spacing w:after="120"/>
+      </w:pPr>
+      <w:r>
+        <w:rPr>
+          <w:b/>
+          <w:bCs/>
+          <w:color w:val="6A6A6A"/>
+          <w:sz w:val="18"/>
+          <w:szCs w:val="18"/>
+        </w:rPr>
+        <w:t xml:space="preserve">Syntax:  </w:t>
+      </w:r>
+      <w:r>
+        <w:rPr>
+          <w:rFonts w:ascii="Consolas" w:cs="Consolas" w:eastAsia="Consolas" w:hAnsi="Consolas"/>
+          <w:color w:val="335577"/>
+          <w:sz w:val="19"/>
+          <w:szCs w:val="19"/>
+        </w:rPr>
+        <w:t xml:space="preserve">DIM f AS FUNCREF
+f = funktionsname
+f(args)</w:t>
+      </w:r>
+    </w:p>
+    <w:p>
+      <w:pPr>
+        <w:spacing w:after="180" w:line="312" w:lineRule="auto"/>
+      </w:pPr>
+      <w:r>
+        <w:rPr>
+          <w:sz w:val="22"/>
+          <w:szCs w:val="22"/>
+        </w:rPr>
+        <w:t xml:space="preserve">Eine Variable, die auf eine Funktion verweist. Der bloße Funktionsname (ohne Klammern) wird zur Referenz; mit f(...) rufst du die dahinterliegende Funktion auf.</w:t>
+      </w:r>
+    </w:p>
+    <w:p>
+      <w:pPr>
+        <w:keepNext/>
+        <w:spacing w:after="30" w:before="120"/>
+      </w:pPr>
+      <w:r>
+        <w:rPr>
+          <w:b/>
+          <w:bCs/>
+          <w:i/>
+          <w:iCs/>
+          <w:color w:val="6A6A6A"/>
+          <w:sz w:val="18"/>
+          <w:szCs w:val="18"/>
+        </w:rPr>
+        <w:t xml:space="preserve">Beispiel</w:t>
+      </w:r>
+    </w:p>
+    <w:p>
+      <w:pPr>
+        <w:keepLines/>
+        <w:pBdr>
+          <w:left w:val="single" w:color="1B6CA8" w:sz="18" w:space="6"/>
+        </w:pBdr>
+        <w:shd w:fill="F4F4F4" w:val="clear"/>
+        <w:spacing w:after="200" w:before="100" w:line="264" w:lineRule="auto"/>
+        <w:ind w:left="140"/>
+      </w:pPr>
+      <w:r>
+        <w:rPr>
+          <w:rFonts w:ascii="Consolas" w:cs="Consolas" w:eastAsia="Consolas" w:hAnsi="Consolas"/>
+          <w:sz w:val="19"/>
+          <w:szCs w:val="19"/>
+        </w:rPr>
+        <w:t xml:space="preserve">FUNCTION verdreifache(x AS INTEGER) AS INTEGER</w:t>
+      </w:r>
+      <w:r>
+        <w:rPr>
+          <w:rFonts w:ascii="Consolas" w:cs="Consolas" w:eastAsia="Consolas" w:hAnsi="Consolas"/>
+          <w:sz w:val="19"/>
+          <w:szCs w:val="19"/>
+        </w:rPr>
+        <w:br/>
+        <w:t xml:space="preserve">    RETURN x * 3</w:t>
+      </w:r>
+      <w:r>
+        <w:rPr>
+          <w:rFonts w:ascii="Consolas" w:cs="Consolas" w:eastAsia="Consolas" w:hAnsi="Consolas"/>
+          <w:sz w:val="19"/>
+          <w:szCs w:val="19"/>
+        </w:rPr>
+        <w:br/>
+        <w:t xml:space="preserve">END FUNCTION</w:t>
+      </w:r>
+      <w:r>
+        <w:rPr>
+          <w:rFonts w:ascii="Consolas" w:cs="Consolas" w:eastAsia="Consolas" w:hAnsi="Consolas"/>
+          <w:sz w:val="19"/>
+          <w:szCs w:val="19"/>
+        </w:rPr>
+        <w:br/>
+        <w:t xml:space="preserve"/>
+      </w:r>
+      <w:r>
+        <w:rPr>
+          <w:rFonts w:ascii="Consolas" w:cs="Consolas" w:eastAsia="Consolas" w:hAnsi="Consolas"/>
+          <w:sz w:val="19"/>
+          <w:szCs w:val="19"/>
+        </w:rPr>
+        <w:br/>
+        <w:t xml:space="preserve">DIM f AS FUNCREF</w:t>
+      </w:r>
+      <w:r>
+        <w:rPr>
+          <w:rFonts w:ascii="Consolas" w:cs="Consolas" w:eastAsia="Consolas" w:hAnsi="Consolas"/>
+          <w:sz w:val="19"/>
+          <w:szCs w:val="19"/>
+        </w:rPr>
+        <w:br/>
+        <w:t xml:space="preserve">f = verdreifache</w:t>
+      </w:r>
+      <w:r>
+        <w:rPr>
+          <w:rFonts w:ascii="Consolas" w:cs="Consolas" w:eastAsia="Consolas" w:hAnsi="Consolas"/>
+          <w:sz w:val="19"/>
+          <w:szCs w:val="19"/>
+        </w:rPr>
+        <w:br/>
+        <w:t xml:space="preserve">PRINT f(7)</w:t>
+      </w:r>
+    </w:p>
+    <w:p>
+      <w:pPr>
+        <w:keepNext/>
+        <w:spacing w:after="30" w:before="120"/>
+      </w:pPr>
+      <w:r>
+        <w:rPr>
+          <w:b/>
+          <w:bCs/>
+          <w:i/>
+          <w:iCs/>
+          <w:color w:val="6A6A6A"/>
+          <w:sz w:val="18"/>
+          <w:szCs w:val="18"/>
+        </w:rPr>
+        <w:t xml:space="preserve">Ausgabe</w:t>
+      </w:r>
+    </w:p>
+    <w:p>
+      <w:pPr>
+        <w:keepLines/>
+        <w:pBdr>
+          <w:left w:val="single" w:color="9AC79A" w:sz="18" w:space="6"/>
+        </w:pBdr>
+        <w:shd w:fill="EAF4EA" w:val="clear"/>
+        <w:spacing w:after="200" w:before="100" w:line="264" w:lineRule="auto"/>
+        <w:ind w:left="140"/>
+      </w:pPr>
+      <w:r>
+        <w:rPr>
+          <w:rFonts w:ascii="Consolas" w:cs="Consolas" w:eastAsia="Consolas" w:hAnsi="Consolas"/>
+          <w:sz w:val="19"/>
+          <w:szCs w:val="19"/>
+        </w:rPr>
+        <w:t xml:space="preserve">21</w:t>
+      </w:r>
+    </w:p>
+    <w:p>
+      <w:pPr>
+        <w:pStyle w:val="Heading2"/>
+        <w:keepNext/>
+        <w:keepLines/>
+        <w:spacing w:after="120" w:before="280"/>
+      </w:pPr>
+      <w:r>
+        <w:t xml:space="preserve">Sich selbst aufrufen: Rekursion</w:t>
+      </w:r>
+    </w:p>
+    <w:p>
+      <w:pPr>
+        <w:spacing w:after="180" w:line="312" w:lineRule="auto"/>
+      </w:pPr>
+      <w:r>
+        <w:rPr>
+          <w:sz w:val="22"/>
+          <w:szCs w:val="22"/>
+        </w:rPr>
+        <w:t xml:space="preserve">Eine Funktion darf sich selbst aufrufen. Das nennt man Rekursion und es eignet sich für Probleme, die sich in kleinere Versionen ihrer selbst zerlegen lassen – etwa die Fakultät (5! = 5 · 4 · 3 · 2 · 1). Wichtig ist ein Abbruchfall, der die Kette beendet, sonst ruft sich die Funktion endlos selbst auf.</w:t>
+      </w:r>
+    </w:p>
+    <w:p>
+      <w:pPr>
+        <w:keepLines/>
+        <w:pBdr>
+          <w:left w:val="single" w:color="1B6CA8" w:sz="18" w:space="6"/>
+        </w:pBdr>
+        <w:shd w:fill="F4F4F4" w:val="clear"/>
+        <w:spacing w:after="200" w:before="100" w:line="264" w:lineRule="auto"/>
+        <w:ind w:left="140"/>
+      </w:pPr>
+      <w:r>
+        <w:rPr>
+          <w:rFonts w:ascii="Consolas" w:cs="Consolas" w:eastAsia="Consolas" w:hAnsi="Consolas"/>
+          <w:sz w:val="19"/>
+          <w:szCs w:val="19"/>
+        </w:rPr>
+        <w:t xml:space="preserve">FUNCTION fakultaet(n AS INTEGER) AS INTEGER</w:t>
+      </w:r>
+      <w:r>
+        <w:rPr>
+          <w:rFonts w:ascii="Consolas" w:cs="Consolas" w:eastAsia="Consolas" w:hAnsi="Consolas"/>
+          <w:sz w:val="19"/>
+          <w:szCs w:val="19"/>
+        </w:rPr>
+        <w:br/>
+        <w:t xml:space="preserve">    IF n &lt;= 1 THEN RETURN 1      ' Abbruchfall</w:t>
+      </w:r>
+      <w:r>
+        <w:rPr>
+          <w:rFonts w:ascii="Consolas" w:cs="Consolas" w:eastAsia="Consolas" w:hAnsi="Consolas"/>
+          <w:sz w:val="19"/>
+          <w:szCs w:val="19"/>
+        </w:rPr>
+        <w:br/>
+        <w:t xml:space="preserve">    RETURN n * fakultaet(n - 1)  ' ruft sich selbst auf</w:t>
+      </w:r>
+      <w:r>
+        <w:rPr>
+          <w:rFonts w:ascii="Consolas" w:cs="Consolas" w:eastAsia="Consolas" w:hAnsi="Consolas"/>
+          <w:sz w:val="19"/>
+          <w:szCs w:val="19"/>
+        </w:rPr>
+        <w:br/>
+        <w:t xml:space="preserve">END FUNCTION</w:t>
+      </w:r>
+      <w:r>
+        <w:rPr>
+          <w:rFonts w:ascii="Consolas" w:cs="Consolas" w:eastAsia="Consolas" w:hAnsi="Consolas"/>
+          <w:sz w:val="19"/>
+          <w:szCs w:val="19"/>
+        </w:rPr>
+        <w:br/>
+        <w:t xml:space="preserve"/>
+      </w:r>
+      <w:r>
+        <w:rPr>
+          <w:rFonts w:ascii="Consolas" w:cs="Consolas" w:eastAsia="Consolas" w:hAnsi="Consolas"/>
+          <w:sz w:val="19"/>
+          <w:szCs w:val="19"/>
+        </w:rPr>
+        <w:br/>
+        <w:t xml:space="preserve">PRINT fakultaet(5)</w:t>
+      </w:r>
+    </w:p>
+    <w:p>
+      <w:pPr>
+        <w:keepLines/>
+        <w:pBdr>
+          <w:left w:val="single" w:color="9AC79A" w:sz="18" w:space="6"/>
+        </w:pBdr>
+        <w:shd w:fill="EAF4EA" w:val="clear"/>
+        <w:spacing w:after="200" w:before="100" w:line="264" w:lineRule="auto"/>
+        <w:ind w:left="140"/>
+      </w:pPr>
+      <w:r>
+        <w:rPr>
+          <w:rFonts w:ascii="Consolas" w:cs="Consolas" w:eastAsia="Consolas" w:hAnsi="Consolas"/>
+          <w:sz w:val="19"/>
+          <w:szCs w:val="19"/>
+        </w:rPr>
+        <w:t xml:space="preserve">120</w:t>
+      </w:r>
+    </w:p>
+    <w:p>
+      <w:pPr>
+        <w:spacing w:before="60"/>
+      </w:pPr>
+    </w:p>
+    <w:tbl>
+      <w:tblPr>
+        <w:tblW w:type="dxa" w:w="9360"/>
+        <w:tblBorders>
+          <w:top w:val="single" w:color="auto" w:sz="4"/>
+          <w:left w:val="single" w:color="auto" w:sz="4"/>
+          <w:bottom w:val="single" w:color="auto" w:sz="4"/>
+          <w:right w:val="single" w:color="auto" w:sz="4"/>
+          <w:insideH w:val="single" w:color="auto" w:sz="4"/>
+          <w:insideV w:val="single" w:color="auto" w:sz="4"/>
+        </w:tblBorders>
+      </w:tblPr>
+      <w:tblGrid>
+        <w:gridCol w:w="9360"/>
+      </w:tblGrid>
+      <w:tr>
+        <w:trPr>
+          <w:cantSplit/>
+        </w:trPr>
+        <w:tc>
+          <w:tcPr>
+            <w:tcW w:type="dxa" w:w="9360"/>
+            <w:tcBorders>
+              <w:top w:val="single" w:color="E0A0A0" w:sz="6"/>
+              <w:left w:val="single" w:color="E0A0A0" w:sz="6"/>
+              <w:bottom w:val="single" w:color="E0A0A0" w:sz="6"/>
+              <w:right w:val="single" w:color="E0A0A0" w:sz="6"/>
+            </w:tcBorders>
+            <w:shd w:fill="FBEAEA" w:val="clear"/>
+            <w:tcMar>
+              <w:top w:type="dxa" w:w="140"/>
+              <w:left w:type="dxa" w:w="180"/>
+              <w:bottom w:type="dxa" w:w="140"/>
+              <w:right w:type="dxa" w:w="180"/>
+            </w:tcMar>
+          </w:tcPr>
+          <w:p>
+            <w:pPr>
+              <w:spacing w:after="40"/>
+            </w:pPr>
+            <w:r>
+              <w:rPr>
+                <w:b/>
+                <w:bCs/>
+                <w:color w:val="B23030"/>
+                <w:sz w:val="22"/>
+                <w:szCs w:val="22"/>
+              </w:rPr>
+              <w:t xml:space="preserve">Achtung</w:t>
+            </w:r>
+          </w:p>
+          <w:p>
+            <w:pPr>
+              <w:spacing w:after="0" w:line="312" w:lineRule="auto"/>
+            </w:pPr>
+            <w:r>
+              <w:rPr>
+                <w:sz w:val="22"/>
+                <w:szCs w:val="22"/>
+              </w:rPr>
+              <w:t xml:space="preserve">Jede Rekursion braucht einen Abbruchfall, der ohne weiteren Selbstaufruf zurückkehrt – hier n &lt;= 1. Fehlt er, läuft die Funktion immer tiefer, bis das Programm mit einem Fehler abbricht.</w:t>
+            </w:r>
+          </w:p>
+        </w:tc>
+      </w:tr>
+    </w:tbl>
+    <w:p>
+      <w:pPr>
+        <w:spacing w:after="160"/>
+      </w:pPr>
+    </w:p>
+    <w:p>
+      <w:pPr>
+        <w:spacing w:before="60"/>
+      </w:pPr>
+    </w:p>
+    <w:tbl>
+      <w:tblPr>
+        <w:tblW w:type="dxa" w:w="9360"/>
+        <w:tblBorders>
+          <w:top w:val="single" w:color="auto" w:sz="4"/>
+          <w:left w:val="single" w:color="auto" w:sz="4"/>
+          <w:bottom w:val="single" w:color="auto" w:sz="4"/>
+          <w:right w:val="single" w:color="auto" w:sz="4"/>
+          <w:insideH w:val="single" w:color="auto" w:sz="4"/>
+          <w:insideV w:val="single" w:color="auto" w:sz="4"/>
+        </w:tblBorders>
+      </w:tblPr>
+      <w:tblGrid>
+        <w:gridCol w:w="9360"/>
+      </w:tblGrid>
+      <w:tr>
+        <w:trPr>
+          <w:cantSplit/>
+        </w:trPr>
+        <w:tc>
+          <w:tcPr>
+            <w:tcW w:type="dxa" w:w="9360"/>
+            <w:tcBorders>
+              <w:top w:val="single" w:color="9CC8E6" w:sz="6"/>
+              <w:left w:val="single" w:color="9CC8E6" w:sz="6"/>
+              <w:bottom w:val="single" w:color="9CC8E6" w:sz="6"/>
+              <w:right w:val="single" w:color="9CC8E6" w:sz="6"/>
+            </w:tcBorders>
+            <w:shd w:fill="E7F2FA" w:val="clear"/>
+            <w:tcMar>
+              <w:top w:type="dxa" w:w="140"/>
+              <w:left w:type="dxa" w:w="180"/>
+              <w:bottom w:type="dxa" w:w="140"/>
+              <w:right w:type="dxa" w:w="180"/>
+            </w:tcMar>
+          </w:tcPr>
+          <w:p>
+            <w:pPr>
+              <w:spacing w:after="40"/>
+            </w:pPr>
+            <w:r>
+              <w:rPr>
+                <w:b/>
+                <w:bCs/>
+                <w:color w:val="1B6CA8"/>
+                <w:sz w:val="22"/>
+                <w:szCs w:val="22"/>
+              </w:rPr>
+              <w:t xml:space="preserve">Gute Bausteine</w:t>
+            </w:r>
+          </w:p>
+          <w:p>
+            <w:pPr>
+              <w:spacing w:after="0" w:line="312" w:lineRule="auto"/>
+            </w:pPr>
+            <w:r>
+              <w:rPr>
+                <w:sz w:val="22"/>
+                <w:szCs w:val="22"/>
+              </w:rPr>
+              <w:t xml:space="preserve">Gib Funktionen sprechende Namen (berechne_schaden statt bs), halte sie kurz und lass jede genau eine Sache tun. Brauchst du eine Funktion an vielen Stellen, lagere sie in eine eigene Datei aus und binde sie mit IMPORT ein – das lernst du im Kapitel „Module importieren“.</w:t>
             </w:r>
           </w:p>
         </w:tc>

</xml_diff>

<commit_message>
docs(buch): Lehrbuch Kap 16 -- Strings im Detail
LEN, UPPER$/LOWER$, LEFT$/RIGHT$/MID$ (0-basiert!), Index+Slicing, INSTR/
CONTAINS/IN/STARTSWITH/ENDSWITH, REPLACE$/TRIM$, SPLIT$/JOIN$, PADL$/PADR$/
REPEAT$, STR$/VAL/TRYVAL, CHR$/ASC, Methoden-Syntax. Achtung-Kasten zur
0-basierten Zaehlung. Alle Beispiel-Ausgaben gegen gbrt verifiziert.

Co-Authored-By: Claude Opus 4.8 (1M context) <noreply@anthropic.com>
</commit_message>
<xml_diff>
--- a/buch-referenz/buch/GameBasic-Lehrbuch.docx
+++ b/buch-referenz/buch/GameBasic-Lehrbuch.docx
@@ -408,6 +408,33 @@
           <w:szCs w:val="22"/>
         </w:rPr>
         <w:t xml:space="preserve">	34</w:t>
+      </w:r>
+    </w:p>
+    <w:p>
+      <w:pPr>
+        <w:tabs>
+          <w:tab w:val="right" w:pos="9200" w:leader="dot"/>
+        </w:tabs>
+        <w:spacing w:after="20" w:before="0"/>
+        <w:ind w:left="280"/>
+      </w:pPr>
+      <w:r>
+        <w:rPr>
+          <w:b w:val="false"/>
+          <w:bCs w:val="false"/>
+          <w:color w:val="222222"/>
+          <w:sz w:val="22"/>
+          <w:szCs w:val="22"/>
+        </w:rPr>
+        <w:t xml:space="preserve">Strings im Detail</w:t>
+      </w:r>
+      <w:r>
+        <w:rPr>
+          <w:color w:val="555555"/>
+          <w:sz w:val="22"/>
+          <w:szCs w:val="22"/>
+        </w:rPr>
+        <w:t xml:space="preserve">	39</w:t>
       </w:r>
     </w:p>
     <w:p>
@@ -11152,6 +11179,2383 @@
                 <w:szCs w:val="22"/>
               </w:rPr>
               <w:t xml:space="preserve">Gib Funktionen sprechende Namen (berechne_schaden statt bs), halte sie kurz und lass jede genau eine Sache tun. Brauchst du eine Funktion an vielen Stellen, lagere sie in eine eigene Datei aus und binde sie mit IMPORT ein – das lernst du im Kapitel „Module importieren“.</w:t>
+            </w:r>
+          </w:p>
+        </w:tc>
+      </w:tr>
+    </w:tbl>
+    <w:p>
+      <w:pPr>
+        <w:spacing w:after="160"/>
+      </w:pPr>
+    </w:p>
+    <w:p>
+      <w:pPr>
+        <w:pStyle w:val="Heading1"/>
+        <w:keepNext/>
+        <w:keepLines/>
+        <w:pageBreakBefore/>
+        <w:pBdr>
+          <w:bottom w:val="single" w:color="1B6CA8" w:sz="12" w:space="4"/>
+        </w:pBdr>
+        <w:spacing w:after="160" w:before="0"/>
+      </w:pPr>
+      <w:r>
+        <w:t xml:space="preserve">Strings im Detail</w:t>
+      </w:r>
+    </w:p>
+    <w:p>
+      <w:pPr>
+        <w:spacing w:after="180" w:line="312" w:lineRule="auto"/>
+      </w:pPr>
+      <w:r>
+        <w:rPr>
+          <w:sz w:val="22"/>
+          <w:szCs w:val="22"/>
+        </w:rPr>
+        <w:t xml:space="preserve">Ein String ist eine Zeichenkette – Text, eingeschlossen in Anführungszeichen. Du hast Strings längst benutzt; hier lernst du sie richtig kennen: ihre Länge messen, Teile herausschneiden, suchen, ersetzen, zerlegen und wieder zusammenbauen. Für fast jede Textaufgabe gibt es einen passenden eingebauten Befehl.</w:t>
+      </w:r>
+    </w:p>
+    <w:p>
+      <w:pPr>
+        <w:spacing w:before="60"/>
+      </w:pPr>
+    </w:p>
+    <w:tbl>
+      <w:tblPr>
+        <w:tblW w:type="dxa" w:w="9360"/>
+        <w:tblBorders>
+          <w:top w:val="single" w:color="auto" w:sz="4"/>
+          <w:left w:val="single" w:color="auto" w:sz="4"/>
+          <w:bottom w:val="single" w:color="auto" w:sz="4"/>
+          <w:right w:val="single" w:color="auto" w:sz="4"/>
+          <w:insideH w:val="single" w:color="auto" w:sz="4"/>
+          <w:insideV w:val="single" w:color="auto" w:sz="4"/>
+        </w:tblBorders>
+      </w:tblPr>
+      <w:tblGrid>
+        <w:gridCol w:w="9360"/>
+      </w:tblGrid>
+      <w:tr>
+        <w:trPr>
+          <w:cantSplit/>
+        </w:trPr>
+        <w:tc>
+          <w:tcPr>
+            <w:tcW w:type="dxa" w:w="9360"/>
+            <w:tcBorders>
+              <w:top w:val="single" w:color="E0B96A" w:sz="6"/>
+              <w:left w:val="single" w:color="E0B96A" w:sz="6"/>
+              <w:bottom w:val="single" w:color="E0B96A" w:sz="6"/>
+              <w:right w:val="single" w:color="E0B96A" w:sz="6"/>
+            </w:tcBorders>
+            <w:shd w:fill="FDF3E0" w:val="clear"/>
+            <w:tcMar>
+              <w:top w:type="dxa" w:w="140"/>
+              <w:left w:type="dxa" w:w="180"/>
+              <w:bottom w:type="dxa" w:w="140"/>
+              <w:right w:type="dxa" w:w="180"/>
+            </w:tcMar>
+          </w:tcPr>
+          <w:p>
+            <w:pPr>
+              <w:spacing w:after="40"/>
+            </w:pPr>
+            <w:r>
+              <w:rPr>
+                <w:b/>
+                <w:bCs/>
+                <w:color w:val="9A6A1E"/>
+                <w:sz w:val="22"/>
+                <w:szCs w:val="22"/>
+              </w:rPr>
+              <w:t xml:space="preserve">Merke</w:t>
+            </w:r>
+          </w:p>
+          <w:p>
+            <w:pPr>
+              <w:spacing w:after="0" w:line="312" w:lineRule="auto"/>
+            </w:pPr>
+            <w:r>
+              <w:rPr>
+                <w:sz w:val="22"/>
+                <w:szCs w:val="22"/>
+              </w:rPr>
+              <w:t xml:space="preserve">Viele String-Funktionen tragen ein $ am Namensende (LEFT$, MID$, UPPER$ …). Das ist eine alte BASIC-Tradition und kennzeichnet, dass die Funktion einen String zurückgibt. In GameBasic darfst du das $ auch weglassen: UPPER$ und UPPER sind dasselbe.</w:t>
+            </w:r>
+          </w:p>
+        </w:tc>
+      </w:tr>
+    </w:tbl>
+    <w:p>
+      <w:pPr>
+        <w:spacing w:after="160"/>
+      </w:pPr>
+    </w:p>
+    <w:p>
+      <w:pPr>
+        <w:pStyle w:val="Heading2"/>
+        <w:keepNext/>
+        <w:keepLines/>
+        <w:spacing w:after="120" w:before="280"/>
+      </w:pPr>
+      <w:r>
+        <w:t xml:space="preserve">Wie lang ist der Text?</w:t>
+      </w:r>
+    </w:p>
+    <w:p>
+      <w:pPr>
+        <w:keepNext/>
+        <w:keepLines/>
+        <w:pBdr>
+          <w:bottom w:val="single" w:color="DDD0C0" w:sz="4" w:space="2"/>
+        </w:pBdr>
+        <w:spacing w:after="40" w:before="360"/>
+      </w:pPr>
+      <w:r>
+        <w:rPr>
+          <w:rFonts w:ascii="Consolas" w:cs="Consolas" w:eastAsia="Consolas" w:hAnsi="Consolas"/>
+          <w:b/>
+          <w:bCs/>
+          <w:color w:val="9A3412"/>
+          <w:sz w:val="24"/>
+          <w:szCs w:val="24"/>
+        </w:rPr>
+        <w:t xml:space="preserve">LEN</w:t>
+      </w:r>
+    </w:p>
+    <w:p>
+      <w:pPr>
+        <w:keepNext/>
+        <w:spacing w:after="120"/>
+      </w:pPr>
+      <w:r>
+        <w:rPr>
+          <w:b/>
+          <w:bCs/>
+          <w:color w:val="6A6A6A"/>
+          <w:sz w:val="18"/>
+          <w:szCs w:val="18"/>
+        </w:rPr>
+        <w:t xml:space="preserve">Syntax:  </w:t>
+      </w:r>
+      <w:r>
+        <w:rPr>
+          <w:rFonts w:ascii="Consolas" w:cs="Consolas" w:eastAsia="Consolas" w:hAnsi="Consolas"/>
+          <w:color w:val="335577"/>
+          <w:sz w:val="19"/>
+          <w:szCs w:val="19"/>
+        </w:rPr>
+        <w:t xml:space="preserve">LEN(s$)</w:t>
+      </w:r>
+    </w:p>
+    <w:p>
+      <w:pPr>
+        <w:spacing w:after="180" w:line="312" w:lineRule="auto"/>
+      </w:pPr>
+      <w:r>
+        <w:rPr>
+          <w:sz w:val="22"/>
+          <w:szCs w:val="22"/>
+        </w:rPr>
+        <w:t xml:space="preserve">Liefert die Anzahl der Zeichen in einem String. (LEN funktioniert auch für Arrays und liefert dort die Anzahl der Elemente.)</w:t>
+      </w:r>
+    </w:p>
+    <w:p>
+      <w:pPr>
+        <w:keepNext/>
+        <w:spacing w:after="30" w:before="120"/>
+      </w:pPr>
+      <w:r>
+        <w:rPr>
+          <w:b/>
+          <w:bCs/>
+          <w:i/>
+          <w:iCs/>
+          <w:color w:val="6A6A6A"/>
+          <w:sz w:val="18"/>
+          <w:szCs w:val="18"/>
+        </w:rPr>
+        <w:t xml:space="preserve">Beispiel</w:t>
+      </w:r>
+    </w:p>
+    <w:p>
+      <w:pPr>
+        <w:keepLines/>
+        <w:pBdr>
+          <w:left w:val="single" w:color="1B6CA8" w:sz="18" w:space="6"/>
+        </w:pBdr>
+        <w:shd w:fill="F4F4F4" w:val="clear"/>
+        <w:spacing w:after="200" w:before="100" w:line="264" w:lineRule="auto"/>
+        <w:ind w:left="140"/>
+      </w:pPr>
+      <w:r>
+        <w:rPr>
+          <w:rFonts w:ascii="Consolas" w:cs="Consolas" w:eastAsia="Consolas" w:hAnsi="Consolas"/>
+          <w:sz w:val="19"/>
+          <w:szCs w:val="19"/>
+        </w:rPr>
+        <w:t xml:space="preserve">PRINT LEN("GameBasic")</w:t>
+      </w:r>
+      <w:r>
+        <w:rPr>
+          <w:rFonts w:ascii="Consolas" w:cs="Consolas" w:eastAsia="Consolas" w:hAnsi="Consolas"/>
+          <w:sz w:val="19"/>
+          <w:szCs w:val="19"/>
+        </w:rPr>
+        <w:br/>
+        <w:t xml:space="preserve">PRINT LEN("")</w:t>
+      </w:r>
+    </w:p>
+    <w:p>
+      <w:pPr>
+        <w:keepNext/>
+        <w:spacing w:after="30" w:before="120"/>
+      </w:pPr>
+      <w:r>
+        <w:rPr>
+          <w:b/>
+          <w:bCs/>
+          <w:i/>
+          <w:iCs/>
+          <w:color w:val="6A6A6A"/>
+          <w:sz w:val="18"/>
+          <w:szCs w:val="18"/>
+        </w:rPr>
+        <w:t xml:space="preserve">Ausgabe</w:t>
+      </w:r>
+    </w:p>
+    <w:p>
+      <w:pPr>
+        <w:keepLines/>
+        <w:pBdr>
+          <w:left w:val="single" w:color="9AC79A" w:sz="18" w:space="6"/>
+        </w:pBdr>
+        <w:shd w:fill="EAF4EA" w:val="clear"/>
+        <w:spacing w:after="200" w:before="100" w:line="264" w:lineRule="auto"/>
+        <w:ind w:left="140"/>
+      </w:pPr>
+      <w:r>
+        <w:rPr>
+          <w:rFonts w:ascii="Consolas" w:cs="Consolas" w:eastAsia="Consolas" w:hAnsi="Consolas"/>
+          <w:sz w:val="19"/>
+          <w:szCs w:val="19"/>
+        </w:rPr>
+        <w:t xml:space="preserve">9</w:t>
+      </w:r>
+      <w:r>
+        <w:rPr>
+          <w:rFonts w:ascii="Consolas" w:cs="Consolas" w:eastAsia="Consolas" w:hAnsi="Consolas"/>
+          <w:sz w:val="19"/>
+          <w:szCs w:val="19"/>
+        </w:rPr>
+        <w:br/>
+        <w:t xml:space="preserve">0</w:t>
+      </w:r>
+    </w:p>
+    <w:p>
+      <w:pPr>
+        <w:pStyle w:val="Heading2"/>
+        <w:keepNext/>
+        <w:keepLines/>
+        <w:spacing w:after="120" w:before="280"/>
+      </w:pPr>
+      <w:r>
+        <w:t xml:space="preserve">Groß und klein</w:t>
+      </w:r>
+    </w:p>
+    <w:p>
+      <w:pPr>
+        <w:keepNext/>
+        <w:keepLines/>
+        <w:pBdr>
+          <w:bottom w:val="single" w:color="DDD0C0" w:sz="4" w:space="2"/>
+        </w:pBdr>
+        <w:spacing w:after="40" w:before="360"/>
+      </w:pPr>
+      <w:r>
+        <w:rPr>
+          <w:rFonts w:ascii="Consolas" w:cs="Consolas" w:eastAsia="Consolas" w:hAnsi="Consolas"/>
+          <w:b/>
+          <w:bCs/>
+          <w:color w:val="9A3412"/>
+          <w:sz w:val="24"/>
+          <w:szCs w:val="24"/>
+        </w:rPr>
+        <w:t xml:space="preserve">UPPER$  /  LOWER$</w:t>
+      </w:r>
+    </w:p>
+    <w:p>
+      <w:pPr>
+        <w:keepNext/>
+        <w:spacing w:after="120"/>
+      </w:pPr>
+      <w:r>
+        <w:rPr>
+          <w:b/>
+          <w:bCs/>
+          <w:color w:val="6A6A6A"/>
+          <w:sz w:val="18"/>
+          <w:szCs w:val="18"/>
+        </w:rPr>
+        <w:t xml:space="preserve">Syntax:  </w:t>
+      </w:r>
+      <w:r>
+        <w:rPr>
+          <w:rFonts w:ascii="Consolas" w:cs="Consolas" w:eastAsia="Consolas" w:hAnsi="Consolas"/>
+          <w:color w:val="335577"/>
+          <w:sz w:val="19"/>
+          <w:szCs w:val="19"/>
+        </w:rPr>
+        <w:t xml:space="preserve">UPPER$(s$)   LOWER$(s$)</w:t>
+      </w:r>
+    </w:p>
+    <w:p>
+      <w:pPr>
+        <w:spacing w:after="180" w:line="312" w:lineRule="auto"/>
+      </w:pPr>
+      <w:r>
+        <w:rPr>
+          <w:sz w:val="22"/>
+          <w:szCs w:val="22"/>
+        </w:rPr>
+        <w:t xml:space="preserve">Wandelt den ganzen Text in Groß- bzw. Kleinbuchstaben um. Praktisch, um Eingaben zu vergleichen, ohne auf die Schreibweise zu achten.</w:t>
+      </w:r>
+    </w:p>
+    <w:p>
+      <w:pPr>
+        <w:keepNext/>
+        <w:spacing w:after="30" w:before="120"/>
+      </w:pPr>
+      <w:r>
+        <w:rPr>
+          <w:b/>
+          <w:bCs/>
+          <w:i/>
+          <w:iCs/>
+          <w:color w:val="6A6A6A"/>
+          <w:sz w:val="18"/>
+          <w:szCs w:val="18"/>
+        </w:rPr>
+        <w:t xml:space="preserve">Beispiel</w:t>
+      </w:r>
+    </w:p>
+    <w:p>
+      <w:pPr>
+        <w:keepLines/>
+        <w:pBdr>
+          <w:left w:val="single" w:color="1B6CA8" w:sz="18" w:space="6"/>
+        </w:pBdr>
+        <w:shd w:fill="F4F4F4" w:val="clear"/>
+        <w:spacing w:after="200" w:before="100" w:line="264" w:lineRule="auto"/>
+        <w:ind w:left="140"/>
+      </w:pPr>
+      <w:r>
+        <w:rPr>
+          <w:rFonts w:ascii="Consolas" w:cs="Consolas" w:eastAsia="Consolas" w:hAnsi="Consolas"/>
+          <w:sz w:val="19"/>
+          <w:szCs w:val="19"/>
+        </w:rPr>
+        <w:t xml:space="preserve">PRINT UPPER$("hallo")</w:t>
+      </w:r>
+      <w:r>
+        <w:rPr>
+          <w:rFonts w:ascii="Consolas" w:cs="Consolas" w:eastAsia="Consolas" w:hAnsi="Consolas"/>
+          <w:sz w:val="19"/>
+          <w:szCs w:val="19"/>
+        </w:rPr>
+        <w:br/>
+        <w:t xml:space="preserve">PRINT LOWER$("HALLO")</w:t>
+      </w:r>
+    </w:p>
+    <w:p>
+      <w:pPr>
+        <w:keepNext/>
+        <w:spacing w:after="30" w:before="120"/>
+      </w:pPr>
+      <w:r>
+        <w:rPr>
+          <w:b/>
+          <w:bCs/>
+          <w:i/>
+          <w:iCs/>
+          <w:color w:val="6A6A6A"/>
+          <w:sz w:val="18"/>
+          <w:szCs w:val="18"/>
+        </w:rPr>
+        <w:t xml:space="preserve">Ausgabe</w:t>
+      </w:r>
+    </w:p>
+    <w:p>
+      <w:pPr>
+        <w:keepLines/>
+        <w:pBdr>
+          <w:left w:val="single" w:color="9AC79A" w:sz="18" w:space="6"/>
+        </w:pBdr>
+        <w:shd w:fill="EAF4EA" w:val="clear"/>
+        <w:spacing w:after="200" w:before="100" w:line="264" w:lineRule="auto"/>
+        <w:ind w:left="140"/>
+      </w:pPr>
+      <w:r>
+        <w:rPr>
+          <w:rFonts w:ascii="Consolas" w:cs="Consolas" w:eastAsia="Consolas" w:hAnsi="Consolas"/>
+          <w:sz w:val="19"/>
+          <w:szCs w:val="19"/>
+        </w:rPr>
+        <w:t xml:space="preserve">HALLO</w:t>
+      </w:r>
+      <w:r>
+        <w:rPr>
+          <w:rFonts w:ascii="Consolas" w:cs="Consolas" w:eastAsia="Consolas" w:hAnsi="Consolas"/>
+          <w:sz w:val="19"/>
+          <w:szCs w:val="19"/>
+        </w:rPr>
+        <w:br/>
+        <w:t xml:space="preserve">hallo</w:t>
+      </w:r>
+    </w:p>
+    <w:p>
+      <w:pPr>
+        <w:pStyle w:val="Heading2"/>
+        <w:keepNext/>
+        <w:keepLines/>
+        <w:spacing w:after="120" w:before="280"/>
+      </w:pPr>
+      <w:r>
+        <w:t xml:space="preserve">Teile herausschneiden</w:t>
+      </w:r>
+    </w:p>
+    <w:p>
+      <w:pPr>
+        <w:spacing w:after="180" w:line="312" w:lineRule="auto"/>
+      </w:pPr>
+      <w:r>
+        <w:rPr>
+          <w:sz w:val="22"/>
+          <w:szCs w:val="22"/>
+        </w:rPr>
+        <w:t xml:space="preserve">Mit LEFT$ und RIGHT$ holst du dir die ersten oder letzten Zeichen. MID$ schneidet ab einer beliebigen Stelle. Wichtig: Die Position bei MID$ wird ab 0 gezählt – das erste Zeichen hat die Position 0, das zweite die Position 1 und so weiter.</w:t>
+      </w:r>
+    </w:p>
+    <w:p>
+      <w:pPr>
+        <w:keepNext/>
+        <w:keepLines/>
+        <w:pBdr>
+          <w:bottom w:val="single" w:color="DDD0C0" w:sz="4" w:space="2"/>
+        </w:pBdr>
+        <w:spacing w:after="40" w:before="360"/>
+      </w:pPr>
+      <w:r>
+        <w:rPr>
+          <w:rFonts w:ascii="Consolas" w:cs="Consolas" w:eastAsia="Consolas" w:hAnsi="Consolas"/>
+          <w:b/>
+          <w:bCs/>
+          <w:color w:val="9A3412"/>
+          <w:sz w:val="24"/>
+          <w:szCs w:val="24"/>
+        </w:rPr>
+        <w:t xml:space="preserve">LEFT$  /  RIGHT$</w:t>
+      </w:r>
+    </w:p>
+    <w:p>
+      <w:pPr>
+        <w:keepNext/>
+        <w:spacing w:after="120"/>
+      </w:pPr>
+      <w:r>
+        <w:rPr>
+          <w:b/>
+          <w:bCs/>
+          <w:color w:val="6A6A6A"/>
+          <w:sz w:val="18"/>
+          <w:szCs w:val="18"/>
+        </w:rPr>
+        <w:t xml:space="preserve">Syntax:  </w:t>
+      </w:r>
+      <w:r>
+        <w:rPr>
+          <w:rFonts w:ascii="Consolas" w:cs="Consolas" w:eastAsia="Consolas" w:hAnsi="Consolas"/>
+          <w:color w:val="335577"/>
+          <w:sz w:val="19"/>
+          <w:szCs w:val="19"/>
+        </w:rPr>
+        <w:t xml:space="preserve">LEFT$(s$, n)   RIGHT$(s$, n)</w:t>
+      </w:r>
+    </w:p>
+    <w:p>
+      <w:pPr>
+        <w:spacing w:after="180" w:line="312" w:lineRule="auto"/>
+      </w:pPr>
+      <w:r>
+        <w:rPr>
+          <w:sz w:val="22"/>
+          <w:szCs w:val="22"/>
+        </w:rPr>
+        <w:t xml:space="preserve">LEFT$ liefert die ersten n Zeichen, RIGHT$ die letzten n.</w:t>
+      </w:r>
+    </w:p>
+    <w:p>
+      <w:pPr>
+        <w:keepNext/>
+        <w:spacing w:after="30" w:before="120"/>
+      </w:pPr>
+      <w:r>
+        <w:rPr>
+          <w:b/>
+          <w:bCs/>
+          <w:i/>
+          <w:iCs/>
+          <w:color w:val="6A6A6A"/>
+          <w:sz w:val="18"/>
+          <w:szCs w:val="18"/>
+        </w:rPr>
+        <w:t xml:space="preserve">Beispiel</w:t>
+      </w:r>
+    </w:p>
+    <w:p>
+      <w:pPr>
+        <w:keepLines/>
+        <w:pBdr>
+          <w:left w:val="single" w:color="1B6CA8" w:sz="18" w:space="6"/>
+        </w:pBdr>
+        <w:shd w:fill="F4F4F4" w:val="clear"/>
+        <w:spacing w:after="200" w:before="100" w:line="264" w:lineRule="auto"/>
+        <w:ind w:left="140"/>
+      </w:pPr>
+      <w:r>
+        <w:rPr>
+          <w:rFonts w:ascii="Consolas" w:cs="Consolas" w:eastAsia="Consolas" w:hAnsi="Consolas"/>
+          <w:sz w:val="19"/>
+          <w:szCs w:val="19"/>
+        </w:rPr>
+        <w:t xml:space="preserve">PRINT LEFT$("GameBasic", 4)</w:t>
+      </w:r>
+      <w:r>
+        <w:rPr>
+          <w:rFonts w:ascii="Consolas" w:cs="Consolas" w:eastAsia="Consolas" w:hAnsi="Consolas"/>
+          <w:sz w:val="19"/>
+          <w:szCs w:val="19"/>
+        </w:rPr>
+        <w:br/>
+        <w:t xml:space="preserve">PRINT RIGHT$("GameBasic", 5)</w:t>
+      </w:r>
+    </w:p>
+    <w:p>
+      <w:pPr>
+        <w:keepNext/>
+        <w:spacing w:after="30" w:before="120"/>
+      </w:pPr>
+      <w:r>
+        <w:rPr>
+          <w:b/>
+          <w:bCs/>
+          <w:i/>
+          <w:iCs/>
+          <w:color w:val="6A6A6A"/>
+          <w:sz w:val="18"/>
+          <w:szCs w:val="18"/>
+        </w:rPr>
+        <w:t xml:space="preserve">Ausgabe</w:t>
+      </w:r>
+    </w:p>
+    <w:p>
+      <w:pPr>
+        <w:keepLines/>
+        <w:pBdr>
+          <w:left w:val="single" w:color="9AC79A" w:sz="18" w:space="6"/>
+        </w:pBdr>
+        <w:shd w:fill="EAF4EA" w:val="clear"/>
+        <w:spacing w:after="200" w:before="100" w:line="264" w:lineRule="auto"/>
+        <w:ind w:left="140"/>
+      </w:pPr>
+      <w:r>
+        <w:rPr>
+          <w:rFonts w:ascii="Consolas" w:cs="Consolas" w:eastAsia="Consolas" w:hAnsi="Consolas"/>
+          <w:sz w:val="19"/>
+          <w:szCs w:val="19"/>
+        </w:rPr>
+        <w:t xml:space="preserve">Game</w:t>
+      </w:r>
+      <w:r>
+        <w:rPr>
+          <w:rFonts w:ascii="Consolas" w:cs="Consolas" w:eastAsia="Consolas" w:hAnsi="Consolas"/>
+          <w:sz w:val="19"/>
+          <w:szCs w:val="19"/>
+        </w:rPr>
+        <w:br/>
+        <w:t xml:space="preserve">Basic</w:t>
+      </w:r>
+    </w:p>
+    <w:p>
+      <w:pPr>
+        <w:keepNext/>
+        <w:keepLines/>
+        <w:pBdr>
+          <w:bottom w:val="single" w:color="DDD0C0" w:sz="4" w:space="2"/>
+        </w:pBdr>
+        <w:spacing w:after="40" w:before="360"/>
+      </w:pPr>
+      <w:r>
+        <w:rPr>
+          <w:rFonts w:ascii="Consolas" w:cs="Consolas" w:eastAsia="Consolas" w:hAnsi="Consolas"/>
+          <w:b/>
+          <w:bCs/>
+          <w:color w:val="9A3412"/>
+          <w:sz w:val="24"/>
+          <w:szCs w:val="24"/>
+        </w:rPr>
+        <w:t xml:space="preserve">MID$</w:t>
+      </w:r>
+    </w:p>
+    <w:p>
+      <w:pPr>
+        <w:keepNext/>
+        <w:spacing w:after="120"/>
+      </w:pPr>
+      <w:r>
+        <w:rPr>
+          <w:b/>
+          <w:bCs/>
+          <w:color w:val="6A6A6A"/>
+          <w:sz w:val="18"/>
+          <w:szCs w:val="18"/>
+        </w:rPr>
+        <w:t xml:space="preserve">Syntax:  </w:t>
+      </w:r>
+      <w:r>
+        <w:rPr>
+          <w:rFonts w:ascii="Consolas" w:cs="Consolas" w:eastAsia="Consolas" w:hAnsi="Consolas"/>
+          <w:color w:val="335577"/>
+          <w:sz w:val="19"/>
+          <w:szCs w:val="19"/>
+        </w:rPr>
+        <w:t xml:space="preserve">MID$(s$, start[, n])</w:t>
+      </w:r>
+    </w:p>
+    <w:p>
+      <w:pPr>
+        <w:spacing w:after="180" w:line="312" w:lineRule="auto"/>
+      </w:pPr>
+      <w:r>
+        <w:rPr>
+          <w:sz w:val="22"/>
+          <w:szCs w:val="22"/>
+        </w:rPr>
+        <w:t xml:space="preserve">Liefert ab der Position start (0-basiert!) bis zu n Zeichen. Lässt du n weg, geht es bis zum Ende des Strings.</w:t>
+      </w:r>
+    </w:p>
+    <w:p>
+      <w:pPr>
+        <w:keepNext/>
+        <w:spacing w:after="30" w:before="120"/>
+      </w:pPr>
+      <w:r>
+        <w:rPr>
+          <w:b/>
+          <w:bCs/>
+          <w:i/>
+          <w:iCs/>
+          <w:color w:val="6A6A6A"/>
+          <w:sz w:val="18"/>
+          <w:szCs w:val="18"/>
+        </w:rPr>
+        <w:t xml:space="preserve">Beispiel</w:t>
+      </w:r>
+    </w:p>
+    <w:p>
+      <w:pPr>
+        <w:keepLines/>
+        <w:pBdr>
+          <w:left w:val="single" w:color="1B6CA8" w:sz="18" w:space="6"/>
+        </w:pBdr>
+        <w:shd w:fill="F4F4F4" w:val="clear"/>
+        <w:spacing w:after="200" w:before="100" w:line="264" w:lineRule="auto"/>
+        <w:ind w:left="140"/>
+      </w:pPr>
+      <w:r>
+        <w:rPr>
+          <w:rFonts w:ascii="Consolas" w:cs="Consolas" w:eastAsia="Consolas" w:hAnsi="Consolas"/>
+          <w:sz w:val="19"/>
+          <w:szCs w:val="19"/>
+        </w:rPr>
+        <w:t xml:space="preserve">PRINT MID$("GameBasic", 4)</w:t>
+      </w:r>
+      <w:r>
+        <w:rPr>
+          <w:rFonts w:ascii="Consolas" w:cs="Consolas" w:eastAsia="Consolas" w:hAnsi="Consolas"/>
+          <w:sz w:val="19"/>
+          <w:szCs w:val="19"/>
+        </w:rPr>
+        <w:br/>
+        <w:t xml:space="preserve">PRINT MID$("GameBasic", 4, 5)</w:t>
+      </w:r>
+    </w:p>
+    <w:p>
+      <w:pPr>
+        <w:keepNext/>
+        <w:spacing w:after="30" w:before="120"/>
+      </w:pPr>
+      <w:r>
+        <w:rPr>
+          <w:b/>
+          <w:bCs/>
+          <w:i/>
+          <w:iCs/>
+          <w:color w:val="6A6A6A"/>
+          <w:sz w:val="18"/>
+          <w:szCs w:val="18"/>
+        </w:rPr>
+        <w:t xml:space="preserve">Ausgabe</w:t>
+      </w:r>
+    </w:p>
+    <w:p>
+      <w:pPr>
+        <w:keepLines/>
+        <w:pBdr>
+          <w:left w:val="single" w:color="9AC79A" w:sz="18" w:space="6"/>
+        </w:pBdr>
+        <w:shd w:fill="EAF4EA" w:val="clear"/>
+        <w:spacing w:after="200" w:before="100" w:line="264" w:lineRule="auto"/>
+        <w:ind w:left="140"/>
+      </w:pPr>
+      <w:r>
+        <w:rPr>
+          <w:rFonts w:ascii="Consolas" w:cs="Consolas" w:eastAsia="Consolas" w:hAnsi="Consolas"/>
+          <w:sz w:val="19"/>
+          <w:szCs w:val="19"/>
+        </w:rPr>
+        <w:t xml:space="preserve">Basic</w:t>
+      </w:r>
+      <w:r>
+        <w:rPr>
+          <w:rFonts w:ascii="Consolas" w:cs="Consolas" w:eastAsia="Consolas" w:hAnsi="Consolas"/>
+          <w:sz w:val="19"/>
+          <w:szCs w:val="19"/>
+        </w:rPr>
+        <w:br/>
+        <w:t xml:space="preserve">Basic</w:t>
+      </w:r>
+    </w:p>
+    <w:p>
+      <w:pPr>
+        <w:spacing w:before="60"/>
+      </w:pPr>
+    </w:p>
+    <w:tbl>
+      <w:tblPr>
+        <w:tblW w:type="dxa" w:w="9360"/>
+        <w:tblBorders>
+          <w:top w:val="single" w:color="auto" w:sz="4"/>
+          <w:left w:val="single" w:color="auto" w:sz="4"/>
+          <w:bottom w:val="single" w:color="auto" w:sz="4"/>
+          <w:right w:val="single" w:color="auto" w:sz="4"/>
+          <w:insideH w:val="single" w:color="auto" w:sz="4"/>
+          <w:insideV w:val="single" w:color="auto" w:sz="4"/>
+        </w:tblBorders>
+      </w:tblPr>
+      <w:tblGrid>
+        <w:gridCol w:w="9360"/>
+      </w:tblGrid>
+      <w:tr>
+        <w:trPr>
+          <w:cantSplit/>
+        </w:trPr>
+        <w:tc>
+          <w:tcPr>
+            <w:tcW w:type="dxa" w:w="9360"/>
+            <w:tcBorders>
+              <w:top w:val="single" w:color="E0A0A0" w:sz="6"/>
+              <w:left w:val="single" w:color="E0A0A0" w:sz="6"/>
+              <w:bottom w:val="single" w:color="E0A0A0" w:sz="6"/>
+              <w:right w:val="single" w:color="E0A0A0" w:sz="6"/>
+            </w:tcBorders>
+            <w:shd w:fill="FBEAEA" w:val="clear"/>
+            <w:tcMar>
+              <w:top w:type="dxa" w:w="140"/>
+              <w:left w:type="dxa" w:w="180"/>
+              <w:bottom w:type="dxa" w:w="140"/>
+              <w:right w:type="dxa" w:w="180"/>
+            </w:tcMar>
+          </w:tcPr>
+          <w:p>
+            <w:pPr>
+              <w:spacing w:after="40"/>
+            </w:pPr>
+            <w:r>
+              <w:rPr>
+                <w:b/>
+                <w:bCs/>
+                <w:color w:val="B23030"/>
+                <w:sz w:val="22"/>
+                <w:szCs w:val="22"/>
+              </w:rPr>
+              <w:t xml:space="preserve">Achtung</w:t>
+            </w:r>
+          </w:p>
+          <w:p>
+            <w:pPr>
+              <w:spacing w:after="0" w:line="312" w:lineRule="auto"/>
+            </w:pPr>
+            <w:r>
+              <w:rPr>
+                <w:sz w:val="22"/>
+                <w:szCs w:val="22"/>
+              </w:rPr>
+              <w:t xml:space="preserve">Anders als manche älteren BASIC-Dialekte zählt GameBasic Zeichen-Positionen ab 0, nicht ab 1. Das erste Zeichen von "GameBasic" (das G) sitzt an Position 0, das B an Position 4. Das gilt auch für INSTR und den Index-Zugriff weiter unten.</w:t>
+            </w:r>
+          </w:p>
+        </w:tc>
+      </w:tr>
+    </w:tbl>
+    <w:p>
+      <w:pPr>
+        <w:spacing w:after="160"/>
+      </w:pPr>
+    </w:p>
+    <w:p>
+      <w:pPr>
+        <w:pStyle w:val="Heading2"/>
+        <w:keepNext/>
+        <w:keepLines/>
+        <w:spacing w:after="120" w:before="280"/>
+      </w:pPr>
+      <w:r>
+        <w:t xml:space="preserve">Einzelne Zeichen mit dem Index</w:t>
+      </w:r>
+    </w:p>
+    <w:p>
+      <w:pPr>
+        <w:spacing w:after="180" w:line="312" w:lineRule="auto"/>
+      </w:pPr>
+      <w:r>
+        <w:rPr>
+          <w:sz w:val="22"/>
+          <w:szCs w:val="22"/>
+        </w:rPr>
+        <w:t xml:space="preserve">Du kannst auf ein einzelnes Zeichen direkt über seine Position zugreifen – mit eckigen Klammern, wie bei einem Array. Mit der Doppelpunkt-Schreibweise schneidest du sogar einen ganzen Bereich heraus (das nennt man Slicing).</w:t>
+      </w:r>
+    </w:p>
+    <w:p>
+      <w:pPr>
+        <w:keepLines/>
+        <w:pBdr>
+          <w:left w:val="single" w:color="1B6CA8" w:sz="18" w:space="6"/>
+        </w:pBdr>
+        <w:shd w:fill="F4F4F4" w:val="clear"/>
+        <w:spacing w:after="200" w:before="100" w:line="264" w:lineRule="auto"/>
+        <w:ind w:left="140"/>
+      </w:pPr>
+      <w:r>
+        <w:rPr>
+          <w:rFonts w:ascii="Consolas" w:cs="Consolas" w:eastAsia="Consolas" w:hAnsi="Consolas"/>
+          <w:sz w:val="19"/>
+          <w:szCs w:val="19"/>
+        </w:rPr>
+        <w:t xml:space="preserve">DIM wort AS STRING</w:t>
+      </w:r>
+      <w:r>
+        <w:rPr>
+          <w:rFonts w:ascii="Consolas" w:cs="Consolas" w:eastAsia="Consolas" w:hAnsi="Consolas"/>
+          <w:sz w:val="19"/>
+          <w:szCs w:val="19"/>
+        </w:rPr>
+        <w:br/>
+        <w:t xml:space="preserve">wort = "GameBasic"</w:t>
+      </w:r>
+      <w:r>
+        <w:rPr>
+          <w:rFonts w:ascii="Consolas" w:cs="Consolas" w:eastAsia="Consolas" w:hAnsi="Consolas"/>
+          <w:sz w:val="19"/>
+          <w:szCs w:val="19"/>
+        </w:rPr>
+        <w:br/>
+        <w:t xml:space="preserve">PRINT wort[0]</w:t>
+      </w:r>
+      <w:r>
+        <w:rPr>
+          <w:rFonts w:ascii="Consolas" w:cs="Consolas" w:eastAsia="Consolas" w:hAnsi="Consolas"/>
+          <w:sz w:val="19"/>
+          <w:szCs w:val="19"/>
+        </w:rPr>
+        <w:br/>
+        <w:t xml:space="preserve">PRINT wort[4:9]</w:t>
+      </w:r>
+    </w:p>
+    <w:p>
+      <w:pPr>
+        <w:keepLines/>
+        <w:pBdr>
+          <w:left w:val="single" w:color="9AC79A" w:sz="18" w:space="6"/>
+        </w:pBdr>
+        <w:shd w:fill="EAF4EA" w:val="clear"/>
+        <w:spacing w:after="200" w:before="100" w:line="264" w:lineRule="auto"/>
+        <w:ind w:left="140"/>
+      </w:pPr>
+      <w:r>
+        <w:rPr>
+          <w:rFonts w:ascii="Consolas" w:cs="Consolas" w:eastAsia="Consolas" w:hAnsi="Consolas"/>
+          <w:sz w:val="19"/>
+          <w:szCs w:val="19"/>
+        </w:rPr>
+        <w:t xml:space="preserve">G</w:t>
+      </w:r>
+      <w:r>
+        <w:rPr>
+          <w:rFonts w:ascii="Consolas" w:cs="Consolas" w:eastAsia="Consolas" w:hAnsi="Consolas"/>
+          <w:sz w:val="19"/>
+          <w:szCs w:val="19"/>
+        </w:rPr>
+        <w:br/>
+        <w:t xml:space="preserve">Basic</w:t>
+      </w:r>
+    </w:p>
+    <w:p>
+      <w:pPr>
+        <w:spacing w:after="180" w:line="312" w:lineRule="auto"/>
+      </w:pPr>
+      <w:r>
+        <w:rPr>
+          <w:sz w:val="22"/>
+          <w:szCs w:val="22"/>
+        </w:rPr>
+        <w:t xml:space="preserve">Beim Slicing wort[4:9] ist die untere Grenze dabei, die obere nicht – es werden die Positionen 4 bis 8 geliefert. Beide Grenzen darfst du auch weglassen: wort[:4] sind die ersten vier Zeichen, wort[4:] der Rest ab Position 4.</w:t>
+      </w:r>
+    </w:p>
+    <w:p>
+      <w:pPr>
+        <w:pStyle w:val="Heading2"/>
+        <w:keepNext/>
+        <w:keepLines/>
+        <w:spacing w:after="120" w:before="280"/>
+      </w:pPr>
+      <w:r>
+        <w:t xml:space="preserve">Suchen</w:t>
+      </w:r>
+    </w:p>
+    <w:p>
+      <w:pPr>
+        <w:keepNext/>
+        <w:keepLines/>
+        <w:pBdr>
+          <w:bottom w:val="single" w:color="DDD0C0" w:sz="4" w:space="2"/>
+        </w:pBdr>
+        <w:spacing w:after="40" w:before="360"/>
+      </w:pPr>
+      <w:r>
+        <w:rPr>
+          <w:rFonts w:ascii="Consolas" w:cs="Consolas" w:eastAsia="Consolas" w:hAnsi="Consolas"/>
+          <w:b/>
+          <w:bCs/>
+          <w:color w:val="9A3412"/>
+          <w:sz w:val="24"/>
+          <w:szCs w:val="24"/>
+        </w:rPr>
+        <w:t xml:space="preserve">INSTR</w:t>
+      </w:r>
+    </w:p>
+    <w:p>
+      <w:pPr>
+        <w:keepNext/>
+        <w:spacing w:after="120"/>
+      </w:pPr>
+      <w:r>
+        <w:rPr>
+          <w:b/>
+          <w:bCs/>
+          <w:color w:val="6A6A6A"/>
+          <w:sz w:val="18"/>
+          <w:szCs w:val="18"/>
+        </w:rPr>
+        <w:t xml:space="preserve">Syntax:  </w:t>
+      </w:r>
+      <w:r>
+        <w:rPr>
+          <w:rFonts w:ascii="Consolas" w:cs="Consolas" w:eastAsia="Consolas" w:hAnsi="Consolas"/>
+          <w:color w:val="335577"/>
+          <w:sz w:val="19"/>
+          <w:szCs w:val="19"/>
+        </w:rPr>
+        <w:t xml:space="preserve">INSTR(s$, teil$[, start])</w:t>
+      </w:r>
+    </w:p>
+    <w:p>
+      <w:pPr>
+        <w:spacing w:after="180" w:line="312" w:lineRule="auto"/>
+      </w:pPr>
+      <w:r>
+        <w:rPr>
+          <w:sz w:val="22"/>
+          <w:szCs w:val="22"/>
+        </w:rPr>
+        <w:t xml:space="preserve">Sucht teil$ in s$ und liefert dessen Position (ab 0 gezählt) oder -1, wenn es nicht vorkommt. Optional gibst du an, ab welcher Position gesucht wird.</w:t>
+      </w:r>
+    </w:p>
+    <w:p>
+      <w:pPr>
+        <w:keepNext/>
+        <w:spacing w:after="30" w:before="120"/>
+      </w:pPr>
+      <w:r>
+        <w:rPr>
+          <w:b/>
+          <w:bCs/>
+          <w:i/>
+          <w:iCs/>
+          <w:color w:val="6A6A6A"/>
+          <w:sz w:val="18"/>
+          <w:szCs w:val="18"/>
+        </w:rPr>
+        <w:t xml:space="preserve">Beispiel</w:t>
+      </w:r>
+    </w:p>
+    <w:p>
+      <w:pPr>
+        <w:keepLines/>
+        <w:pBdr>
+          <w:left w:val="single" w:color="1B6CA8" w:sz="18" w:space="6"/>
+        </w:pBdr>
+        <w:shd w:fill="F4F4F4" w:val="clear"/>
+        <w:spacing w:after="200" w:before="100" w:line="264" w:lineRule="auto"/>
+        <w:ind w:left="140"/>
+      </w:pPr>
+      <w:r>
+        <w:rPr>
+          <w:rFonts w:ascii="Consolas" w:cs="Consolas" w:eastAsia="Consolas" w:hAnsi="Consolas"/>
+          <w:sz w:val="19"/>
+          <w:szCs w:val="19"/>
+        </w:rPr>
+        <w:t xml:space="preserve">PRINT INSTR("hello world", "world")</w:t>
+      </w:r>
+      <w:r>
+        <w:rPr>
+          <w:rFonts w:ascii="Consolas" w:cs="Consolas" w:eastAsia="Consolas" w:hAnsi="Consolas"/>
+          <w:sz w:val="19"/>
+          <w:szCs w:val="19"/>
+        </w:rPr>
+        <w:br/>
+        <w:t xml:space="preserve">PRINT INSTR("hello world", "xyz")</w:t>
+      </w:r>
+    </w:p>
+    <w:p>
+      <w:pPr>
+        <w:keepNext/>
+        <w:spacing w:after="30" w:before="120"/>
+      </w:pPr>
+      <w:r>
+        <w:rPr>
+          <w:b/>
+          <w:bCs/>
+          <w:i/>
+          <w:iCs/>
+          <w:color w:val="6A6A6A"/>
+          <w:sz w:val="18"/>
+          <w:szCs w:val="18"/>
+        </w:rPr>
+        <w:t xml:space="preserve">Ausgabe</w:t>
+      </w:r>
+    </w:p>
+    <w:p>
+      <w:pPr>
+        <w:keepLines/>
+        <w:pBdr>
+          <w:left w:val="single" w:color="9AC79A" w:sz="18" w:space="6"/>
+        </w:pBdr>
+        <w:shd w:fill="EAF4EA" w:val="clear"/>
+        <w:spacing w:after="200" w:before="100" w:line="264" w:lineRule="auto"/>
+        <w:ind w:left="140"/>
+      </w:pPr>
+      <w:r>
+        <w:rPr>
+          <w:rFonts w:ascii="Consolas" w:cs="Consolas" w:eastAsia="Consolas" w:hAnsi="Consolas"/>
+          <w:sz w:val="19"/>
+          <w:szCs w:val="19"/>
+        </w:rPr>
+        <w:t xml:space="preserve">6</w:t>
+      </w:r>
+      <w:r>
+        <w:rPr>
+          <w:rFonts w:ascii="Consolas" w:cs="Consolas" w:eastAsia="Consolas" w:hAnsi="Consolas"/>
+          <w:sz w:val="19"/>
+          <w:szCs w:val="19"/>
+        </w:rPr>
+        <w:br/>
+        <w:t xml:space="preserve">-1</w:t>
+      </w:r>
+    </w:p>
+    <w:p>
+      <w:pPr>
+        <w:spacing w:after="180" w:line="312" w:lineRule="auto"/>
+      </w:pPr>
+      <w:r>
+        <w:rPr>
+          <w:sz w:val="22"/>
+          <w:szCs w:val="22"/>
+        </w:rPr>
+        <w:t xml:space="preserve">Willst du nur wissen, OB ein Text enthalten ist, sind CONTAINS oder der IN-Operator bequemer – beide liefern einen Wahrheitswert:</w:t>
+      </w:r>
+    </w:p>
+    <w:p>
+      <w:pPr>
+        <w:keepLines/>
+        <w:pBdr>
+          <w:left w:val="single" w:color="1B6CA8" w:sz="18" w:space="6"/>
+        </w:pBdr>
+        <w:shd w:fill="F4F4F4" w:val="clear"/>
+        <w:spacing w:after="200" w:before="100" w:line="264" w:lineRule="auto"/>
+        <w:ind w:left="140"/>
+      </w:pPr>
+      <w:r>
+        <w:rPr>
+          <w:rFonts w:ascii="Consolas" w:cs="Consolas" w:eastAsia="Consolas" w:hAnsi="Consolas"/>
+          <w:sz w:val="19"/>
+          <w:szCs w:val="19"/>
+        </w:rPr>
+        <w:t xml:space="preserve">PRINT CONTAINS("hello world", "wor")</w:t>
+      </w:r>
+      <w:r>
+        <w:rPr>
+          <w:rFonts w:ascii="Consolas" w:cs="Consolas" w:eastAsia="Consolas" w:hAnsi="Consolas"/>
+          <w:sz w:val="19"/>
+          <w:szCs w:val="19"/>
+        </w:rPr>
+        <w:br/>
+        <w:t xml:space="preserve">PRINT "World" IN "Hello World"</w:t>
+      </w:r>
+      <w:r>
+        <w:rPr>
+          <w:rFonts w:ascii="Consolas" w:cs="Consolas" w:eastAsia="Consolas" w:hAnsi="Consolas"/>
+          <w:sz w:val="19"/>
+          <w:szCs w:val="19"/>
+        </w:rPr>
+        <w:br/>
+        <w:t xml:space="preserve">PRINT STARTSWITH("hello", "he")</w:t>
+      </w:r>
+      <w:r>
+        <w:rPr>
+          <w:rFonts w:ascii="Consolas" w:cs="Consolas" w:eastAsia="Consolas" w:hAnsi="Consolas"/>
+          <w:sz w:val="19"/>
+          <w:szCs w:val="19"/>
+        </w:rPr>
+        <w:br/>
+        <w:t xml:space="preserve">PRINT ENDSWITH("hello", "lo")</w:t>
+      </w:r>
+    </w:p>
+    <w:p>
+      <w:pPr>
+        <w:keepLines/>
+        <w:pBdr>
+          <w:left w:val="single" w:color="9AC79A" w:sz="18" w:space="6"/>
+        </w:pBdr>
+        <w:shd w:fill="EAF4EA" w:val="clear"/>
+        <w:spacing w:after="200" w:before="100" w:line="264" w:lineRule="auto"/>
+        <w:ind w:left="140"/>
+      </w:pPr>
+      <w:r>
+        <w:rPr>
+          <w:rFonts w:ascii="Consolas" w:cs="Consolas" w:eastAsia="Consolas" w:hAnsi="Consolas"/>
+          <w:sz w:val="19"/>
+          <w:szCs w:val="19"/>
+        </w:rPr>
+        <w:t xml:space="preserve">TRUE</w:t>
+      </w:r>
+      <w:r>
+        <w:rPr>
+          <w:rFonts w:ascii="Consolas" w:cs="Consolas" w:eastAsia="Consolas" w:hAnsi="Consolas"/>
+          <w:sz w:val="19"/>
+          <w:szCs w:val="19"/>
+        </w:rPr>
+        <w:br/>
+        <w:t xml:space="preserve">TRUE</w:t>
+      </w:r>
+      <w:r>
+        <w:rPr>
+          <w:rFonts w:ascii="Consolas" w:cs="Consolas" w:eastAsia="Consolas" w:hAnsi="Consolas"/>
+          <w:sz w:val="19"/>
+          <w:szCs w:val="19"/>
+        </w:rPr>
+        <w:br/>
+        <w:t xml:space="preserve">TRUE</w:t>
+      </w:r>
+      <w:r>
+        <w:rPr>
+          <w:rFonts w:ascii="Consolas" w:cs="Consolas" w:eastAsia="Consolas" w:hAnsi="Consolas"/>
+          <w:sz w:val="19"/>
+          <w:szCs w:val="19"/>
+        </w:rPr>
+        <w:br/>
+        <w:t xml:space="preserve">TRUE</w:t>
+      </w:r>
+    </w:p>
+    <w:p>
+      <w:pPr>
+        <w:pStyle w:val="Heading2"/>
+        <w:keepNext/>
+        <w:keepLines/>
+        <w:spacing w:after="120" w:before="280"/>
+      </w:pPr>
+      <w:r>
+        <w:t xml:space="preserve">Ersetzen und Säubern</w:t>
+      </w:r>
+    </w:p>
+    <w:p>
+      <w:pPr>
+        <w:keepNext/>
+        <w:keepLines/>
+        <w:pBdr>
+          <w:bottom w:val="single" w:color="DDD0C0" w:sz="4" w:space="2"/>
+        </w:pBdr>
+        <w:spacing w:after="40" w:before="360"/>
+      </w:pPr>
+      <w:r>
+        <w:rPr>
+          <w:rFonts w:ascii="Consolas" w:cs="Consolas" w:eastAsia="Consolas" w:hAnsi="Consolas"/>
+          <w:b/>
+          <w:bCs/>
+          <w:color w:val="9A3412"/>
+          <w:sz w:val="24"/>
+          <w:szCs w:val="24"/>
+        </w:rPr>
+        <w:t xml:space="preserve">REPLACE$</w:t>
+      </w:r>
+    </w:p>
+    <w:p>
+      <w:pPr>
+        <w:keepNext/>
+        <w:spacing w:after="120"/>
+      </w:pPr>
+      <w:r>
+        <w:rPr>
+          <w:b/>
+          <w:bCs/>
+          <w:color w:val="6A6A6A"/>
+          <w:sz w:val="18"/>
+          <w:szCs w:val="18"/>
+        </w:rPr>
+        <w:t xml:space="preserve">Syntax:  </w:t>
+      </w:r>
+      <w:r>
+        <w:rPr>
+          <w:rFonts w:ascii="Consolas" w:cs="Consolas" w:eastAsia="Consolas" w:hAnsi="Consolas"/>
+          <w:color w:val="335577"/>
+          <w:sz w:val="19"/>
+          <w:szCs w:val="19"/>
+        </w:rPr>
+        <w:t xml:space="preserve">REPLACE$(s$, alt$, neu$)</w:t>
+      </w:r>
+    </w:p>
+    <w:p>
+      <w:pPr>
+        <w:spacing w:after="180" w:line="312" w:lineRule="auto"/>
+      </w:pPr>
+      <w:r>
+        <w:rPr>
+          <w:sz w:val="22"/>
+          <w:szCs w:val="22"/>
+        </w:rPr>
+        <w:t xml:space="preserve">Ersetzt alle Vorkommen von alt$ durch neu$ und liefert den neuen String.</w:t>
+      </w:r>
+    </w:p>
+    <w:p>
+      <w:pPr>
+        <w:keepNext/>
+        <w:spacing w:after="30" w:before="120"/>
+      </w:pPr>
+      <w:r>
+        <w:rPr>
+          <w:b/>
+          <w:bCs/>
+          <w:i/>
+          <w:iCs/>
+          <w:color w:val="6A6A6A"/>
+          <w:sz w:val="18"/>
+          <w:szCs w:val="18"/>
+        </w:rPr>
+        <w:t xml:space="preserve">Beispiel</w:t>
+      </w:r>
+    </w:p>
+    <w:p>
+      <w:pPr>
+        <w:keepLines/>
+        <w:pBdr>
+          <w:left w:val="single" w:color="1B6CA8" w:sz="18" w:space="6"/>
+        </w:pBdr>
+        <w:shd w:fill="F4F4F4" w:val="clear"/>
+        <w:spacing w:after="200" w:before="100" w:line="264" w:lineRule="auto"/>
+        <w:ind w:left="140"/>
+      </w:pPr>
+      <w:r>
+        <w:rPr>
+          <w:rFonts w:ascii="Consolas" w:cs="Consolas" w:eastAsia="Consolas" w:hAnsi="Consolas"/>
+          <w:sz w:val="19"/>
+          <w:szCs w:val="19"/>
+        </w:rPr>
+        <w:t xml:space="preserve">PRINT REPLACE$("a-b-c", "-", "_")</w:t>
+      </w:r>
+    </w:p>
+    <w:p>
+      <w:pPr>
+        <w:keepNext/>
+        <w:spacing w:after="30" w:before="120"/>
+      </w:pPr>
+      <w:r>
+        <w:rPr>
+          <w:b/>
+          <w:bCs/>
+          <w:i/>
+          <w:iCs/>
+          <w:color w:val="6A6A6A"/>
+          <w:sz w:val="18"/>
+          <w:szCs w:val="18"/>
+        </w:rPr>
+        <w:t xml:space="preserve">Ausgabe</w:t>
+      </w:r>
+    </w:p>
+    <w:p>
+      <w:pPr>
+        <w:keepLines/>
+        <w:pBdr>
+          <w:left w:val="single" w:color="9AC79A" w:sz="18" w:space="6"/>
+        </w:pBdr>
+        <w:shd w:fill="EAF4EA" w:val="clear"/>
+        <w:spacing w:after="200" w:before="100" w:line="264" w:lineRule="auto"/>
+        <w:ind w:left="140"/>
+      </w:pPr>
+      <w:r>
+        <w:rPr>
+          <w:rFonts w:ascii="Consolas" w:cs="Consolas" w:eastAsia="Consolas" w:hAnsi="Consolas"/>
+          <w:sz w:val="19"/>
+          <w:szCs w:val="19"/>
+        </w:rPr>
+        <w:t xml:space="preserve">a_b_c</w:t>
+      </w:r>
+    </w:p>
+    <w:p>
+      <w:pPr>
+        <w:keepNext/>
+        <w:keepLines/>
+        <w:pBdr>
+          <w:bottom w:val="single" w:color="DDD0C0" w:sz="4" w:space="2"/>
+        </w:pBdr>
+        <w:spacing w:after="40" w:before="360"/>
+      </w:pPr>
+      <w:r>
+        <w:rPr>
+          <w:rFonts w:ascii="Consolas" w:cs="Consolas" w:eastAsia="Consolas" w:hAnsi="Consolas"/>
+          <w:b/>
+          <w:bCs/>
+          <w:color w:val="9A3412"/>
+          <w:sz w:val="24"/>
+          <w:szCs w:val="24"/>
+        </w:rPr>
+        <w:t xml:space="preserve">TRIM$</w:t>
+      </w:r>
+    </w:p>
+    <w:p>
+      <w:pPr>
+        <w:keepNext/>
+        <w:spacing w:after="120"/>
+      </w:pPr>
+      <w:r>
+        <w:rPr>
+          <w:b/>
+          <w:bCs/>
+          <w:color w:val="6A6A6A"/>
+          <w:sz w:val="18"/>
+          <w:szCs w:val="18"/>
+        </w:rPr>
+        <w:t xml:space="preserve">Syntax:  </w:t>
+      </w:r>
+      <w:r>
+        <w:rPr>
+          <w:rFonts w:ascii="Consolas" w:cs="Consolas" w:eastAsia="Consolas" w:hAnsi="Consolas"/>
+          <w:color w:val="335577"/>
+          <w:sz w:val="19"/>
+          <w:szCs w:val="19"/>
+        </w:rPr>
+        <w:t xml:space="preserve">TRIM$(s$)</w:t>
+      </w:r>
+    </w:p>
+    <w:p>
+      <w:pPr>
+        <w:spacing w:after="180" w:line="312" w:lineRule="auto"/>
+      </w:pPr>
+      <w:r>
+        <w:rPr>
+          <w:sz w:val="22"/>
+          <w:szCs w:val="22"/>
+        </w:rPr>
+        <w:t xml:space="preserve">Entfernt Leerzeichen (und andere Leerraum-Zeichen) am Anfang und Ende. Unverzichtbar bei Benutzereingaben, wo sich gern ein versehentliches Leerzeichen einschleicht. (LTRIM$ / RTRIM$ säubern nur links bzw. rechts.)</w:t>
+      </w:r>
+    </w:p>
+    <w:p>
+      <w:pPr>
+        <w:keepNext/>
+        <w:spacing w:after="30" w:before="120"/>
+      </w:pPr>
+      <w:r>
+        <w:rPr>
+          <w:b/>
+          <w:bCs/>
+          <w:i/>
+          <w:iCs/>
+          <w:color w:val="6A6A6A"/>
+          <w:sz w:val="18"/>
+          <w:szCs w:val="18"/>
+        </w:rPr>
+        <w:t xml:space="preserve">Beispiel</w:t>
+      </w:r>
+    </w:p>
+    <w:p>
+      <w:pPr>
+        <w:keepLines/>
+        <w:pBdr>
+          <w:left w:val="single" w:color="1B6CA8" w:sz="18" w:space="6"/>
+        </w:pBdr>
+        <w:shd w:fill="F4F4F4" w:val="clear"/>
+        <w:spacing w:after="200" w:before="100" w:line="264" w:lineRule="auto"/>
+        <w:ind w:left="140"/>
+      </w:pPr>
+      <w:r>
+        <w:rPr>
+          <w:rFonts w:ascii="Consolas" w:cs="Consolas" w:eastAsia="Consolas" w:hAnsi="Consolas"/>
+          <w:sz w:val="19"/>
+          <w:szCs w:val="19"/>
+        </w:rPr>
+        <w:t xml:space="preserve">PRINT TRIM$("   hallo   ") + "|"</w:t>
+      </w:r>
+    </w:p>
+    <w:p>
+      <w:pPr>
+        <w:keepNext/>
+        <w:spacing w:after="30" w:before="120"/>
+      </w:pPr>
+      <w:r>
+        <w:rPr>
+          <w:b/>
+          <w:bCs/>
+          <w:i/>
+          <w:iCs/>
+          <w:color w:val="6A6A6A"/>
+          <w:sz w:val="18"/>
+          <w:szCs w:val="18"/>
+        </w:rPr>
+        <w:t xml:space="preserve">Ausgabe</w:t>
+      </w:r>
+    </w:p>
+    <w:p>
+      <w:pPr>
+        <w:keepLines/>
+        <w:pBdr>
+          <w:left w:val="single" w:color="9AC79A" w:sz="18" w:space="6"/>
+        </w:pBdr>
+        <w:shd w:fill="EAF4EA" w:val="clear"/>
+        <w:spacing w:after="200" w:before="100" w:line="264" w:lineRule="auto"/>
+        <w:ind w:left="140"/>
+      </w:pPr>
+      <w:r>
+        <w:rPr>
+          <w:rFonts w:ascii="Consolas" w:cs="Consolas" w:eastAsia="Consolas" w:hAnsi="Consolas"/>
+          <w:sz w:val="19"/>
+          <w:szCs w:val="19"/>
+        </w:rPr>
+        <w:t xml:space="preserve">hallo|</w:t>
+      </w:r>
+    </w:p>
+    <w:p>
+      <w:pPr>
+        <w:pStyle w:val="Heading2"/>
+        <w:keepNext/>
+        <w:keepLines/>
+        <w:spacing w:after="120" w:before="280"/>
+      </w:pPr>
+      <w:r>
+        <w:t xml:space="preserve">Zerlegen und Zusammensetzen</w:t>
+      </w:r>
+    </w:p>
+    <w:p>
+      <w:pPr>
+        <w:spacing w:after="180" w:line="312" w:lineRule="auto"/>
+      </w:pPr>
+      <w:r>
+        <w:rPr>
+          <w:sz w:val="22"/>
+          <w:szCs w:val="22"/>
+        </w:rPr>
+        <w:t xml:space="preserve">SPLIT$ zerschneidet einen Text an einem Trennzeichen in seine Bestandteile – das Ergebnis ist ein Array von Strings (Arrays lernst du im nächsten Kapitel kennen). JOIN$ ist die Umkehrung: Es fügt die Teile mit einem Trenner wieder zusammen.</w:t>
+      </w:r>
+    </w:p>
+    <w:p>
+      <w:pPr>
+        <w:keepLines/>
+        <w:pBdr>
+          <w:left w:val="single" w:color="1B6CA8" w:sz="18" w:space="6"/>
+        </w:pBdr>
+        <w:shd w:fill="F4F4F4" w:val="clear"/>
+        <w:spacing w:after="200" w:before="100" w:line="264" w:lineRule="auto"/>
+        <w:ind w:left="140"/>
+      </w:pPr>
+      <w:r>
+        <w:rPr>
+          <w:rFonts w:ascii="Consolas" w:cs="Consolas" w:eastAsia="Consolas" w:hAnsi="Consolas"/>
+          <w:sz w:val="19"/>
+          <w:szCs w:val="19"/>
+        </w:rPr>
+        <w:t xml:space="preserve">DIM teile AS ARRAY OF STRING</w:t>
+      </w:r>
+      <w:r>
+        <w:rPr>
+          <w:rFonts w:ascii="Consolas" w:cs="Consolas" w:eastAsia="Consolas" w:hAnsi="Consolas"/>
+          <w:sz w:val="19"/>
+          <w:szCs w:val="19"/>
+        </w:rPr>
+        <w:br/>
+        <w:t xml:space="preserve">teile = SPLIT$("Anna,Bert,Cilly", ",")</w:t>
+      </w:r>
+      <w:r>
+        <w:rPr>
+          <w:rFonts w:ascii="Consolas" w:cs="Consolas" w:eastAsia="Consolas" w:hAnsi="Consolas"/>
+          <w:sz w:val="19"/>
+          <w:szCs w:val="19"/>
+        </w:rPr>
+        <w:br/>
+        <w:t xml:space="preserve">PRINT teile[0]</w:t>
+      </w:r>
+      <w:r>
+        <w:rPr>
+          <w:rFonts w:ascii="Consolas" w:cs="Consolas" w:eastAsia="Consolas" w:hAnsi="Consolas"/>
+          <w:sz w:val="19"/>
+          <w:szCs w:val="19"/>
+        </w:rPr>
+        <w:br/>
+        <w:t xml:space="preserve">PRINT JOIN$(teile, " | ")</w:t>
+      </w:r>
+    </w:p>
+    <w:p>
+      <w:pPr>
+        <w:keepLines/>
+        <w:pBdr>
+          <w:left w:val="single" w:color="9AC79A" w:sz="18" w:space="6"/>
+        </w:pBdr>
+        <w:shd w:fill="EAF4EA" w:val="clear"/>
+        <w:spacing w:after="200" w:before="100" w:line="264" w:lineRule="auto"/>
+        <w:ind w:left="140"/>
+      </w:pPr>
+      <w:r>
+        <w:rPr>
+          <w:rFonts w:ascii="Consolas" w:cs="Consolas" w:eastAsia="Consolas" w:hAnsi="Consolas"/>
+          <w:sz w:val="19"/>
+          <w:szCs w:val="19"/>
+        </w:rPr>
+        <w:t xml:space="preserve">Anna</w:t>
+      </w:r>
+      <w:r>
+        <w:rPr>
+          <w:rFonts w:ascii="Consolas" w:cs="Consolas" w:eastAsia="Consolas" w:hAnsi="Consolas"/>
+          <w:sz w:val="19"/>
+          <w:szCs w:val="19"/>
+        </w:rPr>
+        <w:br/>
+        <w:t xml:space="preserve">Anna | Bert | Cilly</w:t>
+      </w:r>
+    </w:p>
+    <w:p>
+      <w:pPr>
+        <w:pStyle w:val="Heading2"/>
+        <w:keepNext/>
+        <w:keepLines/>
+        <w:spacing w:after="120" w:before="280"/>
+      </w:pPr>
+      <w:r>
+        <w:t xml:space="preserve">Auffüllen und Wiederholen</w:t>
+      </w:r>
+    </w:p>
+    <w:p>
+      <w:pPr>
+        <w:keepNext/>
+        <w:keepLines/>
+        <w:pBdr>
+          <w:bottom w:val="single" w:color="DDD0C0" w:sz="4" w:space="2"/>
+        </w:pBdr>
+        <w:spacing w:after="40" w:before="360"/>
+      </w:pPr>
+      <w:r>
+        <w:rPr>
+          <w:rFonts w:ascii="Consolas" w:cs="Consolas" w:eastAsia="Consolas" w:hAnsi="Consolas"/>
+          <w:b/>
+          <w:bCs/>
+          <w:color w:val="9A3412"/>
+          <w:sz w:val="24"/>
+          <w:szCs w:val="24"/>
+        </w:rPr>
+        <w:t xml:space="preserve">PADL$  /  PADR$</w:t>
+      </w:r>
+    </w:p>
+    <w:p>
+      <w:pPr>
+        <w:keepNext/>
+        <w:spacing w:after="120"/>
+      </w:pPr>
+      <w:r>
+        <w:rPr>
+          <w:b/>
+          <w:bCs/>
+          <w:color w:val="6A6A6A"/>
+          <w:sz w:val="18"/>
+          <w:szCs w:val="18"/>
+        </w:rPr>
+        <w:t xml:space="preserve">Syntax:  </w:t>
+      </w:r>
+      <w:r>
+        <w:rPr>
+          <w:rFonts w:ascii="Consolas" w:cs="Consolas" w:eastAsia="Consolas" w:hAnsi="Consolas"/>
+          <w:color w:val="335577"/>
+          <w:sz w:val="19"/>
+          <w:szCs w:val="19"/>
+        </w:rPr>
+        <w:t xml:space="preserve">PADL$(s$, breite[, füll$])   PADR$(...)</w:t>
+      </w:r>
+    </w:p>
+    <w:p>
+      <w:pPr>
+        <w:spacing w:after="180" w:line="312" w:lineRule="auto"/>
+      </w:pPr>
+      <w:r>
+        <w:rPr>
+          <w:sz w:val="22"/>
+          <w:szCs w:val="22"/>
+        </w:rPr>
+        <w:t xml:space="preserve">Füllt den String auf die gewünschte Breite auf – PADL$ links (rechtsbündig), PADR$ rechts (linksbündig). Ohne Füllzeichen wird das Leerzeichen verwendet. Gut für Tabellen und führende Nullen.</w:t>
+      </w:r>
+    </w:p>
+    <w:p>
+      <w:pPr>
+        <w:keepNext/>
+        <w:spacing w:after="30" w:before="120"/>
+      </w:pPr>
+      <w:r>
+        <w:rPr>
+          <w:b/>
+          <w:bCs/>
+          <w:i/>
+          <w:iCs/>
+          <w:color w:val="6A6A6A"/>
+          <w:sz w:val="18"/>
+          <w:szCs w:val="18"/>
+        </w:rPr>
+        <w:t xml:space="preserve">Beispiel</w:t>
+      </w:r>
+    </w:p>
+    <w:p>
+      <w:pPr>
+        <w:keepLines/>
+        <w:pBdr>
+          <w:left w:val="single" w:color="1B6CA8" w:sz="18" w:space="6"/>
+        </w:pBdr>
+        <w:shd w:fill="F4F4F4" w:val="clear"/>
+        <w:spacing w:after="200" w:before="100" w:line="264" w:lineRule="auto"/>
+        <w:ind w:left="140"/>
+      </w:pPr>
+      <w:r>
+        <w:rPr>
+          <w:rFonts w:ascii="Consolas" w:cs="Consolas" w:eastAsia="Consolas" w:hAnsi="Consolas"/>
+          <w:sz w:val="19"/>
+          <w:szCs w:val="19"/>
+        </w:rPr>
+        <w:t xml:space="preserve">PRINT PADL$("42", 6, "0")</w:t>
+      </w:r>
+    </w:p>
+    <w:p>
+      <w:pPr>
+        <w:keepNext/>
+        <w:spacing w:after="30" w:before="120"/>
+      </w:pPr>
+      <w:r>
+        <w:rPr>
+          <w:b/>
+          <w:bCs/>
+          <w:i/>
+          <w:iCs/>
+          <w:color w:val="6A6A6A"/>
+          <w:sz w:val="18"/>
+          <w:szCs w:val="18"/>
+        </w:rPr>
+        <w:t xml:space="preserve">Ausgabe</w:t>
+      </w:r>
+    </w:p>
+    <w:p>
+      <w:pPr>
+        <w:keepLines/>
+        <w:pBdr>
+          <w:left w:val="single" w:color="9AC79A" w:sz="18" w:space="6"/>
+        </w:pBdr>
+        <w:shd w:fill="EAF4EA" w:val="clear"/>
+        <w:spacing w:after="200" w:before="100" w:line="264" w:lineRule="auto"/>
+        <w:ind w:left="140"/>
+      </w:pPr>
+      <w:r>
+        <w:rPr>
+          <w:rFonts w:ascii="Consolas" w:cs="Consolas" w:eastAsia="Consolas" w:hAnsi="Consolas"/>
+          <w:sz w:val="19"/>
+          <w:szCs w:val="19"/>
+        </w:rPr>
+        <w:t xml:space="preserve">000042</w:t>
+      </w:r>
+    </w:p>
+    <w:p>
+      <w:pPr>
+        <w:keepNext/>
+        <w:keepLines/>
+        <w:pBdr>
+          <w:bottom w:val="single" w:color="DDD0C0" w:sz="4" w:space="2"/>
+        </w:pBdr>
+        <w:spacing w:after="40" w:before="360"/>
+      </w:pPr>
+      <w:r>
+        <w:rPr>
+          <w:rFonts w:ascii="Consolas" w:cs="Consolas" w:eastAsia="Consolas" w:hAnsi="Consolas"/>
+          <w:b/>
+          <w:bCs/>
+          <w:color w:val="9A3412"/>
+          <w:sz w:val="24"/>
+          <w:szCs w:val="24"/>
+        </w:rPr>
+        <w:t xml:space="preserve">REPEAT$</w:t>
+      </w:r>
+    </w:p>
+    <w:p>
+      <w:pPr>
+        <w:keepNext/>
+        <w:spacing w:after="120"/>
+      </w:pPr>
+      <w:r>
+        <w:rPr>
+          <w:b/>
+          <w:bCs/>
+          <w:color w:val="6A6A6A"/>
+          <w:sz w:val="18"/>
+          <w:szCs w:val="18"/>
+        </w:rPr>
+        <w:t xml:space="preserve">Syntax:  </w:t>
+      </w:r>
+      <w:r>
+        <w:rPr>
+          <w:rFonts w:ascii="Consolas" w:cs="Consolas" w:eastAsia="Consolas" w:hAnsi="Consolas"/>
+          <w:color w:val="335577"/>
+          <w:sz w:val="19"/>
+          <w:szCs w:val="19"/>
+        </w:rPr>
+        <w:t xml:space="preserve">REPEAT$(s$, n)</w:t>
+      </w:r>
+    </w:p>
+    <w:p>
+      <w:pPr>
+        <w:spacing w:after="180" w:line="312" w:lineRule="auto"/>
+      </w:pPr>
+      <w:r>
+        <w:rPr>
+          <w:sz w:val="22"/>
+          <w:szCs w:val="22"/>
+        </w:rPr>
+        <w:t xml:space="preserve">Hängt den String n-mal aneinander. Auch der Stern funktioniert dafür: "-" * 20 ergibt 20 Bindestriche.</w:t>
+      </w:r>
+    </w:p>
+    <w:p>
+      <w:pPr>
+        <w:keepNext/>
+        <w:spacing w:after="30" w:before="120"/>
+      </w:pPr>
+      <w:r>
+        <w:rPr>
+          <w:b/>
+          <w:bCs/>
+          <w:i/>
+          <w:iCs/>
+          <w:color w:val="6A6A6A"/>
+          <w:sz w:val="18"/>
+          <w:szCs w:val="18"/>
+        </w:rPr>
+        <w:t xml:space="preserve">Beispiel</w:t>
+      </w:r>
+    </w:p>
+    <w:p>
+      <w:pPr>
+        <w:keepLines/>
+        <w:pBdr>
+          <w:left w:val="single" w:color="1B6CA8" w:sz="18" w:space="6"/>
+        </w:pBdr>
+        <w:shd w:fill="F4F4F4" w:val="clear"/>
+        <w:spacing w:after="200" w:before="100" w:line="264" w:lineRule="auto"/>
+        <w:ind w:left="140"/>
+      </w:pPr>
+      <w:r>
+        <w:rPr>
+          <w:rFonts w:ascii="Consolas" w:cs="Consolas" w:eastAsia="Consolas" w:hAnsi="Consolas"/>
+          <w:sz w:val="19"/>
+          <w:szCs w:val="19"/>
+        </w:rPr>
+        <w:t xml:space="preserve">PRINT REPEAT$("=*", 5)</w:t>
+      </w:r>
+      <w:r>
+        <w:rPr>
+          <w:rFonts w:ascii="Consolas" w:cs="Consolas" w:eastAsia="Consolas" w:hAnsi="Consolas"/>
+          <w:sz w:val="19"/>
+          <w:szCs w:val="19"/>
+        </w:rPr>
+        <w:br/>
+        <w:t xml:space="preserve">PRINT "-" * 20</w:t>
+      </w:r>
+    </w:p>
+    <w:p>
+      <w:pPr>
+        <w:keepNext/>
+        <w:spacing w:after="30" w:before="120"/>
+      </w:pPr>
+      <w:r>
+        <w:rPr>
+          <w:b/>
+          <w:bCs/>
+          <w:i/>
+          <w:iCs/>
+          <w:color w:val="6A6A6A"/>
+          <w:sz w:val="18"/>
+          <w:szCs w:val="18"/>
+        </w:rPr>
+        <w:t xml:space="preserve">Ausgabe</w:t>
+      </w:r>
+    </w:p>
+    <w:p>
+      <w:pPr>
+        <w:keepLines/>
+        <w:pBdr>
+          <w:left w:val="single" w:color="9AC79A" w:sz="18" w:space="6"/>
+        </w:pBdr>
+        <w:shd w:fill="EAF4EA" w:val="clear"/>
+        <w:spacing w:after="200" w:before="100" w:line="264" w:lineRule="auto"/>
+        <w:ind w:left="140"/>
+      </w:pPr>
+      <w:r>
+        <w:rPr>
+          <w:rFonts w:ascii="Consolas" w:cs="Consolas" w:eastAsia="Consolas" w:hAnsi="Consolas"/>
+          <w:sz w:val="19"/>
+          <w:szCs w:val="19"/>
+        </w:rPr>
+        <w:t xml:space="preserve">=*=*=*=*=*</w:t>
+      </w:r>
+      <w:r>
+        <w:rPr>
+          <w:rFonts w:ascii="Consolas" w:cs="Consolas" w:eastAsia="Consolas" w:hAnsi="Consolas"/>
+          <w:sz w:val="19"/>
+          <w:szCs w:val="19"/>
+        </w:rPr>
+        <w:br/>
+        <w:t xml:space="preserve">--------------------</w:t>
+      </w:r>
+    </w:p>
+    <w:p>
+      <w:pPr>
+        <w:pStyle w:val="Heading2"/>
+        <w:keepNext/>
+        <w:keepLines/>
+        <w:spacing w:after="120" w:before="280"/>
+      </w:pPr>
+      <w:r>
+        <w:t xml:space="preserve">Zwischen Text und Zahl wandeln</w:t>
+      </w:r>
+    </w:p>
+    <w:p>
+      <w:pPr>
+        <w:spacing w:after="180" w:line="312" w:lineRule="auto"/>
+      </w:pPr>
+      <w:r>
+        <w:rPr>
+          <w:sz w:val="22"/>
+          <w:szCs w:val="22"/>
+        </w:rPr>
+        <w:t xml:space="preserve">Eine Zahl ist kein String – willst du sie in Text einbauen, musst du sie umwandeln (oder einen f-String benutzen). Umgekehrt machst du aus getipptem Text eine Zahl, mit der du rechnen kannst.</w:t>
+      </w:r>
+    </w:p>
+    <w:p>
+      <w:pPr>
+        <w:keepNext/>
+        <w:keepLines/>
+        <w:pBdr>
+          <w:bottom w:val="single" w:color="DDD0C0" w:sz="4" w:space="2"/>
+        </w:pBdr>
+        <w:spacing w:after="40" w:before="360"/>
+      </w:pPr>
+      <w:r>
+        <w:rPr>
+          <w:rFonts w:ascii="Consolas" w:cs="Consolas" w:eastAsia="Consolas" w:hAnsi="Consolas"/>
+          <w:b/>
+          <w:bCs/>
+          <w:color w:val="9A3412"/>
+          <w:sz w:val="24"/>
+          <w:szCs w:val="24"/>
+        </w:rPr>
+        <w:t xml:space="preserve">STR$  /  VAL</w:t>
+      </w:r>
+    </w:p>
+    <w:p>
+      <w:pPr>
+        <w:keepNext/>
+        <w:spacing w:after="120"/>
+      </w:pPr>
+      <w:r>
+        <w:rPr>
+          <w:b/>
+          <w:bCs/>
+          <w:color w:val="6A6A6A"/>
+          <w:sz w:val="18"/>
+          <w:szCs w:val="18"/>
+        </w:rPr>
+        <w:t xml:space="preserve">Syntax:  </w:t>
+      </w:r>
+      <w:r>
+        <w:rPr>
+          <w:rFonts w:ascii="Consolas" w:cs="Consolas" w:eastAsia="Consolas" w:hAnsi="Consolas"/>
+          <w:color w:val="335577"/>
+          <w:sz w:val="19"/>
+          <w:szCs w:val="19"/>
+        </w:rPr>
+        <w:t xml:space="preserve">STR$(zahl)   VAL(s$)</w:t>
+      </w:r>
+    </w:p>
+    <w:p>
+      <w:pPr>
+        <w:spacing w:after="180" w:line="312" w:lineRule="auto"/>
+      </w:pPr>
+      <w:r>
+        <w:rPr>
+          <w:sz w:val="22"/>
+          <w:szCs w:val="22"/>
+        </w:rPr>
+        <w:t xml:space="preserve">STR$ wandelt eine Zahl in ihren Text um, VAL einen Text in eine Zahl. Lässt sich der Text nicht deuten, liefert VAL eine 0 – mit TRYVAL(s, ersatz) kannst du stattdessen einen eigenen Ersatzwert bestimmen.</w:t>
+      </w:r>
+    </w:p>
+    <w:p>
+      <w:pPr>
+        <w:keepNext/>
+        <w:spacing w:after="30" w:before="120"/>
+      </w:pPr>
+      <w:r>
+        <w:rPr>
+          <w:b/>
+          <w:bCs/>
+          <w:i/>
+          <w:iCs/>
+          <w:color w:val="6A6A6A"/>
+          <w:sz w:val="18"/>
+          <w:szCs w:val="18"/>
+        </w:rPr>
+        <w:t xml:space="preserve">Beispiel</w:t>
+      </w:r>
+    </w:p>
+    <w:p>
+      <w:pPr>
+        <w:keepLines/>
+        <w:pBdr>
+          <w:left w:val="single" w:color="1B6CA8" w:sz="18" w:space="6"/>
+        </w:pBdr>
+        <w:shd w:fill="F4F4F4" w:val="clear"/>
+        <w:spacing w:after="200" w:before="100" w:line="264" w:lineRule="auto"/>
+        <w:ind w:left="140"/>
+      </w:pPr>
+      <w:r>
+        <w:rPr>
+          <w:rFonts w:ascii="Consolas" w:cs="Consolas" w:eastAsia="Consolas" w:hAnsi="Consolas"/>
+          <w:sz w:val="19"/>
+          <w:szCs w:val="19"/>
+        </w:rPr>
+        <w:t xml:space="preserve">PRINT "Punkte: " + STR$(42)</w:t>
+      </w:r>
+      <w:r>
+        <w:rPr>
+          <w:rFonts w:ascii="Consolas" w:cs="Consolas" w:eastAsia="Consolas" w:hAnsi="Consolas"/>
+          <w:sz w:val="19"/>
+          <w:szCs w:val="19"/>
+        </w:rPr>
+        <w:br/>
+        <w:t xml:space="preserve">PRINT VAL("42") + 1</w:t>
+      </w:r>
+      <w:r>
+        <w:rPr>
+          <w:rFonts w:ascii="Consolas" w:cs="Consolas" w:eastAsia="Consolas" w:hAnsi="Consolas"/>
+          <w:sz w:val="19"/>
+          <w:szCs w:val="19"/>
+        </w:rPr>
+        <w:br/>
+        <w:t xml:space="preserve">PRINT TRYVAL("oops", -1)</w:t>
+      </w:r>
+    </w:p>
+    <w:p>
+      <w:pPr>
+        <w:keepNext/>
+        <w:spacing w:after="30" w:before="120"/>
+      </w:pPr>
+      <w:r>
+        <w:rPr>
+          <w:b/>
+          <w:bCs/>
+          <w:i/>
+          <w:iCs/>
+          <w:color w:val="6A6A6A"/>
+          <w:sz w:val="18"/>
+          <w:szCs w:val="18"/>
+        </w:rPr>
+        <w:t xml:space="preserve">Ausgabe</w:t>
+      </w:r>
+    </w:p>
+    <w:p>
+      <w:pPr>
+        <w:keepLines/>
+        <w:pBdr>
+          <w:left w:val="single" w:color="9AC79A" w:sz="18" w:space="6"/>
+        </w:pBdr>
+        <w:shd w:fill="EAF4EA" w:val="clear"/>
+        <w:spacing w:after="200" w:before="100" w:line="264" w:lineRule="auto"/>
+        <w:ind w:left="140"/>
+      </w:pPr>
+      <w:r>
+        <w:rPr>
+          <w:rFonts w:ascii="Consolas" w:cs="Consolas" w:eastAsia="Consolas" w:hAnsi="Consolas"/>
+          <w:sz w:val="19"/>
+          <w:szCs w:val="19"/>
+        </w:rPr>
+        <w:t xml:space="preserve">Punkte: 42</w:t>
+      </w:r>
+      <w:r>
+        <w:rPr>
+          <w:rFonts w:ascii="Consolas" w:cs="Consolas" w:eastAsia="Consolas" w:hAnsi="Consolas"/>
+          <w:sz w:val="19"/>
+          <w:szCs w:val="19"/>
+        </w:rPr>
+        <w:br/>
+        <w:t xml:space="preserve">43</w:t>
+      </w:r>
+      <w:r>
+        <w:rPr>
+          <w:rFonts w:ascii="Consolas" w:cs="Consolas" w:eastAsia="Consolas" w:hAnsi="Consolas"/>
+          <w:sz w:val="19"/>
+          <w:szCs w:val="19"/>
+        </w:rPr>
+        <w:br/>
+        <w:t xml:space="preserve">-1</w:t>
+      </w:r>
+    </w:p>
+    <w:p>
+      <w:pPr>
+        <w:keepNext/>
+        <w:keepLines/>
+        <w:pBdr>
+          <w:bottom w:val="single" w:color="DDD0C0" w:sz="4" w:space="2"/>
+        </w:pBdr>
+        <w:spacing w:after="40" w:before="360"/>
+      </w:pPr>
+      <w:r>
+        <w:rPr>
+          <w:rFonts w:ascii="Consolas" w:cs="Consolas" w:eastAsia="Consolas" w:hAnsi="Consolas"/>
+          <w:b/>
+          <w:bCs/>
+          <w:color w:val="9A3412"/>
+          <w:sz w:val="24"/>
+          <w:szCs w:val="24"/>
+        </w:rPr>
+        <w:t xml:space="preserve">CHR$  /  ASC</w:t>
+      </w:r>
+    </w:p>
+    <w:p>
+      <w:pPr>
+        <w:keepNext/>
+        <w:spacing w:after="120"/>
+      </w:pPr>
+      <w:r>
+        <w:rPr>
+          <w:b/>
+          <w:bCs/>
+          <w:color w:val="6A6A6A"/>
+          <w:sz w:val="18"/>
+          <w:szCs w:val="18"/>
+        </w:rPr>
+        <w:t xml:space="preserve">Syntax:  </w:t>
+      </w:r>
+      <w:r>
+        <w:rPr>
+          <w:rFonts w:ascii="Consolas" w:cs="Consolas" w:eastAsia="Consolas" w:hAnsi="Consolas"/>
+          <w:color w:val="335577"/>
+          <w:sz w:val="19"/>
+          <w:szCs w:val="19"/>
+        </w:rPr>
+        <w:t xml:space="preserve">CHR$(code)   ASC(s$)</w:t>
+      </w:r>
+    </w:p>
+    <w:p>
+      <w:pPr>
+        <w:spacing w:after="180" w:line="312" w:lineRule="auto"/>
+      </w:pPr>
+      <w:r>
+        <w:rPr>
+          <w:sz w:val="22"/>
+          <w:szCs w:val="22"/>
+        </w:rPr>
+        <w:t xml:space="preserve">CHR$ macht aus einer Zeichen-Nummer (dem Unicode-Codepoint) das zugehörige Zeichen, ASC umgekehrt aus dem ersten Zeichen seine Nummer. A ist 65, B ist 66, und so weiter.</w:t>
+      </w:r>
+    </w:p>
+    <w:p>
+      <w:pPr>
+        <w:keepNext/>
+        <w:spacing w:after="30" w:before="120"/>
+      </w:pPr>
+      <w:r>
+        <w:rPr>
+          <w:b/>
+          <w:bCs/>
+          <w:i/>
+          <w:iCs/>
+          <w:color w:val="6A6A6A"/>
+          <w:sz w:val="18"/>
+          <w:szCs w:val="18"/>
+        </w:rPr>
+        <w:t xml:space="preserve">Beispiel</w:t>
+      </w:r>
+    </w:p>
+    <w:p>
+      <w:pPr>
+        <w:keepLines/>
+        <w:pBdr>
+          <w:left w:val="single" w:color="1B6CA8" w:sz="18" w:space="6"/>
+        </w:pBdr>
+        <w:shd w:fill="F4F4F4" w:val="clear"/>
+        <w:spacing w:after="200" w:before="100" w:line="264" w:lineRule="auto"/>
+        <w:ind w:left="140"/>
+      </w:pPr>
+      <w:r>
+        <w:rPr>
+          <w:rFonts w:ascii="Consolas" w:cs="Consolas" w:eastAsia="Consolas" w:hAnsi="Consolas"/>
+          <w:sz w:val="19"/>
+          <w:szCs w:val="19"/>
+        </w:rPr>
+        <w:t xml:space="preserve">PRINT CHR$(65)</w:t>
+      </w:r>
+      <w:r>
+        <w:rPr>
+          <w:rFonts w:ascii="Consolas" w:cs="Consolas" w:eastAsia="Consolas" w:hAnsi="Consolas"/>
+          <w:sz w:val="19"/>
+          <w:szCs w:val="19"/>
+        </w:rPr>
+        <w:br/>
+        <w:t xml:space="preserve">PRINT ASC("Anna")</w:t>
+      </w:r>
+    </w:p>
+    <w:p>
+      <w:pPr>
+        <w:keepNext/>
+        <w:spacing w:after="30" w:before="120"/>
+      </w:pPr>
+      <w:r>
+        <w:rPr>
+          <w:b/>
+          <w:bCs/>
+          <w:i/>
+          <w:iCs/>
+          <w:color w:val="6A6A6A"/>
+          <w:sz w:val="18"/>
+          <w:szCs w:val="18"/>
+        </w:rPr>
+        <w:t xml:space="preserve">Ausgabe</w:t>
+      </w:r>
+    </w:p>
+    <w:p>
+      <w:pPr>
+        <w:keepLines/>
+        <w:pBdr>
+          <w:left w:val="single" w:color="9AC79A" w:sz="18" w:space="6"/>
+        </w:pBdr>
+        <w:shd w:fill="EAF4EA" w:val="clear"/>
+        <w:spacing w:after="200" w:before="100" w:line="264" w:lineRule="auto"/>
+        <w:ind w:left="140"/>
+      </w:pPr>
+      <w:r>
+        <w:rPr>
+          <w:rFonts w:ascii="Consolas" w:cs="Consolas" w:eastAsia="Consolas" w:hAnsi="Consolas"/>
+          <w:sz w:val="19"/>
+          <w:szCs w:val="19"/>
+        </w:rPr>
+        <w:t xml:space="preserve">A</w:t>
+      </w:r>
+      <w:r>
+        <w:rPr>
+          <w:rFonts w:ascii="Consolas" w:cs="Consolas" w:eastAsia="Consolas" w:hAnsi="Consolas"/>
+          <w:sz w:val="19"/>
+          <w:szCs w:val="19"/>
+        </w:rPr>
+        <w:br/>
+        <w:t xml:space="preserve">65</w:t>
+      </w:r>
+    </w:p>
+    <w:p>
+      <w:pPr>
+        <w:pStyle w:val="Heading2"/>
+        <w:keepNext/>
+        <w:keepLines/>
+        <w:spacing w:after="120" w:before="280"/>
+      </w:pPr>
+      <w:r>
+        <w:t xml:space="preserve">Auch als Methode aufrufbar</w:t>
+      </w:r>
+    </w:p>
+    <w:p>
+      <w:pPr>
+        <w:spacing w:after="180" w:line="312" w:lineRule="auto"/>
+      </w:pPr>
+      <w:r>
+        <w:rPr>
+          <w:sz w:val="22"/>
+          <w:szCs w:val="22"/>
+        </w:rPr>
+        <w:t xml:space="preserve">Viele dieser Funktionen kannst du wahlweise auch in Punkt-Schreibweise an den String hängen – das liest sich oft flüssiger und lässt sich verketten:</w:t>
+      </w:r>
+    </w:p>
+    <w:p>
+      <w:pPr>
+        <w:keepLines/>
+        <w:pBdr>
+          <w:left w:val="single" w:color="1B6CA8" w:sz="18" w:space="6"/>
+        </w:pBdr>
+        <w:shd w:fill="F4F4F4" w:val="clear"/>
+        <w:spacing w:after="200" w:before="100" w:line="264" w:lineRule="auto"/>
+        <w:ind w:left="140"/>
+      </w:pPr>
+      <w:r>
+        <w:rPr>
+          <w:rFonts w:ascii="Consolas" w:cs="Consolas" w:eastAsia="Consolas" w:hAnsi="Consolas"/>
+          <w:sz w:val="19"/>
+          <w:szCs w:val="19"/>
+        </w:rPr>
+        <w:t xml:space="preserve">PRINT "hallo".upper()</w:t>
+      </w:r>
+      <w:r>
+        <w:rPr>
+          <w:rFonts w:ascii="Consolas" w:cs="Consolas" w:eastAsia="Consolas" w:hAnsi="Consolas"/>
+          <w:sz w:val="19"/>
+          <w:szCs w:val="19"/>
+        </w:rPr>
+        <w:br/>
+        <w:t xml:space="preserve">PRINT "  hi  ".trim().upper()</w:t>
+      </w:r>
+      <w:r>
+        <w:rPr>
+          <w:rFonts w:ascii="Consolas" w:cs="Consolas" w:eastAsia="Consolas" w:hAnsi="Consolas"/>
+          <w:sz w:val="19"/>
+          <w:szCs w:val="19"/>
+        </w:rPr>
+        <w:br/>
+        <w:t xml:space="preserve">PRINT "GameBasic".length()</w:t>
+      </w:r>
+    </w:p>
+    <w:p>
+      <w:pPr>
+        <w:keepLines/>
+        <w:pBdr>
+          <w:left w:val="single" w:color="9AC79A" w:sz="18" w:space="6"/>
+        </w:pBdr>
+        <w:shd w:fill="EAF4EA" w:val="clear"/>
+        <w:spacing w:after="200" w:before="100" w:line="264" w:lineRule="auto"/>
+        <w:ind w:left="140"/>
+      </w:pPr>
+      <w:r>
+        <w:rPr>
+          <w:rFonts w:ascii="Consolas" w:cs="Consolas" w:eastAsia="Consolas" w:hAnsi="Consolas"/>
+          <w:sz w:val="19"/>
+          <w:szCs w:val="19"/>
+        </w:rPr>
+        <w:t xml:space="preserve">HALLO</w:t>
+      </w:r>
+      <w:r>
+        <w:rPr>
+          <w:rFonts w:ascii="Consolas" w:cs="Consolas" w:eastAsia="Consolas" w:hAnsi="Consolas"/>
+          <w:sz w:val="19"/>
+          <w:szCs w:val="19"/>
+        </w:rPr>
+        <w:br/>
+        <w:t xml:space="preserve">HI</w:t>
+      </w:r>
+      <w:r>
+        <w:rPr>
+          <w:rFonts w:ascii="Consolas" w:cs="Consolas" w:eastAsia="Consolas" w:hAnsi="Consolas"/>
+          <w:sz w:val="19"/>
+          <w:szCs w:val="19"/>
+        </w:rPr>
+        <w:br/>
+        <w:t xml:space="preserve">9</w:t>
+      </w:r>
+    </w:p>
+    <w:p>
+      <w:pPr>
+        <w:spacing w:before="60"/>
+      </w:pPr>
+    </w:p>
+    <w:tbl>
+      <w:tblPr>
+        <w:tblW w:type="dxa" w:w="9360"/>
+        <w:tblBorders>
+          <w:top w:val="single" w:color="auto" w:sz="4"/>
+          <w:left w:val="single" w:color="auto" w:sz="4"/>
+          <w:bottom w:val="single" w:color="auto" w:sz="4"/>
+          <w:right w:val="single" w:color="auto" w:sz="4"/>
+          <w:insideH w:val="single" w:color="auto" w:sz="4"/>
+          <w:insideV w:val="single" w:color="auto" w:sz="4"/>
+        </w:tblBorders>
+      </w:tblPr>
+      <w:tblGrid>
+        <w:gridCol w:w="9360"/>
+      </w:tblGrid>
+      <w:tr>
+        <w:trPr>
+          <w:cantSplit/>
+        </w:trPr>
+        <w:tc>
+          <w:tcPr>
+            <w:tcW w:type="dxa" w:w="9360"/>
+            <w:tcBorders>
+              <w:top w:val="single" w:color="9CC8E6" w:sz="6"/>
+              <w:left w:val="single" w:color="9CC8E6" w:sz="6"/>
+              <w:bottom w:val="single" w:color="9CC8E6" w:sz="6"/>
+              <w:right w:val="single" w:color="9CC8E6" w:sz="6"/>
+            </w:tcBorders>
+            <w:shd w:fill="E7F2FA" w:val="clear"/>
+            <w:tcMar>
+              <w:top w:type="dxa" w:w="140"/>
+              <w:left w:type="dxa" w:w="180"/>
+              <w:bottom w:type="dxa" w:w="140"/>
+              <w:right w:type="dxa" w:w="180"/>
+            </w:tcMar>
+          </w:tcPr>
+          <w:p>
+            <w:pPr>
+              <w:spacing w:after="40"/>
+            </w:pPr>
+            <w:r>
+              <w:rPr>
+                <w:b/>
+                <w:bCs/>
+                <w:color w:val="1B6CA8"/>
+                <w:sz w:val="22"/>
+                <w:szCs w:val="22"/>
+              </w:rPr>
+              <w:t xml:space="preserve">Text bauen mit f-Strings</w:t>
+            </w:r>
+          </w:p>
+          <w:p>
+            <w:pPr>
+              <w:spacing w:after="0" w:line="312" w:lineRule="auto"/>
+            </w:pPr>
+            <w:r>
+              <w:rPr>
+                <w:sz w:val="22"/>
+                <w:szCs w:val="22"/>
+              </w:rPr>
+              <w:t xml:space="preserve">Für das Zusammensetzen von Text aus Werten ist ein f-String meist die angenehmste Wahl: f"{name} hat {punkte} Punkte" spart dir die vielen + und STR$. Siehe Kapitel „Ein- und Ausgabe“.</w:t>
             </w:r>
           </w:p>
         </w:tc>

</xml_diff>

<commit_message>
docs(buch): Lehrbuch Kap 17 -- Arrays (ausfuehrlich)
DIM[n] + Standardwerte, 0-basierter Index + Bounds-Warnung, LEN/Iteration/
FOR EACH, SORT/REVERSE/ARRAY_INDEXOF, Aggregate SUM/AVG/MIN/MAX/FILL,
dynamische Arrays PUSH/POP/INSERT/REMOVE_AT/REDIM, Slicing (kopiert),
Alias-Stolperstein (b=a kopiert NICHT) + ARRAY_COPY, mehrdimensional.
Schwierige Themen mit mentalen Modellen ausfuehrlicher erklaert.
Alle Beispiel-Ausgaben gegen gbrt verifiziert.

Co-Authored-By: Claude Opus 4.8 (1M context) <noreply@anthropic.com>
</commit_message>
<xml_diff>
--- a/buch-referenz/buch/GameBasic-Lehrbuch.docx
+++ b/buch-referenz/buch/GameBasic-Lehrbuch.docx
@@ -435,6 +435,33 @@
           <w:szCs w:val="22"/>
         </w:rPr>
         <w:t xml:space="preserve">	39</w:t>
+      </w:r>
+    </w:p>
+    <w:p>
+      <w:pPr>
+        <w:tabs>
+          <w:tab w:val="right" w:pos="9200" w:leader="dot"/>
+        </w:tabs>
+        <w:spacing w:after="20" w:before="0"/>
+        <w:ind w:left="280"/>
+      </w:pPr>
+      <w:r>
+        <w:rPr>
+          <w:b w:val="false"/>
+          <w:bCs w:val="false"/>
+          <w:color w:val="222222"/>
+          <w:sz w:val="22"/>
+          <w:szCs w:val="22"/>
+        </w:rPr>
+        <w:t xml:space="preserve">Arrays</w:t>
+      </w:r>
+      <w:r>
+        <w:rPr>
+          <w:color w:val="555555"/>
+          <w:sz w:val="22"/>
+          <w:szCs w:val="22"/>
+        </w:rPr>
+        <w:t xml:space="preserve">	31</w:t>
       </w:r>
     </w:p>
     <w:p>
@@ -13556,6 +13583,2705 @@
                 <w:szCs w:val="22"/>
               </w:rPr>
               <w:t xml:space="preserve">Für das Zusammensetzen von Text aus Werten ist ein f-String meist die angenehmste Wahl: f"{name} hat {punkte} Punkte" spart dir die vielen + und STR$. Siehe Kapitel „Ein- und Ausgabe“.</w:t>
+            </w:r>
+          </w:p>
+        </w:tc>
+      </w:tr>
+    </w:tbl>
+    <w:p>
+      <w:pPr>
+        <w:spacing w:after="160"/>
+      </w:pPr>
+    </w:p>
+    <w:p>
+      <w:pPr>
+        <w:pStyle w:val="Heading1"/>
+        <w:keepNext/>
+        <w:keepLines/>
+        <w:pageBreakBefore/>
+        <w:pBdr>
+          <w:bottom w:val="single" w:color="1B6CA8" w:sz="12" w:space="4"/>
+        </w:pBdr>
+        <w:spacing w:after="160" w:before="0"/>
+      </w:pPr>
+      <w:r>
+        <w:t xml:space="preserve">Arrays</w:t>
+      </w:r>
+    </w:p>
+    <w:p>
+      <w:pPr>
+        <w:spacing w:after="180" w:line="312" w:lineRule="auto"/>
+      </w:pPr>
+      <w:r>
+        <w:rPr>
+          <w:sz w:val="22"/>
+          <w:szCs w:val="22"/>
+        </w:rPr>
+        <w:t xml:space="preserve">Bisher hatte jede Variable genau einen Wert. Doch oft gehören viele Werte zusammen: die Punkte aller Spieler, die Lebenspunkte jedes Gegners, die Kacheln einer Spielkarte. Für jeden eine eigene Variable anzulegen (gegner1, gegner2, gegner3 …) wäre mühsam und unflexibel. Ein Array löst das: Es ist eine einzige Variable, die viele Werte unter einem Namen bündelt – nummeriert und in Reih und Glied.</w:t>
+      </w:r>
+    </w:p>
+    <w:p>
+      <w:pPr>
+        <w:spacing w:after="180" w:line="312" w:lineRule="auto"/>
+      </w:pPr>
+      <w:r>
+        <w:rPr>
+          <w:sz w:val="22"/>
+          <w:szCs w:val="22"/>
+        </w:rPr>
+        <w:t xml:space="preserve">Stell dir ein Array wie eine Reihe nummerierter Schließfächer vor. Alle tragen denselben Namen (etwa punkte), aber jedes hat eine eigene Nummer. Über diese Nummer – den Index – sprichst du ein einzelnes Fach an. So kannst du mit einer Schleife mühelos über hunderte oder tausende Werte laufen, ohne je einen neuen Variablennamen erfinden zu müssen.</w:t>
+      </w:r>
+    </w:p>
+    <w:p>
+      <w:pPr>
+        <w:pStyle w:val="Heading2"/>
+        <w:keepNext/>
+        <w:keepLines/>
+        <w:spacing w:after="120" w:before="280"/>
+      </w:pPr>
+      <w:r>
+        <w:t xml:space="preserve">Ein Array anlegen</w:t>
+      </w:r>
+    </w:p>
+    <w:p>
+      <w:pPr>
+        <w:spacing w:after="180" w:line="312" w:lineRule="auto"/>
+      </w:pPr>
+      <w:r>
+        <w:rPr>
+          <w:sz w:val="22"/>
+          <w:szCs w:val="22"/>
+        </w:rPr>
+        <w:t xml:space="preserve">Ein Array deklarierst du mit DIM – wie eine normale Variable, aber mit der Anzahl der Fächer in eckigen Klammern. Hinter AS steht der Typ, den jedes Fach aufnimmt. Frisch angelegt ist jedes Fach mit dem Standardwert gefüllt: bei Zahlen 0, bei Strings der leere Text, bei Wahrheitswerten FALSE.</w:t>
+      </w:r>
+    </w:p>
+    <w:p>
+      <w:pPr>
+        <w:keepNext/>
+        <w:keepLines/>
+        <w:pBdr>
+          <w:bottom w:val="single" w:color="DDD0C0" w:sz="4" w:space="2"/>
+        </w:pBdr>
+        <w:spacing w:after="40" w:before="360"/>
+      </w:pPr>
+      <w:r>
+        <w:rPr>
+          <w:rFonts w:ascii="Consolas" w:cs="Consolas" w:eastAsia="Consolas" w:hAnsi="Consolas"/>
+          <w:b/>
+          <w:bCs/>
+          <w:color w:val="9A3412"/>
+          <w:sz w:val="24"/>
+          <w:szCs w:val="24"/>
+        </w:rPr>
+        <w:t xml:space="preserve">DIM ... [n] AS Typ</w:t>
+      </w:r>
+    </w:p>
+    <w:p>
+      <w:pPr>
+        <w:keepNext/>
+        <w:spacing w:after="120"/>
+      </w:pPr>
+      <w:r>
+        <w:rPr>
+          <w:b/>
+          <w:bCs/>
+          <w:color w:val="6A6A6A"/>
+          <w:sz w:val="18"/>
+          <w:szCs w:val="18"/>
+        </w:rPr>
+        <w:t xml:space="preserve">Syntax:  </w:t>
+      </w:r>
+      <w:r>
+        <w:rPr>
+          <w:rFonts w:ascii="Consolas" w:cs="Consolas" w:eastAsia="Consolas" w:hAnsi="Consolas"/>
+          <w:color w:val="335577"/>
+          <w:sz w:val="19"/>
+          <w:szCs w:val="19"/>
+        </w:rPr>
+        <w:t xml:space="preserve">DIM name[anzahl] AS Typ</w:t>
+      </w:r>
+    </w:p>
+    <w:p>
+      <w:pPr>
+        <w:spacing w:after="180" w:line="312" w:lineRule="auto"/>
+      </w:pPr>
+      <w:r>
+        <w:rPr>
+          <w:sz w:val="22"/>
+          <w:szCs w:val="22"/>
+        </w:rPr>
+        <w:t xml:space="preserve">Legt ein Array mit der angegebenen Anzahl Fächer an, alle vom genannten Typ und mit dessen Standardwert vorbelegt. Die Anzahl steht in eckigen Klammern.</w:t>
+      </w:r>
+    </w:p>
+    <w:p>
+      <w:pPr>
+        <w:keepNext/>
+        <w:spacing w:after="30" w:before="120"/>
+      </w:pPr>
+      <w:r>
+        <w:rPr>
+          <w:b/>
+          <w:bCs/>
+          <w:i/>
+          <w:iCs/>
+          <w:color w:val="6A6A6A"/>
+          <w:sz w:val="18"/>
+          <w:szCs w:val="18"/>
+        </w:rPr>
+        <w:t xml:space="preserve">Beispiel</w:t>
+      </w:r>
+    </w:p>
+    <w:p>
+      <w:pPr>
+        <w:keepLines/>
+        <w:pBdr>
+          <w:left w:val="single" w:color="1B6CA8" w:sz="18" w:space="6"/>
+        </w:pBdr>
+        <w:shd w:fill="F4F4F4" w:val="clear"/>
+        <w:spacing w:after="200" w:before="100" w:line="264" w:lineRule="auto"/>
+        <w:ind w:left="140"/>
+      </w:pPr>
+      <w:r>
+        <w:rPr>
+          <w:rFonts w:ascii="Consolas" w:cs="Consolas" w:eastAsia="Consolas" w:hAnsi="Consolas"/>
+          <w:sz w:val="19"/>
+          <w:szCs w:val="19"/>
+        </w:rPr>
+        <w:t xml:space="preserve">DIM punkte[5] AS INTEGER</w:t>
+      </w:r>
+      <w:r>
+        <w:rPr>
+          <w:rFonts w:ascii="Consolas" w:cs="Consolas" w:eastAsia="Consolas" w:hAnsi="Consolas"/>
+          <w:sz w:val="19"/>
+          <w:szCs w:val="19"/>
+        </w:rPr>
+        <w:br/>
+        <w:t xml:space="preserve">PRINT punkte[0]      ' noch der Standardwert</w:t>
+      </w:r>
+    </w:p>
+    <w:p>
+      <w:pPr>
+        <w:keepNext/>
+        <w:spacing w:after="30" w:before="120"/>
+      </w:pPr>
+      <w:r>
+        <w:rPr>
+          <w:b/>
+          <w:bCs/>
+          <w:i/>
+          <w:iCs/>
+          <w:color w:val="6A6A6A"/>
+          <w:sz w:val="18"/>
+          <w:szCs w:val="18"/>
+        </w:rPr>
+        <w:t xml:space="preserve">Ausgabe</w:t>
+      </w:r>
+    </w:p>
+    <w:p>
+      <w:pPr>
+        <w:keepLines/>
+        <w:pBdr>
+          <w:left w:val="single" w:color="9AC79A" w:sz="18" w:space="6"/>
+        </w:pBdr>
+        <w:shd w:fill="EAF4EA" w:val="clear"/>
+        <w:spacing w:after="200" w:before="100" w:line="264" w:lineRule="auto"/>
+        <w:ind w:left="140"/>
+      </w:pPr>
+      <w:r>
+        <w:rPr>
+          <w:rFonts w:ascii="Consolas" w:cs="Consolas" w:eastAsia="Consolas" w:hAnsi="Consolas"/>
+          <w:sz w:val="19"/>
+          <w:szCs w:val="19"/>
+        </w:rPr>
+        <w:t xml:space="preserve">0</w:t>
+      </w:r>
+    </w:p>
+    <w:p>
+      <w:pPr>
+        <w:pStyle w:val="Heading2"/>
+        <w:keepNext/>
+        <w:keepLines/>
+        <w:spacing w:after="120" w:before="280"/>
+      </w:pPr>
+      <w:r>
+        <w:t xml:space="preserve">Fächer lesen und beschreiben</w:t>
+      </w:r>
+    </w:p>
+    <w:p>
+      <w:pPr>
+        <w:spacing w:after="180" w:line="312" w:lineRule="auto"/>
+      </w:pPr>
+      <w:r>
+        <w:rPr>
+          <w:sz w:val="22"/>
+          <w:szCs w:val="22"/>
+        </w:rPr>
+        <w:t xml:space="preserve">Ein einzelnes Fach sprichst du über seinen Index in eckigen Klammern an. Und hier kommt der wichtigste Punkt überhaupt: Die Zählung beginnt bei 0, nicht bei 1. Ein Array mit 5 Fächern hat also die gültigen Indizes 0, 1, 2, 3 und 4 – das letzte Fach trägt die Nummer 4, nicht 5.</w:t>
+      </w:r>
+    </w:p>
+    <w:p>
+      <w:pPr>
+        <w:spacing w:after="180" w:line="312" w:lineRule="auto"/>
+      </w:pPr>
+      <w:r>
+        <w:rPr>
+          <w:sz w:val="22"/>
+          <w:szCs w:val="22"/>
+        </w:rPr>
+        <w:t xml:space="preserve">Das fühlt sich am Anfang ungewohnt an, ist aber in fast allen modernen Programmiersprachen so. Merke dir: Der Index ist der „Abstand vom Anfang“. Das erste Element ist null Schritte vom Anfang entfernt, also Index 0.</w:t>
+      </w:r>
+    </w:p>
+    <w:p>
+      <w:pPr>
+        <w:keepLines/>
+        <w:pBdr>
+          <w:left w:val="single" w:color="1B6CA8" w:sz="18" w:space="6"/>
+        </w:pBdr>
+        <w:shd w:fill="F4F4F4" w:val="clear"/>
+        <w:spacing w:after="200" w:before="100" w:line="264" w:lineRule="auto"/>
+        <w:ind w:left="140"/>
+      </w:pPr>
+      <w:r>
+        <w:rPr>
+          <w:rFonts w:ascii="Consolas" w:cs="Consolas" w:eastAsia="Consolas" w:hAnsi="Consolas"/>
+          <w:sz w:val="19"/>
+          <w:szCs w:val="19"/>
+        </w:rPr>
+        <w:t xml:space="preserve">DIM punkte[5] AS INTEGER</w:t>
+      </w:r>
+      <w:r>
+        <w:rPr>
+          <w:rFonts w:ascii="Consolas" w:cs="Consolas" w:eastAsia="Consolas" w:hAnsi="Consolas"/>
+          <w:sz w:val="19"/>
+          <w:szCs w:val="19"/>
+        </w:rPr>
+        <w:br/>
+        <w:t xml:space="preserve">punkte[0] = 42      ' erstes Fach</w:t>
+      </w:r>
+      <w:r>
+        <w:rPr>
+          <w:rFonts w:ascii="Consolas" w:cs="Consolas" w:eastAsia="Consolas" w:hAnsi="Consolas"/>
+          <w:sz w:val="19"/>
+          <w:szCs w:val="19"/>
+        </w:rPr>
+        <w:br/>
+        <w:t xml:space="preserve">punkte[1] = 17</w:t>
+      </w:r>
+      <w:r>
+        <w:rPr>
+          <w:rFonts w:ascii="Consolas" w:cs="Consolas" w:eastAsia="Consolas" w:hAnsi="Consolas"/>
+          <w:sz w:val="19"/>
+          <w:szCs w:val="19"/>
+        </w:rPr>
+        <w:br/>
+        <w:t xml:space="preserve">punkte[4] = 99      ' letztes Fach (nicht 5!)</w:t>
+      </w:r>
+      <w:r>
+        <w:rPr>
+          <w:rFonts w:ascii="Consolas" w:cs="Consolas" w:eastAsia="Consolas" w:hAnsi="Consolas"/>
+          <w:sz w:val="19"/>
+          <w:szCs w:val="19"/>
+        </w:rPr>
+        <w:br/>
+        <w:t xml:space="preserve"/>
+      </w:r>
+      <w:r>
+        <w:rPr>
+          <w:rFonts w:ascii="Consolas" w:cs="Consolas" w:eastAsia="Consolas" w:hAnsi="Consolas"/>
+          <w:sz w:val="19"/>
+          <w:szCs w:val="19"/>
+        </w:rPr>
+        <w:br/>
+        <w:t xml:space="preserve">PRINT punkte[0]</w:t>
+      </w:r>
+      <w:r>
+        <w:rPr>
+          <w:rFonts w:ascii="Consolas" w:cs="Consolas" w:eastAsia="Consolas" w:hAnsi="Consolas"/>
+          <w:sz w:val="19"/>
+          <w:szCs w:val="19"/>
+        </w:rPr>
+        <w:br/>
+        <w:t xml:space="preserve">PRINT punkte[4]</w:t>
+      </w:r>
+    </w:p>
+    <w:p>
+      <w:pPr>
+        <w:keepLines/>
+        <w:pBdr>
+          <w:left w:val="single" w:color="9AC79A" w:sz="18" w:space="6"/>
+        </w:pBdr>
+        <w:shd w:fill="EAF4EA" w:val="clear"/>
+        <w:spacing w:after="200" w:before="100" w:line="264" w:lineRule="auto"/>
+        <w:ind w:left="140"/>
+      </w:pPr>
+      <w:r>
+        <w:rPr>
+          <w:rFonts w:ascii="Consolas" w:cs="Consolas" w:eastAsia="Consolas" w:hAnsi="Consolas"/>
+          <w:sz w:val="19"/>
+          <w:szCs w:val="19"/>
+        </w:rPr>
+        <w:t xml:space="preserve">42</w:t>
+      </w:r>
+      <w:r>
+        <w:rPr>
+          <w:rFonts w:ascii="Consolas" w:cs="Consolas" w:eastAsia="Consolas" w:hAnsi="Consolas"/>
+          <w:sz w:val="19"/>
+          <w:szCs w:val="19"/>
+        </w:rPr>
+        <w:br/>
+        <w:t xml:space="preserve">99</w:t>
+      </w:r>
+    </w:p>
+    <w:p>
+      <w:pPr>
+        <w:spacing w:before="60"/>
+      </w:pPr>
+    </w:p>
+    <w:tbl>
+      <w:tblPr>
+        <w:tblW w:type="dxa" w:w="9360"/>
+        <w:tblBorders>
+          <w:top w:val="single" w:color="auto" w:sz="4"/>
+          <w:left w:val="single" w:color="auto" w:sz="4"/>
+          <w:bottom w:val="single" w:color="auto" w:sz="4"/>
+          <w:right w:val="single" w:color="auto" w:sz="4"/>
+          <w:insideH w:val="single" w:color="auto" w:sz="4"/>
+          <w:insideV w:val="single" w:color="auto" w:sz="4"/>
+        </w:tblBorders>
+      </w:tblPr>
+      <w:tblGrid>
+        <w:gridCol w:w="9360"/>
+      </w:tblGrid>
+      <w:tr>
+        <w:trPr>
+          <w:cantSplit/>
+        </w:trPr>
+        <w:tc>
+          <w:tcPr>
+            <w:tcW w:type="dxa" w:w="9360"/>
+            <w:tcBorders>
+              <w:top w:val="single" w:color="E0A0A0" w:sz="6"/>
+              <w:left w:val="single" w:color="E0A0A0" w:sz="6"/>
+              <w:bottom w:val="single" w:color="E0A0A0" w:sz="6"/>
+              <w:right w:val="single" w:color="E0A0A0" w:sz="6"/>
+            </w:tcBorders>
+            <w:shd w:fill="FBEAEA" w:val="clear"/>
+            <w:tcMar>
+              <w:top w:type="dxa" w:w="140"/>
+              <w:left w:type="dxa" w:w="180"/>
+              <w:bottom w:type="dxa" w:w="140"/>
+              <w:right w:type="dxa" w:w="180"/>
+            </w:tcMar>
+          </w:tcPr>
+          <w:p>
+            <w:pPr>
+              <w:spacing w:after="40"/>
+            </w:pPr>
+            <w:r>
+              <w:rPr>
+                <w:b/>
+                <w:bCs/>
+                <w:color w:val="B23030"/>
+                <w:sz w:val="22"/>
+                <w:szCs w:val="22"/>
+              </w:rPr>
+              <w:t xml:space="preserve">Achtung</w:t>
+            </w:r>
+          </w:p>
+          <w:p>
+            <w:pPr>
+              <w:spacing w:after="0" w:line="312" w:lineRule="auto"/>
+            </w:pPr>
+            <w:r>
+              <w:rPr>
+                <w:sz w:val="22"/>
+                <w:szCs w:val="22"/>
+              </w:rPr>
+              <w:t xml:space="preserve">Greifst du auf ein Fach zu, das es nicht gibt – etwa punkte[5] bei nur 5 Fächern (gültig sind 0 bis 4) – bricht das Programm mit einem Fehler ab. Achte immer darauf, innerhalb der Grenzen zu bleiben. Die Grenze liefert dir LEN (siehe unten).</w:t>
+            </w:r>
+          </w:p>
+        </w:tc>
+      </w:tr>
+    </w:tbl>
+    <w:p>
+      <w:pPr>
+        <w:spacing w:after="160"/>
+      </w:pPr>
+    </w:p>
+    <w:p>
+      <w:pPr>
+        <w:pStyle w:val="Heading2"/>
+        <w:keepNext/>
+        <w:keepLines/>
+        <w:spacing w:after="120" w:before="280"/>
+      </w:pPr>
+      <w:r>
+        <w:t xml:space="preserve">Wie viele Fächer? LEN</w:t>
+      </w:r>
+    </w:p>
+    <w:p>
+      <w:pPr>
+        <w:spacing w:after="180" w:line="312" w:lineRule="auto"/>
+      </w:pPr>
+      <w:r>
+        <w:rPr>
+          <w:sz w:val="22"/>
+          <w:szCs w:val="22"/>
+        </w:rPr>
+        <w:t xml:space="preserve">LEN sagt dir, wie viele Elemente ein Array hat. Das brauchst du ständig – vor allem, um mit einer Schleife sicher über alle Fächer zu laufen. Weil die Indizes bei 0 beginnen, läuft die Schleife von 0 bis LEN minus 1.</w:t>
+      </w:r>
+    </w:p>
+    <w:p>
+      <w:pPr>
+        <w:keepNext/>
+        <w:keepLines/>
+        <w:pBdr>
+          <w:bottom w:val="single" w:color="DDD0C0" w:sz="4" w:space="2"/>
+        </w:pBdr>
+        <w:spacing w:after="40" w:before="360"/>
+      </w:pPr>
+      <w:r>
+        <w:rPr>
+          <w:rFonts w:ascii="Consolas" w:cs="Consolas" w:eastAsia="Consolas" w:hAnsi="Consolas"/>
+          <w:b/>
+          <w:bCs/>
+          <w:color w:val="9A3412"/>
+          <w:sz w:val="24"/>
+          <w:szCs w:val="24"/>
+        </w:rPr>
+        <w:t xml:space="preserve">LEN</w:t>
+      </w:r>
+    </w:p>
+    <w:p>
+      <w:pPr>
+        <w:keepNext/>
+        <w:spacing w:after="120"/>
+      </w:pPr>
+      <w:r>
+        <w:rPr>
+          <w:b/>
+          <w:bCs/>
+          <w:color w:val="6A6A6A"/>
+          <w:sz w:val="18"/>
+          <w:szCs w:val="18"/>
+        </w:rPr>
+        <w:t xml:space="preserve">Syntax:  </w:t>
+      </w:r>
+      <w:r>
+        <w:rPr>
+          <w:rFonts w:ascii="Consolas" w:cs="Consolas" w:eastAsia="Consolas" w:hAnsi="Consolas"/>
+          <w:color w:val="335577"/>
+          <w:sz w:val="19"/>
+          <w:szCs w:val="19"/>
+        </w:rPr>
+        <w:t xml:space="preserve">LEN(arr)</w:t>
+      </w:r>
+    </w:p>
+    <w:p>
+      <w:pPr>
+        <w:spacing w:after="180" w:line="312" w:lineRule="auto"/>
+      </w:pPr>
+      <w:r>
+        <w:rPr>
+          <w:sz w:val="22"/>
+          <w:szCs w:val="22"/>
+        </w:rPr>
+        <w:t xml:space="preserve">Liefert die Anzahl der Elemente eines Arrays. (Bei mehrdimensionalen Arrays die Größe der ersten Dimension.)</w:t>
+      </w:r>
+    </w:p>
+    <w:p>
+      <w:pPr>
+        <w:keepNext/>
+        <w:spacing w:after="30" w:before="120"/>
+      </w:pPr>
+      <w:r>
+        <w:rPr>
+          <w:b/>
+          <w:bCs/>
+          <w:i/>
+          <w:iCs/>
+          <w:color w:val="6A6A6A"/>
+          <w:sz w:val="18"/>
+          <w:szCs w:val="18"/>
+        </w:rPr>
+        <w:t xml:space="preserve">Beispiel</w:t>
+      </w:r>
+    </w:p>
+    <w:p>
+      <w:pPr>
+        <w:keepLines/>
+        <w:pBdr>
+          <w:left w:val="single" w:color="1B6CA8" w:sz="18" w:space="6"/>
+        </w:pBdr>
+        <w:shd w:fill="F4F4F4" w:val="clear"/>
+        <w:spacing w:after="200" w:before="100" w:line="264" w:lineRule="auto"/>
+        <w:ind w:left="140"/>
+      </w:pPr>
+      <w:r>
+        <w:rPr>
+          <w:rFonts w:ascii="Consolas" w:cs="Consolas" w:eastAsia="Consolas" w:hAnsi="Consolas"/>
+          <w:sz w:val="19"/>
+          <w:szCs w:val="19"/>
+        </w:rPr>
+        <w:t xml:space="preserve">DIM noten[3] AS INTEGER</w:t>
+      </w:r>
+      <w:r>
+        <w:rPr>
+          <w:rFonts w:ascii="Consolas" w:cs="Consolas" w:eastAsia="Consolas" w:hAnsi="Consolas"/>
+          <w:sz w:val="19"/>
+          <w:szCs w:val="19"/>
+        </w:rPr>
+        <w:br/>
+        <w:t xml:space="preserve">noten[0] = 1 : noten[1] = 3 : noten[2] = 2</w:t>
+      </w:r>
+      <w:r>
+        <w:rPr>
+          <w:rFonts w:ascii="Consolas" w:cs="Consolas" w:eastAsia="Consolas" w:hAnsi="Consolas"/>
+          <w:sz w:val="19"/>
+          <w:szCs w:val="19"/>
+        </w:rPr>
+        <w:br/>
+        <w:t xml:space="preserve"/>
+      </w:r>
+      <w:r>
+        <w:rPr>
+          <w:rFonts w:ascii="Consolas" w:cs="Consolas" w:eastAsia="Consolas" w:hAnsi="Consolas"/>
+          <w:sz w:val="19"/>
+          <w:szCs w:val="19"/>
+        </w:rPr>
+        <w:br/>
+        <w:t xml:space="preserve">DIM i AS INTEGER</w:t>
+      </w:r>
+      <w:r>
+        <w:rPr>
+          <w:rFonts w:ascii="Consolas" w:cs="Consolas" w:eastAsia="Consolas" w:hAnsi="Consolas"/>
+          <w:sz w:val="19"/>
+          <w:szCs w:val="19"/>
+        </w:rPr>
+        <w:br/>
+        <w:t xml:space="preserve">FOR i = 0 TO LEN(noten) - 1</w:t>
+      </w:r>
+      <w:r>
+        <w:rPr>
+          <w:rFonts w:ascii="Consolas" w:cs="Consolas" w:eastAsia="Consolas" w:hAnsi="Consolas"/>
+          <w:sz w:val="19"/>
+          <w:szCs w:val="19"/>
+        </w:rPr>
+        <w:br/>
+        <w:t xml:space="preserve">    PRINT "Note "; i; ": "; noten[i]</w:t>
+      </w:r>
+      <w:r>
+        <w:rPr>
+          <w:rFonts w:ascii="Consolas" w:cs="Consolas" w:eastAsia="Consolas" w:hAnsi="Consolas"/>
+          <w:sz w:val="19"/>
+          <w:szCs w:val="19"/>
+        </w:rPr>
+        <w:br/>
+        <w:t xml:space="preserve">NEXT</w:t>
+      </w:r>
+    </w:p>
+    <w:p>
+      <w:pPr>
+        <w:keepNext/>
+        <w:spacing w:after="30" w:before="120"/>
+      </w:pPr>
+      <w:r>
+        <w:rPr>
+          <w:b/>
+          <w:bCs/>
+          <w:i/>
+          <w:iCs/>
+          <w:color w:val="6A6A6A"/>
+          <w:sz w:val="18"/>
+          <w:szCs w:val="18"/>
+        </w:rPr>
+        <w:t xml:space="preserve">Ausgabe</w:t>
+      </w:r>
+    </w:p>
+    <w:p>
+      <w:pPr>
+        <w:keepLines/>
+        <w:pBdr>
+          <w:left w:val="single" w:color="9AC79A" w:sz="18" w:space="6"/>
+        </w:pBdr>
+        <w:shd w:fill="EAF4EA" w:val="clear"/>
+        <w:spacing w:after="200" w:before="100" w:line="264" w:lineRule="auto"/>
+        <w:ind w:left="140"/>
+      </w:pPr>
+      <w:r>
+        <w:rPr>
+          <w:rFonts w:ascii="Consolas" w:cs="Consolas" w:eastAsia="Consolas" w:hAnsi="Consolas"/>
+          <w:sz w:val="19"/>
+          <w:szCs w:val="19"/>
+        </w:rPr>
+        <w:t xml:space="preserve">Note 0: 1</w:t>
+      </w:r>
+      <w:r>
+        <w:rPr>
+          <w:rFonts w:ascii="Consolas" w:cs="Consolas" w:eastAsia="Consolas" w:hAnsi="Consolas"/>
+          <w:sz w:val="19"/>
+          <w:szCs w:val="19"/>
+        </w:rPr>
+        <w:br/>
+        <w:t xml:space="preserve">Note 1: 3</w:t>
+      </w:r>
+      <w:r>
+        <w:rPr>
+          <w:rFonts w:ascii="Consolas" w:cs="Consolas" w:eastAsia="Consolas" w:hAnsi="Consolas"/>
+          <w:sz w:val="19"/>
+          <w:szCs w:val="19"/>
+        </w:rPr>
+        <w:br/>
+        <w:t xml:space="preserve">Note 2: 2</w:t>
+      </w:r>
+    </w:p>
+    <w:p>
+      <w:pPr>
+        <w:spacing w:after="180" w:line="312" w:lineRule="auto"/>
+      </w:pPr>
+      <w:r>
+        <w:rPr>
+          <w:sz w:val="22"/>
+          <w:szCs w:val="22"/>
+        </w:rPr>
+        <w:t xml:space="preserve">Geht es dir nur um die Werte und nicht um die Indizes, ist FOR EACH noch kürzer – es reicht dir jedes Element direkt, ohne dass du mit LEN und Index hantieren musst:</w:t>
+      </w:r>
+    </w:p>
+    <w:p>
+      <w:pPr>
+        <w:keepLines/>
+        <w:pBdr>
+          <w:left w:val="single" w:color="1B6CA8" w:sz="18" w:space="6"/>
+        </w:pBdr>
+        <w:shd w:fill="F4F4F4" w:val="clear"/>
+        <w:spacing w:after="200" w:before="100" w:line="264" w:lineRule="auto"/>
+        <w:ind w:left="140"/>
+      </w:pPr>
+      <w:r>
+        <w:rPr>
+          <w:rFonts w:ascii="Consolas" w:cs="Consolas" w:eastAsia="Consolas" w:hAnsi="Consolas"/>
+          <w:sz w:val="19"/>
+          <w:szCs w:val="19"/>
+        </w:rPr>
+        <w:t xml:space="preserve">DIM noten[3] AS INTEGER</w:t>
+      </w:r>
+      <w:r>
+        <w:rPr>
+          <w:rFonts w:ascii="Consolas" w:cs="Consolas" w:eastAsia="Consolas" w:hAnsi="Consolas"/>
+          <w:sz w:val="19"/>
+          <w:szCs w:val="19"/>
+        </w:rPr>
+        <w:br/>
+        <w:t xml:space="preserve">noten[0] = 1 : noten[1] = 3 : noten[2] = 2</w:t>
+      </w:r>
+      <w:r>
+        <w:rPr>
+          <w:rFonts w:ascii="Consolas" w:cs="Consolas" w:eastAsia="Consolas" w:hAnsi="Consolas"/>
+          <w:sz w:val="19"/>
+          <w:szCs w:val="19"/>
+        </w:rPr>
+        <w:br/>
+        <w:t xml:space="preserve"/>
+      </w:r>
+      <w:r>
+        <w:rPr>
+          <w:rFonts w:ascii="Consolas" w:cs="Consolas" w:eastAsia="Consolas" w:hAnsi="Consolas"/>
+          <w:sz w:val="19"/>
+          <w:szCs w:val="19"/>
+        </w:rPr>
+        <w:br/>
+        <w:t xml:space="preserve">FOR EACH note IN noten</w:t>
+      </w:r>
+      <w:r>
+        <w:rPr>
+          <w:rFonts w:ascii="Consolas" w:cs="Consolas" w:eastAsia="Consolas" w:hAnsi="Consolas"/>
+          <w:sz w:val="19"/>
+          <w:szCs w:val="19"/>
+        </w:rPr>
+        <w:br/>
+        <w:t xml:space="preserve">    PRINT note</w:t>
+      </w:r>
+      <w:r>
+        <w:rPr>
+          <w:rFonts w:ascii="Consolas" w:cs="Consolas" w:eastAsia="Consolas" w:hAnsi="Consolas"/>
+          <w:sz w:val="19"/>
+          <w:szCs w:val="19"/>
+        </w:rPr>
+        <w:br/>
+        <w:t xml:space="preserve">NEXT</w:t>
+      </w:r>
+    </w:p>
+    <w:p>
+      <w:pPr>
+        <w:keepLines/>
+        <w:pBdr>
+          <w:left w:val="single" w:color="9AC79A" w:sz="18" w:space="6"/>
+        </w:pBdr>
+        <w:shd w:fill="EAF4EA" w:val="clear"/>
+        <w:spacing w:after="200" w:before="100" w:line="264" w:lineRule="auto"/>
+        <w:ind w:left="140"/>
+      </w:pPr>
+      <w:r>
+        <w:rPr>
+          <w:rFonts w:ascii="Consolas" w:cs="Consolas" w:eastAsia="Consolas" w:hAnsi="Consolas"/>
+          <w:sz w:val="19"/>
+          <w:szCs w:val="19"/>
+        </w:rPr>
+        <w:t xml:space="preserve">1</w:t>
+      </w:r>
+      <w:r>
+        <w:rPr>
+          <w:rFonts w:ascii="Consolas" w:cs="Consolas" w:eastAsia="Consolas" w:hAnsi="Consolas"/>
+          <w:sz w:val="19"/>
+          <w:szCs w:val="19"/>
+        </w:rPr>
+        <w:br/>
+        <w:t xml:space="preserve">3</w:t>
+      </w:r>
+      <w:r>
+        <w:rPr>
+          <w:rFonts w:ascii="Consolas" w:cs="Consolas" w:eastAsia="Consolas" w:hAnsi="Consolas"/>
+          <w:sz w:val="19"/>
+          <w:szCs w:val="19"/>
+        </w:rPr>
+        <w:br/>
+        <w:t xml:space="preserve">2</w:t>
+      </w:r>
+    </w:p>
+    <w:p>
+      <w:pPr>
+        <w:pStyle w:val="Heading2"/>
+        <w:keepNext/>
+        <w:keepLines/>
+        <w:spacing w:after="120" w:before="280"/>
+      </w:pPr>
+      <w:r>
+        <w:t xml:space="preserve">Sortieren, Umkehren, Suchen</w:t>
+      </w:r>
+    </w:p>
+    <w:p>
+      <w:pPr>
+        <w:spacing w:after="180" w:line="312" w:lineRule="auto"/>
+      </w:pPr>
+      <w:r>
+        <w:rPr>
+          <w:sz w:val="22"/>
+          <w:szCs w:val="22"/>
+        </w:rPr>
+        <w:t xml:space="preserve">Für die häufigsten Aufgaben gibt es fertige Befehle. Wichtig: SORT und REVERSE verändern das Array direkt an Ort und Stelle (man sagt „in place“) – sie geben kein neues Array zurück, sondern krempeln das vorhandene um.</w:t>
+      </w:r>
+    </w:p>
+    <w:p>
+      <w:pPr>
+        <w:keepNext/>
+        <w:keepLines/>
+        <w:pBdr>
+          <w:bottom w:val="single" w:color="DDD0C0" w:sz="4" w:space="2"/>
+        </w:pBdr>
+        <w:spacing w:after="40" w:before="360"/>
+      </w:pPr>
+      <w:r>
+        <w:rPr>
+          <w:rFonts w:ascii="Consolas" w:cs="Consolas" w:eastAsia="Consolas" w:hAnsi="Consolas"/>
+          <w:b/>
+          <w:bCs/>
+          <w:color w:val="9A3412"/>
+          <w:sz w:val="24"/>
+          <w:szCs w:val="24"/>
+        </w:rPr>
+        <w:t xml:space="preserve">SORT  /  REVERSE</w:t>
+      </w:r>
+    </w:p>
+    <w:p>
+      <w:pPr>
+        <w:keepNext/>
+        <w:spacing w:after="120"/>
+      </w:pPr>
+      <w:r>
+        <w:rPr>
+          <w:b/>
+          <w:bCs/>
+          <w:color w:val="6A6A6A"/>
+          <w:sz w:val="18"/>
+          <w:szCs w:val="18"/>
+        </w:rPr>
+        <w:t xml:space="preserve">Syntax:  </w:t>
+      </w:r>
+      <w:r>
+        <w:rPr>
+          <w:rFonts w:ascii="Consolas" w:cs="Consolas" w:eastAsia="Consolas" w:hAnsi="Consolas"/>
+          <w:color w:val="335577"/>
+          <w:sz w:val="19"/>
+          <w:szCs w:val="19"/>
+        </w:rPr>
+        <w:t xml:space="preserve">SORT(arr)   REVERSE(arr)</w:t>
+      </w:r>
+    </w:p>
+    <w:p>
+      <w:pPr>
+        <w:spacing w:after="180" w:line="312" w:lineRule="auto"/>
+      </w:pPr>
+      <w:r>
+        <w:rPr>
+          <w:sz w:val="22"/>
+          <w:szCs w:val="22"/>
+        </w:rPr>
+        <w:t xml:space="preserve">SORT ordnet ein eindimensionales Array aufsteigend, REVERSE kehrt die Reihenfolge um. Beide wirken direkt auf das übergebene Array. (SORT kann auch absteigend sortieren oder mit einer eigenen Vergleichsfunktion arbeiten – dazu später.)</w:t>
+      </w:r>
+    </w:p>
+    <w:p>
+      <w:pPr>
+        <w:keepNext/>
+        <w:spacing w:after="30" w:before="120"/>
+      </w:pPr>
+      <w:r>
+        <w:rPr>
+          <w:b/>
+          <w:bCs/>
+          <w:i/>
+          <w:iCs/>
+          <w:color w:val="6A6A6A"/>
+          <w:sz w:val="18"/>
+          <w:szCs w:val="18"/>
+        </w:rPr>
+        <w:t xml:space="preserve">Beispiel</w:t>
+      </w:r>
+    </w:p>
+    <w:p>
+      <w:pPr>
+        <w:keepLines/>
+        <w:pBdr>
+          <w:left w:val="single" w:color="1B6CA8" w:sz="18" w:space="6"/>
+        </w:pBdr>
+        <w:shd w:fill="F4F4F4" w:val="clear"/>
+        <w:spacing w:after="200" w:before="100" w:line="264" w:lineRule="auto"/>
+        <w:ind w:left="140"/>
+      </w:pPr>
+      <w:r>
+        <w:rPr>
+          <w:rFonts w:ascii="Consolas" w:cs="Consolas" w:eastAsia="Consolas" w:hAnsi="Consolas"/>
+          <w:sz w:val="19"/>
+          <w:szCs w:val="19"/>
+        </w:rPr>
+        <w:t xml:space="preserve">DIM werte[4] AS INTEGER</w:t>
+      </w:r>
+      <w:r>
+        <w:rPr>
+          <w:rFonts w:ascii="Consolas" w:cs="Consolas" w:eastAsia="Consolas" w:hAnsi="Consolas"/>
+          <w:sz w:val="19"/>
+          <w:szCs w:val="19"/>
+        </w:rPr>
+        <w:br/>
+        <w:t xml:space="preserve">werte[0]=30 : werte[1]=10 : werte[2]=40 : werte[3]=20</w:t>
+      </w:r>
+      <w:r>
+        <w:rPr>
+          <w:rFonts w:ascii="Consolas" w:cs="Consolas" w:eastAsia="Consolas" w:hAnsi="Consolas"/>
+          <w:sz w:val="19"/>
+          <w:szCs w:val="19"/>
+        </w:rPr>
+        <w:br/>
+        <w:t xml:space="preserve"/>
+      </w:r>
+      <w:r>
+        <w:rPr>
+          <w:rFonts w:ascii="Consolas" w:cs="Consolas" w:eastAsia="Consolas" w:hAnsi="Consolas"/>
+          <w:sz w:val="19"/>
+          <w:szCs w:val="19"/>
+        </w:rPr>
+        <w:br/>
+        <w:t xml:space="preserve">SORT(werte)</w:t>
+      </w:r>
+      <w:r>
+        <w:rPr>
+          <w:rFonts w:ascii="Consolas" w:cs="Consolas" w:eastAsia="Consolas" w:hAnsi="Consolas"/>
+          <w:sz w:val="19"/>
+          <w:szCs w:val="19"/>
+        </w:rPr>
+        <w:br/>
+        <w:t xml:space="preserve">PRINT werte[0]; " "; werte[1]; " "; werte[2]; " "; werte[3]</w:t>
+      </w:r>
+    </w:p>
+    <w:p>
+      <w:pPr>
+        <w:keepNext/>
+        <w:spacing w:after="30" w:before="120"/>
+      </w:pPr>
+      <w:r>
+        <w:rPr>
+          <w:b/>
+          <w:bCs/>
+          <w:i/>
+          <w:iCs/>
+          <w:color w:val="6A6A6A"/>
+          <w:sz w:val="18"/>
+          <w:szCs w:val="18"/>
+        </w:rPr>
+        <w:t xml:space="preserve">Ausgabe</w:t>
+      </w:r>
+    </w:p>
+    <w:p>
+      <w:pPr>
+        <w:keepLines/>
+        <w:pBdr>
+          <w:left w:val="single" w:color="9AC79A" w:sz="18" w:space="6"/>
+        </w:pBdr>
+        <w:shd w:fill="EAF4EA" w:val="clear"/>
+        <w:spacing w:after="200" w:before="100" w:line="264" w:lineRule="auto"/>
+        <w:ind w:left="140"/>
+      </w:pPr>
+      <w:r>
+        <w:rPr>
+          <w:rFonts w:ascii="Consolas" w:cs="Consolas" w:eastAsia="Consolas" w:hAnsi="Consolas"/>
+          <w:sz w:val="19"/>
+          <w:szCs w:val="19"/>
+        </w:rPr>
+        <w:t xml:space="preserve">10 20 30 40</w:t>
+      </w:r>
+    </w:p>
+    <w:p>
+      <w:pPr>
+        <w:keepNext/>
+        <w:keepLines/>
+        <w:pBdr>
+          <w:bottom w:val="single" w:color="DDD0C0" w:sz="4" w:space="2"/>
+        </w:pBdr>
+        <w:spacing w:after="40" w:before="360"/>
+      </w:pPr>
+      <w:r>
+        <w:rPr>
+          <w:rFonts w:ascii="Consolas" w:cs="Consolas" w:eastAsia="Consolas" w:hAnsi="Consolas"/>
+          <w:b/>
+          <w:bCs/>
+          <w:color w:val="9A3412"/>
+          <w:sz w:val="24"/>
+          <w:szCs w:val="24"/>
+        </w:rPr>
+        <w:t xml:space="preserve">ARRAY_INDEXOF</w:t>
+      </w:r>
+    </w:p>
+    <w:p>
+      <w:pPr>
+        <w:keepNext/>
+        <w:spacing w:after="120"/>
+      </w:pPr>
+      <w:r>
+        <w:rPr>
+          <w:b/>
+          <w:bCs/>
+          <w:color w:val="6A6A6A"/>
+          <w:sz w:val="18"/>
+          <w:szCs w:val="18"/>
+        </w:rPr>
+        <w:t xml:space="preserve">Syntax:  </w:t>
+      </w:r>
+      <w:r>
+        <w:rPr>
+          <w:rFonts w:ascii="Consolas" w:cs="Consolas" w:eastAsia="Consolas" w:hAnsi="Consolas"/>
+          <w:color w:val="335577"/>
+          <w:sz w:val="19"/>
+          <w:szCs w:val="19"/>
+        </w:rPr>
+        <w:t xml:space="preserve">ARRAY_INDEXOF(arr, wert)</w:t>
+      </w:r>
+    </w:p>
+    <w:p>
+      <w:pPr>
+        <w:spacing w:after="180" w:line="312" w:lineRule="auto"/>
+      </w:pPr>
+      <w:r>
+        <w:rPr>
+          <w:sz w:val="22"/>
+          <w:szCs w:val="22"/>
+        </w:rPr>
+        <w:t xml:space="preserve">Sucht den ersten Index, an dem wert steht, und liefert ihn zurück – oder -1, wenn der Wert nicht vorkommt.</w:t>
+      </w:r>
+    </w:p>
+    <w:p>
+      <w:pPr>
+        <w:keepNext/>
+        <w:spacing w:after="30" w:before="120"/>
+      </w:pPr>
+      <w:r>
+        <w:rPr>
+          <w:b/>
+          <w:bCs/>
+          <w:i/>
+          <w:iCs/>
+          <w:color w:val="6A6A6A"/>
+          <w:sz w:val="18"/>
+          <w:szCs w:val="18"/>
+        </w:rPr>
+        <w:t xml:space="preserve">Beispiel</w:t>
+      </w:r>
+    </w:p>
+    <w:p>
+      <w:pPr>
+        <w:keepLines/>
+        <w:pBdr>
+          <w:left w:val="single" w:color="1B6CA8" w:sz="18" w:space="6"/>
+        </w:pBdr>
+        <w:shd w:fill="F4F4F4" w:val="clear"/>
+        <w:spacing w:after="200" w:before="100" w:line="264" w:lineRule="auto"/>
+        <w:ind w:left="140"/>
+      </w:pPr>
+      <w:r>
+        <w:rPr>
+          <w:rFonts w:ascii="Consolas" w:cs="Consolas" w:eastAsia="Consolas" w:hAnsi="Consolas"/>
+          <w:sz w:val="19"/>
+          <w:szCs w:val="19"/>
+        </w:rPr>
+        <w:t xml:space="preserve">DIM werte[3] AS INTEGER</w:t>
+      </w:r>
+      <w:r>
+        <w:rPr>
+          <w:rFonts w:ascii="Consolas" w:cs="Consolas" w:eastAsia="Consolas" w:hAnsi="Consolas"/>
+          <w:sz w:val="19"/>
+          <w:szCs w:val="19"/>
+        </w:rPr>
+        <w:br/>
+        <w:t xml:space="preserve">werte[0]=10 : werte[1]=20 : werte[2]=30</w:t>
+      </w:r>
+      <w:r>
+        <w:rPr>
+          <w:rFonts w:ascii="Consolas" w:cs="Consolas" w:eastAsia="Consolas" w:hAnsi="Consolas"/>
+          <w:sz w:val="19"/>
+          <w:szCs w:val="19"/>
+        </w:rPr>
+        <w:br/>
+        <w:t xml:space="preserve">PRINT ARRAY_INDEXOF(werte, 20)</w:t>
+      </w:r>
+      <w:r>
+        <w:rPr>
+          <w:rFonts w:ascii="Consolas" w:cs="Consolas" w:eastAsia="Consolas" w:hAnsi="Consolas"/>
+          <w:sz w:val="19"/>
+          <w:szCs w:val="19"/>
+        </w:rPr>
+        <w:br/>
+        <w:t xml:space="preserve">PRINT ARRAY_INDEXOF(werte, 99)</w:t>
+      </w:r>
+    </w:p>
+    <w:p>
+      <w:pPr>
+        <w:keepNext/>
+        <w:spacing w:after="30" w:before="120"/>
+      </w:pPr>
+      <w:r>
+        <w:rPr>
+          <w:b/>
+          <w:bCs/>
+          <w:i/>
+          <w:iCs/>
+          <w:color w:val="6A6A6A"/>
+          <w:sz w:val="18"/>
+          <w:szCs w:val="18"/>
+        </w:rPr>
+        <w:t xml:space="preserve">Ausgabe</w:t>
+      </w:r>
+    </w:p>
+    <w:p>
+      <w:pPr>
+        <w:keepLines/>
+        <w:pBdr>
+          <w:left w:val="single" w:color="9AC79A" w:sz="18" w:space="6"/>
+        </w:pBdr>
+        <w:shd w:fill="EAF4EA" w:val="clear"/>
+        <w:spacing w:after="200" w:before="100" w:line="264" w:lineRule="auto"/>
+        <w:ind w:left="140"/>
+      </w:pPr>
+      <w:r>
+        <w:rPr>
+          <w:rFonts w:ascii="Consolas" w:cs="Consolas" w:eastAsia="Consolas" w:hAnsi="Consolas"/>
+          <w:sz w:val="19"/>
+          <w:szCs w:val="19"/>
+        </w:rPr>
+        <w:t xml:space="preserve">1</w:t>
+      </w:r>
+      <w:r>
+        <w:rPr>
+          <w:rFonts w:ascii="Consolas" w:cs="Consolas" w:eastAsia="Consolas" w:hAnsi="Consolas"/>
+          <w:sz w:val="19"/>
+          <w:szCs w:val="19"/>
+        </w:rPr>
+        <w:br/>
+        <w:t xml:space="preserve">-1</w:t>
+      </w:r>
+    </w:p>
+    <w:p>
+      <w:pPr>
+        <w:pStyle w:val="Heading2"/>
+        <w:keepNext/>
+        <w:keepLines/>
+        <w:spacing w:after="120" w:before="280"/>
+      </w:pPr>
+      <w:r>
+        <w:t xml:space="preserve">Rechnen über das ganze Array: Aggregate</w:t>
+      </w:r>
+    </w:p>
+    <w:p>
+      <w:pPr>
+        <w:spacing w:after="180" w:line="312" w:lineRule="auto"/>
+      </w:pPr>
+      <w:r>
+        <w:rPr>
+          <w:sz w:val="22"/>
+          <w:szCs w:val="22"/>
+        </w:rPr>
+        <w:t xml:space="preserve">Für Arrays aus Zahlen gibt es Befehle, die das ganze Array auf einmal auswerten – Summe, Durchschnitt, kleinster und größter Wert. Sie ersparen dir die Schleife für diese Standardfragen.</w:t>
+      </w:r>
+    </w:p>
+    <w:p>
+      <w:pPr>
+        <w:keepNext/>
+        <w:keepLines/>
+        <w:pBdr>
+          <w:bottom w:val="single" w:color="DDD0C0" w:sz="4" w:space="2"/>
+        </w:pBdr>
+        <w:spacing w:after="40" w:before="360"/>
+      </w:pPr>
+      <w:r>
+        <w:rPr>
+          <w:rFonts w:ascii="Consolas" w:cs="Consolas" w:eastAsia="Consolas" w:hAnsi="Consolas"/>
+          <w:b/>
+          <w:bCs/>
+          <w:color w:val="9A3412"/>
+          <w:sz w:val="24"/>
+          <w:szCs w:val="24"/>
+        </w:rPr>
+        <w:t xml:space="preserve">ARRAY_SUM / AVG / MIN / MAX</w:t>
+      </w:r>
+    </w:p>
+    <w:p>
+      <w:pPr>
+        <w:keepNext/>
+        <w:spacing w:after="120"/>
+      </w:pPr>
+      <w:r>
+        <w:rPr>
+          <w:b/>
+          <w:bCs/>
+          <w:color w:val="6A6A6A"/>
+          <w:sz w:val="18"/>
+          <w:szCs w:val="18"/>
+        </w:rPr>
+        <w:t xml:space="preserve">Syntax:  </w:t>
+      </w:r>
+      <w:r>
+        <w:rPr>
+          <w:rFonts w:ascii="Consolas" w:cs="Consolas" w:eastAsia="Consolas" w:hAnsi="Consolas"/>
+          <w:color w:val="335577"/>
+          <w:sz w:val="19"/>
+          <w:szCs w:val="19"/>
+        </w:rPr>
+        <w:t xml:space="preserve">ARRAY_SUM(arr)   ARRAY_AVG(arr)   ARRAY_MIN(arr)   ARRAY_MAX(arr)</w:t>
+      </w:r>
+    </w:p>
+    <w:p>
+      <w:pPr>
+        <w:spacing w:after="180" w:line="312" w:lineRule="auto"/>
+      </w:pPr>
+      <w:r>
+        <w:rPr>
+          <w:sz w:val="22"/>
+          <w:szCs w:val="22"/>
+        </w:rPr>
+        <w:t xml:space="preserve">Liefern Summe, Durchschnitt, kleinstes und größtes Element eines Zahlen-Arrays. ARRAY_AVG ergibt immer eine Kommazahl; das Array darf für den Durchschnitt nicht leer sein.</w:t>
+      </w:r>
+    </w:p>
+    <w:p>
+      <w:pPr>
+        <w:keepNext/>
+        <w:spacing w:after="30" w:before="120"/>
+      </w:pPr>
+      <w:r>
+        <w:rPr>
+          <w:b/>
+          <w:bCs/>
+          <w:i/>
+          <w:iCs/>
+          <w:color w:val="6A6A6A"/>
+          <w:sz w:val="18"/>
+          <w:szCs w:val="18"/>
+        </w:rPr>
+        <w:t xml:space="preserve">Beispiel</w:t>
+      </w:r>
+    </w:p>
+    <w:p>
+      <w:pPr>
+        <w:keepLines/>
+        <w:pBdr>
+          <w:left w:val="single" w:color="1B6CA8" w:sz="18" w:space="6"/>
+        </w:pBdr>
+        <w:shd w:fill="F4F4F4" w:val="clear"/>
+        <w:spacing w:after="200" w:before="100" w:line="264" w:lineRule="auto"/>
+        <w:ind w:left="140"/>
+      </w:pPr>
+      <w:r>
+        <w:rPr>
+          <w:rFonts w:ascii="Consolas" w:cs="Consolas" w:eastAsia="Consolas" w:hAnsi="Consolas"/>
+          <w:sz w:val="19"/>
+          <w:szCs w:val="19"/>
+        </w:rPr>
+        <w:t xml:space="preserve">DIM werte[3] AS INTEGER</w:t>
+      </w:r>
+      <w:r>
+        <w:rPr>
+          <w:rFonts w:ascii="Consolas" w:cs="Consolas" w:eastAsia="Consolas" w:hAnsi="Consolas"/>
+          <w:sz w:val="19"/>
+          <w:szCs w:val="19"/>
+        </w:rPr>
+        <w:br/>
+        <w:t xml:space="preserve">werte[0]=5 : werte[1]=9 : werte[2]=1</w:t>
+      </w:r>
+      <w:r>
+        <w:rPr>
+          <w:rFonts w:ascii="Consolas" w:cs="Consolas" w:eastAsia="Consolas" w:hAnsi="Consolas"/>
+          <w:sz w:val="19"/>
+          <w:szCs w:val="19"/>
+        </w:rPr>
+        <w:br/>
+        <w:t xml:space="preserve">PRINT ARRAY_SUM(werte)</w:t>
+      </w:r>
+      <w:r>
+        <w:rPr>
+          <w:rFonts w:ascii="Consolas" w:cs="Consolas" w:eastAsia="Consolas" w:hAnsi="Consolas"/>
+          <w:sz w:val="19"/>
+          <w:szCs w:val="19"/>
+        </w:rPr>
+        <w:br/>
+        <w:t xml:space="preserve">PRINT ARRAY_AVG(werte)</w:t>
+      </w:r>
+      <w:r>
+        <w:rPr>
+          <w:rFonts w:ascii="Consolas" w:cs="Consolas" w:eastAsia="Consolas" w:hAnsi="Consolas"/>
+          <w:sz w:val="19"/>
+          <w:szCs w:val="19"/>
+        </w:rPr>
+        <w:br/>
+        <w:t xml:space="preserve">PRINT ARRAY_MIN(werte); " "; ARRAY_MAX(werte)</w:t>
+      </w:r>
+    </w:p>
+    <w:p>
+      <w:pPr>
+        <w:keepNext/>
+        <w:spacing w:after="30" w:before="120"/>
+      </w:pPr>
+      <w:r>
+        <w:rPr>
+          <w:b/>
+          <w:bCs/>
+          <w:i/>
+          <w:iCs/>
+          <w:color w:val="6A6A6A"/>
+          <w:sz w:val="18"/>
+          <w:szCs w:val="18"/>
+        </w:rPr>
+        <w:t xml:space="preserve">Ausgabe</w:t>
+      </w:r>
+    </w:p>
+    <w:p>
+      <w:pPr>
+        <w:keepLines/>
+        <w:pBdr>
+          <w:left w:val="single" w:color="9AC79A" w:sz="18" w:space="6"/>
+        </w:pBdr>
+        <w:shd w:fill="EAF4EA" w:val="clear"/>
+        <w:spacing w:after="200" w:before="100" w:line="264" w:lineRule="auto"/>
+        <w:ind w:left="140"/>
+      </w:pPr>
+      <w:r>
+        <w:rPr>
+          <w:rFonts w:ascii="Consolas" w:cs="Consolas" w:eastAsia="Consolas" w:hAnsi="Consolas"/>
+          <w:sz w:val="19"/>
+          <w:szCs w:val="19"/>
+        </w:rPr>
+        <w:t xml:space="preserve">15</w:t>
+      </w:r>
+      <w:r>
+        <w:rPr>
+          <w:rFonts w:ascii="Consolas" w:cs="Consolas" w:eastAsia="Consolas" w:hAnsi="Consolas"/>
+          <w:sz w:val="19"/>
+          <w:szCs w:val="19"/>
+        </w:rPr>
+        <w:br/>
+        <w:t xml:space="preserve">5.0</w:t>
+      </w:r>
+      <w:r>
+        <w:rPr>
+          <w:rFonts w:ascii="Consolas" w:cs="Consolas" w:eastAsia="Consolas" w:hAnsi="Consolas"/>
+          <w:sz w:val="19"/>
+          <w:szCs w:val="19"/>
+        </w:rPr>
+        <w:br/>
+        <w:t xml:space="preserve">1 9</w:t>
+      </w:r>
+    </w:p>
+    <w:p>
+      <w:pPr>
+        <w:keepNext/>
+        <w:keepLines/>
+        <w:pBdr>
+          <w:bottom w:val="single" w:color="DDD0C0" w:sz="4" w:space="2"/>
+        </w:pBdr>
+        <w:spacing w:after="40" w:before="360"/>
+      </w:pPr>
+      <w:r>
+        <w:rPr>
+          <w:rFonts w:ascii="Consolas" w:cs="Consolas" w:eastAsia="Consolas" w:hAnsi="Consolas"/>
+          <w:b/>
+          <w:bCs/>
+          <w:color w:val="9A3412"/>
+          <w:sz w:val="24"/>
+          <w:szCs w:val="24"/>
+        </w:rPr>
+        <w:t xml:space="preserve">ARRAY_FILL</w:t>
+      </w:r>
+    </w:p>
+    <w:p>
+      <w:pPr>
+        <w:keepNext/>
+        <w:spacing w:after="120"/>
+      </w:pPr>
+      <w:r>
+        <w:rPr>
+          <w:b/>
+          <w:bCs/>
+          <w:color w:val="6A6A6A"/>
+          <w:sz w:val="18"/>
+          <w:szCs w:val="18"/>
+        </w:rPr>
+        <w:t xml:space="preserve">Syntax:  </w:t>
+      </w:r>
+      <w:r>
+        <w:rPr>
+          <w:rFonts w:ascii="Consolas" w:cs="Consolas" w:eastAsia="Consolas" w:hAnsi="Consolas"/>
+          <w:color w:val="335577"/>
+          <w:sz w:val="19"/>
+          <w:szCs w:val="19"/>
+        </w:rPr>
+        <w:t xml:space="preserve">ARRAY_FILL(arr, wert)</w:t>
+      </w:r>
+    </w:p>
+    <w:p>
+      <w:pPr>
+        <w:spacing w:after="180" w:line="312" w:lineRule="auto"/>
+      </w:pPr>
+      <w:r>
+        <w:rPr>
+          <w:sz w:val="22"/>
+          <w:szCs w:val="22"/>
+        </w:rPr>
+        <w:t xml:space="preserve">Setzt alle Fächer auf denselben Wert – praktisch, um ein Array zurückzusetzen.</w:t>
+      </w:r>
+    </w:p>
+    <w:p>
+      <w:pPr>
+        <w:keepNext/>
+        <w:spacing w:after="30" w:before="120"/>
+      </w:pPr>
+      <w:r>
+        <w:rPr>
+          <w:b/>
+          <w:bCs/>
+          <w:i/>
+          <w:iCs/>
+          <w:color w:val="6A6A6A"/>
+          <w:sz w:val="18"/>
+          <w:szCs w:val="18"/>
+        </w:rPr>
+        <w:t xml:space="preserve">Beispiel</w:t>
+      </w:r>
+    </w:p>
+    <w:p>
+      <w:pPr>
+        <w:keepLines/>
+        <w:pBdr>
+          <w:left w:val="single" w:color="1B6CA8" w:sz="18" w:space="6"/>
+        </w:pBdr>
+        <w:shd w:fill="F4F4F4" w:val="clear"/>
+        <w:spacing w:after="200" w:before="100" w:line="264" w:lineRule="auto"/>
+        <w:ind w:left="140"/>
+      </w:pPr>
+      <w:r>
+        <w:rPr>
+          <w:rFonts w:ascii="Consolas" w:cs="Consolas" w:eastAsia="Consolas" w:hAnsi="Consolas"/>
+          <w:sz w:val="19"/>
+          <w:szCs w:val="19"/>
+        </w:rPr>
+        <w:t xml:space="preserve">DIM raster[4] AS INTEGER</w:t>
+      </w:r>
+      <w:r>
+        <w:rPr>
+          <w:rFonts w:ascii="Consolas" w:cs="Consolas" w:eastAsia="Consolas" w:hAnsi="Consolas"/>
+          <w:sz w:val="19"/>
+          <w:szCs w:val="19"/>
+        </w:rPr>
+        <w:br/>
+        <w:t xml:space="preserve">ARRAY_FILL(raster, 7)</w:t>
+      </w:r>
+      <w:r>
+        <w:rPr>
+          <w:rFonts w:ascii="Consolas" w:cs="Consolas" w:eastAsia="Consolas" w:hAnsi="Consolas"/>
+          <w:sz w:val="19"/>
+          <w:szCs w:val="19"/>
+        </w:rPr>
+        <w:br/>
+        <w:t xml:space="preserve">PRINT raster[0]; " "; raster[3]</w:t>
+      </w:r>
+    </w:p>
+    <w:p>
+      <w:pPr>
+        <w:keepNext/>
+        <w:spacing w:after="30" w:before="120"/>
+      </w:pPr>
+      <w:r>
+        <w:rPr>
+          <w:b/>
+          <w:bCs/>
+          <w:i/>
+          <w:iCs/>
+          <w:color w:val="6A6A6A"/>
+          <w:sz w:val="18"/>
+          <w:szCs w:val="18"/>
+        </w:rPr>
+        <w:t xml:space="preserve">Ausgabe</w:t>
+      </w:r>
+    </w:p>
+    <w:p>
+      <w:pPr>
+        <w:keepLines/>
+        <w:pBdr>
+          <w:left w:val="single" w:color="9AC79A" w:sz="18" w:space="6"/>
+        </w:pBdr>
+        <w:shd w:fill="EAF4EA" w:val="clear"/>
+        <w:spacing w:after="200" w:before="100" w:line="264" w:lineRule="auto"/>
+        <w:ind w:left="140"/>
+      </w:pPr>
+      <w:r>
+        <w:rPr>
+          <w:rFonts w:ascii="Consolas" w:cs="Consolas" w:eastAsia="Consolas" w:hAnsi="Consolas"/>
+          <w:sz w:val="19"/>
+          <w:szCs w:val="19"/>
+        </w:rPr>
+        <w:t xml:space="preserve">7 7</w:t>
+      </w:r>
+    </w:p>
+    <w:p>
+      <w:pPr>
+        <w:pStyle w:val="Heading2"/>
+        <w:keepNext/>
+        <w:keepLines/>
+        <w:spacing w:after="120" w:before="280"/>
+      </w:pPr>
+      <w:r>
+        <w:t xml:space="preserve">Arrays, die wachsen und schrumpfen</w:t>
+      </w:r>
+    </w:p>
+    <w:p>
+      <w:pPr>
+        <w:spacing w:after="180" w:line="312" w:lineRule="auto"/>
+      </w:pPr>
+      <w:r>
+        <w:rPr>
+          <w:sz w:val="22"/>
+          <w:szCs w:val="22"/>
+        </w:rPr>
+        <w:t xml:space="preserve">Bisher hatten unsere Arrays eine feste Größe. Oft weißt du aber vorher nicht, wie viele Werte zusammenkommen – etwa eine Liste der aktiven Geschosse, die ständig größer und kleiner wird. Dafür kannst du ein Array dynamisch verwenden: Du legst es leer an (mit 0 Fächern) und hängst Elemente nach Bedarf an.</w:t>
+      </w:r>
+    </w:p>
+    <w:p>
+      <w:pPr>
+        <w:spacing w:after="180" w:line="312" w:lineRule="auto"/>
+      </w:pPr>
+      <w:r>
+        <w:rPr>
+          <w:sz w:val="22"/>
+          <w:szCs w:val="22"/>
+        </w:rPr>
+        <w:t xml:space="preserve">Diese Befehle verändern das Array direkt. ARRAY_PUSH hängt hinten an, ARRAY_POP nimmt das letzte wieder weg – zusammen ergeben sie einen Stapel (engl. stack), wie ein Stapel Teller, von dem du oben auflegst und oben wegnimmst.</w:t>
+      </w:r>
+    </w:p>
+    <w:p>
+      <w:pPr>
+        <w:keepNext/>
+        <w:keepLines/>
+        <w:pBdr>
+          <w:bottom w:val="single" w:color="DDD0C0" w:sz="4" w:space="2"/>
+        </w:pBdr>
+        <w:spacing w:after="40" w:before="360"/>
+      </w:pPr>
+      <w:r>
+        <w:rPr>
+          <w:rFonts w:ascii="Consolas" w:cs="Consolas" w:eastAsia="Consolas" w:hAnsi="Consolas"/>
+          <w:b/>
+          <w:bCs/>
+          <w:color w:val="9A3412"/>
+          <w:sz w:val="24"/>
+          <w:szCs w:val="24"/>
+        </w:rPr>
+        <w:t xml:space="preserve">ARRAY_PUSH  /  ARRAY_POP</w:t>
+      </w:r>
+    </w:p>
+    <w:p>
+      <w:pPr>
+        <w:keepNext/>
+        <w:spacing w:after="120"/>
+      </w:pPr>
+      <w:r>
+        <w:rPr>
+          <w:b/>
+          <w:bCs/>
+          <w:color w:val="6A6A6A"/>
+          <w:sz w:val="18"/>
+          <w:szCs w:val="18"/>
+        </w:rPr>
+        <w:t xml:space="preserve">Syntax:  </w:t>
+      </w:r>
+      <w:r>
+        <w:rPr>
+          <w:rFonts w:ascii="Consolas" w:cs="Consolas" w:eastAsia="Consolas" w:hAnsi="Consolas"/>
+          <w:color w:val="335577"/>
+          <w:sz w:val="19"/>
+          <w:szCs w:val="19"/>
+        </w:rPr>
+        <w:t xml:space="preserve">ARRAY_PUSH(arr, wert)   ARRAY_POP(arr)</w:t>
+      </w:r>
+    </w:p>
+    <w:p>
+      <w:pPr>
+        <w:spacing w:after="180" w:line="312" w:lineRule="auto"/>
+      </w:pPr>
+      <w:r>
+        <w:rPr>
+          <w:sz w:val="22"/>
+          <w:szCs w:val="22"/>
+        </w:rPr>
+        <w:t xml:space="preserve">ARRAY_PUSH hängt einen Wert hinten an und liefert die neue Länge. ARRAY_POP entfernt das letzte Element und liefert es zurück (das Array darf dafür nicht leer sein).</w:t>
+      </w:r>
+    </w:p>
+    <w:p>
+      <w:pPr>
+        <w:keepNext/>
+        <w:spacing w:after="30" w:before="120"/>
+      </w:pPr>
+      <w:r>
+        <w:rPr>
+          <w:b/>
+          <w:bCs/>
+          <w:i/>
+          <w:iCs/>
+          <w:color w:val="6A6A6A"/>
+          <w:sz w:val="18"/>
+          <w:szCs w:val="18"/>
+        </w:rPr>
+        <w:t xml:space="preserve">Beispiel</w:t>
+      </w:r>
+    </w:p>
+    <w:p>
+      <w:pPr>
+        <w:keepLines/>
+        <w:pBdr>
+          <w:left w:val="single" w:color="1B6CA8" w:sz="18" w:space="6"/>
+        </w:pBdr>
+        <w:shd w:fill="F4F4F4" w:val="clear"/>
+        <w:spacing w:after="200" w:before="100" w:line="264" w:lineRule="auto"/>
+        <w:ind w:left="140"/>
+      </w:pPr>
+      <w:r>
+        <w:rPr>
+          <w:rFonts w:ascii="Consolas" w:cs="Consolas" w:eastAsia="Consolas" w:hAnsi="Consolas"/>
+          <w:sz w:val="19"/>
+          <w:szCs w:val="19"/>
+        </w:rPr>
+        <w:t xml:space="preserve">DIM stapel[0] AS INTEGER     ' leer starten</w:t>
+      </w:r>
+      <w:r>
+        <w:rPr>
+          <w:rFonts w:ascii="Consolas" w:cs="Consolas" w:eastAsia="Consolas" w:hAnsi="Consolas"/>
+          <w:sz w:val="19"/>
+          <w:szCs w:val="19"/>
+        </w:rPr>
+        <w:br/>
+        <w:t xml:space="preserve">ARRAY_PUSH(stapel, 10)</w:t>
+      </w:r>
+      <w:r>
+        <w:rPr>
+          <w:rFonts w:ascii="Consolas" w:cs="Consolas" w:eastAsia="Consolas" w:hAnsi="Consolas"/>
+          <w:sz w:val="19"/>
+          <w:szCs w:val="19"/>
+        </w:rPr>
+        <w:br/>
+        <w:t xml:space="preserve">ARRAY_PUSH(stapel, 20)</w:t>
+      </w:r>
+      <w:r>
+        <w:rPr>
+          <w:rFonts w:ascii="Consolas" w:cs="Consolas" w:eastAsia="Consolas" w:hAnsi="Consolas"/>
+          <w:sz w:val="19"/>
+          <w:szCs w:val="19"/>
+        </w:rPr>
+        <w:br/>
+        <w:t xml:space="preserve">ARRAY_PUSH(stapel, 30)</w:t>
+      </w:r>
+      <w:r>
+        <w:rPr>
+          <w:rFonts w:ascii="Consolas" w:cs="Consolas" w:eastAsia="Consolas" w:hAnsi="Consolas"/>
+          <w:sz w:val="19"/>
+          <w:szCs w:val="19"/>
+        </w:rPr>
+        <w:br/>
+        <w:t xml:space="preserve">PRINT "Länge: "; LEN(stapel)</w:t>
+      </w:r>
+      <w:r>
+        <w:rPr>
+          <w:rFonts w:ascii="Consolas" w:cs="Consolas" w:eastAsia="Consolas" w:hAnsi="Consolas"/>
+          <w:sz w:val="19"/>
+          <w:szCs w:val="19"/>
+        </w:rPr>
+        <w:br/>
+        <w:t xml:space="preserve">PRINT "oben weg: "; ARRAY_POP(stapel)</w:t>
+      </w:r>
+      <w:r>
+        <w:rPr>
+          <w:rFonts w:ascii="Consolas" w:cs="Consolas" w:eastAsia="Consolas" w:hAnsi="Consolas"/>
+          <w:sz w:val="19"/>
+          <w:szCs w:val="19"/>
+        </w:rPr>
+        <w:br/>
+        <w:t xml:space="preserve">PRINT "jetzt Länge: "; LEN(stapel)</w:t>
+      </w:r>
+    </w:p>
+    <w:p>
+      <w:pPr>
+        <w:keepNext/>
+        <w:spacing w:after="30" w:before="120"/>
+      </w:pPr>
+      <w:r>
+        <w:rPr>
+          <w:b/>
+          <w:bCs/>
+          <w:i/>
+          <w:iCs/>
+          <w:color w:val="6A6A6A"/>
+          <w:sz w:val="18"/>
+          <w:szCs w:val="18"/>
+        </w:rPr>
+        <w:t xml:space="preserve">Ausgabe</w:t>
+      </w:r>
+    </w:p>
+    <w:p>
+      <w:pPr>
+        <w:keepLines/>
+        <w:pBdr>
+          <w:left w:val="single" w:color="9AC79A" w:sz="18" w:space="6"/>
+        </w:pBdr>
+        <w:shd w:fill="EAF4EA" w:val="clear"/>
+        <w:spacing w:after="200" w:before="100" w:line="264" w:lineRule="auto"/>
+        <w:ind w:left="140"/>
+      </w:pPr>
+      <w:r>
+        <w:rPr>
+          <w:rFonts w:ascii="Consolas" w:cs="Consolas" w:eastAsia="Consolas" w:hAnsi="Consolas"/>
+          <w:sz w:val="19"/>
+          <w:szCs w:val="19"/>
+        </w:rPr>
+        <w:t xml:space="preserve">Länge: 3</w:t>
+      </w:r>
+      <w:r>
+        <w:rPr>
+          <w:rFonts w:ascii="Consolas" w:cs="Consolas" w:eastAsia="Consolas" w:hAnsi="Consolas"/>
+          <w:sz w:val="19"/>
+          <w:szCs w:val="19"/>
+        </w:rPr>
+        <w:br/>
+        <w:t xml:space="preserve">oben weg: 30</w:t>
+      </w:r>
+      <w:r>
+        <w:rPr>
+          <w:rFonts w:ascii="Consolas" w:cs="Consolas" w:eastAsia="Consolas" w:hAnsi="Consolas"/>
+          <w:sz w:val="19"/>
+          <w:szCs w:val="19"/>
+        </w:rPr>
+        <w:br/>
+        <w:t xml:space="preserve">jetzt Länge: 2</w:t>
+      </w:r>
+    </w:p>
+    <w:p>
+      <w:pPr>
+        <w:keepNext/>
+        <w:keepLines/>
+        <w:pBdr>
+          <w:bottom w:val="single" w:color="DDD0C0" w:sz="4" w:space="2"/>
+        </w:pBdr>
+        <w:spacing w:after="40" w:before="360"/>
+      </w:pPr>
+      <w:r>
+        <w:rPr>
+          <w:rFonts w:ascii="Consolas" w:cs="Consolas" w:eastAsia="Consolas" w:hAnsi="Consolas"/>
+          <w:b/>
+          <w:bCs/>
+          <w:color w:val="9A3412"/>
+          <w:sz w:val="24"/>
+          <w:szCs w:val="24"/>
+        </w:rPr>
+        <w:t xml:space="preserve">ARRAY_INSERT  /  ARRAY_REMOVE_AT</w:t>
+      </w:r>
+    </w:p>
+    <w:p>
+      <w:pPr>
+        <w:keepNext/>
+        <w:spacing w:after="120"/>
+      </w:pPr>
+      <w:r>
+        <w:rPr>
+          <w:b/>
+          <w:bCs/>
+          <w:color w:val="6A6A6A"/>
+          <w:sz w:val="18"/>
+          <w:szCs w:val="18"/>
+        </w:rPr>
+        <w:t xml:space="preserve">Syntax:  </w:t>
+      </w:r>
+      <w:r>
+        <w:rPr>
+          <w:rFonts w:ascii="Consolas" w:cs="Consolas" w:eastAsia="Consolas" w:hAnsi="Consolas"/>
+          <w:color w:val="335577"/>
+          <w:sz w:val="19"/>
+          <w:szCs w:val="19"/>
+        </w:rPr>
+        <w:t xml:space="preserve">ARRAY_INSERT(arr, idx, wert)   ARRAY_REMOVE_AT(arr, idx)</w:t>
+      </w:r>
+    </w:p>
+    <w:p>
+      <w:pPr>
+        <w:spacing w:after="180" w:line="312" w:lineRule="auto"/>
+      </w:pPr>
+      <w:r>
+        <w:rPr>
+          <w:sz w:val="22"/>
+          <w:szCs w:val="22"/>
+        </w:rPr>
+        <w:t xml:space="preserve">ARRAY_INSERT schiebt einen Wert an Position idx ein (alles dahinter rückt nach hinten); idx darf von 0 bis zur Länge gehen. ARRAY_REMOVE_AT entfernt das Element an idx und liefert es zurück (der Rest rückt nach vorne).</w:t>
+      </w:r>
+    </w:p>
+    <w:p>
+      <w:pPr>
+        <w:keepNext/>
+        <w:spacing w:after="30" w:before="120"/>
+      </w:pPr>
+      <w:r>
+        <w:rPr>
+          <w:b/>
+          <w:bCs/>
+          <w:i/>
+          <w:iCs/>
+          <w:color w:val="6A6A6A"/>
+          <w:sz w:val="18"/>
+          <w:szCs w:val="18"/>
+        </w:rPr>
+        <w:t xml:space="preserve">Beispiel</w:t>
+      </w:r>
+    </w:p>
+    <w:p>
+      <w:pPr>
+        <w:keepLines/>
+        <w:pBdr>
+          <w:left w:val="single" w:color="1B6CA8" w:sz="18" w:space="6"/>
+        </w:pBdr>
+        <w:shd w:fill="F4F4F4" w:val="clear"/>
+        <w:spacing w:after="200" w:before="100" w:line="264" w:lineRule="auto"/>
+        <w:ind w:left="140"/>
+      </w:pPr>
+      <w:r>
+        <w:rPr>
+          <w:rFonts w:ascii="Consolas" w:cs="Consolas" w:eastAsia="Consolas" w:hAnsi="Consolas"/>
+          <w:sz w:val="19"/>
+          <w:szCs w:val="19"/>
+        </w:rPr>
+        <w:t xml:space="preserve">DIM liste[0] AS INTEGER</w:t>
+      </w:r>
+      <w:r>
+        <w:rPr>
+          <w:rFonts w:ascii="Consolas" w:cs="Consolas" w:eastAsia="Consolas" w:hAnsi="Consolas"/>
+          <w:sz w:val="19"/>
+          <w:szCs w:val="19"/>
+        </w:rPr>
+        <w:br/>
+        <w:t xml:space="preserve">ARRAY_PUSH(liste, 10)</w:t>
+      </w:r>
+      <w:r>
+        <w:rPr>
+          <w:rFonts w:ascii="Consolas" w:cs="Consolas" w:eastAsia="Consolas" w:hAnsi="Consolas"/>
+          <w:sz w:val="19"/>
+          <w:szCs w:val="19"/>
+        </w:rPr>
+        <w:br/>
+        <w:t xml:space="preserve">ARRAY_PUSH(liste, 20)</w:t>
+      </w:r>
+      <w:r>
+        <w:rPr>
+          <w:rFonts w:ascii="Consolas" w:cs="Consolas" w:eastAsia="Consolas" w:hAnsi="Consolas"/>
+          <w:sz w:val="19"/>
+          <w:szCs w:val="19"/>
+        </w:rPr>
+        <w:br/>
+        <w:t xml:space="preserve">ARRAY_INSERT(liste, 1, 15)   ' 15 zwischen 10 und 20</w:t>
+      </w:r>
+      <w:r>
+        <w:rPr>
+          <w:rFonts w:ascii="Consolas" w:cs="Consolas" w:eastAsia="Consolas" w:hAnsi="Consolas"/>
+          <w:sz w:val="19"/>
+          <w:szCs w:val="19"/>
+        </w:rPr>
+        <w:br/>
+        <w:t xml:space="preserve">PRINT liste[0]; " "; liste[1]; " "; liste[2]</w:t>
+      </w:r>
+      <w:r>
+        <w:rPr>
+          <w:rFonts w:ascii="Consolas" w:cs="Consolas" w:eastAsia="Consolas" w:hAnsi="Consolas"/>
+          <w:sz w:val="19"/>
+          <w:szCs w:val="19"/>
+        </w:rPr>
+        <w:br/>
+        <w:t xml:space="preserve">ARRAY_REMOVE_AT(liste, 0)    ' die 10 entfernen</w:t>
+      </w:r>
+      <w:r>
+        <w:rPr>
+          <w:rFonts w:ascii="Consolas" w:cs="Consolas" w:eastAsia="Consolas" w:hAnsi="Consolas"/>
+          <w:sz w:val="19"/>
+          <w:szCs w:val="19"/>
+        </w:rPr>
+        <w:br/>
+        <w:t xml:space="preserve">PRINT liste[0]; " "; liste[1]</w:t>
+      </w:r>
+    </w:p>
+    <w:p>
+      <w:pPr>
+        <w:keepNext/>
+        <w:spacing w:after="30" w:before="120"/>
+      </w:pPr>
+      <w:r>
+        <w:rPr>
+          <w:b/>
+          <w:bCs/>
+          <w:i/>
+          <w:iCs/>
+          <w:color w:val="6A6A6A"/>
+          <w:sz w:val="18"/>
+          <w:szCs w:val="18"/>
+        </w:rPr>
+        <w:t xml:space="preserve">Ausgabe</w:t>
+      </w:r>
+    </w:p>
+    <w:p>
+      <w:pPr>
+        <w:keepLines/>
+        <w:pBdr>
+          <w:left w:val="single" w:color="9AC79A" w:sz="18" w:space="6"/>
+        </w:pBdr>
+        <w:shd w:fill="EAF4EA" w:val="clear"/>
+        <w:spacing w:after="200" w:before="100" w:line="264" w:lineRule="auto"/>
+        <w:ind w:left="140"/>
+      </w:pPr>
+      <w:r>
+        <w:rPr>
+          <w:rFonts w:ascii="Consolas" w:cs="Consolas" w:eastAsia="Consolas" w:hAnsi="Consolas"/>
+          <w:sz w:val="19"/>
+          <w:szCs w:val="19"/>
+        </w:rPr>
+        <w:t xml:space="preserve">10 15 20</w:t>
+      </w:r>
+      <w:r>
+        <w:rPr>
+          <w:rFonts w:ascii="Consolas" w:cs="Consolas" w:eastAsia="Consolas" w:hAnsi="Consolas"/>
+          <w:sz w:val="19"/>
+          <w:szCs w:val="19"/>
+        </w:rPr>
+        <w:br/>
+        <w:t xml:space="preserve">15 20</w:t>
+      </w:r>
+    </w:p>
+    <w:p>
+      <w:pPr>
+        <w:spacing w:before="60"/>
+      </w:pPr>
+    </w:p>
+    <w:tbl>
+      <w:tblPr>
+        <w:tblW w:type="dxa" w:w="9360"/>
+        <w:tblBorders>
+          <w:top w:val="single" w:color="auto" w:sz="4"/>
+          <w:left w:val="single" w:color="auto" w:sz="4"/>
+          <w:bottom w:val="single" w:color="auto" w:sz="4"/>
+          <w:right w:val="single" w:color="auto" w:sz="4"/>
+          <w:insideH w:val="single" w:color="auto" w:sz="4"/>
+          <w:insideV w:val="single" w:color="auto" w:sz="4"/>
+        </w:tblBorders>
+      </w:tblPr>
+      <w:tblGrid>
+        <w:gridCol w:w="9360"/>
+      </w:tblGrid>
+      <w:tr>
+        <w:trPr>
+          <w:cantSplit/>
+        </w:trPr>
+        <w:tc>
+          <w:tcPr>
+            <w:tcW w:type="dxa" w:w="9360"/>
+            <w:tcBorders>
+              <w:top w:val="single" w:color="E0B96A" w:sz="6"/>
+              <w:left w:val="single" w:color="E0B96A" w:sz="6"/>
+              <w:bottom w:val="single" w:color="E0B96A" w:sz="6"/>
+              <w:right w:val="single" w:color="E0B96A" w:sz="6"/>
+            </w:tcBorders>
+            <w:shd w:fill="FDF3E0" w:val="clear"/>
+            <w:tcMar>
+              <w:top w:type="dxa" w:w="140"/>
+              <w:left w:type="dxa" w:w="180"/>
+              <w:bottom w:type="dxa" w:w="140"/>
+              <w:right w:type="dxa" w:w="180"/>
+            </w:tcMar>
+          </w:tcPr>
+          <w:p>
+            <w:pPr>
+              <w:spacing w:after="40"/>
+            </w:pPr>
+            <w:r>
+              <w:rPr>
+                <w:b/>
+                <w:bCs/>
+                <w:color w:val="9A6A1E"/>
+                <w:sz w:val="22"/>
+                <w:szCs w:val="22"/>
+              </w:rPr>
+              <w:t xml:space="preserve">Merke</w:t>
+            </w:r>
+          </w:p>
+          <w:p>
+            <w:pPr>
+              <w:spacing w:after="0" w:line="312" w:lineRule="auto"/>
+            </w:pPr>
+            <w:r>
+              <w:rPr>
+                <w:sz w:val="22"/>
+                <w:szCs w:val="22"/>
+              </w:rPr>
+              <w:t xml:space="preserve">REDIM(arr, länge) ändert die Größe eines Arrays nachträglich: Es wächst (neue Fächer bekommen den Standardwert) oder schrumpft (überzählige Fächer fallen weg). Vorhandene Werte bleiben dabei erhalten.</w:t>
+            </w:r>
+          </w:p>
+        </w:tc>
+      </w:tr>
+    </w:tbl>
+    <w:p>
+      <w:pPr>
+        <w:spacing w:after="160"/>
+      </w:pPr>
+    </w:p>
+    <w:p>
+      <w:pPr>
+        <w:pStyle w:val="Heading2"/>
+        <w:keepNext/>
+        <w:keepLines/>
+        <w:spacing w:after="120" w:before="280"/>
+      </w:pPr>
+      <w:r>
+        <w:t xml:space="preserve">Ein Stück herausschneiden: Slicing</w:t>
+      </w:r>
+    </w:p>
+    <w:p>
+      <w:pPr>
+        <w:spacing w:after="180" w:line="312" w:lineRule="auto"/>
+      </w:pPr>
+      <w:r>
+        <w:rPr>
+          <w:sz w:val="22"/>
+          <w:szCs w:val="22"/>
+        </w:rPr>
+        <w:t xml:space="preserve">Wie bei Strings kannst du mit der Doppelpunkt-Schreibweise einen Ausschnitt eines Arrays kopieren. Die untere Grenze ist dabei, die obere nicht. Wichtig: Das Ergebnis ist eine eigenständige Kopie – Änderungen daran berühren das ursprüngliche Array nicht.</w:t>
+      </w:r>
+    </w:p>
+    <w:p>
+      <w:pPr>
+        <w:keepLines/>
+        <w:pBdr>
+          <w:left w:val="single" w:color="1B6CA8" w:sz="18" w:space="6"/>
+        </w:pBdr>
+        <w:shd w:fill="F4F4F4" w:val="clear"/>
+        <w:spacing w:after="200" w:before="100" w:line="264" w:lineRule="auto"/>
+        <w:ind w:left="140"/>
+      </w:pPr>
+      <w:r>
+        <w:rPr>
+          <w:rFonts w:ascii="Consolas" w:cs="Consolas" w:eastAsia="Consolas" w:hAnsi="Consolas"/>
+          <w:sz w:val="19"/>
+          <w:szCs w:val="19"/>
+        </w:rPr>
+        <w:t xml:space="preserve">DIM a[5] AS INTEGER</w:t>
+      </w:r>
+      <w:r>
+        <w:rPr>
+          <w:rFonts w:ascii="Consolas" w:cs="Consolas" w:eastAsia="Consolas" w:hAnsi="Consolas"/>
+          <w:sz w:val="19"/>
+          <w:szCs w:val="19"/>
+        </w:rPr>
+        <w:br/>
+        <w:t xml:space="preserve">a[0]=10 : a[1]=20 : a[2]=30 : a[3]=40 : a[4]=50</w:t>
+      </w:r>
+      <w:r>
+        <w:rPr>
+          <w:rFonts w:ascii="Consolas" w:cs="Consolas" w:eastAsia="Consolas" w:hAnsi="Consolas"/>
+          <w:sz w:val="19"/>
+          <w:szCs w:val="19"/>
+        </w:rPr>
+        <w:br/>
+        <w:t xml:space="preserve"/>
+      </w:r>
+      <w:r>
+        <w:rPr>
+          <w:rFonts w:ascii="Consolas" w:cs="Consolas" w:eastAsia="Consolas" w:hAnsi="Consolas"/>
+          <w:sz w:val="19"/>
+          <w:szCs w:val="19"/>
+        </w:rPr>
+        <w:br/>
+        <w:t xml:space="preserve">DIM teil AS ARRAY OF INTEGER</w:t>
+      </w:r>
+      <w:r>
+        <w:rPr>
+          <w:rFonts w:ascii="Consolas" w:cs="Consolas" w:eastAsia="Consolas" w:hAnsi="Consolas"/>
+          <w:sz w:val="19"/>
+          <w:szCs w:val="19"/>
+        </w:rPr>
+        <w:br/>
+        <w:t xml:space="preserve">teil = a[1:4]                ' Fächer 1, 2, 3</w:t>
+      </w:r>
+      <w:r>
+        <w:rPr>
+          <w:rFonts w:ascii="Consolas" w:cs="Consolas" w:eastAsia="Consolas" w:hAnsi="Consolas"/>
+          <w:sz w:val="19"/>
+          <w:szCs w:val="19"/>
+        </w:rPr>
+        <w:br/>
+        <w:t xml:space="preserve">PRINT teil[0]; " "; teil[1]; " "; teil[2]</w:t>
+      </w:r>
+    </w:p>
+    <w:p>
+      <w:pPr>
+        <w:keepLines/>
+        <w:pBdr>
+          <w:left w:val="single" w:color="9AC79A" w:sz="18" w:space="6"/>
+        </w:pBdr>
+        <w:shd w:fill="EAF4EA" w:val="clear"/>
+        <w:spacing w:after="200" w:before="100" w:line="264" w:lineRule="auto"/>
+        <w:ind w:left="140"/>
+      </w:pPr>
+      <w:r>
+        <w:rPr>
+          <w:rFonts w:ascii="Consolas" w:cs="Consolas" w:eastAsia="Consolas" w:hAnsi="Consolas"/>
+          <w:sz w:val="19"/>
+          <w:szCs w:val="19"/>
+        </w:rPr>
+        <w:t xml:space="preserve">20 30 40</w:t>
+      </w:r>
+    </w:p>
+    <w:p>
+      <w:pPr>
+        <w:pStyle w:val="Heading2"/>
+        <w:keepNext/>
+        <w:keepLines/>
+        <w:spacing w:after="120" w:before="280"/>
+      </w:pPr>
+      <w:r>
+        <w:t xml:space="preserve">Vorsicht: Zuweisen kopiert NICHT</w:t>
+      </w:r>
+    </w:p>
+    <w:p>
+      <w:pPr>
+        <w:spacing w:after="180" w:line="312" w:lineRule="auto"/>
+      </w:pPr>
+      <w:r>
+        <w:rPr>
+          <w:sz w:val="22"/>
+          <w:szCs w:val="22"/>
+        </w:rPr>
+        <w:t xml:space="preserve">Hier lauert ein klassischer Stolperstein, den du unbedingt verstehen solltest. Schreibst du b = a, entsteht KEINE Kopie des Arrays. Stattdessen zeigen danach beide Namen auf dasselbe Array – als hätte ein Schließfach zwei Namensschilder. Änderst du etwas über b, ändert sich auch a, denn es ist dasselbe Array.</w:t>
+      </w:r>
+    </w:p>
+    <w:p>
+      <w:pPr>
+        <w:keepLines/>
+        <w:pBdr>
+          <w:left w:val="single" w:color="1B6CA8" w:sz="18" w:space="6"/>
+        </w:pBdr>
+        <w:shd w:fill="F4F4F4" w:val="clear"/>
+        <w:spacing w:after="200" w:before="100" w:line="264" w:lineRule="auto"/>
+        <w:ind w:left="140"/>
+      </w:pPr>
+      <w:r>
+        <w:rPr>
+          <w:rFonts w:ascii="Consolas" w:cs="Consolas" w:eastAsia="Consolas" w:hAnsi="Consolas"/>
+          <w:sz w:val="19"/>
+          <w:szCs w:val="19"/>
+        </w:rPr>
+        <w:t xml:space="preserve">DIM a[2] AS INTEGER</w:t>
+      </w:r>
+      <w:r>
+        <w:rPr>
+          <w:rFonts w:ascii="Consolas" w:cs="Consolas" w:eastAsia="Consolas" w:hAnsi="Consolas"/>
+          <w:sz w:val="19"/>
+          <w:szCs w:val="19"/>
+        </w:rPr>
+        <w:br/>
+        <w:t xml:space="preserve">a[0] = 1 : a[1] = 2</w:t>
+      </w:r>
+      <w:r>
+        <w:rPr>
+          <w:rFonts w:ascii="Consolas" w:cs="Consolas" w:eastAsia="Consolas" w:hAnsi="Consolas"/>
+          <w:sz w:val="19"/>
+          <w:szCs w:val="19"/>
+        </w:rPr>
+        <w:br/>
+        <w:t xml:space="preserve"/>
+      </w:r>
+      <w:r>
+        <w:rPr>
+          <w:rFonts w:ascii="Consolas" w:cs="Consolas" w:eastAsia="Consolas" w:hAnsi="Consolas"/>
+          <w:sz w:val="19"/>
+          <w:szCs w:val="19"/>
+        </w:rPr>
+        <w:br/>
+        <w:t xml:space="preserve">DIM b AS ARRAY OF INTEGER</w:t>
+      </w:r>
+      <w:r>
+        <w:rPr>
+          <w:rFonts w:ascii="Consolas" w:cs="Consolas" w:eastAsia="Consolas" w:hAnsi="Consolas"/>
+          <w:sz w:val="19"/>
+          <w:szCs w:val="19"/>
+        </w:rPr>
+        <w:br/>
+        <w:t xml:space="preserve">b = a            ' KEINE Kopie – b und a sind dasselbe Array!</w:t>
+      </w:r>
+      <w:r>
+        <w:rPr>
+          <w:rFonts w:ascii="Consolas" w:cs="Consolas" w:eastAsia="Consolas" w:hAnsi="Consolas"/>
+          <w:sz w:val="19"/>
+          <w:szCs w:val="19"/>
+        </w:rPr>
+        <w:br/>
+        <w:t xml:space="preserve">b[0] = 99</w:t>
+      </w:r>
+      <w:r>
+        <w:rPr>
+          <w:rFonts w:ascii="Consolas" w:cs="Consolas" w:eastAsia="Consolas" w:hAnsi="Consolas"/>
+          <w:sz w:val="19"/>
+          <w:szCs w:val="19"/>
+        </w:rPr>
+        <w:br/>
+        <w:t xml:space="preserve">PRINT "a[0] = "; a[0]    ' auch a hat sich geändert</w:t>
+      </w:r>
+    </w:p>
+    <w:p>
+      <w:pPr>
+        <w:keepLines/>
+        <w:pBdr>
+          <w:left w:val="single" w:color="9AC79A" w:sz="18" w:space="6"/>
+        </w:pBdr>
+        <w:shd w:fill="EAF4EA" w:val="clear"/>
+        <w:spacing w:after="200" w:before="100" w:line="264" w:lineRule="auto"/>
+        <w:ind w:left="140"/>
+      </w:pPr>
+      <w:r>
+        <w:rPr>
+          <w:rFonts w:ascii="Consolas" w:cs="Consolas" w:eastAsia="Consolas" w:hAnsi="Consolas"/>
+          <w:sz w:val="19"/>
+          <w:szCs w:val="19"/>
+        </w:rPr>
+        <w:t xml:space="preserve">a[0] = 99</w:t>
+      </w:r>
+    </w:p>
+    <w:p>
+      <w:pPr>
+        <w:spacing w:after="180" w:line="312" w:lineRule="auto"/>
+      </w:pPr>
+      <w:r>
+        <w:rPr>
+          <w:sz w:val="22"/>
+          <w:szCs w:val="22"/>
+        </w:rPr>
+        <w:t xml:space="preserve">Willst du wirklich eine unabhängige Kopie – eine, die du verändern kannst, ohne das Original zu berühren – nimm ARRAY_COPY (oder ein Slice wie a[:], das ebenfalls kopiert):</w:t>
+      </w:r>
+    </w:p>
+    <w:p>
+      <w:pPr>
+        <w:keepNext/>
+        <w:keepLines/>
+        <w:pBdr>
+          <w:bottom w:val="single" w:color="DDD0C0" w:sz="4" w:space="2"/>
+        </w:pBdr>
+        <w:spacing w:after="40" w:before="360"/>
+      </w:pPr>
+      <w:r>
+        <w:rPr>
+          <w:rFonts w:ascii="Consolas" w:cs="Consolas" w:eastAsia="Consolas" w:hAnsi="Consolas"/>
+          <w:b/>
+          <w:bCs/>
+          <w:color w:val="9A3412"/>
+          <w:sz w:val="24"/>
+          <w:szCs w:val="24"/>
+        </w:rPr>
+        <w:t xml:space="preserve">ARRAY_COPY</w:t>
+      </w:r>
+    </w:p>
+    <w:p>
+      <w:pPr>
+        <w:keepNext/>
+        <w:spacing w:after="120"/>
+      </w:pPr>
+      <w:r>
+        <w:rPr>
+          <w:b/>
+          <w:bCs/>
+          <w:color w:val="6A6A6A"/>
+          <w:sz w:val="18"/>
+          <w:szCs w:val="18"/>
+        </w:rPr>
+        <w:t xml:space="preserve">Syntax:  </w:t>
+      </w:r>
+      <w:r>
+        <w:rPr>
+          <w:rFonts w:ascii="Consolas" w:cs="Consolas" w:eastAsia="Consolas" w:hAnsi="Consolas"/>
+          <w:color w:val="335577"/>
+          <w:sz w:val="19"/>
+          <w:szCs w:val="19"/>
+        </w:rPr>
+        <w:t xml:space="preserve">ARRAY_COPY(arr)</w:t>
+      </w:r>
+    </w:p>
+    <w:p>
+      <w:pPr>
+        <w:spacing w:after="180" w:line="312" w:lineRule="auto"/>
+      </w:pPr>
+      <w:r>
+        <w:rPr>
+          <w:sz w:val="22"/>
+          <w:szCs w:val="22"/>
+        </w:rPr>
+        <w:t xml:space="preserve">Liefert eine unabhängige Kopie des Arrays mit gleicher Form und gleichem Typ. Änderungen an der Kopie lassen das Original unangetastet.</w:t>
+      </w:r>
+    </w:p>
+    <w:p>
+      <w:pPr>
+        <w:keepNext/>
+        <w:spacing w:after="30" w:before="120"/>
+      </w:pPr>
+      <w:r>
+        <w:rPr>
+          <w:b/>
+          <w:bCs/>
+          <w:i/>
+          <w:iCs/>
+          <w:color w:val="6A6A6A"/>
+          <w:sz w:val="18"/>
+          <w:szCs w:val="18"/>
+        </w:rPr>
+        <w:t xml:space="preserve">Beispiel</w:t>
+      </w:r>
+    </w:p>
+    <w:p>
+      <w:pPr>
+        <w:keepLines/>
+        <w:pBdr>
+          <w:left w:val="single" w:color="1B6CA8" w:sz="18" w:space="6"/>
+        </w:pBdr>
+        <w:shd w:fill="F4F4F4" w:val="clear"/>
+        <w:spacing w:after="200" w:before="100" w:line="264" w:lineRule="auto"/>
+        <w:ind w:left="140"/>
+      </w:pPr>
+      <w:r>
+        <w:rPr>
+          <w:rFonts w:ascii="Consolas" w:cs="Consolas" w:eastAsia="Consolas" w:hAnsi="Consolas"/>
+          <w:sz w:val="19"/>
+          <w:szCs w:val="19"/>
+        </w:rPr>
+        <w:t xml:space="preserve">DIM a[2] AS INTEGER</w:t>
+      </w:r>
+      <w:r>
+        <w:rPr>
+          <w:rFonts w:ascii="Consolas" w:cs="Consolas" w:eastAsia="Consolas" w:hAnsi="Consolas"/>
+          <w:sz w:val="19"/>
+          <w:szCs w:val="19"/>
+        </w:rPr>
+        <w:br/>
+        <w:t xml:space="preserve">a[0] = 1 : a[1] = 2</w:t>
+      </w:r>
+      <w:r>
+        <w:rPr>
+          <w:rFonts w:ascii="Consolas" w:cs="Consolas" w:eastAsia="Consolas" w:hAnsi="Consolas"/>
+          <w:sz w:val="19"/>
+          <w:szCs w:val="19"/>
+        </w:rPr>
+        <w:br/>
+        <w:t xml:space="preserve"/>
+      </w:r>
+      <w:r>
+        <w:rPr>
+          <w:rFonts w:ascii="Consolas" w:cs="Consolas" w:eastAsia="Consolas" w:hAnsi="Consolas"/>
+          <w:sz w:val="19"/>
+          <w:szCs w:val="19"/>
+        </w:rPr>
+        <w:br/>
+        <w:t xml:space="preserve">DIM b AS ARRAY OF INTEGER</w:t>
+      </w:r>
+      <w:r>
+        <w:rPr>
+          <w:rFonts w:ascii="Consolas" w:cs="Consolas" w:eastAsia="Consolas" w:hAnsi="Consolas"/>
+          <w:sz w:val="19"/>
+          <w:szCs w:val="19"/>
+        </w:rPr>
+        <w:br/>
+        <w:t xml:space="preserve">b = ARRAY_COPY(a)     ' echte Kopie</w:t>
+      </w:r>
+      <w:r>
+        <w:rPr>
+          <w:rFonts w:ascii="Consolas" w:cs="Consolas" w:eastAsia="Consolas" w:hAnsi="Consolas"/>
+          <w:sz w:val="19"/>
+          <w:szCs w:val="19"/>
+        </w:rPr>
+        <w:br/>
+        <w:t xml:space="preserve">b[0] = 99</w:t>
+      </w:r>
+      <w:r>
+        <w:rPr>
+          <w:rFonts w:ascii="Consolas" w:cs="Consolas" w:eastAsia="Consolas" w:hAnsi="Consolas"/>
+          <w:sz w:val="19"/>
+          <w:szCs w:val="19"/>
+        </w:rPr>
+        <w:br/>
+        <w:t xml:space="preserve">PRINT "a[0] = "; a[0]; "   b[0] = "; b[0]</w:t>
+      </w:r>
+    </w:p>
+    <w:p>
+      <w:pPr>
+        <w:keepNext/>
+        <w:spacing w:after="30" w:before="120"/>
+      </w:pPr>
+      <w:r>
+        <w:rPr>
+          <w:b/>
+          <w:bCs/>
+          <w:i/>
+          <w:iCs/>
+          <w:color w:val="6A6A6A"/>
+          <w:sz w:val="18"/>
+          <w:szCs w:val="18"/>
+        </w:rPr>
+        <w:t xml:space="preserve">Ausgabe</w:t>
+      </w:r>
+    </w:p>
+    <w:p>
+      <w:pPr>
+        <w:keepLines/>
+        <w:pBdr>
+          <w:left w:val="single" w:color="9AC79A" w:sz="18" w:space="6"/>
+        </w:pBdr>
+        <w:shd w:fill="EAF4EA" w:val="clear"/>
+        <w:spacing w:after="200" w:before="100" w:line="264" w:lineRule="auto"/>
+        <w:ind w:left="140"/>
+      </w:pPr>
+      <w:r>
+        <w:rPr>
+          <w:rFonts w:ascii="Consolas" w:cs="Consolas" w:eastAsia="Consolas" w:hAnsi="Consolas"/>
+          <w:sz w:val="19"/>
+          <w:szCs w:val="19"/>
+        </w:rPr>
+        <w:t xml:space="preserve">a[0] = 1   b[0] = 99</w:t>
+      </w:r>
+    </w:p>
+    <w:p>
+      <w:pPr>
+        <w:pStyle w:val="Heading2"/>
+        <w:keepNext/>
+        <w:keepLines/>
+        <w:spacing w:after="120" w:before="280"/>
+      </w:pPr>
+      <w:r>
+        <w:t xml:space="preserve">Mehrere Dimensionen</w:t>
+      </w:r>
+    </w:p>
+    <w:p>
+      <w:pPr>
+        <w:spacing w:after="180" w:line="312" w:lineRule="auto"/>
+      </w:pPr>
+      <w:r>
+        <w:rPr>
+          <w:sz w:val="22"/>
+          <w:szCs w:val="22"/>
+        </w:rPr>
+        <w:t xml:space="preserve">Ein Array kann auch ein Raster sein – etwa ein Schachbrett oder eine Spielkarte. Dafür gibst du mehrere Größen an, durch Komma getrennt. Ein Element sprichst du dann mit ebenso vielen Indizes an. Du kannst es dir als Tabelle mit Zeilen und Spalten vorstellen.</w:t>
+      </w:r>
+    </w:p>
+    <w:p>
+      <w:pPr>
+        <w:keepNext/>
+        <w:keepLines/>
+        <w:pBdr>
+          <w:bottom w:val="single" w:color="DDD0C0" w:sz="4" w:space="2"/>
+        </w:pBdr>
+        <w:spacing w:after="40" w:before="360"/>
+      </w:pPr>
+      <w:r>
+        <w:rPr>
+          <w:rFonts w:ascii="Consolas" w:cs="Consolas" w:eastAsia="Consolas" w:hAnsi="Consolas"/>
+          <w:b/>
+          <w:bCs/>
+          <w:color w:val="9A3412"/>
+          <w:sz w:val="24"/>
+          <w:szCs w:val="24"/>
+        </w:rPr>
+        <w:t xml:space="preserve">Mehrdimensionales Array</w:t>
+      </w:r>
+    </w:p>
+    <w:p>
+      <w:pPr>
+        <w:keepNext/>
+        <w:spacing w:after="120"/>
+      </w:pPr>
+      <w:r>
+        <w:rPr>
+          <w:b/>
+          <w:bCs/>
+          <w:color w:val="6A6A6A"/>
+          <w:sz w:val="18"/>
+          <w:szCs w:val="18"/>
+        </w:rPr>
+        <w:t xml:space="preserve">Syntax:  </w:t>
+      </w:r>
+      <w:r>
+        <w:rPr>
+          <w:rFonts w:ascii="Consolas" w:cs="Consolas" w:eastAsia="Consolas" w:hAnsi="Consolas"/>
+          <w:color w:val="335577"/>
+          <w:sz w:val="19"/>
+          <w:szCs w:val="19"/>
+        </w:rPr>
+        <w:t xml:space="preserve">DIM name[zeilen, spalten] AS Typ</w:t>
+      </w:r>
+    </w:p>
+    <w:p>
+      <w:pPr>
+        <w:spacing w:after="180" w:line="312" w:lineRule="auto"/>
+      </w:pPr>
+      <w:r>
+        <w:rPr>
+          <w:sz w:val="22"/>
+          <w:szCs w:val="22"/>
+        </w:rPr>
+        <w:t xml:space="preserve">Legt ein Raster an. Jedes Element wird mit so vielen Indizes angesprochen, wie es Dimensionen gibt. DIMCOUNT liefert die Anzahl der Dimensionen, DIMSIZE(arr, n) die Größe der n-ten.</w:t>
+      </w:r>
+    </w:p>
+    <w:p>
+      <w:pPr>
+        <w:keepNext/>
+        <w:spacing w:after="30" w:before="120"/>
+      </w:pPr>
+      <w:r>
+        <w:rPr>
+          <w:b/>
+          <w:bCs/>
+          <w:i/>
+          <w:iCs/>
+          <w:color w:val="6A6A6A"/>
+          <w:sz w:val="18"/>
+          <w:szCs w:val="18"/>
+        </w:rPr>
+        <w:t xml:space="preserve">Beispiel</w:t>
+      </w:r>
+    </w:p>
+    <w:p>
+      <w:pPr>
+        <w:keepLines/>
+        <w:pBdr>
+          <w:left w:val="single" w:color="1B6CA8" w:sz="18" w:space="6"/>
+        </w:pBdr>
+        <w:shd w:fill="F4F4F4" w:val="clear"/>
+        <w:spacing w:after="200" w:before="100" w:line="264" w:lineRule="auto"/>
+        <w:ind w:left="140"/>
+      </w:pPr>
+      <w:r>
+        <w:rPr>
+          <w:rFonts w:ascii="Consolas" w:cs="Consolas" w:eastAsia="Consolas" w:hAnsi="Consolas"/>
+          <w:sz w:val="19"/>
+          <w:szCs w:val="19"/>
+        </w:rPr>
+        <w:t xml:space="preserve">DIM brett[3, 3] AS INTEGER</w:t>
+      </w:r>
+      <w:r>
+        <w:rPr>
+          <w:rFonts w:ascii="Consolas" w:cs="Consolas" w:eastAsia="Consolas" w:hAnsi="Consolas"/>
+          <w:sz w:val="19"/>
+          <w:szCs w:val="19"/>
+        </w:rPr>
+        <w:br/>
+        <w:t xml:space="preserve">brett[1, 2] = 7</w:t>
+      </w:r>
+      <w:r>
+        <w:rPr>
+          <w:rFonts w:ascii="Consolas" w:cs="Consolas" w:eastAsia="Consolas" w:hAnsi="Consolas"/>
+          <w:sz w:val="19"/>
+          <w:szCs w:val="19"/>
+        </w:rPr>
+        <w:br/>
+        <w:t xml:space="preserve">PRINT brett[1, 2]</w:t>
+      </w:r>
+      <w:r>
+        <w:rPr>
+          <w:rFonts w:ascii="Consolas" w:cs="Consolas" w:eastAsia="Consolas" w:hAnsi="Consolas"/>
+          <w:sz w:val="19"/>
+          <w:szCs w:val="19"/>
+        </w:rPr>
+        <w:br/>
+        <w:t xml:space="preserve">PRINT DIMCOUNT(brett)</w:t>
+      </w:r>
+      <w:r>
+        <w:rPr>
+          <w:rFonts w:ascii="Consolas" w:cs="Consolas" w:eastAsia="Consolas" w:hAnsi="Consolas"/>
+          <w:sz w:val="19"/>
+          <w:szCs w:val="19"/>
+        </w:rPr>
+        <w:br/>
+        <w:t xml:space="preserve">PRINT DIMSIZE(brett, 0); " x "; DIMSIZE(brett, 1)</w:t>
+      </w:r>
+    </w:p>
+    <w:p>
+      <w:pPr>
+        <w:keepNext/>
+        <w:spacing w:after="30" w:before="120"/>
+      </w:pPr>
+      <w:r>
+        <w:rPr>
+          <w:b/>
+          <w:bCs/>
+          <w:i/>
+          <w:iCs/>
+          <w:color w:val="6A6A6A"/>
+          <w:sz w:val="18"/>
+          <w:szCs w:val="18"/>
+        </w:rPr>
+        <w:t xml:space="preserve">Ausgabe</w:t>
+      </w:r>
+    </w:p>
+    <w:p>
+      <w:pPr>
+        <w:keepLines/>
+        <w:pBdr>
+          <w:left w:val="single" w:color="9AC79A" w:sz="18" w:space="6"/>
+        </w:pBdr>
+        <w:shd w:fill="EAF4EA" w:val="clear"/>
+        <w:spacing w:after="200" w:before="100" w:line="264" w:lineRule="auto"/>
+        <w:ind w:left="140"/>
+      </w:pPr>
+      <w:r>
+        <w:rPr>
+          <w:rFonts w:ascii="Consolas" w:cs="Consolas" w:eastAsia="Consolas" w:hAnsi="Consolas"/>
+          <w:sz w:val="19"/>
+          <w:szCs w:val="19"/>
+        </w:rPr>
+        <w:t xml:space="preserve">7</w:t>
+      </w:r>
+      <w:r>
+        <w:rPr>
+          <w:rFonts w:ascii="Consolas" w:cs="Consolas" w:eastAsia="Consolas" w:hAnsi="Consolas"/>
+          <w:sz w:val="19"/>
+          <w:szCs w:val="19"/>
+        </w:rPr>
+        <w:br/>
+        <w:t xml:space="preserve">2</w:t>
+      </w:r>
+      <w:r>
+        <w:rPr>
+          <w:rFonts w:ascii="Consolas" w:cs="Consolas" w:eastAsia="Consolas" w:hAnsi="Consolas"/>
+          <w:sz w:val="19"/>
+          <w:szCs w:val="19"/>
+        </w:rPr>
+        <w:br/>
+        <w:t xml:space="preserve">3 x 3</w:t>
+      </w:r>
+    </w:p>
+    <w:p>
+      <w:pPr>
+        <w:spacing w:after="180" w:line="312" w:lineRule="auto"/>
+      </w:pPr>
+      <w:r>
+        <w:rPr>
+          <w:sz w:val="22"/>
+          <w:szCs w:val="22"/>
+        </w:rPr>
+        <w:t xml:space="preserve">Über ein zweidimensionales Array läufst du mit zwei verschachtelten Schleifen – die äußere über die Zeilen, die innere über die Spalten. Genau dieses Muster brauchst du später, um eine Kachelkarte oder ein Spielfeld zu zeichnen.</w:t>
+      </w:r>
+    </w:p>
+    <w:p>
+      <w:pPr>
+        <w:spacing w:before="60"/>
+      </w:pPr>
+    </w:p>
+    <w:tbl>
+      <w:tblPr>
+        <w:tblW w:type="dxa" w:w="9360"/>
+        <w:tblBorders>
+          <w:top w:val="single" w:color="auto" w:sz="4"/>
+          <w:left w:val="single" w:color="auto" w:sz="4"/>
+          <w:bottom w:val="single" w:color="auto" w:sz="4"/>
+          <w:right w:val="single" w:color="auto" w:sz="4"/>
+          <w:insideH w:val="single" w:color="auto" w:sz="4"/>
+          <w:insideV w:val="single" w:color="auto" w:sz="4"/>
+        </w:tblBorders>
+      </w:tblPr>
+      <w:tblGrid>
+        <w:gridCol w:w="9360"/>
+      </w:tblGrid>
+      <w:tr>
+        <w:trPr>
+          <w:cantSplit/>
+        </w:trPr>
+        <w:tc>
+          <w:tcPr>
+            <w:tcW w:type="dxa" w:w="9360"/>
+            <w:tcBorders>
+              <w:top w:val="single" w:color="9CC8E6" w:sz="6"/>
+              <w:left w:val="single" w:color="9CC8E6" w:sz="6"/>
+              <w:bottom w:val="single" w:color="9CC8E6" w:sz="6"/>
+              <w:right w:val="single" w:color="9CC8E6" w:sz="6"/>
+            </w:tcBorders>
+            <w:shd w:fill="E7F2FA" w:val="clear"/>
+            <w:tcMar>
+              <w:top w:type="dxa" w:w="140"/>
+              <w:left w:type="dxa" w:w="180"/>
+              <w:bottom w:type="dxa" w:w="140"/>
+              <w:right w:type="dxa" w:w="180"/>
+            </w:tcMar>
+          </w:tcPr>
+          <w:p>
+            <w:pPr>
+              <w:spacing w:after="40"/>
+            </w:pPr>
+            <w:r>
+              <w:rPr>
+                <w:b/>
+                <w:bCs/>
+                <w:color w:val="1B6CA8"/>
+                <w:sz w:val="22"/>
+                <w:szCs w:val="22"/>
+              </w:rPr>
+              <w:t xml:space="preserve">Arrays oder Map?</w:t>
+            </w:r>
+          </w:p>
+          <w:p>
+            <w:pPr>
+              <w:spacing w:after="0" w:line="312" w:lineRule="auto"/>
+            </w:pPr>
+            <w:r>
+              <w:rPr>
+                <w:sz w:val="22"/>
+                <w:szCs w:val="22"/>
+              </w:rPr>
+              <w:t xml:space="preserve">Ein Array nummeriert seine Werte mit ganzen Zahlen ab 0 – ideal, wenn die Reihenfolge zählt oder du der Reihe nach durchläufst. Brauchst du stattdessen benannte Schlüssel ("spieler1" → 42), ist eine Map die bessere Wahl. Die lernst du im nächsten Kapitel kennen.</w:t>
             </w:r>
           </w:p>
         </w:tc>

</xml_diff>

<commit_message>
docs(buch): Lehrbuch Kap 18 -- Maps
MAPPUT/MAPGET (wirft bei fehlendem Key), MAPGETOR/MAPHAS/IN als sichere Wege,
MAPSIZE/MAPREMOVE/MAPCLEAR, FOR EACH ueber Keys, MAPKEYS/MAPVALUES/MAPITEMS,
Methoden-Syntax, STR$-Keys + Cache-Muster, Alias-Hinweis (Verweis-Wert wie
Array). Woerterbuch-Mentalmodell, schwierige Stellen ausfuehrlich.
Alle Beispiel-Ausgaben gegen gbrt verifiziert.

Co-Authored-By: Claude Opus 4.8 (1M context) <noreply@anthropic.com>
</commit_message>
<xml_diff>
--- a/buch-referenz/buch/GameBasic-Lehrbuch.docx
+++ b/buch-referenz/buch/GameBasic-Lehrbuch.docx
@@ -462,6 +462,33 @@
           <w:szCs w:val="22"/>
         </w:rPr>
         <w:t xml:space="preserve">	31</w:t>
+      </w:r>
+    </w:p>
+    <w:p>
+      <w:pPr>
+        <w:tabs>
+          <w:tab w:val="right" w:pos="9200" w:leader="dot"/>
+        </w:tabs>
+        <w:spacing w:after="20" w:before="0"/>
+        <w:ind w:left="280"/>
+      </w:pPr>
+      <w:r>
+        <w:rPr>
+          <w:b w:val="false"/>
+          <w:bCs w:val="false"/>
+          <w:color w:val="222222"/>
+          <w:sz w:val="22"/>
+          <w:szCs w:val="22"/>
+        </w:rPr>
+        <w:t xml:space="preserve">Maps</w:t>
+      </w:r>
+      <w:r>
+        <w:rPr>
+          <w:color w:val="555555"/>
+          <w:sz w:val="22"/>
+          <w:szCs w:val="22"/>
+        </w:rPr>
+        <w:t xml:space="preserve">	7</w:t>
       </w:r>
     </w:p>
     <w:p>
@@ -16282,6 +16309,1894 @@
                 <w:szCs w:val="22"/>
               </w:rPr>
               <w:t xml:space="preserve">Ein Array nummeriert seine Werte mit ganzen Zahlen ab 0 – ideal, wenn die Reihenfolge zählt oder du der Reihe nach durchläufst. Brauchst du stattdessen benannte Schlüssel ("spieler1" → 42), ist eine Map die bessere Wahl. Die lernst du im nächsten Kapitel kennen.</w:t>
+            </w:r>
+          </w:p>
+        </w:tc>
+      </w:tr>
+    </w:tbl>
+    <w:p>
+      <w:pPr>
+        <w:spacing w:after="160"/>
+      </w:pPr>
+    </w:p>
+    <w:p>
+      <w:pPr>
+        <w:pStyle w:val="Heading1"/>
+        <w:keepNext/>
+        <w:keepLines/>
+        <w:pageBreakBefore/>
+        <w:pBdr>
+          <w:bottom w:val="single" w:color="1B6CA8" w:sz="12" w:space="4"/>
+        </w:pBdr>
+        <w:spacing w:after="160" w:before="0"/>
+      </w:pPr>
+      <w:r>
+        <w:t xml:space="preserve">Maps</w:t>
+      </w:r>
+    </w:p>
+    <w:p>
+      <w:pPr>
+        <w:spacing w:after="180" w:line="312" w:lineRule="auto"/>
+      </w:pPr>
+      <w:r>
+        <w:rPr>
+          <w:sz w:val="22"/>
+          <w:szCs w:val="22"/>
+        </w:rPr>
+        <w:t xml:space="preserve">Ein Array nummeriert seine Werte mit ganzen Zahlen: 0, 1, 2, … Das ist perfekt, solange die Position der natürliche Zugang ist. Aber manchmal willst du Werte nicht über eine Nummer ansprechen, sondern über einen Namen: die Punktzahl von „Anna“, den Bestand an „Holz“, die Einstellung „lautstärke“. Genau dafür gibt es die Map.</w:t>
+      </w:r>
+    </w:p>
+    <w:p>
+      <w:pPr>
+        <w:spacing w:after="180" w:line="312" w:lineRule="auto"/>
+      </w:pPr>
+      <w:r>
+        <w:rPr>
+          <w:sz w:val="22"/>
+          <w:szCs w:val="22"/>
+        </w:rPr>
+        <w:t xml:space="preserve">Eine Map ist eine Sammlung von Paaren aus Schlüssel und Wert. Stell sie dir wie ein Wörterbuch vor: Du schlägst ein Stichwort nach (den Schlüssel) und bekommst die zugehörige Erklärung (den Wert). Oder wie ein Telefonbuch – Name nachschlagen, Nummer erhalten. Der Schlüssel ersetzt die Index-Nummer des Arrays durch etwas Sprechendes.</w:t>
+      </w:r>
+    </w:p>
+    <w:p>
+      <w:pPr>
+        <w:spacing w:before="60"/>
+      </w:pPr>
+    </w:p>
+    <w:tbl>
+      <w:tblPr>
+        <w:tblW w:type="dxa" w:w="9360"/>
+        <w:tblBorders>
+          <w:top w:val="single" w:color="auto" w:sz="4"/>
+          <w:left w:val="single" w:color="auto" w:sz="4"/>
+          <w:bottom w:val="single" w:color="auto" w:sz="4"/>
+          <w:right w:val="single" w:color="auto" w:sz="4"/>
+          <w:insideH w:val="single" w:color="auto" w:sz="4"/>
+          <w:insideV w:val="single" w:color="auto" w:sz="4"/>
+        </w:tblBorders>
+      </w:tblPr>
+      <w:tblGrid>
+        <w:gridCol w:w="9360"/>
+      </w:tblGrid>
+      <w:tr>
+        <w:trPr>
+          <w:cantSplit/>
+        </w:trPr>
+        <w:tc>
+          <w:tcPr>
+            <w:tcW w:type="dxa" w:w="9360"/>
+            <w:tcBorders>
+              <w:top w:val="single" w:color="E0B96A" w:sz="6"/>
+              <w:left w:val="single" w:color="E0B96A" w:sz="6"/>
+              <w:bottom w:val="single" w:color="E0B96A" w:sz="6"/>
+              <w:right w:val="single" w:color="E0B96A" w:sz="6"/>
+            </w:tcBorders>
+            <w:shd w:fill="FDF3E0" w:val="clear"/>
+            <w:tcMar>
+              <w:top w:type="dxa" w:w="140"/>
+              <w:left w:type="dxa" w:w="180"/>
+              <w:bottom w:type="dxa" w:w="140"/>
+              <w:right w:type="dxa" w:w="180"/>
+            </w:tcMar>
+          </w:tcPr>
+          <w:p>
+            <w:pPr>
+              <w:spacing w:after="40"/>
+            </w:pPr>
+            <w:r>
+              <w:rPr>
+                <w:b/>
+                <w:bCs/>
+                <w:color w:val="9A6A1E"/>
+                <w:sz w:val="22"/>
+                <w:szCs w:val="22"/>
+              </w:rPr>
+              <w:t xml:space="preserve">Merke</w:t>
+            </w:r>
+          </w:p>
+          <w:p>
+            <w:pPr>
+              <w:spacing w:after="0" w:line="312" w:lineRule="auto"/>
+            </w:pPr>
+            <w:r>
+              <w:rPr>
+                <w:sz w:val="22"/>
+                <w:szCs w:val="22"/>
+              </w:rPr>
+              <w:t xml:space="preserve">In GameBasic sind die Schlüssel einer Map IMMER Strings. Die Werte dagegen haben den Typ, den du bei DIM angibst – MAP OF INTEGER speichert Zahlen, MAP OF STRING speichert Texte, und so weiter.</w:t>
+            </w:r>
+          </w:p>
+        </w:tc>
+      </w:tr>
+    </w:tbl>
+    <w:p>
+      <w:pPr>
+        <w:spacing w:after="160"/>
+      </w:pPr>
+    </w:p>
+    <w:p>
+      <w:pPr>
+        <w:pStyle w:val="Heading2"/>
+        <w:keepNext/>
+        <w:keepLines/>
+        <w:spacing w:after="120" w:before="280"/>
+      </w:pPr>
+      <w:r>
+        <w:t xml:space="preserve">Eine Map anlegen und füllen</w:t>
+      </w:r>
+    </w:p>
+    <w:p>
+      <w:pPr>
+        <w:spacing w:after="180" w:line="312" w:lineRule="auto"/>
+      </w:pPr>
+      <w:r>
+        <w:rPr>
+          <w:sz w:val="22"/>
+          <w:szCs w:val="22"/>
+        </w:rPr>
+        <w:t xml:space="preserve">Deklariert wird eine Map mit DIM ... AS MAP OF Typ. Frisch angelegt ist sie leer. Mit MAPPUT legst du ein Paar ab: Du nennst den Schlüssel und den Wert. Gibt es den Schlüssel schon, wird sein alter Wert überschrieben – jeder Schlüssel kommt also nur einmal vor.</w:t>
+      </w:r>
+    </w:p>
+    <w:p>
+      <w:pPr>
+        <w:keepNext/>
+        <w:keepLines/>
+        <w:pBdr>
+          <w:bottom w:val="single" w:color="DDD0C0" w:sz="4" w:space="2"/>
+        </w:pBdr>
+        <w:spacing w:after="40" w:before="360"/>
+      </w:pPr>
+      <w:r>
+        <w:rPr>
+          <w:rFonts w:ascii="Consolas" w:cs="Consolas" w:eastAsia="Consolas" w:hAnsi="Consolas"/>
+          <w:b/>
+          <w:bCs/>
+          <w:color w:val="9A3412"/>
+          <w:sz w:val="24"/>
+          <w:szCs w:val="24"/>
+        </w:rPr>
+        <w:t xml:space="preserve">MAPPUT</w:t>
+      </w:r>
+    </w:p>
+    <w:p>
+      <w:pPr>
+        <w:keepNext/>
+        <w:spacing w:after="120"/>
+      </w:pPr>
+      <w:r>
+        <w:rPr>
+          <w:b/>
+          <w:bCs/>
+          <w:color w:val="6A6A6A"/>
+          <w:sz w:val="18"/>
+          <w:szCs w:val="18"/>
+        </w:rPr>
+        <w:t xml:space="preserve">Syntax:  </w:t>
+      </w:r>
+      <w:r>
+        <w:rPr>
+          <w:rFonts w:ascii="Consolas" w:cs="Consolas" w:eastAsia="Consolas" w:hAnsi="Consolas"/>
+          <w:color w:val="335577"/>
+          <w:sz w:val="19"/>
+          <w:szCs w:val="19"/>
+        </w:rPr>
+        <w:t xml:space="preserve">MAPPUT(m, schlüssel$, wert)</w:t>
+      </w:r>
+    </w:p>
+    <w:p>
+      <w:pPr>
+        <w:spacing w:after="180" w:line="312" w:lineRule="auto"/>
+      </w:pPr>
+      <w:r>
+        <w:rPr>
+          <w:sz w:val="22"/>
+          <w:szCs w:val="22"/>
+        </w:rPr>
+        <w:t xml:space="preserve">Legt unter dem Schlüssel einen Wert ab oder überschreibt den bestehenden. Der Schlüssel ist ein String, der Wert hat den Typ der Map.</w:t>
+      </w:r>
+    </w:p>
+    <w:p>
+      <w:pPr>
+        <w:keepNext/>
+        <w:spacing w:after="30" w:before="120"/>
+      </w:pPr>
+      <w:r>
+        <w:rPr>
+          <w:b/>
+          <w:bCs/>
+          <w:i/>
+          <w:iCs/>
+          <w:color w:val="6A6A6A"/>
+          <w:sz w:val="18"/>
+          <w:szCs w:val="18"/>
+        </w:rPr>
+        <w:t xml:space="preserve">Beispiel</w:t>
+      </w:r>
+    </w:p>
+    <w:p>
+      <w:pPr>
+        <w:keepLines/>
+        <w:pBdr>
+          <w:left w:val="single" w:color="1B6CA8" w:sz="18" w:space="6"/>
+        </w:pBdr>
+        <w:shd w:fill="F4F4F4" w:val="clear"/>
+        <w:spacing w:after="200" w:before="100" w:line="264" w:lineRule="auto"/>
+        <w:ind w:left="140"/>
+      </w:pPr>
+      <w:r>
+        <w:rPr>
+          <w:rFonts w:ascii="Consolas" w:cs="Consolas" w:eastAsia="Consolas" w:hAnsi="Consolas"/>
+          <w:sz w:val="19"/>
+          <w:szCs w:val="19"/>
+        </w:rPr>
+        <w:t xml:space="preserve">DIM punkte AS MAP OF INTEGER</w:t>
+      </w:r>
+      <w:r>
+        <w:rPr>
+          <w:rFonts w:ascii="Consolas" w:cs="Consolas" w:eastAsia="Consolas" w:hAnsi="Consolas"/>
+          <w:sz w:val="19"/>
+          <w:szCs w:val="19"/>
+        </w:rPr>
+        <w:br/>
+        <w:t xml:space="preserve">MAPPUT(punkte, "Anna", 95)</w:t>
+      </w:r>
+      <w:r>
+        <w:rPr>
+          <w:rFonts w:ascii="Consolas" w:cs="Consolas" w:eastAsia="Consolas" w:hAnsi="Consolas"/>
+          <w:sz w:val="19"/>
+          <w:szCs w:val="19"/>
+        </w:rPr>
+        <w:br/>
+        <w:t xml:space="preserve">MAPPUT(punkte, "Bert", 78)</w:t>
+      </w:r>
+      <w:r>
+        <w:rPr>
+          <w:rFonts w:ascii="Consolas" w:cs="Consolas" w:eastAsia="Consolas" w:hAnsi="Consolas"/>
+          <w:sz w:val="19"/>
+          <w:szCs w:val="19"/>
+        </w:rPr>
+        <w:br/>
+        <w:t xml:space="preserve">MAPPUT(punkte, "Anna", 100)   ' überschreibt die 95</w:t>
+      </w:r>
+      <w:r>
+        <w:rPr>
+          <w:rFonts w:ascii="Consolas" w:cs="Consolas" w:eastAsia="Consolas" w:hAnsi="Consolas"/>
+          <w:sz w:val="19"/>
+          <w:szCs w:val="19"/>
+        </w:rPr>
+        <w:br/>
+        <w:t xml:space="preserve"/>
+      </w:r>
+      <w:r>
+        <w:rPr>
+          <w:rFonts w:ascii="Consolas" w:cs="Consolas" w:eastAsia="Consolas" w:hAnsi="Consolas"/>
+          <w:sz w:val="19"/>
+          <w:szCs w:val="19"/>
+        </w:rPr>
+        <w:br/>
+        <w:t xml:space="preserve">PRINT MAPSIZE(punkte)</w:t>
+      </w:r>
+    </w:p>
+    <w:p>
+      <w:pPr>
+        <w:keepNext/>
+        <w:spacing w:after="30" w:before="120"/>
+      </w:pPr>
+      <w:r>
+        <w:rPr>
+          <w:b/>
+          <w:bCs/>
+          <w:i/>
+          <w:iCs/>
+          <w:color w:val="6A6A6A"/>
+          <w:sz w:val="18"/>
+          <w:szCs w:val="18"/>
+        </w:rPr>
+        <w:t xml:space="preserve">Ausgabe</w:t>
+      </w:r>
+    </w:p>
+    <w:p>
+      <w:pPr>
+        <w:keepLines/>
+        <w:pBdr>
+          <w:left w:val="single" w:color="9AC79A" w:sz="18" w:space="6"/>
+        </w:pBdr>
+        <w:shd w:fill="EAF4EA" w:val="clear"/>
+        <w:spacing w:after="200" w:before="100" w:line="264" w:lineRule="auto"/>
+        <w:ind w:left="140"/>
+      </w:pPr>
+      <w:r>
+        <w:rPr>
+          <w:rFonts w:ascii="Consolas" w:cs="Consolas" w:eastAsia="Consolas" w:hAnsi="Consolas"/>
+          <w:sz w:val="19"/>
+          <w:szCs w:val="19"/>
+        </w:rPr>
+        <w:t xml:space="preserve">2</w:t>
+      </w:r>
+    </w:p>
+    <w:p>
+      <w:pPr>
+        <w:pStyle w:val="Heading2"/>
+        <w:keepNext/>
+        <w:keepLines/>
+        <w:spacing w:after="120" w:before="280"/>
+      </w:pPr>
+      <w:r>
+        <w:t xml:space="preserve">Einen Wert nachschlagen</w:t>
+      </w:r>
+    </w:p>
+    <w:p>
+      <w:pPr>
+        <w:spacing w:after="180" w:line="312" w:lineRule="auto"/>
+      </w:pPr>
+      <w:r>
+        <w:rPr>
+          <w:sz w:val="22"/>
+          <w:szCs w:val="22"/>
+        </w:rPr>
+        <w:t xml:space="preserve">Mit MAPGET holst du den Wert zu einem Schlüssel. Hier musst du aufpassen: Fragst du nach einem Schlüssel, den es gar nicht gibt, bricht MAPGET mit einem Fehler ab. Das ist Absicht – meist ist ein fehlender Schlüssel an dieser Stelle ein echter Programmfehler, den du sofort bemerken willst.</w:t>
+      </w:r>
+    </w:p>
+    <w:p>
+      <w:pPr>
+        <w:keepNext/>
+        <w:keepLines/>
+        <w:pBdr>
+          <w:bottom w:val="single" w:color="DDD0C0" w:sz="4" w:space="2"/>
+        </w:pBdr>
+        <w:spacing w:after="40" w:before="360"/>
+      </w:pPr>
+      <w:r>
+        <w:rPr>
+          <w:rFonts w:ascii="Consolas" w:cs="Consolas" w:eastAsia="Consolas" w:hAnsi="Consolas"/>
+          <w:b/>
+          <w:bCs/>
+          <w:color w:val="9A3412"/>
+          <w:sz w:val="24"/>
+          <w:szCs w:val="24"/>
+        </w:rPr>
+        <w:t xml:space="preserve">MAPGET</w:t>
+      </w:r>
+    </w:p>
+    <w:p>
+      <w:pPr>
+        <w:keepNext/>
+        <w:spacing w:after="120"/>
+      </w:pPr>
+      <w:r>
+        <w:rPr>
+          <w:b/>
+          <w:bCs/>
+          <w:color w:val="6A6A6A"/>
+          <w:sz w:val="18"/>
+          <w:szCs w:val="18"/>
+        </w:rPr>
+        <w:t xml:space="preserve">Syntax:  </w:t>
+      </w:r>
+      <w:r>
+        <w:rPr>
+          <w:rFonts w:ascii="Consolas" w:cs="Consolas" w:eastAsia="Consolas" w:hAnsi="Consolas"/>
+          <w:color w:val="335577"/>
+          <w:sz w:val="19"/>
+          <w:szCs w:val="19"/>
+        </w:rPr>
+        <w:t xml:space="preserve">MAPGET(m, schlüssel$)</w:t>
+      </w:r>
+    </w:p>
+    <w:p>
+      <w:pPr>
+        <w:spacing w:after="180" w:line="312" w:lineRule="auto"/>
+      </w:pPr>
+      <w:r>
+        <w:rPr>
+          <w:sz w:val="22"/>
+          <w:szCs w:val="22"/>
+        </w:rPr>
+        <w:t xml:space="preserve">Liefert den Wert zum Schlüssel. Existiert der Schlüssel nicht, wird ein Fehler ausgelöst – prüfe im Zweifel vorher mit MAPHAS oder nutze MAPGETOR.</w:t>
+      </w:r>
+    </w:p>
+    <w:p>
+      <w:pPr>
+        <w:keepNext/>
+        <w:spacing w:after="30" w:before="120"/>
+      </w:pPr>
+      <w:r>
+        <w:rPr>
+          <w:b/>
+          <w:bCs/>
+          <w:i/>
+          <w:iCs/>
+          <w:color w:val="6A6A6A"/>
+          <w:sz w:val="18"/>
+          <w:szCs w:val="18"/>
+        </w:rPr>
+        <w:t xml:space="preserve">Beispiel</w:t>
+      </w:r>
+    </w:p>
+    <w:p>
+      <w:pPr>
+        <w:keepLines/>
+        <w:pBdr>
+          <w:left w:val="single" w:color="1B6CA8" w:sz="18" w:space="6"/>
+        </w:pBdr>
+        <w:shd w:fill="F4F4F4" w:val="clear"/>
+        <w:spacing w:after="200" w:before="100" w:line="264" w:lineRule="auto"/>
+        <w:ind w:left="140"/>
+      </w:pPr>
+      <w:r>
+        <w:rPr>
+          <w:rFonts w:ascii="Consolas" w:cs="Consolas" w:eastAsia="Consolas" w:hAnsi="Consolas"/>
+          <w:sz w:val="19"/>
+          <w:szCs w:val="19"/>
+        </w:rPr>
+        <w:t xml:space="preserve">DIM punkte AS MAP OF INTEGER</w:t>
+      </w:r>
+      <w:r>
+        <w:rPr>
+          <w:rFonts w:ascii="Consolas" w:cs="Consolas" w:eastAsia="Consolas" w:hAnsi="Consolas"/>
+          <w:sz w:val="19"/>
+          <w:szCs w:val="19"/>
+        </w:rPr>
+        <w:br/>
+        <w:t xml:space="preserve">MAPPUT(punkte, "Anna", 95)</w:t>
+      </w:r>
+      <w:r>
+        <w:rPr>
+          <w:rFonts w:ascii="Consolas" w:cs="Consolas" w:eastAsia="Consolas" w:hAnsi="Consolas"/>
+          <w:sz w:val="19"/>
+          <w:szCs w:val="19"/>
+        </w:rPr>
+        <w:br/>
+        <w:t xml:space="preserve">PRINT MAPGET(punkte, "Anna")</w:t>
+      </w:r>
+    </w:p>
+    <w:p>
+      <w:pPr>
+        <w:keepNext/>
+        <w:spacing w:after="30" w:before="120"/>
+      </w:pPr>
+      <w:r>
+        <w:rPr>
+          <w:b/>
+          <w:bCs/>
+          <w:i/>
+          <w:iCs/>
+          <w:color w:val="6A6A6A"/>
+          <w:sz w:val="18"/>
+          <w:szCs w:val="18"/>
+        </w:rPr>
+        <w:t xml:space="preserve">Ausgabe</w:t>
+      </w:r>
+    </w:p>
+    <w:p>
+      <w:pPr>
+        <w:keepLines/>
+        <w:pBdr>
+          <w:left w:val="single" w:color="9AC79A" w:sz="18" w:space="6"/>
+        </w:pBdr>
+        <w:shd w:fill="EAF4EA" w:val="clear"/>
+        <w:spacing w:after="200" w:before="100" w:line="264" w:lineRule="auto"/>
+        <w:ind w:left="140"/>
+      </w:pPr>
+      <w:r>
+        <w:rPr>
+          <w:rFonts w:ascii="Consolas" w:cs="Consolas" w:eastAsia="Consolas" w:hAnsi="Consolas"/>
+          <w:sz w:val="19"/>
+          <w:szCs w:val="19"/>
+        </w:rPr>
+        <w:t xml:space="preserve">95</w:t>
+      </w:r>
+    </w:p>
+    <w:p>
+      <w:pPr>
+        <w:spacing w:after="180" w:line="312" w:lineRule="auto"/>
+      </w:pPr>
+      <w:r>
+        <w:rPr>
+          <w:sz w:val="22"/>
+          <w:szCs w:val="22"/>
+        </w:rPr>
+        <w:t xml:space="preserve">Damit dir ein fehlender Schlüssel nicht das Programm abschießt, gibt es zwei sichere Wege. MAPHAS prüft, ob ein Schlüssel überhaupt vorhanden ist. Und MAPGETOR liefert einen selbst gewählten Ersatzwert, falls der Schlüssel fehlt – sehr praktisch für Standardwerte.</w:t>
+      </w:r>
+    </w:p>
+    <w:p>
+      <w:pPr>
+        <w:keepNext/>
+        <w:keepLines/>
+        <w:pBdr>
+          <w:bottom w:val="single" w:color="DDD0C0" w:sz="4" w:space="2"/>
+        </w:pBdr>
+        <w:spacing w:after="40" w:before="360"/>
+      </w:pPr>
+      <w:r>
+        <w:rPr>
+          <w:rFonts w:ascii="Consolas" w:cs="Consolas" w:eastAsia="Consolas" w:hAnsi="Consolas"/>
+          <w:b/>
+          <w:bCs/>
+          <w:color w:val="9A3412"/>
+          <w:sz w:val="24"/>
+          <w:szCs w:val="24"/>
+        </w:rPr>
+        <w:t xml:space="preserve">MAPHAS</w:t>
+      </w:r>
+    </w:p>
+    <w:p>
+      <w:pPr>
+        <w:keepNext/>
+        <w:spacing w:after="120"/>
+      </w:pPr>
+      <w:r>
+        <w:rPr>
+          <w:b/>
+          <w:bCs/>
+          <w:color w:val="6A6A6A"/>
+          <w:sz w:val="18"/>
+          <w:szCs w:val="18"/>
+        </w:rPr>
+        <w:t xml:space="preserve">Syntax:  </w:t>
+      </w:r>
+      <w:r>
+        <w:rPr>
+          <w:rFonts w:ascii="Consolas" w:cs="Consolas" w:eastAsia="Consolas" w:hAnsi="Consolas"/>
+          <w:color w:val="335577"/>
+          <w:sz w:val="19"/>
+          <w:szCs w:val="19"/>
+        </w:rPr>
+        <w:t xml:space="preserve">MAPHAS(m, schlüssel$)</w:t>
+      </w:r>
+    </w:p>
+    <w:p>
+      <w:pPr>
+        <w:spacing w:after="180" w:line="312" w:lineRule="auto"/>
+      </w:pPr>
+      <w:r>
+        <w:rPr>
+          <w:sz w:val="22"/>
+          <w:szCs w:val="22"/>
+        </w:rPr>
+        <w:t xml:space="preserve">Liefert TRUE, wenn der Schlüssel in der Map vorhanden ist, sonst FALSE. Dasselbe leistet der IN-Operator: schlüssel$ IN m.</w:t>
+      </w:r>
+    </w:p>
+    <w:p>
+      <w:pPr>
+        <w:keepNext/>
+        <w:spacing w:after="30" w:before="120"/>
+      </w:pPr>
+      <w:r>
+        <w:rPr>
+          <w:b/>
+          <w:bCs/>
+          <w:i/>
+          <w:iCs/>
+          <w:color w:val="6A6A6A"/>
+          <w:sz w:val="18"/>
+          <w:szCs w:val="18"/>
+        </w:rPr>
+        <w:t xml:space="preserve">Beispiel</w:t>
+      </w:r>
+    </w:p>
+    <w:p>
+      <w:pPr>
+        <w:keepLines/>
+        <w:pBdr>
+          <w:left w:val="single" w:color="1B6CA8" w:sz="18" w:space="6"/>
+        </w:pBdr>
+        <w:shd w:fill="F4F4F4" w:val="clear"/>
+        <w:spacing w:after="200" w:before="100" w:line="264" w:lineRule="auto"/>
+        <w:ind w:left="140"/>
+      </w:pPr>
+      <w:r>
+        <w:rPr>
+          <w:rFonts w:ascii="Consolas" w:cs="Consolas" w:eastAsia="Consolas" w:hAnsi="Consolas"/>
+          <w:sz w:val="19"/>
+          <w:szCs w:val="19"/>
+        </w:rPr>
+        <w:t xml:space="preserve">DIM punkte AS MAP OF INTEGER</w:t>
+      </w:r>
+      <w:r>
+        <w:rPr>
+          <w:rFonts w:ascii="Consolas" w:cs="Consolas" w:eastAsia="Consolas" w:hAnsi="Consolas"/>
+          <w:sz w:val="19"/>
+          <w:szCs w:val="19"/>
+        </w:rPr>
+        <w:br/>
+        <w:t xml:space="preserve">MAPPUT(punkte, "Anna", 95)</w:t>
+      </w:r>
+      <w:r>
+        <w:rPr>
+          <w:rFonts w:ascii="Consolas" w:cs="Consolas" w:eastAsia="Consolas" w:hAnsi="Consolas"/>
+          <w:sz w:val="19"/>
+          <w:szCs w:val="19"/>
+        </w:rPr>
+        <w:br/>
+        <w:t xml:space="preserve">PRINT MAPHAS(punkte, "Anna")</w:t>
+      </w:r>
+      <w:r>
+        <w:rPr>
+          <w:rFonts w:ascii="Consolas" w:cs="Consolas" w:eastAsia="Consolas" w:hAnsi="Consolas"/>
+          <w:sz w:val="19"/>
+          <w:szCs w:val="19"/>
+        </w:rPr>
+        <w:br/>
+        <w:t xml:space="preserve">PRINT "Zoe" IN punkte</w:t>
+      </w:r>
+    </w:p>
+    <w:p>
+      <w:pPr>
+        <w:keepNext/>
+        <w:spacing w:after="30" w:before="120"/>
+      </w:pPr>
+      <w:r>
+        <w:rPr>
+          <w:b/>
+          <w:bCs/>
+          <w:i/>
+          <w:iCs/>
+          <w:color w:val="6A6A6A"/>
+          <w:sz w:val="18"/>
+          <w:szCs w:val="18"/>
+        </w:rPr>
+        <w:t xml:space="preserve">Ausgabe</w:t>
+      </w:r>
+    </w:p>
+    <w:p>
+      <w:pPr>
+        <w:keepLines/>
+        <w:pBdr>
+          <w:left w:val="single" w:color="9AC79A" w:sz="18" w:space="6"/>
+        </w:pBdr>
+        <w:shd w:fill="EAF4EA" w:val="clear"/>
+        <w:spacing w:after="200" w:before="100" w:line="264" w:lineRule="auto"/>
+        <w:ind w:left="140"/>
+      </w:pPr>
+      <w:r>
+        <w:rPr>
+          <w:rFonts w:ascii="Consolas" w:cs="Consolas" w:eastAsia="Consolas" w:hAnsi="Consolas"/>
+          <w:sz w:val="19"/>
+          <w:szCs w:val="19"/>
+        </w:rPr>
+        <w:t xml:space="preserve">TRUE</w:t>
+      </w:r>
+      <w:r>
+        <w:rPr>
+          <w:rFonts w:ascii="Consolas" w:cs="Consolas" w:eastAsia="Consolas" w:hAnsi="Consolas"/>
+          <w:sz w:val="19"/>
+          <w:szCs w:val="19"/>
+        </w:rPr>
+        <w:br/>
+        <w:t xml:space="preserve">FALSE</w:t>
+      </w:r>
+    </w:p>
+    <w:p>
+      <w:pPr>
+        <w:keepNext/>
+        <w:keepLines/>
+        <w:pBdr>
+          <w:bottom w:val="single" w:color="DDD0C0" w:sz="4" w:space="2"/>
+        </w:pBdr>
+        <w:spacing w:after="40" w:before="360"/>
+      </w:pPr>
+      <w:r>
+        <w:rPr>
+          <w:rFonts w:ascii="Consolas" w:cs="Consolas" w:eastAsia="Consolas" w:hAnsi="Consolas"/>
+          <w:b/>
+          <w:bCs/>
+          <w:color w:val="9A3412"/>
+          <w:sz w:val="24"/>
+          <w:szCs w:val="24"/>
+        </w:rPr>
+        <w:t xml:space="preserve">MAPGETOR</w:t>
+      </w:r>
+    </w:p>
+    <w:p>
+      <w:pPr>
+        <w:keepNext/>
+        <w:spacing w:after="120"/>
+      </w:pPr>
+      <w:r>
+        <w:rPr>
+          <w:b/>
+          <w:bCs/>
+          <w:color w:val="6A6A6A"/>
+          <w:sz w:val="18"/>
+          <w:szCs w:val="18"/>
+        </w:rPr>
+        <w:t xml:space="preserve">Syntax:  </w:t>
+      </w:r>
+      <w:r>
+        <w:rPr>
+          <w:rFonts w:ascii="Consolas" w:cs="Consolas" w:eastAsia="Consolas" w:hAnsi="Consolas"/>
+          <w:color w:val="335577"/>
+          <w:sz w:val="19"/>
+          <w:szCs w:val="19"/>
+        </w:rPr>
+        <w:t xml:space="preserve">MAPGETOR(m, schlüssel$, ersatz)</w:t>
+      </w:r>
+    </w:p>
+    <w:p>
+      <w:pPr>
+        <w:spacing w:after="180" w:line="312" w:lineRule="auto"/>
+      </w:pPr>
+      <w:r>
+        <w:rPr>
+          <w:sz w:val="22"/>
+          <w:szCs w:val="22"/>
+        </w:rPr>
+        <w:t xml:space="preserve">Liefert den Wert zum Schlüssel – oder den Ersatzwert, falls der Schlüssel fehlt. Bricht nie ab.</w:t>
+      </w:r>
+    </w:p>
+    <w:p>
+      <w:pPr>
+        <w:keepNext/>
+        <w:spacing w:after="30" w:before="120"/>
+      </w:pPr>
+      <w:r>
+        <w:rPr>
+          <w:b/>
+          <w:bCs/>
+          <w:i/>
+          <w:iCs/>
+          <w:color w:val="6A6A6A"/>
+          <w:sz w:val="18"/>
+          <w:szCs w:val="18"/>
+        </w:rPr>
+        <w:t xml:space="preserve">Beispiel</w:t>
+      </w:r>
+    </w:p>
+    <w:p>
+      <w:pPr>
+        <w:keepLines/>
+        <w:pBdr>
+          <w:left w:val="single" w:color="1B6CA8" w:sz="18" w:space="6"/>
+        </w:pBdr>
+        <w:shd w:fill="F4F4F4" w:val="clear"/>
+        <w:spacing w:after="200" w:before="100" w:line="264" w:lineRule="auto"/>
+        <w:ind w:left="140"/>
+      </w:pPr>
+      <w:r>
+        <w:rPr>
+          <w:rFonts w:ascii="Consolas" w:cs="Consolas" w:eastAsia="Consolas" w:hAnsi="Consolas"/>
+          <w:sz w:val="19"/>
+          <w:szCs w:val="19"/>
+        </w:rPr>
+        <w:t xml:space="preserve">DIM punkte AS MAP OF INTEGER</w:t>
+      </w:r>
+      <w:r>
+        <w:rPr>
+          <w:rFonts w:ascii="Consolas" w:cs="Consolas" w:eastAsia="Consolas" w:hAnsi="Consolas"/>
+          <w:sz w:val="19"/>
+          <w:szCs w:val="19"/>
+        </w:rPr>
+        <w:br/>
+        <w:t xml:space="preserve">MAPPUT(punkte, "Anna", 95)</w:t>
+      </w:r>
+      <w:r>
+        <w:rPr>
+          <w:rFonts w:ascii="Consolas" w:cs="Consolas" w:eastAsia="Consolas" w:hAnsi="Consolas"/>
+          <w:sz w:val="19"/>
+          <w:szCs w:val="19"/>
+        </w:rPr>
+        <w:br/>
+        <w:t xml:space="preserve">PRINT MAPGETOR(punkte, "Anna", 0)</w:t>
+      </w:r>
+      <w:r>
+        <w:rPr>
+          <w:rFonts w:ascii="Consolas" w:cs="Consolas" w:eastAsia="Consolas" w:hAnsi="Consolas"/>
+          <w:sz w:val="19"/>
+          <w:szCs w:val="19"/>
+        </w:rPr>
+        <w:br/>
+        <w:t xml:space="preserve">PRINT MAPGETOR(punkte, "Eve", 0)   ' Eve fehlt → 0</w:t>
+      </w:r>
+    </w:p>
+    <w:p>
+      <w:pPr>
+        <w:keepNext/>
+        <w:spacing w:after="30" w:before="120"/>
+      </w:pPr>
+      <w:r>
+        <w:rPr>
+          <w:b/>
+          <w:bCs/>
+          <w:i/>
+          <w:iCs/>
+          <w:color w:val="6A6A6A"/>
+          <w:sz w:val="18"/>
+          <w:szCs w:val="18"/>
+        </w:rPr>
+        <w:t xml:space="preserve">Ausgabe</w:t>
+      </w:r>
+    </w:p>
+    <w:p>
+      <w:pPr>
+        <w:keepLines/>
+        <w:pBdr>
+          <w:left w:val="single" w:color="9AC79A" w:sz="18" w:space="6"/>
+        </w:pBdr>
+        <w:shd w:fill="EAF4EA" w:val="clear"/>
+        <w:spacing w:after="200" w:before="100" w:line="264" w:lineRule="auto"/>
+        <w:ind w:left="140"/>
+      </w:pPr>
+      <w:r>
+        <w:rPr>
+          <w:rFonts w:ascii="Consolas" w:cs="Consolas" w:eastAsia="Consolas" w:hAnsi="Consolas"/>
+          <w:sz w:val="19"/>
+          <w:szCs w:val="19"/>
+        </w:rPr>
+        <w:t xml:space="preserve">95</w:t>
+      </w:r>
+      <w:r>
+        <w:rPr>
+          <w:rFonts w:ascii="Consolas" w:cs="Consolas" w:eastAsia="Consolas" w:hAnsi="Consolas"/>
+          <w:sz w:val="19"/>
+          <w:szCs w:val="19"/>
+        </w:rPr>
+        <w:br/>
+        <w:t xml:space="preserve">0</w:t>
+      </w:r>
+    </w:p>
+    <w:p>
+      <w:pPr>
+        <w:pStyle w:val="Heading2"/>
+        <w:keepNext/>
+        <w:keepLines/>
+        <w:spacing w:after="120" w:before="280"/>
+      </w:pPr>
+      <w:r>
+        <w:t xml:space="preserve">Größe, Entfernen, Leeren</w:t>
+      </w:r>
+    </w:p>
+    <w:p>
+      <w:pPr>
+        <w:keepNext/>
+        <w:keepLines/>
+        <w:pBdr>
+          <w:bottom w:val="single" w:color="DDD0C0" w:sz="4" w:space="2"/>
+        </w:pBdr>
+        <w:spacing w:after="40" w:before="360"/>
+      </w:pPr>
+      <w:r>
+        <w:rPr>
+          <w:rFonts w:ascii="Consolas" w:cs="Consolas" w:eastAsia="Consolas" w:hAnsi="Consolas"/>
+          <w:b/>
+          <w:bCs/>
+          <w:color w:val="9A3412"/>
+          <w:sz w:val="24"/>
+          <w:szCs w:val="24"/>
+        </w:rPr>
+        <w:t xml:space="preserve">MAPSIZE / MAPREMOVE / MAPCLEAR</w:t>
+      </w:r>
+    </w:p>
+    <w:p>
+      <w:pPr>
+        <w:keepNext/>
+        <w:spacing w:after="120"/>
+      </w:pPr>
+      <w:r>
+        <w:rPr>
+          <w:b/>
+          <w:bCs/>
+          <w:color w:val="6A6A6A"/>
+          <w:sz w:val="18"/>
+          <w:szCs w:val="18"/>
+        </w:rPr>
+        <w:t xml:space="preserve">Syntax:  </w:t>
+      </w:r>
+      <w:r>
+        <w:rPr>
+          <w:rFonts w:ascii="Consolas" w:cs="Consolas" w:eastAsia="Consolas" w:hAnsi="Consolas"/>
+          <w:color w:val="335577"/>
+          <w:sz w:val="19"/>
+          <w:szCs w:val="19"/>
+        </w:rPr>
+        <w:t xml:space="preserve">MAPSIZE(m)   MAPREMOVE(m, schlüssel$)   MAPCLEAR(m)</w:t>
+      </w:r>
+    </w:p>
+    <w:p>
+      <w:pPr>
+        <w:spacing w:after="180" w:line="312" w:lineRule="auto"/>
+      </w:pPr>
+      <w:r>
+        <w:rPr>
+          <w:sz w:val="22"/>
+          <w:szCs w:val="22"/>
+        </w:rPr>
+        <w:t xml:space="preserve">MAPSIZE liefert die Anzahl der Paare. MAPREMOVE löscht ein Paar und gibt TRUE zurück, wenn es den Schlüssel gab. MAPCLEAR leert die ganze Map.</w:t>
+      </w:r>
+    </w:p>
+    <w:p>
+      <w:pPr>
+        <w:keepNext/>
+        <w:spacing w:after="30" w:before="120"/>
+      </w:pPr>
+      <w:r>
+        <w:rPr>
+          <w:b/>
+          <w:bCs/>
+          <w:i/>
+          <w:iCs/>
+          <w:color w:val="6A6A6A"/>
+          <w:sz w:val="18"/>
+          <w:szCs w:val="18"/>
+        </w:rPr>
+        <w:t xml:space="preserve">Beispiel</w:t>
+      </w:r>
+    </w:p>
+    <w:p>
+      <w:pPr>
+        <w:keepLines/>
+        <w:pBdr>
+          <w:left w:val="single" w:color="1B6CA8" w:sz="18" w:space="6"/>
+        </w:pBdr>
+        <w:shd w:fill="F4F4F4" w:val="clear"/>
+        <w:spacing w:after="200" w:before="100" w:line="264" w:lineRule="auto"/>
+        <w:ind w:left="140"/>
+      </w:pPr>
+      <w:r>
+        <w:rPr>
+          <w:rFonts w:ascii="Consolas" w:cs="Consolas" w:eastAsia="Consolas" w:hAnsi="Consolas"/>
+          <w:sz w:val="19"/>
+          <w:szCs w:val="19"/>
+        </w:rPr>
+        <w:t xml:space="preserve">DIM lager AS MAP OF INTEGER</w:t>
+      </w:r>
+      <w:r>
+        <w:rPr>
+          <w:rFonts w:ascii="Consolas" w:cs="Consolas" w:eastAsia="Consolas" w:hAnsi="Consolas"/>
+          <w:sz w:val="19"/>
+          <w:szCs w:val="19"/>
+        </w:rPr>
+        <w:br/>
+        <w:t xml:space="preserve">MAPPUT(lager, "Holz", 5)</w:t>
+      </w:r>
+      <w:r>
+        <w:rPr>
+          <w:rFonts w:ascii="Consolas" w:cs="Consolas" w:eastAsia="Consolas" w:hAnsi="Consolas"/>
+          <w:sz w:val="19"/>
+          <w:szCs w:val="19"/>
+        </w:rPr>
+        <w:br/>
+        <w:t xml:space="preserve">MAPPUT(lager, "Stein", 3)</w:t>
+      </w:r>
+      <w:r>
+        <w:rPr>
+          <w:rFonts w:ascii="Consolas" w:cs="Consolas" w:eastAsia="Consolas" w:hAnsi="Consolas"/>
+          <w:sz w:val="19"/>
+          <w:szCs w:val="19"/>
+        </w:rPr>
+        <w:br/>
+        <w:t xml:space="preserve">PRINT MAPREMOVE(lager, "Holz")</w:t>
+      </w:r>
+      <w:r>
+        <w:rPr>
+          <w:rFonts w:ascii="Consolas" w:cs="Consolas" w:eastAsia="Consolas" w:hAnsi="Consolas"/>
+          <w:sz w:val="19"/>
+          <w:szCs w:val="19"/>
+        </w:rPr>
+        <w:br/>
+        <w:t xml:space="preserve">PRINT MAPSIZE(lager)</w:t>
+      </w:r>
+    </w:p>
+    <w:p>
+      <w:pPr>
+        <w:keepNext/>
+        <w:spacing w:after="30" w:before="120"/>
+      </w:pPr>
+      <w:r>
+        <w:rPr>
+          <w:b/>
+          <w:bCs/>
+          <w:i/>
+          <w:iCs/>
+          <w:color w:val="6A6A6A"/>
+          <w:sz w:val="18"/>
+          <w:szCs w:val="18"/>
+        </w:rPr>
+        <w:t xml:space="preserve">Ausgabe</w:t>
+      </w:r>
+    </w:p>
+    <w:p>
+      <w:pPr>
+        <w:keepLines/>
+        <w:pBdr>
+          <w:left w:val="single" w:color="9AC79A" w:sz="18" w:space="6"/>
+        </w:pBdr>
+        <w:shd w:fill="EAF4EA" w:val="clear"/>
+        <w:spacing w:after="200" w:before="100" w:line="264" w:lineRule="auto"/>
+        <w:ind w:left="140"/>
+      </w:pPr>
+      <w:r>
+        <w:rPr>
+          <w:rFonts w:ascii="Consolas" w:cs="Consolas" w:eastAsia="Consolas" w:hAnsi="Consolas"/>
+          <w:sz w:val="19"/>
+          <w:szCs w:val="19"/>
+        </w:rPr>
+        <w:t xml:space="preserve">TRUE</w:t>
+      </w:r>
+      <w:r>
+        <w:rPr>
+          <w:rFonts w:ascii="Consolas" w:cs="Consolas" w:eastAsia="Consolas" w:hAnsi="Consolas"/>
+          <w:sz w:val="19"/>
+          <w:szCs w:val="19"/>
+        </w:rPr>
+        <w:br/>
+        <w:t xml:space="preserve">1</w:t>
+      </w:r>
+    </w:p>
+    <w:p>
+      <w:pPr>
+        <w:pStyle w:val="Heading2"/>
+        <w:keepNext/>
+        <w:keepLines/>
+        <w:spacing w:after="120" w:before="280"/>
+      </w:pPr>
+      <w:r>
+        <w:t xml:space="preserve">Über alle Paare laufen</w:t>
+      </w:r>
+    </w:p>
+    <w:p>
+      <w:pPr>
+        <w:spacing w:after="180" w:line="312" w:lineRule="auto"/>
+      </w:pPr>
+      <w:r>
+        <w:rPr>
+          <w:sz w:val="22"/>
+          <w:szCs w:val="22"/>
+        </w:rPr>
+        <w:t xml:space="preserve">Oft willst du jedes Paar einer Map nacheinander bearbeiten – etwa eine Rangliste ausgeben. Dafür gibt es mehrere Wege. Am direktesten läufst du mit FOR EACH über die Map: Die Schleifenvariable bekommt dann nacheinander jeden SCHLÜSSEL, und über MAPGET holst du dir den passenden Wert.</w:t>
+      </w:r>
+    </w:p>
+    <w:p>
+      <w:pPr>
+        <w:spacing w:before="60"/>
+      </w:pPr>
+    </w:p>
+    <w:tbl>
+      <w:tblPr>
+        <w:tblW w:type="dxa" w:w="9360"/>
+        <w:tblBorders>
+          <w:top w:val="single" w:color="auto" w:sz="4"/>
+          <w:left w:val="single" w:color="auto" w:sz="4"/>
+          <w:bottom w:val="single" w:color="auto" w:sz="4"/>
+          <w:right w:val="single" w:color="auto" w:sz="4"/>
+          <w:insideH w:val="single" w:color="auto" w:sz="4"/>
+          <w:insideV w:val="single" w:color="auto" w:sz="4"/>
+        </w:tblBorders>
+      </w:tblPr>
+      <w:tblGrid>
+        <w:gridCol w:w="9360"/>
+      </w:tblGrid>
+      <w:tr>
+        <w:trPr>
+          <w:cantSplit/>
+        </w:trPr>
+        <w:tc>
+          <w:tcPr>
+            <w:tcW w:type="dxa" w:w="9360"/>
+            <w:tcBorders>
+              <w:top w:val="single" w:color="E0B96A" w:sz="6"/>
+              <w:left w:val="single" w:color="E0B96A" w:sz="6"/>
+              <w:bottom w:val="single" w:color="E0B96A" w:sz="6"/>
+              <w:right w:val="single" w:color="E0B96A" w:sz="6"/>
+            </w:tcBorders>
+            <w:shd w:fill="FDF3E0" w:val="clear"/>
+            <w:tcMar>
+              <w:top w:type="dxa" w:w="140"/>
+              <w:left w:type="dxa" w:w="180"/>
+              <w:bottom w:type="dxa" w:w="140"/>
+              <w:right w:type="dxa" w:w="180"/>
+            </w:tcMar>
+          </w:tcPr>
+          <w:p>
+            <w:pPr>
+              <w:spacing w:after="40"/>
+            </w:pPr>
+            <w:r>
+              <w:rPr>
+                <w:b/>
+                <w:bCs/>
+                <w:color w:val="9A6A1E"/>
+                <w:sz w:val="22"/>
+                <w:szCs w:val="22"/>
+              </w:rPr>
+              <w:t xml:space="preserve">Merke</w:t>
+            </w:r>
+          </w:p>
+          <w:p>
+            <w:pPr>
+              <w:spacing w:after="0" w:line="312" w:lineRule="auto"/>
+            </w:pPr>
+            <w:r>
+              <w:rPr>
+                <w:sz w:val="22"/>
+                <w:szCs w:val="22"/>
+              </w:rPr>
+              <w:t xml:space="preserve">Die Paare erscheinen in der Reihenfolge, in der du sie eingefügt hast – die erste eingefügte zuerst. Darauf kannst du dich verlassen.</w:t>
+            </w:r>
+          </w:p>
+        </w:tc>
+      </w:tr>
+    </w:tbl>
+    <w:p>
+      <w:pPr>
+        <w:spacing w:after="160"/>
+      </w:pPr>
+    </w:p>
+    <w:p>
+      <w:pPr>
+        <w:keepLines/>
+        <w:pBdr>
+          <w:left w:val="single" w:color="1B6CA8" w:sz="18" w:space="6"/>
+        </w:pBdr>
+        <w:shd w:fill="F4F4F4" w:val="clear"/>
+        <w:spacing w:after="200" w:before="100" w:line="264" w:lineRule="auto"/>
+        <w:ind w:left="140"/>
+      </w:pPr>
+      <w:r>
+        <w:rPr>
+          <w:rFonts w:ascii="Consolas" w:cs="Consolas" w:eastAsia="Consolas" w:hAnsi="Consolas"/>
+          <w:sz w:val="19"/>
+          <w:szCs w:val="19"/>
+        </w:rPr>
+        <w:t xml:space="preserve">DIM punkte AS MAP OF INTEGER</w:t>
+      </w:r>
+      <w:r>
+        <w:rPr>
+          <w:rFonts w:ascii="Consolas" w:cs="Consolas" w:eastAsia="Consolas" w:hAnsi="Consolas"/>
+          <w:sz w:val="19"/>
+          <w:szCs w:val="19"/>
+        </w:rPr>
+        <w:br/>
+        <w:t xml:space="preserve">MAPPUT(punkte, "Anna", 95)</w:t>
+      </w:r>
+      <w:r>
+        <w:rPr>
+          <w:rFonts w:ascii="Consolas" w:cs="Consolas" w:eastAsia="Consolas" w:hAnsi="Consolas"/>
+          <w:sz w:val="19"/>
+          <w:szCs w:val="19"/>
+        </w:rPr>
+        <w:br/>
+        <w:t xml:space="preserve">MAPPUT(punkte, "Bert", 78)</w:t>
+      </w:r>
+      <w:r>
+        <w:rPr>
+          <w:rFonts w:ascii="Consolas" w:cs="Consolas" w:eastAsia="Consolas" w:hAnsi="Consolas"/>
+          <w:sz w:val="19"/>
+          <w:szCs w:val="19"/>
+        </w:rPr>
+        <w:br/>
+        <w:t xml:space="preserve">MAPPUT(punkte, "Cilly", 99)</w:t>
+      </w:r>
+      <w:r>
+        <w:rPr>
+          <w:rFonts w:ascii="Consolas" w:cs="Consolas" w:eastAsia="Consolas" w:hAnsi="Consolas"/>
+          <w:sz w:val="19"/>
+          <w:szCs w:val="19"/>
+        </w:rPr>
+        <w:br/>
+        <w:t xml:space="preserve"/>
+      </w:r>
+      <w:r>
+        <w:rPr>
+          <w:rFonts w:ascii="Consolas" w:cs="Consolas" w:eastAsia="Consolas" w:hAnsi="Consolas"/>
+          <w:sz w:val="19"/>
+          <w:szCs w:val="19"/>
+        </w:rPr>
+        <w:br/>
+        <w:t xml:space="preserve">FOR EACH name IN punkte</w:t>
+      </w:r>
+      <w:r>
+        <w:rPr>
+          <w:rFonts w:ascii="Consolas" w:cs="Consolas" w:eastAsia="Consolas" w:hAnsi="Consolas"/>
+          <w:sz w:val="19"/>
+          <w:szCs w:val="19"/>
+        </w:rPr>
+        <w:br/>
+        <w:t xml:space="preserve">    PRINT name; ": "; MAPGET(punkte, name)</w:t>
+      </w:r>
+      <w:r>
+        <w:rPr>
+          <w:rFonts w:ascii="Consolas" w:cs="Consolas" w:eastAsia="Consolas" w:hAnsi="Consolas"/>
+          <w:sz w:val="19"/>
+          <w:szCs w:val="19"/>
+        </w:rPr>
+        <w:br/>
+        <w:t xml:space="preserve">NEXT</w:t>
+      </w:r>
+    </w:p>
+    <w:p>
+      <w:pPr>
+        <w:keepLines/>
+        <w:pBdr>
+          <w:left w:val="single" w:color="9AC79A" w:sz="18" w:space="6"/>
+        </w:pBdr>
+        <w:shd w:fill="EAF4EA" w:val="clear"/>
+        <w:spacing w:after="200" w:before="100" w:line="264" w:lineRule="auto"/>
+        <w:ind w:left="140"/>
+      </w:pPr>
+      <w:r>
+        <w:rPr>
+          <w:rFonts w:ascii="Consolas" w:cs="Consolas" w:eastAsia="Consolas" w:hAnsi="Consolas"/>
+          <w:sz w:val="19"/>
+          <w:szCs w:val="19"/>
+        </w:rPr>
+        <w:t xml:space="preserve">Anna: 95</w:t>
+      </w:r>
+      <w:r>
+        <w:rPr>
+          <w:rFonts w:ascii="Consolas" w:cs="Consolas" w:eastAsia="Consolas" w:hAnsi="Consolas"/>
+          <w:sz w:val="19"/>
+          <w:szCs w:val="19"/>
+        </w:rPr>
+        <w:br/>
+        <w:t xml:space="preserve">Bert: 78</w:t>
+      </w:r>
+      <w:r>
+        <w:rPr>
+          <w:rFonts w:ascii="Consolas" w:cs="Consolas" w:eastAsia="Consolas" w:hAnsi="Consolas"/>
+          <w:sz w:val="19"/>
+          <w:szCs w:val="19"/>
+        </w:rPr>
+        <w:br/>
+        <w:t xml:space="preserve">Cilly: 99</w:t>
+      </w:r>
+    </w:p>
+    <w:p>
+      <w:pPr>
+        <w:spacing w:after="180" w:line="312" w:lineRule="auto"/>
+      </w:pPr>
+      <w:r>
+        <w:rPr>
+          <w:sz w:val="22"/>
+          <w:szCs w:val="22"/>
+        </w:rPr>
+        <w:t xml:space="preserve">Brauchst du die Schlüssel als Array (etwa um sie zu sortieren), liefert sie dir MAPKEYS. MAPVALUES gibt entsprechend alle Werte, und MAPITEMS alle Paare als kleine Zweier-Bündel (Tupel) aus Schlüssel und Wert:</w:t>
+      </w:r>
+    </w:p>
+    <w:p>
+      <w:pPr>
+        <w:keepNext/>
+        <w:keepLines/>
+        <w:pBdr>
+          <w:bottom w:val="single" w:color="DDD0C0" w:sz="4" w:space="2"/>
+        </w:pBdr>
+        <w:spacing w:after="40" w:before="360"/>
+      </w:pPr>
+      <w:r>
+        <w:rPr>
+          <w:rFonts w:ascii="Consolas" w:cs="Consolas" w:eastAsia="Consolas" w:hAnsi="Consolas"/>
+          <w:b/>
+          <w:bCs/>
+          <w:color w:val="9A3412"/>
+          <w:sz w:val="24"/>
+          <w:szCs w:val="24"/>
+        </w:rPr>
+        <w:t xml:space="preserve">MAPKEYS / MAPVALUES / MAPITEMS</w:t>
+      </w:r>
+    </w:p>
+    <w:p>
+      <w:pPr>
+        <w:keepNext/>
+        <w:spacing w:after="120"/>
+      </w:pPr>
+      <w:r>
+        <w:rPr>
+          <w:b/>
+          <w:bCs/>
+          <w:color w:val="6A6A6A"/>
+          <w:sz w:val="18"/>
+          <w:szCs w:val="18"/>
+        </w:rPr>
+        <w:t xml:space="preserve">Syntax:  </w:t>
+      </w:r>
+      <w:r>
+        <w:rPr>
+          <w:rFonts w:ascii="Consolas" w:cs="Consolas" w:eastAsia="Consolas" w:hAnsi="Consolas"/>
+          <w:color w:val="335577"/>
+          <w:sz w:val="19"/>
+          <w:szCs w:val="19"/>
+        </w:rPr>
+        <w:t xml:space="preserve">MAPKEYS(m)   MAPVALUES(m)   MAPITEMS(m)</w:t>
+      </w:r>
+    </w:p>
+    <w:p>
+      <w:pPr>
+        <w:spacing w:after="180" w:line="312" w:lineRule="auto"/>
+      </w:pPr>
+      <w:r>
+        <w:rPr>
+          <w:sz w:val="22"/>
+          <w:szCs w:val="22"/>
+        </w:rPr>
+        <w:t xml:space="preserve">MAPKEYS liefert ein Array aller Schlüssel, MAPVALUES ein Array aller Werte, MAPITEMS ein Array von (Schlüssel, Wert)-Tupeln. Alle in Einfüge-Reihenfolge.</w:t>
+      </w:r>
+    </w:p>
+    <w:p>
+      <w:pPr>
+        <w:keepNext/>
+        <w:spacing w:after="30" w:before="120"/>
+      </w:pPr>
+      <w:r>
+        <w:rPr>
+          <w:b/>
+          <w:bCs/>
+          <w:i/>
+          <w:iCs/>
+          <w:color w:val="6A6A6A"/>
+          <w:sz w:val="18"/>
+          <w:szCs w:val="18"/>
+        </w:rPr>
+        <w:t xml:space="preserve">Beispiel</w:t>
+      </w:r>
+    </w:p>
+    <w:p>
+      <w:pPr>
+        <w:keepLines/>
+        <w:pBdr>
+          <w:left w:val="single" w:color="1B6CA8" w:sz="18" w:space="6"/>
+        </w:pBdr>
+        <w:shd w:fill="F4F4F4" w:val="clear"/>
+        <w:spacing w:after="200" w:before="100" w:line="264" w:lineRule="auto"/>
+        <w:ind w:left="140"/>
+      </w:pPr>
+      <w:r>
+        <w:rPr>
+          <w:rFonts w:ascii="Consolas" w:cs="Consolas" w:eastAsia="Consolas" w:hAnsi="Consolas"/>
+          <w:sz w:val="19"/>
+          <w:szCs w:val="19"/>
+        </w:rPr>
+        <w:t xml:space="preserve">DIM lager AS MAP OF INTEGER</w:t>
+      </w:r>
+      <w:r>
+        <w:rPr>
+          <w:rFonts w:ascii="Consolas" w:cs="Consolas" w:eastAsia="Consolas" w:hAnsi="Consolas"/>
+          <w:sz w:val="19"/>
+          <w:szCs w:val="19"/>
+        </w:rPr>
+        <w:br/>
+        <w:t xml:space="preserve">MAPPUT(lager, "Holz", 5)</w:t>
+      </w:r>
+      <w:r>
+        <w:rPr>
+          <w:rFonts w:ascii="Consolas" w:cs="Consolas" w:eastAsia="Consolas" w:hAnsi="Consolas"/>
+          <w:sz w:val="19"/>
+          <w:szCs w:val="19"/>
+        </w:rPr>
+        <w:br/>
+        <w:t xml:space="preserve">MAPPUT(lager, "Stein", 3)</w:t>
+      </w:r>
+      <w:r>
+        <w:rPr>
+          <w:rFonts w:ascii="Consolas" w:cs="Consolas" w:eastAsia="Consolas" w:hAnsi="Consolas"/>
+          <w:sz w:val="19"/>
+          <w:szCs w:val="19"/>
+        </w:rPr>
+        <w:br/>
+        <w:t xml:space="preserve"/>
+      </w:r>
+      <w:r>
+        <w:rPr>
+          <w:rFonts w:ascii="Consolas" w:cs="Consolas" w:eastAsia="Consolas" w:hAnsi="Consolas"/>
+          <w:sz w:val="19"/>
+          <w:szCs w:val="19"/>
+        </w:rPr>
+        <w:br/>
+        <w:t xml:space="preserve">FOR EACH paar IN MAPITEMS(lager)</w:t>
+      </w:r>
+      <w:r>
+        <w:rPr>
+          <w:rFonts w:ascii="Consolas" w:cs="Consolas" w:eastAsia="Consolas" w:hAnsi="Consolas"/>
+          <w:sz w:val="19"/>
+          <w:szCs w:val="19"/>
+        </w:rPr>
+        <w:br/>
+        <w:t xml:space="preserve">    PRINT paar[0]; " -&gt; "; paar[1]</w:t>
+      </w:r>
+      <w:r>
+        <w:rPr>
+          <w:rFonts w:ascii="Consolas" w:cs="Consolas" w:eastAsia="Consolas" w:hAnsi="Consolas"/>
+          <w:sz w:val="19"/>
+          <w:szCs w:val="19"/>
+        </w:rPr>
+        <w:br/>
+        <w:t xml:space="preserve">NEXT</w:t>
+      </w:r>
+    </w:p>
+    <w:p>
+      <w:pPr>
+        <w:keepNext/>
+        <w:spacing w:after="30" w:before="120"/>
+      </w:pPr>
+      <w:r>
+        <w:rPr>
+          <w:b/>
+          <w:bCs/>
+          <w:i/>
+          <w:iCs/>
+          <w:color w:val="6A6A6A"/>
+          <w:sz w:val="18"/>
+          <w:szCs w:val="18"/>
+        </w:rPr>
+        <w:t xml:space="preserve">Ausgabe</w:t>
+      </w:r>
+    </w:p>
+    <w:p>
+      <w:pPr>
+        <w:keepLines/>
+        <w:pBdr>
+          <w:left w:val="single" w:color="9AC79A" w:sz="18" w:space="6"/>
+        </w:pBdr>
+        <w:shd w:fill="EAF4EA" w:val="clear"/>
+        <w:spacing w:after="200" w:before="100" w:line="264" w:lineRule="auto"/>
+        <w:ind w:left="140"/>
+      </w:pPr>
+      <w:r>
+        <w:rPr>
+          <w:rFonts w:ascii="Consolas" w:cs="Consolas" w:eastAsia="Consolas" w:hAnsi="Consolas"/>
+          <w:sz w:val="19"/>
+          <w:szCs w:val="19"/>
+        </w:rPr>
+        <w:t xml:space="preserve">Holz -&gt; 5</w:t>
+      </w:r>
+      <w:r>
+        <w:rPr>
+          <w:rFonts w:ascii="Consolas" w:cs="Consolas" w:eastAsia="Consolas" w:hAnsi="Consolas"/>
+          <w:sz w:val="19"/>
+          <w:szCs w:val="19"/>
+        </w:rPr>
+        <w:br/>
+        <w:t xml:space="preserve">Stein -&gt; 3</w:t>
+      </w:r>
+    </w:p>
+    <w:p>
+      <w:pPr>
+        <w:spacing w:after="180" w:line="312" w:lineRule="auto"/>
+      </w:pPr>
+      <w:r>
+        <w:rPr>
+          <w:sz w:val="22"/>
+          <w:szCs w:val="22"/>
+        </w:rPr>
+        <w:t xml:space="preserve">In paar[0] steckt jeweils der Schlüssel, in paar[1] der Wert – die beiden Hälften des Paares.</w:t>
+      </w:r>
+    </w:p>
+    <w:p>
+      <w:pPr>
+        <w:pStyle w:val="Heading2"/>
+        <w:keepNext/>
+        <w:keepLines/>
+        <w:spacing w:after="120" w:before="280"/>
+      </w:pPr>
+      <w:r>
+        <w:t xml:space="preserve">Auch als Methode aufrufbar</w:t>
+      </w:r>
+    </w:p>
+    <w:p>
+      <w:pPr>
+        <w:spacing w:after="180" w:line="312" w:lineRule="auto"/>
+      </w:pPr>
+      <w:r>
+        <w:rPr>
+          <w:sz w:val="22"/>
+          <w:szCs w:val="22"/>
+        </w:rPr>
+        <w:t xml:space="preserve">Wie bei Strings gibt es die meisten Map-Befehle auch in Punkt-Schreibweise, direkt an die Map gehängt. Welche Form du nimmst, ist Geschmackssache – sie tun dasselbe.</w:t>
+      </w:r>
+    </w:p>
+    <w:p>
+      <w:pPr>
+        <w:keepLines/>
+        <w:pBdr>
+          <w:left w:val="single" w:color="1B6CA8" w:sz="18" w:space="6"/>
+        </w:pBdr>
+        <w:shd w:fill="F4F4F4" w:val="clear"/>
+        <w:spacing w:after="200" w:before="100" w:line="264" w:lineRule="auto"/>
+        <w:ind w:left="140"/>
+      </w:pPr>
+      <w:r>
+        <w:rPr>
+          <w:rFonts w:ascii="Consolas" w:cs="Consolas" w:eastAsia="Consolas" w:hAnsi="Consolas"/>
+          <w:sz w:val="19"/>
+          <w:szCs w:val="19"/>
+        </w:rPr>
+        <w:t xml:space="preserve">DIM lager AS MAP OF INTEGER</w:t>
+      </w:r>
+      <w:r>
+        <w:rPr>
+          <w:rFonts w:ascii="Consolas" w:cs="Consolas" w:eastAsia="Consolas" w:hAnsi="Consolas"/>
+          <w:sz w:val="19"/>
+          <w:szCs w:val="19"/>
+        </w:rPr>
+        <w:br/>
+        <w:t xml:space="preserve">lager.put("Holz", 5)</w:t>
+      </w:r>
+      <w:r>
+        <w:rPr>
+          <w:rFonts w:ascii="Consolas" w:cs="Consolas" w:eastAsia="Consolas" w:hAnsi="Consolas"/>
+          <w:sz w:val="19"/>
+          <w:szCs w:val="19"/>
+        </w:rPr>
+        <w:br/>
+        <w:t xml:space="preserve">PRINT lager.get("Holz")</w:t>
+      </w:r>
+      <w:r>
+        <w:rPr>
+          <w:rFonts w:ascii="Consolas" w:cs="Consolas" w:eastAsia="Consolas" w:hAnsi="Consolas"/>
+          <w:sz w:val="19"/>
+          <w:szCs w:val="19"/>
+        </w:rPr>
+        <w:br/>
+        <w:t xml:space="preserve">PRINT lager.has("Stein")</w:t>
+      </w:r>
+      <w:r>
+        <w:rPr>
+          <w:rFonts w:ascii="Consolas" w:cs="Consolas" w:eastAsia="Consolas" w:hAnsi="Consolas"/>
+          <w:sz w:val="19"/>
+          <w:szCs w:val="19"/>
+        </w:rPr>
+        <w:br/>
+        <w:t xml:space="preserve">PRINT lager.getor("Gold", 0)</w:t>
+      </w:r>
+      <w:r>
+        <w:rPr>
+          <w:rFonts w:ascii="Consolas" w:cs="Consolas" w:eastAsia="Consolas" w:hAnsi="Consolas"/>
+          <w:sz w:val="19"/>
+          <w:szCs w:val="19"/>
+        </w:rPr>
+        <w:br/>
+        <w:t xml:space="preserve">PRINT lager.size()</w:t>
+      </w:r>
+    </w:p>
+    <w:p>
+      <w:pPr>
+        <w:keepLines/>
+        <w:pBdr>
+          <w:left w:val="single" w:color="9AC79A" w:sz="18" w:space="6"/>
+        </w:pBdr>
+        <w:shd w:fill="EAF4EA" w:val="clear"/>
+        <w:spacing w:after="200" w:before="100" w:line="264" w:lineRule="auto"/>
+        <w:ind w:left="140"/>
+      </w:pPr>
+      <w:r>
+        <w:rPr>
+          <w:rFonts w:ascii="Consolas" w:cs="Consolas" w:eastAsia="Consolas" w:hAnsi="Consolas"/>
+          <w:sz w:val="19"/>
+          <w:szCs w:val="19"/>
+        </w:rPr>
+        <w:t xml:space="preserve">5</w:t>
+      </w:r>
+      <w:r>
+        <w:rPr>
+          <w:rFonts w:ascii="Consolas" w:cs="Consolas" w:eastAsia="Consolas" w:hAnsi="Consolas"/>
+          <w:sz w:val="19"/>
+          <w:szCs w:val="19"/>
+        </w:rPr>
+        <w:br/>
+        <w:t xml:space="preserve">FALSE</w:t>
+      </w:r>
+      <w:r>
+        <w:rPr>
+          <w:rFonts w:ascii="Consolas" w:cs="Consolas" w:eastAsia="Consolas" w:hAnsi="Consolas"/>
+          <w:sz w:val="19"/>
+          <w:szCs w:val="19"/>
+        </w:rPr>
+        <w:br/>
+        <w:t xml:space="preserve">0</w:t>
+      </w:r>
+      <w:r>
+        <w:rPr>
+          <w:rFonts w:ascii="Consolas" w:cs="Consolas" w:eastAsia="Consolas" w:hAnsi="Consolas"/>
+          <w:sz w:val="19"/>
+          <w:szCs w:val="19"/>
+        </w:rPr>
+        <w:br/>
+        <w:t xml:space="preserve">1</w:t>
+      </w:r>
+    </w:p>
+    <w:p>
+      <w:pPr>
+        <w:pStyle w:val="Heading2"/>
+        <w:keepNext/>
+        <w:keepLines/>
+        <w:spacing w:after="120" w:before="280"/>
+      </w:pPr>
+      <w:r>
+        <w:t xml:space="preserve">Was, wenn der Schlüssel eine Zahl ist?</w:t>
+      </w:r>
+    </w:p>
+    <w:p>
+      <w:pPr>
+        <w:spacing w:after="180" w:line="312" w:lineRule="auto"/>
+      </w:pPr>
+      <w:r>
+        <w:rPr>
+          <w:sz w:val="22"/>
+          <w:szCs w:val="22"/>
+        </w:rPr>
+        <w:t xml:space="preserve">Map-Schlüssel müssen Strings sein. Willst du trotzdem über eine Zahl nachschlagen – etwa einen Wert pro Spieler-Nummer zwischenspeichern – wandle die Zahl einfach mit STR$ in einen String um. Das ist ein häufiges Muster, zum Beispiel bei einem Zwischenspeicher (Cache), der schon berechnete Ergebnisse merkt, damit sie nicht doppelt berechnet werden müssen:</w:t>
+      </w:r>
+    </w:p>
+    <w:p>
+      <w:pPr>
+        <w:keepLines/>
+        <w:pBdr>
+          <w:left w:val="single" w:color="1B6CA8" w:sz="18" w:space="6"/>
+        </w:pBdr>
+        <w:shd w:fill="F4F4F4" w:val="clear"/>
+        <w:spacing w:after="200" w:before="100" w:line="264" w:lineRule="auto"/>
+        <w:ind w:left="140"/>
+      </w:pPr>
+      <w:r>
+        <w:rPr>
+          <w:rFonts w:ascii="Consolas" w:cs="Consolas" w:eastAsia="Consolas" w:hAnsi="Consolas"/>
+          <w:sz w:val="19"/>
+          <w:szCs w:val="19"/>
+        </w:rPr>
+        <w:t xml:space="preserve">DIM cache AS MAP OF INTEGER</w:t>
+      </w:r>
+      <w:r>
+        <w:rPr>
+          <w:rFonts w:ascii="Consolas" w:cs="Consolas" w:eastAsia="Consolas" w:hAnsi="Consolas"/>
+          <w:sz w:val="19"/>
+          <w:szCs w:val="19"/>
+        </w:rPr>
+        <w:br/>
+        <w:t xml:space="preserve">DIM n AS INTEGER</w:t>
+      </w:r>
+      <w:r>
+        <w:rPr>
+          <w:rFonts w:ascii="Consolas" w:cs="Consolas" w:eastAsia="Consolas" w:hAnsi="Consolas"/>
+          <w:sz w:val="19"/>
+          <w:szCs w:val="19"/>
+        </w:rPr>
+        <w:br/>
+        <w:t xml:space="preserve">n = 12</w:t>
+      </w:r>
+      <w:r>
+        <w:rPr>
+          <w:rFonts w:ascii="Consolas" w:cs="Consolas" w:eastAsia="Consolas" w:hAnsi="Consolas"/>
+          <w:sz w:val="19"/>
+          <w:szCs w:val="19"/>
+        </w:rPr>
+        <w:br/>
+        <w:t xml:space="preserve"/>
+      </w:r>
+      <w:r>
+        <w:rPr>
+          <w:rFonts w:ascii="Consolas" w:cs="Consolas" w:eastAsia="Consolas" w:hAnsi="Consolas"/>
+          <w:sz w:val="19"/>
+          <w:szCs w:val="19"/>
+        </w:rPr>
+        <w:br/>
+        <w:t xml:space="preserve">IF MAPHAS(cache, STR$(n)) THEN</w:t>
+      </w:r>
+      <w:r>
+        <w:rPr>
+          <w:rFonts w:ascii="Consolas" w:cs="Consolas" w:eastAsia="Consolas" w:hAnsi="Consolas"/>
+          <w:sz w:val="19"/>
+          <w:szCs w:val="19"/>
+        </w:rPr>
+        <w:br/>
+        <w:t xml:space="preserve">    PRINT "schon bekannt"</w:t>
+      </w:r>
+      <w:r>
+        <w:rPr>
+          <w:rFonts w:ascii="Consolas" w:cs="Consolas" w:eastAsia="Consolas" w:hAnsi="Consolas"/>
+          <w:sz w:val="19"/>
+          <w:szCs w:val="19"/>
+        </w:rPr>
+        <w:br/>
+        <w:t xml:space="preserve">ELSE</w:t>
+      </w:r>
+      <w:r>
+        <w:rPr>
+          <w:rFonts w:ascii="Consolas" w:cs="Consolas" w:eastAsia="Consolas" w:hAnsi="Consolas"/>
+          <w:sz w:val="19"/>
+          <w:szCs w:val="19"/>
+        </w:rPr>
+        <w:br/>
+        <w:t xml:space="preserve">    MAPPUT(cache, STR$(n), n * n)</w:t>
+      </w:r>
+      <w:r>
+        <w:rPr>
+          <w:rFonts w:ascii="Consolas" w:cs="Consolas" w:eastAsia="Consolas" w:hAnsi="Consolas"/>
+          <w:sz w:val="19"/>
+          <w:szCs w:val="19"/>
+        </w:rPr>
+        <w:br/>
+        <w:t xml:space="preserve">    PRINT "berechnet: "; MAPGET(cache, STR$(n))</w:t>
+      </w:r>
+      <w:r>
+        <w:rPr>
+          <w:rFonts w:ascii="Consolas" w:cs="Consolas" w:eastAsia="Consolas" w:hAnsi="Consolas"/>
+          <w:sz w:val="19"/>
+          <w:szCs w:val="19"/>
+        </w:rPr>
+        <w:br/>
+        <w:t xml:space="preserve">END IF</w:t>
+      </w:r>
+    </w:p>
+    <w:p>
+      <w:pPr>
+        <w:keepLines/>
+        <w:pBdr>
+          <w:left w:val="single" w:color="9AC79A" w:sz="18" w:space="6"/>
+        </w:pBdr>
+        <w:shd w:fill="EAF4EA" w:val="clear"/>
+        <w:spacing w:after="200" w:before="100" w:line="264" w:lineRule="auto"/>
+        <w:ind w:left="140"/>
+      </w:pPr>
+      <w:r>
+        <w:rPr>
+          <w:rFonts w:ascii="Consolas" w:cs="Consolas" w:eastAsia="Consolas" w:hAnsi="Consolas"/>
+          <w:sz w:val="19"/>
+          <w:szCs w:val="19"/>
+        </w:rPr>
+        <w:t xml:space="preserve">berechnet: 144</w:t>
+      </w:r>
+    </w:p>
+    <w:p>
+      <w:pPr>
+        <w:spacing w:before="60"/>
+      </w:pPr>
+    </w:p>
+    <w:tbl>
+      <w:tblPr>
+        <w:tblW w:type="dxa" w:w="9360"/>
+        <w:tblBorders>
+          <w:top w:val="single" w:color="auto" w:sz="4"/>
+          <w:left w:val="single" w:color="auto" w:sz="4"/>
+          <w:bottom w:val="single" w:color="auto" w:sz="4"/>
+          <w:right w:val="single" w:color="auto" w:sz="4"/>
+          <w:insideH w:val="single" w:color="auto" w:sz="4"/>
+          <w:insideV w:val="single" w:color="auto" w:sz="4"/>
+        </w:tblBorders>
+      </w:tblPr>
+      <w:tblGrid>
+        <w:gridCol w:w="9360"/>
+      </w:tblGrid>
+      <w:tr>
+        <w:trPr>
+          <w:cantSplit/>
+        </w:trPr>
+        <w:tc>
+          <w:tcPr>
+            <w:tcW w:type="dxa" w:w="9360"/>
+            <w:tcBorders>
+              <w:top w:val="single" w:color="E0A0A0" w:sz="6"/>
+              <w:left w:val="single" w:color="E0A0A0" w:sz="6"/>
+              <w:bottom w:val="single" w:color="E0A0A0" w:sz="6"/>
+              <w:right w:val="single" w:color="E0A0A0" w:sz="6"/>
+            </w:tcBorders>
+            <w:shd w:fill="FBEAEA" w:val="clear"/>
+            <w:tcMar>
+              <w:top w:type="dxa" w:w="140"/>
+              <w:left w:type="dxa" w:w="180"/>
+              <w:bottom w:type="dxa" w:w="140"/>
+              <w:right w:type="dxa" w:w="180"/>
+            </w:tcMar>
+          </w:tcPr>
+          <w:p>
+            <w:pPr>
+              <w:spacing w:after="40"/>
+            </w:pPr>
+            <w:r>
+              <w:rPr>
+                <w:b/>
+                <w:bCs/>
+                <w:color w:val="B23030"/>
+                <w:sz w:val="22"/>
+                <w:szCs w:val="22"/>
+              </w:rPr>
+              <w:t xml:space="preserve">Achtung</w:t>
+            </w:r>
+          </w:p>
+          <w:p>
+            <w:pPr>
+              <w:spacing w:after="0" w:line="312" w:lineRule="auto"/>
+            </w:pPr>
+            <w:r>
+              <w:rPr>
+                <w:sz w:val="22"/>
+                <w:szCs w:val="22"/>
+              </w:rPr>
+              <w:t xml:space="preserve">Wie ein Array ist eine Map ein Verweis-Wert: Schreibst du b = a, zeigen danach beide Namen auf DIESELBE Map – eine Änderung über b wirkt auch auf a. Das ist derselbe Stolperstein wie bei Arrays (siehe Kapitel „Arrays“). Brauchst du eine echte Kopie, baue sie dir mit einer Schleife über MAPITEMS neu auf.</w:t>
+            </w:r>
+          </w:p>
+        </w:tc>
+      </w:tr>
+    </w:tbl>
+    <w:p>
+      <w:pPr>
+        <w:spacing w:after="160"/>
+      </w:pPr>
+    </w:p>
+    <w:p>
+      <w:pPr>
+        <w:spacing w:before="60"/>
+      </w:pPr>
+    </w:p>
+    <w:tbl>
+      <w:tblPr>
+        <w:tblW w:type="dxa" w:w="9360"/>
+        <w:tblBorders>
+          <w:top w:val="single" w:color="auto" w:sz="4"/>
+          <w:left w:val="single" w:color="auto" w:sz="4"/>
+          <w:bottom w:val="single" w:color="auto" w:sz="4"/>
+          <w:right w:val="single" w:color="auto" w:sz="4"/>
+          <w:insideH w:val="single" w:color="auto" w:sz="4"/>
+          <w:insideV w:val="single" w:color="auto" w:sz="4"/>
+        </w:tblBorders>
+      </w:tblPr>
+      <w:tblGrid>
+        <w:gridCol w:w="9360"/>
+      </w:tblGrid>
+      <w:tr>
+        <w:trPr>
+          <w:cantSplit/>
+        </w:trPr>
+        <w:tc>
+          <w:tcPr>
+            <w:tcW w:type="dxa" w:w="9360"/>
+            <w:tcBorders>
+              <w:top w:val="single" w:color="9CC8E6" w:sz="6"/>
+              <w:left w:val="single" w:color="9CC8E6" w:sz="6"/>
+              <w:bottom w:val="single" w:color="9CC8E6" w:sz="6"/>
+              <w:right w:val="single" w:color="9CC8E6" w:sz="6"/>
+            </w:tcBorders>
+            <w:shd w:fill="E7F2FA" w:val="clear"/>
+            <w:tcMar>
+              <w:top w:type="dxa" w:w="140"/>
+              <w:left w:type="dxa" w:w="180"/>
+              <w:bottom w:type="dxa" w:w="140"/>
+              <w:right w:type="dxa" w:w="180"/>
+            </w:tcMar>
+          </w:tcPr>
+          <w:p>
+            <w:pPr>
+              <w:spacing w:after="40"/>
+            </w:pPr>
+            <w:r>
+              <w:rPr>
+                <w:b/>
+                <w:bCs/>
+                <w:color w:val="1B6CA8"/>
+                <w:sz w:val="22"/>
+                <w:szCs w:val="22"/>
+              </w:rPr>
+              <w:t xml:space="preserve">Array oder Map?</w:t>
+            </w:r>
+          </w:p>
+          <w:p>
+            <w:pPr>
+              <w:spacing w:after="0" w:line="312" w:lineRule="auto"/>
+            </w:pPr>
+            <w:r>
+              <w:rPr>
+                <w:sz w:val="22"/>
+                <w:szCs w:val="22"/>
+              </w:rPr>
+              <w:t xml:space="preserve">Frag dich, wie du an deine Werte heran willst. Über eine laufende Nummer und in fester Reihenfolge? → Array. Über einen sprechenden Namen? → Map. Beide lassen sich übrigens kombinieren: eine MAP OF (ARRAY …) oder ein Array von Maps ist völlig in Ordnung.</w:t>
             </w:r>
           </w:p>
         </w:tc>

</xml_diff>

<commit_message>
docs(buch): Lehrbuch Kap 19 -- Tupel & Destructuring
Tupel-Literal (>=2 Elemente, gemischte Typen), Index/length, Unveraender-
lichkeit, Destructuring-Zuweisung (a,b)=tupel mit Anzahl-Pruefung, mehrere
Rueckgabewerte per Tupel, Tausch-Trick, FOR EACH. Tupel-vs-Array-Abgrenzung.
Alle Beispiel-Ausgaben gegen gbrt verifiziert.

Co-Authored-By: Claude Opus 4.8 (1M context) <noreply@anthropic.com>
</commit_message>
<xml_diff>
--- a/buch-referenz/buch/GameBasic-Lehrbuch.docx
+++ b/buch-referenz/buch/GameBasic-Lehrbuch.docx
@@ -489,6 +489,33 @@
           <w:szCs w:val="22"/>
         </w:rPr>
         <w:t xml:space="preserve">	7</w:t>
+      </w:r>
+    </w:p>
+    <w:p>
+      <w:pPr>
+        <w:tabs>
+          <w:tab w:val="right" w:pos="9200" w:leader="dot"/>
+        </w:tabs>
+        <w:spacing w:after="20" w:before="0"/>
+        <w:ind w:left="280"/>
+      </w:pPr>
+      <w:r>
+        <w:rPr>
+          <w:b w:val="false"/>
+          <w:bCs w:val="false"/>
+          <w:color w:val="222222"/>
+          <w:sz w:val="22"/>
+          <w:szCs w:val="22"/>
+        </w:rPr>
+        <w:t xml:space="preserve">Tupel &amp; Destructuring</w:t>
+      </w:r>
+      <w:r>
+        <w:rPr>
+          <w:color w:val="555555"/>
+          <w:sz w:val="22"/>
+          <w:szCs w:val="22"/>
+        </w:rPr>
+        <w:t xml:space="preserve">	36</w:t>
       </w:r>
     </w:p>
     <w:p>
@@ -18197,6 +18224,1156 @@
                 <w:szCs w:val="22"/>
               </w:rPr>
               <w:t xml:space="preserve">Frag dich, wie du an deine Werte heran willst. Über eine laufende Nummer und in fester Reihenfolge? → Array. Über einen sprechenden Namen? → Map. Beide lassen sich übrigens kombinieren: eine MAP OF (ARRAY …) oder ein Array von Maps ist völlig in Ordnung.</w:t>
+            </w:r>
+          </w:p>
+        </w:tc>
+      </w:tr>
+    </w:tbl>
+    <w:p>
+      <w:pPr>
+        <w:spacing w:after="160"/>
+      </w:pPr>
+    </w:p>
+    <w:p>
+      <w:pPr>
+        <w:pStyle w:val="Heading1"/>
+        <w:keepNext/>
+        <w:keepLines/>
+        <w:pageBreakBefore/>
+        <w:pBdr>
+          <w:bottom w:val="single" w:color="1B6CA8" w:sz="12" w:space="4"/>
+        </w:pBdr>
+        <w:spacing w:after="160" w:before="0"/>
+      </w:pPr>
+      <w:r>
+        <w:t xml:space="preserve">Tupel &amp; Destructuring</w:t>
+      </w:r>
+    </w:p>
+    <w:p>
+      <w:pPr>
+        <w:spacing w:after="180" w:line="312" w:lineRule="auto"/>
+      </w:pPr>
+      <w:r>
+        <w:rPr>
+          <w:sz w:val="22"/>
+          <w:szCs w:val="22"/>
+        </w:rPr>
+        <w:t xml:space="preserve">Ein Tupel ist ein festes Bündel aus mehreren Werten, die zusammengehören – etwa die x- und y-Koordinate eines Punktes, oder ein Name zusammen mit einem Alter. Du schreibst die Werte einfach durch Kommas getrennt in runde Klammern. Anders als ein Array darf ein Tupel Werte unterschiedlichen Typs enthalten, und es hat eine feste Größe, die sich nie ändert.</w:t>
+      </w:r>
+    </w:p>
+    <w:p>
+      <w:pPr>
+        <w:spacing w:after="180" w:line="312" w:lineRule="auto"/>
+      </w:pPr>
+      <w:r>
+        <w:rPr>
+          <w:sz w:val="22"/>
+          <w:szCs w:val="22"/>
+        </w:rPr>
+        <w:t xml:space="preserve">Tupel glänzen vor allem in zwei Situationen: Sie lassen eine Funktion mehrere Ergebnisse auf einmal zurückgeben, und sie lassen sich beim Zuweisen elegant wieder in einzelne Variablen zerlegen. Diese Zerlegung heißt Destructuring – sie ist der eigentliche Star dieses Kapitels.</w:t>
+      </w:r>
+    </w:p>
+    <w:p>
+      <w:pPr>
+        <w:pStyle w:val="Heading2"/>
+        <w:keepNext/>
+        <w:keepLines/>
+        <w:spacing w:after="120" w:before="280"/>
+      </w:pPr>
+      <w:r>
+        <w:t xml:space="preserve">Ein Tupel bauen</w:t>
+      </w:r>
+    </w:p>
+    <w:p>
+      <w:pPr>
+        <w:spacing w:after="180" w:line="312" w:lineRule="auto"/>
+      </w:pPr>
+      <w:r>
+        <w:rPr>
+          <w:sz w:val="22"/>
+          <w:szCs w:val="22"/>
+        </w:rPr>
+        <w:t xml:space="preserve">Ein Tupel-Literal ist eine Liste von mindestens zwei Werten in runden Klammern. Du legst es in einer Variablen vom Typ TUPLE ab. Auf die einzelnen Werte greifst du wie bei einem Array über einen Index zu (auch hier ab 0 gezählt), und length() verrät dir die Anzahl.</w:t>
+      </w:r>
+    </w:p>
+    <w:p>
+      <w:pPr>
+        <w:keepNext/>
+        <w:keepLines/>
+        <w:pBdr>
+          <w:bottom w:val="single" w:color="DDD0C0" w:sz="4" w:space="2"/>
+        </w:pBdr>
+        <w:spacing w:after="40" w:before="360"/>
+      </w:pPr>
+      <w:r>
+        <w:rPr>
+          <w:rFonts w:ascii="Consolas" w:cs="Consolas" w:eastAsia="Consolas" w:hAnsi="Consolas"/>
+          <w:b/>
+          <w:bCs/>
+          <w:color w:val="9A3412"/>
+          <w:sz w:val="24"/>
+          <w:szCs w:val="24"/>
+        </w:rPr>
+        <w:t xml:space="preserve">Tupel-Literal</w:t>
+      </w:r>
+    </w:p>
+    <w:p>
+      <w:pPr>
+        <w:keepNext/>
+        <w:spacing w:after="120"/>
+      </w:pPr>
+      <w:r>
+        <w:rPr>
+          <w:b/>
+          <w:bCs/>
+          <w:color w:val="6A6A6A"/>
+          <w:sz w:val="18"/>
+          <w:szCs w:val="18"/>
+        </w:rPr>
+        <w:t xml:space="preserve">Syntax:  </w:t>
+      </w:r>
+      <w:r>
+        <w:rPr>
+          <w:rFonts w:ascii="Consolas" w:cs="Consolas" w:eastAsia="Consolas" w:hAnsi="Consolas"/>
+          <w:color w:val="335577"/>
+          <w:sz w:val="19"/>
+          <w:szCs w:val="19"/>
+        </w:rPr>
+        <w:t xml:space="preserve">(wert1, wert2, ...)</w:t>
+      </w:r>
+    </w:p>
+    <w:p>
+      <w:pPr>
+        <w:spacing w:after="180" w:line="312" w:lineRule="auto"/>
+      </w:pPr>
+      <w:r>
+        <w:rPr>
+          <w:sz w:val="22"/>
+          <w:szCs w:val="22"/>
+        </w:rPr>
+        <w:t xml:space="preserve">Bündelt zwei oder mehr Werte – auch unterschiedlichen Typs – zu einem Tupel. Eine einzelne Klammer wie (5) ist KEIN Tupel, sondern nur eine eingeklammerte Zahl; ein Tupel braucht mindestens zwei Elemente.</w:t>
+      </w:r>
+    </w:p>
+    <w:p>
+      <w:pPr>
+        <w:keepNext/>
+        <w:spacing w:after="30" w:before="120"/>
+      </w:pPr>
+      <w:r>
+        <w:rPr>
+          <w:b/>
+          <w:bCs/>
+          <w:i/>
+          <w:iCs/>
+          <w:color w:val="6A6A6A"/>
+          <w:sz w:val="18"/>
+          <w:szCs w:val="18"/>
+        </w:rPr>
+        <w:t xml:space="preserve">Beispiel</w:t>
+      </w:r>
+    </w:p>
+    <w:p>
+      <w:pPr>
+        <w:keepLines/>
+        <w:pBdr>
+          <w:left w:val="single" w:color="1B6CA8" w:sz="18" w:space="6"/>
+        </w:pBdr>
+        <w:shd w:fill="F4F4F4" w:val="clear"/>
+        <w:spacing w:after="200" w:before="100" w:line="264" w:lineRule="auto"/>
+        <w:ind w:left="140"/>
+      </w:pPr>
+      <w:r>
+        <w:rPr>
+          <w:rFonts w:ascii="Consolas" w:cs="Consolas" w:eastAsia="Consolas" w:hAnsi="Consolas"/>
+          <w:sz w:val="19"/>
+          <w:szCs w:val="19"/>
+        </w:rPr>
+        <w:t xml:space="preserve">DIM punkt AS TUPLE</w:t>
+      </w:r>
+      <w:r>
+        <w:rPr>
+          <w:rFonts w:ascii="Consolas" w:cs="Consolas" w:eastAsia="Consolas" w:hAnsi="Consolas"/>
+          <w:sz w:val="19"/>
+          <w:szCs w:val="19"/>
+        </w:rPr>
+        <w:br/>
+        <w:t xml:space="preserve">punkt = (3, 4)</w:t>
+      </w:r>
+      <w:r>
+        <w:rPr>
+          <w:rFonts w:ascii="Consolas" w:cs="Consolas" w:eastAsia="Consolas" w:hAnsi="Consolas"/>
+          <w:sz w:val="19"/>
+          <w:szCs w:val="19"/>
+        </w:rPr>
+        <w:br/>
+        <w:t xml:space="preserve">PRINT punkt</w:t>
+      </w:r>
+      <w:r>
+        <w:rPr>
+          <w:rFonts w:ascii="Consolas" w:cs="Consolas" w:eastAsia="Consolas" w:hAnsi="Consolas"/>
+          <w:sz w:val="19"/>
+          <w:szCs w:val="19"/>
+        </w:rPr>
+        <w:br/>
+        <w:t xml:space="preserve">PRINT punkt[0]; " "; punkt[1]</w:t>
+      </w:r>
+      <w:r>
+        <w:rPr>
+          <w:rFonts w:ascii="Consolas" w:cs="Consolas" w:eastAsia="Consolas" w:hAnsi="Consolas"/>
+          <w:sz w:val="19"/>
+          <w:szCs w:val="19"/>
+        </w:rPr>
+        <w:br/>
+        <w:t xml:space="preserve">PRINT punkt.length()</w:t>
+      </w:r>
+    </w:p>
+    <w:p>
+      <w:pPr>
+        <w:keepNext/>
+        <w:spacing w:after="30" w:before="120"/>
+      </w:pPr>
+      <w:r>
+        <w:rPr>
+          <w:b/>
+          <w:bCs/>
+          <w:i/>
+          <w:iCs/>
+          <w:color w:val="6A6A6A"/>
+          <w:sz w:val="18"/>
+          <w:szCs w:val="18"/>
+        </w:rPr>
+        <w:t xml:space="preserve">Ausgabe</w:t>
+      </w:r>
+    </w:p>
+    <w:p>
+      <w:pPr>
+        <w:keepLines/>
+        <w:pBdr>
+          <w:left w:val="single" w:color="9AC79A" w:sz="18" w:space="6"/>
+        </w:pBdr>
+        <w:shd w:fill="EAF4EA" w:val="clear"/>
+        <w:spacing w:after="200" w:before="100" w:line="264" w:lineRule="auto"/>
+        <w:ind w:left="140"/>
+      </w:pPr>
+      <w:r>
+        <w:rPr>
+          <w:rFonts w:ascii="Consolas" w:cs="Consolas" w:eastAsia="Consolas" w:hAnsi="Consolas"/>
+          <w:sz w:val="19"/>
+          <w:szCs w:val="19"/>
+        </w:rPr>
+        <w:t xml:space="preserve">(3, 4)</w:t>
+      </w:r>
+      <w:r>
+        <w:rPr>
+          <w:rFonts w:ascii="Consolas" w:cs="Consolas" w:eastAsia="Consolas" w:hAnsi="Consolas"/>
+          <w:sz w:val="19"/>
+          <w:szCs w:val="19"/>
+        </w:rPr>
+        <w:br/>
+        <w:t xml:space="preserve">3 4</w:t>
+      </w:r>
+      <w:r>
+        <w:rPr>
+          <w:rFonts w:ascii="Consolas" w:cs="Consolas" w:eastAsia="Consolas" w:hAnsi="Consolas"/>
+          <w:sz w:val="19"/>
+          <w:szCs w:val="19"/>
+        </w:rPr>
+        <w:br/>
+        <w:t xml:space="preserve">2</w:t>
+      </w:r>
+    </w:p>
+    <w:p>
+      <w:pPr>
+        <w:spacing w:after="180" w:line="312" w:lineRule="auto"/>
+      </w:pPr>
+      <w:r>
+        <w:rPr>
+          <w:sz w:val="22"/>
+          <w:szCs w:val="22"/>
+        </w:rPr>
+        <w:t xml:space="preserve">Dass verschiedene Typen erlaubt sind, macht Tupel ideal, um einen kleinen Datensatz zusammenzufassen – hier Name, Alter und ein Wahrheitswert in einem einzigen Wert:</w:t>
+      </w:r>
+    </w:p>
+    <w:p>
+      <w:pPr>
+        <w:keepLines/>
+        <w:pBdr>
+          <w:left w:val="single" w:color="1B6CA8" w:sz="18" w:space="6"/>
+        </w:pBdr>
+        <w:shd w:fill="F4F4F4" w:val="clear"/>
+        <w:spacing w:after="200" w:before="100" w:line="264" w:lineRule="auto"/>
+        <w:ind w:left="140"/>
+      </w:pPr>
+      <w:r>
+        <w:rPr>
+          <w:rFonts w:ascii="Consolas" w:cs="Consolas" w:eastAsia="Consolas" w:hAnsi="Consolas"/>
+          <w:sz w:val="19"/>
+          <w:szCs w:val="19"/>
+        </w:rPr>
+        <w:t xml:space="preserve">DIM person AS TUPLE</w:t>
+      </w:r>
+      <w:r>
+        <w:rPr>
+          <w:rFonts w:ascii="Consolas" w:cs="Consolas" w:eastAsia="Consolas" w:hAnsi="Consolas"/>
+          <w:sz w:val="19"/>
+          <w:szCs w:val="19"/>
+        </w:rPr>
+        <w:br/>
+        <w:t xml:space="preserve">person = ("Anna", 30, TRUE)</w:t>
+      </w:r>
+      <w:r>
+        <w:rPr>
+          <w:rFonts w:ascii="Consolas" w:cs="Consolas" w:eastAsia="Consolas" w:hAnsi="Consolas"/>
+          <w:sz w:val="19"/>
+          <w:szCs w:val="19"/>
+        </w:rPr>
+        <w:br/>
+        <w:t xml:space="preserve">PRINT person[0]; " ist "; person[1]</w:t>
+      </w:r>
+    </w:p>
+    <w:p>
+      <w:pPr>
+        <w:keepLines/>
+        <w:pBdr>
+          <w:left w:val="single" w:color="9AC79A" w:sz="18" w:space="6"/>
+        </w:pBdr>
+        <w:shd w:fill="EAF4EA" w:val="clear"/>
+        <w:spacing w:after="200" w:before="100" w:line="264" w:lineRule="auto"/>
+        <w:ind w:left="140"/>
+      </w:pPr>
+      <w:r>
+        <w:rPr>
+          <w:rFonts w:ascii="Consolas" w:cs="Consolas" w:eastAsia="Consolas" w:hAnsi="Consolas"/>
+          <w:sz w:val="19"/>
+          <w:szCs w:val="19"/>
+        </w:rPr>
+        <w:t xml:space="preserve">Anna ist 30</w:t>
+      </w:r>
+    </w:p>
+    <w:p>
+      <w:pPr>
+        <w:pStyle w:val="Heading2"/>
+        <w:keepNext/>
+        <w:keepLines/>
+        <w:spacing w:after="120" w:before="280"/>
+      </w:pPr>
+      <w:r>
+        <w:t xml:space="preserve">Tupel sind unveränderlich</w:t>
+      </w:r>
+    </w:p>
+    <w:p>
+      <w:pPr>
+        <w:spacing w:after="180" w:line="312" w:lineRule="auto"/>
+      </w:pPr>
+      <w:r>
+        <w:rPr>
+          <w:sz w:val="22"/>
+          <w:szCs w:val="22"/>
+        </w:rPr>
+        <w:t xml:space="preserve">Ein wichtiger Unterschied zum Array: Ein Tupel kannst du nach dem Erzeugen nicht mehr ändern. Es gibt keine einzelne Zuweisung an ein Fach – der Versuch wird abgelehnt. Ein Tupel ist eine feste Momentaufnahme. Willst du andere Werte, baust du ein neues Tupel.</w:t>
+      </w:r>
+    </w:p>
+    <w:p>
+      <w:pPr>
+        <w:keepLines/>
+        <w:pBdr>
+          <w:left w:val="single" w:color="1B6CA8" w:sz="18" w:space="6"/>
+        </w:pBdr>
+        <w:shd w:fill="F4F4F4" w:val="clear"/>
+        <w:spacing w:after="200" w:before="100" w:line="264" w:lineRule="auto"/>
+        <w:ind w:left="140"/>
+      </w:pPr>
+      <w:r>
+        <w:rPr>
+          <w:rFonts w:ascii="Consolas" w:cs="Consolas" w:eastAsia="Consolas" w:hAnsi="Consolas"/>
+          <w:sz w:val="19"/>
+          <w:szCs w:val="19"/>
+        </w:rPr>
+        <w:t xml:space="preserve">DIM t AS TUPLE</w:t>
+      </w:r>
+      <w:r>
+        <w:rPr>
+          <w:rFonts w:ascii="Consolas" w:cs="Consolas" w:eastAsia="Consolas" w:hAnsi="Consolas"/>
+          <w:sz w:val="19"/>
+          <w:szCs w:val="19"/>
+        </w:rPr>
+        <w:br/>
+        <w:t xml:space="preserve">t = (1, 2, 3)</w:t>
+      </w:r>
+      <w:r>
+        <w:rPr>
+          <w:rFonts w:ascii="Consolas" w:cs="Consolas" w:eastAsia="Consolas" w:hAnsi="Consolas"/>
+          <w:sz w:val="19"/>
+          <w:szCs w:val="19"/>
+        </w:rPr>
+        <w:br/>
+        <w:t xml:space="preserve">t[0] = 99      ' FEHLER: ein Tupel lässt sich nicht ändern</w:t>
+      </w:r>
+    </w:p>
+    <w:p>
+      <w:pPr>
+        <w:keepLines/>
+        <w:pBdr>
+          <w:left w:val="single" w:color="9AC79A" w:sz="18" w:space="6"/>
+        </w:pBdr>
+        <w:shd w:fill="EAF4EA" w:val="clear"/>
+        <w:spacing w:after="200" w:before="100" w:line="264" w:lineRule="auto"/>
+        <w:ind w:left="140"/>
+      </w:pPr>
+      <w:r>
+        <w:rPr>
+          <w:rFonts w:ascii="Consolas" w:cs="Consolas" w:eastAsia="Consolas" w:hAnsi="Consolas"/>
+          <w:sz w:val="19"/>
+          <w:szCs w:val="19"/>
+        </w:rPr>
+        <w:t xml:space="preserve">Laufzeitfehler: Index-Zuweisung an Nicht-Array (TUPLE)</w:t>
+      </w:r>
+    </w:p>
+    <w:p>
+      <w:pPr>
+        <w:spacing w:before="60"/>
+      </w:pPr>
+    </w:p>
+    <w:tbl>
+      <w:tblPr>
+        <w:tblW w:type="dxa" w:w="9360"/>
+        <w:tblBorders>
+          <w:top w:val="single" w:color="auto" w:sz="4"/>
+          <w:left w:val="single" w:color="auto" w:sz="4"/>
+          <w:bottom w:val="single" w:color="auto" w:sz="4"/>
+          <w:right w:val="single" w:color="auto" w:sz="4"/>
+          <w:insideH w:val="single" w:color="auto" w:sz="4"/>
+          <w:insideV w:val="single" w:color="auto" w:sz="4"/>
+        </w:tblBorders>
+      </w:tblPr>
+      <w:tblGrid>
+        <w:gridCol w:w="9360"/>
+      </w:tblGrid>
+      <w:tr>
+        <w:trPr>
+          <w:cantSplit/>
+        </w:trPr>
+        <w:tc>
+          <w:tcPr>
+            <w:tcW w:type="dxa" w:w="9360"/>
+            <w:tcBorders>
+              <w:top w:val="single" w:color="E0B96A" w:sz="6"/>
+              <w:left w:val="single" w:color="E0B96A" w:sz="6"/>
+              <w:bottom w:val="single" w:color="E0B96A" w:sz="6"/>
+              <w:right w:val="single" w:color="E0B96A" w:sz="6"/>
+            </w:tcBorders>
+            <w:shd w:fill="FDF3E0" w:val="clear"/>
+            <w:tcMar>
+              <w:top w:type="dxa" w:w="140"/>
+              <w:left w:type="dxa" w:w="180"/>
+              <w:bottom w:type="dxa" w:w="140"/>
+              <w:right w:type="dxa" w:w="180"/>
+            </w:tcMar>
+          </w:tcPr>
+          <w:p>
+            <w:pPr>
+              <w:spacing w:after="40"/>
+            </w:pPr>
+            <w:r>
+              <w:rPr>
+                <w:b/>
+                <w:bCs/>
+                <w:color w:val="9A6A1E"/>
+                <w:sz w:val="22"/>
+                <w:szCs w:val="22"/>
+              </w:rPr>
+              <w:t xml:space="preserve">Merke</w:t>
+            </w:r>
+          </w:p>
+          <w:p>
+            <w:pPr>
+              <w:spacing w:after="0" w:line="312" w:lineRule="auto"/>
+            </w:pPr>
+            <w:r>
+              <w:rPr>
+                <w:sz w:val="22"/>
+                <w:szCs w:val="22"/>
+              </w:rPr>
+              <w:t xml:space="preserve">Genau diese Unveränderlichkeit macht Tupel sicher und übersichtlich: Wenn du ein Tupel irgendwohin weitergibst, kann niemand es dir hinter dem Rücken verändern. Brauchst du eine veränderbare, gleichartige Sammlung, nimm ein Array (Kapitel „Arrays“).</w:t>
+            </w:r>
+          </w:p>
+        </w:tc>
+      </w:tr>
+    </w:tbl>
+    <w:p>
+      <w:pPr>
+        <w:spacing w:after="160"/>
+      </w:pPr>
+    </w:p>
+    <w:p>
+      <w:pPr>
+        <w:pStyle w:val="Heading2"/>
+        <w:keepNext/>
+        <w:keepLines/>
+        <w:spacing w:after="120" w:before="280"/>
+      </w:pPr>
+      <w:r>
+        <w:t xml:space="preserve">Zerlegen: Destructuring</w:t>
+      </w:r>
+    </w:p>
+    <w:p>
+      <w:pPr>
+        <w:spacing w:after="180" w:line="312" w:lineRule="auto"/>
+      </w:pPr>
+      <w:r>
+        <w:rPr>
+          <w:sz w:val="22"/>
+          <w:szCs w:val="22"/>
+        </w:rPr>
+        <w:t xml:space="preserve">Jetzt zum eigentlichen Trick. Statt die Einzelwerte mühsam über punkt[0], punkt[1] herauszuziehen, kannst du ein Tupel in einem Rutsch auf mehrere Variablen verteilen. Dazu schreibst du auf die linke Seite der Zuweisung selbst eine Klammer mit den Zielvariablen. GameBasic packt das Tupel aus und füllt sie der Reihe nach.</w:t>
+      </w:r>
+    </w:p>
+    <w:p>
+      <w:pPr>
+        <w:keepNext/>
+        <w:keepLines/>
+        <w:pBdr>
+          <w:bottom w:val="single" w:color="DDD0C0" w:sz="4" w:space="2"/>
+        </w:pBdr>
+        <w:spacing w:after="40" w:before="360"/>
+      </w:pPr>
+      <w:r>
+        <w:rPr>
+          <w:rFonts w:ascii="Consolas" w:cs="Consolas" w:eastAsia="Consolas" w:hAnsi="Consolas"/>
+          <w:b/>
+          <w:bCs/>
+          <w:color w:val="9A3412"/>
+          <w:sz w:val="24"/>
+          <w:szCs w:val="24"/>
+        </w:rPr>
+        <w:t xml:space="preserve">Destructuring-Zuweisung</w:t>
+      </w:r>
+    </w:p>
+    <w:p>
+      <w:pPr>
+        <w:keepNext/>
+        <w:spacing w:after="120"/>
+      </w:pPr>
+      <w:r>
+        <w:rPr>
+          <w:b/>
+          <w:bCs/>
+          <w:color w:val="6A6A6A"/>
+          <w:sz w:val="18"/>
+          <w:szCs w:val="18"/>
+        </w:rPr>
+        <w:t xml:space="preserve">Syntax:  </w:t>
+      </w:r>
+      <w:r>
+        <w:rPr>
+          <w:rFonts w:ascii="Consolas" w:cs="Consolas" w:eastAsia="Consolas" w:hAnsi="Consolas"/>
+          <w:color w:val="335577"/>
+          <w:sz w:val="19"/>
+          <w:szCs w:val="19"/>
+        </w:rPr>
+        <w:t xml:space="preserve">(var1, var2, ...) = tupel</w:t>
+      </w:r>
+    </w:p>
+    <w:p>
+      <w:pPr>
+        <w:spacing w:after="180" w:line="312" w:lineRule="auto"/>
+      </w:pPr>
+      <w:r>
+        <w:rPr>
+          <w:sz w:val="22"/>
+          <w:szCs w:val="22"/>
+        </w:rPr>
+        <w:t xml:space="preserve">Verteilt die Elemente eines Tupels auf mehrere Variablen. Die Anzahl der Variablen links muss genau zur Anzahl der Tupel-Elemente rechts passen – sonst gibt es einen Fehler.</w:t>
+      </w:r>
+    </w:p>
+    <w:p>
+      <w:pPr>
+        <w:keepNext/>
+        <w:spacing w:after="30" w:before="120"/>
+      </w:pPr>
+      <w:r>
+        <w:rPr>
+          <w:b/>
+          <w:bCs/>
+          <w:i/>
+          <w:iCs/>
+          <w:color w:val="6A6A6A"/>
+          <w:sz w:val="18"/>
+          <w:szCs w:val="18"/>
+        </w:rPr>
+        <w:t xml:space="preserve">Beispiel</w:t>
+      </w:r>
+    </w:p>
+    <w:p>
+      <w:pPr>
+        <w:keepLines/>
+        <w:pBdr>
+          <w:left w:val="single" w:color="1B6CA8" w:sz="18" w:space="6"/>
+        </w:pBdr>
+        <w:shd w:fill="F4F4F4" w:val="clear"/>
+        <w:spacing w:after="200" w:before="100" w:line="264" w:lineRule="auto"/>
+        <w:ind w:left="140"/>
+      </w:pPr>
+      <w:r>
+        <w:rPr>
+          <w:rFonts w:ascii="Consolas" w:cs="Consolas" w:eastAsia="Consolas" w:hAnsi="Consolas"/>
+          <w:sz w:val="19"/>
+          <w:szCs w:val="19"/>
+        </w:rPr>
+        <w:t xml:space="preserve">DIM lo AS INTEGER</w:t>
+      </w:r>
+      <w:r>
+        <w:rPr>
+          <w:rFonts w:ascii="Consolas" w:cs="Consolas" w:eastAsia="Consolas" w:hAnsi="Consolas"/>
+          <w:sz w:val="19"/>
+          <w:szCs w:val="19"/>
+        </w:rPr>
+        <w:br/>
+        <w:t xml:space="preserve">DIM hi AS INTEGER</w:t>
+      </w:r>
+      <w:r>
+        <w:rPr>
+          <w:rFonts w:ascii="Consolas" w:cs="Consolas" w:eastAsia="Consolas" w:hAnsi="Consolas"/>
+          <w:sz w:val="19"/>
+          <w:szCs w:val="19"/>
+        </w:rPr>
+        <w:br/>
+        <w:t xml:space="preserve">(lo, hi) = (7, 3)</w:t>
+      </w:r>
+      <w:r>
+        <w:rPr>
+          <w:rFonts w:ascii="Consolas" w:cs="Consolas" w:eastAsia="Consolas" w:hAnsi="Consolas"/>
+          <w:sz w:val="19"/>
+          <w:szCs w:val="19"/>
+        </w:rPr>
+        <w:br/>
+        <w:t xml:space="preserve">PRINT "lo="; lo; "  hi="; hi</w:t>
+      </w:r>
+    </w:p>
+    <w:p>
+      <w:pPr>
+        <w:keepNext/>
+        <w:spacing w:after="30" w:before="120"/>
+      </w:pPr>
+      <w:r>
+        <w:rPr>
+          <w:b/>
+          <w:bCs/>
+          <w:i/>
+          <w:iCs/>
+          <w:color w:val="6A6A6A"/>
+          <w:sz w:val="18"/>
+          <w:szCs w:val="18"/>
+        </w:rPr>
+        <w:t xml:space="preserve">Ausgabe</w:t>
+      </w:r>
+    </w:p>
+    <w:p>
+      <w:pPr>
+        <w:keepLines/>
+        <w:pBdr>
+          <w:left w:val="single" w:color="9AC79A" w:sz="18" w:space="6"/>
+        </w:pBdr>
+        <w:shd w:fill="EAF4EA" w:val="clear"/>
+        <w:spacing w:after="200" w:before="100" w:line="264" w:lineRule="auto"/>
+        <w:ind w:left="140"/>
+      </w:pPr>
+      <w:r>
+        <w:rPr>
+          <w:rFonts w:ascii="Consolas" w:cs="Consolas" w:eastAsia="Consolas" w:hAnsi="Consolas"/>
+          <w:sz w:val="19"/>
+          <w:szCs w:val="19"/>
+        </w:rPr>
+        <w:t xml:space="preserve">lo=7  hi=3</w:t>
+      </w:r>
+    </w:p>
+    <w:p>
+      <w:pPr>
+        <w:spacing w:before="60"/>
+      </w:pPr>
+    </w:p>
+    <w:tbl>
+      <w:tblPr>
+        <w:tblW w:type="dxa" w:w="9360"/>
+        <w:tblBorders>
+          <w:top w:val="single" w:color="auto" w:sz="4"/>
+          <w:left w:val="single" w:color="auto" w:sz="4"/>
+          <w:bottom w:val="single" w:color="auto" w:sz="4"/>
+          <w:right w:val="single" w:color="auto" w:sz="4"/>
+          <w:insideH w:val="single" w:color="auto" w:sz="4"/>
+          <w:insideV w:val="single" w:color="auto" w:sz="4"/>
+        </w:tblBorders>
+      </w:tblPr>
+      <w:tblGrid>
+        <w:gridCol w:w="9360"/>
+      </w:tblGrid>
+      <w:tr>
+        <w:trPr>
+          <w:cantSplit/>
+        </w:trPr>
+        <w:tc>
+          <w:tcPr>
+            <w:tcW w:type="dxa" w:w="9360"/>
+            <w:tcBorders>
+              <w:top w:val="single" w:color="E0A0A0" w:sz="6"/>
+              <w:left w:val="single" w:color="E0A0A0" w:sz="6"/>
+              <w:bottom w:val="single" w:color="E0A0A0" w:sz="6"/>
+              <w:right w:val="single" w:color="E0A0A0" w:sz="6"/>
+            </w:tcBorders>
+            <w:shd w:fill="FBEAEA" w:val="clear"/>
+            <w:tcMar>
+              <w:top w:type="dxa" w:w="140"/>
+              <w:left w:type="dxa" w:w="180"/>
+              <w:bottom w:type="dxa" w:w="140"/>
+              <w:right w:type="dxa" w:w="180"/>
+            </w:tcMar>
+          </w:tcPr>
+          <w:p>
+            <w:pPr>
+              <w:spacing w:after="40"/>
+            </w:pPr>
+            <w:r>
+              <w:rPr>
+                <w:b/>
+                <w:bCs/>
+                <w:color w:val="B23030"/>
+                <w:sz w:val="22"/>
+                <w:szCs w:val="22"/>
+              </w:rPr>
+              <w:t xml:space="preserve">Achtung</w:t>
+            </w:r>
+          </w:p>
+          <w:p>
+            <w:pPr>
+              <w:spacing w:after="0" w:line="312" w:lineRule="auto"/>
+            </w:pPr>
+            <w:r>
+              <w:rPr>
+                <w:sz w:val="22"/>
+                <w:szCs w:val="22"/>
+              </w:rPr>
+              <w:t xml:space="preserve">Links müssen genau so viele Variablen stehen, wie das Tupel Elemente hat. Schreibst du (a, b) = (1, 2, 3), bricht das Programm mit einer klaren Meldung ab: „2 Ziele, aber Tupel hat 3 Element(e)“.</w:t>
+            </w:r>
+          </w:p>
+        </w:tc>
+      </w:tr>
+    </w:tbl>
+    <w:p>
+      <w:pPr>
+        <w:spacing w:after="160"/>
+      </w:pPr>
+    </w:p>
+    <w:p>
+      <w:pPr>
+        <w:pStyle w:val="Heading2"/>
+        <w:keepNext/>
+        <w:keepLines/>
+        <w:spacing w:after="120" w:before="280"/>
+      </w:pPr>
+      <w:r>
+        <w:t xml:space="preserve">Mehrere Ergebnisse zurückgeben</w:t>
+      </w:r>
+    </w:p>
+    <w:p>
+      <w:pPr>
+        <w:spacing w:after="180" w:line="312" w:lineRule="auto"/>
+      </w:pPr>
+      <w:r>
+        <w:rPr>
+          <w:sz w:val="22"/>
+          <w:szCs w:val="22"/>
+        </w:rPr>
+        <w:t xml:space="preserve">Hier zeigt sich die wahre Stärke. Eine Funktion kann mit RETURN normalerweise nur einen Wert liefern. Packst du mehrere Werte in ein Tupel, gibst du praktisch mehrere Ergebnisse zurück – und beim Aufruf zerlegst du sie sofort wieder. Das ist viel angenehmer als der Umweg über BYREF aus dem Funktionen-Kapitel.</w:t>
+      </w:r>
+    </w:p>
+    <w:p>
+      <w:pPr>
+        <w:keepLines/>
+        <w:pBdr>
+          <w:left w:val="single" w:color="1B6CA8" w:sz="18" w:space="6"/>
+        </w:pBdr>
+        <w:shd w:fill="F4F4F4" w:val="clear"/>
+        <w:spacing w:after="200" w:before="100" w:line="264" w:lineRule="auto"/>
+        <w:ind w:left="140"/>
+      </w:pPr>
+      <w:r>
+        <w:rPr>
+          <w:rFonts w:ascii="Consolas" w:cs="Consolas" w:eastAsia="Consolas" w:hAnsi="Consolas"/>
+          <w:sz w:val="19"/>
+          <w:szCs w:val="19"/>
+        </w:rPr>
+        <w:t xml:space="preserve">FUNCTION minmax(a AS INTEGER, b AS INTEGER) AS TUPLE</w:t>
+      </w:r>
+      <w:r>
+        <w:rPr>
+          <w:rFonts w:ascii="Consolas" w:cs="Consolas" w:eastAsia="Consolas" w:hAnsi="Consolas"/>
+          <w:sz w:val="19"/>
+          <w:szCs w:val="19"/>
+        </w:rPr>
+        <w:br/>
+        <w:t xml:space="preserve">    IF a &lt; b THEN RETURN (a, b)</w:t>
+      </w:r>
+      <w:r>
+        <w:rPr>
+          <w:rFonts w:ascii="Consolas" w:cs="Consolas" w:eastAsia="Consolas" w:hAnsi="Consolas"/>
+          <w:sz w:val="19"/>
+          <w:szCs w:val="19"/>
+        </w:rPr>
+        <w:br/>
+        <w:t xml:space="preserve">    RETURN (b, a)</w:t>
+      </w:r>
+      <w:r>
+        <w:rPr>
+          <w:rFonts w:ascii="Consolas" w:cs="Consolas" w:eastAsia="Consolas" w:hAnsi="Consolas"/>
+          <w:sz w:val="19"/>
+          <w:szCs w:val="19"/>
+        </w:rPr>
+        <w:br/>
+        <w:t xml:space="preserve">END FUNCTION</w:t>
+      </w:r>
+      <w:r>
+        <w:rPr>
+          <w:rFonts w:ascii="Consolas" w:cs="Consolas" w:eastAsia="Consolas" w:hAnsi="Consolas"/>
+          <w:sz w:val="19"/>
+          <w:szCs w:val="19"/>
+        </w:rPr>
+        <w:br/>
+        <w:t xml:space="preserve"/>
+      </w:r>
+      <w:r>
+        <w:rPr>
+          <w:rFonts w:ascii="Consolas" w:cs="Consolas" w:eastAsia="Consolas" w:hAnsi="Consolas"/>
+          <w:sz w:val="19"/>
+          <w:szCs w:val="19"/>
+        </w:rPr>
+        <w:br/>
+        <w:t xml:space="preserve">DIM kleiner AS INTEGER</w:t>
+      </w:r>
+      <w:r>
+        <w:rPr>
+          <w:rFonts w:ascii="Consolas" w:cs="Consolas" w:eastAsia="Consolas" w:hAnsi="Consolas"/>
+          <w:sz w:val="19"/>
+          <w:szCs w:val="19"/>
+        </w:rPr>
+        <w:br/>
+        <w:t xml:space="preserve">DIM groesser AS INTEGER</w:t>
+      </w:r>
+      <w:r>
+        <w:rPr>
+          <w:rFonts w:ascii="Consolas" w:cs="Consolas" w:eastAsia="Consolas" w:hAnsi="Consolas"/>
+          <w:sz w:val="19"/>
+          <w:szCs w:val="19"/>
+        </w:rPr>
+        <w:br/>
+        <w:t xml:space="preserve">(kleiner, groesser) = minmax(9, 2)</w:t>
+      </w:r>
+      <w:r>
+        <w:rPr>
+          <w:rFonts w:ascii="Consolas" w:cs="Consolas" w:eastAsia="Consolas" w:hAnsi="Consolas"/>
+          <w:sz w:val="19"/>
+          <w:szCs w:val="19"/>
+        </w:rPr>
+        <w:br/>
+        <w:t xml:space="preserve">PRINT "kleiner: "; kleiner</w:t>
+      </w:r>
+      <w:r>
+        <w:rPr>
+          <w:rFonts w:ascii="Consolas" w:cs="Consolas" w:eastAsia="Consolas" w:hAnsi="Consolas"/>
+          <w:sz w:val="19"/>
+          <w:szCs w:val="19"/>
+        </w:rPr>
+        <w:br/>
+        <w:t xml:space="preserve">PRINT "größer:  "; groesser</w:t>
+      </w:r>
+    </w:p>
+    <w:p>
+      <w:pPr>
+        <w:keepLines/>
+        <w:pBdr>
+          <w:left w:val="single" w:color="9AC79A" w:sz="18" w:space="6"/>
+        </w:pBdr>
+        <w:shd w:fill="EAF4EA" w:val="clear"/>
+        <w:spacing w:after="200" w:before="100" w:line="264" w:lineRule="auto"/>
+        <w:ind w:left="140"/>
+      </w:pPr>
+      <w:r>
+        <w:rPr>
+          <w:rFonts w:ascii="Consolas" w:cs="Consolas" w:eastAsia="Consolas" w:hAnsi="Consolas"/>
+          <w:sz w:val="19"/>
+          <w:szCs w:val="19"/>
+        </w:rPr>
+        <w:t xml:space="preserve">kleiner: 2</w:t>
+      </w:r>
+      <w:r>
+        <w:rPr>
+          <w:rFonts w:ascii="Consolas" w:cs="Consolas" w:eastAsia="Consolas" w:hAnsi="Consolas"/>
+          <w:sz w:val="19"/>
+          <w:szCs w:val="19"/>
+        </w:rPr>
+        <w:br/>
+        <w:t xml:space="preserve">größer:  9</w:t>
+      </w:r>
+    </w:p>
+    <w:p>
+      <w:pPr>
+        <w:pStyle w:val="Heading2"/>
+        <w:keepNext/>
+        <w:keepLines/>
+        <w:spacing w:after="120" w:before="280"/>
+      </w:pPr>
+      <w:r>
+        <w:t xml:space="preserve">Der elegante Tausch-Trick</w:t>
+      </w:r>
+    </w:p>
+    <w:p>
+      <w:pPr>
+        <w:spacing w:after="180" w:line="312" w:lineRule="auto"/>
+      </w:pPr>
+      <w:r>
+        <w:rPr>
+          <w:sz w:val="22"/>
+          <w:szCs w:val="22"/>
+        </w:rPr>
+        <w:t xml:space="preserve">Will man die Werte zweier Variablen vertauschen, braucht man klassisch eine dritte Hilfsvariable (merke dir x, überschreibe x mit y, schreibe das Gemerkte in y). Mit Destructuring geht das in einer einzigen Zeile – die rechte Seite wird komplett ausgewertet, bevor zugewiesen wird:</w:t>
+      </w:r>
+    </w:p>
+    <w:p>
+      <w:pPr>
+        <w:keepLines/>
+        <w:pBdr>
+          <w:left w:val="single" w:color="1B6CA8" w:sz="18" w:space="6"/>
+        </w:pBdr>
+        <w:shd w:fill="F4F4F4" w:val="clear"/>
+        <w:spacing w:after="200" w:before="100" w:line="264" w:lineRule="auto"/>
+        <w:ind w:left="140"/>
+      </w:pPr>
+      <w:r>
+        <w:rPr>
+          <w:rFonts w:ascii="Consolas" w:cs="Consolas" w:eastAsia="Consolas" w:hAnsi="Consolas"/>
+          <w:sz w:val="19"/>
+          <w:szCs w:val="19"/>
+        </w:rPr>
+        <w:t xml:space="preserve">DIM x AS INTEGER</w:t>
+      </w:r>
+      <w:r>
+        <w:rPr>
+          <w:rFonts w:ascii="Consolas" w:cs="Consolas" w:eastAsia="Consolas" w:hAnsi="Consolas"/>
+          <w:sz w:val="19"/>
+          <w:szCs w:val="19"/>
+        </w:rPr>
+        <w:br/>
+        <w:t xml:space="preserve">DIM y AS INTEGER</w:t>
+      </w:r>
+      <w:r>
+        <w:rPr>
+          <w:rFonts w:ascii="Consolas" w:cs="Consolas" w:eastAsia="Consolas" w:hAnsi="Consolas"/>
+          <w:sz w:val="19"/>
+          <w:szCs w:val="19"/>
+        </w:rPr>
+        <w:br/>
+        <w:t xml:space="preserve">x = 1 : y = 2</w:t>
+      </w:r>
+      <w:r>
+        <w:rPr>
+          <w:rFonts w:ascii="Consolas" w:cs="Consolas" w:eastAsia="Consolas" w:hAnsi="Consolas"/>
+          <w:sz w:val="19"/>
+          <w:szCs w:val="19"/>
+        </w:rPr>
+        <w:br/>
+        <w:t xml:space="preserve">(x, y) = (y, x)      ' tauschen ohne Hilfsvariable</w:t>
+      </w:r>
+      <w:r>
+        <w:rPr>
+          <w:rFonts w:ascii="Consolas" w:cs="Consolas" w:eastAsia="Consolas" w:hAnsi="Consolas"/>
+          <w:sz w:val="19"/>
+          <w:szCs w:val="19"/>
+        </w:rPr>
+        <w:br/>
+        <w:t xml:space="preserve">PRINT "x="; x; "  y="; y</w:t>
+      </w:r>
+    </w:p>
+    <w:p>
+      <w:pPr>
+        <w:keepLines/>
+        <w:pBdr>
+          <w:left w:val="single" w:color="9AC79A" w:sz="18" w:space="6"/>
+        </w:pBdr>
+        <w:shd w:fill="EAF4EA" w:val="clear"/>
+        <w:spacing w:after="200" w:before="100" w:line="264" w:lineRule="auto"/>
+        <w:ind w:left="140"/>
+      </w:pPr>
+      <w:r>
+        <w:rPr>
+          <w:rFonts w:ascii="Consolas" w:cs="Consolas" w:eastAsia="Consolas" w:hAnsi="Consolas"/>
+          <w:sz w:val="19"/>
+          <w:szCs w:val="19"/>
+        </w:rPr>
+        <w:t xml:space="preserve">x=2  y=1</w:t>
+      </w:r>
+    </w:p>
+    <w:p>
+      <w:pPr>
+        <w:pStyle w:val="Heading2"/>
+        <w:keepNext/>
+        <w:keepLines/>
+        <w:spacing w:after="120" w:before="280"/>
+      </w:pPr>
+      <w:r>
+        <w:t xml:space="preserve">Tupel durchlaufen</w:t>
+      </w:r>
+    </w:p>
+    <w:p>
+      <w:pPr>
+        <w:spacing w:after="180" w:line="312" w:lineRule="auto"/>
+      </w:pPr>
+      <w:r>
+        <w:rPr>
+          <w:sz w:val="22"/>
+          <w:szCs w:val="22"/>
+        </w:rPr>
+        <w:t xml:space="preserve">Wie Arrays und Maps lässt sich auch ein Tupel mit FOR EACH durchlaufen – praktisch für eine kurze, feste Aufzählung, die du nicht erst in ein Array packen willst:</w:t>
+      </w:r>
+    </w:p>
+    <w:p>
+      <w:pPr>
+        <w:keepLines/>
+        <w:pBdr>
+          <w:left w:val="single" w:color="1B6CA8" w:sz="18" w:space="6"/>
+        </w:pBdr>
+        <w:shd w:fill="F4F4F4" w:val="clear"/>
+        <w:spacing w:after="200" w:before="100" w:line="264" w:lineRule="auto"/>
+        <w:ind w:left="140"/>
+      </w:pPr>
+      <w:r>
+        <w:rPr>
+          <w:rFonts w:ascii="Consolas" w:cs="Consolas" w:eastAsia="Consolas" w:hAnsi="Consolas"/>
+          <w:sz w:val="19"/>
+          <w:szCs w:val="19"/>
+        </w:rPr>
+        <w:t xml:space="preserve">FOR EACH wert IN (10, 20, 30)</w:t>
+      </w:r>
+      <w:r>
+        <w:rPr>
+          <w:rFonts w:ascii="Consolas" w:cs="Consolas" w:eastAsia="Consolas" w:hAnsi="Consolas"/>
+          <w:sz w:val="19"/>
+          <w:szCs w:val="19"/>
+        </w:rPr>
+        <w:br/>
+        <w:t xml:space="preserve">    PRINT wert</w:t>
+      </w:r>
+      <w:r>
+        <w:rPr>
+          <w:rFonts w:ascii="Consolas" w:cs="Consolas" w:eastAsia="Consolas" w:hAnsi="Consolas"/>
+          <w:sz w:val="19"/>
+          <w:szCs w:val="19"/>
+        </w:rPr>
+        <w:br/>
+        <w:t xml:space="preserve">NEXT</w:t>
+      </w:r>
+    </w:p>
+    <w:p>
+      <w:pPr>
+        <w:keepLines/>
+        <w:pBdr>
+          <w:left w:val="single" w:color="9AC79A" w:sz="18" w:space="6"/>
+        </w:pBdr>
+        <w:shd w:fill="EAF4EA" w:val="clear"/>
+        <w:spacing w:after="200" w:before="100" w:line="264" w:lineRule="auto"/>
+        <w:ind w:left="140"/>
+      </w:pPr>
+      <w:r>
+        <w:rPr>
+          <w:rFonts w:ascii="Consolas" w:cs="Consolas" w:eastAsia="Consolas" w:hAnsi="Consolas"/>
+          <w:sz w:val="19"/>
+          <w:szCs w:val="19"/>
+        </w:rPr>
+        <w:t xml:space="preserve">10</w:t>
+      </w:r>
+      <w:r>
+        <w:rPr>
+          <w:rFonts w:ascii="Consolas" w:cs="Consolas" w:eastAsia="Consolas" w:hAnsi="Consolas"/>
+          <w:sz w:val="19"/>
+          <w:szCs w:val="19"/>
+        </w:rPr>
+        <w:br/>
+        <w:t xml:space="preserve">20</w:t>
+      </w:r>
+      <w:r>
+        <w:rPr>
+          <w:rFonts w:ascii="Consolas" w:cs="Consolas" w:eastAsia="Consolas" w:hAnsi="Consolas"/>
+          <w:sz w:val="19"/>
+          <w:szCs w:val="19"/>
+        </w:rPr>
+        <w:br/>
+        <w:t xml:space="preserve">30</w:t>
+      </w:r>
+    </w:p>
+    <w:p>
+      <w:pPr>
+        <w:spacing w:before="60"/>
+      </w:pPr>
+    </w:p>
+    <w:tbl>
+      <w:tblPr>
+        <w:tblW w:type="dxa" w:w="9360"/>
+        <w:tblBorders>
+          <w:top w:val="single" w:color="auto" w:sz="4"/>
+          <w:left w:val="single" w:color="auto" w:sz="4"/>
+          <w:bottom w:val="single" w:color="auto" w:sz="4"/>
+          <w:right w:val="single" w:color="auto" w:sz="4"/>
+          <w:insideH w:val="single" w:color="auto" w:sz="4"/>
+          <w:insideV w:val="single" w:color="auto" w:sz="4"/>
+        </w:tblBorders>
+      </w:tblPr>
+      <w:tblGrid>
+        <w:gridCol w:w="9360"/>
+      </w:tblGrid>
+      <w:tr>
+        <w:trPr>
+          <w:cantSplit/>
+        </w:trPr>
+        <w:tc>
+          <w:tcPr>
+            <w:tcW w:type="dxa" w:w="9360"/>
+            <w:tcBorders>
+              <w:top w:val="single" w:color="9CC8E6" w:sz="6"/>
+              <w:left w:val="single" w:color="9CC8E6" w:sz="6"/>
+              <w:bottom w:val="single" w:color="9CC8E6" w:sz="6"/>
+              <w:right w:val="single" w:color="9CC8E6" w:sz="6"/>
+            </w:tcBorders>
+            <w:shd w:fill="E7F2FA" w:val="clear"/>
+            <w:tcMar>
+              <w:top w:type="dxa" w:w="140"/>
+              <w:left w:type="dxa" w:w="180"/>
+              <w:bottom w:type="dxa" w:w="140"/>
+              <w:right w:type="dxa" w:w="180"/>
+            </w:tcMar>
+          </w:tcPr>
+          <w:p>
+            <w:pPr>
+              <w:spacing w:after="40"/>
+            </w:pPr>
+            <w:r>
+              <w:rPr>
+                <w:b/>
+                <w:bCs/>
+                <w:color w:val="1B6CA8"/>
+                <w:sz w:val="22"/>
+                <w:szCs w:val="22"/>
+              </w:rPr>
+              <w:t xml:space="preserve">Tupel oder Array?</w:t>
+            </w:r>
+          </w:p>
+          <w:p>
+            <w:pPr>
+              <w:spacing w:after="0" w:line="312" w:lineRule="auto"/>
+            </w:pPr>
+            <w:r>
+              <w:rPr>
+                <w:sz w:val="22"/>
+                <w:szCs w:val="22"/>
+              </w:rPr>
+              <w:t xml:space="preserve">Nimm ein Tupel für ein kleines, festes Bündel zusammengehöriger Werte – besonders als Rückgabe mehrerer Ergebnisse oder für gemischte Typen. Nimm ein Array für eine größere, gleichartige Sammlung, die wachsen, schrumpfen und sich ändern soll.</w:t>
             </w:r>
           </w:p>
         </w:tc>

</xml_diff>

<commit_message>
docs(buch): Lehrbuch Kap 20 -- Klassen & Objekte (ausfuehrlich)
Bauplan-vs-Objekt-Mentalmodell, CLASS + DIM-Felder, NEW, Konstruktor SUB Init
+ Self erklaert, Methoden (SUB/FUNCTION) auf Self-Feldern, impliziter
Methodenaufruf, viele unabhaengige Objekte, Verweis-Semantik (b=a kopiert
nicht). Schwieriges Thema mit viel konzeptionellem Geruest.
Alle Beispiel-Ausgaben gegen gbrt verifiziert.

Co-Authored-By: Claude Opus 4.8 (1M context) <noreply@anthropic.com>
</commit_message>
<xml_diff>
--- a/buch-referenz/buch/GameBasic-Lehrbuch.docx
+++ b/buch-referenz/buch/GameBasic-Lehrbuch.docx
@@ -516,6 +516,33 @@
           <w:szCs w:val="22"/>
         </w:rPr>
         <w:t xml:space="preserve">	36</w:t>
+      </w:r>
+    </w:p>
+    <w:p>
+      <w:pPr>
+        <w:tabs>
+          <w:tab w:val="right" w:pos="9200" w:leader="dot"/>
+        </w:tabs>
+        <w:spacing w:after="20" w:before="0"/>
+        <w:ind w:left="280"/>
+      </w:pPr>
+      <w:r>
+        <w:rPr>
+          <w:b w:val="false"/>
+          <w:bCs w:val="false"/>
+          <w:color w:val="222222"/>
+          <w:sz w:val="22"/>
+          <w:szCs w:val="22"/>
+        </w:rPr>
+        <w:t xml:space="preserve">Klassen &amp; Objekte</w:t>
+      </w:r>
+      <w:r>
+        <w:rPr>
+          <w:color w:val="555555"/>
+          <w:sz w:val="22"/>
+          <w:szCs w:val="22"/>
+        </w:rPr>
+        <w:t xml:space="preserve">	61</w:t>
       </w:r>
     </w:p>
     <w:p>
@@ -19374,6 +19401,1350 @@
                 <w:szCs w:val="22"/>
               </w:rPr>
               <w:t xml:space="preserve">Nimm ein Tupel für ein kleines, festes Bündel zusammengehöriger Werte – besonders als Rückgabe mehrerer Ergebnisse oder für gemischte Typen. Nimm ein Array für eine größere, gleichartige Sammlung, die wachsen, schrumpfen und sich ändern soll.</w:t>
+            </w:r>
+          </w:p>
+        </w:tc>
+      </w:tr>
+    </w:tbl>
+    <w:p>
+      <w:pPr>
+        <w:spacing w:after="160"/>
+      </w:pPr>
+    </w:p>
+    <w:p>
+      <w:pPr>
+        <w:pStyle w:val="Heading1"/>
+        <w:keepNext/>
+        <w:keepLines/>
+        <w:pageBreakBefore/>
+        <w:pBdr>
+          <w:bottom w:val="single" w:color="1B6CA8" w:sz="12" w:space="4"/>
+        </w:pBdr>
+        <w:spacing w:after="160" w:before="0"/>
+      </w:pPr>
+      <w:r>
+        <w:t xml:space="preserve">Klassen &amp; Objekte</w:t>
+      </w:r>
+    </w:p>
+    <w:p>
+      <w:pPr>
+        <w:spacing w:after="180" w:line="312" w:lineRule="auto"/>
+      </w:pPr>
+      <w:r>
+        <w:rPr>
+          <w:sz w:val="22"/>
+          <w:szCs w:val="22"/>
+        </w:rPr>
+        <w:t xml:space="preserve">Bis hierhin hast du mit einzelnen Werten gearbeitet – Zahlen, Strings, Arrays. Doch in einem Spiel gehören viele Dinge eng zusammen: Ein Gegner hat eine Position, Lebenspunkte, einen Namen und ein Verhalten. Diese Daten in lose nebeneinanderliegenden Variablen zu verwalten (gegner_x, gegner_y, gegner_hp …) wird schnell unübersichtlich – erst recht, wenn es viele Gegner gibt.</w:t>
+      </w:r>
+    </w:p>
+    <w:p>
+      <w:pPr>
+        <w:spacing w:after="180" w:line="312" w:lineRule="auto"/>
+      </w:pPr>
+      <w:r>
+        <w:rPr>
+          <w:sz w:val="22"/>
+          <w:szCs w:val="22"/>
+        </w:rPr>
+        <w:t xml:space="preserve">Die objektorientierte Programmierung bietet eine aufgeräumtere Idee: Du fasst zusammengehörige Daten UND die dazu passenden Tätigkeiten in einem einzigen Gebilde zusammen – einer Klasse. Dieses Kapitel führt dich Schritt für Schritt heran. Lass dir Zeit; das Konzept ist mächtig und am Anfang ungewohnt, aber sobald der Groschen fällt, willst du es nicht mehr missen.</w:t>
+      </w:r>
+    </w:p>
+    <w:p>
+      <w:pPr>
+        <w:pStyle w:val="Heading2"/>
+        <w:keepNext/>
+        <w:keepLines/>
+        <w:spacing w:after="120" w:before="280"/>
+      </w:pPr>
+      <w:r>
+        <w:t xml:space="preserve">Bauplan und Objekt – der zentrale Gedanke</w:t>
+      </w:r>
+    </w:p>
+    <w:p>
+      <w:pPr>
+        <w:spacing w:after="180" w:line="312" w:lineRule="auto"/>
+      </w:pPr>
+      <w:r>
+        <w:rPr>
+          <w:sz w:val="22"/>
+          <w:szCs w:val="22"/>
+        </w:rPr>
+        <w:t xml:space="preserve">Stell dir eine Klasse wie einen Bauplan vor – etwa den Bauplan für ein Haus. Der Plan selbst ist kein Haus; er beschreibt nur, wie ein Haus aussehen soll: wie viele Zimmer es hat, welche Farbe, welche Türen. Aus EINEM Plan kannst du beliebig viele echte Häuser bauen, und jedes ist ein eigenständiges Ding mit eigenen Werten.</w:t>
+      </w:r>
+    </w:p>
+    <w:p>
+      <w:pPr>
+        <w:spacing w:after="180" w:line="312" w:lineRule="auto"/>
+      </w:pPr>
+      <w:r>
+        <w:rPr>
+          <w:sz w:val="22"/>
+          <w:szCs w:val="22"/>
+        </w:rPr>
+        <w:t xml:space="preserve">Genauso ist es hier: Die Klasse ist der Bauplan, das fertige Ding nennt man ein Objekt (oder eine Instanz). Du schreibst die Klasse einmal und erzeugst daraus dann so viele Objekte, wie du brauchst – jeder Gegner ein eigenes Objekt, mit eigenen Lebenspunkten, aber alle nach demselben Plan gebaut.</w:t>
+      </w:r>
+    </w:p>
+    <w:p>
+      <w:pPr>
+        <w:pStyle w:val="ListParagraph"/>
+        <w:numPr>
+          <w:ilvl w:val="0"/>
+          <w:numId w:val="2"/>
+        </w:numPr>
+        <w:spacing w:after="100" w:line="312" w:lineRule="auto"/>
+      </w:pPr>
+      <w:r>
+        <w:rPr>
+          <w:b/>
+          <w:bCs/>
+          <w:sz w:val="22"/>
+          <w:szCs w:val="22"/>
+        </w:rPr>
+        <w:t xml:space="preserve">Klasse  </w:t>
+      </w:r>
+      <w:r>
+        <w:rPr>
+          <w:sz w:val="22"/>
+          <w:szCs w:val="22"/>
+        </w:rPr>
+        <w:t xml:space="preserve">= der Bauplan. Beschreibt, welche Daten (Felder) und welche Tätigkeiten (Methoden) ein Objekt hat.</w:t>
+      </w:r>
+    </w:p>
+    <w:p>
+      <w:pPr>
+        <w:pStyle w:val="ListParagraph"/>
+        <w:numPr>
+          <w:ilvl w:val="0"/>
+          <w:numId w:val="2"/>
+        </w:numPr>
+        <w:spacing w:after="100" w:line="312" w:lineRule="auto"/>
+      </w:pPr>
+      <w:r>
+        <w:rPr>
+          <w:b/>
+          <w:bCs/>
+          <w:sz w:val="22"/>
+          <w:szCs w:val="22"/>
+        </w:rPr>
+        <w:t xml:space="preserve">Objekt  </w:t>
+      </w:r>
+      <w:r>
+        <w:rPr>
+          <w:sz w:val="22"/>
+          <w:szCs w:val="22"/>
+        </w:rPr>
+        <w:t xml:space="preserve">= ein konkretes, aus dem Plan gebautes Exemplar mit eigenen Werten.</w:t>
+      </w:r>
+    </w:p>
+    <w:p>
+      <w:pPr>
+        <w:pStyle w:val="Heading2"/>
+        <w:keepNext/>
+        <w:keepLines/>
+        <w:spacing w:after="120" w:before="280"/>
+      </w:pPr>
+      <w:r>
+        <w:t xml:space="preserve">Eine Klasse definieren</w:t>
+      </w:r>
+    </w:p>
+    <w:p>
+      <w:pPr>
+        <w:spacing w:after="180" w:line="312" w:lineRule="auto"/>
+      </w:pPr>
+      <w:r>
+        <w:rPr>
+          <w:sz w:val="22"/>
+          <w:szCs w:val="22"/>
+        </w:rPr>
+        <w:t xml:space="preserve">Eine Klasse schreibst du zwischen CLASS und END CLASS. Darin stehen zunächst ihre Felder – das sind Variablen, die jedes Objekt für sich besitzt. Du deklarierst sie wie gewohnt mit DIM. Hier ein einfacher Spieler mit Name und Lebenspunkten:</w:t>
+      </w:r>
+    </w:p>
+    <w:p>
+      <w:pPr>
+        <w:keepLines/>
+        <w:pBdr>
+          <w:left w:val="single" w:color="1B6CA8" w:sz="18" w:space="6"/>
+        </w:pBdr>
+        <w:shd w:fill="F4F4F4" w:val="clear"/>
+        <w:spacing w:after="200" w:before="100" w:line="264" w:lineRule="auto"/>
+        <w:ind w:left="140"/>
+      </w:pPr>
+      <w:r>
+        <w:rPr>
+          <w:rFonts w:ascii="Consolas" w:cs="Consolas" w:eastAsia="Consolas" w:hAnsi="Consolas"/>
+          <w:sz w:val="19"/>
+          <w:szCs w:val="19"/>
+        </w:rPr>
+        <w:t xml:space="preserve">CLASS Spieler</w:t>
+      </w:r>
+      <w:r>
+        <w:rPr>
+          <w:rFonts w:ascii="Consolas" w:cs="Consolas" w:eastAsia="Consolas" w:hAnsi="Consolas"/>
+          <w:sz w:val="19"/>
+          <w:szCs w:val="19"/>
+        </w:rPr>
+        <w:br/>
+        <w:t xml:space="preserve">    DIM name AS STRING</w:t>
+      </w:r>
+      <w:r>
+        <w:rPr>
+          <w:rFonts w:ascii="Consolas" w:cs="Consolas" w:eastAsia="Consolas" w:hAnsi="Consolas"/>
+          <w:sz w:val="19"/>
+          <w:szCs w:val="19"/>
+        </w:rPr>
+        <w:br/>
+        <w:t xml:space="preserve">    DIM hp AS INTEGER</w:t>
+      </w:r>
+      <w:r>
+        <w:rPr>
+          <w:rFonts w:ascii="Consolas" w:cs="Consolas" w:eastAsia="Consolas" w:hAnsi="Consolas"/>
+          <w:sz w:val="19"/>
+          <w:szCs w:val="19"/>
+        </w:rPr>
+        <w:br/>
+        <w:t xml:space="preserve">END CLASS</w:t>
+      </w:r>
+    </w:p>
+    <w:p>
+      <w:pPr>
+        <w:spacing w:after="180" w:line="312" w:lineRule="auto"/>
+      </w:pPr>
+      <w:r>
+        <w:rPr>
+          <w:sz w:val="22"/>
+          <w:szCs w:val="22"/>
+        </w:rPr>
+        <w:t xml:space="preserve">Das allein erzeugt noch nichts – es beschreibt nur den Bauplan. Jeder gebaute Spieler wird ein eigenes name- und ein eigenes hp-Feld haben.</w:t>
+      </w:r>
+    </w:p>
+    <w:p>
+      <w:pPr>
+        <w:pStyle w:val="Heading2"/>
+        <w:keepNext/>
+        <w:keepLines/>
+        <w:spacing w:after="120" w:before="280"/>
+      </w:pPr>
+      <w:r>
+        <w:t xml:space="preserve">Ein Objekt erzeugen: NEW</w:t>
+      </w:r>
+    </w:p>
+    <w:p>
+      <w:pPr>
+        <w:spacing w:after="180" w:line="312" w:lineRule="auto"/>
+      </w:pPr>
+      <w:r>
+        <w:rPr>
+          <w:sz w:val="22"/>
+          <w:szCs w:val="22"/>
+        </w:rPr>
+        <w:t xml:space="preserve">Aus dem Bauplan baust du ein echtes Objekt mit dem Schlüsselwort NEW. Das Ergebnis legst du in einer Variablen ab, deren Typ der Klassenname ist. Frisch gebaut tragen die Felder ihre Standardwerte (0 bei Zahlen, leerer Text bei Strings).</w:t>
+      </w:r>
+    </w:p>
+    <w:p>
+      <w:pPr>
+        <w:keepLines/>
+        <w:pBdr>
+          <w:left w:val="single" w:color="1B6CA8" w:sz="18" w:space="6"/>
+        </w:pBdr>
+        <w:shd w:fill="F4F4F4" w:val="clear"/>
+        <w:spacing w:after="200" w:before="100" w:line="264" w:lineRule="auto"/>
+        <w:ind w:left="140"/>
+      </w:pPr>
+      <w:r>
+        <w:rPr>
+          <w:rFonts w:ascii="Consolas" w:cs="Consolas" w:eastAsia="Consolas" w:hAnsi="Consolas"/>
+          <w:sz w:val="19"/>
+          <w:szCs w:val="19"/>
+        </w:rPr>
+        <w:t xml:space="preserve">DIM held AS Spieler        ' eine Variable vom Typ Spieler</w:t>
+      </w:r>
+      <w:r>
+        <w:rPr>
+          <w:rFonts w:ascii="Consolas" w:cs="Consolas" w:eastAsia="Consolas" w:hAnsi="Consolas"/>
+          <w:sz w:val="19"/>
+          <w:szCs w:val="19"/>
+        </w:rPr>
+        <w:br/>
+        <w:t xml:space="preserve">held = NEW Spieler()       ' ein Objekt bauen</w:t>
+      </w:r>
+      <w:r>
+        <w:rPr>
+          <w:rFonts w:ascii="Consolas" w:cs="Consolas" w:eastAsia="Consolas" w:hAnsi="Consolas"/>
+          <w:sz w:val="19"/>
+          <w:szCs w:val="19"/>
+        </w:rPr>
+        <w:br/>
+        <w:t xml:space="preserve"/>
+      </w:r>
+      <w:r>
+        <w:rPr>
+          <w:rFonts w:ascii="Consolas" w:cs="Consolas" w:eastAsia="Consolas" w:hAnsi="Consolas"/>
+          <w:sz w:val="19"/>
+          <w:szCs w:val="19"/>
+        </w:rPr>
+        <w:br/>
+        <w:t xml:space="preserve">held.name = "Mario"        ' Felder über den Punkt ansprechen</w:t>
+      </w:r>
+      <w:r>
+        <w:rPr>
+          <w:rFonts w:ascii="Consolas" w:cs="Consolas" w:eastAsia="Consolas" w:hAnsi="Consolas"/>
+          <w:sz w:val="19"/>
+          <w:szCs w:val="19"/>
+        </w:rPr>
+        <w:br/>
+        <w:t xml:space="preserve">held.hp = 100</w:t>
+      </w:r>
+      <w:r>
+        <w:rPr>
+          <w:rFonts w:ascii="Consolas" w:cs="Consolas" w:eastAsia="Consolas" w:hAnsi="Consolas"/>
+          <w:sz w:val="19"/>
+          <w:szCs w:val="19"/>
+        </w:rPr>
+        <w:br/>
+        <w:t xml:space="preserve">PRINT held.name; " hat "; held.hp; " HP"</w:t>
+      </w:r>
+    </w:p>
+    <w:p>
+      <w:pPr>
+        <w:keepLines/>
+        <w:pBdr>
+          <w:left w:val="single" w:color="9AC79A" w:sz="18" w:space="6"/>
+        </w:pBdr>
+        <w:shd w:fill="EAF4EA" w:val="clear"/>
+        <w:spacing w:after="200" w:before="100" w:line="264" w:lineRule="auto"/>
+        <w:ind w:left="140"/>
+      </w:pPr>
+      <w:r>
+        <w:rPr>
+          <w:rFonts w:ascii="Consolas" w:cs="Consolas" w:eastAsia="Consolas" w:hAnsi="Consolas"/>
+          <w:sz w:val="19"/>
+          <w:szCs w:val="19"/>
+        </w:rPr>
+        <w:t xml:space="preserve">Mario hat 100 HP</w:t>
+      </w:r>
+    </w:p>
+    <w:p>
+      <w:pPr>
+        <w:spacing w:after="180" w:line="312" w:lineRule="auto"/>
+      </w:pPr>
+      <w:r>
+        <w:rPr>
+          <w:sz w:val="22"/>
+          <w:szCs w:val="22"/>
+        </w:rPr>
+        <w:t xml:space="preserve">Den Punkt kennst du schon von den Methoden auf Strings und Maps. Bei Objekten führt er dich zu einem Feld (held.hp) oder gleich zu einer Tätigkeit (held.NimmSchaden(...), siehe unten).</w:t>
+      </w:r>
+    </w:p>
+    <w:p>
+      <w:pPr>
+        <w:pStyle w:val="Heading2"/>
+        <w:keepNext/>
+        <w:keepLines/>
+        <w:spacing w:after="120" w:before="280"/>
+      </w:pPr>
+      <w:r>
+        <w:t xml:space="preserve">Der Konstruktor: SUB Init</w:t>
+      </w:r>
+    </w:p>
+    <w:p>
+      <w:pPr>
+        <w:spacing w:after="180" w:line="312" w:lineRule="auto"/>
+      </w:pPr>
+      <w:r>
+        <w:rPr>
+          <w:sz w:val="22"/>
+          <w:szCs w:val="22"/>
+        </w:rPr>
+        <w:t xml:space="preserve">Es ist mühsam, nach jedem NEW alle Felder von Hand zu setzen. Dafür gibt es einen besonderen Baustein: eine SUB mit dem Namen Init. Sie wird automatisch ausgeführt, sobald du ein Objekt mit NEW erzeugst – und ihre Argumente gibst du direkt beim NEW an. Man nennt sie den Konstruktor („den Erbauer“).</w:t>
+      </w:r>
+    </w:p>
+    <w:p>
+      <w:pPr>
+        <w:spacing w:after="180" w:line="312" w:lineRule="auto"/>
+      </w:pPr>
+      <w:r>
+        <w:rPr>
+          <w:sz w:val="22"/>
+          <w:szCs w:val="22"/>
+        </w:rPr>
+        <w:t xml:space="preserve">In der Init-Methode (und in allen Methoden) brauchst du einen Weg, um „das gerade gebaute Objekt“ anzusprechen. Dafür gibt es das Schlüsselwort Self – es bedeutet immer „dieses Objekt hier, an dem ich gerade arbeite“. Self.hp = 100 setzt also das hp-Feld genau dieses einen Objekts.</w:t>
+      </w:r>
+    </w:p>
+    <w:p>
+      <w:pPr>
+        <w:keepLines/>
+        <w:pBdr>
+          <w:left w:val="single" w:color="1B6CA8" w:sz="18" w:space="6"/>
+        </w:pBdr>
+        <w:shd w:fill="F4F4F4" w:val="clear"/>
+        <w:spacing w:after="200" w:before="100" w:line="264" w:lineRule="auto"/>
+        <w:ind w:left="140"/>
+      </w:pPr>
+      <w:r>
+        <w:rPr>
+          <w:rFonts w:ascii="Consolas" w:cs="Consolas" w:eastAsia="Consolas" w:hAnsi="Consolas"/>
+          <w:sz w:val="19"/>
+          <w:szCs w:val="19"/>
+        </w:rPr>
+        <w:t xml:space="preserve">CLASS Spieler</w:t>
+      </w:r>
+      <w:r>
+        <w:rPr>
+          <w:rFonts w:ascii="Consolas" w:cs="Consolas" w:eastAsia="Consolas" w:hAnsi="Consolas"/>
+          <w:sz w:val="19"/>
+          <w:szCs w:val="19"/>
+        </w:rPr>
+        <w:br/>
+        <w:t xml:space="preserve">    DIM name AS STRING</w:t>
+      </w:r>
+      <w:r>
+        <w:rPr>
+          <w:rFonts w:ascii="Consolas" w:cs="Consolas" w:eastAsia="Consolas" w:hAnsi="Consolas"/>
+          <w:sz w:val="19"/>
+          <w:szCs w:val="19"/>
+        </w:rPr>
+        <w:br/>
+        <w:t xml:space="preserve">    DIM hp AS INTEGER</w:t>
+      </w:r>
+      <w:r>
+        <w:rPr>
+          <w:rFonts w:ascii="Consolas" w:cs="Consolas" w:eastAsia="Consolas" w:hAnsi="Consolas"/>
+          <w:sz w:val="19"/>
+          <w:szCs w:val="19"/>
+        </w:rPr>
+        <w:br/>
+        <w:t xml:space="preserve"/>
+      </w:r>
+      <w:r>
+        <w:rPr>
+          <w:rFonts w:ascii="Consolas" w:cs="Consolas" w:eastAsia="Consolas" w:hAnsi="Consolas"/>
+          <w:sz w:val="19"/>
+          <w:szCs w:val="19"/>
+        </w:rPr>
+        <w:br/>
+        <w:t xml:space="preserve">    SUB Init(n AS STRING)</w:t>
+      </w:r>
+      <w:r>
+        <w:rPr>
+          <w:rFonts w:ascii="Consolas" w:cs="Consolas" w:eastAsia="Consolas" w:hAnsi="Consolas"/>
+          <w:sz w:val="19"/>
+          <w:szCs w:val="19"/>
+        </w:rPr>
+        <w:br/>
+        <w:t xml:space="preserve">        Self.name = n        ' das Feld dieses Objekts ...</w:t>
+      </w:r>
+      <w:r>
+        <w:rPr>
+          <w:rFonts w:ascii="Consolas" w:cs="Consolas" w:eastAsia="Consolas" w:hAnsi="Consolas"/>
+          <w:sz w:val="19"/>
+          <w:szCs w:val="19"/>
+        </w:rPr>
+        <w:br/>
+        <w:t xml:space="preserve">        Self.hp = 100        ' ... mit Startwerten füllen</w:t>
+      </w:r>
+      <w:r>
+        <w:rPr>
+          <w:rFonts w:ascii="Consolas" w:cs="Consolas" w:eastAsia="Consolas" w:hAnsi="Consolas"/>
+          <w:sz w:val="19"/>
+          <w:szCs w:val="19"/>
+        </w:rPr>
+        <w:br/>
+        <w:t xml:space="preserve">    END SUB</w:t>
+      </w:r>
+      <w:r>
+        <w:rPr>
+          <w:rFonts w:ascii="Consolas" w:cs="Consolas" w:eastAsia="Consolas" w:hAnsi="Consolas"/>
+          <w:sz w:val="19"/>
+          <w:szCs w:val="19"/>
+        </w:rPr>
+        <w:br/>
+        <w:t xml:space="preserve">END CLASS</w:t>
+      </w:r>
+      <w:r>
+        <w:rPr>
+          <w:rFonts w:ascii="Consolas" w:cs="Consolas" w:eastAsia="Consolas" w:hAnsi="Consolas"/>
+          <w:sz w:val="19"/>
+          <w:szCs w:val="19"/>
+        </w:rPr>
+        <w:br/>
+        <w:t xml:space="preserve"/>
+      </w:r>
+      <w:r>
+        <w:rPr>
+          <w:rFonts w:ascii="Consolas" w:cs="Consolas" w:eastAsia="Consolas" w:hAnsi="Consolas"/>
+          <w:sz w:val="19"/>
+          <w:szCs w:val="19"/>
+        </w:rPr>
+        <w:br/>
+        <w:t xml:space="preserve">DIM held AS Spieler</w:t>
+      </w:r>
+      <w:r>
+        <w:rPr>
+          <w:rFonts w:ascii="Consolas" w:cs="Consolas" w:eastAsia="Consolas" w:hAnsi="Consolas"/>
+          <w:sz w:val="19"/>
+          <w:szCs w:val="19"/>
+        </w:rPr>
+        <w:br/>
+        <w:t xml:space="preserve">held = NEW Spieler("Mario")  ' Init läuft mit n = "Mario"</w:t>
+      </w:r>
+      <w:r>
+        <w:rPr>
+          <w:rFonts w:ascii="Consolas" w:cs="Consolas" w:eastAsia="Consolas" w:hAnsi="Consolas"/>
+          <w:sz w:val="19"/>
+          <w:szCs w:val="19"/>
+        </w:rPr>
+        <w:br/>
+        <w:t xml:space="preserve">PRINT held.name; " hat "; held.hp; " HP"</w:t>
+      </w:r>
+    </w:p>
+    <w:p>
+      <w:pPr>
+        <w:keepLines/>
+        <w:pBdr>
+          <w:left w:val="single" w:color="9AC79A" w:sz="18" w:space="6"/>
+        </w:pBdr>
+        <w:shd w:fill="EAF4EA" w:val="clear"/>
+        <w:spacing w:after="200" w:before="100" w:line="264" w:lineRule="auto"/>
+        <w:ind w:left="140"/>
+      </w:pPr>
+      <w:r>
+        <w:rPr>
+          <w:rFonts w:ascii="Consolas" w:cs="Consolas" w:eastAsia="Consolas" w:hAnsi="Consolas"/>
+          <w:sz w:val="19"/>
+          <w:szCs w:val="19"/>
+        </w:rPr>
+        <w:t xml:space="preserve">Mario hat 100 HP</w:t>
+      </w:r>
+    </w:p>
+    <w:p>
+      <w:pPr>
+        <w:spacing w:before="60"/>
+      </w:pPr>
+    </w:p>
+    <w:tbl>
+      <w:tblPr>
+        <w:tblW w:type="dxa" w:w="9360"/>
+        <w:tblBorders>
+          <w:top w:val="single" w:color="auto" w:sz="4"/>
+          <w:left w:val="single" w:color="auto" w:sz="4"/>
+          <w:bottom w:val="single" w:color="auto" w:sz="4"/>
+          <w:right w:val="single" w:color="auto" w:sz="4"/>
+          <w:insideH w:val="single" w:color="auto" w:sz="4"/>
+          <w:insideV w:val="single" w:color="auto" w:sz="4"/>
+        </w:tblBorders>
+      </w:tblPr>
+      <w:tblGrid>
+        <w:gridCol w:w="9360"/>
+      </w:tblGrid>
+      <w:tr>
+        <w:trPr>
+          <w:cantSplit/>
+        </w:trPr>
+        <w:tc>
+          <w:tcPr>
+            <w:tcW w:type="dxa" w:w="9360"/>
+            <w:tcBorders>
+              <w:top w:val="single" w:color="E0B96A" w:sz="6"/>
+              <w:left w:val="single" w:color="E0B96A" w:sz="6"/>
+              <w:bottom w:val="single" w:color="E0B96A" w:sz="6"/>
+              <w:right w:val="single" w:color="E0B96A" w:sz="6"/>
+            </w:tcBorders>
+            <w:shd w:fill="FDF3E0" w:val="clear"/>
+            <w:tcMar>
+              <w:top w:type="dxa" w:w="140"/>
+              <w:left w:type="dxa" w:w="180"/>
+              <w:bottom w:type="dxa" w:w="140"/>
+              <w:right w:type="dxa" w:w="180"/>
+            </w:tcMar>
+          </w:tcPr>
+          <w:p>
+            <w:pPr>
+              <w:spacing w:after="40"/>
+            </w:pPr>
+            <w:r>
+              <w:rPr>
+                <w:b/>
+                <w:bCs/>
+                <w:color w:val="9A6A1E"/>
+                <w:sz w:val="22"/>
+                <w:szCs w:val="22"/>
+              </w:rPr>
+              <w:t xml:space="preserve">Merke</w:t>
+            </w:r>
+          </w:p>
+          <w:p>
+            <w:pPr>
+              <w:spacing w:after="0" w:line="312" w:lineRule="auto"/>
+            </w:pPr>
+            <w:r>
+              <w:rPr>
+                <w:sz w:val="22"/>
+                <w:szCs w:val="22"/>
+              </w:rPr>
+              <w:t xml:space="preserve">Self verweist immer auf das Objekt, für das die Methode gerade läuft. Rufst du held.NimmSchaden(...) auf, ist Self innerhalb der Methode der held; rufst du gegner.NimmSchaden(...) auf, ist Self der gegner. So arbeitet derselbe Methoden-Code für jedes Objekt mit dessen eigenen Daten.</w:t>
+            </w:r>
+          </w:p>
+        </w:tc>
+      </w:tr>
+    </w:tbl>
+    <w:p>
+      <w:pPr>
+        <w:spacing w:after="160"/>
+      </w:pPr>
+    </w:p>
+    <w:p>
+      <w:pPr>
+        <w:pStyle w:val="Heading2"/>
+        <w:keepNext/>
+        <w:keepLines/>
+        <w:spacing w:after="120" w:before="280"/>
+      </w:pPr>
+      <w:r>
+        <w:t xml:space="preserve">Methoden: Tätigkeiten der Klasse</w:t>
+      </w:r>
+    </w:p>
+    <w:p>
+      <w:pPr>
+        <w:spacing w:after="180" w:line="312" w:lineRule="auto"/>
+      </w:pPr>
+      <w:r>
+        <w:rPr>
+          <w:sz w:val="22"/>
+          <w:szCs w:val="22"/>
+        </w:rPr>
+        <w:t xml:space="preserve">Bis jetzt hat unsere Klasse nur Daten. Das eigentlich Spannende sind Methoden: Funktionen und SUBs, die INNERHALB der Klasse stehen und auf deren Feldern arbeiten. Eine Methode definierst du genau wie eine normale SUB oder FUNCTION (Kapitel „Funktionen &amp; SUBs“) – nur eben im Klassen-Body und mit Zugriff auf Self.</w:t>
+      </w:r>
+    </w:p>
+    <w:p>
+      <w:pPr>
+        <w:spacing w:after="180" w:line="312" w:lineRule="auto"/>
+      </w:pPr>
+      <w:r>
+        <w:rPr>
+          <w:sz w:val="22"/>
+          <w:szCs w:val="22"/>
+        </w:rPr>
+        <w:t xml:space="preserve">Erweitern wir den Spieler um Verhalten: Schaden nehmen, prüfen ob er noch lebt, seinen Status ausgeben.</w:t>
+      </w:r>
+    </w:p>
+    <w:p>
+      <w:pPr>
+        <w:keepLines/>
+        <w:pBdr>
+          <w:left w:val="single" w:color="1B6CA8" w:sz="18" w:space="6"/>
+        </w:pBdr>
+        <w:shd w:fill="F4F4F4" w:val="clear"/>
+        <w:spacing w:after="200" w:before="100" w:line="264" w:lineRule="auto"/>
+        <w:ind w:left="140"/>
+      </w:pPr>
+      <w:r>
+        <w:rPr>
+          <w:rFonts w:ascii="Consolas" w:cs="Consolas" w:eastAsia="Consolas" w:hAnsi="Consolas"/>
+          <w:sz w:val="19"/>
+          <w:szCs w:val="19"/>
+        </w:rPr>
+        <w:t xml:space="preserve">CLASS Spieler</w:t>
+      </w:r>
+      <w:r>
+        <w:rPr>
+          <w:rFonts w:ascii="Consolas" w:cs="Consolas" w:eastAsia="Consolas" w:hAnsi="Consolas"/>
+          <w:sz w:val="19"/>
+          <w:szCs w:val="19"/>
+        </w:rPr>
+        <w:br/>
+        <w:t xml:space="preserve">    DIM name AS STRING</w:t>
+      </w:r>
+      <w:r>
+        <w:rPr>
+          <w:rFonts w:ascii="Consolas" w:cs="Consolas" w:eastAsia="Consolas" w:hAnsi="Consolas"/>
+          <w:sz w:val="19"/>
+          <w:szCs w:val="19"/>
+        </w:rPr>
+        <w:br/>
+        <w:t xml:space="preserve">    DIM hp AS INTEGER</w:t>
+      </w:r>
+      <w:r>
+        <w:rPr>
+          <w:rFonts w:ascii="Consolas" w:cs="Consolas" w:eastAsia="Consolas" w:hAnsi="Consolas"/>
+          <w:sz w:val="19"/>
+          <w:szCs w:val="19"/>
+        </w:rPr>
+        <w:br/>
+        <w:t xml:space="preserve"/>
+      </w:r>
+      <w:r>
+        <w:rPr>
+          <w:rFonts w:ascii="Consolas" w:cs="Consolas" w:eastAsia="Consolas" w:hAnsi="Consolas"/>
+          <w:sz w:val="19"/>
+          <w:szCs w:val="19"/>
+        </w:rPr>
+        <w:br/>
+        <w:t xml:space="preserve">    SUB Init(n AS STRING)</w:t>
+      </w:r>
+      <w:r>
+        <w:rPr>
+          <w:rFonts w:ascii="Consolas" w:cs="Consolas" w:eastAsia="Consolas" w:hAnsi="Consolas"/>
+          <w:sz w:val="19"/>
+          <w:szCs w:val="19"/>
+        </w:rPr>
+        <w:br/>
+        <w:t xml:space="preserve">        Self.name = n</w:t>
+      </w:r>
+      <w:r>
+        <w:rPr>
+          <w:rFonts w:ascii="Consolas" w:cs="Consolas" w:eastAsia="Consolas" w:hAnsi="Consolas"/>
+          <w:sz w:val="19"/>
+          <w:szCs w:val="19"/>
+        </w:rPr>
+        <w:br/>
+        <w:t xml:space="preserve">        Self.hp = 100</w:t>
+      </w:r>
+      <w:r>
+        <w:rPr>
+          <w:rFonts w:ascii="Consolas" w:cs="Consolas" w:eastAsia="Consolas" w:hAnsi="Consolas"/>
+          <w:sz w:val="19"/>
+          <w:szCs w:val="19"/>
+        </w:rPr>
+        <w:br/>
+        <w:t xml:space="preserve">    END SUB</w:t>
+      </w:r>
+      <w:r>
+        <w:rPr>
+          <w:rFonts w:ascii="Consolas" w:cs="Consolas" w:eastAsia="Consolas" w:hAnsi="Consolas"/>
+          <w:sz w:val="19"/>
+          <w:szCs w:val="19"/>
+        </w:rPr>
+        <w:br/>
+        <w:t xml:space="preserve"/>
+      </w:r>
+      <w:r>
+        <w:rPr>
+          <w:rFonts w:ascii="Consolas" w:cs="Consolas" w:eastAsia="Consolas" w:hAnsi="Consolas"/>
+          <w:sz w:val="19"/>
+          <w:szCs w:val="19"/>
+        </w:rPr>
+        <w:br/>
+        <w:t xml:space="preserve">    SUB NimmSchaden(menge AS INTEGER)</w:t>
+      </w:r>
+      <w:r>
+        <w:rPr>
+          <w:rFonts w:ascii="Consolas" w:cs="Consolas" w:eastAsia="Consolas" w:hAnsi="Consolas"/>
+          <w:sz w:val="19"/>
+          <w:szCs w:val="19"/>
+        </w:rPr>
+        <w:br/>
+        <w:t xml:space="preserve">        Self.hp = Self.hp - menge</w:t>
+      </w:r>
+      <w:r>
+        <w:rPr>
+          <w:rFonts w:ascii="Consolas" w:cs="Consolas" w:eastAsia="Consolas" w:hAnsi="Consolas"/>
+          <w:sz w:val="19"/>
+          <w:szCs w:val="19"/>
+        </w:rPr>
+        <w:br/>
+        <w:t xml:space="preserve">        IF Self.hp &lt; 0 THEN Self.hp = 0</w:t>
+      </w:r>
+      <w:r>
+        <w:rPr>
+          <w:rFonts w:ascii="Consolas" w:cs="Consolas" w:eastAsia="Consolas" w:hAnsi="Consolas"/>
+          <w:sz w:val="19"/>
+          <w:szCs w:val="19"/>
+        </w:rPr>
+        <w:br/>
+        <w:t xml:space="preserve">    END SUB</w:t>
+      </w:r>
+      <w:r>
+        <w:rPr>
+          <w:rFonts w:ascii="Consolas" w:cs="Consolas" w:eastAsia="Consolas" w:hAnsi="Consolas"/>
+          <w:sz w:val="19"/>
+          <w:szCs w:val="19"/>
+        </w:rPr>
+        <w:br/>
+        <w:t xml:space="preserve"/>
+      </w:r>
+      <w:r>
+        <w:rPr>
+          <w:rFonts w:ascii="Consolas" w:cs="Consolas" w:eastAsia="Consolas" w:hAnsi="Consolas"/>
+          <w:sz w:val="19"/>
+          <w:szCs w:val="19"/>
+        </w:rPr>
+        <w:br/>
+        <w:t xml:space="preserve">    FUNCTION IstAmLeben() AS BOOLEAN</w:t>
+      </w:r>
+      <w:r>
+        <w:rPr>
+          <w:rFonts w:ascii="Consolas" w:cs="Consolas" w:eastAsia="Consolas" w:hAnsi="Consolas"/>
+          <w:sz w:val="19"/>
+          <w:szCs w:val="19"/>
+        </w:rPr>
+        <w:br/>
+        <w:t xml:space="preserve">        RETURN Self.hp &gt; 0</w:t>
+      </w:r>
+      <w:r>
+        <w:rPr>
+          <w:rFonts w:ascii="Consolas" w:cs="Consolas" w:eastAsia="Consolas" w:hAnsi="Consolas"/>
+          <w:sz w:val="19"/>
+          <w:szCs w:val="19"/>
+        </w:rPr>
+        <w:br/>
+        <w:t xml:space="preserve">    END FUNCTION</w:t>
+      </w:r>
+      <w:r>
+        <w:rPr>
+          <w:rFonts w:ascii="Consolas" w:cs="Consolas" w:eastAsia="Consolas" w:hAnsi="Consolas"/>
+          <w:sz w:val="19"/>
+          <w:szCs w:val="19"/>
+        </w:rPr>
+        <w:br/>
+        <w:t xml:space="preserve"/>
+      </w:r>
+      <w:r>
+        <w:rPr>
+          <w:rFonts w:ascii="Consolas" w:cs="Consolas" w:eastAsia="Consolas" w:hAnsi="Consolas"/>
+          <w:sz w:val="19"/>
+          <w:szCs w:val="19"/>
+        </w:rPr>
+        <w:br/>
+        <w:t xml:space="preserve">    SUB Status()</w:t>
+      </w:r>
+      <w:r>
+        <w:rPr>
+          <w:rFonts w:ascii="Consolas" w:cs="Consolas" w:eastAsia="Consolas" w:hAnsi="Consolas"/>
+          <w:sz w:val="19"/>
+          <w:szCs w:val="19"/>
+        </w:rPr>
+        <w:br/>
+        <w:t xml:space="preserve">        PRINT Self.name; ": "; Self.hp; " HP"</w:t>
+      </w:r>
+      <w:r>
+        <w:rPr>
+          <w:rFonts w:ascii="Consolas" w:cs="Consolas" w:eastAsia="Consolas" w:hAnsi="Consolas"/>
+          <w:sz w:val="19"/>
+          <w:szCs w:val="19"/>
+        </w:rPr>
+        <w:br/>
+        <w:t xml:space="preserve">    END SUB</w:t>
+      </w:r>
+      <w:r>
+        <w:rPr>
+          <w:rFonts w:ascii="Consolas" w:cs="Consolas" w:eastAsia="Consolas" w:hAnsi="Consolas"/>
+          <w:sz w:val="19"/>
+          <w:szCs w:val="19"/>
+        </w:rPr>
+        <w:br/>
+        <w:t xml:space="preserve">END CLASS</w:t>
+      </w:r>
+    </w:p>
+    <w:p>
+      <w:pPr>
+        <w:spacing w:after="180" w:line="312" w:lineRule="auto"/>
+      </w:pPr>
+      <w:r>
+        <w:rPr>
+          <w:sz w:val="22"/>
+          <w:szCs w:val="22"/>
+        </w:rPr>
+        <w:t xml:space="preserve">Jetzt kannst du dem Objekt Befehle geben, indem du die Methode mit dem Punkt aufrufst. Das liest sich fast wie ein Satz: „held, nimm 30 Schaden.“</w:t>
+      </w:r>
+    </w:p>
+    <w:p>
+      <w:pPr>
+        <w:keepLines/>
+        <w:pBdr>
+          <w:left w:val="single" w:color="1B6CA8" w:sz="18" w:space="6"/>
+        </w:pBdr>
+        <w:shd w:fill="F4F4F4" w:val="clear"/>
+        <w:spacing w:after="200" w:before="100" w:line="264" w:lineRule="auto"/>
+        <w:ind w:left="140"/>
+      </w:pPr>
+      <w:r>
+        <w:rPr>
+          <w:rFonts w:ascii="Consolas" w:cs="Consolas" w:eastAsia="Consolas" w:hAnsi="Consolas"/>
+          <w:sz w:val="19"/>
+          <w:szCs w:val="19"/>
+        </w:rPr>
+        <w:t xml:space="preserve">DIM held AS Spieler</w:t>
+      </w:r>
+      <w:r>
+        <w:rPr>
+          <w:rFonts w:ascii="Consolas" w:cs="Consolas" w:eastAsia="Consolas" w:hAnsi="Consolas"/>
+          <w:sz w:val="19"/>
+          <w:szCs w:val="19"/>
+        </w:rPr>
+        <w:br/>
+        <w:t xml:space="preserve">held = NEW Spieler("Mario")</w:t>
+      </w:r>
+      <w:r>
+        <w:rPr>
+          <w:rFonts w:ascii="Consolas" w:cs="Consolas" w:eastAsia="Consolas" w:hAnsi="Consolas"/>
+          <w:sz w:val="19"/>
+          <w:szCs w:val="19"/>
+        </w:rPr>
+        <w:br/>
+        <w:t xml:space="preserve">held.Status()</w:t>
+      </w:r>
+      <w:r>
+        <w:rPr>
+          <w:rFonts w:ascii="Consolas" w:cs="Consolas" w:eastAsia="Consolas" w:hAnsi="Consolas"/>
+          <w:sz w:val="19"/>
+          <w:szCs w:val="19"/>
+        </w:rPr>
+        <w:br/>
+        <w:t xml:space="preserve">held.NimmSchaden(30)</w:t>
+      </w:r>
+      <w:r>
+        <w:rPr>
+          <w:rFonts w:ascii="Consolas" w:cs="Consolas" w:eastAsia="Consolas" w:hAnsi="Consolas"/>
+          <w:sz w:val="19"/>
+          <w:szCs w:val="19"/>
+        </w:rPr>
+        <w:br/>
+        <w:t xml:space="preserve">held.Status()</w:t>
+      </w:r>
+      <w:r>
+        <w:rPr>
+          <w:rFonts w:ascii="Consolas" w:cs="Consolas" w:eastAsia="Consolas" w:hAnsi="Consolas"/>
+          <w:sz w:val="19"/>
+          <w:szCs w:val="19"/>
+        </w:rPr>
+        <w:br/>
+        <w:t xml:space="preserve">PRINT "Noch am Leben? "; held.IstAmLeben()</w:t>
+      </w:r>
+      <w:r>
+        <w:rPr>
+          <w:rFonts w:ascii="Consolas" w:cs="Consolas" w:eastAsia="Consolas" w:hAnsi="Consolas"/>
+          <w:sz w:val="19"/>
+          <w:szCs w:val="19"/>
+        </w:rPr>
+        <w:br/>
+        <w:t xml:space="preserve">held.NimmSchaden(100)        ' mehr als die restlichen HP</w:t>
+      </w:r>
+      <w:r>
+        <w:rPr>
+          <w:rFonts w:ascii="Consolas" w:cs="Consolas" w:eastAsia="Consolas" w:hAnsi="Consolas"/>
+          <w:sz w:val="19"/>
+          <w:szCs w:val="19"/>
+        </w:rPr>
+        <w:br/>
+        <w:t xml:space="preserve">held.Status()</w:t>
+      </w:r>
+      <w:r>
+        <w:rPr>
+          <w:rFonts w:ascii="Consolas" w:cs="Consolas" w:eastAsia="Consolas" w:hAnsi="Consolas"/>
+          <w:sz w:val="19"/>
+          <w:szCs w:val="19"/>
+        </w:rPr>
+        <w:br/>
+        <w:t xml:space="preserve">PRINT "Noch am Leben? "; held.IstAmLeben()</w:t>
+      </w:r>
+    </w:p>
+    <w:p>
+      <w:pPr>
+        <w:keepLines/>
+        <w:pBdr>
+          <w:left w:val="single" w:color="9AC79A" w:sz="18" w:space="6"/>
+        </w:pBdr>
+        <w:shd w:fill="EAF4EA" w:val="clear"/>
+        <w:spacing w:after="200" w:before="100" w:line="264" w:lineRule="auto"/>
+        <w:ind w:left="140"/>
+      </w:pPr>
+      <w:r>
+        <w:rPr>
+          <w:rFonts w:ascii="Consolas" w:cs="Consolas" w:eastAsia="Consolas" w:hAnsi="Consolas"/>
+          <w:sz w:val="19"/>
+          <w:szCs w:val="19"/>
+        </w:rPr>
+        <w:t xml:space="preserve">Mario: 100 HP</w:t>
+      </w:r>
+      <w:r>
+        <w:rPr>
+          <w:rFonts w:ascii="Consolas" w:cs="Consolas" w:eastAsia="Consolas" w:hAnsi="Consolas"/>
+          <w:sz w:val="19"/>
+          <w:szCs w:val="19"/>
+        </w:rPr>
+        <w:br/>
+        <w:t xml:space="preserve">Mario: 70 HP</w:t>
+      </w:r>
+      <w:r>
+        <w:rPr>
+          <w:rFonts w:ascii="Consolas" w:cs="Consolas" w:eastAsia="Consolas" w:hAnsi="Consolas"/>
+          <w:sz w:val="19"/>
+          <w:szCs w:val="19"/>
+        </w:rPr>
+        <w:br/>
+        <w:t xml:space="preserve">Noch am Leben? TRUE</w:t>
+      </w:r>
+      <w:r>
+        <w:rPr>
+          <w:rFonts w:ascii="Consolas" w:cs="Consolas" w:eastAsia="Consolas" w:hAnsi="Consolas"/>
+          <w:sz w:val="19"/>
+          <w:szCs w:val="19"/>
+        </w:rPr>
+        <w:br/>
+        <w:t xml:space="preserve">Mario: 0 HP</w:t>
+      </w:r>
+      <w:r>
+        <w:rPr>
+          <w:rFonts w:ascii="Consolas" w:cs="Consolas" w:eastAsia="Consolas" w:hAnsi="Consolas"/>
+          <w:sz w:val="19"/>
+          <w:szCs w:val="19"/>
+        </w:rPr>
+        <w:br/>
+        <w:t xml:space="preserve">Noch am Leben? FALSE</w:t>
+      </w:r>
+    </w:p>
+    <w:p>
+      <w:pPr>
+        <w:spacing w:before="60"/>
+      </w:pPr>
+    </w:p>
+    <w:tbl>
+      <w:tblPr>
+        <w:tblW w:type="dxa" w:w="9360"/>
+        <w:tblBorders>
+          <w:top w:val="single" w:color="auto" w:sz="4"/>
+          <w:left w:val="single" w:color="auto" w:sz="4"/>
+          <w:bottom w:val="single" w:color="auto" w:sz="4"/>
+          <w:right w:val="single" w:color="auto" w:sz="4"/>
+          <w:insideH w:val="single" w:color="auto" w:sz="4"/>
+          <w:insideV w:val="single" w:color="auto" w:sz="4"/>
+        </w:tblBorders>
+      </w:tblPr>
+      <w:tblGrid>
+        <w:gridCol w:w="9360"/>
+      </w:tblGrid>
+      <w:tr>
+        <w:trPr>
+          <w:cantSplit/>
+        </w:trPr>
+        <w:tc>
+          <w:tcPr>
+            <w:tcW w:type="dxa" w:w="9360"/>
+            <w:tcBorders>
+              <w:top w:val="single" w:color="E0B96A" w:sz="6"/>
+              <w:left w:val="single" w:color="E0B96A" w:sz="6"/>
+              <w:bottom w:val="single" w:color="E0B96A" w:sz="6"/>
+              <w:right w:val="single" w:color="E0B96A" w:sz="6"/>
+            </w:tcBorders>
+            <w:shd w:fill="FDF3E0" w:val="clear"/>
+            <w:tcMar>
+              <w:top w:type="dxa" w:w="140"/>
+              <w:left w:type="dxa" w:w="180"/>
+              <w:bottom w:type="dxa" w:w="140"/>
+              <w:right w:type="dxa" w:w="180"/>
+            </w:tcMar>
+          </w:tcPr>
+          <w:p>
+            <w:pPr>
+              <w:spacing w:after="40"/>
+            </w:pPr>
+            <w:r>
+              <w:rPr>
+                <w:b/>
+                <w:bCs/>
+                <w:color w:val="9A6A1E"/>
+                <w:sz w:val="22"/>
+                <w:szCs w:val="22"/>
+              </w:rPr>
+              <w:t xml:space="preserve">Merke</w:t>
+            </w:r>
+          </w:p>
+          <w:p>
+            <w:pPr>
+              <w:spacing w:after="0" w:line="312" w:lineRule="auto"/>
+            </w:pPr>
+            <w:r>
+              <w:rPr>
+                <w:sz w:val="22"/>
+                <w:szCs w:val="22"/>
+              </w:rPr>
+              <w:t xml:space="preserve">Innerhalb einer Methode darfst du eine andere Methode derselben Klasse auch ohne Self. aufrufen – ein bloßes Reset() genügt und ist dasselbe wie Self.Reset(). Beides ist erlaubt; das Self. macht nur besonders deutlich, dass es um eine Methode des eigenen Objekts geht.</w:t>
+            </w:r>
+          </w:p>
+        </w:tc>
+      </w:tr>
+    </w:tbl>
+    <w:p>
+      <w:pPr>
+        <w:spacing w:after="160"/>
+      </w:pPr>
+    </w:p>
+    <w:p>
+      <w:pPr>
+        <w:pStyle w:val="Heading2"/>
+        <w:keepNext/>
+        <w:keepLines/>
+        <w:spacing w:after="120" w:before="280"/>
+      </w:pPr>
+      <w:r>
+        <w:t xml:space="preserve">Viele Objekte, jedes für sich</w:t>
+      </w:r>
+    </w:p>
+    <w:p>
+      <w:pPr>
+        <w:spacing w:after="180" w:line="312" w:lineRule="auto"/>
+      </w:pPr>
+      <w:r>
+        <w:rPr>
+          <w:sz w:val="22"/>
+          <w:szCs w:val="22"/>
+        </w:rPr>
+        <w:t xml:space="preserve">Der ganze Sinn eines Bauplans ist, dass du daraus viele eigenständige Objekte baust. Jedes hat seinen eigenen Satz Felder – verändere das eine, bleibt das andere unberührt. So verwaltest du mühelos einen ganzen Schwung Spieler oder Gegner, alle mit derselben Klasse:</w:t>
+      </w:r>
+    </w:p>
+    <w:p>
+      <w:pPr>
+        <w:keepLines/>
+        <w:pBdr>
+          <w:left w:val="single" w:color="1B6CA8" w:sz="18" w:space="6"/>
+        </w:pBdr>
+        <w:shd w:fill="F4F4F4" w:val="clear"/>
+        <w:spacing w:after="200" w:before="100" w:line="264" w:lineRule="auto"/>
+        <w:ind w:left="140"/>
+      </w:pPr>
+      <w:r>
+        <w:rPr>
+          <w:rFonts w:ascii="Consolas" w:cs="Consolas" w:eastAsia="Consolas" w:hAnsi="Consolas"/>
+          <w:sz w:val="19"/>
+          <w:szCs w:val="19"/>
+        </w:rPr>
+        <w:t xml:space="preserve">DIM held AS Spieler</w:t>
+      </w:r>
+      <w:r>
+        <w:rPr>
+          <w:rFonts w:ascii="Consolas" w:cs="Consolas" w:eastAsia="Consolas" w:hAnsi="Consolas"/>
+          <w:sz w:val="19"/>
+          <w:szCs w:val="19"/>
+        </w:rPr>
+        <w:br/>
+        <w:t xml:space="preserve">DIM gegner AS Spieler</w:t>
+      </w:r>
+      <w:r>
+        <w:rPr>
+          <w:rFonts w:ascii="Consolas" w:cs="Consolas" w:eastAsia="Consolas" w:hAnsi="Consolas"/>
+          <w:sz w:val="19"/>
+          <w:szCs w:val="19"/>
+        </w:rPr>
+        <w:br/>
+        <w:t xml:space="preserve">held = NEW Spieler("Mario")</w:t>
+      </w:r>
+      <w:r>
+        <w:rPr>
+          <w:rFonts w:ascii="Consolas" w:cs="Consolas" w:eastAsia="Consolas" w:hAnsi="Consolas"/>
+          <w:sz w:val="19"/>
+          <w:szCs w:val="19"/>
+        </w:rPr>
+        <w:br/>
+        <w:t xml:space="preserve">gegner = NEW Spieler("Goomba")</w:t>
+      </w:r>
+      <w:r>
+        <w:rPr>
+          <w:rFonts w:ascii="Consolas" w:cs="Consolas" w:eastAsia="Consolas" w:hAnsi="Consolas"/>
+          <w:sz w:val="19"/>
+          <w:szCs w:val="19"/>
+        </w:rPr>
+        <w:br/>
+        <w:t xml:space="preserve"/>
+      </w:r>
+      <w:r>
+        <w:rPr>
+          <w:rFonts w:ascii="Consolas" w:cs="Consolas" w:eastAsia="Consolas" w:hAnsi="Consolas"/>
+          <w:sz w:val="19"/>
+          <w:szCs w:val="19"/>
+        </w:rPr>
+        <w:br/>
+        <w:t xml:space="preserve">held.NimmSchaden(40)         ' nur der Held nimmt Schaden</w:t>
+      </w:r>
+      <w:r>
+        <w:rPr>
+          <w:rFonts w:ascii="Consolas" w:cs="Consolas" w:eastAsia="Consolas" w:hAnsi="Consolas"/>
+          <w:sz w:val="19"/>
+          <w:szCs w:val="19"/>
+        </w:rPr>
+        <w:br/>
+        <w:t xml:space="preserve">held.Status()</w:t>
+      </w:r>
+      <w:r>
+        <w:rPr>
+          <w:rFonts w:ascii="Consolas" w:cs="Consolas" w:eastAsia="Consolas" w:hAnsi="Consolas"/>
+          <w:sz w:val="19"/>
+          <w:szCs w:val="19"/>
+        </w:rPr>
+        <w:br/>
+        <w:t xml:space="preserve">gegner.Status()              ' der Gegner ist unberührt</w:t>
+      </w:r>
+    </w:p>
+    <w:p>
+      <w:pPr>
+        <w:keepLines/>
+        <w:pBdr>
+          <w:left w:val="single" w:color="9AC79A" w:sz="18" w:space="6"/>
+        </w:pBdr>
+        <w:shd w:fill="EAF4EA" w:val="clear"/>
+        <w:spacing w:after="200" w:before="100" w:line="264" w:lineRule="auto"/>
+        <w:ind w:left="140"/>
+      </w:pPr>
+      <w:r>
+        <w:rPr>
+          <w:rFonts w:ascii="Consolas" w:cs="Consolas" w:eastAsia="Consolas" w:hAnsi="Consolas"/>
+          <w:sz w:val="19"/>
+          <w:szCs w:val="19"/>
+        </w:rPr>
+        <w:t xml:space="preserve">Mario: 60 HP</w:t>
+      </w:r>
+      <w:r>
+        <w:rPr>
+          <w:rFonts w:ascii="Consolas" w:cs="Consolas" w:eastAsia="Consolas" w:hAnsi="Consolas"/>
+          <w:sz w:val="19"/>
+          <w:szCs w:val="19"/>
+        </w:rPr>
+        <w:br/>
+        <w:t xml:space="preserve">Goomba: 100 HP</w:t>
+      </w:r>
+    </w:p>
+    <w:p>
+      <w:pPr>
+        <w:spacing w:before="60"/>
+      </w:pPr>
+    </w:p>
+    <w:tbl>
+      <w:tblPr>
+        <w:tblW w:type="dxa" w:w="9360"/>
+        <w:tblBorders>
+          <w:top w:val="single" w:color="auto" w:sz="4"/>
+          <w:left w:val="single" w:color="auto" w:sz="4"/>
+          <w:bottom w:val="single" w:color="auto" w:sz="4"/>
+          <w:right w:val="single" w:color="auto" w:sz="4"/>
+          <w:insideH w:val="single" w:color="auto" w:sz="4"/>
+          <w:insideV w:val="single" w:color="auto" w:sz="4"/>
+        </w:tblBorders>
+      </w:tblPr>
+      <w:tblGrid>
+        <w:gridCol w:w="9360"/>
+      </w:tblGrid>
+      <w:tr>
+        <w:trPr>
+          <w:cantSplit/>
+        </w:trPr>
+        <w:tc>
+          <w:tcPr>
+            <w:tcW w:type="dxa" w:w="9360"/>
+            <w:tcBorders>
+              <w:top w:val="single" w:color="E0A0A0" w:sz="6"/>
+              <w:left w:val="single" w:color="E0A0A0" w:sz="6"/>
+              <w:bottom w:val="single" w:color="E0A0A0" w:sz="6"/>
+              <w:right w:val="single" w:color="E0A0A0" w:sz="6"/>
+            </w:tcBorders>
+            <w:shd w:fill="FBEAEA" w:val="clear"/>
+            <w:tcMar>
+              <w:top w:type="dxa" w:w="140"/>
+              <w:left w:type="dxa" w:w="180"/>
+              <w:bottom w:type="dxa" w:w="140"/>
+              <w:right w:type="dxa" w:w="180"/>
+            </w:tcMar>
+          </w:tcPr>
+          <w:p>
+            <w:pPr>
+              <w:spacing w:after="40"/>
+            </w:pPr>
+            <w:r>
+              <w:rPr>
+                <w:b/>
+                <w:bCs/>
+                <w:color w:val="B23030"/>
+                <w:sz w:val="22"/>
+                <w:szCs w:val="22"/>
+              </w:rPr>
+              <w:t xml:space="preserve">Achtung</w:t>
+            </w:r>
+          </w:p>
+          <w:p>
+            <w:pPr>
+              <w:spacing w:after="0" w:line="312" w:lineRule="auto"/>
+            </w:pPr>
+            <w:r>
+              <w:rPr>
+                <w:sz w:val="22"/>
+                <w:szCs w:val="22"/>
+              </w:rPr>
+              <w:t xml:space="preserve">Ein Objekt ist – wie Array und Map – ein Verweis-Wert. Schreibst du zweiterHeld = held, entsteht KEINE Kopie: Beide Namen zeigen auf dasselbe Objekt, und eine Änderung über den einen wirkt auch auf den anderen. Willst du einen echten zweiten Spieler, baue ihn mit einem eigenen NEW.</w:t>
+            </w:r>
+          </w:p>
+        </w:tc>
+      </w:tr>
+    </w:tbl>
+    <w:p>
+      <w:pPr>
+        <w:spacing w:after="160"/>
+      </w:pPr>
+    </w:p>
+    <w:p>
+      <w:pPr>
+        <w:spacing w:before="60"/>
+      </w:pPr>
+    </w:p>
+    <w:tbl>
+      <w:tblPr>
+        <w:tblW w:type="dxa" w:w="9360"/>
+        <w:tblBorders>
+          <w:top w:val="single" w:color="auto" w:sz="4"/>
+          <w:left w:val="single" w:color="auto" w:sz="4"/>
+          <w:bottom w:val="single" w:color="auto" w:sz="4"/>
+          <w:right w:val="single" w:color="auto" w:sz="4"/>
+          <w:insideH w:val="single" w:color="auto" w:sz="4"/>
+          <w:insideV w:val="single" w:color="auto" w:sz="4"/>
+        </w:tblBorders>
+      </w:tblPr>
+      <w:tblGrid>
+        <w:gridCol w:w="9360"/>
+      </w:tblGrid>
+      <w:tr>
+        <w:trPr>
+          <w:cantSplit/>
+        </w:trPr>
+        <w:tc>
+          <w:tcPr>
+            <w:tcW w:type="dxa" w:w="9360"/>
+            <w:tcBorders>
+              <w:top w:val="single" w:color="9CC8E6" w:sz="6"/>
+              <w:left w:val="single" w:color="9CC8E6" w:sz="6"/>
+              <w:bottom w:val="single" w:color="9CC8E6" w:sz="6"/>
+              <w:right w:val="single" w:color="9CC8E6" w:sz="6"/>
+            </w:tcBorders>
+            <w:shd w:fill="E7F2FA" w:val="clear"/>
+            <w:tcMar>
+              <w:top w:type="dxa" w:w="140"/>
+              <w:left w:type="dxa" w:w="180"/>
+              <w:bottom w:type="dxa" w:w="140"/>
+              <w:right w:type="dxa" w:w="180"/>
+            </w:tcMar>
+          </w:tcPr>
+          <w:p>
+            <w:pPr>
+              <w:spacing w:after="40"/>
+            </w:pPr>
+            <w:r>
+              <w:rPr>
+                <w:b/>
+                <w:bCs/>
+                <w:color w:val="1B6CA8"/>
+                <w:sz w:val="22"/>
+                <w:szCs w:val="22"/>
+              </w:rPr>
+              <w:t xml:space="preserve">Wann eine eigene Klasse?</w:t>
+            </w:r>
+          </w:p>
+          <w:p>
+            <w:pPr>
+              <w:spacing w:after="0" w:line="312" w:lineRule="auto"/>
+            </w:pPr>
+            <w:r>
+              <w:rPr>
+                <w:sz w:val="22"/>
+                <w:szCs w:val="22"/>
+              </w:rPr>
+              <w:t xml:space="preserve">Eine Klasse lohnt sich, sobald mehrere Daten zusammengehören und es Tätigkeiten gibt, die auf ihnen arbeiten – ein Spieler, ein Gegner, ein Item, eine Spielkarte. Faustregel: Wenn du dich bei Variablennamen mit gleichem Präfix ertappst (spieler_x, spieler_y, spieler_hp), ist das fast immer der Ruf nach einer Klasse. Im nächsten Kapitel geht es weiter mit Vererbung, Properties, Operatoren und statischen Mitgliedern.</w:t>
             </w:r>
           </w:p>
         </w:tc>

</xml_diff>

<commit_message>
docs(buch): Lehrbuch Kap 21 -- Vererbung, Properties, Operatoren, Static
EXTENDS (erben/ueberschreiben/Polymorphie inkl. Init-Hinweis), PROPERTY
GET/SET (Wert-Waechter mit value), OPERATOR-Ueberladung, STATIC CONST.
Vier fortgeschrittene OOP-Themen ausfuehrlich, je mit Mentalmodell.
Alle Beispiel-Ausgaben gegen gbrt verifiziert.

Co-Authored-By: Claude Opus 4.8 (1M context) <noreply@anthropic.com>
</commit_message>
<xml_diff>
--- a/buch-referenz/buch/GameBasic-Lehrbuch.docx
+++ b/buch-referenz/buch/GameBasic-Lehrbuch.docx
@@ -543,6 +543,33 @@
           <w:szCs w:val="22"/>
         </w:rPr>
         <w:t xml:space="preserve">	61</w:t>
+      </w:r>
+    </w:p>
+    <w:p>
+      <w:pPr>
+        <w:tabs>
+          <w:tab w:val="right" w:pos="9200" w:leader="dot"/>
+        </w:tabs>
+        <w:spacing w:after="20" w:before="0"/>
+        <w:ind w:left="280"/>
+      </w:pPr>
+      <w:r>
+        <w:rPr>
+          <w:b w:val="false"/>
+          <w:bCs w:val="false"/>
+          <w:color w:val="222222"/>
+          <w:sz w:val="22"/>
+          <w:szCs w:val="22"/>
+        </w:rPr>
+        <w:t xml:space="preserve">Vererbung, Properties, Operatoren &amp; Static</w:t>
+      </w:r>
+      <w:r>
+        <w:rPr>
+          <w:color w:val="555555"/>
+          <w:sz w:val="22"/>
+          <w:szCs w:val="22"/>
+        </w:rPr>
+        <w:t xml:space="preserve">	66</w:t>
       </w:r>
     </w:p>
     <w:p>
@@ -20745,6 +20772,1991 @@
                 <w:szCs w:val="22"/>
               </w:rPr>
               <w:t xml:space="preserve">Eine Klasse lohnt sich, sobald mehrere Daten zusammengehören und es Tätigkeiten gibt, die auf ihnen arbeiten – ein Spieler, ein Gegner, ein Item, eine Spielkarte. Faustregel: Wenn du dich bei Variablennamen mit gleichem Präfix ertappst (spieler_x, spieler_y, spieler_hp), ist das fast immer der Ruf nach einer Klasse. Im nächsten Kapitel geht es weiter mit Vererbung, Properties, Operatoren und statischen Mitgliedern.</w:t>
+            </w:r>
+          </w:p>
+        </w:tc>
+      </w:tr>
+    </w:tbl>
+    <w:p>
+      <w:pPr>
+        <w:spacing w:after="160"/>
+      </w:pPr>
+    </w:p>
+    <w:p>
+      <w:pPr>
+        <w:pStyle w:val="Heading1"/>
+        <w:keepNext/>
+        <w:keepLines/>
+        <w:pageBreakBefore/>
+        <w:pBdr>
+          <w:bottom w:val="single" w:color="1B6CA8" w:sz="12" w:space="4"/>
+        </w:pBdr>
+        <w:spacing w:after="160" w:before="0"/>
+      </w:pPr>
+      <w:r>
+        <w:t xml:space="preserve">Vererbung, Properties, Operatoren &amp; Static</w:t>
+      </w:r>
+    </w:p>
+    <w:p>
+      <w:pPr>
+        <w:spacing w:after="180" w:line="312" w:lineRule="auto"/>
+      </w:pPr>
+      <w:r>
+        <w:rPr>
+          <w:sz w:val="22"/>
+          <w:szCs w:val="22"/>
+        </w:rPr>
+        <w:t xml:space="preserve">Im letzten Kapitel hast du Klassen und Objekte kennengelernt. Jetzt kommen vier fortgeschrittene Werkzeuge dazu, die das Klassen-System richtig mächtig machen: Vererbung (Klassen bauen auf anderen auf), Properties (kontrollierter Zugriff auf Felder), Operator-Überladung (eigene Typen mit + und = verbinden) und statische Mitglieder (Werte, die zur Klasse selbst gehören). Jedes ist ein eigenes Thema – nimm sie dir der Reihe nach vor.</w:t>
+      </w:r>
+    </w:p>
+    <w:p>
+      <w:pPr>
+        <w:pStyle w:val="Heading2"/>
+        <w:keepNext/>
+        <w:keepLines/>
+        <w:spacing w:after="120" w:before="280"/>
+      </w:pPr>
+      <w:r>
+        <w:t xml:space="preserve">Vererbung: auf einer Klasse aufbauen</w:t>
+      </w:r>
+    </w:p>
+    <w:p>
+      <w:pPr>
+        <w:spacing w:after="180" w:line="312" w:lineRule="auto"/>
+      </w:pPr>
+      <w:r>
+        <w:rPr>
+          <w:sz w:val="22"/>
+          <w:szCs w:val="22"/>
+        </w:rPr>
+        <w:t xml:space="preserve">Oft sind sich mehrere Klassen ähnlich: Ein Hund und eine Katze sind beide Tiere – sie haben einen Namen und können ein Geräusch machen, unterscheiden sich aber im Detail. Statt alles doppelt zu schreiben, definierst du eine allgemeine Basisklasse (Tier) und leitest davon speziellere Klassen ab. Die abgeleitete Klasse erbt alle Felder und Methoden der Basis und kann eigene hinzufügen.</w:t>
+      </w:r>
+    </w:p>
+    <w:p>
+      <w:pPr>
+        <w:spacing w:after="180" w:line="312" w:lineRule="auto"/>
+      </w:pPr>
+      <w:r>
+        <w:rPr>
+          <w:sz w:val="22"/>
+          <w:szCs w:val="22"/>
+        </w:rPr>
+        <w:t xml:space="preserve">Abgeleitet wird mit dem Schlüsselwort EXTENDS. Man sagt: Hund ist eine Unterklasse von Tier, Tier ist die Oberklasse. Ein Hund hat damit automatisch auch alles, was ein Tier hat.</w:t>
+      </w:r>
+    </w:p>
+    <w:p>
+      <w:pPr>
+        <w:keepNext/>
+        <w:keepLines/>
+        <w:pBdr>
+          <w:bottom w:val="single" w:color="DDD0C0" w:sz="4" w:space="2"/>
+        </w:pBdr>
+        <w:spacing w:after="40" w:before="360"/>
+      </w:pPr>
+      <w:r>
+        <w:rPr>
+          <w:rFonts w:ascii="Consolas" w:cs="Consolas" w:eastAsia="Consolas" w:hAnsi="Consolas"/>
+          <w:b/>
+          <w:bCs/>
+          <w:color w:val="9A3412"/>
+          <w:sz w:val="24"/>
+          <w:szCs w:val="24"/>
+        </w:rPr>
+        <w:t xml:space="preserve">EXTENDS</w:t>
+      </w:r>
+    </w:p>
+    <w:p>
+      <w:pPr>
+        <w:keepNext/>
+        <w:spacing w:after="120"/>
+      </w:pPr>
+      <w:r>
+        <w:rPr>
+          <w:b/>
+          <w:bCs/>
+          <w:color w:val="6A6A6A"/>
+          <w:sz w:val="18"/>
+          <w:szCs w:val="18"/>
+        </w:rPr>
+        <w:t xml:space="preserve">Syntax:  </w:t>
+      </w:r>
+      <w:r>
+        <w:rPr>
+          <w:rFonts w:ascii="Consolas" w:cs="Consolas" w:eastAsia="Consolas" w:hAnsi="Consolas"/>
+          <w:color w:val="335577"/>
+          <w:sz w:val="19"/>
+          <w:szCs w:val="19"/>
+        </w:rPr>
+        <w:t xml:space="preserve">CLASS Unterklasse EXTENDS Oberklasse</w:t>
+      </w:r>
+    </w:p>
+    <w:p>
+      <w:pPr>
+        <w:spacing w:after="180" w:line="312" w:lineRule="auto"/>
+      </w:pPr>
+      <w:r>
+        <w:rPr>
+          <w:sz w:val="22"/>
+          <w:szCs w:val="22"/>
+        </w:rPr>
+        <w:t xml:space="preserve">Leitet eine Klasse von einer anderen ab. Die Unterklasse erbt deren Felder und Methoden und kann eigene ergänzen. Auf geerbte Felder greifst du genauso über Self zu.</w:t>
+      </w:r>
+    </w:p>
+    <w:p>
+      <w:pPr>
+        <w:keepNext/>
+        <w:spacing w:after="30" w:before="120"/>
+      </w:pPr>
+      <w:r>
+        <w:rPr>
+          <w:b/>
+          <w:bCs/>
+          <w:i/>
+          <w:iCs/>
+          <w:color w:val="6A6A6A"/>
+          <w:sz w:val="18"/>
+          <w:szCs w:val="18"/>
+        </w:rPr>
+        <w:t xml:space="preserve">Beispiel</w:t>
+      </w:r>
+    </w:p>
+    <w:p>
+      <w:pPr>
+        <w:keepLines/>
+        <w:pBdr>
+          <w:left w:val="single" w:color="1B6CA8" w:sz="18" w:space="6"/>
+        </w:pBdr>
+        <w:shd w:fill="F4F4F4" w:val="clear"/>
+        <w:spacing w:after="200" w:before="100" w:line="264" w:lineRule="auto"/>
+        <w:ind w:left="140"/>
+      </w:pPr>
+      <w:r>
+        <w:rPr>
+          <w:rFonts w:ascii="Consolas" w:cs="Consolas" w:eastAsia="Consolas" w:hAnsi="Consolas"/>
+          <w:sz w:val="19"/>
+          <w:szCs w:val="19"/>
+        </w:rPr>
+        <w:t xml:space="preserve">CLASS Tier</w:t>
+      </w:r>
+      <w:r>
+        <w:rPr>
+          <w:rFonts w:ascii="Consolas" w:cs="Consolas" w:eastAsia="Consolas" w:hAnsi="Consolas"/>
+          <w:sz w:val="19"/>
+          <w:szCs w:val="19"/>
+        </w:rPr>
+        <w:br/>
+        <w:t xml:space="preserve">    DIM name AS STRING</w:t>
+      </w:r>
+      <w:r>
+        <w:rPr>
+          <w:rFonts w:ascii="Consolas" w:cs="Consolas" w:eastAsia="Consolas" w:hAnsi="Consolas"/>
+          <w:sz w:val="19"/>
+          <w:szCs w:val="19"/>
+        </w:rPr>
+        <w:br/>
+        <w:t xml:space="preserve">    SUB Init(n AS STRING)</w:t>
+      </w:r>
+      <w:r>
+        <w:rPr>
+          <w:rFonts w:ascii="Consolas" w:cs="Consolas" w:eastAsia="Consolas" w:hAnsi="Consolas"/>
+          <w:sz w:val="19"/>
+          <w:szCs w:val="19"/>
+        </w:rPr>
+        <w:br/>
+        <w:t xml:space="preserve">        Self.name = n</w:t>
+      </w:r>
+      <w:r>
+        <w:rPr>
+          <w:rFonts w:ascii="Consolas" w:cs="Consolas" w:eastAsia="Consolas" w:hAnsi="Consolas"/>
+          <w:sz w:val="19"/>
+          <w:szCs w:val="19"/>
+        </w:rPr>
+        <w:br/>
+        <w:t xml:space="preserve">    END SUB</w:t>
+      </w:r>
+      <w:r>
+        <w:rPr>
+          <w:rFonts w:ascii="Consolas" w:cs="Consolas" w:eastAsia="Consolas" w:hAnsi="Consolas"/>
+          <w:sz w:val="19"/>
+          <w:szCs w:val="19"/>
+        </w:rPr>
+        <w:br/>
+        <w:t xml:space="preserve">    FUNCTION Beschreibung() AS STRING</w:t>
+      </w:r>
+      <w:r>
+        <w:rPr>
+          <w:rFonts w:ascii="Consolas" w:cs="Consolas" w:eastAsia="Consolas" w:hAnsi="Consolas"/>
+          <w:sz w:val="19"/>
+          <w:szCs w:val="19"/>
+        </w:rPr>
+        <w:br/>
+        <w:t xml:space="preserve">        RETURN "Tier namens " + Self.name</w:t>
+      </w:r>
+      <w:r>
+        <w:rPr>
+          <w:rFonts w:ascii="Consolas" w:cs="Consolas" w:eastAsia="Consolas" w:hAnsi="Consolas"/>
+          <w:sz w:val="19"/>
+          <w:szCs w:val="19"/>
+        </w:rPr>
+        <w:br/>
+        <w:t xml:space="preserve">    END FUNCTION</w:t>
+      </w:r>
+      <w:r>
+        <w:rPr>
+          <w:rFonts w:ascii="Consolas" w:cs="Consolas" w:eastAsia="Consolas" w:hAnsi="Consolas"/>
+          <w:sz w:val="19"/>
+          <w:szCs w:val="19"/>
+        </w:rPr>
+        <w:br/>
+        <w:t xml:space="preserve">END CLASS</w:t>
+      </w:r>
+      <w:r>
+        <w:rPr>
+          <w:rFonts w:ascii="Consolas" w:cs="Consolas" w:eastAsia="Consolas" w:hAnsi="Consolas"/>
+          <w:sz w:val="19"/>
+          <w:szCs w:val="19"/>
+        </w:rPr>
+        <w:br/>
+        <w:t xml:space="preserve"/>
+      </w:r>
+      <w:r>
+        <w:rPr>
+          <w:rFonts w:ascii="Consolas" w:cs="Consolas" w:eastAsia="Consolas" w:hAnsi="Consolas"/>
+          <w:sz w:val="19"/>
+          <w:szCs w:val="19"/>
+        </w:rPr>
+        <w:br/>
+        <w:t xml:space="preserve">CLASS Hund EXTENDS Tier</w:t>
+      </w:r>
+      <w:r>
+        <w:rPr>
+          <w:rFonts w:ascii="Consolas" w:cs="Consolas" w:eastAsia="Consolas" w:hAnsi="Consolas"/>
+          <w:sz w:val="19"/>
+          <w:szCs w:val="19"/>
+        </w:rPr>
+        <w:br/>
+        <w:t xml:space="preserve">    ' erbt name, Init und Beschreibung von Tier</w:t>
+      </w:r>
+      <w:r>
+        <w:rPr>
+          <w:rFonts w:ascii="Consolas" w:cs="Consolas" w:eastAsia="Consolas" w:hAnsi="Consolas"/>
+          <w:sz w:val="19"/>
+          <w:szCs w:val="19"/>
+        </w:rPr>
+        <w:br/>
+        <w:t xml:space="preserve">END CLASS</w:t>
+      </w:r>
+      <w:r>
+        <w:rPr>
+          <w:rFonts w:ascii="Consolas" w:cs="Consolas" w:eastAsia="Consolas" w:hAnsi="Consolas"/>
+          <w:sz w:val="19"/>
+          <w:szCs w:val="19"/>
+        </w:rPr>
+        <w:br/>
+        <w:t xml:space="preserve"/>
+      </w:r>
+      <w:r>
+        <w:rPr>
+          <w:rFonts w:ascii="Consolas" w:cs="Consolas" w:eastAsia="Consolas" w:hAnsi="Consolas"/>
+          <w:sz w:val="19"/>
+          <w:szCs w:val="19"/>
+        </w:rPr>
+        <w:br/>
+        <w:t xml:space="preserve">DIM rex AS Hund</w:t>
+      </w:r>
+      <w:r>
+        <w:rPr>
+          <w:rFonts w:ascii="Consolas" w:cs="Consolas" w:eastAsia="Consolas" w:hAnsi="Consolas"/>
+          <w:sz w:val="19"/>
+          <w:szCs w:val="19"/>
+        </w:rPr>
+        <w:br/>
+        <w:t xml:space="preserve">rex = NEW Hund("Rex")        ' geerbtes Init läuft</w:t>
+      </w:r>
+      <w:r>
+        <w:rPr>
+          <w:rFonts w:ascii="Consolas" w:cs="Consolas" w:eastAsia="Consolas" w:hAnsi="Consolas"/>
+          <w:sz w:val="19"/>
+          <w:szCs w:val="19"/>
+        </w:rPr>
+        <w:br/>
+        <w:t xml:space="preserve">PRINT rex.Beschreibung()     ' geerbte Methode</w:t>
+      </w:r>
+    </w:p>
+    <w:p>
+      <w:pPr>
+        <w:keepNext/>
+        <w:spacing w:after="30" w:before="120"/>
+      </w:pPr>
+      <w:r>
+        <w:rPr>
+          <w:b/>
+          <w:bCs/>
+          <w:i/>
+          <w:iCs/>
+          <w:color w:val="6A6A6A"/>
+          <w:sz w:val="18"/>
+          <w:szCs w:val="18"/>
+        </w:rPr>
+        <w:t xml:space="preserve">Ausgabe</w:t>
+      </w:r>
+    </w:p>
+    <w:p>
+      <w:pPr>
+        <w:keepLines/>
+        <w:pBdr>
+          <w:left w:val="single" w:color="9AC79A" w:sz="18" w:space="6"/>
+        </w:pBdr>
+        <w:shd w:fill="EAF4EA" w:val="clear"/>
+        <w:spacing w:after="200" w:before="100" w:line="264" w:lineRule="auto"/>
+        <w:ind w:left="140"/>
+      </w:pPr>
+      <w:r>
+        <w:rPr>
+          <w:rFonts w:ascii="Consolas" w:cs="Consolas" w:eastAsia="Consolas" w:hAnsi="Consolas"/>
+          <w:sz w:val="19"/>
+          <w:szCs w:val="19"/>
+        </w:rPr>
+        <w:t xml:space="preserve">Tier namens Rex</w:t>
+      </w:r>
+    </w:p>
+    <w:p>
+      <w:pPr>
+        <w:pStyle w:val="Heading2"/>
+        <w:keepNext/>
+        <w:keepLines/>
+        <w:spacing w:after="120" w:before="280"/>
+      </w:pPr>
+      <w:r>
+        <w:t xml:space="preserve">Methoden überschreiben</w:t>
+      </w:r>
+    </w:p>
+    <w:p>
+      <w:pPr>
+        <w:spacing w:after="180" w:line="312" w:lineRule="auto"/>
+      </w:pPr>
+      <w:r>
+        <w:rPr>
+          <w:sz w:val="22"/>
+          <w:szCs w:val="22"/>
+        </w:rPr>
+        <w:t xml:space="preserve">Eine Unterklasse kann eine geerbte Methode neu definieren – das nennt man überschreiben. Sie ersetzt damit für ihre Objekte die Version der Oberklasse. So macht jedes Tier auf seine eigene Art ein Geräusch, obwohl die Methode überall Sprich heißt.</w:t>
+      </w:r>
+    </w:p>
+    <w:p>
+      <w:pPr>
+        <w:keepLines/>
+        <w:pBdr>
+          <w:left w:val="single" w:color="1B6CA8" w:sz="18" w:space="6"/>
+        </w:pBdr>
+        <w:shd w:fill="F4F4F4" w:val="clear"/>
+        <w:spacing w:after="200" w:before="100" w:line="264" w:lineRule="auto"/>
+        <w:ind w:left="140"/>
+      </w:pPr>
+      <w:r>
+        <w:rPr>
+          <w:rFonts w:ascii="Consolas" w:cs="Consolas" w:eastAsia="Consolas" w:hAnsi="Consolas"/>
+          <w:sz w:val="19"/>
+          <w:szCs w:val="19"/>
+        </w:rPr>
+        <w:t xml:space="preserve">CLASS Tier</w:t>
+      </w:r>
+      <w:r>
+        <w:rPr>
+          <w:rFonts w:ascii="Consolas" w:cs="Consolas" w:eastAsia="Consolas" w:hAnsi="Consolas"/>
+          <w:sz w:val="19"/>
+          <w:szCs w:val="19"/>
+        </w:rPr>
+        <w:br/>
+        <w:t xml:space="preserve">    DIM name AS STRING</w:t>
+      </w:r>
+      <w:r>
+        <w:rPr>
+          <w:rFonts w:ascii="Consolas" w:cs="Consolas" w:eastAsia="Consolas" w:hAnsi="Consolas"/>
+          <w:sz w:val="19"/>
+          <w:szCs w:val="19"/>
+        </w:rPr>
+        <w:br/>
+        <w:t xml:space="preserve">    SUB Init(n AS STRING)</w:t>
+      </w:r>
+      <w:r>
+        <w:rPr>
+          <w:rFonts w:ascii="Consolas" w:cs="Consolas" w:eastAsia="Consolas" w:hAnsi="Consolas"/>
+          <w:sz w:val="19"/>
+          <w:szCs w:val="19"/>
+        </w:rPr>
+        <w:br/>
+        <w:t xml:space="preserve">        Self.name = n</w:t>
+      </w:r>
+      <w:r>
+        <w:rPr>
+          <w:rFonts w:ascii="Consolas" w:cs="Consolas" w:eastAsia="Consolas" w:hAnsi="Consolas"/>
+          <w:sz w:val="19"/>
+          <w:szCs w:val="19"/>
+        </w:rPr>
+        <w:br/>
+        <w:t xml:space="preserve">    END SUB</w:t>
+      </w:r>
+      <w:r>
+        <w:rPr>
+          <w:rFonts w:ascii="Consolas" w:cs="Consolas" w:eastAsia="Consolas" w:hAnsi="Consolas"/>
+          <w:sz w:val="19"/>
+          <w:szCs w:val="19"/>
+        </w:rPr>
+        <w:br/>
+        <w:t xml:space="preserve">    SUB Sprich()</w:t>
+      </w:r>
+      <w:r>
+        <w:rPr>
+          <w:rFonts w:ascii="Consolas" w:cs="Consolas" w:eastAsia="Consolas" w:hAnsi="Consolas"/>
+          <w:sz w:val="19"/>
+          <w:szCs w:val="19"/>
+        </w:rPr>
+        <w:br/>
+        <w:t xml:space="preserve">        PRINT Self.name; " macht ein Geräusch."</w:t>
+      </w:r>
+      <w:r>
+        <w:rPr>
+          <w:rFonts w:ascii="Consolas" w:cs="Consolas" w:eastAsia="Consolas" w:hAnsi="Consolas"/>
+          <w:sz w:val="19"/>
+          <w:szCs w:val="19"/>
+        </w:rPr>
+        <w:br/>
+        <w:t xml:space="preserve">    END SUB</w:t>
+      </w:r>
+      <w:r>
+        <w:rPr>
+          <w:rFonts w:ascii="Consolas" w:cs="Consolas" w:eastAsia="Consolas" w:hAnsi="Consolas"/>
+          <w:sz w:val="19"/>
+          <w:szCs w:val="19"/>
+        </w:rPr>
+        <w:br/>
+        <w:t xml:space="preserve">END CLASS</w:t>
+      </w:r>
+      <w:r>
+        <w:rPr>
+          <w:rFonts w:ascii="Consolas" w:cs="Consolas" w:eastAsia="Consolas" w:hAnsi="Consolas"/>
+          <w:sz w:val="19"/>
+          <w:szCs w:val="19"/>
+        </w:rPr>
+        <w:br/>
+        <w:t xml:space="preserve"/>
+      </w:r>
+      <w:r>
+        <w:rPr>
+          <w:rFonts w:ascii="Consolas" w:cs="Consolas" w:eastAsia="Consolas" w:hAnsi="Consolas"/>
+          <w:sz w:val="19"/>
+          <w:szCs w:val="19"/>
+        </w:rPr>
+        <w:br/>
+        <w:t xml:space="preserve">CLASS Hund EXTENDS Tier</w:t>
+      </w:r>
+      <w:r>
+        <w:rPr>
+          <w:rFonts w:ascii="Consolas" w:cs="Consolas" w:eastAsia="Consolas" w:hAnsi="Consolas"/>
+          <w:sz w:val="19"/>
+          <w:szCs w:val="19"/>
+        </w:rPr>
+        <w:br/>
+        <w:t xml:space="preserve">    SUB Sprich()                       ' überschreibt Tier.Sprich</w:t>
+      </w:r>
+      <w:r>
+        <w:rPr>
+          <w:rFonts w:ascii="Consolas" w:cs="Consolas" w:eastAsia="Consolas" w:hAnsi="Consolas"/>
+          <w:sz w:val="19"/>
+          <w:szCs w:val="19"/>
+        </w:rPr>
+        <w:br/>
+        <w:t xml:space="preserve">        PRINT Self.name; " bellt: WAU!"</w:t>
+      </w:r>
+      <w:r>
+        <w:rPr>
+          <w:rFonts w:ascii="Consolas" w:cs="Consolas" w:eastAsia="Consolas" w:hAnsi="Consolas"/>
+          <w:sz w:val="19"/>
+          <w:szCs w:val="19"/>
+        </w:rPr>
+        <w:br/>
+        <w:t xml:space="preserve">    END SUB</w:t>
+      </w:r>
+      <w:r>
+        <w:rPr>
+          <w:rFonts w:ascii="Consolas" w:cs="Consolas" w:eastAsia="Consolas" w:hAnsi="Consolas"/>
+          <w:sz w:val="19"/>
+          <w:szCs w:val="19"/>
+        </w:rPr>
+        <w:br/>
+        <w:t xml:space="preserve">END CLASS</w:t>
+      </w:r>
+      <w:r>
+        <w:rPr>
+          <w:rFonts w:ascii="Consolas" w:cs="Consolas" w:eastAsia="Consolas" w:hAnsi="Consolas"/>
+          <w:sz w:val="19"/>
+          <w:szCs w:val="19"/>
+        </w:rPr>
+        <w:br/>
+        <w:t xml:space="preserve"/>
+      </w:r>
+      <w:r>
+        <w:rPr>
+          <w:rFonts w:ascii="Consolas" w:cs="Consolas" w:eastAsia="Consolas" w:hAnsi="Consolas"/>
+          <w:sz w:val="19"/>
+          <w:szCs w:val="19"/>
+        </w:rPr>
+        <w:br/>
+        <w:t xml:space="preserve">DIM rex AS Hund</w:t>
+      </w:r>
+      <w:r>
+        <w:rPr>
+          <w:rFonts w:ascii="Consolas" w:cs="Consolas" w:eastAsia="Consolas" w:hAnsi="Consolas"/>
+          <w:sz w:val="19"/>
+          <w:szCs w:val="19"/>
+        </w:rPr>
+        <w:br/>
+        <w:t xml:space="preserve">rex = NEW Hund("Rex")</w:t>
+      </w:r>
+      <w:r>
+        <w:rPr>
+          <w:rFonts w:ascii="Consolas" w:cs="Consolas" w:eastAsia="Consolas" w:hAnsi="Consolas"/>
+          <w:sz w:val="19"/>
+          <w:szCs w:val="19"/>
+        </w:rPr>
+        <w:br/>
+        <w:t xml:space="preserve">rex.Sprich()</w:t>
+      </w:r>
+    </w:p>
+    <w:p>
+      <w:pPr>
+        <w:keepLines/>
+        <w:pBdr>
+          <w:left w:val="single" w:color="9AC79A" w:sz="18" w:space="6"/>
+        </w:pBdr>
+        <w:shd w:fill="EAF4EA" w:val="clear"/>
+        <w:spacing w:after="200" w:before="100" w:line="264" w:lineRule="auto"/>
+        <w:ind w:left="140"/>
+      </w:pPr>
+      <w:r>
+        <w:rPr>
+          <w:rFonts w:ascii="Consolas" w:cs="Consolas" w:eastAsia="Consolas" w:hAnsi="Consolas"/>
+          <w:sz w:val="19"/>
+          <w:szCs w:val="19"/>
+        </w:rPr>
+        <w:t xml:space="preserve">Rex bellt: WAU!</w:t>
+      </w:r>
+    </w:p>
+    <w:p>
+      <w:pPr>
+        <w:spacing w:before="60"/>
+      </w:pPr>
+    </w:p>
+    <w:tbl>
+      <w:tblPr>
+        <w:tblW w:type="dxa" w:w="9360"/>
+        <w:tblBorders>
+          <w:top w:val="single" w:color="auto" w:sz="4"/>
+          <w:left w:val="single" w:color="auto" w:sz="4"/>
+          <w:bottom w:val="single" w:color="auto" w:sz="4"/>
+          <w:right w:val="single" w:color="auto" w:sz="4"/>
+          <w:insideH w:val="single" w:color="auto" w:sz="4"/>
+          <w:insideV w:val="single" w:color="auto" w:sz="4"/>
+        </w:tblBorders>
+      </w:tblPr>
+      <w:tblGrid>
+        <w:gridCol w:w="9360"/>
+      </w:tblGrid>
+      <w:tr>
+        <w:trPr>
+          <w:cantSplit/>
+        </w:trPr>
+        <w:tc>
+          <w:tcPr>
+            <w:tcW w:type="dxa" w:w="9360"/>
+            <w:tcBorders>
+              <w:top w:val="single" w:color="E0B96A" w:sz="6"/>
+              <w:left w:val="single" w:color="E0B96A" w:sz="6"/>
+              <w:bottom w:val="single" w:color="E0B96A" w:sz="6"/>
+              <w:right w:val="single" w:color="E0B96A" w:sz="6"/>
+            </w:tcBorders>
+            <w:shd w:fill="FDF3E0" w:val="clear"/>
+            <w:tcMar>
+              <w:top w:type="dxa" w:w="140"/>
+              <w:left w:type="dxa" w:w="180"/>
+              <w:bottom w:type="dxa" w:w="140"/>
+              <w:right w:type="dxa" w:w="180"/>
+            </w:tcMar>
+          </w:tcPr>
+          <w:p>
+            <w:pPr>
+              <w:spacing w:after="40"/>
+            </w:pPr>
+            <w:r>
+              <w:rPr>
+                <w:b/>
+                <w:bCs/>
+                <w:color w:val="9A6A1E"/>
+                <w:sz w:val="22"/>
+                <w:szCs w:val="22"/>
+              </w:rPr>
+              <w:t xml:space="preserve">Merke</w:t>
+            </w:r>
+          </w:p>
+          <w:p>
+            <w:pPr>
+              <w:spacing w:after="0" w:line="312" w:lineRule="auto"/>
+            </w:pPr>
+            <w:r>
+              <w:rPr>
+                <w:sz w:val="22"/>
+                <w:szCs w:val="22"/>
+              </w:rPr>
+              <w:t xml:space="preserve">Überschreibt eine Unterklasse die Init-Methode, wird die Init der Oberklasse NICHT automatisch zusätzlich aufgerufen – die neue Init ersetzt sie ganz. Setze die geerbten Felder dann in deiner eigenen Init selbst. Brauchst du die Eltern-Vorbereitung nicht zu ändern, definiere einfach kein eigenes Init und das geerbte läuft.</w:t>
+            </w:r>
+          </w:p>
+        </w:tc>
+      </w:tr>
+    </w:tbl>
+    <w:p>
+      <w:pPr>
+        <w:spacing w:after="160"/>
+      </w:pPr>
+    </w:p>
+    <w:p>
+      <w:pPr>
+        <w:pStyle w:val="Heading2"/>
+        <w:keepNext/>
+        <w:keepLines/>
+        <w:spacing w:after="120" w:before="280"/>
+      </w:pPr>
+      <w:r>
+        <w:t xml:space="preserve">Polymorphie: ein Typ, viele Gestalten</w:t>
+      </w:r>
+    </w:p>
+    <w:p>
+      <w:pPr>
+        <w:spacing w:after="180" w:line="312" w:lineRule="auto"/>
+      </w:pPr>
+      <w:r>
+        <w:rPr>
+          <w:sz w:val="22"/>
+          <w:szCs w:val="22"/>
+        </w:rPr>
+        <w:t xml:space="preserve">Hier wird Vererbung erst richtig nützlich. Eine Variable vom Typ der Oberklasse darf auch Objekte der Unterklassen aufnehmen – schließlich ist ein Hund ein Tier. Rufst du dann eine Methode auf, läuft automatisch die Version, die zum tatsächlichen Objekt gehört. Dieses „der passende Code wird zur Laufzeit gewählt“ heißt Polymorphie (Vielgestaltigkeit).</w:t>
+      </w:r>
+    </w:p>
+    <w:p>
+      <w:pPr>
+        <w:spacing w:after="180" w:line="312" w:lineRule="auto"/>
+      </w:pPr>
+      <w:r>
+        <w:rPr>
+          <w:sz w:val="22"/>
+          <w:szCs w:val="22"/>
+        </w:rPr>
+        <w:t xml:space="preserve">Das erlaubt dir, ganz verschiedene Objekte gleich zu behandeln – etwa alle Wesen in einer Liste durchzugehen und jedem einfach Sprich() zu sagen, ohne zu wissen, ob es ein Hund oder eine Katze ist:</w:t>
+      </w:r>
+    </w:p>
+    <w:p>
+      <w:pPr>
+        <w:keepLines/>
+        <w:pBdr>
+          <w:left w:val="single" w:color="1B6CA8" w:sz="18" w:space="6"/>
+        </w:pBdr>
+        <w:shd w:fill="F4F4F4" w:val="clear"/>
+        <w:spacing w:after="200" w:before="100" w:line="264" w:lineRule="auto"/>
+        <w:ind w:left="140"/>
+      </w:pPr>
+      <w:r>
+        <w:rPr>
+          <w:rFonts w:ascii="Consolas" w:cs="Consolas" w:eastAsia="Consolas" w:hAnsi="Consolas"/>
+          <w:sz w:val="19"/>
+          <w:szCs w:val="19"/>
+        </w:rPr>
+        <w:t xml:space="preserve">CLASS Tier</w:t>
+      </w:r>
+      <w:r>
+        <w:rPr>
+          <w:rFonts w:ascii="Consolas" w:cs="Consolas" w:eastAsia="Consolas" w:hAnsi="Consolas"/>
+          <w:sz w:val="19"/>
+          <w:szCs w:val="19"/>
+        </w:rPr>
+        <w:br/>
+        <w:t xml:space="preserve">    DIM name AS STRING</w:t>
+      </w:r>
+      <w:r>
+        <w:rPr>
+          <w:rFonts w:ascii="Consolas" w:cs="Consolas" w:eastAsia="Consolas" w:hAnsi="Consolas"/>
+          <w:sz w:val="19"/>
+          <w:szCs w:val="19"/>
+        </w:rPr>
+        <w:br/>
+        <w:t xml:space="preserve">    SUB Init(n AS STRING)</w:t>
+      </w:r>
+      <w:r>
+        <w:rPr>
+          <w:rFonts w:ascii="Consolas" w:cs="Consolas" w:eastAsia="Consolas" w:hAnsi="Consolas"/>
+          <w:sz w:val="19"/>
+          <w:szCs w:val="19"/>
+        </w:rPr>
+        <w:br/>
+        <w:t xml:space="preserve">        Self.name = n</w:t>
+      </w:r>
+      <w:r>
+        <w:rPr>
+          <w:rFonts w:ascii="Consolas" w:cs="Consolas" w:eastAsia="Consolas" w:hAnsi="Consolas"/>
+          <w:sz w:val="19"/>
+          <w:szCs w:val="19"/>
+        </w:rPr>
+        <w:br/>
+        <w:t xml:space="preserve">    END SUB</w:t>
+      </w:r>
+      <w:r>
+        <w:rPr>
+          <w:rFonts w:ascii="Consolas" w:cs="Consolas" w:eastAsia="Consolas" w:hAnsi="Consolas"/>
+          <w:sz w:val="19"/>
+          <w:szCs w:val="19"/>
+        </w:rPr>
+        <w:br/>
+        <w:t xml:space="preserve">    SUB Sprich()</w:t>
+      </w:r>
+      <w:r>
+        <w:rPr>
+          <w:rFonts w:ascii="Consolas" w:cs="Consolas" w:eastAsia="Consolas" w:hAnsi="Consolas"/>
+          <w:sz w:val="19"/>
+          <w:szCs w:val="19"/>
+        </w:rPr>
+        <w:br/>
+        <w:t xml:space="preserve">        PRINT Self.name; " macht ein Geräusch."</w:t>
+      </w:r>
+      <w:r>
+        <w:rPr>
+          <w:rFonts w:ascii="Consolas" w:cs="Consolas" w:eastAsia="Consolas" w:hAnsi="Consolas"/>
+          <w:sz w:val="19"/>
+          <w:szCs w:val="19"/>
+        </w:rPr>
+        <w:br/>
+        <w:t xml:space="preserve">    END SUB</w:t>
+      </w:r>
+      <w:r>
+        <w:rPr>
+          <w:rFonts w:ascii="Consolas" w:cs="Consolas" w:eastAsia="Consolas" w:hAnsi="Consolas"/>
+          <w:sz w:val="19"/>
+          <w:szCs w:val="19"/>
+        </w:rPr>
+        <w:br/>
+        <w:t xml:space="preserve">END CLASS</w:t>
+      </w:r>
+      <w:r>
+        <w:rPr>
+          <w:rFonts w:ascii="Consolas" w:cs="Consolas" w:eastAsia="Consolas" w:hAnsi="Consolas"/>
+          <w:sz w:val="19"/>
+          <w:szCs w:val="19"/>
+        </w:rPr>
+        <w:br/>
+        <w:t xml:space="preserve">CLASS Hund EXTENDS Tier</w:t>
+      </w:r>
+      <w:r>
+        <w:rPr>
+          <w:rFonts w:ascii="Consolas" w:cs="Consolas" w:eastAsia="Consolas" w:hAnsi="Consolas"/>
+          <w:sz w:val="19"/>
+          <w:szCs w:val="19"/>
+        </w:rPr>
+        <w:br/>
+        <w:t xml:space="preserve">    SUB Sprich()</w:t>
+      </w:r>
+      <w:r>
+        <w:rPr>
+          <w:rFonts w:ascii="Consolas" w:cs="Consolas" w:eastAsia="Consolas" w:hAnsi="Consolas"/>
+          <w:sz w:val="19"/>
+          <w:szCs w:val="19"/>
+        </w:rPr>
+        <w:br/>
+        <w:t xml:space="preserve">        PRINT Self.name; " bellt: WAU!"</w:t>
+      </w:r>
+      <w:r>
+        <w:rPr>
+          <w:rFonts w:ascii="Consolas" w:cs="Consolas" w:eastAsia="Consolas" w:hAnsi="Consolas"/>
+          <w:sz w:val="19"/>
+          <w:szCs w:val="19"/>
+        </w:rPr>
+        <w:br/>
+        <w:t xml:space="preserve">    END SUB</w:t>
+      </w:r>
+      <w:r>
+        <w:rPr>
+          <w:rFonts w:ascii="Consolas" w:cs="Consolas" w:eastAsia="Consolas" w:hAnsi="Consolas"/>
+          <w:sz w:val="19"/>
+          <w:szCs w:val="19"/>
+        </w:rPr>
+        <w:br/>
+        <w:t xml:space="preserve">END CLASS</w:t>
+      </w:r>
+      <w:r>
+        <w:rPr>
+          <w:rFonts w:ascii="Consolas" w:cs="Consolas" w:eastAsia="Consolas" w:hAnsi="Consolas"/>
+          <w:sz w:val="19"/>
+          <w:szCs w:val="19"/>
+        </w:rPr>
+        <w:br/>
+        <w:t xml:space="preserve">CLASS Katze EXTENDS Tier</w:t>
+      </w:r>
+      <w:r>
+        <w:rPr>
+          <w:rFonts w:ascii="Consolas" w:cs="Consolas" w:eastAsia="Consolas" w:hAnsi="Consolas"/>
+          <w:sz w:val="19"/>
+          <w:szCs w:val="19"/>
+        </w:rPr>
+        <w:br/>
+        <w:t xml:space="preserve">    SUB Sprich()</w:t>
+      </w:r>
+      <w:r>
+        <w:rPr>
+          <w:rFonts w:ascii="Consolas" w:cs="Consolas" w:eastAsia="Consolas" w:hAnsi="Consolas"/>
+          <w:sz w:val="19"/>
+          <w:szCs w:val="19"/>
+        </w:rPr>
+        <w:br/>
+        <w:t xml:space="preserve">        PRINT Self.name; " miaut: MIAU!"</w:t>
+      </w:r>
+      <w:r>
+        <w:rPr>
+          <w:rFonts w:ascii="Consolas" w:cs="Consolas" w:eastAsia="Consolas" w:hAnsi="Consolas"/>
+          <w:sz w:val="19"/>
+          <w:szCs w:val="19"/>
+        </w:rPr>
+        <w:br/>
+        <w:t xml:space="preserve">    END SUB</w:t>
+      </w:r>
+      <w:r>
+        <w:rPr>
+          <w:rFonts w:ascii="Consolas" w:cs="Consolas" w:eastAsia="Consolas" w:hAnsi="Consolas"/>
+          <w:sz w:val="19"/>
+          <w:szCs w:val="19"/>
+        </w:rPr>
+        <w:br/>
+        <w:t xml:space="preserve">END CLASS</w:t>
+      </w:r>
+      <w:r>
+        <w:rPr>
+          <w:rFonts w:ascii="Consolas" w:cs="Consolas" w:eastAsia="Consolas" w:hAnsi="Consolas"/>
+          <w:sz w:val="19"/>
+          <w:szCs w:val="19"/>
+        </w:rPr>
+        <w:br/>
+        <w:t xml:space="preserve"/>
+      </w:r>
+      <w:r>
+        <w:rPr>
+          <w:rFonts w:ascii="Consolas" w:cs="Consolas" w:eastAsia="Consolas" w:hAnsi="Consolas"/>
+          <w:sz w:val="19"/>
+          <w:szCs w:val="19"/>
+        </w:rPr>
+        <w:br/>
+        <w:t xml:space="preserve">DIM t AS Tier              ' Typ der Oberklasse</w:t>
+      </w:r>
+      <w:r>
+        <w:rPr>
+          <w:rFonts w:ascii="Consolas" w:cs="Consolas" w:eastAsia="Consolas" w:hAnsi="Consolas"/>
+          <w:sz w:val="19"/>
+          <w:szCs w:val="19"/>
+        </w:rPr>
+        <w:br/>
+        <w:t xml:space="preserve">t = NEW Hund("Rex")</w:t>
+      </w:r>
+      <w:r>
+        <w:rPr>
+          <w:rFonts w:ascii="Consolas" w:cs="Consolas" w:eastAsia="Consolas" w:hAnsi="Consolas"/>
+          <w:sz w:val="19"/>
+          <w:szCs w:val="19"/>
+        </w:rPr>
+        <w:br/>
+        <w:t xml:space="preserve">t.Sprich()                 ' die Hund-Version läuft</w:t>
+      </w:r>
+      <w:r>
+        <w:rPr>
+          <w:rFonts w:ascii="Consolas" w:cs="Consolas" w:eastAsia="Consolas" w:hAnsi="Consolas"/>
+          <w:sz w:val="19"/>
+          <w:szCs w:val="19"/>
+        </w:rPr>
+        <w:br/>
+        <w:t xml:space="preserve">t = NEW Katze("Mia")</w:t>
+      </w:r>
+      <w:r>
+        <w:rPr>
+          <w:rFonts w:ascii="Consolas" w:cs="Consolas" w:eastAsia="Consolas" w:hAnsi="Consolas"/>
+          <w:sz w:val="19"/>
+          <w:szCs w:val="19"/>
+        </w:rPr>
+        <w:br/>
+        <w:t xml:space="preserve">t.Sprich()                 ' die Katze-Version läuft</w:t>
+      </w:r>
+    </w:p>
+    <w:p>
+      <w:pPr>
+        <w:keepLines/>
+        <w:pBdr>
+          <w:left w:val="single" w:color="9AC79A" w:sz="18" w:space="6"/>
+        </w:pBdr>
+        <w:shd w:fill="EAF4EA" w:val="clear"/>
+        <w:spacing w:after="200" w:before="100" w:line="264" w:lineRule="auto"/>
+        <w:ind w:left="140"/>
+      </w:pPr>
+      <w:r>
+        <w:rPr>
+          <w:rFonts w:ascii="Consolas" w:cs="Consolas" w:eastAsia="Consolas" w:hAnsi="Consolas"/>
+          <w:sz w:val="19"/>
+          <w:szCs w:val="19"/>
+        </w:rPr>
+        <w:t xml:space="preserve">Rex bellt: WAU!</w:t>
+      </w:r>
+      <w:r>
+        <w:rPr>
+          <w:rFonts w:ascii="Consolas" w:cs="Consolas" w:eastAsia="Consolas" w:hAnsi="Consolas"/>
+          <w:sz w:val="19"/>
+          <w:szCs w:val="19"/>
+        </w:rPr>
+        <w:br/>
+        <w:t xml:space="preserve">Mia miaut: MIAU!</w:t>
+      </w:r>
+    </w:p>
+    <w:p>
+      <w:pPr>
+        <w:pStyle w:val="Heading2"/>
+        <w:keepNext/>
+        <w:keepLines/>
+        <w:spacing w:after="120" w:before="280"/>
+      </w:pPr>
+      <w:r>
+        <w:t xml:space="preserve">Properties: Felder mit Wächter</w:t>
+      </w:r>
+    </w:p>
+    <w:p>
+      <w:pPr>
+        <w:spacing w:after="180" w:line="312" w:lineRule="auto"/>
+      </w:pPr>
+      <w:r>
+        <w:rPr>
+          <w:sz w:val="22"/>
+          <w:szCs w:val="22"/>
+        </w:rPr>
+        <w:t xml:space="preserve">Manchmal willst du nicht, dass jeder Code ein Feld direkt und ungeprüft verändert. Beispiel: Die Lebenspunkte sollen nie unter 0 oder über 100 gehen. Eine Property sieht von außen aus wie ein normales Feld (du schreibst objekt.hp = 200), führt beim Lesen und Schreiben aber heimlich deinen Code aus – einen Wächter, der prüfen, begrenzen oder umrechnen kann.</w:t>
+      </w:r>
+    </w:p>
+    <w:p>
+      <w:pPr>
+        <w:spacing w:after="180" w:line="312" w:lineRule="auto"/>
+      </w:pPr>
+      <w:r>
+        <w:rPr>
+          <w:sz w:val="22"/>
+          <w:szCs w:val="22"/>
+        </w:rPr>
+        <w:t xml:space="preserve">Dazu schreibst du zwei besondere Blöcke: PROPERTY GET liefert den Wert beim Lesen, PROPERTY SET nimmt ihn beim Schreiben entgegen (der zugewiesene Wert steht in value). Das eigentliche Feld versteckst du üblicherweise hinter einem Namen mit Unterstrich, etwa _hp.</w:t>
+      </w:r>
+    </w:p>
+    <w:p>
+      <w:pPr>
+        <w:keepNext/>
+        <w:keepLines/>
+        <w:pBdr>
+          <w:bottom w:val="single" w:color="DDD0C0" w:sz="4" w:space="2"/>
+        </w:pBdr>
+        <w:spacing w:after="40" w:before="360"/>
+      </w:pPr>
+      <w:r>
+        <w:rPr>
+          <w:rFonts w:ascii="Consolas" w:cs="Consolas" w:eastAsia="Consolas" w:hAnsi="Consolas"/>
+          <w:b/>
+          <w:bCs/>
+          <w:color w:val="9A3412"/>
+          <w:sz w:val="24"/>
+          <w:szCs w:val="24"/>
+        </w:rPr>
+        <w:t xml:space="preserve">PROPERTY GET / SET</w:t>
+      </w:r>
+    </w:p>
+    <w:p>
+      <w:pPr>
+        <w:keepNext/>
+        <w:spacing w:after="120"/>
+      </w:pPr>
+      <w:r>
+        <w:rPr>
+          <w:b/>
+          <w:bCs/>
+          <w:color w:val="6A6A6A"/>
+          <w:sz w:val="18"/>
+          <w:szCs w:val="18"/>
+        </w:rPr>
+        <w:t xml:space="preserve">Syntax:  </w:t>
+      </w:r>
+      <w:r>
+        <w:rPr>
+          <w:rFonts w:ascii="Consolas" w:cs="Consolas" w:eastAsia="Consolas" w:hAnsi="Consolas"/>
+          <w:color w:val="335577"/>
+          <w:sz w:val="19"/>
+          <w:szCs w:val="19"/>
+        </w:rPr>
+        <w:t xml:space="preserve">PROPERTY GET name() AS Typ ... END PROPERTY
+PROPERTY SET name(value AS Typ) ... END PROPERTY</w:t>
+      </w:r>
+    </w:p>
+    <w:p>
+      <w:pPr>
+        <w:spacing w:after="180" w:line="312" w:lineRule="auto"/>
+      </w:pPr>
+      <w:r>
+        <w:rPr>
+          <w:sz w:val="22"/>
+          <w:szCs w:val="22"/>
+        </w:rPr>
+        <w:t xml:space="preserve">Definiert kontrollierten Lese- und Schreibzugriff. GET läuft beim Lesen von objekt.name, SET beim Zuweisen objekt.name = ... (der neue Wert kommt als value). Definierst du nur GET, ist die Property nur lesbar; nur SET macht sie nur schreibbar.</w:t>
+      </w:r>
+    </w:p>
+    <w:p>
+      <w:pPr>
+        <w:keepNext/>
+        <w:spacing w:after="30" w:before="120"/>
+      </w:pPr>
+      <w:r>
+        <w:rPr>
+          <w:b/>
+          <w:bCs/>
+          <w:i/>
+          <w:iCs/>
+          <w:color w:val="6A6A6A"/>
+          <w:sz w:val="18"/>
+          <w:szCs w:val="18"/>
+        </w:rPr>
+        <w:t xml:space="preserve">Beispiel</w:t>
+      </w:r>
+    </w:p>
+    <w:p>
+      <w:pPr>
+        <w:keepLines/>
+        <w:pBdr>
+          <w:left w:val="single" w:color="1B6CA8" w:sz="18" w:space="6"/>
+        </w:pBdr>
+        <w:shd w:fill="F4F4F4" w:val="clear"/>
+        <w:spacing w:after="200" w:before="100" w:line="264" w:lineRule="auto"/>
+        <w:ind w:left="140"/>
+      </w:pPr>
+      <w:r>
+        <w:rPr>
+          <w:rFonts w:ascii="Consolas" w:cs="Consolas" w:eastAsia="Consolas" w:hAnsi="Consolas"/>
+          <w:sz w:val="19"/>
+          <w:szCs w:val="19"/>
+        </w:rPr>
+        <w:t xml:space="preserve">CLASS Spieler</w:t>
+      </w:r>
+      <w:r>
+        <w:rPr>
+          <w:rFonts w:ascii="Consolas" w:cs="Consolas" w:eastAsia="Consolas" w:hAnsi="Consolas"/>
+          <w:sz w:val="19"/>
+          <w:szCs w:val="19"/>
+        </w:rPr>
+        <w:br/>
+        <w:t xml:space="preserve">    DIM _hp AS INTEGER</w:t>
+      </w:r>
+      <w:r>
+        <w:rPr>
+          <w:rFonts w:ascii="Consolas" w:cs="Consolas" w:eastAsia="Consolas" w:hAnsi="Consolas"/>
+          <w:sz w:val="19"/>
+          <w:szCs w:val="19"/>
+        </w:rPr>
+        <w:br/>
+        <w:t xml:space="preserve"/>
+      </w:r>
+      <w:r>
+        <w:rPr>
+          <w:rFonts w:ascii="Consolas" w:cs="Consolas" w:eastAsia="Consolas" w:hAnsi="Consolas"/>
+          <w:sz w:val="19"/>
+          <w:szCs w:val="19"/>
+        </w:rPr>
+        <w:br/>
+        <w:t xml:space="preserve">    PROPERTY GET hp() AS INTEGER</w:t>
+      </w:r>
+      <w:r>
+        <w:rPr>
+          <w:rFonts w:ascii="Consolas" w:cs="Consolas" w:eastAsia="Consolas" w:hAnsi="Consolas"/>
+          <w:sz w:val="19"/>
+          <w:szCs w:val="19"/>
+        </w:rPr>
+        <w:br/>
+        <w:t xml:space="preserve">        RETURN Self._hp</w:t>
+      </w:r>
+      <w:r>
+        <w:rPr>
+          <w:rFonts w:ascii="Consolas" w:cs="Consolas" w:eastAsia="Consolas" w:hAnsi="Consolas"/>
+          <w:sz w:val="19"/>
+          <w:szCs w:val="19"/>
+        </w:rPr>
+        <w:br/>
+        <w:t xml:space="preserve">    END PROPERTY</w:t>
+      </w:r>
+      <w:r>
+        <w:rPr>
+          <w:rFonts w:ascii="Consolas" w:cs="Consolas" w:eastAsia="Consolas" w:hAnsi="Consolas"/>
+          <w:sz w:val="19"/>
+          <w:szCs w:val="19"/>
+        </w:rPr>
+        <w:br/>
+        <w:t xml:space="preserve"/>
+      </w:r>
+      <w:r>
+        <w:rPr>
+          <w:rFonts w:ascii="Consolas" w:cs="Consolas" w:eastAsia="Consolas" w:hAnsi="Consolas"/>
+          <w:sz w:val="19"/>
+          <w:szCs w:val="19"/>
+        </w:rPr>
+        <w:br/>
+        <w:t xml:space="preserve">    PROPERTY SET hp(value AS INTEGER)</w:t>
+      </w:r>
+      <w:r>
+        <w:rPr>
+          <w:rFonts w:ascii="Consolas" w:cs="Consolas" w:eastAsia="Consolas" w:hAnsi="Consolas"/>
+          <w:sz w:val="19"/>
+          <w:szCs w:val="19"/>
+        </w:rPr>
+        <w:br/>
+        <w:t xml:space="preserve">        IF value &lt; 0 THEN value = 0</w:t>
+      </w:r>
+      <w:r>
+        <w:rPr>
+          <w:rFonts w:ascii="Consolas" w:cs="Consolas" w:eastAsia="Consolas" w:hAnsi="Consolas"/>
+          <w:sz w:val="19"/>
+          <w:szCs w:val="19"/>
+        </w:rPr>
+        <w:br/>
+        <w:t xml:space="preserve">        IF value &gt; 100 THEN value = 100</w:t>
+      </w:r>
+      <w:r>
+        <w:rPr>
+          <w:rFonts w:ascii="Consolas" w:cs="Consolas" w:eastAsia="Consolas" w:hAnsi="Consolas"/>
+          <w:sz w:val="19"/>
+          <w:szCs w:val="19"/>
+        </w:rPr>
+        <w:br/>
+        <w:t xml:space="preserve">        Self._hp = value</w:t>
+      </w:r>
+      <w:r>
+        <w:rPr>
+          <w:rFonts w:ascii="Consolas" w:cs="Consolas" w:eastAsia="Consolas" w:hAnsi="Consolas"/>
+          <w:sz w:val="19"/>
+          <w:szCs w:val="19"/>
+        </w:rPr>
+        <w:br/>
+        <w:t xml:space="preserve">    END PROPERTY</w:t>
+      </w:r>
+      <w:r>
+        <w:rPr>
+          <w:rFonts w:ascii="Consolas" w:cs="Consolas" w:eastAsia="Consolas" w:hAnsi="Consolas"/>
+          <w:sz w:val="19"/>
+          <w:szCs w:val="19"/>
+        </w:rPr>
+        <w:br/>
+        <w:t xml:space="preserve">END CLASS</w:t>
+      </w:r>
+      <w:r>
+        <w:rPr>
+          <w:rFonts w:ascii="Consolas" w:cs="Consolas" w:eastAsia="Consolas" w:hAnsi="Consolas"/>
+          <w:sz w:val="19"/>
+          <w:szCs w:val="19"/>
+        </w:rPr>
+        <w:br/>
+        <w:t xml:space="preserve"/>
+      </w:r>
+      <w:r>
+        <w:rPr>
+          <w:rFonts w:ascii="Consolas" w:cs="Consolas" w:eastAsia="Consolas" w:hAnsi="Consolas"/>
+          <w:sz w:val="19"/>
+          <w:szCs w:val="19"/>
+        </w:rPr>
+        <w:br/>
+        <w:t xml:space="preserve">DIM p AS Spieler</w:t>
+      </w:r>
+      <w:r>
+        <w:rPr>
+          <w:rFonts w:ascii="Consolas" w:cs="Consolas" w:eastAsia="Consolas" w:hAnsi="Consolas"/>
+          <w:sz w:val="19"/>
+          <w:szCs w:val="19"/>
+        </w:rPr>
+        <w:br/>
+        <w:t xml:space="preserve">p = NEW Spieler()</w:t>
+      </w:r>
+      <w:r>
+        <w:rPr>
+          <w:rFonts w:ascii="Consolas" w:cs="Consolas" w:eastAsia="Consolas" w:hAnsi="Consolas"/>
+          <w:sz w:val="19"/>
+          <w:szCs w:val="19"/>
+        </w:rPr>
+        <w:br/>
+        <w:t xml:space="preserve">p.hp = 200        ' der Setter begrenzt auf 100</w:t>
+      </w:r>
+      <w:r>
+        <w:rPr>
+          <w:rFonts w:ascii="Consolas" w:cs="Consolas" w:eastAsia="Consolas" w:hAnsi="Consolas"/>
+          <w:sz w:val="19"/>
+          <w:szCs w:val="19"/>
+        </w:rPr>
+        <w:br/>
+        <w:t xml:space="preserve">PRINT p.hp</w:t>
+      </w:r>
+      <w:r>
+        <w:rPr>
+          <w:rFonts w:ascii="Consolas" w:cs="Consolas" w:eastAsia="Consolas" w:hAnsi="Consolas"/>
+          <w:sz w:val="19"/>
+          <w:szCs w:val="19"/>
+        </w:rPr>
+        <w:br/>
+        <w:t xml:space="preserve">p.hp = -50        ' der Setter hebt auf 0 an</w:t>
+      </w:r>
+      <w:r>
+        <w:rPr>
+          <w:rFonts w:ascii="Consolas" w:cs="Consolas" w:eastAsia="Consolas" w:hAnsi="Consolas"/>
+          <w:sz w:val="19"/>
+          <w:szCs w:val="19"/>
+        </w:rPr>
+        <w:br/>
+        <w:t xml:space="preserve">PRINT p.hp</w:t>
+      </w:r>
+    </w:p>
+    <w:p>
+      <w:pPr>
+        <w:keepNext/>
+        <w:spacing w:after="30" w:before="120"/>
+      </w:pPr>
+      <w:r>
+        <w:rPr>
+          <w:b/>
+          <w:bCs/>
+          <w:i/>
+          <w:iCs/>
+          <w:color w:val="6A6A6A"/>
+          <w:sz w:val="18"/>
+          <w:szCs w:val="18"/>
+        </w:rPr>
+        <w:t xml:space="preserve">Ausgabe</w:t>
+      </w:r>
+    </w:p>
+    <w:p>
+      <w:pPr>
+        <w:keepLines/>
+        <w:pBdr>
+          <w:left w:val="single" w:color="9AC79A" w:sz="18" w:space="6"/>
+        </w:pBdr>
+        <w:shd w:fill="EAF4EA" w:val="clear"/>
+        <w:spacing w:after="200" w:before="100" w:line="264" w:lineRule="auto"/>
+        <w:ind w:left="140"/>
+      </w:pPr>
+      <w:r>
+        <w:rPr>
+          <w:rFonts w:ascii="Consolas" w:cs="Consolas" w:eastAsia="Consolas" w:hAnsi="Consolas"/>
+          <w:sz w:val="19"/>
+          <w:szCs w:val="19"/>
+        </w:rPr>
+        <w:t xml:space="preserve">100</w:t>
+      </w:r>
+      <w:r>
+        <w:rPr>
+          <w:rFonts w:ascii="Consolas" w:cs="Consolas" w:eastAsia="Consolas" w:hAnsi="Consolas"/>
+          <w:sz w:val="19"/>
+          <w:szCs w:val="19"/>
+        </w:rPr>
+        <w:br/>
+        <w:t xml:space="preserve">0</w:t>
+      </w:r>
+    </w:p>
+    <w:p>
+      <w:pPr>
+        <w:pStyle w:val="Heading2"/>
+        <w:keepNext/>
+        <w:keepLines/>
+        <w:spacing w:after="120" w:before="280"/>
+      </w:pPr>
+      <w:r>
+        <w:t xml:space="preserve">Operatoren überladen</w:t>
+      </w:r>
+    </w:p>
+    <w:p>
+      <w:pPr>
+        <w:spacing w:after="180" w:line="312" w:lineRule="auto"/>
+      </w:pPr>
+      <w:r>
+        <w:rPr>
+          <w:sz w:val="22"/>
+          <w:szCs w:val="22"/>
+        </w:rPr>
+        <w:t xml:space="preserve">Für eigene Klassen, die mathematische Werte darstellen – Geldbeträge, Vektoren, Brüche –, kannst du festlegen, was +, -, =, &lt; und so weiter zwischen zwei Objekten bedeuten. Das nennt man Operator-Überladung. Statt geld_a.Plus(geld_b) schreibst du dann einfach geld_a + geld_b – viel natürlicher.</w:t>
+      </w:r>
+    </w:p>
+    <w:p>
+      <w:pPr>
+        <w:spacing w:after="180" w:line="312" w:lineRule="auto"/>
+      </w:pPr>
+      <w:r>
+        <w:rPr>
+          <w:sz w:val="22"/>
+          <w:szCs w:val="22"/>
+        </w:rPr>
+        <w:t xml:space="preserve">Dazu definierst du im Klassen-Body einen OPERATOR-Block: wie eine Methode, aber statt eines Namens steht das Operator-Zeichen dort. Er bekommt genau einen Parameter (den rechten Operanden) und einen Rückgabetyp.</w:t>
+      </w:r>
+    </w:p>
+    <w:p>
+      <w:pPr>
+        <w:keepNext/>
+        <w:keepLines/>
+        <w:pBdr>
+          <w:bottom w:val="single" w:color="DDD0C0" w:sz="4" w:space="2"/>
+        </w:pBdr>
+        <w:spacing w:after="40" w:before="360"/>
+      </w:pPr>
+      <w:r>
+        <w:rPr>
+          <w:rFonts w:ascii="Consolas" w:cs="Consolas" w:eastAsia="Consolas" w:hAnsi="Consolas"/>
+          <w:b/>
+          <w:bCs/>
+          <w:color w:val="9A3412"/>
+          <w:sz w:val="24"/>
+          <w:szCs w:val="24"/>
+        </w:rPr>
+        <w:t xml:space="preserve">OPERATOR</w:t>
+      </w:r>
+    </w:p>
+    <w:p>
+      <w:pPr>
+        <w:keepNext/>
+        <w:spacing w:after="120"/>
+      </w:pPr>
+      <w:r>
+        <w:rPr>
+          <w:b/>
+          <w:bCs/>
+          <w:color w:val="6A6A6A"/>
+          <w:sz w:val="18"/>
+          <w:szCs w:val="18"/>
+        </w:rPr>
+        <w:t xml:space="preserve">Syntax:  </w:t>
+      </w:r>
+      <w:r>
+        <w:rPr>
+          <w:rFonts w:ascii="Consolas" w:cs="Consolas" w:eastAsia="Consolas" w:hAnsi="Consolas"/>
+          <w:color w:val="335577"/>
+          <w:sz w:val="19"/>
+          <w:szCs w:val="19"/>
+        </w:rPr>
+        <w:t xml:space="preserve">OPERATOR zeichen (other AS Typ) AS Rückgabetyp ... END OPERATOR</w:t>
+      </w:r>
+    </w:p>
+    <w:p>
+      <w:pPr>
+        <w:spacing w:after="180" w:line="312" w:lineRule="auto"/>
+      </w:pPr>
+      <w:r>
+        <w:rPr>
+          <w:sz w:val="22"/>
+          <w:szCs w:val="22"/>
+        </w:rPr>
+        <w:t xml:space="preserve">Legt fest, wie ein Operator zwischen Objekten dieser Klasse wirkt. Erlaubt sind +, -, *, /, MOD, =, &lt;&gt;, &lt;, &gt;, &lt;=, &gt;=. Der eine Parameter ist der rechte Operand; Self ist der linke.</w:t>
+      </w:r>
+    </w:p>
+    <w:p>
+      <w:pPr>
+        <w:keepNext/>
+        <w:spacing w:after="30" w:before="120"/>
+      </w:pPr>
+      <w:r>
+        <w:rPr>
+          <w:b/>
+          <w:bCs/>
+          <w:i/>
+          <w:iCs/>
+          <w:color w:val="6A6A6A"/>
+          <w:sz w:val="18"/>
+          <w:szCs w:val="18"/>
+        </w:rPr>
+        <w:t xml:space="preserve">Beispiel</w:t>
+      </w:r>
+    </w:p>
+    <w:p>
+      <w:pPr>
+        <w:keepLines/>
+        <w:pBdr>
+          <w:left w:val="single" w:color="1B6CA8" w:sz="18" w:space="6"/>
+        </w:pBdr>
+        <w:shd w:fill="F4F4F4" w:val="clear"/>
+        <w:spacing w:after="200" w:before="100" w:line="264" w:lineRule="auto"/>
+        <w:ind w:left="140"/>
+      </w:pPr>
+      <w:r>
+        <w:rPr>
+          <w:rFonts w:ascii="Consolas" w:cs="Consolas" w:eastAsia="Consolas" w:hAnsi="Consolas"/>
+          <w:sz w:val="19"/>
+          <w:szCs w:val="19"/>
+        </w:rPr>
+        <w:t xml:space="preserve">CLASS Geld</w:t>
+      </w:r>
+      <w:r>
+        <w:rPr>
+          <w:rFonts w:ascii="Consolas" w:cs="Consolas" w:eastAsia="Consolas" w:hAnsi="Consolas"/>
+          <w:sz w:val="19"/>
+          <w:szCs w:val="19"/>
+        </w:rPr>
+        <w:br/>
+        <w:t xml:space="preserve">    DIM cent AS INTEGER</w:t>
+      </w:r>
+      <w:r>
+        <w:rPr>
+          <w:rFonts w:ascii="Consolas" w:cs="Consolas" w:eastAsia="Consolas" w:hAnsi="Consolas"/>
+          <w:sz w:val="19"/>
+          <w:szCs w:val="19"/>
+        </w:rPr>
+        <w:br/>
+        <w:t xml:space="preserve"/>
+      </w:r>
+      <w:r>
+        <w:rPr>
+          <w:rFonts w:ascii="Consolas" w:cs="Consolas" w:eastAsia="Consolas" w:hAnsi="Consolas"/>
+          <w:sz w:val="19"/>
+          <w:szCs w:val="19"/>
+        </w:rPr>
+        <w:br/>
+        <w:t xml:space="preserve">    OPERATOR + (other AS Geld) AS Geld</w:t>
+      </w:r>
+      <w:r>
+        <w:rPr>
+          <w:rFonts w:ascii="Consolas" w:cs="Consolas" w:eastAsia="Consolas" w:hAnsi="Consolas"/>
+          <w:sz w:val="19"/>
+          <w:szCs w:val="19"/>
+        </w:rPr>
+        <w:br/>
+        <w:t xml:space="preserve">        DIM r AS Geld</w:t>
+      </w:r>
+      <w:r>
+        <w:rPr>
+          <w:rFonts w:ascii="Consolas" w:cs="Consolas" w:eastAsia="Consolas" w:hAnsi="Consolas"/>
+          <w:sz w:val="19"/>
+          <w:szCs w:val="19"/>
+        </w:rPr>
+        <w:br/>
+        <w:t xml:space="preserve">        r = NEW Geld()</w:t>
+      </w:r>
+      <w:r>
+        <w:rPr>
+          <w:rFonts w:ascii="Consolas" w:cs="Consolas" w:eastAsia="Consolas" w:hAnsi="Consolas"/>
+          <w:sz w:val="19"/>
+          <w:szCs w:val="19"/>
+        </w:rPr>
+        <w:br/>
+        <w:t xml:space="preserve">        r.cent = Self.cent + other.cent</w:t>
+      </w:r>
+      <w:r>
+        <w:rPr>
+          <w:rFonts w:ascii="Consolas" w:cs="Consolas" w:eastAsia="Consolas" w:hAnsi="Consolas"/>
+          <w:sz w:val="19"/>
+          <w:szCs w:val="19"/>
+        </w:rPr>
+        <w:br/>
+        <w:t xml:space="preserve">        RETURN r</w:t>
+      </w:r>
+      <w:r>
+        <w:rPr>
+          <w:rFonts w:ascii="Consolas" w:cs="Consolas" w:eastAsia="Consolas" w:hAnsi="Consolas"/>
+          <w:sz w:val="19"/>
+          <w:szCs w:val="19"/>
+        </w:rPr>
+        <w:br/>
+        <w:t xml:space="preserve">    END OPERATOR</w:t>
+      </w:r>
+      <w:r>
+        <w:rPr>
+          <w:rFonts w:ascii="Consolas" w:cs="Consolas" w:eastAsia="Consolas" w:hAnsi="Consolas"/>
+          <w:sz w:val="19"/>
+          <w:szCs w:val="19"/>
+        </w:rPr>
+        <w:br/>
+        <w:t xml:space="preserve">END CLASS</w:t>
+      </w:r>
+      <w:r>
+        <w:rPr>
+          <w:rFonts w:ascii="Consolas" w:cs="Consolas" w:eastAsia="Consolas" w:hAnsi="Consolas"/>
+          <w:sz w:val="19"/>
+          <w:szCs w:val="19"/>
+        </w:rPr>
+        <w:br/>
+        <w:t xml:space="preserve"/>
+      </w:r>
+      <w:r>
+        <w:rPr>
+          <w:rFonts w:ascii="Consolas" w:cs="Consolas" w:eastAsia="Consolas" w:hAnsi="Consolas"/>
+          <w:sz w:val="19"/>
+          <w:szCs w:val="19"/>
+        </w:rPr>
+        <w:br/>
+        <w:t xml:space="preserve">DIM a AS Geld</w:t>
+      </w:r>
+      <w:r>
+        <w:rPr>
+          <w:rFonts w:ascii="Consolas" w:cs="Consolas" w:eastAsia="Consolas" w:hAnsi="Consolas"/>
+          <w:sz w:val="19"/>
+          <w:szCs w:val="19"/>
+        </w:rPr>
+        <w:br/>
+        <w:t xml:space="preserve">DIM b AS Geld</w:t>
+      </w:r>
+      <w:r>
+        <w:rPr>
+          <w:rFonts w:ascii="Consolas" w:cs="Consolas" w:eastAsia="Consolas" w:hAnsi="Consolas"/>
+          <w:sz w:val="19"/>
+          <w:szCs w:val="19"/>
+        </w:rPr>
+        <w:br/>
+        <w:t xml:space="preserve">a = NEW Geld()</w:t>
+      </w:r>
+      <w:r>
+        <w:rPr>
+          <w:rFonts w:ascii="Consolas" w:cs="Consolas" w:eastAsia="Consolas" w:hAnsi="Consolas"/>
+          <w:sz w:val="19"/>
+          <w:szCs w:val="19"/>
+        </w:rPr>
+        <w:br/>
+        <w:t xml:space="preserve">b = NEW Geld()</w:t>
+      </w:r>
+      <w:r>
+        <w:rPr>
+          <w:rFonts w:ascii="Consolas" w:cs="Consolas" w:eastAsia="Consolas" w:hAnsi="Consolas"/>
+          <w:sz w:val="19"/>
+          <w:szCs w:val="19"/>
+        </w:rPr>
+        <w:br/>
+        <w:t xml:space="preserve">a.cent = 150</w:t>
+      </w:r>
+      <w:r>
+        <w:rPr>
+          <w:rFonts w:ascii="Consolas" w:cs="Consolas" w:eastAsia="Consolas" w:hAnsi="Consolas"/>
+          <w:sz w:val="19"/>
+          <w:szCs w:val="19"/>
+        </w:rPr>
+        <w:br/>
+        <w:t xml:space="preserve">b.cent = 250</w:t>
+      </w:r>
+      <w:r>
+        <w:rPr>
+          <w:rFonts w:ascii="Consolas" w:cs="Consolas" w:eastAsia="Consolas" w:hAnsi="Consolas"/>
+          <w:sz w:val="19"/>
+          <w:szCs w:val="19"/>
+        </w:rPr>
+        <w:br/>
+        <w:t xml:space="preserve">PRINT (a + b).cent</w:t>
+      </w:r>
+    </w:p>
+    <w:p>
+      <w:pPr>
+        <w:keepNext/>
+        <w:spacing w:after="30" w:before="120"/>
+      </w:pPr>
+      <w:r>
+        <w:rPr>
+          <w:b/>
+          <w:bCs/>
+          <w:i/>
+          <w:iCs/>
+          <w:color w:val="6A6A6A"/>
+          <w:sz w:val="18"/>
+          <w:szCs w:val="18"/>
+        </w:rPr>
+        <w:t xml:space="preserve">Ausgabe</w:t>
+      </w:r>
+    </w:p>
+    <w:p>
+      <w:pPr>
+        <w:keepLines/>
+        <w:pBdr>
+          <w:left w:val="single" w:color="9AC79A" w:sz="18" w:space="6"/>
+        </w:pBdr>
+        <w:shd w:fill="EAF4EA" w:val="clear"/>
+        <w:spacing w:after="200" w:before="100" w:line="264" w:lineRule="auto"/>
+        <w:ind w:left="140"/>
+      </w:pPr>
+      <w:r>
+        <w:rPr>
+          <w:rFonts w:ascii="Consolas" w:cs="Consolas" w:eastAsia="Consolas" w:hAnsi="Consolas"/>
+          <w:sz w:val="19"/>
+          <w:szCs w:val="19"/>
+        </w:rPr>
+        <w:t xml:space="preserve">400</w:t>
+      </w:r>
+    </w:p>
+    <w:p>
+      <w:pPr>
+        <w:spacing w:before="60"/>
+      </w:pPr>
+    </w:p>
+    <w:tbl>
+      <w:tblPr>
+        <w:tblW w:type="dxa" w:w="9360"/>
+        <w:tblBorders>
+          <w:top w:val="single" w:color="auto" w:sz="4"/>
+          <w:left w:val="single" w:color="auto" w:sz="4"/>
+          <w:bottom w:val="single" w:color="auto" w:sz="4"/>
+          <w:right w:val="single" w:color="auto" w:sz="4"/>
+          <w:insideH w:val="single" w:color="auto" w:sz="4"/>
+          <w:insideV w:val="single" w:color="auto" w:sz="4"/>
+        </w:tblBorders>
+      </w:tblPr>
+      <w:tblGrid>
+        <w:gridCol w:w="9360"/>
+      </w:tblGrid>
+      <w:tr>
+        <w:trPr>
+          <w:cantSplit/>
+        </w:trPr>
+        <w:tc>
+          <w:tcPr>
+            <w:tcW w:type="dxa" w:w="9360"/>
+            <w:tcBorders>
+              <w:top w:val="single" w:color="E0B96A" w:sz="6"/>
+              <w:left w:val="single" w:color="E0B96A" w:sz="6"/>
+              <w:bottom w:val="single" w:color="E0B96A" w:sz="6"/>
+              <w:right w:val="single" w:color="E0B96A" w:sz="6"/>
+            </w:tcBorders>
+            <w:shd w:fill="FDF3E0" w:val="clear"/>
+            <w:tcMar>
+              <w:top w:type="dxa" w:w="140"/>
+              <w:left w:type="dxa" w:w="180"/>
+              <w:bottom w:type="dxa" w:w="140"/>
+              <w:right w:type="dxa" w:w="180"/>
+            </w:tcMar>
+          </w:tcPr>
+          <w:p>
+            <w:pPr>
+              <w:spacing w:after="40"/>
+            </w:pPr>
+            <w:r>
+              <w:rPr>
+                <w:b/>
+                <w:bCs/>
+                <w:color w:val="9A6A1E"/>
+                <w:sz w:val="22"/>
+                <w:szCs w:val="22"/>
+              </w:rPr>
+              <w:t xml:space="preserve">Merke</w:t>
+            </w:r>
+          </w:p>
+          <w:p>
+            <w:pPr>
+              <w:spacing w:after="0" w:line="312" w:lineRule="auto"/>
+            </w:pPr>
+            <w:r>
+              <w:rPr>
+                <w:sz w:val="22"/>
+                <w:szCs w:val="22"/>
+              </w:rPr>
+              <w:t xml:space="preserve">Pro Operator gibt es genau eine Definition – ein Mischen von Geld + Geld und Geld + INTEGER in zwei getrennten Blöcken ist nicht möglich. Überladene Operatoren werden wie Methoden mitvererbt. Für fertige mathematische Typen liefert GameBasic übrigens schon Module mit, etwa vec2 für 2D-Vektoren (Teil V).</w:t>
+            </w:r>
+          </w:p>
+        </w:tc>
+      </w:tr>
+    </w:tbl>
+    <w:p>
+      <w:pPr>
+        <w:spacing w:after="160"/>
+      </w:pPr>
+    </w:p>
+    <w:p>
+      <w:pPr>
+        <w:pStyle w:val="Heading2"/>
+        <w:keepNext/>
+        <w:keepLines/>
+        <w:spacing w:after="120" w:before="280"/>
+      </w:pPr>
+      <w:r>
+        <w:t xml:space="preserve">Statische Mitglieder: zur Klasse, nicht zum Objekt</w:t>
+      </w:r>
+    </w:p>
+    <w:p>
+      <w:pPr>
+        <w:spacing w:after="180" w:line="312" w:lineRule="auto"/>
+      </w:pPr>
+      <w:r>
+        <w:rPr>
+          <w:sz w:val="22"/>
+          <w:szCs w:val="22"/>
+        </w:rPr>
+        <w:t xml:space="preserve">Bisher gehörte jedes Feld einem Objekt. Manche Werte gehören aber zur Klasse als Ganzes – feste Kennzahlen, die für alle Objekte gleich sind und kein Objekt zum Nachschlagen brauchen: die maximale Lebenspunktzahl, der Spielname, die Schwerkraft. Dafür gibt es STATIC CONST. Du sprichst sie über den Klassennamen an, ohne je ein Objekt zu erzeugen.</w:t>
+      </w:r>
+    </w:p>
+    <w:p>
+      <w:pPr>
+        <w:keepNext/>
+        <w:keepLines/>
+        <w:pBdr>
+          <w:bottom w:val="single" w:color="DDD0C0" w:sz="4" w:space="2"/>
+        </w:pBdr>
+        <w:spacing w:after="40" w:before="360"/>
+      </w:pPr>
+      <w:r>
+        <w:rPr>
+          <w:rFonts w:ascii="Consolas" w:cs="Consolas" w:eastAsia="Consolas" w:hAnsi="Consolas"/>
+          <w:b/>
+          <w:bCs/>
+          <w:color w:val="9A3412"/>
+          <w:sz w:val="24"/>
+          <w:szCs w:val="24"/>
+        </w:rPr>
+        <w:t xml:space="preserve">STATIC CONST</w:t>
+      </w:r>
+    </w:p>
+    <w:p>
+      <w:pPr>
+        <w:keepNext/>
+        <w:spacing w:after="120"/>
+      </w:pPr>
+      <w:r>
+        <w:rPr>
+          <w:b/>
+          <w:bCs/>
+          <w:color w:val="6A6A6A"/>
+          <w:sz w:val="18"/>
+          <w:szCs w:val="18"/>
+        </w:rPr>
+        <w:t xml:space="preserve">Syntax:  </w:t>
+      </w:r>
+      <w:r>
+        <w:rPr>
+          <w:rFonts w:ascii="Consolas" w:cs="Consolas" w:eastAsia="Consolas" w:hAnsi="Consolas"/>
+          <w:color w:val="335577"/>
+          <w:sz w:val="19"/>
+          <w:szCs w:val="19"/>
+        </w:rPr>
+        <w:t xml:space="preserve">STATIC CONST NAME AS Typ = wert</w:t>
+      </w:r>
+    </w:p>
+    <w:p>
+      <w:pPr>
+        <w:spacing w:after="180" w:line="312" w:lineRule="auto"/>
+      </w:pPr>
+      <w:r>
+        <w:rPr>
+          <w:sz w:val="22"/>
+          <w:szCs w:val="22"/>
+        </w:rPr>
+        <w:t xml:space="preserve">Definiert eine zur Klasse gehörende Konstante, abrufbar als Klassenname.NAME. Der Wert muss ein fester Literalwert sein (Zahl, String, Wahrheitswert). So bündelst du feste Kennzahlen sauber bei ihrer Klasse statt in losen globalen Konstanten.</w:t>
+      </w:r>
+    </w:p>
+    <w:p>
+      <w:pPr>
+        <w:keepNext/>
+        <w:spacing w:after="30" w:before="120"/>
+      </w:pPr>
+      <w:r>
+        <w:rPr>
+          <w:b/>
+          <w:bCs/>
+          <w:i/>
+          <w:iCs/>
+          <w:color w:val="6A6A6A"/>
+          <w:sz w:val="18"/>
+          <w:szCs w:val="18"/>
+        </w:rPr>
+        <w:t xml:space="preserve">Beispiel</w:t>
+      </w:r>
+    </w:p>
+    <w:p>
+      <w:pPr>
+        <w:keepLines/>
+        <w:pBdr>
+          <w:left w:val="single" w:color="1B6CA8" w:sz="18" w:space="6"/>
+        </w:pBdr>
+        <w:shd w:fill="F4F4F4" w:val="clear"/>
+        <w:spacing w:after="200" w:before="100" w:line="264" w:lineRule="auto"/>
+        <w:ind w:left="140"/>
+      </w:pPr>
+      <w:r>
+        <w:rPr>
+          <w:rFonts w:ascii="Consolas" w:cs="Consolas" w:eastAsia="Consolas" w:hAnsi="Consolas"/>
+          <w:sz w:val="19"/>
+          <w:szCs w:val="19"/>
+        </w:rPr>
+        <w:t xml:space="preserve">CLASS Config</w:t>
+      </w:r>
+      <w:r>
+        <w:rPr>
+          <w:rFonts w:ascii="Consolas" w:cs="Consolas" w:eastAsia="Consolas" w:hAnsi="Consolas"/>
+          <w:sz w:val="19"/>
+          <w:szCs w:val="19"/>
+        </w:rPr>
+        <w:br/>
+        <w:t xml:space="preserve">    STATIC CONST MAX_HP AS INTEGER = 100</w:t>
+      </w:r>
+      <w:r>
+        <w:rPr>
+          <w:rFonts w:ascii="Consolas" w:cs="Consolas" w:eastAsia="Consolas" w:hAnsi="Consolas"/>
+          <w:sz w:val="19"/>
+          <w:szCs w:val="19"/>
+        </w:rPr>
+        <w:br/>
+        <w:t xml:space="preserve">    STATIC CONST SPIELNAME AS STRING = "GameBasic"</w:t>
+      </w:r>
+      <w:r>
+        <w:rPr>
+          <w:rFonts w:ascii="Consolas" w:cs="Consolas" w:eastAsia="Consolas" w:hAnsi="Consolas"/>
+          <w:sz w:val="19"/>
+          <w:szCs w:val="19"/>
+        </w:rPr>
+        <w:br/>
+        <w:t xml:space="preserve">END CLASS</w:t>
+      </w:r>
+      <w:r>
+        <w:rPr>
+          <w:rFonts w:ascii="Consolas" w:cs="Consolas" w:eastAsia="Consolas" w:hAnsi="Consolas"/>
+          <w:sz w:val="19"/>
+          <w:szCs w:val="19"/>
+        </w:rPr>
+        <w:br/>
+        <w:t xml:space="preserve"/>
+      </w:r>
+      <w:r>
+        <w:rPr>
+          <w:rFonts w:ascii="Consolas" w:cs="Consolas" w:eastAsia="Consolas" w:hAnsi="Consolas"/>
+          <w:sz w:val="19"/>
+          <w:szCs w:val="19"/>
+        </w:rPr>
+        <w:br/>
+        <w:t xml:space="preserve">PRINT Config.MAX_HP</w:t>
+      </w:r>
+      <w:r>
+        <w:rPr>
+          <w:rFonts w:ascii="Consolas" w:cs="Consolas" w:eastAsia="Consolas" w:hAnsi="Consolas"/>
+          <w:sz w:val="19"/>
+          <w:szCs w:val="19"/>
+        </w:rPr>
+        <w:br/>
+        <w:t xml:space="preserve">PRINT Config.SPIELNAME</w:t>
+      </w:r>
+    </w:p>
+    <w:p>
+      <w:pPr>
+        <w:keepNext/>
+        <w:spacing w:after="30" w:before="120"/>
+      </w:pPr>
+      <w:r>
+        <w:rPr>
+          <w:b/>
+          <w:bCs/>
+          <w:i/>
+          <w:iCs/>
+          <w:color w:val="6A6A6A"/>
+          <w:sz w:val="18"/>
+          <w:szCs w:val="18"/>
+        </w:rPr>
+        <w:t xml:space="preserve">Ausgabe</w:t>
+      </w:r>
+    </w:p>
+    <w:p>
+      <w:pPr>
+        <w:keepLines/>
+        <w:pBdr>
+          <w:left w:val="single" w:color="9AC79A" w:sz="18" w:space="6"/>
+        </w:pBdr>
+        <w:shd w:fill="EAF4EA" w:val="clear"/>
+        <w:spacing w:after="200" w:before="100" w:line="264" w:lineRule="auto"/>
+        <w:ind w:left="140"/>
+      </w:pPr>
+      <w:r>
+        <w:rPr>
+          <w:rFonts w:ascii="Consolas" w:cs="Consolas" w:eastAsia="Consolas" w:hAnsi="Consolas"/>
+          <w:sz w:val="19"/>
+          <w:szCs w:val="19"/>
+        </w:rPr>
+        <w:t xml:space="preserve">100</w:t>
+      </w:r>
+      <w:r>
+        <w:rPr>
+          <w:rFonts w:ascii="Consolas" w:cs="Consolas" w:eastAsia="Consolas" w:hAnsi="Consolas"/>
+          <w:sz w:val="19"/>
+          <w:szCs w:val="19"/>
+        </w:rPr>
+        <w:br/>
+        <w:t xml:space="preserve">GameBasic</w:t>
+      </w:r>
+    </w:p>
+    <w:p>
+      <w:pPr>
+        <w:spacing w:after="180" w:line="312" w:lineRule="auto"/>
+      </w:pPr>
+      <w:r>
+        <w:rPr>
+          <w:sz w:val="22"/>
+          <w:szCs w:val="22"/>
+        </w:rPr>
+        <w:t xml:space="preserve">Innerhalb einer Methode der Klasse greifst du genauso zu (Config.MAX_HP). Statische Konstanten sind fest – sie lassen sich zur Laufzeit nicht überschreiben. Brauchst du veränderlichen, geteilten Zustand, nimm stattdessen eine globale Variable.</w:t>
+      </w:r>
+    </w:p>
+    <w:p>
+      <w:pPr>
+        <w:spacing w:before="60"/>
+      </w:pPr>
+    </w:p>
+    <w:tbl>
+      <w:tblPr>
+        <w:tblW w:type="dxa" w:w="9360"/>
+        <w:tblBorders>
+          <w:top w:val="single" w:color="auto" w:sz="4"/>
+          <w:left w:val="single" w:color="auto" w:sz="4"/>
+          <w:bottom w:val="single" w:color="auto" w:sz="4"/>
+          <w:right w:val="single" w:color="auto" w:sz="4"/>
+          <w:insideH w:val="single" w:color="auto" w:sz="4"/>
+          <w:insideV w:val="single" w:color="auto" w:sz="4"/>
+        </w:tblBorders>
+      </w:tblPr>
+      <w:tblGrid>
+        <w:gridCol w:w="9360"/>
+      </w:tblGrid>
+      <w:tr>
+        <w:trPr>
+          <w:cantSplit/>
+        </w:trPr>
+        <w:tc>
+          <w:tcPr>
+            <w:tcW w:type="dxa" w:w="9360"/>
+            <w:tcBorders>
+              <w:top w:val="single" w:color="9CC8E6" w:sz="6"/>
+              <w:left w:val="single" w:color="9CC8E6" w:sz="6"/>
+              <w:bottom w:val="single" w:color="9CC8E6" w:sz="6"/>
+              <w:right w:val="single" w:color="9CC8E6" w:sz="6"/>
+            </w:tcBorders>
+            <w:shd w:fill="E7F2FA" w:val="clear"/>
+            <w:tcMar>
+              <w:top w:type="dxa" w:w="140"/>
+              <w:left w:type="dxa" w:w="180"/>
+              <w:bottom w:type="dxa" w:w="140"/>
+              <w:right w:type="dxa" w:w="180"/>
+            </w:tcMar>
+          </w:tcPr>
+          <w:p>
+            <w:pPr>
+              <w:spacing w:after="40"/>
+            </w:pPr>
+            <w:r>
+              <w:rPr>
+                <w:b/>
+                <w:bCs/>
+                <w:color w:val="1B6CA8"/>
+                <w:sz w:val="22"/>
+                <w:szCs w:val="22"/>
+              </w:rPr>
+              <w:t xml:space="preserve">Nicht übertreiben</w:t>
+            </w:r>
+          </w:p>
+          <w:p>
+            <w:pPr>
+              <w:spacing w:after="0" w:line="312" w:lineRule="auto"/>
+            </w:pPr>
+            <w:r>
+              <w:rPr>
+                <w:sz w:val="22"/>
+                <w:szCs w:val="22"/>
+              </w:rPr>
+              <w:t xml:space="preserve">Vererbung, Properties und Operatoren sind starke Werkzeuge – aber nicht jedes Programm braucht sie. Fang ruhig mit schlichten Klassen aus Feldern und Methoden an (Kapitel 20). Greife zu Vererbung, wenn echte „ist ein“-Beziehungen vorliegen (ein Hund IST ein Tier), zu Properties bei Werten mit Regeln, zu Operatoren nur bei echten Rechen-Typen. Klarheit schlägt Cleverness.</w:t>
             </w:r>
           </w:p>
         </w:tc>

</xml_diff>

<commit_message>
docs(buch): Lehrbuch Kap 22 -- ENUM
Kompakte und Block-Form, Auto-Nummerierung ab 0, eigene Werte, gemischtes
Weiterzaehlen, Einsatz mit DIM AS Enum + SELECT CASE, Keyword-Member.
ENUM-vs-STATIC-CONST-Abgrenzung. Alle Beispiel-Ausgaben gegen gbrt verifiziert.

Co-Authored-By: Claude Opus 4.8 (1M context) <noreply@anthropic.com>
</commit_message>
<xml_diff>
--- a/buch-referenz/buch/GameBasic-Lehrbuch.docx
+++ b/buch-referenz/buch/GameBasic-Lehrbuch.docx
@@ -570,6 +570,33 @@
           <w:szCs w:val="22"/>
         </w:rPr>
         <w:t xml:space="preserve">	66</w:t>
+      </w:r>
+    </w:p>
+    <w:p>
+      <w:pPr>
+        <w:tabs>
+          <w:tab w:val="right" w:pos="9200" w:leader="dot"/>
+        </w:tabs>
+        <w:spacing w:after="20" w:before="0"/>
+        <w:ind w:left="280"/>
+      </w:pPr>
+      <w:r>
+        <w:rPr>
+          <w:b w:val="false"/>
+          <w:bCs w:val="false"/>
+          <w:color w:val="222222"/>
+          <w:sz w:val="22"/>
+          <w:szCs w:val="22"/>
+        </w:rPr>
+        <w:t xml:space="preserve">ENUM</w:t>
+      </w:r>
+      <w:r>
+        <w:rPr>
+          <w:color w:val="555555"/>
+          <w:sz w:val="22"/>
+          <w:szCs w:val="22"/>
+        </w:rPr>
+        <w:t xml:space="preserve">	21</w:t>
       </w:r>
     </w:p>
     <w:p>
@@ -22757,6 +22784,861 @@
                 <w:szCs w:val="22"/>
               </w:rPr>
               <w:t xml:space="preserve">Vererbung, Properties und Operatoren sind starke Werkzeuge – aber nicht jedes Programm braucht sie. Fang ruhig mit schlichten Klassen aus Feldern und Methoden an (Kapitel 20). Greife zu Vererbung, wenn echte „ist ein“-Beziehungen vorliegen (ein Hund IST ein Tier), zu Properties bei Werten mit Regeln, zu Operatoren nur bei echten Rechen-Typen. Klarheit schlägt Cleverness.</w:t>
+            </w:r>
+          </w:p>
+        </w:tc>
+      </w:tr>
+    </w:tbl>
+    <w:p>
+      <w:pPr>
+        <w:spacing w:after="160"/>
+      </w:pPr>
+    </w:p>
+    <w:p>
+      <w:pPr>
+        <w:pStyle w:val="Heading1"/>
+        <w:keepNext/>
+        <w:keepLines/>
+        <w:pageBreakBefore/>
+        <w:pBdr>
+          <w:bottom w:val="single" w:color="1B6CA8" w:sz="12" w:space="4"/>
+        </w:pBdr>
+        <w:spacing w:after="160" w:before="0"/>
+      </w:pPr>
+      <w:r>
+        <w:t xml:space="preserve">ENUM</w:t>
+      </w:r>
+    </w:p>
+    <w:p>
+      <w:pPr>
+        <w:spacing w:after="180" w:line="312" w:lineRule="auto"/>
+      </w:pPr>
+      <w:r>
+        <w:rPr>
+          <w:sz w:val="22"/>
+          <w:szCs w:val="22"/>
+        </w:rPr>
+        <w:t xml:space="preserve">Programme stecken voller Zustände und Kategorien: Ein Spiel ist im Menü, läuft gerade oder ist pausiert. Solche Fälle könntest du mit Zahlen darstellen (0 = Menü, 1 = läuft, 2 = Pause) – aber wer merkt sich, dass 2 für Pause steht? Ein ENUM (kurz für „Enumeration“, Aufzählung) gibt diesen Zahlen sprechende Namen. Dein Code wird dadurch lesbar und unverwechselbar.</w:t>
+      </w:r>
+    </w:p>
+    <w:p>
+      <w:pPr>
+        <w:pStyle w:val="Heading2"/>
+        <w:keepNext/>
+        <w:keepLines/>
+        <w:spacing w:after="120" w:before="280"/>
+      </w:pPr>
+      <w:r>
+        <w:t xml:space="preserve">Ein ENUM definieren</w:t>
+      </w:r>
+    </w:p>
+    <w:p>
+      <w:pPr>
+        <w:spacing w:after="180" w:line="312" w:lineRule="auto"/>
+      </w:pPr>
+      <w:r>
+        <w:rPr>
+          <w:sz w:val="22"/>
+          <w:szCs w:val="22"/>
+        </w:rPr>
+        <w:t xml:space="preserve">Im einfachsten Fall zählst du die Namen kompakt in einer Zeile auf. GameBasic vergibt automatisch die Zahlen 0, 1, 2 und so weiter. Angesprochen werden die Werte über den ENUM-Namen mit Punkt – also Status.MENU. Diese Schreibweise macht sofort klar, worum es geht.</w:t>
+      </w:r>
+    </w:p>
+    <w:p>
+      <w:pPr>
+        <w:keepNext/>
+        <w:keepLines/>
+        <w:pBdr>
+          <w:bottom w:val="single" w:color="DDD0C0" w:sz="4" w:space="2"/>
+        </w:pBdr>
+        <w:spacing w:after="40" w:before="360"/>
+      </w:pPr>
+      <w:r>
+        <w:rPr>
+          <w:rFonts w:ascii="Consolas" w:cs="Consolas" w:eastAsia="Consolas" w:hAnsi="Consolas"/>
+          <w:b/>
+          <w:bCs/>
+          <w:color w:val="9A3412"/>
+          <w:sz w:val="24"/>
+          <w:szCs w:val="24"/>
+        </w:rPr>
+        <w:t xml:space="preserve">ENUM (kompakt)</w:t>
+      </w:r>
+    </w:p>
+    <w:p>
+      <w:pPr>
+        <w:keepNext/>
+        <w:spacing w:after="120"/>
+      </w:pPr>
+      <w:r>
+        <w:rPr>
+          <w:b/>
+          <w:bCs/>
+          <w:color w:val="6A6A6A"/>
+          <w:sz w:val="18"/>
+          <w:szCs w:val="18"/>
+        </w:rPr>
+        <w:t xml:space="preserve">Syntax:  </w:t>
+      </w:r>
+      <w:r>
+        <w:rPr>
+          <w:rFonts w:ascii="Consolas" w:cs="Consolas" w:eastAsia="Consolas" w:hAnsi="Consolas"/>
+          <w:color w:val="335577"/>
+          <w:sz w:val="19"/>
+          <w:szCs w:val="19"/>
+        </w:rPr>
+        <w:t xml:space="preserve">ENUM Name = WERT1, WERT2, ...</w:t>
+      </w:r>
+    </w:p>
+    <w:p>
+      <w:pPr>
+        <w:spacing w:after="180" w:line="312" w:lineRule="auto"/>
+      </w:pPr>
+      <w:r>
+        <w:rPr>
+          <w:sz w:val="22"/>
+          <w:szCs w:val="22"/>
+        </w:rPr>
+        <w:t xml:space="preserve">Definiert eine Aufzählung. Die Mitglieder bekommen der Reihe nach die Werte 0, 1, 2, … und werden als Name.MITGLIED angesprochen.</w:t>
+      </w:r>
+    </w:p>
+    <w:p>
+      <w:pPr>
+        <w:keepNext/>
+        <w:spacing w:after="30" w:before="120"/>
+      </w:pPr>
+      <w:r>
+        <w:rPr>
+          <w:b/>
+          <w:bCs/>
+          <w:i/>
+          <w:iCs/>
+          <w:color w:val="6A6A6A"/>
+          <w:sz w:val="18"/>
+          <w:szCs w:val="18"/>
+        </w:rPr>
+        <w:t xml:space="preserve">Beispiel</w:t>
+      </w:r>
+    </w:p>
+    <w:p>
+      <w:pPr>
+        <w:keepLines/>
+        <w:pBdr>
+          <w:left w:val="single" w:color="1B6CA8" w:sz="18" w:space="6"/>
+        </w:pBdr>
+        <w:shd w:fill="F4F4F4" w:val="clear"/>
+        <w:spacing w:after="200" w:before="100" w:line="264" w:lineRule="auto"/>
+        <w:ind w:left="140"/>
+      </w:pPr>
+      <w:r>
+        <w:rPr>
+          <w:rFonts w:ascii="Consolas" w:cs="Consolas" w:eastAsia="Consolas" w:hAnsi="Consolas"/>
+          <w:sz w:val="19"/>
+          <w:szCs w:val="19"/>
+        </w:rPr>
+        <w:t xml:space="preserve">ENUM Status = MENU, SPIELT, PAUSE</w:t>
+      </w:r>
+      <w:r>
+        <w:rPr>
+          <w:rFonts w:ascii="Consolas" w:cs="Consolas" w:eastAsia="Consolas" w:hAnsi="Consolas"/>
+          <w:sz w:val="19"/>
+          <w:szCs w:val="19"/>
+        </w:rPr>
+        <w:br/>
+        <w:t xml:space="preserve"/>
+      </w:r>
+      <w:r>
+        <w:rPr>
+          <w:rFonts w:ascii="Consolas" w:cs="Consolas" w:eastAsia="Consolas" w:hAnsi="Consolas"/>
+          <w:sz w:val="19"/>
+          <w:szCs w:val="19"/>
+        </w:rPr>
+        <w:br/>
+        <w:t xml:space="preserve">PRINT Status.MENU</w:t>
+      </w:r>
+      <w:r>
+        <w:rPr>
+          <w:rFonts w:ascii="Consolas" w:cs="Consolas" w:eastAsia="Consolas" w:hAnsi="Consolas"/>
+          <w:sz w:val="19"/>
+          <w:szCs w:val="19"/>
+        </w:rPr>
+        <w:br/>
+        <w:t xml:space="preserve">PRINT Status.SPIELT</w:t>
+      </w:r>
+      <w:r>
+        <w:rPr>
+          <w:rFonts w:ascii="Consolas" w:cs="Consolas" w:eastAsia="Consolas" w:hAnsi="Consolas"/>
+          <w:sz w:val="19"/>
+          <w:szCs w:val="19"/>
+        </w:rPr>
+        <w:br/>
+        <w:t xml:space="preserve">PRINT Status.PAUSE</w:t>
+      </w:r>
+    </w:p>
+    <w:p>
+      <w:pPr>
+        <w:keepNext/>
+        <w:spacing w:after="30" w:before="120"/>
+      </w:pPr>
+      <w:r>
+        <w:rPr>
+          <w:b/>
+          <w:bCs/>
+          <w:i/>
+          <w:iCs/>
+          <w:color w:val="6A6A6A"/>
+          <w:sz w:val="18"/>
+          <w:szCs w:val="18"/>
+        </w:rPr>
+        <w:t xml:space="preserve">Ausgabe</w:t>
+      </w:r>
+    </w:p>
+    <w:p>
+      <w:pPr>
+        <w:keepLines/>
+        <w:pBdr>
+          <w:left w:val="single" w:color="9AC79A" w:sz="18" w:space="6"/>
+        </w:pBdr>
+        <w:shd w:fill="EAF4EA" w:val="clear"/>
+        <w:spacing w:after="200" w:before="100" w:line="264" w:lineRule="auto"/>
+        <w:ind w:left="140"/>
+      </w:pPr>
+      <w:r>
+        <w:rPr>
+          <w:rFonts w:ascii="Consolas" w:cs="Consolas" w:eastAsia="Consolas" w:hAnsi="Consolas"/>
+          <w:sz w:val="19"/>
+          <w:szCs w:val="19"/>
+        </w:rPr>
+        <w:t xml:space="preserve">0</w:t>
+      </w:r>
+      <w:r>
+        <w:rPr>
+          <w:rFonts w:ascii="Consolas" w:cs="Consolas" w:eastAsia="Consolas" w:hAnsi="Consolas"/>
+          <w:sz w:val="19"/>
+          <w:szCs w:val="19"/>
+        </w:rPr>
+        <w:br/>
+        <w:t xml:space="preserve">1</w:t>
+      </w:r>
+      <w:r>
+        <w:rPr>
+          <w:rFonts w:ascii="Consolas" w:cs="Consolas" w:eastAsia="Consolas" w:hAnsi="Consolas"/>
+          <w:sz w:val="19"/>
+          <w:szCs w:val="19"/>
+        </w:rPr>
+        <w:br/>
+        <w:t xml:space="preserve">2</w:t>
+      </w:r>
+    </w:p>
+    <w:p>
+      <w:pPr>
+        <w:pStyle w:val="Heading2"/>
+        <w:keepNext/>
+        <w:keepLines/>
+        <w:spacing w:after="120" w:before="280"/>
+      </w:pPr>
+      <w:r>
+        <w:t xml:space="preserve">Eigene Werte vergeben</w:t>
+      </w:r>
+    </w:p>
+    <w:p>
+      <w:pPr>
+        <w:spacing w:after="180" w:line="312" w:lineRule="auto"/>
+      </w:pPr>
+      <w:r>
+        <w:rPr>
+          <w:sz w:val="22"/>
+          <w:szCs w:val="22"/>
+        </w:rPr>
+        <w:t xml:space="preserve">Brauchst du bestimmte Zahlen – etwa weil sie zu Daten von außen passen müssen –, schreibst du das ENUM als Block und gibst jedem Mitglied seinen Wert. Das liest sich übersichtlich, sobald es mehr Einträge werden.</w:t>
+      </w:r>
+    </w:p>
+    <w:p>
+      <w:pPr>
+        <w:keepNext/>
+        <w:keepLines/>
+        <w:pBdr>
+          <w:bottom w:val="single" w:color="DDD0C0" w:sz="4" w:space="2"/>
+        </w:pBdr>
+        <w:spacing w:after="40" w:before="360"/>
+      </w:pPr>
+      <w:r>
+        <w:rPr>
+          <w:rFonts w:ascii="Consolas" w:cs="Consolas" w:eastAsia="Consolas" w:hAnsi="Consolas"/>
+          <w:b/>
+          <w:bCs/>
+          <w:color w:val="9A3412"/>
+          <w:sz w:val="24"/>
+          <w:szCs w:val="24"/>
+        </w:rPr>
+        <w:t xml:space="preserve">ENUM (Block)</w:t>
+      </w:r>
+    </w:p>
+    <w:p>
+      <w:pPr>
+        <w:keepNext/>
+        <w:spacing w:after="120"/>
+      </w:pPr>
+      <w:r>
+        <w:rPr>
+          <w:b/>
+          <w:bCs/>
+          <w:color w:val="6A6A6A"/>
+          <w:sz w:val="18"/>
+          <w:szCs w:val="18"/>
+        </w:rPr>
+        <w:t xml:space="preserve">Syntax:  </w:t>
+      </w:r>
+      <w:r>
+        <w:rPr>
+          <w:rFonts w:ascii="Consolas" w:cs="Consolas" w:eastAsia="Consolas" w:hAnsi="Consolas"/>
+          <w:color w:val="335577"/>
+          <w:sz w:val="19"/>
+          <w:szCs w:val="19"/>
+        </w:rPr>
+        <w:t xml:space="preserve">ENUM Name
+    MITGLIED = wert
+    ...
+END ENUM</w:t>
+      </w:r>
+    </w:p>
+    <w:p>
+      <w:pPr>
+        <w:spacing w:after="180" w:line="312" w:lineRule="auto"/>
+      </w:pPr>
+      <w:r>
+        <w:rPr>
+          <w:sz w:val="22"/>
+          <w:szCs w:val="22"/>
+        </w:rPr>
+        <w:t xml:space="preserve">Block-Schreibweise mit ausdrücklichen Werten. Lässt du bei einem Mitglied den Wert weg, zählt GameBasic vom letzten vergebenen Wert um eins weiter.</w:t>
+      </w:r>
+    </w:p>
+    <w:p>
+      <w:pPr>
+        <w:keepNext/>
+        <w:spacing w:after="30" w:before="120"/>
+      </w:pPr>
+      <w:r>
+        <w:rPr>
+          <w:b/>
+          <w:bCs/>
+          <w:i/>
+          <w:iCs/>
+          <w:color w:val="6A6A6A"/>
+          <w:sz w:val="18"/>
+          <w:szCs w:val="18"/>
+        </w:rPr>
+        <w:t xml:space="preserve">Beispiel</w:t>
+      </w:r>
+    </w:p>
+    <w:p>
+      <w:pPr>
+        <w:keepLines/>
+        <w:pBdr>
+          <w:left w:val="single" w:color="1B6CA8" w:sz="18" w:space="6"/>
+        </w:pBdr>
+        <w:shd w:fill="F4F4F4" w:val="clear"/>
+        <w:spacing w:after="200" w:before="100" w:line="264" w:lineRule="auto"/>
+        <w:ind w:left="140"/>
+      </w:pPr>
+      <w:r>
+        <w:rPr>
+          <w:rFonts w:ascii="Consolas" w:cs="Consolas" w:eastAsia="Consolas" w:hAnsi="Consolas"/>
+          <w:sz w:val="19"/>
+          <w:szCs w:val="19"/>
+        </w:rPr>
+        <w:t xml:space="preserve">ENUM Recht</w:t>
+      </w:r>
+      <w:r>
+        <w:rPr>
+          <w:rFonts w:ascii="Consolas" w:cs="Consolas" w:eastAsia="Consolas" w:hAnsi="Consolas"/>
+          <w:sz w:val="19"/>
+          <w:szCs w:val="19"/>
+        </w:rPr>
+        <w:br/>
+        <w:t xml:space="preserve">    KEINS = 0</w:t>
+      </w:r>
+      <w:r>
+        <w:rPr>
+          <w:rFonts w:ascii="Consolas" w:cs="Consolas" w:eastAsia="Consolas" w:hAnsi="Consolas"/>
+          <w:sz w:val="19"/>
+          <w:szCs w:val="19"/>
+        </w:rPr>
+        <w:br/>
+        <w:t xml:space="preserve">    LESEN = 1</w:t>
+      </w:r>
+      <w:r>
+        <w:rPr>
+          <w:rFonts w:ascii="Consolas" w:cs="Consolas" w:eastAsia="Consolas" w:hAnsi="Consolas"/>
+          <w:sz w:val="19"/>
+          <w:szCs w:val="19"/>
+        </w:rPr>
+        <w:br/>
+        <w:t xml:space="preserve">    SCHREIBEN = 2</w:t>
+      </w:r>
+      <w:r>
+        <w:rPr>
+          <w:rFonts w:ascii="Consolas" w:cs="Consolas" w:eastAsia="Consolas" w:hAnsi="Consolas"/>
+          <w:sz w:val="19"/>
+          <w:szCs w:val="19"/>
+        </w:rPr>
+        <w:br/>
+        <w:t xml:space="preserve">    ADMIN = 99</w:t>
+      </w:r>
+      <w:r>
+        <w:rPr>
+          <w:rFonts w:ascii="Consolas" w:cs="Consolas" w:eastAsia="Consolas" w:hAnsi="Consolas"/>
+          <w:sz w:val="19"/>
+          <w:szCs w:val="19"/>
+        </w:rPr>
+        <w:br/>
+        <w:t xml:space="preserve">END ENUM</w:t>
+      </w:r>
+      <w:r>
+        <w:rPr>
+          <w:rFonts w:ascii="Consolas" w:cs="Consolas" w:eastAsia="Consolas" w:hAnsi="Consolas"/>
+          <w:sz w:val="19"/>
+          <w:szCs w:val="19"/>
+        </w:rPr>
+        <w:br/>
+        <w:t xml:space="preserve"/>
+      </w:r>
+      <w:r>
+        <w:rPr>
+          <w:rFonts w:ascii="Consolas" w:cs="Consolas" w:eastAsia="Consolas" w:hAnsi="Consolas"/>
+          <w:sz w:val="19"/>
+          <w:szCs w:val="19"/>
+        </w:rPr>
+        <w:br/>
+        <w:t xml:space="preserve">PRINT Recht.SCHREIBEN</w:t>
+      </w:r>
+      <w:r>
+        <w:rPr>
+          <w:rFonts w:ascii="Consolas" w:cs="Consolas" w:eastAsia="Consolas" w:hAnsi="Consolas"/>
+          <w:sz w:val="19"/>
+          <w:szCs w:val="19"/>
+        </w:rPr>
+        <w:br/>
+        <w:t xml:space="preserve">PRINT Recht.ADMIN</w:t>
+      </w:r>
+    </w:p>
+    <w:p>
+      <w:pPr>
+        <w:keepNext/>
+        <w:spacing w:after="30" w:before="120"/>
+      </w:pPr>
+      <w:r>
+        <w:rPr>
+          <w:b/>
+          <w:bCs/>
+          <w:i/>
+          <w:iCs/>
+          <w:color w:val="6A6A6A"/>
+          <w:sz w:val="18"/>
+          <w:szCs w:val="18"/>
+        </w:rPr>
+        <w:t xml:space="preserve">Ausgabe</w:t>
+      </w:r>
+    </w:p>
+    <w:p>
+      <w:pPr>
+        <w:keepLines/>
+        <w:pBdr>
+          <w:left w:val="single" w:color="9AC79A" w:sz="18" w:space="6"/>
+        </w:pBdr>
+        <w:shd w:fill="EAF4EA" w:val="clear"/>
+        <w:spacing w:after="200" w:before="100" w:line="264" w:lineRule="auto"/>
+        <w:ind w:left="140"/>
+      </w:pPr>
+      <w:r>
+        <w:rPr>
+          <w:rFonts w:ascii="Consolas" w:cs="Consolas" w:eastAsia="Consolas" w:hAnsi="Consolas"/>
+          <w:sz w:val="19"/>
+          <w:szCs w:val="19"/>
+        </w:rPr>
+        <w:t xml:space="preserve">2</w:t>
+      </w:r>
+      <w:r>
+        <w:rPr>
+          <w:rFonts w:ascii="Consolas" w:cs="Consolas" w:eastAsia="Consolas" w:hAnsi="Consolas"/>
+          <w:sz w:val="19"/>
+          <w:szCs w:val="19"/>
+        </w:rPr>
+        <w:br/>
+        <w:t xml:space="preserve">99</w:t>
+      </w:r>
+    </w:p>
+    <w:p>
+      <w:pPr>
+        <w:spacing w:after="180" w:line="312" w:lineRule="auto"/>
+      </w:pPr>
+      <w:r>
+        <w:rPr>
+          <w:sz w:val="22"/>
+          <w:szCs w:val="22"/>
+        </w:rPr>
+        <w:t xml:space="preserve">Du darfst beide Stile mischen: Nach einem ausdrücklich gesetzten Wert zählt die automatische Nummerierung von dort weiter. Im folgenden ENUM ist A also 0, B wird auf 5 gesetzt, und C bekommt daraufhin 6:</w:t>
+      </w:r>
+    </w:p>
+    <w:p>
+      <w:pPr>
+        <w:keepLines/>
+        <w:pBdr>
+          <w:left w:val="single" w:color="1B6CA8" w:sz="18" w:space="6"/>
+        </w:pBdr>
+        <w:shd w:fill="F4F4F4" w:val="clear"/>
+        <w:spacing w:after="200" w:before="100" w:line="264" w:lineRule="auto"/>
+        <w:ind w:left="140"/>
+      </w:pPr>
+      <w:r>
+        <w:rPr>
+          <w:rFonts w:ascii="Consolas" w:cs="Consolas" w:eastAsia="Consolas" w:hAnsi="Consolas"/>
+          <w:sz w:val="19"/>
+          <w:szCs w:val="19"/>
+        </w:rPr>
+        <w:t xml:space="preserve">ENUM Misch = A, B = 5, C</w:t>
+      </w:r>
+      <w:r>
+        <w:rPr>
+          <w:rFonts w:ascii="Consolas" w:cs="Consolas" w:eastAsia="Consolas" w:hAnsi="Consolas"/>
+          <w:sz w:val="19"/>
+          <w:szCs w:val="19"/>
+        </w:rPr>
+        <w:br/>
+        <w:t xml:space="preserve">PRINT Misch.A; " "; Misch.B; " "; Misch.C</w:t>
+      </w:r>
+    </w:p>
+    <w:p>
+      <w:pPr>
+        <w:keepLines/>
+        <w:pBdr>
+          <w:left w:val="single" w:color="9AC79A" w:sz="18" w:space="6"/>
+        </w:pBdr>
+        <w:shd w:fill="EAF4EA" w:val="clear"/>
+        <w:spacing w:after="200" w:before="100" w:line="264" w:lineRule="auto"/>
+        <w:ind w:left="140"/>
+      </w:pPr>
+      <w:r>
+        <w:rPr>
+          <w:rFonts w:ascii="Consolas" w:cs="Consolas" w:eastAsia="Consolas" w:hAnsi="Consolas"/>
+          <w:sz w:val="19"/>
+          <w:szCs w:val="19"/>
+        </w:rPr>
+        <w:t xml:space="preserve">0 5 6</w:t>
+      </w:r>
+    </w:p>
+    <w:p>
+      <w:pPr>
+        <w:pStyle w:val="Heading2"/>
+        <w:keepNext/>
+        <w:keepLines/>
+        <w:spacing w:after="120" w:before="280"/>
+      </w:pPr>
+      <w:r>
+        <w:t xml:space="preserve">ENUMs im Einsatz</w:t>
+      </w:r>
+    </w:p>
+    <w:p>
+      <w:pPr>
+        <w:spacing w:after="180" w:line="312" w:lineRule="auto"/>
+      </w:pPr>
+      <w:r>
+        <w:rPr>
+          <w:sz w:val="22"/>
+          <w:szCs w:val="22"/>
+        </w:rPr>
+        <w:t xml:space="preserve">Eine Variable, die einen ENUM-Wert halten soll, deklarierst du mit dem ENUM-Namen als Typ (intern ist das eine ganze Zahl). Besonders gut passen ENUMs zu SELECT CASE: Die Fälle tragen sprechende Namen, und du siehst auf einen Blick, dass alle Zustände abgedeckt sind.</w:t>
+      </w:r>
+    </w:p>
+    <w:p>
+      <w:pPr>
+        <w:keepLines/>
+        <w:pBdr>
+          <w:left w:val="single" w:color="1B6CA8" w:sz="18" w:space="6"/>
+        </w:pBdr>
+        <w:shd w:fill="F4F4F4" w:val="clear"/>
+        <w:spacing w:after="200" w:before="100" w:line="264" w:lineRule="auto"/>
+        <w:ind w:left="140"/>
+      </w:pPr>
+      <w:r>
+        <w:rPr>
+          <w:rFonts w:ascii="Consolas" w:cs="Consolas" w:eastAsia="Consolas" w:hAnsi="Consolas"/>
+          <w:sz w:val="19"/>
+          <w:szCs w:val="19"/>
+        </w:rPr>
+        <w:t xml:space="preserve">ENUM Status = MENU, SPIELT, PAUSE</w:t>
+      </w:r>
+      <w:r>
+        <w:rPr>
+          <w:rFonts w:ascii="Consolas" w:cs="Consolas" w:eastAsia="Consolas" w:hAnsi="Consolas"/>
+          <w:sz w:val="19"/>
+          <w:szCs w:val="19"/>
+        </w:rPr>
+        <w:br/>
+        <w:t xml:space="preserve"/>
+      </w:r>
+      <w:r>
+        <w:rPr>
+          <w:rFonts w:ascii="Consolas" w:cs="Consolas" w:eastAsia="Consolas" w:hAnsi="Consolas"/>
+          <w:sz w:val="19"/>
+          <w:szCs w:val="19"/>
+        </w:rPr>
+        <w:br/>
+        <w:t xml:space="preserve">DIM s AS Status</w:t>
+      </w:r>
+      <w:r>
+        <w:rPr>
+          <w:rFonts w:ascii="Consolas" w:cs="Consolas" w:eastAsia="Consolas" w:hAnsi="Consolas"/>
+          <w:sz w:val="19"/>
+          <w:szCs w:val="19"/>
+        </w:rPr>
+        <w:br/>
+        <w:t xml:space="preserve">s = Status.SPIELT</w:t>
+      </w:r>
+      <w:r>
+        <w:rPr>
+          <w:rFonts w:ascii="Consolas" w:cs="Consolas" w:eastAsia="Consolas" w:hAnsi="Consolas"/>
+          <w:sz w:val="19"/>
+          <w:szCs w:val="19"/>
+        </w:rPr>
+        <w:br/>
+        <w:t xml:space="preserve"/>
+      </w:r>
+      <w:r>
+        <w:rPr>
+          <w:rFonts w:ascii="Consolas" w:cs="Consolas" w:eastAsia="Consolas" w:hAnsi="Consolas"/>
+          <w:sz w:val="19"/>
+          <w:szCs w:val="19"/>
+        </w:rPr>
+        <w:br/>
+        <w:t xml:space="preserve">SELECT CASE s</w:t>
+      </w:r>
+      <w:r>
+        <w:rPr>
+          <w:rFonts w:ascii="Consolas" w:cs="Consolas" w:eastAsia="Consolas" w:hAnsi="Consolas"/>
+          <w:sz w:val="19"/>
+          <w:szCs w:val="19"/>
+        </w:rPr>
+        <w:br/>
+        <w:t xml:space="preserve">    CASE Status.MENU</w:t>
+      </w:r>
+      <w:r>
+        <w:rPr>
+          <w:rFonts w:ascii="Consolas" w:cs="Consolas" w:eastAsia="Consolas" w:hAnsi="Consolas"/>
+          <w:sz w:val="19"/>
+          <w:szCs w:val="19"/>
+        </w:rPr>
+        <w:br/>
+        <w:t xml:space="preserve">        PRINT "im Menü"</w:t>
+      </w:r>
+      <w:r>
+        <w:rPr>
+          <w:rFonts w:ascii="Consolas" w:cs="Consolas" w:eastAsia="Consolas" w:hAnsi="Consolas"/>
+          <w:sz w:val="19"/>
+          <w:szCs w:val="19"/>
+        </w:rPr>
+        <w:br/>
+        <w:t xml:space="preserve">    CASE Status.SPIELT</w:t>
+      </w:r>
+      <w:r>
+        <w:rPr>
+          <w:rFonts w:ascii="Consolas" w:cs="Consolas" w:eastAsia="Consolas" w:hAnsi="Consolas"/>
+          <w:sz w:val="19"/>
+          <w:szCs w:val="19"/>
+        </w:rPr>
+        <w:br/>
+        <w:t xml:space="preserve">        PRINT "spielt gerade"</w:t>
+      </w:r>
+      <w:r>
+        <w:rPr>
+          <w:rFonts w:ascii="Consolas" w:cs="Consolas" w:eastAsia="Consolas" w:hAnsi="Consolas"/>
+          <w:sz w:val="19"/>
+          <w:szCs w:val="19"/>
+        </w:rPr>
+        <w:br/>
+        <w:t xml:space="preserve">    CASE Status.PAUSE</w:t>
+      </w:r>
+      <w:r>
+        <w:rPr>
+          <w:rFonts w:ascii="Consolas" w:cs="Consolas" w:eastAsia="Consolas" w:hAnsi="Consolas"/>
+          <w:sz w:val="19"/>
+          <w:szCs w:val="19"/>
+        </w:rPr>
+        <w:br/>
+        <w:t xml:space="preserve">        PRINT "pausiert"</w:t>
+      </w:r>
+      <w:r>
+        <w:rPr>
+          <w:rFonts w:ascii="Consolas" w:cs="Consolas" w:eastAsia="Consolas" w:hAnsi="Consolas"/>
+          <w:sz w:val="19"/>
+          <w:szCs w:val="19"/>
+        </w:rPr>
+        <w:br/>
+        <w:t xml:space="preserve">END SELECT</w:t>
+      </w:r>
+    </w:p>
+    <w:p>
+      <w:pPr>
+        <w:keepLines/>
+        <w:pBdr>
+          <w:left w:val="single" w:color="9AC79A" w:sz="18" w:space="6"/>
+        </w:pBdr>
+        <w:shd w:fill="EAF4EA" w:val="clear"/>
+        <w:spacing w:after="200" w:before="100" w:line="264" w:lineRule="auto"/>
+        <w:ind w:left="140"/>
+      </w:pPr>
+      <w:r>
+        <w:rPr>
+          <w:rFonts w:ascii="Consolas" w:cs="Consolas" w:eastAsia="Consolas" w:hAnsi="Consolas"/>
+          <w:sz w:val="19"/>
+          <w:szCs w:val="19"/>
+        </w:rPr>
+        <w:t xml:space="preserve">spielt gerade</w:t>
+      </w:r>
+    </w:p>
+    <w:p>
+      <w:pPr>
+        <w:spacing w:before="60"/>
+      </w:pPr>
+    </w:p>
+    <w:tbl>
+      <w:tblPr>
+        <w:tblW w:type="dxa" w:w="9360"/>
+        <w:tblBorders>
+          <w:top w:val="single" w:color="auto" w:sz="4"/>
+          <w:left w:val="single" w:color="auto" w:sz="4"/>
+          <w:bottom w:val="single" w:color="auto" w:sz="4"/>
+          <w:right w:val="single" w:color="auto" w:sz="4"/>
+          <w:insideH w:val="single" w:color="auto" w:sz="4"/>
+          <w:insideV w:val="single" w:color="auto" w:sz="4"/>
+        </w:tblBorders>
+      </w:tblPr>
+      <w:tblGrid>
+        <w:gridCol w:w="9360"/>
+      </w:tblGrid>
+      <w:tr>
+        <w:trPr>
+          <w:cantSplit/>
+        </w:trPr>
+        <w:tc>
+          <w:tcPr>
+            <w:tcW w:type="dxa" w:w="9360"/>
+            <w:tcBorders>
+              <w:top w:val="single" w:color="E0B96A" w:sz="6"/>
+              <w:left w:val="single" w:color="E0B96A" w:sz="6"/>
+              <w:bottom w:val="single" w:color="E0B96A" w:sz="6"/>
+              <w:right w:val="single" w:color="E0B96A" w:sz="6"/>
+            </w:tcBorders>
+            <w:shd w:fill="FDF3E0" w:val="clear"/>
+            <w:tcMar>
+              <w:top w:type="dxa" w:w="140"/>
+              <w:left w:type="dxa" w:w="180"/>
+              <w:bottom w:type="dxa" w:w="140"/>
+              <w:right w:type="dxa" w:w="180"/>
+            </w:tcMar>
+          </w:tcPr>
+          <w:p>
+            <w:pPr>
+              <w:spacing w:after="40"/>
+            </w:pPr>
+            <w:r>
+              <w:rPr>
+                <w:b/>
+                <w:bCs/>
+                <w:color w:val="9A6A1E"/>
+                <w:sz w:val="22"/>
+                <w:szCs w:val="22"/>
+              </w:rPr>
+              <w:t xml:space="preserve">Merke</w:t>
+            </w:r>
+          </w:p>
+          <w:p>
+            <w:pPr>
+              <w:spacing w:after="0" w:line="312" w:lineRule="auto"/>
+            </w:pPr>
+            <w:r>
+              <w:rPr>
+                <w:sz w:val="22"/>
+                <w:szCs w:val="22"/>
+              </w:rPr>
+              <w:t xml:space="preserve">Die Mitglieds-Namen dürfen sogar mit Schlüsselwörtern übereinstimmen (READ, DATA, NEW …). Weil sie immer hinter dem ENUM-Namen und einem Punkt stehen (Befehl.READ), ist eindeutig, dass kein Befehl gemeint ist.</w:t>
+            </w:r>
+          </w:p>
+        </w:tc>
+      </w:tr>
+    </w:tbl>
+    <w:p>
+      <w:pPr>
+        <w:spacing w:after="160"/>
+      </w:pPr>
+    </w:p>
+    <w:p>
+      <w:pPr>
+        <w:spacing w:before="60"/>
+      </w:pPr>
+    </w:p>
+    <w:tbl>
+      <w:tblPr>
+        <w:tblW w:type="dxa" w:w="9360"/>
+        <w:tblBorders>
+          <w:top w:val="single" w:color="auto" w:sz="4"/>
+          <w:left w:val="single" w:color="auto" w:sz="4"/>
+          <w:bottom w:val="single" w:color="auto" w:sz="4"/>
+          <w:right w:val="single" w:color="auto" w:sz="4"/>
+          <w:insideH w:val="single" w:color="auto" w:sz="4"/>
+          <w:insideV w:val="single" w:color="auto" w:sz="4"/>
+        </w:tblBorders>
+      </w:tblPr>
+      <w:tblGrid>
+        <w:gridCol w:w="9360"/>
+      </w:tblGrid>
+      <w:tr>
+        <w:trPr>
+          <w:cantSplit/>
+        </w:trPr>
+        <w:tc>
+          <w:tcPr>
+            <w:tcW w:type="dxa" w:w="9360"/>
+            <w:tcBorders>
+              <w:top w:val="single" w:color="9CC8E6" w:sz="6"/>
+              <w:left w:val="single" w:color="9CC8E6" w:sz="6"/>
+              <w:bottom w:val="single" w:color="9CC8E6" w:sz="6"/>
+              <w:right w:val="single" w:color="9CC8E6" w:sz="6"/>
+            </w:tcBorders>
+            <w:shd w:fill="E7F2FA" w:val="clear"/>
+            <w:tcMar>
+              <w:top w:type="dxa" w:w="140"/>
+              <w:left w:type="dxa" w:w="180"/>
+              <w:bottom w:type="dxa" w:w="140"/>
+              <w:right w:type="dxa" w:w="180"/>
+            </w:tcMar>
+          </w:tcPr>
+          <w:p>
+            <w:pPr>
+              <w:spacing w:after="40"/>
+            </w:pPr>
+            <w:r>
+              <w:rPr>
+                <w:b/>
+                <w:bCs/>
+                <w:color w:val="1B6CA8"/>
+                <w:sz w:val="22"/>
+                <w:szCs w:val="22"/>
+              </w:rPr>
+              <w:t xml:space="preserve">ENUM oder STATIC CONST?</w:t>
+            </w:r>
+          </w:p>
+          <w:p>
+            <w:pPr>
+              <w:spacing w:after="0" w:line="312" w:lineRule="auto"/>
+            </w:pPr>
+            <w:r>
+              <w:rPr>
+                <w:sz w:val="22"/>
+                <w:szCs w:val="22"/>
+              </w:rPr>
+              <w:t xml:space="preserve">Beide ersetzen „magische Zahlen“ durch Namen. Nimm ein ENUM für eine zusammengehörige Gruppe sich gegenseitig ausschließender Möglichkeiten (die Spielzustände, die Himmelsrichtungen). Eine STATIC CONST (Kapitel 21) passt besser für eine einzelne feste Kennzahl, die zu einer bestimmten Klasse gehört.</w:t>
             </w:r>
           </w:p>
         </w:tc>

</xml_diff>

<commit_message>
docs(buch): Lehrbuch Kap 23 -- Comprehensions (List/Dict/Set)
List-Comprehension [e FOR v IN s] + WHERE-Filter (-> TUPLE), Vergleich mit
ausgeschriebener Schleife, Dict-Comprehension {k:v FOR ...} (-> MAP),
Set-Comprehension {e FOR ...} mit Dedup (-> TUPLE). Dichte Syntax als Satz
erklaert. Alle Beispiel-Ausgaben gegen gbrt verifiziert.

Co-Authored-By: Claude Opus 4.8 (1M context) <noreply@anthropic.com>
</commit_message>
<xml_diff>
--- a/buch-referenz/buch/GameBasic-Lehrbuch.docx
+++ b/buch-referenz/buch/GameBasic-Lehrbuch.docx
@@ -597,6 +597,33 @@
           <w:szCs w:val="22"/>
         </w:rPr>
         <w:t xml:space="preserve">	21</w:t>
+      </w:r>
+    </w:p>
+    <w:p>
+      <w:pPr>
+        <w:tabs>
+          <w:tab w:val="right" w:pos="9200" w:leader="dot"/>
+        </w:tabs>
+        <w:spacing w:after="20" w:before="0"/>
+        <w:ind w:left="280"/>
+      </w:pPr>
+      <w:r>
+        <w:rPr>
+          <w:b w:val="false"/>
+          <w:bCs w:val="false"/>
+          <w:color w:val="222222"/>
+          <w:sz w:val="22"/>
+          <w:szCs w:val="22"/>
+        </w:rPr>
+        <w:t xml:space="preserve">Comprehensions</w:t>
+      </w:r>
+      <w:r>
+        <w:rPr>
+          <w:color w:val="555555"/>
+          <w:sz w:val="22"/>
+          <w:szCs w:val="22"/>
+        </w:rPr>
+        <w:t xml:space="preserve">	75</w:t>
       </w:r>
     </w:p>
     <w:p>
@@ -23639,6 +23666,1032 @@
                 <w:szCs w:val="22"/>
               </w:rPr>
               <w:t xml:space="preserve">Beide ersetzen „magische Zahlen“ durch Namen. Nimm ein ENUM für eine zusammengehörige Gruppe sich gegenseitig ausschließender Möglichkeiten (die Spielzustände, die Himmelsrichtungen). Eine STATIC CONST (Kapitel 21) passt besser für eine einzelne feste Kennzahl, die zu einer bestimmten Klasse gehört.</w:t>
+            </w:r>
+          </w:p>
+        </w:tc>
+      </w:tr>
+    </w:tbl>
+    <w:p>
+      <w:pPr>
+        <w:spacing w:after="160"/>
+      </w:pPr>
+    </w:p>
+    <w:p>
+      <w:pPr>
+        <w:pStyle w:val="Heading1"/>
+        <w:keepNext/>
+        <w:keepLines/>
+        <w:pageBreakBefore/>
+        <w:pBdr>
+          <w:bottom w:val="single" w:color="1B6CA8" w:sz="12" w:space="4"/>
+        </w:pBdr>
+        <w:spacing w:after="160" w:before="0"/>
+      </w:pPr>
+      <w:r>
+        <w:t xml:space="preserve">Comprehensions</w:t>
+      </w:r>
+    </w:p>
+    <w:p>
+      <w:pPr>
+        <w:spacing w:after="180" w:line="312" w:lineRule="auto"/>
+      </w:pPr>
+      <w:r>
+        <w:rPr>
+          <w:sz w:val="22"/>
+          <w:szCs w:val="22"/>
+        </w:rPr>
+        <w:t xml:space="preserve">Sehr oft will man aus einer vorhandenen Sammlung eine neue bauen: aus einer Liste von Zahlen die Liste ihrer Quadrate, aus allen Spielern nur die mit genug Punkten. Das geht natürlich mit einer Schleife. Comprehensions sind eine kürzere, gut lesbare Kurzschreibweise für genau dieses Muster – „nimm jedes Element und mache etwas damit“ – alles in einer einzigen Zeile.</w:t>
+      </w:r>
+    </w:p>
+    <w:p>
+      <w:pPr>
+        <w:spacing w:after="180" w:line="312" w:lineRule="auto"/>
+      </w:pPr>
+      <w:r>
+        <w:rPr>
+          <w:sz w:val="22"/>
+          <w:szCs w:val="22"/>
+        </w:rPr>
+        <w:t xml:space="preserve">Der Begriff klingt sperrig, die Idee ist einfach. Lies eine Comprehension wie einen Satz: „Bilde n mal n, für jedes n in zahlen.“ Genau in dieser Reihenfolge steht es auch da.</w:t>
+      </w:r>
+    </w:p>
+    <w:p>
+      <w:pPr>
+        <w:pStyle w:val="Heading2"/>
+        <w:keepNext/>
+        <w:keepLines/>
+        <w:spacing w:after="120" w:before="280"/>
+      </w:pPr>
+      <w:r>
+        <w:t xml:space="preserve">List-Comprehension</w:t>
+      </w:r>
+    </w:p>
+    <w:p>
+      <w:pPr>
+        <w:spacing w:after="180" w:line="312" w:lineRule="auto"/>
+      </w:pPr>
+      <w:r>
+        <w:rPr>
+          <w:sz w:val="22"/>
+          <w:szCs w:val="22"/>
+        </w:rPr>
+        <w:t xml:space="preserve">Die Grundform steht in eckigen Klammern und besteht aus zwei Teilen: vorne der Ausdruck, der für jedes Element berechnet wird, dahinter das FOR, das die Sammlung durchläuft. Das Ergebnis ist ein Tupel mit allen berechneten Werten (Tupel kennst du aus Kapitel 19 – sie sind unveränderlich).</w:t>
+      </w:r>
+    </w:p>
+    <w:p>
+      <w:pPr>
+        <w:keepNext/>
+        <w:keepLines/>
+        <w:pBdr>
+          <w:bottom w:val="single" w:color="DDD0C0" w:sz="4" w:space="2"/>
+        </w:pBdr>
+        <w:spacing w:after="40" w:before="360"/>
+      </w:pPr>
+      <w:r>
+        <w:rPr>
+          <w:rFonts w:ascii="Consolas" w:cs="Consolas" w:eastAsia="Consolas" w:hAnsi="Consolas"/>
+          <w:b/>
+          <w:bCs/>
+          <w:color w:val="9A3412"/>
+          <w:sz w:val="24"/>
+          <w:szCs w:val="24"/>
+        </w:rPr>
+        <w:t xml:space="preserve">List-Comprehension</w:t>
+      </w:r>
+    </w:p>
+    <w:p>
+      <w:pPr>
+        <w:keepNext/>
+        <w:spacing w:after="120"/>
+      </w:pPr>
+      <w:r>
+        <w:rPr>
+          <w:b/>
+          <w:bCs/>
+          <w:color w:val="6A6A6A"/>
+          <w:sz w:val="18"/>
+          <w:szCs w:val="18"/>
+        </w:rPr>
+        <w:t xml:space="preserve">Syntax:  </w:t>
+      </w:r>
+      <w:r>
+        <w:rPr>
+          <w:rFonts w:ascii="Consolas" w:cs="Consolas" w:eastAsia="Consolas" w:hAnsi="Consolas"/>
+          <w:color w:val="335577"/>
+          <w:sz w:val="19"/>
+          <w:szCs w:val="19"/>
+        </w:rPr>
+        <w:t xml:space="preserve">[ ausdruck FOR variable IN sammlung ]</w:t>
+      </w:r>
+    </w:p>
+    <w:p>
+      <w:pPr>
+        <w:spacing w:after="180" w:line="312" w:lineRule="auto"/>
+      </w:pPr>
+      <w:r>
+        <w:rPr>
+          <w:sz w:val="22"/>
+          <w:szCs w:val="22"/>
+        </w:rPr>
+        <w:t xml:space="preserve">Berechnet den Ausdruck für jedes Element der Sammlung und sammelt die Ergebnisse in einem Tupel. Als Sammlung dienen Tupel, Arrays, die Zeichen eines Strings oder die Schlüssel einer Map.</w:t>
+      </w:r>
+    </w:p>
+    <w:p>
+      <w:pPr>
+        <w:keepNext/>
+        <w:spacing w:after="30" w:before="120"/>
+      </w:pPr>
+      <w:r>
+        <w:rPr>
+          <w:b/>
+          <w:bCs/>
+          <w:i/>
+          <w:iCs/>
+          <w:color w:val="6A6A6A"/>
+          <w:sz w:val="18"/>
+          <w:szCs w:val="18"/>
+        </w:rPr>
+        <w:t xml:space="preserve">Beispiel</w:t>
+      </w:r>
+    </w:p>
+    <w:p>
+      <w:pPr>
+        <w:keepLines/>
+        <w:pBdr>
+          <w:left w:val="single" w:color="1B6CA8" w:sz="18" w:space="6"/>
+        </w:pBdr>
+        <w:shd w:fill="F4F4F4" w:val="clear"/>
+        <w:spacing w:after="200" w:before="100" w:line="264" w:lineRule="auto"/>
+        <w:ind w:left="140"/>
+      </w:pPr>
+      <w:r>
+        <w:rPr>
+          <w:rFonts w:ascii="Consolas" w:cs="Consolas" w:eastAsia="Consolas" w:hAnsi="Consolas"/>
+          <w:sz w:val="19"/>
+          <w:szCs w:val="19"/>
+        </w:rPr>
+        <w:t xml:space="preserve">DIM zahlen AS TUPLE</w:t>
+      </w:r>
+      <w:r>
+        <w:rPr>
+          <w:rFonts w:ascii="Consolas" w:cs="Consolas" w:eastAsia="Consolas" w:hAnsi="Consolas"/>
+          <w:sz w:val="19"/>
+          <w:szCs w:val="19"/>
+        </w:rPr>
+        <w:br/>
+        <w:t xml:space="preserve">zahlen = (1, 2, 3, 4, 5)</w:t>
+      </w:r>
+      <w:r>
+        <w:rPr>
+          <w:rFonts w:ascii="Consolas" w:cs="Consolas" w:eastAsia="Consolas" w:hAnsi="Consolas"/>
+          <w:sz w:val="19"/>
+          <w:szCs w:val="19"/>
+        </w:rPr>
+        <w:br/>
+        <w:t xml:space="preserve"/>
+      </w:r>
+      <w:r>
+        <w:rPr>
+          <w:rFonts w:ascii="Consolas" w:cs="Consolas" w:eastAsia="Consolas" w:hAnsi="Consolas"/>
+          <w:sz w:val="19"/>
+          <w:szCs w:val="19"/>
+        </w:rPr>
+        <w:br/>
+        <w:t xml:space="preserve">DIM quadrate AS TUPLE</w:t>
+      </w:r>
+      <w:r>
+        <w:rPr>
+          <w:rFonts w:ascii="Consolas" w:cs="Consolas" w:eastAsia="Consolas" w:hAnsi="Consolas"/>
+          <w:sz w:val="19"/>
+          <w:szCs w:val="19"/>
+        </w:rPr>
+        <w:br/>
+        <w:t xml:space="preserve">quadrate = [n * n FOR n IN zahlen]</w:t>
+      </w:r>
+      <w:r>
+        <w:rPr>
+          <w:rFonts w:ascii="Consolas" w:cs="Consolas" w:eastAsia="Consolas" w:hAnsi="Consolas"/>
+          <w:sz w:val="19"/>
+          <w:szCs w:val="19"/>
+        </w:rPr>
+        <w:br/>
+        <w:t xml:space="preserve">PRINT quadrate</w:t>
+      </w:r>
+    </w:p>
+    <w:p>
+      <w:pPr>
+        <w:keepNext/>
+        <w:spacing w:after="30" w:before="120"/>
+      </w:pPr>
+      <w:r>
+        <w:rPr>
+          <w:b/>
+          <w:bCs/>
+          <w:i/>
+          <w:iCs/>
+          <w:color w:val="6A6A6A"/>
+          <w:sz w:val="18"/>
+          <w:szCs w:val="18"/>
+        </w:rPr>
+        <w:t xml:space="preserve">Ausgabe</w:t>
+      </w:r>
+    </w:p>
+    <w:p>
+      <w:pPr>
+        <w:keepLines/>
+        <w:pBdr>
+          <w:left w:val="single" w:color="9AC79A" w:sz="18" w:space="6"/>
+        </w:pBdr>
+        <w:shd w:fill="EAF4EA" w:val="clear"/>
+        <w:spacing w:after="200" w:before="100" w:line="264" w:lineRule="auto"/>
+        <w:ind w:left="140"/>
+      </w:pPr>
+      <w:r>
+        <w:rPr>
+          <w:rFonts w:ascii="Consolas" w:cs="Consolas" w:eastAsia="Consolas" w:hAnsi="Consolas"/>
+          <w:sz w:val="19"/>
+          <w:szCs w:val="19"/>
+        </w:rPr>
+        <w:t xml:space="preserve">(1, 4, 9, 16, 25)</w:t>
+      </w:r>
+    </w:p>
+    <w:p>
+      <w:pPr>
+        <w:spacing w:after="180" w:line="312" w:lineRule="auto"/>
+      </w:pPr>
+      <w:r>
+        <w:rPr>
+          <w:sz w:val="22"/>
+          <w:szCs w:val="22"/>
+        </w:rPr>
+        <w:t xml:space="preserve">Vergleiche das mit der ausgeschriebenen Schleife – beide tun dasselbe, aber die Comprehension fasst es in eine Zeile:</w:t>
+      </w:r>
+    </w:p>
+    <w:p>
+      <w:pPr>
+        <w:keepLines/>
+        <w:pBdr>
+          <w:left w:val="single" w:color="1B6CA8" w:sz="18" w:space="6"/>
+        </w:pBdr>
+        <w:shd w:fill="F4F4F4" w:val="clear"/>
+        <w:spacing w:after="200" w:before="100" w:line="264" w:lineRule="auto"/>
+        <w:ind w:left="140"/>
+      </w:pPr>
+      <w:r>
+        <w:rPr>
+          <w:rFonts w:ascii="Consolas" w:cs="Consolas" w:eastAsia="Consolas" w:hAnsi="Consolas"/>
+          <w:sz w:val="19"/>
+          <w:szCs w:val="19"/>
+        </w:rPr>
+        <w:t xml:space="preserve">' dieselbe Aufgabe mit einer Schleife:</w:t>
+      </w:r>
+      <w:r>
+        <w:rPr>
+          <w:rFonts w:ascii="Consolas" w:cs="Consolas" w:eastAsia="Consolas" w:hAnsi="Consolas"/>
+          <w:sz w:val="19"/>
+          <w:szCs w:val="19"/>
+        </w:rPr>
+        <w:br/>
+        <w:t xml:space="preserve">DIM quadrate AS TUPLE</w:t>
+      </w:r>
+      <w:r>
+        <w:rPr>
+          <w:rFonts w:ascii="Consolas" w:cs="Consolas" w:eastAsia="Consolas" w:hAnsi="Consolas"/>
+          <w:sz w:val="19"/>
+          <w:szCs w:val="19"/>
+        </w:rPr>
+        <w:br/>
+        <w:t xml:space="preserve">DIM liste[0] AS INTEGER</w:t>
+      </w:r>
+      <w:r>
+        <w:rPr>
+          <w:rFonts w:ascii="Consolas" w:cs="Consolas" w:eastAsia="Consolas" w:hAnsi="Consolas"/>
+          <w:sz w:val="19"/>
+          <w:szCs w:val="19"/>
+        </w:rPr>
+        <w:br/>
+        <w:t xml:space="preserve">DIM n AS INTEGER</w:t>
+      </w:r>
+      <w:r>
+        <w:rPr>
+          <w:rFonts w:ascii="Consolas" w:cs="Consolas" w:eastAsia="Consolas" w:hAnsi="Consolas"/>
+          <w:sz w:val="19"/>
+          <w:szCs w:val="19"/>
+        </w:rPr>
+        <w:br/>
+        <w:t xml:space="preserve">FOR n = 1 TO 5</w:t>
+      </w:r>
+      <w:r>
+        <w:rPr>
+          <w:rFonts w:ascii="Consolas" w:cs="Consolas" w:eastAsia="Consolas" w:hAnsi="Consolas"/>
+          <w:sz w:val="19"/>
+          <w:szCs w:val="19"/>
+        </w:rPr>
+        <w:br/>
+        <w:t xml:space="preserve">    ARRAY_PUSH(liste, n * n)</w:t>
+      </w:r>
+      <w:r>
+        <w:rPr>
+          <w:rFonts w:ascii="Consolas" w:cs="Consolas" w:eastAsia="Consolas" w:hAnsi="Consolas"/>
+          <w:sz w:val="19"/>
+          <w:szCs w:val="19"/>
+        </w:rPr>
+        <w:br/>
+        <w:t xml:space="preserve">NEXT</w:t>
+      </w:r>
+    </w:p>
+    <w:p>
+      <w:pPr>
+        <w:pStyle w:val="Heading2"/>
+        <w:keepNext/>
+        <w:keepLines/>
+        <w:spacing w:after="120" w:before="280"/>
+      </w:pPr>
+      <w:r>
+        <w:t xml:space="preserve">Mit Bedingung: WHERE</w:t>
+      </w:r>
+    </w:p>
+    <w:p>
+      <w:pPr>
+        <w:spacing w:after="180" w:line="312" w:lineRule="auto"/>
+      </w:pPr>
+      <w:r>
+        <w:rPr>
+          <w:sz w:val="22"/>
+          <w:szCs w:val="22"/>
+        </w:rPr>
+        <w:t xml:space="preserve">Hängst du ein WHERE samt Bedingung an, landen nur die Elemente im Ergebnis, für die die Bedingung wahr ist – die anderen werden übersprungen. So filterst und verwandelst du in einem Rutsch. Hier bleiben nur die geraden Zahlen übrig:</w:t>
+      </w:r>
+    </w:p>
+    <w:p>
+      <w:pPr>
+        <w:keepNext/>
+        <w:keepLines/>
+        <w:pBdr>
+          <w:bottom w:val="single" w:color="DDD0C0" w:sz="4" w:space="2"/>
+        </w:pBdr>
+        <w:spacing w:after="40" w:before="360"/>
+      </w:pPr>
+      <w:r>
+        <w:rPr>
+          <w:rFonts w:ascii="Consolas" w:cs="Consolas" w:eastAsia="Consolas" w:hAnsi="Consolas"/>
+          <w:b/>
+          <w:bCs/>
+          <w:color w:val="9A3412"/>
+          <w:sz w:val="24"/>
+          <w:szCs w:val="24"/>
+        </w:rPr>
+        <w:t xml:space="preserve">Comprehension mit Filter</w:t>
+      </w:r>
+    </w:p>
+    <w:p>
+      <w:pPr>
+        <w:keepNext/>
+        <w:spacing w:after="120"/>
+      </w:pPr>
+      <w:r>
+        <w:rPr>
+          <w:b/>
+          <w:bCs/>
+          <w:color w:val="6A6A6A"/>
+          <w:sz w:val="18"/>
+          <w:szCs w:val="18"/>
+        </w:rPr>
+        <w:t xml:space="preserve">Syntax:  </w:t>
+      </w:r>
+      <w:r>
+        <w:rPr>
+          <w:rFonts w:ascii="Consolas" w:cs="Consolas" w:eastAsia="Consolas" w:hAnsi="Consolas"/>
+          <w:color w:val="335577"/>
+          <w:sz w:val="19"/>
+          <w:szCs w:val="19"/>
+        </w:rPr>
+        <w:t xml:space="preserve">[ ausdruck FOR variable IN sammlung WHERE bedingung ]</w:t>
+      </w:r>
+    </w:p>
+    <w:p>
+      <w:pPr>
+        <w:spacing w:after="180" w:line="312" w:lineRule="auto"/>
+      </w:pPr>
+      <w:r>
+        <w:rPr>
+          <w:sz w:val="22"/>
+          <w:szCs w:val="22"/>
+        </w:rPr>
+        <w:t xml:space="preserve">Wie die List-Comprehension, übernimmt aber nur die Elemente, für die die Bedingung zutrifft.</w:t>
+      </w:r>
+    </w:p>
+    <w:p>
+      <w:pPr>
+        <w:keepNext/>
+        <w:spacing w:after="30" w:before="120"/>
+      </w:pPr>
+      <w:r>
+        <w:rPr>
+          <w:b/>
+          <w:bCs/>
+          <w:i/>
+          <w:iCs/>
+          <w:color w:val="6A6A6A"/>
+          <w:sz w:val="18"/>
+          <w:szCs w:val="18"/>
+        </w:rPr>
+        <w:t xml:space="preserve">Beispiel</w:t>
+      </w:r>
+    </w:p>
+    <w:p>
+      <w:pPr>
+        <w:keepLines/>
+        <w:pBdr>
+          <w:left w:val="single" w:color="1B6CA8" w:sz="18" w:space="6"/>
+        </w:pBdr>
+        <w:shd w:fill="F4F4F4" w:val="clear"/>
+        <w:spacing w:after="200" w:before="100" w:line="264" w:lineRule="auto"/>
+        <w:ind w:left="140"/>
+      </w:pPr>
+      <w:r>
+        <w:rPr>
+          <w:rFonts w:ascii="Consolas" w:cs="Consolas" w:eastAsia="Consolas" w:hAnsi="Consolas"/>
+          <w:sz w:val="19"/>
+          <w:szCs w:val="19"/>
+        </w:rPr>
+        <w:t xml:space="preserve">DIM zahlen AS TUPLE</w:t>
+      </w:r>
+      <w:r>
+        <w:rPr>
+          <w:rFonts w:ascii="Consolas" w:cs="Consolas" w:eastAsia="Consolas" w:hAnsi="Consolas"/>
+          <w:sz w:val="19"/>
+          <w:szCs w:val="19"/>
+        </w:rPr>
+        <w:br/>
+        <w:t xml:space="preserve">zahlen = (1, 2, 3, 4, 5, 6)</w:t>
+      </w:r>
+      <w:r>
+        <w:rPr>
+          <w:rFonts w:ascii="Consolas" w:cs="Consolas" w:eastAsia="Consolas" w:hAnsi="Consolas"/>
+          <w:sz w:val="19"/>
+          <w:szCs w:val="19"/>
+        </w:rPr>
+        <w:br/>
+        <w:t xml:space="preserve"/>
+      </w:r>
+      <w:r>
+        <w:rPr>
+          <w:rFonts w:ascii="Consolas" w:cs="Consolas" w:eastAsia="Consolas" w:hAnsi="Consolas"/>
+          <w:sz w:val="19"/>
+          <w:szCs w:val="19"/>
+        </w:rPr>
+        <w:br/>
+        <w:t xml:space="preserve">DIM gerade AS TUPLE</w:t>
+      </w:r>
+      <w:r>
+        <w:rPr>
+          <w:rFonts w:ascii="Consolas" w:cs="Consolas" w:eastAsia="Consolas" w:hAnsi="Consolas"/>
+          <w:sz w:val="19"/>
+          <w:szCs w:val="19"/>
+        </w:rPr>
+        <w:br/>
+        <w:t xml:space="preserve">gerade = [n FOR n IN zahlen WHERE n MOD 2 = 0]</w:t>
+      </w:r>
+      <w:r>
+        <w:rPr>
+          <w:rFonts w:ascii="Consolas" w:cs="Consolas" w:eastAsia="Consolas" w:hAnsi="Consolas"/>
+          <w:sz w:val="19"/>
+          <w:szCs w:val="19"/>
+        </w:rPr>
+        <w:br/>
+        <w:t xml:space="preserve">PRINT gerade</w:t>
+      </w:r>
+    </w:p>
+    <w:p>
+      <w:pPr>
+        <w:keepNext/>
+        <w:spacing w:after="30" w:before="120"/>
+      </w:pPr>
+      <w:r>
+        <w:rPr>
+          <w:b/>
+          <w:bCs/>
+          <w:i/>
+          <w:iCs/>
+          <w:color w:val="6A6A6A"/>
+          <w:sz w:val="18"/>
+          <w:szCs w:val="18"/>
+        </w:rPr>
+        <w:t xml:space="preserve">Ausgabe</w:t>
+      </w:r>
+    </w:p>
+    <w:p>
+      <w:pPr>
+        <w:keepLines/>
+        <w:pBdr>
+          <w:left w:val="single" w:color="9AC79A" w:sz="18" w:space="6"/>
+        </w:pBdr>
+        <w:shd w:fill="EAF4EA" w:val="clear"/>
+        <w:spacing w:after="200" w:before="100" w:line="264" w:lineRule="auto"/>
+        <w:ind w:left="140"/>
+      </w:pPr>
+      <w:r>
+        <w:rPr>
+          <w:rFonts w:ascii="Consolas" w:cs="Consolas" w:eastAsia="Consolas" w:hAnsi="Consolas"/>
+          <w:sz w:val="19"/>
+          <w:szCs w:val="19"/>
+        </w:rPr>
+        <w:t xml:space="preserve">(2, 4, 6)</w:t>
+      </w:r>
+    </w:p>
+    <w:p>
+      <w:pPr>
+        <w:spacing w:after="180" w:line="312" w:lineRule="auto"/>
+      </w:pPr>
+      <w:r>
+        <w:rPr>
+          <w:sz w:val="22"/>
+          <w:szCs w:val="22"/>
+        </w:rPr>
+        <w:t xml:space="preserve">Der Ausdruck vorne darf alles sein – eine Rechnung, ein Funktionsaufruf, ein Methodenaufruf. So machst du etwa aus jedem Zeichen eines Strings einen Großbuchstaben:</w:t>
+      </w:r>
+    </w:p>
+    <w:p>
+      <w:pPr>
+        <w:keepLines/>
+        <w:pBdr>
+          <w:left w:val="single" w:color="1B6CA8" w:sz="18" w:space="6"/>
+        </w:pBdr>
+        <w:shd w:fill="F4F4F4" w:val="clear"/>
+        <w:spacing w:after="200" w:before="100" w:line="264" w:lineRule="auto"/>
+        <w:ind w:left="140"/>
+      </w:pPr>
+      <w:r>
+        <w:rPr>
+          <w:rFonts w:ascii="Consolas" w:cs="Consolas" w:eastAsia="Consolas" w:hAnsi="Consolas"/>
+          <w:sz w:val="19"/>
+          <w:szCs w:val="19"/>
+        </w:rPr>
+        <w:t xml:space="preserve">DIM gross AS TUPLE</w:t>
+      </w:r>
+      <w:r>
+        <w:rPr>
+          <w:rFonts w:ascii="Consolas" w:cs="Consolas" w:eastAsia="Consolas" w:hAnsi="Consolas"/>
+          <w:sz w:val="19"/>
+          <w:szCs w:val="19"/>
+        </w:rPr>
+        <w:br/>
+        <w:t xml:space="preserve">gross = [UPPER$(c) FOR c IN "abc"]</w:t>
+      </w:r>
+      <w:r>
+        <w:rPr>
+          <w:rFonts w:ascii="Consolas" w:cs="Consolas" w:eastAsia="Consolas" w:hAnsi="Consolas"/>
+          <w:sz w:val="19"/>
+          <w:szCs w:val="19"/>
+        </w:rPr>
+        <w:br/>
+        <w:t xml:space="preserve">PRINT gross</w:t>
+      </w:r>
+    </w:p>
+    <w:p>
+      <w:pPr>
+        <w:keepLines/>
+        <w:pBdr>
+          <w:left w:val="single" w:color="9AC79A" w:sz="18" w:space="6"/>
+        </w:pBdr>
+        <w:shd w:fill="EAF4EA" w:val="clear"/>
+        <w:spacing w:after="200" w:before="100" w:line="264" w:lineRule="auto"/>
+        <w:ind w:left="140"/>
+      </w:pPr>
+      <w:r>
+        <w:rPr>
+          <w:rFonts w:ascii="Consolas" w:cs="Consolas" w:eastAsia="Consolas" w:hAnsi="Consolas"/>
+          <w:sz w:val="19"/>
+          <w:szCs w:val="19"/>
+        </w:rPr>
+        <w:t xml:space="preserve">(A, B, C)</w:t>
+      </w:r>
+    </w:p>
+    <w:p>
+      <w:pPr>
+        <w:pStyle w:val="Heading2"/>
+        <w:keepNext/>
+        <w:keepLines/>
+        <w:spacing w:after="120" w:before="280"/>
+      </w:pPr>
+      <w:r>
+        <w:t xml:space="preserve">Dict-Comprehension: eine Map bauen</w:t>
+      </w:r>
+    </w:p>
+    <w:p>
+      <w:pPr>
+        <w:spacing w:after="180" w:line="312" w:lineRule="auto"/>
+      </w:pPr>
+      <w:r>
+        <w:rPr>
+          <w:sz w:val="22"/>
+          <w:szCs w:val="22"/>
+        </w:rPr>
+        <w:t xml:space="preserve">Mit geschweiften Klammern und einem Doppelpunkt baust du in einem Zug eine ganze Map auf. Vor dem Doppelpunkt steht der Schlüssel, dahinter der Wert – beide werden für jedes Element berechnet. Denk daran: Map-Schlüssel sind immer Strings (Kapitel 18), bei Bedarf also mit STR$ umwandeln.</w:t>
+      </w:r>
+    </w:p>
+    <w:p>
+      <w:pPr>
+        <w:keepNext/>
+        <w:keepLines/>
+        <w:pBdr>
+          <w:bottom w:val="single" w:color="DDD0C0" w:sz="4" w:space="2"/>
+        </w:pBdr>
+        <w:spacing w:after="40" w:before="360"/>
+      </w:pPr>
+      <w:r>
+        <w:rPr>
+          <w:rFonts w:ascii="Consolas" w:cs="Consolas" w:eastAsia="Consolas" w:hAnsi="Consolas"/>
+          <w:b/>
+          <w:bCs/>
+          <w:color w:val="9A3412"/>
+          <w:sz w:val="24"/>
+          <w:szCs w:val="24"/>
+        </w:rPr>
+        <w:t xml:space="preserve">Dict-Comprehension</w:t>
+      </w:r>
+    </w:p>
+    <w:p>
+      <w:pPr>
+        <w:keepNext/>
+        <w:spacing w:after="120"/>
+      </w:pPr>
+      <w:r>
+        <w:rPr>
+          <w:b/>
+          <w:bCs/>
+          <w:color w:val="6A6A6A"/>
+          <w:sz w:val="18"/>
+          <w:szCs w:val="18"/>
+        </w:rPr>
+        <w:t xml:space="preserve">Syntax:  </w:t>
+      </w:r>
+      <w:r>
+        <w:rPr>
+          <w:rFonts w:ascii="Consolas" w:cs="Consolas" w:eastAsia="Consolas" w:hAnsi="Consolas"/>
+          <w:color w:val="335577"/>
+          <w:sz w:val="19"/>
+          <w:szCs w:val="19"/>
+        </w:rPr>
+        <w:t xml:space="preserve">{ schlüssel : wert FOR variable IN sammlung }</w:t>
+      </w:r>
+    </w:p>
+    <w:p>
+      <w:pPr>
+        <w:spacing w:after="180" w:line="312" w:lineRule="auto"/>
+      </w:pPr>
+      <w:r>
+        <w:rPr>
+          <w:sz w:val="22"/>
+          <w:szCs w:val="22"/>
+        </w:rPr>
+        <w:t xml:space="preserve">Erzeugt eine Map, indem für jedes Element ein Schlüssel-Wert-Paar berechnet wird. Ein WHERE-Filter ist auch hier erlaubt.</w:t>
+      </w:r>
+    </w:p>
+    <w:p>
+      <w:pPr>
+        <w:keepNext/>
+        <w:spacing w:after="30" w:before="120"/>
+      </w:pPr>
+      <w:r>
+        <w:rPr>
+          <w:b/>
+          <w:bCs/>
+          <w:i/>
+          <w:iCs/>
+          <w:color w:val="6A6A6A"/>
+          <w:sz w:val="18"/>
+          <w:szCs w:val="18"/>
+        </w:rPr>
+        <w:t xml:space="preserve">Beispiel</w:t>
+      </w:r>
+    </w:p>
+    <w:p>
+      <w:pPr>
+        <w:keepLines/>
+        <w:pBdr>
+          <w:left w:val="single" w:color="1B6CA8" w:sz="18" w:space="6"/>
+        </w:pBdr>
+        <w:shd w:fill="F4F4F4" w:val="clear"/>
+        <w:spacing w:after="200" w:before="100" w:line="264" w:lineRule="auto"/>
+        <w:ind w:left="140"/>
+      </w:pPr>
+      <w:r>
+        <w:rPr>
+          <w:rFonts w:ascii="Consolas" w:cs="Consolas" w:eastAsia="Consolas" w:hAnsi="Consolas"/>
+          <w:sz w:val="19"/>
+          <w:szCs w:val="19"/>
+        </w:rPr>
+        <w:t xml:space="preserve">DIM quadr AS MAP OF INTEGER</w:t>
+      </w:r>
+      <w:r>
+        <w:rPr>
+          <w:rFonts w:ascii="Consolas" w:cs="Consolas" w:eastAsia="Consolas" w:hAnsi="Consolas"/>
+          <w:sz w:val="19"/>
+          <w:szCs w:val="19"/>
+        </w:rPr>
+        <w:br/>
+        <w:t xml:space="preserve">quadr = {STR$(x) + "sq": x * x FOR x IN (1, 2, 3, 4)}</w:t>
+      </w:r>
+      <w:r>
+        <w:rPr>
+          <w:rFonts w:ascii="Consolas" w:cs="Consolas" w:eastAsia="Consolas" w:hAnsi="Consolas"/>
+          <w:sz w:val="19"/>
+          <w:szCs w:val="19"/>
+        </w:rPr>
+        <w:br/>
+        <w:t xml:space="preserve">PRINT MAPGET(quadr, "3sq")</w:t>
+      </w:r>
+    </w:p>
+    <w:p>
+      <w:pPr>
+        <w:keepNext/>
+        <w:spacing w:after="30" w:before="120"/>
+      </w:pPr>
+      <w:r>
+        <w:rPr>
+          <w:b/>
+          <w:bCs/>
+          <w:i/>
+          <w:iCs/>
+          <w:color w:val="6A6A6A"/>
+          <w:sz w:val="18"/>
+          <w:szCs w:val="18"/>
+        </w:rPr>
+        <w:t xml:space="preserve">Ausgabe</w:t>
+      </w:r>
+    </w:p>
+    <w:p>
+      <w:pPr>
+        <w:keepLines/>
+        <w:pBdr>
+          <w:left w:val="single" w:color="9AC79A" w:sz="18" w:space="6"/>
+        </w:pBdr>
+        <w:shd w:fill="EAF4EA" w:val="clear"/>
+        <w:spacing w:after="200" w:before="100" w:line="264" w:lineRule="auto"/>
+        <w:ind w:left="140"/>
+      </w:pPr>
+      <w:r>
+        <w:rPr>
+          <w:rFonts w:ascii="Consolas" w:cs="Consolas" w:eastAsia="Consolas" w:hAnsi="Consolas"/>
+          <w:sz w:val="19"/>
+          <w:szCs w:val="19"/>
+        </w:rPr>
+        <w:t xml:space="preserve">9</w:t>
+      </w:r>
+    </w:p>
+    <w:p>
+      <w:pPr>
+        <w:pStyle w:val="Heading2"/>
+        <w:keepNext/>
+        <w:keepLines/>
+        <w:spacing w:after="120" w:before="280"/>
+      </w:pPr>
+      <w:r>
+        <w:t xml:space="preserve">Set-Comprehension: doppelte entfernen</w:t>
+      </w:r>
+    </w:p>
+    <w:p>
+      <w:pPr>
+        <w:spacing w:after="180" w:line="312" w:lineRule="auto"/>
+      </w:pPr>
+      <w:r>
+        <w:rPr>
+          <w:sz w:val="22"/>
+          <w:szCs w:val="22"/>
+        </w:rPr>
+        <w:t xml:space="preserve">Schreibst du geschweifte Klammern OHNE Doppelpunkt, bekommst du eine Set-Comprehension. Sie berechnet wie eine List-Comprehension einen Wert pro Element, lässt aber Doppelte weg – jeder Wert erscheint nur einmal, in der Reihenfolge seines ersten Auftretens. Das Ergebnis ist wieder ein Tupel.</w:t>
+      </w:r>
+    </w:p>
+    <w:p>
+      <w:pPr>
+        <w:keepNext/>
+        <w:keepLines/>
+        <w:pBdr>
+          <w:bottom w:val="single" w:color="DDD0C0" w:sz="4" w:space="2"/>
+        </w:pBdr>
+        <w:spacing w:after="40" w:before="360"/>
+      </w:pPr>
+      <w:r>
+        <w:rPr>
+          <w:rFonts w:ascii="Consolas" w:cs="Consolas" w:eastAsia="Consolas" w:hAnsi="Consolas"/>
+          <w:b/>
+          <w:bCs/>
+          <w:color w:val="9A3412"/>
+          <w:sz w:val="24"/>
+          <w:szCs w:val="24"/>
+        </w:rPr>
+        <w:t xml:space="preserve">Set-Comprehension</w:t>
+      </w:r>
+    </w:p>
+    <w:p>
+      <w:pPr>
+        <w:keepNext/>
+        <w:spacing w:after="120"/>
+      </w:pPr>
+      <w:r>
+        <w:rPr>
+          <w:b/>
+          <w:bCs/>
+          <w:color w:val="6A6A6A"/>
+          <w:sz w:val="18"/>
+          <w:szCs w:val="18"/>
+        </w:rPr>
+        <w:t xml:space="preserve">Syntax:  </w:t>
+      </w:r>
+      <w:r>
+        <w:rPr>
+          <w:rFonts w:ascii="Consolas" w:cs="Consolas" w:eastAsia="Consolas" w:hAnsi="Consolas"/>
+          <w:color w:val="335577"/>
+          <w:sz w:val="19"/>
+          <w:szCs w:val="19"/>
+        </w:rPr>
+        <w:t xml:space="preserve">{ ausdruck FOR variable IN sammlung }</w:t>
+      </w:r>
+    </w:p>
+    <w:p>
+      <w:pPr>
+        <w:spacing w:after="180" w:line="312" w:lineRule="auto"/>
+      </w:pPr>
+      <w:r>
+        <w:rPr>
+          <w:sz w:val="22"/>
+          <w:szCs w:val="22"/>
+        </w:rPr>
+        <w:t xml:space="preserve">Wie die List-Comprehension, entfernt aber Duplikate. Praktisch, um aus vielen Werten die eindeutigen herauszuziehen.</w:t>
+      </w:r>
+    </w:p>
+    <w:p>
+      <w:pPr>
+        <w:keepNext/>
+        <w:spacing w:after="30" w:before="120"/>
+      </w:pPr>
+      <w:r>
+        <w:rPr>
+          <w:b/>
+          <w:bCs/>
+          <w:i/>
+          <w:iCs/>
+          <w:color w:val="6A6A6A"/>
+          <w:sz w:val="18"/>
+          <w:szCs w:val="18"/>
+        </w:rPr>
+        <w:t xml:space="preserve">Beispiel</w:t>
+      </w:r>
+    </w:p>
+    <w:p>
+      <w:pPr>
+        <w:keepLines/>
+        <w:pBdr>
+          <w:left w:val="single" w:color="1B6CA8" w:sz="18" w:space="6"/>
+        </w:pBdr>
+        <w:shd w:fill="F4F4F4" w:val="clear"/>
+        <w:spacing w:after="200" w:before="100" w:line="264" w:lineRule="auto"/>
+        <w:ind w:left="140"/>
+      </w:pPr>
+      <w:r>
+        <w:rPr>
+          <w:rFonts w:ascii="Consolas" w:cs="Consolas" w:eastAsia="Consolas" w:hAnsi="Consolas"/>
+          <w:sz w:val="19"/>
+          <w:szCs w:val="19"/>
+        </w:rPr>
+        <w:t xml:space="preserve">DIM reste AS TUPLE</w:t>
+      </w:r>
+      <w:r>
+        <w:rPr>
+          <w:rFonts w:ascii="Consolas" w:cs="Consolas" w:eastAsia="Consolas" w:hAnsi="Consolas"/>
+          <w:sz w:val="19"/>
+          <w:szCs w:val="19"/>
+        </w:rPr>
+        <w:br/>
+        <w:t xml:space="preserve">reste = {x MOD 3 FOR x IN (0, 1, 2, 3, 4, 5, 6, 7, 8)}</w:t>
+      </w:r>
+      <w:r>
+        <w:rPr>
+          <w:rFonts w:ascii="Consolas" w:cs="Consolas" w:eastAsia="Consolas" w:hAnsi="Consolas"/>
+          <w:sz w:val="19"/>
+          <w:szCs w:val="19"/>
+        </w:rPr>
+        <w:br/>
+        <w:t xml:space="preserve">PRINT reste</w:t>
+      </w:r>
+    </w:p>
+    <w:p>
+      <w:pPr>
+        <w:keepNext/>
+        <w:spacing w:after="30" w:before="120"/>
+      </w:pPr>
+      <w:r>
+        <w:rPr>
+          <w:b/>
+          <w:bCs/>
+          <w:i/>
+          <w:iCs/>
+          <w:color w:val="6A6A6A"/>
+          <w:sz w:val="18"/>
+          <w:szCs w:val="18"/>
+        </w:rPr>
+        <w:t xml:space="preserve">Ausgabe</w:t>
+      </w:r>
+    </w:p>
+    <w:p>
+      <w:pPr>
+        <w:keepLines/>
+        <w:pBdr>
+          <w:left w:val="single" w:color="9AC79A" w:sz="18" w:space="6"/>
+        </w:pBdr>
+        <w:shd w:fill="EAF4EA" w:val="clear"/>
+        <w:spacing w:after="200" w:before="100" w:line="264" w:lineRule="auto"/>
+        <w:ind w:left="140"/>
+      </w:pPr>
+      <w:r>
+        <w:rPr>
+          <w:rFonts w:ascii="Consolas" w:cs="Consolas" w:eastAsia="Consolas" w:hAnsi="Consolas"/>
+          <w:sz w:val="19"/>
+          <w:szCs w:val="19"/>
+        </w:rPr>
+        <w:t xml:space="preserve">(0, 1, 2)</w:t>
+      </w:r>
+    </w:p>
+    <w:p>
+      <w:pPr>
+        <w:spacing w:after="180" w:line="312" w:lineRule="auto"/>
+      </w:pPr>
+      <w:r>
+        <w:rPr>
+          <w:sz w:val="22"/>
+          <w:szCs w:val="22"/>
+        </w:rPr>
+        <w:t xml:space="preserve">Obwohl neun Zahlen hineingehen, kommen nur drei verschiedene Reste heraus (0, 1, 2) – die Wiederholungen wurden geschluckt.</w:t>
+      </w:r>
+    </w:p>
+    <w:p>
+      <w:pPr>
+        <w:spacing w:before="60"/>
+      </w:pPr>
+    </w:p>
+    <w:tbl>
+      <w:tblPr>
+        <w:tblW w:type="dxa" w:w="9360"/>
+        <w:tblBorders>
+          <w:top w:val="single" w:color="auto" w:sz="4"/>
+          <w:left w:val="single" w:color="auto" w:sz="4"/>
+          <w:bottom w:val="single" w:color="auto" w:sz="4"/>
+          <w:right w:val="single" w:color="auto" w:sz="4"/>
+          <w:insideH w:val="single" w:color="auto" w:sz="4"/>
+          <w:insideV w:val="single" w:color="auto" w:sz="4"/>
+        </w:tblBorders>
+      </w:tblPr>
+      <w:tblGrid>
+        <w:gridCol w:w="9360"/>
+      </w:tblGrid>
+      <w:tr>
+        <w:trPr>
+          <w:cantSplit/>
+        </w:trPr>
+        <w:tc>
+          <w:tcPr>
+            <w:tcW w:type="dxa" w:w="9360"/>
+            <w:tcBorders>
+              <w:top w:val="single" w:color="9CC8E6" w:sz="6"/>
+              <w:left w:val="single" w:color="9CC8E6" w:sz="6"/>
+              <w:bottom w:val="single" w:color="9CC8E6" w:sz="6"/>
+              <w:right w:val="single" w:color="9CC8E6" w:sz="6"/>
+            </w:tcBorders>
+            <w:shd w:fill="E7F2FA" w:val="clear"/>
+            <w:tcMar>
+              <w:top w:type="dxa" w:w="140"/>
+              <w:left w:type="dxa" w:w="180"/>
+              <w:bottom w:type="dxa" w:w="140"/>
+              <w:right w:type="dxa" w:w="180"/>
+            </w:tcMar>
+          </w:tcPr>
+          <w:p>
+            <w:pPr>
+              <w:spacing w:after="40"/>
+            </w:pPr>
+            <w:r>
+              <w:rPr>
+                <w:b/>
+                <w:bCs/>
+                <w:color w:val="1B6CA8"/>
+                <w:sz w:val="22"/>
+                <w:szCs w:val="22"/>
+              </w:rPr>
+              <w:t xml:space="preserve">Wann Comprehension, wann Schleife?</w:t>
+            </w:r>
+          </w:p>
+          <w:p>
+            <w:pPr>
+              <w:spacing w:after="0" w:line="312" w:lineRule="auto"/>
+            </w:pPr>
+            <w:r>
+              <w:rPr>
+                <w:sz w:val="22"/>
+                <w:szCs w:val="22"/>
+              </w:rPr>
+              <w:t xml:space="preserve">Eine Comprehension glänzt, wenn du aus einer Sammlung schlicht eine neue ableitest – abbilden und/oder filtern. Wird die Logik komplizierter (mehrere Schritte, Zwischenwerte, viele Bedingungen), bleibt die ausgeschriebene Schleife klarer. Lesbarkeit geht vor Kürze.</w:t>
             </w:r>
           </w:p>
         </w:tc>

</xml_diff>

<commit_message>
docs(buch): Lehrbuch Kap 24 -- Fehlerbehandlung (TRY/CATCH/THROW)
TRY...CATCH[e]...END TRY (Programm laeuft nach abgefangenem Fehler weiter),
Catch-Variable haelt Meldung, optionales CATCH ohne Name, THROW eigener
Fehler (springt ueber Funktionsaufrufe zum naechsten CATCH), wann nutzen
(echte Ausnahmen, nicht normale IF-Logik) + TRYVAL-Hinweis.
Alle Beispiel-Ausgaben gegen gbrt verifiziert.

Co-Authored-By: Claude Opus 4.8 (1M context) <noreply@anthropic.com>
</commit_message>
<xml_diff>
--- a/buch-referenz/buch/GameBasic-Lehrbuch.docx
+++ b/buch-referenz/buch/GameBasic-Lehrbuch.docx
@@ -624,6 +624,33 @@
           <w:szCs w:val="22"/>
         </w:rPr>
         <w:t xml:space="preserve">	75</w:t>
+      </w:r>
+    </w:p>
+    <w:p>
+      <w:pPr>
+        <w:tabs>
+          <w:tab w:val="right" w:pos="9200" w:leader="dot"/>
+        </w:tabs>
+        <w:spacing w:after="20" w:before="0"/>
+        <w:ind w:left="280"/>
+      </w:pPr>
+      <w:r>
+        <w:rPr>
+          <w:b w:val="false"/>
+          <w:bCs w:val="false"/>
+          <w:color w:val="222222"/>
+          <w:sz w:val="22"/>
+          <w:szCs w:val="22"/>
+        </w:rPr>
+        <w:t xml:space="preserve">Fehlerbehandlung</w:t>
+      </w:r>
+      <w:r>
+        <w:rPr>
+          <w:color w:val="555555"/>
+          <w:sz w:val="22"/>
+          <w:szCs w:val="22"/>
+        </w:rPr>
+        <w:t xml:space="preserve">	78</w:t>
       </w:r>
     </w:p>
     <w:p>
@@ -24692,6 +24719,729 @@
                 <w:szCs w:val="22"/>
               </w:rPr>
               <w:t xml:space="preserve">Eine Comprehension glänzt, wenn du aus einer Sammlung schlicht eine neue ableitest – abbilden und/oder filtern. Wird die Logik komplizierter (mehrere Schritte, Zwischenwerte, viele Bedingungen), bleibt die ausgeschriebene Schleife klarer. Lesbarkeit geht vor Kürze.</w:t>
+            </w:r>
+          </w:p>
+        </w:tc>
+      </w:tr>
+    </w:tbl>
+    <w:p>
+      <w:pPr>
+        <w:spacing w:after="160"/>
+      </w:pPr>
+    </w:p>
+    <w:p>
+      <w:pPr>
+        <w:pStyle w:val="Heading1"/>
+        <w:keepNext/>
+        <w:keepLines/>
+        <w:pageBreakBefore/>
+        <w:pBdr>
+          <w:bottom w:val="single" w:color="1B6CA8" w:sz="12" w:space="4"/>
+        </w:pBdr>
+        <w:spacing w:after="160" w:before="0"/>
+      </w:pPr>
+      <w:r>
+        <w:t xml:space="preserve">Fehlerbehandlung</w:t>
+      </w:r>
+    </w:p>
+    <w:p>
+      <w:pPr>
+        <w:spacing w:after="180" w:line="312" w:lineRule="auto"/>
+      </w:pPr>
+      <w:r>
+        <w:rPr>
+          <w:sz w:val="22"/>
+          <w:szCs w:val="22"/>
+        </w:rPr>
+        <w:t xml:space="preserve">Manche Dinge können schiefgehen, ohne dass du als Programmierer schuld bist: Eine Datei fehlt, eine Eingabe ergibt keinen Sinn, eine Berechnung teilt versehentlich durch null. Tritt so ein Laufzeitfehler auf, bricht GameBasic das Programm normalerweise mit einer Meldung ab. Oft willst du aber nicht abstürzen, sondern den Fehler sauber auffangen und weitermachen. Genau dafür gibt es TRY, CATCH und THROW.</w:t>
+      </w:r>
+    </w:p>
+    <w:p>
+      <w:pPr>
+        <w:pStyle w:val="Heading2"/>
+        <w:keepNext/>
+        <w:keepLines/>
+        <w:spacing w:after="120" w:before="280"/>
+      </w:pPr>
+      <w:r>
+        <w:t xml:space="preserve">Auffangen mit TRY ... CATCH</w:t>
+      </w:r>
+    </w:p>
+    <w:p>
+      <w:pPr>
+        <w:spacing w:after="180" w:line="312" w:lineRule="auto"/>
+      </w:pPr>
+      <w:r>
+        <w:rPr>
+          <w:sz w:val="22"/>
+          <w:szCs w:val="22"/>
+        </w:rPr>
+        <w:t xml:space="preserve">Du legst den heiklen Code in einen TRY-Block. Geht alles gut, läuft er ganz normal durch und der CATCH-Teil wird übersprungen. Tritt aber irgendwo im TRY-Block ein Fehler auf, springt GameBasic sofort in den CATCH-Block – der Rest des TRY-Blocks wird übersprungen, das Programm aber NICHT abgebrochen. Danach geht es hinter END TRY ganz normal weiter.</w:t>
+      </w:r>
+    </w:p>
+    <w:p>
+      <w:pPr>
+        <w:spacing w:after="180" w:line="312" w:lineRule="auto"/>
+      </w:pPr>
+      <w:r>
+        <w:rPr>
+          <w:sz w:val="22"/>
+          <w:szCs w:val="22"/>
+        </w:rPr>
+        <w:t xml:space="preserve">Im CATCH kannst du eine Variable angeben (hier e). Sie enthält dann die Fehlermeldung als Text – nützlich, um zu sehen, was passiert ist.</w:t>
+      </w:r>
+    </w:p>
+    <w:p>
+      <w:pPr>
+        <w:keepNext/>
+        <w:keepLines/>
+        <w:pBdr>
+          <w:bottom w:val="single" w:color="DDD0C0" w:sz="4" w:space="2"/>
+        </w:pBdr>
+        <w:spacing w:after="40" w:before="360"/>
+      </w:pPr>
+      <w:r>
+        <w:rPr>
+          <w:rFonts w:ascii="Consolas" w:cs="Consolas" w:eastAsia="Consolas" w:hAnsi="Consolas"/>
+          <w:b/>
+          <w:bCs/>
+          <w:color w:val="9A3412"/>
+          <w:sz w:val="24"/>
+          <w:szCs w:val="24"/>
+        </w:rPr>
+        <w:t xml:space="preserve">TRY ... CATCH ... END TRY</w:t>
+      </w:r>
+    </w:p>
+    <w:p>
+      <w:pPr>
+        <w:keepNext/>
+        <w:spacing w:after="120"/>
+      </w:pPr>
+      <w:r>
+        <w:rPr>
+          <w:b/>
+          <w:bCs/>
+          <w:color w:val="6A6A6A"/>
+          <w:sz w:val="18"/>
+          <w:szCs w:val="18"/>
+        </w:rPr>
+        <w:t xml:space="preserve">Syntax:  </w:t>
+      </w:r>
+      <w:r>
+        <w:rPr>
+          <w:rFonts w:ascii="Consolas" w:cs="Consolas" w:eastAsia="Consolas" w:hAnsi="Consolas"/>
+          <w:color w:val="335577"/>
+          <w:sz w:val="19"/>
+          <w:szCs w:val="19"/>
+        </w:rPr>
+        <w:t xml:space="preserve">TRY
+    ...
+CATCH [e]
+    ...
+END TRY</w:t>
+      </w:r>
+    </w:p>
+    <w:p>
+      <w:pPr>
+        <w:spacing w:after="180" w:line="312" w:lineRule="auto"/>
+      </w:pPr>
+      <w:r>
+        <w:rPr>
+          <w:sz w:val="22"/>
+          <w:szCs w:val="22"/>
+        </w:rPr>
+        <w:t xml:space="preserve">Führt den TRY-Block aus. Tritt ein Fehler auf, läuft stattdessen der CATCH-Block weiter. Die optionale Variable nach CATCH nimmt die Fehlermeldung als String auf. Nach END TRY läuft das Programm normal weiter – ein abgefangener Fehler beendet es nicht.</w:t>
+      </w:r>
+    </w:p>
+    <w:p>
+      <w:pPr>
+        <w:keepNext/>
+        <w:spacing w:after="30" w:before="120"/>
+      </w:pPr>
+      <w:r>
+        <w:rPr>
+          <w:b/>
+          <w:bCs/>
+          <w:i/>
+          <w:iCs/>
+          <w:color w:val="6A6A6A"/>
+          <w:sz w:val="18"/>
+          <w:szCs w:val="18"/>
+        </w:rPr>
+        <w:t xml:space="preserve">Beispiel</w:t>
+      </w:r>
+    </w:p>
+    <w:p>
+      <w:pPr>
+        <w:keepLines/>
+        <w:pBdr>
+          <w:left w:val="single" w:color="1B6CA8" w:sz="18" w:space="6"/>
+        </w:pBdr>
+        <w:shd w:fill="F4F4F4" w:val="clear"/>
+        <w:spacing w:after="200" w:before="100" w:line="264" w:lineRule="auto"/>
+        <w:ind w:left="140"/>
+      </w:pPr>
+      <w:r>
+        <w:rPr>
+          <w:rFonts w:ascii="Consolas" w:cs="Consolas" w:eastAsia="Consolas" w:hAnsi="Consolas"/>
+          <w:sz w:val="19"/>
+          <w:szCs w:val="19"/>
+        </w:rPr>
+        <w:t xml:space="preserve">TRY</w:t>
+      </w:r>
+      <w:r>
+        <w:rPr>
+          <w:rFonts w:ascii="Consolas" w:cs="Consolas" w:eastAsia="Consolas" w:hAnsi="Consolas"/>
+          <w:sz w:val="19"/>
+          <w:szCs w:val="19"/>
+        </w:rPr>
+        <w:br/>
+        <w:t xml:space="preserve">    DIM a AS INTEGER</w:t>
+      </w:r>
+      <w:r>
+        <w:rPr>
+          <w:rFonts w:ascii="Consolas" w:cs="Consolas" w:eastAsia="Consolas" w:hAnsi="Consolas"/>
+          <w:sz w:val="19"/>
+          <w:szCs w:val="19"/>
+        </w:rPr>
+        <w:br/>
+        <w:t xml:space="preserve">    a = 10 \ 0           ' Division durch null!</w:t>
+      </w:r>
+      <w:r>
+        <w:rPr>
+          <w:rFonts w:ascii="Consolas" w:cs="Consolas" w:eastAsia="Consolas" w:hAnsi="Consolas"/>
+          <w:sz w:val="19"/>
+          <w:szCs w:val="19"/>
+        </w:rPr>
+        <w:br/>
+        <w:t xml:space="preserve">    PRINT "wird übersprungen"</w:t>
+      </w:r>
+      <w:r>
+        <w:rPr>
+          <w:rFonts w:ascii="Consolas" w:cs="Consolas" w:eastAsia="Consolas" w:hAnsi="Consolas"/>
+          <w:sz w:val="19"/>
+          <w:szCs w:val="19"/>
+        </w:rPr>
+        <w:br/>
+        <w:t xml:space="preserve">CATCH e</w:t>
+      </w:r>
+      <w:r>
+        <w:rPr>
+          <w:rFonts w:ascii="Consolas" w:cs="Consolas" w:eastAsia="Consolas" w:hAnsi="Consolas"/>
+          <w:sz w:val="19"/>
+          <w:szCs w:val="19"/>
+        </w:rPr>
+        <w:br/>
+        <w:t xml:space="preserve">    PRINT "Fehler abgefangen: "; e</w:t>
+      </w:r>
+      <w:r>
+        <w:rPr>
+          <w:rFonts w:ascii="Consolas" w:cs="Consolas" w:eastAsia="Consolas" w:hAnsi="Consolas"/>
+          <w:sz w:val="19"/>
+          <w:szCs w:val="19"/>
+        </w:rPr>
+        <w:br/>
+        <w:t xml:space="preserve">END TRY</w:t>
+      </w:r>
+      <w:r>
+        <w:rPr>
+          <w:rFonts w:ascii="Consolas" w:cs="Consolas" w:eastAsia="Consolas" w:hAnsi="Consolas"/>
+          <w:sz w:val="19"/>
+          <w:szCs w:val="19"/>
+        </w:rPr>
+        <w:br/>
+        <w:t xml:space="preserve">PRINT "weiter geht's"</w:t>
+      </w:r>
+    </w:p>
+    <w:p>
+      <w:pPr>
+        <w:keepNext/>
+        <w:spacing w:after="30" w:before="120"/>
+      </w:pPr>
+      <w:r>
+        <w:rPr>
+          <w:b/>
+          <w:bCs/>
+          <w:i/>
+          <w:iCs/>
+          <w:color w:val="6A6A6A"/>
+          <w:sz w:val="18"/>
+          <w:szCs w:val="18"/>
+        </w:rPr>
+        <w:t xml:space="preserve">Ausgabe</w:t>
+      </w:r>
+    </w:p>
+    <w:p>
+      <w:pPr>
+        <w:keepLines/>
+        <w:pBdr>
+          <w:left w:val="single" w:color="9AC79A" w:sz="18" w:space="6"/>
+        </w:pBdr>
+        <w:shd w:fill="EAF4EA" w:val="clear"/>
+        <w:spacing w:after="200" w:before="100" w:line="264" w:lineRule="auto"/>
+        <w:ind w:left="140"/>
+      </w:pPr>
+      <w:r>
+        <w:rPr>
+          <w:rFonts w:ascii="Consolas" w:cs="Consolas" w:eastAsia="Consolas" w:hAnsi="Consolas"/>
+          <w:sz w:val="19"/>
+          <w:szCs w:val="19"/>
+        </w:rPr>
+        <w:t xml:space="preserve">Fehler abgefangen: Integer-Division durch 0</w:t>
+      </w:r>
+      <w:r>
+        <w:rPr>
+          <w:rFonts w:ascii="Consolas" w:cs="Consolas" w:eastAsia="Consolas" w:hAnsi="Consolas"/>
+          <w:sz w:val="19"/>
+          <w:szCs w:val="19"/>
+        </w:rPr>
+        <w:br/>
+        <w:t xml:space="preserve">weiter geht's</w:t>
+      </w:r>
+    </w:p>
+    <w:p>
+      <w:pPr>
+        <w:spacing w:after="180" w:line="312" w:lineRule="auto"/>
+      </w:pPr>
+      <w:r>
+        <w:rPr>
+          <w:sz w:val="22"/>
+          <w:szCs w:val="22"/>
+        </w:rPr>
+        <w:t xml:space="preserve">Beachte: Die Zeile nach der Division wurde nie ausgeführt – sobald der Fehler auftrat, sprang die Ausführung direkt in den CATCH. Aber das Programm lief danach weiter und gab „weiter geht's“ aus, statt abzustürzen.</w:t>
+      </w:r>
+    </w:p>
+    <w:p>
+      <w:pPr>
+        <w:pStyle w:val="Heading2"/>
+        <w:keepNext/>
+        <w:keepLines/>
+        <w:spacing w:after="120" w:before="280"/>
+      </w:pPr>
+      <w:r>
+        <w:t xml:space="preserve">Eigene Fehler auslösen mit THROW</w:t>
+      </w:r>
+    </w:p>
+    <w:p>
+      <w:pPr>
+        <w:spacing w:after="180" w:line="312" w:lineRule="auto"/>
+      </w:pPr>
+      <w:r>
+        <w:rPr>
+          <w:sz w:val="22"/>
+          <w:szCs w:val="22"/>
+        </w:rPr>
+        <w:t xml:space="preserve">Du kannst Fehler auch selbst auslösen – etwa wenn ein Wert nicht zulässig ist. THROW wirft einen Fehler mit einer Nachricht deiner Wahl. Er verhält sich wie ein eingebauter Laufzeitfehler: Er bricht den aktuellen Ablauf ab und wird vom nächsten umgebenden CATCH aufgefangen (auch über Funktionsaufrufe hinweg).</w:t>
+      </w:r>
+    </w:p>
+    <w:p>
+      <w:pPr>
+        <w:keepNext/>
+        <w:keepLines/>
+        <w:pBdr>
+          <w:bottom w:val="single" w:color="DDD0C0" w:sz="4" w:space="2"/>
+        </w:pBdr>
+        <w:spacing w:after="40" w:before="360"/>
+      </w:pPr>
+      <w:r>
+        <w:rPr>
+          <w:rFonts w:ascii="Consolas" w:cs="Consolas" w:eastAsia="Consolas" w:hAnsi="Consolas"/>
+          <w:b/>
+          <w:bCs/>
+          <w:color w:val="9A3412"/>
+          <w:sz w:val="24"/>
+          <w:szCs w:val="24"/>
+        </w:rPr>
+        <w:t xml:space="preserve">THROW</w:t>
+      </w:r>
+    </w:p>
+    <w:p>
+      <w:pPr>
+        <w:keepNext/>
+        <w:spacing w:after="120"/>
+      </w:pPr>
+      <w:r>
+        <w:rPr>
+          <w:b/>
+          <w:bCs/>
+          <w:color w:val="6A6A6A"/>
+          <w:sz w:val="18"/>
+          <w:szCs w:val="18"/>
+        </w:rPr>
+        <w:t xml:space="preserve">Syntax:  </w:t>
+      </w:r>
+      <w:r>
+        <w:rPr>
+          <w:rFonts w:ascii="Consolas" w:cs="Consolas" w:eastAsia="Consolas" w:hAnsi="Consolas"/>
+          <w:color w:val="335577"/>
+          <w:sz w:val="19"/>
+          <w:szCs w:val="19"/>
+        </w:rPr>
+        <w:t xml:space="preserve">THROW wert</w:t>
+      </w:r>
+    </w:p>
+    <w:p>
+      <w:pPr>
+        <w:spacing w:after="180" w:line="312" w:lineRule="auto"/>
+      </w:pPr>
+      <w:r>
+        <w:rPr>
+          <w:sz w:val="22"/>
+          <w:szCs w:val="22"/>
+        </w:rPr>
+        <w:t xml:space="preserve">Löst einen Fehler mit dem angegebenen Wert (meist ein String) aus. Der Ablauf bricht ab und springt zum nächsten umgebenden CATCH – egal, wie viele Funktionsaufrufe dazwischenliegen.</w:t>
+      </w:r>
+    </w:p>
+    <w:p>
+      <w:pPr>
+        <w:keepNext/>
+        <w:spacing w:after="30" w:before="120"/>
+      </w:pPr>
+      <w:r>
+        <w:rPr>
+          <w:b/>
+          <w:bCs/>
+          <w:i/>
+          <w:iCs/>
+          <w:color w:val="6A6A6A"/>
+          <w:sz w:val="18"/>
+          <w:szCs w:val="18"/>
+        </w:rPr>
+        <w:t xml:space="preserve">Beispiel</w:t>
+      </w:r>
+    </w:p>
+    <w:p>
+      <w:pPr>
+        <w:keepLines/>
+        <w:pBdr>
+          <w:left w:val="single" w:color="1B6CA8" w:sz="18" w:space="6"/>
+        </w:pBdr>
+        <w:shd w:fill="F4F4F4" w:val="clear"/>
+        <w:spacing w:after="200" w:before="100" w:line="264" w:lineRule="auto"/>
+        <w:ind w:left="140"/>
+      </w:pPr>
+      <w:r>
+        <w:rPr>
+          <w:rFonts w:ascii="Consolas" w:cs="Consolas" w:eastAsia="Consolas" w:hAnsi="Consolas"/>
+          <w:sz w:val="19"/>
+          <w:szCs w:val="19"/>
+        </w:rPr>
+        <w:t xml:space="preserve">SUB pruefe(alter AS INTEGER)</w:t>
+      </w:r>
+      <w:r>
+        <w:rPr>
+          <w:rFonts w:ascii="Consolas" w:cs="Consolas" w:eastAsia="Consolas" w:hAnsi="Consolas"/>
+          <w:sz w:val="19"/>
+          <w:szCs w:val="19"/>
+        </w:rPr>
+        <w:br/>
+        <w:t xml:space="preserve">    IF alter &lt; 0 THEN THROW "Alter darf nicht negativ sein"</w:t>
+      </w:r>
+      <w:r>
+        <w:rPr>
+          <w:rFonts w:ascii="Consolas" w:cs="Consolas" w:eastAsia="Consolas" w:hAnsi="Consolas"/>
+          <w:sz w:val="19"/>
+          <w:szCs w:val="19"/>
+        </w:rPr>
+        <w:br/>
+        <w:t xml:space="preserve">    PRINT "Alter ok: "; alter</w:t>
+      </w:r>
+      <w:r>
+        <w:rPr>
+          <w:rFonts w:ascii="Consolas" w:cs="Consolas" w:eastAsia="Consolas" w:hAnsi="Consolas"/>
+          <w:sz w:val="19"/>
+          <w:szCs w:val="19"/>
+        </w:rPr>
+        <w:br/>
+        <w:t xml:space="preserve">END SUB</w:t>
+      </w:r>
+      <w:r>
+        <w:rPr>
+          <w:rFonts w:ascii="Consolas" w:cs="Consolas" w:eastAsia="Consolas" w:hAnsi="Consolas"/>
+          <w:sz w:val="19"/>
+          <w:szCs w:val="19"/>
+        </w:rPr>
+        <w:br/>
+        <w:t xml:space="preserve"/>
+      </w:r>
+      <w:r>
+        <w:rPr>
+          <w:rFonts w:ascii="Consolas" w:cs="Consolas" w:eastAsia="Consolas" w:hAnsi="Consolas"/>
+          <w:sz w:val="19"/>
+          <w:szCs w:val="19"/>
+        </w:rPr>
+        <w:br/>
+        <w:t xml:space="preserve">TRY</w:t>
+      </w:r>
+      <w:r>
+        <w:rPr>
+          <w:rFonts w:ascii="Consolas" w:cs="Consolas" w:eastAsia="Consolas" w:hAnsi="Consolas"/>
+          <w:sz w:val="19"/>
+          <w:szCs w:val="19"/>
+        </w:rPr>
+        <w:br/>
+        <w:t xml:space="preserve">    pruefe(25)</w:t>
+      </w:r>
+      <w:r>
+        <w:rPr>
+          <w:rFonts w:ascii="Consolas" w:cs="Consolas" w:eastAsia="Consolas" w:hAnsi="Consolas"/>
+          <w:sz w:val="19"/>
+          <w:szCs w:val="19"/>
+        </w:rPr>
+        <w:br/>
+        <w:t xml:space="preserve">    pruefe(-5)            ' wirft hier</w:t>
+      </w:r>
+      <w:r>
+        <w:rPr>
+          <w:rFonts w:ascii="Consolas" w:cs="Consolas" w:eastAsia="Consolas" w:hAnsi="Consolas"/>
+          <w:sz w:val="19"/>
+          <w:szCs w:val="19"/>
+        </w:rPr>
+        <w:br/>
+        <w:t xml:space="preserve">CATCH msg</w:t>
+      </w:r>
+      <w:r>
+        <w:rPr>
+          <w:rFonts w:ascii="Consolas" w:cs="Consolas" w:eastAsia="Consolas" w:hAnsi="Consolas"/>
+          <w:sz w:val="19"/>
+          <w:szCs w:val="19"/>
+        </w:rPr>
+        <w:br/>
+        <w:t xml:space="preserve">    PRINT "Abgefangen: "; msg</w:t>
+      </w:r>
+      <w:r>
+        <w:rPr>
+          <w:rFonts w:ascii="Consolas" w:cs="Consolas" w:eastAsia="Consolas" w:hAnsi="Consolas"/>
+          <w:sz w:val="19"/>
+          <w:szCs w:val="19"/>
+        </w:rPr>
+        <w:br/>
+        <w:t xml:space="preserve">END TRY</w:t>
+      </w:r>
+    </w:p>
+    <w:p>
+      <w:pPr>
+        <w:keepNext/>
+        <w:spacing w:after="30" w:before="120"/>
+      </w:pPr>
+      <w:r>
+        <w:rPr>
+          <w:b/>
+          <w:bCs/>
+          <w:i/>
+          <w:iCs/>
+          <w:color w:val="6A6A6A"/>
+          <w:sz w:val="18"/>
+          <w:szCs w:val="18"/>
+        </w:rPr>
+        <w:t xml:space="preserve">Ausgabe</w:t>
+      </w:r>
+    </w:p>
+    <w:p>
+      <w:pPr>
+        <w:keepLines/>
+        <w:pBdr>
+          <w:left w:val="single" w:color="9AC79A" w:sz="18" w:space="6"/>
+        </w:pBdr>
+        <w:shd w:fill="EAF4EA" w:val="clear"/>
+        <w:spacing w:after="200" w:before="100" w:line="264" w:lineRule="auto"/>
+        <w:ind w:left="140"/>
+      </w:pPr>
+      <w:r>
+        <w:rPr>
+          <w:rFonts w:ascii="Consolas" w:cs="Consolas" w:eastAsia="Consolas" w:hAnsi="Consolas"/>
+          <w:sz w:val="19"/>
+          <w:szCs w:val="19"/>
+        </w:rPr>
+        <w:t xml:space="preserve">Alter ok: 25</w:t>
+      </w:r>
+      <w:r>
+        <w:rPr>
+          <w:rFonts w:ascii="Consolas" w:cs="Consolas" w:eastAsia="Consolas" w:hAnsi="Consolas"/>
+          <w:sz w:val="19"/>
+          <w:szCs w:val="19"/>
+        </w:rPr>
+        <w:br/>
+        <w:t xml:space="preserve">Abgefangen: Alter darf nicht negativ sein</w:t>
+      </w:r>
+    </w:p>
+    <w:p>
+      <w:pPr>
+        <w:spacing w:after="180" w:line="312" w:lineRule="auto"/>
+      </w:pPr>
+      <w:r>
+        <w:rPr>
+          <w:sz w:val="22"/>
+          <w:szCs w:val="22"/>
+        </w:rPr>
+        <w:t xml:space="preserve">Schön zu sehen: pruefe(25) lief normal durch, pruefe(-5) warf den Fehler. Dieser sprang aus der SUB heraus bis zum CATCH im aufrufenden Code – so trennst du das Erkennen eines Problems (in der SUB) sauber von seiner Behandlung (im CATCH).</w:t>
+      </w:r>
+    </w:p>
+    <w:p>
+      <w:pPr>
+        <w:spacing w:before="60"/>
+      </w:pPr>
+    </w:p>
+    <w:tbl>
+      <w:tblPr>
+        <w:tblW w:type="dxa" w:w="9360"/>
+        <w:tblBorders>
+          <w:top w:val="single" w:color="auto" w:sz="4"/>
+          <w:left w:val="single" w:color="auto" w:sz="4"/>
+          <w:bottom w:val="single" w:color="auto" w:sz="4"/>
+          <w:right w:val="single" w:color="auto" w:sz="4"/>
+          <w:insideH w:val="single" w:color="auto" w:sz="4"/>
+          <w:insideV w:val="single" w:color="auto" w:sz="4"/>
+        </w:tblBorders>
+      </w:tblPr>
+      <w:tblGrid>
+        <w:gridCol w:w="9360"/>
+      </w:tblGrid>
+      <w:tr>
+        <w:trPr>
+          <w:cantSplit/>
+        </w:trPr>
+        <w:tc>
+          <w:tcPr>
+            <w:tcW w:type="dxa" w:w="9360"/>
+            <w:tcBorders>
+              <w:top w:val="single" w:color="E0B96A" w:sz="6"/>
+              <w:left w:val="single" w:color="E0B96A" w:sz="6"/>
+              <w:bottom w:val="single" w:color="E0B96A" w:sz="6"/>
+              <w:right w:val="single" w:color="E0B96A" w:sz="6"/>
+            </w:tcBorders>
+            <w:shd w:fill="FDF3E0" w:val="clear"/>
+            <w:tcMar>
+              <w:top w:type="dxa" w:w="140"/>
+              <w:left w:type="dxa" w:w="180"/>
+              <w:bottom w:type="dxa" w:w="140"/>
+              <w:right w:type="dxa" w:w="180"/>
+            </w:tcMar>
+          </w:tcPr>
+          <w:p>
+            <w:pPr>
+              <w:spacing w:after="40"/>
+            </w:pPr>
+            <w:r>
+              <w:rPr>
+                <w:b/>
+                <w:bCs/>
+                <w:color w:val="9A6A1E"/>
+                <w:sz w:val="22"/>
+                <w:szCs w:val="22"/>
+              </w:rPr>
+              <w:t xml:space="preserve">Merke</w:t>
+            </w:r>
+          </w:p>
+          <w:p>
+            <w:pPr>
+              <w:spacing w:after="0" w:line="312" w:lineRule="auto"/>
+            </w:pPr>
+            <w:r>
+              <w:rPr>
+                <w:sz w:val="22"/>
+                <w:szCs w:val="22"/>
+              </w:rPr>
+              <w:t xml:space="preserve">Die Variable nach CATCH ist optional. Interessiert dich die genaue Meldung nicht, schreibst du einfach CATCH ohne Namen – der Block fängt den Fehler trotzdem ab.</w:t>
+            </w:r>
+          </w:p>
+        </w:tc>
+      </w:tr>
+    </w:tbl>
+    <w:p>
+      <w:pPr>
+        <w:spacing w:after="160"/>
+      </w:pPr>
+    </w:p>
+    <w:p>
+      <w:pPr>
+        <w:pStyle w:val="Heading2"/>
+        <w:keepNext/>
+        <w:keepLines/>
+        <w:spacing w:after="120" w:before="280"/>
+      </w:pPr>
+      <w:r>
+        <w:t xml:space="preserve">Wann (und wann nicht) Fehlerbehandlung?</w:t>
+      </w:r>
+    </w:p>
+    <w:p>
+      <w:pPr>
+        <w:spacing w:after="180" w:line="312" w:lineRule="auto"/>
+      </w:pPr>
+      <w:r>
+        <w:rPr>
+          <w:sz w:val="22"/>
+          <w:szCs w:val="22"/>
+        </w:rPr>
+        <w:t xml:space="preserve">TRY/CATCH ist mächtig, aber kein Ersatz für gewöhnliche Verzweigungen. Nutze es für Dinge, die WIRKLICH außergewöhnlich sind und die du nicht einfach vorher prüfen kannst – eine fehlende Datei, eine kaputte Benutzereingabe, ein Netzwerkproblem. Für normale Fallunterscheidungen („hat der Spieler genug Gold?“) bleibt ein schlichtes IF die richtige und klarere Wahl.</w:t>
+      </w:r>
+    </w:p>
+    <w:p>
+      <w:pPr>
+        <w:spacing w:before="60"/>
+      </w:pPr>
+    </w:p>
+    <w:tbl>
+      <w:tblPr>
+        <w:tblW w:type="dxa" w:w="9360"/>
+        <w:tblBorders>
+          <w:top w:val="single" w:color="auto" w:sz="4"/>
+          <w:left w:val="single" w:color="auto" w:sz="4"/>
+          <w:bottom w:val="single" w:color="auto" w:sz="4"/>
+          <w:right w:val="single" w:color="auto" w:sz="4"/>
+          <w:insideH w:val="single" w:color="auto" w:sz="4"/>
+          <w:insideV w:val="single" w:color="auto" w:sz="4"/>
+        </w:tblBorders>
+      </w:tblPr>
+      <w:tblGrid>
+        <w:gridCol w:w="9360"/>
+      </w:tblGrid>
+      <w:tr>
+        <w:trPr>
+          <w:cantSplit/>
+        </w:trPr>
+        <w:tc>
+          <w:tcPr>
+            <w:tcW w:type="dxa" w:w="9360"/>
+            <w:tcBorders>
+              <w:top w:val="single" w:color="9CC8E6" w:sz="6"/>
+              <w:left w:val="single" w:color="9CC8E6" w:sz="6"/>
+              <w:bottom w:val="single" w:color="9CC8E6" w:sz="6"/>
+              <w:right w:val="single" w:color="9CC8E6" w:sz="6"/>
+            </w:tcBorders>
+            <w:shd w:fill="E7F2FA" w:val="clear"/>
+            <w:tcMar>
+              <w:top w:type="dxa" w:w="140"/>
+              <w:left w:type="dxa" w:w="180"/>
+              <w:bottom w:type="dxa" w:w="140"/>
+              <w:right w:type="dxa" w:w="180"/>
+            </w:tcMar>
+          </w:tcPr>
+          <w:p>
+            <w:pPr>
+              <w:spacing w:after="40"/>
+            </w:pPr>
+            <w:r>
+              <w:rPr>
+                <w:b/>
+                <w:bCs/>
+                <w:color w:val="1B6CA8"/>
+                <w:sz w:val="22"/>
+                <w:szCs w:val="22"/>
+              </w:rPr>
+              <w:t xml:space="preserve">Robuste Eingaben</w:t>
+            </w:r>
+          </w:p>
+          <w:p>
+            <w:pPr>
+              <w:spacing w:after="0" w:line="312" w:lineRule="auto"/>
+            </w:pPr>
+            <w:r>
+              <w:rPr>
+                <w:sz w:val="22"/>
+                <w:szCs w:val="22"/>
+              </w:rPr>
+              <w:t xml:space="preserve">Ein klassischer Einsatz: Du liest Text ein und willst eine Zahl daraus machen. Statt mit TRY/CATCH um VAL herumzubauen, ist hier oft TRYVAL(text, ersatz) (Kapitel „Strings“) die einfachere Lösung – es liefert bei ungültiger Eingabe still einen Ersatzwert. Greife zu TRY/CATCH, wenn es kein so bequemes Sicherheitsnetz gibt.</w:t>
             </w:r>
           </w:p>
         </w:tc>

</xml_diff>

<commit_message>
docs(buch): Lehrbuch Kap 25 -- Coroutinen (YIELD, ausfuehrlich)
YIELD macht FUNCTION/SUB zur Coroutine (Aufruf liefert COROUTINE-Handle,
startet nicht), CORO_RESUME treibt bis YIELD/Ende, CORO_DONE/CORO_RESULT,
FOR EACH treibt bis Ende (Warnung bei unendlichen Generatoren), CORO_SEND
fuer zweiweg-Dialog (YIELD ist Ausdruck), CORO_CLOSE. Use-Cases. Schwieriges
Thema mit "Funktion mit Pausenknopf"-Mentalmodell. Ausgaben gegen gbrt verifiziert.

Co-Authored-By: Claude Opus 4.8 (1M context) <noreply@anthropic.com>
</commit_message>
<xml_diff>
--- a/buch-referenz/buch/GameBasic-Lehrbuch.docx
+++ b/buch-referenz/buch/GameBasic-Lehrbuch.docx
@@ -651,6 +651,33 @@
           <w:szCs w:val="22"/>
         </w:rPr>
         <w:t xml:space="preserve">	78</w:t>
+      </w:r>
+    </w:p>
+    <w:p>
+      <w:pPr>
+        <w:tabs>
+          <w:tab w:val="right" w:pos="9200" w:leader="dot"/>
+        </w:tabs>
+        <w:spacing w:after="20" w:before="0"/>
+        <w:ind w:left="280"/>
+      </w:pPr>
+      <w:r>
+        <w:rPr>
+          <w:b w:val="false"/>
+          <w:bCs w:val="false"/>
+          <w:color w:val="222222"/>
+          <w:sz w:val="22"/>
+          <w:szCs w:val="22"/>
+        </w:rPr>
+        <w:t xml:space="preserve">Coroutinen</w:t>
+      </w:r>
+      <w:r>
+        <w:rPr>
+          <w:color w:val="555555"/>
+          <w:sz w:val="22"/>
+          <w:szCs w:val="22"/>
+        </w:rPr>
+        <w:t xml:space="preserve">	81</w:t>
       </w:r>
     </w:p>
     <w:p>
@@ -25442,6 +25469,1346 @@
                 <w:szCs w:val="22"/>
               </w:rPr>
               <w:t xml:space="preserve">Ein klassischer Einsatz: Du liest Text ein und willst eine Zahl daraus machen. Statt mit TRY/CATCH um VAL herumzubauen, ist hier oft TRYVAL(text, ersatz) (Kapitel „Strings“) die einfachere Lösung – es liefert bei ungültiger Eingabe still einen Ersatzwert. Greife zu TRY/CATCH, wenn es kein so bequemes Sicherheitsnetz gibt.</w:t>
+            </w:r>
+          </w:p>
+        </w:tc>
+      </w:tr>
+    </w:tbl>
+    <w:p>
+      <w:pPr>
+        <w:spacing w:after="160"/>
+      </w:pPr>
+    </w:p>
+    <w:p>
+      <w:pPr>
+        <w:pStyle w:val="Heading1"/>
+        <w:keepNext/>
+        <w:keepLines/>
+        <w:pageBreakBefore/>
+        <w:pBdr>
+          <w:bottom w:val="single" w:color="1B6CA8" w:sz="12" w:space="4"/>
+        </w:pBdr>
+        <w:spacing w:after="160" w:before="0"/>
+      </w:pPr>
+      <w:r>
+        <w:t xml:space="preserve">Coroutinen</w:t>
+      </w:r>
+    </w:p>
+    <w:p>
+      <w:pPr>
+        <w:spacing w:after="180" w:line="312" w:lineRule="auto"/>
+      </w:pPr>
+      <w:r>
+        <w:rPr>
+          <w:sz w:val="22"/>
+          <w:szCs w:val="22"/>
+        </w:rPr>
+        <w:t xml:space="preserve">Eine gewöhnliche Funktion läuft von oben bis zum RETURN durch und ist dann fertig. Eine Coroutine kann mehr: Sie darf sich mitten in der Ausführung anhalten, einen Wert nach draußen reichen – und später genau dort weiterlaufen, wo sie stehen geblieben ist. Sie merkt sich dabei ihren kompletten Zustand: alle lokalen Variablen, die Stelle im Code, alles. Man kann sie sich wie eine Funktion mit Pausenknopf vorstellen.</w:t>
+      </w:r>
+    </w:p>
+    <w:p>
+      <w:pPr>
+        <w:spacing w:after="180" w:line="312" w:lineRule="auto"/>
+      </w:pPr>
+      <w:r>
+        <w:rPr>
+          <w:sz w:val="22"/>
+          <w:szCs w:val="22"/>
+        </w:rPr>
+        <w:t xml:space="preserve">Das klingt exotisch, ist aber für Spiele Gold wert: Zwischensequenzen, die Schritt für Schritt ablaufen; Gegner-Muster, die eine Weile dies und dann jenes tun; oder das Erzeugen einer endlosen Zahlenfolge, Wert für Wert. Dieses Kapitel ist anspruchsvoll – lass dir Zeit und probiere die Beispiele selbst aus.</w:t>
+      </w:r>
+    </w:p>
+    <w:p>
+      <w:pPr>
+        <w:pStyle w:val="Heading2"/>
+        <w:keepNext/>
+        <w:keepLines/>
+        <w:spacing w:after="120" w:before="280"/>
+      </w:pPr>
+      <w:r>
+        <w:t xml:space="preserve">Was eine Coroutine zur Coroutine macht</w:t>
+      </w:r>
+    </w:p>
+    <w:p>
+      <w:pPr>
+        <w:spacing w:after="180" w:line="312" w:lineRule="auto"/>
+      </w:pPr>
+      <w:r>
+        <w:rPr>
+          <w:sz w:val="22"/>
+          <w:szCs w:val="22"/>
+        </w:rPr>
+        <w:t xml:space="preserve">Du brauchst kein besonderes Schlüsselwort bei der Definition. Sobald im Körper einer FUNCTION (oder SUB) irgendwo ein YIELD steht, ist sie automatisch eine Coroutine. YIELD bedeutet „halte hier an und reiche diesen Wert nach draußen“.</w:t>
+      </w:r>
+    </w:p>
+    <w:p>
+      <w:pPr>
+        <w:spacing w:after="180" w:line="312" w:lineRule="auto"/>
+      </w:pPr>
+      <w:r>
+        <w:rPr>
+          <w:sz w:val="22"/>
+          <w:szCs w:val="22"/>
+        </w:rPr>
+        <w:t xml:space="preserve">Und jetzt das Überraschende: Rufst du eine Coroutine auf, läuft ihr Code zunächst GAR NICHT. Stattdessen bekommst du ein Handle zurück – eine Art Fernbedienung für die pausierte Coroutine, die du in einer Variablen vom Typ COROUTINE aufbewahrst. Erst CORO_RESUME startet und treibt sie an.</w:t>
+      </w:r>
+    </w:p>
+    <w:p>
+      <w:pPr>
+        <w:keepNext/>
+        <w:keepLines/>
+        <w:pBdr>
+          <w:bottom w:val="single" w:color="DDD0C0" w:sz="4" w:space="2"/>
+        </w:pBdr>
+        <w:spacing w:after="40" w:before="360"/>
+      </w:pPr>
+      <w:r>
+        <w:rPr>
+          <w:rFonts w:ascii="Consolas" w:cs="Consolas" w:eastAsia="Consolas" w:hAnsi="Consolas"/>
+          <w:b/>
+          <w:bCs/>
+          <w:color w:val="9A3412"/>
+          <w:sz w:val="24"/>
+          <w:szCs w:val="24"/>
+        </w:rPr>
+        <w:t xml:space="preserve">YIELD  /  CORO_RESUME</w:t>
+      </w:r>
+    </w:p>
+    <w:p>
+      <w:pPr>
+        <w:keepNext/>
+        <w:spacing w:after="120"/>
+      </w:pPr>
+      <w:r>
+        <w:rPr>
+          <w:b/>
+          <w:bCs/>
+          <w:color w:val="6A6A6A"/>
+          <w:sz w:val="18"/>
+          <w:szCs w:val="18"/>
+        </w:rPr>
+        <w:t xml:space="preserve">Syntax:  </w:t>
+      </w:r>
+      <w:r>
+        <w:rPr>
+          <w:rFonts w:ascii="Consolas" w:cs="Consolas" w:eastAsia="Consolas" w:hAnsi="Consolas"/>
+          <w:color w:val="335577"/>
+          <w:sz w:val="19"/>
+          <w:szCs w:val="19"/>
+        </w:rPr>
+        <w:t xml:space="preserve">YIELD wert        CORO_RESUME(c)</w:t>
+      </w:r>
+    </w:p>
+    <w:p>
+      <w:pPr>
+        <w:spacing w:after="180" w:line="312" w:lineRule="auto"/>
+      </w:pPr>
+      <w:r>
+        <w:rPr>
+          <w:sz w:val="22"/>
+          <w:szCs w:val="22"/>
+        </w:rPr>
+        <w:t xml:space="preserve">YIELD hält die Coroutine an und gibt einen Wert nach außen. CORO_RESUME setzt sie bis zum nächsten YIELD fort und liefert dessen Wert. Läuft die Coroutine in diesem Schritt zu Ende, liefert CORO_RESUME stattdessen ihren RETURN-Wert.</w:t>
+      </w:r>
+    </w:p>
+    <w:p>
+      <w:pPr>
+        <w:keepNext/>
+        <w:spacing w:after="30" w:before="120"/>
+      </w:pPr>
+      <w:r>
+        <w:rPr>
+          <w:b/>
+          <w:bCs/>
+          <w:i/>
+          <w:iCs/>
+          <w:color w:val="6A6A6A"/>
+          <w:sz w:val="18"/>
+          <w:szCs w:val="18"/>
+        </w:rPr>
+        <w:t xml:space="preserve">Beispiel</w:t>
+      </w:r>
+    </w:p>
+    <w:p>
+      <w:pPr>
+        <w:keepLines/>
+        <w:pBdr>
+          <w:left w:val="single" w:color="1B6CA8" w:sz="18" w:space="6"/>
+        </w:pBdr>
+        <w:shd w:fill="F4F4F4" w:val="clear"/>
+        <w:spacing w:after="200" w:before="100" w:line="264" w:lineRule="auto"/>
+        <w:ind w:left="140"/>
+      </w:pPr>
+      <w:r>
+        <w:rPr>
+          <w:rFonts w:ascii="Consolas" w:cs="Consolas" w:eastAsia="Consolas" w:hAnsi="Consolas"/>
+          <w:sz w:val="19"/>
+          <w:szCs w:val="19"/>
+        </w:rPr>
+        <w:t xml:space="preserve">FUNCTION zaehler() AS INTEGER</w:t>
+      </w:r>
+      <w:r>
+        <w:rPr>
+          <w:rFonts w:ascii="Consolas" w:cs="Consolas" w:eastAsia="Consolas" w:hAnsi="Consolas"/>
+          <w:sz w:val="19"/>
+          <w:szCs w:val="19"/>
+        </w:rPr>
+        <w:br/>
+        <w:t xml:space="preserve">    YIELD 1</w:t>
+      </w:r>
+      <w:r>
+        <w:rPr>
+          <w:rFonts w:ascii="Consolas" w:cs="Consolas" w:eastAsia="Consolas" w:hAnsi="Consolas"/>
+          <w:sz w:val="19"/>
+          <w:szCs w:val="19"/>
+        </w:rPr>
+        <w:br/>
+        <w:t xml:space="preserve">    YIELD 2</w:t>
+      </w:r>
+      <w:r>
+        <w:rPr>
+          <w:rFonts w:ascii="Consolas" w:cs="Consolas" w:eastAsia="Consolas" w:hAnsi="Consolas"/>
+          <w:sz w:val="19"/>
+          <w:szCs w:val="19"/>
+        </w:rPr>
+        <w:br/>
+        <w:t xml:space="preserve">    YIELD 3</w:t>
+      </w:r>
+      <w:r>
+        <w:rPr>
+          <w:rFonts w:ascii="Consolas" w:cs="Consolas" w:eastAsia="Consolas" w:hAnsi="Consolas"/>
+          <w:sz w:val="19"/>
+          <w:szCs w:val="19"/>
+        </w:rPr>
+        <w:br/>
+        <w:t xml:space="preserve">    RETURN 99</w:t>
+      </w:r>
+      <w:r>
+        <w:rPr>
+          <w:rFonts w:ascii="Consolas" w:cs="Consolas" w:eastAsia="Consolas" w:hAnsi="Consolas"/>
+          <w:sz w:val="19"/>
+          <w:szCs w:val="19"/>
+        </w:rPr>
+        <w:br/>
+        <w:t xml:space="preserve">END FUNCTION</w:t>
+      </w:r>
+      <w:r>
+        <w:rPr>
+          <w:rFonts w:ascii="Consolas" w:cs="Consolas" w:eastAsia="Consolas" w:hAnsi="Consolas"/>
+          <w:sz w:val="19"/>
+          <w:szCs w:val="19"/>
+        </w:rPr>
+        <w:br/>
+        <w:t xml:space="preserve"/>
+      </w:r>
+      <w:r>
+        <w:rPr>
+          <w:rFonts w:ascii="Consolas" w:cs="Consolas" w:eastAsia="Consolas" w:hAnsi="Consolas"/>
+          <w:sz w:val="19"/>
+          <w:szCs w:val="19"/>
+        </w:rPr>
+        <w:br/>
+        <w:t xml:space="preserve">DIM c AS COROUTINE</w:t>
+      </w:r>
+      <w:r>
+        <w:rPr>
+          <w:rFonts w:ascii="Consolas" w:cs="Consolas" w:eastAsia="Consolas" w:hAnsi="Consolas"/>
+          <w:sz w:val="19"/>
+          <w:szCs w:val="19"/>
+        </w:rPr>
+        <w:br/>
+        <w:t xml:space="preserve">c = zaehler()           ' startet NICHT – liefert ein Handle</w:t>
+      </w:r>
+      <w:r>
+        <w:rPr>
+          <w:rFonts w:ascii="Consolas" w:cs="Consolas" w:eastAsia="Consolas" w:hAnsi="Consolas"/>
+          <w:sz w:val="19"/>
+          <w:szCs w:val="19"/>
+        </w:rPr>
+        <w:br/>
+        <w:t xml:space="preserve">PRINT CORO_RESUME(c)    ' läuft bis YIELD 1</w:t>
+      </w:r>
+      <w:r>
+        <w:rPr>
+          <w:rFonts w:ascii="Consolas" w:cs="Consolas" w:eastAsia="Consolas" w:hAnsi="Consolas"/>
+          <w:sz w:val="19"/>
+          <w:szCs w:val="19"/>
+        </w:rPr>
+        <w:br/>
+        <w:t xml:space="preserve">PRINT CORO_RESUME(c)    ' weiter bis YIELD 2</w:t>
+      </w:r>
+      <w:r>
+        <w:rPr>
+          <w:rFonts w:ascii="Consolas" w:cs="Consolas" w:eastAsia="Consolas" w:hAnsi="Consolas"/>
+          <w:sz w:val="19"/>
+          <w:szCs w:val="19"/>
+        </w:rPr>
+        <w:br/>
+        <w:t xml:space="preserve">PRINT CORO_RESUME(c)    ' weiter bis YIELD 3</w:t>
+      </w:r>
+      <w:r>
+        <w:rPr>
+          <w:rFonts w:ascii="Consolas" w:cs="Consolas" w:eastAsia="Consolas" w:hAnsi="Consolas"/>
+          <w:sz w:val="19"/>
+          <w:szCs w:val="19"/>
+        </w:rPr>
+        <w:br/>
+        <w:t xml:space="preserve">PRINT CORO_RESUME(c)    ' läuft zu Ende: der RETURN-Wert</w:t>
+      </w:r>
+    </w:p>
+    <w:p>
+      <w:pPr>
+        <w:keepNext/>
+        <w:spacing w:after="30" w:before="120"/>
+      </w:pPr>
+      <w:r>
+        <w:rPr>
+          <w:b/>
+          <w:bCs/>
+          <w:i/>
+          <w:iCs/>
+          <w:color w:val="6A6A6A"/>
+          <w:sz w:val="18"/>
+          <w:szCs w:val="18"/>
+        </w:rPr>
+        <w:t xml:space="preserve">Ausgabe</w:t>
+      </w:r>
+    </w:p>
+    <w:p>
+      <w:pPr>
+        <w:keepLines/>
+        <w:pBdr>
+          <w:left w:val="single" w:color="9AC79A" w:sz="18" w:space="6"/>
+        </w:pBdr>
+        <w:shd w:fill="EAF4EA" w:val="clear"/>
+        <w:spacing w:after="200" w:before="100" w:line="264" w:lineRule="auto"/>
+        <w:ind w:left="140"/>
+      </w:pPr>
+      <w:r>
+        <w:rPr>
+          <w:rFonts w:ascii="Consolas" w:cs="Consolas" w:eastAsia="Consolas" w:hAnsi="Consolas"/>
+          <w:sz w:val="19"/>
+          <w:szCs w:val="19"/>
+        </w:rPr>
+        <w:t xml:space="preserve">1</w:t>
+      </w:r>
+      <w:r>
+        <w:rPr>
+          <w:rFonts w:ascii="Consolas" w:cs="Consolas" w:eastAsia="Consolas" w:hAnsi="Consolas"/>
+          <w:sz w:val="19"/>
+          <w:szCs w:val="19"/>
+        </w:rPr>
+        <w:br/>
+        <w:t xml:space="preserve">2</w:t>
+      </w:r>
+      <w:r>
+        <w:rPr>
+          <w:rFonts w:ascii="Consolas" w:cs="Consolas" w:eastAsia="Consolas" w:hAnsi="Consolas"/>
+          <w:sz w:val="19"/>
+          <w:szCs w:val="19"/>
+        </w:rPr>
+        <w:br/>
+        <w:t xml:space="preserve">3</w:t>
+      </w:r>
+      <w:r>
+        <w:rPr>
+          <w:rFonts w:ascii="Consolas" w:cs="Consolas" w:eastAsia="Consolas" w:hAnsi="Consolas"/>
+          <w:sz w:val="19"/>
+          <w:szCs w:val="19"/>
+        </w:rPr>
+        <w:br/>
+        <w:t xml:space="preserve">99</w:t>
+      </w:r>
+    </w:p>
+    <w:p>
+      <w:pPr>
+        <w:spacing w:after="180" w:line="312" w:lineRule="auto"/>
+      </w:pPr>
+      <w:r>
+        <w:rPr>
+          <w:sz w:val="22"/>
+          <w:szCs w:val="22"/>
+        </w:rPr>
+        <w:t xml:space="preserve">Jeder CORO_RESUME nimmt den Faden dort wieder auf, wo das letzte YIELD ihn fallen ließ. Die Coroutine erinnert sich an alles dazwischen.</w:t>
+      </w:r>
+    </w:p>
+    <w:p>
+      <w:pPr>
+        <w:pStyle w:val="Heading2"/>
+        <w:keepNext/>
+        <w:keepLines/>
+        <w:spacing w:after="120" w:before="280"/>
+      </w:pPr>
+      <w:r>
+        <w:t xml:space="preserve">Ist sie fertig? CORO_DONE und CORO_RESULT</w:t>
+      </w:r>
+    </w:p>
+    <w:p>
+      <w:pPr>
+        <w:spacing w:after="180" w:line="312" w:lineRule="auto"/>
+      </w:pPr>
+      <w:r>
+        <w:rPr>
+          <w:sz w:val="22"/>
+          <w:szCs w:val="22"/>
+        </w:rPr>
+        <w:t xml:space="preserve">Mit CORO_DONE fragst du, ob eine Coroutine durchgelaufen ist. Ihren endgültigen RETURN-Wert kannst du danach jederzeit mit CORO_RESULT abholen.</w:t>
+      </w:r>
+    </w:p>
+    <w:p>
+      <w:pPr>
+        <w:keepNext/>
+        <w:keepLines/>
+        <w:pBdr>
+          <w:bottom w:val="single" w:color="DDD0C0" w:sz="4" w:space="2"/>
+        </w:pBdr>
+        <w:spacing w:after="40" w:before="360"/>
+      </w:pPr>
+      <w:r>
+        <w:rPr>
+          <w:rFonts w:ascii="Consolas" w:cs="Consolas" w:eastAsia="Consolas" w:hAnsi="Consolas"/>
+          <w:b/>
+          <w:bCs/>
+          <w:color w:val="9A3412"/>
+          <w:sz w:val="24"/>
+          <w:szCs w:val="24"/>
+        </w:rPr>
+        <w:t xml:space="preserve">CORO_DONE  /  CORO_RESULT</w:t>
+      </w:r>
+    </w:p>
+    <w:p>
+      <w:pPr>
+        <w:keepNext/>
+        <w:spacing w:after="120"/>
+      </w:pPr>
+      <w:r>
+        <w:rPr>
+          <w:b/>
+          <w:bCs/>
+          <w:color w:val="6A6A6A"/>
+          <w:sz w:val="18"/>
+          <w:szCs w:val="18"/>
+        </w:rPr>
+        <w:t xml:space="preserve">Syntax:  </w:t>
+      </w:r>
+      <w:r>
+        <w:rPr>
+          <w:rFonts w:ascii="Consolas" w:cs="Consolas" w:eastAsia="Consolas" w:hAnsi="Consolas"/>
+          <w:color w:val="335577"/>
+          <w:sz w:val="19"/>
+          <w:szCs w:val="19"/>
+        </w:rPr>
+        <w:t xml:space="preserve">CORO_DONE(c)        CORO_RESULT(c)</w:t>
+      </w:r>
+    </w:p>
+    <w:p>
+      <w:pPr>
+        <w:spacing w:after="180" w:line="312" w:lineRule="auto"/>
+      </w:pPr>
+      <w:r>
+        <w:rPr>
+          <w:sz w:val="22"/>
+          <w:szCs w:val="22"/>
+        </w:rPr>
+        <w:t xml:space="preserve">CORO_DONE liefert TRUE, sobald die Coroutine beendet ist. CORO_RESULT liefert ihren finalen RETURN-Wert (erst sinnvoll, wenn sie fertig ist).</w:t>
+      </w:r>
+    </w:p>
+    <w:p>
+      <w:pPr>
+        <w:keepNext/>
+        <w:spacing w:after="30" w:before="120"/>
+      </w:pPr>
+      <w:r>
+        <w:rPr>
+          <w:b/>
+          <w:bCs/>
+          <w:i/>
+          <w:iCs/>
+          <w:color w:val="6A6A6A"/>
+          <w:sz w:val="18"/>
+          <w:szCs w:val="18"/>
+        </w:rPr>
+        <w:t xml:space="preserve">Beispiel</w:t>
+      </w:r>
+    </w:p>
+    <w:p>
+      <w:pPr>
+        <w:keepLines/>
+        <w:pBdr>
+          <w:left w:val="single" w:color="1B6CA8" w:sz="18" w:space="6"/>
+        </w:pBdr>
+        <w:shd w:fill="F4F4F4" w:val="clear"/>
+        <w:spacing w:after="200" w:before="100" w:line="264" w:lineRule="auto"/>
+        <w:ind w:left="140"/>
+      </w:pPr>
+      <w:r>
+        <w:rPr>
+          <w:rFonts w:ascii="Consolas" w:cs="Consolas" w:eastAsia="Consolas" w:hAnsi="Consolas"/>
+          <w:sz w:val="19"/>
+          <w:szCs w:val="19"/>
+        </w:rPr>
+        <w:t xml:space="preserve">FUNCTION zaehler() AS INTEGER</w:t>
+      </w:r>
+      <w:r>
+        <w:rPr>
+          <w:rFonts w:ascii="Consolas" w:cs="Consolas" w:eastAsia="Consolas" w:hAnsi="Consolas"/>
+          <w:sz w:val="19"/>
+          <w:szCs w:val="19"/>
+        </w:rPr>
+        <w:br/>
+        <w:t xml:space="preserve">    YIELD 1</w:t>
+      </w:r>
+      <w:r>
+        <w:rPr>
+          <w:rFonts w:ascii="Consolas" w:cs="Consolas" w:eastAsia="Consolas" w:hAnsi="Consolas"/>
+          <w:sz w:val="19"/>
+          <w:szCs w:val="19"/>
+        </w:rPr>
+        <w:br/>
+        <w:t xml:space="preserve">    RETURN 99</w:t>
+      </w:r>
+      <w:r>
+        <w:rPr>
+          <w:rFonts w:ascii="Consolas" w:cs="Consolas" w:eastAsia="Consolas" w:hAnsi="Consolas"/>
+          <w:sz w:val="19"/>
+          <w:szCs w:val="19"/>
+        </w:rPr>
+        <w:br/>
+        <w:t xml:space="preserve">END FUNCTION</w:t>
+      </w:r>
+      <w:r>
+        <w:rPr>
+          <w:rFonts w:ascii="Consolas" w:cs="Consolas" w:eastAsia="Consolas" w:hAnsi="Consolas"/>
+          <w:sz w:val="19"/>
+          <w:szCs w:val="19"/>
+        </w:rPr>
+        <w:br/>
+        <w:t xml:space="preserve"/>
+      </w:r>
+      <w:r>
+        <w:rPr>
+          <w:rFonts w:ascii="Consolas" w:cs="Consolas" w:eastAsia="Consolas" w:hAnsi="Consolas"/>
+          <w:sz w:val="19"/>
+          <w:szCs w:val="19"/>
+        </w:rPr>
+        <w:br/>
+        <w:t xml:space="preserve">DIM c AS COROUTINE</w:t>
+      </w:r>
+      <w:r>
+        <w:rPr>
+          <w:rFonts w:ascii="Consolas" w:cs="Consolas" w:eastAsia="Consolas" w:hAnsi="Consolas"/>
+          <w:sz w:val="19"/>
+          <w:szCs w:val="19"/>
+        </w:rPr>
+        <w:br/>
+        <w:t xml:space="preserve">c = zaehler()</w:t>
+      </w:r>
+      <w:r>
+        <w:rPr>
+          <w:rFonts w:ascii="Consolas" w:cs="Consolas" w:eastAsia="Consolas" w:hAnsi="Consolas"/>
+          <w:sz w:val="19"/>
+          <w:szCs w:val="19"/>
+        </w:rPr>
+        <w:br/>
+        <w:t xml:space="preserve">PRINT CORO_RESUME(c)</w:t>
+      </w:r>
+      <w:r>
+        <w:rPr>
+          <w:rFonts w:ascii="Consolas" w:cs="Consolas" w:eastAsia="Consolas" w:hAnsi="Consolas"/>
+          <w:sz w:val="19"/>
+          <w:szCs w:val="19"/>
+        </w:rPr>
+        <w:br/>
+        <w:t xml:space="preserve">PRINT "fertig? "; CORO_DONE(c)</w:t>
+      </w:r>
+      <w:r>
+        <w:rPr>
+          <w:rFonts w:ascii="Consolas" w:cs="Consolas" w:eastAsia="Consolas" w:hAnsi="Consolas"/>
+          <w:sz w:val="19"/>
+          <w:szCs w:val="19"/>
+        </w:rPr>
+        <w:br/>
+        <w:t xml:space="preserve">PRINT CORO_RESUME(c)        ' jetzt läuft sie zu Ende</w:t>
+      </w:r>
+      <w:r>
+        <w:rPr>
+          <w:rFonts w:ascii="Consolas" w:cs="Consolas" w:eastAsia="Consolas" w:hAnsi="Consolas"/>
+          <w:sz w:val="19"/>
+          <w:szCs w:val="19"/>
+        </w:rPr>
+        <w:br/>
+        <w:t xml:space="preserve">PRINT "fertig? "; CORO_DONE(c)</w:t>
+      </w:r>
+      <w:r>
+        <w:rPr>
+          <w:rFonts w:ascii="Consolas" w:cs="Consolas" w:eastAsia="Consolas" w:hAnsi="Consolas"/>
+          <w:sz w:val="19"/>
+          <w:szCs w:val="19"/>
+        </w:rPr>
+        <w:br/>
+        <w:t xml:space="preserve">PRINT "Ergebnis: "; CORO_RESULT(c)</w:t>
+      </w:r>
+    </w:p>
+    <w:p>
+      <w:pPr>
+        <w:keepNext/>
+        <w:spacing w:after="30" w:before="120"/>
+      </w:pPr>
+      <w:r>
+        <w:rPr>
+          <w:b/>
+          <w:bCs/>
+          <w:i/>
+          <w:iCs/>
+          <w:color w:val="6A6A6A"/>
+          <w:sz w:val="18"/>
+          <w:szCs w:val="18"/>
+        </w:rPr>
+        <w:t xml:space="preserve">Ausgabe</w:t>
+      </w:r>
+    </w:p>
+    <w:p>
+      <w:pPr>
+        <w:keepLines/>
+        <w:pBdr>
+          <w:left w:val="single" w:color="9AC79A" w:sz="18" w:space="6"/>
+        </w:pBdr>
+        <w:shd w:fill="EAF4EA" w:val="clear"/>
+        <w:spacing w:after="200" w:before="100" w:line="264" w:lineRule="auto"/>
+        <w:ind w:left="140"/>
+      </w:pPr>
+      <w:r>
+        <w:rPr>
+          <w:rFonts w:ascii="Consolas" w:cs="Consolas" w:eastAsia="Consolas" w:hAnsi="Consolas"/>
+          <w:sz w:val="19"/>
+          <w:szCs w:val="19"/>
+        </w:rPr>
+        <w:t xml:space="preserve">1</w:t>
+      </w:r>
+      <w:r>
+        <w:rPr>
+          <w:rFonts w:ascii="Consolas" w:cs="Consolas" w:eastAsia="Consolas" w:hAnsi="Consolas"/>
+          <w:sz w:val="19"/>
+          <w:szCs w:val="19"/>
+        </w:rPr>
+        <w:br/>
+        <w:t xml:space="preserve">fertig? FALSE</w:t>
+      </w:r>
+      <w:r>
+        <w:rPr>
+          <w:rFonts w:ascii="Consolas" w:cs="Consolas" w:eastAsia="Consolas" w:hAnsi="Consolas"/>
+          <w:sz w:val="19"/>
+          <w:szCs w:val="19"/>
+        </w:rPr>
+        <w:br/>
+        <w:t xml:space="preserve">99</w:t>
+      </w:r>
+      <w:r>
+        <w:rPr>
+          <w:rFonts w:ascii="Consolas" w:cs="Consolas" w:eastAsia="Consolas" w:hAnsi="Consolas"/>
+          <w:sz w:val="19"/>
+          <w:szCs w:val="19"/>
+        </w:rPr>
+        <w:br/>
+        <w:t xml:space="preserve">fertig? TRUE</w:t>
+      </w:r>
+      <w:r>
+        <w:rPr>
+          <w:rFonts w:ascii="Consolas" w:cs="Consolas" w:eastAsia="Consolas" w:hAnsi="Consolas"/>
+          <w:sz w:val="19"/>
+          <w:szCs w:val="19"/>
+        </w:rPr>
+        <w:br/>
+        <w:t xml:space="preserve">Ergebnis: 99</w:t>
+      </w:r>
+    </w:p>
+    <w:p>
+      <w:pPr>
+        <w:pStyle w:val="Heading2"/>
+        <w:keepNext/>
+        <w:keepLines/>
+        <w:spacing w:after="120" w:before="280"/>
+      </w:pPr>
+      <w:r>
+        <w:t xml:space="preserve">Der bequeme Weg: FOR EACH</w:t>
+      </w:r>
+    </w:p>
+    <w:p>
+      <w:pPr>
+        <w:spacing w:after="180" w:line="312" w:lineRule="auto"/>
+      </w:pPr>
+      <w:r>
+        <w:rPr>
+          <w:sz w:val="22"/>
+          <w:szCs w:val="22"/>
+        </w:rPr>
+        <w:t xml:space="preserve">Willst du einfach nur alle Werte einsammeln, die eine Coroutine nach und nach ausspuckt, musst du nicht selbst mit RESUME und DONE hantieren. FOR EACH treibt die Coroutine automatisch bis zum Ende und reicht dir jeden gelieferten Wert. Das ist die klarste Art, eine erzeugende Coroutine (einen „Generator“) zu durchlaufen.</w:t>
+      </w:r>
+    </w:p>
+    <w:p>
+      <w:pPr>
+        <w:spacing w:after="180" w:line="312" w:lineRule="auto"/>
+      </w:pPr>
+      <w:r>
+        <w:rPr>
+          <w:sz w:val="22"/>
+          <w:szCs w:val="22"/>
+        </w:rPr>
+        <w:t xml:space="preserve">Hier eine Coroutine, die die Fibonacci-Folge erzeugt – sie hält nach jeder Zahl an und rechnet beim nächsten Mal weiter:</w:t>
+      </w:r>
+    </w:p>
+    <w:p>
+      <w:pPr>
+        <w:keepLines/>
+        <w:pBdr>
+          <w:left w:val="single" w:color="1B6CA8" w:sz="18" w:space="6"/>
+        </w:pBdr>
+        <w:shd w:fill="F4F4F4" w:val="clear"/>
+        <w:spacing w:after="200" w:before="100" w:line="264" w:lineRule="auto"/>
+        <w:ind w:left="140"/>
+      </w:pPr>
+      <w:r>
+        <w:rPr>
+          <w:rFonts w:ascii="Consolas" w:cs="Consolas" w:eastAsia="Consolas" w:hAnsi="Consolas"/>
+          <w:sz w:val="19"/>
+          <w:szCs w:val="19"/>
+        </w:rPr>
+        <w:t xml:space="preserve">FUNCTION fibo(anzahl AS INTEGER) AS INTEGER</w:t>
+      </w:r>
+      <w:r>
+        <w:rPr>
+          <w:rFonts w:ascii="Consolas" w:cs="Consolas" w:eastAsia="Consolas" w:hAnsi="Consolas"/>
+          <w:sz w:val="19"/>
+          <w:szCs w:val="19"/>
+        </w:rPr>
+        <w:br/>
+        <w:t xml:space="preserve">    DIM a AS INTEGER</w:t>
+      </w:r>
+      <w:r>
+        <w:rPr>
+          <w:rFonts w:ascii="Consolas" w:cs="Consolas" w:eastAsia="Consolas" w:hAnsi="Consolas"/>
+          <w:sz w:val="19"/>
+          <w:szCs w:val="19"/>
+        </w:rPr>
+        <w:br/>
+        <w:t xml:space="preserve">    DIM b AS INTEGER</w:t>
+      </w:r>
+      <w:r>
+        <w:rPr>
+          <w:rFonts w:ascii="Consolas" w:cs="Consolas" w:eastAsia="Consolas" w:hAnsi="Consolas"/>
+          <w:sz w:val="19"/>
+          <w:szCs w:val="19"/>
+        </w:rPr>
+        <w:br/>
+        <w:t xml:space="preserve">    DIM i AS INTEGER</w:t>
+      </w:r>
+      <w:r>
+        <w:rPr>
+          <w:rFonts w:ascii="Consolas" w:cs="Consolas" w:eastAsia="Consolas" w:hAnsi="Consolas"/>
+          <w:sz w:val="19"/>
+          <w:szCs w:val="19"/>
+        </w:rPr>
+        <w:br/>
+        <w:t xml:space="preserve">    a = 0 : b = 1</w:t>
+      </w:r>
+      <w:r>
+        <w:rPr>
+          <w:rFonts w:ascii="Consolas" w:cs="Consolas" w:eastAsia="Consolas" w:hAnsi="Consolas"/>
+          <w:sz w:val="19"/>
+          <w:szCs w:val="19"/>
+        </w:rPr>
+        <w:br/>
+        <w:t xml:space="preserve">    FOR i = 1 TO anzahl</w:t>
+      </w:r>
+      <w:r>
+        <w:rPr>
+          <w:rFonts w:ascii="Consolas" w:cs="Consolas" w:eastAsia="Consolas" w:hAnsi="Consolas"/>
+          <w:sz w:val="19"/>
+          <w:szCs w:val="19"/>
+        </w:rPr>
+        <w:br/>
+        <w:t xml:space="preserve">        YIELD a               ' Zahl rausgeben, dann pausieren</w:t>
+      </w:r>
+      <w:r>
+        <w:rPr>
+          <w:rFonts w:ascii="Consolas" w:cs="Consolas" w:eastAsia="Consolas" w:hAnsi="Consolas"/>
+          <w:sz w:val="19"/>
+          <w:szCs w:val="19"/>
+        </w:rPr>
+        <w:br/>
+        <w:t xml:space="preserve">        DIM tmp AS INTEGER</w:t>
+      </w:r>
+      <w:r>
+        <w:rPr>
+          <w:rFonts w:ascii="Consolas" w:cs="Consolas" w:eastAsia="Consolas" w:hAnsi="Consolas"/>
+          <w:sz w:val="19"/>
+          <w:szCs w:val="19"/>
+        </w:rPr>
+        <w:br/>
+        <w:t xml:space="preserve">        tmp = a + b</w:t>
+      </w:r>
+      <w:r>
+        <w:rPr>
+          <w:rFonts w:ascii="Consolas" w:cs="Consolas" w:eastAsia="Consolas" w:hAnsi="Consolas"/>
+          <w:sz w:val="19"/>
+          <w:szCs w:val="19"/>
+        </w:rPr>
+        <w:br/>
+        <w:t xml:space="preserve">        a = b</w:t>
+      </w:r>
+      <w:r>
+        <w:rPr>
+          <w:rFonts w:ascii="Consolas" w:cs="Consolas" w:eastAsia="Consolas" w:hAnsi="Consolas"/>
+          <w:sz w:val="19"/>
+          <w:szCs w:val="19"/>
+        </w:rPr>
+        <w:br/>
+        <w:t xml:space="preserve">        b = tmp</w:t>
+      </w:r>
+      <w:r>
+        <w:rPr>
+          <w:rFonts w:ascii="Consolas" w:cs="Consolas" w:eastAsia="Consolas" w:hAnsi="Consolas"/>
+          <w:sz w:val="19"/>
+          <w:szCs w:val="19"/>
+        </w:rPr>
+        <w:br/>
+        <w:t xml:space="preserve">    NEXT</w:t>
+      </w:r>
+      <w:r>
+        <w:rPr>
+          <w:rFonts w:ascii="Consolas" w:cs="Consolas" w:eastAsia="Consolas" w:hAnsi="Consolas"/>
+          <w:sz w:val="19"/>
+          <w:szCs w:val="19"/>
+        </w:rPr>
+        <w:br/>
+        <w:t xml:space="preserve">END FUNCTION</w:t>
+      </w:r>
+      <w:r>
+        <w:rPr>
+          <w:rFonts w:ascii="Consolas" w:cs="Consolas" w:eastAsia="Consolas" w:hAnsi="Consolas"/>
+          <w:sz w:val="19"/>
+          <w:szCs w:val="19"/>
+        </w:rPr>
+        <w:br/>
+        <w:t xml:space="preserve"/>
+      </w:r>
+      <w:r>
+        <w:rPr>
+          <w:rFonts w:ascii="Consolas" w:cs="Consolas" w:eastAsia="Consolas" w:hAnsi="Consolas"/>
+          <w:sz w:val="19"/>
+          <w:szCs w:val="19"/>
+        </w:rPr>
+        <w:br/>
+        <w:t xml:space="preserve">FOR EACH zahl IN fibo(8)</w:t>
+      </w:r>
+      <w:r>
+        <w:rPr>
+          <w:rFonts w:ascii="Consolas" w:cs="Consolas" w:eastAsia="Consolas" w:hAnsi="Consolas"/>
+          <w:sz w:val="19"/>
+          <w:szCs w:val="19"/>
+        </w:rPr>
+        <w:br/>
+        <w:t xml:space="preserve">    PRINT zahl; " ";</w:t>
+      </w:r>
+      <w:r>
+        <w:rPr>
+          <w:rFonts w:ascii="Consolas" w:cs="Consolas" w:eastAsia="Consolas" w:hAnsi="Consolas"/>
+          <w:sz w:val="19"/>
+          <w:szCs w:val="19"/>
+        </w:rPr>
+        <w:br/>
+        <w:t xml:space="preserve">NEXT</w:t>
+      </w:r>
+      <w:r>
+        <w:rPr>
+          <w:rFonts w:ascii="Consolas" w:cs="Consolas" w:eastAsia="Consolas" w:hAnsi="Consolas"/>
+          <w:sz w:val="19"/>
+          <w:szCs w:val="19"/>
+        </w:rPr>
+        <w:br/>
+        <w:t xml:space="preserve">PRINT</w:t>
+      </w:r>
+    </w:p>
+    <w:p>
+      <w:pPr>
+        <w:keepLines/>
+        <w:pBdr>
+          <w:left w:val="single" w:color="9AC79A" w:sz="18" w:space="6"/>
+        </w:pBdr>
+        <w:shd w:fill="EAF4EA" w:val="clear"/>
+        <w:spacing w:after="200" w:before="100" w:line="264" w:lineRule="auto"/>
+        <w:ind w:left="140"/>
+      </w:pPr>
+      <w:r>
+        <w:rPr>
+          <w:rFonts w:ascii="Consolas" w:cs="Consolas" w:eastAsia="Consolas" w:hAnsi="Consolas"/>
+          <w:sz w:val="19"/>
+          <w:szCs w:val="19"/>
+        </w:rPr>
+        <w:t xml:space="preserve">0 1 1 2 3 5 8 13</w:t>
+      </w:r>
+    </w:p>
+    <w:p>
+      <w:pPr>
+        <w:spacing w:before="60"/>
+      </w:pPr>
+    </w:p>
+    <w:tbl>
+      <w:tblPr>
+        <w:tblW w:type="dxa" w:w="9360"/>
+        <w:tblBorders>
+          <w:top w:val="single" w:color="auto" w:sz="4"/>
+          <w:left w:val="single" w:color="auto" w:sz="4"/>
+          <w:bottom w:val="single" w:color="auto" w:sz="4"/>
+          <w:right w:val="single" w:color="auto" w:sz="4"/>
+          <w:insideH w:val="single" w:color="auto" w:sz="4"/>
+          <w:insideV w:val="single" w:color="auto" w:sz="4"/>
+        </w:tblBorders>
+      </w:tblPr>
+      <w:tblGrid>
+        <w:gridCol w:w="9360"/>
+      </w:tblGrid>
+      <w:tr>
+        <w:trPr>
+          <w:cantSplit/>
+        </w:trPr>
+        <w:tc>
+          <w:tcPr>
+            <w:tcW w:type="dxa" w:w="9360"/>
+            <w:tcBorders>
+              <w:top w:val="single" w:color="E0A0A0" w:sz="6"/>
+              <w:left w:val="single" w:color="E0A0A0" w:sz="6"/>
+              <w:bottom w:val="single" w:color="E0A0A0" w:sz="6"/>
+              <w:right w:val="single" w:color="E0A0A0" w:sz="6"/>
+            </w:tcBorders>
+            <w:shd w:fill="FBEAEA" w:val="clear"/>
+            <w:tcMar>
+              <w:top w:type="dxa" w:w="140"/>
+              <w:left w:type="dxa" w:w="180"/>
+              <w:bottom w:type="dxa" w:w="140"/>
+              <w:right w:type="dxa" w:w="180"/>
+            </w:tcMar>
+          </w:tcPr>
+          <w:p>
+            <w:pPr>
+              <w:spacing w:after="40"/>
+            </w:pPr>
+            <w:r>
+              <w:rPr>
+                <w:b/>
+                <w:bCs/>
+                <w:color w:val="B23030"/>
+                <w:sz w:val="22"/>
+                <w:szCs w:val="22"/>
+              </w:rPr>
+              <w:t xml:space="preserve">Achtung</w:t>
+            </w:r>
+          </w:p>
+          <w:p>
+            <w:pPr>
+              <w:spacing w:after="0" w:line="312" w:lineRule="auto"/>
+            </w:pPr>
+            <w:r>
+              <w:rPr>
+                <w:sz w:val="22"/>
+                <w:szCs w:val="22"/>
+              </w:rPr>
+              <w:t xml:space="preserve">Treibe eine UNENDLICHE Coroutine (eine ohne natürliches Ende) niemals mit FOR EACH an – das läuft endlos. Steuere sie dann von Hand mit CORO_RESUME und brich selbst ab, wenn du genug Werte hast. Tipp: Beim manuellen RESUME-Loop liefert der allerletzte (beendende) Aufruf den RETURN-Wert bzw. NIL – für reines Einsammeln ist FOR EACH darum die sicherere Wahl.</w:t>
+            </w:r>
+          </w:p>
+        </w:tc>
+      </w:tr>
+    </w:tbl>
+    <w:p>
+      <w:pPr>
+        <w:spacing w:after="160"/>
+      </w:pPr>
+    </w:p>
+    <w:p>
+      <w:pPr>
+        <w:pStyle w:val="Heading2"/>
+        <w:keepNext/>
+        <w:keepLines/>
+        <w:spacing w:after="120" w:before="280"/>
+      </w:pPr>
+      <w:r>
+        <w:t xml:space="preserve">Werte hineingeben: CORO_SEND</w:t>
+      </w:r>
+    </w:p>
+    <w:p>
+      <w:pPr>
+        <w:spacing w:after="180" w:line="312" w:lineRule="auto"/>
+      </w:pPr>
+      <w:r>
+        <w:rPr>
+          <w:sz w:val="22"/>
+          <w:szCs w:val="22"/>
+        </w:rPr>
+        <w:t xml:space="preserve">YIELD ist keine Einbahnstraße. YIELD ist nämlich selbst ein Ausdruck: Du kannst sein Ergebnis einer Variablen zuweisen. Mit CORO_SEND setzt du die Coroutine nicht nur fort, sondern schiebst ihr dabei auch einen Wert hinein – genau der wird zum Ergebnis des YIELD, an dem sie gerade pausiert. So entsteht ein echter Dialog zwischen deinem Code und der Coroutine.</w:t>
+      </w:r>
+    </w:p>
+    <w:p>
+      <w:pPr>
+        <w:keepNext/>
+        <w:keepLines/>
+        <w:pBdr>
+          <w:bottom w:val="single" w:color="DDD0C0" w:sz="4" w:space="2"/>
+        </w:pBdr>
+        <w:spacing w:after="40" w:before="360"/>
+      </w:pPr>
+      <w:r>
+        <w:rPr>
+          <w:rFonts w:ascii="Consolas" w:cs="Consolas" w:eastAsia="Consolas" w:hAnsi="Consolas"/>
+          <w:b/>
+          <w:bCs/>
+          <w:color w:val="9A3412"/>
+          <w:sz w:val="24"/>
+          <w:szCs w:val="24"/>
+        </w:rPr>
+        <w:t xml:space="preserve">CORO_SEND</w:t>
+      </w:r>
+    </w:p>
+    <w:p>
+      <w:pPr>
+        <w:keepNext/>
+        <w:spacing w:after="120"/>
+      </w:pPr>
+      <w:r>
+        <w:rPr>
+          <w:b/>
+          <w:bCs/>
+          <w:color w:val="6A6A6A"/>
+          <w:sz w:val="18"/>
+          <w:szCs w:val="18"/>
+        </w:rPr>
+        <w:t xml:space="preserve">Syntax:  </w:t>
+      </w:r>
+      <w:r>
+        <w:rPr>
+          <w:rFonts w:ascii="Consolas" w:cs="Consolas" w:eastAsia="Consolas" w:hAnsi="Consolas"/>
+          <w:color w:val="335577"/>
+          <w:sz w:val="19"/>
+          <w:szCs w:val="19"/>
+        </w:rPr>
+        <w:t xml:space="preserve">CORO_SEND(c, wert)</w:t>
+      </w:r>
+    </w:p>
+    <w:p>
+      <w:pPr>
+        <w:spacing w:after="180" w:line="312" w:lineRule="auto"/>
+      </w:pPr>
+      <w:r>
+        <w:rPr>
+          <w:sz w:val="22"/>
+          <w:szCs w:val="22"/>
+        </w:rPr>
+        <w:t xml:space="preserve">Setzt die Coroutine fort wie CORO_RESUME, aber der YIELD-Ausdruck, an dem sie pausiert, liefert den übergebenen Wert. (Beim allerersten Start gibt es noch kein wartendes YIELD – nutze dort CORO_RESUME.)</w:t>
+      </w:r>
+    </w:p>
+    <w:p>
+      <w:pPr>
+        <w:keepNext/>
+        <w:spacing w:after="30" w:before="120"/>
+      </w:pPr>
+      <w:r>
+        <w:rPr>
+          <w:b/>
+          <w:bCs/>
+          <w:i/>
+          <w:iCs/>
+          <w:color w:val="6A6A6A"/>
+          <w:sz w:val="18"/>
+          <w:szCs w:val="18"/>
+        </w:rPr>
+        <w:t xml:space="preserve">Beispiel</w:t>
+      </w:r>
+    </w:p>
+    <w:p>
+      <w:pPr>
+        <w:keepLines/>
+        <w:pBdr>
+          <w:left w:val="single" w:color="1B6CA8" w:sz="18" w:space="6"/>
+        </w:pBdr>
+        <w:shd w:fill="F4F4F4" w:val="clear"/>
+        <w:spacing w:after="200" w:before="100" w:line="264" w:lineRule="auto"/>
+        <w:ind w:left="140"/>
+      </w:pPr>
+      <w:r>
+        <w:rPr>
+          <w:rFonts w:ascii="Consolas" w:cs="Consolas" w:eastAsia="Consolas" w:hAnsi="Consolas"/>
+          <w:sz w:val="19"/>
+          <w:szCs w:val="19"/>
+        </w:rPr>
+        <w:t xml:space="preserve">FUNCTION echo() AS INTEGER</w:t>
+      </w:r>
+      <w:r>
+        <w:rPr>
+          <w:rFonts w:ascii="Consolas" w:cs="Consolas" w:eastAsia="Consolas" w:hAnsi="Consolas"/>
+          <w:sz w:val="19"/>
+          <w:szCs w:val="19"/>
+        </w:rPr>
+        <w:br/>
+        <w:t xml:space="preserve">    DIM x AS INTEGER</w:t>
+      </w:r>
+      <w:r>
+        <w:rPr>
+          <w:rFonts w:ascii="Consolas" w:cs="Consolas" w:eastAsia="Consolas" w:hAnsi="Consolas"/>
+          <w:sz w:val="19"/>
+          <w:szCs w:val="19"/>
+        </w:rPr>
+        <w:br/>
+        <w:t xml:space="preserve">    x = YIELD 0          ' x bekommt den hineingegebenen Wert</w:t>
+      </w:r>
+      <w:r>
+        <w:rPr>
+          <w:rFonts w:ascii="Consolas" w:cs="Consolas" w:eastAsia="Consolas" w:hAnsi="Consolas"/>
+          <w:sz w:val="19"/>
+          <w:szCs w:val="19"/>
+        </w:rPr>
+        <w:br/>
+        <w:t xml:space="preserve">    YIELD x * 10</w:t>
+      </w:r>
+      <w:r>
+        <w:rPr>
+          <w:rFonts w:ascii="Consolas" w:cs="Consolas" w:eastAsia="Consolas" w:hAnsi="Consolas"/>
+          <w:sz w:val="19"/>
+          <w:szCs w:val="19"/>
+        </w:rPr>
+        <w:br/>
+        <w:t xml:space="preserve">END FUNCTION</w:t>
+      </w:r>
+      <w:r>
+        <w:rPr>
+          <w:rFonts w:ascii="Consolas" w:cs="Consolas" w:eastAsia="Consolas" w:hAnsi="Consolas"/>
+          <w:sz w:val="19"/>
+          <w:szCs w:val="19"/>
+        </w:rPr>
+        <w:br/>
+        <w:t xml:space="preserve"/>
+      </w:r>
+      <w:r>
+        <w:rPr>
+          <w:rFonts w:ascii="Consolas" w:cs="Consolas" w:eastAsia="Consolas" w:hAnsi="Consolas"/>
+          <w:sz w:val="19"/>
+          <w:szCs w:val="19"/>
+        </w:rPr>
+        <w:br/>
+        <w:t xml:space="preserve">DIM e AS COROUTINE</w:t>
+      </w:r>
+      <w:r>
+        <w:rPr>
+          <w:rFonts w:ascii="Consolas" w:cs="Consolas" w:eastAsia="Consolas" w:hAnsi="Consolas"/>
+          <w:sz w:val="19"/>
+          <w:szCs w:val="19"/>
+        </w:rPr>
+        <w:br/>
+        <w:t xml:space="preserve">e = echo()</w:t>
+      </w:r>
+      <w:r>
+        <w:rPr>
+          <w:rFonts w:ascii="Consolas" w:cs="Consolas" w:eastAsia="Consolas" w:hAnsi="Consolas"/>
+          <w:sz w:val="19"/>
+          <w:szCs w:val="19"/>
+        </w:rPr>
+        <w:br/>
+        <w:t xml:space="preserve">PRINT CORO_RESUME(e)     ' bis zum ersten YIELD: 0</w:t>
+      </w:r>
+      <w:r>
+        <w:rPr>
+          <w:rFonts w:ascii="Consolas" w:cs="Consolas" w:eastAsia="Consolas" w:hAnsi="Consolas"/>
+          <w:sz w:val="19"/>
+          <w:szCs w:val="19"/>
+        </w:rPr>
+        <w:br/>
+        <w:t xml:space="preserve">PRINT CORO_SEND(e, 5)    ' schickt 5 hinein -&gt; x=5 -&gt; YIELD 50</w:t>
+      </w:r>
+    </w:p>
+    <w:p>
+      <w:pPr>
+        <w:keepNext/>
+        <w:spacing w:after="30" w:before="120"/>
+      </w:pPr>
+      <w:r>
+        <w:rPr>
+          <w:b/>
+          <w:bCs/>
+          <w:i/>
+          <w:iCs/>
+          <w:color w:val="6A6A6A"/>
+          <w:sz w:val="18"/>
+          <w:szCs w:val="18"/>
+        </w:rPr>
+        <w:t xml:space="preserve">Ausgabe</w:t>
+      </w:r>
+    </w:p>
+    <w:p>
+      <w:pPr>
+        <w:keepLines/>
+        <w:pBdr>
+          <w:left w:val="single" w:color="9AC79A" w:sz="18" w:space="6"/>
+        </w:pBdr>
+        <w:shd w:fill="EAF4EA" w:val="clear"/>
+        <w:spacing w:after="200" w:before="100" w:line="264" w:lineRule="auto"/>
+        <w:ind w:left="140"/>
+      </w:pPr>
+      <w:r>
+        <w:rPr>
+          <w:rFonts w:ascii="Consolas" w:cs="Consolas" w:eastAsia="Consolas" w:hAnsi="Consolas"/>
+          <w:sz w:val="19"/>
+          <w:szCs w:val="19"/>
+        </w:rPr>
+        <w:t xml:space="preserve">0</w:t>
+      </w:r>
+      <w:r>
+        <w:rPr>
+          <w:rFonts w:ascii="Consolas" w:cs="Consolas" w:eastAsia="Consolas" w:hAnsi="Consolas"/>
+          <w:sz w:val="19"/>
+          <w:szCs w:val="19"/>
+        </w:rPr>
+        <w:br/>
+        <w:t xml:space="preserve">50</w:t>
+      </w:r>
+    </w:p>
+    <w:p>
+      <w:pPr>
+        <w:pStyle w:val="Heading2"/>
+        <w:keepNext/>
+        <w:keepLines/>
+        <w:spacing w:after="120" w:before="280"/>
+      </w:pPr>
+      <w:r>
+        <w:t xml:space="preserve">Wofür Coroutinen?</w:t>
+      </w:r>
+    </w:p>
+    <w:p>
+      <w:pPr>
+        <w:spacing w:after="180" w:line="312" w:lineRule="auto"/>
+      </w:pPr>
+      <w:r>
+        <w:rPr>
+          <w:sz w:val="22"/>
+          <w:szCs w:val="22"/>
+        </w:rPr>
+        <w:t xml:space="preserve">Coroutinen sind ein Spezialwerkzeug – für viele Programme brauchst du sie nie. Wo sie aber passen, vereinfachen sie den Code enorm, weil die Coroutine ihren Fortschritt selbst behält, statt dass du ihn mühsam in Variablen mitführst:</w:t>
+      </w:r>
+    </w:p>
+    <w:p>
+      <w:pPr>
+        <w:pStyle w:val="ListParagraph"/>
+        <w:numPr>
+          <w:ilvl w:val="0"/>
+          <w:numId w:val="2"/>
+        </w:numPr>
+        <w:spacing w:after="100" w:line="312" w:lineRule="auto"/>
+      </w:pPr>
+      <w:r>
+        <w:rPr>
+          <w:sz w:val="22"/>
+          <w:szCs w:val="22"/>
+        </w:rPr>
+        <w:t xml:space="preserve">Zwischensequenzen / Dialoge: ein Schritt pro YIELD, der Rest wartet.</w:t>
+      </w:r>
+    </w:p>
+    <w:p>
+      <w:pPr>
+        <w:pStyle w:val="ListParagraph"/>
+        <w:numPr>
+          <w:ilvl w:val="0"/>
+          <w:numId w:val="2"/>
+        </w:numPr>
+        <w:spacing w:after="100" w:line="312" w:lineRule="auto"/>
+      </w:pPr>
+      <w:r>
+        <w:rPr>
+          <w:sz w:val="22"/>
+          <w:szCs w:val="22"/>
+        </w:rPr>
+        <w:t xml:space="preserve">Gegner- oder Boss-Muster: „fahre links, warte, schieße dreimal, von vorn.“</w:t>
+      </w:r>
+    </w:p>
+    <w:p>
+      <w:pPr>
+        <w:pStyle w:val="ListParagraph"/>
+        <w:numPr>
+          <w:ilvl w:val="0"/>
+          <w:numId w:val="2"/>
+        </w:numPr>
+        <w:spacing w:after="100" w:line="312" w:lineRule="auto"/>
+      </w:pPr>
+      <w:r>
+        <w:rPr>
+          <w:sz w:val="22"/>
+          <w:szCs w:val="22"/>
+        </w:rPr>
+        <w:t xml:space="preserve">Generatoren: erzeuge eine (auch endlose) Folge von Werten auf Abruf.</w:t>
+      </w:r>
+    </w:p>
+    <w:p>
+      <w:pPr>
+        <w:spacing w:before="60"/>
+      </w:pPr>
+    </w:p>
+    <w:tbl>
+      <w:tblPr>
+        <w:tblW w:type="dxa" w:w="9360"/>
+        <w:tblBorders>
+          <w:top w:val="single" w:color="auto" w:sz="4"/>
+          <w:left w:val="single" w:color="auto" w:sz="4"/>
+          <w:bottom w:val="single" w:color="auto" w:sz="4"/>
+          <w:right w:val="single" w:color="auto" w:sz="4"/>
+          <w:insideH w:val="single" w:color="auto" w:sz="4"/>
+          <w:insideV w:val="single" w:color="auto" w:sz="4"/>
+        </w:tblBorders>
+      </w:tblPr>
+      <w:tblGrid>
+        <w:gridCol w:w="9360"/>
+      </w:tblGrid>
+      <w:tr>
+        <w:trPr>
+          <w:cantSplit/>
+        </w:trPr>
+        <w:tc>
+          <w:tcPr>
+            <w:tcW w:type="dxa" w:w="9360"/>
+            <w:tcBorders>
+              <w:top w:val="single" w:color="9CC8E6" w:sz="6"/>
+              <w:left w:val="single" w:color="9CC8E6" w:sz="6"/>
+              <w:bottom w:val="single" w:color="9CC8E6" w:sz="6"/>
+              <w:right w:val="single" w:color="9CC8E6" w:sz="6"/>
+            </w:tcBorders>
+            <w:shd w:fill="E7F2FA" w:val="clear"/>
+            <w:tcMar>
+              <w:top w:type="dxa" w:w="140"/>
+              <w:left w:type="dxa" w:w="180"/>
+              <w:bottom w:type="dxa" w:w="140"/>
+              <w:right w:type="dxa" w:w="180"/>
+            </w:tcMar>
+          </w:tcPr>
+          <w:p>
+            <w:pPr>
+              <w:spacing w:after="40"/>
+            </w:pPr>
+            <w:r>
+              <w:rPr>
+                <w:b/>
+                <w:bCs/>
+                <w:color w:val="1B6CA8"/>
+                <w:sz w:val="22"/>
+                <w:szCs w:val="22"/>
+              </w:rPr>
+              <w:t xml:space="preserve">Aufräumen</w:t>
+            </w:r>
+          </w:p>
+          <w:p>
+            <w:pPr>
+              <w:spacing w:after="0" w:line="312" w:lineRule="auto"/>
+            </w:pPr>
+            <w:r>
+              <w:rPr>
+                <w:sz w:val="22"/>
+                <w:szCs w:val="22"/>
+              </w:rPr>
+              <w:t xml:space="preserve">Eine pausierte Coroutine, die du nicht zu Ende laufen lässt, kannst du mit CORO_CLOSE(c) sauber beenden. Bei kurzen Programmen ist das selten nötig; bei vielen langlebigen Coroutinen ist es guter Stil.</w:t>
             </w:r>
           </w:p>
         </w:tc>

</xml_diff>

<commit_message>
docs(buch): Lehrbuch Kap 26 -- Module importieren (IMPORT) -- Teil II komplett
Eingebaute Module IMPORT "name" (OHNE Endung), eigene Dateien IMPORT "datei.gb"
(MIT .gb-Endung, textuell inkludiert), Alias IMPORT "json" AS j (Praefix-
Ersetzung). Achtung-Kasten zum Endungs-Unterschied. Abschluss Teil II.
Alle Beispiel-Ausgaben gegen gbrt verifiziert.

Co-Authored-By: Claude Opus 4.8 (1M context) <noreply@anthropic.com>
</commit_message>
<xml_diff>
--- a/buch-referenz/buch/GameBasic-Lehrbuch.docx
+++ b/buch-referenz/buch/GameBasic-Lehrbuch.docx
@@ -678,6 +678,33 @@
           <w:szCs w:val="22"/>
         </w:rPr>
         <w:t xml:space="preserve">	81</w:t>
+      </w:r>
+    </w:p>
+    <w:p>
+      <w:pPr>
+        <w:tabs>
+          <w:tab w:val="right" w:pos="9200" w:leader="dot"/>
+        </w:tabs>
+        <w:spacing w:after="20" w:before="0"/>
+        <w:ind w:left="280"/>
+      </w:pPr>
+      <w:r>
+        <w:rPr>
+          <w:b w:val="false"/>
+          <w:bCs w:val="false"/>
+          <w:color w:val="222222"/>
+          <w:sz w:val="22"/>
+          <w:szCs w:val="22"/>
+        </w:rPr>
+        <w:t xml:space="preserve">Module importieren</w:t>
+      </w:r>
+      <w:r>
+        <w:rPr>
+          <w:color w:val="555555"/>
+          <w:sz w:val="22"/>
+          <w:szCs w:val="22"/>
+        </w:rPr>
+        <w:t xml:space="preserve">	38</w:t>
       </w:r>
     </w:p>
     <w:p>
@@ -26818,6 +26845,946 @@
       <w:pPr>
         <w:spacing w:after="160"/>
       </w:pPr>
+    </w:p>
+    <w:p>
+      <w:pPr>
+        <w:pStyle w:val="Heading1"/>
+        <w:keepNext/>
+        <w:keepLines/>
+        <w:pageBreakBefore/>
+        <w:pBdr>
+          <w:bottom w:val="single" w:color="1B6CA8" w:sz="12" w:space="4"/>
+        </w:pBdr>
+        <w:spacing w:after="160" w:before="0"/>
+      </w:pPr>
+      <w:r>
+        <w:t xml:space="preserve">Module importieren</w:t>
+      </w:r>
+    </w:p>
+    <w:p>
+      <w:pPr>
+        <w:spacing w:after="180" w:line="312" w:lineRule="auto"/>
+      </w:pPr>
+      <w:r>
+        <w:rPr>
+          <w:sz w:val="22"/>
+          <w:szCs w:val="22"/>
+        </w:rPr>
+        <w:t xml:space="preserve">Je größer ein Programm wird, desto unhandlicher wird eine einzige riesige Datei. Mit IMPORT holst du Code von außerhalb herein – entweder eine der vielen eingebauten Bibliotheken von GameBasic oder eine eigene Datei, in die du wiederverwendbaren Code ausgelagert hast. Das hält deine Programme aufgeräumt und spart Tipparbeit, weil du Bewährtes nicht ständig neu schreibst.</w:t>
+      </w:r>
+    </w:p>
+    <w:p>
+      <w:pPr>
+        <w:spacing w:after="180" w:line="312" w:lineRule="auto"/>
+      </w:pPr>
+      <w:r>
+        <w:rPr>
+          <w:sz w:val="22"/>
+          <w:szCs w:val="22"/>
+        </w:rPr>
+        <w:t xml:space="preserve">Eine IMPORT-Zeile schreibst du an den Anfang deines Programms. Es gibt zwei Sorten von Modulen, die sich in einer Kleinigkeit unterscheiden – merke dir den Unterschied gut.</w:t>
+      </w:r>
+    </w:p>
+    <w:p>
+      <w:pPr>
+        <w:pStyle w:val="Heading2"/>
+        <w:keepNext/>
+        <w:keepLines/>
+        <w:spacing w:after="120" w:before="280"/>
+      </w:pPr>
+      <w:r>
+        <w:t xml:space="preserve">Eingebaute Module</w:t>
+      </w:r>
+    </w:p>
+    <w:p>
+      <w:pPr>
+        <w:spacing w:after="180" w:line="312" w:lineRule="auto"/>
+      </w:pPr>
+      <w:r>
+        <w:rPr>
+          <w:sz w:val="22"/>
+          <w:szCs w:val="22"/>
+        </w:rPr>
+        <w:t xml:space="preserve">GameBasic bringt eine große Sammlung fertiger Module mit – für 2D-Vektoren, JSON, Datenbanken, Physik, Pfadfindung und vieles mehr (du lernst sie alle in Teil V kennen). Ein solches Modul holst du dir mit IMPORT und dem Modulnamen in Anführungszeichen, OHNE Dateiendung. Danach stehen dir die Funktionen und Typen des Moduls zur Verfügung.</w:t>
+      </w:r>
+    </w:p>
+    <w:p>
+      <w:pPr>
+        <w:keepNext/>
+        <w:keepLines/>
+        <w:pBdr>
+          <w:bottom w:val="single" w:color="DDD0C0" w:sz="4" w:space="2"/>
+        </w:pBdr>
+        <w:spacing w:after="40" w:before="360"/>
+      </w:pPr>
+      <w:r>
+        <w:rPr>
+          <w:rFonts w:ascii="Consolas" w:cs="Consolas" w:eastAsia="Consolas" w:hAnsi="Consolas"/>
+          <w:b/>
+          <w:bCs/>
+          <w:color w:val="9A3412"/>
+          <w:sz w:val="24"/>
+          <w:szCs w:val="24"/>
+        </w:rPr>
+        <w:t xml:space="preserve">IMPORT (eingebautes Modul)</w:t>
+      </w:r>
+    </w:p>
+    <w:p>
+      <w:pPr>
+        <w:keepNext/>
+        <w:spacing w:after="120"/>
+      </w:pPr>
+      <w:r>
+        <w:rPr>
+          <w:b/>
+          <w:bCs/>
+          <w:color w:val="6A6A6A"/>
+          <w:sz w:val="18"/>
+          <w:szCs w:val="18"/>
+        </w:rPr>
+        <w:t xml:space="preserve">Syntax:  </w:t>
+      </w:r>
+      <w:r>
+        <w:rPr>
+          <w:rFonts w:ascii="Consolas" w:cs="Consolas" w:eastAsia="Consolas" w:hAnsi="Consolas"/>
+          <w:color w:val="335577"/>
+          <w:sz w:val="19"/>
+          <w:szCs w:val="19"/>
+        </w:rPr>
+        <w:t xml:space="preserve">IMPORT "modulname"</w:t>
+      </w:r>
+    </w:p>
+    <w:p>
+      <w:pPr>
+        <w:spacing w:after="180" w:line="312" w:lineRule="auto"/>
+      </w:pPr>
+      <w:r>
+        <w:rPr>
+          <w:sz w:val="22"/>
+          <w:szCs w:val="22"/>
+        </w:rPr>
+        <w:t xml:space="preserve">Macht ein eingebautes Modul nutzbar. Der Name steht ohne Endung in Anführungszeichen. Anschließend kannst du die Funktionen und externen Typen des Moduls verwenden.</w:t>
+      </w:r>
+    </w:p>
+    <w:p>
+      <w:pPr>
+        <w:keepNext/>
+        <w:spacing w:after="30" w:before="120"/>
+      </w:pPr>
+      <w:r>
+        <w:rPr>
+          <w:b/>
+          <w:bCs/>
+          <w:i/>
+          <w:iCs/>
+          <w:color w:val="6A6A6A"/>
+          <w:sz w:val="18"/>
+          <w:szCs w:val="18"/>
+        </w:rPr>
+        <w:t xml:space="preserve">Beispiel</w:t>
+      </w:r>
+    </w:p>
+    <w:p>
+      <w:pPr>
+        <w:keepLines/>
+        <w:pBdr>
+          <w:left w:val="single" w:color="1B6CA8" w:sz="18" w:space="6"/>
+        </w:pBdr>
+        <w:shd w:fill="F4F4F4" w:val="clear"/>
+        <w:spacing w:after="200" w:before="100" w:line="264" w:lineRule="auto"/>
+        <w:ind w:left="140"/>
+      </w:pPr>
+      <w:r>
+        <w:rPr>
+          <w:rFonts w:ascii="Consolas" w:cs="Consolas" w:eastAsia="Consolas" w:hAnsi="Consolas"/>
+          <w:sz w:val="19"/>
+          <w:szCs w:val="19"/>
+        </w:rPr>
+        <w:t xml:space="preserve">IMPORT "vec2"</w:t>
+      </w:r>
+      <w:r>
+        <w:rPr>
+          <w:rFonts w:ascii="Consolas" w:cs="Consolas" w:eastAsia="Consolas" w:hAnsi="Consolas"/>
+          <w:sz w:val="19"/>
+          <w:szCs w:val="19"/>
+        </w:rPr>
+        <w:br/>
+        <w:t xml:space="preserve"/>
+      </w:r>
+      <w:r>
+        <w:rPr>
+          <w:rFonts w:ascii="Consolas" w:cs="Consolas" w:eastAsia="Consolas" w:hAnsi="Consolas"/>
+          <w:sz w:val="19"/>
+          <w:szCs w:val="19"/>
+        </w:rPr>
+        <w:br/>
+        <w:t xml:space="preserve">DIM v AS VEC2</w:t>
+      </w:r>
+      <w:r>
+        <w:rPr>
+          <w:rFonts w:ascii="Consolas" w:cs="Consolas" w:eastAsia="Consolas" w:hAnsi="Consolas"/>
+          <w:sz w:val="19"/>
+          <w:szCs w:val="19"/>
+        </w:rPr>
+        <w:br/>
+        <w:t xml:space="preserve">v = VEC2_NEW(3.0, 4.0)</w:t>
+      </w:r>
+      <w:r>
+        <w:rPr>
+          <w:rFonts w:ascii="Consolas" w:cs="Consolas" w:eastAsia="Consolas" w:hAnsi="Consolas"/>
+          <w:sz w:val="19"/>
+          <w:szCs w:val="19"/>
+        </w:rPr>
+        <w:br/>
+        <w:t xml:space="preserve">PRINT VEC2_LENGTH(v)</w:t>
+      </w:r>
+    </w:p>
+    <w:p>
+      <w:pPr>
+        <w:keepNext/>
+        <w:spacing w:after="30" w:before="120"/>
+      </w:pPr>
+      <w:r>
+        <w:rPr>
+          <w:b/>
+          <w:bCs/>
+          <w:i/>
+          <w:iCs/>
+          <w:color w:val="6A6A6A"/>
+          <w:sz w:val="18"/>
+          <w:szCs w:val="18"/>
+        </w:rPr>
+        <w:t xml:space="preserve">Ausgabe</w:t>
+      </w:r>
+    </w:p>
+    <w:p>
+      <w:pPr>
+        <w:keepLines/>
+        <w:pBdr>
+          <w:left w:val="single" w:color="9AC79A" w:sz="18" w:space="6"/>
+        </w:pBdr>
+        <w:shd w:fill="EAF4EA" w:val="clear"/>
+        <w:spacing w:after="200" w:before="100" w:line="264" w:lineRule="auto"/>
+        <w:ind w:left="140"/>
+      </w:pPr>
+      <w:r>
+        <w:rPr>
+          <w:rFonts w:ascii="Consolas" w:cs="Consolas" w:eastAsia="Consolas" w:hAnsi="Consolas"/>
+          <w:sz w:val="19"/>
+          <w:szCs w:val="19"/>
+        </w:rPr>
+        <w:t xml:space="preserve">5.0</w:t>
+      </w:r>
+    </w:p>
+    <w:p>
+      <w:pPr>
+        <w:pStyle w:val="Heading2"/>
+        <w:keepNext/>
+        <w:keepLines/>
+        <w:spacing w:after="120" w:before="280"/>
+      </w:pPr>
+      <w:r>
+        <w:t xml:space="preserve">Eigene Dateien als Modul</w:t>
+      </w:r>
+    </w:p>
+    <w:p>
+      <w:pPr>
+        <w:spacing w:after="180" w:line="312" w:lineRule="auto"/>
+      </w:pPr>
+      <w:r>
+        <w:rPr>
+          <w:sz w:val="22"/>
+          <w:szCs w:val="22"/>
+        </w:rPr>
+        <w:t xml:space="preserve">Du kannst deinen eigenen Code in eine separate .gb-Datei auslagern und sie importieren. Damit teilst du ein großes Programm in handliche Stücke – etwa alle Mathe-Hilfsfunktionen in mathe.gb. Beim Import einer eigenen Datei gibst du den Dateinamen MIT der Endung .gb an. GameBasic fügt den Inhalt der Datei an dieser Stelle ein, sodass du deren Funktionen und Konstanten direkt nutzen kannst.</w:t>
+      </w:r>
+    </w:p>
+    <w:p>
+      <w:pPr>
+        <w:spacing w:after="180" w:line="312" w:lineRule="auto"/>
+      </w:pPr>
+      <w:r>
+        <w:rPr>
+          <w:sz w:val="22"/>
+          <w:szCs w:val="22"/>
+        </w:rPr>
+        <w:t xml:space="preserve">Angenommen, du hast neben deinem Programm eine Datei mathe.gb mit diesem Inhalt:</w:t>
+      </w:r>
+    </w:p>
+    <w:p>
+      <w:pPr>
+        <w:keepLines/>
+        <w:pBdr>
+          <w:left w:val="single" w:color="1B6CA8" w:sz="18" w:space="6"/>
+        </w:pBdr>
+        <w:shd w:fill="F4F4F4" w:val="clear"/>
+        <w:spacing w:after="200" w:before="100" w:line="264" w:lineRule="auto"/>
+        <w:ind w:left="140"/>
+      </w:pPr>
+      <w:r>
+        <w:rPr>
+          <w:rFonts w:ascii="Consolas" w:cs="Consolas" w:eastAsia="Consolas" w:hAnsi="Consolas"/>
+          <w:sz w:val="19"/>
+          <w:szCs w:val="19"/>
+        </w:rPr>
+        <w:t xml:space="preserve">' Datei: mathe.gb</w:t>
+      </w:r>
+      <w:r>
+        <w:rPr>
+          <w:rFonts w:ascii="Consolas" w:cs="Consolas" w:eastAsia="Consolas" w:hAnsi="Consolas"/>
+          <w:sz w:val="19"/>
+          <w:szCs w:val="19"/>
+        </w:rPr>
+        <w:br/>
+        <w:t xml:space="preserve">FUNCTION quadrat(x AS INTEGER) AS INTEGER</w:t>
+      </w:r>
+      <w:r>
+        <w:rPr>
+          <w:rFonts w:ascii="Consolas" w:cs="Consolas" w:eastAsia="Consolas" w:hAnsi="Consolas"/>
+          <w:sz w:val="19"/>
+          <w:szCs w:val="19"/>
+        </w:rPr>
+        <w:br/>
+        <w:t xml:space="preserve">    RETURN x * x</w:t>
+      </w:r>
+      <w:r>
+        <w:rPr>
+          <w:rFonts w:ascii="Consolas" w:cs="Consolas" w:eastAsia="Consolas" w:hAnsi="Consolas"/>
+          <w:sz w:val="19"/>
+          <w:szCs w:val="19"/>
+        </w:rPr>
+        <w:br/>
+        <w:t xml:space="preserve">END FUNCTION</w:t>
+      </w:r>
+      <w:r>
+        <w:rPr>
+          <w:rFonts w:ascii="Consolas" w:cs="Consolas" w:eastAsia="Consolas" w:hAnsi="Consolas"/>
+          <w:sz w:val="19"/>
+          <w:szCs w:val="19"/>
+        </w:rPr>
+        <w:br/>
+        <w:t xml:space="preserve"/>
+      </w:r>
+      <w:r>
+        <w:rPr>
+          <w:rFonts w:ascii="Consolas" w:cs="Consolas" w:eastAsia="Consolas" w:hAnsi="Consolas"/>
+          <w:sz w:val="19"/>
+          <w:szCs w:val="19"/>
+        </w:rPr>
+        <w:br/>
+        <w:t xml:space="preserve">CONST GOLDENER_SCHNITT AS FLOAT = 1.618</w:t>
+      </w:r>
+    </w:p>
+    <w:p>
+      <w:pPr>
+        <w:spacing w:after="180" w:line="312" w:lineRule="auto"/>
+      </w:pPr>
+      <w:r>
+        <w:rPr>
+          <w:sz w:val="22"/>
+          <w:szCs w:val="22"/>
+        </w:rPr>
+        <w:t xml:space="preserve">Dann holst du sie so in dein Hauptprogramm und benutzt ihre Inhalte, als stünden sie direkt darin:</w:t>
+      </w:r>
+    </w:p>
+    <w:p>
+      <w:pPr>
+        <w:keepNext/>
+        <w:keepLines/>
+        <w:pBdr>
+          <w:bottom w:val="single" w:color="DDD0C0" w:sz="4" w:space="2"/>
+        </w:pBdr>
+        <w:spacing w:after="40" w:before="360"/>
+      </w:pPr>
+      <w:r>
+        <w:rPr>
+          <w:rFonts w:ascii="Consolas" w:cs="Consolas" w:eastAsia="Consolas" w:hAnsi="Consolas"/>
+          <w:b/>
+          <w:bCs/>
+          <w:color w:val="9A3412"/>
+          <w:sz w:val="24"/>
+          <w:szCs w:val="24"/>
+        </w:rPr>
+        <w:t xml:space="preserve">IMPORT (eigene Datei)</w:t>
+      </w:r>
+    </w:p>
+    <w:p>
+      <w:pPr>
+        <w:keepNext/>
+        <w:spacing w:after="120"/>
+      </w:pPr>
+      <w:r>
+        <w:rPr>
+          <w:b/>
+          <w:bCs/>
+          <w:color w:val="6A6A6A"/>
+          <w:sz w:val="18"/>
+          <w:szCs w:val="18"/>
+        </w:rPr>
+        <w:t xml:space="preserve">Syntax:  </w:t>
+      </w:r>
+      <w:r>
+        <w:rPr>
+          <w:rFonts w:ascii="Consolas" w:cs="Consolas" w:eastAsia="Consolas" w:hAnsi="Consolas"/>
+          <w:color w:val="335577"/>
+          <w:sz w:val="19"/>
+          <w:szCs w:val="19"/>
+        </w:rPr>
+        <w:t xml:space="preserve">IMPORT "datei.gb"</w:t>
+      </w:r>
+    </w:p>
+    <w:p>
+      <w:pPr>
+        <w:spacing w:after="180" w:line="312" w:lineRule="auto"/>
+      </w:pPr>
+      <w:r>
+        <w:rPr>
+          <w:sz w:val="22"/>
+          <w:szCs w:val="22"/>
+        </w:rPr>
+        <w:t xml:space="preserve">Fügt den Inhalt einer eigenen .gb-Datei ein – mit Dateiendung angegeben, relativ zum Verzeichnis deines Programms. Danach sind deren Funktionen, SUBs, Klassen und Konstanten verfügbar.</w:t>
+      </w:r>
+    </w:p>
+    <w:p>
+      <w:pPr>
+        <w:keepNext/>
+        <w:spacing w:after="30" w:before="120"/>
+      </w:pPr>
+      <w:r>
+        <w:rPr>
+          <w:b/>
+          <w:bCs/>
+          <w:i/>
+          <w:iCs/>
+          <w:color w:val="6A6A6A"/>
+          <w:sz w:val="18"/>
+          <w:szCs w:val="18"/>
+        </w:rPr>
+        <w:t xml:space="preserve">Beispiel</w:t>
+      </w:r>
+    </w:p>
+    <w:p>
+      <w:pPr>
+        <w:keepLines/>
+        <w:pBdr>
+          <w:left w:val="single" w:color="1B6CA8" w:sz="18" w:space="6"/>
+        </w:pBdr>
+        <w:shd w:fill="F4F4F4" w:val="clear"/>
+        <w:spacing w:after="200" w:before="100" w:line="264" w:lineRule="auto"/>
+        <w:ind w:left="140"/>
+      </w:pPr>
+      <w:r>
+        <w:rPr>
+          <w:rFonts w:ascii="Consolas" w:cs="Consolas" w:eastAsia="Consolas" w:hAnsi="Consolas"/>
+          <w:sz w:val="19"/>
+          <w:szCs w:val="19"/>
+        </w:rPr>
+        <w:t xml:space="preserve">IMPORT "mathe.gb"</w:t>
+      </w:r>
+      <w:r>
+        <w:rPr>
+          <w:rFonts w:ascii="Consolas" w:cs="Consolas" w:eastAsia="Consolas" w:hAnsi="Consolas"/>
+          <w:sz w:val="19"/>
+          <w:szCs w:val="19"/>
+        </w:rPr>
+        <w:br/>
+        <w:t xml:space="preserve"/>
+      </w:r>
+      <w:r>
+        <w:rPr>
+          <w:rFonts w:ascii="Consolas" w:cs="Consolas" w:eastAsia="Consolas" w:hAnsi="Consolas"/>
+          <w:sz w:val="19"/>
+          <w:szCs w:val="19"/>
+        </w:rPr>
+        <w:br/>
+        <w:t xml:space="preserve">PRINT quadrat(6)</w:t>
+      </w:r>
+      <w:r>
+        <w:rPr>
+          <w:rFonts w:ascii="Consolas" w:cs="Consolas" w:eastAsia="Consolas" w:hAnsi="Consolas"/>
+          <w:sz w:val="19"/>
+          <w:szCs w:val="19"/>
+        </w:rPr>
+        <w:br/>
+        <w:t xml:space="preserve">PRINT GOLDENER_SCHNITT</w:t>
+      </w:r>
+    </w:p>
+    <w:p>
+      <w:pPr>
+        <w:keepNext/>
+        <w:spacing w:after="30" w:before="120"/>
+      </w:pPr>
+      <w:r>
+        <w:rPr>
+          <w:b/>
+          <w:bCs/>
+          <w:i/>
+          <w:iCs/>
+          <w:color w:val="6A6A6A"/>
+          <w:sz w:val="18"/>
+          <w:szCs w:val="18"/>
+        </w:rPr>
+        <w:t xml:space="preserve">Ausgabe</w:t>
+      </w:r>
+    </w:p>
+    <w:p>
+      <w:pPr>
+        <w:keepLines/>
+        <w:pBdr>
+          <w:left w:val="single" w:color="9AC79A" w:sz="18" w:space="6"/>
+        </w:pBdr>
+        <w:shd w:fill="EAF4EA" w:val="clear"/>
+        <w:spacing w:after="200" w:before="100" w:line="264" w:lineRule="auto"/>
+        <w:ind w:left="140"/>
+      </w:pPr>
+      <w:r>
+        <w:rPr>
+          <w:rFonts w:ascii="Consolas" w:cs="Consolas" w:eastAsia="Consolas" w:hAnsi="Consolas"/>
+          <w:sz w:val="19"/>
+          <w:szCs w:val="19"/>
+        </w:rPr>
+        <w:t xml:space="preserve">36</w:t>
+      </w:r>
+      <w:r>
+        <w:rPr>
+          <w:rFonts w:ascii="Consolas" w:cs="Consolas" w:eastAsia="Consolas" w:hAnsi="Consolas"/>
+          <w:sz w:val="19"/>
+          <w:szCs w:val="19"/>
+        </w:rPr>
+        <w:br/>
+        <w:t xml:space="preserve">1.618</w:t>
+      </w:r>
+    </w:p>
+    <w:p>
+      <w:pPr>
+        <w:spacing w:before="60"/>
+      </w:pPr>
+    </w:p>
+    <w:tbl>
+      <w:tblPr>
+        <w:tblW w:type="dxa" w:w="9360"/>
+        <w:tblBorders>
+          <w:top w:val="single" w:color="auto" w:sz="4"/>
+          <w:left w:val="single" w:color="auto" w:sz="4"/>
+          <w:bottom w:val="single" w:color="auto" w:sz="4"/>
+          <w:right w:val="single" w:color="auto" w:sz="4"/>
+          <w:insideH w:val="single" w:color="auto" w:sz="4"/>
+          <w:insideV w:val="single" w:color="auto" w:sz="4"/>
+        </w:tblBorders>
+      </w:tblPr>
+      <w:tblGrid>
+        <w:gridCol w:w="9360"/>
+      </w:tblGrid>
+      <w:tr>
+        <w:trPr>
+          <w:cantSplit/>
+        </w:trPr>
+        <w:tc>
+          <w:tcPr>
+            <w:tcW w:type="dxa" w:w="9360"/>
+            <w:tcBorders>
+              <w:top w:val="single" w:color="E0A0A0" w:sz="6"/>
+              <w:left w:val="single" w:color="E0A0A0" w:sz="6"/>
+              <w:bottom w:val="single" w:color="E0A0A0" w:sz="6"/>
+              <w:right w:val="single" w:color="E0A0A0" w:sz="6"/>
+            </w:tcBorders>
+            <w:shd w:fill="FBEAEA" w:val="clear"/>
+            <w:tcMar>
+              <w:top w:type="dxa" w:w="140"/>
+              <w:left w:type="dxa" w:w="180"/>
+              <w:bottom w:type="dxa" w:w="140"/>
+              <w:right w:type="dxa" w:w="180"/>
+            </w:tcMar>
+          </w:tcPr>
+          <w:p>
+            <w:pPr>
+              <w:spacing w:after="40"/>
+            </w:pPr>
+            <w:r>
+              <w:rPr>
+                <w:b/>
+                <w:bCs/>
+                <w:color w:val="B23030"/>
+                <w:sz w:val="22"/>
+                <w:szCs w:val="22"/>
+              </w:rPr>
+              <w:t xml:space="preserve">Achtung</w:t>
+            </w:r>
+          </w:p>
+          <w:p>
+            <w:pPr>
+              <w:spacing w:after="0" w:line="312" w:lineRule="auto"/>
+            </w:pPr>
+            <w:r>
+              <w:rPr>
+                <w:sz w:val="22"/>
+                <w:szCs w:val="22"/>
+              </w:rPr>
+              <w:t xml:space="preserve">Hier der feine, aber wichtige Unterschied: Ein eingebautes Modul schreibst du OHNE Endung (IMPORT "vec2"), eine eigene Datei MIT (IMPORT "mathe.gb"). Die Endung .gb sagt GameBasic: „Das ist eine Datei von mir, kein eingebautes Modul.“</w:t>
+            </w:r>
+          </w:p>
+        </w:tc>
+      </w:tr>
+    </w:tbl>
+    <w:p>
+      <w:pPr>
+        <w:spacing w:after="160"/>
+      </w:pPr>
+    </w:p>
+    <w:p>
+      <w:pPr>
+        <w:pStyle w:val="Heading2"/>
+        <w:keepNext/>
+        <w:keepLines/>
+        <w:spacing w:after="120" w:before="280"/>
+      </w:pPr>
+      <w:r>
+        <w:t xml:space="preserve">Module unter anderem Namen: AS</w:t>
+      </w:r>
+    </w:p>
+    <w:p>
+      <w:pPr>
+        <w:spacing w:after="180" w:line="312" w:lineRule="auto"/>
+      </w:pPr>
+      <w:r>
+        <w:rPr>
+          <w:sz w:val="22"/>
+          <w:szCs w:val="22"/>
+        </w:rPr>
+        <w:t xml:space="preserve">Manche Module haben lange Funktionsnamen. Mit dem Zusatz AS gibst du einem Modul beim Import ein kürzeres Namenspräfix. Aus den JSON-Funktionen, die normalerweise mit JSON_ beginnen, werden dann etwa J_-Funktionen – das spart Tipparbeit, wenn du das Modul oft benutzt.</w:t>
+      </w:r>
+    </w:p>
+    <w:p>
+      <w:pPr>
+        <w:keepNext/>
+        <w:keepLines/>
+        <w:pBdr>
+          <w:bottom w:val="single" w:color="DDD0C0" w:sz="4" w:space="2"/>
+        </w:pBdr>
+        <w:spacing w:after="40" w:before="360"/>
+      </w:pPr>
+      <w:r>
+        <w:rPr>
+          <w:rFonts w:ascii="Consolas" w:cs="Consolas" w:eastAsia="Consolas" w:hAnsi="Consolas"/>
+          <w:b/>
+          <w:bCs/>
+          <w:color w:val="9A3412"/>
+          <w:sz w:val="24"/>
+          <w:szCs w:val="24"/>
+        </w:rPr>
+        <w:t xml:space="preserve">IMPORT ... AS</w:t>
+      </w:r>
+    </w:p>
+    <w:p>
+      <w:pPr>
+        <w:keepNext/>
+        <w:spacing w:after="120"/>
+      </w:pPr>
+      <w:r>
+        <w:rPr>
+          <w:b/>
+          <w:bCs/>
+          <w:color w:val="6A6A6A"/>
+          <w:sz w:val="18"/>
+          <w:szCs w:val="18"/>
+        </w:rPr>
+        <w:t xml:space="preserve">Syntax:  </w:t>
+      </w:r>
+      <w:r>
+        <w:rPr>
+          <w:rFonts w:ascii="Consolas" w:cs="Consolas" w:eastAsia="Consolas" w:hAnsi="Consolas"/>
+          <w:color w:val="335577"/>
+          <w:sz w:val="19"/>
+          <w:szCs w:val="19"/>
+        </w:rPr>
+        <w:t xml:space="preserve">IMPORT "modul" AS kürzel</w:t>
+      </w:r>
+    </w:p>
+    <w:p>
+      <w:pPr>
+        <w:spacing w:after="180" w:line="312" w:lineRule="auto"/>
+      </w:pPr>
+      <w:r>
+        <w:rPr>
+          <w:sz w:val="22"/>
+          <w:szCs w:val="22"/>
+        </w:rPr>
+        <w:t xml:space="preserve">Importiert ein Modul und ersetzt sein Namenspräfix durch das angegebene Kürzel. Aus JSON_PARSE wird so zum Beispiel J_PARSE.</w:t>
+      </w:r>
+    </w:p>
+    <w:p>
+      <w:pPr>
+        <w:keepNext/>
+        <w:spacing w:after="30" w:before="120"/>
+      </w:pPr>
+      <w:r>
+        <w:rPr>
+          <w:b/>
+          <w:bCs/>
+          <w:i/>
+          <w:iCs/>
+          <w:color w:val="6A6A6A"/>
+          <w:sz w:val="18"/>
+          <w:szCs w:val="18"/>
+        </w:rPr>
+        <w:t xml:space="preserve">Beispiel</w:t>
+      </w:r>
+    </w:p>
+    <w:p>
+      <w:pPr>
+        <w:keepLines/>
+        <w:pBdr>
+          <w:left w:val="single" w:color="1B6CA8" w:sz="18" w:space="6"/>
+        </w:pBdr>
+        <w:shd w:fill="F4F4F4" w:val="clear"/>
+        <w:spacing w:after="200" w:before="100" w:line="264" w:lineRule="auto"/>
+        <w:ind w:left="140"/>
+      </w:pPr>
+      <w:r>
+        <w:rPr>
+          <w:rFonts w:ascii="Consolas" w:cs="Consolas" w:eastAsia="Consolas" w:hAnsi="Consolas"/>
+          <w:sz w:val="19"/>
+          <w:szCs w:val="19"/>
+        </w:rPr>
+        <w:t xml:space="preserve">IMPORT "json" AS j</w:t>
+      </w:r>
+      <w:r>
+        <w:rPr>
+          <w:rFonts w:ascii="Consolas" w:cs="Consolas" w:eastAsia="Consolas" w:hAnsi="Consolas"/>
+          <w:sz w:val="19"/>
+          <w:szCs w:val="19"/>
+        </w:rPr>
+        <w:br/>
+        <w:t xml:space="preserve"/>
+      </w:r>
+      <w:r>
+        <w:rPr>
+          <w:rFonts w:ascii="Consolas" w:cs="Consolas" w:eastAsia="Consolas" w:hAnsi="Consolas"/>
+          <w:sz w:val="19"/>
+          <w:szCs w:val="19"/>
+        </w:rPr>
+        <w:br/>
+        <w:t xml:space="preserve">DIM h AS J_HANDLE</w:t>
+      </w:r>
+      <w:r>
+        <w:rPr>
+          <w:rFonts w:ascii="Consolas" w:cs="Consolas" w:eastAsia="Consolas" w:hAnsi="Consolas"/>
+          <w:sz w:val="19"/>
+          <w:szCs w:val="19"/>
+        </w:rPr>
+        <w:br/>
+        <w:t xml:space="preserve">h = J_PARSE("[10, 20, 30]")</w:t>
+      </w:r>
+      <w:r>
+        <w:rPr>
+          <w:rFonts w:ascii="Consolas" w:cs="Consolas" w:eastAsia="Consolas" w:hAnsi="Consolas"/>
+          <w:sz w:val="19"/>
+          <w:szCs w:val="19"/>
+        </w:rPr>
+        <w:br/>
+        <w:t xml:space="preserve">PRINT J_GET_INT(h, "1")</w:t>
+      </w:r>
+    </w:p>
+    <w:p>
+      <w:pPr>
+        <w:keepNext/>
+        <w:spacing w:after="30" w:before="120"/>
+      </w:pPr>
+      <w:r>
+        <w:rPr>
+          <w:b/>
+          <w:bCs/>
+          <w:i/>
+          <w:iCs/>
+          <w:color w:val="6A6A6A"/>
+          <w:sz w:val="18"/>
+          <w:szCs w:val="18"/>
+        </w:rPr>
+        <w:t xml:space="preserve">Ausgabe</w:t>
+      </w:r>
+    </w:p>
+    <w:p>
+      <w:pPr>
+        <w:keepLines/>
+        <w:pBdr>
+          <w:left w:val="single" w:color="9AC79A" w:sz="18" w:space="6"/>
+        </w:pBdr>
+        <w:shd w:fill="EAF4EA" w:val="clear"/>
+        <w:spacing w:after="200" w:before="100" w:line="264" w:lineRule="auto"/>
+        <w:ind w:left="140"/>
+      </w:pPr>
+      <w:r>
+        <w:rPr>
+          <w:rFonts w:ascii="Consolas" w:cs="Consolas" w:eastAsia="Consolas" w:hAnsi="Consolas"/>
+          <w:sz w:val="19"/>
+          <w:szCs w:val="19"/>
+        </w:rPr>
+        <w:t xml:space="preserve">20</w:t>
+      </w:r>
+    </w:p>
+    <w:p>
+      <w:pPr>
+        <w:spacing w:before="60"/>
+      </w:pPr>
+    </w:p>
+    <w:tbl>
+      <w:tblPr>
+        <w:tblW w:type="dxa" w:w="9360"/>
+        <w:tblBorders>
+          <w:top w:val="single" w:color="auto" w:sz="4"/>
+          <w:left w:val="single" w:color="auto" w:sz="4"/>
+          <w:bottom w:val="single" w:color="auto" w:sz="4"/>
+          <w:right w:val="single" w:color="auto" w:sz="4"/>
+          <w:insideH w:val="single" w:color="auto" w:sz="4"/>
+          <w:insideV w:val="single" w:color="auto" w:sz="4"/>
+        </w:tblBorders>
+      </w:tblPr>
+      <w:tblGrid>
+        <w:gridCol w:w="9360"/>
+      </w:tblGrid>
+      <w:tr>
+        <w:trPr>
+          <w:cantSplit/>
+        </w:trPr>
+        <w:tc>
+          <w:tcPr>
+            <w:tcW w:type="dxa" w:w="9360"/>
+            <w:tcBorders>
+              <w:top w:val="single" w:color="E0B96A" w:sz="6"/>
+              <w:left w:val="single" w:color="E0B96A" w:sz="6"/>
+              <w:bottom w:val="single" w:color="E0B96A" w:sz="6"/>
+              <w:right w:val="single" w:color="E0B96A" w:sz="6"/>
+            </w:tcBorders>
+            <w:shd w:fill="FDF3E0" w:val="clear"/>
+            <w:tcMar>
+              <w:top w:type="dxa" w:w="140"/>
+              <w:left w:type="dxa" w:w="180"/>
+              <w:bottom w:type="dxa" w:w="140"/>
+              <w:right w:type="dxa" w:w="180"/>
+            </w:tcMar>
+          </w:tcPr>
+          <w:p>
+            <w:pPr>
+              <w:spacing w:after="40"/>
+            </w:pPr>
+            <w:r>
+              <w:rPr>
+                <w:b/>
+                <w:bCs/>
+                <w:color w:val="9A6A1E"/>
+                <w:sz w:val="22"/>
+                <w:szCs w:val="22"/>
+              </w:rPr>
+              <w:t xml:space="preserve">Merke</w:t>
+            </w:r>
+          </w:p>
+          <w:p>
+            <w:pPr>
+              <w:spacing w:after="0" w:line="312" w:lineRule="auto"/>
+            </w:pPr>
+            <w:r>
+              <w:rPr>
+                <w:sz w:val="22"/>
+                <w:szCs w:val="22"/>
+              </w:rPr>
+              <w:t xml:space="preserve">Der Alias ersetzt das Präfix für alle Funktionen und Typen des Moduls (J_PARSE, J_HANDLE …). Das funktioniert bei Modulen, deren Funktionen mit dem Modulnamen beginnen – also bei den allermeisten.</w:t>
+            </w:r>
+          </w:p>
+        </w:tc>
+      </w:tr>
+    </w:tbl>
+    <w:p>
+      <w:pPr>
+        <w:spacing w:after="160"/>
+      </w:pPr>
+    </w:p>
+    <w:p>
+      <w:pPr>
+        <w:spacing w:before="60"/>
+      </w:pPr>
+    </w:p>
+    <w:tbl>
+      <w:tblPr>
+        <w:tblW w:type="dxa" w:w="9360"/>
+        <w:tblBorders>
+          <w:top w:val="single" w:color="auto" w:sz="4"/>
+          <w:left w:val="single" w:color="auto" w:sz="4"/>
+          <w:bottom w:val="single" w:color="auto" w:sz="4"/>
+          <w:right w:val="single" w:color="auto" w:sz="4"/>
+          <w:insideH w:val="single" w:color="auto" w:sz="4"/>
+          <w:insideV w:val="single" w:color="auto" w:sz="4"/>
+        </w:tblBorders>
+      </w:tblPr>
+      <w:tblGrid>
+        <w:gridCol w:w="9360"/>
+      </w:tblGrid>
+      <w:tr>
+        <w:trPr>
+          <w:cantSplit/>
+        </w:trPr>
+        <w:tc>
+          <w:tcPr>
+            <w:tcW w:type="dxa" w:w="9360"/>
+            <w:tcBorders>
+              <w:top w:val="single" w:color="9CC8E6" w:sz="6"/>
+              <w:left w:val="single" w:color="9CC8E6" w:sz="6"/>
+              <w:bottom w:val="single" w:color="9CC8E6" w:sz="6"/>
+              <w:right w:val="single" w:color="9CC8E6" w:sz="6"/>
+            </w:tcBorders>
+            <w:shd w:fill="E7F2FA" w:val="clear"/>
+            <w:tcMar>
+              <w:top w:type="dxa" w:w="140"/>
+              <w:left w:type="dxa" w:w="180"/>
+              <w:bottom w:type="dxa" w:w="140"/>
+              <w:right w:type="dxa" w:w="180"/>
+            </w:tcMar>
+          </w:tcPr>
+          <w:p>
+            <w:pPr>
+              <w:spacing w:after="40"/>
+            </w:pPr>
+            <w:r>
+              <w:rPr>
+                <w:b/>
+                <w:bCs/>
+                <w:color w:val="1B6CA8"/>
+                <w:sz w:val="22"/>
+                <w:szCs w:val="22"/>
+              </w:rPr>
+              <w:t xml:space="preserve">Code sauber aufteilen</w:t>
+            </w:r>
+          </w:p>
+          <w:p>
+            <w:pPr>
+              <w:spacing w:after="0" w:line="312" w:lineRule="auto"/>
+            </w:pPr>
+            <w:r>
+              <w:rPr>
+                <w:sz w:val="22"/>
+                <w:szCs w:val="22"/>
+              </w:rPr>
+              <w:t xml:space="preserve">Lagere zusammengehörige Bausteine in eigene Dateien aus: eine für Mathe-Helfer, eine für deine Spieler-Klasse, eine für die Gegner. Dein Hauptprogramm beginnt dann mit ein paar IMPORT-Zeilen und bleibt übersichtlich. So findest du dich auch in großen Projekten zurecht – und kannst eine bewährte Datei im nächsten Spiel einfach wiederverwenden.</w:t>
+            </w:r>
+          </w:p>
+        </w:tc>
+      </w:tr>
+    </w:tbl>
+    <w:p>
+      <w:pPr>
+        <w:spacing w:after="160"/>
+      </w:pPr>
+    </w:p>
+    <w:p>
+      <w:pPr>
+        <w:spacing w:after="180" w:line="312" w:lineRule="auto"/>
+      </w:pPr>
+      <w:r>
+        <w:rPr>
+          <w:sz w:val="22"/>
+          <w:szCs w:val="22"/>
+        </w:rPr>
+        <w:t xml:space="preserve">Damit endet Teil II: Du beherrschst jetzt die ganze Sprache GameBasic – von Variablen über Schleifen und Funktionen bis zu Klassen, Coroutinen und Modulen. In den folgenden Teilen geht es um die eingebauten Befehle im Detail (Teil III), um Grafik, Sound und Spiele (Teil IV) und um die mitgelieferten Module (Teil V).</w:t>
+      </w:r>
     </w:p>
     <w:sectPr>
       <w:footerReference w:type="default" r:id="rId7"/>

</xml_diff>

<commit_message>
fix(buch): ToC-Seitenzahlen korrekt -- Ueberschriften per Schriftgroesse erkennen
measure() traf bisher Fliesstext-Erwaehnungen kurzer Titel (Schleifen=3,
Maps=7, Arrays=31, ENUM=21 ...). Jetzt: nur Spans mit Groesse >=15 zaehlen
als Ueberschrift (Kapitel=17, Teil=26; Fliesstext=11, h2=13, cmd/Code<=12
ausgeschlossen) + monotone Vorwaerts-Suche (Titel in Dokument-Reihenfolge).

Co-Authored-By: Claude Opus 4.8 (1M context) <noreply@anthropic.com>
</commit_message>
<xml_diff>
--- a/buch-referenz/buch/GameBasic-Lehrbuch.docx
+++ b/buch-referenz/buch/GameBasic-Lehrbuch.docx
@@ -353,7 +353,7 @@
           <w:sz w:val="22"/>
           <w:szCs w:val="22"/>
         </w:rPr>
-        <w:t xml:space="preserve">	14</w:t>
+        <w:t xml:space="preserve">	24</w:t>
       </w:r>
     </w:p>
     <w:p>
@@ -380,7 +380,7 @@
           <w:sz w:val="22"/>
           <w:szCs w:val="22"/>
         </w:rPr>
-        <w:t xml:space="preserve">	3</w:t>
+        <w:t xml:space="preserve">	29</w:t>
       </w:r>
     </w:p>
     <w:p>
@@ -461,7 +461,7 @@
           <w:sz w:val="22"/>
           <w:szCs w:val="22"/>
         </w:rPr>
-        <w:t xml:space="preserve">	31</w:t>
+        <w:t xml:space="preserve">	45</w:t>
       </w:r>
     </w:p>
     <w:p>
@@ -488,7 +488,7 @@
           <w:sz w:val="22"/>
           <w:szCs w:val="22"/>
         </w:rPr>
-        <w:t xml:space="preserve">	7</w:t>
+        <w:t xml:space="preserve">	52</w:t>
       </w:r>
     </w:p>
     <w:p>
@@ -515,7 +515,7 @@
           <w:sz w:val="22"/>
           <w:szCs w:val="22"/>
         </w:rPr>
-        <w:t xml:space="preserve">	36</w:t>
+        <w:t xml:space="preserve">	57</w:t>
       </w:r>
     </w:p>
     <w:p>
@@ -596,7 +596,7 @@
           <w:sz w:val="22"/>
           <w:szCs w:val="22"/>
         </w:rPr>
-        <w:t xml:space="preserve">	21</w:t>
+        <w:t xml:space="preserve">	72</w:t>
       </w:r>
     </w:p>
     <w:p>
@@ -704,7 +704,7 @@
           <w:sz w:val="22"/>
           <w:szCs w:val="22"/>
         </w:rPr>
-        <w:t xml:space="preserve">	38</w:t>
+        <w:t xml:space="preserve">	85</w:t>
       </w:r>
     </w:p>
     <w:p>

</xml_diff>

<commit_message>
docs(buch): Teil III + Kap 30 Konsole; mehrzeilige cmd-Syntax als Zeilenumbruch
Start des Referenzteils (Teil III). Kap 30 Konsole & Ein-/Ausgabe:
PRINT (Trenner), INPUT (typgebunden), FORMAT$ (%d/%.Nf/%0Nd/%x/%s),
Querverweise auf Teil II + Teil IV. Renderer: cmd-Syntax mit \n rendert
jetzt als echte, eingerueckte Zeilenumbrueche (betrifft INPUT/SELECT/TRY/
FUNCTION/PROPERTY ... im ganzen Buch). Alle Ausgaben gegen gbrt verifiziert.

Co-Authored-By: Claude Opus 4.8 (1M context) <noreply@anthropic.com>
</commit_message>
<xml_diff>
--- a/buch-referenz/buch/GameBasic-Lehrbuch.docx
+++ b/buch-referenz/buch/GameBasic-Lehrbuch.docx
@@ -705,6 +705,60 @@
           <w:szCs w:val="22"/>
         </w:rPr>
         <w:t xml:space="preserve">	85</w:t>
+      </w:r>
+    </w:p>
+    <w:p>
+      <w:pPr>
+        <w:tabs>
+          <w:tab w:val="right" w:pos="9200" w:leader="dot"/>
+        </w:tabs>
+        <w:spacing w:after="40" w:before="120"/>
+        <w:ind/>
+      </w:pPr>
+      <w:r>
+        <w:rPr>
+          <w:b/>
+          <w:bCs/>
+          <w:color w:val="10507F"/>
+          <w:sz w:val="24"/>
+          <w:szCs w:val="24"/>
+        </w:rPr>
+        <w:t xml:space="preserve">Teil III — Eingebaute Befehle</w:t>
+      </w:r>
+      <w:r>
+        <w:rPr>
+          <w:color w:val="555555"/>
+          <w:sz w:val="24"/>
+          <w:szCs w:val="24"/>
+        </w:rPr>
+        <w:t xml:space="preserve">	88</w:t>
+      </w:r>
+    </w:p>
+    <w:p>
+      <w:pPr>
+        <w:tabs>
+          <w:tab w:val="right" w:pos="9200" w:leader="dot"/>
+        </w:tabs>
+        <w:spacing w:after="20" w:before="0"/>
+        <w:ind w:left="280"/>
+      </w:pPr>
+      <w:r>
+        <w:rPr>
+          <w:b w:val="false"/>
+          <w:bCs w:val="false"/>
+          <w:color w:val="222222"/>
+          <w:sz w:val="22"/>
+          <w:szCs w:val="22"/>
+        </w:rPr>
+        <w:t xml:space="preserve">Konsole &amp; Ein-/Ausgabe</w:t>
+      </w:r>
+      <w:r>
+        <w:rPr>
+          <w:color w:val="555555"/>
+          <w:sz w:val="22"/>
+          <w:szCs w:val="22"/>
+        </w:rPr>
+        <w:t xml:space="preserve">	89</w:t>
       </w:r>
     </w:p>
     <w:p>
@@ -5353,8 +5407,17 @@
           <w:sz w:val="19"/>
           <w:szCs w:val="19"/>
         </w:rPr>
-        <w:t xml:space="preserve">INPUT variable
-INPUT "Frage", variable</w:t>
+        <w:t xml:space="preserve">INPUT variable</w:t>
+      </w:r>
+      <w:r>
+        <w:rPr>
+          <w:rFonts w:ascii="Consolas" w:cs="Consolas" w:eastAsia="Consolas" w:hAnsi="Consolas"/>
+          <w:color w:val="335577"/>
+          <w:sz w:val="19"/>
+          <w:szCs w:val="19"/>
+        </w:rPr>
+        <w:br/>
+        <w:t xml:space="preserve">         INPUT "Frage", variable</w:t>
       </w:r>
     </w:p>
     <w:p>
@@ -6330,9 +6393,27 @@
           <w:sz w:val="19"/>
           <w:szCs w:val="19"/>
         </w:rPr>
-        <w:t xml:space="preserve">IF bedingung THEN
-    ...
-END IF</w:t>
+        <w:t xml:space="preserve">IF bedingung THEN</w:t>
+      </w:r>
+      <w:r>
+        <w:rPr>
+          <w:rFonts w:ascii="Consolas" w:cs="Consolas" w:eastAsia="Consolas" w:hAnsi="Consolas"/>
+          <w:color w:val="335577"/>
+          <w:sz w:val="19"/>
+          <w:szCs w:val="19"/>
+        </w:rPr>
+        <w:br/>
+        <w:t xml:space="preserve">             ...</w:t>
+      </w:r>
+      <w:r>
+        <w:rPr>
+          <w:rFonts w:ascii="Consolas" w:cs="Consolas" w:eastAsia="Consolas" w:hAnsi="Consolas"/>
+          <w:color w:val="335577"/>
+          <w:sz w:val="19"/>
+          <w:szCs w:val="19"/>
+        </w:rPr>
+        <w:br/>
+        <w:t xml:space="preserve">         END IF</w:t>
       </w:r>
     </w:p>
     <w:p>
@@ -7114,12 +7195,57 @@
           <w:sz w:val="19"/>
           <w:szCs w:val="19"/>
         </w:rPr>
-        <w:t xml:space="preserve">SELECT CASE wert
-    CASE muster
-        ...
-    CASE ELSE
-        ...
-END SELECT</w:t>
+        <w:t xml:space="preserve">SELECT CASE wert</w:t>
+      </w:r>
+      <w:r>
+        <w:rPr>
+          <w:rFonts w:ascii="Consolas" w:cs="Consolas" w:eastAsia="Consolas" w:hAnsi="Consolas"/>
+          <w:color w:val="335577"/>
+          <w:sz w:val="19"/>
+          <w:szCs w:val="19"/>
+        </w:rPr>
+        <w:br/>
+        <w:t xml:space="preserve">             CASE muster</w:t>
+      </w:r>
+      <w:r>
+        <w:rPr>
+          <w:rFonts w:ascii="Consolas" w:cs="Consolas" w:eastAsia="Consolas" w:hAnsi="Consolas"/>
+          <w:color w:val="335577"/>
+          <w:sz w:val="19"/>
+          <w:szCs w:val="19"/>
+        </w:rPr>
+        <w:br/>
+        <w:t xml:space="preserve">                 ...</w:t>
+      </w:r>
+      <w:r>
+        <w:rPr>
+          <w:rFonts w:ascii="Consolas" w:cs="Consolas" w:eastAsia="Consolas" w:hAnsi="Consolas"/>
+          <w:color w:val="335577"/>
+          <w:sz w:val="19"/>
+          <w:szCs w:val="19"/>
+        </w:rPr>
+        <w:br/>
+        <w:t xml:space="preserve">             CASE ELSE</w:t>
+      </w:r>
+      <w:r>
+        <w:rPr>
+          <w:rFonts w:ascii="Consolas" w:cs="Consolas" w:eastAsia="Consolas" w:hAnsi="Consolas"/>
+          <w:color w:val="335577"/>
+          <w:sz w:val="19"/>
+          <w:szCs w:val="19"/>
+        </w:rPr>
+        <w:br/>
+        <w:t xml:space="preserve">                 ...</w:t>
+      </w:r>
+      <w:r>
+        <w:rPr>
+          <w:rFonts w:ascii="Consolas" w:cs="Consolas" w:eastAsia="Consolas" w:hAnsi="Consolas"/>
+          <w:color w:val="335577"/>
+          <w:sz w:val="19"/>
+          <w:szCs w:val="19"/>
+        </w:rPr>
+        <w:br/>
+        <w:t xml:space="preserve">         END SELECT</w:t>
       </w:r>
     </w:p>
     <w:p>
@@ -8117,9 +8243,27 @@
           <w:sz w:val="19"/>
           <w:szCs w:val="19"/>
         </w:rPr>
-        <w:t xml:space="preserve">FOR var = start TO ende
-    ...
-NEXT</w:t>
+        <w:t xml:space="preserve">FOR var = start TO ende</w:t>
+      </w:r>
+      <w:r>
+        <w:rPr>
+          <w:rFonts w:ascii="Consolas" w:cs="Consolas" w:eastAsia="Consolas" w:hAnsi="Consolas"/>
+          <w:color w:val="335577"/>
+          <w:sz w:val="19"/>
+          <w:szCs w:val="19"/>
+        </w:rPr>
+        <w:br/>
+        <w:t xml:space="preserve">             ...</w:t>
+      </w:r>
+      <w:r>
+        <w:rPr>
+          <w:rFonts w:ascii="Consolas" w:cs="Consolas" w:eastAsia="Consolas" w:hAnsi="Consolas"/>
+          <w:color w:val="335577"/>
+          <w:sz w:val="19"/>
+          <w:szCs w:val="19"/>
+        </w:rPr>
+        <w:br/>
+        <w:t xml:space="preserve">         NEXT</w:t>
       </w:r>
     </w:p>
     <w:p>
@@ -8510,9 +8654,27 @@
           <w:sz w:val="19"/>
           <w:szCs w:val="19"/>
         </w:rPr>
-        <w:t xml:space="preserve">WHILE bedingung
-    ...
-WEND</w:t>
+        <w:t xml:space="preserve">WHILE bedingung</w:t>
+      </w:r>
+      <w:r>
+        <w:rPr>
+          <w:rFonts w:ascii="Consolas" w:cs="Consolas" w:eastAsia="Consolas" w:hAnsi="Consolas"/>
+          <w:color w:val="335577"/>
+          <w:sz w:val="19"/>
+          <w:szCs w:val="19"/>
+        </w:rPr>
+        <w:br/>
+        <w:t xml:space="preserve">             ...</w:t>
+      </w:r>
+      <w:r>
+        <w:rPr>
+          <w:rFonts w:ascii="Consolas" w:cs="Consolas" w:eastAsia="Consolas" w:hAnsi="Consolas"/>
+          <w:color w:val="335577"/>
+          <w:sz w:val="19"/>
+          <w:szCs w:val="19"/>
+        </w:rPr>
+        <w:br/>
+        <w:t xml:space="preserve">         WEND</w:t>
       </w:r>
     </w:p>
     <w:p>
@@ -8788,9 +8950,27 @@
           <w:sz w:val="19"/>
           <w:szCs w:val="19"/>
         </w:rPr>
-        <w:t xml:space="preserve">REPEAT
-    ...
-UNTIL bedingung</w:t>
+        <w:t xml:space="preserve">REPEAT</w:t>
+      </w:r>
+      <w:r>
+        <w:rPr>
+          <w:rFonts w:ascii="Consolas" w:cs="Consolas" w:eastAsia="Consolas" w:hAnsi="Consolas"/>
+          <w:color w:val="335577"/>
+          <w:sz w:val="19"/>
+          <w:szCs w:val="19"/>
+        </w:rPr>
+        <w:br/>
+        <w:t xml:space="preserve">             ...</w:t>
+      </w:r>
+      <w:r>
+        <w:rPr>
+          <w:rFonts w:ascii="Consolas" w:cs="Consolas" w:eastAsia="Consolas" w:hAnsi="Consolas"/>
+          <w:color w:val="335577"/>
+          <w:sz w:val="19"/>
+          <w:szCs w:val="19"/>
+        </w:rPr>
+        <w:br/>
+        <w:t xml:space="preserve">         UNTIL bedingung</w:t>
       </w:r>
     </w:p>
     <w:p>
@@ -9066,9 +9246,27 @@
           <w:sz w:val="19"/>
           <w:szCs w:val="19"/>
         </w:rPr>
-        <w:t xml:space="preserve">FOR EACH var IN sammlung
-    ...
-NEXT</w:t>
+        <w:t xml:space="preserve">FOR EACH var IN sammlung</w:t>
+      </w:r>
+      <w:r>
+        <w:rPr>
+          <w:rFonts w:ascii="Consolas" w:cs="Consolas" w:eastAsia="Consolas" w:hAnsi="Consolas"/>
+          <w:color w:val="335577"/>
+          <w:sz w:val="19"/>
+          <w:szCs w:val="19"/>
+        </w:rPr>
+        <w:br/>
+        <w:t xml:space="preserve">             ...</w:t>
+      </w:r>
+      <w:r>
+        <w:rPr>
+          <w:rFonts w:ascii="Consolas" w:cs="Consolas" w:eastAsia="Consolas" w:hAnsi="Consolas"/>
+          <w:color w:val="335577"/>
+          <w:sz w:val="19"/>
+          <w:szCs w:val="19"/>
+        </w:rPr>
+        <w:br/>
+        <w:t xml:space="preserve">         NEXT</w:t>
       </w:r>
     </w:p>
     <w:p>
@@ -9710,9 +9908,27 @@
           <w:sz w:val="19"/>
           <w:szCs w:val="19"/>
         </w:rPr>
-        <w:t xml:space="preserve">FUNCTION name(param AS Typ) AS Rückgabetyp
-    RETURN wert
-END FUNCTION</w:t>
+        <w:t xml:space="preserve">FUNCTION name(param AS Typ) AS Rückgabetyp</w:t>
+      </w:r>
+      <w:r>
+        <w:rPr>
+          <w:rFonts w:ascii="Consolas" w:cs="Consolas" w:eastAsia="Consolas" w:hAnsi="Consolas"/>
+          <w:color w:val="335577"/>
+          <w:sz w:val="19"/>
+          <w:szCs w:val="19"/>
+        </w:rPr>
+        <w:br/>
+        <w:t xml:space="preserve">             RETURN wert</w:t>
+      </w:r>
+      <w:r>
+        <w:rPr>
+          <w:rFonts w:ascii="Consolas" w:cs="Consolas" w:eastAsia="Consolas" w:hAnsi="Consolas"/>
+          <w:color w:val="335577"/>
+          <w:sz w:val="19"/>
+          <w:szCs w:val="19"/>
+        </w:rPr>
+        <w:br/>
+        <w:t xml:space="preserve">         END FUNCTION</w:t>
       </w:r>
     </w:p>
     <w:p>
@@ -9903,9 +10119,27 @@
           <w:sz w:val="19"/>
           <w:szCs w:val="19"/>
         </w:rPr>
-        <w:t xml:space="preserve">SUB name(param AS Typ)
-    ...
-END SUB</w:t>
+        <w:t xml:space="preserve">SUB name(param AS Typ)</w:t>
+      </w:r>
+      <w:r>
+        <w:rPr>
+          <w:rFonts w:ascii="Consolas" w:cs="Consolas" w:eastAsia="Consolas" w:hAnsi="Consolas"/>
+          <w:color w:val="335577"/>
+          <w:sz w:val="19"/>
+          <w:szCs w:val="19"/>
+        </w:rPr>
+        <w:br/>
+        <w:t xml:space="preserve">             ...</w:t>
+      </w:r>
+      <w:r>
+        <w:rPr>
+          <w:rFonts w:ascii="Consolas" w:cs="Consolas" w:eastAsia="Consolas" w:hAnsi="Consolas"/>
+          <w:color w:val="335577"/>
+          <w:sz w:val="19"/>
+          <w:szCs w:val="19"/>
+        </w:rPr>
+        <w:br/>
+        <w:t xml:space="preserve">         END SUB</w:t>
       </w:r>
     </w:p>
     <w:p>
@@ -11056,9 +11290,27 @@
           <w:sz w:val="19"/>
           <w:szCs w:val="19"/>
         </w:rPr>
-        <w:t xml:space="preserve">DIM f AS FUNCREF
-f = funktionsname
-f(args)</w:t>
+        <w:t xml:space="preserve">DIM f AS FUNCREF</w:t>
+      </w:r>
+      <w:r>
+        <w:rPr>
+          <w:rFonts w:ascii="Consolas" w:cs="Consolas" w:eastAsia="Consolas" w:hAnsi="Consolas"/>
+          <w:color w:val="335577"/>
+          <w:sz w:val="19"/>
+          <w:szCs w:val="19"/>
+        </w:rPr>
+        <w:br/>
+        <w:t xml:space="preserve">         f = funktionsname</w:t>
+      </w:r>
+      <w:r>
+        <w:rPr>
+          <w:rFonts w:ascii="Consolas" w:cs="Consolas" w:eastAsia="Consolas" w:hAnsi="Consolas"/>
+          <w:color w:val="335577"/>
+          <w:sz w:val="19"/>
+          <w:szCs w:val="19"/>
+        </w:rPr>
+        <w:br/>
+        <w:t xml:space="preserve">         f(args)</w:t>
       </w:r>
     </w:p>
     <w:p>
@@ -21930,8 +22182,17 @@
           <w:sz w:val="19"/>
           <w:szCs w:val="19"/>
         </w:rPr>
-        <w:t xml:space="preserve">PROPERTY GET name() AS Typ ... END PROPERTY
-PROPERTY SET name(value AS Typ) ... END PROPERTY</w:t>
+        <w:t xml:space="preserve">PROPERTY GET name() AS Typ ... END PROPERTY</w:t>
+      </w:r>
+      <w:r>
+        <w:rPr>
+          <w:rFonts w:ascii="Consolas" w:cs="Consolas" w:eastAsia="Consolas" w:hAnsi="Consolas"/>
+          <w:color w:val="335577"/>
+          <w:sz w:val="19"/>
+          <w:szCs w:val="19"/>
+        </w:rPr>
+        <w:br/>
+        <w:t xml:space="preserve">         PROPERTY SET name(value AS Typ) ... END PROPERTY</w:t>
       </w:r>
     </w:p>
     <w:p>
@@ -23204,10 +23465,37 @@
           <w:sz w:val="19"/>
           <w:szCs w:val="19"/>
         </w:rPr>
-        <w:t xml:space="preserve">ENUM Name
-    MITGLIED = wert
-    ...
-END ENUM</w:t>
+        <w:t xml:space="preserve">ENUM Name</w:t>
+      </w:r>
+      <w:r>
+        <w:rPr>
+          <w:rFonts w:ascii="Consolas" w:cs="Consolas" w:eastAsia="Consolas" w:hAnsi="Consolas"/>
+          <w:color w:val="335577"/>
+          <w:sz w:val="19"/>
+          <w:szCs w:val="19"/>
+        </w:rPr>
+        <w:br/>
+        <w:t xml:space="preserve">             MITGLIED = wert</w:t>
+      </w:r>
+      <w:r>
+        <w:rPr>
+          <w:rFonts w:ascii="Consolas" w:cs="Consolas" w:eastAsia="Consolas" w:hAnsi="Consolas"/>
+          <w:color w:val="335577"/>
+          <w:sz w:val="19"/>
+          <w:szCs w:val="19"/>
+        </w:rPr>
+        <w:br/>
+        <w:t xml:space="preserve">             ...</w:t>
+      </w:r>
+      <w:r>
+        <w:rPr>
+          <w:rFonts w:ascii="Consolas" w:cs="Consolas" w:eastAsia="Consolas" w:hAnsi="Consolas"/>
+          <w:color w:val="335577"/>
+          <w:sz w:val="19"/>
+          <w:szCs w:val="19"/>
+        </w:rPr>
+        <w:br/>
+        <w:t xml:space="preserve">         END ENUM</w:t>
       </w:r>
     </w:p>
     <w:p>
@@ -24888,11 +25176,47 @@
           <w:sz w:val="19"/>
           <w:szCs w:val="19"/>
         </w:rPr>
-        <w:t xml:space="preserve">TRY
-    ...
-CATCH [e]
-    ...
-END TRY</w:t>
+        <w:t xml:space="preserve">TRY</w:t>
+      </w:r>
+      <w:r>
+        <w:rPr>
+          <w:rFonts w:ascii="Consolas" w:cs="Consolas" w:eastAsia="Consolas" w:hAnsi="Consolas"/>
+          <w:color w:val="335577"/>
+          <w:sz w:val="19"/>
+          <w:szCs w:val="19"/>
+        </w:rPr>
+        <w:br/>
+        <w:t xml:space="preserve">             ...</w:t>
+      </w:r>
+      <w:r>
+        <w:rPr>
+          <w:rFonts w:ascii="Consolas" w:cs="Consolas" w:eastAsia="Consolas" w:hAnsi="Consolas"/>
+          <w:color w:val="335577"/>
+          <w:sz w:val="19"/>
+          <w:szCs w:val="19"/>
+        </w:rPr>
+        <w:br/>
+        <w:t xml:space="preserve">         CATCH [e]</w:t>
+      </w:r>
+      <w:r>
+        <w:rPr>
+          <w:rFonts w:ascii="Consolas" w:cs="Consolas" w:eastAsia="Consolas" w:hAnsi="Consolas"/>
+          <w:color w:val="335577"/>
+          <w:sz w:val="19"/>
+          <w:szCs w:val="19"/>
+        </w:rPr>
+        <w:br/>
+        <w:t xml:space="preserve">             ...</w:t>
+      </w:r>
+      <w:r>
+        <w:rPr>
+          <w:rFonts w:ascii="Consolas" w:cs="Consolas" w:eastAsia="Consolas" w:hAnsi="Consolas"/>
+          <w:color w:val="335577"/>
+          <w:sz w:val="19"/>
+          <w:szCs w:val="19"/>
+        </w:rPr>
+        <w:br/>
+        <w:t xml:space="preserve">         END TRY</w:t>
       </w:r>
     </w:p>
     <w:p>
@@ -27785,6 +28109,759 @@
         </w:rPr>
         <w:t xml:space="preserve">Damit endet Teil II: Du beherrschst jetzt die ganze Sprache GameBasic – von Variablen über Schleifen und Funktionen bis zu Klassen, Coroutinen und Modulen. In den folgenden Teilen geht es um die eingebauten Befehle im Detail (Teil III), um Grafik, Sound und Spiele (Teil IV) und um die mitgelieferten Module (Teil V).</w:t>
       </w:r>
+    </w:p>
+    <w:p>
+      <w:pPr>
+        <w:pageBreakBefore/>
+        <w:spacing w:after="200" w:before="2600"/>
+        <w:jc w:val="center"/>
+      </w:pPr>
+      <w:r>
+        <w:rPr>
+          <w:b/>
+          <w:bCs/>
+          <w:color w:val="10507F"/>
+          <w:sz w:val="52"/>
+          <w:szCs w:val="52"/>
+        </w:rPr>
+        <w:t xml:space="preserve">Teil III — Eingebaute Befehle</w:t>
+      </w:r>
+    </w:p>
+    <w:p>
+      <w:pPr>
+        <w:pStyle w:val="Heading1"/>
+        <w:keepNext/>
+        <w:keepLines/>
+        <w:pageBreakBefore/>
+        <w:pBdr>
+          <w:bottom w:val="single" w:color="1B6CA8" w:sz="12" w:space="4"/>
+        </w:pBdr>
+        <w:spacing w:after="160" w:before="0"/>
+      </w:pPr>
+      <w:r>
+        <w:t xml:space="preserve">Konsole &amp; Ein-/Ausgabe</w:t>
+      </w:r>
+    </w:p>
+    <w:p>
+      <w:pPr>
+        <w:spacing w:after="180" w:line="312" w:lineRule="auto"/>
+      </w:pPr>
+      <w:r>
+        <w:rPr>
+          <w:sz w:val="22"/>
+          <w:szCs w:val="22"/>
+        </w:rPr>
+        <w:t xml:space="preserve">Mit Teil III beginnt der Nachschlage-Teil des Buches. Die folgenden Kapitel stellen die eingebauten Befehle von GameBasic geordnet nach Themen vor – jeweils mit Signatur, kurzer Erklärung und einem kleinen Beispiel. Du musst sie nicht am Stück lesen; nutze sie als Lexikon, wenn du einen bestimmten Befehl suchst.</w:t>
+      </w:r>
+    </w:p>
+    <w:p>
+      <w:pPr>
+        <w:spacing w:after="180" w:line="312" w:lineRule="auto"/>
+      </w:pPr>
+      <w:r>
+        <w:rPr>
+          <w:sz w:val="22"/>
+          <w:szCs w:val="22"/>
+        </w:rPr>
+        <w:t xml:space="preserve">Dieses erste Referenzkapitel sammelt die Befehle für die Textkonsole: ausgeben mit PRINT, einlesen mit INPUT, formatieren mit FORMAT$. Die Konsole ist die einfache textbasierte Ein- und Ausgabe – ganz ohne Grafikfenster. (Tastatur und Maus im Spielfenster behandelt Teil IV.)</w:t>
+      </w:r>
+    </w:p>
+    <w:p>
+      <w:pPr>
+        <w:pStyle w:val="Heading2"/>
+        <w:keepNext/>
+        <w:keepLines/>
+        <w:spacing w:after="120" w:before="280"/>
+      </w:pPr>
+      <w:r>
+        <w:t xml:space="preserve">Ausgabe</w:t>
+      </w:r>
+    </w:p>
+    <w:p>
+      <w:pPr>
+        <w:keepNext/>
+        <w:keepLines/>
+        <w:pBdr>
+          <w:bottom w:val="single" w:color="DDD0C0" w:sz="4" w:space="2"/>
+        </w:pBdr>
+        <w:spacing w:after="40" w:before="360"/>
+      </w:pPr>
+      <w:r>
+        <w:rPr>
+          <w:rFonts w:ascii="Consolas" w:cs="Consolas" w:eastAsia="Consolas" w:hAnsi="Consolas"/>
+          <w:b/>
+          <w:bCs/>
+          <w:color w:val="9A3412"/>
+          <w:sz w:val="24"/>
+          <w:szCs w:val="24"/>
+        </w:rPr>
+        <w:t xml:space="preserve">PRINT</w:t>
+      </w:r>
+    </w:p>
+    <w:p>
+      <w:pPr>
+        <w:keepNext/>
+        <w:spacing w:after="120"/>
+      </w:pPr>
+      <w:r>
+        <w:rPr>
+          <w:b/>
+          <w:bCs/>
+          <w:color w:val="6A6A6A"/>
+          <w:sz w:val="18"/>
+          <w:szCs w:val="18"/>
+        </w:rPr>
+        <w:t xml:space="preserve">Syntax:  </w:t>
+      </w:r>
+      <w:r>
+        <w:rPr>
+          <w:rFonts w:ascii="Consolas" w:cs="Consolas" w:eastAsia="Consolas" w:hAnsi="Consolas"/>
+          <w:color w:val="335577"/>
+          <w:sz w:val="19"/>
+          <w:szCs w:val="19"/>
+        </w:rPr>
+        <w:t xml:space="preserve">PRINT [wert1] [, oder ; wert2 ...] [;]</w:t>
+      </w:r>
+    </w:p>
+    <w:p>
+      <w:pPr>
+        <w:spacing w:after="180" w:line="312" w:lineRule="auto"/>
+      </w:pPr>
+      <w:r>
+        <w:rPr>
+          <w:sz w:val="22"/>
+          <w:szCs w:val="22"/>
+        </w:rPr>
+        <w:t xml:space="preserve">Gibt die Werte aus und beginnt eine neue Zeile. Mehrere Werte trennst du mit Komma (Leerzeichen dazwischen) oder Semikolon (kein Zwischenraum). Ein Semikolon ganz am Ende unterdrückt den Zeilenumbruch, sodass der nächste PRINT direkt anschließt. PRINT ohne Argument gibt eine Leerzeile aus.</w:t>
+      </w:r>
+    </w:p>
+    <w:p>
+      <w:pPr>
+        <w:spacing w:after="180" w:line="312" w:lineRule="auto"/>
+      </w:pPr>
+      <w:r>
+        <w:rPr>
+          <w:sz w:val="22"/>
+          <w:szCs w:val="22"/>
+        </w:rPr>
+        <w:t xml:space="preserve">Ausführlich erklärt im Kapitel „Ein- und Ausgabe“ (Teil II).</w:t>
+      </w:r>
+    </w:p>
+    <w:p>
+      <w:pPr>
+        <w:keepNext/>
+        <w:spacing w:after="30" w:before="120"/>
+      </w:pPr>
+      <w:r>
+        <w:rPr>
+          <w:b/>
+          <w:bCs/>
+          <w:i/>
+          <w:iCs/>
+          <w:color w:val="6A6A6A"/>
+          <w:sz w:val="18"/>
+          <w:szCs w:val="18"/>
+        </w:rPr>
+        <w:t xml:space="preserve">Beispiel</w:t>
+      </w:r>
+    </w:p>
+    <w:p>
+      <w:pPr>
+        <w:keepLines/>
+        <w:pBdr>
+          <w:left w:val="single" w:color="1B6CA8" w:sz="18" w:space="6"/>
+        </w:pBdr>
+        <w:shd w:fill="F4F4F4" w:val="clear"/>
+        <w:spacing w:after="200" w:before="100" w:line="264" w:lineRule="auto"/>
+        <w:ind w:left="140"/>
+      </w:pPr>
+      <w:r>
+        <w:rPr>
+          <w:rFonts w:ascii="Consolas" w:cs="Consolas" w:eastAsia="Consolas" w:hAnsi="Consolas"/>
+          <w:sz w:val="19"/>
+          <w:szCs w:val="19"/>
+        </w:rPr>
+        <w:t xml:space="preserve">PRINT "a", "b"       ' Komma: Leerzeichen</w:t>
+      </w:r>
+      <w:r>
+        <w:rPr>
+          <w:rFonts w:ascii="Consolas" w:cs="Consolas" w:eastAsia="Consolas" w:hAnsi="Consolas"/>
+          <w:sz w:val="19"/>
+          <w:szCs w:val="19"/>
+        </w:rPr>
+        <w:br/>
+        <w:t xml:space="preserve">PRINT "a"; "b"       ' Semikolon: kein Zwischenraum</w:t>
+      </w:r>
+      <w:r>
+        <w:rPr>
+          <w:rFonts w:ascii="Consolas" w:cs="Consolas" w:eastAsia="Consolas" w:hAnsi="Consolas"/>
+          <w:sz w:val="19"/>
+          <w:szCs w:val="19"/>
+        </w:rPr>
+        <w:br/>
+        <w:t xml:space="preserve">PRINT "Punkte: "; 42</w:t>
+      </w:r>
+    </w:p>
+    <w:p>
+      <w:pPr>
+        <w:keepNext/>
+        <w:spacing w:after="30" w:before="120"/>
+      </w:pPr>
+      <w:r>
+        <w:rPr>
+          <w:b/>
+          <w:bCs/>
+          <w:i/>
+          <w:iCs/>
+          <w:color w:val="6A6A6A"/>
+          <w:sz w:val="18"/>
+          <w:szCs w:val="18"/>
+        </w:rPr>
+        <w:t xml:space="preserve">Ausgabe</w:t>
+      </w:r>
+    </w:p>
+    <w:p>
+      <w:pPr>
+        <w:keepLines/>
+        <w:pBdr>
+          <w:left w:val="single" w:color="9AC79A" w:sz="18" w:space="6"/>
+        </w:pBdr>
+        <w:shd w:fill="EAF4EA" w:val="clear"/>
+        <w:spacing w:after="200" w:before="100" w:line="264" w:lineRule="auto"/>
+        <w:ind w:left="140"/>
+      </w:pPr>
+      <w:r>
+        <w:rPr>
+          <w:rFonts w:ascii="Consolas" w:cs="Consolas" w:eastAsia="Consolas" w:hAnsi="Consolas"/>
+          <w:sz w:val="19"/>
+          <w:szCs w:val="19"/>
+        </w:rPr>
+        <w:t xml:space="preserve">a b</w:t>
+      </w:r>
+      <w:r>
+        <w:rPr>
+          <w:rFonts w:ascii="Consolas" w:cs="Consolas" w:eastAsia="Consolas" w:hAnsi="Consolas"/>
+          <w:sz w:val="19"/>
+          <w:szCs w:val="19"/>
+        </w:rPr>
+        <w:br/>
+        <w:t xml:space="preserve">ab</w:t>
+      </w:r>
+      <w:r>
+        <w:rPr>
+          <w:rFonts w:ascii="Consolas" w:cs="Consolas" w:eastAsia="Consolas" w:hAnsi="Consolas"/>
+          <w:sz w:val="19"/>
+          <w:szCs w:val="19"/>
+        </w:rPr>
+        <w:br/>
+        <w:t xml:space="preserve">Punkte: 42</w:t>
+      </w:r>
+    </w:p>
+    <w:p>
+      <w:pPr>
+        <w:pStyle w:val="Heading2"/>
+        <w:keepNext/>
+        <w:keepLines/>
+        <w:spacing w:after="120" w:before="280"/>
+      </w:pPr>
+      <w:r>
+        <w:t xml:space="preserve">Eingabe</w:t>
+      </w:r>
+    </w:p>
+    <w:p>
+      <w:pPr>
+        <w:keepNext/>
+        <w:keepLines/>
+        <w:pBdr>
+          <w:bottom w:val="single" w:color="DDD0C0" w:sz="4" w:space="2"/>
+        </w:pBdr>
+        <w:spacing w:after="40" w:before="360"/>
+      </w:pPr>
+      <w:r>
+        <w:rPr>
+          <w:rFonts w:ascii="Consolas" w:cs="Consolas" w:eastAsia="Consolas" w:hAnsi="Consolas"/>
+          <w:b/>
+          <w:bCs/>
+          <w:color w:val="9A3412"/>
+          <w:sz w:val="24"/>
+          <w:szCs w:val="24"/>
+        </w:rPr>
+        <w:t xml:space="preserve">INPUT</w:t>
+      </w:r>
+    </w:p>
+    <w:p>
+      <w:pPr>
+        <w:keepNext/>
+        <w:spacing w:after="120"/>
+      </w:pPr>
+      <w:r>
+        <w:rPr>
+          <w:b/>
+          <w:bCs/>
+          <w:color w:val="6A6A6A"/>
+          <w:sz w:val="18"/>
+          <w:szCs w:val="18"/>
+        </w:rPr>
+        <w:t xml:space="preserve">Syntax:  </w:t>
+      </w:r>
+      <w:r>
+        <w:rPr>
+          <w:rFonts w:ascii="Consolas" w:cs="Consolas" w:eastAsia="Consolas" w:hAnsi="Consolas"/>
+          <w:color w:val="335577"/>
+          <w:sz w:val="19"/>
+          <w:szCs w:val="19"/>
+        </w:rPr>
+        <w:t xml:space="preserve">INPUT variable</w:t>
+      </w:r>
+      <w:r>
+        <w:rPr>
+          <w:rFonts w:ascii="Consolas" w:cs="Consolas" w:eastAsia="Consolas" w:hAnsi="Consolas"/>
+          <w:color w:val="335577"/>
+          <w:sz w:val="19"/>
+          <w:szCs w:val="19"/>
+        </w:rPr>
+        <w:br/>
+        <w:t xml:space="preserve">         INPUT "Frage", variable</w:t>
+      </w:r>
+    </w:p>
+    <w:p>
+      <w:pPr>
+        <w:spacing w:after="180" w:line="312" w:lineRule="auto"/>
+      </w:pPr>
+      <w:r>
+        <w:rPr>
+          <w:sz w:val="22"/>
+          <w:szCs w:val="22"/>
+        </w:rPr>
+        <w:t xml:space="preserve">Liest eine Zeile von der Tastatur in die Variable. Die Eingabe wird in den Typ der Variablen umgewandelt (Zahl, Text, Wahrheitswert). Optional steht ein Fragetext davor. Die Variable muss vorher mit DIM angelegt sein.</w:t>
+      </w:r>
+    </w:p>
+    <w:p>
+      <w:pPr>
+        <w:keepNext/>
+        <w:spacing w:after="30" w:before="120"/>
+      </w:pPr>
+      <w:r>
+        <w:rPr>
+          <w:b/>
+          <w:bCs/>
+          <w:i/>
+          <w:iCs/>
+          <w:color w:val="6A6A6A"/>
+          <w:sz w:val="18"/>
+          <w:szCs w:val="18"/>
+        </w:rPr>
+        <w:t xml:space="preserve">Beispiel</w:t>
+      </w:r>
+    </w:p>
+    <w:p>
+      <w:pPr>
+        <w:keepLines/>
+        <w:pBdr>
+          <w:left w:val="single" w:color="1B6CA8" w:sz="18" w:space="6"/>
+        </w:pBdr>
+        <w:shd w:fill="F4F4F4" w:val="clear"/>
+        <w:spacing w:after="200" w:before="100" w:line="264" w:lineRule="auto"/>
+        <w:ind w:left="140"/>
+      </w:pPr>
+      <w:r>
+        <w:rPr>
+          <w:rFonts w:ascii="Consolas" w:cs="Consolas" w:eastAsia="Consolas" w:hAnsi="Consolas"/>
+          <w:sz w:val="19"/>
+          <w:szCs w:val="19"/>
+        </w:rPr>
+        <w:t xml:space="preserve">DIM name AS STRING</w:t>
+      </w:r>
+      <w:r>
+        <w:rPr>
+          <w:rFonts w:ascii="Consolas" w:cs="Consolas" w:eastAsia="Consolas" w:hAnsi="Consolas"/>
+          <w:sz w:val="19"/>
+          <w:szCs w:val="19"/>
+        </w:rPr>
+        <w:br/>
+        <w:t xml:space="preserve">INPUT "Wie heißt du? ", name</w:t>
+      </w:r>
+      <w:r>
+        <w:rPr>
+          <w:rFonts w:ascii="Consolas" w:cs="Consolas" w:eastAsia="Consolas" w:hAnsi="Consolas"/>
+          <w:sz w:val="19"/>
+          <w:szCs w:val="19"/>
+        </w:rPr>
+        <w:br/>
+        <w:t xml:space="preserve">PRINT "Hallo, " + name</w:t>
+      </w:r>
+    </w:p>
+    <w:p>
+      <w:pPr>
+        <w:pStyle w:val="Heading2"/>
+        <w:keepNext/>
+        <w:keepLines/>
+        <w:spacing w:after="120" w:before="280"/>
+      </w:pPr>
+      <w:r>
+        <w:t xml:space="preserve">Formatieren</w:t>
+      </w:r>
+    </w:p>
+    <w:p>
+      <w:pPr>
+        <w:keepNext/>
+        <w:keepLines/>
+        <w:pBdr>
+          <w:bottom w:val="single" w:color="DDD0C0" w:sz="4" w:space="2"/>
+        </w:pBdr>
+        <w:spacing w:after="40" w:before="360"/>
+      </w:pPr>
+      <w:r>
+        <w:rPr>
+          <w:rFonts w:ascii="Consolas" w:cs="Consolas" w:eastAsia="Consolas" w:hAnsi="Consolas"/>
+          <w:b/>
+          <w:bCs/>
+          <w:color w:val="9A3412"/>
+          <w:sz w:val="24"/>
+          <w:szCs w:val="24"/>
+        </w:rPr>
+        <w:t xml:space="preserve">FORMAT$</w:t>
+      </w:r>
+    </w:p>
+    <w:p>
+      <w:pPr>
+        <w:keepNext/>
+        <w:spacing w:after="120"/>
+      </w:pPr>
+      <w:r>
+        <w:rPr>
+          <w:b/>
+          <w:bCs/>
+          <w:color w:val="6A6A6A"/>
+          <w:sz w:val="18"/>
+          <w:szCs w:val="18"/>
+        </w:rPr>
+        <w:t xml:space="preserve">Syntax:  </w:t>
+      </w:r>
+      <w:r>
+        <w:rPr>
+          <w:rFonts w:ascii="Consolas" w:cs="Consolas" w:eastAsia="Consolas" w:hAnsi="Consolas"/>
+          <w:color w:val="335577"/>
+          <w:sz w:val="19"/>
+          <w:szCs w:val="19"/>
+        </w:rPr>
+        <w:t xml:space="preserve">FORMAT$(wert, format$)</w:t>
+      </w:r>
+    </w:p>
+    <w:p>
+      <w:pPr>
+        <w:spacing w:after="180" w:line="312" w:lineRule="auto"/>
+      </w:pPr>
+      <w:r>
+        <w:rPr>
+          <w:sz w:val="22"/>
+          <w:szCs w:val="22"/>
+        </w:rPr>
+        <w:t xml:space="preserve">Formatiert einen Wert nach einer Format-Angabe im C-Stil und liefert einen String. Der Platzhalter beginnt mit %. Die wichtigsten: %d (ganze Zahl), %.Nf (Kommazahl mit N Nachkommastellen), %0Nd (Zahl mit führenden Nullen auf N Stellen), %x (hexadezimal), %s (String). Text um den Platzhalter herum bleibt erhalten.</w:t>
+      </w:r>
+    </w:p>
+    <w:p>
+      <w:pPr>
+        <w:keepNext/>
+        <w:spacing w:after="30" w:before="120"/>
+      </w:pPr>
+      <w:r>
+        <w:rPr>
+          <w:b/>
+          <w:bCs/>
+          <w:i/>
+          <w:iCs/>
+          <w:color w:val="6A6A6A"/>
+          <w:sz w:val="18"/>
+          <w:szCs w:val="18"/>
+        </w:rPr>
+        <w:t xml:space="preserve">Beispiel</w:t>
+      </w:r>
+    </w:p>
+    <w:p>
+      <w:pPr>
+        <w:keepLines/>
+        <w:pBdr>
+          <w:left w:val="single" w:color="1B6CA8" w:sz="18" w:space="6"/>
+        </w:pBdr>
+        <w:shd w:fill="F4F4F4" w:val="clear"/>
+        <w:spacing w:after="200" w:before="100" w:line="264" w:lineRule="auto"/>
+        <w:ind w:left="140"/>
+      </w:pPr>
+      <w:r>
+        <w:rPr>
+          <w:rFonts w:ascii="Consolas" w:cs="Consolas" w:eastAsia="Consolas" w:hAnsi="Consolas"/>
+          <w:sz w:val="19"/>
+          <w:szCs w:val="19"/>
+        </w:rPr>
+        <w:t xml:space="preserve">PRINT FORMAT$(3.14159, "%.2f")</w:t>
+      </w:r>
+      <w:r>
+        <w:rPr>
+          <w:rFonts w:ascii="Consolas" w:cs="Consolas" w:eastAsia="Consolas" w:hAnsi="Consolas"/>
+          <w:sz w:val="19"/>
+          <w:szCs w:val="19"/>
+        </w:rPr>
+        <w:br/>
+        <w:t xml:space="preserve">PRINT FORMAT$(42, "%05d")</w:t>
+      </w:r>
+      <w:r>
+        <w:rPr>
+          <w:rFonts w:ascii="Consolas" w:cs="Consolas" w:eastAsia="Consolas" w:hAnsi="Consolas"/>
+          <w:sz w:val="19"/>
+          <w:szCs w:val="19"/>
+        </w:rPr>
+        <w:br/>
+        <w:t xml:space="preserve">PRINT FORMAT$(255, "%x")</w:t>
+      </w:r>
+      <w:r>
+        <w:rPr>
+          <w:rFonts w:ascii="Consolas" w:cs="Consolas" w:eastAsia="Consolas" w:hAnsi="Consolas"/>
+          <w:sz w:val="19"/>
+          <w:szCs w:val="19"/>
+        </w:rPr>
+        <w:br/>
+        <w:t xml:space="preserve">PRINT FORMAT$(7, "Level %03d")</w:t>
+      </w:r>
+    </w:p>
+    <w:p>
+      <w:pPr>
+        <w:keepNext/>
+        <w:spacing w:after="30" w:before="120"/>
+      </w:pPr>
+      <w:r>
+        <w:rPr>
+          <w:b/>
+          <w:bCs/>
+          <w:i/>
+          <w:iCs/>
+          <w:color w:val="6A6A6A"/>
+          <w:sz w:val="18"/>
+          <w:szCs w:val="18"/>
+        </w:rPr>
+        <w:t xml:space="preserve">Ausgabe</w:t>
+      </w:r>
+    </w:p>
+    <w:p>
+      <w:pPr>
+        <w:keepLines/>
+        <w:pBdr>
+          <w:left w:val="single" w:color="9AC79A" w:sz="18" w:space="6"/>
+        </w:pBdr>
+        <w:shd w:fill="EAF4EA" w:val="clear"/>
+        <w:spacing w:after="200" w:before="100" w:line="264" w:lineRule="auto"/>
+        <w:ind w:left="140"/>
+      </w:pPr>
+      <w:r>
+        <w:rPr>
+          <w:rFonts w:ascii="Consolas" w:cs="Consolas" w:eastAsia="Consolas" w:hAnsi="Consolas"/>
+          <w:sz w:val="19"/>
+          <w:szCs w:val="19"/>
+        </w:rPr>
+        <w:t xml:space="preserve">3.14</w:t>
+      </w:r>
+      <w:r>
+        <w:rPr>
+          <w:rFonts w:ascii="Consolas" w:cs="Consolas" w:eastAsia="Consolas" w:hAnsi="Consolas"/>
+          <w:sz w:val="19"/>
+          <w:szCs w:val="19"/>
+        </w:rPr>
+        <w:br/>
+        <w:t xml:space="preserve">00042</w:t>
+      </w:r>
+      <w:r>
+        <w:rPr>
+          <w:rFonts w:ascii="Consolas" w:cs="Consolas" w:eastAsia="Consolas" w:hAnsi="Consolas"/>
+          <w:sz w:val="19"/>
+          <w:szCs w:val="19"/>
+        </w:rPr>
+        <w:br/>
+        <w:t xml:space="preserve">ff</w:t>
+      </w:r>
+      <w:r>
+        <w:rPr>
+          <w:rFonts w:ascii="Consolas" w:cs="Consolas" w:eastAsia="Consolas" w:hAnsi="Consolas"/>
+          <w:sz w:val="19"/>
+          <w:szCs w:val="19"/>
+        </w:rPr>
+        <w:br/>
+        <w:t xml:space="preserve">Level 007</w:t>
+      </w:r>
+    </w:p>
+    <w:p>
+      <w:pPr>
+        <w:spacing w:before="60"/>
+      </w:pPr>
+    </w:p>
+    <w:tbl>
+      <w:tblPr>
+        <w:tblW w:type="dxa" w:w="9360"/>
+        <w:tblBorders>
+          <w:top w:val="single" w:color="auto" w:sz="4"/>
+          <w:left w:val="single" w:color="auto" w:sz="4"/>
+          <w:bottom w:val="single" w:color="auto" w:sz="4"/>
+          <w:right w:val="single" w:color="auto" w:sz="4"/>
+          <w:insideH w:val="single" w:color="auto" w:sz="4"/>
+          <w:insideV w:val="single" w:color="auto" w:sz="4"/>
+        </w:tblBorders>
+      </w:tblPr>
+      <w:tblGrid>
+        <w:gridCol w:w="9360"/>
+      </w:tblGrid>
+      <w:tr>
+        <w:trPr>
+          <w:cantSplit/>
+        </w:trPr>
+        <w:tc>
+          <w:tcPr>
+            <w:tcW w:type="dxa" w:w="9360"/>
+            <w:tcBorders>
+              <w:top w:val="single" w:color="E0B96A" w:sz="6"/>
+              <w:left w:val="single" w:color="E0B96A" w:sz="6"/>
+              <w:bottom w:val="single" w:color="E0B96A" w:sz="6"/>
+              <w:right w:val="single" w:color="E0B96A" w:sz="6"/>
+            </w:tcBorders>
+            <w:shd w:fill="FDF3E0" w:val="clear"/>
+            <w:tcMar>
+              <w:top w:type="dxa" w:w="140"/>
+              <w:left w:type="dxa" w:w="180"/>
+              <w:bottom w:type="dxa" w:w="140"/>
+              <w:right w:type="dxa" w:w="180"/>
+            </w:tcMar>
+          </w:tcPr>
+          <w:p>
+            <w:pPr>
+              <w:spacing w:after="40"/>
+            </w:pPr>
+            <w:r>
+              <w:rPr>
+                <w:b/>
+                <w:bCs/>
+                <w:color w:val="9A6A1E"/>
+                <w:sz w:val="22"/>
+                <w:szCs w:val="22"/>
+              </w:rPr>
+              <w:t xml:space="preserve">Merke</w:t>
+            </w:r>
+          </w:p>
+          <w:p>
+            <w:pPr>
+              <w:spacing w:after="0" w:line="312" w:lineRule="auto"/>
+            </w:pPr>
+            <w:r>
+              <w:rPr>
+                <w:sz w:val="22"/>
+                <w:szCs w:val="22"/>
+              </w:rPr>
+              <w:t xml:space="preserve">Innerhalb eines f-Strings kannst du dieselben Format-Angaben direkt im Platzhalter nutzen: f"FPS {wert:.1f}". Das ist meist die bequemste Art zu formatieren – siehe Kapitel „Ein- und Ausgabe“.</w:t>
+            </w:r>
+          </w:p>
+        </w:tc>
+      </w:tr>
+    </w:tbl>
+    <w:p>
+      <w:pPr>
+        <w:spacing w:after="160"/>
+      </w:pPr>
+    </w:p>
+    <w:p>
+      <w:pPr>
+        <w:pStyle w:val="Heading2"/>
+        <w:keepNext/>
+        <w:keepLines/>
+        <w:spacing w:after="120" w:before="280"/>
+      </w:pPr>
+      <w:r>
+        <w:t xml:space="preserve">Hinweis zur Konsole und zum Spielfenster</w:t>
+      </w:r>
+    </w:p>
+    <w:p>
+      <w:pPr>
+        <w:spacing w:after="180" w:line="312" w:lineRule="auto"/>
+      </w:pPr>
+      <w:r>
+        <w:rPr>
+          <w:sz w:val="22"/>
+          <w:szCs w:val="22"/>
+        </w:rPr>
+        <w:t xml:space="preserve">PRINT und INPUT arbeiten mit der Textkonsole. Sobald du ein Grafikfenster öffnest (mit SCREEN, siehe Teil IV), zeichnest du Text stattdessen mit TEXT an eine Bildposition, und Tastendrücke fragst du mit Befehlen wie KEYPRESSED oder dem Eingabe-Modul ab – nicht mit INPUT. Für Konsolen-Programme (reine Logik, kleine Helfer, Lernbeispiele) bleibt dieses Kapitel dein Handwerkszeug.</w:t>
+      </w:r>
+    </w:p>
+    <w:p>
+      <w:pPr>
+        <w:spacing w:before="60"/>
+      </w:pPr>
+    </w:p>
+    <w:tbl>
+      <w:tblPr>
+        <w:tblW w:type="dxa" w:w="9360"/>
+        <w:tblBorders>
+          <w:top w:val="single" w:color="auto" w:sz="4"/>
+          <w:left w:val="single" w:color="auto" w:sz="4"/>
+          <w:bottom w:val="single" w:color="auto" w:sz="4"/>
+          <w:right w:val="single" w:color="auto" w:sz="4"/>
+          <w:insideH w:val="single" w:color="auto" w:sz="4"/>
+          <w:insideV w:val="single" w:color="auto" w:sz="4"/>
+        </w:tblBorders>
+      </w:tblPr>
+      <w:tblGrid>
+        <w:gridCol w:w="9360"/>
+      </w:tblGrid>
+      <w:tr>
+        <w:trPr>
+          <w:cantSplit/>
+        </w:trPr>
+        <w:tc>
+          <w:tcPr>
+            <w:tcW w:type="dxa" w:w="9360"/>
+            <w:tcBorders>
+              <w:top w:val="single" w:color="9CC8E6" w:sz="6"/>
+              <w:left w:val="single" w:color="9CC8E6" w:sz="6"/>
+              <w:bottom w:val="single" w:color="9CC8E6" w:sz="6"/>
+              <w:right w:val="single" w:color="9CC8E6" w:sz="6"/>
+            </w:tcBorders>
+            <w:shd w:fill="E7F2FA" w:val="clear"/>
+            <w:tcMar>
+              <w:top w:type="dxa" w:w="140"/>
+              <w:left w:type="dxa" w:w="180"/>
+              <w:bottom w:type="dxa" w:w="140"/>
+              <w:right w:type="dxa" w:w="180"/>
+            </w:tcMar>
+          </w:tcPr>
+          <w:p>
+            <w:pPr>
+              <w:spacing w:after="40"/>
+            </w:pPr>
+            <w:r>
+              <w:rPr>
+                <w:b/>
+                <w:bCs/>
+                <w:color w:val="1B6CA8"/>
+                <w:sz w:val="22"/>
+                <w:szCs w:val="22"/>
+              </w:rPr>
+              <w:t xml:space="preserve">Wo geht es weiter?</w:t>
+            </w:r>
+          </w:p>
+          <w:p>
+            <w:pPr>
+              <w:spacing w:after="0" w:line="312" w:lineRule="auto"/>
+            </w:pPr>
+            <w:r>
+              <w:rPr>
+                <w:sz w:val="22"/>
+                <w:szCs w:val="22"/>
+              </w:rPr>
+              <w:t xml:space="preserve">Zahl- und Textumwandlung für die Ausgabe (STR$, VAL, CHR$ …) findest du im Kapitel „Typumwandlung &amp; Prüfung“ und bei den „Zeichenketten-Funktionen“. Grafiktext, Tastatur und Maus kommen in Teil IV („Grafik, Sound &amp; Spiele“).</w:t>
+            </w:r>
+          </w:p>
+        </w:tc>
+      </w:tr>
+    </w:tbl>
+    <w:p>
+      <w:pPr>
+        <w:spacing w:after="160"/>
+      </w:pPr>
     </w:p>
     <w:sectPr>
       <w:footerReference w:type="default" r:id="rId7"/>

</xml_diff>

<commit_message>
docs(buch): Lehrbuch Kap 31 -- Mathematik (Referenz)
ABS/SQR/POW/HYPOT/EXP/LOG, FLOOR/CEIL/ROUND, MIN/MAX/CLAMP/SIGN,
LERP/REMAP, SIN/COS/TAN/ATAN2/DEG/RAD, WRAP/PINGPONG/MOVETOWARD, PI/TAU
(kein E -> EXP(1)). Alle Beispiel-Ausgaben gegen gbrt verifiziert.

Co-Authored-By: Claude Opus 4.8 (1M context) <noreply@anthropic.com>
</commit_message>
<xml_diff>
--- a/buch-referenz/buch/GameBasic-Lehrbuch.docx
+++ b/buch-referenz/buch/GameBasic-Lehrbuch.docx
@@ -759,6 +759,33 @@
           <w:szCs w:val="22"/>
         </w:rPr>
         <w:t xml:space="preserve">	89</w:t>
+      </w:r>
+    </w:p>
+    <w:p>
+      <w:pPr>
+        <w:tabs>
+          <w:tab w:val="right" w:pos="9200" w:leader="dot"/>
+        </w:tabs>
+        <w:spacing w:after="20" w:before="0"/>
+        <w:ind w:left="280"/>
+      </w:pPr>
+      <w:r>
+        <w:rPr>
+          <w:b w:val="false"/>
+          <w:bCs w:val="false"/>
+          <w:color w:val="222222"/>
+          <w:sz w:val="22"/>
+          <w:szCs w:val="22"/>
+        </w:rPr>
+        <w:t xml:space="preserve">Mathematik</w:t>
+      </w:r>
+      <w:r>
+        <w:rPr>
+          <w:color w:val="555555"/>
+          <w:sz w:val="22"/>
+          <w:szCs w:val="22"/>
+        </w:rPr>
+        <w:t xml:space="preserve">	92</w:t>
       </w:r>
     </w:p>
     <w:p>
@@ -28853,6 +28880,1652 @@
                 <w:szCs w:val="22"/>
               </w:rPr>
               <w:t xml:space="preserve">Zahl- und Textumwandlung für die Ausgabe (STR$, VAL, CHR$ …) findest du im Kapitel „Typumwandlung &amp; Prüfung“ und bei den „Zeichenketten-Funktionen“. Grafiktext, Tastatur und Maus kommen in Teil IV („Grafik, Sound &amp; Spiele“).</w:t>
+            </w:r>
+          </w:p>
+        </w:tc>
+      </w:tr>
+    </w:tbl>
+    <w:p>
+      <w:pPr>
+        <w:spacing w:after="160"/>
+      </w:pPr>
+    </w:p>
+    <w:p>
+      <w:pPr>
+        <w:pStyle w:val="Heading1"/>
+        <w:keepNext/>
+        <w:keepLines/>
+        <w:pageBreakBefore/>
+        <w:pBdr>
+          <w:bottom w:val="single" w:color="1B6CA8" w:sz="12" w:space="4"/>
+        </w:pBdr>
+        <w:spacing w:after="160" w:before="0"/>
+      </w:pPr>
+      <w:r>
+        <w:t xml:space="preserve">Mathematik</w:t>
+      </w:r>
+    </w:p>
+    <w:p>
+      <w:pPr>
+        <w:spacing w:after="180" w:line="312" w:lineRule="auto"/>
+      </w:pPr>
+      <w:r>
+        <w:rPr>
+          <w:sz w:val="22"/>
+          <w:szCs w:val="22"/>
+        </w:rPr>
+        <w:t xml:space="preserve">GameBasic bringt eine vollständige Mathe-Bibliothek mit – von einfachen Funktionen wie Betrag und Wurzel bis zu Trigonometrie und praktischen Spiel-Helfern. Alle hier vorgestellten Funktionen sind direkt verfügbar, ohne IMPORT. Winkel werden, wie in der Mathematik üblich, im Bogenmaß (Radiant) angegeben – mit DEG und RAD rechnest du nach Grad um.</w:t>
+      </w:r>
+    </w:p>
+    <w:p>
+      <w:pPr>
+        <w:pStyle w:val="Heading2"/>
+        <w:keepNext/>
+        <w:keepLines/>
+        <w:spacing w:after="120" w:before="280"/>
+      </w:pPr>
+      <w:r>
+        <w:t xml:space="preserve">Grundfunktionen</w:t>
+      </w:r>
+    </w:p>
+    <w:p>
+      <w:pPr>
+        <w:keepNext/>
+        <w:keepLines/>
+        <w:pBdr>
+          <w:bottom w:val="single" w:color="DDD0C0" w:sz="4" w:space="2"/>
+        </w:pBdr>
+        <w:spacing w:after="40" w:before="360"/>
+      </w:pPr>
+      <w:r>
+        <w:rPr>
+          <w:rFonts w:ascii="Consolas" w:cs="Consolas" w:eastAsia="Consolas" w:hAnsi="Consolas"/>
+          <w:b/>
+          <w:bCs/>
+          <w:color w:val="9A3412"/>
+          <w:sz w:val="24"/>
+          <w:szCs w:val="24"/>
+        </w:rPr>
+        <w:t xml:space="preserve">ABS · SQR · POW · HYPOT</w:t>
+      </w:r>
+    </w:p>
+    <w:p>
+      <w:pPr>
+        <w:keepNext/>
+        <w:spacing w:after="120"/>
+      </w:pPr>
+      <w:r>
+        <w:rPr>
+          <w:b/>
+          <w:bCs/>
+          <w:color w:val="6A6A6A"/>
+          <w:sz w:val="18"/>
+          <w:szCs w:val="18"/>
+        </w:rPr>
+        <w:t xml:space="preserve">Syntax:  </w:t>
+      </w:r>
+      <w:r>
+        <w:rPr>
+          <w:rFonts w:ascii="Consolas" w:cs="Consolas" w:eastAsia="Consolas" w:hAnsi="Consolas"/>
+          <w:color w:val="335577"/>
+          <w:sz w:val="19"/>
+          <w:szCs w:val="19"/>
+        </w:rPr>
+        <w:t xml:space="preserve">ABS(x)   SQR(x)   POW(b, e)   HYPOT(x, y)</w:t>
+      </w:r>
+    </w:p>
+    <w:p>
+      <w:pPr>
+        <w:spacing w:after="180" w:line="312" w:lineRule="auto"/>
+      </w:pPr>
+      <w:r>
+        <w:rPr>
+          <w:sz w:val="22"/>
+          <w:szCs w:val="22"/>
+        </w:rPr>
+        <w:t xml:space="preserve">ABS liefert den Betrag (das Vorzeichen fällt weg), SQR die Quadratwurzel (x ≥ 0), POW die Potenz (b hoch e), HYPOT die Länge der Hypotenuse – also die Wurzel aus x²+y², ohne Überlauf. (SQRT ist ein erlaubter Zweitname für SQR.)</w:t>
+      </w:r>
+    </w:p>
+    <w:p>
+      <w:pPr>
+        <w:keepNext/>
+        <w:spacing w:after="30" w:before="120"/>
+      </w:pPr>
+      <w:r>
+        <w:rPr>
+          <w:b/>
+          <w:bCs/>
+          <w:i/>
+          <w:iCs/>
+          <w:color w:val="6A6A6A"/>
+          <w:sz w:val="18"/>
+          <w:szCs w:val="18"/>
+        </w:rPr>
+        <w:t xml:space="preserve">Beispiel</w:t>
+      </w:r>
+    </w:p>
+    <w:p>
+      <w:pPr>
+        <w:keepLines/>
+        <w:pBdr>
+          <w:left w:val="single" w:color="1B6CA8" w:sz="18" w:space="6"/>
+        </w:pBdr>
+        <w:shd w:fill="F4F4F4" w:val="clear"/>
+        <w:spacing w:after="200" w:before="100" w:line="264" w:lineRule="auto"/>
+        <w:ind w:left="140"/>
+      </w:pPr>
+      <w:r>
+        <w:rPr>
+          <w:rFonts w:ascii="Consolas" w:cs="Consolas" w:eastAsia="Consolas" w:hAnsi="Consolas"/>
+          <w:sz w:val="19"/>
+          <w:szCs w:val="19"/>
+        </w:rPr>
+        <w:t xml:space="preserve">PRINT ABS(-7)</w:t>
+      </w:r>
+      <w:r>
+        <w:rPr>
+          <w:rFonts w:ascii="Consolas" w:cs="Consolas" w:eastAsia="Consolas" w:hAnsi="Consolas"/>
+          <w:sz w:val="19"/>
+          <w:szCs w:val="19"/>
+        </w:rPr>
+        <w:br/>
+        <w:t xml:space="preserve">PRINT POW(2, 10)</w:t>
+      </w:r>
+      <w:r>
+        <w:rPr>
+          <w:rFonts w:ascii="Consolas" w:cs="Consolas" w:eastAsia="Consolas" w:hAnsi="Consolas"/>
+          <w:sz w:val="19"/>
+          <w:szCs w:val="19"/>
+        </w:rPr>
+        <w:br/>
+        <w:t xml:space="preserve">PRINT HYPOT(3.0, 4.0)</w:t>
+      </w:r>
+    </w:p>
+    <w:p>
+      <w:pPr>
+        <w:keepNext/>
+        <w:spacing w:after="30" w:before="120"/>
+      </w:pPr>
+      <w:r>
+        <w:rPr>
+          <w:b/>
+          <w:bCs/>
+          <w:i/>
+          <w:iCs/>
+          <w:color w:val="6A6A6A"/>
+          <w:sz w:val="18"/>
+          <w:szCs w:val="18"/>
+        </w:rPr>
+        <w:t xml:space="preserve">Ausgabe</w:t>
+      </w:r>
+    </w:p>
+    <w:p>
+      <w:pPr>
+        <w:keepLines/>
+        <w:pBdr>
+          <w:left w:val="single" w:color="9AC79A" w:sz="18" w:space="6"/>
+        </w:pBdr>
+        <w:shd w:fill="EAF4EA" w:val="clear"/>
+        <w:spacing w:after="200" w:before="100" w:line="264" w:lineRule="auto"/>
+        <w:ind w:left="140"/>
+      </w:pPr>
+      <w:r>
+        <w:rPr>
+          <w:rFonts w:ascii="Consolas" w:cs="Consolas" w:eastAsia="Consolas" w:hAnsi="Consolas"/>
+          <w:sz w:val="19"/>
+          <w:szCs w:val="19"/>
+        </w:rPr>
+        <w:t xml:space="preserve">7</w:t>
+      </w:r>
+      <w:r>
+        <w:rPr>
+          <w:rFonts w:ascii="Consolas" w:cs="Consolas" w:eastAsia="Consolas" w:hAnsi="Consolas"/>
+          <w:sz w:val="19"/>
+          <w:szCs w:val="19"/>
+        </w:rPr>
+        <w:br/>
+        <w:t xml:space="preserve">1024</w:t>
+      </w:r>
+      <w:r>
+        <w:rPr>
+          <w:rFonts w:ascii="Consolas" w:cs="Consolas" w:eastAsia="Consolas" w:hAnsi="Consolas"/>
+          <w:sz w:val="19"/>
+          <w:szCs w:val="19"/>
+        </w:rPr>
+        <w:br/>
+        <w:t xml:space="preserve">5.0</w:t>
+      </w:r>
+    </w:p>
+    <w:p>
+      <w:pPr>
+        <w:keepNext/>
+        <w:keepLines/>
+        <w:pBdr>
+          <w:bottom w:val="single" w:color="DDD0C0" w:sz="4" w:space="2"/>
+        </w:pBdr>
+        <w:spacing w:after="40" w:before="360"/>
+      </w:pPr>
+      <w:r>
+        <w:rPr>
+          <w:rFonts w:ascii="Consolas" w:cs="Consolas" w:eastAsia="Consolas" w:hAnsi="Consolas"/>
+          <w:b/>
+          <w:bCs/>
+          <w:color w:val="9A3412"/>
+          <w:sz w:val="24"/>
+          <w:szCs w:val="24"/>
+        </w:rPr>
+        <w:t xml:space="preserve">EXP · LOG</w:t>
+      </w:r>
+    </w:p>
+    <w:p>
+      <w:pPr>
+        <w:keepNext/>
+        <w:spacing w:after="120"/>
+      </w:pPr>
+      <w:r>
+        <w:rPr>
+          <w:b/>
+          <w:bCs/>
+          <w:color w:val="6A6A6A"/>
+          <w:sz w:val="18"/>
+          <w:szCs w:val="18"/>
+        </w:rPr>
+        <w:t xml:space="preserve">Syntax:  </w:t>
+      </w:r>
+      <w:r>
+        <w:rPr>
+          <w:rFonts w:ascii="Consolas" w:cs="Consolas" w:eastAsia="Consolas" w:hAnsi="Consolas"/>
+          <w:color w:val="335577"/>
+          <w:sz w:val="19"/>
+          <w:szCs w:val="19"/>
+        </w:rPr>
+        <w:t xml:space="preserve">EXP(x)   LOG(x[, basis])</w:t>
+      </w:r>
+    </w:p>
+    <w:p>
+      <w:pPr>
+        <w:spacing w:after="180" w:line="312" w:lineRule="auto"/>
+      </w:pPr>
+      <w:r>
+        <w:rPr>
+          <w:sz w:val="22"/>
+          <w:szCs w:val="22"/>
+        </w:rPr>
+        <w:t xml:space="preserve">EXP ist e hoch x, LOG der Logarithmus (ohne Basis: der natürliche Logarithmus zur Basis e; mit zweitem Argument zu beliebiger Basis). LOG10 gibt es als Kurzform für den Zehnerlogarithmus.</w:t>
+      </w:r>
+    </w:p>
+    <w:p>
+      <w:pPr>
+        <w:keepNext/>
+        <w:spacing w:after="30" w:before="120"/>
+      </w:pPr>
+      <w:r>
+        <w:rPr>
+          <w:b/>
+          <w:bCs/>
+          <w:i/>
+          <w:iCs/>
+          <w:color w:val="6A6A6A"/>
+          <w:sz w:val="18"/>
+          <w:szCs w:val="18"/>
+        </w:rPr>
+        <w:t xml:space="preserve">Beispiel</w:t>
+      </w:r>
+    </w:p>
+    <w:p>
+      <w:pPr>
+        <w:keepLines/>
+        <w:pBdr>
+          <w:left w:val="single" w:color="1B6CA8" w:sz="18" w:space="6"/>
+        </w:pBdr>
+        <w:shd w:fill="F4F4F4" w:val="clear"/>
+        <w:spacing w:after="200" w:before="100" w:line="264" w:lineRule="auto"/>
+        <w:ind w:left="140"/>
+      </w:pPr>
+      <w:r>
+        <w:rPr>
+          <w:rFonts w:ascii="Consolas" w:cs="Consolas" w:eastAsia="Consolas" w:hAnsi="Consolas"/>
+          <w:sz w:val="19"/>
+          <w:szCs w:val="19"/>
+        </w:rPr>
+        <w:t xml:space="preserve">PRINT ROUND(EXP(1), 4)</w:t>
+      </w:r>
+      <w:r>
+        <w:rPr>
+          <w:rFonts w:ascii="Consolas" w:cs="Consolas" w:eastAsia="Consolas" w:hAnsi="Consolas"/>
+          <w:sz w:val="19"/>
+          <w:szCs w:val="19"/>
+        </w:rPr>
+        <w:br/>
+        <w:t xml:space="preserve">PRINT ROUND(LOG(EXP(1)), 4)</w:t>
+      </w:r>
+    </w:p>
+    <w:p>
+      <w:pPr>
+        <w:keepNext/>
+        <w:spacing w:after="30" w:before="120"/>
+      </w:pPr>
+      <w:r>
+        <w:rPr>
+          <w:b/>
+          <w:bCs/>
+          <w:i/>
+          <w:iCs/>
+          <w:color w:val="6A6A6A"/>
+          <w:sz w:val="18"/>
+          <w:szCs w:val="18"/>
+        </w:rPr>
+        <w:t xml:space="preserve">Ausgabe</w:t>
+      </w:r>
+    </w:p>
+    <w:p>
+      <w:pPr>
+        <w:keepLines/>
+        <w:pBdr>
+          <w:left w:val="single" w:color="9AC79A" w:sz="18" w:space="6"/>
+        </w:pBdr>
+        <w:shd w:fill="EAF4EA" w:val="clear"/>
+        <w:spacing w:after="200" w:before="100" w:line="264" w:lineRule="auto"/>
+        <w:ind w:left="140"/>
+      </w:pPr>
+      <w:r>
+        <w:rPr>
+          <w:rFonts w:ascii="Consolas" w:cs="Consolas" w:eastAsia="Consolas" w:hAnsi="Consolas"/>
+          <w:sz w:val="19"/>
+          <w:szCs w:val="19"/>
+        </w:rPr>
+        <w:t xml:space="preserve">2.7183</w:t>
+      </w:r>
+      <w:r>
+        <w:rPr>
+          <w:rFonts w:ascii="Consolas" w:cs="Consolas" w:eastAsia="Consolas" w:hAnsi="Consolas"/>
+          <w:sz w:val="19"/>
+          <w:szCs w:val="19"/>
+        </w:rPr>
+        <w:br/>
+        <w:t xml:space="preserve">1.0</w:t>
+      </w:r>
+    </w:p>
+    <w:p>
+      <w:pPr>
+        <w:pStyle w:val="Heading2"/>
+        <w:keepNext/>
+        <w:keepLines/>
+        <w:spacing w:after="120" w:before="280"/>
+      </w:pPr>
+      <w:r>
+        <w:t xml:space="preserve">Runden</w:t>
+      </w:r>
+    </w:p>
+    <w:p>
+      <w:pPr>
+        <w:keepNext/>
+        <w:keepLines/>
+        <w:pBdr>
+          <w:bottom w:val="single" w:color="DDD0C0" w:sz="4" w:space="2"/>
+        </w:pBdr>
+        <w:spacing w:after="40" w:before="360"/>
+      </w:pPr>
+      <w:r>
+        <w:rPr>
+          <w:rFonts w:ascii="Consolas" w:cs="Consolas" w:eastAsia="Consolas" w:hAnsi="Consolas"/>
+          <w:b/>
+          <w:bCs/>
+          <w:color w:val="9A3412"/>
+          <w:sz w:val="24"/>
+          <w:szCs w:val="24"/>
+        </w:rPr>
+        <w:t xml:space="preserve">FLOOR · CEIL · ROUND</w:t>
+      </w:r>
+    </w:p>
+    <w:p>
+      <w:pPr>
+        <w:keepNext/>
+        <w:spacing w:after="120"/>
+      </w:pPr>
+      <w:r>
+        <w:rPr>
+          <w:b/>
+          <w:bCs/>
+          <w:color w:val="6A6A6A"/>
+          <w:sz w:val="18"/>
+          <w:szCs w:val="18"/>
+        </w:rPr>
+        <w:t xml:space="preserve">Syntax:  </w:t>
+      </w:r>
+      <w:r>
+        <w:rPr>
+          <w:rFonts w:ascii="Consolas" w:cs="Consolas" w:eastAsia="Consolas" w:hAnsi="Consolas"/>
+          <w:color w:val="335577"/>
+          <w:sz w:val="19"/>
+          <w:szCs w:val="19"/>
+        </w:rPr>
+        <w:t xml:space="preserve">FLOOR(x)   CEIL(x)   ROUND(x[, stellen])</w:t>
+      </w:r>
+    </w:p>
+    <w:p>
+      <w:pPr>
+        <w:spacing w:after="180" w:line="312" w:lineRule="auto"/>
+      </w:pPr>
+      <w:r>
+        <w:rPr>
+          <w:sz w:val="22"/>
+          <w:szCs w:val="22"/>
+        </w:rPr>
+        <w:t xml:space="preserve">FLOOR rundet ab (zur nächstkleineren ganzen Zahl), CEIL auf, ROUND kaufmännisch zur nächsten ganzen Zahl. Mit einem zweiten Argument rundet ROUND auf so viele Nachkommastellen.</w:t>
+      </w:r>
+    </w:p>
+    <w:p>
+      <w:pPr>
+        <w:keepNext/>
+        <w:spacing w:after="30" w:before="120"/>
+      </w:pPr>
+      <w:r>
+        <w:rPr>
+          <w:b/>
+          <w:bCs/>
+          <w:i/>
+          <w:iCs/>
+          <w:color w:val="6A6A6A"/>
+          <w:sz w:val="18"/>
+          <w:szCs w:val="18"/>
+        </w:rPr>
+        <w:t xml:space="preserve">Beispiel</w:t>
+      </w:r>
+    </w:p>
+    <w:p>
+      <w:pPr>
+        <w:keepLines/>
+        <w:pBdr>
+          <w:left w:val="single" w:color="1B6CA8" w:sz="18" w:space="6"/>
+        </w:pBdr>
+        <w:shd w:fill="F4F4F4" w:val="clear"/>
+        <w:spacing w:after="200" w:before="100" w:line="264" w:lineRule="auto"/>
+        <w:ind w:left="140"/>
+      </w:pPr>
+      <w:r>
+        <w:rPr>
+          <w:rFonts w:ascii="Consolas" w:cs="Consolas" w:eastAsia="Consolas" w:hAnsi="Consolas"/>
+          <w:sz w:val="19"/>
+          <w:szCs w:val="19"/>
+        </w:rPr>
+        <w:t xml:space="preserve">PRINT FLOOR(3.7); " "; CEIL(3.2); " "; ROUND(3.5)</w:t>
+      </w:r>
+      <w:r>
+        <w:rPr>
+          <w:rFonts w:ascii="Consolas" w:cs="Consolas" w:eastAsia="Consolas" w:hAnsi="Consolas"/>
+          <w:sz w:val="19"/>
+          <w:szCs w:val="19"/>
+        </w:rPr>
+        <w:br/>
+        <w:t xml:space="preserve">PRINT ROUND(3.14159, 2)</w:t>
+      </w:r>
+    </w:p>
+    <w:p>
+      <w:pPr>
+        <w:keepNext/>
+        <w:spacing w:after="30" w:before="120"/>
+      </w:pPr>
+      <w:r>
+        <w:rPr>
+          <w:b/>
+          <w:bCs/>
+          <w:i/>
+          <w:iCs/>
+          <w:color w:val="6A6A6A"/>
+          <w:sz w:val="18"/>
+          <w:szCs w:val="18"/>
+        </w:rPr>
+        <w:t xml:space="preserve">Ausgabe</w:t>
+      </w:r>
+    </w:p>
+    <w:p>
+      <w:pPr>
+        <w:keepLines/>
+        <w:pBdr>
+          <w:left w:val="single" w:color="9AC79A" w:sz="18" w:space="6"/>
+        </w:pBdr>
+        <w:shd w:fill="EAF4EA" w:val="clear"/>
+        <w:spacing w:after="200" w:before="100" w:line="264" w:lineRule="auto"/>
+        <w:ind w:left="140"/>
+      </w:pPr>
+      <w:r>
+        <w:rPr>
+          <w:rFonts w:ascii="Consolas" w:cs="Consolas" w:eastAsia="Consolas" w:hAnsi="Consolas"/>
+          <w:sz w:val="19"/>
+          <w:szCs w:val="19"/>
+        </w:rPr>
+        <w:t xml:space="preserve">3 4 4</w:t>
+      </w:r>
+      <w:r>
+        <w:rPr>
+          <w:rFonts w:ascii="Consolas" w:cs="Consolas" w:eastAsia="Consolas" w:hAnsi="Consolas"/>
+          <w:sz w:val="19"/>
+          <w:szCs w:val="19"/>
+        </w:rPr>
+        <w:br/>
+        <w:t xml:space="preserve">3.14</w:t>
+      </w:r>
+    </w:p>
+    <w:p>
+      <w:pPr>
+        <w:pStyle w:val="Heading2"/>
+        <w:keepNext/>
+        <w:keepLines/>
+        <w:spacing w:after="120" w:before="280"/>
+      </w:pPr>
+      <w:r>
+        <w:t xml:space="preserve">Vergleichen &amp; Begrenzen</w:t>
+      </w:r>
+    </w:p>
+    <w:p>
+      <w:pPr>
+        <w:keepNext/>
+        <w:keepLines/>
+        <w:pBdr>
+          <w:bottom w:val="single" w:color="DDD0C0" w:sz="4" w:space="2"/>
+        </w:pBdr>
+        <w:spacing w:after="40" w:before="360"/>
+      </w:pPr>
+      <w:r>
+        <w:rPr>
+          <w:rFonts w:ascii="Consolas" w:cs="Consolas" w:eastAsia="Consolas" w:hAnsi="Consolas"/>
+          <w:b/>
+          <w:bCs/>
+          <w:color w:val="9A3412"/>
+          <w:sz w:val="24"/>
+          <w:szCs w:val="24"/>
+        </w:rPr>
+        <w:t xml:space="preserve">MIN · MAX</w:t>
+      </w:r>
+    </w:p>
+    <w:p>
+      <w:pPr>
+        <w:keepNext/>
+        <w:spacing w:after="120"/>
+      </w:pPr>
+      <w:r>
+        <w:rPr>
+          <w:b/>
+          <w:bCs/>
+          <w:color w:val="6A6A6A"/>
+          <w:sz w:val="18"/>
+          <w:szCs w:val="18"/>
+        </w:rPr>
+        <w:t xml:space="preserve">Syntax:  </w:t>
+      </w:r>
+      <w:r>
+        <w:rPr>
+          <w:rFonts w:ascii="Consolas" w:cs="Consolas" w:eastAsia="Consolas" w:hAnsi="Consolas"/>
+          <w:color w:val="335577"/>
+          <w:sz w:val="19"/>
+          <w:szCs w:val="19"/>
+        </w:rPr>
+        <w:t xml:space="preserve">MIN(a, b, ...)   MAX(a, b, ...)</w:t>
+      </w:r>
+    </w:p>
+    <w:p>
+      <w:pPr>
+        <w:spacing w:after="180" w:line="312" w:lineRule="auto"/>
+      </w:pPr>
+      <w:r>
+        <w:rPr>
+          <w:sz w:val="22"/>
+          <w:szCs w:val="22"/>
+        </w:rPr>
+        <w:t xml:space="preserve">Liefern den kleinsten bzw. größten der übergebenen Werte. Du darfst beliebig viele angeben.</w:t>
+      </w:r>
+    </w:p>
+    <w:p>
+      <w:pPr>
+        <w:keepNext/>
+        <w:spacing w:after="30" w:before="120"/>
+      </w:pPr>
+      <w:r>
+        <w:rPr>
+          <w:b/>
+          <w:bCs/>
+          <w:i/>
+          <w:iCs/>
+          <w:color w:val="6A6A6A"/>
+          <w:sz w:val="18"/>
+          <w:szCs w:val="18"/>
+        </w:rPr>
+        <w:t xml:space="preserve">Beispiel</w:t>
+      </w:r>
+    </w:p>
+    <w:p>
+      <w:pPr>
+        <w:keepLines/>
+        <w:pBdr>
+          <w:left w:val="single" w:color="1B6CA8" w:sz="18" w:space="6"/>
+        </w:pBdr>
+        <w:shd w:fill="F4F4F4" w:val="clear"/>
+        <w:spacing w:after="200" w:before="100" w:line="264" w:lineRule="auto"/>
+        <w:ind w:left="140"/>
+      </w:pPr>
+      <w:r>
+        <w:rPr>
+          <w:rFonts w:ascii="Consolas" w:cs="Consolas" w:eastAsia="Consolas" w:hAnsi="Consolas"/>
+          <w:sz w:val="19"/>
+          <w:szCs w:val="19"/>
+        </w:rPr>
+        <w:t xml:space="preserve">PRINT MIN(5, 2, 9)</w:t>
+      </w:r>
+      <w:r>
+        <w:rPr>
+          <w:rFonts w:ascii="Consolas" w:cs="Consolas" w:eastAsia="Consolas" w:hAnsi="Consolas"/>
+          <w:sz w:val="19"/>
+          <w:szCs w:val="19"/>
+        </w:rPr>
+        <w:br/>
+        <w:t xml:space="preserve">PRINT MAX(5, 2, 9)</w:t>
+      </w:r>
+    </w:p>
+    <w:p>
+      <w:pPr>
+        <w:keepNext/>
+        <w:spacing w:after="30" w:before="120"/>
+      </w:pPr>
+      <w:r>
+        <w:rPr>
+          <w:b/>
+          <w:bCs/>
+          <w:i/>
+          <w:iCs/>
+          <w:color w:val="6A6A6A"/>
+          <w:sz w:val="18"/>
+          <w:szCs w:val="18"/>
+        </w:rPr>
+        <w:t xml:space="preserve">Ausgabe</w:t>
+      </w:r>
+    </w:p>
+    <w:p>
+      <w:pPr>
+        <w:keepLines/>
+        <w:pBdr>
+          <w:left w:val="single" w:color="9AC79A" w:sz="18" w:space="6"/>
+        </w:pBdr>
+        <w:shd w:fill="EAF4EA" w:val="clear"/>
+        <w:spacing w:after="200" w:before="100" w:line="264" w:lineRule="auto"/>
+        <w:ind w:left="140"/>
+      </w:pPr>
+      <w:r>
+        <w:rPr>
+          <w:rFonts w:ascii="Consolas" w:cs="Consolas" w:eastAsia="Consolas" w:hAnsi="Consolas"/>
+          <w:sz w:val="19"/>
+          <w:szCs w:val="19"/>
+        </w:rPr>
+        <w:t xml:space="preserve">2</w:t>
+      </w:r>
+      <w:r>
+        <w:rPr>
+          <w:rFonts w:ascii="Consolas" w:cs="Consolas" w:eastAsia="Consolas" w:hAnsi="Consolas"/>
+          <w:sz w:val="19"/>
+          <w:szCs w:val="19"/>
+        </w:rPr>
+        <w:br/>
+        <w:t xml:space="preserve">9</w:t>
+      </w:r>
+    </w:p>
+    <w:p>
+      <w:pPr>
+        <w:keepNext/>
+        <w:keepLines/>
+        <w:pBdr>
+          <w:bottom w:val="single" w:color="DDD0C0" w:sz="4" w:space="2"/>
+        </w:pBdr>
+        <w:spacing w:after="40" w:before="360"/>
+      </w:pPr>
+      <w:r>
+        <w:rPr>
+          <w:rFonts w:ascii="Consolas" w:cs="Consolas" w:eastAsia="Consolas" w:hAnsi="Consolas"/>
+          <w:b/>
+          <w:bCs/>
+          <w:color w:val="9A3412"/>
+          <w:sz w:val="24"/>
+          <w:szCs w:val="24"/>
+        </w:rPr>
+        <w:t xml:space="preserve">CLAMP · SIGN</w:t>
+      </w:r>
+    </w:p>
+    <w:p>
+      <w:pPr>
+        <w:keepNext/>
+        <w:spacing w:after="120"/>
+      </w:pPr>
+      <w:r>
+        <w:rPr>
+          <w:b/>
+          <w:bCs/>
+          <w:color w:val="6A6A6A"/>
+          <w:sz w:val="18"/>
+          <w:szCs w:val="18"/>
+        </w:rPr>
+        <w:t xml:space="preserve">Syntax:  </w:t>
+      </w:r>
+      <w:r>
+        <w:rPr>
+          <w:rFonts w:ascii="Consolas" w:cs="Consolas" w:eastAsia="Consolas" w:hAnsi="Consolas"/>
+          <w:color w:val="335577"/>
+          <w:sz w:val="19"/>
+          <w:szCs w:val="19"/>
+        </w:rPr>
+        <w:t xml:space="preserve">CLAMP(v, lo, hi)   SIGN(x)</w:t>
+      </w:r>
+    </w:p>
+    <w:p>
+      <w:pPr>
+        <w:spacing w:after="180" w:line="312" w:lineRule="auto"/>
+      </w:pPr>
+      <w:r>
+        <w:rPr>
+          <w:sz w:val="22"/>
+          <w:szCs w:val="22"/>
+        </w:rPr>
+        <w:t xml:space="preserve">CLAMP zwängt einen Wert in den Bereich von lo bis hi (kleinere werden zu lo, größere zu hi). SIGN liefert das Vorzeichen: -1 bei negativen, 0 bei null, +1 bei positiven Zahlen. (CLAMP01(v) ist die Kurzform für CLAMP(v, 0, 1).)</w:t>
+      </w:r>
+    </w:p>
+    <w:p>
+      <w:pPr>
+        <w:keepNext/>
+        <w:spacing w:after="30" w:before="120"/>
+      </w:pPr>
+      <w:r>
+        <w:rPr>
+          <w:b/>
+          <w:bCs/>
+          <w:i/>
+          <w:iCs/>
+          <w:color w:val="6A6A6A"/>
+          <w:sz w:val="18"/>
+          <w:szCs w:val="18"/>
+        </w:rPr>
+        <w:t xml:space="preserve">Beispiel</w:t>
+      </w:r>
+    </w:p>
+    <w:p>
+      <w:pPr>
+        <w:keepLines/>
+        <w:pBdr>
+          <w:left w:val="single" w:color="1B6CA8" w:sz="18" w:space="6"/>
+        </w:pBdr>
+        <w:shd w:fill="F4F4F4" w:val="clear"/>
+        <w:spacing w:after="200" w:before="100" w:line="264" w:lineRule="auto"/>
+        <w:ind w:left="140"/>
+      </w:pPr>
+      <w:r>
+        <w:rPr>
+          <w:rFonts w:ascii="Consolas" w:cs="Consolas" w:eastAsia="Consolas" w:hAnsi="Consolas"/>
+          <w:sz w:val="19"/>
+          <w:szCs w:val="19"/>
+        </w:rPr>
+        <w:t xml:space="preserve">PRINT CLAMP(150, 0, 100)</w:t>
+      </w:r>
+      <w:r>
+        <w:rPr>
+          <w:rFonts w:ascii="Consolas" w:cs="Consolas" w:eastAsia="Consolas" w:hAnsi="Consolas"/>
+          <w:sz w:val="19"/>
+          <w:szCs w:val="19"/>
+        </w:rPr>
+        <w:br/>
+        <w:t xml:space="preserve">PRINT SIGN(-3); " "; SIGN(0); " "; SIGN(8)</w:t>
+      </w:r>
+    </w:p>
+    <w:p>
+      <w:pPr>
+        <w:keepNext/>
+        <w:spacing w:after="30" w:before="120"/>
+      </w:pPr>
+      <w:r>
+        <w:rPr>
+          <w:b/>
+          <w:bCs/>
+          <w:i/>
+          <w:iCs/>
+          <w:color w:val="6A6A6A"/>
+          <w:sz w:val="18"/>
+          <w:szCs w:val="18"/>
+        </w:rPr>
+        <w:t xml:space="preserve">Ausgabe</w:t>
+      </w:r>
+    </w:p>
+    <w:p>
+      <w:pPr>
+        <w:keepLines/>
+        <w:pBdr>
+          <w:left w:val="single" w:color="9AC79A" w:sz="18" w:space="6"/>
+        </w:pBdr>
+        <w:shd w:fill="EAF4EA" w:val="clear"/>
+        <w:spacing w:after="200" w:before="100" w:line="264" w:lineRule="auto"/>
+        <w:ind w:left="140"/>
+      </w:pPr>
+      <w:r>
+        <w:rPr>
+          <w:rFonts w:ascii="Consolas" w:cs="Consolas" w:eastAsia="Consolas" w:hAnsi="Consolas"/>
+          <w:sz w:val="19"/>
+          <w:szCs w:val="19"/>
+        </w:rPr>
+        <w:t xml:space="preserve">100</w:t>
+      </w:r>
+      <w:r>
+        <w:rPr>
+          <w:rFonts w:ascii="Consolas" w:cs="Consolas" w:eastAsia="Consolas" w:hAnsi="Consolas"/>
+          <w:sz w:val="19"/>
+          <w:szCs w:val="19"/>
+        </w:rPr>
+        <w:br/>
+        <w:t xml:space="preserve">-1 0 1</w:t>
+      </w:r>
+    </w:p>
+    <w:p>
+      <w:pPr>
+        <w:pStyle w:val="Heading2"/>
+        <w:keepNext/>
+        <w:keepLines/>
+        <w:spacing w:after="120" w:before="280"/>
+      </w:pPr>
+      <w:r>
+        <w:t xml:space="preserve">Interpolieren &amp; Umskalieren</w:t>
+      </w:r>
+    </w:p>
+    <w:p>
+      <w:pPr>
+        <w:spacing w:after="180" w:line="312" w:lineRule="auto"/>
+      </w:pPr>
+      <w:r>
+        <w:rPr>
+          <w:sz w:val="22"/>
+          <w:szCs w:val="22"/>
+        </w:rPr>
+        <w:t xml:space="preserve">Diese Funktionen sind das Rückgrat vieler Animationen und Bewegungen – etwa um einen Wert sanft von A nach B laufen zu lassen oder einen Messwert in einen anderen Bereich zu übertragen.</w:t>
+      </w:r>
+    </w:p>
+    <w:p>
+      <w:pPr>
+        <w:keepNext/>
+        <w:keepLines/>
+        <w:pBdr>
+          <w:bottom w:val="single" w:color="DDD0C0" w:sz="4" w:space="2"/>
+        </w:pBdr>
+        <w:spacing w:after="40" w:before="360"/>
+      </w:pPr>
+      <w:r>
+        <w:rPr>
+          <w:rFonts w:ascii="Consolas" w:cs="Consolas" w:eastAsia="Consolas" w:hAnsi="Consolas"/>
+          <w:b/>
+          <w:bCs/>
+          <w:color w:val="9A3412"/>
+          <w:sz w:val="24"/>
+          <w:szCs w:val="24"/>
+        </w:rPr>
+        <w:t xml:space="preserve">LERP · REMAP</w:t>
+      </w:r>
+    </w:p>
+    <w:p>
+      <w:pPr>
+        <w:keepNext/>
+        <w:spacing w:after="120"/>
+      </w:pPr>
+      <w:r>
+        <w:rPr>
+          <w:b/>
+          <w:bCs/>
+          <w:color w:val="6A6A6A"/>
+          <w:sz w:val="18"/>
+          <w:szCs w:val="18"/>
+        </w:rPr>
+        <w:t xml:space="preserve">Syntax:  </w:t>
+      </w:r>
+      <w:r>
+        <w:rPr>
+          <w:rFonts w:ascii="Consolas" w:cs="Consolas" w:eastAsia="Consolas" w:hAnsi="Consolas"/>
+          <w:color w:val="335577"/>
+          <w:sz w:val="19"/>
+          <w:szCs w:val="19"/>
+        </w:rPr>
+        <w:t xml:space="preserve">LERP(a, b, t)   REMAP(v, von_lo, von_hi, nach_lo, nach_hi)</w:t>
+      </w:r>
+    </w:p>
+    <w:p>
+      <w:pPr>
+        <w:spacing w:after="180" w:line="312" w:lineRule="auto"/>
+      </w:pPr>
+      <w:r>
+        <w:rPr>
+          <w:sz w:val="22"/>
+          <w:szCs w:val="22"/>
+        </w:rPr>
+        <w:t xml:space="preserve">LERP („lineare Interpolation“) liefert den Wert, der zum Anteil t zwischen a und b liegt: t=0 ergibt a, t=1 ergibt b, t=0.5 die Mitte. REMAP überträgt einen Wert aus einem Bereich linear in einen anderen.</w:t>
+      </w:r>
+    </w:p>
+    <w:p>
+      <w:pPr>
+        <w:keepNext/>
+        <w:spacing w:after="30" w:before="120"/>
+      </w:pPr>
+      <w:r>
+        <w:rPr>
+          <w:b/>
+          <w:bCs/>
+          <w:i/>
+          <w:iCs/>
+          <w:color w:val="6A6A6A"/>
+          <w:sz w:val="18"/>
+          <w:szCs w:val="18"/>
+        </w:rPr>
+        <w:t xml:space="preserve">Beispiel</w:t>
+      </w:r>
+    </w:p>
+    <w:p>
+      <w:pPr>
+        <w:keepLines/>
+        <w:pBdr>
+          <w:left w:val="single" w:color="1B6CA8" w:sz="18" w:space="6"/>
+        </w:pBdr>
+        <w:shd w:fill="F4F4F4" w:val="clear"/>
+        <w:spacing w:after="200" w:before="100" w:line="264" w:lineRule="auto"/>
+        <w:ind w:left="140"/>
+      </w:pPr>
+      <w:r>
+        <w:rPr>
+          <w:rFonts w:ascii="Consolas" w:cs="Consolas" w:eastAsia="Consolas" w:hAnsi="Consolas"/>
+          <w:sz w:val="19"/>
+          <w:szCs w:val="19"/>
+        </w:rPr>
+        <w:t xml:space="preserve">PRINT LERP(0.0, 10.0, 0.25)</w:t>
+      </w:r>
+      <w:r>
+        <w:rPr>
+          <w:rFonts w:ascii="Consolas" w:cs="Consolas" w:eastAsia="Consolas" w:hAnsi="Consolas"/>
+          <w:sz w:val="19"/>
+          <w:szCs w:val="19"/>
+        </w:rPr>
+        <w:br/>
+        <w:t xml:space="preserve">PRINT REMAP(5, 0, 10, 0, 100)</w:t>
+      </w:r>
+    </w:p>
+    <w:p>
+      <w:pPr>
+        <w:keepNext/>
+        <w:spacing w:after="30" w:before="120"/>
+      </w:pPr>
+      <w:r>
+        <w:rPr>
+          <w:b/>
+          <w:bCs/>
+          <w:i/>
+          <w:iCs/>
+          <w:color w:val="6A6A6A"/>
+          <w:sz w:val="18"/>
+          <w:szCs w:val="18"/>
+        </w:rPr>
+        <w:t xml:space="preserve">Ausgabe</w:t>
+      </w:r>
+    </w:p>
+    <w:p>
+      <w:pPr>
+        <w:keepLines/>
+        <w:pBdr>
+          <w:left w:val="single" w:color="9AC79A" w:sz="18" w:space="6"/>
+        </w:pBdr>
+        <w:shd w:fill="EAF4EA" w:val="clear"/>
+        <w:spacing w:after="200" w:before="100" w:line="264" w:lineRule="auto"/>
+        <w:ind w:left="140"/>
+      </w:pPr>
+      <w:r>
+        <w:rPr>
+          <w:rFonts w:ascii="Consolas" w:cs="Consolas" w:eastAsia="Consolas" w:hAnsi="Consolas"/>
+          <w:sz w:val="19"/>
+          <w:szCs w:val="19"/>
+        </w:rPr>
+        <w:t xml:space="preserve">2.5</w:t>
+      </w:r>
+      <w:r>
+        <w:rPr>
+          <w:rFonts w:ascii="Consolas" w:cs="Consolas" w:eastAsia="Consolas" w:hAnsi="Consolas"/>
+          <w:sz w:val="19"/>
+          <w:szCs w:val="19"/>
+        </w:rPr>
+        <w:br/>
+        <w:t xml:space="preserve">50.0</w:t>
+      </w:r>
+    </w:p>
+    <w:p>
+      <w:pPr>
+        <w:pStyle w:val="Heading2"/>
+        <w:keepNext/>
+        <w:keepLines/>
+        <w:spacing w:after="120" w:before="280"/>
+      </w:pPr>
+      <w:r>
+        <w:t xml:space="preserve">Trigonometrie</w:t>
+      </w:r>
+    </w:p>
+    <w:p>
+      <w:pPr>
+        <w:keepNext/>
+        <w:keepLines/>
+        <w:pBdr>
+          <w:bottom w:val="single" w:color="DDD0C0" w:sz="4" w:space="2"/>
+        </w:pBdr>
+        <w:spacing w:after="40" w:before="360"/>
+      </w:pPr>
+      <w:r>
+        <w:rPr>
+          <w:rFonts w:ascii="Consolas" w:cs="Consolas" w:eastAsia="Consolas" w:hAnsi="Consolas"/>
+          <w:b/>
+          <w:bCs/>
+          <w:color w:val="9A3412"/>
+          <w:sz w:val="24"/>
+          <w:szCs w:val="24"/>
+        </w:rPr>
+        <w:t xml:space="preserve">SIN · COS · TAN · ATAN2</w:t>
+      </w:r>
+    </w:p>
+    <w:p>
+      <w:pPr>
+        <w:keepNext/>
+        <w:spacing w:after="120"/>
+      </w:pPr>
+      <w:r>
+        <w:rPr>
+          <w:b/>
+          <w:bCs/>
+          <w:color w:val="6A6A6A"/>
+          <w:sz w:val="18"/>
+          <w:szCs w:val="18"/>
+        </w:rPr>
+        <w:t xml:space="preserve">Syntax:  </w:t>
+      </w:r>
+      <w:r>
+        <w:rPr>
+          <w:rFonts w:ascii="Consolas" w:cs="Consolas" w:eastAsia="Consolas" w:hAnsi="Consolas"/>
+          <w:color w:val="335577"/>
+          <w:sz w:val="19"/>
+          <w:szCs w:val="19"/>
+        </w:rPr>
+        <w:t xml:space="preserve">SIN(x)   COS(x)   TAN(x)   ATAN2(y, x)</w:t>
+      </w:r>
+    </w:p>
+    <w:p>
+      <w:pPr>
+        <w:spacing w:after="180" w:line="312" w:lineRule="auto"/>
+      </w:pPr>
+      <w:r>
+        <w:rPr>
+          <w:sz w:val="22"/>
+          <w:szCs w:val="22"/>
+        </w:rPr>
+        <w:t xml:space="preserve">Die Winkelfunktionen erwarten den Winkel im Bogenmaß. ATAN2(y, x) liefert umgekehrt den Winkel (im Bogenmaß) zum Punkt (x, y) – ideal, um die Richtung von einem Punkt zu einem anderen zu bestimmen. (Ebenfalls vorhanden: ASIN, ACOS, ATAN.)</w:t>
+      </w:r>
+    </w:p>
+    <w:p>
+      <w:pPr>
+        <w:keepNext/>
+        <w:spacing w:after="30" w:before="120"/>
+      </w:pPr>
+      <w:r>
+        <w:rPr>
+          <w:b/>
+          <w:bCs/>
+          <w:i/>
+          <w:iCs/>
+          <w:color w:val="6A6A6A"/>
+          <w:sz w:val="18"/>
+          <w:szCs w:val="18"/>
+        </w:rPr>
+        <w:t xml:space="preserve">Beispiel</w:t>
+      </w:r>
+    </w:p>
+    <w:p>
+      <w:pPr>
+        <w:keepLines/>
+        <w:pBdr>
+          <w:left w:val="single" w:color="1B6CA8" w:sz="18" w:space="6"/>
+        </w:pBdr>
+        <w:shd w:fill="F4F4F4" w:val="clear"/>
+        <w:spacing w:after="200" w:before="100" w:line="264" w:lineRule="auto"/>
+        <w:ind w:left="140"/>
+      </w:pPr>
+      <w:r>
+        <w:rPr>
+          <w:rFonts w:ascii="Consolas" w:cs="Consolas" w:eastAsia="Consolas" w:hAnsi="Consolas"/>
+          <w:sz w:val="19"/>
+          <w:szCs w:val="19"/>
+        </w:rPr>
+        <w:t xml:space="preserve">PRINT ROUND(SIN(PI / 2), 4)</w:t>
+      </w:r>
+      <w:r>
+        <w:rPr>
+          <w:rFonts w:ascii="Consolas" w:cs="Consolas" w:eastAsia="Consolas" w:hAnsi="Consolas"/>
+          <w:sz w:val="19"/>
+          <w:szCs w:val="19"/>
+        </w:rPr>
+        <w:br/>
+        <w:t xml:space="preserve">PRINT ROUND(DEG(ATAN2(4.0, 3.0)), 1)</w:t>
+      </w:r>
+    </w:p>
+    <w:p>
+      <w:pPr>
+        <w:keepNext/>
+        <w:spacing w:after="30" w:before="120"/>
+      </w:pPr>
+      <w:r>
+        <w:rPr>
+          <w:b/>
+          <w:bCs/>
+          <w:i/>
+          <w:iCs/>
+          <w:color w:val="6A6A6A"/>
+          <w:sz w:val="18"/>
+          <w:szCs w:val="18"/>
+        </w:rPr>
+        <w:t xml:space="preserve">Ausgabe</w:t>
+      </w:r>
+    </w:p>
+    <w:p>
+      <w:pPr>
+        <w:keepLines/>
+        <w:pBdr>
+          <w:left w:val="single" w:color="9AC79A" w:sz="18" w:space="6"/>
+        </w:pBdr>
+        <w:shd w:fill="EAF4EA" w:val="clear"/>
+        <w:spacing w:after="200" w:before="100" w:line="264" w:lineRule="auto"/>
+        <w:ind w:left="140"/>
+      </w:pPr>
+      <w:r>
+        <w:rPr>
+          <w:rFonts w:ascii="Consolas" w:cs="Consolas" w:eastAsia="Consolas" w:hAnsi="Consolas"/>
+          <w:sz w:val="19"/>
+          <w:szCs w:val="19"/>
+        </w:rPr>
+        <w:t xml:space="preserve">1.0</w:t>
+      </w:r>
+      <w:r>
+        <w:rPr>
+          <w:rFonts w:ascii="Consolas" w:cs="Consolas" w:eastAsia="Consolas" w:hAnsi="Consolas"/>
+          <w:sz w:val="19"/>
+          <w:szCs w:val="19"/>
+        </w:rPr>
+        <w:br/>
+        <w:t xml:space="preserve">53.1</w:t>
+      </w:r>
+    </w:p>
+    <w:p>
+      <w:pPr>
+        <w:keepNext/>
+        <w:keepLines/>
+        <w:pBdr>
+          <w:bottom w:val="single" w:color="DDD0C0" w:sz="4" w:space="2"/>
+        </w:pBdr>
+        <w:spacing w:after="40" w:before="360"/>
+      </w:pPr>
+      <w:r>
+        <w:rPr>
+          <w:rFonts w:ascii="Consolas" w:cs="Consolas" w:eastAsia="Consolas" w:hAnsi="Consolas"/>
+          <w:b/>
+          <w:bCs/>
+          <w:color w:val="9A3412"/>
+          <w:sz w:val="24"/>
+          <w:szCs w:val="24"/>
+        </w:rPr>
+        <w:t xml:space="preserve">DEG · RAD</w:t>
+      </w:r>
+    </w:p>
+    <w:p>
+      <w:pPr>
+        <w:keepNext/>
+        <w:spacing w:after="120"/>
+      </w:pPr>
+      <w:r>
+        <w:rPr>
+          <w:b/>
+          <w:bCs/>
+          <w:color w:val="6A6A6A"/>
+          <w:sz w:val="18"/>
+          <w:szCs w:val="18"/>
+        </w:rPr>
+        <w:t xml:space="preserve">Syntax:  </w:t>
+      </w:r>
+      <w:r>
+        <w:rPr>
+          <w:rFonts w:ascii="Consolas" w:cs="Consolas" w:eastAsia="Consolas" w:hAnsi="Consolas"/>
+          <w:color w:val="335577"/>
+          <w:sz w:val="19"/>
+          <w:szCs w:val="19"/>
+        </w:rPr>
+        <w:t xml:space="preserve">DEG(bogenmaß)   RAD(grad)</w:t>
+      </w:r>
+    </w:p>
+    <w:p>
+      <w:pPr>
+        <w:spacing w:after="180" w:line="312" w:lineRule="auto"/>
+      </w:pPr>
+      <w:r>
+        <w:rPr>
+          <w:sz w:val="22"/>
+          <w:szCs w:val="22"/>
+        </w:rPr>
+        <w:t xml:space="preserve">Rechnen zwischen den Winkeleinheiten um: DEG wandelt Bogenmaß in Grad, RAD Grad in Bogenmaß. Praktisch, weil man Winkel oft in Grad denkt, die Funktionen aber Bogenmaß brauchen.</w:t>
+      </w:r>
+    </w:p>
+    <w:p>
+      <w:pPr>
+        <w:keepNext/>
+        <w:spacing w:after="30" w:before="120"/>
+      </w:pPr>
+      <w:r>
+        <w:rPr>
+          <w:b/>
+          <w:bCs/>
+          <w:i/>
+          <w:iCs/>
+          <w:color w:val="6A6A6A"/>
+          <w:sz w:val="18"/>
+          <w:szCs w:val="18"/>
+        </w:rPr>
+        <w:t xml:space="preserve">Beispiel</w:t>
+      </w:r>
+    </w:p>
+    <w:p>
+      <w:pPr>
+        <w:keepLines/>
+        <w:pBdr>
+          <w:left w:val="single" w:color="1B6CA8" w:sz="18" w:space="6"/>
+        </w:pBdr>
+        <w:shd w:fill="F4F4F4" w:val="clear"/>
+        <w:spacing w:after="200" w:before="100" w:line="264" w:lineRule="auto"/>
+        <w:ind w:left="140"/>
+      </w:pPr>
+      <w:r>
+        <w:rPr>
+          <w:rFonts w:ascii="Consolas" w:cs="Consolas" w:eastAsia="Consolas" w:hAnsi="Consolas"/>
+          <w:sz w:val="19"/>
+          <w:szCs w:val="19"/>
+        </w:rPr>
+        <w:t xml:space="preserve">PRINT DEG(PI)</w:t>
+      </w:r>
+      <w:r>
+        <w:rPr>
+          <w:rFonts w:ascii="Consolas" w:cs="Consolas" w:eastAsia="Consolas" w:hAnsi="Consolas"/>
+          <w:sz w:val="19"/>
+          <w:szCs w:val="19"/>
+        </w:rPr>
+        <w:br/>
+        <w:t xml:space="preserve">PRINT ROUND(RAD(180.0), 4)</w:t>
+      </w:r>
+    </w:p>
+    <w:p>
+      <w:pPr>
+        <w:keepNext/>
+        <w:spacing w:after="30" w:before="120"/>
+      </w:pPr>
+      <w:r>
+        <w:rPr>
+          <w:b/>
+          <w:bCs/>
+          <w:i/>
+          <w:iCs/>
+          <w:color w:val="6A6A6A"/>
+          <w:sz w:val="18"/>
+          <w:szCs w:val="18"/>
+        </w:rPr>
+        <w:t xml:space="preserve">Ausgabe</w:t>
+      </w:r>
+    </w:p>
+    <w:p>
+      <w:pPr>
+        <w:keepLines/>
+        <w:pBdr>
+          <w:left w:val="single" w:color="9AC79A" w:sz="18" w:space="6"/>
+        </w:pBdr>
+        <w:shd w:fill="EAF4EA" w:val="clear"/>
+        <w:spacing w:after="200" w:before="100" w:line="264" w:lineRule="auto"/>
+        <w:ind w:left="140"/>
+      </w:pPr>
+      <w:r>
+        <w:rPr>
+          <w:rFonts w:ascii="Consolas" w:cs="Consolas" w:eastAsia="Consolas" w:hAnsi="Consolas"/>
+          <w:sz w:val="19"/>
+          <w:szCs w:val="19"/>
+        </w:rPr>
+        <w:t xml:space="preserve">180.0</w:t>
+      </w:r>
+      <w:r>
+        <w:rPr>
+          <w:rFonts w:ascii="Consolas" w:cs="Consolas" w:eastAsia="Consolas" w:hAnsi="Consolas"/>
+          <w:sz w:val="19"/>
+          <w:szCs w:val="19"/>
+        </w:rPr>
+        <w:br/>
+        <w:t xml:space="preserve">3.1416</w:t>
+      </w:r>
+    </w:p>
+    <w:p>
+      <w:pPr>
+        <w:pStyle w:val="Heading2"/>
+        <w:keepNext/>
+        <w:keepLines/>
+        <w:spacing w:after="120" w:before="280"/>
+      </w:pPr>
+      <w:r>
+        <w:t xml:space="preserve">Spiel-Helfer</w:t>
+      </w:r>
+    </w:p>
+    <w:p>
+      <w:pPr>
+        <w:keepNext/>
+        <w:keepLines/>
+        <w:pBdr>
+          <w:bottom w:val="single" w:color="DDD0C0" w:sz="4" w:space="2"/>
+        </w:pBdr>
+        <w:spacing w:after="40" w:before="360"/>
+      </w:pPr>
+      <w:r>
+        <w:rPr>
+          <w:rFonts w:ascii="Consolas" w:cs="Consolas" w:eastAsia="Consolas" w:hAnsi="Consolas"/>
+          <w:b/>
+          <w:bCs/>
+          <w:color w:val="9A3412"/>
+          <w:sz w:val="24"/>
+          <w:szCs w:val="24"/>
+        </w:rPr>
+        <w:t xml:space="preserve">WRAP · PINGPONG · MOVETOWARD</w:t>
+      </w:r>
+    </w:p>
+    <w:p>
+      <w:pPr>
+        <w:keepNext/>
+        <w:spacing w:after="120"/>
+      </w:pPr>
+      <w:r>
+        <w:rPr>
+          <w:b/>
+          <w:bCs/>
+          <w:color w:val="6A6A6A"/>
+          <w:sz w:val="18"/>
+          <w:szCs w:val="18"/>
+        </w:rPr>
+        <w:t xml:space="preserve">Syntax:  </w:t>
+      </w:r>
+      <w:r>
+        <w:rPr>
+          <w:rFonts w:ascii="Consolas" w:cs="Consolas" w:eastAsia="Consolas" w:hAnsi="Consolas"/>
+          <w:color w:val="335577"/>
+          <w:sz w:val="19"/>
+          <w:szCs w:val="19"/>
+        </w:rPr>
+        <w:t xml:space="preserve">WRAP(v, lo, hi)   PINGPONG(t, länge)   MOVETOWARD(akt, ziel, maxd)</w:t>
+      </w:r>
+    </w:p>
+    <w:p>
+      <w:pPr>
+        <w:spacing w:after="180" w:line="312" w:lineRule="auto"/>
+      </w:pPr>
+      <w:r>
+        <w:rPr>
+          <w:sz w:val="22"/>
+          <w:szCs w:val="22"/>
+        </w:rPr>
+        <w:t xml:space="preserve">WRAP faltet einen Wert zyklisch in den Bereich [lo, hi) – gut für umlaufende Winkel oder Indizes (370° werden zu 10°). PINGPONG pendelt im Bereich [0, länge] hin und her (eine Dreieckswelle, gut für Hin-und-Her-Bewegungen). MOVETOWARD schiebt den aktuellen Wert um höchstens maxd in Richtung Ziel, ohne darüber hinauszuschießen.</w:t>
+      </w:r>
+    </w:p>
+    <w:p>
+      <w:pPr>
+        <w:keepNext/>
+        <w:spacing w:after="30" w:before="120"/>
+      </w:pPr>
+      <w:r>
+        <w:rPr>
+          <w:b/>
+          <w:bCs/>
+          <w:i/>
+          <w:iCs/>
+          <w:color w:val="6A6A6A"/>
+          <w:sz w:val="18"/>
+          <w:szCs w:val="18"/>
+        </w:rPr>
+        <w:t xml:space="preserve">Beispiel</w:t>
+      </w:r>
+    </w:p>
+    <w:p>
+      <w:pPr>
+        <w:keepLines/>
+        <w:pBdr>
+          <w:left w:val="single" w:color="1B6CA8" w:sz="18" w:space="6"/>
+        </w:pBdr>
+        <w:shd w:fill="F4F4F4" w:val="clear"/>
+        <w:spacing w:after="200" w:before="100" w:line="264" w:lineRule="auto"/>
+        <w:ind w:left="140"/>
+      </w:pPr>
+      <w:r>
+        <w:rPr>
+          <w:rFonts w:ascii="Consolas" w:cs="Consolas" w:eastAsia="Consolas" w:hAnsi="Consolas"/>
+          <w:sz w:val="19"/>
+          <w:szCs w:val="19"/>
+        </w:rPr>
+        <w:t xml:space="preserve">PRINT WRAP(370, 0, 360)</w:t>
+      </w:r>
+      <w:r>
+        <w:rPr>
+          <w:rFonts w:ascii="Consolas" w:cs="Consolas" w:eastAsia="Consolas" w:hAnsi="Consolas"/>
+          <w:sz w:val="19"/>
+          <w:szCs w:val="19"/>
+        </w:rPr>
+        <w:br/>
+        <w:t xml:space="preserve">PRINT PINGPONG(2.5, 2)</w:t>
+      </w:r>
+      <w:r>
+        <w:rPr>
+          <w:rFonts w:ascii="Consolas" w:cs="Consolas" w:eastAsia="Consolas" w:hAnsi="Consolas"/>
+          <w:sz w:val="19"/>
+          <w:szCs w:val="19"/>
+        </w:rPr>
+        <w:br/>
+        <w:t xml:space="preserve">PRINT MOVETOWARD(0, 10, 3)</w:t>
+      </w:r>
+    </w:p>
+    <w:p>
+      <w:pPr>
+        <w:keepNext/>
+        <w:spacing w:after="30" w:before="120"/>
+      </w:pPr>
+      <w:r>
+        <w:rPr>
+          <w:b/>
+          <w:bCs/>
+          <w:i/>
+          <w:iCs/>
+          <w:color w:val="6A6A6A"/>
+          <w:sz w:val="18"/>
+          <w:szCs w:val="18"/>
+        </w:rPr>
+        <w:t xml:space="preserve">Ausgabe</w:t>
+      </w:r>
+    </w:p>
+    <w:p>
+      <w:pPr>
+        <w:keepLines/>
+        <w:pBdr>
+          <w:left w:val="single" w:color="9AC79A" w:sz="18" w:space="6"/>
+        </w:pBdr>
+        <w:shd w:fill="EAF4EA" w:val="clear"/>
+        <w:spacing w:after="200" w:before="100" w:line="264" w:lineRule="auto"/>
+        <w:ind w:left="140"/>
+      </w:pPr>
+      <w:r>
+        <w:rPr>
+          <w:rFonts w:ascii="Consolas" w:cs="Consolas" w:eastAsia="Consolas" w:hAnsi="Consolas"/>
+          <w:sz w:val="19"/>
+          <w:szCs w:val="19"/>
+        </w:rPr>
+        <w:t xml:space="preserve">10.0</w:t>
+      </w:r>
+      <w:r>
+        <w:rPr>
+          <w:rFonts w:ascii="Consolas" w:cs="Consolas" w:eastAsia="Consolas" w:hAnsi="Consolas"/>
+          <w:sz w:val="19"/>
+          <w:szCs w:val="19"/>
+        </w:rPr>
+        <w:br/>
+        <w:t xml:space="preserve">1.5</w:t>
+      </w:r>
+      <w:r>
+        <w:rPr>
+          <w:rFonts w:ascii="Consolas" w:cs="Consolas" w:eastAsia="Consolas" w:hAnsi="Consolas"/>
+          <w:sz w:val="19"/>
+          <w:szCs w:val="19"/>
+        </w:rPr>
+        <w:br/>
+        <w:t xml:space="preserve">3.0</w:t>
+      </w:r>
+    </w:p>
+    <w:p>
+      <w:pPr>
+        <w:pStyle w:val="Heading2"/>
+        <w:keepNext/>
+        <w:keepLines/>
+        <w:spacing w:after="120" w:before="280"/>
+      </w:pPr>
+      <w:r>
+        <w:t xml:space="preserve">Konstanten</w:t>
+      </w:r>
+    </w:p>
+    <w:p>
+      <w:pPr>
+        <w:spacing w:after="180" w:line="312" w:lineRule="auto"/>
+      </w:pPr>
+      <w:r>
+        <w:rPr>
+          <w:sz w:val="22"/>
+          <w:szCs w:val="22"/>
+        </w:rPr>
+        <w:t xml:space="preserve">Zwei Kreiszahl-Konstanten stehen bereit: PI (3,14159…) und TAU (= 2·PI, der volle Kreis im Bogenmaß). Eine Konstante E gibt es bewusst NICHT, weil e ein beliebter Name für die Fehlervariable in CATCH ist – nutze stattdessen EXP(1).</w:t>
+      </w:r>
+    </w:p>
+    <w:p>
+      <w:pPr>
+        <w:keepLines/>
+        <w:pBdr>
+          <w:left w:val="single" w:color="1B6CA8" w:sz="18" w:space="6"/>
+        </w:pBdr>
+        <w:shd w:fill="F4F4F4" w:val="clear"/>
+        <w:spacing w:after="200" w:before="100" w:line="264" w:lineRule="auto"/>
+        <w:ind w:left="140"/>
+      </w:pPr>
+      <w:r>
+        <w:rPr>
+          <w:rFonts w:ascii="Consolas" w:cs="Consolas" w:eastAsia="Consolas" w:hAnsi="Consolas"/>
+          <w:sz w:val="19"/>
+          <w:szCs w:val="19"/>
+        </w:rPr>
+        <w:t xml:space="preserve">PRINT ROUND(PI, 5)</w:t>
+      </w:r>
+      <w:r>
+        <w:rPr>
+          <w:rFonts w:ascii="Consolas" w:cs="Consolas" w:eastAsia="Consolas" w:hAnsi="Consolas"/>
+          <w:sz w:val="19"/>
+          <w:szCs w:val="19"/>
+        </w:rPr>
+        <w:br/>
+        <w:t xml:space="preserve">PRINT ROUND(TAU, 5)</w:t>
+      </w:r>
+    </w:p>
+    <w:p>
+      <w:pPr>
+        <w:keepLines/>
+        <w:pBdr>
+          <w:left w:val="single" w:color="9AC79A" w:sz="18" w:space="6"/>
+        </w:pBdr>
+        <w:shd w:fill="EAF4EA" w:val="clear"/>
+        <w:spacing w:after="200" w:before="100" w:line="264" w:lineRule="auto"/>
+        <w:ind w:left="140"/>
+      </w:pPr>
+      <w:r>
+        <w:rPr>
+          <w:rFonts w:ascii="Consolas" w:cs="Consolas" w:eastAsia="Consolas" w:hAnsi="Consolas"/>
+          <w:sz w:val="19"/>
+          <w:szCs w:val="19"/>
+        </w:rPr>
+        <w:t xml:space="preserve">3.14159</w:t>
+      </w:r>
+      <w:r>
+        <w:rPr>
+          <w:rFonts w:ascii="Consolas" w:cs="Consolas" w:eastAsia="Consolas" w:hAnsi="Consolas"/>
+          <w:sz w:val="19"/>
+          <w:szCs w:val="19"/>
+        </w:rPr>
+        <w:br/>
+        <w:t xml:space="preserve">6.28319</w:t>
+      </w:r>
+    </w:p>
+    <w:p>
+      <w:pPr>
+        <w:spacing w:before="60"/>
+      </w:pPr>
+    </w:p>
+    <w:tbl>
+      <w:tblPr>
+        <w:tblW w:type="dxa" w:w="9360"/>
+        <w:tblBorders>
+          <w:top w:val="single" w:color="auto" w:sz="4"/>
+          <w:left w:val="single" w:color="auto" w:sz="4"/>
+          <w:bottom w:val="single" w:color="auto" w:sz="4"/>
+          <w:right w:val="single" w:color="auto" w:sz="4"/>
+          <w:insideH w:val="single" w:color="auto" w:sz="4"/>
+          <w:insideV w:val="single" w:color="auto" w:sz="4"/>
+        </w:tblBorders>
+      </w:tblPr>
+      <w:tblGrid>
+        <w:gridCol w:w="9360"/>
+      </w:tblGrid>
+      <w:tr>
+        <w:trPr>
+          <w:cantSplit/>
+        </w:trPr>
+        <w:tc>
+          <w:tcPr>
+            <w:tcW w:type="dxa" w:w="9360"/>
+            <w:tcBorders>
+              <w:top w:val="single" w:color="9CC8E6" w:sz="6"/>
+              <w:left w:val="single" w:color="9CC8E6" w:sz="6"/>
+              <w:bottom w:val="single" w:color="9CC8E6" w:sz="6"/>
+              <w:right w:val="single" w:color="9CC8E6" w:sz="6"/>
+            </w:tcBorders>
+            <w:shd w:fill="E7F2FA" w:val="clear"/>
+            <w:tcMar>
+              <w:top w:type="dxa" w:w="140"/>
+              <w:left w:type="dxa" w:w="180"/>
+              <w:bottom w:type="dxa" w:w="140"/>
+              <w:right w:type="dxa" w:w="180"/>
+            </w:tcMar>
+          </w:tcPr>
+          <w:p>
+            <w:pPr>
+              <w:spacing w:after="40"/>
+            </w:pPr>
+            <w:r>
+              <w:rPr>
+                <w:b/>
+                <w:bCs/>
+                <w:color w:val="1B6CA8"/>
+                <w:sz w:val="22"/>
+                <w:szCs w:val="22"/>
+              </w:rPr>
+              <w:t xml:space="preserve">Zufall und Rauschen</w:t>
+            </w:r>
+          </w:p>
+          <w:p>
+            <w:pPr>
+              <w:spacing w:after="0" w:line="312" w:lineRule="auto"/>
+            </w:pPr>
+            <w:r>
+              <w:rPr>
+                <w:sz w:val="22"/>
+                <w:szCs w:val="22"/>
+              </w:rPr>
+              <w:t xml:space="preserve">Für Zufallszahlen gibt es ein eigenes Kapitel („Zufall“). Für sanftes, zusammenhängendes „Rauschen“ – etwa zur Gelände- oder Wolkenerzeugung – stehen NOISE, NOISE2, NOISE3 und FBM bereit; mehr dazu bei den Spiel-Helfern in Teil IV.</w:t>
             </w:r>
           </w:p>
         </w:tc>

</xml_diff>

<commit_message>
docs(buch): Lehrbuch Kap 32 -- Zufall (Referenz)
RND()/RND(n), RANDINT/RANDF, CHOICE/WEIGHTED_CHOICE (Loot-Tabellen),
SHUFFLE (in place), RANDOMIZE (Seed -> reproduzierbar). Zufallswerte als
Bereich beschrieben statt gepinnt; Seed-Beispiel (2,5) gegen gbrt verifiziert.

Co-Authored-By: Claude Opus 4.8 (1M context) <noreply@anthropic.com>
</commit_message>
<xml_diff>
--- a/buch-referenz/buch/GameBasic-Lehrbuch.docx
+++ b/buch-referenz/buch/GameBasic-Lehrbuch.docx
@@ -786,6 +786,33 @@
           <w:szCs w:val="22"/>
         </w:rPr>
         <w:t xml:space="preserve">	92</w:t>
+      </w:r>
+    </w:p>
+    <w:p>
+      <w:pPr>
+        <w:tabs>
+          <w:tab w:val="right" w:pos="9200" w:leader="dot"/>
+        </w:tabs>
+        <w:spacing w:after="20" w:before="0"/>
+        <w:ind w:left="280"/>
+      </w:pPr>
+      <w:r>
+        <w:rPr>
+          <w:b w:val="false"/>
+          <w:bCs w:val="false"/>
+          <w:color w:val="222222"/>
+          <w:sz w:val="22"/>
+          <w:szCs w:val="22"/>
+        </w:rPr>
+        <w:t xml:space="preserve">Zufall</w:t>
+      </w:r>
+      <w:r>
+        <w:rPr>
+          <w:color w:val="555555"/>
+          <w:sz w:val="22"/>
+          <w:szCs w:val="22"/>
+        </w:rPr>
+        <w:t xml:space="preserve">	96</w:t>
       </w:r>
     </w:p>
     <w:p>
@@ -30526,6 +30553,972 @@
                 <w:szCs w:val="22"/>
               </w:rPr>
               <w:t xml:space="preserve">Für Zufallszahlen gibt es ein eigenes Kapitel („Zufall“). Für sanftes, zusammenhängendes „Rauschen“ – etwa zur Gelände- oder Wolkenerzeugung – stehen NOISE, NOISE2, NOISE3 und FBM bereit; mehr dazu bei den Spiel-Helfern in Teil IV.</w:t>
+            </w:r>
+          </w:p>
+        </w:tc>
+      </w:tr>
+    </w:tbl>
+    <w:p>
+      <w:pPr>
+        <w:spacing w:after="160"/>
+      </w:pPr>
+    </w:p>
+    <w:p>
+      <w:pPr>
+        <w:pStyle w:val="Heading1"/>
+        <w:keepNext/>
+        <w:keepLines/>
+        <w:pageBreakBefore/>
+        <w:pBdr>
+          <w:bottom w:val="single" w:color="1B6CA8" w:sz="12" w:space="4"/>
+        </w:pBdr>
+        <w:spacing w:after="160" w:before="0"/>
+      </w:pPr>
+      <w:r>
+        <w:t xml:space="preserve">Zufall</w:t>
+      </w:r>
+    </w:p>
+    <w:p>
+      <w:pPr>
+        <w:spacing w:after="180" w:line="312" w:lineRule="auto"/>
+      </w:pPr>
+      <w:r>
+        <w:rPr>
+          <w:sz w:val="22"/>
+          <w:szCs w:val="22"/>
+        </w:rPr>
+        <w:t xml:space="preserve">Zufall macht Spiele lebendig: Würfel, zufällige Gegner-Positionen, gemischte Karten, abwechslungsreiche Beute. GameBasic bietet dafür mehrere Funktionen – von der einfachen Zufallszahl bis zum gewichteten Ziehen aus einer Liste. Weil die Werte naturgemäß bei jedem Aufruf anders ausfallen, zeigen die meisten Beispiele hier keine feste Ausgabe, sondern beschreiben den möglichen Bereich.</w:t>
+      </w:r>
+    </w:p>
+    <w:p>
+      <w:pPr>
+        <w:pStyle w:val="Heading2"/>
+        <w:keepNext/>
+        <w:keepLines/>
+        <w:spacing w:after="120" w:before="280"/>
+      </w:pPr>
+      <w:r>
+        <w:t xml:space="preserve">Zufallszahlen</w:t>
+      </w:r>
+    </w:p>
+    <w:p>
+      <w:pPr>
+        <w:keepNext/>
+        <w:keepLines/>
+        <w:pBdr>
+          <w:bottom w:val="single" w:color="DDD0C0" w:sz="4" w:space="2"/>
+        </w:pBdr>
+        <w:spacing w:after="40" w:before="360"/>
+      </w:pPr>
+      <w:r>
+        <w:rPr>
+          <w:rFonts w:ascii="Consolas" w:cs="Consolas" w:eastAsia="Consolas" w:hAnsi="Consolas"/>
+          <w:b/>
+          <w:bCs/>
+          <w:color w:val="9A3412"/>
+          <w:sz w:val="24"/>
+          <w:szCs w:val="24"/>
+        </w:rPr>
+        <w:t xml:space="preserve">RND</w:t>
+      </w:r>
+    </w:p>
+    <w:p>
+      <w:pPr>
+        <w:keepNext/>
+        <w:spacing w:after="120"/>
+      </w:pPr>
+      <w:r>
+        <w:rPr>
+          <w:b/>
+          <w:bCs/>
+          <w:color w:val="6A6A6A"/>
+          <w:sz w:val="18"/>
+          <w:szCs w:val="18"/>
+        </w:rPr>
+        <w:t xml:space="preserve">Syntax:  </w:t>
+      </w:r>
+      <w:r>
+        <w:rPr>
+          <w:rFonts w:ascii="Consolas" w:cs="Consolas" w:eastAsia="Consolas" w:hAnsi="Consolas"/>
+          <w:color w:val="335577"/>
+          <w:sz w:val="19"/>
+          <w:szCs w:val="19"/>
+        </w:rPr>
+        <w:t xml:space="preserve">RND()        RND(n)</w:t>
+      </w:r>
+    </w:p>
+    <w:p>
+      <w:pPr>
+        <w:spacing w:after="180" w:line="312" w:lineRule="auto"/>
+      </w:pPr>
+      <w:r>
+        <w:rPr>
+          <w:sz w:val="22"/>
+          <w:szCs w:val="22"/>
+        </w:rPr>
+        <w:t xml:space="preserve">Ohne Argument liefert RND eine Kommazahl im Bereich von 0 (einschließlich) bis 1 (ausschließlich). Mit einem Argument n liefert RND eine ganze Zahl von 0 bis n-1 – ideal als Baustein, etwa für einen Würfel.</w:t>
+      </w:r>
+    </w:p>
+    <w:p>
+      <w:pPr>
+        <w:keepNext/>
+        <w:spacing w:after="30" w:before="120"/>
+      </w:pPr>
+      <w:r>
+        <w:rPr>
+          <w:b/>
+          <w:bCs/>
+          <w:i/>
+          <w:iCs/>
+          <w:color w:val="6A6A6A"/>
+          <w:sz w:val="18"/>
+          <w:szCs w:val="18"/>
+        </w:rPr>
+        <w:t xml:space="preserve">Beispiel</w:t>
+      </w:r>
+    </w:p>
+    <w:p>
+      <w:pPr>
+        <w:keepLines/>
+        <w:pBdr>
+          <w:left w:val="single" w:color="1B6CA8" w:sz="18" w:space="6"/>
+        </w:pBdr>
+        <w:shd w:fill="F4F4F4" w:val="clear"/>
+        <w:spacing w:after="200" w:before="100" w:line="264" w:lineRule="auto"/>
+        <w:ind w:left="140"/>
+      </w:pPr>
+      <w:r>
+        <w:rPr>
+          <w:rFonts w:ascii="Consolas" w:cs="Consolas" w:eastAsia="Consolas" w:hAnsi="Consolas"/>
+          <w:sz w:val="19"/>
+          <w:szCs w:val="19"/>
+        </w:rPr>
+        <w:t xml:space="preserve">DIM augen AS INTEGER</w:t>
+      </w:r>
+      <w:r>
+        <w:rPr>
+          <w:rFonts w:ascii="Consolas" w:cs="Consolas" w:eastAsia="Consolas" w:hAnsi="Consolas"/>
+          <w:sz w:val="19"/>
+          <w:szCs w:val="19"/>
+        </w:rPr>
+        <w:br/>
+        <w:t xml:space="preserve">augen = RND(6) + 1      ' ganze Zahl 1..6</w:t>
+      </w:r>
+      <w:r>
+        <w:rPr>
+          <w:rFonts w:ascii="Consolas" w:cs="Consolas" w:eastAsia="Consolas" w:hAnsi="Consolas"/>
+          <w:sz w:val="19"/>
+          <w:szCs w:val="19"/>
+        </w:rPr>
+        <w:br/>
+        <w:t xml:space="preserve">PRINT "Du würfelst eine "; augen</w:t>
+      </w:r>
+    </w:p>
+    <w:p>
+      <w:pPr>
+        <w:keepNext/>
+        <w:keepLines/>
+        <w:pBdr>
+          <w:bottom w:val="single" w:color="DDD0C0" w:sz="4" w:space="2"/>
+        </w:pBdr>
+        <w:spacing w:after="40" w:before="360"/>
+      </w:pPr>
+      <w:r>
+        <w:rPr>
+          <w:rFonts w:ascii="Consolas" w:cs="Consolas" w:eastAsia="Consolas" w:hAnsi="Consolas"/>
+          <w:b/>
+          <w:bCs/>
+          <w:color w:val="9A3412"/>
+          <w:sz w:val="24"/>
+          <w:szCs w:val="24"/>
+        </w:rPr>
+        <w:t xml:space="preserve">RANDINT · RANDF</w:t>
+      </w:r>
+    </w:p>
+    <w:p>
+      <w:pPr>
+        <w:keepNext/>
+        <w:spacing w:after="120"/>
+      </w:pPr>
+      <w:r>
+        <w:rPr>
+          <w:b/>
+          <w:bCs/>
+          <w:color w:val="6A6A6A"/>
+          <w:sz w:val="18"/>
+          <w:szCs w:val="18"/>
+        </w:rPr>
+        <w:t xml:space="preserve">Syntax:  </w:t>
+      </w:r>
+      <w:r>
+        <w:rPr>
+          <w:rFonts w:ascii="Consolas" w:cs="Consolas" w:eastAsia="Consolas" w:hAnsi="Consolas"/>
+          <w:color w:val="335577"/>
+          <w:sz w:val="19"/>
+          <w:szCs w:val="19"/>
+        </w:rPr>
+        <w:t xml:space="preserve">RANDINT(lo, hi)   RANDF(lo, hi)</w:t>
+      </w:r>
+    </w:p>
+    <w:p>
+      <w:pPr>
+        <w:spacing w:after="180" w:line="312" w:lineRule="auto"/>
+      </w:pPr>
+      <w:r>
+        <w:rPr>
+          <w:sz w:val="22"/>
+          <w:szCs w:val="22"/>
+        </w:rPr>
+        <w:t xml:space="preserve">RANDINT liefert eine ganze Zufallszahl von lo bis hi – beide Grenzen eingeschlossen (anders als RND(n)). RANDF liefert eine Kommazahl von lo (einschließlich) bis hi (ausschließlich). Meist liest sich RANDINT(1, 6) angenehmer als RND(6) + 1.</w:t>
+      </w:r>
+    </w:p>
+    <w:p>
+      <w:pPr>
+        <w:keepNext/>
+        <w:spacing w:after="30" w:before="120"/>
+      </w:pPr>
+      <w:r>
+        <w:rPr>
+          <w:b/>
+          <w:bCs/>
+          <w:i/>
+          <w:iCs/>
+          <w:color w:val="6A6A6A"/>
+          <w:sz w:val="18"/>
+          <w:szCs w:val="18"/>
+        </w:rPr>
+        <w:t xml:space="preserve">Beispiel</w:t>
+      </w:r>
+    </w:p>
+    <w:p>
+      <w:pPr>
+        <w:keepLines/>
+        <w:pBdr>
+          <w:left w:val="single" w:color="1B6CA8" w:sz="18" w:space="6"/>
+        </w:pBdr>
+        <w:shd w:fill="F4F4F4" w:val="clear"/>
+        <w:spacing w:after="200" w:before="100" w:line="264" w:lineRule="auto"/>
+        <w:ind w:left="140"/>
+      </w:pPr>
+      <w:r>
+        <w:rPr>
+          <w:rFonts w:ascii="Consolas" w:cs="Consolas" w:eastAsia="Consolas" w:hAnsi="Consolas"/>
+          <w:sz w:val="19"/>
+          <w:szCs w:val="19"/>
+        </w:rPr>
+        <w:t xml:space="preserve">PRINT RANDINT(1, 6)     ' Würfel: 1, 2, 3, 4, 5 oder 6</w:t>
+      </w:r>
+      <w:r>
+        <w:rPr>
+          <w:rFonts w:ascii="Consolas" w:cs="Consolas" w:eastAsia="Consolas" w:hAnsi="Consolas"/>
+          <w:sz w:val="19"/>
+          <w:szCs w:val="19"/>
+        </w:rPr>
+        <w:br/>
+        <w:t xml:space="preserve">PRINT RANDF(0.0, 1.0)   ' z. B. eine Wahrscheinlichkeit</w:t>
+      </w:r>
+    </w:p>
+    <w:p>
+      <w:pPr>
+        <w:pStyle w:val="Heading2"/>
+        <w:keepNext/>
+        <w:keepLines/>
+        <w:spacing w:after="120" w:before="280"/>
+      </w:pPr>
+      <w:r>
+        <w:t xml:space="preserve">Aus einer Liste ziehen</w:t>
+      </w:r>
+    </w:p>
+    <w:p>
+      <w:pPr>
+        <w:keepNext/>
+        <w:keepLines/>
+        <w:pBdr>
+          <w:bottom w:val="single" w:color="DDD0C0" w:sz="4" w:space="2"/>
+        </w:pBdr>
+        <w:spacing w:after="40" w:before="360"/>
+      </w:pPr>
+      <w:r>
+        <w:rPr>
+          <w:rFonts w:ascii="Consolas" w:cs="Consolas" w:eastAsia="Consolas" w:hAnsi="Consolas"/>
+          <w:b/>
+          <w:bCs/>
+          <w:color w:val="9A3412"/>
+          <w:sz w:val="24"/>
+          <w:szCs w:val="24"/>
+        </w:rPr>
+        <w:t xml:space="preserve">CHOICE</w:t>
+      </w:r>
+    </w:p>
+    <w:p>
+      <w:pPr>
+        <w:keepNext/>
+        <w:spacing w:after="120"/>
+      </w:pPr>
+      <w:r>
+        <w:rPr>
+          <w:b/>
+          <w:bCs/>
+          <w:color w:val="6A6A6A"/>
+          <w:sz w:val="18"/>
+          <w:szCs w:val="18"/>
+        </w:rPr>
+        <w:t xml:space="preserve">Syntax:  </w:t>
+      </w:r>
+      <w:r>
+        <w:rPr>
+          <w:rFonts w:ascii="Consolas" w:cs="Consolas" w:eastAsia="Consolas" w:hAnsi="Consolas"/>
+          <w:color w:val="335577"/>
+          <w:sz w:val="19"/>
+          <w:szCs w:val="19"/>
+        </w:rPr>
+        <w:t xml:space="preserve">CHOICE(array)</w:t>
+      </w:r>
+    </w:p>
+    <w:p>
+      <w:pPr>
+        <w:spacing w:after="180" w:line="312" w:lineRule="auto"/>
+      </w:pPr>
+      <w:r>
+        <w:rPr>
+          <w:sz w:val="22"/>
+          <w:szCs w:val="22"/>
+        </w:rPr>
+        <w:t xml:space="preserve">Liefert ein zufällig gewähltes Element eines 1D-Arrays – jedes mit gleicher Wahrscheinlichkeit.</w:t>
+      </w:r>
+    </w:p>
+    <w:p>
+      <w:pPr>
+        <w:keepNext/>
+        <w:spacing w:after="30" w:before="120"/>
+      </w:pPr>
+      <w:r>
+        <w:rPr>
+          <w:b/>
+          <w:bCs/>
+          <w:i/>
+          <w:iCs/>
+          <w:color w:val="6A6A6A"/>
+          <w:sz w:val="18"/>
+          <w:szCs w:val="18"/>
+        </w:rPr>
+        <w:t xml:space="preserve">Beispiel</w:t>
+      </w:r>
+    </w:p>
+    <w:p>
+      <w:pPr>
+        <w:keepLines/>
+        <w:pBdr>
+          <w:left w:val="single" w:color="1B6CA8" w:sz="18" w:space="6"/>
+        </w:pBdr>
+        <w:shd w:fill="F4F4F4" w:val="clear"/>
+        <w:spacing w:after="200" w:before="100" w:line="264" w:lineRule="auto"/>
+        <w:ind w:left="140"/>
+      </w:pPr>
+      <w:r>
+        <w:rPr>
+          <w:rFonts w:ascii="Consolas" w:cs="Consolas" w:eastAsia="Consolas" w:hAnsi="Consolas"/>
+          <w:sz w:val="19"/>
+          <w:szCs w:val="19"/>
+        </w:rPr>
+        <w:t xml:space="preserve">DIM farben AS ARRAY OF STRING</w:t>
+      </w:r>
+      <w:r>
+        <w:rPr>
+          <w:rFonts w:ascii="Consolas" w:cs="Consolas" w:eastAsia="Consolas" w:hAnsi="Consolas"/>
+          <w:sz w:val="19"/>
+          <w:szCs w:val="19"/>
+        </w:rPr>
+        <w:br/>
+        <w:t xml:space="preserve">farben = SPLIT$("rot,grün,blau,gelb", ",")</w:t>
+      </w:r>
+      <w:r>
+        <w:rPr>
+          <w:rFonts w:ascii="Consolas" w:cs="Consolas" w:eastAsia="Consolas" w:hAnsi="Consolas"/>
+          <w:sz w:val="19"/>
+          <w:szCs w:val="19"/>
+        </w:rPr>
+        <w:br/>
+        <w:t xml:space="preserve">PRINT CHOICE(farben)    ' eine der vier Farben</w:t>
+      </w:r>
+    </w:p>
+    <w:p>
+      <w:pPr>
+        <w:keepNext/>
+        <w:keepLines/>
+        <w:pBdr>
+          <w:bottom w:val="single" w:color="DDD0C0" w:sz="4" w:space="2"/>
+        </w:pBdr>
+        <w:spacing w:after="40" w:before="360"/>
+      </w:pPr>
+      <w:r>
+        <w:rPr>
+          <w:rFonts w:ascii="Consolas" w:cs="Consolas" w:eastAsia="Consolas" w:hAnsi="Consolas"/>
+          <w:b/>
+          <w:bCs/>
+          <w:color w:val="9A3412"/>
+          <w:sz w:val="24"/>
+          <w:szCs w:val="24"/>
+        </w:rPr>
+        <w:t xml:space="preserve">WEIGHTED_CHOICE</w:t>
+      </w:r>
+    </w:p>
+    <w:p>
+      <w:pPr>
+        <w:keepNext/>
+        <w:spacing w:after="120"/>
+      </w:pPr>
+      <w:r>
+        <w:rPr>
+          <w:b/>
+          <w:bCs/>
+          <w:color w:val="6A6A6A"/>
+          <w:sz w:val="18"/>
+          <w:szCs w:val="18"/>
+        </w:rPr>
+        <w:t xml:space="preserve">Syntax:  </w:t>
+      </w:r>
+      <w:r>
+        <w:rPr>
+          <w:rFonts w:ascii="Consolas" w:cs="Consolas" w:eastAsia="Consolas" w:hAnsi="Consolas"/>
+          <w:color w:val="335577"/>
+          <w:sz w:val="19"/>
+          <w:szCs w:val="19"/>
+        </w:rPr>
+        <w:t xml:space="preserve">WEIGHTED_CHOICE(werte, gewichte)</w:t>
+      </w:r>
+    </w:p>
+    <w:p>
+      <w:pPr>
+        <w:spacing w:after="180" w:line="312" w:lineRule="auto"/>
+      </w:pPr>
+      <w:r>
+        <w:rPr>
+          <w:sz w:val="22"/>
+          <w:szCs w:val="22"/>
+        </w:rPr>
+        <w:t xml:space="preserve">Zieht ein Element aus werte, aber nicht gleichverteilt: Je höher das zugehörige Gewicht, desto wahrscheinlicher. werte und gewichte sind zwei gleich lange 1D-Arrays. Das klassische Werkzeug für Beute-Tabellen („selten, gelegentlich, häufig“).</w:t>
+      </w:r>
+    </w:p>
+    <w:p>
+      <w:pPr>
+        <w:keepNext/>
+        <w:spacing w:after="30" w:before="120"/>
+      </w:pPr>
+      <w:r>
+        <w:rPr>
+          <w:b/>
+          <w:bCs/>
+          <w:i/>
+          <w:iCs/>
+          <w:color w:val="6A6A6A"/>
+          <w:sz w:val="18"/>
+          <w:szCs w:val="18"/>
+        </w:rPr>
+        <w:t xml:space="preserve">Beispiel</w:t>
+      </w:r>
+    </w:p>
+    <w:p>
+      <w:pPr>
+        <w:keepLines/>
+        <w:pBdr>
+          <w:left w:val="single" w:color="1B6CA8" w:sz="18" w:space="6"/>
+        </w:pBdr>
+        <w:shd w:fill="F4F4F4" w:val="clear"/>
+        <w:spacing w:after="200" w:before="100" w:line="264" w:lineRule="auto"/>
+        <w:ind w:left="140"/>
+      </w:pPr>
+      <w:r>
+        <w:rPr>
+          <w:rFonts w:ascii="Consolas" w:cs="Consolas" w:eastAsia="Consolas" w:hAnsi="Consolas"/>
+          <w:sz w:val="19"/>
+          <w:szCs w:val="19"/>
+        </w:rPr>
+        <w:t xml:space="preserve">DIM beute AS ARRAY OF STRING</w:t>
+      </w:r>
+      <w:r>
+        <w:rPr>
+          <w:rFonts w:ascii="Consolas" w:cs="Consolas" w:eastAsia="Consolas" w:hAnsi="Consolas"/>
+          <w:sz w:val="19"/>
+          <w:szCs w:val="19"/>
+        </w:rPr>
+        <w:br/>
+        <w:t xml:space="preserve">DIM chance AS ARRAY OF INTEGER</w:t>
+      </w:r>
+      <w:r>
+        <w:rPr>
+          <w:rFonts w:ascii="Consolas" w:cs="Consolas" w:eastAsia="Consolas" w:hAnsi="Consolas"/>
+          <w:sz w:val="19"/>
+          <w:szCs w:val="19"/>
+        </w:rPr>
+        <w:br/>
+        <w:t xml:space="preserve">beute  = SPLIT$("Gold,Trank,Schwert", ",")</w:t>
+      </w:r>
+      <w:r>
+        <w:rPr>
+          <w:rFonts w:ascii="Consolas" w:cs="Consolas" w:eastAsia="Consolas" w:hAnsi="Consolas"/>
+          <w:sz w:val="19"/>
+          <w:szCs w:val="19"/>
+        </w:rPr>
+        <w:br/>
+        <w:t xml:space="preserve">chance[0]=70 : chance[1]=25 : chance[2]=5   ' Schwert ist selten</w:t>
+      </w:r>
+      <w:r>
+        <w:rPr>
+          <w:rFonts w:ascii="Consolas" w:cs="Consolas" w:eastAsia="Consolas" w:hAnsi="Consolas"/>
+          <w:sz w:val="19"/>
+          <w:szCs w:val="19"/>
+        </w:rPr>
+        <w:br/>
+        <w:t xml:space="preserve">PRINT WEIGHTED_CHOICE(beute, chance)</w:t>
+      </w:r>
+    </w:p>
+    <w:p>
+      <w:pPr>
+        <w:keepNext/>
+        <w:keepLines/>
+        <w:pBdr>
+          <w:bottom w:val="single" w:color="DDD0C0" w:sz="4" w:space="2"/>
+        </w:pBdr>
+        <w:spacing w:after="40" w:before="360"/>
+      </w:pPr>
+      <w:r>
+        <w:rPr>
+          <w:rFonts w:ascii="Consolas" w:cs="Consolas" w:eastAsia="Consolas" w:hAnsi="Consolas"/>
+          <w:b/>
+          <w:bCs/>
+          <w:color w:val="9A3412"/>
+          <w:sz w:val="24"/>
+          <w:szCs w:val="24"/>
+        </w:rPr>
+        <w:t xml:space="preserve">SHUFFLE</w:t>
+      </w:r>
+    </w:p>
+    <w:p>
+      <w:pPr>
+        <w:keepNext/>
+        <w:spacing w:after="120"/>
+      </w:pPr>
+      <w:r>
+        <w:rPr>
+          <w:b/>
+          <w:bCs/>
+          <w:color w:val="6A6A6A"/>
+          <w:sz w:val="18"/>
+          <w:szCs w:val="18"/>
+        </w:rPr>
+        <w:t xml:space="preserve">Syntax:  </w:t>
+      </w:r>
+      <w:r>
+        <w:rPr>
+          <w:rFonts w:ascii="Consolas" w:cs="Consolas" w:eastAsia="Consolas" w:hAnsi="Consolas"/>
+          <w:color w:val="335577"/>
+          <w:sz w:val="19"/>
+          <w:szCs w:val="19"/>
+        </w:rPr>
+        <w:t xml:space="preserve">SHUFFLE(array)</w:t>
+      </w:r>
+    </w:p>
+    <w:p>
+      <w:pPr>
+        <w:spacing w:after="180" w:line="312" w:lineRule="auto"/>
+      </w:pPr>
+      <w:r>
+        <w:rPr>
+          <w:sz w:val="22"/>
+          <w:szCs w:val="22"/>
+        </w:rPr>
+        <w:t xml:space="preserve">Mischt ein 1D-Array zufällig durch – direkt an Ort und Stelle (das Array wird selbst verändert, es entsteht keine Kopie). Perfekt zum Mischen eines Kartenstapels.</w:t>
+      </w:r>
+    </w:p>
+    <w:p>
+      <w:pPr>
+        <w:keepNext/>
+        <w:spacing w:after="30" w:before="120"/>
+      </w:pPr>
+      <w:r>
+        <w:rPr>
+          <w:b/>
+          <w:bCs/>
+          <w:i/>
+          <w:iCs/>
+          <w:color w:val="6A6A6A"/>
+          <w:sz w:val="18"/>
+          <w:szCs w:val="18"/>
+        </w:rPr>
+        <w:t xml:space="preserve">Beispiel</w:t>
+      </w:r>
+    </w:p>
+    <w:p>
+      <w:pPr>
+        <w:keepLines/>
+        <w:pBdr>
+          <w:left w:val="single" w:color="1B6CA8" w:sz="18" w:space="6"/>
+        </w:pBdr>
+        <w:shd w:fill="F4F4F4" w:val="clear"/>
+        <w:spacing w:after="200" w:before="100" w:line="264" w:lineRule="auto"/>
+        <w:ind w:left="140"/>
+      </w:pPr>
+      <w:r>
+        <w:rPr>
+          <w:rFonts w:ascii="Consolas" w:cs="Consolas" w:eastAsia="Consolas" w:hAnsi="Consolas"/>
+          <w:sz w:val="19"/>
+          <w:szCs w:val="19"/>
+        </w:rPr>
+        <w:t xml:space="preserve">DIM karten[5] AS INTEGER</w:t>
+      </w:r>
+      <w:r>
+        <w:rPr>
+          <w:rFonts w:ascii="Consolas" w:cs="Consolas" w:eastAsia="Consolas" w:hAnsi="Consolas"/>
+          <w:sz w:val="19"/>
+          <w:szCs w:val="19"/>
+        </w:rPr>
+        <w:br/>
+        <w:t xml:space="preserve">karten[0]=1 : karten[1]=2 : karten[2]=3</w:t>
+      </w:r>
+      <w:r>
+        <w:rPr>
+          <w:rFonts w:ascii="Consolas" w:cs="Consolas" w:eastAsia="Consolas" w:hAnsi="Consolas"/>
+          <w:sz w:val="19"/>
+          <w:szCs w:val="19"/>
+        </w:rPr>
+        <w:br/>
+        <w:t xml:space="preserve">karten[3]=4 : karten[4]=5</w:t>
+      </w:r>
+      <w:r>
+        <w:rPr>
+          <w:rFonts w:ascii="Consolas" w:cs="Consolas" w:eastAsia="Consolas" w:hAnsi="Consolas"/>
+          <w:sz w:val="19"/>
+          <w:szCs w:val="19"/>
+        </w:rPr>
+        <w:br/>
+        <w:t xml:space="preserve">SHUFFLE(karten)         ' nun in zufälliger Reihenfolge</w:t>
+      </w:r>
+    </w:p>
+    <w:p>
+      <w:pPr>
+        <w:pStyle w:val="Heading2"/>
+        <w:keepNext/>
+        <w:keepLines/>
+        <w:spacing w:after="120" w:before="280"/>
+      </w:pPr>
+      <w:r>
+        <w:t xml:space="preserve">Den Zufall steuern: RANDOMIZE</w:t>
+      </w:r>
+    </w:p>
+    <w:p>
+      <w:pPr>
+        <w:spacing w:after="180" w:line="312" w:lineRule="auto"/>
+      </w:pPr>
+      <w:r>
+        <w:rPr>
+          <w:sz w:val="22"/>
+          <w:szCs w:val="22"/>
+        </w:rPr>
+        <w:t xml:space="preserve">Hinter den Zufallszahlen steckt ein berechneter Strom von Werten, der von einem Startwert – dem Seed – abhängt. Setzt du mit RANDOMIZE einen festen Seed, kommt danach IMMER dieselbe Folge heraus. Das klingt unzufällig, ist aber sehr nützlich: zum Testen (jeder Lauf ist gleich) oder für reproduzierbare Level („Welt Nr. 42“ sieht bei allen Spielern gleich aus).</w:t>
+      </w:r>
+    </w:p>
+    <w:p>
+      <w:pPr>
+        <w:keepNext/>
+        <w:keepLines/>
+        <w:pBdr>
+          <w:bottom w:val="single" w:color="DDD0C0" w:sz="4" w:space="2"/>
+        </w:pBdr>
+        <w:spacing w:after="40" w:before="360"/>
+      </w:pPr>
+      <w:r>
+        <w:rPr>
+          <w:rFonts w:ascii="Consolas" w:cs="Consolas" w:eastAsia="Consolas" w:hAnsi="Consolas"/>
+          <w:b/>
+          <w:bCs/>
+          <w:color w:val="9A3412"/>
+          <w:sz w:val="24"/>
+          <w:szCs w:val="24"/>
+        </w:rPr>
+        <w:t xml:space="preserve">RANDOMIZE</w:t>
+      </w:r>
+    </w:p>
+    <w:p>
+      <w:pPr>
+        <w:keepNext/>
+        <w:spacing w:after="120"/>
+      </w:pPr>
+      <w:r>
+        <w:rPr>
+          <w:b/>
+          <w:bCs/>
+          <w:color w:val="6A6A6A"/>
+          <w:sz w:val="18"/>
+          <w:szCs w:val="18"/>
+        </w:rPr>
+        <w:t xml:space="preserve">Syntax:  </w:t>
+      </w:r>
+      <w:r>
+        <w:rPr>
+          <w:rFonts w:ascii="Consolas" w:cs="Consolas" w:eastAsia="Consolas" w:hAnsi="Consolas"/>
+          <w:color w:val="335577"/>
+          <w:sz w:val="19"/>
+          <w:szCs w:val="19"/>
+        </w:rPr>
+        <w:t xml:space="preserve">RANDOMIZE([seed])</w:t>
+      </w:r>
+    </w:p>
+    <w:p>
+      <w:pPr>
+        <w:spacing w:after="180" w:line="312" w:lineRule="auto"/>
+      </w:pPr>
+      <w:r>
+        <w:rPr>
+          <w:sz w:val="22"/>
+          <w:szCs w:val="22"/>
+        </w:rPr>
+        <w:t xml:space="preserve">Setzt den Startwert des Zufalls. Mit einer festen Zahl wird die Zufallsfolge reproduzierbar; ohne Argument nimmt GameBasic einen unvorhersehbaren System-Seed (das ist der Normalfall für echten Zufall).</w:t>
+      </w:r>
+    </w:p>
+    <w:p>
+      <w:pPr>
+        <w:keepNext/>
+        <w:spacing w:after="30" w:before="120"/>
+      </w:pPr>
+      <w:r>
+        <w:rPr>
+          <w:b/>
+          <w:bCs/>
+          <w:i/>
+          <w:iCs/>
+          <w:color w:val="6A6A6A"/>
+          <w:sz w:val="18"/>
+          <w:szCs w:val="18"/>
+        </w:rPr>
+        <w:t xml:space="preserve">Beispiel</w:t>
+      </w:r>
+    </w:p>
+    <w:p>
+      <w:pPr>
+        <w:keepLines/>
+        <w:pBdr>
+          <w:left w:val="single" w:color="1B6CA8" w:sz="18" w:space="6"/>
+        </w:pBdr>
+        <w:shd w:fill="F4F4F4" w:val="clear"/>
+        <w:spacing w:after="200" w:before="100" w:line="264" w:lineRule="auto"/>
+        <w:ind w:left="140"/>
+      </w:pPr>
+      <w:r>
+        <w:rPr>
+          <w:rFonts w:ascii="Consolas" w:cs="Consolas" w:eastAsia="Consolas" w:hAnsi="Consolas"/>
+          <w:sz w:val="19"/>
+          <w:szCs w:val="19"/>
+        </w:rPr>
+        <w:t xml:space="preserve">RANDOMIZE(42)           ' fester Seed</w:t>
+      </w:r>
+      <w:r>
+        <w:rPr>
+          <w:rFonts w:ascii="Consolas" w:cs="Consolas" w:eastAsia="Consolas" w:hAnsi="Consolas"/>
+          <w:sz w:val="19"/>
+          <w:szCs w:val="19"/>
+        </w:rPr>
+        <w:br/>
+        <w:t xml:space="preserve">PRINT RND(6) + 1</w:t>
+      </w:r>
+      <w:r>
+        <w:rPr>
+          <w:rFonts w:ascii="Consolas" w:cs="Consolas" w:eastAsia="Consolas" w:hAnsi="Consolas"/>
+          <w:sz w:val="19"/>
+          <w:szCs w:val="19"/>
+        </w:rPr>
+        <w:br/>
+        <w:t xml:space="preserve">PRINT RND(6) + 1</w:t>
+      </w:r>
+    </w:p>
+    <w:p>
+      <w:pPr>
+        <w:keepNext/>
+        <w:spacing w:after="30" w:before="120"/>
+      </w:pPr>
+      <w:r>
+        <w:rPr>
+          <w:b/>
+          <w:bCs/>
+          <w:i/>
+          <w:iCs/>
+          <w:color w:val="6A6A6A"/>
+          <w:sz w:val="18"/>
+          <w:szCs w:val="18"/>
+        </w:rPr>
+        <w:t xml:space="preserve">Ausgabe</w:t>
+      </w:r>
+    </w:p>
+    <w:p>
+      <w:pPr>
+        <w:keepLines/>
+        <w:pBdr>
+          <w:left w:val="single" w:color="9AC79A" w:sz="18" w:space="6"/>
+        </w:pBdr>
+        <w:shd w:fill="EAF4EA" w:val="clear"/>
+        <w:spacing w:after="200" w:before="100" w:line="264" w:lineRule="auto"/>
+        <w:ind w:left="140"/>
+      </w:pPr>
+      <w:r>
+        <w:rPr>
+          <w:rFonts w:ascii="Consolas" w:cs="Consolas" w:eastAsia="Consolas" w:hAnsi="Consolas"/>
+          <w:sz w:val="19"/>
+          <w:szCs w:val="19"/>
+        </w:rPr>
+        <w:t xml:space="preserve">2</w:t>
+      </w:r>
+      <w:r>
+        <w:rPr>
+          <w:rFonts w:ascii="Consolas" w:cs="Consolas" w:eastAsia="Consolas" w:hAnsi="Consolas"/>
+          <w:sz w:val="19"/>
+          <w:szCs w:val="19"/>
+        </w:rPr>
+        <w:br/>
+        <w:t xml:space="preserve">5</w:t>
+      </w:r>
+    </w:p>
+    <w:p>
+      <w:pPr>
+        <w:spacing w:before="60"/>
+      </w:pPr>
+    </w:p>
+    <w:tbl>
+      <w:tblPr>
+        <w:tblW w:type="dxa" w:w="9360"/>
+        <w:tblBorders>
+          <w:top w:val="single" w:color="auto" w:sz="4"/>
+          <w:left w:val="single" w:color="auto" w:sz="4"/>
+          <w:bottom w:val="single" w:color="auto" w:sz="4"/>
+          <w:right w:val="single" w:color="auto" w:sz="4"/>
+          <w:insideH w:val="single" w:color="auto" w:sz="4"/>
+          <w:insideV w:val="single" w:color="auto" w:sz="4"/>
+        </w:tblBorders>
+      </w:tblPr>
+      <w:tblGrid>
+        <w:gridCol w:w="9360"/>
+      </w:tblGrid>
+      <w:tr>
+        <w:trPr>
+          <w:cantSplit/>
+        </w:trPr>
+        <w:tc>
+          <w:tcPr>
+            <w:tcW w:type="dxa" w:w="9360"/>
+            <w:tcBorders>
+              <w:top w:val="single" w:color="E0B96A" w:sz="6"/>
+              <w:left w:val="single" w:color="E0B96A" w:sz="6"/>
+              <w:bottom w:val="single" w:color="E0B96A" w:sz="6"/>
+              <w:right w:val="single" w:color="E0B96A" w:sz="6"/>
+            </w:tcBorders>
+            <w:shd w:fill="FDF3E0" w:val="clear"/>
+            <w:tcMar>
+              <w:top w:type="dxa" w:w="140"/>
+              <w:left w:type="dxa" w:w="180"/>
+              <w:bottom w:type="dxa" w:w="140"/>
+              <w:right w:type="dxa" w:w="180"/>
+            </w:tcMar>
+          </w:tcPr>
+          <w:p>
+            <w:pPr>
+              <w:spacing w:after="40"/>
+            </w:pPr>
+            <w:r>
+              <w:rPr>
+                <w:b/>
+                <w:bCs/>
+                <w:color w:val="9A6A1E"/>
+                <w:sz w:val="22"/>
+                <w:szCs w:val="22"/>
+              </w:rPr>
+              <w:t xml:space="preserve">Merke</w:t>
+            </w:r>
+          </w:p>
+          <w:p>
+            <w:pPr>
+              <w:spacing w:after="0" w:line="312" w:lineRule="auto"/>
+            </w:pPr>
+            <w:r>
+              <w:rPr>
+                <w:sz w:val="22"/>
+                <w:szCs w:val="22"/>
+              </w:rPr>
+              <w:t xml:space="preserve">Mit RANDOMIZE(42) erhältst du genau diese Folge (2, dann 5) – bei dir genauso. Lässt du das RANDOMIZE weg oder rufst es ohne Argument auf, ist die Folge bei jedem Programmstart anders.</w:t>
+            </w:r>
+          </w:p>
+        </w:tc>
+      </w:tr>
+    </w:tbl>
+    <w:p>
+      <w:pPr>
+        <w:spacing w:after="160"/>
+      </w:pPr>
+    </w:p>
+    <w:p>
+      <w:pPr>
+        <w:spacing w:before="60"/>
+      </w:pPr>
+    </w:p>
+    <w:tbl>
+      <w:tblPr>
+        <w:tblW w:type="dxa" w:w="9360"/>
+        <w:tblBorders>
+          <w:top w:val="single" w:color="auto" w:sz="4"/>
+          <w:left w:val="single" w:color="auto" w:sz="4"/>
+          <w:bottom w:val="single" w:color="auto" w:sz="4"/>
+          <w:right w:val="single" w:color="auto" w:sz="4"/>
+          <w:insideH w:val="single" w:color="auto" w:sz="4"/>
+          <w:insideV w:val="single" w:color="auto" w:sz="4"/>
+        </w:tblBorders>
+      </w:tblPr>
+      <w:tblGrid>
+        <w:gridCol w:w="9360"/>
+      </w:tblGrid>
+      <w:tr>
+        <w:trPr>
+          <w:cantSplit/>
+        </w:trPr>
+        <w:tc>
+          <w:tcPr>
+            <w:tcW w:type="dxa" w:w="9360"/>
+            <w:tcBorders>
+              <w:top w:val="single" w:color="9CC8E6" w:sz="6"/>
+              <w:left w:val="single" w:color="9CC8E6" w:sz="6"/>
+              <w:bottom w:val="single" w:color="9CC8E6" w:sz="6"/>
+              <w:right w:val="single" w:color="9CC8E6" w:sz="6"/>
+            </w:tcBorders>
+            <w:shd w:fill="E7F2FA" w:val="clear"/>
+            <w:tcMar>
+              <w:top w:type="dxa" w:w="140"/>
+              <w:left w:type="dxa" w:w="180"/>
+              <w:bottom w:type="dxa" w:w="140"/>
+              <w:right w:type="dxa" w:w="180"/>
+            </w:tcMar>
+          </w:tcPr>
+          <w:p>
+            <w:pPr>
+              <w:spacing w:after="40"/>
+            </w:pPr>
+            <w:r>
+              <w:rPr>
+                <w:b/>
+                <w:bCs/>
+                <w:color w:val="1B6CA8"/>
+                <w:sz w:val="22"/>
+                <w:szCs w:val="22"/>
+              </w:rPr>
+              <w:t xml:space="preserve">Wann Seed setzen?</w:t>
+            </w:r>
+          </w:p>
+          <w:p>
+            <w:pPr>
+              <w:spacing w:after="0" w:line="312" w:lineRule="auto"/>
+            </w:pPr>
+            <w:r>
+              <w:rPr>
+                <w:sz w:val="22"/>
+                <w:szCs w:val="22"/>
+              </w:rPr>
+              <w:t xml:space="preserve">Für echten Zufall im fertigen Spiel brauchst du RANDOMIZE meist gar nicht – ohne Seed ist jede Runde anders. Greife zum festen Seed gezielt: beim Testen, für nachbaubare Zufalls-Level oder wenn ein Fehler nur bei bestimmten Zufallswerten auftritt und du ihn zuverlässig wiederholen willst.</w:t>
             </w:r>
           </w:p>
         </w:tc>

</xml_diff>

<commit_message>
docs(buch): Lehrbuch Kap 33 -- Zeichenketten-Funktionen (kompakte Referenz)
Gruppierte Schnelluebersicht aller String-Fns (LEN/UPPER/LOWER/REVERSE,
LEFT/RIGHT/MID/Slicing, INSTR/CONTAINS/STARTSWITH/ENDSWITH, REPLACE/TRIM/
LTRIM/RTRIM, SPLIT/JOIN, PADL/PADR/REPEAT) + Methoden-Ketten-Beispiel.
Verweist fuers Tutorial auf Kap 16. Beispiel gegen gbrt verifiziert.

Co-Authored-By: Claude Opus 4.8 (1M context) <noreply@anthropic.com>
</commit_message>
<xml_diff>
--- a/buch-referenz/buch/GameBasic-Lehrbuch.docx
+++ b/buch-referenz/buch/GameBasic-Lehrbuch.docx
@@ -813,6 +813,33 @@
           <w:szCs w:val="22"/>
         </w:rPr>
         <w:t xml:space="preserve">	96</w:t>
+      </w:r>
+    </w:p>
+    <w:p>
+      <w:pPr>
+        <w:tabs>
+          <w:tab w:val="right" w:pos="9200" w:leader="dot"/>
+        </w:tabs>
+        <w:spacing w:after="20" w:before="0"/>
+        <w:ind w:left="280"/>
+      </w:pPr>
+      <w:r>
+        <w:rPr>
+          <w:b w:val="false"/>
+          <w:bCs w:val="false"/>
+          <w:color w:val="222222"/>
+          <w:sz w:val="22"/>
+          <w:szCs w:val="22"/>
+        </w:rPr>
+        <w:t xml:space="preserve">Zeichenketten-Funktionen</w:t>
+      </w:r>
+      <w:r>
+        <w:rPr>
+          <w:color w:val="555555"/>
+          <w:sz w:val="22"/>
+          <w:szCs w:val="22"/>
+        </w:rPr>
+        <w:t xml:space="preserve">	99</w:t>
       </w:r>
     </w:p>
     <w:p>
@@ -31519,6 +31546,688 @@
                 <w:szCs w:val="22"/>
               </w:rPr>
               <w:t xml:space="preserve">Für echten Zufall im fertigen Spiel brauchst du RANDOMIZE meist gar nicht – ohne Seed ist jede Runde anders. Greife zum festen Seed gezielt: beim Testen, für nachbaubare Zufalls-Level oder wenn ein Fehler nur bei bestimmten Zufallswerten auftritt und du ihn zuverlässig wiederholen willst.</w:t>
+            </w:r>
+          </w:p>
+        </w:tc>
+      </w:tr>
+    </w:tbl>
+    <w:p>
+      <w:pPr>
+        <w:spacing w:after="160"/>
+      </w:pPr>
+    </w:p>
+    <w:p>
+      <w:pPr>
+        <w:pStyle w:val="Heading1"/>
+        <w:keepNext/>
+        <w:keepLines/>
+        <w:pageBreakBefore/>
+        <w:pBdr>
+          <w:bottom w:val="single" w:color="1B6CA8" w:sz="12" w:space="4"/>
+        </w:pBdr>
+        <w:spacing w:after="160" w:before="0"/>
+      </w:pPr>
+      <w:r>
+        <w:t xml:space="preserve">Zeichenketten-Funktionen</w:t>
+      </w:r>
+    </w:p>
+    <w:p>
+      <w:pPr>
+        <w:spacing w:after="180" w:line="312" w:lineRule="auto"/>
+      </w:pPr>
+      <w:r>
+        <w:rPr>
+          <w:sz w:val="22"/>
+          <w:szCs w:val="22"/>
+        </w:rPr>
+        <w:t xml:space="preserve">Dieses Kapitel ist die kompakte Übersicht aller String-Funktionen zum Nachschlagen. Ausführlich erklärt und mit Beispielen versehen sind sie im Kapitel „Strings im Detail“ (Teil II) – dort findest du auch den wichtigen Hinweis, dass Zeichen-Positionen ab 0 gezählt werden. Funktionen mit $-Endung liefern einen String; das $ darfst du weglassen (UPPER$ ≡ UPPER).</w:t>
+      </w:r>
+    </w:p>
+    <w:p>
+      <w:pPr>
+        <w:pStyle w:val="Heading2"/>
+        <w:keepNext/>
+        <w:keepLines/>
+        <w:spacing w:after="120" w:before="280"/>
+      </w:pPr>
+      <w:r>
+        <w:t xml:space="preserve">Länge &amp; Schreibweise</w:t>
+      </w:r>
+    </w:p>
+    <w:p>
+      <w:pPr>
+        <w:pStyle w:val="ListParagraph"/>
+        <w:numPr>
+          <w:ilvl w:val="0"/>
+          <w:numId w:val="2"/>
+        </w:numPr>
+        <w:spacing w:after="100" w:line="312" w:lineRule="auto"/>
+      </w:pPr>
+      <w:r>
+        <w:rPr>
+          <w:b/>
+          <w:bCs/>
+          <w:sz w:val="22"/>
+          <w:szCs w:val="22"/>
+        </w:rPr>
+        <w:t xml:space="preserve">LEN(s$)  </w:t>
+      </w:r>
+      <w:r>
+        <w:rPr>
+          <w:sz w:val="22"/>
+          <w:szCs w:val="22"/>
+        </w:rPr>
+        <w:t xml:space="preserve">→ Anzahl der Zeichen.</w:t>
+      </w:r>
+    </w:p>
+    <w:p>
+      <w:pPr>
+        <w:pStyle w:val="ListParagraph"/>
+        <w:numPr>
+          <w:ilvl w:val="0"/>
+          <w:numId w:val="2"/>
+        </w:numPr>
+        <w:spacing w:after="100" w:line="312" w:lineRule="auto"/>
+      </w:pPr>
+      <w:r>
+        <w:rPr>
+          <w:b/>
+          <w:bCs/>
+          <w:sz w:val="22"/>
+          <w:szCs w:val="22"/>
+        </w:rPr>
+        <w:t xml:space="preserve">UPPER$(s$) · LOWER$(s$)  </w:t>
+      </w:r>
+      <w:r>
+        <w:rPr>
+          <w:sz w:val="22"/>
+          <w:szCs w:val="22"/>
+        </w:rPr>
+        <w:t xml:space="preserve">→ in Groß- bzw. Kleinbuchstaben.</w:t>
+      </w:r>
+    </w:p>
+    <w:p>
+      <w:pPr>
+        <w:pStyle w:val="ListParagraph"/>
+        <w:numPr>
+          <w:ilvl w:val="0"/>
+          <w:numId w:val="2"/>
+        </w:numPr>
+        <w:spacing w:after="100" w:line="312" w:lineRule="auto"/>
+      </w:pPr>
+      <w:r>
+        <w:rPr>
+          <w:b/>
+          <w:bCs/>
+          <w:sz w:val="22"/>
+          <w:szCs w:val="22"/>
+        </w:rPr>
+        <w:t xml:space="preserve">REVERSE$(s$)  </w:t>
+      </w:r>
+      <w:r>
+        <w:rPr>
+          <w:sz w:val="22"/>
+          <w:szCs w:val="22"/>
+        </w:rPr>
+        <w:t xml:space="preserve">→ Zeichen in umgekehrter Reihenfolge.</w:t>
+      </w:r>
+    </w:p>
+    <w:p>
+      <w:pPr>
+        <w:pStyle w:val="Heading2"/>
+        <w:keepNext/>
+        <w:keepLines/>
+        <w:spacing w:after="120" w:before="280"/>
+      </w:pPr>
+      <w:r>
+        <w:t xml:space="preserve">Teile herausschneiden</w:t>
+      </w:r>
+    </w:p>
+    <w:p>
+      <w:pPr>
+        <w:pStyle w:val="ListParagraph"/>
+        <w:numPr>
+          <w:ilvl w:val="0"/>
+          <w:numId w:val="2"/>
+        </w:numPr>
+        <w:spacing w:after="100" w:line="312" w:lineRule="auto"/>
+      </w:pPr>
+      <w:r>
+        <w:rPr>
+          <w:b/>
+          <w:bCs/>
+          <w:sz w:val="22"/>
+          <w:szCs w:val="22"/>
+        </w:rPr>
+        <w:t xml:space="preserve">LEFT$(s$, n) · RIGHT$(s$, n)  </w:t>
+      </w:r>
+      <w:r>
+        <w:rPr>
+          <w:sz w:val="22"/>
+          <w:szCs w:val="22"/>
+        </w:rPr>
+        <w:t xml:space="preserve">→ die ersten bzw. letzten n Zeichen.</w:t>
+      </w:r>
+    </w:p>
+    <w:p>
+      <w:pPr>
+        <w:pStyle w:val="ListParagraph"/>
+        <w:numPr>
+          <w:ilvl w:val="0"/>
+          <w:numId w:val="2"/>
+        </w:numPr>
+        <w:spacing w:after="100" w:line="312" w:lineRule="auto"/>
+      </w:pPr>
+      <w:r>
+        <w:rPr>
+          <w:b/>
+          <w:bCs/>
+          <w:sz w:val="22"/>
+          <w:szCs w:val="22"/>
+        </w:rPr>
+        <w:t xml:space="preserve">MID$(s$, start[, n])  </w:t>
+      </w:r>
+      <w:r>
+        <w:rPr>
+          <w:sz w:val="22"/>
+          <w:szCs w:val="22"/>
+        </w:rPr>
+        <w:t xml:space="preserve">→ ab Position start (ab 0!) bis zu n Zeichen, sonst bis zum Ende.</w:t>
+      </w:r>
+    </w:p>
+    <w:p>
+      <w:pPr>
+        <w:pStyle w:val="ListParagraph"/>
+        <w:numPr>
+          <w:ilvl w:val="0"/>
+          <w:numId w:val="2"/>
+        </w:numPr>
+        <w:spacing w:after="100" w:line="312" w:lineRule="auto"/>
+      </w:pPr>
+      <w:r>
+        <w:rPr>
+          <w:b/>
+          <w:bCs/>
+          <w:sz w:val="22"/>
+          <w:szCs w:val="22"/>
+        </w:rPr>
+        <w:t xml:space="preserve">s[i]  ·  s[a:b]  </w:t>
+      </w:r>
+      <w:r>
+        <w:rPr>
+          <w:sz w:val="22"/>
+          <w:szCs w:val="22"/>
+        </w:rPr>
+        <w:t xml:space="preserve">→ einzelnes Zeichen bzw. Ausschnitt (Slicing; untere Grenze dabei, obere nicht).</w:t>
+      </w:r>
+    </w:p>
+    <w:p>
+      <w:pPr>
+        <w:pStyle w:val="Heading2"/>
+        <w:keepNext/>
+        <w:keepLines/>
+        <w:spacing w:after="120" w:before="280"/>
+      </w:pPr>
+      <w:r>
+        <w:t xml:space="preserve">Suchen &amp; Prüfen</w:t>
+      </w:r>
+    </w:p>
+    <w:p>
+      <w:pPr>
+        <w:pStyle w:val="ListParagraph"/>
+        <w:numPr>
+          <w:ilvl w:val="0"/>
+          <w:numId w:val="2"/>
+        </w:numPr>
+        <w:spacing w:after="100" w:line="312" w:lineRule="auto"/>
+      </w:pPr>
+      <w:r>
+        <w:rPr>
+          <w:b/>
+          <w:bCs/>
+          <w:sz w:val="22"/>
+          <w:szCs w:val="22"/>
+        </w:rPr>
+        <w:t xml:space="preserve">INSTR(s$, teil$[, start])  </w:t>
+      </w:r>
+      <w:r>
+        <w:rPr>
+          <w:sz w:val="22"/>
+          <w:szCs w:val="22"/>
+        </w:rPr>
+        <w:t xml:space="preserve">→ Position von teil$ (ab 0) oder -1, wenn nicht enthalten; optional ab Position start.</w:t>
+      </w:r>
+    </w:p>
+    <w:p>
+      <w:pPr>
+        <w:pStyle w:val="ListParagraph"/>
+        <w:numPr>
+          <w:ilvl w:val="0"/>
+          <w:numId w:val="2"/>
+        </w:numPr>
+        <w:spacing w:after="100" w:line="312" w:lineRule="auto"/>
+      </w:pPr>
+      <w:r>
+        <w:rPr>
+          <w:b/>
+          <w:bCs/>
+          <w:sz w:val="22"/>
+          <w:szCs w:val="22"/>
+        </w:rPr>
+        <w:t xml:space="preserve">CONTAINS(s$, teil$)  </w:t>
+      </w:r>
+      <w:r>
+        <w:rPr>
+          <w:sz w:val="22"/>
+          <w:szCs w:val="22"/>
+        </w:rPr>
+        <w:t xml:space="preserve">→ TRUE, wenn teil$ enthalten ist (auch: teil$ IN s$).</w:t>
+      </w:r>
+    </w:p>
+    <w:p>
+      <w:pPr>
+        <w:pStyle w:val="ListParagraph"/>
+        <w:numPr>
+          <w:ilvl w:val="0"/>
+          <w:numId w:val="2"/>
+        </w:numPr>
+        <w:spacing w:after="100" w:line="312" w:lineRule="auto"/>
+      </w:pPr>
+      <w:r>
+        <w:rPr>
+          <w:b/>
+          <w:bCs/>
+          <w:sz w:val="22"/>
+          <w:szCs w:val="22"/>
+        </w:rPr>
+        <w:t xml:space="preserve">STARTSWITH(s$, präfix$) · ENDSWITH(s$, suffix$)  </w:t>
+      </w:r>
+      <w:r>
+        <w:rPr>
+          <w:sz w:val="22"/>
+          <w:szCs w:val="22"/>
+        </w:rPr>
+        <w:t xml:space="preserve">→ TRUE, wenn s$ so beginnt bzw. endet.</w:t>
+      </w:r>
+    </w:p>
+    <w:p>
+      <w:pPr>
+        <w:pStyle w:val="Heading2"/>
+        <w:keepNext/>
+        <w:keepLines/>
+        <w:spacing w:after="120" w:before="280"/>
+      </w:pPr>
+      <w:r>
+        <w:t xml:space="preserve">Ersetzen &amp; Säubern</w:t>
+      </w:r>
+    </w:p>
+    <w:p>
+      <w:pPr>
+        <w:pStyle w:val="ListParagraph"/>
+        <w:numPr>
+          <w:ilvl w:val="0"/>
+          <w:numId w:val="2"/>
+        </w:numPr>
+        <w:spacing w:after="100" w:line="312" w:lineRule="auto"/>
+      </w:pPr>
+      <w:r>
+        <w:rPr>
+          <w:b/>
+          <w:bCs/>
+          <w:sz w:val="22"/>
+          <w:szCs w:val="22"/>
+        </w:rPr>
+        <w:t xml:space="preserve">REPLACE$(s$, alt$, neu$)  </w:t>
+      </w:r>
+      <w:r>
+        <w:rPr>
+          <w:sz w:val="22"/>
+          <w:szCs w:val="22"/>
+        </w:rPr>
+        <w:t xml:space="preserve">→ alle Vorkommen von alt$ durch neu$ ersetzt.</w:t>
+      </w:r>
+    </w:p>
+    <w:p>
+      <w:pPr>
+        <w:pStyle w:val="ListParagraph"/>
+        <w:numPr>
+          <w:ilvl w:val="0"/>
+          <w:numId w:val="2"/>
+        </w:numPr>
+        <w:spacing w:after="100" w:line="312" w:lineRule="auto"/>
+      </w:pPr>
+      <w:r>
+        <w:rPr>
+          <w:b/>
+          <w:bCs/>
+          <w:sz w:val="22"/>
+          <w:szCs w:val="22"/>
+        </w:rPr>
+        <w:t xml:space="preserve">TRIM$(s$)  </w:t>
+      </w:r>
+      <w:r>
+        <w:rPr>
+          <w:sz w:val="22"/>
+          <w:szCs w:val="22"/>
+        </w:rPr>
+        <w:t xml:space="preserve">→ Leerraum vorne und hinten entfernt.</w:t>
+      </w:r>
+    </w:p>
+    <w:p>
+      <w:pPr>
+        <w:pStyle w:val="ListParagraph"/>
+        <w:numPr>
+          <w:ilvl w:val="0"/>
+          <w:numId w:val="2"/>
+        </w:numPr>
+        <w:spacing w:after="100" w:line="312" w:lineRule="auto"/>
+      </w:pPr>
+      <w:r>
+        <w:rPr>
+          <w:b/>
+          <w:bCs/>
+          <w:sz w:val="22"/>
+          <w:szCs w:val="22"/>
+        </w:rPr>
+        <w:t xml:space="preserve">LTRIM$(s$) · RTRIM$(s$)  </w:t>
+      </w:r>
+      <w:r>
+        <w:rPr>
+          <w:sz w:val="22"/>
+          <w:szCs w:val="22"/>
+        </w:rPr>
+        <w:t xml:space="preserve">→ Leerraum nur links bzw. nur rechts entfernt.</w:t>
+      </w:r>
+    </w:p>
+    <w:p>
+      <w:pPr>
+        <w:pStyle w:val="Heading2"/>
+        <w:keepNext/>
+        <w:keepLines/>
+        <w:spacing w:after="120" w:before="280"/>
+      </w:pPr>
+      <w:r>
+        <w:t xml:space="preserve">Zerlegen &amp; Zusammensetzen</w:t>
+      </w:r>
+    </w:p>
+    <w:p>
+      <w:pPr>
+        <w:pStyle w:val="ListParagraph"/>
+        <w:numPr>
+          <w:ilvl w:val="0"/>
+          <w:numId w:val="2"/>
+        </w:numPr>
+        <w:spacing w:after="100" w:line="312" w:lineRule="auto"/>
+      </w:pPr>
+      <w:r>
+        <w:rPr>
+          <w:b/>
+          <w:bCs/>
+          <w:sz w:val="22"/>
+          <w:szCs w:val="22"/>
+        </w:rPr>
+        <w:t xml:space="preserve">SPLIT$(s$, trenner$)  </w:t>
+      </w:r>
+      <w:r>
+        <w:rPr>
+          <w:sz w:val="22"/>
+          <w:szCs w:val="22"/>
+        </w:rPr>
+        <w:t xml:space="preserve">→ zerlegt s$ am Trenner in ein ARRAY OF STRING.</w:t>
+      </w:r>
+    </w:p>
+    <w:p>
+      <w:pPr>
+        <w:pStyle w:val="ListParagraph"/>
+        <w:numPr>
+          <w:ilvl w:val="0"/>
+          <w:numId w:val="2"/>
+        </w:numPr>
+        <w:spacing w:after="100" w:line="312" w:lineRule="auto"/>
+      </w:pPr>
+      <w:r>
+        <w:rPr>
+          <w:b/>
+          <w:bCs/>
+          <w:sz w:val="22"/>
+          <w:szCs w:val="22"/>
+        </w:rPr>
+        <w:t xml:space="preserve">JOIN$(array, trenner$)  </w:t>
+      </w:r>
+      <w:r>
+        <w:rPr>
+          <w:sz w:val="22"/>
+          <w:szCs w:val="22"/>
+        </w:rPr>
+        <w:t xml:space="preserve">→ fügt ein String-Array mit dem Trenner zu einem String.</w:t>
+      </w:r>
+    </w:p>
+    <w:p>
+      <w:pPr>
+        <w:pStyle w:val="Heading2"/>
+        <w:keepNext/>
+        <w:keepLines/>
+        <w:spacing w:after="120" w:before="280"/>
+      </w:pPr>
+      <w:r>
+        <w:t xml:space="preserve">Auffüllen &amp; Wiederholen</w:t>
+      </w:r>
+    </w:p>
+    <w:p>
+      <w:pPr>
+        <w:pStyle w:val="ListParagraph"/>
+        <w:numPr>
+          <w:ilvl w:val="0"/>
+          <w:numId w:val="2"/>
+        </w:numPr>
+        <w:spacing w:after="100" w:line="312" w:lineRule="auto"/>
+      </w:pPr>
+      <w:r>
+        <w:rPr>
+          <w:b/>
+          <w:bCs/>
+          <w:sz w:val="22"/>
+          <w:szCs w:val="22"/>
+        </w:rPr>
+        <w:t xml:space="preserve">PADL$(s$, breite[, füll$]) · PADR$(...)  </w:t>
+      </w:r>
+      <w:r>
+        <w:rPr>
+          <w:sz w:val="22"/>
+          <w:szCs w:val="22"/>
+        </w:rPr>
+        <w:t xml:space="preserve">→ auf Breite auffüllen, links (rechtsbündig) bzw. rechts (linksbündig).</w:t>
+      </w:r>
+    </w:p>
+    <w:p>
+      <w:pPr>
+        <w:pStyle w:val="ListParagraph"/>
+        <w:numPr>
+          <w:ilvl w:val="0"/>
+          <w:numId w:val="2"/>
+        </w:numPr>
+        <w:spacing w:after="100" w:line="312" w:lineRule="auto"/>
+      </w:pPr>
+      <w:r>
+        <w:rPr>
+          <w:b/>
+          <w:bCs/>
+          <w:sz w:val="22"/>
+          <w:szCs w:val="22"/>
+        </w:rPr>
+        <w:t xml:space="preserve">REPEAT$(s$, n)  </w:t>
+      </w:r>
+      <w:r>
+        <w:rPr>
+          <w:sz w:val="22"/>
+          <w:szCs w:val="22"/>
+        </w:rPr>
+        <w:t xml:space="preserve">→ s$ n-mal aneinandergehängt (auch: "-" * n).</w:t>
+      </w:r>
+    </w:p>
+    <w:p>
+      <w:pPr>
+        <w:pStyle w:val="Heading2"/>
+        <w:keepNext/>
+        <w:keepLines/>
+        <w:spacing w:after="120" w:before="280"/>
+      </w:pPr>
+      <w:r>
+        <w:t xml:space="preserve">Praxis: alles zusammen</w:t>
+      </w:r>
+    </w:p>
+    <w:p>
+      <w:pPr>
+        <w:spacing w:after="180" w:line="312" w:lineRule="auto"/>
+      </w:pPr>
+      <w:r>
+        <w:rPr>
+          <w:sz w:val="22"/>
+          <w:szCs w:val="22"/>
+        </w:rPr>
+        <w:t xml:space="preserve">Viele dieser Funktionen lassen sich auch als Methode mit dem Punkt aufrufen und so zu einer Kette verbinden – oft die lesbarste Form:</w:t>
+      </w:r>
+    </w:p>
+    <w:p>
+      <w:pPr>
+        <w:keepLines/>
+        <w:pBdr>
+          <w:left w:val="single" w:color="1B6CA8" w:sz="18" w:space="6"/>
+        </w:pBdr>
+        <w:shd w:fill="F4F4F4" w:val="clear"/>
+        <w:spacing w:after="200" w:before="100" w:line="264" w:lineRule="auto"/>
+        <w:ind w:left="140"/>
+      </w:pPr>
+      <w:r>
+        <w:rPr>
+          <w:rFonts w:ascii="Consolas" w:cs="Consolas" w:eastAsia="Consolas" w:hAnsi="Consolas"/>
+          <w:sz w:val="19"/>
+          <w:szCs w:val="19"/>
+        </w:rPr>
+        <w:t xml:space="preserve">DIM eingabe AS STRING</w:t>
+      </w:r>
+      <w:r>
+        <w:rPr>
+          <w:rFonts w:ascii="Consolas" w:cs="Consolas" w:eastAsia="Consolas" w:hAnsi="Consolas"/>
+          <w:sz w:val="19"/>
+          <w:szCs w:val="19"/>
+        </w:rPr>
+        <w:br/>
+        <w:t xml:space="preserve">eingabe = "  Hallo Welt  "</w:t>
+      </w:r>
+      <w:r>
+        <w:rPr>
+          <w:rFonts w:ascii="Consolas" w:cs="Consolas" w:eastAsia="Consolas" w:hAnsi="Consolas"/>
+          <w:sz w:val="19"/>
+          <w:szCs w:val="19"/>
+        </w:rPr>
+        <w:br/>
+        <w:t xml:space="preserve">PRINT eingabe.trim().upper()</w:t>
+      </w:r>
+      <w:r>
+        <w:rPr>
+          <w:rFonts w:ascii="Consolas" w:cs="Consolas" w:eastAsia="Consolas" w:hAnsi="Consolas"/>
+          <w:sz w:val="19"/>
+          <w:szCs w:val="19"/>
+        </w:rPr>
+        <w:br/>
+        <w:t xml:space="preserve">PRINT eingabe.trim().replace("Welt", "GameBasic")</w:t>
+      </w:r>
+    </w:p>
+    <w:p>
+      <w:pPr>
+        <w:keepLines/>
+        <w:pBdr>
+          <w:left w:val="single" w:color="9AC79A" w:sz="18" w:space="6"/>
+        </w:pBdr>
+        <w:shd w:fill="EAF4EA" w:val="clear"/>
+        <w:spacing w:after="200" w:before="100" w:line="264" w:lineRule="auto"/>
+        <w:ind w:left="140"/>
+      </w:pPr>
+      <w:r>
+        <w:rPr>
+          <w:rFonts w:ascii="Consolas" w:cs="Consolas" w:eastAsia="Consolas" w:hAnsi="Consolas"/>
+          <w:sz w:val="19"/>
+          <w:szCs w:val="19"/>
+        </w:rPr>
+        <w:t xml:space="preserve">HALLO WELT</w:t>
+      </w:r>
+      <w:r>
+        <w:rPr>
+          <w:rFonts w:ascii="Consolas" w:cs="Consolas" w:eastAsia="Consolas" w:hAnsi="Consolas"/>
+          <w:sz w:val="19"/>
+          <w:szCs w:val="19"/>
+        </w:rPr>
+        <w:br/>
+        <w:t xml:space="preserve">Hallo GameBasic</w:t>
+      </w:r>
+    </w:p>
+    <w:p>
+      <w:pPr>
+        <w:spacing w:before="60"/>
+      </w:pPr>
+    </w:p>
+    <w:tbl>
+      <w:tblPr>
+        <w:tblW w:type="dxa" w:w="9360"/>
+        <w:tblBorders>
+          <w:top w:val="single" w:color="auto" w:sz="4"/>
+          <w:left w:val="single" w:color="auto" w:sz="4"/>
+          <w:bottom w:val="single" w:color="auto" w:sz="4"/>
+          <w:right w:val="single" w:color="auto" w:sz="4"/>
+          <w:insideH w:val="single" w:color="auto" w:sz="4"/>
+          <w:insideV w:val="single" w:color="auto" w:sz="4"/>
+        </w:tblBorders>
+      </w:tblPr>
+      <w:tblGrid>
+        <w:gridCol w:w="9360"/>
+      </w:tblGrid>
+      <w:tr>
+        <w:trPr>
+          <w:cantSplit/>
+        </w:trPr>
+        <w:tc>
+          <w:tcPr>
+            <w:tcW w:type="dxa" w:w="9360"/>
+            <w:tcBorders>
+              <w:top w:val="single" w:color="E0B96A" w:sz="6"/>
+              <w:left w:val="single" w:color="E0B96A" w:sz="6"/>
+              <w:bottom w:val="single" w:color="E0B96A" w:sz="6"/>
+              <w:right w:val="single" w:color="E0B96A" w:sz="6"/>
+            </w:tcBorders>
+            <w:shd w:fill="FDF3E0" w:val="clear"/>
+            <w:tcMar>
+              <w:top w:type="dxa" w:w="140"/>
+              <w:left w:type="dxa" w:w="180"/>
+              <w:bottom w:type="dxa" w:w="140"/>
+              <w:right w:type="dxa" w:w="180"/>
+            </w:tcMar>
+          </w:tcPr>
+          <w:p>
+            <w:pPr>
+              <w:spacing w:after="40"/>
+            </w:pPr>
+            <w:r>
+              <w:rPr>
+                <w:b/>
+                <w:bCs/>
+                <w:color w:val="9A6A1E"/>
+                <w:sz w:val="22"/>
+                <w:szCs w:val="22"/>
+              </w:rPr>
+              <w:t xml:space="preserve">Merke</w:t>
+            </w:r>
+          </w:p>
+          <w:p>
+            <w:pPr>
+              <w:spacing w:after="0" w:line="312" w:lineRule="auto"/>
+            </w:pPr>
+            <w:r>
+              <w:rPr>
+                <w:sz w:val="22"/>
+                <w:szCs w:val="22"/>
+              </w:rPr>
+              <w:t xml:space="preserve">Zum Umwandeln zwischen Text und Zahl (STR$, VAL, CHR$, ASC) gibt es das eigene Kapitel „Typumwandlung &amp; Prüfung“. Text bequem aus Werten zusammenbauen kannst du außerdem mit f-Strings (Kapitel „Ein- und Ausgabe“).</w:t>
             </w:r>
           </w:p>
         </w:tc>

</xml_diff>

<commit_message>
docs(buch): Lehrbuch Kap 34 -- Typumwandlung & Pruefung (Referenz)
STR$/VAL/TRYVAL/INT, CHR$/ASC/HEX$/BIN$, TYPEOF + ISNUM/ISINT/ISSTR/ISBOOL
(Bool ist keine Zahl), IS_NIL (uninitialisiertes Objekt = NIL), BASE64/CRC32/
HASH. NIL ist kein Literal -> IS_NIL an DIM-ohne-NEW gezeigt. Gegen gbrt verifiziert.

Co-Authored-By: Claude Opus 4.8 (1M context) <noreply@anthropic.com>
</commit_message>
<xml_diff>
--- a/buch-referenz/buch/GameBasic-Lehrbuch.docx
+++ b/buch-referenz/buch/GameBasic-Lehrbuch.docx
@@ -840,6 +840,33 @@
           <w:szCs w:val="22"/>
         </w:rPr>
         <w:t xml:space="preserve">	99</w:t>
+      </w:r>
+    </w:p>
+    <w:p>
+      <w:pPr>
+        <w:tabs>
+          <w:tab w:val="right" w:pos="9200" w:leader="dot"/>
+        </w:tabs>
+        <w:spacing w:after="20" w:before="0"/>
+        <w:ind w:left="280"/>
+      </w:pPr>
+      <w:r>
+        <w:rPr>
+          <w:b w:val="false"/>
+          <w:bCs w:val="false"/>
+          <w:color w:val="222222"/>
+          <w:sz w:val="22"/>
+          <w:szCs w:val="22"/>
+        </w:rPr>
+        <w:t xml:space="preserve">Typumwandlung &amp; Prüfung</w:t>
+      </w:r>
+      <w:r>
+        <w:rPr>
+          <w:color w:val="555555"/>
+          <w:sz w:val="22"/>
+          <w:szCs w:val="22"/>
+        </w:rPr>
+        <w:t xml:space="preserve">	101</w:t>
       </w:r>
     </w:p>
     <w:p>
@@ -32228,6 +32255,1400 @@
                 <w:szCs w:val="22"/>
               </w:rPr>
               <w:t xml:space="preserve">Zum Umwandeln zwischen Text und Zahl (STR$, VAL, CHR$, ASC) gibt es das eigene Kapitel „Typumwandlung &amp; Prüfung“. Text bequem aus Werten zusammenbauen kannst du außerdem mit f-Strings (Kapitel „Ein- und Ausgabe“).</w:t>
+            </w:r>
+          </w:p>
+        </w:tc>
+      </w:tr>
+    </w:tbl>
+    <w:p>
+      <w:pPr>
+        <w:spacing w:after="160"/>
+      </w:pPr>
+    </w:p>
+    <w:p>
+      <w:pPr>
+        <w:pStyle w:val="Heading1"/>
+        <w:keepNext/>
+        <w:keepLines/>
+        <w:pageBreakBefore/>
+        <w:pBdr>
+          <w:bottom w:val="single" w:color="1B6CA8" w:sz="12" w:space="4"/>
+        </w:pBdr>
+        <w:spacing w:after="160" w:before="0"/>
+      </w:pPr>
+      <w:r>
+        <w:t xml:space="preserve">Typumwandlung &amp; Prüfung</w:t>
+      </w:r>
+    </w:p>
+    <w:p>
+      <w:pPr>
+        <w:spacing w:after="180" w:line="312" w:lineRule="auto"/>
+      </w:pPr>
+      <w:r>
+        <w:rPr>
+          <w:sz w:val="22"/>
+          <w:szCs w:val="22"/>
+        </w:rPr>
+        <w:t xml:space="preserve">Werte haben Typen – Zahl, Text, Wahrheitswert. Oft musst du zwischen ihnen umwandeln: eine Zahl in Text zum Ausgeben, getippten Text zurück in eine Zahl zum Rechnen. Dieses Kapitel sammelt die Umwandlungs-Funktionen sowie die Befehle, mit denen du den Typ eines Werts zur Laufzeit prüfst.</w:t>
+      </w:r>
+    </w:p>
+    <w:p>
+      <w:pPr>
+        <w:pStyle w:val="Heading2"/>
+        <w:keepNext/>
+        <w:keepLines/>
+        <w:spacing w:after="120" w:before="280"/>
+      </w:pPr>
+      <w:r>
+        <w:t xml:space="preserve">Zahl ↔ Text</w:t>
+      </w:r>
+    </w:p>
+    <w:p>
+      <w:pPr>
+        <w:keepNext/>
+        <w:keepLines/>
+        <w:pBdr>
+          <w:bottom w:val="single" w:color="DDD0C0" w:sz="4" w:space="2"/>
+        </w:pBdr>
+        <w:spacing w:after="40" w:before="360"/>
+      </w:pPr>
+      <w:r>
+        <w:rPr>
+          <w:rFonts w:ascii="Consolas" w:cs="Consolas" w:eastAsia="Consolas" w:hAnsi="Consolas"/>
+          <w:b/>
+          <w:bCs/>
+          <w:color w:val="9A3412"/>
+          <w:sz w:val="24"/>
+          <w:szCs w:val="24"/>
+        </w:rPr>
+        <w:t xml:space="preserve">STR$ · VAL · TRYVAL</w:t>
+      </w:r>
+    </w:p>
+    <w:p>
+      <w:pPr>
+        <w:keepNext/>
+        <w:spacing w:after="120"/>
+      </w:pPr>
+      <w:r>
+        <w:rPr>
+          <w:b/>
+          <w:bCs/>
+          <w:color w:val="6A6A6A"/>
+          <w:sz w:val="18"/>
+          <w:szCs w:val="18"/>
+        </w:rPr>
+        <w:t xml:space="preserve">Syntax:  </w:t>
+      </w:r>
+      <w:r>
+        <w:rPr>
+          <w:rFonts w:ascii="Consolas" w:cs="Consolas" w:eastAsia="Consolas" w:hAnsi="Consolas"/>
+          <w:color w:val="335577"/>
+          <w:sz w:val="19"/>
+          <w:szCs w:val="19"/>
+        </w:rPr>
+        <w:t xml:space="preserve">STR$(wert)   VAL(s$)   TRYVAL(s$, ersatz)</w:t>
+      </w:r>
+    </w:p>
+    <w:p>
+      <w:pPr>
+        <w:spacing w:after="180" w:line="312" w:lineRule="auto"/>
+      </w:pPr>
+      <w:r>
+        <w:rPr>
+          <w:sz w:val="22"/>
+          <w:szCs w:val="22"/>
+        </w:rPr>
+        <w:t xml:space="preserve">STR$ macht aus einem beliebigen Wert seinen Text (aus 3.14 wird "3.14", aus TRUE wird "TRUE"). VAL liest umgekehrt eine Zahl aus einem String – mit Punkt ergibt sich eine Kommazahl, sonst eine ganze Zahl; unleserlicher Text wird stillschweigend zu 0. TRYVAL macht dasselbe, liefert bei ungültiger Eingabe aber deinen Ersatzwert statt 0.</w:t>
+      </w:r>
+    </w:p>
+    <w:p>
+      <w:pPr>
+        <w:keepNext/>
+        <w:spacing w:after="30" w:before="120"/>
+      </w:pPr>
+      <w:r>
+        <w:rPr>
+          <w:b/>
+          <w:bCs/>
+          <w:i/>
+          <w:iCs/>
+          <w:color w:val="6A6A6A"/>
+          <w:sz w:val="18"/>
+          <w:szCs w:val="18"/>
+        </w:rPr>
+        <w:t xml:space="preserve">Beispiel</w:t>
+      </w:r>
+    </w:p>
+    <w:p>
+      <w:pPr>
+        <w:keepLines/>
+        <w:pBdr>
+          <w:left w:val="single" w:color="1B6CA8" w:sz="18" w:space="6"/>
+        </w:pBdr>
+        <w:shd w:fill="F4F4F4" w:val="clear"/>
+        <w:spacing w:after="200" w:before="100" w:line="264" w:lineRule="auto"/>
+        <w:ind w:left="140"/>
+      </w:pPr>
+      <w:r>
+        <w:rPr>
+          <w:rFonts w:ascii="Consolas" w:cs="Consolas" w:eastAsia="Consolas" w:hAnsi="Consolas"/>
+          <w:sz w:val="19"/>
+          <w:szCs w:val="19"/>
+        </w:rPr>
+        <w:t xml:space="preserve">PRINT STR$(3.14)</w:t>
+      </w:r>
+      <w:r>
+        <w:rPr>
+          <w:rFonts w:ascii="Consolas" w:cs="Consolas" w:eastAsia="Consolas" w:hAnsi="Consolas"/>
+          <w:sz w:val="19"/>
+          <w:szCs w:val="19"/>
+        </w:rPr>
+        <w:br/>
+        <w:t xml:space="preserve">PRINT VAL("42") + 1</w:t>
+      </w:r>
+      <w:r>
+        <w:rPr>
+          <w:rFonts w:ascii="Consolas" w:cs="Consolas" w:eastAsia="Consolas" w:hAnsi="Consolas"/>
+          <w:sz w:val="19"/>
+          <w:szCs w:val="19"/>
+        </w:rPr>
+        <w:br/>
+        <w:t xml:space="preserve">PRINT TRYVAL("oops", -1)</w:t>
+      </w:r>
+    </w:p>
+    <w:p>
+      <w:pPr>
+        <w:keepNext/>
+        <w:spacing w:after="30" w:before="120"/>
+      </w:pPr>
+      <w:r>
+        <w:rPr>
+          <w:b/>
+          <w:bCs/>
+          <w:i/>
+          <w:iCs/>
+          <w:color w:val="6A6A6A"/>
+          <w:sz w:val="18"/>
+          <w:szCs w:val="18"/>
+        </w:rPr>
+        <w:t xml:space="preserve">Ausgabe</w:t>
+      </w:r>
+    </w:p>
+    <w:p>
+      <w:pPr>
+        <w:keepLines/>
+        <w:pBdr>
+          <w:left w:val="single" w:color="9AC79A" w:sz="18" w:space="6"/>
+        </w:pBdr>
+        <w:shd w:fill="EAF4EA" w:val="clear"/>
+        <w:spacing w:after="200" w:before="100" w:line="264" w:lineRule="auto"/>
+        <w:ind w:left="140"/>
+      </w:pPr>
+      <w:r>
+        <w:rPr>
+          <w:rFonts w:ascii="Consolas" w:cs="Consolas" w:eastAsia="Consolas" w:hAnsi="Consolas"/>
+          <w:sz w:val="19"/>
+          <w:szCs w:val="19"/>
+        </w:rPr>
+        <w:t xml:space="preserve">3.14</w:t>
+      </w:r>
+      <w:r>
+        <w:rPr>
+          <w:rFonts w:ascii="Consolas" w:cs="Consolas" w:eastAsia="Consolas" w:hAnsi="Consolas"/>
+          <w:sz w:val="19"/>
+          <w:szCs w:val="19"/>
+        </w:rPr>
+        <w:br/>
+        <w:t xml:space="preserve">43</w:t>
+      </w:r>
+      <w:r>
+        <w:rPr>
+          <w:rFonts w:ascii="Consolas" w:cs="Consolas" w:eastAsia="Consolas" w:hAnsi="Consolas"/>
+          <w:sz w:val="19"/>
+          <w:szCs w:val="19"/>
+        </w:rPr>
+        <w:br/>
+        <w:t xml:space="preserve">-1</w:t>
+      </w:r>
+    </w:p>
+    <w:p>
+      <w:pPr>
+        <w:keepNext/>
+        <w:keepLines/>
+        <w:pBdr>
+          <w:bottom w:val="single" w:color="DDD0C0" w:sz="4" w:space="2"/>
+        </w:pBdr>
+        <w:spacing w:after="40" w:before="360"/>
+      </w:pPr>
+      <w:r>
+        <w:rPr>
+          <w:rFonts w:ascii="Consolas" w:cs="Consolas" w:eastAsia="Consolas" w:hAnsi="Consolas"/>
+          <w:b/>
+          <w:bCs/>
+          <w:color w:val="9A3412"/>
+          <w:sz w:val="24"/>
+          <w:szCs w:val="24"/>
+        </w:rPr>
+        <w:t xml:space="preserve">INT</w:t>
+      </w:r>
+    </w:p>
+    <w:p>
+      <w:pPr>
+        <w:keepNext/>
+        <w:spacing w:after="120"/>
+      </w:pPr>
+      <w:r>
+        <w:rPr>
+          <w:b/>
+          <w:bCs/>
+          <w:color w:val="6A6A6A"/>
+          <w:sz w:val="18"/>
+          <w:szCs w:val="18"/>
+        </w:rPr>
+        <w:t xml:space="preserve">Syntax:  </w:t>
+      </w:r>
+      <w:r>
+        <w:rPr>
+          <w:rFonts w:ascii="Consolas" w:cs="Consolas" w:eastAsia="Consolas" w:hAnsi="Consolas"/>
+          <w:color w:val="335577"/>
+          <w:sz w:val="19"/>
+          <w:szCs w:val="19"/>
+        </w:rPr>
+        <w:t xml:space="preserve">INT(zahl)</w:t>
+      </w:r>
+    </w:p>
+    <w:p>
+      <w:pPr>
+        <w:spacing w:after="180" w:line="312" w:lineRule="auto"/>
+      </w:pPr>
+      <w:r>
+        <w:rPr>
+          <w:sz w:val="22"/>
+          <w:szCs w:val="22"/>
+        </w:rPr>
+        <w:t xml:space="preserve">Wandelt eine Kommazahl in eine ganze Zahl, indem abgerundet wird (in Richtung minus unendlich): INT(3.7) ist 3, INT(-1.5) ist -2.</w:t>
+      </w:r>
+    </w:p>
+    <w:p>
+      <w:pPr>
+        <w:keepNext/>
+        <w:spacing w:after="30" w:before="120"/>
+      </w:pPr>
+      <w:r>
+        <w:rPr>
+          <w:b/>
+          <w:bCs/>
+          <w:i/>
+          <w:iCs/>
+          <w:color w:val="6A6A6A"/>
+          <w:sz w:val="18"/>
+          <w:szCs w:val="18"/>
+        </w:rPr>
+        <w:t xml:space="preserve">Beispiel</w:t>
+      </w:r>
+    </w:p>
+    <w:p>
+      <w:pPr>
+        <w:keepLines/>
+        <w:pBdr>
+          <w:left w:val="single" w:color="1B6CA8" w:sz="18" w:space="6"/>
+        </w:pBdr>
+        <w:shd w:fill="F4F4F4" w:val="clear"/>
+        <w:spacing w:after="200" w:before="100" w:line="264" w:lineRule="auto"/>
+        <w:ind w:left="140"/>
+      </w:pPr>
+      <w:r>
+        <w:rPr>
+          <w:rFonts w:ascii="Consolas" w:cs="Consolas" w:eastAsia="Consolas" w:hAnsi="Consolas"/>
+          <w:sz w:val="19"/>
+          <w:szCs w:val="19"/>
+        </w:rPr>
+        <w:t xml:space="preserve">PRINT INT(3.7); " "; INT(-1.5)</w:t>
+      </w:r>
+    </w:p>
+    <w:p>
+      <w:pPr>
+        <w:keepNext/>
+        <w:spacing w:after="30" w:before="120"/>
+      </w:pPr>
+      <w:r>
+        <w:rPr>
+          <w:b/>
+          <w:bCs/>
+          <w:i/>
+          <w:iCs/>
+          <w:color w:val="6A6A6A"/>
+          <w:sz w:val="18"/>
+          <w:szCs w:val="18"/>
+        </w:rPr>
+        <w:t xml:space="preserve">Ausgabe</w:t>
+      </w:r>
+    </w:p>
+    <w:p>
+      <w:pPr>
+        <w:keepLines/>
+        <w:pBdr>
+          <w:left w:val="single" w:color="9AC79A" w:sz="18" w:space="6"/>
+        </w:pBdr>
+        <w:shd w:fill="EAF4EA" w:val="clear"/>
+        <w:spacing w:after="200" w:before="100" w:line="264" w:lineRule="auto"/>
+        <w:ind w:left="140"/>
+      </w:pPr>
+      <w:r>
+        <w:rPr>
+          <w:rFonts w:ascii="Consolas" w:cs="Consolas" w:eastAsia="Consolas" w:hAnsi="Consolas"/>
+          <w:sz w:val="19"/>
+          <w:szCs w:val="19"/>
+        </w:rPr>
+        <w:t xml:space="preserve">3 -2</w:t>
+      </w:r>
+    </w:p>
+    <w:p>
+      <w:pPr>
+        <w:pStyle w:val="Heading2"/>
+        <w:keepNext/>
+        <w:keepLines/>
+        <w:spacing w:after="120" w:before="280"/>
+      </w:pPr>
+      <w:r>
+        <w:t xml:space="preserve">Zeichen ↔ Code, Zahlensysteme</w:t>
+      </w:r>
+    </w:p>
+    <w:p>
+      <w:pPr>
+        <w:keepNext/>
+        <w:keepLines/>
+        <w:pBdr>
+          <w:bottom w:val="single" w:color="DDD0C0" w:sz="4" w:space="2"/>
+        </w:pBdr>
+        <w:spacing w:after="40" w:before="360"/>
+      </w:pPr>
+      <w:r>
+        <w:rPr>
+          <w:rFonts w:ascii="Consolas" w:cs="Consolas" w:eastAsia="Consolas" w:hAnsi="Consolas"/>
+          <w:b/>
+          <w:bCs/>
+          <w:color w:val="9A3412"/>
+          <w:sz w:val="24"/>
+          <w:szCs w:val="24"/>
+        </w:rPr>
+        <w:t xml:space="preserve">CHR$ · ASC</w:t>
+      </w:r>
+    </w:p>
+    <w:p>
+      <w:pPr>
+        <w:keepNext/>
+        <w:spacing w:after="120"/>
+      </w:pPr>
+      <w:r>
+        <w:rPr>
+          <w:b/>
+          <w:bCs/>
+          <w:color w:val="6A6A6A"/>
+          <w:sz w:val="18"/>
+          <w:szCs w:val="18"/>
+        </w:rPr>
+        <w:t xml:space="preserve">Syntax:  </w:t>
+      </w:r>
+      <w:r>
+        <w:rPr>
+          <w:rFonts w:ascii="Consolas" w:cs="Consolas" w:eastAsia="Consolas" w:hAnsi="Consolas"/>
+          <w:color w:val="335577"/>
+          <w:sz w:val="19"/>
+          <w:szCs w:val="19"/>
+        </w:rPr>
+        <w:t xml:space="preserve">CHR$(code)   ASC(s$)</w:t>
+      </w:r>
+    </w:p>
+    <w:p>
+      <w:pPr>
+        <w:spacing w:after="180" w:line="312" w:lineRule="auto"/>
+      </w:pPr>
+      <w:r>
+        <w:rPr>
+          <w:sz w:val="22"/>
+          <w:szCs w:val="22"/>
+        </w:rPr>
+        <w:t xml:space="preserve">CHR$ macht aus einer Zeichen-Nummer (Unicode-Codepoint) das Zeichen, ASC aus dem ersten Zeichen seine Nummer. A ist 65, B ist 66 …</w:t>
+      </w:r>
+    </w:p>
+    <w:p>
+      <w:pPr>
+        <w:keepNext/>
+        <w:spacing w:after="30" w:before="120"/>
+      </w:pPr>
+      <w:r>
+        <w:rPr>
+          <w:b/>
+          <w:bCs/>
+          <w:i/>
+          <w:iCs/>
+          <w:color w:val="6A6A6A"/>
+          <w:sz w:val="18"/>
+          <w:szCs w:val="18"/>
+        </w:rPr>
+        <w:t xml:space="preserve">Beispiel</w:t>
+      </w:r>
+    </w:p>
+    <w:p>
+      <w:pPr>
+        <w:keepLines/>
+        <w:pBdr>
+          <w:left w:val="single" w:color="1B6CA8" w:sz="18" w:space="6"/>
+        </w:pBdr>
+        <w:shd w:fill="F4F4F4" w:val="clear"/>
+        <w:spacing w:after="200" w:before="100" w:line="264" w:lineRule="auto"/>
+        <w:ind w:left="140"/>
+      </w:pPr>
+      <w:r>
+        <w:rPr>
+          <w:rFonts w:ascii="Consolas" w:cs="Consolas" w:eastAsia="Consolas" w:hAnsi="Consolas"/>
+          <w:sz w:val="19"/>
+          <w:szCs w:val="19"/>
+        </w:rPr>
+        <w:t xml:space="preserve">PRINT CHR$(65); CHR$(66)</w:t>
+      </w:r>
+      <w:r>
+        <w:rPr>
+          <w:rFonts w:ascii="Consolas" w:cs="Consolas" w:eastAsia="Consolas" w:hAnsi="Consolas"/>
+          <w:sz w:val="19"/>
+          <w:szCs w:val="19"/>
+        </w:rPr>
+        <w:br/>
+        <w:t xml:space="preserve">PRINT ASC("Anna")</w:t>
+      </w:r>
+    </w:p>
+    <w:p>
+      <w:pPr>
+        <w:keepNext/>
+        <w:spacing w:after="30" w:before="120"/>
+      </w:pPr>
+      <w:r>
+        <w:rPr>
+          <w:b/>
+          <w:bCs/>
+          <w:i/>
+          <w:iCs/>
+          <w:color w:val="6A6A6A"/>
+          <w:sz w:val="18"/>
+          <w:szCs w:val="18"/>
+        </w:rPr>
+        <w:t xml:space="preserve">Ausgabe</w:t>
+      </w:r>
+    </w:p>
+    <w:p>
+      <w:pPr>
+        <w:keepLines/>
+        <w:pBdr>
+          <w:left w:val="single" w:color="9AC79A" w:sz="18" w:space="6"/>
+        </w:pBdr>
+        <w:shd w:fill="EAF4EA" w:val="clear"/>
+        <w:spacing w:after="200" w:before="100" w:line="264" w:lineRule="auto"/>
+        <w:ind w:left="140"/>
+      </w:pPr>
+      <w:r>
+        <w:rPr>
+          <w:rFonts w:ascii="Consolas" w:cs="Consolas" w:eastAsia="Consolas" w:hAnsi="Consolas"/>
+          <w:sz w:val="19"/>
+          <w:szCs w:val="19"/>
+        </w:rPr>
+        <w:t xml:space="preserve">AB</w:t>
+      </w:r>
+      <w:r>
+        <w:rPr>
+          <w:rFonts w:ascii="Consolas" w:cs="Consolas" w:eastAsia="Consolas" w:hAnsi="Consolas"/>
+          <w:sz w:val="19"/>
+          <w:szCs w:val="19"/>
+        </w:rPr>
+        <w:br/>
+        <w:t xml:space="preserve">65</w:t>
+      </w:r>
+    </w:p>
+    <w:p>
+      <w:pPr>
+        <w:keepNext/>
+        <w:keepLines/>
+        <w:pBdr>
+          <w:bottom w:val="single" w:color="DDD0C0" w:sz="4" w:space="2"/>
+        </w:pBdr>
+        <w:spacing w:after="40" w:before="360"/>
+      </w:pPr>
+      <w:r>
+        <w:rPr>
+          <w:rFonts w:ascii="Consolas" w:cs="Consolas" w:eastAsia="Consolas" w:hAnsi="Consolas"/>
+          <w:b/>
+          <w:bCs/>
+          <w:color w:val="9A3412"/>
+          <w:sz w:val="24"/>
+          <w:szCs w:val="24"/>
+        </w:rPr>
+        <w:t xml:space="preserve">HEX$ · BIN$</w:t>
+      </w:r>
+    </w:p>
+    <w:p>
+      <w:pPr>
+        <w:keepNext/>
+        <w:spacing w:after="120"/>
+      </w:pPr>
+      <w:r>
+        <w:rPr>
+          <w:b/>
+          <w:bCs/>
+          <w:color w:val="6A6A6A"/>
+          <w:sz w:val="18"/>
+          <w:szCs w:val="18"/>
+        </w:rPr>
+        <w:t xml:space="preserve">Syntax:  </w:t>
+      </w:r>
+      <w:r>
+        <w:rPr>
+          <w:rFonts w:ascii="Consolas" w:cs="Consolas" w:eastAsia="Consolas" w:hAnsi="Consolas"/>
+          <w:color w:val="335577"/>
+          <w:sz w:val="19"/>
+          <w:szCs w:val="19"/>
+        </w:rPr>
+        <w:t xml:space="preserve">HEX$(n)   BIN$(n)</w:t>
+      </w:r>
+    </w:p>
+    <w:p>
+      <w:pPr>
+        <w:spacing w:after="180" w:line="312" w:lineRule="auto"/>
+      </w:pPr>
+      <w:r>
+        <w:rPr>
+          <w:sz w:val="22"/>
+          <w:szCs w:val="22"/>
+        </w:rPr>
+        <w:t xml:space="preserve">Stellen eine ganze Zahl als Text im Hexadezimal- (Basis 16) bzw. Binärsystem (Basis 2) dar – nützlich für Farben (HEX$) oder Bit-Masken (BIN$).</w:t>
+      </w:r>
+    </w:p>
+    <w:p>
+      <w:pPr>
+        <w:keepNext/>
+        <w:spacing w:after="30" w:before="120"/>
+      </w:pPr>
+      <w:r>
+        <w:rPr>
+          <w:b/>
+          <w:bCs/>
+          <w:i/>
+          <w:iCs/>
+          <w:color w:val="6A6A6A"/>
+          <w:sz w:val="18"/>
+          <w:szCs w:val="18"/>
+        </w:rPr>
+        <w:t xml:space="preserve">Beispiel</w:t>
+      </w:r>
+    </w:p>
+    <w:p>
+      <w:pPr>
+        <w:keepLines/>
+        <w:pBdr>
+          <w:left w:val="single" w:color="1B6CA8" w:sz="18" w:space="6"/>
+        </w:pBdr>
+        <w:shd w:fill="F4F4F4" w:val="clear"/>
+        <w:spacing w:after="200" w:before="100" w:line="264" w:lineRule="auto"/>
+        <w:ind w:left="140"/>
+      </w:pPr>
+      <w:r>
+        <w:rPr>
+          <w:rFonts w:ascii="Consolas" w:cs="Consolas" w:eastAsia="Consolas" w:hAnsi="Consolas"/>
+          <w:sz w:val="19"/>
+          <w:szCs w:val="19"/>
+        </w:rPr>
+        <w:t xml:space="preserve">PRINT HEX$(255)</w:t>
+      </w:r>
+      <w:r>
+        <w:rPr>
+          <w:rFonts w:ascii="Consolas" w:cs="Consolas" w:eastAsia="Consolas" w:hAnsi="Consolas"/>
+          <w:sz w:val="19"/>
+          <w:szCs w:val="19"/>
+        </w:rPr>
+        <w:br/>
+        <w:t xml:space="preserve">PRINT BIN$(10)</w:t>
+      </w:r>
+    </w:p>
+    <w:p>
+      <w:pPr>
+        <w:keepNext/>
+        <w:spacing w:after="30" w:before="120"/>
+      </w:pPr>
+      <w:r>
+        <w:rPr>
+          <w:b/>
+          <w:bCs/>
+          <w:i/>
+          <w:iCs/>
+          <w:color w:val="6A6A6A"/>
+          <w:sz w:val="18"/>
+          <w:szCs w:val="18"/>
+        </w:rPr>
+        <w:t xml:space="preserve">Ausgabe</w:t>
+      </w:r>
+    </w:p>
+    <w:p>
+      <w:pPr>
+        <w:keepLines/>
+        <w:pBdr>
+          <w:left w:val="single" w:color="9AC79A" w:sz="18" w:space="6"/>
+        </w:pBdr>
+        <w:shd w:fill="EAF4EA" w:val="clear"/>
+        <w:spacing w:after="200" w:before="100" w:line="264" w:lineRule="auto"/>
+        <w:ind w:left="140"/>
+      </w:pPr>
+      <w:r>
+        <w:rPr>
+          <w:rFonts w:ascii="Consolas" w:cs="Consolas" w:eastAsia="Consolas" w:hAnsi="Consolas"/>
+          <w:sz w:val="19"/>
+          <w:szCs w:val="19"/>
+        </w:rPr>
+        <w:t xml:space="preserve">FF</w:t>
+      </w:r>
+      <w:r>
+        <w:rPr>
+          <w:rFonts w:ascii="Consolas" w:cs="Consolas" w:eastAsia="Consolas" w:hAnsi="Consolas"/>
+          <w:sz w:val="19"/>
+          <w:szCs w:val="19"/>
+        </w:rPr>
+        <w:br/>
+        <w:t xml:space="preserve">1010</w:t>
+      </w:r>
+    </w:p>
+    <w:p>
+      <w:pPr>
+        <w:pStyle w:val="Heading2"/>
+        <w:keepNext/>
+        <w:keepLines/>
+        <w:spacing w:after="120" w:before="280"/>
+      </w:pPr>
+      <w:r>
+        <w:t xml:space="preserve">Den Typ herausfinden</w:t>
+      </w:r>
+    </w:p>
+    <w:p>
+      <w:pPr>
+        <w:keepNext/>
+        <w:keepLines/>
+        <w:pBdr>
+          <w:bottom w:val="single" w:color="DDD0C0" w:sz="4" w:space="2"/>
+        </w:pBdr>
+        <w:spacing w:after="40" w:before="360"/>
+      </w:pPr>
+      <w:r>
+        <w:rPr>
+          <w:rFonts w:ascii="Consolas" w:cs="Consolas" w:eastAsia="Consolas" w:hAnsi="Consolas"/>
+          <w:b/>
+          <w:bCs/>
+          <w:color w:val="9A3412"/>
+          <w:sz w:val="24"/>
+          <w:szCs w:val="24"/>
+        </w:rPr>
+        <w:t xml:space="preserve">TYPEOF</w:t>
+      </w:r>
+    </w:p>
+    <w:p>
+      <w:pPr>
+        <w:keepNext/>
+        <w:spacing w:after="120"/>
+      </w:pPr>
+      <w:r>
+        <w:rPr>
+          <w:b/>
+          <w:bCs/>
+          <w:color w:val="6A6A6A"/>
+          <w:sz w:val="18"/>
+          <w:szCs w:val="18"/>
+        </w:rPr>
+        <w:t xml:space="preserve">Syntax:  </w:t>
+      </w:r>
+      <w:r>
+        <w:rPr>
+          <w:rFonts w:ascii="Consolas" w:cs="Consolas" w:eastAsia="Consolas" w:hAnsi="Consolas"/>
+          <w:color w:val="335577"/>
+          <w:sz w:val="19"/>
+          <w:szCs w:val="19"/>
+        </w:rPr>
+        <w:t xml:space="preserve">TYPEOF(x)</w:t>
+      </w:r>
+    </w:p>
+    <w:p>
+      <w:pPr>
+        <w:spacing w:after="180" w:line="312" w:lineRule="auto"/>
+      </w:pPr>
+      <w:r>
+        <w:rPr>
+          <w:sz w:val="22"/>
+          <w:szCs w:val="22"/>
+        </w:rPr>
+        <w:t xml:space="preserve">Liefert den Typnamen eines Werts als Text zur Laufzeit – etwa "INTEGER", "FLOAT", "STRING", "BOOLEAN" oder den Namen einer Klasse bzw. eines Modul-Typs.</w:t>
+      </w:r>
+    </w:p>
+    <w:p>
+      <w:pPr>
+        <w:keepNext/>
+        <w:spacing w:after="30" w:before="120"/>
+      </w:pPr>
+      <w:r>
+        <w:rPr>
+          <w:b/>
+          <w:bCs/>
+          <w:i/>
+          <w:iCs/>
+          <w:color w:val="6A6A6A"/>
+          <w:sz w:val="18"/>
+          <w:szCs w:val="18"/>
+        </w:rPr>
+        <w:t xml:space="preserve">Beispiel</w:t>
+      </w:r>
+    </w:p>
+    <w:p>
+      <w:pPr>
+        <w:keepLines/>
+        <w:pBdr>
+          <w:left w:val="single" w:color="1B6CA8" w:sz="18" w:space="6"/>
+        </w:pBdr>
+        <w:shd w:fill="F4F4F4" w:val="clear"/>
+        <w:spacing w:after="200" w:before="100" w:line="264" w:lineRule="auto"/>
+        <w:ind w:left="140"/>
+      </w:pPr>
+      <w:r>
+        <w:rPr>
+          <w:rFonts w:ascii="Consolas" w:cs="Consolas" w:eastAsia="Consolas" w:hAnsi="Consolas"/>
+          <w:sz w:val="19"/>
+          <w:szCs w:val="19"/>
+        </w:rPr>
+        <w:t xml:space="preserve">PRINT TYPEOF(3.0)</w:t>
+      </w:r>
+      <w:r>
+        <w:rPr>
+          <w:rFonts w:ascii="Consolas" w:cs="Consolas" w:eastAsia="Consolas" w:hAnsi="Consolas"/>
+          <w:sz w:val="19"/>
+          <w:szCs w:val="19"/>
+        </w:rPr>
+        <w:br/>
+        <w:t xml:space="preserve">PRINT TYPEOF("hi"); " "; TYPEOF(5); " "; TYPEOF(TRUE)</w:t>
+      </w:r>
+    </w:p>
+    <w:p>
+      <w:pPr>
+        <w:keepNext/>
+        <w:spacing w:after="30" w:before="120"/>
+      </w:pPr>
+      <w:r>
+        <w:rPr>
+          <w:b/>
+          <w:bCs/>
+          <w:i/>
+          <w:iCs/>
+          <w:color w:val="6A6A6A"/>
+          <w:sz w:val="18"/>
+          <w:szCs w:val="18"/>
+        </w:rPr>
+        <w:t xml:space="preserve">Ausgabe</w:t>
+      </w:r>
+    </w:p>
+    <w:p>
+      <w:pPr>
+        <w:keepLines/>
+        <w:pBdr>
+          <w:left w:val="single" w:color="9AC79A" w:sz="18" w:space="6"/>
+        </w:pBdr>
+        <w:shd w:fill="EAF4EA" w:val="clear"/>
+        <w:spacing w:after="200" w:before="100" w:line="264" w:lineRule="auto"/>
+        <w:ind w:left="140"/>
+      </w:pPr>
+      <w:r>
+        <w:rPr>
+          <w:rFonts w:ascii="Consolas" w:cs="Consolas" w:eastAsia="Consolas" w:hAnsi="Consolas"/>
+          <w:sz w:val="19"/>
+          <w:szCs w:val="19"/>
+        </w:rPr>
+        <w:t xml:space="preserve">FLOAT</w:t>
+      </w:r>
+      <w:r>
+        <w:rPr>
+          <w:rFonts w:ascii="Consolas" w:cs="Consolas" w:eastAsia="Consolas" w:hAnsi="Consolas"/>
+          <w:sz w:val="19"/>
+          <w:szCs w:val="19"/>
+        </w:rPr>
+        <w:br/>
+        <w:t xml:space="preserve">STRING INTEGER BOOLEAN</w:t>
+      </w:r>
+    </w:p>
+    <w:p>
+      <w:pPr>
+        <w:keepNext/>
+        <w:keepLines/>
+        <w:pBdr>
+          <w:bottom w:val="single" w:color="DDD0C0" w:sz="4" w:space="2"/>
+        </w:pBdr>
+        <w:spacing w:after="40" w:before="360"/>
+      </w:pPr>
+      <w:r>
+        <w:rPr>
+          <w:rFonts w:ascii="Consolas" w:cs="Consolas" w:eastAsia="Consolas" w:hAnsi="Consolas"/>
+          <w:b/>
+          <w:bCs/>
+          <w:color w:val="9A3412"/>
+          <w:sz w:val="24"/>
+          <w:szCs w:val="24"/>
+        </w:rPr>
+        <w:t xml:space="preserve">ISNUM · ISINT · ISSTR · ISBOOL</w:t>
+      </w:r>
+    </w:p>
+    <w:p>
+      <w:pPr>
+        <w:keepNext/>
+        <w:spacing w:after="120"/>
+      </w:pPr>
+      <w:r>
+        <w:rPr>
+          <w:b/>
+          <w:bCs/>
+          <w:color w:val="6A6A6A"/>
+          <w:sz w:val="18"/>
+          <w:szCs w:val="18"/>
+        </w:rPr>
+        <w:t xml:space="preserve">Syntax:  </w:t>
+      </w:r>
+      <w:r>
+        <w:rPr>
+          <w:rFonts w:ascii="Consolas" w:cs="Consolas" w:eastAsia="Consolas" w:hAnsi="Consolas"/>
+          <w:color w:val="335577"/>
+          <w:sz w:val="19"/>
+          <w:szCs w:val="19"/>
+        </w:rPr>
+        <w:t xml:space="preserve">ISNUM(x)   ISINT(x)   ISSTR(x)   ISBOOL(x)</w:t>
+      </w:r>
+    </w:p>
+    <w:p>
+      <w:pPr>
+        <w:spacing w:after="180" w:line="312" w:lineRule="auto"/>
+      </w:pPr>
+      <w:r>
+        <w:rPr>
+          <w:sz w:val="22"/>
+          <w:szCs w:val="22"/>
+        </w:rPr>
+        <w:t xml:space="preserve">Prüfen den Typ und liefern TRUE oder FALSE. Wichtig: Ein Wahrheitswert gilt NICHT als Zahl – ISNUM(TRUE) ist FALSE. Und ISINT(3.0) ist FALSE, weil 3.0 eine Kommazahl ist.</w:t>
+      </w:r>
+    </w:p>
+    <w:p>
+      <w:pPr>
+        <w:keepNext/>
+        <w:spacing w:after="30" w:before="120"/>
+      </w:pPr>
+      <w:r>
+        <w:rPr>
+          <w:b/>
+          <w:bCs/>
+          <w:i/>
+          <w:iCs/>
+          <w:color w:val="6A6A6A"/>
+          <w:sz w:val="18"/>
+          <w:szCs w:val="18"/>
+        </w:rPr>
+        <w:t xml:space="preserve">Beispiel</w:t>
+      </w:r>
+    </w:p>
+    <w:p>
+      <w:pPr>
+        <w:keepLines/>
+        <w:pBdr>
+          <w:left w:val="single" w:color="1B6CA8" w:sz="18" w:space="6"/>
+        </w:pBdr>
+        <w:shd w:fill="F4F4F4" w:val="clear"/>
+        <w:spacing w:after="200" w:before="100" w:line="264" w:lineRule="auto"/>
+        <w:ind w:left="140"/>
+      </w:pPr>
+      <w:r>
+        <w:rPr>
+          <w:rFonts w:ascii="Consolas" w:cs="Consolas" w:eastAsia="Consolas" w:hAnsi="Consolas"/>
+          <w:sz w:val="19"/>
+          <w:szCs w:val="19"/>
+        </w:rPr>
+        <w:t xml:space="preserve">PRINT ISINT(5); " "; ISINT(3.0)</w:t>
+      </w:r>
+      <w:r>
+        <w:rPr>
+          <w:rFonts w:ascii="Consolas" w:cs="Consolas" w:eastAsia="Consolas" w:hAnsi="Consolas"/>
+          <w:sz w:val="19"/>
+          <w:szCs w:val="19"/>
+        </w:rPr>
+        <w:br/>
+        <w:t xml:space="preserve">PRINT ISNUM(5); " "; ISNUM(TRUE)</w:t>
+      </w:r>
+    </w:p>
+    <w:p>
+      <w:pPr>
+        <w:keepNext/>
+        <w:spacing w:after="30" w:before="120"/>
+      </w:pPr>
+      <w:r>
+        <w:rPr>
+          <w:b/>
+          <w:bCs/>
+          <w:i/>
+          <w:iCs/>
+          <w:color w:val="6A6A6A"/>
+          <w:sz w:val="18"/>
+          <w:szCs w:val="18"/>
+        </w:rPr>
+        <w:t xml:space="preserve">Ausgabe</w:t>
+      </w:r>
+    </w:p>
+    <w:p>
+      <w:pPr>
+        <w:keepLines/>
+        <w:pBdr>
+          <w:left w:val="single" w:color="9AC79A" w:sz="18" w:space="6"/>
+        </w:pBdr>
+        <w:shd w:fill="EAF4EA" w:val="clear"/>
+        <w:spacing w:after="200" w:before="100" w:line="264" w:lineRule="auto"/>
+        <w:ind w:left="140"/>
+      </w:pPr>
+      <w:r>
+        <w:rPr>
+          <w:rFonts w:ascii="Consolas" w:cs="Consolas" w:eastAsia="Consolas" w:hAnsi="Consolas"/>
+          <w:sz w:val="19"/>
+          <w:szCs w:val="19"/>
+        </w:rPr>
+        <w:t xml:space="preserve">TRUE FALSE</w:t>
+      </w:r>
+      <w:r>
+        <w:rPr>
+          <w:rFonts w:ascii="Consolas" w:cs="Consolas" w:eastAsia="Consolas" w:hAnsi="Consolas"/>
+          <w:sz w:val="19"/>
+          <w:szCs w:val="19"/>
+        </w:rPr>
+        <w:br/>
+        <w:t xml:space="preserve">TRUE FALSE</w:t>
+      </w:r>
+    </w:p>
+    <w:p>
+      <w:pPr>
+        <w:pStyle w:val="Heading2"/>
+        <w:keepNext/>
+        <w:keepLines/>
+        <w:spacing w:after="120" w:before="280"/>
+      </w:pPr>
+      <w:r>
+        <w:t xml:space="preserve">Auf „nichts“ prüfen: IS_NIL</w:t>
+      </w:r>
+    </w:p>
+    <w:p>
+      <w:pPr>
+        <w:spacing w:after="180" w:line="312" w:lineRule="auto"/>
+      </w:pPr>
+      <w:r>
+        <w:rPr>
+          <w:sz w:val="22"/>
+          <w:szCs w:val="22"/>
+        </w:rPr>
+        <w:t xml:space="preserve">Eine Objekt-Variable, die zwar mit DIM angelegt, aber noch nicht mit NEW befüllt wurde, enthält „nichts“ – einen besonderen Leerwert namens NIL. Mit IS_NIL prüfst du, ob eine Variable in diesem Zustand ist, bevor du versehentlich darauf zugreifst.</w:t>
+      </w:r>
+    </w:p>
+    <w:p>
+      <w:pPr>
+        <w:keepNext/>
+        <w:keepLines/>
+        <w:pBdr>
+          <w:bottom w:val="single" w:color="DDD0C0" w:sz="4" w:space="2"/>
+        </w:pBdr>
+        <w:spacing w:after="40" w:before="360"/>
+      </w:pPr>
+      <w:r>
+        <w:rPr>
+          <w:rFonts w:ascii="Consolas" w:cs="Consolas" w:eastAsia="Consolas" w:hAnsi="Consolas"/>
+          <w:b/>
+          <w:bCs/>
+          <w:color w:val="9A3412"/>
+          <w:sz w:val="24"/>
+          <w:szCs w:val="24"/>
+        </w:rPr>
+        <w:t xml:space="preserve">IS_NIL</w:t>
+      </w:r>
+    </w:p>
+    <w:p>
+      <w:pPr>
+        <w:keepNext/>
+        <w:spacing w:after="120"/>
+      </w:pPr>
+      <w:r>
+        <w:rPr>
+          <w:b/>
+          <w:bCs/>
+          <w:color w:val="6A6A6A"/>
+          <w:sz w:val="18"/>
+          <w:szCs w:val="18"/>
+        </w:rPr>
+        <w:t xml:space="preserve">Syntax:  </w:t>
+      </w:r>
+      <w:r>
+        <w:rPr>
+          <w:rFonts w:ascii="Consolas" w:cs="Consolas" w:eastAsia="Consolas" w:hAnsi="Consolas"/>
+          <w:color w:val="335577"/>
+          <w:sz w:val="19"/>
+          <w:szCs w:val="19"/>
+        </w:rPr>
+        <w:t xml:space="preserve">IS_NIL(x)</w:t>
+      </w:r>
+    </w:p>
+    <w:p>
+      <w:pPr>
+        <w:spacing w:after="180" w:line="312" w:lineRule="auto"/>
+      </w:pPr>
+      <w:r>
+        <w:rPr>
+          <w:sz w:val="22"/>
+          <w:szCs w:val="22"/>
+        </w:rPr>
+        <w:t xml:space="preserve">Liefert TRUE, wenn der Wert NIL ist (also „noch nichts“), sonst FALSE. Typisch, um vor dem Benutzen eines Objekts zu prüfen, ob es überhaupt schon erzeugt wurde.</w:t>
+      </w:r>
+    </w:p>
+    <w:p>
+      <w:pPr>
+        <w:keepNext/>
+        <w:spacing w:after="30" w:before="120"/>
+      </w:pPr>
+      <w:r>
+        <w:rPr>
+          <w:b/>
+          <w:bCs/>
+          <w:i/>
+          <w:iCs/>
+          <w:color w:val="6A6A6A"/>
+          <w:sz w:val="18"/>
+          <w:szCs w:val="18"/>
+        </w:rPr>
+        <w:t xml:space="preserve">Beispiel</w:t>
+      </w:r>
+    </w:p>
+    <w:p>
+      <w:pPr>
+        <w:keepLines/>
+        <w:pBdr>
+          <w:left w:val="single" w:color="1B6CA8" w:sz="18" w:space="6"/>
+        </w:pBdr>
+        <w:shd w:fill="F4F4F4" w:val="clear"/>
+        <w:spacing w:after="200" w:before="100" w:line="264" w:lineRule="auto"/>
+        <w:ind w:left="140"/>
+      </w:pPr>
+      <w:r>
+        <w:rPr>
+          <w:rFonts w:ascii="Consolas" w:cs="Consolas" w:eastAsia="Consolas" w:hAnsi="Consolas"/>
+          <w:sz w:val="19"/>
+          <w:szCs w:val="19"/>
+        </w:rPr>
+        <w:t xml:space="preserve">CLASS Gegner</w:t>
+      </w:r>
+      <w:r>
+        <w:rPr>
+          <w:rFonts w:ascii="Consolas" w:cs="Consolas" w:eastAsia="Consolas" w:hAnsi="Consolas"/>
+          <w:sz w:val="19"/>
+          <w:szCs w:val="19"/>
+        </w:rPr>
+        <w:br/>
+        <w:t xml:space="preserve">    DIM hp AS INTEGER</w:t>
+      </w:r>
+      <w:r>
+        <w:rPr>
+          <w:rFonts w:ascii="Consolas" w:cs="Consolas" w:eastAsia="Consolas" w:hAnsi="Consolas"/>
+          <w:sz w:val="19"/>
+          <w:szCs w:val="19"/>
+        </w:rPr>
+        <w:br/>
+        <w:t xml:space="preserve">END CLASS</w:t>
+      </w:r>
+      <w:r>
+        <w:rPr>
+          <w:rFonts w:ascii="Consolas" w:cs="Consolas" w:eastAsia="Consolas" w:hAnsi="Consolas"/>
+          <w:sz w:val="19"/>
+          <w:szCs w:val="19"/>
+        </w:rPr>
+        <w:br/>
+        <w:t xml:space="preserve"/>
+      </w:r>
+      <w:r>
+        <w:rPr>
+          <w:rFonts w:ascii="Consolas" w:cs="Consolas" w:eastAsia="Consolas" w:hAnsi="Consolas"/>
+          <w:sz w:val="19"/>
+          <w:szCs w:val="19"/>
+        </w:rPr>
+        <w:br/>
+        <w:t xml:space="preserve">DIM boss AS Gegner</w:t>
+      </w:r>
+      <w:r>
+        <w:rPr>
+          <w:rFonts w:ascii="Consolas" w:cs="Consolas" w:eastAsia="Consolas" w:hAnsi="Consolas"/>
+          <w:sz w:val="19"/>
+          <w:szCs w:val="19"/>
+        </w:rPr>
+        <w:br/>
+        <w:t xml:space="preserve">PRINT IS_NIL(boss)      ' noch kein NEW</w:t>
+      </w:r>
+      <w:r>
+        <w:rPr>
+          <w:rFonts w:ascii="Consolas" w:cs="Consolas" w:eastAsia="Consolas" w:hAnsi="Consolas"/>
+          <w:sz w:val="19"/>
+          <w:szCs w:val="19"/>
+        </w:rPr>
+        <w:br/>
+        <w:t xml:space="preserve">boss = NEW Gegner()</w:t>
+      </w:r>
+      <w:r>
+        <w:rPr>
+          <w:rFonts w:ascii="Consolas" w:cs="Consolas" w:eastAsia="Consolas" w:hAnsi="Consolas"/>
+          <w:sz w:val="19"/>
+          <w:szCs w:val="19"/>
+        </w:rPr>
+        <w:br/>
+        <w:t xml:space="preserve">PRINT IS_NIL(boss)      ' jetzt existiert es</w:t>
+      </w:r>
+    </w:p>
+    <w:p>
+      <w:pPr>
+        <w:keepNext/>
+        <w:spacing w:after="30" w:before="120"/>
+      </w:pPr>
+      <w:r>
+        <w:rPr>
+          <w:b/>
+          <w:bCs/>
+          <w:i/>
+          <w:iCs/>
+          <w:color w:val="6A6A6A"/>
+          <w:sz w:val="18"/>
+          <w:szCs w:val="18"/>
+        </w:rPr>
+        <w:t xml:space="preserve">Ausgabe</w:t>
+      </w:r>
+    </w:p>
+    <w:p>
+      <w:pPr>
+        <w:keepLines/>
+        <w:pBdr>
+          <w:left w:val="single" w:color="9AC79A" w:sz="18" w:space="6"/>
+        </w:pBdr>
+        <w:shd w:fill="EAF4EA" w:val="clear"/>
+        <w:spacing w:after="200" w:before="100" w:line="264" w:lineRule="auto"/>
+        <w:ind w:left="140"/>
+      </w:pPr>
+      <w:r>
+        <w:rPr>
+          <w:rFonts w:ascii="Consolas" w:cs="Consolas" w:eastAsia="Consolas" w:hAnsi="Consolas"/>
+          <w:sz w:val="19"/>
+          <w:szCs w:val="19"/>
+        </w:rPr>
+        <w:t xml:space="preserve">TRUE</w:t>
+      </w:r>
+      <w:r>
+        <w:rPr>
+          <w:rFonts w:ascii="Consolas" w:cs="Consolas" w:eastAsia="Consolas" w:hAnsi="Consolas"/>
+          <w:sz w:val="19"/>
+          <w:szCs w:val="19"/>
+        </w:rPr>
+        <w:br/>
+        <w:t xml:space="preserve">FALSE</w:t>
+      </w:r>
+    </w:p>
+    <w:p>
+      <w:pPr>
+        <w:pStyle w:val="Heading2"/>
+        <w:keepNext/>
+        <w:keepLines/>
+        <w:spacing w:after="120" w:before="280"/>
+      </w:pPr>
+      <w:r>
+        <w:t xml:space="preserve">Kodierung &amp; Prüfsummen</w:t>
+      </w:r>
+    </w:p>
+    <w:p>
+      <w:pPr>
+        <w:spacing w:after="180" w:line="312" w:lineRule="auto"/>
+      </w:pPr>
+      <w:r>
+        <w:rPr>
+          <w:sz w:val="22"/>
+          <w:szCs w:val="22"/>
+        </w:rPr>
+        <w:t xml:space="preserve">Für Speicherstände und Datenaustausch gibt es ein paar weitere Helfer. Base64 verpackt beliebigen Text in ein kompaktes, transportables Format; Prüfsummen erkennen, ob Daten unverändert sind.</w:t>
+      </w:r>
+    </w:p>
+    <w:p>
+      <w:pPr>
+        <w:pStyle w:val="ListParagraph"/>
+        <w:numPr>
+          <w:ilvl w:val="0"/>
+          <w:numId w:val="2"/>
+        </w:numPr>
+        <w:spacing w:after="100" w:line="312" w:lineRule="auto"/>
+      </w:pPr>
+      <w:r>
+        <w:rPr>
+          <w:b/>
+          <w:bCs/>
+          <w:sz w:val="22"/>
+          <w:szCs w:val="22"/>
+        </w:rPr>
+        <w:t xml:space="preserve">BASE64_ENCODE(s$) · BASE64_DECODE(s$)  </w:t>
+      </w:r>
+      <w:r>
+        <w:rPr>
+          <w:sz w:val="22"/>
+          <w:szCs w:val="22"/>
+        </w:rPr>
+        <w:t xml:space="preserve">→ Text nach Base64 und zurück.</w:t>
+      </w:r>
+    </w:p>
+    <w:p>
+      <w:pPr>
+        <w:pStyle w:val="ListParagraph"/>
+        <w:numPr>
+          <w:ilvl w:val="0"/>
+          <w:numId w:val="2"/>
+        </w:numPr>
+        <w:spacing w:after="100" w:line="312" w:lineRule="auto"/>
+      </w:pPr>
+      <w:r>
+        <w:rPr>
+          <w:b/>
+          <w:bCs/>
+          <w:sz w:val="22"/>
+          <w:szCs w:val="22"/>
+        </w:rPr>
+        <w:t xml:space="preserve">CRC32(s$) · HASH(s$)  </w:t>
+      </w:r>
+      <w:r>
+        <w:rPr>
+          <w:sz w:val="22"/>
+          <w:szCs w:val="22"/>
+        </w:rPr>
+        <w:t xml:space="preserve">→ Prüfsumme bzw. stabiler Hash (z. B. zur Save-Integrität).</w:t>
+      </w:r>
+    </w:p>
+    <w:p>
+      <w:pPr>
+        <w:keepLines/>
+        <w:pBdr>
+          <w:left w:val="single" w:color="1B6CA8" w:sz="18" w:space="6"/>
+        </w:pBdr>
+        <w:shd w:fill="F4F4F4" w:val="clear"/>
+        <w:spacing w:after="200" w:before="100" w:line="264" w:lineRule="auto"/>
+        <w:ind w:left="140"/>
+      </w:pPr>
+      <w:r>
+        <w:rPr>
+          <w:rFonts w:ascii="Consolas" w:cs="Consolas" w:eastAsia="Consolas" w:hAnsi="Consolas"/>
+          <w:sz w:val="19"/>
+          <w:szCs w:val="19"/>
+        </w:rPr>
+        <w:t xml:space="preserve">PRINT BASE64_ENCODE("Hi!")</w:t>
+      </w:r>
+      <w:r>
+        <w:rPr>
+          <w:rFonts w:ascii="Consolas" w:cs="Consolas" w:eastAsia="Consolas" w:hAnsi="Consolas"/>
+          <w:sz w:val="19"/>
+          <w:szCs w:val="19"/>
+        </w:rPr>
+        <w:br/>
+        <w:t xml:space="preserve">PRINT BASE64_DECODE("SGkh")</w:t>
+      </w:r>
+    </w:p>
+    <w:p>
+      <w:pPr>
+        <w:keepLines/>
+        <w:pBdr>
+          <w:left w:val="single" w:color="9AC79A" w:sz="18" w:space="6"/>
+        </w:pBdr>
+        <w:shd w:fill="EAF4EA" w:val="clear"/>
+        <w:spacing w:after="200" w:before="100" w:line="264" w:lineRule="auto"/>
+        <w:ind w:left="140"/>
+      </w:pPr>
+      <w:r>
+        <w:rPr>
+          <w:rFonts w:ascii="Consolas" w:cs="Consolas" w:eastAsia="Consolas" w:hAnsi="Consolas"/>
+          <w:sz w:val="19"/>
+          <w:szCs w:val="19"/>
+        </w:rPr>
+        <w:t xml:space="preserve">SGkh</w:t>
+      </w:r>
+      <w:r>
+        <w:rPr>
+          <w:rFonts w:ascii="Consolas" w:cs="Consolas" w:eastAsia="Consolas" w:hAnsi="Consolas"/>
+          <w:sz w:val="19"/>
+          <w:szCs w:val="19"/>
+        </w:rPr>
+        <w:br/>
+        <w:t xml:space="preserve">Hi!</w:t>
+      </w:r>
+    </w:p>
+    <w:p>
+      <w:pPr>
+        <w:spacing w:before="60"/>
+      </w:pPr>
+    </w:p>
+    <w:tbl>
+      <w:tblPr>
+        <w:tblW w:type="dxa" w:w="9360"/>
+        <w:tblBorders>
+          <w:top w:val="single" w:color="auto" w:sz="4"/>
+          <w:left w:val="single" w:color="auto" w:sz="4"/>
+          <w:bottom w:val="single" w:color="auto" w:sz="4"/>
+          <w:right w:val="single" w:color="auto" w:sz="4"/>
+          <w:insideH w:val="single" w:color="auto" w:sz="4"/>
+          <w:insideV w:val="single" w:color="auto" w:sz="4"/>
+        </w:tblBorders>
+      </w:tblPr>
+      <w:tblGrid>
+        <w:gridCol w:w="9360"/>
+      </w:tblGrid>
+      <w:tr>
+        <w:trPr>
+          <w:cantSplit/>
+        </w:trPr>
+        <w:tc>
+          <w:tcPr>
+            <w:tcW w:type="dxa" w:w="9360"/>
+            <w:tcBorders>
+              <w:top w:val="single" w:color="9CC8E6" w:sz="6"/>
+              <w:left w:val="single" w:color="9CC8E6" w:sz="6"/>
+              <w:bottom w:val="single" w:color="9CC8E6" w:sz="6"/>
+              <w:right w:val="single" w:color="9CC8E6" w:sz="6"/>
+            </w:tcBorders>
+            <w:shd w:fill="E7F2FA" w:val="clear"/>
+            <w:tcMar>
+              <w:top w:type="dxa" w:w="140"/>
+              <w:left w:type="dxa" w:w="180"/>
+              <w:bottom w:type="dxa" w:w="140"/>
+              <w:right w:type="dxa" w:w="180"/>
+            </w:tcMar>
+          </w:tcPr>
+          <w:p>
+            <w:pPr>
+              <w:spacing w:after="40"/>
+            </w:pPr>
+            <w:r>
+              <w:rPr>
+                <w:b/>
+                <w:bCs/>
+                <w:color w:val="1B6CA8"/>
+                <w:sz w:val="22"/>
+                <w:szCs w:val="22"/>
+              </w:rPr>
+              <w:t xml:space="preserve">Verwandte Kapitel</w:t>
+            </w:r>
+          </w:p>
+          <w:p>
+            <w:pPr>
+              <w:spacing w:after="0" w:line="312" w:lineRule="auto"/>
+            </w:pPr>
+            <w:r>
+              <w:rPr>
+                <w:sz w:val="22"/>
+                <w:szCs w:val="22"/>
+              </w:rPr>
+              <w:t xml:space="preserve">Das Zusammenbauen von Text aus Werten geht am bequemsten mit f-Strings (Kapitel „Ein- und Ausgabe“); feste Nachkommastellen oder führende Nullen liefert FORMAT$ (Kapitel „Konsole &amp; Ein-/Ausgabe“).</w:t>
             </w:r>
           </w:p>
         </w:tc>

</xml_diff>

<commit_message>
docs(buch): Lehrbuch Kap 36 -- Map-Helfer (Referenz, Beispiel pro Befehl)
MAPPUT/MAPGET/MAPGETOR, MAPHAS(+IN)/MAPSIZE/MAPREMOVE/MAPCLEAR,
MAPKEYS/MAPVALUES/MAPITEMS (FOR EACH), Methoden-Syntax. Jeder Befehl mit
eigenem Beispiel + Ausgabe. Alle Ausgaben gegen gbrt verifiziert.

Co-Authored-By: Claude Opus 4.8 (1M context) <noreply@anthropic.com>
</commit_message>
<xml_diff>
--- a/buch-referenz/buch/GameBasic-Lehrbuch.docx
+++ b/buch-referenz/buch/GameBasic-Lehrbuch.docx
@@ -894,6 +894,33 @@
           <w:szCs w:val="22"/>
         </w:rPr>
         <w:t xml:space="preserve">	108</w:t>
+      </w:r>
+    </w:p>
+    <w:p>
+      <w:pPr>
+        <w:tabs>
+          <w:tab w:val="right" w:pos="9200" w:leader="dot"/>
+        </w:tabs>
+        <w:spacing w:after="20" w:before="0"/>
+        <w:ind w:left="280"/>
+      </w:pPr>
+      <w:r>
+        <w:rPr>
+          <w:b w:val="false"/>
+          <w:bCs w:val="false"/>
+          <w:color w:val="222222"/>
+          <w:sz w:val="22"/>
+          <w:szCs w:val="22"/>
+        </w:rPr>
+        <w:t xml:space="preserve">Map-Helfer</w:t>
+      </w:r>
+      <w:r>
+        <w:rPr>
+          <w:color w:val="555555"/>
+          <w:sz w:val="22"/>
+          <w:szCs w:val="22"/>
+        </w:rPr>
+        <w:t xml:space="preserve">	113</w:t>
       </w:r>
     </w:p>
     <w:p>
@@ -37889,6 +37916,1895 @@
       <w:pPr>
         <w:spacing w:after="160"/>
       </w:pPr>
+    </w:p>
+    <w:p>
+      <w:pPr>
+        <w:pStyle w:val="Heading1"/>
+        <w:keepNext/>
+        <w:keepLines/>
+        <w:pageBreakBefore/>
+        <w:pBdr>
+          <w:bottom w:val="single" w:color="1B6CA8" w:sz="12" w:space="4"/>
+        </w:pBdr>
+        <w:spacing w:after="160" w:before="0"/>
+      </w:pPr>
+      <w:r>
+        <w:t xml:space="preserve">Map-Helfer</w:t>
+      </w:r>
+    </w:p>
+    <w:p>
+      <w:pPr>
+        <w:spacing w:after="180" w:line="312" w:lineRule="auto"/>
+      </w:pPr>
+      <w:r>
+        <w:rPr>
+          <w:sz w:val="22"/>
+          <w:szCs w:val="22"/>
+        </w:rPr>
+        <w:t xml:space="preserve">Eine Map verbindet Schlüssel (immer Strings) mit Werten – ausführlich erklärt im Kapitel „Maps“ (Teil II). Hier findest du alle Map-Funktionen einzeln mit Beispiel zum Nachschlagen. Viele gibt es auch in Punkt-Schreibweise (m.get(...), m.put(...) …); das steht am Ende des Kapitels.</w:t>
+      </w:r>
+    </w:p>
+    <w:p>
+      <w:pPr>
+        <w:pStyle w:val="Heading2"/>
+        <w:keepNext/>
+        <w:keepLines/>
+        <w:spacing w:after="120" w:before="280"/>
+      </w:pPr>
+      <w:r>
+        <w:t xml:space="preserve">Ablegen &amp; Nachschlagen</w:t>
+      </w:r>
+    </w:p>
+    <w:p>
+      <w:pPr>
+        <w:keepNext/>
+        <w:keepLines/>
+        <w:pBdr>
+          <w:bottom w:val="single" w:color="DDD0C0" w:sz="4" w:space="2"/>
+        </w:pBdr>
+        <w:spacing w:after="40" w:before="360"/>
+      </w:pPr>
+      <w:r>
+        <w:rPr>
+          <w:rFonts w:ascii="Consolas" w:cs="Consolas" w:eastAsia="Consolas" w:hAnsi="Consolas"/>
+          <w:b/>
+          <w:bCs/>
+          <w:color w:val="9A3412"/>
+          <w:sz w:val="24"/>
+          <w:szCs w:val="24"/>
+        </w:rPr>
+        <w:t xml:space="preserve">MAPPUT</w:t>
+      </w:r>
+    </w:p>
+    <w:p>
+      <w:pPr>
+        <w:keepNext/>
+        <w:spacing w:after="120"/>
+      </w:pPr>
+      <w:r>
+        <w:rPr>
+          <w:b/>
+          <w:bCs/>
+          <w:color w:val="6A6A6A"/>
+          <w:sz w:val="18"/>
+          <w:szCs w:val="18"/>
+        </w:rPr>
+        <w:t xml:space="preserve">Syntax:  </w:t>
+      </w:r>
+      <w:r>
+        <w:rPr>
+          <w:rFonts w:ascii="Consolas" w:cs="Consolas" w:eastAsia="Consolas" w:hAnsi="Consolas"/>
+          <w:color w:val="335577"/>
+          <w:sz w:val="19"/>
+          <w:szCs w:val="19"/>
+        </w:rPr>
+        <w:t xml:space="preserve">MAPPUT(m, schlüssel$, wert)</w:t>
+      </w:r>
+    </w:p>
+    <w:p>
+      <w:pPr>
+        <w:spacing w:after="180" w:line="312" w:lineRule="auto"/>
+      </w:pPr>
+      <w:r>
+        <w:rPr>
+          <w:sz w:val="22"/>
+          <w:szCs w:val="22"/>
+        </w:rPr>
+        <w:t xml:space="preserve">Legt unter dem Schlüssel einen Wert ab oder überschreibt den vorhandenen.</w:t>
+      </w:r>
+    </w:p>
+    <w:p>
+      <w:pPr>
+        <w:keepNext/>
+        <w:spacing w:after="30" w:before="120"/>
+      </w:pPr>
+      <w:r>
+        <w:rPr>
+          <w:b/>
+          <w:bCs/>
+          <w:i/>
+          <w:iCs/>
+          <w:color w:val="6A6A6A"/>
+          <w:sz w:val="18"/>
+          <w:szCs w:val="18"/>
+        </w:rPr>
+        <w:t xml:space="preserve">Beispiel</w:t>
+      </w:r>
+    </w:p>
+    <w:p>
+      <w:pPr>
+        <w:keepLines/>
+        <w:pBdr>
+          <w:left w:val="single" w:color="1B6CA8" w:sz="18" w:space="6"/>
+        </w:pBdr>
+        <w:shd w:fill="F4F4F4" w:val="clear"/>
+        <w:spacing w:after="200" w:before="100" w:line="264" w:lineRule="auto"/>
+        <w:ind w:left="140"/>
+      </w:pPr>
+      <w:r>
+        <w:rPr>
+          <w:rFonts w:ascii="Consolas" w:cs="Consolas" w:eastAsia="Consolas" w:hAnsi="Consolas"/>
+          <w:sz w:val="19"/>
+          <w:szCs w:val="19"/>
+        </w:rPr>
+        <w:t xml:space="preserve">DIM m AS MAP OF INTEGER</w:t>
+      </w:r>
+      <w:r>
+        <w:rPr>
+          <w:rFonts w:ascii="Consolas" w:cs="Consolas" w:eastAsia="Consolas" w:hAnsi="Consolas"/>
+          <w:sz w:val="19"/>
+          <w:szCs w:val="19"/>
+        </w:rPr>
+        <w:br/>
+        <w:t xml:space="preserve">MAPPUT(m, "Holz", 5)</w:t>
+      </w:r>
+      <w:r>
+        <w:rPr>
+          <w:rFonts w:ascii="Consolas" w:cs="Consolas" w:eastAsia="Consolas" w:hAnsi="Consolas"/>
+          <w:sz w:val="19"/>
+          <w:szCs w:val="19"/>
+        </w:rPr>
+        <w:br/>
+        <w:t xml:space="preserve">PRINT MAPGET(m, "Holz")</w:t>
+      </w:r>
+    </w:p>
+    <w:p>
+      <w:pPr>
+        <w:keepNext/>
+        <w:spacing w:after="30" w:before="120"/>
+      </w:pPr>
+      <w:r>
+        <w:rPr>
+          <w:b/>
+          <w:bCs/>
+          <w:i/>
+          <w:iCs/>
+          <w:color w:val="6A6A6A"/>
+          <w:sz w:val="18"/>
+          <w:szCs w:val="18"/>
+        </w:rPr>
+        <w:t xml:space="preserve">Ausgabe</w:t>
+      </w:r>
+    </w:p>
+    <w:p>
+      <w:pPr>
+        <w:keepLines/>
+        <w:pBdr>
+          <w:left w:val="single" w:color="9AC79A" w:sz="18" w:space="6"/>
+        </w:pBdr>
+        <w:shd w:fill="EAF4EA" w:val="clear"/>
+        <w:spacing w:after="200" w:before="100" w:line="264" w:lineRule="auto"/>
+        <w:ind w:left="140"/>
+      </w:pPr>
+      <w:r>
+        <w:rPr>
+          <w:rFonts w:ascii="Consolas" w:cs="Consolas" w:eastAsia="Consolas" w:hAnsi="Consolas"/>
+          <w:sz w:val="19"/>
+          <w:szCs w:val="19"/>
+        </w:rPr>
+        <w:t xml:space="preserve">5</w:t>
+      </w:r>
+    </w:p>
+    <w:p>
+      <w:pPr>
+        <w:keepNext/>
+        <w:keepLines/>
+        <w:pBdr>
+          <w:bottom w:val="single" w:color="DDD0C0" w:sz="4" w:space="2"/>
+        </w:pBdr>
+        <w:spacing w:after="40" w:before="360"/>
+      </w:pPr>
+      <w:r>
+        <w:rPr>
+          <w:rFonts w:ascii="Consolas" w:cs="Consolas" w:eastAsia="Consolas" w:hAnsi="Consolas"/>
+          <w:b/>
+          <w:bCs/>
+          <w:color w:val="9A3412"/>
+          <w:sz w:val="24"/>
+          <w:szCs w:val="24"/>
+        </w:rPr>
+        <w:t xml:space="preserve">MAPGET</w:t>
+      </w:r>
+    </w:p>
+    <w:p>
+      <w:pPr>
+        <w:keepNext/>
+        <w:spacing w:after="120"/>
+      </w:pPr>
+      <w:r>
+        <w:rPr>
+          <w:b/>
+          <w:bCs/>
+          <w:color w:val="6A6A6A"/>
+          <w:sz w:val="18"/>
+          <w:szCs w:val="18"/>
+        </w:rPr>
+        <w:t xml:space="preserve">Syntax:  </w:t>
+      </w:r>
+      <w:r>
+        <w:rPr>
+          <w:rFonts w:ascii="Consolas" w:cs="Consolas" w:eastAsia="Consolas" w:hAnsi="Consolas"/>
+          <w:color w:val="335577"/>
+          <w:sz w:val="19"/>
+          <w:szCs w:val="19"/>
+        </w:rPr>
+        <w:t xml:space="preserve">MAPGET(m, schlüssel$)</w:t>
+      </w:r>
+    </w:p>
+    <w:p>
+      <w:pPr>
+        <w:spacing w:after="180" w:line="312" w:lineRule="auto"/>
+      </w:pPr>
+      <w:r>
+        <w:rPr>
+          <w:sz w:val="22"/>
+          <w:szCs w:val="22"/>
+        </w:rPr>
+        <w:t xml:space="preserve">Liefert den Wert zum Schlüssel. Achtung: Fehlt der Schlüssel, bricht das Programm ab – prüfe vorher mit MAPHAS oder nutze MAPGETOR.</w:t>
+      </w:r>
+    </w:p>
+    <w:p>
+      <w:pPr>
+        <w:keepNext/>
+        <w:spacing w:after="30" w:before="120"/>
+      </w:pPr>
+      <w:r>
+        <w:rPr>
+          <w:b/>
+          <w:bCs/>
+          <w:i/>
+          <w:iCs/>
+          <w:color w:val="6A6A6A"/>
+          <w:sz w:val="18"/>
+          <w:szCs w:val="18"/>
+        </w:rPr>
+        <w:t xml:space="preserve">Beispiel</w:t>
+      </w:r>
+    </w:p>
+    <w:p>
+      <w:pPr>
+        <w:keepLines/>
+        <w:pBdr>
+          <w:left w:val="single" w:color="1B6CA8" w:sz="18" w:space="6"/>
+        </w:pBdr>
+        <w:shd w:fill="F4F4F4" w:val="clear"/>
+        <w:spacing w:after="200" w:before="100" w:line="264" w:lineRule="auto"/>
+        <w:ind w:left="140"/>
+      </w:pPr>
+      <w:r>
+        <w:rPr>
+          <w:rFonts w:ascii="Consolas" w:cs="Consolas" w:eastAsia="Consolas" w:hAnsi="Consolas"/>
+          <w:sz w:val="19"/>
+          <w:szCs w:val="19"/>
+        </w:rPr>
+        <w:t xml:space="preserve">DIM m AS MAP OF STRING</w:t>
+      </w:r>
+      <w:r>
+        <w:rPr>
+          <w:rFonts w:ascii="Consolas" w:cs="Consolas" w:eastAsia="Consolas" w:hAnsi="Consolas"/>
+          <w:sz w:val="19"/>
+          <w:szCs w:val="19"/>
+        </w:rPr>
+        <w:br/>
+        <w:t xml:space="preserve">MAPPUT(m, "name", "Anna")</w:t>
+      </w:r>
+      <w:r>
+        <w:rPr>
+          <w:rFonts w:ascii="Consolas" w:cs="Consolas" w:eastAsia="Consolas" w:hAnsi="Consolas"/>
+          <w:sz w:val="19"/>
+          <w:szCs w:val="19"/>
+        </w:rPr>
+        <w:br/>
+        <w:t xml:space="preserve">PRINT MAPGET(m, "name")</w:t>
+      </w:r>
+    </w:p>
+    <w:p>
+      <w:pPr>
+        <w:keepNext/>
+        <w:spacing w:after="30" w:before="120"/>
+      </w:pPr>
+      <w:r>
+        <w:rPr>
+          <w:b/>
+          <w:bCs/>
+          <w:i/>
+          <w:iCs/>
+          <w:color w:val="6A6A6A"/>
+          <w:sz w:val="18"/>
+          <w:szCs w:val="18"/>
+        </w:rPr>
+        <w:t xml:space="preserve">Ausgabe</w:t>
+      </w:r>
+    </w:p>
+    <w:p>
+      <w:pPr>
+        <w:keepLines/>
+        <w:pBdr>
+          <w:left w:val="single" w:color="9AC79A" w:sz="18" w:space="6"/>
+        </w:pBdr>
+        <w:shd w:fill="EAF4EA" w:val="clear"/>
+        <w:spacing w:after="200" w:before="100" w:line="264" w:lineRule="auto"/>
+        <w:ind w:left="140"/>
+      </w:pPr>
+      <w:r>
+        <w:rPr>
+          <w:rFonts w:ascii="Consolas" w:cs="Consolas" w:eastAsia="Consolas" w:hAnsi="Consolas"/>
+          <w:sz w:val="19"/>
+          <w:szCs w:val="19"/>
+        </w:rPr>
+        <w:t xml:space="preserve">Anna</w:t>
+      </w:r>
+    </w:p>
+    <w:p>
+      <w:pPr>
+        <w:keepNext/>
+        <w:keepLines/>
+        <w:pBdr>
+          <w:bottom w:val="single" w:color="DDD0C0" w:sz="4" w:space="2"/>
+        </w:pBdr>
+        <w:spacing w:after="40" w:before="360"/>
+      </w:pPr>
+      <w:r>
+        <w:rPr>
+          <w:rFonts w:ascii="Consolas" w:cs="Consolas" w:eastAsia="Consolas" w:hAnsi="Consolas"/>
+          <w:b/>
+          <w:bCs/>
+          <w:color w:val="9A3412"/>
+          <w:sz w:val="24"/>
+          <w:szCs w:val="24"/>
+        </w:rPr>
+        <w:t xml:space="preserve">MAPGETOR</w:t>
+      </w:r>
+    </w:p>
+    <w:p>
+      <w:pPr>
+        <w:keepNext/>
+        <w:spacing w:after="120"/>
+      </w:pPr>
+      <w:r>
+        <w:rPr>
+          <w:b/>
+          <w:bCs/>
+          <w:color w:val="6A6A6A"/>
+          <w:sz w:val="18"/>
+          <w:szCs w:val="18"/>
+        </w:rPr>
+        <w:t xml:space="preserve">Syntax:  </w:t>
+      </w:r>
+      <w:r>
+        <w:rPr>
+          <w:rFonts w:ascii="Consolas" w:cs="Consolas" w:eastAsia="Consolas" w:hAnsi="Consolas"/>
+          <w:color w:val="335577"/>
+          <w:sz w:val="19"/>
+          <w:szCs w:val="19"/>
+        </w:rPr>
+        <w:t xml:space="preserve">MAPGETOR(m, schlüssel$, ersatz)</w:t>
+      </w:r>
+    </w:p>
+    <w:p>
+      <w:pPr>
+        <w:spacing w:after="180" w:line="312" w:lineRule="auto"/>
+      </w:pPr>
+      <w:r>
+        <w:rPr>
+          <w:sz w:val="22"/>
+          <w:szCs w:val="22"/>
+        </w:rPr>
+        <w:t xml:space="preserve">Liefert den Wert zum Schlüssel oder den Ersatzwert, falls der Schlüssel fehlt. Bricht nie ab.</w:t>
+      </w:r>
+    </w:p>
+    <w:p>
+      <w:pPr>
+        <w:keepNext/>
+        <w:spacing w:after="30" w:before="120"/>
+      </w:pPr>
+      <w:r>
+        <w:rPr>
+          <w:b/>
+          <w:bCs/>
+          <w:i/>
+          <w:iCs/>
+          <w:color w:val="6A6A6A"/>
+          <w:sz w:val="18"/>
+          <w:szCs w:val="18"/>
+        </w:rPr>
+        <w:t xml:space="preserve">Beispiel</w:t>
+      </w:r>
+    </w:p>
+    <w:p>
+      <w:pPr>
+        <w:keepLines/>
+        <w:pBdr>
+          <w:left w:val="single" w:color="1B6CA8" w:sz="18" w:space="6"/>
+        </w:pBdr>
+        <w:shd w:fill="F4F4F4" w:val="clear"/>
+        <w:spacing w:after="200" w:before="100" w:line="264" w:lineRule="auto"/>
+        <w:ind w:left="140"/>
+      </w:pPr>
+      <w:r>
+        <w:rPr>
+          <w:rFonts w:ascii="Consolas" w:cs="Consolas" w:eastAsia="Consolas" w:hAnsi="Consolas"/>
+          <w:sz w:val="19"/>
+          <w:szCs w:val="19"/>
+        </w:rPr>
+        <w:t xml:space="preserve">DIM m AS MAP OF INTEGER</w:t>
+      </w:r>
+      <w:r>
+        <w:rPr>
+          <w:rFonts w:ascii="Consolas" w:cs="Consolas" w:eastAsia="Consolas" w:hAnsi="Consolas"/>
+          <w:sz w:val="19"/>
+          <w:szCs w:val="19"/>
+        </w:rPr>
+        <w:br/>
+        <w:t xml:space="preserve">MAPPUT(m, "Holz", 5)</w:t>
+      </w:r>
+      <w:r>
+        <w:rPr>
+          <w:rFonts w:ascii="Consolas" w:cs="Consolas" w:eastAsia="Consolas" w:hAnsi="Consolas"/>
+          <w:sz w:val="19"/>
+          <w:szCs w:val="19"/>
+        </w:rPr>
+        <w:br/>
+        <w:t xml:space="preserve">PRINT MAPGETOR(m, "Gold", 0)</w:t>
+      </w:r>
+    </w:p>
+    <w:p>
+      <w:pPr>
+        <w:keepNext/>
+        <w:spacing w:after="30" w:before="120"/>
+      </w:pPr>
+      <w:r>
+        <w:rPr>
+          <w:b/>
+          <w:bCs/>
+          <w:i/>
+          <w:iCs/>
+          <w:color w:val="6A6A6A"/>
+          <w:sz w:val="18"/>
+          <w:szCs w:val="18"/>
+        </w:rPr>
+        <w:t xml:space="preserve">Ausgabe</w:t>
+      </w:r>
+    </w:p>
+    <w:p>
+      <w:pPr>
+        <w:keepLines/>
+        <w:pBdr>
+          <w:left w:val="single" w:color="9AC79A" w:sz="18" w:space="6"/>
+        </w:pBdr>
+        <w:shd w:fill="EAF4EA" w:val="clear"/>
+        <w:spacing w:after="200" w:before="100" w:line="264" w:lineRule="auto"/>
+        <w:ind w:left="140"/>
+      </w:pPr>
+      <w:r>
+        <w:rPr>
+          <w:rFonts w:ascii="Consolas" w:cs="Consolas" w:eastAsia="Consolas" w:hAnsi="Consolas"/>
+          <w:sz w:val="19"/>
+          <w:szCs w:val="19"/>
+        </w:rPr>
+        <w:t xml:space="preserve">0</w:t>
+      </w:r>
+    </w:p>
+    <w:p>
+      <w:pPr>
+        <w:pStyle w:val="Heading2"/>
+        <w:keepNext/>
+        <w:keepLines/>
+        <w:spacing w:after="120" w:before="280"/>
+      </w:pPr>
+      <w:r>
+        <w:t xml:space="preserve">Prüfen, Entfernen, Größe</w:t>
+      </w:r>
+    </w:p>
+    <w:p>
+      <w:pPr>
+        <w:keepNext/>
+        <w:keepLines/>
+        <w:pBdr>
+          <w:bottom w:val="single" w:color="DDD0C0" w:sz="4" w:space="2"/>
+        </w:pBdr>
+        <w:spacing w:after="40" w:before="360"/>
+      </w:pPr>
+      <w:r>
+        <w:rPr>
+          <w:rFonts w:ascii="Consolas" w:cs="Consolas" w:eastAsia="Consolas" w:hAnsi="Consolas"/>
+          <w:b/>
+          <w:bCs/>
+          <w:color w:val="9A3412"/>
+          <w:sz w:val="24"/>
+          <w:szCs w:val="24"/>
+        </w:rPr>
+        <w:t xml:space="preserve">MAPHAS</w:t>
+      </w:r>
+    </w:p>
+    <w:p>
+      <w:pPr>
+        <w:keepNext/>
+        <w:spacing w:after="120"/>
+      </w:pPr>
+      <w:r>
+        <w:rPr>
+          <w:b/>
+          <w:bCs/>
+          <w:color w:val="6A6A6A"/>
+          <w:sz w:val="18"/>
+          <w:szCs w:val="18"/>
+        </w:rPr>
+        <w:t xml:space="preserve">Syntax:  </w:t>
+      </w:r>
+      <w:r>
+        <w:rPr>
+          <w:rFonts w:ascii="Consolas" w:cs="Consolas" w:eastAsia="Consolas" w:hAnsi="Consolas"/>
+          <w:color w:val="335577"/>
+          <w:sz w:val="19"/>
+          <w:szCs w:val="19"/>
+        </w:rPr>
+        <w:t xml:space="preserve">MAPHAS(m, schlüssel$)</w:t>
+      </w:r>
+    </w:p>
+    <w:p>
+      <w:pPr>
+        <w:spacing w:after="180" w:line="312" w:lineRule="auto"/>
+      </w:pPr>
+      <w:r>
+        <w:rPr>
+          <w:sz w:val="22"/>
+          <w:szCs w:val="22"/>
+        </w:rPr>
+        <w:t xml:space="preserve">TRUE, wenn der Schlüssel vorhanden ist. Gleichbedeutend mit schlüssel$ IN m.</w:t>
+      </w:r>
+    </w:p>
+    <w:p>
+      <w:pPr>
+        <w:keepNext/>
+        <w:spacing w:after="30" w:before="120"/>
+      </w:pPr>
+      <w:r>
+        <w:rPr>
+          <w:b/>
+          <w:bCs/>
+          <w:i/>
+          <w:iCs/>
+          <w:color w:val="6A6A6A"/>
+          <w:sz w:val="18"/>
+          <w:szCs w:val="18"/>
+        </w:rPr>
+        <w:t xml:space="preserve">Beispiel</w:t>
+      </w:r>
+    </w:p>
+    <w:p>
+      <w:pPr>
+        <w:keepLines/>
+        <w:pBdr>
+          <w:left w:val="single" w:color="1B6CA8" w:sz="18" w:space="6"/>
+        </w:pBdr>
+        <w:shd w:fill="F4F4F4" w:val="clear"/>
+        <w:spacing w:after="200" w:before="100" w:line="264" w:lineRule="auto"/>
+        <w:ind w:left="140"/>
+      </w:pPr>
+      <w:r>
+        <w:rPr>
+          <w:rFonts w:ascii="Consolas" w:cs="Consolas" w:eastAsia="Consolas" w:hAnsi="Consolas"/>
+          <w:sz w:val="19"/>
+          <w:szCs w:val="19"/>
+        </w:rPr>
+        <w:t xml:space="preserve">DIM m AS MAP OF INTEGER</w:t>
+      </w:r>
+      <w:r>
+        <w:rPr>
+          <w:rFonts w:ascii="Consolas" w:cs="Consolas" w:eastAsia="Consolas" w:hAnsi="Consolas"/>
+          <w:sz w:val="19"/>
+          <w:szCs w:val="19"/>
+        </w:rPr>
+        <w:br/>
+        <w:t xml:space="preserve">MAPPUT(m, "Stein", 3)</w:t>
+      </w:r>
+      <w:r>
+        <w:rPr>
+          <w:rFonts w:ascii="Consolas" w:cs="Consolas" w:eastAsia="Consolas" w:hAnsi="Consolas"/>
+          <w:sz w:val="19"/>
+          <w:szCs w:val="19"/>
+        </w:rPr>
+        <w:br/>
+        <w:t xml:space="preserve">PRINT MAPHAS(m, "Stein")</w:t>
+      </w:r>
+      <w:r>
+        <w:rPr>
+          <w:rFonts w:ascii="Consolas" w:cs="Consolas" w:eastAsia="Consolas" w:hAnsi="Consolas"/>
+          <w:sz w:val="19"/>
+          <w:szCs w:val="19"/>
+        </w:rPr>
+        <w:br/>
+        <w:t xml:space="preserve">PRINT "Gold" IN m</w:t>
+      </w:r>
+    </w:p>
+    <w:p>
+      <w:pPr>
+        <w:keepNext/>
+        <w:spacing w:after="30" w:before="120"/>
+      </w:pPr>
+      <w:r>
+        <w:rPr>
+          <w:b/>
+          <w:bCs/>
+          <w:i/>
+          <w:iCs/>
+          <w:color w:val="6A6A6A"/>
+          <w:sz w:val="18"/>
+          <w:szCs w:val="18"/>
+        </w:rPr>
+        <w:t xml:space="preserve">Ausgabe</w:t>
+      </w:r>
+    </w:p>
+    <w:p>
+      <w:pPr>
+        <w:keepLines/>
+        <w:pBdr>
+          <w:left w:val="single" w:color="9AC79A" w:sz="18" w:space="6"/>
+        </w:pBdr>
+        <w:shd w:fill="EAF4EA" w:val="clear"/>
+        <w:spacing w:after="200" w:before="100" w:line="264" w:lineRule="auto"/>
+        <w:ind w:left="140"/>
+      </w:pPr>
+      <w:r>
+        <w:rPr>
+          <w:rFonts w:ascii="Consolas" w:cs="Consolas" w:eastAsia="Consolas" w:hAnsi="Consolas"/>
+          <w:sz w:val="19"/>
+          <w:szCs w:val="19"/>
+        </w:rPr>
+        <w:t xml:space="preserve">TRUE</w:t>
+      </w:r>
+      <w:r>
+        <w:rPr>
+          <w:rFonts w:ascii="Consolas" w:cs="Consolas" w:eastAsia="Consolas" w:hAnsi="Consolas"/>
+          <w:sz w:val="19"/>
+          <w:szCs w:val="19"/>
+        </w:rPr>
+        <w:br/>
+        <w:t xml:space="preserve">FALSE</w:t>
+      </w:r>
+    </w:p>
+    <w:p>
+      <w:pPr>
+        <w:keepNext/>
+        <w:keepLines/>
+        <w:pBdr>
+          <w:bottom w:val="single" w:color="DDD0C0" w:sz="4" w:space="2"/>
+        </w:pBdr>
+        <w:spacing w:after="40" w:before="360"/>
+      </w:pPr>
+      <w:r>
+        <w:rPr>
+          <w:rFonts w:ascii="Consolas" w:cs="Consolas" w:eastAsia="Consolas" w:hAnsi="Consolas"/>
+          <w:b/>
+          <w:bCs/>
+          <w:color w:val="9A3412"/>
+          <w:sz w:val="24"/>
+          <w:szCs w:val="24"/>
+        </w:rPr>
+        <w:t xml:space="preserve">MAPSIZE</w:t>
+      </w:r>
+    </w:p>
+    <w:p>
+      <w:pPr>
+        <w:keepNext/>
+        <w:spacing w:after="120"/>
+      </w:pPr>
+      <w:r>
+        <w:rPr>
+          <w:b/>
+          <w:bCs/>
+          <w:color w:val="6A6A6A"/>
+          <w:sz w:val="18"/>
+          <w:szCs w:val="18"/>
+        </w:rPr>
+        <w:t xml:space="preserve">Syntax:  </w:t>
+      </w:r>
+      <w:r>
+        <w:rPr>
+          <w:rFonts w:ascii="Consolas" w:cs="Consolas" w:eastAsia="Consolas" w:hAnsi="Consolas"/>
+          <w:color w:val="335577"/>
+          <w:sz w:val="19"/>
+          <w:szCs w:val="19"/>
+        </w:rPr>
+        <w:t xml:space="preserve">MAPSIZE(m)</w:t>
+      </w:r>
+    </w:p>
+    <w:p>
+      <w:pPr>
+        <w:spacing w:after="180" w:line="312" w:lineRule="auto"/>
+      </w:pPr>
+      <w:r>
+        <w:rPr>
+          <w:sz w:val="22"/>
+          <w:szCs w:val="22"/>
+        </w:rPr>
+        <w:t xml:space="preserve">Anzahl der Schlüssel-Wert-Paare.</w:t>
+      </w:r>
+    </w:p>
+    <w:p>
+      <w:pPr>
+        <w:keepNext/>
+        <w:spacing w:after="30" w:before="120"/>
+      </w:pPr>
+      <w:r>
+        <w:rPr>
+          <w:b/>
+          <w:bCs/>
+          <w:i/>
+          <w:iCs/>
+          <w:color w:val="6A6A6A"/>
+          <w:sz w:val="18"/>
+          <w:szCs w:val="18"/>
+        </w:rPr>
+        <w:t xml:space="preserve">Beispiel</w:t>
+      </w:r>
+    </w:p>
+    <w:p>
+      <w:pPr>
+        <w:keepLines/>
+        <w:pBdr>
+          <w:left w:val="single" w:color="1B6CA8" w:sz="18" w:space="6"/>
+        </w:pBdr>
+        <w:shd w:fill="F4F4F4" w:val="clear"/>
+        <w:spacing w:after="200" w:before="100" w:line="264" w:lineRule="auto"/>
+        <w:ind w:left="140"/>
+      </w:pPr>
+      <w:r>
+        <w:rPr>
+          <w:rFonts w:ascii="Consolas" w:cs="Consolas" w:eastAsia="Consolas" w:hAnsi="Consolas"/>
+          <w:sz w:val="19"/>
+          <w:szCs w:val="19"/>
+        </w:rPr>
+        <w:t xml:space="preserve">DIM m AS MAP OF INTEGER</w:t>
+      </w:r>
+      <w:r>
+        <w:rPr>
+          <w:rFonts w:ascii="Consolas" w:cs="Consolas" w:eastAsia="Consolas" w:hAnsi="Consolas"/>
+          <w:sz w:val="19"/>
+          <w:szCs w:val="19"/>
+        </w:rPr>
+        <w:br/>
+        <w:t xml:space="preserve">MAPPUT(m, "a", 1) : MAPPUT(m, "b", 2)</w:t>
+      </w:r>
+      <w:r>
+        <w:rPr>
+          <w:rFonts w:ascii="Consolas" w:cs="Consolas" w:eastAsia="Consolas" w:hAnsi="Consolas"/>
+          <w:sz w:val="19"/>
+          <w:szCs w:val="19"/>
+        </w:rPr>
+        <w:br/>
+        <w:t xml:space="preserve">PRINT MAPSIZE(m)</w:t>
+      </w:r>
+    </w:p>
+    <w:p>
+      <w:pPr>
+        <w:keepNext/>
+        <w:spacing w:after="30" w:before="120"/>
+      </w:pPr>
+      <w:r>
+        <w:rPr>
+          <w:b/>
+          <w:bCs/>
+          <w:i/>
+          <w:iCs/>
+          <w:color w:val="6A6A6A"/>
+          <w:sz w:val="18"/>
+          <w:szCs w:val="18"/>
+        </w:rPr>
+        <w:t xml:space="preserve">Ausgabe</w:t>
+      </w:r>
+    </w:p>
+    <w:p>
+      <w:pPr>
+        <w:keepLines/>
+        <w:pBdr>
+          <w:left w:val="single" w:color="9AC79A" w:sz="18" w:space="6"/>
+        </w:pBdr>
+        <w:shd w:fill="EAF4EA" w:val="clear"/>
+        <w:spacing w:after="200" w:before="100" w:line="264" w:lineRule="auto"/>
+        <w:ind w:left="140"/>
+      </w:pPr>
+      <w:r>
+        <w:rPr>
+          <w:rFonts w:ascii="Consolas" w:cs="Consolas" w:eastAsia="Consolas" w:hAnsi="Consolas"/>
+          <w:sz w:val="19"/>
+          <w:szCs w:val="19"/>
+        </w:rPr>
+        <w:t xml:space="preserve">2</w:t>
+      </w:r>
+    </w:p>
+    <w:p>
+      <w:pPr>
+        <w:keepNext/>
+        <w:keepLines/>
+        <w:pBdr>
+          <w:bottom w:val="single" w:color="DDD0C0" w:sz="4" w:space="2"/>
+        </w:pBdr>
+        <w:spacing w:after="40" w:before="360"/>
+      </w:pPr>
+      <w:r>
+        <w:rPr>
+          <w:rFonts w:ascii="Consolas" w:cs="Consolas" w:eastAsia="Consolas" w:hAnsi="Consolas"/>
+          <w:b/>
+          <w:bCs/>
+          <w:color w:val="9A3412"/>
+          <w:sz w:val="24"/>
+          <w:szCs w:val="24"/>
+        </w:rPr>
+        <w:t xml:space="preserve">MAPREMOVE</w:t>
+      </w:r>
+    </w:p>
+    <w:p>
+      <w:pPr>
+        <w:keepNext/>
+        <w:spacing w:after="120"/>
+      </w:pPr>
+      <w:r>
+        <w:rPr>
+          <w:b/>
+          <w:bCs/>
+          <w:color w:val="6A6A6A"/>
+          <w:sz w:val="18"/>
+          <w:szCs w:val="18"/>
+        </w:rPr>
+        <w:t xml:space="preserve">Syntax:  </w:t>
+      </w:r>
+      <w:r>
+        <w:rPr>
+          <w:rFonts w:ascii="Consolas" w:cs="Consolas" w:eastAsia="Consolas" w:hAnsi="Consolas"/>
+          <w:color w:val="335577"/>
+          <w:sz w:val="19"/>
+          <w:szCs w:val="19"/>
+        </w:rPr>
+        <w:t xml:space="preserve">MAPREMOVE(m, schlüssel$)</w:t>
+      </w:r>
+    </w:p>
+    <w:p>
+      <w:pPr>
+        <w:spacing w:after="180" w:line="312" w:lineRule="auto"/>
+      </w:pPr>
+      <w:r>
+        <w:rPr>
+          <w:sz w:val="22"/>
+          <w:szCs w:val="22"/>
+        </w:rPr>
+        <w:t xml:space="preserve">Entfernt ein Paar und liefert TRUE, wenn es den Schlüssel gab (sonst FALSE).</w:t>
+      </w:r>
+    </w:p>
+    <w:p>
+      <w:pPr>
+        <w:keepNext/>
+        <w:spacing w:after="30" w:before="120"/>
+      </w:pPr>
+      <w:r>
+        <w:rPr>
+          <w:b/>
+          <w:bCs/>
+          <w:i/>
+          <w:iCs/>
+          <w:color w:val="6A6A6A"/>
+          <w:sz w:val="18"/>
+          <w:szCs w:val="18"/>
+        </w:rPr>
+        <w:t xml:space="preserve">Beispiel</w:t>
+      </w:r>
+    </w:p>
+    <w:p>
+      <w:pPr>
+        <w:keepLines/>
+        <w:pBdr>
+          <w:left w:val="single" w:color="1B6CA8" w:sz="18" w:space="6"/>
+        </w:pBdr>
+        <w:shd w:fill="F4F4F4" w:val="clear"/>
+        <w:spacing w:after="200" w:before="100" w:line="264" w:lineRule="auto"/>
+        <w:ind w:left="140"/>
+      </w:pPr>
+      <w:r>
+        <w:rPr>
+          <w:rFonts w:ascii="Consolas" w:cs="Consolas" w:eastAsia="Consolas" w:hAnsi="Consolas"/>
+          <w:sz w:val="19"/>
+          <w:szCs w:val="19"/>
+        </w:rPr>
+        <w:t xml:space="preserve">DIM m AS MAP OF INTEGER</w:t>
+      </w:r>
+      <w:r>
+        <w:rPr>
+          <w:rFonts w:ascii="Consolas" w:cs="Consolas" w:eastAsia="Consolas" w:hAnsi="Consolas"/>
+          <w:sz w:val="19"/>
+          <w:szCs w:val="19"/>
+        </w:rPr>
+        <w:br/>
+        <w:t xml:space="preserve">MAPPUT(m, "Holz", 5)</w:t>
+      </w:r>
+      <w:r>
+        <w:rPr>
+          <w:rFonts w:ascii="Consolas" w:cs="Consolas" w:eastAsia="Consolas" w:hAnsi="Consolas"/>
+          <w:sz w:val="19"/>
+          <w:szCs w:val="19"/>
+        </w:rPr>
+        <w:br/>
+        <w:t xml:space="preserve">PRINT MAPREMOVE(m, "Holz")</w:t>
+      </w:r>
+      <w:r>
+        <w:rPr>
+          <w:rFonts w:ascii="Consolas" w:cs="Consolas" w:eastAsia="Consolas" w:hAnsi="Consolas"/>
+          <w:sz w:val="19"/>
+          <w:szCs w:val="19"/>
+        </w:rPr>
+        <w:br/>
+        <w:t xml:space="preserve">PRINT MAPSIZE(m)</w:t>
+      </w:r>
+    </w:p>
+    <w:p>
+      <w:pPr>
+        <w:keepNext/>
+        <w:spacing w:after="30" w:before="120"/>
+      </w:pPr>
+      <w:r>
+        <w:rPr>
+          <w:b/>
+          <w:bCs/>
+          <w:i/>
+          <w:iCs/>
+          <w:color w:val="6A6A6A"/>
+          <w:sz w:val="18"/>
+          <w:szCs w:val="18"/>
+        </w:rPr>
+        <w:t xml:space="preserve">Ausgabe</w:t>
+      </w:r>
+    </w:p>
+    <w:p>
+      <w:pPr>
+        <w:keepLines/>
+        <w:pBdr>
+          <w:left w:val="single" w:color="9AC79A" w:sz="18" w:space="6"/>
+        </w:pBdr>
+        <w:shd w:fill="EAF4EA" w:val="clear"/>
+        <w:spacing w:after="200" w:before="100" w:line="264" w:lineRule="auto"/>
+        <w:ind w:left="140"/>
+      </w:pPr>
+      <w:r>
+        <w:rPr>
+          <w:rFonts w:ascii="Consolas" w:cs="Consolas" w:eastAsia="Consolas" w:hAnsi="Consolas"/>
+          <w:sz w:val="19"/>
+          <w:szCs w:val="19"/>
+        </w:rPr>
+        <w:t xml:space="preserve">TRUE</w:t>
+      </w:r>
+      <w:r>
+        <w:rPr>
+          <w:rFonts w:ascii="Consolas" w:cs="Consolas" w:eastAsia="Consolas" w:hAnsi="Consolas"/>
+          <w:sz w:val="19"/>
+          <w:szCs w:val="19"/>
+        </w:rPr>
+        <w:br/>
+        <w:t xml:space="preserve">0</w:t>
+      </w:r>
+    </w:p>
+    <w:p>
+      <w:pPr>
+        <w:keepNext/>
+        <w:keepLines/>
+        <w:pBdr>
+          <w:bottom w:val="single" w:color="DDD0C0" w:sz="4" w:space="2"/>
+        </w:pBdr>
+        <w:spacing w:after="40" w:before="360"/>
+      </w:pPr>
+      <w:r>
+        <w:rPr>
+          <w:rFonts w:ascii="Consolas" w:cs="Consolas" w:eastAsia="Consolas" w:hAnsi="Consolas"/>
+          <w:b/>
+          <w:bCs/>
+          <w:color w:val="9A3412"/>
+          <w:sz w:val="24"/>
+          <w:szCs w:val="24"/>
+        </w:rPr>
+        <w:t xml:space="preserve">MAPCLEAR</w:t>
+      </w:r>
+    </w:p>
+    <w:p>
+      <w:pPr>
+        <w:keepNext/>
+        <w:spacing w:after="120"/>
+      </w:pPr>
+      <w:r>
+        <w:rPr>
+          <w:b/>
+          <w:bCs/>
+          <w:color w:val="6A6A6A"/>
+          <w:sz w:val="18"/>
+          <w:szCs w:val="18"/>
+        </w:rPr>
+        <w:t xml:space="preserve">Syntax:  </w:t>
+      </w:r>
+      <w:r>
+        <w:rPr>
+          <w:rFonts w:ascii="Consolas" w:cs="Consolas" w:eastAsia="Consolas" w:hAnsi="Consolas"/>
+          <w:color w:val="335577"/>
+          <w:sz w:val="19"/>
+          <w:szCs w:val="19"/>
+        </w:rPr>
+        <w:t xml:space="preserve">MAPCLEAR(m)</w:t>
+      </w:r>
+    </w:p>
+    <w:p>
+      <w:pPr>
+        <w:spacing w:after="180" w:line="312" w:lineRule="auto"/>
+      </w:pPr>
+      <w:r>
+        <w:rPr>
+          <w:sz w:val="22"/>
+          <w:szCs w:val="22"/>
+        </w:rPr>
+        <w:t xml:space="preserve">Leert die ganze Map auf einmal.</w:t>
+      </w:r>
+    </w:p>
+    <w:p>
+      <w:pPr>
+        <w:keepNext/>
+        <w:spacing w:after="30" w:before="120"/>
+      </w:pPr>
+      <w:r>
+        <w:rPr>
+          <w:b/>
+          <w:bCs/>
+          <w:i/>
+          <w:iCs/>
+          <w:color w:val="6A6A6A"/>
+          <w:sz w:val="18"/>
+          <w:szCs w:val="18"/>
+        </w:rPr>
+        <w:t xml:space="preserve">Beispiel</w:t>
+      </w:r>
+    </w:p>
+    <w:p>
+      <w:pPr>
+        <w:keepLines/>
+        <w:pBdr>
+          <w:left w:val="single" w:color="1B6CA8" w:sz="18" w:space="6"/>
+        </w:pBdr>
+        <w:shd w:fill="F4F4F4" w:val="clear"/>
+        <w:spacing w:after="200" w:before="100" w:line="264" w:lineRule="auto"/>
+        <w:ind w:left="140"/>
+      </w:pPr>
+      <w:r>
+        <w:rPr>
+          <w:rFonts w:ascii="Consolas" w:cs="Consolas" w:eastAsia="Consolas" w:hAnsi="Consolas"/>
+          <w:sz w:val="19"/>
+          <w:szCs w:val="19"/>
+        </w:rPr>
+        <w:t xml:space="preserve">DIM m AS MAP OF INTEGER</w:t>
+      </w:r>
+      <w:r>
+        <w:rPr>
+          <w:rFonts w:ascii="Consolas" w:cs="Consolas" w:eastAsia="Consolas" w:hAnsi="Consolas"/>
+          <w:sz w:val="19"/>
+          <w:szCs w:val="19"/>
+        </w:rPr>
+        <w:br/>
+        <w:t xml:space="preserve">MAPPUT(m, "a", 1) : MAPPUT(m, "b", 2)</w:t>
+      </w:r>
+      <w:r>
+        <w:rPr>
+          <w:rFonts w:ascii="Consolas" w:cs="Consolas" w:eastAsia="Consolas" w:hAnsi="Consolas"/>
+          <w:sz w:val="19"/>
+          <w:szCs w:val="19"/>
+        </w:rPr>
+        <w:br/>
+        <w:t xml:space="preserve">MAPCLEAR(m)</w:t>
+      </w:r>
+      <w:r>
+        <w:rPr>
+          <w:rFonts w:ascii="Consolas" w:cs="Consolas" w:eastAsia="Consolas" w:hAnsi="Consolas"/>
+          <w:sz w:val="19"/>
+          <w:szCs w:val="19"/>
+        </w:rPr>
+        <w:br/>
+        <w:t xml:space="preserve">PRINT MAPSIZE(m)</w:t>
+      </w:r>
+    </w:p>
+    <w:p>
+      <w:pPr>
+        <w:keepNext/>
+        <w:spacing w:after="30" w:before="120"/>
+      </w:pPr>
+      <w:r>
+        <w:rPr>
+          <w:b/>
+          <w:bCs/>
+          <w:i/>
+          <w:iCs/>
+          <w:color w:val="6A6A6A"/>
+          <w:sz w:val="18"/>
+          <w:szCs w:val="18"/>
+        </w:rPr>
+        <w:t xml:space="preserve">Ausgabe</w:t>
+      </w:r>
+    </w:p>
+    <w:p>
+      <w:pPr>
+        <w:keepLines/>
+        <w:pBdr>
+          <w:left w:val="single" w:color="9AC79A" w:sz="18" w:space="6"/>
+        </w:pBdr>
+        <w:shd w:fill="EAF4EA" w:val="clear"/>
+        <w:spacing w:after="200" w:before="100" w:line="264" w:lineRule="auto"/>
+        <w:ind w:left="140"/>
+      </w:pPr>
+      <w:r>
+        <w:rPr>
+          <w:rFonts w:ascii="Consolas" w:cs="Consolas" w:eastAsia="Consolas" w:hAnsi="Consolas"/>
+          <w:sz w:val="19"/>
+          <w:szCs w:val="19"/>
+        </w:rPr>
+        <w:t xml:space="preserve">0</w:t>
+      </w:r>
+    </w:p>
+    <w:p>
+      <w:pPr>
+        <w:pStyle w:val="Heading2"/>
+        <w:keepNext/>
+        <w:keepLines/>
+        <w:spacing w:after="120" w:before="280"/>
+      </w:pPr>
+      <w:r>
+        <w:t xml:space="preserve">Über alle Einträge</w:t>
+      </w:r>
+    </w:p>
+    <w:p>
+      <w:pPr>
+        <w:spacing w:after="180" w:line="312" w:lineRule="auto"/>
+      </w:pPr>
+      <w:r>
+        <w:rPr>
+          <w:sz w:val="22"/>
+          <w:szCs w:val="22"/>
+        </w:rPr>
+        <w:t xml:space="preserve">Die Paare erscheinen stets in der Reihenfolge, in der sie eingefügt wurden.</w:t>
+      </w:r>
+    </w:p>
+    <w:p>
+      <w:pPr>
+        <w:keepNext/>
+        <w:keepLines/>
+        <w:pBdr>
+          <w:bottom w:val="single" w:color="DDD0C0" w:sz="4" w:space="2"/>
+        </w:pBdr>
+        <w:spacing w:after="40" w:before="360"/>
+      </w:pPr>
+      <w:r>
+        <w:rPr>
+          <w:rFonts w:ascii="Consolas" w:cs="Consolas" w:eastAsia="Consolas" w:hAnsi="Consolas"/>
+          <w:b/>
+          <w:bCs/>
+          <w:color w:val="9A3412"/>
+          <w:sz w:val="24"/>
+          <w:szCs w:val="24"/>
+        </w:rPr>
+        <w:t xml:space="preserve">MAPKEYS</w:t>
+      </w:r>
+    </w:p>
+    <w:p>
+      <w:pPr>
+        <w:keepNext/>
+        <w:spacing w:after="120"/>
+      </w:pPr>
+      <w:r>
+        <w:rPr>
+          <w:b/>
+          <w:bCs/>
+          <w:color w:val="6A6A6A"/>
+          <w:sz w:val="18"/>
+          <w:szCs w:val="18"/>
+        </w:rPr>
+        <w:t xml:space="preserve">Syntax:  </w:t>
+      </w:r>
+      <w:r>
+        <w:rPr>
+          <w:rFonts w:ascii="Consolas" w:cs="Consolas" w:eastAsia="Consolas" w:hAnsi="Consolas"/>
+          <w:color w:val="335577"/>
+          <w:sz w:val="19"/>
+          <w:szCs w:val="19"/>
+        </w:rPr>
+        <w:t xml:space="preserve">MAPKEYS(m)</w:t>
+      </w:r>
+    </w:p>
+    <w:p>
+      <w:pPr>
+        <w:spacing w:after="180" w:line="312" w:lineRule="auto"/>
+      </w:pPr>
+      <w:r>
+        <w:rPr>
+          <w:sz w:val="22"/>
+          <w:szCs w:val="22"/>
+        </w:rPr>
+        <w:t xml:space="preserve">Liefert alle Schlüssel als ARRAY OF STRING (gut zum Sortieren oder Durchlaufen).</w:t>
+      </w:r>
+    </w:p>
+    <w:p>
+      <w:pPr>
+        <w:keepNext/>
+        <w:spacing w:after="30" w:before="120"/>
+      </w:pPr>
+      <w:r>
+        <w:rPr>
+          <w:b/>
+          <w:bCs/>
+          <w:i/>
+          <w:iCs/>
+          <w:color w:val="6A6A6A"/>
+          <w:sz w:val="18"/>
+          <w:szCs w:val="18"/>
+        </w:rPr>
+        <w:t xml:space="preserve">Beispiel</w:t>
+      </w:r>
+    </w:p>
+    <w:p>
+      <w:pPr>
+        <w:keepLines/>
+        <w:pBdr>
+          <w:left w:val="single" w:color="1B6CA8" w:sz="18" w:space="6"/>
+        </w:pBdr>
+        <w:shd w:fill="F4F4F4" w:val="clear"/>
+        <w:spacing w:after="200" w:before="100" w:line="264" w:lineRule="auto"/>
+        <w:ind w:left="140"/>
+      </w:pPr>
+      <w:r>
+        <w:rPr>
+          <w:rFonts w:ascii="Consolas" w:cs="Consolas" w:eastAsia="Consolas" w:hAnsi="Consolas"/>
+          <w:sz w:val="19"/>
+          <w:szCs w:val="19"/>
+        </w:rPr>
+        <w:t xml:space="preserve">DIM m AS MAP OF INTEGER</w:t>
+      </w:r>
+      <w:r>
+        <w:rPr>
+          <w:rFonts w:ascii="Consolas" w:cs="Consolas" w:eastAsia="Consolas" w:hAnsi="Consolas"/>
+          <w:sz w:val="19"/>
+          <w:szCs w:val="19"/>
+        </w:rPr>
+        <w:br/>
+        <w:t xml:space="preserve">MAPPUT(m, "Holz", 5) : MAPPUT(m, "Stein", 3)</w:t>
+      </w:r>
+      <w:r>
+        <w:rPr>
+          <w:rFonts w:ascii="Consolas" w:cs="Consolas" w:eastAsia="Consolas" w:hAnsi="Consolas"/>
+          <w:sz w:val="19"/>
+          <w:szCs w:val="19"/>
+        </w:rPr>
+        <w:br/>
+        <w:t xml:space="preserve">DIM k AS ARRAY OF STRING</w:t>
+      </w:r>
+      <w:r>
+        <w:rPr>
+          <w:rFonts w:ascii="Consolas" w:cs="Consolas" w:eastAsia="Consolas" w:hAnsi="Consolas"/>
+          <w:sz w:val="19"/>
+          <w:szCs w:val="19"/>
+        </w:rPr>
+        <w:br/>
+        <w:t xml:space="preserve">k = MAPKEYS(m)</w:t>
+      </w:r>
+      <w:r>
+        <w:rPr>
+          <w:rFonts w:ascii="Consolas" w:cs="Consolas" w:eastAsia="Consolas" w:hAnsi="Consolas"/>
+          <w:sz w:val="19"/>
+          <w:szCs w:val="19"/>
+        </w:rPr>
+        <w:br/>
+        <w:t xml:space="preserve">PRINT k[0]; " "; k[1]</w:t>
+      </w:r>
+    </w:p>
+    <w:p>
+      <w:pPr>
+        <w:keepNext/>
+        <w:spacing w:after="30" w:before="120"/>
+      </w:pPr>
+      <w:r>
+        <w:rPr>
+          <w:b/>
+          <w:bCs/>
+          <w:i/>
+          <w:iCs/>
+          <w:color w:val="6A6A6A"/>
+          <w:sz w:val="18"/>
+          <w:szCs w:val="18"/>
+        </w:rPr>
+        <w:t xml:space="preserve">Ausgabe</w:t>
+      </w:r>
+    </w:p>
+    <w:p>
+      <w:pPr>
+        <w:keepLines/>
+        <w:pBdr>
+          <w:left w:val="single" w:color="9AC79A" w:sz="18" w:space="6"/>
+        </w:pBdr>
+        <w:shd w:fill="EAF4EA" w:val="clear"/>
+        <w:spacing w:after="200" w:before="100" w:line="264" w:lineRule="auto"/>
+        <w:ind w:left="140"/>
+      </w:pPr>
+      <w:r>
+        <w:rPr>
+          <w:rFonts w:ascii="Consolas" w:cs="Consolas" w:eastAsia="Consolas" w:hAnsi="Consolas"/>
+          <w:sz w:val="19"/>
+          <w:szCs w:val="19"/>
+        </w:rPr>
+        <w:t xml:space="preserve">Holz Stein</w:t>
+      </w:r>
+    </w:p>
+    <w:p>
+      <w:pPr>
+        <w:keepNext/>
+        <w:keepLines/>
+        <w:pBdr>
+          <w:bottom w:val="single" w:color="DDD0C0" w:sz="4" w:space="2"/>
+        </w:pBdr>
+        <w:spacing w:after="40" w:before="360"/>
+      </w:pPr>
+      <w:r>
+        <w:rPr>
+          <w:rFonts w:ascii="Consolas" w:cs="Consolas" w:eastAsia="Consolas" w:hAnsi="Consolas"/>
+          <w:b/>
+          <w:bCs/>
+          <w:color w:val="9A3412"/>
+          <w:sz w:val="24"/>
+          <w:szCs w:val="24"/>
+        </w:rPr>
+        <w:t xml:space="preserve">MAPVALUES</w:t>
+      </w:r>
+    </w:p>
+    <w:p>
+      <w:pPr>
+        <w:keepNext/>
+        <w:spacing w:after="120"/>
+      </w:pPr>
+      <w:r>
+        <w:rPr>
+          <w:b/>
+          <w:bCs/>
+          <w:color w:val="6A6A6A"/>
+          <w:sz w:val="18"/>
+          <w:szCs w:val="18"/>
+        </w:rPr>
+        <w:t xml:space="preserve">Syntax:  </w:t>
+      </w:r>
+      <w:r>
+        <w:rPr>
+          <w:rFonts w:ascii="Consolas" w:cs="Consolas" w:eastAsia="Consolas" w:hAnsi="Consolas"/>
+          <w:color w:val="335577"/>
+          <w:sz w:val="19"/>
+          <w:szCs w:val="19"/>
+        </w:rPr>
+        <w:t xml:space="preserve">MAPVALUES(m)</w:t>
+      </w:r>
+    </w:p>
+    <w:p>
+      <w:pPr>
+        <w:spacing w:after="180" w:line="312" w:lineRule="auto"/>
+      </w:pPr>
+      <w:r>
+        <w:rPr>
+          <w:sz w:val="22"/>
+          <w:szCs w:val="22"/>
+        </w:rPr>
+        <w:t xml:space="preserve">Liefert alle Werte als Array (in Einfüge-Reihenfolge).</w:t>
+      </w:r>
+    </w:p>
+    <w:p>
+      <w:pPr>
+        <w:keepNext/>
+        <w:spacing w:after="30" w:before="120"/>
+      </w:pPr>
+      <w:r>
+        <w:rPr>
+          <w:b/>
+          <w:bCs/>
+          <w:i/>
+          <w:iCs/>
+          <w:color w:val="6A6A6A"/>
+          <w:sz w:val="18"/>
+          <w:szCs w:val="18"/>
+        </w:rPr>
+        <w:t xml:space="preserve">Beispiel</w:t>
+      </w:r>
+    </w:p>
+    <w:p>
+      <w:pPr>
+        <w:keepLines/>
+        <w:pBdr>
+          <w:left w:val="single" w:color="1B6CA8" w:sz="18" w:space="6"/>
+        </w:pBdr>
+        <w:shd w:fill="F4F4F4" w:val="clear"/>
+        <w:spacing w:after="200" w:before="100" w:line="264" w:lineRule="auto"/>
+        <w:ind w:left="140"/>
+      </w:pPr>
+      <w:r>
+        <w:rPr>
+          <w:rFonts w:ascii="Consolas" w:cs="Consolas" w:eastAsia="Consolas" w:hAnsi="Consolas"/>
+          <w:sz w:val="19"/>
+          <w:szCs w:val="19"/>
+        </w:rPr>
+        <w:t xml:space="preserve">DIM m AS MAP OF INTEGER</w:t>
+      </w:r>
+      <w:r>
+        <w:rPr>
+          <w:rFonts w:ascii="Consolas" w:cs="Consolas" w:eastAsia="Consolas" w:hAnsi="Consolas"/>
+          <w:sz w:val="19"/>
+          <w:szCs w:val="19"/>
+        </w:rPr>
+        <w:br/>
+        <w:t xml:space="preserve">MAPPUT(m, "Holz", 5) : MAPPUT(m, "Stein", 3)</w:t>
+      </w:r>
+      <w:r>
+        <w:rPr>
+          <w:rFonts w:ascii="Consolas" w:cs="Consolas" w:eastAsia="Consolas" w:hAnsi="Consolas"/>
+          <w:sz w:val="19"/>
+          <w:szCs w:val="19"/>
+        </w:rPr>
+        <w:br/>
+        <w:t xml:space="preserve">DIM v AS ARRAY OF INTEGER</w:t>
+      </w:r>
+      <w:r>
+        <w:rPr>
+          <w:rFonts w:ascii="Consolas" w:cs="Consolas" w:eastAsia="Consolas" w:hAnsi="Consolas"/>
+          <w:sz w:val="19"/>
+          <w:szCs w:val="19"/>
+        </w:rPr>
+        <w:br/>
+        <w:t xml:space="preserve">v = MAPVALUES(m)</w:t>
+      </w:r>
+      <w:r>
+        <w:rPr>
+          <w:rFonts w:ascii="Consolas" w:cs="Consolas" w:eastAsia="Consolas" w:hAnsi="Consolas"/>
+          <w:sz w:val="19"/>
+          <w:szCs w:val="19"/>
+        </w:rPr>
+        <w:br/>
+        <w:t xml:space="preserve">PRINT v[0]; " "; v[1]</w:t>
+      </w:r>
+    </w:p>
+    <w:p>
+      <w:pPr>
+        <w:keepNext/>
+        <w:spacing w:after="30" w:before="120"/>
+      </w:pPr>
+      <w:r>
+        <w:rPr>
+          <w:b/>
+          <w:bCs/>
+          <w:i/>
+          <w:iCs/>
+          <w:color w:val="6A6A6A"/>
+          <w:sz w:val="18"/>
+          <w:szCs w:val="18"/>
+        </w:rPr>
+        <w:t xml:space="preserve">Ausgabe</w:t>
+      </w:r>
+    </w:p>
+    <w:p>
+      <w:pPr>
+        <w:keepLines/>
+        <w:pBdr>
+          <w:left w:val="single" w:color="9AC79A" w:sz="18" w:space="6"/>
+        </w:pBdr>
+        <w:shd w:fill="EAF4EA" w:val="clear"/>
+        <w:spacing w:after="200" w:before="100" w:line="264" w:lineRule="auto"/>
+        <w:ind w:left="140"/>
+      </w:pPr>
+      <w:r>
+        <w:rPr>
+          <w:rFonts w:ascii="Consolas" w:cs="Consolas" w:eastAsia="Consolas" w:hAnsi="Consolas"/>
+          <w:sz w:val="19"/>
+          <w:szCs w:val="19"/>
+        </w:rPr>
+        <w:t xml:space="preserve">5 3</w:t>
+      </w:r>
+    </w:p>
+    <w:p>
+      <w:pPr>
+        <w:keepNext/>
+        <w:keepLines/>
+        <w:pBdr>
+          <w:bottom w:val="single" w:color="DDD0C0" w:sz="4" w:space="2"/>
+        </w:pBdr>
+        <w:spacing w:after="40" w:before="360"/>
+      </w:pPr>
+      <w:r>
+        <w:rPr>
+          <w:rFonts w:ascii="Consolas" w:cs="Consolas" w:eastAsia="Consolas" w:hAnsi="Consolas"/>
+          <w:b/>
+          <w:bCs/>
+          <w:color w:val="9A3412"/>
+          <w:sz w:val="24"/>
+          <w:szCs w:val="24"/>
+        </w:rPr>
+        <w:t xml:space="preserve">MAPITEMS</w:t>
+      </w:r>
+    </w:p>
+    <w:p>
+      <w:pPr>
+        <w:keepNext/>
+        <w:spacing w:after="120"/>
+      </w:pPr>
+      <w:r>
+        <w:rPr>
+          <w:b/>
+          <w:bCs/>
+          <w:color w:val="6A6A6A"/>
+          <w:sz w:val="18"/>
+          <w:szCs w:val="18"/>
+        </w:rPr>
+        <w:t xml:space="preserve">Syntax:  </w:t>
+      </w:r>
+      <w:r>
+        <w:rPr>
+          <w:rFonts w:ascii="Consolas" w:cs="Consolas" w:eastAsia="Consolas" w:hAnsi="Consolas"/>
+          <w:color w:val="335577"/>
+          <w:sz w:val="19"/>
+          <w:szCs w:val="19"/>
+        </w:rPr>
+        <w:t xml:space="preserve">MAPITEMS(m)</w:t>
+      </w:r>
+    </w:p>
+    <w:p>
+      <w:pPr>
+        <w:spacing w:after="180" w:line="312" w:lineRule="auto"/>
+      </w:pPr>
+      <w:r>
+        <w:rPr>
+          <w:sz w:val="22"/>
+          <w:szCs w:val="22"/>
+        </w:rPr>
+        <w:t xml:space="preserve">Liefert alle Paare als Array von (Schlüssel, Wert)-Tupeln – ideal mit FOR EACH. In paar[0] steht der Schlüssel, in paar[1] der Wert.</w:t>
+      </w:r>
+    </w:p>
+    <w:p>
+      <w:pPr>
+        <w:keepNext/>
+        <w:spacing w:after="30" w:before="120"/>
+      </w:pPr>
+      <w:r>
+        <w:rPr>
+          <w:b/>
+          <w:bCs/>
+          <w:i/>
+          <w:iCs/>
+          <w:color w:val="6A6A6A"/>
+          <w:sz w:val="18"/>
+          <w:szCs w:val="18"/>
+        </w:rPr>
+        <w:t xml:space="preserve">Beispiel</w:t>
+      </w:r>
+    </w:p>
+    <w:p>
+      <w:pPr>
+        <w:keepLines/>
+        <w:pBdr>
+          <w:left w:val="single" w:color="1B6CA8" w:sz="18" w:space="6"/>
+        </w:pBdr>
+        <w:shd w:fill="F4F4F4" w:val="clear"/>
+        <w:spacing w:after="200" w:before="100" w:line="264" w:lineRule="auto"/>
+        <w:ind w:left="140"/>
+      </w:pPr>
+      <w:r>
+        <w:rPr>
+          <w:rFonts w:ascii="Consolas" w:cs="Consolas" w:eastAsia="Consolas" w:hAnsi="Consolas"/>
+          <w:sz w:val="19"/>
+          <w:szCs w:val="19"/>
+        </w:rPr>
+        <w:t xml:space="preserve">DIM m AS MAP OF INTEGER</w:t>
+      </w:r>
+      <w:r>
+        <w:rPr>
+          <w:rFonts w:ascii="Consolas" w:cs="Consolas" w:eastAsia="Consolas" w:hAnsi="Consolas"/>
+          <w:sz w:val="19"/>
+          <w:szCs w:val="19"/>
+        </w:rPr>
+        <w:br/>
+        <w:t xml:space="preserve">MAPPUT(m, "Holz", 5) : MAPPUT(m, "Stein", 3)</w:t>
+      </w:r>
+      <w:r>
+        <w:rPr>
+          <w:rFonts w:ascii="Consolas" w:cs="Consolas" w:eastAsia="Consolas" w:hAnsi="Consolas"/>
+          <w:sz w:val="19"/>
+          <w:szCs w:val="19"/>
+        </w:rPr>
+        <w:br/>
+        <w:t xml:space="preserve">FOR EACH paar IN MAPITEMS(m)</w:t>
+      </w:r>
+      <w:r>
+        <w:rPr>
+          <w:rFonts w:ascii="Consolas" w:cs="Consolas" w:eastAsia="Consolas" w:hAnsi="Consolas"/>
+          <w:sz w:val="19"/>
+          <w:szCs w:val="19"/>
+        </w:rPr>
+        <w:br/>
+        <w:t xml:space="preserve">    PRINT paar[0]; "="; paar[1]</w:t>
+      </w:r>
+      <w:r>
+        <w:rPr>
+          <w:rFonts w:ascii="Consolas" w:cs="Consolas" w:eastAsia="Consolas" w:hAnsi="Consolas"/>
+          <w:sz w:val="19"/>
+          <w:szCs w:val="19"/>
+        </w:rPr>
+        <w:br/>
+        <w:t xml:space="preserve">NEXT</w:t>
+      </w:r>
+    </w:p>
+    <w:p>
+      <w:pPr>
+        <w:keepNext/>
+        <w:spacing w:after="30" w:before="120"/>
+      </w:pPr>
+      <w:r>
+        <w:rPr>
+          <w:b/>
+          <w:bCs/>
+          <w:i/>
+          <w:iCs/>
+          <w:color w:val="6A6A6A"/>
+          <w:sz w:val="18"/>
+          <w:szCs w:val="18"/>
+        </w:rPr>
+        <w:t xml:space="preserve">Ausgabe</w:t>
+      </w:r>
+    </w:p>
+    <w:p>
+      <w:pPr>
+        <w:keepLines/>
+        <w:pBdr>
+          <w:left w:val="single" w:color="9AC79A" w:sz="18" w:space="6"/>
+        </w:pBdr>
+        <w:shd w:fill="EAF4EA" w:val="clear"/>
+        <w:spacing w:after="200" w:before="100" w:line="264" w:lineRule="auto"/>
+        <w:ind w:left="140"/>
+      </w:pPr>
+      <w:r>
+        <w:rPr>
+          <w:rFonts w:ascii="Consolas" w:cs="Consolas" w:eastAsia="Consolas" w:hAnsi="Consolas"/>
+          <w:sz w:val="19"/>
+          <w:szCs w:val="19"/>
+        </w:rPr>
+        <w:t xml:space="preserve">Holz=5</w:t>
+      </w:r>
+      <w:r>
+        <w:rPr>
+          <w:rFonts w:ascii="Consolas" w:cs="Consolas" w:eastAsia="Consolas" w:hAnsi="Consolas"/>
+          <w:sz w:val="19"/>
+          <w:szCs w:val="19"/>
+        </w:rPr>
+        <w:br/>
+        <w:t xml:space="preserve">Stein=3</w:t>
+      </w:r>
+    </w:p>
+    <w:p>
+      <w:pPr>
+        <w:spacing w:before="60"/>
+      </w:pPr>
+    </w:p>
+    <w:tbl>
+      <w:tblPr>
+        <w:tblW w:type="dxa" w:w="9360"/>
+        <w:tblBorders>
+          <w:top w:val="single" w:color="auto" w:sz="4"/>
+          <w:left w:val="single" w:color="auto" w:sz="4"/>
+          <w:bottom w:val="single" w:color="auto" w:sz="4"/>
+          <w:right w:val="single" w:color="auto" w:sz="4"/>
+          <w:insideH w:val="single" w:color="auto" w:sz="4"/>
+          <w:insideV w:val="single" w:color="auto" w:sz="4"/>
+        </w:tblBorders>
+      </w:tblPr>
+      <w:tblGrid>
+        <w:gridCol w:w="9360"/>
+      </w:tblGrid>
+      <w:tr>
+        <w:trPr>
+          <w:cantSplit/>
+        </w:trPr>
+        <w:tc>
+          <w:tcPr>
+            <w:tcW w:type="dxa" w:w="9360"/>
+            <w:tcBorders>
+              <w:top w:val="single" w:color="E0B96A" w:sz="6"/>
+              <w:left w:val="single" w:color="E0B96A" w:sz="6"/>
+              <w:bottom w:val="single" w:color="E0B96A" w:sz="6"/>
+              <w:right w:val="single" w:color="E0B96A" w:sz="6"/>
+            </w:tcBorders>
+            <w:shd w:fill="FDF3E0" w:val="clear"/>
+            <w:tcMar>
+              <w:top w:type="dxa" w:w="140"/>
+              <w:left w:type="dxa" w:w="180"/>
+              <w:bottom w:type="dxa" w:w="140"/>
+              <w:right w:type="dxa" w:w="180"/>
+            </w:tcMar>
+          </w:tcPr>
+          <w:p>
+            <w:pPr>
+              <w:spacing w:after="40"/>
+            </w:pPr>
+            <w:r>
+              <w:rPr>
+                <w:b/>
+                <w:bCs/>
+                <w:color w:val="9A6A1E"/>
+                <w:sz w:val="22"/>
+                <w:szCs w:val="22"/>
+              </w:rPr>
+              <w:t xml:space="preserve">Merke</w:t>
+            </w:r>
+          </w:p>
+          <w:p>
+            <w:pPr>
+              <w:spacing w:after="0" w:line="312" w:lineRule="auto"/>
+            </w:pPr>
+            <w:r>
+              <w:rPr>
+                <w:sz w:val="22"/>
+                <w:szCs w:val="22"/>
+              </w:rPr>
+              <w:t xml:space="preserve">Auch direkt über die Map läuft FOR EACH – die Schleifenvariable bekommt dann jeden SCHLÜSSEL, den Wert holst du mit MAPGET. Siehe Kapitel „Maps“.</w:t>
+            </w:r>
+          </w:p>
+        </w:tc>
+      </w:tr>
+    </w:tbl>
+    <w:p>
+      <w:pPr>
+        <w:spacing w:after="160"/>
+      </w:pPr>
+    </w:p>
+    <w:p>
+      <w:pPr>
+        <w:pStyle w:val="Heading2"/>
+        <w:keepNext/>
+        <w:keepLines/>
+        <w:spacing w:after="120" w:before="280"/>
+      </w:pPr>
+      <w:r>
+        <w:t xml:space="preserve">Punkt-Schreibweise (Methoden)</w:t>
+      </w:r>
+    </w:p>
+    <w:p>
+      <w:pPr>
+        <w:spacing w:after="180" w:line="312" w:lineRule="auto"/>
+      </w:pPr>
+      <w:r>
+        <w:rPr>
+          <w:sz w:val="22"/>
+          <w:szCs w:val="22"/>
+        </w:rPr>
+        <w:t xml:space="preserve">Dieselben Operationen gibt es als Methode an der Map – oft kürzer zu lesen:</w:t>
+      </w:r>
+    </w:p>
+    <w:p>
+      <w:pPr>
+        <w:keepLines/>
+        <w:pBdr>
+          <w:left w:val="single" w:color="1B6CA8" w:sz="18" w:space="6"/>
+        </w:pBdr>
+        <w:shd w:fill="F4F4F4" w:val="clear"/>
+        <w:spacing w:after="200" w:before="100" w:line="264" w:lineRule="auto"/>
+        <w:ind w:left="140"/>
+      </w:pPr>
+      <w:r>
+        <w:rPr>
+          <w:rFonts w:ascii="Consolas" w:cs="Consolas" w:eastAsia="Consolas" w:hAnsi="Consolas"/>
+          <w:sz w:val="19"/>
+          <w:szCs w:val="19"/>
+        </w:rPr>
+        <w:t xml:space="preserve">DIM lager AS MAP OF INTEGER</w:t>
+      </w:r>
+      <w:r>
+        <w:rPr>
+          <w:rFonts w:ascii="Consolas" w:cs="Consolas" w:eastAsia="Consolas" w:hAnsi="Consolas"/>
+          <w:sz w:val="19"/>
+          <w:szCs w:val="19"/>
+        </w:rPr>
+        <w:br/>
+        <w:t xml:space="preserve">lager.put("Holz", 5)</w:t>
+      </w:r>
+      <w:r>
+        <w:rPr>
+          <w:rFonts w:ascii="Consolas" w:cs="Consolas" w:eastAsia="Consolas" w:hAnsi="Consolas"/>
+          <w:sz w:val="19"/>
+          <w:szCs w:val="19"/>
+        </w:rPr>
+        <w:br/>
+        <w:t xml:space="preserve">PRINT lager.get("Holz")</w:t>
+      </w:r>
+      <w:r>
+        <w:rPr>
+          <w:rFonts w:ascii="Consolas" w:cs="Consolas" w:eastAsia="Consolas" w:hAnsi="Consolas"/>
+          <w:sz w:val="19"/>
+          <w:szCs w:val="19"/>
+        </w:rPr>
+        <w:br/>
+        <w:t xml:space="preserve">PRINT lager.has("Stein")</w:t>
+      </w:r>
+      <w:r>
+        <w:rPr>
+          <w:rFonts w:ascii="Consolas" w:cs="Consolas" w:eastAsia="Consolas" w:hAnsi="Consolas"/>
+          <w:sz w:val="19"/>
+          <w:szCs w:val="19"/>
+        </w:rPr>
+        <w:br/>
+        <w:t xml:space="preserve">PRINT lager.getor("Gold", 0)</w:t>
+      </w:r>
+      <w:r>
+        <w:rPr>
+          <w:rFonts w:ascii="Consolas" w:cs="Consolas" w:eastAsia="Consolas" w:hAnsi="Consolas"/>
+          <w:sz w:val="19"/>
+          <w:szCs w:val="19"/>
+        </w:rPr>
+        <w:br/>
+        <w:t xml:space="preserve">PRINT lager.size()</w:t>
+      </w:r>
+    </w:p>
+    <w:p>
+      <w:pPr>
+        <w:keepLines/>
+        <w:pBdr>
+          <w:left w:val="single" w:color="9AC79A" w:sz="18" w:space="6"/>
+        </w:pBdr>
+        <w:shd w:fill="EAF4EA" w:val="clear"/>
+        <w:spacing w:after="200" w:before="100" w:line="264" w:lineRule="auto"/>
+        <w:ind w:left="140"/>
+      </w:pPr>
+      <w:r>
+        <w:rPr>
+          <w:rFonts w:ascii="Consolas" w:cs="Consolas" w:eastAsia="Consolas" w:hAnsi="Consolas"/>
+          <w:sz w:val="19"/>
+          <w:szCs w:val="19"/>
+        </w:rPr>
+        <w:t xml:space="preserve">5</w:t>
+      </w:r>
+      <w:r>
+        <w:rPr>
+          <w:rFonts w:ascii="Consolas" w:cs="Consolas" w:eastAsia="Consolas" w:hAnsi="Consolas"/>
+          <w:sz w:val="19"/>
+          <w:szCs w:val="19"/>
+        </w:rPr>
+        <w:br/>
+        <w:t xml:space="preserve">FALSE</w:t>
+      </w:r>
+      <w:r>
+        <w:rPr>
+          <w:rFonts w:ascii="Consolas" w:cs="Consolas" w:eastAsia="Consolas" w:hAnsi="Consolas"/>
+          <w:sz w:val="19"/>
+          <w:szCs w:val="19"/>
+        </w:rPr>
+        <w:br/>
+        <w:t xml:space="preserve">0</w:t>
+      </w:r>
+      <w:r>
+        <w:rPr>
+          <w:rFonts w:ascii="Consolas" w:cs="Consolas" w:eastAsia="Consolas" w:hAnsi="Consolas"/>
+          <w:sz w:val="19"/>
+          <w:szCs w:val="19"/>
+        </w:rPr>
+        <w:br/>
+        <w:t xml:space="preserve">1</w:t>
+      </w:r>
     </w:p>
     <w:sectPr>
       <w:footerReference w:type="default" r:id="rId7"/>

</xml_diff>

<commit_message>
docs(buch): Lehrbuch Kap 37 -- Zeit & Datum (Referenz, Beispiel pro Befehl)
MILLIS (Dauer messen), SLEEP (Pause, im Spiel meiden), TIME$ "HH:MM:SS",
DATE$ "YYYY-MM-DD", Zeitstempel-Muster. Nicht-deterministische Werte als
Kommentar statt Ausgabe-Kasten; DELTA-Hinweis (Teil IV). Gegen gbrt verifiziert.

Co-Authored-By: Claude Opus 4.8 (1M context) <noreply@anthropic.com>
</commit_message>
<xml_diff>
--- a/buch-referenz/buch/GameBasic-Lehrbuch.docx
+++ b/buch-referenz/buch/GameBasic-Lehrbuch.docx
@@ -921,6 +921,33 @@
           <w:szCs w:val="22"/>
         </w:rPr>
         <w:t xml:space="preserve">	113</w:t>
+      </w:r>
+    </w:p>
+    <w:p>
+      <w:pPr>
+        <w:tabs>
+          <w:tab w:val="right" w:pos="9200" w:leader="dot"/>
+        </w:tabs>
+        <w:spacing w:after="20" w:before="0"/>
+        <w:ind w:left="280"/>
+      </w:pPr>
+      <w:r>
+        <w:rPr>
+          <w:b w:val="false"/>
+          <w:bCs w:val="false"/>
+          <w:color w:val="222222"/>
+          <w:sz w:val="22"/>
+          <w:szCs w:val="22"/>
+        </w:rPr>
+        <w:t xml:space="preserve">Zeit &amp; Datum</w:t>
+      </w:r>
+      <w:r>
+        <w:rPr>
+          <w:color w:val="555555"/>
+          <w:sz w:val="22"/>
+          <w:szCs w:val="22"/>
+        </w:rPr>
+        <w:t xml:space="preserve">	117</w:t>
       </w:r>
     </w:p>
     <w:p>
@@ -39805,6 +39832,737 @@
         <w:br/>
         <w:t xml:space="preserve">1</w:t>
       </w:r>
+    </w:p>
+    <w:p>
+      <w:pPr>
+        <w:pStyle w:val="Heading1"/>
+        <w:keepNext/>
+        <w:keepLines/>
+        <w:pageBreakBefore/>
+        <w:pBdr>
+          <w:bottom w:val="single" w:color="1B6CA8" w:sz="12" w:space="4"/>
+        </w:pBdr>
+        <w:spacing w:after="160" w:before="0"/>
+      </w:pPr>
+      <w:r>
+        <w:t xml:space="preserve">Zeit &amp; Datum</w:t>
+      </w:r>
+    </w:p>
+    <w:p>
+      <w:pPr>
+        <w:spacing w:after="180" w:line="312" w:lineRule="auto"/>
+      </w:pPr>
+      <w:r>
+        <w:rPr>
+          <w:sz w:val="22"/>
+          <w:szCs w:val="22"/>
+        </w:rPr>
+        <w:t xml:space="preserve">Diese Befehle liefern die aktuelle Uhrzeit, das Datum und die seit Programmstart vergangene Zeit – nützlich für Zeitmessungen, Cooldowns oder einen Zeitstempel im Speicherstand. Weil die Werte vom Zeitpunkt der Ausführung abhängen, zeigen die Beispiele statt einer festen Ausgabe einen repräsentativen Wert als Kommentar.</w:t>
+      </w:r>
+    </w:p>
+    <w:p>
+      <w:pPr>
+        <w:pStyle w:val="Heading2"/>
+        <w:keepNext/>
+        <w:keepLines/>
+        <w:spacing w:after="120" w:before="280"/>
+      </w:pPr>
+      <w:r>
+        <w:t xml:space="preserve">Vergangene Zeit messen</w:t>
+      </w:r>
+    </w:p>
+    <w:p>
+      <w:pPr>
+        <w:keepNext/>
+        <w:keepLines/>
+        <w:pBdr>
+          <w:bottom w:val="single" w:color="DDD0C0" w:sz="4" w:space="2"/>
+        </w:pBdr>
+        <w:spacing w:after="40" w:before="360"/>
+      </w:pPr>
+      <w:r>
+        <w:rPr>
+          <w:rFonts w:ascii="Consolas" w:cs="Consolas" w:eastAsia="Consolas" w:hAnsi="Consolas"/>
+          <w:b/>
+          <w:bCs/>
+          <w:color w:val="9A3412"/>
+          <w:sz w:val="24"/>
+          <w:szCs w:val="24"/>
+        </w:rPr>
+        <w:t xml:space="preserve">MILLIS</w:t>
+      </w:r>
+    </w:p>
+    <w:p>
+      <w:pPr>
+        <w:keepNext/>
+        <w:spacing w:after="120"/>
+      </w:pPr>
+      <w:r>
+        <w:rPr>
+          <w:b/>
+          <w:bCs/>
+          <w:color w:val="6A6A6A"/>
+          <w:sz w:val="18"/>
+          <w:szCs w:val="18"/>
+        </w:rPr>
+        <w:t xml:space="preserve">Syntax:  </w:t>
+      </w:r>
+      <w:r>
+        <w:rPr>
+          <w:rFonts w:ascii="Consolas" w:cs="Consolas" w:eastAsia="Consolas" w:hAnsi="Consolas"/>
+          <w:color w:val="335577"/>
+          <w:sz w:val="19"/>
+          <w:szCs w:val="19"/>
+        </w:rPr>
+        <w:t xml:space="preserve">MILLIS()</w:t>
+      </w:r>
+    </w:p>
+    <w:p>
+      <w:pPr>
+        <w:spacing w:after="180" w:line="312" w:lineRule="auto"/>
+      </w:pPr>
+      <w:r>
+        <w:rPr>
+          <w:sz w:val="22"/>
+          <w:szCs w:val="22"/>
+        </w:rPr>
+        <w:t xml:space="preserve">Liefert die Anzahl der Millisekunden seit dem Programmstart (1000 ms = 1 Sekunde). Die absolute Zahl ist selten interessant – wertvoll ist die Differenz zweier MILLIS-Werte, um eine Dauer zu messen.</w:t>
+      </w:r>
+    </w:p>
+    <w:p>
+      <w:pPr>
+        <w:keepNext/>
+        <w:spacing w:after="30" w:before="120"/>
+      </w:pPr>
+      <w:r>
+        <w:rPr>
+          <w:b/>
+          <w:bCs/>
+          <w:i/>
+          <w:iCs/>
+          <w:color w:val="6A6A6A"/>
+          <w:sz w:val="18"/>
+          <w:szCs w:val="18"/>
+        </w:rPr>
+        <w:t xml:space="preserve">Beispiel</w:t>
+      </w:r>
+    </w:p>
+    <w:p>
+      <w:pPr>
+        <w:keepLines/>
+        <w:pBdr>
+          <w:left w:val="single" w:color="1B6CA8" w:sz="18" w:space="6"/>
+        </w:pBdr>
+        <w:shd w:fill="F4F4F4" w:val="clear"/>
+        <w:spacing w:after="200" w:before="100" w:line="264" w:lineRule="auto"/>
+        <w:ind w:left="140"/>
+      </w:pPr>
+      <w:r>
+        <w:rPr>
+          <w:rFonts w:ascii="Consolas" w:cs="Consolas" w:eastAsia="Consolas" w:hAnsi="Consolas"/>
+          <w:sz w:val="19"/>
+          <w:szCs w:val="19"/>
+        </w:rPr>
+        <w:t xml:space="preserve">DIM start AS INTEGER</w:t>
+      </w:r>
+      <w:r>
+        <w:rPr>
+          <w:rFonts w:ascii="Consolas" w:cs="Consolas" w:eastAsia="Consolas" w:hAnsi="Consolas"/>
+          <w:sz w:val="19"/>
+          <w:szCs w:val="19"/>
+        </w:rPr>
+        <w:br/>
+        <w:t xml:space="preserve">start = MILLIS()</w:t>
+      </w:r>
+      <w:r>
+        <w:rPr>
+          <w:rFonts w:ascii="Consolas" w:cs="Consolas" w:eastAsia="Consolas" w:hAnsi="Consolas"/>
+          <w:sz w:val="19"/>
+          <w:szCs w:val="19"/>
+        </w:rPr>
+        <w:br/>
+        <w:t xml:space="preserve">' ... etwas tun ...</w:t>
+      </w:r>
+      <w:r>
+        <w:rPr>
+          <w:rFonts w:ascii="Consolas" w:cs="Consolas" w:eastAsia="Consolas" w:hAnsi="Consolas"/>
+          <w:sz w:val="19"/>
+          <w:szCs w:val="19"/>
+        </w:rPr>
+        <w:br/>
+        <w:t xml:space="preserve">DIM dauer AS INTEGER</w:t>
+      </w:r>
+      <w:r>
+        <w:rPr>
+          <w:rFonts w:ascii="Consolas" w:cs="Consolas" w:eastAsia="Consolas" w:hAnsi="Consolas"/>
+          <w:sz w:val="19"/>
+          <w:szCs w:val="19"/>
+        </w:rPr>
+        <w:br/>
+        <w:t xml:space="preserve">dauer = MILLIS() - start</w:t>
+      </w:r>
+      <w:r>
+        <w:rPr>
+          <w:rFonts w:ascii="Consolas" w:cs="Consolas" w:eastAsia="Consolas" w:hAnsi="Consolas"/>
+          <w:sz w:val="19"/>
+          <w:szCs w:val="19"/>
+        </w:rPr>
+        <w:br/>
+        <w:t xml:space="preserve">PRINT "Das dauerte "; dauer; " ms"</w:t>
+      </w:r>
+    </w:p>
+    <w:p>
+      <w:pPr>
+        <w:spacing w:before="60"/>
+      </w:pPr>
+    </w:p>
+    <w:tbl>
+      <w:tblPr>
+        <w:tblW w:type="dxa" w:w="9360"/>
+        <w:tblBorders>
+          <w:top w:val="single" w:color="auto" w:sz="4"/>
+          <w:left w:val="single" w:color="auto" w:sz="4"/>
+          <w:bottom w:val="single" w:color="auto" w:sz="4"/>
+          <w:right w:val="single" w:color="auto" w:sz="4"/>
+          <w:insideH w:val="single" w:color="auto" w:sz="4"/>
+          <w:insideV w:val="single" w:color="auto" w:sz="4"/>
+        </w:tblBorders>
+      </w:tblPr>
+      <w:tblGrid>
+        <w:gridCol w:w="9360"/>
+      </w:tblGrid>
+      <w:tr>
+        <w:trPr>
+          <w:cantSplit/>
+        </w:trPr>
+        <w:tc>
+          <w:tcPr>
+            <w:tcW w:type="dxa" w:w="9360"/>
+            <w:tcBorders>
+              <w:top w:val="single" w:color="E0B96A" w:sz="6"/>
+              <w:left w:val="single" w:color="E0B96A" w:sz="6"/>
+              <w:bottom w:val="single" w:color="E0B96A" w:sz="6"/>
+              <w:right w:val="single" w:color="E0B96A" w:sz="6"/>
+            </w:tcBorders>
+            <w:shd w:fill="FDF3E0" w:val="clear"/>
+            <w:tcMar>
+              <w:top w:type="dxa" w:w="140"/>
+              <w:left w:type="dxa" w:w="180"/>
+              <w:bottom w:type="dxa" w:w="140"/>
+              <w:right w:type="dxa" w:w="180"/>
+            </w:tcMar>
+          </w:tcPr>
+          <w:p>
+            <w:pPr>
+              <w:spacing w:after="40"/>
+            </w:pPr>
+            <w:r>
+              <w:rPr>
+                <w:b/>
+                <w:bCs/>
+                <w:color w:val="9A6A1E"/>
+                <w:sz w:val="22"/>
+                <w:szCs w:val="22"/>
+              </w:rPr>
+              <w:t xml:space="preserve">Merke</w:t>
+            </w:r>
+          </w:p>
+          <w:p>
+            <w:pPr>
+              <w:spacing w:after="0" w:line="312" w:lineRule="auto"/>
+            </w:pPr>
+            <w:r>
+              <w:rPr>
+                <w:sz w:val="22"/>
+                <w:szCs w:val="22"/>
+              </w:rPr>
+              <w:t xml:space="preserve">MILLIS eignet sich gut für eigene Zeitschranken („alle 500 ms etwas tun“). Für gezielte Aktionen nach Ablauf einer Zeit gibt es außerdem das timer-Modul mit COOLDOWN (Teil V).</w:t>
+            </w:r>
+          </w:p>
+        </w:tc>
+      </w:tr>
+    </w:tbl>
+    <w:p>
+      <w:pPr>
+        <w:spacing w:after="160"/>
+      </w:pPr>
+    </w:p>
+    <w:p>
+      <w:pPr>
+        <w:pStyle w:val="Heading2"/>
+        <w:keepNext/>
+        <w:keepLines/>
+        <w:spacing w:after="120" w:before="280"/>
+      </w:pPr>
+      <w:r>
+        <w:t xml:space="preserve">Eine Pause einlegen</w:t>
+      </w:r>
+    </w:p>
+    <w:p>
+      <w:pPr>
+        <w:keepNext/>
+        <w:keepLines/>
+        <w:pBdr>
+          <w:bottom w:val="single" w:color="DDD0C0" w:sz="4" w:space="2"/>
+        </w:pBdr>
+        <w:spacing w:after="40" w:before="360"/>
+      </w:pPr>
+      <w:r>
+        <w:rPr>
+          <w:rFonts w:ascii="Consolas" w:cs="Consolas" w:eastAsia="Consolas" w:hAnsi="Consolas"/>
+          <w:b/>
+          <w:bCs/>
+          <w:color w:val="9A3412"/>
+          <w:sz w:val="24"/>
+          <w:szCs w:val="24"/>
+        </w:rPr>
+        <w:t xml:space="preserve">SLEEP</w:t>
+      </w:r>
+    </w:p>
+    <w:p>
+      <w:pPr>
+        <w:keepNext/>
+        <w:spacing w:after="120"/>
+      </w:pPr>
+      <w:r>
+        <w:rPr>
+          <w:b/>
+          <w:bCs/>
+          <w:color w:val="6A6A6A"/>
+          <w:sz w:val="18"/>
+          <w:szCs w:val="18"/>
+        </w:rPr>
+        <w:t xml:space="preserve">Syntax:  </w:t>
+      </w:r>
+      <w:r>
+        <w:rPr>
+          <w:rFonts w:ascii="Consolas" w:cs="Consolas" w:eastAsia="Consolas" w:hAnsi="Consolas"/>
+          <w:color w:val="335577"/>
+          <w:sz w:val="19"/>
+          <w:szCs w:val="19"/>
+        </w:rPr>
+        <w:t xml:space="preserve">SLEEP(millisekunden)</w:t>
+      </w:r>
+    </w:p>
+    <w:p>
+      <w:pPr>
+        <w:spacing w:after="180" w:line="312" w:lineRule="auto"/>
+      </w:pPr>
+      <w:r>
+        <w:rPr>
+          <w:sz w:val="22"/>
+          <w:szCs w:val="22"/>
+        </w:rPr>
+        <w:t xml:space="preserve">Hält das Programm für die angegebene Zeit an. In einem Grafik-Spiel mit laufendem Bild solltest du SLEEP meiden (es friert das Fenster ein) – dort steuerst du Tempo über die Bildrate. Für Konsolen-Programme ist es aber praktisch.</w:t>
+      </w:r>
+    </w:p>
+    <w:p>
+      <w:pPr>
+        <w:keepNext/>
+        <w:spacing w:after="30" w:before="120"/>
+      </w:pPr>
+      <w:r>
+        <w:rPr>
+          <w:b/>
+          <w:bCs/>
+          <w:i/>
+          <w:iCs/>
+          <w:color w:val="6A6A6A"/>
+          <w:sz w:val="18"/>
+          <w:szCs w:val="18"/>
+        </w:rPr>
+        <w:t xml:space="preserve">Beispiel</w:t>
+      </w:r>
+    </w:p>
+    <w:p>
+      <w:pPr>
+        <w:keepLines/>
+        <w:pBdr>
+          <w:left w:val="single" w:color="1B6CA8" w:sz="18" w:space="6"/>
+        </w:pBdr>
+        <w:shd w:fill="F4F4F4" w:val="clear"/>
+        <w:spacing w:after="200" w:before="100" w:line="264" w:lineRule="auto"/>
+        <w:ind w:left="140"/>
+      </w:pPr>
+      <w:r>
+        <w:rPr>
+          <w:rFonts w:ascii="Consolas" w:cs="Consolas" w:eastAsia="Consolas" w:hAnsi="Consolas"/>
+          <w:sz w:val="19"/>
+          <w:szCs w:val="19"/>
+        </w:rPr>
+        <w:t xml:space="preserve">PRINT "Start"</w:t>
+      </w:r>
+      <w:r>
+        <w:rPr>
+          <w:rFonts w:ascii="Consolas" w:cs="Consolas" w:eastAsia="Consolas" w:hAnsi="Consolas"/>
+          <w:sz w:val="19"/>
+          <w:szCs w:val="19"/>
+        </w:rPr>
+        <w:br/>
+        <w:t xml:space="preserve">SLEEP(1000)        ' eine Sekunde warten</w:t>
+      </w:r>
+      <w:r>
+        <w:rPr>
+          <w:rFonts w:ascii="Consolas" w:cs="Consolas" w:eastAsia="Consolas" w:hAnsi="Consolas"/>
+          <w:sz w:val="19"/>
+          <w:szCs w:val="19"/>
+        </w:rPr>
+        <w:br/>
+        <w:t xml:space="preserve">PRINT "... eine Sekunde später"</w:t>
+      </w:r>
+    </w:p>
+    <w:p>
+      <w:pPr>
+        <w:pStyle w:val="Heading2"/>
+        <w:keepNext/>
+        <w:keepLines/>
+        <w:spacing w:after="120" w:before="280"/>
+      </w:pPr>
+      <w:r>
+        <w:t xml:space="preserve">Uhrzeit &amp; Datum</w:t>
+      </w:r>
+    </w:p>
+    <w:p>
+      <w:pPr>
+        <w:keepNext/>
+        <w:keepLines/>
+        <w:pBdr>
+          <w:bottom w:val="single" w:color="DDD0C0" w:sz="4" w:space="2"/>
+        </w:pBdr>
+        <w:spacing w:after="40" w:before="360"/>
+      </w:pPr>
+      <w:r>
+        <w:rPr>
+          <w:rFonts w:ascii="Consolas" w:cs="Consolas" w:eastAsia="Consolas" w:hAnsi="Consolas"/>
+          <w:b/>
+          <w:bCs/>
+          <w:color w:val="9A3412"/>
+          <w:sz w:val="24"/>
+          <w:szCs w:val="24"/>
+        </w:rPr>
+        <w:t xml:space="preserve">TIME$</w:t>
+      </w:r>
+    </w:p>
+    <w:p>
+      <w:pPr>
+        <w:keepNext/>
+        <w:spacing w:after="120"/>
+      </w:pPr>
+      <w:r>
+        <w:rPr>
+          <w:b/>
+          <w:bCs/>
+          <w:color w:val="6A6A6A"/>
+          <w:sz w:val="18"/>
+          <w:szCs w:val="18"/>
+        </w:rPr>
+        <w:t xml:space="preserve">Syntax:  </w:t>
+      </w:r>
+      <w:r>
+        <w:rPr>
+          <w:rFonts w:ascii="Consolas" w:cs="Consolas" w:eastAsia="Consolas" w:hAnsi="Consolas"/>
+          <w:color w:val="335577"/>
+          <w:sz w:val="19"/>
+          <w:szCs w:val="19"/>
+        </w:rPr>
+        <w:t xml:space="preserve">TIME$()</w:t>
+      </w:r>
+    </w:p>
+    <w:p>
+      <w:pPr>
+        <w:spacing w:after="180" w:line="312" w:lineRule="auto"/>
+      </w:pPr>
+      <w:r>
+        <w:rPr>
+          <w:sz w:val="22"/>
+          <w:szCs w:val="22"/>
+        </w:rPr>
+        <w:t xml:space="preserve">Liefert die aktuelle Uhrzeit als String im Format "HH:MM:SS" (Stunden:Minuten:Sekunden).</w:t>
+      </w:r>
+    </w:p>
+    <w:p>
+      <w:pPr>
+        <w:keepNext/>
+        <w:spacing w:after="30" w:before="120"/>
+      </w:pPr>
+      <w:r>
+        <w:rPr>
+          <w:b/>
+          <w:bCs/>
+          <w:i/>
+          <w:iCs/>
+          <w:color w:val="6A6A6A"/>
+          <w:sz w:val="18"/>
+          <w:szCs w:val="18"/>
+        </w:rPr>
+        <w:t xml:space="preserve">Beispiel</w:t>
+      </w:r>
+    </w:p>
+    <w:p>
+      <w:pPr>
+        <w:keepLines/>
+        <w:pBdr>
+          <w:left w:val="single" w:color="1B6CA8" w:sz="18" w:space="6"/>
+        </w:pBdr>
+        <w:shd w:fill="F4F4F4" w:val="clear"/>
+        <w:spacing w:after="200" w:before="100" w:line="264" w:lineRule="auto"/>
+        <w:ind w:left="140"/>
+      </w:pPr>
+      <w:r>
+        <w:rPr>
+          <w:rFonts w:ascii="Consolas" w:cs="Consolas" w:eastAsia="Consolas" w:hAnsi="Consolas"/>
+          <w:sz w:val="19"/>
+          <w:szCs w:val="19"/>
+        </w:rPr>
+        <w:t xml:space="preserve">PRINT "Es ist jetzt "; TIME$()</w:t>
+      </w:r>
+      <w:r>
+        <w:rPr>
+          <w:rFonts w:ascii="Consolas" w:cs="Consolas" w:eastAsia="Consolas" w:hAnsi="Consolas"/>
+          <w:sz w:val="19"/>
+          <w:szCs w:val="19"/>
+        </w:rPr>
+        <w:br/>
+        <w:t xml:space="preserve">' z. B.:  Es ist jetzt 14:30:05</w:t>
+      </w:r>
+    </w:p>
+    <w:p>
+      <w:pPr>
+        <w:keepNext/>
+        <w:keepLines/>
+        <w:pBdr>
+          <w:bottom w:val="single" w:color="DDD0C0" w:sz="4" w:space="2"/>
+        </w:pBdr>
+        <w:spacing w:after="40" w:before="360"/>
+      </w:pPr>
+      <w:r>
+        <w:rPr>
+          <w:rFonts w:ascii="Consolas" w:cs="Consolas" w:eastAsia="Consolas" w:hAnsi="Consolas"/>
+          <w:b/>
+          <w:bCs/>
+          <w:color w:val="9A3412"/>
+          <w:sz w:val="24"/>
+          <w:szCs w:val="24"/>
+        </w:rPr>
+        <w:t xml:space="preserve">DATE$</w:t>
+      </w:r>
+    </w:p>
+    <w:p>
+      <w:pPr>
+        <w:keepNext/>
+        <w:spacing w:after="120"/>
+      </w:pPr>
+      <w:r>
+        <w:rPr>
+          <w:b/>
+          <w:bCs/>
+          <w:color w:val="6A6A6A"/>
+          <w:sz w:val="18"/>
+          <w:szCs w:val="18"/>
+        </w:rPr>
+        <w:t xml:space="preserve">Syntax:  </w:t>
+      </w:r>
+      <w:r>
+        <w:rPr>
+          <w:rFonts w:ascii="Consolas" w:cs="Consolas" w:eastAsia="Consolas" w:hAnsi="Consolas"/>
+          <w:color w:val="335577"/>
+          <w:sz w:val="19"/>
+          <w:szCs w:val="19"/>
+        </w:rPr>
+        <w:t xml:space="preserve">DATE$()</w:t>
+      </w:r>
+    </w:p>
+    <w:p>
+      <w:pPr>
+        <w:spacing w:after="180" w:line="312" w:lineRule="auto"/>
+      </w:pPr>
+      <w:r>
+        <w:rPr>
+          <w:sz w:val="22"/>
+          <w:szCs w:val="22"/>
+        </w:rPr>
+        <w:t xml:space="preserve">Liefert das aktuelle Datum als String im Format "YYYY-MM-DD" (Jahr-Monat-Tag).</w:t>
+      </w:r>
+    </w:p>
+    <w:p>
+      <w:pPr>
+        <w:keepNext/>
+        <w:spacing w:after="30" w:before="120"/>
+      </w:pPr>
+      <w:r>
+        <w:rPr>
+          <w:b/>
+          <w:bCs/>
+          <w:i/>
+          <w:iCs/>
+          <w:color w:val="6A6A6A"/>
+          <w:sz w:val="18"/>
+          <w:szCs w:val="18"/>
+        </w:rPr>
+        <w:t xml:space="preserve">Beispiel</w:t>
+      </w:r>
+    </w:p>
+    <w:p>
+      <w:pPr>
+        <w:keepLines/>
+        <w:pBdr>
+          <w:left w:val="single" w:color="1B6CA8" w:sz="18" w:space="6"/>
+        </w:pBdr>
+        <w:shd w:fill="F4F4F4" w:val="clear"/>
+        <w:spacing w:after="200" w:before="100" w:line="264" w:lineRule="auto"/>
+        <w:ind w:left="140"/>
+      </w:pPr>
+      <w:r>
+        <w:rPr>
+          <w:rFonts w:ascii="Consolas" w:cs="Consolas" w:eastAsia="Consolas" w:hAnsi="Consolas"/>
+          <w:sz w:val="19"/>
+          <w:szCs w:val="19"/>
+        </w:rPr>
+        <w:t xml:space="preserve">PRINT "Heute ist der "; DATE$()</w:t>
+      </w:r>
+      <w:r>
+        <w:rPr>
+          <w:rFonts w:ascii="Consolas" w:cs="Consolas" w:eastAsia="Consolas" w:hAnsi="Consolas"/>
+          <w:sz w:val="19"/>
+          <w:szCs w:val="19"/>
+        </w:rPr>
+        <w:br/>
+        <w:t xml:space="preserve">' z. B.:  Heute ist der 2026-06-13</w:t>
+      </w:r>
+    </w:p>
+    <w:p>
+      <w:pPr>
+        <w:spacing w:after="180" w:line="312" w:lineRule="auto"/>
+      </w:pPr>
+      <w:r>
+        <w:rPr>
+          <w:sz w:val="22"/>
+          <w:szCs w:val="22"/>
+        </w:rPr>
+        <w:t xml:space="preserve">Beide eignen sich gut für einen Zeitstempel – etwa um festzuhalten, wann ein Spielstand gespeichert wurde:</w:t>
+      </w:r>
+    </w:p>
+    <w:p>
+      <w:pPr>
+        <w:keepLines/>
+        <w:pBdr>
+          <w:left w:val="single" w:color="1B6CA8" w:sz="18" w:space="6"/>
+        </w:pBdr>
+        <w:shd w:fill="F4F4F4" w:val="clear"/>
+        <w:spacing w:after="200" w:before="100" w:line="264" w:lineRule="auto"/>
+        <w:ind w:left="140"/>
+      </w:pPr>
+      <w:r>
+        <w:rPr>
+          <w:rFonts w:ascii="Consolas" w:cs="Consolas" w:eastAsia="Consolas" w:hAnsi="Consolas"/>
+          <w:sz w:val="19"/>
+          <w:szCs w:val="19"/>
+        </w:rPr>
+        <w:t xml:space="preserve">DIM stempel AS STRING</w:t>
+      </w:r>
+      <w:r>
+        <w:rPr>
+          <w:rFonts w:ascii="Consolas" w:cs="Consolas" w:eastAsia="Consolas" w:hAnsi="Consolas"/>
+          <w:sz w:val="19"/>
+          <w:szCs w:val="19"/>
+        </w:rPr>
+        <w:br/>
+        <w:t xml:space="preserve">stempel = DATE$() + " " + TIME$()</w:t>
+      </w:r>
+      <w:r>
+        <w:rPr>
+          <w:rFonts w:ascii="Consolas" w:cs="Consolas" w:eastAsia="Consolas" w:hAnsi="Consolas"/>
+          <w:sz w:val="19"/>
+          <w:szCs w:val="19"/>
+        </w:rPr>
+        <w:br/>
+        <w:t xml:space="preserve">PRINT "Gespeichert am: " + stempel</w:t>
+      </w:r>
+      <w:r>
+        <w:rPr>
+          <w:rFonts w:ascii="Consolas" w:cs="Consolas" w:eastAsia="Consolas" w:hAnsi="Consolas"/>
+          <w:sz w:val="19"/>
+          <w:szCs w:val="19"/>
+        </w:rPr>
+        <w:br/>
+        <w:t xml:space="preserve">' z. B.:  Gespeichert am: 2026-06-13 14:30:05</w:t>
+      </w:r>
+    </w:p>
+    <w:p>
+      <w:pPr>
+        <w:spacing w:before="60"/>
+      </w:pPr>
+    </w:p>
+    <w:tbl>
+      <w:tblPr>
+        <w:tblW w:type="dxa" w:w="9360"/>
+        <w:tblBorders>
+          <w:top w:val="single" w:color="auto" w:sz="4"/>
+          <w:left w:val="single" w:color="auto" w:sz="4"/>
+          <w:bottom w:val="single" w:color="auto" w:sz="4"/>
+          <w:right w:val="single" w:color="auto" w:sz="4"/>
+          <w:insideH w:val="single" w:color="auto" w:sz="4"/>
+          <w:insideV w:val="single" w:color="auto" w:sz="4"/>
+        </w:tblBorders>
+      </w:tblPr>
+      <w:tblGrid>
+        <w:gridCol w:w="9360"/>
+      </w:tblGrid>
+      <w:tr>
+        <w:trPr>
+          <w:cantSplit/>
+        </w:trPr>
+        <w:tc>
+          <w:tcPr>
+            <w:tcW w:type="dxa" w:w="9360"/>
+            <w:tcBorders>
+              <w:top w:val="single" w:color="9CC8E6" w:sz="6"/>
+              <w:left w:val="single" w:color="9CC8E6" w:sz="6"/>
+              <w:bottom w:val="single" w:color="9CC8E6" w:sz="6"/>
+              <w:right w:val="single" w:color="9CC8E6" w:sz="6"/>
+            </w:tcBorders>
+            <w:shd w:fill="E7F2FA" w:val="clear"/>
+            <w:tcMar>
+              <w:top w:type="dxa" w:w="140"/>
+              <w:left w:type="dxa" w:w="180"/>
+              <w:bottom w:type="dxa" w:w="140"/>
+              <w:right w:type="dxa" w:w="180"/>
+            </w:tcMar>
+          </w:tcPr>
+          <w:p>
+            <w:pPr>
+              <w:spacing w:after="40"/>
+            </w:pPr>
+            <w:r>
+              <w:rPr>
+                <w:b/>
+                <w:bCs/>
+                <w:color w:val="1B6CA8"/>
+                <w:sz w:val="22"/>
+                <w:szCs w:val="22"/>
+              </w:rPr>
+              <w:t xml:space="preserve">Tempo im Spiel</w:t>
+            </w:r>
+          </w:p>
+          <w:p>
+            <w:pPr>
+              <w:spacing w:after="0" w:line="312" w:lineRule="auto"/>
+            </w:pPr>
+            <w:r>
+              <w:rPr>
+                <w:sz w:val="22"/>
+                <w:szCs w:val="22"/>
+              </w:rPr>
+              <w:t xml:space="preserve">Für framerate-unabhängige Bewegung im Spielfenster nimmst du nicht MILLIS, sondern DELTA() – die Sekunden seit dem letzten Bild. Das gehört zum Game-Loop und wird in Teil IV („Das Fenster“) behandelt.</w:t>
+            </w:r>
+          </w:p>
+        </w:tc>
+      </w:tr>
+    </w:tbl>
+    <w:p>
+      <w:pPr>
+        <w:spacing w:after="160"/>
+      </w:pPr>
     </w:p>
     <w:sectPr>
       <w:footerReference w:type="default" r:id="rId7"/>

</xml_diff>

<commit_message>
docs(buch): Lehrbuch Kap 38 -- Dateien (Referenz) -- Teil III komplett
Handle-basiert (OPENFILE/CLOSEFILE/WRITELINE/WRITE/READLINE/ENDOFFILE/READALL$),
pfadbasiert (WRITEALL/READLINES/APPENDFILE/FILESIZE), Verwaltung (FILEEXISTS/
COPYFILE/RENAME/DELETEFILE), Verzeichnisse (MKDIR/DIREXISTS/DIRLIST), Pfade
(PATHJOIN/BASENAME/DIRNAME). Beispiel pro Befehl, gegen gbrt verifiziert.
Abschluss Teil III.

Co-Authored-By: Claude Opus 4.8 (1M context) <noreply@anthropic.com>
</commit_message>
<xml_diff>
--- a/buch-referenz/buch/GameBasic-Lehrbuch.docx
+++ b/buch-referenz/buch/GameBasic-Lehrbuch.docx
@@ -948,6 +948,33 @@
           <w:szCs w:val="22"/>
         </w:rPr>
         <w:t xml:space="preserve">	117</w:t>
+      </w:r>
+    </w:p>
+    <w:p>
+      <w:pPr>
+        <w:tabs>
+          <w:tab w:val="right" w:pos="9200" w:leader="dot"/>
+        </w:tabs>
+        <w:spacing w:after="20" w:before="0"/>
+        <w:ind w:left="280"/>
+      </w:pPr>
+      <w:r>
+        <w:rPr>
+          <w:b w:val="false"/>
+          <w:bCs w:val="false"/>
+          <w:color w:val="222222"/>
+          <w:sz w:val="22"/>
+          <w:szCs w:val="22"/>
+        </w:rPr>
+        <w:t xml:space="preserve">Dateien</w:t>
+      </w:r>
+      <w:r>
+        <w:rPr>
+          <w:color w:val="555555"/>
+          <w:sz w:val="22"/>
+          <w:szCs w:val="22"/>
+        </w:rPr>
+        <w:t xml:space="preserve">	119</w:t>
       </w:r>
     </w:p>
     <w:p>
@@ -40563,6 +40590,2566 @@
       <w:pPr>
         <w:spacing w:after="160"/>
       </w:pPr>
+    </w:p>
+    <w:p>
+      <w:pPr>
+        <w:pStyle w:val="Heading1"/>
+        <w:keepNext/>
+        <w:keepLines/>
+        <w:pageBreakBefore/>
+        <w:pBdr>
+          <w:bottom w:val="single" w:color="1B6CA8" w:sz="12" w:space="4"/>
+        </w:pBdr>
+        <w:spacing w:after="160" w:before="0"/>
+      </w:pPr>
+      <w:r>
+        <w:t xml:space="preserve">Dateien</w:t>
+      </w:r>
+    </w:p>
+    <w:p>
+      <w:pPr>
+        <w:spacing w:after="180" w:line="312" w:lineRule="auto"/>
+      </w:pPr>
+      <w:r>
+        <w:rPr>
+          <w:sz w:val="22"/>
+          <w:szCs w:val="22"/>
+        </w:rPr>
+        <w:t xml:space="preserve">Mit Datei-Befehlen speicherst du Daten dauerhaft auf der Festplatte – Spielstände, Highscores, Einstellungen, Level. GameBasic bietet zwei Wege: den klassischen mit einem FILE-Handle (Datei öffnen, zeilenweise lesen/schreiben, schließen) und den bequemen pfadbasierten (ganze Datei in einem Aufruf lesen oder schreiben). Pfade sind relativ zum Verzeichnis deines Programms.</w:t>
+      </w:r>
+    </w:p>
+    <w:p>
+      <w:pPr>
+        <w:spacing w:before="60"/>
+      </w:pPr>
+    </w:p>
+    <w:tbl>
+      <w:tblPr>
+        <w:tblW w:type="dxa" w:w="9360"/>
+        <w:tblBorders>
+          <w:top w:val="single" w:color="auto" w:sz="4"/>
+          <w:left w:val="single" w:color="auto" w:sz="4"/>
+          <w:bottom w:val="single" w:color="auto" w:sz="4"/>
+          <w:right w:val="single" w:color="auto" w:sz="4"/>
+          <w:insideH w:val="single" w:color="auto" w:sz="4"/>
+          <w:insideV w:val="single" w:color="auto" w:sz="4"/>
+        </w:tblBorders>
+      </w:tblPr>
+      <w:tblGrid>
+        <w:gridCol w:w="9360"/>
+      </w:tblGrid>
+      <w:tr>
+        <w:trPr>
+          <w:cantSplit/>
+        </w:trPr>
+        <w:tc>
+          <w:tcPr>
+            <w:tcW w:type="dxa" w:w="9360"/>
+            <w:tcBorders>
+              <w:top w:val="single" w:color="E0B96A" w:sz="6"/>
+              <w:left w:val="single" w:color="E0B96A" w:sz="6"/>
+              <w:bottom w:val="single" w:color="E0B96A" w:sz="6"/>
+              <w:right w:val="single" w:color="E0B96A" w:sz="6"/>
+            </w:tcBorders>
+            <w:shd w:fill="FDF3E0" w:val="clear"/>
+            <w:tcMar>
+              <w:top w:type="dxa" w:w="140"/>
+              <w:left w:type="dxa" w:w="180"/>
+              <w:bottom w:type="dxa" w:w="140"/>
+              <w:right w:type="dxa" w:w="180"/>
+            </w:tcMar>
+          </w:tcPr>
+          <w:p>
+            <w:pPr>
+              <w:spacing w:after="40"/>
+            </w:pPr>
+            <w:r>
+              <w:rPr>
+                <w:b/>
+                <w:bCs/>
+                <w:color w:val="9A6A1E"/>
+                <w:sz w:val="22"/>
+                <w:szCs w:val="22"/>
+              </w:rPr>
+              <w:t xml:space="preserve">Merke</w:t>
+            </w:r>
+          </w:p>
+          <w:p>
+            <w:pPr>
+              <w:spacing w:after="0" w:line="312" w:lineRule="auto"/>
+            </w:pPr>
+            <w:r>
+              <w:rPr>
+                <w:sz w:val="22"/>
+                <w:szCs w:val="22"/>
+              </w:rPr>
+              <w:t xml:space="preserve">Jedes Beispiel hier schreibt und liest echte Dateien. Achte beim Ausprobieren darauf, in welchem Ordner dein Programm liegt – dort entstehen die Dateien.</w:t>
+            </w:r>
+          </w:p>
+        </w:tc>
+      </w:tr>
+    </w:tbl>
+    <w:p>
+      <w:pPr>
+        <w:spacing w:after="160"/>
+      </w:pPr>
+    </w:p>
+    <w:p>
+      <w:pPr>
+        <w:pStyle w:val="Heading2"/>
+        <w:keepNext/>
+        <w:keepLines/>
+        <w:spacing w:after="120" w:before="280"/>
+      </w:pPr>
+      <w:r>
+        <w:t xml:space="preserve">Datei öffnen &amp; schließen</w:t>
+      </w:r>
+    </w:p>
+    <w:p>
+      <w:pPr>
+        <w:keepNext/>
+        <w:keepLines/>
+        <w:pBdr>
+          <w:bottom w:val="single" w:color="DDD0C0" w:sz="4" w:space="2"/>
+        </w:pBdr>
+        <w:spacing w:after="40" w:before="360"/>
+      </w:pPr>
+      <w:r>
+        <w:rPr>
+          <w:rFonts w:ascii="Consolas" w:cs="Consolas" w:eastAsia="Consolas" w:hAnsi="Consolas"/>
+          <w:b/>
+          <w:bCs/>
+          <w:color w:val="9A3412"/>
+          <w:sz w:val="24"/>
+          <w:szCs w:val="24"/>
+        </w:rPr>
+        <w:t xml:space="preserve">OPENFILE · CLOSEFILE</w:t>
+      </w:r>
+    </w:p>
+    <w:p>
+      <w:pPr>
+        <w:keepNext/>
+        <w:spacing w:after="120"/>
+      </w:pPr>
+      <w:r>
+        <w:rPr>
+          <w:b/>
+          <w:bCs/>
+          <w:color w:val="6A6A6A"/>
+          <w:sz w:val="18"/>
+          <w:szCs w:val="18"/>
+        </w:rPr>
+        <w:t xml:space="preserve">Syntax:  </w:t>
+      </w:r>
+      <w:r>
+        <w:rPr>
+          <w:rFonts w:ascii="Consolas" w:cs="Consolas" w:eastAsia="Consolas" w:hAnsi="Consolas"/>
+          <w:color w:val="335577"/>
+          <w:sz w:val="19"/>
+          <w:szCs w:val="19"/>
+        </w:rPr>
+        <w:t xml:space="preserve">OPENFILE(pfad$, modus$)   CLOSEFILE(f)</w:t>
+      </w:r>
+    </w:p>
+    <w:p>
+      <w:pPr>
+        <w:spacing w:after="180" w:line="312" w:lineRule="auto"/>
+      </w:pPr>
+      <w:r>
+        <w:rPr>
+          <w:sz w:val="22"/>
+          <w:szCs w:val="22"/>
+        </w:rPr>
+        <w:t xml:space="preserve">OPENFILE öffnet eine Datei und liefert ein FILE-Handle. Der Modus ist "r" (lesen), "w" (neu schreiben, überschreibt) oder "a" (anhängen). CLOSEFILE schließt sie wieder – wichtig, damit Geschriebenes sicher auf der Platte landet.</w:t>
+      </w:r>
+    </w:p>
+    <w:p>
+      <w:pPr>
+        <w:keepNext/>
+        <w:spacing w:after="30" w:before="120"/>
+      </w:pPr>
+      <w:r>
+        <w:rPr>
+          <w:b/>
+          <w:bCs/>
+          <w:i/>
+          <w:iCs/>
+          <w:color w:val="6A6A6A"/>
+          <w:sz w:val="18"/>
+          <w:szCs w:val="18"/>
+        </w:rPr>
+        <w:t xml:space="preserve">Beispiel</w:t>
+      </w:r>
+    </w:p>
+    <w:p>
+      <w:pPr>
+        <w:keepLines/>
+        <w:pBdr>
+          <w:left w:val="single" w:color="1B6CA8" w:sz="18" w:space="6"/>
+        </w:pBdr>
+        <w:shd w:fill="F4F4F4" w:val="clear"/>
+        <w:spacing w:after="200" w:before="100" w:line="264" w:lineRule="auto"/>
+        <w:ind w:left="140"/>
+      </w:pPr>
+      <w:r>
+        <w:rPr>
+          <w:rFonts w:ascii="Consolas" w:cs="Consolas" w:eastAsia="Consolas" w:hAnsi="Consolas"/>
+          <w:sz w:val="19"/>
+          <w:szCs w:val="19"/>
+        </w:rPr>
+        <w:t xml:space="preserve">DIM f AS FILE</w:t>
+      </w:r>
+      <w:r>
+        <w:rPr>
+          <w:rFonts w:ascii="Consolas" w:cs="Consolas" w:eastAsia="Consolas" w:hAnsi="Consolas"/>
+          <w:sz w:val="19"/>
+          <w:szCs w:val="19"/>
+        </w:rPr>
+        <w:br/>
+        <w:t xml:space="preserve">f = OPENFILE("notiz.txt", "w")</w:t>
+      </w:r>
+      <w:r>
+        <w:rPr>
+          <w:rFonts w:ascii="Consolas" w:cs="Consolas" w:eastAsia="Consolas" w:hAnsi="Consolas"/>
+          <w:sz w:val="19"/>
+          <w:szCs w:val="19"/>
+        </w:rPr>
+        <w:br/>
+        <w:t xml:space="preserve">WRITELINE(f, "Hallo Datei")</w:t>
+      </w:r>
+      <w:r>
+        <w:rPr>
+          <w:rFonts w:ascii="Consolas" w:cs="Consolas" w:eastAsia="Consolas" w:hAnsi="Consolas"/>
+          <w:sz w:val="19"/>
+          <w:szCs w:val="19"/>
+        </w:rPr>
+        <w:br/>
+        <w:t xml:space="preserve">CLOSEFILE(f)</w:t>
+      </w:r>
+      <w:r>
+        <w:rPr>
+          <w:rFonts w:ascii="Consolas" w:cs="Consolas" w:eastAsia="Consolas" w:hAnsi="Consolas"/>
+          <w:sz w:val="19"/>
+          <w:szCs w:val="19"/>
+        </w:rPr>
+        <w:br/>
+        <w:t xml:space="preserve">PRINT "geschrieben"</w:t>
+      </w:r>
+    </w:p>
+    <w:p>
+      <w:pPr>
+        <w:keepNext/>
+        <w:spacing w:after="30" w:before="120"/>
+      </w:pPr>
+      <w:r>
+        <w:rPr>
+          <w:b/>
+          <w:bCs/>
+          <w:i/>
+          <w:iCs/>
+          <w:color w:val="6A6A6A"/>
+          <w:sz w:val="18"/>
+          <w:szCs w:val="18"/>
+        </w:rPr>
+        <w:t xml:space="preserve">Ausgabe</w:t>
+      </w:r>
+    </w:p>
+    <w:p>
+      <w:pPr>
+        <w:keepLines/>
+        <w:pBdr>
+          <w:left w:val="single" w:color="9AC79A" w:sz="18" w:space="6"/>
+        </w:pBdr>
+        <w:shd w:fill="EAF4EA" w:val="clear"/>
+        <w:spacing w:after="200" w:before="100" w:line="264" w:lineRule="auto"/>
+        <w:ind w:left="140"/>
+      </w:pPr>
+      <w:r>
+        <w:rPr>
+          <w:rFonts w:ascii="Consolas" w:cs="Consolas" w:eastAsia="Consolas" w:hAnsi="Consolas"/>
+          <w:sz w:val="19"/>
+          <w:szCs w:val="19"/>
+        </w:rPr>
+        <w:t xml:space="preserve">geschrieben</w:t>
+      </w:r>
+    </w:p>
+    <w:p>
+      <w:pPr>
+        <w:pStyle w:val="Heading2"/>
+        <w:keepNext/>
+        <w:keepLines/>
+        <w:spacing w:after="120" w:before="280"/>
+      </w:pPr>
+      <w:r>
+        <w:t xml:space="preserve">Zeilenweise schreiben</w:t>
+      </w:r>
+    </w:p>
+    <w:p>
+      <w:pPr>
+        <w:keepNext/>
+        <w:keepLines/>
+        <w:pBdr>
+          <w:bottom w:val="single" w:color="DDD0C0" w:sz="4" w:space="2"/>
+        </w:pBdr>
+        <w:spacing w:after="40" w:before="360"/>
+      </w:pPr>
+      <w:r>
+        <w:rPr>
+          <w:rFonts w:ascii="Consolas" w:cs="Consolas" w:eastAsia="Consolas" w:hAnsi="Consolas"/>
+          <w:b/>
+          <w:bCs/>
+          <w:color w:val="9A3412"/>
+          <w:sz w:val="24"/>
+          <w:szCs w:val="24"/>
+        </w:rPr>
+        <w:t xml:space="preserve">WRITELINE · WRITE</w:t>
+      </w:r>
+    </w:p>
+    <w:p>
+      <w:pPr>
+        <w:keepNext/>
+        <w:spacing w:after="120"/>
+      </w:pPr>
+      <w:r>
+        <w:rPr>
+          <w:b/>
+          <w:bCs/>
+          <w:color w:val="6A6A6A"/>
+          <w:sz w:val="18"/>
+          <w:szCs w:val="18"/>
+        </w:rPr>
+        <w:t xml:space="preserve">Syntax:  </w:t>
+      </w:r>
+      <w:r>
+        <w:rPr>
+          <w:rFonts w:ascii="Consolas" w:cs="Consolas" w:eastAsia="Consolas" w:hAnsi="Consolas"/>
+          <w:color w:val="335577"/>
+          <w:sz w:val="19"/>
+          <w:szCs w:val="19"/>
+        </w:rPr>
+        <w:t xml:space="preserve">WRITELINE(f, text$)   WRITE(f, text$)</w:t>
+      </w:r>
+    </w:p>
+    <w:p>
+      <w:pPr>
+        <w:spacing w:after="180" w:line="312" w:lineRule="auto"/>
+      </w:pPr>
+      <w:r>
+        <w:rPr>
+          <w:sz w:val="22"/>
+          <w:szCs w:val="22"/>
+        </w:rPr>
+        <w:t xml:space="preserve">WRITELINE schreibt den Text und einen Zeilenumbruch. WRITE schreibt ohne Umbruch, sodass mehrere Stücke in einer Zeile landen.</w:t>
+      </w:r>
+    </w:p>
+    <w:p>
+      <w:pPr>
+        <w:keepNext/>
+        <w:spacing w:after="30" w:before="120"/>
+      </w:pPr>
+      <w:r>
+        <w:rPr>
+          <w:b/>
+          <w:bCs/>
+          <w:i/>
+          <w:iCs/>
+          <w:color w:val="6A6A6A"/>
+          <w:sz w:val="18"/>
+          <w:szCs w:val="18"/>
+        </w:rPr>
+        <w:t xml:space="preserve">Beispiel</w:t>
+      </w:r>
+    </w:p>
+    <w:p>
+      <w:pPr>
+        <w:keepLines/>
+        <w:pBdr>
+          <w:left w:val="single" w:color="1B6CA8" w:sz="18" w:space="6"/>
+        </w:pBdr>
+        <w:shd w:fill="F4F4F4" w:val="clear"/>
+        <w:spacing w:after="200" w:before="100" w:line="264" w:lineRule="auto"/>
+        <w:ind w:left="140"/>
+      </w:pPr>
+      <w:r>
+        <w:rPr>
+          <w:rFonts w:ascii="Consolas" w:cs="Consolas" w:eastAsia="Consolas" w:hAnsi="Consolas"/>
+          <w:sz w:val="19"/>
+          <w:szCs w:val="19"/>
+        </w:rPr>
+        <w:t xml:space="preserve">DIM f AS FILE</w:t>
+      </w:r>
+      <w:r>
+        <w:rPr>
+          <w:rFonts w:ascii="Consolas" w:cs="Consolas" w:eastAsia="Consolas" w:hAnsi="Consolas"/>
+          <w:sz w:val="19"/>
+          <w:szCs w:val="19"/>
+        </w:rPr>
+        <w:br/>
+        <w:t xml:space="preserve">f = OPENFILE("scores.txt", "w")</w:t>
+      </w:r>
+      <w:r>
+        <w:rPr>
+          <w:rFonts w:ascii="Consolas" w:cs="Consolas" w:eastAsia="Consolas" w:hAnsi="Consolas"/>
+          <w:sz w:val="19"/>
+          <w:szCs w:val="19"/>
+        </w:rPr>
+        <w:br/>
+        <w:t xml:space="preserve">WRITELINE(f, "Anna 95")</w:t>
+      </w:r>
+      <w:r>
+        <w:rPr>
+          <w:rFonts w:ascii="Consolas" w:cs="Consolas" w:eastAsia="Consolas" w:hAnsi="Consolas"/>
+          <w:sz w:val="19"/>
+          <w:szCs w:val="19"/>
+        </w:rPr>
+        <w:br/>
+        <w:t xml:space="preserve">WRITE(f, "Bert ")</w:t>
+      </w:r>
+      <w:r>
+        <w:rPr>
+          <w:rFonts w:ascii="Consolas" w:cs="Consolas" w:eastAsia="Consolas" w:hAnsi="Consolas"/>
+          <w:sz w:val="19"/>
+          <w:szCs w:val="19"/>
+        </w:rPr>
+        <w:br/>
+        <w:t xml:space="preserve">WRITE(f, "78")</w:t>
+      </w:r>
+      <w:r>
+        <w:rPr>
+          <w:rFonts w:ascii="Consolas" w:cs="Consolas" w:eastAsia="Consolas" w:hAnsi="Consolas"/>
+          <w:sz w:val="19"/>
+          <w:szCs w:val="19"/>
+        </w:rPr>
+        <w:br/>
+        <w:t xml:space="preserve">CLOSEFILE(f)</w:t>
+      </w:r>
+      <w:r>
+        <w:rPr>
+          <w:rFonts w:ascii="Consolas" w:cs="Consolas" w:eastAsia="Consolas" w:hAnsi="Consolas"/>
+          <w:sz w:val="19"/>
+          <w:szCs w:val="19"/>
+        </w:rPr>
+        <w:br/>
+        <w:t xml:space="preserve">PRINT "fertig"</w:t>
+      </w:r>
+    </w:p>
+    <w:p>
+      <w:pPr>
+        <w:keepNext/>
+        <w:spacing w:after="30" w:before="120"/>
+      </w:pPr>
+      <w:r>
+        <w:rPr>
+          <w:b/>
+          <w:bCs/>
+          <w:i/>
+          <w:iCs/>
+          <w:color w:val="6A6A6A"/>
+          <w:sz w:val="18"/>
+          <w:szCs w:val="18"/>
+        </w:rPr>
+        <w:t xml:space="preserve">Ausgabe</w:t>
+      </w:r>
+    </w:p>
+    <w:p>
+      <w:pPr>
+        <w:keepLines/>
+        <w:pBdr>
+          <w:left w:val="single" w:color="9AC79A" w:sz="18" w:space="6"/>
+        </w:pBdr>
+        <w:shd w:fill="EAF4EA" w:val="clear"/>
+        <w:spacing w:after="200" w:before="100" w:line="264" w:lineRule="auto"/>
+        <w:ind w:left="140"/>
+      </w:pPr>
+      <w:r>
+        <w:rPr>
+          <w:rFonts w:ascii="Consolas" w:cs="Consolas" w:eastAsia="Consolas" w:hAnsi="Consolas"/>
+          <w:sz w:val="19"/>
+          <w:szCs w:val="19"/>
+        </w:rPr>
+        <w:t xml:space="preserve">fertig</w:t>
+      </w:r>
+    </w:p>
+    <w:p>
+      <w:pPr>
+        <w:pStyle w:val="Heading2"/>
+        <w:keepNext/>
+        <w:keepLines/>
+        <w:spacing w:after="120" w:before="280"/>
+      </w:pPr>
+      <w:r>
+        <w:t xml:space="preserve">Zeilenweise lesen</w:t>
+      </w:r>
+    </w:p>
+    <w:p>
+      <w:pPr>
+        <w:keepNext/>
+        <w:keepLines/>
+        <w:pBdr>
+          <w:bottom w:val="single" w:color="DDD0C0" w:sz="4" w:space="2"/>
+        </w:pBdr>
+        <w:spacing w:after="40" w:before="360"/>
+      </w:pPr>
+      <w:r>
+        <w:rPr>
+          <w:rFonts w:ascii="Consolas" w:cs="Consolas" w:eastAsia="Consolas" w:hAnsi="Consolas"/>
+          <w:b/>
+          <w:bCs/>
+          <w:color w:val="9A3412"/>
+          <w:sz w:val="24"/>
+          <w:szCs w:val="24"/>
+        </w:rPr>
+        <w:t xml:space="preserve">READLINE · ENDOFFILE</w:t>
+      </w:r>
+    </w:p>
+    <w:p>
+      <w:pPr>
+        <w:keepNext/>
+        <w:spacing w:after="120"/>
+      </w:pPr>
+      <w:r>
+        <w:rPr>
+          <w:b/>
+          <w:bCs/>
+          <w:color w:val="6A6A6A"/>
+          <w:sz w:val="18"/>
+          <w:szCs w:val="18"/>
+        </w:rPr>
+        <w:t xml:space="preserve">Syntax:  </w:t>
+      </w:r>
+      <w:r>
+        <w:rPr>
+          <w:rFonts w:ascii="Consolas" w:cs="Consolas" w:eastAsia="Consolas" w:hAnsi="Consolas"/>
+          <w:color w:val="335577"/>
+          <w:sz w:val="19"/>
+          <w:szCs w:val="19"/>
+        </w:rPr>
+        <w:t xml:space="preserve">READLINE(f)   ENDOFFILE(f)</w:t>
+      </w:r>
+    </w:p>
+    <w:p>
+      <w:pPr>
+        <w:spacing w:after="180" w:line="312" w:lineRule="auto"/>
+      </w:pPr>
+      <w:r>
+        <w:rPr>
+          <w:sz w:val="22"/>
+          <w:szCs w:val="22"/>
+        </w:rPr>
+        <w:t xml:space="preserve">READLINE liefert die nächste Zeile (ohne den Umbruch). ENDOFFILE wird TRUE, sobald das Dateiende erreicht ist – die typische Schleife liest, solange NOT ENDOFFILE.</w:t>
+      </w:r>
+    </w:p>
+    <w:p>
+      <w:pPr>
+        <w:keepNext/>
+        <w:spacing w:after="30" w:before="120"/>
+      </w:pPr>
+      <w:r>
+        <w:rPr>
+          <w:b/>
+          <w:bCs/>
+          <w:i/>
+          <w:iCs/>
+          <w:color w:val="6A6A6A"/>
+          <w:sz w:val="18"/>
+          <w:szCs w:val="18"/>
+        </w:rPr>
+        <w:t xml:space="preserve">Beispiel</w:t>
+      </w:r>
+    </w:p>
+    <w:p>
+      <w:pPr>
+        <w:keepLines/>
+        <w:pBdr>
+          <w:left w:val="single" w:color="1B6CA8" w:sz="18" w:space="6"/>
+        </w:pBdr>
+        <w:shd w:fill="F4F4F4" w:val="clear"/>
+        <w:spacing w:after="200" w:before="100" w:line="264" w:lineRule="auto"/>
+        <w:ind w:left="140"/>
+      </w:pPr>
+      <w:r>
+        <w:rPr>
+          <w:rFonts w:ascii="Consolas" w:cs="Consolas" w:eastAsia="Consolas" w:hAnsi="Consolas"/>
+          <w:sz w:val="19"/>
+          <w:szCs w:val="19"/>
+        </w:rPr>
+        <w:t xml:space="preserve">DIM f AS FILE</w:t>
+      </w:r>
+      <w:r>
+        <w:rPr>
+          <w:rFonts w:ascii="Consolas" w:cs="Consolas" w:eastAsia="Consolas" w:hAnsi="Consolas"/>
+          <w:sz w:val="19"/>
+          <w:szCs w:val="19"/>
+        </w:rPr>
+        <w:br/>
+        <w:t xml:space="preserve">f = OPENFILE("scores.txt", "w")</w:t>
+      </w:r>
+      <w:r>
+        <w:rPr>
+          <w:rFonts w:ascii="Consolas" w:cs="Consolas" w:eastAsia="Consolas" w:hAnsi="Consolas"/>
+          <w:sz w:val="19"/>
+          <w:szCs w:val="19"/>
+        </w:rPr>
+        <w:br/>
+        <w:t xml:space="preserve">WRITELINE(f, "Anna 95")</w:t>
+      </w:r>
+      <w:r>
+        <w:rPr>
+          <w:rFonts w:ascii="Consolas" w:cs="Consolas" w:eastAsia="Consolas" w:hAnsi="Consolas"/>
+          <w:sz w:val="19"/>
+          <w:szCs w:val="19"/>
+        </w:rPr>
+        <w:br/>
+        <w:t xml:space="preserve">WRITELINE(f, "Bert 78")</w:t>
+      </w:r>
+      <w:r>
+        <w:rPr>
+          <w:rFonts w:ascii="Consolas" w:cs="Consolas" w:eastAsia="Consolas" w:hAnsi="Consolas"/>
+          <w:sz w:val="19"/>
+          <w:szCs w:val="19"/>
+        </w:rPr>
+        <w:br/>
+        <w:t xml:space="preserve">CLOSEFILE(f)</w:t>
+      </w:r>
+      <w:r>
+        <w:rPr>
+          <w:rFonts w:ascii="Consolas" w:cs="Consolas" w:eastAsia="Consolas" w:hAnsi="Consolas"/>
+          <w:sz w:val="19"/>
+          <w:szCs w:val="19"/>
+        </w:rPr>
+        <w:br/>
+        <w:t xml:space="preserve"/>
+      </w:r>
+      <w:r>
+        <w:rPr>
+          <w:rFonts w:ascii="Consolas" w:cs="Consolas" w:eastAsia="Consolas" w:hAnsi="Consolas"/>
+          <w:sz w:val="19"/>
+          <w:szCs w:val="19"/>
+        </w:rPr>
+        <w:br/>
+        <w:t xml:space="preserve">f = OPENFILE("scores.txt", "r")</w:t>
+      </w:r>
+      <w:r>
+        <w:rPr>
+          <w:rFonts w:ascii="Consolas" w:cs="Consolas" w:eastAsia="Consolas" w:hAnsi="Consolas"/>
+          <w:sz w:val="19"/>
+          <w:szCs w:val="19"/>
+        </w:rPr>
+        <w:br/>
+        <w:t xml:space="preserve">WHILE NOT ENDOFFILE(f)</w:t>
+      </w:r>
+      <w:r>
+        <w:rPr>
+          <w:rFonts w:ascii="Consolas" w:cs="Consolas" w:eastAsia="Consolas" w:hAnsi="Consolas"/>
+          <w:sz w:val="19"/>
+          <w:szCs w:val="19"/>
+        </w:rPr>
+        <w:br/>
+        <w:t xml:space="preserve">    PRINT READLINE(f)</w:t>
+      </w:r>
+      <w:r>
+        <w:rPr>
+          <w:rFonts w:ascii="Consolas" w:cs="Consolas" w:eastAsia="Consolas" w:hAnsi="Consolas"/>
+          <w:sz w:val="19"/>
+          <w:szCs w:val="19"/>
+        </w:rPr>
+        <w:br/>
+        <w:t xml:space="preserve">WEND</w:t>
+      </w:r>
+      <w:r>
+        <w:rPr>
+          <w:rFonts w:ascii="Consolas" w:cs="Consolas" w:eastAsia="Consolas" w:hAnsi="Consolas"/>
+          <w:sz w:val="19"/>
+          <w:szCs w:val="19"/>
+        </w:rPr>
+        <w:br/>
+        <w:t xml:space="preserve">CLOSEFILE(f)</w:t>
+      </w:r>
+    </w:p>
+    <w:p>
+      <w:pPr>
+        <w:keepNext/>
+        <w:spacing w:after="30" w:before="120"/>
+      </w:pPr>
+      <w:r>
+        <w:rPr>
+          <w:b/>
+          <w:bCs/>
+          <w:i/>
+          <w:iCs/>
+          <w:color w:val="6A6A6A"/>
+          <w:sz w:val="18"/>
+          <w:szCs w:val="18"/>
+        </w:rPr>
+        <w:t xml:space="preserve">Ausgabe</w:t>
+      </w:r>
+    </w:p>
+    <w:p>
+      <w:pPr>
+        <w:keepLines/>
+        <w:pBdr>
+          <w:left w:val="single" w:color="9AC79A" w:sz="18" w:space="6"/>
+        </w:pBdr>
+        <w:shd w:fill="EAF4EA" w:val="clear"/>
+        <w:spacing w:after="200" w:before="100" w:line="264" w:lineRule="auto"/>
+        <w:ind w:left="140"/>
+      </w:pPr>
+      <w:r>
+        <w:rPr>
+          <w:rFonts w:ascii="Consolas" w:cs="Consolas" w:eastAsia="Consolas" w:hAnsi="Consolas"/>
+          <w:sz w:val="19"/>
+          <w:szCs w:val="19"/>
+        </w:rPr>
+        <w:t xml:space="preserve">Anna 95</w:t>
+      </w:r>
+      <w:r>
+        <w:rPr>
+          <w:rFonts w:ascii="Consolas" w:cs="Consolas" w:eastAsia="Consolas" w:hAnsi="Consolas"/>
+          <w:sz w:val="19"/>
+          <w:szCs w:val="19"/>
+        </w:rPr>
+        <w:br/>
+        <w:t xml:space="preserve">Bert 78</w:t>
+      </w:r>
+    </w:p>
+    <w:p>
+      <w:pPr>
+        <w:keepNext/>
+        <w:keepLines/>
+        <w:pBdr>
+          <w:bottom w:val="single" w:color="DDD0C0" w:sz="4" w:space="2"/>
+        </w:pBdr>
+        <w:spacing w:after="40" w:before="360"/>
+      </w:pPr>
+      <w:r>
+        <w:rPr>
+          <w:rFonts w:ascii="Consolas" w:cs="Consolas" w:eastAsia="Consolas" w:hAnsi="Consolas"/>
+          <w:b/>
+          <w:bCs/>
+          <w:color w:val="9A3412"/>
+          <w:sz w:val="24"/>
+          <w:szCs w:val="24"/>
+        </w:rPr>
+        <w:t xml:space="preserve">READALL$</w:t>
+      </w:r>
+    </w:p>
+    <w:p>
+      <w:pPr>
+        <w:keepNext/>
+        <w:spacing w:after="120"/>
+      </w:pPr>
+      <w:r>
+        <w:rPr>
+          <w:b/>
+          <w:bCs/>
+          <w:color w:val="6A6A6A"/>
+          <w:sz w:val="18"/>
+          <w:szCs w:val="18"/>
+        </w:rPr>
+        <w:t xml:space="preserve">Syntax:  </w:t>
+      </w:r>
+      <w:r>
+        <w:rPr>
+          <w:rFonts w:ascii="Consolas" w:cs="Consolas" w:eastAsia="Consolas" w:hAnsi="Consolas"/>
+          <w:color w:val="335577"/>
+          <w:sz w:val="19"/>
+          <w:szCs w:val="19"/>
+        </w:rPr>
+        <w:t xml:space="preserve">READALL$(f)</w:t>
+      </w:r>
+    </w:p>
+    <w:p>
+      <w:pPr>
+        <w:spacing w:after="180" w:line="312" w:lineRule="auto"/>
+      </w:pPr>
+      <w:r>
+        <w:rPr>
+          <w:sz w:val="22"/>
+          <w:szCs w:val="22"/>
+        </w:rPr>
+        <w:t xml:space="preserve">Liest den gesamten verbleibenden Inhalt der Datei auf einmal als einen String.</w:t>
+      </w:r>
+    </w:p>
+    <w:p>
+      <w:pPr>
+        <w:keepNext/>
+        <w:spacing w:after="30" w:before="120"/>
+      </w:pPr>
+      <w:r>
+        <w:rPr>
+          <w:b/>
+          <w:bCs/>
+          <w:i/>
+          <w:iCs/>
+          <w:color w:val="6A6A6A"/>
+          <w:sz w:val="18"/>
+          <w:szCs w:val="18"/>
+        </w:rPr>
+        <w:t xml:space="preserve">Beispiel</w:t>
+      </w:r>
+    </w:p>
+    <w:p>
+      <w:pPr>
+        <w:keepLines/>
+        <w:pBdr>
+          <w:left w:val="single" w:color="1B6CA8" w:sz="18" w:space="6"/>
+        </w:pBdr>
+        <w:shd w:fill="F4F4F4" w:val="clear"/>
+        <w:spacing w:after="200" w:before="100" w:line="264" w:lineRule="auto"/>
+        <w:ind w:left="140"/>
+      </w:pPr>
+      <w:r>
+        <w:rPr>
+          <w:rFonts w:ascii="Consolas" w:cs="Consolas" w:eastAsia="Consolas" w:hAnsi="Consolas"/>
+          <w:sz w:val="19"/>
+          <w:szCs w:val="19"/>
+        </w:rPr>
+        <w:t xml:space="preserve">DIM f AS FILE</w:t>
+      </w:r>
+      <w:r>
+        <w:rPr>
+          <w:rFonts w:ascii="Consolas" w:cs="Consolas" w:eastAsia="Consolas" w:hAnsi="Consolas"/>
+          <w:sz w:val="19"/>
+          <w:szCs w:val="19"/>
+        </w:rPr>
+        <w:br/>
+        <w:t xml:space="preserve">f = OPENFILE("notiz.txt", "w")</w:t>
+      </w:r>
+      <w:r>
+        <w:rPr>
+          <w:rFonts w:ascii="Consolas" w:cs="Consolas" w:eastAsia="Consolas" w:hAnsi="Consolas"/>
+          <w:sz w:val="19"/>
+          <w:szCs w:val="19"/>
+        </w:rPr>
+        <w:br/>
+        <w:t xml:space="preserve">WRITE(f, "abc")</w:t>
+      </w:r>
+      <w:r>
+        <w:rPr>
+          <w:rFonts w:ascii="Consolas" w:cs="Consolas" w:eastAsia="Consolas" w:hAnsi="Consolas"/>
+          <w:sz w:val="19"/>
+          <w:szCs w:val="19"/>
+        </w:rPr>
+        <w:br/>
+        <w:t xml:space="preserve">CLOSEFILE(f)</w:t>
+      </w:r>
+      <w:r>
+        <w:rPr>
+          <w:rFonts w:ascii="Consolas" w:cs="Consolas" w:eastAsia="Consolas" w:hAnsi="Consolas"/>
+          <w:sz w:val="19"/>
+          <w:szCs w:val="19"/>
+        </w:rPr>
+        <w:br/>
+        <w:t xml:space="preserve">f = OPENFILE("notiz.txt", "r")</w:t>
+      </w:r>
+      <w:r>
+        <w:rPr>
+          <w:rFonts w:ascii="Consolas" w:cs="Consolas" w:eastAsia="Consolas" w:hAnsi="Consolas"/>
+          <w:sz w:val="19"/>
+          <w:szCs w:val="19"/>
+        </w:rPr>
+        <w:br/>
+        <w:t xml:space="preserve">PRINT READALL$(f)</w:t>
+      </w:r>
+      <w:r>
+        <w:rPr>
+          <w:rFonts w:ascii="Consolas" w:cs="Consolas" w:eastAsia="Consolas" w:hAnsi="Consolas"/>
+          <w:sz w:val="19"/>
+          <w:szCs w:val="19"/>
+        </w:rPr>
+        <w:br/>
+        <w:t xml:space="preserve">CLOSEFILE(f)</w:t>
+      </w:r>
+    </w:p>
+    <w:p>
+      <w:pPr>
+        <w:keepNext/>
+        <w:spacing w:after="30" w:before="120"/>
+      </w:pPr>
+      <w:r>
+        <w:rPr>
+          <w:b/>
+          <w:bCs/>
+          <w:i/>
+          <w:iCs/>
+          <w:color w:val="6A6A6A"/>
+          <w:sz w:val="18"/>
+          <w:szCs w:val="18"/>
+        </w:rPr>
+        <w:t xml:space="preserve">Ausgabe</w:t>
+      </w:r>
+    </w:p>
+    <w:p>
+      <w:pPr>
+        <w:keepLines/>
+        <w:pBdr>
+          <w:left w:val="single" w:color="9AC79A" w:sz="18" w:space="6"/>
+        </w:pBdr>
+        <w:shd w:fill="EAF4EA" w:val="clear"/>
+        <w:spacing w:after="200" w:before="100" w:line="264" w:lineRule="auto"/>
+        <w:ind w:left="140"/>
+      </w:pPr>
+      <w:r>
+        <w:rPr>
+          <w:rFonts w:ascii="Consolas" w:cs="Consolas" w:eastAsia="Consolas" w:hAnsi="Consolas"/>
+          <w:sz w:val="19"/>
+          <w:szCs w:val="19"/>
+        </w:rPr>
+        <w:t xml:space="preserve">abc</w:t>
+      </w:r>
+    </w:p>
+    <w:p>
+      <w:pPr>
+        <w:pStyle w:val="Heading2"/>
+        <w:keepNext/>
+        <w:keepLines/>
+        <w:spacing w:after="120" w:before="280"/>
+      </w:pPr>
+      <w:r>
+        <w:t xml:space="preserve">Bequem: ganze Datei auf einmal</w:t>
+      </w:r>
+    </w:p>
+    <w:p>
+      <w:pPr>
+        <w:spacing w:after="180" w:line="312" w:lineRule="auto"/>
+      </w:pPr>
+      <w:r>
+        <w:rPr>
+          <w:sz w:val="22"/>
+          <w:szCs w:val="22"/>
+        </w:rPr>
+        <w:t xml:space="preserve">Für viele Fälle brauchst du gar kein Handle. Diese pfadbasierten Befehle erledigen Öffnen, Lesen/Schreiben und Schließen in einem Schritt.</w:t>
+      </w:r>
+    </w:p>
+    <w:p>
+      <w:pPr>
+        <w:keepNext/>
+        <w:keepLines/>
+        <w:pBdr>
+          <w:bottom w:val="single" w:color="DDD0C0" w:sz="4" w:space="2"/>
+        </w:pBdr>
+        <w:spacing w:after="40" w:before="360"/>
+      </w:pPr>
+      <w:r>
+        <w:rPr>
+          <w:rFonts w:ascii="Consolas" w:cs="Consolas" w:eastAsia="Consolas" w:hAnsi="Consolas"/>
+          <w:b/>
+          <w:bCs/>
+          <w:color w:val="9A3412"/>
+          <w:sz w:val="24"/>
+          <w:szCs w:val="24"/>
+        </w:rPr>
+        <w:t xml:space="preserve">WRITEALL</w:t>
+      </w:r>
+    </w:p>
+    <w:p>
+      <w:pPr>
+        <w:keepNext/>
+        <w:spacing w:after="120"/>
+      </w:pPr>
+      <w:r>
+        <w:rPr>
+          <w:b/>
+          <w:bCs/>
+          <w:color w:val="6A6A6A"/>
+          <w:sz w:val="18"/>
+          <w:szCs w:val="18"/>
+        </w:rPr>
+        <w:t xml:space="preserve">Syntax:  </w:t>
+      </w:r>
+      <w:r>
+        <w:rPr>
+          <w:rFonts w:ascii="Consolas" w:cs="Consolas" w:eastAsia="Consolas" w:hAnsi="Consolas"/>
+          <w:color w:val="335577"/>
+          <w:sz w:val="19"/>
+          <w:szCs w:val="19"/>
+        </w:rPr>
+        <w:t xml:space="preserve">WRITEALL(pfad$, text$)</w:t>
+      </w:r>
+    </w:p>
+    <w:p>
+      <w:pPr>
+        <w:spacing w:after="180" w:line="312" w:lineRule="auto"/>
+      </w:pPr>
+      <w:r>
+        <w:rPr>
+          <w:sz w:val="22"/>
+          <w:szCs w:val="22"/>
+        </w:rPr>
+        <w:t xml:space="preserve">Schreibt den Text komplett in die Datei (erzeugt sie neu bzw. überschreibt sie).</w:t>
+      </w:r>
+    </w:p>
+    <w:p>
+      <w:pPr>
+        <w:keepNext/>
+        <w:spacing w:after="30" w:before="120"/>
+      </w:pPr>
+      <w:r>
+        <w:rPr>
+          <w:b/>
+          <w:bCs/>
+          <w:i/>
+          <w:iCs/>
+          <w:color w:val="6A6A6A"/>
+          <w:sz w:val="18"/>
+          <w:szCs w:val="18"/>
+        </w:rPr>
+        <w:t xml:space="preserve">Beispiel</w:t>
+      </w:r>
+    </w:p>
+    <w:p>
+      <w:pPr>
+        <w:keepLines/>
+        <w:pBdr>
+          <w:left w:val="single" w:color="1B6CA8" w:sz="18" w:space="6"/>
+        </w:pBdr>
+        <w:shd w:fill="F4F4F4" w:val="clear"/>
+        <w:spacing w:after="200" w:before="100" w:line="264" w:lineRule="auto"/>
+        <w:ind w:left="140"/>
+      </w:pPr>
+      <w:r>
+        <w:rPr>
+          <w:rFonts w:ascii="Consolas" w:cs="Consolas" w:eastAsia="Consolas" w:hAnsi="Consolas"/>
+          <w:sz w:val="19"/>
+          <w:szCs w:val="19"/>
+        </w:rPr>
+        <w:t xml:space="preserve">WRITEALL("daten.txt", "score=42")</w:t>
+      </w:r>
+      <w:r>
+        <w:rPr>
+          <w:rFonts w:ascii="Consolas" w:cs="Consolas" w:eastAsia="Consolas" w:hAnsi="Consolas"/>
+          <w:sz w:val="19"/>
+          <w:szCs w:val="19"/>
+        </w:rPr>
+        <w:br/>
+        <w:t xml:space="preserve">PRINT FILEEXISTS("daten.txt")</w:t>
+      </w:r>
+    </w:p>
+    <w:p>
+      <w:pPr>
+        <w:keepNext/>
+        <w:spacing w:after="30" w:before="120"/>
+      </w:pPr>
+      <w:r>
+        <w:rPr>
+          <w:b/>
+          <w:bCs/>
+          <w:i/>
+          <w:iCs/>
+          <w:color w:val="6A6A6A"/>
+          <w:sz w:val="18"/>
+          <w:szCs w:val="18"/>
+        </w:rPr>
+        <w:t xml:space="preserve">Ausgabe</w:t>
+      </w:r>
+    </w:p>
+    <w:p>
+      <w:pPr>
+        <w:keepLines/>
+        <w:pBdr>
+          <w:left w:val="single" w:color="9AC79A" w:sz="18" w:space="6"/>
+        </w:pBdr>
+        <w:shd w:fill="EAF4EA" w:val="clear"/>
+        <w:spacing w:after="200" w:before="100" w:line="264" w:lineRule="auto"/>
+        <w:ind w:left="140"/>
+      </w:pPr>
+      <w:r>
+        <w:rPr>
+          <w:rFonts w:ascii="Consolas" w:cs="Consolas" w:eastAsia="Consolas" w:hAnsi="Consolas"/>
+          <w:sz w:val="19"/>
+          <w:szCs w:val="19"/>
+        </w:rPr>
+        <w:t xml:space="preserve">TRUE</w:t>
+      </w:r>
+    </w:p>
+    <w:p>
+      <w:pPr>
+        <w:keepNext/>
+        <w:keepLines/>
+        <w:pBdr>
+          <w:bottom w:val="single" w:color="DDD0C0" w:sz="4" w:space="2"/>
+        </w:pBdr>
+        <w:spacing w:after="40" w:before="360"/>
+      </w:pPr>
+      <w:r>
+        <w:rPr>
+          <w:rFonts w:ascii="Consolas" w:cs="Consolas" w:eastAsia="Consolas" w:hAnsi="Consolas"/>
+          <w:b/>
+          <w:bCs/>
+          <w:color w:val="9A3412"/>
+          <w:sz w:val="24"/>
+          <w:szCs w:val="24"/>
+        </w:rPr>
+        <w:t xml:space="preserve">READLINES</w:t>
+      </w:r>
+    </w:p>
+    <w:p>
+      <w:pPr>
+        <w:keepNext/>
+        <w:spacing w:after="120"/>
+      </w:pPr>
+      <w:r>
+        <w:rPr>
+          <w:b/>
+          <w:bCs/>
+          <w:color w:val="6A6A6A"/>
+          <w:sz w:val="18"/>
+          <w:szCs w:val="18"/>
+        </w:rPr>
+        <w:t xml:space="preserve">Syntax:  </w:t>
+      </w:r>
+      <w:r>
+        <w:rPr>
+          <w:rFonts w:ascii="Consolas" w:cs="Consolas" w:eastAsia="Consolas" w:hAnsi="Consolas"/>
+          <w:color w:val="335577"/>
+          <w:sz w:val="19"/>
+          <w:szCs w:val="19"/>
+        </w:rPr>
+        <w:t xml:space="preserve">READLINES(pfad$)</w:t>
+      </w:r>
+    </w:p>
+    <w:p>
+      <w:pPr>
+        <w:spacing w:after="180" w:line="312" w:lineRule="auto"/>
+      </w:pPr>
+      <w:r>
+        <w:rPr>
+          <w:sz w:val="22"/>
+          <w:szCs w:val="22"/>
+        </w:rPr>
+        <w:t xml:space="preserve">Liest die ganze Datei und liefert ihre Zeilen als ARRAY OF STRING.</w:t>
+      </w:r>
+    </w:p>
+    <w:p>
+      <w:pPr>
+        <w:keepNext/>
+        <w:spacing w:after="30" w:before="120"/>
+      </w:pPr>
+      <w:r>
+        <w:rPr>
+          <w:b/>
+          <w:bCs/>
+          <w:i/>
+          <w:iCs/>
+          <w:color w:val="6A6A6A"/>
+          <w:sz w:val="18"/>
+          <w:szCs w:val="18"/>
+        </w:rPr>
+        <w:t xml:space="preserve">Beispiel</w:t>
+      </w:r>
+    </w:p>
+    <w:p>
+      <w:pPr>
+        <w:keepLines/>
+        <w:pBdr>
+          <w:left w:val="single" w:color="1B6CA8" w:sz="18" w:space="6"/>
+        </w:pBdr>
+        <w:shd w:fill="F4F4F4" w:val="clear"/>
+        <w:spacing w:after="200" w:before="100" w:line="264" w:lineRule="auto"/>
+        <w:ind w:left="140"/>
+      </w:pPr>
+      <w:r>
+        <w:rPr>
+          <w:rFonts w:ascii="Consolas" w:cs="Consolas" w:eastAsia="Consolas" w:hAnsi="Consolas"/>
+          <w:sz w:val="19"/>
+          <w:szCs w:val="19"/>
+        </w:rPr>
+        <w:t xml:space="preserve">WRITEALL("liste.txt", "eins" + CHR$(10) + "zwei")</w:t>
+      </w:r>
+      <w:r>
+        <w:rPr>
+          <w:rFonts w:ascii="Consolas" w:cs="Consolas" w:eastAsia="Consolas" w:hAnsi="Consolas"/>
+          <w:sz w:val="19"/>
+          <w:szCs w:val="19"/>
+        </w:rPr>
+        <w:br/>
+        <w:t xml:space="preserve">DIM z AS ARRAY OF STRING</w:t>
+      </w:r>
+      <w:r>
+        <w:rPr>
+          <w:rFonts w:ascii="Consolas" w:cs="Consolas" w:eastAsia="Consolas" w:hAnsi="Consolas"/>
+          <w:sz w:val="19"/>
+          <w:szCs w:val="19"/>
+        </w:rPr>
+        <w:br/>
+        <w:t xml:space="preserve">z = READLINES("liste.txt")</w:t>
+      </w:r>
+      <w:r>
+        <w:rPr>
+          <w:rFonts w:ascii="Consolas" w:cs="Consolas" w:eastAsia="Consolas" w:hAnsi="Consolas"/>
+          <w:sz w:val="19"/>
+          <w:szCs w:val="19"/>
+        </w:rPr>
+        <w:br/>
+        <w:t xml:space="preserve">PRINT LEN(z); ": "; z[0]; "/"; z[1]</w:t>
+      </w:r>
+    </w:p>
+    <w:p>
+      <w:pPr>
+        <w:keepNext/>
+        <w:spacing w:after="30" w:before="120"/>
+      </w:pPr>
+      <w:r>
+        <w:rPr>
+          <w:b/>
+          <w:bCs/>
+          <w:i/>
+          <w:iCs/>
+          <w:color w:val="6A6A6A"/>
+          <w:sz w:val="18"/>
+          <w:szCs w:val="18"/>
+        </w:rPr>
+        <w:t xml:space="preserve">Ausgabe</w:t>
+      </w:r>
+    </w:p>
+    <w:p>
+      <w:pPr>
+        <w:keepLines/>
+        <w:pBdr>
+          <w:left w:val="single" w:color="9AC79A" w:sz="18" w:space="6"/>
+        </w:pBdr>
+        <w:shd w:fill="EAF4EA" w:val="clear"/>
+        <w:spacing w:after="200" w:before="100" w:line="264" w:lineRule="auto"/>
+        <w:ind w:left="140"/>
+      </w:pPr>
+      <w:r>
+        <w:rPr>
+          <w:rFonts w:ascii="Consolas" w:cs="Consolas" w:eastAsia="Consolas" w:hAnsi="Consolas"/>
+          <w:sz w:val="19"/>
+          <w:szCs w:val="19"/>
+        </w:rPr>
+        <w:t xml:space="preserve">2: eins/zwei</w:t>
+      </w:r>
+    </w:p>
+    <w:p>
+      <w:pPr>
+        <w:keepNext/>
+        <w:keepLines/>
+        <w:pBdr>
+          <w:bottom w:val="single" w:color="DDD0C0" w:sz="4" w:space="2"/>
+        </w:pBdr>
+        <w:spacing w:after="40" w:before="360"/>
+      </w:pPr>
+      <w:r>
+        <w:rPr>
+          <w:rFonts w:ascii="Consolas" w:cs="Consolas" w:eastAsia="Consolas" w:hAnsi="Consolas"/>
+          <w:b/>
+          <w:bCs/>
+          <w:color w:val="9A3412"/>
+          <w:sz w:val="24"/>
+          <w:szCs w:val="24"/>
+        </w:rPr>
+        <w:t xml:space="preserve">APPENDFILE</w:t>
+      </w:r>
+    </w:p>
+    <w:p>
+      <w:pPr>
+        <w:keepNext/>
+        <w:spacing w:after="120"/>
+      </w:pPr>
+      <w:r>
+        <w:rPr>
+          <w:b/>
+          <w:bCs/>
+          <w:color w:val="6A6A6A"/>
+          <w:sz w:val="18"/>
+          <w:szCs w:val="18"/>
+        </w:rPr>
+        <w:t xml:space="preserve">Syntax:  </w:t>
+      </w:r>
+      <w:r>
+        <w:rPr>
+          <w:rFonts w:ascii="Consolas" w:cs="Consolas" w:eastAsia="Consolas" w:hAnsi="Consolas"/>
+          <w:color w:val="335577"/>
+          <w:sz w:val="19"/>
+          <w:szCs w:val="19"/>
+        </w:rPr>
+        <w:t xml:space="preserve">APPENDFILE(pfad$, text$)</w:t>
+      </w:r>
+    </w:p>
+    <w:p>
+      <w:pPr>
+        <w:spacing w:after="180" w:line="312" w:lineRule="auto"/>
+      </w:pPr>
+      <w:r>
+        <w:rPr>
+          <w:sz w:val="22"/>
+          <w:szCs w:val="22"/>
+        </w:rPr>
+        <w:t xml:space="preserve">Hängt Text ans Ende einer Datei an (legt sie an, falls sie noch nicht existiert).</w:t>
+      </w:r>
+    </w:p>
+    <w:p>
+      <w:pPr>
+        <w:keepNext/>
+        <w:spacing w:after="30" w:before="120"/>
+      </w:pPr>
+      <w:r>
+        <w:rPr>
+          <w:b/>
+          <w:bCs/>
+          <w:i/>
+          <w:iCs/>
+          <w:color w:val="6A6A6A"/>
+          <w:sz w:val="18"/>
+          <w:szCs w:val="18"/>
+        </w:rPr>
+        <w:t xml:space="preserve">Beispiel</w:t>
+      </w:r>
+    </w:p>
+    <w:p>
+      <w:pPr>
+        <w:keepLines/>
+        <w:pBdr>
+          <w:left w:val="single" w:color="1B6CA8" w:sz="18" w:space="6"/>
+        </w:pBdr>
+        <w:shd w:fill="F4F4F4" w:val="clear"/>
+        <w:spacing w:after="200" w:before="100" w:line="264" w:lineRule="auto"/>
+        <w:ind w:left="140"/>
+      </w:pPr>
+      <w:r>
+        <w:rPr>
+          <w:rFonts w:ascii="Consolas" w:cs="Consolas" w:eastAsia="Consolas" w:hAnsi="Consolas"/>
+          <w:sz w:val="19"/>
+          <w:szCs w:val="19"/>
+        </w:rPr>
+        <w:t xml:space="preserve">WRITEALL("log.txt", "Start")</w:t>
+      </w:r>
+      <w:r>
+        <w:rPr>
+          <w:rFonts w:ascii="Consolas" w:cs="Consolas" w:eastAsia="Consolas" w:hAnsi="Consolas"/>
+          <w:sz w:val="19"/>
+          <w:szCs w:val="19"/>
+        </w:rPr>
+        <w:br/>
+        <w:t xml:space="preserve">APPENDFILE("log.txt", CHR$(10) + "Ende")</w:t>
+      </w:r>
+      <w:r>
+        <w:rPr>
+          <w:rFonts w:ascii="Consolas" w:cs="Consolas" w:eastAsia="Consolas" w:hAnsi="Consolas"/>
+          <w:sz w:val="19"/>
+          <w:szCs w:val="19"/>
+        </w:rPr>
+        <w:br/>
+        <w:t xml:space="preserve">PRINT LEN(READLINES("log.txt"))</w:t>
+      </w:r>
+    </w:p>
+    <w:p>
+      <w:pPr>
+        <w:keepNext/>
+        <w:spacing w:after="30" w:before="120"/>
+      </w:pPr>
+      <w:r>
+        <w:rPr>
+          <w:b/>
+          <w:bCs/>
+          <w:i/>
+          <w:iCs/>
+          <w:color w:val="6A6A6A"/>
+          <w:sz w:val="18"/>
+          <w:szCs w:val="18"/>
+        </w:rPr>
+        <w:t xml:space="preserve">Ausgabe</w:t>
+      </w:r>
+    </w:p>
+    <w:p>
+      <w:pPr>
+        <w:keepLines/>
+        <w:pBdr>
+          <w:left w:val="single" w:color="9AC79A" w:sz="18" w:space="6"/>
+        </w:pBdr>
+        <w:shd w:fill="EAF4EA" w:val="clear"/>
+        <w:spacing w:after="200" w:before="100" w:line="264" w:lineRule="auto"/>
+        <w:ind w:left="140"/>
+      </w:pPr>
+      <w:r>
+        <w:rPr>
+          <w:rFonts w:ascii="Consolas" w:cs="Consolas" w:eastAsia="Consolas" w:hAnsi="Consolas"/>
+          <w:sz w:val="19"/>
+          <w:szCs w:val="19"/>
+        </w:rPr>
+        <w:t xml:space="preserve">2</w:t>
+      </w:r>
+    </w:p>
+    <w:p>
+      <w:pPr>
+        <w:keepNext/>
+        <w:keepLines/>
+        <w:pBdr>
+          <w:bottom w:val="single" w:color="DDD0C0" w:sz="4" w:space="2"/>
+        </w:pBdr>
+        <w:spacing w:after="40" w:before="360"/>
+      </w:pPr>
+      <w:r>
+        <w:rPr>
+          <w:rFonts w:ascii="Consolas" w:cs="Consolas" w:eastAsia="Consolas" w:hAnsi="Consolas"/>
+          <w:b/>
+          <w:bCs/>
+          <w:color w:val="9A3412"/>
+          <w:sz w:val="24"/>
+          <w:szCs w:val="24"/>
+        </w:rPr>
+        <w:t xml:space="preserve">FILESIZE</w:t>
+      </w:r>
+    </w:p>
+    <w:p>
+      <w:pPr>
+        <w:keepNext/>
+        <w:spacing w:after="120"/>
+      </w:pPr>
+      <w:r>
+        <w:rPr>
+          <w:b/>
+          <w:bCs/>
+          <w:color w:val="6A6A6A"/>
+          <w:sz w:val="18"/>
+          <w:szCs w:val="18"/>
+        </w:rPr>
+        <w:t xml:space="preserve">Syntax:  </w:t>
+      </w:r>
+      <w:r>
+        <w:rPr>
+          <w:rFonts w:ascii="Consolas" w:cs="Consolas" w:eastAsia="Consolas" w:hAnsi="Consolas"/>
+          <w:color w:val="335577"/>
+          <w:sz w:val="19"/>
+          <w:szCs w:val="19"/>
+        </w:rPr>
+        <w:t xml:space="preserve">FILESIZE(pfad$)</w:t>
+      </w:r>
+    </w:p>
+    <w:p>
+      <w:pPr>
+        <w:spacing w:after="180" w:line="312" w:lineRule="auto"/>
+      </w:pPr>
+      <w:r>
+        <w:rPr>
+          <w:sz w:val="22"/>
+          <w:szCs w:val="22"/>
+        </w:rPr>
+        <w:t xml:space="preserve">Liefert die Größe der Datei in Bytes.</w:t>
+      </w:r>
+    </w:p>
+    <w:p>
+      <w:pPr>
+        <w:keepNext/>
+        <w:spacing w:after="30" w:before="120"/>
+      </w:pPr>
+      <w:r>
+        <w:rPr>
+          <w:b/>
+          <w:bCs/>
+          <w:i/>
+          <w:iCs/>
+          <w:color w:val="6A6A6A"/>
+          <w:sz w:val="18"/>
+          <w:szCs w:val="18"/>
+        </w:rPr>
+        <w:t xml:space="preserve">Beispiel</w:t>
+      </w:r>
+    </w:p>
+    <w:p>
+      <w:pPr>
+        <w:keepLines/>
+        <w:pBdr>
+          <w:left w:val="single" w:color="1B6CA8" w:sz="18" w:space="6"/>
+        </w:pBdr>
+        <w:shd w:fill="F4F4F4" w:val="clear"/>
+        <w:spacing w:after="200" w:before="100" w:line="264" w:lineRule="auto"/>
+        <w:ind w:left="140"/>
+      </w:pPr>
+      <w:r>
+        <w:rPr>
+          <w:rFonts w:ascii="Consolas" w:cs="Consolas" w:eastAsia="Consolas" w:hAnsi="Consolas"/>
+          <w:sz w:val="19"/>
+          <w:szCs w:val="19"/>
+        </w:rPr>
+        <w:t xml:space="preserve">WRITEALL("daten.txt", "12345")</w:t>
+      </w:r>
+      <w:r>
+        <w:rPr>
+          <w:rFonts w:ascii="Consolas" w:cs="Consolas" w:eastAsia="Consolas" w:hAnsi="Consolas"/>
+          <w:sz w:val="19"/>
+          <w:szCs w:val="19"/>
+        </w:rPr>
+        <w:br/>
+        <w:t xml:space="preserve">PRINT FILESIZE("daten.txt")</w:t>
+      </w:r>
+    </w:p>
+    <w:p>
+      <w:pPr>
+        <w:keepNext/>
+        <w:spacing w:after="30" w:before="120"/>
+      </w:pPr>
+      <w:r>
+        <w:rPr>
+          <w:b/>
+          <w:bCs/>
+          <w:i/>
+          <w:iCs/>
+          <w:color w:val="6A6A6A"/>
+          <w:sz w:val="18"/>
+          <w:szCs w:val="18"/>
+        </w:rPr>
+        <w:t xml:space="preserve">Ausgabe</w:t>
+      </w:r>
+    </w:p>
+    <w:p>
+      <w:pPr>
+        <w:keepLines/>
+        <w:pBdr>
+          <w:left w:val="single" w:color="9AC79A" w:sz="18" w:space="6"/>
+        </w:pBdr>
+        <w:shd w:fill="EAF4EA" w:val="clear"/>
+        <w:spacing w:after="200" w:before="100" w:line="264" w:lineRule="auto"/>
+        <w:ind w:left="140"/>
+      </w:pPr>
+      <w:r>
+        <w:rPr>
+          <w:rFonts w:ascii="Consolas" w:cs="Consolas" w:eastAsia="Consolas" w:hAnsi="Consolas"/>
+          <w:sz w:val="19"/>
+          <w:szCs w:val="19"/>
+        </w:rPr>
+        <w:t xml:space="preserve">5</w:t>
+      </w:r>
+    </w:p>
+    <w:p>
+      <w:pPr>
+        <w:pStyle w:val="Heading2"/>
+        <w:keepNext/>
+        <w:keepLines/>
+        <w:spacing w:after="120" w:before="280"/>
+      </w:pPr>
+      <w:r>
+        <w:t xml:space="preserve">Vorhandensein &amp; Verwaltung</w:t>
+      </w:r>
+    </w:p>
+    <w:p>
+      <w:pPr>
+        <w:keepNext/>
+        <w:keepLines/>
+        <w:pBdr>
+          <w:bottom w:val="single" w:color="DDD0C0" w:sz="4" w:space="2"/>
+        </w:pBdr>
+        <w:spacing w:after="40" w:before="360"/>
+      </w:pPr>
+      <w:r>
+        <w:rPr>
+          <w:rFonts w:ascii="Consolas" w:cs="Consolas" w:eastAsia="Consolas" w:hAnsi="Consolas"/>
+          <w:b/>
+          <w:bCs/>
+          <w:color w:val="9A3412"/>
+          <w:sz w:val="24"/>
+          <w:szCs w:val="24"/>
+        </w:rPr>
+        <w:t xml:space="preserve">FILEEXISTS</w:t>
+      </w:r>
+    </w:p>
+    <w:p>
+      <w:pPr>
+        <w:keepNext/>
+        <w:spacing w:after="120"/>
+      </w:pPr>
+      <w:r>
+        <w:rPr>
+          <w:b/>
+          <w:bCs/>
+          <w:color w:val="6A6A6A"/>
+          <w:sz w:val="18"/>
+          <w:szCs w:val="18"/>
+        </w:rPr>
+        <w:t xml:space="preserve">Syntax:  </w:t>
+      </w:r>
+      <w:r>
+        <w:rPr>
+          <w:rFonts w:ascii="Consolas" w:cs="Consolas" w:eastAsia="Consolas" w:hAnsi="Consolas"/>
+          <w:color w:val="335577"/>
+          <w:sz w:val="19"/>
+          <w:szCs w:val="19"/>
+        </w:rPr>
+        <w:t xml:space="preserve">FILEEXISTS(pfad$)</w:t>
+      </w:r>
+    </w:p>
+    <w:p>
+      <w:pPr>
+        <w:spacing w:after="180" w:line="312" w:lineRule="auto"/>
+      </w:pPr>
+      <w:r>
+        <w:rPr>
+          <w:sz w:val="22"/>
+          <w:szCs w:val="22"/>
+        </w:rPr>
+        <w:t xml:space="preserve">TRUE, wenn die Datei existiert. Praktisch, um vor dem Lesen zu prüfen, ob z. B. ein Spielstand vorhanden ist.</w:t>
+      </w:r>
+    </w:p>
+    <w:p>
+      <w:pPr>
+        <w:keepNext/>
+        <w:spacing w:after="30" w:before="120"/>
+      </w:pPr>
+      <w:r>
+        <w:rPr>
+          <w:b/>
+          <w:bCs/>
+          <w:i/>
+          <w:iCs/>
+          <w:color w:val="6A6A6A"/>
+          <w:sz w:val="18"/>
+          <w:szCs w:val="18"/>
+        </w:rPr>
+        <w:t xml:space="preserve">Beispiel</w:t>
+      </w:r>
+    </w:p>
+    <w:p>
+      <w:pPr>
+        <w:keepLines/>
+        <w:pBdr>
+          <w:left w:val="single" w:color="1B6CA8" w:sz="18" w:space="6"/>
+        </w:pBdr>
+        <w:shd w:fill="F4F4F4" w:val="clear"/>
+        <w:spacing w:after="200" w:before="100" w:line="264" w:lineRule="auto"/>
+        <w:ind w:left="140"/>
+      </w:pPr>
+      <w:r>
+        <w:rPr>
+          <w:rFonts w:ascii="Consolas" w:cs="Consolas" w:eastAsia="Consolas" w:hAnsi="Consolas"/>
+          <w:sz w:val="19"/>
+          <w:szCs w:val="19"/>
+        </w:rPr>
+        <w:t xml:space="preserve">WRITEALL("save.dat", "x")</w:t>
+      </w:r>
+      <w:r>
+        <w:rPr>
+          <w:rFonts w:ascii="Consolas" w:cs="Consolas" w:eastAsia="Consolas" w:hAnsi="Consolas"/>
+          <w:sz w:val="19"/>
+          <w:szCs w:val="19"/>
+        </w:rPr>
+        <w:br/>
+        <w:t xml:space="preserve">PRINT FILEEXISTS("save.dat")</w:t>
+      </w:r>
+      <w:r>
+        <w:rPr>
+          <w:rFonts w:ascii="Consolas" w:cs="Consolas" w:eastAsia="Consolas" w:hAnsi="Consolas"/>
+          <w:sz w:val="19"/>
+          <w:szCs w:val="19"/>
+        </w:rPr>
+        <w:br/>
+        <w:t xml:space="preserve">PRINT FILEEXISTS("gibtsnicht.dat")</w:t>
+      </w:r>
+    </w:p>
+    <w:p>
+      <w:pPr>
+        <w:keepNext/>
+        <w:spacing w:after="30" w:before="120"/>
+      </w:pPr>
+      <w:r>
+        <w:rPr>
+          <w:b/>
+          <w:bCs/>
+          <w:i/>
+          <w:iCs/>
+          <w:color w:val="6A6A6A"/>
+          <w:sz w:val="18"/>
+          <w:szCs w:val="18"/>
+        </w:rPr>
+        <w:t xml:space="preserve">Ausgabe</w:t>
+      </w:r>
+    </w:p>
+    <w:p>
+      <w:pPr>
+        <w:keepLines/>
+        <w:pBdr>
+          <w:left w:val="single" w:color="9AC79A" w:sz="18" w:space="6"/>
+        </w:pBdr>
+        <w:shd w:fill="EAF4EA" w:val="clear"/>
+        <w:spacing w:after="200" w:before="100" w:line="264" w:lineRule="auto"/>
+        <w:ind w:left="140"/>
+      </w:pPr>
+      <w:r>
+        <w:rPr>
+          <w:rFonts w:ascii="Consolas" w:cs="Consolas" w:eastAsia="Consolas" w:hAnsi="Consolas"/>
+          <w:sz w:val="19"/>
+          <w:szCs w:val="19"/>
+        </w:rPr>
+        <w:t xml:space="preserve">TRUE</w:t>
+      </w:r>
+      <w:r>
+        <w:rPr>
+          <w:rFonts w:ascii="Consolas" w:cs="Consolas" w:eastAsia="Consolas" w:hAnsi="Consolas"/>
+          <w:sz w:val="19"/>
+          <w:szCs w:val="19"/>
+        </w:rPr>
+        <w:br/>
+        <w:t xml:space="preserve">FALSE</w:t>
+      </w:r>
+    </w:p>
+    <w:p>
+      <w:pPr>
+        <w:keepNext/>
+        <w:keepLines/>
+        <w:pBdr>
+          <w:bottom w:val="single" w:color="DDD0C0" w:sz="4" w:space="2"/>
+        </w:pBdr>
+        <w:spacing w:after="40" w:before="360"/>
+      </w:pPr>
+      <w:r>
+        <w:rPr>
+          <w:rFonts w:ascii="Consolas" w:cs="Consolas" w:eastAsia="Consolas" w:hAnsi="Consolas"/>
+          <w:b/>
+          <w:bCs/>
+          <w:color w:val="9A3412"/>
+          <w:sz w:val="24"/>
+          <w:szCs w:val="24"/>
+        </w:rPr>
+        <w:t xml:space="preserve">COPYFILE · RENAME · DELETEFILE</w:t>
+      </w:r>
+    </w:p>
+    <w:p>
+      <w:pPr>
+        <w:keepNext/>
+        <w:spacing w:after="120"/>
+      </w:pPr>
+      <w:r>
+        <w:rPr>
+          <w:b/>
+          <w:bCs/>
+          <w:color w:val="6A6A6A"/>
+          <w:sz w:val="18"/>
+          <w:szCs w:val="18"/>
+        </w:rPr>
+        <w:t xml:space="preserve">Syntax:  </w:t>
+      </w:r>
+      <w:r>
+        <w:rPr>
+          <w:rFonts w:ascii="Consolas" w:cs="Consolas" w:eastAsia="Consolas" w:hAnsi="Consolas"/>
+          <w:color w:val="335577"/>
+          <w:sz w:val="19"/>
+          <w:szCs w:val="19"/>
+        </w:rPr>
+        <w:t xml:space="preserve">COPYFILE(src$, dst$)   RENAME(alt$, neu$)   DELETEFILE(pfad$)</w:t>
+      </w:r>
+    </w:p>
+    <w:p>
+      <w:pPr>
+        <w:spacing w:after="180" w:line="312" w:lineRule="auto"/>
+      </w:pPr>
+      <w:r>
+        <w:rPr>
+          <w:sz w:val="22"/>
+          <w:szCs w:val="22"/>
+        </w:rPr>
+        <w:t xml:space="preserve">COPYFILE kopiert eine Datei, RENAME benennt sie um bzw. verschiebt sie, DELETEFILE löscht sie.</w:t>
+      </w:r>
+    </w:p>
+    <w:p>
+      <w:pPr>
+        <w:keepNext/>
+        <w:spacing w:after="30" w:before="120"/>
+      </w:pPr>
+      <w:r>
+        <w:rPr>
+          <w:b/>
+          <w:bCs/>
+          <w:i/>
+          <w:iCs/>
+          <w:color w:val="6A6A6A"/>
+          <w:sz w:val="18"/>
+          <w:szCs w:val="18"/>
+        </w:rPr>
+        <w:t xml:space="preserve">Beispiel</w:t>
+      </w:r>
+    </w:p>
+    <w:p>
+      <w:pPr>
+        <w:keepLines/>
+        <w:pBdr>
+          <w:left w:val="single" w:color="1B6CA8" w:sz="18" w:space="6"/>
+        </w:pBdr>
+        <w:shd w:fill="F4F4F4" w:val="clear"/>
+        <w:spacing w:after="200" w:before="100" w:line="264" w:lineRule="auto"/>
+        <w:ind w:left="140"/>
+      </w:pPr>
+      <w:r>
+        <w:rPr>
+          <w:rFonts w:ascii="Consolas" w:cs="Consolas" w:eastAsia="Consolas" w:hAnsi="Consolas"/>
+          <w:sz w:val="19"/>
+          <w:szCs w:val="19"/>
+        </w:rPr>
+        <w:t xml:space="preserve">WRITEALL("a.txt", "hi")</w:t>
+      </w:r>
+      <w:r>
+        <w:rPr>
+          <w:rFonts w:ascii="Consolas" w:cs="Consolas" w:eastAsia="Consolas" w:hAnsi="Consolas"/>
+          <w:sz w:val="19"/>
+          <w:szCs w:val="19"/>
+        </w:rPr>
+        <w:br/>
+        <w:t xml:space="preserve">COPYFILE("a.txt", "b.txt")</w:t>
+      </w:r>
+      <w:r>
+        <w:rPr>
+          <w:rFonts w:ascii="Consolas" w:cs="Consolas" w:eastAsia="Consolas" w:hAnsi="Consolas"/>
+          <w:sz w:val="19"/>
+          <w:szCs w:val="19"/>
+        </w:rPr>
+        <w:br/>
+        <w:t xml:space="preserve">RENAME("b.txt", "c.txt")</w:t>
+      </w:r>
+      <w:r>
+        <w:rPr>
+          <w:rFonts w:ascii="Consolas" w:cs="Consolas" w:eastAsia="Consolas" w:hAnsi="Consolas"/>
+          <w:sz w:val="19"/>
+          <w:szCs w:val="19"/>
+        </w:rPr>
+        <w:br/>
+        <w:t xml:space="preserve">DELETEFILE("c.txt")</w:t>
+      </w:r>
+      <w:r>
+        <w:rPr>
+          <w:rFonts w:ascii="Consolas" w:cs="Consolas" w:eastAsia="Consolas" w:hAnsi="Consolas"/>
+          <w:sz w:val="19"/>
+          <w:szCs w:val="19"/>
+        </w:rPr>
+        <w:br/>
+        <w:t xml:space="preserve">PRINT FILEEXISTS("a.txt"); " "; FILEEXISTS("c.txt")</w:t>
+      </w:r>
+    </w:p>
+    <w:p>
+      <w:pPr>
+        <w:keepNext/>
+        <w:spacing w:after="30" w:before="120"/>
+      </w:pPr>
+      <w:r>
+        <w:rPr>
+          <w:b/>
+          <w:bCs/>
+          <w:i/>
+          <w:iCs/>
+          <w:color w:val="6A6A6A"/>
+          <w:sz w:val="18"/>
+          <w:szCs w:val="18"/>
+        </w:rPr>
+        <w:t xml:space="preserve">Ausgabe</w:t>
+      </w:r>
+    </w:p>
+    <w:p>
+      <w:pPr>
+        <w:keepLines/>
+        <w:pBdr>
+          <w:left w:val="single" w:color="9AC79A" w:sz="18" w:space="6"/>
+        </w:pBdr>
+        <w:shd w:fill="EAF4EA" w:val="clear"/>
+        <w:spacing w:after="200" w:before="100" w:line="264" w:lineRule="auto"/>
+        <w:ind w:left="140"/>
+      </w:pPr>
+      <w:r>
+        <w:rPr>
+          <w:rFonts w:ascii="Consolas" w:cs="Consolas" w:eastAsia="Consolas" w:hAnsi="Consolas"/>
+          <w:sz w:val="19"/>
+          <w:szCs w:val="19"/>
+        </w:rPr>
+        <w:t xml:space="preserve">TRUE FALSE</w:t>
+      </w:r>
+    </w:p>
+    <w:p>
+      <w:pPr>
+        <w:pStyle w:val="Heading2"/>
+        <w:keepNext/>
+        <w:keepLines/>
+        <w:spacing w:after="120" w:before="280"/>
+      </w:pPr>
+      <w:r>
+        <w:t xml:space="preserve">Verzeichnisse</w:t>
+      </w:r>
+    </w:p>
+    <w:p>
+      <w:pPr>
+        <w:keepNext/>
+        <w:keepLines/>
+        <w:pBdr>
+          <w:bottom w:val="single" w:color="DDD0C0" w:sz="4" w:space="2"/>
+        </w:pBdr>
+        <w:spacing w:after="40" w:before="360"/>
+      </w:pPr>
+      <w:r>
+        <w:rPr>
+          <w:rFonts w:ascii="Consolas" w:cs="Consolas" w:eastAsia="Consolas" w:hAnsi="Consolas"/>
+          <w:b/>
+          <w:bCs/>
+          <w:color w:val="9A3412"/>
+          <w:sz w:val="24"/>
+          <w:szCs w:val="24"/>
+        </w:rPr>
+        <w:t xml:space="preserve">MKDIR · DIREXISTS</w:t>
+      </w:r>
+    </w:p>
+    <w:p>
+      <w:pPr>
+        <w:keepNext/>
+        <w:spacing w:after="120"/>
+      </w:pPr>
+      <w:r>
+        <w:rPr>
+          <w:b/>
+          <w:bCs/>
+          <w:color w:val="6A6A6A"/>
+          <w:sz w:val="18"/>
+          <w:szCs w:val="18"/>
+        </w:rPr>
+        <w:t xml:space="preserve">Syntax:  </w:t>
+      </w:r>
+      <w:r>
+        <w:rPr>
+          <w:rFonts w:ascii="Consolas" w:cs="Consolas" w:eastAsia="Consolas" w:hAnsi="Consolas"/>
+          <w:color w:val="335577"/>
+          <w:sz w:val="19"/>
+          <w:szCs w:val="19"/>
+        </w:rPr>
+        <w:t xml:space="preserve">MKDIR(pfad$)   DIREXISTS(pfad$)</w:t>
+      </w:r>
+    </w:p>
+    <w:p>
+      <w:pPr>
+        <w:spacing w:after="180" w:line="312" w:lineRule="auto"/>
+      </w:pPr>
+      <w:r>
+        <w:rPr>
+          <w:sz w:val="22"/>
+          <w:szCs w:val="22"/>
+        </w:rPr>
+        <w:t xml:space="preserve">MKDIR legt ein Verzeichnis an (samt fehlender Elternverzeichnisse). DIREXISTS prüft, ob ein Verzeichnis vorhanden ist.</w:t>
+      </w:r>
+    </w:p>
+    <w:p>
+      <w:pPr>
+        <w:keepNext/>
+        <w:spacing w:after="30" w:before="120"/>
+      </w:pPr>
+      <w:r>
+        <w:rPr>
+          <w:b/>
+          <w:bCs/>
+          <w:i/>
+          <w:iCs/>
+          <w:color w:val="6A6A6A"/>
+          <w:sz w:val="18"/>
+          <w:szCs w:val="18"/>
+        </w:rPr>
+        <w:t xml:space="preserve">Beispiel</w:t>
+      </w:r>
+    </w:p>
+    <w:p>
+      <w:pPr>
+        <w:keepLines/>
+        <w:pBdr>
+          <w:left w:val="single" w:color="1B6CA8" w:sz="18" w:space="6"/>
+        </w:pBdr>
+        <w:shd w:fill="F4F4F4" w:val="clear"/>
+        <w:spacing w:after="200" w:before="100" w:line="264" w:lineRule="auto"/>
+        <w:ind w:left="140"/>
+      </w:pPr>
+      <w:r>
+        <w:rPr>
+          <w:rFonts w:ascii="Consolas" w:cs="Consolas" w:eastAsia="Consolas" w:hAnsi="Consolas"/>
+          <w:sz w:val="19"/>
+          <w:szCs w:val="19"/>
+        </w:rPr>
+        <w:t xml:space="preserve">MKDIR("saves")</w:t>
+      </w:r>
+      <w:r>
+        <w:rPr>
+          <w:rFonts w:ascii="Consolas" w:cs="Consolas" w:eastAsia="Consolas" w:hAnsi="Consolas"/>
+          <w:sz w:val="19"/>
+          <w:szCs w:val="19"/>
+        </w:rPr>
+        <w:br/>
+        <w:t xml:space="preserve">PRINT DIREXISTS("saves")</w:t>
+      </w:r>
+    </w:p>
+    <w:p>
+      <w:pPr>
+        <w:keepNext/>
+        <w:spacing w:after="30" w:before="120"/>
+      </w:pPr>
+      <w:r>
+        <w:rPr>
+          <w:b/>
+          <w:bCs/>
+          <w:i/>
+          <w:iCs/>
+          <w:color w:val="6A6A6A"/>
+          <w:sz w:val="18"/>
+          <w:szCs w:val="18"/>
+        </w:rPr>
+        <w:t xml:space="preserve">Ausgabe</w:t>
+      </w:r>
+    </w:p>
+    <w:p>
+      <w:pPr>
+        <w:keepLines/>
+        <w:pBdr>
+          <w:left w:val="single" w:color="9AC79A" w:sz="18" w:space="6"/>
+        </w:pBdr>
+        <w:shd w:fill="EAF4EA" w:val="clear"/>
+        <w:spacing w:after="200" w:before="100" w:line="264" w:lineRule="auto"/>
+        <w:ind w:left="140"/>
+      </w:pPr>
+      <w:r>
+        <w:rPr>
+          <w:rFonts w:ascii="Consolas" w:cs="Consolas" w:eastAsia="Consolas" w:hAnsi="Consolas"/>
+          <w:sz w:val="19"/>
+          <w:szCs w:val="19"/>
+        </w:rPr>
+        <w:t xml:space="preserve">TRUE</w:t>
+      </w:r>
+    </w:p>
+    <w:p>
+      <w:pPr>
+        <w:keepNext/>
+        <w:keepLines/>
+        <w:pBdr>
+          <w:bottom w:val="single" w:color="DDD0C0" w:sz="4" w:space="2"/>
+        </w:pBdr>
+        <w:spacing w:after="40" w:before="360"/>
+      </w:pPr>
+      <w:r>
+        <w:rPr>
+          <w:rFonts w:ascii="Consolas" w:cs="Consolas" w:eastAsia="Consolas" w:hAnsi="Consolas"/>
+          <w:b/>
+          <w:bCs/>
+          <w:color w:val="9A3412"/>
+          <w:sz w:val="24"/>
+          <w:szCs w:val="24"/>
+        </w:rPr>
+        <w:t xml:space="preserve">DIRLIST</w:t>
+      </w:r>
+    </w:p>
+    <w:p>
+      <w:pPr>
+        <w:keepNext/>
+        <w:spacing w:after="120"/>
+      </w:pPr>
+      <w:r>
+        <w:rPr>
+          <w:b/>
+          <w:bCs/>
+          <w:color w:val="6A6A6A"/>
+          <w:sz w:val="18"/>
+          <w:szCs w:val="18"/>
+        </w:rPr>
+        <w:t xml:space="preserve">Syntax:  </w:t>
+      </w:r>
+      <w:r>
+        <w:rPr>
+          <w:rFonts w:ascii="Consolas" w:cs="Consolas" w:eastAsia="Consolas" w:hAnsi="Consolas"/>
+          <w:color w:val="335577"/>
+          <w:sz w:val="19"/>
+          <w:szCs w:val="19"/>
+        </w:rPr>
+        <w:t xml:space="preserve">DIRLIST(pfad$)</w:t>
+      </w:r>
+    </w:p>
+    <w:p>
+      <w:pPr>
+        <w:spacing w:after="180" w:line="312" w:lineRule="auto"/>
+      </w:pPr>
+      <w:r>
+        <w:rPr>
+          <w:sz w:val="22"/>
+          <w:szCs w:val="22"/>
+        </w:rPr>
+        <w:t xml:space="preserve">Liefert die Namen der Einträge eines Verzeichnisses als (sortiertes) ARRAY OF STRING.</w:t>
+      </w:r>
+    </w:p>
+    <w:p>
+      <w:pPr>
+        <w:keepNext/>
+        <w:spacing w:after="30" w:before="120"/>
+      </w:pPr>
+      <w:r>
+        <w:rPr>
+          <w:b/>
+          <w:bCs/>
+          <w:i/>
+          <w:iCs/>
+          <w:color w:val="6A6A6A"/>
+          <w:sz w:val="18"/>
+          <w:szCs w:val="18"/>
+        </w:rPr>
+        <w:t xml:space="preserve">Beispiel</w:t>
+      </w:r>
+    </w:p>
+    <w:p>
+      <w:pPr>
+        <w:keepLines/>
+        <w:pBdr>
+          <w:left w:val="single" w:color="1B6CA8" w:sz="18" w:space="6"/>
+        </w:pBdr>
+        <w:shd w:fill="F4F4F4" w:val="clear"/>
+        <w:spacing w:after="200" w:before="100" w:line="264" w:lineRule="auto"/>
+        <w:ind w:left="140"/>
+      </w:pPr>
+      <w:r>
+        <w:rPr>
+          <w:rFonts w:ascii="Consolas" w:cs="Consolas" w:eastAsia="Consolas" w:hAnsi="Consolas"/>
+          <w:sz w:val="19"/>
+          <w:szCs w:val="19"/>
+        </w:rPr>
+        <w:t xml:space="preserve">MKDIR("ordner")</w:t>
+      </w:r>
+      <w:r>
+        <w:rPr>
+          <w:rFonts w:ascii="Consolas" w:cs="Consolas" w:eastAsia="Consolas" w:hAnsi="Consolas"/>
+          <w:sz w:val="19"/>
+          <w:szCs w:val="19"/>
+        </w:rPr>
+        <w:br/>
+        <w:t xml:space="preserve">WRITEALL("ordner/datei.txt", "x")</w:t>
+      </w:r>
+      <w:r>
+        <w:rPr>
+          <w:rFonts w:ascii="Consolas" w:cs="Consolas" w:eastAsia="Consolas" w:hAnsi="Consolas"/>
+          <w:sz w:val="19"/>
+          <w:szCs w:val="19"/>
+        </w:rPr>
+        <w:br/>
+        <w:t xml:space="preserve">DIM e AS ARRAY OF STRING</w:t>
+      </w:r>
+      <w:r>
+        <w:rPr>
+          <w:rFonts w:ascii="Consolas" w:cs="Consolas" w:eastAsia="Consolas" w:hAnsi="Consolas"/>
+          <w:sz w:val="19"/>
+          <w:szCs w:val="19"/>
+        </w:rPr>
+        <w:br/>
+        <w:t xml:space="preserve">e = DIRLIST("ordner")</w:t>
+      </w:r>
+      <w:r>
+        <w:rPr>
+          <w:rFonts w:ascii="Consolas" w:cs="Consolas" w:eastAsia="Consolas" w:hAnsi="Consolas"/>
+          <w:sz w:val="19"/>
+          <w:szCs w:val="19"/>
+        </w:rPr>
+        <w:br/>
+        <w:t xml:space="preserve">PRINT e[0]</w:t>
+      </w:r>
+    </w:p>
+    <w:p>
+      <w:pPr>
+        <w:keepNext/>
+        <w:spacing w:after="30" w:before="120"/>
+      </w:pPr>
+      <w:r>
+        <w:rPr>
+          <w:b/>
+          <w:bCs/>
+          <w:i/>
+          <w:iCs/>
+          <w:color w:val="6A6A6A"/>
+          <w:sz w:val="18"/>
+          <w:szCs w:val="18"/>
+        </w:rPr>
+        <w:t xml:space="preserve">Ausgabe</w:t>
+      </w:r>
+    </w:p>
+    <w:p>
+      <w:pPr>
+        <w:keepLines/>
+        <w:pBdr>
+          <w:left w:val="single" w:color="9AC79A" w:sz="18" w:space="6"/>
+        </w:pBdr>
+        <w:shd w:fill="EAF4EA" w:val="clear"/>
+        <w:spacing w:after="200" w:before="100" w:line="264" w:lineRule="auto"/>
+        <w:ind w:left="140"/>
+      </w:pPr>
+      <w:r>
+        <w:rPr>
+          <w:rFonts w:ascii="Consolas" w:cs="Consolas" w:eastAsia="Consolas" w:hAnsi="Consolas"/>
+          <w:sz w:val="19"/>
+          <w:szCs w:val="19"/>
+        </w:rPr>
+        <w:t xml:space="preserve">datei.txt</w:t>
+      </w:r>
+    </w:p>
+    <w:p>
+      <w:pPr>
+        <w:pStyle w:val="Heading2"/>
+        <w:keepNext/>
+        <w:keepLines/>
+        <w:spacing w:after="120" w:before="280"/>
+      </w:pPr>
+      <w:r>
+        <w:t xml:space="preserve">Pfade zusammenbauen</w:t>
+      </w:r>
+    </w:p>
+    <w:p>
+      <w:pPr>
+        <w:keepNext/>
+        <w:keepLines/>
+        <w:pBdr>
+          <w:bottom w:val="single" w:color="DDD0C0" w:sz="4" w:space="2"/>
+        </w:pBdr>
+        <w:spacing w:after="40" w:before="360"/>
+      </w:pPr>
+      <w:r>
+        <w:rPr>
+          <w:rFonts w:ascii="Consolas" w:cs="Consolas" w:eastAsia="Consolas" w:hAnsi="Consolas"/>
+          <w:b/>
+          <w:bCs/>
+          <w:color w:val="9A3412"/>
+          <w:sz w:val="24"/>
+          <w:szCs w:val="24"/>
+        </w:rPr>
+        <w:t xml:space="preserve">PATHJOIN</w:t>
+      </w:r>
+    </w:p>
+    <w:p>
+      <w:pPr>
+        <w:keepNext/>
+        <w:spacing w:after="120"/>
+      </w:pPr>
+      <w:r>
+        <w:rPr>
+          <w:b/>
+          <w:bCs/>
+          <w:color w:val="6A6A6A"/>
+          <w:sz w:val="18"/>
+          <w:szCs w:val="18"/>
+        </w:rPr>
+        <w:t xml:space="preserve">Syntax:  </w:t>
+      </w:r>
+      <w:r>
+        <w:rPr>
+          <w:rFonts w:ascii="Consolas" w:cs="Consolas" w:eastAsia="Consolas" w:hAnsi="Consolas"/>
+          <w:color w:val="335577"/>
+          <w:sz w:val="19"/>
+          <w:szCs w:val="19"/>
+        </w:rPr>
+        <w:t xml:space="preserve">PATHJOIN(teil1$, teil2$, ...)</w:t>
+      </w:r>
+    </w:p>
+    <w:p>
+      <w:pPr>
+        <w:spacing w:after="180" w:line="312" w:lineRule="auto"/>
+      </w:pPr>
+      <w:r>
+        <w:rPr>
+          <w:sz w:val="22"/>
+          <w:szCs w:val="22"/>
+        </w:rPr>
+        <w:t xml:space="preserve">Verbindet Pfadteile sauber mit Schrägstrichen – besser, als Strings von Hand mit "/" zu verketten.</w:t>
+      </w:r>
+    </w:p>
+    <w:p>
+      <w:pPr>
+        <w:keepNext/>
+        <w:spacing w:after="30" w:before="120"/>
+      </w:pPr>
+      <w:r>
+        <w:rPr>
+          <w:b/>
+          <w:bCs/>
+          <w:i/>
+          <w:iCs/>
+          <w:color w:val="6A6A6A"/>
+          <w:sz w:val="18"/>
+          <w:szCs w:val="18"/>
+        </w:rPr>
+        <w:t xml:space="preserve">Beispiel</w:t>
+      </w:r>
+    </w:p>
+    <w:p>
+      <w:pPr>
+        <w:keepLines/>
+        <w:pBdr>
+          <w:left w:val="single" w:color="1B6CA8" w:sz="18" w:space="6"/>
+        </w:pBdr>
+        <w:shd w:fill="F4F4F4" w:val="clear"/>
+        <w:spacing w:after="200" w:before="100" w:line="264" w:lineRule="auto"/>
+        <w:ind w:left="140"/>
+      </w:pPr>
+      <w:r>
+        <w:rPr>
+          <w:rFonts w:ascii="Consolas" w:cs="Consolas" w:eastAsia="Consolas" w:hAnsi="Consolas"/>
+          <w:sz w:val="19"/>
+          <w:szCs w:val="19"/>
+        </w:rPr>
+        <w:t xml:space="preserve">PRINT PATHJOIN("saves", "level1", "p.txt")</w:t>
+      </w:r>
+    </w:p>
+    <w:p>
+      <w:pPr>
+        <w:keepNext/>
+        <w:spacing w:after="30" w:before="120"/>
+      </w:pPr>
+      <w:r>
+        <w:rPr>
+          <w:b/>
+          <w:bCs/>
+          <w:i/>
+          <w:iCs/>
+          <w:color w:val="6A6A6A"/>
+          <w:sz w:val="18"/>
+          <w:szCs w:val="18"/>
+        </w:rPr>
+        <w:t xml:space="preserve">Ausgabe</w:t>
+      </w:r>
+    </w:p>
+    <w:p>
+      <w:pPr>
+        <w:keepLines/>
+        <w:pBdr>
+          <w:left w:val="single" w:color="9AC79A" w:sz="18" w:space="6"/>
+        </w:pBdr>
+        <w:shd w:fill="EAF4EA" w:val="clear"/>
+        <w:spacing w:after="200" w:before="100" w:line="264" w:lineRule="auto"/>
+        <w:ind w:left="140"/>
+      </w:pPr>
+      <w:r>
+        <w:rPr>
+          <w:rFonts w:ascii="Consolas" w:cs="Consolas" w:eastAsia="Consolas" w:hAnsi="Consolas"/>
+          <w:sz w:val="19"/>
+          <w:szCs w:val="19"/>
+        </w:rPr>
+        <w:t xml:space="preserve">saves/level1/p.txt</w:t>
+      </w:r>
+    </w:p>
+    <w:p>
+      <w:pPr>
+        <w:keepNext/>
+        <w:keepLines/>
+        <w:pBdr>
+          <w:bottom w:val="single" w:color="DDD0C0" w:sz="4" w:space="2"/>
+        </w:pBdr>
+        <w:spacing w:after="40" w:before="360"/>
+      </w:pPr>
+      <w:r>
+        <w:rPr>
+          <w:rFonts w:ascii="Consolas" w:cs="Consolas" w:eastAsia="Consolas" w:hAnsi="Consolas"/>
+          <w:b/>
+          <w:bCs/>
+          <w:color w:val="9A3412"/>
+          <w:sz w:val="24"/>
+          <w:szCs w:val="24"/>
+        </w:rPr>
+        <w:t xml:space="preserve">BASENAME · DIRNAME</w:t>
+      </w:r>
+    </w:p>
+    <w:p>
+      <w:pPr>
+        <w:keepNext/>
+        <w:spacing w:after="120"/>
+      </w:pPr>
+      <w:r>
+        <w:rPr>
+          <w:b/>
+          <w:bCs/>
+          <w:color w:val="6A6A6A"/>
+          <w:sz w:val="18"/>
+          <w:szCs w:val="18"/>
+        </w:rPr>
+        <w:t xml:space="preserve">Syntax:  </w:t>
+      </w:r>
+      <w:r>
+        <w:rPr>
+          <w:rFonts w:ascii="Consolas" w:cs="Consolas" w:eastAsia="Consolas" w:hAnsi="Consolas"/>
+          <w:color w:val="335577"/>
+          <w:sz w:val="19"/>
+          <w:szCs w:val="19"/>
+        </w:rPr>
+        <w:t xml:space="preserve">BASENAME(pfad$)   DIRNAME(pfad$)</w:t>
+      </w:r>
+    </w:p>
+    <w:p>
+      <w:pPr>
+        <w:spacing w:after="180" w:line="312" w:lineRule="auto"/>
+      </w:pPr>
+      <w:r>
+        <w:rPr>
+          <w:sz w:val="22"/>
+          <w:szCs w:val="22"/>
+        </w:rPr>
+        <w:t xml:space="preserve">BASENAME liefert den letzten Bestandteil eines Pfads (den Datei- oder Ordnernamen), DIRNAME den Verzeichnis-Anteil davor.</w:t>
+      </w:r>
+    </w:p>
+    <w:p>
+      <w:pPr>
+        <w:keepNext/>
+        <w:spacing w:after="30" w:before="120"/>
+      </w:pPr>
+      <w:r>
+        <w:rPr>
+          <w:b/>
+          <w:bCs/>
+          <w:i/>
+          <w:iCs/>
+          <w:color w:val="6A6A6A"/>
+          <w:sz w:val="18"/>
+          <w:szCs w:val="18"/>
+        </w:rPr>
+        <w:t xml:space="preserve">Beispiel</w:t>
+      </w:r>
+    </w:p>
+    <w:p>
+      <w:pPr>
+        <w:keepLines/>
+        <w:pBdr>
+          <w:left w:val="single" w:color="1B6CA8" w:sz="18" w:space="6"/>
+        </w:pBdr>
+        <w:shd w:fill="F4F4F4" w:val="clear"/>
+        <w:spacing w:after="200" w:before="100" w:line="264" w:lineRule="auto"/>
+        <w:ind w:left="140"/>
+      </w:pPr>
+      <w:r>
+        <w:rPr>
+          <w:rFonts w:ascii="Consolas" w:cs="Consolas" w:eastAsia="Consolas" w:hAnsi="Consolas"/>
+          <w:sz w:val="19"/>
+          <w:szCs w:val="19"/>
+        </w:rPr>
+        <w:t xml:space="preserve">PRINT BASENAME("saves/level1/p.txt")</w:t>
+      </w:r>
+      <w:r>
+        <w:rPr>
+          <w:rFonts w:ascii="Consolas" w:cs="Consolas" w:eastAsia="Consolas" w:hAnsi="Consolas"/>
+          <w:sz w:val="19"/>
+          <w:szCs w:val="19"/>
+        </w:rPr>
+        <w:br/>
+        <w:t xml:space="preserve">PRINT DIRNAME("saves/level1/p.txt")</w:t>
+      </w:r>
+    </w:p>
+    <w:p>
+      <w:pPr>
+        <w:keepNext/>
+        <w:spacing w:after="30" w:before="120"/>
+      </w:pPr>
+      <w:r>
+        <w:rPr>
+          <w:b/>
+          <w:bCs/>
+          <w:i/>
+          <w:iCs/>
+          <w:color w:val="6A6A6A"/>
+          <w:sz w:val="18"/>
+          <w:szCs w:val="18"/>
+        </w:rPr>
+        <w:t xml:space="preserve">Ausgabe</w:t>
+      </w:r>
+    </w:p>
+    <w:p>
+      <w:pPr>
+        <w:keepLines/>
+        <w:pBdr>
+          <w:left w:val="single" w:color="9AC79A" w:sz="18" w:space="6"/>
+        </w:pBdr>
+        <w:shd w:fill="EAF4EA" w:val="clear"/>
+        <w:spacing w:after="200" w:before="100" w:line="264" w:lineRule="auto"/>
+        <w:ind w:left="140"/>
+      </w:pPr>
+      <w:r>
+        <w:rPr>
+          <w:rFonts w:ascii="Consolas" w:cs="Consolas" w:eastAsia="Consolas" w:hAnsi="Consolas"/>
+          <w:sz w:val="19"/>
+          <w:szCs w:val="19"/>
+        </w:rPr>
+        <w:t xml:space="preserve">p.txt</w:t>
+      </w:r>
+      <w:r>
+        <w:rPr>
+          <w:rFonts w:ascii="Consolas" w:cs="Consolas" w:eastAsia="Consolas" w:hAnsi="Consolas"/>
+          <w:sz w:val="19"/>
+          <w:szCs w:val="19"/>
+        </w:rPr>
+        <w:br/>
+        <w:t xml:space="preserve">saves/level1</w:t>
+      </w:r>
+    </w:p>
+    <w:p>
+      <w:pPr>
+        <w:spacing w:before="60"/>
+      </w:pPr>
+    </w:p>
+    <w:tbl>
+      <w:tblPr>
+        <w:tblW w:type="dxa" w:w="9360"/>
+        <w:tblBorders>
+          <w:top w:val="single" w:color="auto" w:sz="4"/>
+          <w:left w:val="single" w:color="auto" w:sz="4"/>
+          <w:bottom w:val="single" w:color="auto" w:sz="4"/>
+          <w:right w:val="single" w:color="auto" w:sz="4"/>
+          <w:insideH w:val="single" w:color="auto" w:sz="4"/>
+          <w:insideV w:val="single" w:color="auto" w:sz="4"/>
+        </w:tblBorders>
+      </w:tblPr>
+      <w:tblGrid>
+        <w:gridCol w:w="9360"/>
+      </w:tblGrid>
+      <w:tr>
+        <w:trPr>
+          <w:cantSplit/>
+        </w:trPr>
+        <w:tc>
+          <w:tcPr>
+            <w:tcW w:type="dxa" w:w="9360"/>
+            <w:tcBorders>
+              <w:top w:val="single" w:color="9CC8E6" w:sz="6"/>
+              <w:left w:val="single" w:color="9CC8E6" w:sz="6"/>
+              <w:bottom w:val="single" w:color="9CC8E6" w:sz="6"/>
+              <w:right w:val="single" w:color="9CC8E6" w:sz="6"/>
+            </w:tcBorders>
+            <w:shd w:fill="E7F2FA" w:val="clear"/>
+            <w:tcMar>
+              <w:top w:type="dxa" w:w="140"/>
+              <w:left w:type="dxa" w:w="180"/>
+              <w:bottom w:type="dxa" w:w="140"/>
+              <w:right w:type="dxa" w:w="180"/>
+            </w:tcMar>
+          </w:tcPr>
+          <w:p>
+            <w:pPr>
+              <w:spacing w:after="40"/>
+            </w:pPr>
+            <w:r>
+              <w:rPr>
+                <w:b/>
+                <w:bCs/>
+                <w:color w:val="1B6CA8"/>
+                <w:sz w:val="22"/>
+                <w:szCs w:val="22"/>
+              </w:rPr>
+              <w:t xml:space="preserve">Speicherstände leicht gemacht</w:t>
+            </w:r>
+          </w:p>
+          <w:p>
+            <w:pPr>
+              <w:spacing w:after="0" w:line="312" w:lineRule="auto"/>
+            </w:pPr>
+            <w:r>
+              <w:rPr>
+                <w:sz w:val="22"/>
+                <w:szCs w:val="22"/>
+              </w:rPr>
+              <w:t xml:space="preserve">Für echte Spielstände musst du Dateien nicht selbst Zeile für Zeile verwalten: Das save-Modul (Teil V) bietet komfortable Save-Slots mit benannten Werten, und das json-Modul speichert ganze Datenstrukturen. Die rohen Datei-Befehle hier sind die Grundlage darunter.</w:t>
+            </w:r>
+          </w:p>
+        </w:tc>
+      </w:tr>
+    </w:tbl>
+    <w:p>
+      <w:pPr>
+        <w:spacing w:after="160"/>
+      </w:pPr>
+    </w:p>
+    <w:p>
+      <w:pPr>
+        <w:spacing w:after="180" w:line="312" w:lineRule="auto"/>
+      </w:pPr>
+      <w:r>
+        <w:rPr>
+          <w:sz w:val="22"/>
+          <w:szCs w:val="22"/>
+        </w:rPr>
+        <w:t xml:space="preserve">Damit endet Teil III. Du kennst nun die wichtigsten eingebauten Befehle für Konsole, Mathematik, Zufall, Text, Typen, Sammlungen, Zeit und Dateien. In Teil IV geht es um das, wofür GameBasic gemacht ist: Grafik, Sound und Spiele.</w:t>
+      </w:r>
     </w:p>
     <w:sectPr>
       <w:footerReference w:type="default" r:id="rId7"/>

</xml_diff>

<commit_message>
docs(buch): Teil IV + Kap 40 Das Fenster & Game-Loop (mit Screenshot)
Start Teil IV (Grafik/Sound/Spiele). SCREEN, Game-Loop (CLS/zeichnen/FLIP,
QUITREQUESTED), DELTA (framerate-unabhaengig), FPS/SETFPS, SCREENWIDTH/HEIGHT.
Erster echter Screenshot via Headless-Pipeline (figures/40_fenster.gb ->
images/40_fenster.png, eingebettet mit H.figure). Beispiel pro Befehl, verifiziert.

Co-Authored-By: Claude Opus 4.8 (1M context) <noreply@anthropic.com>
</commit_message>
<xml_diff>
--- a/buch-referenz/buch/GameBasic-Lehrbuch.docx
+++ b/buch-referenz/buch/GameBasic-Lehrbuch.docx
@@ -975,6 +975,60 @@
           <w:szCs w:val="22"/>
         </w:rPr>
         <w:t xml:space="preserve">	119</w:t>
+      </w:r>
+    </w:p>
+    <w:p>
+      <w:pPr>
+        <w:tabs>
+          <w:tab w:val="right" w:pos="9200" w:leader="dot"/>
+        </w:tabs>
+        <w:spacing w:after="40" w:before="120"/>
+        <w:ind/>
+      </w:pPr>
+      <w:r>
+        <w:rPr>
+          <w:b/>
+          <w:bCs/>
+          <w:color w:val="10507F"/>
+          <w:sz w:val="24"/>
+          <w:szCs w:val="24"/>
+        </w:rPr>
+        <w:t xml:space="preserve">Teil IV — Grafik, Sound &amp; Spiele</w:t>
+      </w:r>
+      <w:r>
+        <w:rPr>
+          <w:color w:val="555555"/>
+          <w:sz w:val="24"/>
+          <w:szCs w:val="24"/>
+        </w:rPr>
+        <w:t xml:space="preserve">	125</w:t>
+      </w:r>
+    </w:p>
+    <w:p>
+      <w:pPr>
+        <w:tabs>
+          <w:tab w:val="right" w:pos="9200" w:leader="dot"/>
+        </w:tabs>
+        <w:spacing w:after="20" w:before="0"/>
+        <w:ind w:left="280"/>
+      </w:pPr>
+      <w:r>
+        <w:rPr>
+          <w:b w:val="false"/>
+          <w:bCs w:val="false"/>
+          <w:color w:val="222222"/>
+          <w:sz w:val="22"/>
+          <w:szCs w:val="22"/>
+        </w:rPr>
+        <w:t xml:space="preserve">Das Fenster &amp; der Game-Loop</w:t>
+      </w:r>
+      <w:r>
+        <w:rPr>
+          <w:color w:val="555555"/>
+          <w:sz w:val="22"/>
+          <w:szCs w:val="22"/>
+        </w:rPr>
+        <w:t xml:space="preserve">	126</w:t>
       </w:r>
     </w:p>
     <w:p>
@@ -43150,6 +43204,1444 @@
         </w:rPr>
         <w:t xml:space="preserve">Damit endet Teil III. Du kennst nun die wichtigsten eingebauten Befehle für Konsole, Mathematik, Zufall, Text, Typen, Sammlungen, Zeit und Dateien. In Teil IV geht es um das, wofür GameBasic gemacht ist: Grafik, Sound und Spiele.</w:t>
       </w:r>
+    </w:p>
+    <w:p>
+      <w:pPr>
+        <w:pageBreakBefore/>
+        <w:spacing w:after="200" w:before="2600"/>
+        <w:jc w:val="center"/>
+      </w:pPr>
+      <w:r>
+        <w:rPr>
+          <w:b/>
+          <w:bCs/>
+          <w:color w:val="10507F"/>
+          <w:sz w:val="52"/>
+          <w:szCs w:val="52"/>
+        </w:rPr>
+        <w:t xml:space="preserve">Teil IV — Grafik, Sound &amp; Spiele</w:t>
+      </w:r>
+    </w:p>
+    <w:p>
+      <w:pPr>
+        <w:pStyle w:val="Heading1"/>
+        <w:keepNext/>
+        <w:keepLines/>
+        <w:pageBreakBefore/>
+        <w:pBdr>
+          <w:bottom w:val="single" w:color="1B6CA8" w:sz="12" w:space="4"/>
+        </w:pBdr>
+        <w:spacing w:after="160" w:before="0"/>
+      </w:pPr>
+      <w:r>
+        <w:t xml:space="preserve">Das Fenster &amp; der Game-Loop</w:t>
+      </w:r>
+    </w:p>
+    <w:p>
+      <w:pPr>
+        <w:spacing w:after="180" w:line="312" w:lineRule="auto"/>
+      </w:pPr>
+      <w:r>
+        <w:rPr>
+          <w:sz w:val="22"/>
+          <w:szCs w:val="22"/>
+        </w:rPr>
+        <w:t xml:space="preserve">Jetzt wird es bunt: In Teil IV verlässt du die Textkonsole und öffnest ein echtes Grafikfenster. Hier zeichnest du Formen und Bilder, spielst Töne ab, fragst Tastatur und Maus ab – kurz: Hier entstehen Spiele. All das übernimmt die Laufzeit gbrt; ein Grafikprogramm läuft also immer im gbrt-Fenster, nicht in der Konsole.</w:t>
+      </w:r>
+    </w:p>
+    <w:p>
+      <w:pPr>
+        <w:spacing w:after="180" w:line="312" w:lineRule="auto"/>
+      </w:pPr>
+      <w:r>
+        <w:rPr>
+          <w:sz w:val="22"/>
+          <w:szCs w:val="22"/>
+        </w:rPr>
+        <w:t xml:space="preserve">Bevor irgendetwas gezeichnet werden kann, muss ein Fenster geöffnet sein. Und weil ein Spiel sich ständig bewegt, läuft fast jedes Grafikprogramm in einer Schleife, die viele Male pro Sekunde ein neues Bild zeichnet. Dieses Kapitel erklärt beides: das Fenster und diesen Game-Loop.</w:t>
+      </w:r>
+    </w:p>
+    <w:p>
+      <w:pPr>
+        <w:pStyle w:val="Heading2"/>
+        <w:keepNext/>
+        <w:keepLines/>
+        <w:spacing w:after="120" w:before="280"/>
+      </w:pPr>
+      <w:r>
+        <w:t xml:space="preserve">Ein Fenster öffnen: SCREEN</w:t>
+      </w:r>
+    </w:p>
+    <w:p>
+      <w:pPr>
+        <w:keepNext/>
+        <w:keepLines/>
+        <w:pBdr>
+          <w:bottom w:val="single" w:color="DDD0C0" w:sz="4" w:space="2"/>
+        </w:pBdr>
+        <w:spacing w:after="40" w:before="360"/>
+      </w:pPr>
+      <w:r>
+        <w:rPr>
+          <w:rFonts w:ascii="Consolas" w:cs="Consolas" w:eastAsia="Consolas" w:hAnsi="Consolas"/>
+          <w:b/>
+          <w:bCs/>
+          <w:color w:val="9A3412"/>
+          <w:sz w:val="24"/>
+          <w:szCs w:val="24"/>
+        </w:rPr>
+        <w:t xml:space="preserve">SCREEN</w:t>
+      </w:r>
+    </w:p>
+    <w:p>
+      <w:pPr>
+        <w:keepNext/>
+        <w:spacing w:after="120"/>
+      </w:pPr>
+      <w:r>
+        <w:rPr>
+          <w:b/>
+          <w:bCs/>
+          <w:color w:val="6A6A6A"/>
+          <w:sz w:val="18"/>
+          <w:szCs w:val="18"/>
+        </w:rPr>
+        <w:t xml:space="preserve">Syntax:  </w:t>
+      </w:r>
+      <w:r>
+        <w:rPr>
+          <w:rFonts w:ascii="Consolas" w:cs="Consolas" w:eastAsia="Consolas" w:hAnsi="Consolas"/>
+          <w:color w:val="335577"/>
+          <w:sz w:val="19"/>
+          <w:szCs w:val="19"/>
+        </w:rPr>
+        <w:t xml:space="preserve">SCREEN(breite, höhe[, titel$[, skala]])</w:t>
+      </w:r>
+    </w:p>
+    <w:p>
+      <w:pPr>
+        <w:spacing w:after="180" w:line="312" w:lineRule="auto"/>
+      </w:pPr>
+      <w:r>
+        <w:rPr>
+          <w:sz w:val="22"/>
+          <w:szCs w:val="22"/>
+        </w:rPr>
+        <w:t xml:space="preserve">Öffnet das Grafikfenster mit der angegebenen logischen Größe in Pixeln. Optional ein Fenstertitel und eine Skalierung: skala &gt; 1 vergrößert jeden logischen Pixel (für einen Retro-Look). SCREEN muss vor allen anderen Grafikbefehlen stehen.</w:t>
+      </w:r>
+    </w:p>
+    <w:p>
+      <w:pPr>
+        <w:keepNext/>
+        <w:spacing w:after="30" w:before="120"/>
+      </w:pPr>
+      <w:r>
+        <w:rPr>
+          <w:b/>
+          <w:bCs/>
+          <w:i/>
+          <w:iCs/>
+          <w:color w:val="6A6A6A"/>
+          <w:sz w:val="18"/>
+          <w:szCs w:val="18"/>
+        </w:rPr>
+        <w:t xml:space="preserve">Beispiel</w:t>
+      </w:r>
+    </w:p>
+    <w:p>
+      <w:pPr>
+        <w:keepLines/>
+        <w:pBdr>
+          <w:left w:val="single" w:color="1B6CA8" w:sz="18" w:space="6"/>
+        </w:pBdr>
+        <w:shd w:fill="F4F4F4" w:val="clear"/>
+        <w:spacing w:after="200" w:before="100" w:line="264" w:lineRule="auto"/>
+        <w:ind w:left="140"/>
+      </w:pPr>
+      <w:r>
+        <w:rPr>
+          <w:rFonts w:ascii="Consolas" w:cs="Consolas" w:eastAsia="Consolas" w:hAnsi="Consolas"/>
+          <w:sz w:val="19"/>
+          <w:szCs w:val="19"/>
+        </w:rPr>
+        <w:t xml:space="preserve">SCREEN(480, 320, "Mein Spiel")</w:t>
+      </w:r>
+      <w:r>
+        <w:rPr>
+          <w:rFonts w:ascii="Consolas" w:cs="Consolas" w:eastAsia="Consolas" w:hAnsi="Consolas"/>
+          <w:sz w:val="19"/>
+          <w:szCs w:val="19"/>
+        </w:rPr>
+        <w:br/>
+        <w:t xml:space="preserve">PRINT SCREENWIDTH(); " x "; SCREENHEIGHT()</w:t>
+      </w:r>
+    </w:p>
+    <w:p>
+      <w:pPr>
+        <w:keepNext/>
+        <w:spacing w:after="30" w:before="120"/>
+      </w:pPr>
+      <w:r>
+        <w:rPr>
+          <w:b/>
+          <w:bCs/>
+          <w:i/>
+          <w:iCs/>
+          <w:color w:val="6A6A6A"/>
+          <w:sz w:val="18"/>
+          <w:szCs w:val="18"/>
+        </w:rPr>
+        <w:t xml:space="preserve">Ausgabe</w:t>
+      </w:r>
+    </w:p>
+    <w:p>
+      <w:pPr>
+        <w:keepLines/>
+        <w:pBdr>
+          <w:left w:val="single" w:color="9AC79A" w:sz="18" w:space="6"/>
+        </w:pBdr>
+        <w:shd w:fill="EAF4EA" w:val="clear"/>
+        <w:spacing w:after="200" w:before="100" w:line="264" w:lineRule="auto"/>
+        <w:ind w:left="140"/>
+      </w:pPr>
+      <w:r>
+        <w:rPr>
+          <w:rFonts w:ascii="Consolas" w:cs="Consolas" w:eastAsia="Consolas" w:hAnsi="Consolas"/>
+          <w:sz w:val="19"/>
+          <w:szCs w:val="19"/>
+        </w:rPr>
+        <w:t xml:space="preserve">480 x 320</w:t>
+      </w:r>
+    </w:p>
+    <w:p>
+      <w:pPr>
+        <w:pStyle w:val="Heading2"/>
+        <w:keepNext/>
+        <w:keepLines/>
+        <w:spacing w:after="120" w:before="280"/>
+      </w:pPr>
+      <w:r>
+        <w:t xml:space="preserve">Der Game-Loop</w:t>
+      </w:r>
+    </w:p>
+    <w:p>
+      <w:pPr>
+        <w:spacing w:after="180" w:line="312" w:lineRule="auto"/>
+      </w:pPr>
+      <w:r>
+        <w:rPr>
+          <w:sz w:val="22"/>
+          <w:szCs w:val="22"/>
+        </w:rPr>
+        <w:t xml:space="preserve">Ein Spiel zeigt nicht ein einziges Standbild, sondern viele Bilder pro Sekunde – so entsteht Bewegung. Der Game-Loop ist eine Schleife, die immer wieder dasselbe tut: das alte Bild löschen, die Szene neu zeichnen, das fertige Bild anzeigen. Drei Befehle bilden sein Gerüst:</w:t>
+      </w:r>
+    </w:p>
+    <w:p>
+      <w:pPr>
+        <w:pStyle w:val="ListParagraph"/>
+        <w:numPr>
+          <w:ilvl w:val="0"/>
+          <w:numId w:val="2"/>
+        </w:numPr>
+        <w:spacing w:after="100" w:line="312" w:lineRule="auto"/>
+      </w:pPr>
+      <w:r>
+        <w:rPr>
+          <w:b/>
+          <w:bCs/>
+          <w:sz w:val="22"/>
+          <w:szCs w:val="22"/>
+        </w:rPr>
+        <w:t xml:space="preserve">CLS([farbe])  </w:t>
+      </w:r>
+      <w:r>
+        <w:rPr>
+          <w:sz w:val="22"/>
+          <w:szCs w:val="22"/>
+        </w:rPr>
+        <w:t xml:space="preserve">löscht das Bild (füllt es mit einer Farbe, Standard Schwarz).</w:t>
+      </w:r>
+    </w:p>
+    <w:p>
+      <w:pPr>
+        <w:pStyle w:val="ListParagraph"/>
+        <w:numPr>
+          <w:ilvl w:val="0"/>
+          <w:numId w:val="2"/>
+        </w:numPr>
+        <w:spacing w:after="100" w:line="312" w:lineRule="auto"/>
+      </w:pPr>
+      <w:r>
+        <w:rPr>
+          <w:b/>
+          <w:bCs/>
+          <w:sz w:val="22"/>
+          <w:szCs w:val="22"/>
+        </w:rPr>
+        <w:t xml:space="preserve">… zeichnen …  </w:t>
+      </w:r>
+      <w:r>
+        <w:rPr>
+          <w:sz w:val="22"/>
+          <w:szCs w:val="22"/>
+        </w:rPr>
+        <w:t xml:space="preserve">alle Formen, Bilder und Texte dieses Bildes.</w:t>
+      </w:r>
+    </w:p>
+    <w:p>
+      <w:pPr>
+        <w:pStyle w:val="ListParagraph"/>
+        <w:numPr>
+          <w:ilvl w:val="0"/>
+          <w:numId w:val="2"/>
+        </w:numPr>
+        <w:spacing w:after="100" w:line="312" w:lineRule="auto"/>
+      </w:pPr>
+      <w:r>
+        <w:rPr>
+          <w:b/>
+          <w:bCs/>
+          <w:sz w:val="22"/>
+          <w:szCs w:val="22"/>
+        </w:rPr>
+        <w:t xml:space="preserve">FLIP()  </w:t>
+      </w:r>
+      <w:r>
+        <w:rPr>
+          <w:sz w:val="22"/>
+          <w:szCs w:val="22"/>
+        </w:rPr>
+        <w:t xml:space="preserve">zeigt das fertige Bild an und wartet kurz (synchronisiert auf 60 Bilder/Sekunde).</w:t>
+      </w:r>
+    </w:p>
+    <w:p>
+      <w:pPr>
+        <w:spacing w:after="180" w:line="312" w:lineRule="auto"/>
+      </w:pPr>
+      <w:r>
+        <w:rPr>
+          <w:sz w:val="22"/>
+          <w:szCs w:val="22"/>
+        </w:rPr>
+        <w:t xml:space="preserve">Die Schleife läuft, solange das Fenster offen ist – QUITREQUESTED() wird TRUE, sobald der Benutzer das Fenster schließt. Das ist das Grundgerüst praktisch jedes GameBasic-Spiels:</w:t>
+      </w:r>
+    </w:p>
+    <w:p>
+      <w:pPr>
+        <w:keepLines/>
+        <w:pBdr>
+          <w:left w:val="single" w:color="1B6CA8" w:sz="18" w:space="6"/>
+        </w:pBdr>
+        <w:shd w:fill="F4F4F4" w:val="clear"/>
+        <w:spacing w:after="200" w:before="100" w:line="264" w:lineRule="auto"/>
+        <w:ind w:left="140"/>
+      </w:pPr>
+      <w:r>
+        <w:rPr>
+          <w:rFonts w:ascii="Consolas" w:cs="Consolas" w:eastAsia="Consolas" w:hAnsi="Consolas"/>
+          <w:sz w:val="19"/>
+          <w:szCs w:val="19"/>
+        </w:rPr>
+        <w:t xml:space="preserve">SCREEN(480, 320, "Mein erstes Fenster")</w:t>
+      </w:r>
+      <w:r>
+        <w:rPr>
+          <w:rFonts w:ascii="Consolas" w:cs="Consolas" w:eastAsia="Consolas" w:hAnsi="Consolas"/>
+          <w:sz w:val="19"/>
+          <w:szCs w:val="19"/>
+        </w:rPr>
+        <w:br/>
+        <w:t xml:space="preserve"/>
+      </w:r>
+      <w:r>
+        <w:rPr>
+          <w:rFonts w:ascii="Consolas" w:cs="Consolas" w:eastAsia="Consolas" w:hAnsi="Consolas"/>
+          <w:sz w:val="19"/>
+          <w:szCs w:val="19"/>
+        </w:rPr>
+        <w:br/>
+        <w:t xml:space="preserve">WHILE NOT QUITREQUESTED()</w:t>
+      </w:r>
+      <w:r>
+        <w:rPr>
+          <w:rFonts w:ascii="Consolas" w:cs="Consolas" w:eastAsia="Consolas" w:hAnsi="Consolas"/>
+          <w:sz w:val="19"/>
+          <w:szCs w:val="19"/>
+        </w:rPr>
+        <w:br/>
+        <w:t xml:space="preserve">    CLS(RGB(22, 26, 44))                 ' Hintergrund löschen</w:t>
+      </w:r>
+      <w:r>
+        <w:rPr>
+          <w:rFonts w:ascii="Consolas" w:cs="Consolas" w:eastAsia="Consolas" w:hAnsi="Consolas"/>
+          <w:sz w:val="19"/>
+          <w:szCs w:val="19"/>
+        </w:rPr>
+        <w:br/>
+        <w:t xml:space="preserve">    TEXT(110, 120, "Mein erstes Fenster", RGB(120, 200, 255))</w:t>
+      </w:r>
+      <w:r>
+        <w:rPr>
+          <w:rFonts w:ascii="Consolas" w:cs="Consolas" w:eastAsia="Consolas" w:hAnsi="Consolas"/>
+          <w:sz w:val="19"/>
+          <w:szCs w:val="19"/>
+        </w:rPr>
+        <w:br/>
+        <w:t xml:space="preserve">    BOX(190, 165, 290, 215, RGB(255, 180, 40))</w:t>
+      </w:r>
+      <w:r>
+        <w:rPr>
+          <w:rFonts w:ascii="Consolas" w:cs="Consolas" w:eastAsia="Consolas" w:hAnsi="Consolas"/>
+          <w:sz w:val="19"/>
+          <w:szCs w:val="19"/>
+        </w:rPr>
+        <w:br/>
+        <w:t xml:space="preserve">    CIRCLE(240, 250, 18, RGB(90, 220, 140))</w:t>
+      </w:r>
+      <w:r>
+        <w:rPr>
+          <w:rFonts w:ascii="Consolas" w:cs="Consolas" w:eastAsia="Consolas" w:hAnsi="Consolas"/>
+          <w:sz w:val="19"/>
+          <w:szCs w:val="19"/>
+        </w:rPr>
+        <w:br/>
+        <w:t xml:space="preserve">    FLIP()                               ' Bild anzeigen</w:t>
+      </w:r>
+      <w:r>
+        <w:rPr>
+          <w:rFonts w:ascii="Consolas" w:cs="Consolas" w:eastAsia="Consolas" w:hAnsi="Consolas"/>
+          <w:sz w:val="19"/>
+          <w:szCs w:val="19"/>
+        </w:rPr>
+        <w:br/>
+        <w:t xml:space="preserve">WEND</w:t>
+      </w:r>
+    </w:p>
+    <w:p>
+      <w:pPr>
+        <w:keepNext/>
+        <w:spacing w:after="40" w:before="160"/>
+        <w:jc w:val="center"/>
+      </w:pPr>
+      <w:r>
+        <w:drawing>
+          <wp:inline distT="0" distB="0" distL="0" distR="0">
+            <wp:extent cx="4572000" cy="3048000"/>
+            <wp:effectExtent t="0" r="0" b="0" l="0"/>
+            <wp:docPr id="1" name="40_fenster.png" descr="Das Ergebnis des Game-Loops: ein Fenster mit Text und zwei Formen." title="Das Ergebnis des Game-Loops: ein Fenster mit Text und zwei Formen."/>
+            <wp:cNvGraphicFramePr>
+              <a:graphicFrameLocks xmlns:a="http://schemas.openxmlformats.org/drawingml/2006/main" noChangeAspect="1"/>
+            </wp:cNvGraphicFramePr>
+            <a:graphic xmlns:a="http://schemas.openxmlformats.org/drawingml/2006/main">
+              <a:graphicData uri="http://schemas.openxmlformats.org/drawingml/2006/picture">
+                <pic:pic xmlns:pic="http://schemas.openxmlformats.org/drawingml/2006/picture">
+                  <pic:nvPicPr>
+                    <pic:cNvPr id="0" name="" descr=""/>
+                    <pic:cNvPicPr>
+                      <a:picLocks noChangeAspect="1" noChangeArrowheads="1"/>
+                    </pic:cNvPicPr>
+                  </pic:nvPicPr>
+                  <pic:blipFill>
+                    <a:blip r:embed="rId8" cstate="none"/>
+                    <a:srcRect/>
+                    <a:stretch>
+                      <a:fillRect/>
+                    </a:stretch>
+                  </pic:blipFill>
+                  <pic:spPr bwMode="auto">
+                    <a:xfrm>
+                      <a:off x="0" y="0"/>
+                      <a:ext cx="4572000" cy="3048000"/>
+                    </a:xfrm>
+                    <a:prstGeom prst="rect">
+                      <a:avLst/>
+                    </a:prstGeom>
+                  </pic:spPr>
+                </pic:pic>
+              </a:graphicData>
+            </a:graphic>
+          </wp:inline>
+        </w:drawing>
+      </w:r>
+    </w:p>
+    <w:p>
+      <w:pPr>
+        <w:spacing w:after="200"/>
+        <w:jc w:val="center"/>
+      </w:pPr>
+      <w:r>
+        <w:rPr>
+          <w:i/>
+          <w:iCs/>
+          <w:color w:val="6A6A6A"/>
+          <w:sz w:val="18"/>
+          <w:szCs w:val="18"/>
+        </w:rPr>
+        <w:t xml:space="preserve">Das Ergebnis des Game-Loops: ein Fenster mit Text und zwei Formen.</w:t>
+      </w:r>
+    </w:p>
+    <w:p>
+      <w:pPr>
+        <w:spacing w:after="180" w:line="312" w:lineRule="auto"/>
+      </w:pPr>
+      <w:r>
+        <w:rPr>
+          <w:sz w:val="22"/>
+          <w:szCs w:val="22"/>
+        </w:rPr>
+        <w:t xml:space="preserve">Die einzelnen Zeichenbefehle (TEXT, BOX, CIRCLE …) lernst du im nächsten Kapitel im Detail kennen. Wichtig ist hier das Muster: CLS am Anfang, FLIP am Ende, dazwischen das Zeichnen – Bild für Bild.</w:t>
+      </w:r>
+    </w:p>
+    <w:p>
+      <w:pPr>
+        <w:keepNext/>
+        <w:keepLines/>
+        <w:pBdr>
+          <w:bottom w:val="single" w:color="DDD0C0" w:sz="4" w:space="2"/>
+        </w:pBdr>
+        <w:spacing w:after="40" w:before="360"/>
+      </w:pPr>
+      <w:r>
+        <w:rPr>
+          <w:rFonts w:ascii="Consolas" w:cs="Consolas" w:eastAsia="Consolas" w:hAnsi="Consolas"/>
+          <w:b/>
+          <w:bCs/>
+          <w:color w:val="9A3412"/>
+          <w:sz w:val="24"/>
+          <w:szCs w:val="24"/>
+        </w:rPr>
+        <w:t xml:space="preserve">CLS</w:t>
+      </w:r>
+    </w:p>
+    <w:p>
+      <w:pPr>
+        <w:keepNext/>
+        <w:spacing w:after="120"/>
+      </w:pPr>
+      <w:r>
+        <w:rPr>
+          <w:b/>
+          <w:bCs/>
+          <w:color w:val="6A6A6A"/>
+          <w:sz w:val="18"/>
+          <w:szCs w:val="18"/>
+        </w:rPr>
+        <w:t xml:space="preserve">Syntax:  </w:t>
+      </w:r>
+      <w:r>
+        <w:rPr>
+          <w:rFonts w:ascii="Consolas" w:cs="Consolas" w:eastAsia="Consolas" w:hAnsi="Consolas"/>
+          <w:color w:val="335577"/>
+          <w:sz w:val="19"/>
+          <w:szCs w:val="19"/>
+        </w:rPr>
+        <w:t xml:space="preserve">CLS([farbe])</w:t>
+      </w:r>
+    </w:p>
+    <w:p>
+      <w:pPr>
+        <w:spacing w:after="180" w:line="312" w:lineRule="auto"/>
+      </w:pPr>
+      <w:r>
+        <w:rPr>
+          <w:sz w:val="22"/>
+          <w:szCs w:val="22"/>
+        </w:rPr>
+        <w:t xml:space="preserve">Löscht den Zeichenpuffer, indem es ihn komplett mit einer Farbe füllt (ohne Argument schwarz). Steht üblicherweise als Erstes im Game-Loop, damit das vorige Bild verschwindet.</w:t>
+      </w:r>
+    </w:p>
+    <w:p>
+      <w:pPr>
+        <w:keepNext/>
+        <w:spacing w:after="30" w:before="120"/>
+      </w:pPr>
+      <w:r>
+        <w:rPr>
+          <w:b/>
+          <w:bCs/>
+          <w:i/>
+          <w:iCs/>
+          <w:color w:val="6A6A6A"/>
+          <w:sz w:val="18"/>
+          <w:szCs w:val="18"/>
+        </w:rPr>
+        <w:t xml:space="preserve">Beispiel</w:t>
+      </w:r>
+    </w:p>
+    <w:p>
+      <w:pPr>
+        <w:keepLines/>
+        <w:pBdr>
+          <w:left w:val="single" w:color="1B6CA8" w:sz="18" w:space="6"/>
+        </w:pBdr>
+        <w:shd w:fill="F4F4F4" w:val="clear"/>
+        <w:spacing w:after="200" w:before="100" w:line="264" w:lineRule="auto"/>
+        <w:ind w:left="140"/>
+      </w:pPr>
+      <w:r>
+        <w:rPr>
+          <w:rFonts w:ascii="Consolas" w:cs="Consolas" w:eastAsia="Consolas" w:hAnsi="Consolas"/>
+          <w:sz w:val="19"/>
+          <w:szCs w:val="19"/>
+        </w:rPr>
+        <w:t xml:space="preserve">SCREEN(320, 240)</w:t>
+      </w:r>
+      <w:r>
+        <w:rPr>
+          <w:rFonts w:ascii="Consolas" w:cs="Consolas" w:eastAsia="Consolas" w:hAnsi="Consolas"/>
+          <w:sz w:val="19"/>
+          <w:szCs w:val="19"/>
+        </w:rPr>
+        <w:br/>
+        <w:t xml:space="preserve">CLS(RGB(30, 30, 60))     ' dunkelblauer Hintergrund</w:t>
+      </w:r>
+      <w:r>
+        <w:rPr>
+          <w:rFonts w:ascii="Consolas" w:cs="Consolas" w:eastAsia="Consolas" w:hAnsi="Consolas"/>
+          <w:sz w:val="19"/>
+          <w:szCs w:val="19"/>
+        </w:rPr>
+        <w:br/>
+        <w:t xml:space="preserve">FLIP()</w:t>
+      </w:r>
+    </w:p>
+    <w:p>
+      <w:pPr>
+        <w:keepNext/>
+        <w:keepLines/>
+        <w:pBdr>
+          <w:bottom w:val="single" w:color="DDD0C0" w:sz="4" w:space="2"/>
+        </w:pBdr>
+        <w:spacing w:after="40" w:before="360"/>
+      </w:pPr>
+      <w:r>
+        <w:rPr>
+          <w:rFonts w:ascii="Consolas" w:cs="Consolas" w:eastAsia="Consolas" w:hAnsi="Consolas"/>
+          <w:b/>
+          <w:bCs/>
+          <w:color w:val="9A3412"/>
+          <w:sz w:val="24"/>
+          <w:szCs w:val="24"/>
+        </w:rPr>
+        <w:t xml:space="preserve">FLIP</w:t>
+      </w:r>
+    </w:p>
+    <w:p>
+      <w:pPr>
+        <w:keepNext/>
+        <w:spacing w:after="120"/>
+      </w:pPr>
+      <w:r>
+        <w:rPr>
+          <w:b/>
+          <w:bCs/>
+          <w:color w:val="6A6A6A"/>
+          <w:sz w:val="18"/>
+          <w:szCs w:val="18"/>
+        </w:rPr>
+        <w:t xml:space="preserve">Syntax:  </w:t>
+      </w:r>
+      <w:r>
+        <w:rPr>
+          <w:rFonts w:ascii="Consolas" w:cs="Consolas" w:eastAsia="Consolas" w:hAnsi="Consolas"/>
+          <w:color w:val="335577"/>
+          <w:sz w:val="19"/>
+          <w:szCs w:val="19"/>
+        </w:rPr>
+        <w:t xml:space="preserve">FLIP()</w:t>
+      </w:r>
+    </w:p>
+    <w:p>
+      <w:pPr>
+        <w:spacing w:after="180" w:line="312" w:lineRule="auto"/>
+      </w:pPr>
+      <w:r>
+        <w:rPr>
+          <w:sz w:val="22"/>
+          <w:szCs w:val="22"/>
+        </w:rPr>
+        <w:t xml:space="preserve">Zeigt das fertig gezeichnete Bild im Fenster an und wartet bis zum nächsten Frame (Standard: 60 pro Sekunde). Ohne FLIP bleibt das Gezeichnete unsichtbar.</w:t>
+      </w:r>
+    </w:p>
+    <w:p>
+      <w:pPr>
+        <w:keepNext/>
+        <w:spacing w:after="30" w:before="120"/>
+      </w:pPr>
+      <w:r>
+        <w:rPr>
+          <w:b/>
+          <w:bCs/>
+          <w:i/>
+          <w:iCs/>
+          <w:color w:val="6A6A6A"/>
+          <w:sz w:val="18"/>
+          <w:szCs w:val="18"/>
+        </w:rPr>
+        <w:t xml:space="preserve">Beispiel</w:t>
+      </w:r>
+    </w:p>
+    <w:p>
+      <w:pPr>
+        <w:keepLines/>
+        <w:pBdr>
+          <w:left w:val="single" w:color="1B6CA8" w:sz="18" w:space="6"/>
+        </w:pBdr>
+        <w:shd w:fill="F4F4F4" w:val="clear"/>
+        <w:spacing w:after="200" w:before="100" w:line="264" w:lineRule="auto"/>
+        <w:ind w:left="140"/>
+      </w:pPr>
+      <w:r>
+        <w:rPr>
+          <w:rFonts w:ascii="Consolas" w:cs="Consolas" w:eastAsia="Consolas" w:hAnsi="Consolas"/>
+          <w:sz w:val="19"/>
+          <w:szCs w:val="19"/>
+        </w:rPr>
+        <w:t xml:space="preserve">SCREEN(320, 240)</w:t>
+      </w:r>
+      <w:r>
+        <w:rPr>
+          <w:rFonts w:ascii="Consolas" w:cs="Consolas" w:eastAsia="Consolas" w:hAnsi="Consolas"/>
+          <w:sz w:val="19"/>
+          <w:szCs w:val="19"/>
+        </w:rPr>
+        <w:br/>
+        <w:t xml:space="preserve">CLS()</w:t>
+      </w:r>
+      <w:r>
+        <w:rPr>
+          <w:rFonts w:ascii="Consolas" w:cs="Consolas" w:eastAsia="Consolas" w:hAnsi="Consolas"/>
+          <w:sz w:val="19"/>
+          <w:szCs w:val="19"/>
+        </w:rPr>
+        <w:br/>
+        <w:t xml:space="preserve">CIRCLE(160, 120, 40, RGB(255, 200, 0))</w:t>
+      </w:r>
+      <w:r>
+        <w:rPr>
+          <w:rFonts w:ascii="Consolas" w:cs="Consolas" w:eastAsia="Consolas" w:hAnsi="Consolas"/>
+          <w:sz w:val="19"/>
+          <w:szCs w:val="19"/>
+        </w:rPr>
+        <w:br/>
+        <w:t xml:space="preserve">FLIP()                   ' erst jetzt wird es sichtbar</w:t>
+      </w:r>
+    </w:p>
+    <w:p>
+      <w:pPr>
+        <w:keepNext/>
+        <w:keepLines/>
+        <w:pBdr>
+          <w:bottom w:val="single" w:color="DDD0C0" w:sz="4" w:space="2"/>
+        </w:pBdr>
+        <w:spacing w:after="40" w:before="360"/>
+      </w:pPr>
+      <w:r>
+        <w:rPr>
+          <w:rFonts w:ascii="Consolas" w:cs="Consolas" w:eastAsia="Consolas" w:hAnsi="Consolas"/>
+          <w:b/>
+          <w:bCs/>
+          <w:color w:val="9A3412"/>
+          <w:sz w:val="24"/>
+          <w:szCs w:val="24"/>
+        </w:rPr>
+        <w:t xml:space="preserve">QUITREQUESTED</w:t>
+      </w:r>
+    </w:p>
+    <w:p>
+      <w:pPr>
+        <w:keepNext/>
+        <w:spacing w:after="120"/>
+      </w:pPr>
+      <w:r>
+        <w:rPr>
+          <w:b/>
+          <w:bCs/>
+          <w:color w:val="6A6A6A"/>
+          <w:sz w:val="18"/>
+          <w:szCs w:val="18"/>
+        </w:rPr>
+        <w:t xml:space="preserve">Syntax:  </w:t>
+      </w:r>
+      <w:r>
+        <w:rPr>
+          <w:rFonts w:ascii="Consolas" w:cs="Consolas" w:eastAsia="Consolas" w:hAnsi="Consolas"/>
+          <w:color w:val="335577"/>
+          <w:sz w:val="19"/>
+          <w:szCs w:val="19"/>
+        </w:rPr>
+        <w:t xml:space="preserve">QUITREQUESTED()</w:t>
+      </w:r>
+    </w:p>
+    <w:p>
+      <w:pPr>
+        <w:spacing w:after="180" w:line="312" w:lineRule="auto"/>
+      </w:pPr>
+      <w:r>
+        <w:rPr>
+          <w:sz w:val="22"/>
+          <w:szCs w:val="22"/>
+        </w:rPr>
+        <w:t xml:space="preserve">Liefert TRUE, sobald der Benutzer das Fenster schließen will (Schließen-Knopf). Damit beendet sich der Game-Loop sauber.</w:t>
+      </w:r>
+    </w:p>
+    <w:p>
+      <w:pPr>
+        <w:keepNext/>
+        <w:spacing w:after="30" w:before="120"/>
+      </w:pPr>
+      <w:r>
+        <w:rPr>
+          <w:b/>
+          <w:bCs/>
+          <w:i/>
+          <w:iCs/>
+          <w:color w:val="6A6A6A"/>
+          <w:sz w:val="18"/>
+          <w:szCs w:val="18"/>
+        </w:rPr>
+        <w:t xml:space="preserve">Beispiel</w:t>
+      </w:r>
+    </w:p>
+    <w:p>
+      <w:pPr>
+        <w:keepLines/>
+        <w:pBdr>
+          <w:left w:val="single" w:color="1B6CA8" w:sz="18" w:space="6"/>
+        </w:pBdr>
+        <w:shd w:fill="F4F4F4" w:val="clear"/>
+        <w:spacing w:after="200" w:before="100" w:line="264" w:lineRule="auto"/>
+        <w:ind w:left="140"/>
+      </w:pPr>
+      <w:r>
+        <w:rPr>
+          <w:rFonts w:ascii="Consolas" w:cs="Consolas" w:eastAsia="Consolas" w:hAnsi="Consolas"/>
+          <w:sz w:val="19"/>
+          <w:szCs w:val="19"/>
+        </w:rPr>
+        <w:t xml:space="preserve">SCREEN(320, 240)</w:t>
+      </w:r>
+      <w:r>
+        <w:rPr>
+          <w:rFonts w:ascii="Consolas" w:cs="Consolas" w:eastAsia="Consolas" w:hAnsi="Consolas"/>
+          <w:sz w:val="19"/>
+          <w:szCs w:val="19"/>
+        </w:rPr>
+        <w:br/>
+        <w:t xml:space="preserve">WHILE NOT QUITREQUESTED()</w:t>
+      </w:r>
+      <w:r>
+        <w:rPr>
+          <w:rFonts w:ascii="Consolas" w:cs="Consolas" w:eastAsia="Consolas" w:hAnsi="Consolas"/>
+          <w:sz w:val="19"/>
+          <w:szCs w:val="19"/>
+        </w:rPr>
+        <w:br/>
+        <w:t xml:space="preserve">    CLS()</w:t>
+      </w:r>
+      <w:r>
+        <w:rPr>
+          <w:rFonts w:ascii="Consolas" w:cs="Consolas" w:eastAsia="Consolas" w:hAnsi="Consolas"/>
+          <w:sz w:val="19"/>
+          <w:szCs w:val="19"/>
+        </w:rPr>
+        <w:br/>
+        <w:t xml:space="preserve">    FLIP()</w:t>
+      </w:r>
+      <w:r>
+        <w:rPr>
+          <w:rFonts w:ascii="Consolas" w:cs="Consolas" w:eastAsia="Consolas" w:hAnsi="Consolas"/>
+          <w:sz w:val="19"/>
+          <w:szCs w:val="19"/>
+        </w:rPr>
+        <w:br/>
+        <w:t xml:space="preserve">WEND</w:t>
+      </w:r>
+    </w:p>
+    <w:p>
+      <w:pPr>
+        <w:pStyle w:val="Heading2"/>
+        <w:keepNext/>
+        <w:keepLines/>
+        <w:spacing w:after="120" w:before="280"/>
+      </w:pPr>
+      <w:r>
+        <w:t xml:space="preserve">Bewegung mit gleichem Tempo: DELTA</w:t>
+      </w:r>
+    </w:p>
+    <w:p>
+      <w:pPr>
+        <w:spacing w:after="180" w:line="312" w:lineRule="auto"/>
+      </w:pPr>
+      <w:r>
+        <w:rPr>
+          <w:sz w:val="22"/>
+          <w:szCs w:val="22"/>
+        </w:rPr>
+        <w:t xml:space="preserve">Nicht jeder Computer schafft gleich viele Bilder pro Sekunde. Würdest du eine Figur bei jedem Bild um feste 5 Pixel bewegen, liefe sie auf einem schnellen Rechner schneller als auf einem langsamen. Die Lösung: DELTA() liefert die Zeit (in Sekunden) seit dem letzten Bild. Multiplizierst du deine Geschwindigkeit damit, ist die Bewegung auf jedem Rechner gleich schnell.</w:t>
+      </w:r>
+    </w:p>
+    <w:p>
+      <w:pPr>
+        <w:keepNext/>
+        <w:keepLines/>
+        <w:pBdr>
+          <w:bottom w:val="single" w:color="DDD0C0" w:sz="4" w:space="2"/>
+        </w:pBdr>
+        <w:spacing w:after="40" w:before="360"/>
+      </w:pPr>
+      <w:r>
+        <w:rPr>
+          <w:rFonts w:ascii="Consolas" w:cs="Consolas" w:eastAsia="Consolas" w:hAnsi="Consolas"/>
+          <w:b/>
+          <w:bCs/>
+          <w:color w:val="9A3412"/>
+          <w:sz w:val="24"/>
+          <w:szCs w:val="24"/>
+        </w:rPr>
+        <w:t xml:space="preserve">DELTA</w:t>
+      </w:r>
+    </w:p>
+    <w:p>
+      <w:pPr>
+        <w:keepNext/>
+        <w:spacing w:after="120"/>
+      </w:pPr>
+      <w:r>
+        <w:rPr>
+          <w:b/>
+          <w:bCs/>
+          <w:color w:val="6A6A6A"/>
+          <w:sz w:val="18"/>
+          <w:szCs w:val="18"/>
+        </w:rPr>
+        <w:t xml:space="preserve">Syntax:  </w:t>
+      </w:r>
+      <w:r>
+        <w:rPr>
+          <w:rFonts w:ascii="Consolas" w:cs="Consolas" w:eastAsia="Consolas" w:hAnsi="Consolas"/>
+          <w:color w:val="335577"/>
+          <w:sz w:val="19"/>
+          <w:szCs w:val="19"/>
+        </w:rPr>
+        <w:t xml:space="preserve">DELTA()</w:t>
+      </w:r>
+    </w:p>
+    <w:p>
+      <w:pPr>
+        <w:spacing w:after="180" w:line="312" w:lineRule="auto"/>
+      </w:pPr>
+      <w:r>
+        <w:rPr>
+          <w:sz w:val="22"/>
+          <w:szCs w:val="22"/>
+        </w:rPr>
+        <w:t xml:space="preserve">Liefert die seit dem letzten FLIP vergangene Zeit in Sekunden (eine kleine Kommazahl). Multipliziere Geschwindigkeiten damit, um framerate-unabhängige Bewegung zu erhalten.</w:t>
+      </w:r>
+    </w:p>
+    <w:p>
+      <w:pPr>
+        <w:keepNext/>
+        <w:spacing w:after="30" w:before="120"/>
+      </w:pPr>
+      <w:r>
+        <w:rPr>
+          <w:b/>
+          <w:bCs/>
+          <w:i/>
+          <w:iCs/>
+          <w:color w:val="6A6A6A"/>
+          <w:sz w:val="18"/>
+          <w:szCs w:val="18"/>
+        </w:rPr>
+        <w:t xml:space="preserve">Beispiel</w:t>
+      </w:r>
+    </w:p>
+    <w:p>
+      <w:pPr>
+        <w:keepLines/>
+        <w:pBdr>
+          <w:left w:val="single" w:color="1B6CA8" w:sz="18" w:space="6"/>
+        </w:pBdr>
+        <w:shd w:fill="F4F4F4" w:val="clear"/>
+        <w:spacing w:after="200" w:before="100" w:line="264" w:lineRule="auto"/>
+        <w:ind w:left="140"/>
+      </w:pPr>
+      <w:r>
+        <w:rPr>
+          <w:rFonts w:ascii="Consolas" w:cs="Consolas" w:eastAsia="Consolas" w:hAnsi="Consolas"/>
+          <w:sz w:val="19"/>
+          <w:szCs w:val="19"/>
+        </w:rPr>
+        <w:t xml:space="preserve">DIM x AS FLOAT</w:t>
+      </w:r>
+      <w:r>
+        <w:rPr>
+          <w:rFonts w:ascii="Consolas" w:cs="Consolas" w:eastAsia="Consolas" w:hAnsi="Consolas"/>
+          <w:sz w:val="19"/>
+          <w:szCs w:val="19"/>
+        </w:rPr>
+        <w:br/>
+        <w:t xml:space="preserve">x = 0.0</w:t>
+      </w:r>
+      <w:r>
+        <w:rPr>
+          <w:rFonts w:ascii="Consolas" w:cs="Consolas" w:eastAsia="Consolas" w:hAnsi="Consolas"/>
+          <w:sz w:val="19"/>
+          <w:szCs w:val="19"/>
+        </w:rPr>
+        <w:br/>
+        <w:t xml:space="preserve">SCREEN(320, 240)</w:t>
+      </w:r>
+      <w:r>
+        <w:rPr>
+          <w:rFonts w:ascii="Consolas" w:cs="Consolas" w:eastAsia="Consolas" w:hAnsi="Consolas"/>
+          <w:sz w:val="19"/>
+          <w:szCs w:val="19"/>
+        </w:rPr>
+        <w:br/>
+        <w:t xml:space="preserve">WHILE NOT QUITREQUESTED()</w:t>
+      </w:r>
+      <w:r>
+        <w:rPr>
+          <w:rFonts w:ascii="Consolas" w:cs="Consolas" w:eastAsia="Consolas" w:hAnsi="Consolas"/>
+          <w:sz w:val="19"/>
+          <w:szCs w:val="19"/>
+        </w:rPr>
+        <w:br/>
+        <w:t xml:space="preserve">    x = x + 80.0 * DELTA()    ' 80 Pixel pro Sekunde</w:t>
+      </w:r>
+      <w:r>
+        <w:rPr>
+          <w:rFonts w:ascii="Consolas" w:cs="Consolas" w:eastAsia="Consolas" w:hAnsi="Consolas"/>
+          <w:sz w:val="19"/>
+          <w:szCs w:val="19"/>
+        </w:rPr>
+        <w:br/>
+        <w:t xml:space="preserve">    CLS()</w:t>
+      </w:r>
+      <w:r>
+        <w:rPr>
+          <w:rFonts w:ascii="Consolas" w:cs="Consolas" w:eastAsia="Consolas" w:hAnsi="Consolas"/>
+          <w:sz w:val="19"/>
+          <w:szCs w:val="19"/>
+        </w:rPr>
+        <w:br/>
+        <w:t xml:space="preserve">    BOX(INT(x), 100, INT(x) + 20, 120, RGB(255, 180, 40))</w:t>
+      </w:r>
+      <w:r>
+        <w:rPr>
+          <w:rFonts w:ascii="Consolas" w:cs="Consolas" w:eastAsia="Consolas" w:hAnsi="Consolas"/>
+          <w:sz w:val="19"/>
+          <w:szCs w:val="19"/>
+        </w:rPr>
+        <w:br/>
+        <w:t xml:space="preserve">    FLIP()</w:t>
+      </w:r>
+      <w:r>
+        <w:rPr>
+          <w:rFonts w:ascii="Consolas" w:cs="Consolas" w:eastAsia="Consolas" w:hAnsi="Consolas"/>
+          <w:sz w:val="19"/>
+          <w:szCs w:val="19"/>
+        </w:rPr>
+        <w:br/>
+        <w:t xml:space="preserve">WEND</w:t>
+      </w:r>
+    </w:p>
+    <w:p>
+      <w:pPr>
+        <w:pStyle w:val="Heading2"/>
+        <w:keepNext/>
+        <w:keepLines/>
+        <w:spacing w:after="120" w:before="280"/>
+      </w:pPr>
+      <w:r>
+        <w:t xml:space="preserve">Bildrate steuern</w:t>
+      </w:r>
+    </w:p>
+    <w:p>
+      <w:pPr>
+        <w:keepNext/>
+        <w:keepLines/>
+        <w:pBdr>
+          <w:bottom w:val="single" w:color="DDD0C0" w:sz="4" w:space="2"/>
+        </w:pBdr>
+        <w:spacing w:after="40" w:before="360"/>
+      </w:pPr>
+      <w:r>
+        <w:rPr>
+          <w:rFonts w:ascii="Consolas" w:cs="Consolas" w:eastAsia="Consolas" w:hAnsi="Consolas"/>
+          <w:b/>
+          <w:bCs/>
+          <w:color w:val="9A3412"/>
+          <w:sz w:val="24"/>
+          <w:szCs w:val="24"/>
+        </w:rPr>
+        <w:t xml:space="preserve">FPS · SETFPS</w:t>
+      </w:r>
+    </w:p>
+    <w:p>
+      <w:pPr>
+        <w:keepNext/>
+        <w:spacing w:after="120"/>
+      </w:pPr>
+      <w:r>
+        <w:rPr>
+          <w:b/>
+          <w:bCs/>
+          <w:color w:val="6A6A6A"/>
+          <w:sz w:val="18"/>
+          <w:szCs w:val="18"/>
+        </w:rPr>
+        <w:t xml:space="preserve">Syntax:  </w:t>
+      </w:r>
+      <w:r>
+        <w:rPr>
+          <w:rFonts w:ascii="Consolas" w:cs="Consolas" w:eastAsia="Consolas" w:hAnsi="Consolas"/>
+          <w:color w:val="335577"/>
+          <w:sz w:val="19"/>
+          <w:szCs w:val="19"/>
+        </w:rPr>
+        <w:t xml:space="preserve">FPS()   SETFPS(n)</w:t>
+      </w:r>
+    </w:p>
+    <w:p>
+      <w:pPr>
+        <w:spacing w:after="180" w:line="312" w:lineRule="auto"/>
+      </w:pPr>
+      <w:r>
+        <w:rPr>
+          <w:sz w:val="22"/>
+          <w:szCs w:val="22"/>
+        </w:rPr>
+        <w:t xml:space="preserve">FPS liefert die aktuell erreichten Bilder pro Sekunde (gut zum Anzeigen). SETFPS legt die Ziel-Bildrate fest; SETFPS(0) hebt die Drosselung auf (so schnell wie möglich).</w:t>
+      </w:r>
+    </w:p>
+    <w:p>
+      <w:pPr>
+        <w:keepNext/>
+        <w:spacing w:after="30" w:before="120"/>
+      </w:pPr>
+      <w:r>
+        <w:rPr>
+          <w:b/>
+          <w:bCs/>
+          <w:i/>
+          <w:iCs/>
+          <w:color w:val="6A6A6A"/>
+          <w:sz w:val="18"/>
+          <w:szCs w:val="18"/>
+        </w:rPr>
+        <w:t xml:space="preserve">Beispiel</w:t>
+      </w:r>
+    </w:p>
+    <w:p>
+      <w:pPr>
+        <w:keepLines/>
+        <w:pBdr>
+          <w:left w:val="single" w:color="1B6CA8" w:sz="18" w:space="6"/>
+        </w:pBdr>
+        <w:shd w:fill="F4F4F4" w:val="clear"/>
+        <w:spacing w:after="200" w:before="100" w:line="264" w:lineRule="auto"/>
+        <w:ind w:left="140"/>
+      </w:pPr>
+      <w:r>
+        <w:rPr>
+          <w:rFonts w:ascii="Consolas" w:cs="Consolas" w:eastAsia="Consolas" w:hAnsi="Consolas"/>
+          <w:sz w:val="19"/>
+          <w:szCs w:val="19"/>
+        </w:rPr>
+        <w:t xml:space="preserve">SCREEN(320, 240)</w:t>
+      </w:r>
+      <w:r>
+        <w:rPr>
+          <w:rFonts w:ascii="Consolas" w:cs="Consolas" w:eastAsia="Consolas" w:hAnsi="Consolas"/>
+          <w:sz w:val="19"/>
+          <w:szCs w:val="19"/>
+        </w:rPr>
+        <w:br/>
+        <w:t xml:space="preserve">SETFPS(30)               ' auf 30 Bilder/Sekunde begrenzen</w:t>
+      </w:r>
+      <w:r>
+        <w:rPr>
+          <w:rFonts w:ascii="Consolas" w:cs="Consolas" w:eastAsia="Consolas" w:hAnsi="Consolas"/>
+          <w:sz w:val="19"/>
+          <w:szCs w:val="19"/>
+        </w:rPr>
+        <w:br/>
+        <w:t xml:space="preserve">WHILE NOT QUITREQUESTED()</w:t>
+      </w:r>
+      <w:r>
+        <w:rPr>
+          <w:rFonts w:ascii="Consolas" w:cs="Consolas" w:eastAsia="Consolas" w:hAnsi="Consolas"/>
+          <w:sz w:val="19"/>
+          <w:szCs w:val="19"/>
+        </w:rPr>
+        <w:br/>
+        <w:t xml:space="preserve">    CLS()</w:t>
+      </w:r>
+      <w:r>
+        <w:rPr>
+          <w:rFonts w:ascii="Consolas" w:cs="Consolas" w:eastAsia="Consolas" w:hAnsi="Consolas"/>
+          <w:sz w:val="19"/>
+          <w:szCs w:val="19"/>
+        </w:rPr>
+        <w:br/>
+        <w:t xml:space="preserve">    TEXT(10, 10, "FPS: " + STR$(FPS()))</w:t>
+      </w:r>
+      <w:r>
+        <w:rPr>
+          <w:rFonts w:ascii="Consolas" w:cs="Consolas" w:eastAsia="Consolas" w:hAnsi="Consolas"/>
+          <w:sz w:val="19"/>
+          <w:szCs w:val="19"/>
+        </w:rPr>
+        <w:br/>
+        <w:t xml:space="preserve">    FLIP()</w:t>
+      </w:r>
+      <w:r>
+        <w:rPr>
+          <w:rFonts w:ascii="Consolas" w:cs="Consolas" w:eastAsia="Consolas" w:hAnsi="Consolas"/>
+          <w:sz w:val="19"/>
+          <w:szCs w:val="19"/>
+        </w:rPr>
+        <w:br/>
+        <w:t xml:space="preserve">WEND</w:t>
+      </w:r>
+    </w:p>
+    <w:p>
+      <w:pPr>
+        <w:keepNext/>
+        <w:keepLines/>
+        <w:pBdr>
+          <w:bottom w:val="single" w:color="DDD0C0" w:sz="4" w:space="2"/>
+        </w:pBdr>
+        <w:spacing w:after="40" w:before="360"/>
+      </w:pPr>
+      <w:r>
+        <w:rPr>
+          <w:rFonts w:ascii="Consolas" w:cs="Consolas" w:eastAsia="Consolas" w:hAnsi="Consolas"/>
+          <w:b/>
+          <w:bCs/>
+          <w:color w:val="9A3412"/>
+          <w:sz w:val="24"/>
+          <w:szCs w:val="24"/>
+        </w:rPr>
+        <w:t xml:space="preserve">SCREENWIDTH · SCREENHEIGHT</w:t>
+      </w:r>
+    </w:p>
+    <w:p>
+      <w:pPr>
+        <w:keepNext/>
+        <w:spacing w:after="120"/>
+      </w:pPr>
+      <w:r>
+        <w:rPr>
+          <w:b/>
+          <w:bCs/>
+          <w:color w:val="6A6A6A"/>
+          <w:sz w:val="18"/>
+          <w:szCs w:val="18"/>
+        </w:rPr>
+        <w:t xml:space="preserve">Syntax:  </w:t>
+      </w:r>
+      <w:r>
+        <w:rPr>
+          <w:rFonts w:ascii="Consolas" w:cs="Consolas" w:eastAsia="Consolas" w:hAnsi="Consolas"/>
+          <w:color w:val="335577"/>
+          <w:sz w:val="19"/>
+          <w:szCs w:val="19"/>
+        </w:rPr>
+        <w:t xml:space="preserve">SCREENWIDTH()   SCREENHEIGHT()</w:t>
+      </w:r>
+    </w:p>
+    <w:p>
+      <w:pPr>
+        <w:spacing w:after="180" w:line="312" w:lineRule="auto"/>
+      </w:pPr>
+      <w:r>
+        <w:rPr>
+          <w:sz w:val="22"/>
+          <w:szCs w:val="22"/>
+        </w:rPr>
+        <w:t xml:space="preserve">Liefern die aktuelle Breite und Höhe des Fensters in Pixeln – praktisch, um etwas mittig zu platzieren, ohne feste Zahlen zu verwenden.</w:t>
+      </w:r>
+    </w:p>
+    <w:p>
+      <w:pPr>
+        <w:keepNext/>
+        <w:spacing w:after="30" w:before="120"/>
+      </w:pPr>
+      <w:r>
+        <w:rPr>
+          <w:b/>
+          <w:bCs/>
+          <w:i/>
+          <w:iCs/>
+          <w:color w:val="6A6A6A"/>
+          <w:sz w:val="18"/>
+          <w:szCs w:val="18"/>
+        </w:rPr>
+        <w:t xml:space="preserve">Beispiel</w:t>
+      </w:r>
+    </w:p>
+    <w:p>
+      <w:pPr>
+        <w:keepLines/>
+        <w:pBdr>
+          <w:left w:val="single" w:color="1B6CA8" w:sz="18" w:space="6"/>
+        </w:pBdr>
+        <w:shd w:fill="F4F4F4" w:val="clear"/>
+        <w:spacing w:after="200" w:before="100" w:line="264" w:lineRule="auto"/>
+        <w:ind w:left="140"/>
+      </w:pPr>
+      <w:r>
+        <w:rPr>
+          <w:rFonts w:ascii="Consolas" w:cs="Consolas" w:eastAsia="Consolas" w:hAnsi="Consolas"/>
+          <w:sz w:val="19"/>
+          <w:szCs w:val="19"/>
+        </w:rPr>
+        <w:t xml:space="preserve">SCREEN(480, 320)</w:t>
+      </w:r>
+      <w:r>
+        <w:rPr>
+          <w:rFonts w:ascii="Consolas" w:cs="Consolas" w:eastAsia="Consolas" w:hAnsi="Consolas"/>
+          <w:sz w:val="19"/>
+          <w:szCs w:val="19"/>
+        </w:rPr>
+        <w:br/>
+        <w:t xml:space="preserve">DIM mx AS INTEGER</w:t>
+      </w:r>
+      <w:r>
+        <w:rPr>
+          <w:rFonts w:ascii="Consolas" w:cs="Consolas" w:eastAsia="Consolas" w:hAnsi="Consolas"/>
+          <w:sz w:val="19"/>
+          <w:szCs w:val="19"/>
+        </w:rPr>
+        <w:br/>
+        <w:t xml:space="preserve">mx = SCREENWIDTH() \ 2     ' Bildmitte (x)</w:t>
+      </w:r>
+      <w:r>
+        <w:rPr>
+          <w:rFonts w:ascii="Consolas" w:cs="Consolas" w:eastAsia="Consolas" w:hAnsi="Consolas"/>
+          <w:sz w:val="19"/>
+          <w:szCs w:val="19"/>
+        </w:rPr>
+        <w:br/>
+        <w:t xml:space="preserve">PRINT mx</w:t>
+      </w:r>
+    </w:p>
+    <w:p>
+      <w:pPr>
+        <w:keepNext/>
+        <w:spacing w:after="30" w:before="120"/>
+      </w:pPr>
+      <w:r>
+        <w:rPr>
+          <w:b/>
+          <w:bCs/>
+          <w:i/>
+          <w:iCs/>
+          <w:color w:val="6A6A6A"/>
+          <w:sz w:val="18"/>
+          <w:szCs w:val="18"/>
+        </w:rPr>
+        <w:t xml:space="preserve">Ausgabe</w:t>
+      </w:r>
+    </w:p>
+    <w:p>
+      <w:pPr>
+        <w:keepLines/>
+        <w:pBdr>
+          <w:left w:val="single" w:color="9AC79A" w:sz="18" w:space="6"/>
+        </w:pBdr>
+        <w:shd w:fill="EAF4EA" w:val="clear"/>
+        <w:spacing w:after="200" w:before="100" w:line="264" w:lineRule="auto"/>
+        <w:ind w:left="140"/>
+      </w:pPr>
+      <w:r>
+        <w:rPr>
+          <w:rFonts w:ascii="Consolas" w:cs="Consolas" w:eastAsia="Consolas" w:hAnsi="Consolas"/>
+          <w:sz w:val="19"/>
+          <w:szCs w:val="19"/>
+        </w:rPr>
+        <w:t xml:space="preserve">240</w:t>
+      </w:r>
+    </w:p>
+    <w:p>
+      <w:pPr>
+        <w:spacing w:before="60"/>
+      </w:pPr>
+    </w:p>
+    <w:tbl>
+      <w:tblPr>
+        <w:tblW w:type="dxa" w:w="9360"/>
+        <w:tblBorders>
+          <w:top w:val="single" w:color="auto" w:sz="4"/>
+          <w:left w:val="single" w:color="auto" w:sz="4"/>
+          <w:bottom w:val="single" w:color="auto" w:sz="4"/>
+          <w:right w:val="single" w:color="auto" w:sz="4"/>
+          <w:insideH w:val="single" w:color="auto" w:sz="4"/>
+          <w:insideV w:val="single" w:color="auto" w:sz="4"/>
+        </w:tblBorders>
+      </w:tblPr>
+      <w:tblGrid>
+        <w:gridCol w:w="9360"/>
+      </w:tblGrid>
+      <w:tr>
+        <w:trPr>
+          <w:cantSplit/>
+        </w:trPr>
+        <w:tc>
+          <w:tcPr>
+            <w:tcW w:type="dxa" w:w="9360"/>
+            <w:tcBorders>
+              <w:top w:val="single" w:color="9CC8E6" w:sz="6"/>
+              <w:left w:val="single" w:color="9CC8E6" w:sz="6"/>
+              <w:bottom w:val="single" w:color="9CC8E6" w:sz="6"/>
+              <w:right w:val="single" w:color="9CC8E6" w:sz="6"/>
+            </w:tcBorders>
+            <w:shd w:fill="E7F2FA" w:val="clear"/>
+            <w:tcMar>
+              <w:top w:type="dxa" w:w="140"/>
+              <w:left w:type="dxa" w:w="180"/>
+              <w:bottom w:type="dxa" w:w="140"/>
+              <w:right w:type="dxa" w:w="180"/>
+            </w:tcMar>
+          </w:tcPr>
+          <w:p>
+            <w:pPr>
+              <w:spacing w:after="40"/>
+            </w:pPr>
+            <w:r>
+              <w:rPr>
+                <w:b/>
+                <w:bCs/>
+                <w:color w:val="1B6CA8"/>
+                <w:sz w:val="22"/>
+                <w:szCs w:val="22"/>
+              </w:rPr>
+              <w:t xml:space="preserve">Konsole vs. Fenster</w:t>
+            </w:r>
+          </w:p>
+          <w:p>
+            <w:pPr>
+              <w:spacing w:after="0" w:line="312" w:lineRule="auto"/>
+            </w:pPr>
+            <w:r>
+              <w:rPr>
+                <w:sz w:val="22"/>
+                <w:szCs w:val="22"/>
+              </w:rPr>
+              <w:t xml:space="preserve">PRINT und INPUT (Teil III) gehören zur Textkonsole. Sobald SCREEN läuft, gibst du Text mit TEXT ins Fenster und fragst Eingaben mit Tastatur-/Maus-Befehlen ab (Kapitel „Eingabe“). Mische beides nicht im selben Programmteil.</w:t>
+            </w:r>
+          </w:p>
+        </w:tc>
+      </w:tr>
+    </w:tbl>
+    <w:p>
+      <w:pPr>
+        <w:spacing w:after="160"/>
+      </w:pPr>
     </w:p>
     <w:sectPr>
       <w:footerReference w:type="default" r:id="rId7"/>

</xml_diff>

<commit_message>
docs(buch): Lehrbuch Kap 41 -- 2D-Zeichnen (mit Formen-Screenshot)
PLOT/LINE/BOX/RECT/CIRCLE/ELLIPSE(+OUTLINE)/TRIANGLE(+OUTLINE)/POLYGON(+OUTLINE)/
ARC/TEXT/TEXTROT, je mit Beispiel; Uebersichts-Screenshot aller Grundformen.
Warn-Kasten: gefuellte TRIANGLE/POLYGON brauchen CCW-Wicklung (raylib-Culling).
Koordinaten ab oben-links (y nach unten). Gegen gbrt verifiziert.

Co-Authored-By: Claude Opus 4.8 (1M context) <noreply@anthropic.com>
</commit_message>
<xml_diff>
--- a/buch-referenz/buch/GameBasic-Lehrbuch.docx
+++ b/buch-referenz/buch/GameBasic-Lehrbuch.docx
@@ -1029,6 +1029,33 @@
           <w:szCs w:val="22"/>
         </w:rPr>
         <w:t xml:space="preserve">	126</w:t>
+      </w:r>
+    </w:p>
+    <w:p>
+      <w:pPr>
+        <w:tabs>
+          <w:tab w:val="right" w:pos="9200" w:leader="dot"/>
+        </w:tabs>
+        <w:spacing w:after="20" w:before="0"/>
+        <w:ind w:left="280"/>
+      </w:pPr>
+      <w:r>
+        <w:rPr>
+          <w:b w:val="false"/>
+          <w:bCs w:val="false"/>
+          <w:color w:val="222222"/>
+          <w:sz w:val="22"/>
+          <w:szCs w:val="22"/>
+        </w:rPr>
+        <w:t xml:space="preserve">2D-Zeichnen</w:t>
+      </w:r>
+      <w:r>
+        <w:rPr>
+          <w:color w:val="555555"/>
+          <w:sz w:val="22"/>
+          <w:szCs w:val="22"/>
+        </w:rPr>
+        <w:t xml:space="preserve">	131</w:t>
       </w:r>
     </w:p>
     <w:p>
@@ -44633,6 +44660,1708 @@
                 <w:szCs w:val="22"/>
               </w:rPr>
               <w:t xml:space="preserve">PRINT und INPUT (Teil III) gehören zur Textkonsole. Sobald SCREEN läuft, gibst du Text mit TEXT ins Fenster und fragst Eingaben mit Tastatur-/Maus-Befehlen ab (Kapitel „Eingabe“). Mische beides nicht im selben Programmteil.</w:t>
+            </w:r>
+          </w:p>
+        </w:tc>
+      </w:tr>
+    </w:tbl>
+    <w:p>
+      <w:pPr>
+        <w:spacing w:after="160"/>
+      </w:pPr>
+    </w:p>
+    <w:p>
+      <w:pPr>
+        <w:pStyle w:val="Heading1"/>
+        <w:keepNext/>
+        <w:keepLines/>
+        <w:pageBreakBefore/>
+        <w:pBdr>
+          <w:bottom w:val="single" w:color="1B6CA8" w:sz="12" w:space="4"/>
+        </w:pBdr>
+        <w:spacing w:after="160" w:before="0"/>
+      </w:pPr>
+      <w:r>
+        <w:t xml:space="preserve">2D-Zeichnen</w:t>
+      </w:r>
+    </w:p>
+    <w:p>
+      <w:pPr>
+        <w:spacing w:after="180" w:line="312" w:lineRule="auto"/>
+      </w:pPr>
+      <w:r>
+        <w:rPr>
+          <w:sz w:val="22"/>
+          <w:szCs w:val="22"/>
+        </w:rPr>
+        <w:t xml:space="preserve">Mit dem Fenster aus dem letzten Kapitel kannst du jetzt zeichnen. GameBasic bietet alle Grundformen: Pixel, Linien, Rechtecke, Kreise, Dreiecke, Polygone, Ellipsen, Bögen und Text. Jeder Befehl wird zwischen CLS und FLIP aufgerufen (siehe Game-Loop). Das letzte Argument ist fast immer eine Farbe – als RGB(r, g, b) oder eine der Farbkonstanten (Kapitel „Farben“).</w:t>
+      </w:r>
+    </w:p>
+    <w:p>
+      <w:pPr>
+        <w:spacing w:after="180" w:line="312" w:lineRule="auto"/>
+      </w:pPr>
+      <w:r>
+        <w:rPr>
+          <w:sz w:val="22"/>
+          <w:szCs w:val="22"/>
+        </w:rPr>
+        <w:t xml:space="preserve">Das folgende Bild zeigt die wichtigsten Formen auf einen Blick; danach kommt jeder Befehl einzeln mit Beispiel.</w:t>
+      </w:r>
+    </w:p>
+    <w:p>
+      <w:pPr>
+        <w:keepNext/>
+        <w:spacing w:after="40" w:before="160"/>
+        <w:jc w:val="center"/>
+      </w:pPr>
+      <w:r>
+        <w:drawing>
+          <wp:inline distT="0" distB="0" distL="0" distR="0">
+            <wp:extent cx="4572000" cy="3048000"/>
+            <wp:effectExtent t="0" r="0" b="0" l="0"/>
+            <wp:docPr id="1" name="41_formen.png" descr="Die 2D-Grundformen: Linie, gefülltes und umrandetes Rechteck, Kreis, Dreieck, Ellipse, Polygon, Bogen und Text." title="Die 2D-Grundformen: Linie, gefülltes und umrandetes Rechteck, Kreis, Dreieck, Ellipse, Polygon, Bogen und Text."/>
+            <wp:cNvGraphicFramePr>
+              <a:graphicFrameLocks xmlns:a="http://schemas.openxmlformats.org/drawingml/2006/main" noChangeAspect="1"/>
+            </wp:cNvGraphicFramePr>
+            <a:graphic xmlns:a="http://schemas.openxmlformats.org/drawingml/2006/main">
+              <a:graphicData uri="http://schemas.openxmlformats.org/drawingml/2006/picture">
+                <pic:pic xmlns:pic="http://schemas.openxmlformats.org/drawingml/2006/picture">
+                  <pic:nvPicPr>
+                    <pic:cNvPr id="0" name="" descr=""/>
+                    <pic:cNvPicPr>
+                      <a:picLocks noChangeAspect="1" noChangeArrowheads="1"/>
+                    </pic:cNvPicPr>
+                  </pic:nvPicPr>
+                  <pic:blipFill>
+                    <a:blip r:embed="rId9" cstate="none"/>
+                    <a:srcRect/>
+                    <a:stretch>
+                      <a:fillRect/>
+                    </a:stretch>
+                  </pic:blipFill>
+                  <pic:spPr bwMode="auto">
+                    <a:xfrm>
+                      <a:off x="0" y="0"/>
+                      <a:ext cx="4572000" cy="3048000"/>
+                    </a:xfrm>
+                    <a:prstGeom prst="rect">
+                      <a:avLst/>
+                    </a:prstGeom>
+                  </pic:spPr>
+                </pic:pic>
+              </a:graphicData>
+            </a:graphic>
+          </wp:inline>
+        </w:drawing>
+      </w:r>
+    </w:p>
+    <w:p>
+      <w:pPr>
+        <w:spacing w:after="200"/>
+        <w:jc w:val="center"/>
+      </w:pPr>
+      <w:r>
+        <w:rPr>
+          <w:i/>
+          <w:iCs/>
+          <w:color w:val="6A6A6A"/>
+          <w:sz w:val="18"/>
+          <w:szCs w:val="18"/>
+        </w:rPr>
+        <w:t xml:space="preserve">Die 2D-Grundformen: Linie, gefülltes und umrandetes Rechteck, Kreis, Dreieck, Ellipse, Polygon, Bogen und Text.</w:t>
+      </w:r>
+    </w:p>
+    <w:p>
+      <w:pPr>
+        <w:spacing w:before="60"/>
+      </w:pPr>
+    </w:p>
+    <w:tbl>
+      <w:tblPr>
+        <w:tblW w:type="dxa" w:w="9360"/>
+        <w:tblBorders>
+          <w:top w:val="single" w:color="auto" w:sz="4"/>
+          <w:left w:val="single" w:color="auto" w:sz="4"/>
+          <w:bottom w:val="single" w:color="auto" w:sz="4"/>
+          <w:right w:val="single" w:color="auto" w:sz="4"/>
+          <w:insideH w:val="single" w:color="auto" w:sz="4"/>
+          <w:insideV w:val="single" w:color="auto" w:sz="4"/>
+        </w:tblBorders>
+      </w:tblPr>
+      <w:tblGrid>
+        <w:gridCol w:w="9360"/>
+      </w:tblGrid>
+      <w:tr>
+        <w:trPr>
+          <w:cantSplit/>
+        </w:trPr>
+        <w:tc>
+          <w:tcPr>
+            <w:tcW w:type="dxa" w:w="9360"/>
+            <w:tcBorders>
+              <w:top w:val="single" w:color="E0B96A" w:sz="6"/>
+              <w:left w:val="single" w:color="E0B96A" w:sz="6"/>
+              <w:bottom w:val="single" w:color="E0B96A" w:sz="6"/>
+              <w:right w:val="single" w:color="E0B96A" w:sz="6"/>
+            </w:tcBorders>
+            <w:shd w:fill="FDF3E0" w:val="clear"/>
+            <w:tcMar>
+              <w:top w:type="dxa" w:w="140"/>
+              <w:left w:type="dxa" w:w="180"/>
+              <w:bottom w:type="dxa" w:w="140"/>
+              <w:right w:type="dxa" w:w="180"/>
+            </w:tcMar>
+          </w:tcPr>
+          <w:p>
+            <w:pPr>
+              <w:spacing w:after="40"/>
+            </w:pPr>
+            <w:r>
+              <w:rPr>
+                <w:b/>
+                <w:bCs/>
+                <w:color w:val="9A6A1E"/>
+                <w:sz w:val="22"/>
+                <w:szCs w:val="22"/>
+              </w:rPr>
+              <w:t xml:space="preserve">Merke</w:t>
+            </w:r>
+          </w:p>
+          <w:p>
+            <w:pPr>
+              <w:spacing w:after="0" w:line="312" w:lineRule="auto"/>
+            </w:pPr>
+            <w:r>
+              <w:rPr>
+                <w:sz w:val="22"/>
+                <w:szCs w:val="22"/>
+              </w:rPr>
+              <w:t xml:space="preserve">Koordinaten zählen ab der linken oberen Ecke: x nach rechts, y nach UNTEN. (0, 0) ist also oben links. Bei BOX und RECT gibst du zwei Eckpunkte (x1, y1, x2, y2) an – beide eingeschlossen.</w:t>
+            </w:r>
+          </w:p>
+        </w:tc>
+      </w:tr>
+    </w:tbl>
+    <w:p>
+      <w:pPr>
+        <w:spacing w:after="160"/>
+      </w:pPr>
+    </w:p>
+    <w:p>
+      <w:pPr>
+        <w:pStyle w:val="Heading2"/>
+        <w:keepNext/>
+        <w:keepLines/>
+        <w:spacing w:after="120" w:before="280"/>
+      </w:pPr>
+      <w:r>
+        <w:t xml:space="preserve">Pixel &amp; Linien</w:t>
+      </w:r>
+    </w:p>
+    <w:p>
+      <w:pPr>
+        <w:keepNext/>
+        <w:keepLines/>
+        <w:pBdr>
+          <w:bottom w:val="single" w:color="DDD0C0" w:sz="4" w:space="2"/>
+        </w:pBdr>
+        <w:spacing w:after="40" w:before="360"/>
+      </w:pPr>
+      <w:r>
+        <w:rPr>
+          <w:rFonts w:ascii="Consolas" w:cs="Consolas" w:eastAsia="Consolas" w:hAnsi="Consolas"/>
+          <w:b/>
+          <w:bCs/>
+          <w:color w:val="9A3412"/>
+          <w:sz w:val="24"/>
+          <w:szCs w:val="24"/>
+        </w:rPr>
+        <w:t xml:space="preserve">PLOT</w:t>
+      </w:r>
+    </w:p>
+    <w:p>
+      <w:pPr>
+        <w:keepNext/>
+        <w:spacing w:after="120"/>
+      </w:pPr>
+      <w:r>
+        <w:rPr>
+          <w:b/>
+          <w:bCs/>
+          <w:color w:val="6A6A6A"/>
+          <w:sz w:val="18"/>
+          <w:szCs w:val="18"/>
+        </w:rPr>
+        <w:t xml:space="preserve">Syntax:  </w:t>
+      </w:r>
+      <w:r>
+        <w:rPr>
+          <w:rFonts w:ascii="Consolas" w:cs="Consolas" w:eastAsia="Consolas" w:hAnsi="Consolas"/>
+          <w:color w:val="335577"/>
+          <w:sz w:val="19"/>
+          <w:szCs w:val="19"/>
+        </w:rPr>
+        <w:t xml:space="preserve">PLOT(x, y[, farbe])</w:t>
+      </w:r>
+    </w:p>
+    <w:p>
+      <w:pPr>
+        <w:spacing w:after="180" w:line="312" w:lineRule="auto"/>
+      </w:pPr>
+      <w:r>
+        <w:rPr>
+          <w:sz w:val="22"/>
+          <w:szCs w:val="22"/>
+        </w:rPr>
+        <w:t xml:space="preserve">Setzt ein einzelnes Pixel.</w:t>
+      </w:r>
+    </w:p>
+    <w:p>
+      <w:pPr>
+        <w:keepNext/>
+        <w:spacing w:after="30" w:before="120"/>
+      </w:pPr>
+      <w:r>
+        <w:rPr>
+          <w:b/>
+          <w:bCs/>
+          <w:i/>
+          <w:iCs/>
+          <w:color w:val="6A6A6A"/>
+          <w:sz w:val="18"/>
+          <w:szCs w:val="18"/>
+        </w:rPr>
+        <w:t xml:space="preserve">Beispiel</w:t>
+      </w:r>
+    </w:p>
+    <w:p>
+      <w:pPr>
+        <w:keepLines/>
+        <w:pBdr>
+          <w:left w:val="single" w:color="1B6CA8" w:sz="18" w:space="6"/>
+        </w:pBdr>
+        <w:shd w:fill="F4F4F4" w:val="clear"/>
+        <w:spacing w:after="200" w:before="100" w:line="264" w:lineRule="auto"/>
+        <w:ind w:left="140"/>
+      </w:pPr>
+      <w:r>
+        <w:rPr>
+          <w:rFonts w:ascii="Consolas" w:cs="Consolas" w:eastAsia="Consolas" w:hAnsi="Consolas"/>
+          <w:sz w:val="19"/>
+          <w:szCs w:val="19"/>
+        </w:rPr>
+        <w:t xml:space="preserve">SCREEN(320, 240)</w:t>
+      </w:r>
+      <w:r>
+        <w:rPr>
+          <w:rFonts w:ascii="Consolas" w:cs="Consolas" w:eastAsia="Consolas" w:hAnsi="Consolas"/>
+          <w:sz w:val="19"/>
+          <w:szCs w:val="19"/>
+        </w:rPr>
+        <w:br/>
+        <w:t xml:space="preserve">CLS()</w:t>
+      </w:r>
+      <w:r>
+        <w:rPr>
+          <w:rFonts w:ascii="Consolas" w:cs="Consolas" w:eastAsia="Consolas" w:hAnsi="Consolas"/>
+          <w:sz w:val="19"/>
+          <w:szCs w:val="19"/>
+        </w:rPr>
+        <w:br/>
+        <w:t xml:space="preserve">PLOT(160, 120, RGB(255, 255, 255))</w:t>
+      </w:r>
+      <w:r>
+        <w:rPr>
+          <w:rFonts w:ascii="Consolas" w:cs="Consolas" w:eastAsia="Consolas" w:hAnsi="Consolas"/>
+          <w:sz w:val="19"/>
+          <w:szCs w:val="19"/>
+        </w:rPr>
+        <w:br/>
+        <w:t xml:space="preserve">FLIP()</w:t>
+      </w:r>
+    </w:p>
+    <w:p>
+      <w:pPr>
+        <w:keepNext/>
+        <w:keepLines/>
+        <w:pBdr>
+          <w:bottom w:val="single" w:color="DDD0C0" w:sz="4" w:space="2"/>
+        </w:pBdr>
+        <w:spacing w:after="40" w:before="360"/>
+      </w:pPr>
+      <w:r>
+        <w:rPr>
+          <w:rFonts w:ascii="Consolas" w:cs="Consolas" w:eastAsia="Consolas" w:hAnsi="Consolas"/>
+          <w:b/>
+          <w:bCs/>
+          <w:color w:val="9A3412"/>
+          <w:sz w:val="24"/>
+          <w:szCs w:val="24"/>
+        </w:rPr>
+        <w:t xml:space="preserve">LINE</w:t>
+      </w:r>
+    </w:p>
+    <w:p>
+      <w:pPr>
+        <w:keepNext/>
+        <w:spacing w:after="120"/>
+      </w:pPr>
+      <w:r>
+        <w:rPr>
+          <w:b/>
+          <w:bCs/>
+          <w:color w:val="6A6A6A"/>
+          <w:sz w:val="18"/>
+          <w:szCs w:val="18"/>
+        </w:rPr>
+        <w:t xml:space="preserve">Syntax:  </w:t>
+      </w:r>
+      <w:r>
+        <w:rPr>
+          <w:rFonts w:ascii="Consolas" w:cs="Consolas" w:eastAsia="Consolas" w:hAnsi="Consolas"/>
+          <w:color w:val="335577"/>
+          <w:sz w:val="19"/>
+          <w:szCs w:val="19"/>
+        </w:rPr>
+        <w:t xml:space="preserve">LINE(x1, y1, x2, y2[, farbe])</w:t>
+      </w:r>
+    </w:p>
+    <w:p>
+      <w:pPr>
+        <w:spacing w:after="180" w:line="312" w:lineRule="auto"/>
+      </w:pPr>
+      <w:r>
+        <w:rPr>
+          <w:sz w:val="22"/>
+          <w:szCs w:val="22"/>
+        </w:rPr>
+        <w:t xml:space="preserve">Zieht eine Linie von (x1, y1) nach (x2, y2).</w:t>
+      </w:r>
+    </w:p>
+    <w:p>
+      <w:pPr>
+        <w:keepNext/>
+        <w:spacing w:after="30" w:before="120"/>
+      </w:pPr>
+      <w:r>
+        <w:rPr>
+          <w:b/>
+          <w:bCs/>
+          <w:i/>
+          <w:iCs/>
+          <w:color w:val="6A6A6A"/>
+          <w:sz w:val="18"/>
+          <w:szCs w:val="18"/>
+        </w:rPr>
+        <w:t xml:space="preserve">Beispiel</w:t>
+      </w:r>
+    </w:p>
+    <w:p>
+      <w:pPr>
+        <w:keepLines/>
+        <w:pBdr>
+          <w:left w:val="single" w:color="1B6CA8" w:sz="18" w:space="6"/>
+        </w:pBdr>
+        <w:shd w:fill="F4F4F4" w:val="clear"/>
+        <w:spacing w:after="200" w:before="100" w:line="264" w:lineRule="auto"/>
+        <w:ind w:left="140"/>
+      </w:pPr>
+      <w:r>
+        <w:rPr>
+          <w:rFonts w:ascii="Consolas" w:cs="Consolas" w:eastAsia="Consolas" w:hAnsi="Consolas"/>
+          <w:sz w:val="19"/>
+          <w:szCs w:val="19"/>
+        </w:rPr>
+        <w:t xml:space="preserve">CLS()</w:t>
+      </w:r>
+      <w:r>
+        <w:rPr>
+          <w:rFonts w:ascii="Consolas" w:cs="Consolas" w:eastAsia="Consolas" w:hAnsi="Consolas"/>
+          <w:sz w:val="19"/>
+          <w:szCs w:val="19"/>
+        </w:rPr>
+        <w:br/>
+        <w:t xml:space="preserve">LINE(0, 0, 319, 239, RGB(255, 80, 80))</w:t>
+      </w:r>
+      <w:r>
+        <w:rPr>
+          <w:rFonts w:ascii="Consolas" w:cs="Consolas" w:eastAsia="Consolas" w:hAnsi="Consolas"/>
+          <w:sz w:val="19"/>
+          <w:szCs w:val="19"/>
+        </w:rPr>
+        <w:br/>
+        <w:t xml:space="preserve">FLIP()</w:t>
+      </w:r>
+    </w:p>
+    <w:p>
+      <w:pPr>
+        <w:pStyle w:val="Heading2"/>
+        <w:keepNext/>
+        <w:keepLines/>
+        <w:spacing w:after="120" w:before="280"/>
+      </w:pPr>
+      <w:r>
+        <w:t xml:space="preserve">Rechtecke</w:t>
+      </w:r>
+    </w:p>
+    <w:p>
+      <w:pPr>
+        <w:keepNext/>
+        <w:keepLines/>
+        <w:pBdr>
+          <w:bottom w:val="single" w:color="DDD0C0" w:sz="4" w:space="2"/>
+        </w:pBdr>
+        <w:spacing w:after="40" w:before="360"/>
+      </w:pPr>
+      <w:r>
+        <w:rPr>
+          <w:rFonts w:ascii="Consolas" w:cs="Consolas" w:eastAsia="Consolas" w:hAnsi="Consolas"/>
+          <w:b/>
+          <w:bCs/>
+          <w:color w:val="9A3412"/>
+          <w:sz w:val="24"/>
+          <w:szCs w:val="24"/>
+        </w:rPr>
+        <w:t xml:space="preserve">BOX</w:t>
+      </w:r>
+    </w:p>
+    <w:p>
+      <w:pPr>
+        <w:keepNext/>
+        <w:spacing w:after="120"/>
+      </w:pPr>
+      <w:r>
+        <w:rPr>
+          <w:b/>
+          <w:bCs/>
+          <w:color w:val="6A6A6A"/>
+          <w:sz w:val="18"/>
+          <w:szCs w:val="18"/>
+        </w:rPr>
+        <w:t xml:space="preserve">Syntax:  </w:t>
+      </w:r>
+      <w:r>
+        <w:rPr>
+          <w:rFonts w:ascii="Consolas" w:cs="Consolas" w:eastAsia="Consolas" w:hAnsi="Consolas"/>
+          <w:color w:val="335577"/>
+          <w:sz w:val="19"/>
+          <w:szCs w:val="19"/>
+        </w:rPr>
+        <w:t xml:space="preserve">BOX(x1, y1, x2, y2[, farbe])</w:t>
+      </w:r>
+    </w:p>
+    <w:p>
+      <w:pPr>
+        <w:spacing w:after="180" w:line="312" w:lineRule="auto"/>
+      </w:pPr>
+      <w:r>
+        <w:rPr>
+          <w:sz w:val="22"/>
+          <w:szCs w:val="22"/>
+        </w:rPr>
+        <w:t xml:space="preserve">Zeichnet ein GEFÜLLTES Rechteck zwischen den beiden Eckpunkten.</w:t>
+      </w:r>
+    </w:p>
+    <w:p>
+      <w:pPr>
+        <w:keepNext/>
+        <w:spacing w:after="30" w:before="120"/>
+      </w:pPr>
+      <w:r>
+        <w:rPr>
+          <w:b/>
+          <w:bCs/>
+          <w:i/>
+          <w:iCs/>
+          <w:color w:val="6A6A6A"/>
+          <w:sz w:val="18"/>
+          <w:szCs w:val="18"/>
+        </w:rPr>
+        <w:t xml:space="preserve">Beispiel</w:t>
+      </w:r>
+    </w:p>
+    <w:p>
+      <w:pPr>
+        <w:keepLines/>
+        <w:pBdr>
+          <w:left w:val="single" w:color="1B6CA8" w:sz="18" w:space="6"/>
+        </w:pBdr>
+        <w:shd w:fill="F4F4F4" w:val="clear"/>
+        <w:spacing w:after="200" w:before="100" w:line="264" w:lineRule="auto"/>
+        <w:ind w:left="140"/>
+      </w:pPr>
+      <w:r>
+        <w:rPr>
+          <w:rFonts w:ascii="Consolas" w:cs="Consolas" w:eastAsia="Consolas" w:hAnsi="Consolas"/>
+          <w:sz w:val="19"/>
+          <w:szCs w:val="19"/>
+        </w:rPr>
+        <w:t xml:space="preserve">CLS()</w:t>
+      </w:r>
+      <w:r>
+        <w:rPr>
+          <w:rFonts w:ascii="Consolas" w:cs="Consolas" w:eastAsia="Consolas" w:hAnsi="Consolas"/>
+          <w:sz w:val="19"/>
+          <w:szCs w:val="19"/>
+        </w:rPr>
+        <w:br/>
+        <w:t xml:space="preserve">BOX(50, 50, 150, 100, RGB(0, 200, 120))</w:t>
+      </w:r>
+      <w:r>
+        <w:rPr>
+          <w:rFonts w:ascii="Consolas" w:cs="Consolas" w:eastAsia="Consolas" w:hAnsi="Consolas"/>
+          <w:sz w:val="19"/>
+          <w:szCs w:val="19"/>
+        </w:rPr>
+        <w:br/>
+        <w:t xml:space="preserve">FLIP()</w:t>
+      </w:r>
+    </w:p>
+    <w:p>
+      <w:pPr>
+        <w:keepNext/>
+        <w:keepLines/>
+        <w:pBdr>
+          <w:bottom w:val="single" w:color="DDD0C0" w:sz="4" w:space="2"/>
+        </w:pBdr>
+        <w:spacing w:after="40" w:before="360"/>
+      </w:pPr>
+      <w:r>
+        <w:rPr>
+          <w:rFonts w:ascii="Consolas" w:cs="Consolas" w:eastAsia="Consolas" w:hAnsi="Consolas"/>
+          <w:b/>
+          <w:bCs/>
+          <w:color w:val="9A3412"/>
+          <w:sz w:val="24"/>
+          <w:szCs w:val="24"/>
+        </w:rPr>
+        <w:t xml:space="preserve">RECT</w:t>
+      </w:r>
+    </w:p>
+    <w:p>
+      <w:pPr>
+        <w:keepNext/>
+        <w:spacing w:after="120"/>
+      </w:pPr>
+      <w:r>
+        <w:rPr>
+          <w:b/>
+          <w:bCs/>
+          <w:color w:val="6A6A6A"/>
+          <w:sz w:val="18"/>
+          <w:szCs w:val="18"/>
+        </w:rPr>
+        <w:t xml:space="preserve">Syntax:  </w:t>
+      </w:r>
+      <w:r>
+        <w:rPr>
+          <w:rFonts w:ascii="Consolas" w:cs="Consolas" w:eastAsia="Consolas" w:hAnsi="Consolas"/>
+          <w:color w:val="335577"/>
+          <w:sz w:val="19"/>
+          <w:szCs w:val="19"/>
+        </w:rPr>
+        <w:t xml:space="preserve">RECT(x1, y1, x2, y2[, farbe])</w:t>
+      </w:r>
+    </w:p>
+    <w:p>
+      <w:pPr>
+        <w:spacing w:after="180" w:line="312" w:lineRule="auto"/>
+      </w:pPr>
+      <w:r>
+        <w:rPr>
+          <w:sz w:val="22"/>
+          <w:szCs w:val="22"/>
+        </w:rPr>
+        <w:t xml:space="preserve">Zeichnet nur den RAHMEN eines Rechtecks (1 Pixel breit).</w:t>
+      </w:r>
+    </w:p>
+    <w:p>
+      <w:pPr>
+        <w:keepNext/>
+        <w:spacing w:after="30" w:before="120"/>
+      </w:pPr>
+      <w:r>
+        <w:rPr>
+          <w:b/>
+          <w:bCs/>
+          <w:i/>
+          <w:iCs/>
+          <w:color w:val="6A6A6A"/>
+          <w:sz w:val="18"/>
+          <w:szCs w:val="18"/>
+        </w:rPr>
+        <w:t xml:space="preserve">Beispiel</w:t>
+      </w:r>
+    </w:p>
+    <w:p>
+      <w:pPr>
+        <w:keepLines/>
+        <w:pBdr>
+          <w:left w:val="single" w:color="1B6CA8" w:sz="18" w:space="6"/>
+        </w:pBdr>
+        <w:shd w:fill="F4F4F4" w:val="clear"/>
+        <w:spacing w:after="200" w:before="100" w:line="264" w:lineRule="auto"/>
+        <w:ind w:left="140"/>
+      </w:pPr>
+      <w:r>
+        <w:rPr>
+          <w:rFonts w:ascii="Consolas" w:cs="Consolas" w:eastAsia="Consolas" w:hAnsi="Consolas"/>
+          <w:sz w:val="19"/>
+          <w:szCs w:val="19"/>
+        </w:rPr>
+        <w:t xml:space="preserve">CLS()</w:t>
+      </w:r>
+      <w:r>
+        <w:rPr>
+          <w:rFonts w:ascii="Consolas" w:cs="Consolas" w:eastAsia="Consolas" w:hAnsi="Consolas"/>
+          <w:sz w:val="19"/>
+          <w:szCs w:val="19"/>
+        </w:rPr>
+        <w:br/>
+        <w:t xml:space="preserve">RECT(50, 50, 150, 100, RGB(0, 200, 120))</w:t>
+      </w:r>
+      <w:r>
+        <w:rPr>
+          <w:rFonts w:ascii="Consolas" w:cs="Consolas" w:eastAsia="Consolas" w:hAnsi="Consolas"/>
+          <w:sz w:val="19"/>
+          <w:szCs w:val="19"/>
+        </w:rPr>
+        <w:br/>
+        <w:t xml:space="preserve">FLIP()</w:t>
+      </w:r>
+    </w:p>
+    <w:p>
+      <w:pPr>
+        <w:pStyle w:val="Heading2"/>
+        <w:keepNext/>
+        <w:keepLines/>
+        <w:spacing w:after="120" w:before="280"/>
+      </w:pPr>
+      <w:r>
+        <w:t xml:space="preserve">Kreise &amp; Ellipsen</w:t>
+      </w:r>
+    </w:p>
+    <w:p>
+      <w:pPr>
+        <w:keepNext/>
+        <w:keepLines/>
+        <w:pBdr>
+          <w:bottom w:val="single" w:color="DDD0C0" w:sz="4" w:space="2"/>
+        </w:pBdr>
+        <w:spacing w:after="40" w:before="360"/>
+      </w:pPr>
+      <w:r>
+        <w:rPr>
+          <w:rFonts w:ascii="Consolas" w:cs="Consolas" w:eastAsia="Consolas" w:hAnsi="Consolas"/>
+          <w:b/>
+          <w:bCs/>
+          <w:color w:val="9A3412"/>
+          <w:sz w:val="24"/>
+          <w:szCs w:val="24"/>
+        </w:rPr>
+        <w:t xml:space="preserve">CIRCLE</w:t>
+      </w:r>
+    </w:p>
+    <w:p>
+      <w:pPr>
+        <w:keepNext/>
+        <w:spacing w:after="120"/>
+      </w:pPr>
+      <w:r>
+        <w:rPr>
+          <w:b/>
+          <w:bCs/>
+          <w:color w:val="6A6A6A"/>
+          <w:sz w:val="18"/>
+          <w:szCs w:val="18"/>
+        </w:rPr>
+        <w:t xml:space="preserve">Syntax:  </w:t>
+      </w:r>
+      <w:r>
+        <w:rPr>
+          <w:rFonts w:ascii="Consolas" w:cs="Consolas" w:eastAsia="Consolas" w:hAnsi="Consolas"/>
+          <w:color w:val="335577"/>
+          <w:sz w:val="19"/>
+          <w:szCs w:val="19"/>
+        </w:rPr>
+        <w:t xml:space="preserve">CIRCLE(x, y, radius[, farbe])</w:t>
+      </w:r>
+    </w:p>
+    <w:p>
+      <w:pPr>
+        <w:spacing w:after="180" w:line="312" w:lineRule="auto"/>
+      </w:pPr>
+      <w:r>
+        <w:rPr>
+          <w:sz w:val="22"/>
+          <w:szCs w:val="22"/>
+        </w:rPr>
+        <w:t xml:space="preserve">Zeichnet einen gefüllten Kreis mit Mittelpunkt (x, y) und dem angegebenen Radius.</w:t>
+      </w:r>
+    </w:p>
+    <w:p>
+      <w:pPr>
+        <w:keepNext/>
+        <w:spacing w:after="30" w:before="120"/>
+      </w:pPr>
+      <w:r>
+        <w:rPr>
+          <w:b/>
+          <w:bCs/>
+          <w:i/>
+          <w:iCs/>
+          <w:color w:val="6A6A6A"/>
+          <w:sz w:val="18"/>
+          <w:szCs w:val="18"/>
+        </w:rPr>
+        <w:t xml:space="preserve">Beispiel</w:t>
+      </w:r>
+    </w:p>
+    <w:p>
+      <w:pPr>
+        <w:keepLines/>
+        <w:pBdr>
+          <w:left w:val="single" w:color="1B6CA8" w:sz="18" w:space="6"/>
+        </w:pBdr>
+        <w:shd w:fill="F4F4F4" w:val="clear"/>
+        <w:spacing w:after="200" w:before="100" w:line="264" w:lineRule="auto"/>
+        <w:ind w:left="140"/>
+      </w:pPr>
+      <w:r>
+        <w:rPr>
+          <w:rFonts w:ascii="Consolas" w:cs="Consolas" w:eastAsia="Consolas" w:hAnsi="Consolas"/>
+          <w:sz w:val="19"/>
+          <w:szCs w:val="19"/>
+        </w:rPr>
+        <w:t xml:space="preserve">CLS()</w:t>
+      </w:r>
+      <w:r>
+        <w:rPr>
+          <w:rFonts w:ascii="Consolas" w:cs="Consolas" w:eastAsia="Consolas" w:hAnsi="Consolas"/>
+          <w:sz w:val="19"/>
+          <w:szCs w:val="19"/>
+        </w:rPr>
+        <w:br/>
+        <w:t xml:space="preserve">CIRCLE(160, 120, 40, RGB(255, 200, 40))</w:t>
+      </w:r>
+      <w:r>
+        <w:rPr>
+          <w:rFonts w:ascii="Consolas" w:cs="Consolas" w:eastAsia="Consolas" w:hAnsi="Consolas"/>
+          <w:sz w:val="19"/>
+          <w:szCs w:val="19"/>
+        </w:rPr>
+        <w:br/>
+        <w:t xml:space="preserve">FLIP()</w:t>
+      </w:r>
+    </w:p>
+    <w:p>
+      <w:pPr>
+        <w:keepNext/>
+        <w:keepLines/>
+        <w:pBdr>
+          <w:bottom w:val="single" w:color="DDD0C0" w:sz="4" w:space="2"/>
+        </w:pBdr>
+        <w:spacing w:after="40" w:before="360"/>
+      </w:pPr>
+      <w:r>
+        <w:rPr>
+          <w:rFonts w:ascii="Consolas" w:cs="Consolas" w:eastAsia="Consolas" w:hAnsi="Consolas"/>
+          <w:b/>
+          <w:bCs/>
+          <w:color w:val="9A3412"/>
+          <w:sz w:val="24"/>
+          <w:szCs w:val="24"/>
+        </w:rPr>
+        <w:t xml:space="preserve">ELLIPSE · ELLIPSEOUTLINE</w:t>
+      </w:r>
+    </w:p>
+    <w:p>
+      <w:pPr>
+        <w:keepNext/>
+        <w:spacing w:after="120"/>
+      </w:pPr>
+      <w:r>
+        <w:rPr>
+          <w:b/>
+          <w:bCs/>
+          <w:color w:val="6A6A6A"/>
+          <w:sz w:val="18"/>
+          <w:szCs w:val="18"/>
+        </w:rPr>
+        <w:t xml:space="preserve">Syntax:  </w:t>
+      </w:r>
+      <w:r>
+        <w:rPr>
+          <w:rFonts w:ascii="Consolas" w:cs="Consolas" w:eastAsia="Consolas" w:hAnsi="Consolas"/>
+          <w:color w:val="335577"/>
+          <w:sz w:val="19"/>
+          <w:szCs w:val="19"/>
+        </w:rPr>
+        <w:t xml:space="preserve">ELLIPSE(x1, y1, x2, y2[, farbe])   ELLIPSEOUTLINE(...)</w:t>
+      </w:r>
+    </w:p>
+    <w:p>
+      <w:pPr>
+        <w:spacing w:after="180" w:line="312" w:lineRule="auto"/>
+      </w:pPr>
+      <w:r>
+        <w:rPr>
+          <w:sz w:val="22"/>
+          <w:szCs w:val="22"/>
+        </w:rPr>
+        <w:t xml:space="preserve">Zeichnet eine Ellipse, eingepasst in das Rechteck (x1, y1)–(x2, y2). ELLIPSE füllt, ELLIPSEOUTLINE zeichnet nur die Kontur (mit optionaler Breite).</w:t>
+      </w:r>
+    </w:p>
+    <w:p>
+      <w:pPr>
+        <w:keepNext/>
+        <w:spacing w:after="30" w:before="120"/>
+      </w:pPr>
+      <w:r>
+        <w:rPr>
+          <w:b/>
+          <w:bCs/>
+          <w:i/>
+          <w:iCs/>
+          <w:color w:val="6A6A6A"/>
+          <w:sz w:val="18"/>
+          <w:szCs w:val="18"/>
+        </w:rPr>
+        <w:t xml:space="preserve">Beispiel</w:t>
+      </w:r>
+    </w:p>
+    <w:p>
+      <w:pPr>
+        <w:keepLines/>
+        <w:pBdr>
+          <w:left w:val="single" w:color="1B6CA8" w:sz="18" w:space="6"/>
+        </w:pBdr>
+        <w:shd w:fill="F4F4F4" w:val="clear"/>
+        <w:spacing w:after="200" w:before="100" w:line="264" w:lineRule="auto"/>
+        <w:ind w:left="140"/>
+      </w:pPr>
+      <w:r>
+        <w:rPr>
+          <w:rFonts w:ascii="Consolas" w:cs="Consolas" w:eastAsia="Consolas" w:hAnsi="Consolas"/>
+          <w:sz w:val="19"/>
+          <w:szCs w:val="19"/>
+        </w:rPr>
+        <w:t xml:space="preserve">CLS()</w:t>
+      </w:r>
+      <w:r>
+        <w:rPr>
+          <w:rFonts w:ascii="Consolas" w:cs="Consolas" w:eastAsia="Consolas" w:hAnsi="Consolas"/>
+          <w:sz w:val="19"/>
+          <w:szCs w:val="19"/>
+        </w:rPr>
+        <w:br/>
+        <w:t xml:space="preserve">ELLIPSE(60, 80, 200, 160, RGB(80, 140, 255))</w:t>
+      </w:r>
+      <w:r>
+        <w:rPr>
+          <w:rFonts w:ascii="Consolas" w:cs="Consolas" w:eastAsia="Consolas" w:hAnsi="Consolas"/>
+          <w:sz w:val="19"/>
+          <w:szCs w:val="19"/>
+        </w:rPr>
+        <w:br/>
+        <w:t xml:space="preserve">ELLIPSEOUTLINE(220, 80, 300, 160, RGB(80, 140, 255), 2)</w:t>
+      </w:r>
+      <w:r>
+        <w:rPr>
+          <w:rFonts w:ascii="Consolas" w:cs="Consolas" w:eastAsia="Consolas" w:hAnsi="Consolas"/>
+          <w:sz w:val="19"/>
+          <w:szCs w:val="19"/>
+        </w:rPr>
+        <w:br/>
+        <w:t xml:space="preserve">FLIP()</w:t>
+      </w:r>
+    </w:p>
+    <w:p>
+      <w:pPr>
+        <w:pStyle w:val="Heading2"/>
+        <w:keepNext/>
+        <w:keepLines/>
+        <w:spacing w:after="120" w:before="280"/>
+      </w:pPr>
+      <w:r>
+        <w:t xml:space="preserve">Dreiecke &amp; Polygone</w:t>
+      </w:r>
+    </w:p>
+    <w:p>
+      <w:pPr>
+        <w:keepNext/>
+        <w:keepLines/>
+        <w:pBdr>
+          <w:bottom w:val="single" w:color="DDD0C0" w:sz="4" w:space="2"/>
+        </w:pBdr>
+        <w:spacing w:after="40" w:before="360"/>
+      </w:pPr>
+      <w:r>
+        <w:rPr>
+          <w:rFonts w:ascii="Consolas" w:cs="Consolas" w:eastAsia="Consolas" w:hAnsi="Consolas"/>
+          <w:b/>
+          <w:bCs/>
+          <w:color w:val="9A3412"/>
+          <w:sz w:val="24"/>
+          <w:szCs w:val="24"/>
+        </w:rPr>
+        <w:t xml:space="preserve">TRIANGLE · TRIANGLEOUTLINE</w:t>
+      </w:r>
+    </w:p>
+    <w:p>
+      <w:pPr>
+        <w:keepNext/>
+        <w:spacing w:after="120"/>
+      </w:pPr>
+      <w:r>
+        <w:rPr>
+          <w:b/>
+          <w:bCs/>
+          <w:color w:val="6A6A6A"/>
+          <w:sz w:val="18"/>
+          <w:szCs w:val="18"/>
+        </w:rPr>
+        <w:t xml:space="preserve">Syntax:  </w:t>
+      </w:r>
+      <w:r>
+        <w:rPr>
+          <w:rFonts w:ascii="Consolas" w:cs="Consolas" w:eastAsia="Consolas" w:hAnsi="Consolas"/>
+          <w:color w:val="335577"/>
+          <w:sz w:val="19"/>
+          <w:szCs w:val="19"/>
+        </w:rPr>
+        <w:t xml:space="preserve">TRIANGLE(x1,y1, x2,y2, x3,y3[, farbe])   TRIANGLEOUTLINE(...)</w:t>
+      </w:r>
+    </w:p>
+    <w:p>
+      <w:pPr>
+        <w:spacing w:after="180" w:line="312" w:lineRule="auto"/>
+      </w:pPr>
+      <w:r>
+        <w:rPr>
+          <w:sz w:val="22"/>
+          <w:szCs w:val="22"/>
+        </w:rPr>
+        <w:t xml:space="preserve">Zeichnet ein Dreieck aus drei Eckpunkten – TRIANGLE gefüllt, TRIANGLEOUTLINE nur als Kontur.</w:t>
+      </w:r>
+    </w:p>
+    <w:p>
+      <w:pPr>
+        <w:keepNext/>
+        <w:spacing w:after="30" w:before="120"/>
+      </w:pPr>
+      <w:r>
+        <w:rPr>
+          <w:b/>
+          <w:bCs/>
+          <w:i/>
+          <w:iCs/>
+          <w:color w:val="6A6A6A"/>
+          <w:sz w:val="18"/>
+          <w:szCs w:val="18"/>
+        </w:rPr>
+        <w:t xml:space="preserve">Beispiel</w:t>
+      </w:r>
+    </w:p>
+    <w:p>
+      <w:pPr>
+        <w:keepLines/>
+        <w:pBdr>
+          <w:left w:val="single" w:color="1B6CA8" w:sz="18" w:space="6"/>
+        </w:pBdr>
+        <w:shd w:fill="F4F4F4" w:val="clear"/>
+        <w:spacing w:after="200" w:before="100" w:line="264" w:lineRule="auto"/>
+        <w:ind w:left="140"/>
+      </w:pPr>
+      <w:r>
+        <w:rPr>
+          <w:rFonts w:ascii="Consolas" w:cs="Consolas" w:eastAsia="Consolas" w:hAnsi="Consolas"/>
+          <w:sz w:val="19"/>
+          <w:szCs w:val="19"/>
+        </w:rPr>
+        <w:t xml:space="preserve">CLS()</w:t>
+      </w:r>
+      <w:r>
+        <w:rPr>
+          <w:rFonts w:ascii="Consolas" w:cs="Consolas" w:eastAsia="Consolas" w:hAnsi="Consolas"/>
+          <w:sz w:val="19"/>
+          <w:szCs w:val="19"/>
+        </w:rPr>
+        <w:br/>
+        <w:t xml:space="preserve">TRIANGLE(160, 80, 120, 160, 200, 160, RGB(255, 110, 255))</w:t>
+      </w:r>
+      <w:r>
+        <w:rPr>
+          <w:rFonts w:ascii="Consolas" w:cs="Consolas" w:eastAsia="Consolas" w:hAnsi="Consolas"/>
+          <w:sz w:val="19"/>
+          <w:szCs w:val="19"/>
+        </w:rPr>
+        <w:br/>
+        <w:t xml:space="preserve">FLIP()</w:t>
+      </w:r>
+    </w:p>
+    <w:p>
+      <w:pPr>
+        <w:keepNext/>
+        <w:keepLines/>
+        <w:pBdr>
+          <w:bottom w:val="single" w:color="DDD0C0" w:sz="4" w:space="2"/>
+        </w:pBdr>
+        <w:spacing w:after="40" w:before="360"/>
+      </w:pPr>
+      <w:r>
+        <w:rPr>
+          <w:rFonts w:ascii="Consolas" w:cs="Consolas" w:eastAsia="Consolas" w:hAnsi="Consolas"/>
+          <w:b/>
+          <w:bCs/>
+          <w:color w:val="9A3412"/>
+          <w:sz w:val="24"/>
+          <w:szCs w:val="24"/>
+        </w:rPr>
+        <w:t xml:space="preserve">POLYGON · POLYGONOUTLINE</w:t>
+      </w:r>
+    </w:p>
+    <w:p>
+      <w:pPr>
+        <w:keepNext/>
+        <w:spacing w:after="120"/>
+      </w:pPr>
+      <w:r>
+        <w:rPr>
+          <w:b/>
+          <w:bCs/>
+          <w:color w:val="6A6A6A"/>
+          <w:sz w:val="18"/>
+          <w:szCs w:val="18"/>
+        </w:rPr>
+        <w:t xml:space="preserve">Syntax:  </w:t>
+      </w:r>
+      <w:r>
+        <w:rPr>
+          <w:rFonts w:ascii="Consolas" w:cs="Consolas" w:eastAsia="Consolas" w:hAnsi="Consolas"/>
+          <w:color w:val="335577"/>
+          <w:sz w:val="19"/>
+          <w:szCs w:val="19"/>
+        </w:rPr>
+        <w:t xml:space="preserve">POLYGON(punkte[, farbe])   POLYGONOUTLINE(...)</w:t>
+      </w:r>
+    </w:p>
+    <w:p>
+      <w:pPr>
+        <w:spacing w:after="180" w:line="312" w:lineRule="auto"/>
+      </w:pPr>
+      <w:r>
+        <w:rPr>
+          <w:sz w:val="22"/>
+          <w:szCs w:val="22"/>
+        </w:rPr>
+        <w:t xml:space="preserve">Zeichnet ein Vieleck. punkte ist ein ARRAY OF INTEGER mit abwechselnd x- und y-Werten ([x1, y1, x2, y2, …], mindestens 3 Punkte). POLYGON füllt, POLYGONOUTLINE zeichnet nur die Kanten.</w:t>
+      </w:r>
+    </w:p>
+    <w:p>
+      <w:pPr>
+        <w:keepNext/>
+        <w:spacing w:after="30" w:before="120"/>
+      </w:pPr>
+      <w:r>
+        <w:rPr>
+          <w:b/>
+          <w:bCs/>
+          <w:i/>
+          <w:iCs/>
+          <w:color w:val="6A6A6A"/>
+          <w:sz w:val="18"/>
+          <w:szCs w:val="18"/>
+        </w:rPr>
+        <w:t xml:space="preserve">Beispiel</w:t>
+      </w:r>
+    </w:p>
+    <w:p>
+      <w:pPr>
+        <w:keepLines/>
+        <w:pBdr>
+          <w:left w:val="single" w:color="1B6CA8" w:sz="18" w:space="6"/>
+        </w:pBdr>
+        <w:shd w:fill="F4F4F4" w:val="clear"/>
+        <w:spacing w:after="200" w:before="100" w:line="264" w:lineRule="auto"/>
+        <w:ind w:left="140"/>
+      </w:pPr>
+      <w:r>
+        <w:rPr>
+          <w:rFonts w:ascii="Consolas" w:cs="Consolas" w:eastAsia="Consolas" w:hAnsi="Consolas"/>
+          <w:sz w:val="19"/>
+          <w:szCs w:val="19"/>
+        </w:rPr>
+        <w:t xml:space="preserve">DIM p[8] AS INTEGER          ' 4 Punkte (Raute)</w:t>
+      </w:r>
+      <w:r>
+        <w:rPr>
+          <w:rFonts w:ascii="Consolas" w:cs="Consolas" w:eastAsia="Consolas" w:hAnsi="Consolas"/>
+          <w:sz w:val="19"/>
+          <w:szCs w:val="19"/>
+        </w:rPr>
+        <w:br/>
+        <w:t xml:space="preserve">p[0]=160 : p[1]=60</w:t>
+      </w:r>
+      <w:r>
+        <w:rPr>
+          <w:rFonts w:ascii="Consolas" w:cs="Consolas" w:eastAsia="Consolas" w:hAnsi="Consolas"/>
+          <w:sz w:val="19"/>
+          <w:szCs w:val="19"/>
+        </w:rPr>
+        <w:br/>
+        <w:t xml:space="preserve">p[2]=120 : p[3]=120</w:t>
+      </w:r>
+      <w:r>
+        <w:rPr>
+          <w:rFonts w:ascii="Consolas" w:cs="Consolas" w:eastAsia="Consolas" w:hAnsi="Consolas"/>
+          <w:sz w:val="19"/>
+          <w:szCs w:val="19"/>
+        </w:rPr>
+        <w:br/>
+        <w:t xml:space="preserve">p[4]=160 : p[5]=180</w:t>
+      </w:r>
+      <w:r>
+        <w:rPr>
+          <w:rFonts w:ascii="Consolas" w:cs="Consolas" w:eastAsia="Consolas" w:hAnsi="Consolas"/>
+          <w:sz w:val="19"/>
+          <w:szCs w:val="19"/>
+        </w:rPr>
+        <w:br/>
+        <w:t xml:space="preserve">p[6]=200 : p[7]=120</w:t>
+      </w:r>
+      <w:r>
+        <w:rPr>
+          <w:rFonts w:ascii="Consolas" w:cs="Consolas" w:eastAsia="Consolas" w:hAnsi="Consolas"/>
+          <w:sz w:val="19"/>
+          <w:szCs w:val="19"/>
+        </w:rPr>
+        <w:br/>
+        <w:t xml:space="preserve">CLS()</w:t>
+      </w:r>
+      <w:r>
+        <w:rPr>
+          <w:rFonts w:ascii="Consolas" w:cs="Consolas" w:eastAsia="Consolas" w:hAnsi="Consolas"/>
+          <w:sz w:val="19"/>
+          <w:szCs w:val="19"/>
+        </w:rPr>
+        <w:br/>
+        <w:t xml:space="preserve">POLYGON(p, RGB(0, 210, 210))</w:t>
+      </w:r>
+      <w:r>
+        <w:rPr>
+          <w:rFonts w:ascii="Consolas" w:cs="Consolas" w:eastAsia="Consolas" w:hAnsi="Consolas"/>
+          <w:sz w:val="19"/>
+          <w:szCs w:val="19"/>
+        </w:rPr>
+        <w:br/>
+        <w:t xml:space="preserve">FLIP()</w:t>
+      </w:r>
+    </w:p>
+    <w:p>
+      <w:pPr>
+        <w:spacing w:before="60"/>
+      </w:pPr>
+    </w:p>
+    <w:tbl>
+      <w:tblPr>
+        <w:tblW w:type="dxa" w:w="9360"/>
+        <w:tblBorders>
+          <w:top w:val="single" w:color="auto" w:sz="4"/>
+          <w:left w:val="single" w:color="auto" w:sz="4"/>
+          <w:bottom w:val="single" w:color="auto" w:sz="4"/>
+          <w:right w:val="single" w:color="auto" w:sz="4"/>
+          <w:insideH w:val="single" w:color="auto" w:sz="4"/>
+          <w:insideV w:val="single" w:color="auto" w:sz="4"/>
+        </w:tblBorders>
+      </w:tblPr>
+      <w:tblGrid>
+        <w:gridCol w:w="9360"/>
+      </w:tblGrid>
+      <w:tr>
+        <w:trPr>
+          <w:cantSplit/>
+        </w:trPr>
+        <w:tc>
+          <w:tcPr>
+            <w:tcW w:type="dxa" w:w="9360"/>
+            <w:tcBorders>
+              <w:top w:val="single" w:color="E0A0A0" w:sz="6"/>
+              <w:left w:val="single" w:color="E0A0A0" w:sz="6"/>
+              <w:bottom w:val="single" w:color="E0A0A0" w:sz="6"/>
+              <w:right w:val="single" w:color="E0A0A0" w:sz="6"/>
+            </w:tcBorders>
+            <w:shd w:fill="FBEAEA" w:val="clear"/>
+            <w:tcMar>
+              <w:top w:type="dxa" w:w="140"/>
+              <w:left w:type="dxa" w:w="180"/>
+              <w:bottom w:type="dxa" w:w="140"/>
+              <w:right w:type="dxa" w:w="180"/>
+            </w:tcMar>
+          </w:tcPr>
+          <w:p>
+            <w:pPr>
+              <w:spacing w:after="40"/>
+            </w:pPr>
+            <w:r>
+              <w:rPr>
+                <w:b/>
+                <w:bCs/>
+                <w:color w:val="B23030"/>
+                <w:sz w:val="22"/>
+                <w:szCs w:val="22"/>
+              </w:rPr>
+              <w:t xml:space="preserve">Achtung</w:t>
+            </w:r>
+          </w:p>
+          <w:p>
+            <w:pPr>
+              <w:spacing w:after="0" w:line="312" w:lineRule="auto"/>
+            </w:pPr>
+            <w:r>
+              <w:rPr>
+                <w:sz w:val="22"/>
+                <w:szCs w:val="22"/>
+              </w:rPr>
+              <w:t xml:space="preserve">Gefüllte Dreiecke und Polygone erscheinen nur, wenn du die Eckpunkte GEGEN den Uhrzeigersinn angibst (auf dem Bildschirm, wo y nach unten zeigt). Gibst du sie im Uhrzeigersinn an, bleibt die Fläche unsichtbar. Bei Bedarf einfach die Reihenfolge der Punkte umdrehen. (Die Outline-Varianten sind davon nicht betroffen.)</w:t>
+            </w:r>
+          </w:p>
+        </w:tc>
+      </w:tr>
+    </w:tbl>
+    <w:p>
+      <w:pPr>
+        <w:spacing w:after="160"/>
+      </w:pPr>
+    </w:p>
+    <w:p>
+      <w:pPr>
+        <w:pStyle w:val="Heading2"/>
+        <w:keepNext/>
+        <w:keepLines/>
+        <w:spacing w:after="120" w:before="280"/>
+      </w:pPr>
+      <w:r>
+        <w:t xml:space="preserve">Bögen</w:t>
+      </w:r>
+    </w:p>
+    <w:p>
+      <w:pPr>
+        <w:keepNext/>
+        <w:keepLines/>
+        <w:pBdr>
+          <w:bottom w:val="single" w:color="DDD0C0" w:sz="4" w:space="2"/>
+        </w:pBdr>
+        <w:spacing w:after="40" w:before="360"/>
+      </w:pPr>
+      <w:r>
+        <w:rPr>
+          <w:rFonts w:ascii="Consolas" w:cs="Consolas" w:eastAsia="Consolas" w:hAnsi="Consolas"/>
+          <w:b/>
+          <w:bCs/>
+          <w:color w:val="9A3412"/>
+          <w:sz w:val="24"/>
+          <w:szCs w:val="24"/>
+        </w:rPr>
+        <w:t xml:space="preserve">ARC</w:t>
+      </w:r>
+    </w:p>
+    <w:p>
+      <w:pPr>
+        <w:keepNext/>
+        <w:spacing w:after="120"/>
+      </w:pPr>
+      <w:r>
+        <w:rPr>
+          <w:b/>
+          <w:bCs/>
+          <w:color w:val="6A6A6A"/>
+          <w:sz w:val="18"/>
+          <w:szCs w:val="18"/>
+        </w:rPr>
+        <w:t xml:space="preserve">Syntax:  </w:t>
+      </w:r>
+      <w:r>
+        <w:rPr>
+          <w:rFonts w:ascii="Consolas" w:cs="Consolas" w:eastAsia="Consolas" w:hAnsi="Consolas"/>
+          <w:color w:val="335577"/>
+          <w:sz w:val="19"/>
+          <w:szCs w:val="19"/>
+        </w:rPr>
+        <w:t xml:space="preserve">ARC(x1, y1, x2, y2, start, ende[, farbe[, breite]])</w:t>
+      </w:r>
+    </w:p>
+    <w:p>
+      <w:pPr>
+        <w:spacing w:after="180" w:line="312" w:lineRule="auto"/>
+      </w:pPr>
+      <w:r>
+        <w:rPr>
+          <w:sz w:val="22"/>
+          <w:szCs w:val="22"/>
+        </w:rPr>
+        <w:t xml:space="preserve">Zeichnet ein Bogensegment, eingepasst in das Rechteck (x1, y1)–(x2, y2). Die Winkel start und ende sind im Bogenmaß (0 bis 2·PI), gegen den Uhrzeigersinn.</w:t>
+      </w:r>
+    </w:p>
+    <w:p>
+      <w:pPr>
+        <w:keepNext/>
+        <w:spacing w:after="30" w:before="120"/>
+      </w:pPr>
+      <w:r>
+        <w:rPr>
+          <w:b/>
+          <w:bCs/>
+          <w:i/>
+          <w:iCs/>
+          <w:color w:val="6A6A6A"/>
+          <w:sz w:val="18"/>
+          <w:szCs w:val="18"/>
+        </w:rPr>
+        <w:t xml:space="preserve">Beispiel</w:t>
+      </w:r>
+    </w:p>
+    <w:p>
+      <w:pPr>
+        <w:keepLines/>
+        <w:pBdr>
+          <w:left w:val="single" w:color="1B6CA8" w:sz="18" w:space="6"/>
+        </w:pBdr>
+        <w:shd w:fill="F4F4F4" w:val="clear"/>
+        <w:spacing w:after="200" w:before="100" w:line="264" w:lineRule="auto"/>
+        <w:ind w:left="140"/>
+      </w:pPr>
+      <w:r>
+        <w:rPr>
+          <w:rFonts w:ascii="Consolas" w:cs="Consolas" w:eastAsia="Consolas" w:hAnsi="Consolas"/>
+          <w:sz w:val="19"/>
+          <w:szCs w:val="19"/>
+        </w:rPr>
+        <w:t xml:space="preserve">CLS()</w:t>
+      </w:r>
+      <w:r>
+        <w:rPr>
+          <w:rFonts w:ascii="Consolas" w:cs="Consolas" w:eastAsia="Consolas" w:hAnsi="Consolas"/>
+          <w:sz w:val="19"/>
+          <w:szCs w:val="19"/>
+        </w:rPr>
+        <w:br/>
+        <w:t xml:space="preserve">ARC(120, 80, 200, 160, 0.0, PI, RGB(255, 255, 0), 3)</w:t>
+      </w:r>
+      <w:r>
+        <w:rPr>
+          <w:rFonts w:ascii="Consolas" w:cs="Consolas" w:eastAsia="Consolas" w:hAnsi="Consolas"/>
+          <w:sz w:val="19"/>
+          <w:szCs w:val="19"/>
+        </w:rPr>
+        <w:br/>
+        <w:t xml:space="preserve">FLIP()</w:t>
+      </w:r>
+    </w:p>
+    <w:p>
+      <w:pPr>
+        <w:pStyle w:val="Heading2"/>
+        <w:keepNext/>
+        <w:keepLines/>
+        <w:spacing w:after="120" w:before="280"/>
+      </w:pPr>
+      <w:r>
+        <w:t xml:space="preserve">Text</w:t>
+      </w:r>
+    </w:p>
+    <w:p>
+      <w:pPr>
+        <w:keepNext/>
+        <w:keepLines/>
+        <w:pBdr>
+          <w:bottom w:val="single" w:color="DDD0C0" w:sz="4" w:space="2"/>
+        </w:pBdr>
+        <w:spacing w:after="40" w:before="360"/>
+      </w:pPr>
+      <w:r>
+        <w:rPr>
+          <w:rFonts w:ascii="Consolas" w:cs="Consolas" w:eastAsia="Consolas" w:hAnsi="Consolas"/>
+          <w:b/>
+          <w:bCs/>
+          <w:color w:val="9A3412"/>
+          <w:sz w:val="24"/>
+          <w:szCs w:val="24"/>
+        </w:rPr>
+        <w:t xml:space="preserve">TEXT</w:t>
+      </w:r>
+    </w:p>
+    <w:p>
+      <w:pPr>
+        <w:keepNext/>
+        <w:spacing w:after="120"/>
+      </w:pPr>
+      <w:r>
+        <w:rPr>
+          <w:b/>
+          <w:bCs/>
+          <w:color w:val="6A6A6A"/>
+          <w:sz w:val="18"/>
+          <w:szCs w:val="18"/>
+        </w:rPr>
+        <w:t xml:space="preserve">Syntax:  </w:t>
+      </w:r>
+      <w:r>
+        <w:rPr>
+          <w:rFonts w:ascii="Consolas" w:cs="Consolas" w:eastAsia="Consolas" w:hAnsi="Consolas"/>
+          <w:color w:val="335577"/>
+          <w:sz w:val="19"/>
+          <w:szCs w:val="19"/>
+        </w:rPr>
+        <w:t xml:space="preserve">TEXT(x, y, text$[, farbe])</w:t>
+      </w:r>
+    </w:p>
+    <w:p>
+      <w:pPr>
+        <w:spacing w:after="180" w:line="312" w:lineRule="auto"/>
+      </w:pPr>
+      <w:r>
+        <w:rPr>
+          <w:sz w:val="22"/>
+          <w:szCs w:val="22"/>
+        </w:rPr>
+        <w:t xml:space="preserve">Schreibt Text an die Position (x, y) (linke obere Ecke des Textes). In der Konsole nutzt du PRINT, im Fenster TEXT.</w:t>
+      </w:r>
+    </w:p>
+    <w:p>
+      <w:pPr>
+        <w:keepNext/>
+        <w:spacing w:after="30" w:before="120"/>
+      </w:pPr>
+      <w:r>
+        <w:rPr>
+          <w:b/>
+          <w:bCs/>
+          <w:i/>
+          <w:iCs/>
+          <w:color w:val="6A6A6A"/>
+          <w:sz w:val="18"/>
+          <w:szCs w:val="18"/>
+        </w:rPr>
+        <w:t xml:space="preserve">Beispiel</w:t>
+      </w:r>
+    </w:p>
+    <w:p>
+      <w:pPr>
+        <w:keepLines/>
+        <w:pBdr>
+          <w:left w:val="single" w:color="1B6CA8" w:sz="18" w:space="6"/>
+        </w:pBdr>
+        <w:shd w:fill="F4F4F4" w:val="clear"/>
+        <w:spacing w:after="200" w:before="100" w:line="264" w:lineRule="auto"/>
+        <w:ind w:left="140"/>
+      </w:pPr>
+      <w:r>
+        <w:rPr>
+          <w:rFonts w:ascii="Consolas" w:cs="Consolas" w:eastAsia="Consolas" w:hAnsi="Consolas"/>
+          <w:sz w:val="19"/>
+          <w:szCs w:val="19"/>
+        </w:rPr>
+        <w:t xml:space="preserve">CLS()</w:t>
+      </w:r>
+      <w:r>
+        <w:rPr>
+          <w:rFonts w:ascii="Consolas" w:cs="Consolas" w:eastAsia="Consolas" w:hAnsi="Consolas"/>
+          <w:sz w:val="19"/>
+          <w:szCs w:val="19"/>
+        </w:rPr>
+        <w:br/>
+        <w:t xml:space="preserve">TEXT(20, 20, "Punkte: 1200", RGB(255, 255, 255))</w:t>
+      </w:r>
+      <w:r>
+        <w:rPr>
+          <w:rFonts w:ascii="Consolas" w:cs="Consolas" w:eastAsia="Consolas" w:hAnsi="Consolas"/>
+          <w:sz w:val="19"/>
+          <w:szCs w:val="19"/>
+        </w:rPr>
+        <w:br/>
+        <w:t xml:space="preserve">FLIP()</w:t>
+      </w:r>
+    </w:p>
+    <w:p>
+      <w:pPr>
+        <w:keepNext/>
+        <w:keepLines/>
+        <w:pBdr>
+          <w:bottom w:val="single" w:color="DDD0C0" w:sz="4" w:space="2"/>
+        </w:pBdr>
+        <w:spacing w:after="40" w:before="360"/>
+      </w:pPr>
+      <w:r>
+        <w:rPr>
+          <w:rFonts w:ascii="Consolas" w:cs="Consolas" w:eastAsia="Consolas" w:hAnsi="Consolas"/>
+          <w:b/>
+          <w:bCs/>
+          <w:color w:val="9A3412"/>
+          <w:sz w:val="24"/>
+          <w:szCs w:val="24"/>
+        </w:rPr>
+        <w:t xml:space="preserve">TEXTROT</w:t>
+      </w:r>
+    </w:p>
+    <w:p>
+      <w:pPr>
+        <w:keepNext/>
+        <w:spacing w:after="120"/>
+      </w:pPr>
+      <w:r>
+        <w:rPr>
+          <w:b/>
+          <w:bCs/>
+          <w:color w:val="6A6A6A"/>
+          <w:sz w:val="18"/>
+          <w:szCs w:val="18"/>
+        </w:rPr>
+        <w:t xml:space="preserve">Syntax:  </w:t>
+      </w:r>
+      <w:r>
+        <w:rPr>
+          <w:rFonts w:ascii="Consolas" w:cs="Consolas" w:eastAsia="Consolas" w:hAnsi="Consolas"/>
+          <w:color w:val="335577"/>
+          <w:sz w:val="19"/>
+          <w:szCs w:val="19"/>
+        </w:rPr>
+        <w:t xml:space="preserve">TEXTROT(x, y, text$, winkel[, skala[, farbe]])</w:t>
+      </w:r>
+    </w:p>
+    <w:p>
+      <w:pPr>
+        <w:spacing w:after="180" w:line="312" w:lineRule="auto"/>
+      </w:pPr>
+      <w:r>
+        <w:rPr>
+          <w:sz w:val="22"/>
+          <w:szCs w:val="22"/>
+        </w:rPr>
+        <w:t xml:space="preserve">Schreibt Text ZENTRIERT auf (x, y), um diesen Punkt gedreht (Winkel in Grad) und optional skaliert – gut für schräge Beschriftungen oder Punkte-Pop-ups.</w:t>
+      </w:r>
+    </w:p>
+    <w:p>
+      <w:pPr>
+        <w:keepNext/>
+        <w:spacing w:after="30" w:before="120"/>
+      </w:pPr>
+      <w:r>
+        <w:rPr>
+          <w:b/>
+          <w:bCs/>
+          <w:i/>
+          <w:iCs/>
+          <w:color w:val="6A6A6A"/>
+          <w:sz w:val="18"/>
+          <w:szCs w:val="18"/>
+        </w:rPr>
+        <w:t xml:space="preserve">Beispiel</w:t>
+      </w:r>
+    </w:p>
+    <w:p>
+      <w:pPr>
+        <w:keepLines/>
+        <w:pBdr>
+          <w:left w:val="single" w:color="1B6CA8" w:sz="18" w:space="6"/>
+        </w:pBdr>
+        <w:shd w:fill="F4F4F4" w:val="clear"/>
+        <w:spacing w:after="200" w:before="100" w:line="264" w:lineRule="auto"/>
+        <w:ind w:left="140"/>
+      </w:pPr>
+      <w:r>
+        <w:rPr>
+          <w:rFonts w:ascii="Consolas" w:cs="Consolas" w:eastAsia="Consolas" w:hAnsi="Consolas"/>
+          <w:sz w:val="19"/>
+          <w:szCs w:val="19"/>
+        </w:rPr>
+        <w:t xml:space="preserve">CLS()</w:t>
+      </w:r>
+      <w:r>
+        <w:rPr>
+          <w:rFonts w:ascii="Consolas" w:cs="Consolas" w:eastAsia="Consolas" w:hAnsi="Consolas"/>
+          <w:sz w:val="19"/>
+          <w:szCs w:val="19"/>
+        </w:rPr>
+        <w:br/>
+        <w:t xml:space="preserve">TEXTROT(160, 120, "+100", -20.0, 2.0, RGB(255, 220, 0))</w:t>
+      </w:r>
+      <w:r>
+        <w:rPr>
+          <w:rFonts w:ascii="Consolas" w:cs="Consolas" w:eastAsia="Consolas" w:hAnsi="Consolas"/>
+          <w:sz w:val="19"/>
+          <w:szCs w:val="19"/>
+        </w:rPr>
+        <w:br/>
+        <w:t xml:space="preserve">FLIP()</w:t>
+      </w:r>
+    </w:p>
+    <w:p>
+      <w:pPr>
+        <w:spacing w:before="60"/>
+      </w:pPr>
+    </w:p>
+    <w:tbl>
+      <w:tblPr>
+        <w:tblW w:type="dxa" w:w="9360"/>
+        <w:tblBorders>
+          <w:top w:val="single" w:color="auto" w:sz="4"/>
+          <w:left w:val="single" w:color="auto" w:sz="4"/>
+          <w:bottom w:val="single" w:color="auto" w:sz="4"/>
+          <w:right w:val="single" w:color="auto" w:sz="4"/>
+          <w:insideH w:val="single" w:color="auto" w:sz="4"/>
+          <w:insideV w:val="single" w:color="auto" w:sz="4"/>
+        </w:tblBorders>
+      </w:tblPr>
+      <w:tblGrid>
+        <w:gridCol w:w="9360"/>
+      </w:tblGrid>
+      <w:tr>
+        <w:trPr>
+          <w:cantSplit/>
+        </w:trPr>
+        <w:tc>
+          <w:tcPr>
+            <w:tcW w:type="dxa" w:w="9360"/>
+            <w:tcBorders>
+              <w:top w:val="single" w:color="9CC8E6" w:sz="6"/>
+              <w:left w:val="single" w:color="9CC8E6" w:sz="6"/>
+              <w:bottom w:val="single" w:color="9CC8E6" w:sz="6"/>
+              <w:right w:val="single" w:color="9CC8E6" w:sz="6"/>
+            </w:tcBorders>
+            <w:shd w:fill="E7F2FA" w:val="clear"/>
+            <w:tcMar>
+              <w:top w:type="dxa" w:w="140"/>
+              <w:left w:type="dxa" w:w="180"/>
+              <w:bottom w:type="dxa" w:w="140"/>
+              <w:right w:type="dxa" w:w="180"/>
+            </w:tcMar>
+          </w:tcPr>
+          <w:p>
+            <w:pPr>
+              <w:spacing w:after="40"/>
+            </w:pPr>
+            <w:r>
+              <w:rPr>
+                <w:b/>
+                <w:bCs/>
+                <w:color w:val="1B6CA8"/>
+                <w:sz w:val="22"/>
+                <w:szCs w:val="22"/>
+              </w:rPr>
+              <w:t xml:space="preserve">Schriftart &amp; Größe</w:t>
+            </w:r>
+          </w:p>
+          <w:p>
+            <w:pPr>
+              <w:spacing w:after="0" w:line="312" w:lineRule="auto"/>
+            </w:pPr>
+            <w:r>
+              <w:rPr>
+                <w:sz w:val="22"/>
+                <w:szCs w:val="22"/>
+              </w:rPr>
+              <w:t xml:space="preserve">Standardmäßig zeichnet TEXT in einer eingebauten Schrift. Eigene TrueType-Schriften lädst du mit LOADFONT und aktivierst sie mit SETFONT – damit kannst du Überschriften groß und stilvoll setzen. Mehr dazu in der Doku zu Schriften.</w:t>
             </w:r>
           </w:p>
         </w:tc>

</xml_diff>

<commit_message>
docs(buch): Lehrbuch Kap 42 -- 2D-Extras (2 Screenshots)
LINEW, BOXROUND/RECTROUND, GRADIENTV/GRADIENTH, SPLINE, BLEND_MODE (add/mult/
subtract), GENTEX_PERLIN/GRADIENT/CHECKED/COLOR/RADIAL, RENDERTARGET_NEW/BEGIN/
END/DRAW. Je Beispiel; Screenshots fuer Extras-Uebersicht + Blend/GenTex.
Alle Demos gegen gbrt verifiziert.

Co-Authored-By: Claude Opus 4.8 (1M context) <noreply@anthropic.com>
</commit_message>
<xml_diff>
--- a/buch-referenz/buch/GameBasic-Lehrbuch.docx
+++ b/buch-referenz/buch/GameBasic-Lehrbuch.docx
@@ -1056,6 +1056,33 @@
           <w:szCs w:val="22"/>
         </w:rPr>
         <w:t xml:space="preserve">	131</w:t>
+      </w:r>
+    </w:p>
+    <w:p>
+      <w:pPr>
+        <w:tabs>
+          <w:tab w:val="right" w:pos="9200" w:leader="dot"/>
+        </w:tabs>
+        <w:spacing w:after="20" w:before="0"/>
+        <w:ind w:left="280"/>
+      </w:pPr>
+      <w:r>
+        <w:rPr>
+          <w:b w:val="false"/>
+          <w:bCs w:val="false"/>
+          <w:color w:val="222222"/>
+          <w:sz w:val="22"/>
+          <w:szCs w:val="22"/>
+        </w:rPr>
+        <w:t xml:space="preserve">2D-Extras</w:t>
+      </w:r>
+      <w:r>
+        <w:rPr>
+          <w:color w:val="555555"/>
+          <w:sz w:val="22"/>
+          <w:szCs w:val="22"/>
+        </w:rPr>
+        <w:t xml:space="preserve">	136</w:t>
       </w:r>
     </w:p>
     <w:p>
@@ -46362,6 +46389,1525 @@
                 <w:szCs w:val="22"/>
               </w:rPr>
               <w:t xml:space="preserve">Standardmäßig zeichnet TEXT in einer eingebauten Schrift. Eigene TrueType-Schriften lädst du mit LOADFONT und aktivierst sie mit SETFONT – damit kannst du Überschriften groß und stilvoll setzen. Mehr dazu in der Doku zu Schriften.</w:t>
+            </w:r>
+          </w:p>
+        </w:tc>
+      </w:tr>
+    </w:tbl>
+    <w:p>
+      <w:pPr>
+        <w:spacing w:after="160"/>
+      </w:pPr>
+    </w:p>
+    <w:p>
+      <w:pPr>
+        <w:pStyle w:val="Heading1"/>
+        <w:keepNext/>
+        <w:keepLines/>
+        <w:pageBreakBefore/>
+        <w:pBdr>
+          <w:bottom w:val="single" w:color="1B6CA8" w:sz="12" w:space="4"/>
+        </w:pBdr>
+        <w:spacing w:after="160" w:before="0"/>
+      </w:pPr>
+      <w:r>
+        <w:t xml:space="preserve">2D-Extras</w:t>
+      </w:r>
+    </w:p>
+    <w:p>
+      <w:pPr>
+        <w:spacing w:after="180" w:line="312" w:lineRule="auto"/>
+      </w:pPr>
+      <w:r>
+        <w:rPr>
+          <w:sz w:val="22"/>
+          <w:szCs w:val="22"/>
+        </w:rPr>
+        <w:t xml:space="preserve">Über die Grundformen hinaus bietet GameBasic einige hübsche Extras: dicke Linien, runde Rechtecke, Farbverläufe, weiche Kurven, Mischmodi für Leucht-Effekte, fertig erzeugte Texturen und Zwischen-Zeichenflächen. Alle werden – wie das ganze Kapitel – im Grafikfenster zwischen CLS und FLIP benutzt.</w:t>
+      </w:r>
+    </w:p>
+    <w:p>
+      <w:pPr>
+        <w:keepNext/>
+        <w:spacing w:after="40" w:before="160"/>
+        <w:jc w:val="center"/>
+      </w:pPr>
+      <w:r>
+        <w:drawing>
+          <wp:inline distT="0" distB="0" distL="0" distR="0">
+            <wp:extent cx="4572000" cy="3048000"/>
+            <wp:effectExtent t="0" r="0" b="0" l="0"/>
+            <wp:docPr id="1" name="42_extras.png" descr="Farbverläufe, ein rundes Rechteck, dicke Linien und eine weiche Spline-Kurve." title="Farbverläufe, ein rundes Rechteck, dicke Linien und eine weiche Spline-Kurve."/>
+            <wp:cNvGraphicFramePr>
+              <a:graphicFrameLocks xmlns:a="http://schemas.openxmlformats.org/drawingml/2006/main" noChangeAspect="1"/>
+            </wp:cNvGraphicFramePr>
+            <a:graphic xmlns:a="http://schemas.openxmlformats.org/drawingml/2006/main">
+              <a:graphicData uri="http://schemas.openxmlformats.org/drawingml/2006/picture">
+                <pic:pic xmlns:pic="http://schemas.openxmlformats.org/drawingml/2006/picture">
+                  <pic:nvPicPr>
+                    <pic:cNvPr id="0" name="" descr=""/>
+                    <pic:cNvPicPr>
+                      <a:picLocks noChangeAspect="1" noChangeArrowheads="1"/>
+                    </pic:cNvPicPr>
+                  </pic:nvPicPr>
+                  <pic:blipFill>
+                    <a:blip r:embed="rId10" cstate="none"/>
+                    <a:srcRect/>
+                    <a:stretch>
+                      <a:fillRect/>
+                    </a:stretch>
+                  </pic:blipFill>
+                  <pic:spPr bwMode="auto">
+                    <a:xfrm>
+                      <a:off x="0" y="0"/>
+                      <a:ext cx="4572000" cy="3048000"/>
+                    </a:xfrm>
+                    <a:prstGeom prst="rect">
+                      <a:avLst/>
+                    </a:prstGeom>
+                  </pic:spPr>
+                </pic:pic>
+              </a:graphicData>
+            </a:graphic>
+          </wp:inline>
+        </w:drawing>
+      </w:r>
+    </w:p>
+    <w:p>
+      <w:pPr>
+        <w:spacing w:after="200"/>
+        <w:jc w:val="center"/>
+      </w:pPr>
+      <w:r>
+        <w:rPr>
+          <w:i/>
+          <w:iCs/>
+          <w:color w:val="6A6A6A"/>
+          <w:sz w:val="18"/>
+          <w:szCs w:val="18"/>
+        </w:rPr>
+        <w:t xml:space="preserve">Farbverläufe, ein rundes Rechteck, dicke Linien und eine weiche Spline-Kurve.</w:t>
+      </w:r>
+    </w:p>
+    <w:p>
+      <w:pPr>
+        <w:pStyle w:val="Heading2"/>
+        <w:keepNext/>
+        <w:keepLines/>
+        <w:spacing w:after="120" w:before="280"/>
+      </w:pPr>
+      <w:r>
+        <w:t xml:space="preserve">Dicke Linien &amp; runde Rechtecke</w:t>
+      </w:r>
+    </w:p>
+    <w:p>
+      <w:pPr>
+        <w:keepNext/>
+        <w:keepLines/>
+        <w:pBdr>
+          <w:bottom w:val="single" w:color="DDD0C0" w:sz="4" w:space="2"/>
+        </w:pBdr>
+        <w:spacing w:after="40" w:before="360"/>
+      </w:pPr>
+      <w:r>
+        <w:rPr>
+          <w:rFonts w:ascii="Consolas" w:cs="Consolas" w:eastAsia="Consolas" w:hAnsi="Consolas"/>
+          <w:b/>
+          <w:bCs/>
+          <w:color w:val="9A3412"/>
+          <w:sz w:val="24"/>
+          <w:szCs w:val="24"/>
+        </w:rPr>
+        <w:t xml:space="preserve">LINEW</w:t>
+      </w:r>
+    </w:p>
+    <w:p>
+      <w:pPr>
+        <w:keepNext/>
+        <w:spacing w:after="120"/>
+      </w:pPr>
+      <w:r>
+        <w:rPr>
+          <w:b/>
+          <w:bCs/>
+          <w:color w:val="6A6A6A"/>
+          <w:sz w:val="18"/>
+          <w:szCs w:val="18"/>
+        </w:rPr>
+        <w:t xml:space="preserve">Syntax:  </w:t>
+      </w:r>
+      <w:r>
+        <w:rPr>
+          <w:rFonts w:ascii="Consolas" w:cs="Consolas" w:eastAsia="Consolas" w:hAnsi="Consolas"/>
+          <w:color w:val="335577"/>
+          <w:sz w:val="19"/>
+          <w:szCs w:val="19"/>
+        </w:rPr>
+        <w:t xml:space="preserve">LINEW(x1, y1, x2, y2, breite[, farbe])</w:t>
+      </w:r>
+    </w:p>
+    <w:p>
+      <w:pPr>
+        <w:spacing w:after="180" w:line="312" w:lineRule="auto"/>
+      </w:pPr>
+      <w:r>
+        <w:rPr>
+          <w:sz w:val="22"/>
+          <w:szCs w:val="22"/>
+        </w:rPr>
+        <w:t xml:space="preserve">Wie LINE, aber mit einstellbarer Strichbreite in Pixeln.</w:t>
+      </w:r>
+    </w:p>
+    <w:p>
+      <w:pPr>
+        <w:keepNext/>
+        <w:spacing w:after="30" w:before="120"/>
+      </w:pPr>
+      <w:r>
+        <w:rPr>
+          <w:b/>
+          <w:bCs/>
+          <w:i/>
+          <w:iCs/>
+          <w:color w:val="6A6A6A"/>
+          <w:sz w:val="18"/>
+          <w:szCs w:val="18"/>
+        </w:rPr>
+        <w:t xml:space="preserve">Beispiel</w:t>
+      </w:r>
+    </w:p>
+    <w:p>
+      <w:pPr>
+        <w:keepLines/>
+        <w:pBdr>
+          <w:left w:val="single" w:color="1B6CA8" w:sz="18" w:space="6"/>
+        </w:pBdr>
+        <w:shd w:fill="F4F4F4" w:val="clear"/>
+        <w:spacing w:after="200" w:before="100" w:line="264" w:lineRule="auto"/>
+        <w:ind w:left="140"/>
+      </w:pPr>
+      <w:r>
+        <w:rPr>
+          <w:rFonts w:ascii="Consolas" w:cs="Consolas" w:eastAsia="Consolas" w:hAnsi="Consolas"/>
+          <w:sz w:val="19"/>
+          <w:szCs w:val="19"/>
+        </w:rPr>
+        <w:t xml:space="preserve">CLS()</w:t>
+      </w:r>
+      <w:r>
+        <w:rPr>
+          <w:rFonts w:ascii="Consolas" w:cs="Consolas" w:eastAsia="Consolas" w:hAnsi="Consolas"/>
+          <w:sz w:val="19"/>
+          <w:szCs w:val="19"/>
+        </w:rPr>
+        <w:br/>
+        <w:t xml:space="preserve">LINEW(40, 60, 280, 60, 6, RGB(255, 204, 0))</w:t>
+      </w:r>
+      <w:r>
+        <w:rPr>
+          <w:rFonts w:ascii="Consolas" w:cs="Consolas" w:eastAsia="Consolas" w:hAnsi="Consolas"/>
+          <w:sz w:val="19"/>
+          <w:szCs w:val="19"/>
+        </w:rPr>
+        <w:br/>
+        <w:t xml:space="preserve">FLIP()</w:t>
+      </w:r>
+    </w:p>
+    <w:p>
+      <w:pPr>
+        <w:keepNext/>
+        <w:keepLines/>
+        <w:pBdr>
+          <w:bottom w:val="single" w:color="DDD0C0" w:sz="4" w:space="2"/>
+        </w:pBdr>
+        <w:spacing w:after="40" w:before="360"/>
+      </w:pPr>
+      <w:r>
+        <w:rPr>
+          <w:rFonts w:ascii="Consolas" w:cs="Consolas" w:eastAsia="Consolas" w:hAnsi="Consolas"/>
+          <w:b/>
+          <w:bCs/>
+          <w:color w:val="9A3412"/>
+          <w:sz w:val="24"/>
+          <w:szCs w:val="24"/>
+        </w:rPr>
+        <w:t xml:space="preserve">BOXROUND · RECTROUND</w:t>
+      </w:r>
+    </w:p>
+    <w:p>
+      <w:pPr>
+        <w:keepNext/>
+        <w:spacing w:after="120"/>
+      </w:pPr>
+      <w:r>
+        <w:rPr>
+          <w:b/>
+          <w:bCs/>
+          <w:color w:val="6A6A6A"/>
+          <w:sz w:val="18"/>
+          <w:szCs w:val="18"/>
+        </w:rPr>
+        <w:t xml:space="preserve">Syntax:  </w:t>
+      </w:r>
+      <w:r>
+        <w:rPr>
+          <w:rFonts w:ascii="Consolas" w:cs="Consolas" w:eastAsia="Consolas" w:hAnsi="Consolas"/>
+          <w:color w:val="335577"/>
+          <w:sz w:val="19"/>
+          <w:szCs w:val="19"/>
+        </w:rPr>
+        <w:t xml:space="preserve">BOXROUND(x1, y1, x2, y2, radius[, farbe])   RECTROUND(...)</w:t>
+      </w:r>
+    </w:p>
+    <w:p>
+      <w:pPr>
+        <w:spacing w:after="180" w:line="312" w:lineRule="auto"/>
+      </w:pPr>
+      <w:r>
+        <w:rPr>
+          <w:sz w:val="22"/>
+          <w:szCs w:val="22"/>
+        </w:rPr>
+        <w:t xml:space="preserve">Zeichnen ein Rechteck mit abgerundeten Ecken (Eckradius in Pixeln). BOXROUND füllt, RECTROUND zeichnet nur den Rahmen.</w:t>
+      </w:r>
+    </w:p>
+    <w:p>
+      <w:pPr>
+        <w:keepNext/>
+        <w:spacing w:after="30" w:before="120"/>
+      </w:pPr>
+      <w:r>
+        <w:rPr>
+          <w:b/>
+          <w:bCs/>
+          <w:i/>
+          <w:iCs/>
+          <w:color w:val="6A6A6A"/>
+          <w:sz w:val="18"/>
+          <w:szCs w:val="18"/>
+        </w:rPr>
+        <w:t xml:space="preserve">Beispiel</w:t>
+      </w:r>
+    </w:p>
+    <w:p>
+      <w:pPr>
+        <w:keepLines/>
+        <w:pBdr>
+          <w:left w:val="single" w:color="1B6CA8" w:sz="18" w:space="6"/>
+        </w:pBdr>
+        <w:shd w:fill="F4F4F4" w:val="clear"/>
+        <w:spacing w:after="200" w:before="100" w:line="264" w:lineRule="auto"/>
+        <w:ind w:left="140"/>
+      </w:pPr>
+      <w:r>
+        <w:rPr>
+          <w:rFonts w:ascii="Consolas" w:cs="Consolas" w:eastAsia="Consolas" w:hAnsi="Consolas"/>
+          <w:sz w:val="19"/>
+          <w:szCs w:val="19"/>
+        </w:rPr>
+        <w:t xml:space="preserve">CLS()</w:t>
+      </w:r>
+      <w:r>
+        <w:rPr>
+          <w:rFonts w:ascii="Consolas" w:cs="Consolas" w:eastAsia="Consolas" w:hAnsi="Consolas"/>
+          <w:sz w:val="19"/>
+          <w:szCs w:val="19"/>
+        </w:rPr>
+        <w:br/>
+        <w:t xml:space="preserve">BOXROUND(40, 40, 200, 120, 20, RGB(48, 208, 128))</w:t>
+      </w:r>
+      <w:r>
+        <w:rPr>
+          <w:rFonts w:ascii="Consolas" w:cs="Consolas" w:eastAsia="Consolas" w:hAnsi="Consolas"/>
+          <w:sz w:val="19"/>
+          <w:szCs w:val="19"/>
+        </w:rPr>
+        <w:br/>
+        <w:t xml:space="preserve">RECTROUND(40, 40, 200, 120, 20, RGB(255, 255, 255))</w:t>
+      </w:r>
+      <w:r>
+        <w:rPr>
+          <w:rFonts w:ascii="Consolas" w:cs="Consolas" w:eastAsia="Consolas" w:hAnsi="Consolas"/>
+          <w:sz w:val="19"/>
+          <w:szCs w:val="19"/>
+        </w:rPr>
+        <w:br/>
+        <w:t xml:space="preserve">FLIP()</w:t>
+      </w:r>
+    </w:p>
+    <w:p>
+      <w:pPr>
+        <w:pStyle w:val="Heading2"/>
+        <w:keepNext/>
+        <w:keepLines/>
+        <w:spacing w:after="120" w:before="280"/>
+      </w:pPr>
+      <w:r>
+        <w:t xml:space="preserve">Farbverläufe</w:t>
+      </w:r>
+    </w:p>
+    <w:p>
+      <w:pPr>
+        <w:keepNext/>
+        <w:keepLines/>
+        <w:pBdr>
+          <w:bottom w:val="single" w:color="DDD0C0" w:sz="4" w:space="2"/>
+        </w:pBdr>
+        <w:spacing w:after="40" w:before="360"/>
+      </w:pPr>
+      <w:r>
+        <w:rPr>
+          <w:rFonts w:ascii="Consolas" w:cs="Consolas" w:eastAsia="Consolas" w:hAnsi="Consolas"/>
+          <w:b/>
+          <w:bCs/>
+          <w:color w:val="9A3412"/>
+          <w:sz w:val="24"/>
+          <w:szCs w:val="24"/>
+        </w:rPr>
+        <w:t xml:space="preserve">GRADIENTV · GRADIENTH</w:t>
+      </w:r>
+    </w:p>
+    <w:p>
+      <w:pPr>
+        <w:keepNext/>
+        <w:spacing w:after="120"/>
+      </w:pPr>
+      <w:r>
+        <w:rPr>
+          <w:b/>
+          <w:bCs/>
+          <w:color w:val="6A6A6A"/>
+          <w:sz w:val="18"/>
+          <w:szCs w:val="18"/>
+        </w:rPr>
+        <w:t xml:space="preserve">Syntax:  </w:t>
+      </w:r>
+      <w:r>
+        <w:rPr>
+          <w:rFonts w:ascii="Consolas" w:cs="Consolas" w:eastAsia="Consolas" w:hAnsi="Consolas"/>
+          <w:color w:val="335577"/>
+          <w:sz w:val="19"/>
+          <w:szCs w:val="19"/>
+        </w:rPr>
+        <w:t xml:space="preserve">GRADIENTV(x1, y1, x2, y2, farbe1, farbe2)   GRADIENTH(...)</w:t>
+      </w:r>
+    </w:p>
+    <w:p>
+      <w:pPr>
+        <w:spacing w:after="180" w:line="312" w:lineRule="auto"/>
+      </w:pPr>
+      <w:r>
+        <w:rPr>
+          <w:sz w:val="22"/>
+          <w:szCs w:val="22"/>
+        </w:rPr>
+        <w:t xml:space="preserve">Füllen ein Rechteck mit einem weichen Farbverlauf von farbe1 nach farbe2 – GRADIENTV senkrecht (oben→unten), GRADIENTH waagerecht (links→rechts). Gut für Himmel, Hintergründe oder Knöpfe.</w:t>
+      </w:r>
+    </w:p>
+    <w:p>
+      <w:pPr>
+        <w:keepNext/>
+        <w:spacing w:after="30" w:before="120"/>
+      </w:pPr>
+      <w:r>
+        <w:rPr>
+          <w:b/>
+          <w:bCs/>
+          <w:i/>
+          <w:iCs/>
+          <w:color w:val="6A6A6A"/>
+          <w:sz w:val="18"/>
+          <w:szCs w:val="18"/>
+        </w:rPr>
+        <w:t xml:space="preserve">Beispiel</w:t>
+      </w:r>
+    </w:p>
+    <w:p>
+      <w:pPr>
+        <w:keepLines/>
+        <w:pBdr>
+          <w:left w:val="single" w:color="1B6CA8" w:sz="18" w:space="6"/>
+        </w:pBdr>
+        <w:shd w:fill="F4F4F4" w:val="clear"/>
+        <w:spacing w:after="200" w:before="100" w:line="264" w:lineRule="auto"/>
+        <w:ind w:left="140"/>
+      </w:pPr>
+      <w:r>
+        <w:rPr>
+          <w:rFonts w:ascii="Consolas" w:cs="Consolas" w:eastAsia="Consolas" w:hAnsi="Consolas"/>
+          <w:sz w:val="19"/>
+          <w:szCs w:val="19"/>
+        </w:rPr>
+        <w:t xml:space="preserve">CLS()</w:t>
+      </w:r>
+      <w:r>
+        <w:rPr>
+          <w:rFonts w:ascii="Consolas" w:cs="Consolas" w:eastAsia="Consolas" w:hAnsi="Consolas"/>
+          <w:sz w:val="19"/>
+          <w:szCs w:val="19"/>
+        </w:rPr>
+        <w:br/>
+        <w:t xml:space="preserve">GRADIENTV(0, 0, 320, 240, RGB(20, 30, 60), RGB(60, 20, 40))</w:t>
+      </w:r>
+      <w:r>
+        <w:rPr>
+          <w:rFonts w:ascii="Consolas" w:cs="Consolas" w:eastAsia="Consolas" w:hAnsi="Consolas"/>
+          <w:sz w:val="19"/>
+          <w:szCs w:val="19"/>
+        </w:rPr>
+        <w:br/>
+        <w:t xml:space="preserve">FLIP()</w:t>
+      </w:r>
+    </w:p>
+    <w:p>
+      <w:pPr>
+        <w:pStyle w:val="Heading2"/>
+        <w:keepNext/>
+        <w:keepLines/>
+        <w:spacing w:after="120" w:before="280"/>
+      </w:pPr>
+      <w:r>
+        <w:t xml:space="preserve">Weiche Kurven</w:t>
+      </w:r>
+    </w:p>
+    <w:p>
+      <w:pPr>
+        <w:keepNext/>
+        <w:keepLines/>
+        <w:pBdr>
+          <w:bottom w:val="single" w:color="DDD0C0" w:sz="4" w:space="2"/>
+        </w:pBdr>
+        <w:spacing w:after="40" w:before="360"/>
+      </w:pPr>
+      <w:r>
+        <w:rPr>
+          <w:rFonts w:ascii="Consolas" w:cs="Consolas" w:eastAsia="Consolas" w:hAnsi="Consolas"/>
+          <w:b/>
+          <w:bCs/>
+          <w:color w:val="9A3412"/>
+          <w:sz w:val="24"/>
+          <w:szCs w:val="24"/>
+        </w:rPr>
+        <w:t xml:space="preserve">SPLINE</w:t>
+      </w:r>
+    </w:p>
+    <w:p>
+      <w:pPr>
+        <w:keepNext/>
+        <w:spacing w:after="120"/>
+      </w:pPr>
+      <w:r>
+        <w:rPr>
+          <w:b/>
+          <w:bCs/>
+          <w:color w:val="6A6A6A"/>
+          <w:sz w:val="18"/>
+          <w:szCs w:val="18"/>
+        </w:rPr>
+        <w:t xml:space="preserve">Syntax:  </w:t>
+      </w:r>
+      <w:r>
+        <w:rPr>
+          <w:rFonts w:ascii="Consolas" w:cs="Consolas" w:eastAsia="Consolas" w:hAnsi="Consolas"/>
+          <w:color w:val="335577"/>
+          <w:sz w:val="19"/>
+          <w:szCs w:val="19"/>
+        </w:rPr>
+        <w:t xml:space="preserve">SPLINE(xs, ys[, farbe[, breite]])</w:t>
+      </w:r>
+    </w:p>
+    <w:p>
+      <w:pPr>
+        <w:spacing w:after="180" w:line="312" w:lineRule="auto"/>
+      </w:pPr>
+      <w:r>
+        <w:rPr>
+          <w:sz w:val="22"/>
+          <w:szCs w:val="22"/>
+        </w:rPr>
+        <w:t xml:space="preserve">Zeichnet eine weiche Kurve, die durch alle angegebenen Stützpunkte läuft. xs und ys sind zwei gleich lange Arrays mit den x- und y-Koordinaten der Punkte.</w:t>
+      </w:r>
+    </w:p>
+    <w:p>
+      <w:pPr>
+        <w:keepNext/>
+        <w:spacing w:after="30" w:before="120"/>
+      </w:pPr>
+      <w:r>
+        <w:rPr>
+          <w:b/>
+          <w:bCs/>
+          <w:i/>
+          <w:iCs/>
+          <w:color w:val="6A6A6A"/>
+          <w:sz w:val="18"/>
+          <w:szCs w:val="18"/>
+        </w:rPr>
+        <w:t xml:space="preserve">Beispiel</w:t>
+      </w:r>
+    </w:p>
+    <w:p>
+      <w:pPr>
+        <w:keepLines/>
+        <w:pBdr>
+          <w:left w:val="single" w:color="1B6CA8" w:sz="18" w:space="6"/>
+        </w:pBdr>
+        <w:shd w:fill="F4F4F4" w:val="clear"/>
+        <w:spacing w:after="200" w:before="100" w:line="264" w:lineRule="auto"/>
+        <w:ind w:left="140"/>
+      </w:pPr>
+      <w:r>
+        <w:rPr>
+          <w:rFonts w:ascii="Consolas" w:cs="Consolas" w:eastAsia="Consolas" w:hAnsi="Consolas"/>
+          <w:sz w:val="19"/>
+          <w:szCs w:val="19"/>
+        </w:rPr>
+        <w:t xml:space="preserve">DIM xs[4] AS INTEGER</w:t>
+      </w:r>
+      <w:r>
+        <w:rPr>
+          <w:rFonts w:ascii="Consolas" w:cs="Consolas" w:eastAsia="Consolas" w:hAnsi="Consolas"/>
+          <w:sz w:val="19"/>
+          <w:szCs w:val="19"/>
+        </w:rPr>
+        <w:br/>
+        <w:t xml:space="preserve">DIM ys[4] AS INTEGER</w:t>
+      </w:r>
+      <w:r>
+        <w:rPr>
+          <w:rFonts w:ascii="Consolas" w:cs="Consolas" w:eastAsia="Consolas" w:hAnsi="Consolas"/>
+          <w:sz w:val="19"/>
+          <w:szCs w:val="19"/>
+        </w:rPr>
+        <w:br/>
+        <w:t xml:space="preserve">xs[0]=20  : ys[0]=200</w:t>
+      </w:r>
+      <w:r>
+        <w:rPr>
+          <w:rFonts w:ascii="Consolas" w:cs="Consolas" w:eastAsia="Consolas" w:hAnsi="Consolas"/>
+          <w:sz w:val="19"/>
+          <w:szCs w:val="19"/>
+        </w:rPr>
+        <w:br/>
+        <w:t xml:space="preserve">xs[1]=110 : ys[1]=120</w:t>
+      </w:r>
+      <w:r>
+        <w:rPr>
+          <w:rFonts w:ascii="Consolas" w:cs="Consolas" w:eastAsia="Consolas" w:hAnsi="Consolas"/>
+          <w:sz w:val="19"/>
+          <w:szCs w:val="19"/>
+        </w:rPr>
+        <w:br/>
+        <w:t xml:space="preserve">xs[2]=210 : ys[2]=200</w:t>
+      </w:r>
+      <w:r>
+        <w:rPr>
+          <w:rFonts w:ascii="Consolas" w:cs="Consolas" w:eastAsia="Consolas" w:hAnsi="Consolas"/>
+          <w:sz w:val="19"/>
+          <w:szCs w:val="19"/>
+        </w:rPr>
+        <w:br/>
+        <w:t xml:space="preserve">xs[3]=300 : ys[3]=120</w:t>
+      </w:r>
+      <w:r>
+        <w:rPr>
+          <w:rFonts w:ascii="Consolas" w:cs="Consolas" w:eastAsia="Consolas" w:hAnsi="Consolas"/>
+          <w:sz w:val="19"/>
+          <w:szCs w:val="19"/>
+        </w:rPr>
+        <w:br/>
+        <w:t xml:space="preserve">CLS()</w:t>
+      </w:r>
+      <w:r>
+        <w:rPr>
+          <w:rFonts w:ascii="Consolas" w:cs="Consolas" w:eastAsia="Consolas" w:hAnsi="Consolas"/>
+          <w:sz w:val="19"/>
+          <w:szCs w:val="19"/>
+        </w:rPr>
+        <w:br/>
+        <w:t xml:space="preserve">SPLINE(xs, ys, RGB(0, 255, 208), 3.0)</w:t>
+      </w:r>
+      <w:r>
+        <w:rPr>
+          <w:rFonts w:ascii="Consolas" w:cs="Consolas" w:eastAsia="Consolas" w:hAnsi="Consolas"/>
+          <w:sz w:val="19"/>
+          <w:szCs w:val="19"/>
+        </w:rPr>
+        <w:br/>
+        <w:t xml:space="preserve">FLIP()</w:t>
+      </w:r>
+    </w:p>
+    <w:p>
+      <w:pPr>
+        <w:pStyle w:val="Heading2"/>
+        <w:keepNext/>
+        <w:keepLines/>
+        <w:spacing w:after="120" w:before="280"/>
+      </w:pPr>
+      <w:r>
+        <w:t xml:space="preserve">Mischmodi für Leucht-Effekte</w:t>
+      </w:r>
+    </w:p>
+    <w:p>
+      <w:pPr>
+        <w:spacing w:after="180" w:line="312" w:lineRule="auto"/>
+      </w:pPr>
+      <w:r>
+        <w:rPr>
+          <w:sz w:val="22"/>
+          <w:szCs w:val="22"/>
+        </w:rPr>
+        <w:t xml:space="preserve">Normalerweise überdeckt eine neue Form das, was darunter liegt. Mit einem anderen Mischmodus kannst du Farben stattdessen addieren – überlappende Flächen werden dann heller und leuchten. Ideal für Feuer, Magie oder Lichtkegel.</w:t>
+      </w:r>
+    </w:p>
+    <w:p>
+      <w:pPr>
+        <w:keepNext/>
+        <w:spacing w:after="40" w:before="160"/>
+        <w:jc w:val="center"/>
+      </w:pPr>
+      <w:r>
+        <w:drawing>
+          <wp:inline distT="0" distB="0" distL="0" distR="0">
+            <wp:extent cx="4572000" cy="3048000"/>
+            <wp:effectExtent t="0" r="0" b="0" l="0"/>
+            <wp:docPr id="1" name="42_blend.png" descr="Oben drei erzeugte Texturen; unten überlappende Kreise im additiven Modus (heller = Glow)." title="Oben drei erzeugte Texturen; unten überlappende Kreise im additiven Modus (heller = Glow)."/>
+            <wp:cNvGraphicFramePr>
+              <a:graphicFrameLocks xmlns:a="http://schemas.openxmlformats.org/drawingml/2006/main" noChangeAspect="1"/>
+            </wp:cNvGraphicFramePr>
+            <a:graphic xmlns:a="http://schemas.openxmlformats.org/drawingml/2006/main">
+              <a:graphicData uri="http://schemas.openxmlformats.org/drawingml/2006/picture">
+                <pic:pic xmlns:pic="http://schemas.openxmlformats.org/drawingml/2006/picture">
+                  <pic:nvPicPr>
+                    <pic:cNvPr id="0" name="" descr=""/>
+                    <pic:cNvPicPr>
+                      <a:picLocks noChangeAspect="1" noChangeArrowheads="1"/>
+                    </pic:cNvPicPr>
+                  </pic:nvPicPr>
+                  <pic:blipFill>
+                    <a:blip r:embed="rId11" cstate="none"/>
+                    <a:srcRect/>
+                    <a:stretch>
+                      <a:fillRect/>
+                    </a:stretch>
+                  </pic:blipFill>
+                  <pic:spPr bwMode="auto">
+                    <a:xfrm>
+                      <a:off x="0" y="0"/>
+                      <a:ext cx="4572000" cy="3048000"/>
+                    </a:xfrm>
+                    <a:prstGeom prst="rect">
+                      <a:avLst/>
+                    </a:prstGeom>
+                  </pic:spPr>
+                </pic:pic>
+              </a:graphicData>
+            </a:graphic>
+          </wp:inline>
+        </w:drawing>
+      </w:r>
+    </w:p>
+    <w:p>
+      <w:pPr>
+        <w:spacing w:after="200"/>
+        <w:jc w:val="center"/>
+      </w:pPr>
+      <w:r>
+        <w:rPr>
+          <w:i/>
+          <w:iCs/>
+          <w:color w:val="6A6A6A"/>
+          <w:sz w:val="18"/>
+          <w:szCs w:val="18"/>
+        </w:rPr>
+        <w:t xml:space="preserve">Oben drei erzeugte Texturen; unten überlappende Kreise im additiven Modus (heller = Glow).</w:t>
+      </w:r>
+    </w:p>
+    <w:p>
+      <w:pPr>
+        <w:keepNext/>
+        <w:keepLines/>
+        <w:pBdr>
+          <w:bottom w:val="single" w:color="DDD0C0" w:sz="4" w:space="2"/>
+        </w:pBdr>
+        <w:spacing w:after="40" w:before="360"/>
+      </w:pPr>
+      <w:r>
+        <w:rPr>
+          <w:rFonts w:ascii="Consolas" w:cs="Consolas" w:eastAsia="Consolas" w:hAnsi="Consolas"/>
+          <w:b/>
+          <w:bCs/>
+          <w:color w:val="9A3412"/>
+          <w:sz w:val="24"/>
+          <w:szCs w:val="24"/>
+        </w:rPr>
+        <w:t xml:space="preserve">BLEND_MODE</w:t>
+      </w:r>
+    </w:p>
+    <w:p>
+      <w:pPr>
+        <w:keepNext/>
+        <w:spacing w:after="120"/>
+      </w:pPr>
+      <w:r>
+        <w:rPr>
+          <w:b/>
+          <w:bCs/>
+          <w:color w:val="6A6A6A"/>
+          <w:sz w:val="18"/>
+          <w:szCs w:val="18"/>
+        </w:rPr>
+        <w:t xml:space="preserve">Syntax:  </w:t>
+      </w:r>
+      <w:r>
+        <w:rPr>
+          <w:rFonts w:ascii="Consolas" w:cs="Consolas" w:eastAsia="Consolas" w:hAnsi="Consolas"/>
+          <w:color w:val="335577"/>
+          <w:sz w:val="19"/>
+          <w:szCs w:val="19"/>
+        </w:rPr>
+        <w:t xml:space="preserve">BLEND_MODE(modus$)</w:t>
+      </w:r>
+    </w:p>
+    <w:p>
+      <w:pPr>
+        <w:spacing w:after="180" w:line="312" w:lineRule="auto"/>
+      </w:pPr>
+      <w:r>
+        <w:rPr>
+          <w:sz w:val="22"/>
+          <w:szCs w:val="22"/>
+        </w:rPr>
+        <w:t xml:space="preserve">Stellt den Mischmodus für die folgenden Zeichenbefehle ein: "alpha" (normal), "add" (addierend – leuchtet), "mult" (multiplizierend – verdunkelt) oder "subtract". Nach dem Effekt mit BLEND_MODE("alpha") zurückschalten.</w:t>
+      </w:r>
+    </w:p>
+    <w:p>
+      <w:pPr>
+        <w:keepNext/>
+        <w:spacing w:after="30" w:before="120"/>
+      </w:pPr>
+      <w:r>
+        <w:rPr>
+          <w:b/>
+          <w:bCs/>
+          <w:i/>
+          <w:iCs/>
+          <w:color w:val="6A6A6A"/>
+          <w:sz w:val="18"/>
+          <w:szCs w:val="18"/>
+        </w:rPr>
+        <w:t xml:space="preserve">Beispiel</w:t>
+      </w:r>
+    </w:p>
+    <w:p>
+      <w:pPr>
+        <w:keepLines/>
+        <w:pBdr>
+          <w:left w:val="single" w:color="1B6CA8" w:sz="18" w:space="6"/>
+        </w:pBdr>
+        <w:shd w:fill="F4F4F4" w:val="clear"/>
+        <w:spacing w:after="200" w:before="100" w:line="264" w:lineRule="auto"/>
+        <w:ind w:left="140"/>
+      </w:pPr>
+      <w:r>
+        <w:rPr>
+          <w:rFonts w:ascii="Consolas" w:cs="Consolas" w:eastAsia="Consolas" w:hAnsi="Consolas"/>
+          <w:sz w:val="19"/>
+          <w:szCs w:val="19"/>
+        </w:rPr>
+        <w:t xml:space="preserve">CLS()</w:t>
+      </w:r>
+      <w:r>
+        <w:rPr>
+          <w:rFonts w:ascii="Consolas" w:cs="Consolas" w:eastAsia="Consolas" w:hAnsi="Consolas"/>
+          <w:sz w:val="19"/>
+          <w:szCs w:val="19"/>
+        </w:rPr>
+        <w:br/>
+        <w:t xml:space="preserve">BLEND_MODE("add")           ' ab jetzt addierend</w:t>
+      </w:r>
+      <w:r>
+        <w:rPr>
+          <w:rFonts w:ascii="Consolas" w:cs="Consolas" w:eastAsia="Consolas" w:hAnsi="Consolas"/>
+          <w:sz w:val="19"/>
+          <w:szCs w:val="19"/>
+        </w:rPr>
+        <w:br/>
+        <w:t xml:space="preserve">CIRCLE(150, 120, 50, RGB(64, 32, 0))</w:t>
+      </w:r>
+      <w:r>
+        <w:rPr>
+          <w:rFonts w:ascii="Consolas" w:cs="Consolas" w:eastAsia="Consolas" w:hAnsi="Consolas"/>
+          <w:sz w:val="19"/>
+          <w:szCs w:val="19"/>
+        </w:rPr>
+        <w:br/>
+        <w:t xml:space="preserve">CIRCLE(190, 120, 50, RGB(16, 64, 48))</w:t>
+      </w:r>
+      <w:r>
+        <w:rPr>
+          <w:rFonts w:ascii="Consolas" w:cs="Consolas" w:eastAsia="Consolas" w:hAnsi="Consolas"/>
+          <w:sz w:val="19"/>
+          <w:szCs w:val="19"/>
+        </w:rPr>
+        <w:br/>
+        <w:t xml:space="preserve">BLEND_MODE("alpha")         ' zurück zum Normalmodus</w:t>
+      </w:r>
+      <w:r>
+        <w:rPr>
+          <w:rFonts w:ascii="Consolas" w:cs="Consolas" w:eastAsia="Consolas" w:hAnsi="Consolas"/>
+          <w:sz w:val="19"/>
+          <w:szCs w:val="19"/>
+        </w:rPr>
+        <w:br/>
+        <w:t xml:space="preserve">FLIP()</w:t>
+      </w:r>
+    </w:p>
+    <w:p>
+      <w:pPr>
+        <w:pStyle w:val="Heading2"/>
+        <w:keepNext/>
+        <w:keepLines/>
+        <w:spacing w:after="120" w:before="280"/>
+      </w:pPr>
+      <w:r>
+        <w:t xml:space="preserve">Texturen erzeugen</w:t>
+      </w:r>
+    </w:p>
+    <w:p>
+      <w:pPr>
+        <w:spacing w:after="180" w:line="312" w:lineRule="auto"/>
+      </w:pPr>
+      <w:r>
+        <w:rPr>
+          <w:sz w:val="22"/>
+          <w:szCs w:val="22"/>
+        </w:rPr>
+        <w:t xml:space="preserve">Diese Befehle berechnen ein fertiges Bild (ein IMAGE), das du dann wie ein geladenes Bild mit DRAWIMAGE zeichnest (siehe Kapitel „Bilder“). Praktisch für Hintergründe, ohne eine Bilddatei mitliefern zu müssen.</w:t>
+      </w:r>
+    </w:p>
+    <w:p>
+      <w:pPr>
+        <w:keepNext/>
+        <w:keepLines/>
+        <w:pBdr>
+          <w:bottom w:val="single" w:color="DDD0C0" w:sz="4" w:space="2"/>
+        </w:pBdr>
+        <w:spacing w:after="40" w:before="360"/>
+      </w:pPr>
+      <w:r>
+        <w:rPr>
+          <w:rFonts w:ascii="Consolas" w:cs="Consolas" w:eastAsia="Consolas" w:hAnsi="Consolas"/>
+          <w:b/>
+          <w:bCs/>
+          <w:color w:val="9A3412"/>
+          <w:sz w:val="24"/>
+          <w:szCs w:val="24"/>
+        </w:rPr>
+        <w:t xml:space="preserve">GENTEX_PERLIN</w:t>
+      </w:r>
+    </w:p>
+    <w:p>
+      <w:pPr>
+        <w:keepNext/>
+        <w:spacing w:after="120"/>
+      </w:pPr>
+      <w:r>
+        <w:rPr>
+          <w:b/>
+          <w:bCs/>
+          <w:color w:val="6A6A6A"/>
+          <w:sz w:val="18"/>
+          <w:szCs w:val="18"/>
+        </w:rPr>
+        <w:t xml:space="preserve">Syntax:  </w:t>
+      </w:r>
+      <w:r>
+        <w:rPr>
+          <w:rFonts w:ascii="Consolas" w:cs="Consolas" w:eastAsia="Consolas" w:hAnsi="Consolas"/>
+          <w:color w:val="335577"/>
+          <w:sz w:val="19"/>
+          <w:szCs w:val="19"/>
+        </w:rPr>
+        <w:t xml:space="preserve">GENTEX_PERLIN(breite, höhe, skala)</w:t>
+      </w:r>
+    </w:p>
+    <w:p>
+      <w:pPr>
+        <w:spacing w:after="180" w:line="312" w:lineRule="auto"/>
+      </w:pPr>
+      <w:r>
+        <w:rPr>
+          <w:sz w:val="22"/>
+          <w:szCs w:val="22"/>
+        </w:rPr>
+        <w:t xml:space="preserve">Erzeugt eine weiche, wolkige Rauschtextur (Perlin-Noise). Größere skala = gröbere Muster. Gut für Wolken, Nebel, Terrain.</w:t>
+      </w:r>
+    </w:p>
+    <w:p>
+      <w:pPr>
+        <w:keepNext/>
+        <w:spacing w:after="30" w:before="120"/>
+      </w:pPr>
+      <w:r>
+        <w:rPr>
+          <w:b/>
+          <w:bCs/>
+          <w:i/>
+          <w:iCs/>
+          <w:color w:val="6A6A6A"/>
+          <w:sz w:val="18"/>
+          <w:szCs w:val="18"/>
+        </w:rPr>
+        <w:t xml:space="preserve">Beispiel</w:t>
+      </w:r>
+    </w:p>
+    <w:p>
+      <w:pPr>
+        <w:keepLines/>
+        <w:pBdr>
+          <w:left w:val="single" w:color="1B6CA8" w:sz="18" w:space="6"/>
+        </w:pBdr>
+        <w:shd w:fill="F4F4F4" w:val="clear"/>
+        <w:spacing w:after="200" w:before="100" w:line="264" w:lineRule="auto"/>
+        <w:ind w:left="140"/>
+      </w:pPr>
+      <w:r>
+        <w:rPr>
+          <w:rFonts w:ascii="Consolas" w:cs="Consolas" w:eastAsia="Consolas" w:hAnsi="Consolas"/>
+          <w:sz w:val="19"/>
+          <w:szCs w:val="19"/>
+        </w:rPr>
+        <w:t xml:space="preserve">DIM wolken AS IMAGE</w:t>
+      </w:r>
+      <w:r>
+        <w:rPr>
+          <w:rFonts w:ascii="Consolas" w:cs="Consolas" w:eastAsia="Consolas" w:hAnsi="Consolas"/>
+          <w:sz w:val="19"/>
+          <w:szCs w:val="19"/>
+        </w:rPr>
+        <w:br/>
+        <w:t xml:space="preserve">wolken = GENTEX_PERLIN(160, 120, 6.0)</w:t>
+      </w:r>
+      <w:r>
+        <w:rPr>
+          <w:rFonts w:ascii="Consolas" w:cs="Consolas" w:eastAsia="Consolas" w:hAnsi="Consolas"/>
+          <w:sz w:val="19"/>
+          <w:szCs w:val="19"/>
+        </w:rPr>
+        <w:br/>
+        <w:t xml:space="preserve">CLS() : DRAWIMAGE(wolken, 0, 0) : FLIP()</w:t>
+      </w:r>
+    </w:p>
+    <w:p>
+      <w:pPr>
+        <w:keepNext/>
+        <w:keepLines/>
+        <w:pBdr>
+          <w:bottom w:val="single" w:color="DDD0C0" w:sz="4" w:space="2"/>
+        </w:pBdr>
+        <w:spacing w:after="40" w:before="360"/>
+      </w:pPr>
+      <w:r>
+        <w:rPr>
+          <w:rFonts w:ascii="Consolas" w:cs="Consolas" w:eastAsia="Consolas" w:hAnsi="Consolas"/>
+          <w:b/>
+          <w:bCs/>
+          <w:color w:val="9A3412"/>
+          <w:sz w:val="24"/>
+          <w:szCs w:val="24"/>
+        </w:rPr>
+        <w:t xml:space="preserve">GENTEX_GRADIENT</w:t>
+      </w:r>
+    </w:p>
+    <w:p>
+      <w:pPr>
+        <w:keepNext/>
+        <w:spacing w:after="120"/>
+      </w:pPr>
+      <w:r>
+        <w:rPr>
+          <w:b/>
+          <w:bCs/>
+          <w:color w:val="6A6A6A"/>
+          <w:sz w:val="18"/>
+          <w:szCs w:val="18"/>
+        </w:rPr>
+        <w:t xml:space="preserve">Syntax:  </w:t>
+      </w:r>
+      <w:r>
+        <w:rPr>
+          <w:rFonts w:ascii="Consolas" w:cs="Consolas" w:eastAsia="Consolas" w:hAnsi="Consolas"/>
+          <w:color w:val="335577"/>
+          <w:sz w:val="19"/>
+          <w:szCs w:val="19"/>
+        </w:rPr>
+        <w:t xml:space="preserve">GENTEX_GRADIENT(breite, höhe, farbe1, farbe2, vertikal)</w:t>
+      </w:r>
+    </w:p>
+    <w:p>
+      <w:pPr>
+        <w:spacing w:after="180" w:line="312" w:lineRule="auto"/>
+      </w:pPr>
+      <w:r>
+        <w:rPr>
+          <w:sz w:val="22"/>
+          <w:szCs w:val="22"/>
+        </w:rPr>
+        <w:t xml:space="preserve">Erzeugt eine Verlaufstextur von farbe1 nach farbe2 (vertikal = TRUE für senkrecht, FALSE für waagerecht).</w:t>
+      </w:r>
+    </w:p>
+    <w:p>
+      <w:pPr>
+        <w:keepNext/>
+        <w:spacing w:after="30" w:before="120"/>
+      </w:pPr>
+      <w:r>
+        <w:rPr>
+          <w:b/>
+          <w:bCs/>
+          <w:i/>
+          <w:iCs/>
+          <w:color w:val="6A6A6A"/>
+          <w:sz w:val="18"/>
+          <w:szCs w:val="18"/>
+        </w:rPr>
+        <w:t xml:space="preserve">Beispiel</w:t>
+      </w:r>
+    </w:p>
+    <w:p>
+      <w:pPr>
+        <w:keepLines/>
+        <w:pBdr>
+          <w:left w:val="single" w:color="1B6CA8" w:sz="18" w:space="6"/>
+        </w:pBdr>
+        <w:shd w:fill="F4F4F4" w:val="clear"/>
+        <w:spacing w:after="200" w:before="100" w:line="264" w:lineRule="auto"/>
+        <w:ind w:left="140"/>
+      </w:pPr>
+      <w:r>
+        <w:rPr>
+          <w:rFonts w:ascii="Consolas" w:cs="Consolas" w:eastAsia="Consolas" w:hAnsi="Consolas"/>
+          <w:sz w:val="19"/>
+          <w:szCs w:val="19"/>
+        </w:rPr>
+        <w:t xml:space="preserve">DIM himmel AS IMAGE</w:t>
+      </w:r>
+      <w:r>
+        <w:rPr>
+          <w:rFonts w:ascii="Consolas" w:cs="Consolas" w:eastAsia="Consolas" w:hAnsi="Consolas"/>
+          <w:sz w:val="19"/>
+          <w:szCs w:val="19"/>
+        </w:rPr>
+        <w:br/>
+        <w:t xml:space="preserve">himmel = GENTEX_GRADIENT(160, 120, RGB(255, 96, 32), RGB(32, 64, 255), TRUE)</w:t>
+      </w:r>
+      <w:r>
+        <w:rPr>
+          <w:rFonts w:ascii="Consolas" w:cs="Consolas" w:eastAsia="Consolas" w:hAnsi="Consolas"/>
+          <w:sz w:val="19"/>
+          <w:szCs w:val="19"/>
+        </w:rPr>
+        <w:br/>
+        <w:t xml:space="preserve">CLS() : DRAWIMAGE(himmel, 0, 0) : FLIP()</w:t>
+      </w:r>
+    </w:p>
+    <w:p>
+      <w:pPr>
+        <w:keepNext/>
+        <w:keepLines/>
+        <w:pBdr>
+          <w:bottom w:val="single" w:color="DDD0C0" w:sz="4" w:space="2"/>
+        </w:pBdr>
+        <w:spacing w:after="40" w:before="360"/>
+      </w:pPr>
+      <w:r>
+        <w:rPr>
+          <w:rFonts w:ascii="Consolas" w:cs="Consolas" w:eastAsia="Consolas" w:hAnsi="Consolas"/>
+          <w:b/>
+          <w:bCs/>
+          <w:color w:val="9A3412"/>
+          <w:sz w:val="24"/>
+          <w:szCs w:val="24"/>
+        </w:rPr>
+        <w:t xml:space="preserve">GENTEX_CHECKED · GENTEX_COLOR · GENTEX_RADIAL</w:t>
+      </w:r>
+    </w:p>
+    <w:p>
+      <w:pPr>
+        <w:keepNext/>
+        <w:spacing w:after="120"/>
+      </w:pPr>
+      <w:r>
+        <w:rPr>
+          <w:b/>
+          <w:bCs/>
+          <w:color w:val="6A6A6A"/>
+          <w:sz w:val="18"/>
+          <w:szCs w:val="18"/>
+        </w:rPr>
+        <w:t xml:space="preserve">Syntax:  </w:t>
+      </w:r>
+      <w:r>
+        <w:rPr>
+          <w:rFonts w:ascii="Consolas" w:cs="Consolas" w:eastAsia="Consolas" w:hAnsi="Consolas"/>
+          <w:color w:val="335577"/>
+          <w:sz w:val="19"/>
+          <w:szCs w:val="19"/>
+        </w:rPr>
+        <w:t xml:space="preserve">GENTEX_CHECKED(b, h, fx, fy, f1, f2)   GENTEX_COLOR(b, h, f)   GENTEX_RADIAL(b, h, innen, außen[, dichte])</w:t>
+      </w:r>
+    </w:p>
+    <w:p>
+      <w:pPr>
+        <w:spacing w:after="180" w:line="312" w:lineRule="auto"/>
+      </w:pPr>
+      <w:r>
+        <w:rPr>
+          <w:sz w:val="22"/>
+          <w:szCs w:val="22"/>
+        </w:rPr>
+        <w:t xml:space="preserve">GENTEX_CHECKED erzeugt ein Schachbrettmuster (fx × fy Felder), GENTEX_COLOR eine einfarbige Fläche, GENTEX_RADIAL einen runden Verlauf von der Mitte nach außen – perfekt für weiche Lichter und Glows.</w:t>
+      </w:r>
+    </w:p>
+    <w:p>
+      <w:pPr>
+        <w:keepNext/>
+        <w:spacing w:after="30" w:before="120"/>
+      </w:pPr>
+      <w:r>
+        <w:rPr>
+          <w:b/>
+          <w:bCs/>
+          <w:i/>
+          <w:iCs/>
+          <w:color w:val="6A6A6A"/>
+          <w:sz w:val="18"/>
+          <w:szCs w:val="18"/>
+        </w:rPr>
+        <w:t xml:space="preserve">Beispiel</w:t>
+      </w:r>
+    </w:p>
+    <w:p>
+      <w:pPr>
+        <w:keepLines/>
+        <w:pBdr>
+          <w:left w:val="single" w:color="1B6CA8" w:sz="18" w:space="6"/>
+        </w:pBdr>
+        <w:shd w:fill="F4F4F4" w:val="clear"/>
+        <w:spacing w:after="200" w:before="100" w:line="264" w:lineRule="auto"/>
+        <w:ind w:left="140"/>
+      </w:pPr>
+      <w:r>
+        <w:rPr>
+          <w:rFonts w:ascii="Consolas" w:cs="Consolas" w:eastAsia="Consolas" w:hAnsi="Consolas"/>
+          <w:sz w:val="19"/>
+          <w:szCs w:val="19"/>
+        </w:rPr>
+        <w:t xml:space="preserve">DIM brett AS IMAGE</w:t>
+      </w:r>
+      <w:r>
+        <w:rPr>
+          <w:rFonts w:ascii="Consolas" w:cs="Consolas" w:eastAsia="Consolas" w:hAnsi="Consolas"/>
+          <w:sz w:val="19"/>
+          <w:szCs w:val="19"/>
+        </w:rPr>
+        <w:br/>
+        <w:t xml:space="preserve">brett = GENTEX_CHECKED(160, 120, 8, 6, RGB(48, 56, 56), RGB(208, 216, 208))</w:t>
+      </w:r>
+      <w:r>
+        <w:rPr>
+          <w:rFonts w:ascii="Consolas" w:cs="Consolas" w:eastAsia="Consolas" w:hAnsi="Consolas"/>
+          <w:sz w:val="19"/>
+          <w:szCs w:val="19"/>
+        </w:rPr>
+        <w:br/>
+        <w:t xml:space="preserve">DIM licht AS IMAGE</w:t>
+      </w:r>
+      <w:r>
+        <w:rPr>
+          <w:rFonts w:ascii="Consolas" w:cs="Consolas" w:eastAsia="Consolas" w:hAnsi="Consolas"/>
+          <w:sz w:val="19"/>
+          <w:szCs w:val="19"/>
+        </w:rPr>
+        <w:br/>
+        <w:t xml:space="preserve">licht = GENTEX_RADIAL(128, 128, RGB(255, 255, 200), RGB(0, 0, 0))</w:t>
+      </w:r>
+      <w:r>
+        <w:rPr>
+          <w:rFonts w:ascii="Consolas" w:cs="Consolas" w:eastAsia="Consolas" w:hAnsi="Consolas"/>
+          <w:sz w:val="19"/>
+          <w:szCs w:val="19"/>
+        </w:rPr>
+        <w:br/>
+        <w:t xml:space="preserve">CLS() : DRAWIMAGE(brett, 0, 0) : FLIP()</w:t>
+      </w:r>
+    </w:p>
+    <w:p>
+      <w:pPr>
+        <w:pStyle w:val="Heading2"/>
+        <w:keepNext/>
+        <w:keepLines/>
+        <w:spacing w:after="120" w:before="280"/>
+      </w:pPr>
+      <w:r>
+        <w:t xml:space="preserve">Zwischen-Zeichenflächen: Render-Targets</w:t>
+      </w:r>
+    </w:p>
+    <w:p>
+      <w:pPr>
+        <w:spacing w:after="180" w:line="312" w:lineRule="auto"/>
+      </w:pPr>
+      <w:r>
+        <w:rPr>
+          <w:sz w:val="22"/>
+          <w:szCs w:val="22"/>
+        </w:rPr>
+        <w:t xml:space="preserve">Ein Render-Target ist eine unsichtbare Zeichenfläche im Hintergrund. Du zeichnest etwas einmal hinein und stempelst es danach beliebig oft ins Bild – das spart Arbeit, wenn ein zusammengesetztes Bild (etwa ein Abzeichen oder eine Minimap) mehrmals erscheint oder sich nur selten ändert.</w:t>
+      </w:r>
+    </w:p>
+    <w:p>
+      <w:pPr>
+        <w:keepNext/>
+        <w:keepLines/>
+        <w:pBdr>
+          <w:bottom w:val="single" w:color="DDD0C0" w:sz="4" w:space="2"/>
+        </w:pBdr>
+        <w:spacing w:after="40" w:before="360"/>
+      </w:pPr>
+      <w:r>
+        <w:rPr>
+          <w:rFonts w:ascii="Consolas" w:cs="Consolas" w:eastAsia="Consolas" w:hAnsi="Consolas"/>
+          <w:b/>
+          <w:bCs/>
+          <w:color w:val="9A3412"/>
+          <w:sz w:val="24"/>
+          <w:szCs w:val="24"/>
+        </w:rPr>
+        <w:t xml:space="preserve">RENDERTARGET_NEW · _BEGIN · _END · _DRAW</w:t>
+      </w:r>
+    </w:p>
+    <w:p>
+      <w:pPr>
+        <w:keepNext/>
+        <w:spacing w:after="120"/>
+      </w:pPr>
+      <w:r>
+        <w:rPr>
+          <w:b/>
+          <w:bCs/>
+          <w:color w:val="6A6A6A"/>
+          <w:sz w:val="18"/>
+          <w:szCs w:val="18"/>
+        </w:rPr>
+        <w:t xml:space="preserve">Syntax:  </w:t>
+      </w:r>
+      <w:r>
+        <w:rPr>
+          <w:rFonts w:ascii="Consolas" w:cs="Consolas" w:eastAsia="Consolas" w:hAnsi="Consolas"/>
+          <w:color w:val="335577"/>
+          <w:sz w:val="19"/>
+          <w:szCs w:val="19"/>
+        </w:rPr>
+        <w:t xml:space="preserve">RENDERTARGET_NEW(b, h)   RENDERTARGET_BEGIN(rt)   RENDERTARGET_END()   RENDERTARGET_DRAW(rt, x, y[, skala[, tint]])</w:t>
+      </w:r>
+    </w:p>
+    <w:p>
+      <w:pPr>
+        <w:spacing w:after="180" w:line="312" w:lineRule="auto"/>
+      </w:pPr>
+      <w:r>
+        <w:rPr>
+          <w:sz w:val="22"/>
+          <w:szCs w:val="22"/>
+        </w:rPr>
+        <w:t xml:space="preserve">RENDERTARGET_NEW legt eine Fläche an. Zwischen _BEGIN und _END landen alle Zeichenbefehle in dieser Fläche statt im Fenster. _DRAW stempelt die fertige Fläche an Position (x, y) ins Bild.</w:t>
+      </w:r>
+    </w:p>
+    <w:p>
+      <w:pPr>
+        <w:keepNext/>
+        <w:spacing w:after="30" w:before="120"/>
+      </w:pPr>
+      <w:r>
+        <w:rPr>
+          <w:b/>
+          <w:bCs/>
+          <w:i/>
+          <w:iCs/>
+          <w:color w:val="6A6A6A"/>
+          <w:sz w:val="18"/>
+          <w:szCs w:val="18"/>
+        </w:rPr>
+        <w:t xml:space="preserve">Beispiel</w:t>
+      </w:r>
+    </w:p>
+    <w:p>
+      <w:pPr>
+        <w:keepLines/>
+        <w:pBdr>
+          <w:left w:val="single" w:color="1B6CA8" w:sz="18" w:space="6"/>
+        </w:pBdr>
+        <w:shd w:fill="F4F4F4" w:val="clear"/>
+        <w:spacing w:after="200" w:before="100" w:line="264" w:lineRule="auto"/>
+        <w:ind w:left="140"/>
+      </w:pPr>
+      <w:r>
+        <w:rPr>
+          <w:rFonts w:ascii="Consolas" w:cs="Consolas" w:eastAsia="Consolas" w:hAnsi="Consolas"/>
+          <w:sz w:val="19"/>
+          <w:szCs w:val="19"/>
+        </w:rPr>
+        <w:t xml:space="preserve">DIM rt AS INTEGER</w:t>
+      </w:r>
+      <w:r>
+        <w:rPr>
+          <w:rFonts w:ascii="Consolas" w:cs="Consolas" w:eastAsia="Consolas" w:hAnsi="Consolas"/>
+          <w:sz w:val="19"/>
+          <w:szCs w:val="19"/>
+        </w:rPr>
+        <w:br/>
+        <w:t xml:space="preserve">rt = RENDERTARGET_NEW(64, 64)</w:t>
+      </w:r>
+      <w:r>
+        <w:rPr>
+          <w:rFonts w:ascii="Consolas" w:cs="Consolas" w:eastAsia="Consolas" w:hAnsi="Consolas"/>
+          <w:sz w:val="19"/>
+          <w:szCs w:val="19"/>
+        </w:rPr>
+        <w:br/>
+        <w:t xml:space="preserve">RENDERTARGET_BEGIN(rt)         ' ab jetzt in die Flaeche zeichnen</w:t>
+      </w:r>
+      <w:r>
+        <w:rPr>
+          <w:rFonts w:ascii="Consolas" w:cs="Consolas" w:eastAsia="Consolas" w:hAnsi="Consolas"/>
+          <w:sz w:val="19"/>
+          <w:szCs w:val="19"/>
+        </w:rPr>
+        <w:br/>
+        <w:t xml:space="preserve">CIRCLE(32, 32, 28, RGB(255, 180, 40))</w:t>
+      </w:r>
+      <w:r>
+        <w:rPr>
+          <w:rFonts w:ascii="Consolas" w:cs="Consolas" w:eastAsia="Consolas" w:hAnsi="Consolas"/>
+          <w:sz w:val="19"/>
+          <w:szCs w:val="19"/>
+        </w:rPr>
+        <w:br/>
+        <w:t xml:space="preserve">RENDERTARGET_END()</w:t>
+      </w:r>
+      <w:r>
+        <w:rPr>
+          <w:rFonts w:ascii="Consolas" w:cs="Consolas" w:eastAsia="Consolas" w:hAnsi="Consolas"/>
+          <w:sz w:val="19"/>
+          <w:szCs w:val="19"/>
+        </w:rPr>
+        <w:br/>
+        <w:t xml:space="preserve"/>
+      </w:r>
+      <w:r>
+        <w:rPr>
+          <w:rFonts w:ascii="Consolas" w:cs="Consolas" w:eastAsia="Consolas" w:hAnsi="Consolas"/>
+          <w:sz w:val="19"/>
+          <w:szCs w:val="19"/>
+        </w:rPr>
+        <w:br/>
+        <w:t xml:space="preserve">CLS()</w:t>
+      </w:r>
+      <w:r>
+        <w:rPr>
+          <w:rFonts w:ascii="Consolas" w:cs="Consolas" w:eastAsia="Consolas" w:hAnsi="Consolas"/>
+          <w:sz w:val="19"/>
+          <w:szCs w:val="19"/>
+        </w:rPr>
+        <w:br/>
+        <w:t xml:space="preserve">RENDERTARGET_DRAW(rt, 50, 50)  ' Flaeche ins Bild stempeln</w:t>
+      </w:r>
+      <w:r>
+        <w:rPr>
+          <w:rFonts w:ascii="Consolas" w:cs="Consolas" w:eastAsia="Consolas" w:hAnsi="Consolas"/>
+          <w:sz w:val="19"/>
+          <w:szCs w:val="19"/>
+        </w:rPr>
+        <w:br/>
+        <w:t xml:space="preserve">RENDERTARGET_DRAW(rt, 150, 50) ' nochmal woanders</w:t>
+      </w:r>
+      <w:r>
+        <w:rPr>
+          <w:rFonts w:ascii="Consolas" w:cs="Consolas" w:eastAsia="Consolas" w:hAnsi="Consolas"/>
+          <w:sz w:val="19"/>
+          <w:szCs w:val="19"/>
+        </w:rPr>
+        <w:br/>
+        <w:t xml:space="preserve">FLIP()</w:t>
+      </w:r>
+    </w:p>
+    <w:p>
+      <w:pPr>
+        <w:spacing w:before="60"/>
+      </w:pPr>
+    </w:p>
+    <w:tbl>
+      <w:tblPr>
+        <w:tblW w:type="dxa" w:w="9360"/>
+        <w:tblBorders>
+          <w:top w:val="single" w:color="auto" w:sz="4"/>
+          <w:left w:val="single" w:color="auto" w:sz="4"/>
+          <w:bottom w:val="single" w:color="auto" w:sz="4"/>
+          <w:right w:val="single" w:color="auto" w:sz="4"/>
+          <w:insideH w:val="single" w:color="auto" w:sz="4"/>
+          <w:insideV w:val="single" w:color="auto" w:sz="4"/>
+        </w:tblBorders>
+      </w:tblPr>
+      <w:tblGrid>
+        <w:gridCol w:w="9360"/>
+      </w:tblGrid>
+      <w:tr>
+        <w:trPr>
+          <w:cantSplit/>
+        </w:trPr>
+        <w:tc>
+          <w:tcPr>
+            <w:tcW w:type="dxa" w:w="9360"/>
+            <w:tcBorders>
+              <w:top w:val="single" w:color="9CC8E6" w:sz="6"/>
+              <w:left w:val="single" w:color="9CC8E6" w:sz="6"/>
+              <w:bottom w:val="single" w:color="9CC8E6" w:sz="6"/>
+              <w:right w:val="single" w:color="9CC8E6" w:sz="6"/>
+            </w:tcBorders>
+            <w:shd w:fill="E7F2FA" w:val="clear"/>
+            <w:tcMar>
+              <w:top w:type="dxa" w:w="140"/>
+              <w:left w:type="dxa" w:w="180"/>
+              <w:bottom w:type="dxa" w:w="140"/>
+              <w:right w:type="dxa" w:w="180"/>
+            </w:tcMar>
+          </w:tcPr>
+          <w:p>
+            <w:pPr>
+              <w:spacing w:after="40"/>
+            </w:pPr>
+            <w:r>
+              <w:rPr>
+                <w:b/>
+                <w:bCs/>
+                <w:color w:val="1B6CA8"/>
+                <w:sz w:val="22"/>
+                <w:szCs w:val="22"/>
+              </w:rPr>
+              <w:t xml:space="preserve">Alles nur in gbrt</w:t>
+            </w:r>
+          </w:p>
+          <w:p>
+            <w:pPr>
+              <w:spacing w:after="0" w:line="312" w:lineRule="auto"/>
+            </w:pPr>
+            <w:r>
+              <w:rPr>
+                <w:sz w:val="22"/>
+                <w:szCs w:val="22"/>
+              </w:rPr>
+              <w:t xml:space="preserve">Diese Extras (besonders Blend-Modes, GenTex und Render-Targets) nutzen die Grafikkarte und laufen nur im gbrt-Fenster – wie der ganze Teil IV. In einem reinen Konsolenprogramm gibt es sie nicht.</w:t>
             </w:r>
           </w:p>
         </w:tc>

</xml_diff>

<commit_message>
docs(buch): Lehrbuch Kap 43 -- Bilder (mit Spritesheet-Screenshot)
LOADIMAGE, IMAGEWIDTH/HEIGHT, DRAWIMAGE, DRAWIMAGEPART (Frame aus Sheet),
DRAWIMAGEROT (zentriert/gedreht/skaliert), imgfx IMAGE_SCALE/FLIP/ROTATE/TINT.
Screenshot mit echtem Spritesheet (figures/assets/hero.png/coin.png/held1.png).
Je Beispiel; Demo gegen gbrt verifiziert.

Co-Authored-By: Claude Opus 4.8 (1M context) <noreply@anthropic.com>
</commit_message>
<xml_diff>
--- a/buch-referenz/buch/GameBasic-Lehrbuch.docx
+++ b/buch-referenz/buch/GameBasic-Lehrbuch.docx
@@ -1083,6 +1083,33 @@
           <w:szCs w:val="22"/>
         </w:rPr>
         <w:t xml:space="preserve">	136</w:t>
+      </w:r>
+    </w:p>
+    <w:p>
+      <w:pPr>
+        <w:tabs>
+          <w:tab w:val="right" w:pos="9200" w:leader="dot"/>
+        </w:tabs>
+        <w:spacing w:after="20" w:before="0"/>
+        <w:ind w:left="280"/>
+      </w:pPr>
+      <w:r>
+        <w:rPr>
+          <w:b w:val="false"/>
+          <w:bCs w:val="false"/>
+          <w:color w:val="222222"/>
+          <w:sz w:val="22"/>
+          <w:szCs w:val="22"/>
+        </w:rPr>
+        <w:t xml:space="preserve">Bilder</w:t>
+      </w:r>
+      <w:r>
+        <w:rPr>
+          <w:color w:val="555555"/>
+          <w:sz w:val="22"/>
+          <w:szCs w:val="22"/>
+        </w:rPr>
+        <w:t xml:space="preserve">	141</w:t>
       </w:r>
     </w:p>
     <w:p>
@@ -47908,6 +47935,1251 @@
                 <w:szCs w:val="22"/>
               </w:rPr>
               <w:t xml:space="preserve">Diese Extras (besonders Blend-Modes, GenTex und Render-Targets) nutzen die Grafikkarte und laufen nur im gbrt-Fenster – wie der ganze Teil IV. In einem reinen Konsolenprogramm gibt es sie nicht.</w:t>
+            </w:r>
+          </w:p>
+        </w:tc>
+      </w:tr>
+    </w:tbl>
+    <w:p>
+      <w:pPr>
+        <w:spacing w:after="160"/>
+      </w:pPr>
+    </w:p>
+    <w:p>
+      <w:pPr>
+        <w:pStyle w:val="Heading1"/>
+        <w:keepNext/>
+        <w:keepLines/>
+        <w:pageBreakBefore/>
+        <w:pBdr>
+          <w:bottom w:val="single" w:color="1B6CA8" w:sz="12" w:space="4"/>
+        </w:pBdr>
+        <w:spacing w:after="160" w:before="0"/>
+      </w:pPr>
+      <w:r>
+        <w:t xml:space="preserve">Bilder</w:t>
+      </w:r>
+    </w:p>
+    <w:p>
+      <w:pPr>
+        <w:spacing w:after="180" w:line="312" w:lineRule="auto"/>
+      </w:pPr>
+      <w:r>
+        <w:rPr>
+          <w:sz w:val="22"/>
+          <w:szCs w:val="22"/>
+        </w:rPr>
+        <w:t xml:space="preserve">Statt alles aus Formen zu zeichnen, lädst du meist fertige Bilder (Sprites, Hintergründe, Tilesets) aus PNG-Dateien. Ein Bild ist in GameBasic ein IMAGE-Wert; du lädst es einmal vor dem Game-Loop und zeichnest es dann jeden Frame. Häufig steckt in einer Datei ein ganzes „Spritesheet“ – mehrere Einzelbilder nebeneinander, aus dem du das gewünschte herausschneidest.</w:t>
+      </w:r>
+    </w:p>
+    <w:p>
+      <w:pPr>
+        <w:keepNext/>
+        <w:spacing w:after="40" w:before="160"/>
+        <w:jc w:val="center"/>
+      </w:pPr>
+      <w:r>
+        <w:drawing>
+          <wp:inline distT="0" distB="0" distL="0" distR="0">
+            <wp:extent cx="4572000" cy="3048000"/>
+            <wp:effectExtent t="0" r="0" b="0" l="0"/>
+            <wp:docPr id="1" name="43_bilder.png" descr="Ein Spritesheet als Ganzes, ein einzelner Frame daraus, skaliert/gedreht, sowie gespiegelt und getönt (imgfx)." title="Ein Spritesheet als Ganzes, ein einzelner Frame daraus, skaliert/gedreht, sowie gespiegelt und getönt (imgfx)."/>
+            <wp:cNvGraphicFramePr>
+              <a:graphicFrameLocks xmlns:a="http://schemas.openxmlformats.org/drawingml/2006/main" noChangeAspect="1"/>
+            </wp:cNvGraphicFramePr>
+            <a:graphic xmlns:a="http://schemas.openxmlformats.org/drawingml/2006/main">
+              <a:graphicData uri="http://schemas.openxmlformats.org/drawingml/2006/picture">
+                <pic:pic xmlns:pic="http://schemas.openxmlformats.org/drawingml/2006/picture">
+                  <pic:nvPicPr>
+                    <pic:cNvPr id="0" name="" descr=""/>
+                    <pic:cNvPicPr>
+                      <a:picLocks noChangeAspect="1" noChangeArrowheads="1"/>
+                    </pic:cNvPicPr>
+                  </pic:nvPicPr>
+                  <pic:blipFill>
+                    <a:blip r:embed="rId12" cstate="none"/>
+                    <a:srcRect/>
+                    <a:stretch>
+                      <a:fillRect/>
+                    </a:stretch>
+                  </pic:blipFill>
+                  <pic:spPr bwMode="auto">
+                    <a:xfrm>
+                      <a:off x="0" y="0"/>
+                      <a:ext cx="4572000" cy="3048000"/>
+                    </a:xfrm>
+                    <a:prstGeom prst="rect">
+                      <a:avLst/>
+                    </a:prstGeom>
+                  </pic:spPr>
+                </pic:pic>
+              </a:graphicData>
+            </a:graphic>
+          </wp:inline>
+        </w:drawing>
+      </w:r>
+    </w:p>
+    <w:p>
+      <w:pPr>
+        <w:spacing w:after="200"/>
+        <w:jc w:val="center"/>
+      </w:pPr>
+      <w:r>
+        <w:rPr>
+          <w:i/>
+          <w:iCs/>
+          <w:color w:val="6A6A6A"/>
+          <w:sz w:val="18"/>
+          <w:szCs w:val="18"/>
+        </w:rPr>
+        <w:t xml:space="preserve">Ein Spritesheet als Ganzes, ein einzelner Frame daraus, skaliert/gedreht, sowie gespiegelt und getönt (imgfx).</w:t>
+      </w:r>
+    </w:p>
+    <w:p>
+      <w:pPr>
+        <w:spacing w:before="60"/>
+      </w:pPr>
+    </w:p>
+    <w:tbl>
+      <w:tblPr>
+        <w:tblW w:type="dxa" w:w="9360"/>
+        <w:tblBorders>
+          <w:top w:val="single" w:color="auto" w:sz="4"/>
+          <w:left w:val="single" w:color="auto" w:sz="4"/>
+          <w:bottom w:val="single" w:color="auto" w:sz="4"/>
+          <w:right w:val="single" w:color="auto" w:sz="4"/>
+          <w:insideH w:val="single" w:color="auto" w:sz="4"/>
+          <w:insideV w:val="single" w:color="auto" w:sz="4"/>
+        </w:tblBorders>
+      </w:tblPr>
+      <w:tblGrid>
+        <w:gridCol w:w="9360"/>
+      </w:tblGrid>
+      <w:tr>
+        <w:trPr>
+          <w:cantSplit/>
+        </w:trPr>
+        <w:tc>
+          <w:tcPr>
+            <w:tcW w:type="dxa" w:w="9360"/>
+            <w:tcBorders>
+              <w:top w:val="single" w:color="E0B96A" w:sz="6"/>
+              <w:left w:val="single" w:color="E0B96A" w:sz="6"/>
+              <w:bottom w:val="single" w:color="E0B96A" w:sz="6"/>
+              <w:right w:val="single" w:color="E0B96A" w:sz="6"/>
+            </w:tcBorders>
+            <w:shd w:fill="FDF3E0" w:val="clear"/>
+            <w:tcMar>
+              <w:top w:type="dxa" w:w="140"/>
+              <w:left w:type="dxa" w:w="180"/>
+              <w:bottom w:type="dxa" w:w="140"/>
+              <w:right w:type="dxa" w:w="180"/>
+            </w:tcMar>
+          </w:tcPr>
+          <w:p>
+            <w:pPr>
+              <w:spacing w:after="40"/>
+            </w:pPr>
+            <w:r>
+              <w:rPr>
+                <w:b/>
+                <w:bCs/>
+                <w:color w:val="9A6A1E"/>
+                <w:sz w:val="22"/>
+                <w:szCs w:val="22"/>
+              </w:rPr>
+              <w:t xml:space="preserve">Merke</w:t>
+            </w:r>
+          </w:p>
+          <w:p>
+            <w:pPr>
+              <w:spacing w:after="0" w:line="312" w:lineRule="auto"/>
+            </w:pPr>
+            <w:r>
+              <w:rPr>
+                <w:sz w:val="22"/>
+                <w:szCs w:val="22"/>
+              </w:rPr>
+              <w:t xml:space="preserve">Bildpfade sind relativ zum Verzeichnis deines Programms (üblich ist ein Unterordner assets/). Lade Bilder einmalig vor dem Game-Loop – nicht in jedem Frame neu.</w:t>
+            </w:r>
+          </w:p>
+        </w:tc>
+      </w:tr>
+    </w:tbl>
+    <w:p>
+      <w:pPr>
+        <w:spacing w:after="160"/>
+      </w:pPr>
+    </w:p>
+    <w:p>
+      <w:pPr>
+        <w:pStyle w:val="Heading2"/>
+        <w:keepNext/>
+        <w:keepLines/>
+        <w:spacing w:after="120" w:before="280"/>
+      </w:pPr>
+      <w:r>
+        <w:t xml:space="preserve">Laden &amp; Größe</w:t>
+      </w:r>
+    </w:p>
+    <w:p>
+      <w:pPr>
+        <w:keepNext/>
+        <w:keepLines/>
+        <w:pBdr>
+          <w:bottom w:val="single" w:color="DDD0C0" w:sz="4" w:space="2"/>
+        </w:pBdr>
+        <w:spacing w:after="40" w:before="360"/>
+      </w:pPr>
+      <w:r>
+        <w:rPr>
+          <w:rFonts w:ascii="Consolas" w:cs="Consolas" w:eastAsia="Consolas" w:hAnsi="Consolas"/>
+          <w:b/>
+          <w:bCs/>
+          <w:color w:val="9A3412"/>
+          <w:sz w:val="24"/>
+          <w:szCs w:val="24"/>
+        </w:rPr>
+        <w:t xml:space="preserve">LOADIMAGE</w:t>
+      </w:r>
+    </w:p>
+    <w:p>
+      <w:pPr>
+        <w:keepNext/>
+        <w:spacing w:after="120"/>
+      </w:pPr>
+      <w:r>
+        <w:rPr>
+          <w:b/>
+          <w:bCs/>
+          <w:color w:val="6A6A6A"/>
+          <w:sz w:val="18"/>
+          <w:szCs w:val="18"/>
+        </w:rPr>
+        <w:t xml:space="preserve">Syntax:  </w:t>
+      </w:r>
+      <w:r>
+        <w:rPr>
+          <w:rFonts w:ascii="Consolas" w:cs="Consolas" w:eastAsia="Consolas" w:hAnsi="Consolas"/>
+          <w:color w:val="335577"/>
+          <w:sz w:val="19"/>
+          <w:szCs w:val="19"/>
+        </w:rPr>
+        <w:t xml:space="preserve">LOADIMAGE(pfad$)</w:t>
+      </w:r>
+    </w:p>
+    <w:p>
+      <w:pPr>
+        <w:spacing w:after="180" w:line="312" w:lineRule="auto"/>
+      </w:pPr>
+      <w:r>
+        <w:rPr>
+          <w:sz w:val="22"/>
+          <w:szCs w:val="22"/>
+        </w:rPr>
+        <w:t xml:space="preserve">Lädt eine Bilddatei (PNG, JPG, BMP …) und liefert ein IMAGE. Das Ergebnis wird zwischengespeichert – ein zweiter Aufruf mit demselben Pfad lädt nicht erneut von der Platte.</w:t>
+      </w:r>
+    </w:p>
+    <w:p>
+      <w:pPr>
+        <w:keepNext/>
+        <w:spacing w:after="30" w:before="120"/>
+      </w:pPr>
+      <w:r>
+        <w:rPr>
+          <w:b/>
+          <w:bCs/>
+          <w:i/>
+          <w:iCs/>
+          <w:color w:val="6A6A6A"/>
+          <w:sz w:val="18"/>
+          <w:szCs w:val="18"/>
+        </w:rPr>
+        <w:t xml:space="preserve">Beispiel</w:t>
+      </w:r>
+    </w:p>
+    <w:p>
+      <w:pPr>
+        <w:keepLines/>
+        <w:pBdr>
+          <w:left w:val="single" w:color="1B6CA8" w:sz="18" w:space="6"/>
+        </w:pBdr>
+        <w:shd w:fill="F4F4F4" w:val="clear"/>
+        <w:spacing w:after="200" w:before="100" w:line="264" w:lineRule="auto"/>
+        <w:ind w:left="140"/>
+      </w:pPr>
+      <w:r>
+        <w:rPr>
+          <w:rFonts w:ascii="Consolas" w:cs="Consolas" w:eastAsia="Consolas" w:hAnsi="Consolas"/>
+          <w:sz w:val="19"/>
+          <w:szCs w:val="19"/>
+        </w:rPr>
+        <w:t xml:space="preserve">DIM held AS IMAGE</w:t>
+      </w:r>
+      <w:r>
+        <w:rPr>
+          <w:rFonts w:ascii="Consolas" w:cs="Consolas" w:eastAsia="Consolas" w:hAnsi="Consolas"/>
+          <w:sz w:val="19"/>
+          <w:szCs w:val="19"/>
+        </w:rPr>
+        <w:br/>
+        <w:t xml:space="preserve">held = LOADIMAGE("assets/hero.png")</w:t>
+      </w:r>
+    </w:p>
+    <w:p>
+      <w:pPr>
+        <w:keepNext/>
+        <w:keepLines/>
+        <w:pBdr>
+          <w:bottom w:val="single" w:color="DDD0C0" w:sz="4" w:space="2"/>
+        </w:pBdr>
+        <w:spacing w:after="40" w:before="360"/>
+      </w:pPr>
+      <w:r>
+        <w:rPr>
+          <w:rFonts w:ascii="Consolas" w:cs="Consolas" w:eastAsia="Consolas" w:hAnsi="Consolas"/>
+          <w:b/>
+          <w:bCs/>
+          <w:color w:val="9A3412"/>
+          <w:sz w:val="24"/>
+          <w:szCs w:val="24"/>
+        </w:rPr>
+        <w:t xml:space="preserve">IMAGEWIDTH · IMAGEHEIGHT</w:t>
+      </w:r>
+    </w:p>
+    <w:p>
+      <w:pPr>
+        <w:keepNext/>
+        <w:spacing w:after="120"/>
+      </w:pPr>
+      <w:r>
+        <w:rPr>
+          <w:b/>
+          <w:bCs/>
+          <w:color w:val="6A6A6A"/>
+          <w:sz w:val="18"/>
+          <w:szCs w:val="18"/>
+        </w:rPr>
+        <w:t xml:space="preserve">Syntax:  </w:t>
+      </w:r>
+      <w:r>
+        <w:rPr>
+          <w:rFonts w:ascii="Consolas" w:cs="Consolas" w:eastAsia="Consolas" w:hAnsi="Consolas"/>
+          <w:color w:val="335577"/>
+          <w:sz w:val="19"/>
+          <w:szCs w:val="19"/>
+        </w:rPr>
+        <w:t xml:space="preserve">IMAGEWIDTH(img)   IMAGEHEIGHT(img)</w:t>
+      </w:r>
+    </w:p>
+    <w:p>
+      <w:pPr>
+        <w:spacing w:after="180" w:line="312" w:lineRule="auto"/>
+      </w:pPr>
+      <w:r>
+        <w:rPr>
+          <w:sz w:val="22"/>
+          <w:szCs w:val="22"/>
+        </w:rPr>
+        <w:t xml:space="preserve">Liefern Breite und Höhe eines Bildes in Pixeln – nützlich, um es zu zentrieren oder ein Sheet in Frames aufzuteilen.</w:t>
+      </w:r>
+    </w:p>
+    <w:p>
+      <w:pPr>
+        <w:keepNext/>
+        <w:spacing w:after="30" w:before="120"/>
+      </w:pPr>
+      <w:r>
+        <w:rPr>
+          <w:b/>
+          <w:bCs/>
+          <w:i/>
+          <w:iCs/>
+          <w:color w:val="6A6A6A"/>
+          <w:sz w:val="18"/>
+          <w:szCs w:val="18"/>
+        </w:rPr>
+        <w:t xml:space="preserve">Beispiel</w:t>
+      </w:r>
+    </w:p>
+    <w:p>
+      <w:pPr>
+        <w:keepLines/>
+        <w:pBdr>
+          <w:left w:val="single" w:color="1B6CA8" w:sz="18" w:space="6"/>
+        </w:pBdr>
+        <w:shd w:fill="F4F4F4" w:val="clear"/>
+        <w:spacing w:after="200" w:before="100" w:line="264" w:lineRule="auto"/>
+        <w:ind w:left="140"/>
+      </w:pPr>
+      <w:r>
+        <w:rPr>
+          <w:rFonts w:ascii="Consolas" w:cs="Consolas" w:eastAsia="Consolas" w:hAnsi="Consolas"/>
+          <w:sz w:val="19"/>
+          <w:szCs w:val="19"/>
+        </w:rPr>
+        <w:t xml:space="preserve">DIM held AS IMAGE</w:t>
+      </w:r>
+      <w:r>
+        <w:rPr>
+          <w:rFonts w:ascii="Consolas" w:cs="Consolas" w:eastAsia="Consolas" w:hAnsi="Consolas"/>
+          <w:sz w:val="19"/>
+          <w:szCs w:val="19"/>
+        </w:rPr>
+        <w:br/>
+        <w:t xml:space="preserve">held = LOADIMAGE("assets/hero.png")</w:t>
+      </w:r>
+      <w:r>
+        <w:rPr>
+          <w:rFonts w:ascii="Consolas" w:cs="Consolas" w:eastAsia="Consolas" w:hAnsi="Consolas"/>
+          <w:sz w:val="19"/>
+          <w:szCs w:val="19"/>
+        </w:rPr>
+        <w:br/>
+        <w:t xml:space="preserve">PRINT IMAGEWIDTH(held); " x "; IMAGEHEIGHT(held)</w:t>
+      </w:r>
+      <w:r>
+        <w:rPr>
+          <w:rFonts w:ascii="Consolas" w:cs="Consolas" w:eastAsia="Consolas" w:hAnsi="Consolas"/>
+          <w:sz w:val="19"/>
+          <w:szCs w:val="19"/>
+        </w:rPr>
+        <w:br/>
+        <w:t xml:space="preserve">' z. B.:  256 x 32</w:t>
+      </w:r>
+    </w:p>
+    <w:p>
+      <w:pPr>
+        <w:pStyle w:val="Heading2"/>
+        <w:keepNext/>
+        <w:keepLines/>
+        <w:spacing w:after="120" w:before="280"/>
+      </w:pPr>
+      <w:r>
+        <w:t xml:space="preserve">Zeichnen</w:t>
+      </w:r>
+    </w:p>
+    <w:p>
+      <w:pPr>
+        <w:keepNext/>
+        <w:keepLines/>
+        <w:pBdr>
+          <w:bottom w:val="single" w:color="DDD0C0" w:sz="4" w:space="2"/>
+        </w:pBdr>
+        <w:spacing w:after="40" w:before="360"/>
+      </w:pPr>
+      <w:r>
+        <w:rPr>
+          <w:rFonts w:ascii="Consolas" w:cs="Consolas" w:eastAsia="Consolas" w:hAnsi="Consolas"/>
+          <w:b/>
+          <w:bCs/>
+          <w:color w:val="9A3412"/>
+          <w:sz w:val="24"/>
+          <w:szCs w:val="24"/>
+        </w:rPr>
+        <w:t xml:space="preserve">DRAWIMAGE</w:t>
+      </w:r>
+    </w:p>
+    <w:p>
+      <w:pPr>
+        <w:keepNext/>
+        <w:spacing w:after="120"/>
+      </w:pPr>
+      <w:r>
+        <w:rPr>
+          <w:b/>
+          <w:bCs/>
+          <w:color w:val="6A6A6A"/>
+          <w:sz w:val="18"/>
+          <w:szCs w:val="18"/>
+        </w:rPr>
+        <w:t xml:space="preserve">Syntax:  </w:t>
+      </w:r>
+      <w:r>
+        <w:rPr>
+          <w:rFonts w:ascii="Consolas" w:cs="Consolas" w:eastAsia="Consolas" w:hAnsi="Consolas"/>
+          <w:color w:val="335577"/>
+          <w:sz w:val="19"/>
+          <w:szCs w:val="19"/>
+        </w:rPr>
+        <w:t xml:space="preserve">DRAWIMAGE(img, x, y)</w:t>
+      </w:r>
+    </w:p>
+    <w:p>
+      <w:pPr>
+        <w:spacing w:after="180" w:line="312" w:lineRule="auto"/>
+      </w:pPr>
+      <w:r>
+        <w:rPr>
+          <w:sz w:val="22"/>
+          <w:szCs w:val="22"/>
+        </w:rPr>
+        <w:t xml:space="preserve">Zeichnet das ganze Bild mit der linken oberen Ecke bei (x, y).</w:t>
+      </w:r>
+    </w:p>
+    <w:p>
+      <w:pPr>
+        <w:keepNext/>
+        <w:spacing w:after="30" w:before="120"/>
+      </w:pPr>
+      <w:r>
+        <w:rPr>
+          <w:b/>
+          <w:bCs/>
+          <w:i/>
+          <w:iCs/>
+          <w:color w:val="6A6A6A"/>
+          <w:sz w:val="18"/>
+          <w:szCs w:val="18"/>
+        </w:rPr>
+        <w:t xml:space="preserve">Beispiel</w:t>
+      </w:r>
+    </w:p>
+    <w:p>
+      <w:pPr>
+        <w:keepLines/>
+        <w:pBdr>
+          <w:left w:val="single" w:color="1B6CA8" w:sz="18" w:space="6"/>
+        </w:pBdr>
+        <w:shd w:fill="F4F4F4" w:val="clear"/>
+        <w:spacing w:after="200" w:before="100" w:line="264" w:lineRule="auto"/>
+        <w:ind w:left="140"/>
+      </w:pPr>
+      <w:r>
+        <w:rPr>
+          <w:rFonts w:ascii="Consolas" w:cs="Consolas" w:eastAsia="Consolas" w:hAnsi="Consolas"/>
+          <w:sz w:val="19"/>
+          <w:szCs w:val="19"/>
+        </w:rPr>
+        <w:t xml:space="preserve">CLS()</w:t>
+      </w:r>
+      <w:r>
+        <w:rPr>
+          <w:rFonts w:ascii="Consolas" w:cs="Consolas" w:eastAsia="Consolas" w:hAnsi="Consolas"/>
+          <w:sz w:val="19"/>
+          <w:szCs w:val="19"/>
+        </w:rPr>
+        <w:br/>
+        <w:t xml:space="preserve">DRAWIMAGE(held, 100, 80)</w:t>
+      </w:r>
+      <w:r>
+        <w:rPr>
+          <w:rFonts w:ascii="Consolas" w:cs="Consolas" w:eastAsia="Consolas" w:hAnsi="Consolas"/>
+          <w:sz w:val="19"/>
+          <w:szCs w:val="19"/>
+        </w:rPr>
+        <w:br/>
+        <w:t xml:space="preserve">FLIP()</w:t>
+      </w:r>
+    </w:p>
+    <w:p>
+      <w:pPr>
+        <w:keepNext/>
+        <w:keepLines/>
+        <w:pBdr>
+          <w:bottom w:val="single" w:color="DDD0C0" w:sz="4" w:space="2"/>
+        </w:pBdr>
+        <w:spacing w:after="40" w:before="360"/>
+      </w:pPr>
+      <w:r>
+        <w:rPr>
+          <w:rFonts w:ascii="Consolas" w:cs="Consolas" w:eastAsia="Consolas" w:hAnsi="Consolas"/>
+          <w:b/>
+          <w:bCs/>
+          <w:color w:val="9A3412"/>
+          <w:sz w:val="24"/>
+          <w:szCs w:val="24"/>
+        </w:rPr>
+        <w:t xml:space="preserve">DRAWIMAGEPART</w:t>
+      </w:r>
+    </w:p>
+    <w:p>
+      <w:pPr>
+        <w:keepNext/>
+        <w:spacing w:after="120"/>
+      </w:pPr>
+      <w:r>
+        <w:rPr>
+          <w:b/>
+          <w:bCs/>
+          <w:color w:val="6A6A6A"/>
+          <w:sz w:val="18"/>
+          <w:szCs w:val="18"/>
+        </w:rPr>
+        <w:t xml:space="preserve">Syntax:  </w:t>
+      </w:r>
+      <w:r>
+        <w:rPr>
+          <w:rFonts w:ascii="Consolas" w:cs="Consolas" w:eastAsia="Consolas" w:hAnsi="Consolas"/>
+          <w:color w:val="335577"/>
+          <w:sz w:val="19"/>
+          <w:szCs w:val="19"/>
+        </w:rPr>
+        <w:t xml:space="preserve">DRAWIMAGEPART(img, sx, sy, sw, sh, x, y)</w:t>
+      </w:r>
+    </w:p>
+    <w:p>
+      <w:pPr>
+        <w:spacing w:after="180" w:line="312" w:lineRule="auto"/>
+      </w:pPr>
+      <w:r>
+        <w:rPr>
+          <w:sz w:val="22"/>
+          <w:szCs w:val="22"/>
+        </w:rPr>
+        <w:t xml:space="preserve">Zeichnet nur einen Ausschnitt des Bildes: das Rechteck (sx, sy, sw, sh) aus der Quelle, gezeichnet bei (x, y). So holst du einen einzelnen Frame aus einem Spritesheet – hier den ersten von acht 32×32-Frames.</w:t>
+      </w:r>
+    </w:p>
+    <w:p>
+      <w:pPr>
+        <w:keepNext/>
+        <w:spacing w:after="30" w:before="120"/>
+      </w:pPr>
+      <w:r>
+        <w:rPr>
+          <w:b/>
+          <w:bCs/>
+          <w:i/>
+          <w:iCs/>
+          <w:color w:val="6A6A6A"/>
+          <w:sz w:val="18"/>
+          <w:szCs w:val="18"/>
+        </w:rPr>
+        <w:t xml:space="preserve">Beispiel</w:t>
+      </w:r>
+    </w:p>
+    <w:p>
+      <w:pPr>
+        <w:keepLines/>
+        <w:pBdr>
+          <w:left w:val="single" w:color="1B6CA8" w:sz="18" w:space="6"/>
+        </w:pBdr>
+        <w:shd w:fill="F4F4F4" w:val="clear"/>
+        <w:spacing w:after="200" w:before="100" w:line="264" w:lineRule="auto"/>
+        <w:ind w:left="140"/>
+      </w:pPr>
+      <w:r>
+        <w:rPr>
+          <w:rFonts w:ascii="Consolas" w:cs="Consolas" w:eastAsia="Consolas" w:hAnsi="Consolas"/>
+          <w:sz w:val="19"/>
+          <w:szCs w:val="19"/>
+        </w:rPr>
+        <w:t xml:space="preserve">CLS()</w:t>
+      </w:r>
+      <w:r>
+        <w:rPr>
+          <w:rFonts w:ascii="Consolas" w:cs="Consolas" w:eastAsia="Consolas" w:hAnsi="Consolas"/>
+          <w:sz w:val="19"/>
+          <w:szCs w:val="19"/>
+        </w:rPr>
+        <w:br/>
+        <w:t xml:space="preserve">' Frame 0 (Spalte 0) aus einem 32x32-Raster:</w:t>
+      </w:r>
+      <w:r>
+        <w:rPr>
+          <w:rFonts w:ascii="Consolas" w:cs="Consolas" w:eastAsia="Consolas" w:hAnsi="Consolas"/>
+          <w:sz w:val="19"/>
+          <w:szCs w:val="19"/>
+        </w:rPr>
+        <w:br/>
+        <w:t xml:space="preserve">DRAWIMAGEPART(held, 0, 0, 32, 32, 100, 80)</w:t>
+      </w:r>
+      <w:r>
+        <w:rPr>
+          <w:rFonts w:ascii="Consolas" w:cs="Consolas" w:eastAsia="Consolas" w:hAnsi="Consolas"/>
+          <w:sz w:val="19"/>
+          <w:szCs w:val="19"/>
+        </w:rPr>
+        <w:br/>
+        <w:t xml:space="preserve">' Frame 3 liegt bei sx = 3 * 32 = 96:</w:t>
+      </w:r>
+      <w:r>
+        <w:rPr>
+          <w:rFonts w:ascii="Consolas" w:cs="Consolas" w:eastAsia="Consolas" w:hAnsi="Consolas"/>
+          <w:sz w:val="19"/>
+          <w:szCs w:val="19"/>
+        </w:rPr>
+        <w:br/>
+        <w:t xml:space="preserve">DRAWIMAGEPART(held, 96, 0, 32, 32, 140, 80)</w:t>
+      </w:r>
+      <w:r>
+        <w:rPr>
+          <w:rFonts w:ascii="Consolas" w:cs="Consolas" w:eastAsia="Consolas" w:hAnsi="Consolas"/>
+          <w:sz w:val="19"/>
+          <w:szCs w:val="19"/>
+        </w:rPr>
+        <w:br/>
+        <w:t xml:space="preserve">FLIP()</w:t>
+      </w:r>
+    </w:p>
+    <w:p>
+      <w:pPr>
+        <w:keepNext/>
+        <w:keepLines/>
+        <w:pBdr>
+          <w:bottom w:val="single" w:color="DDD0C0" w:sz="4" w:space="2"/>
+        </w:pBdr>
+        <w:spacing w:after="40" w:before="360"/>
+      </w:pPr>
+      <w:r>
+        <w:rPr>
+          <w:rFonts w:ascii="Consolas" w:cs="Consolas" w:eastAsia="Consolas" w:hAnsi="Consolas"/>
+          <w:b/>
+          <w:bCs/>
+          <w:color w:val="9A3412"/>
+          <w:sz w:val="24"/>
+          <w:szCs w:val="24"/>
+        </w:rPr>
+        <w:t xml:space="preserve">DRAWIMAGEROT</w:t>
+      </w:r>
+    </w:p>
+    <w:p>
+      <w:pPr>
+        <w:keepNext/>
+        <w:spacing w:after="120"/>
+      </w:pPr>
+      <w:r>
+        <w:rPr>
+          <w:b/>
+          <w:bCs/>
+          <w:color w:val="6A6A6A"/>
+          <w:sz w:val="18"/>
+          <w:szCs w:val="18"/>
+        </w:rPr>
+        <w:t xml:space="preserve">Syntax:  </w:t>
+      </w:r>
+      <w:r>
+        <w:rPr>
+          <w:rFonts w:ascii="Consolas" w:cs="Consolas" w:eastAsia="Consolas" w:hAnsi="Consolas"/>
+          <w:color w:val="335577"/>
+          <w:sz w:val="19"/>
+          <w:szCs w:val="19"/>
+        </w:rPr>
+        <w:t xml:space="preserve">DRAWIMAGEROT(img, x, y, winkel[, skala[, tint]])</w:t>
+      </w:r>
+    </w:p>
+    <w:p>
+      <w:pPr>
+        <w:spacing w:after="180" w:line="312" w:lineRule="auto"/>
+      </w:pPr>
+      <w:r>
+        <w:rPr>
+          <w:sz w:val="22"/>
+          <w:szCs w:val="22"/>
+        </w:rPr>
+        <w:t xml:space="preserve">Zeichnet das Bild ZENTRIERT auf (x, y), um diesen Punkt um winkel Grad gedreht und optional skaliert und eingefärbt (tint). Ideal für rotierende Sprites (Asteroiden, Geschosse, gedrehte Spielfiguren).</w:t>
+      </w:r>
+    </w:p>
+    <w:p>
+      <w:pPr>
+        <w:keepNext/>
+        <w:spacing w:after="30" w:before="120"/>
+      </w:pPr>
+      <w:r>
+        <w:rPr>
+          <w:b/>
+          <w:bCs/>
+          <w:i/>
+          <w:iCs/>
+          <w:color w:val="6A6A6A"/>
+          <w:sz w:val="18"/>
+          <w:szCs w:val="18"/>
+        </w:rPr>
+        <w:t xml:space="preserve">Beispiel</w:t>
+      </w:r>
+    </w:p>
+    <w:p>
+      <w:pPr>
+        <w:keepLines/>
+        <w:pBdr>
+          <w:left w:val="single" w:color="1B6CA8" w:sz="18" w:space="6"/>
+        </w:pBdr>
+        <w:shd w:fill="F4F4F4" w:val="clear"/>
+        <w:spacing w:after="200" w:before="100" w:line="264" w:lineRule="auto"/>
+        <w:ind w:left="140"/>
+      </w:pPr>
+      <w:r>
+        <w:rPr>
+          <w:rFonts w:ascii="Consolas" w:cs="Consolas" w:eastAsia="Consolas" w:hAnsi="Consolas"/>
+          <w:sz w:val="19"/>
+          <w:szCs w:val="19"/>
+        </w:rPr>
+        <w:t xml:space="preserve">CLS()</w:t>
+      </w:r>
+      <w:r>
+        <w:rPr>
+          <w:rFonts w:ascii="Consolas" w:cs="Consolas" w:eastAsia="Consolas" w:hAnsi="Consolas"/>
+          <w:sz w:val="19"/>
+          <w:szCs w:val="19"/>
+        </w:rPr>
+        <w:br/>
+        <w:t xml:space="preserve">DRAWIMAGEROT(held, 160, 120, 45.0)         ' 45 Grad gedreht</w:t>
+      </w:r>
+      <w:r>
+        <w:rPr>
+          <w:rFonts w:ascii="Consolas" w:cs="Consolas" w:eastAsia="Consolas" w:hAnsi="Consolas"/>
+          <w:sz w:val="19"/>
+          <w:szCs w:val="19"/>
+        </w:rPr>
+        <w:br/>
+        <w:t xml:space="preserve">DRAWIMAGEROT(held, 240, 120, 0.0, 2.0)     ' doppelt so groß</w:t>
+      </w:r>
+      <w:r>
+        <w:rPr>
+          <w:rFonts w:ascii="Consolas" w:cs="Consolas" w:eastAsia="Consolas" w:hAnsi="Consolas"/>
+          <w:sz w:val="19"/>
+          <w:szCs w:val="19"/>
+        </w:rPr>
+        <w:br/>
+        <w:t xml:space="preserve">FLIP()</w:t>
+      </w:r>
+    </w:p>
+    <w:p>
+      <w:pPr>
+        <w:pStyle w:val="Heading2"/>
+        <w:keepNext/>
+        <w:keepLines/>
+        <w:spacing w:after="120" w:before="280"/>
+      </w:pPr>
+      <w:r>
+        <w:t xml:space="preserve">Bilder umrechnen: das Modul imgfx</w:t>
+      </w:r>
+    </w:p>
+    <w:p>
+      <w:pPr>
+        <w:spacing w:after="180" w:line="312" w:lineRule="auto"/>
+      </w:pPr>
+      <w:r>
+        <w:rPr>
+          <w:sz w:val="22"/>
+          <w:szCs w:val="22"/>
+        </w:rPr>
+        <w:t xml:space="preserve">Das Modul imgfx erzeugt aus einem Bild ein NEUES, verändertes Bild – skaliert, gedreht, gespiegelt oder eingefärbt. Das Original bleibt unverändert. Mache solche Umrechnungen einmalig vor dem Game-Loop (nicht jeden Frame), denn sie kosten etwas Zeit.</w:t>
+      </w:r>
+    </w:p>
+    <w:p>
+      <w:pPr>
+        <w:keepNext/>
+        <w:keepLines/>
+        <w:pBdr>
+          <w:bottom w:val="single" w:color="DDD0C0" w:sz="4" w:space="2"/>
+        </w:pBdr>
+        <w:spacing w:after="40" w:before="360"/>
+      </w:pPr>
+      <w:r>
+        <w:rPr>
+          <w:rFonts w:ascii="Consolas" w:cs="Consolas" w:eastAsia="Consolas" w:hAnsi="Consolas"/>
+          <w:b/>
+          <w:bCs/>
+          <w:color w:val="9A3412"/>
+          <w:sz w:val="24"/>
+          <w:szCs w:val="24"/>
+        </w:rPr>
+        <w:t xml:space="preserve">IMAGE_SCALE</w:t>
+      </w:r>
+    </w:p>
+    <w:p>
+      <w:pPr>
+        <w:keepNext/>
+        <w:spacing w:after="120"/>
+      </w:pPr>
+      <w:r>
+        <w:rPr>
+          <w:b/>
+          <w:bCs/>
+          <w:color w:val="6A6A6A"/>
+          <w:sz w:val="18"/>
+          <w:szCs w:val="18"/>
+        </w:rPr>
+        <w:t xml:space="preserve">Syntax:  </w:t>
+      </w:r>
+      <w:r>
+        <w:rPr>
+          <w:rFonts w:ascii="Consolas" w:cs="Consolas" w:eastAsia="Consolas" w:hAnsi="Consolas"/>
+          <w:color w:val="335577"/>
+          <w:sz w:val="19"/>
+          <w:szCs w:val="19"/>
+        </w:rPr>
+        <w:t xml:space="preserve">IMAGE_SCALE(img, breite, höhe)</w:t>
+      </w:r>
+    </w:p>
+    <w:p>
+      <w:pPr>
+        <w:spacing w:after="180" w:line="312" w:lineRule="auto"/>
+      </w:pPr>
+      <w:r>
+        <w:rPr>
+          <w:sz w:val="22"/>
+          <w:szCs w:val="22"/>
+        </w:rPr>
+        <w:t xml:space="preserve">Liefert eine in der angegebenen Größe skalierte Kopie des Bildes.</w:t>
+      </w:r>
+    </w:p>
+    <w:p>
+      <w:pPr>
+        <w:keepNext/>
+        <w:spacing w:after="30" w:before="120"/>
+      </w:pPr>
+      <w:r>
+        <w:rPr>
+          <w:b/>
+          <w:bCs/>
+          <w:i/>
+          <w:iCs/>
+          <w:color w:val="6A6A6A"/>
+          <w:sz w:val="18"/>
+          <w:szCs w:val="18"/>
+        </w:rPr>
+        <w:t xml:space="preserve">Beispiel</w:t>
+      </w:r>
+    </w:p>
+    <w:p>
+      <w:pPr>
+        <w:keepLines/>
+        <w:pBdr>
+          <w:left w:val="single" w:color="1B6CA8" w:sz="18" w:space="6"/>
+        </w:pBdr>
+        <w:shd w:fill="F4F4F4" w:val="clear"/>
+        <w:spacing w:after="200" w:before="100" w:line="264" w:lineRule="auto"/>
+        <w:ind w:left="140"/>
+      </w:pPr>
+      <w:r>
+        <w:rPr>
+          <w:rFonts w:ascii="Consolas" w:cs="Consolas" w:eastAsia="Consolas" w:hAnsi="Consolas"/>
+          <w:sz w:val="19"/>
+          <w:szCs w:val="19"/>
+        </w:rPr>
+        <w:t xml:space="preserve">IMPORT "imgfx"</w:t>
+      </w:r>
+      <w:r>
+        <w:rPr>
+          <w:rFonts w:ascii="Consolas" w:cs="Consolas" w:eastAsia="Consolas" w:hAnsi="Consolas"/>
+          <w:sz w:val="19"/>
+          <w:szCs w:val="19"/>
+        </w:rPr>
+        <w:br/>
+        <w:t xml:space="preserve">DIM gross AS IMAGE</w:t>
+      </w:r>
+      <w:r>
+        <w:rPr>
+          <w:rFonts w:ascii="Consolas" w:cs="Consolas" w:eastAsia="Consolas" w:hAnsi="Consolas"/>
+          <w:sz w:val="19"/>
+          <w:szCs w:val="19"/>
+        </w:rPr>
+        <w:br/>
+        <w:t xml:space="preserve">gross = IMAGE_SCALE(held, 64, 64)   ' auf 64x64 vergrößern</w:t>
+      </w:r>
+    </w:p>
+    <w:p>
+      <w:pPr>
+        <w:keepNext/>
+        <w:keepLines/>
+        <w:pBdr>
+          <w:bottom w:val="single" w:color="DDD0C0" w:sz="4" w:space="2"/>
+        </w:pBdr>
+        <w:spacing w:after="40" w:before="360"/>
+      </w:pPr>
+      <w:r>
+        <w:rPr>
+          <w:rFonts w:ascii="Consolas" w:cs="Consolas" w:eastAsia="Consolas" w:hAnsi="Consolas"/>
+          <w:b/>
+          <w:bCs/>
+          <w:color w:val="9A3412"/>
+          <w:sz w:val="24"/>
+          <w:szCs w:val="24"/>
+        </w:rPr>
+        <w:t xml:space="preserve">IMAGE_FLIP</w:t>
+      </w:r>
+    </w:p>
+    <w:p>
+      <w:pPr>
+        <w:keepNext/>
+        <w:spacing w:after="120"/>
+      </w:pPr>
+      <w:r>
+        <w:rPr>
+          <w:b/>
+          <w:bCs/>
+          <w:color w:val="6A6A6A"/>
+          <w:sz w:val="18"/>
+          <w:szCs w:val="18"/>
+        </w:rPr>
+        <w:t xml:space="preserve">Syntax:  </w:t>
+      </w:r>
+      <w:r>
+        <w:rPr>
+          <w:rFonts w:ascii="Consolas" w:cs="Consolas" w:eastAsia="Consolas" w:hAnsi="Consolas"/>
+          <w:color w:val="335577"/>
+          <w:sz w:val="19"/>
+          <w:szCs w:val="19"/>
+        </w:rPr>
+        <w:t xml:space="preserve">IMAGE_FLIP(img, flipX, flipY)</w:t>
+      </w:r>
+    </w:p>
+    <w:p>
+      <w:pPr>
+        <w:spacing w:after="180" w:line="312" w:lineRule="auto"/>
+      </w:pPr>
+      <w:r>
+        <w:rPr>
+          <w:sz w:val="22"/>
+          <w:szCs w:val="22"/>
+        </w:rPr>
+        <w:t xml:space="preserve">Liefert eine gespiegelte Kopie – flipX spiegelt waagerecht (links/rechts), flipY senkrecht (oben/unten). Klassisch, um eine nach rechts laufende Figur auch nach links blicken zu lassen.</w:t>
+      </w:r>
+    </w:p>
+    <w:p>
+      <w:pPr>
+        <w:keepNext/>
+        <w:spacing w:after="30" w:before="120"/>
+      </w:pPr>
+      <w:r>
+        <w:rPr>
+          <w:b/>
+          <w:bCs/>
+          <w:i/>
+          <w:iCs/>
+          <w:color w:val="6A6A6A"/>
+          <w:sz w:val="18"/>
+          <w:szCs w:val="18"/>
+        </w:rPr>
+        <w:t xml:space="preserve">Beispiel</w:t>
+      </w:r>
+    </w:p>
+    <w:p>
+      <w:pPr>
+        <w:keepLines/>
+        <w:pBdr>
+          <w:left w:val="single" w:color="1B6CA8" w:sz="18" w:space="6"/>
+        </w:pBdr>
+        <w:shd w:fill="F4F4F4" w:val="clear"/>
+        <w:spacing w:after="200" w:before="100" w:line="264" w:lineRule="auto"/>
+        <w:ind w:left="140"/>
+      </w:pPr>
+      <w:r>
+        <w:rPr>
+          <w:rFonts w:ascii="Consolas" w:cs="Consolas" w:eastAsia="Consolas" w:hAnsi="Consolas"/>
+          <w:sz w:val="19"/>
+          <w:szCs w:val="19"/>
+        </w:rPr>
+        <w:t xml:space="preserve">IMPORT "imgfx"</w:t>
+      </w:r>
+      <w:r>
+        <w:rPr>
+          <w:rFonts w:ascii="Consolas" w:cs="Consolas" w:eastAsia="Consolas" w:hAnsi="Consolas"/>
+          <w:sz w:val="19"/>
+          <w:szCs w:val="19"/>
+        </w:rPr>
+        <w:br/>
+        <w:t xml:space="preserve">DIM nachLinks AS IMAGE</w:t>
+      </w:r>
+      <w:r>
+        <w:rPr>
+          <w:rFonts w:ascii="Consolas" w:cs="Consolas" w:eastAsia="Consolas" w:hAnsi="Consolas"/>
+          <w:sz w:val="19"/>
+          <w:szCs w:val="19"/>
+        </w:rPr>
+        <w:br/>
+        <w:t xml:space="preserve">nachLinks = IMAGE_FLIP(held, TRUE, FALSE)</w:t>
+      </w:r>
+    </w:p>
+    <w:p>
+      <w:pPr>
+        <w:keepNext/>
+        <w:keepLines/>
+        <w:pBdr>
+          <w:bottom w:val="single" w:color="DDD0C0" w:sz="4" w:space="2"/>
+        </w:pBdr>
+        <w:spacing w:after="40" w:before="360"/>
+      </w:pPr>
+      <w:r>
+        <w:rPr>
+          <w:rFonts w:ascii="Consolas" w:cs="Consolas" w:eastAsia="Consolas" w:hAnsi="Consolas"/>
+          <w:b/>
+          <w:bCs/>
+          <w:color w:val="9A3412"/>
+          <w:sz w:val="24"/>
+          <w:szCs w:val="24"/>
+        </w:rPr>
+        <w:t xml:space="preserve">IMAGE_ROTATE · IMAGE_TINT</w:t>
+      </w:r>
+    </w:p>
+    <w:p>
+      <w:pPr>
+        <w:keepNext/>
+        <w:spacing w:after="120"/>
+      </w:pPr>
+      <w:r>
+        <w:rPr>
+          <w:b/>
+          <w:bCs/>
+          <w:color w:val="6A6A6A"/>
+          <w:sz w:val="18"/>
+          <w:szCs w:val="18"/>
+        </w:rPr>
+        <w:t xml:space="preserve">Syntax:  </w:t>
+      </w:r>
+      <w:r>
+        <w:rPr>
+          <w:rFonts w:ascii="Consolas" w:cs="Consolas" w:eastAsia="Consolas" w:hAnsi="Consolas"/>
+          <w:color w:val="335577"/>
+          <w:sz w:val="19"/>
+          <w:szCs w:val="19"/>
+        </w:rPr>
+        <w:t xml:space="preserve">IMAGE_ROTATE(img, grad)   IMAGE_TINT(img, farbe)</w:t>
+      </w:r>
+    </w:p>
+    <w:p>
+      <w:pPr>
+        <w:spacing w:after="180" w:line="312" w:lineRule="auto"/>
+      </w:pPr>
+      <w:r>
+        <w:rPr>
+          <w:sz w:val="22"/>
+          <w:szCs w:val="22"/>
+        </w:rPr>
+        <w:t xml:space="preserve">IMAGE_ROTATE liefert eine um grad gedrehte Kopie (die Bildgröße wächst ggf. mit). IMAGE_TINT multipliziert jede Pixelfarbe mit farbe – gut, um dasselbe Sprite in Teamfarben einzufärben (rotes / blaues Team).</w:t>
+      </w:r>
+    </w:p>
+    <w:p>
+      <w:pPr>
+        <w:keepNext/>
+        <w:spacing w:after="30" w:before="120"/>
+      </w:pPr>
+      <w:r>
+        <w:rPr>
+          <w:b/>
+          <w:bCs/>
+          <w:i/>
+          <w:iCs/>
+          <w:color w:val="6A6A6A"/>
+          <w:sz w:val="18"/>
+          <w:szCs w:val="18"/>
+        </w:rPr>
+        <w:t xml:space="preserve">Beispiel</w:t>
+      </w:r>
+    </w:p>
+    <w:p>
+      <w:pPr>
+        <w:keepLines/>
+        <w:pBdr>
+          <w:left w:val="single" w:color="1B6CA8" w:sz="18" w:space="6"/>
+        </w:pBdr>
+        <w:shd w:fill="F4F4F4" w:val="clear"/>
+        <w:spacing w:after="200" w:before="100" w:line="264" w:lineRule="auto"/>
+        <w:ind w:left="140"/>
+      </w:pPr>
+      <w:r>
+        <w:rPr>
+          <w:rFonts w:ascii="Consolas" w:cs="Consolas" w:eastAsia="Consolas" w:hAnsi="Consolas"/>
+          <w:sz w:val="19"/>
+          <w:szCs w:val="19"/>
+        </w:rPr>
+        <w:t xml:space="preserve">IMPORT "imgfx"</w:t>
+      </w:r>
+      <w:r>
+        <w:rPr>
+          <w:rFonts w:ascii="Consolas" w:cs="Consolas" w:eastAsia="Consolas" w:hAnsi="Consolas"/>
+          <w:sz w:val="19"/>
+          <w:szCs w:val="19"/>
+        </w:rPr>
+        <w:br/>
+        <w:t xml:space="preserve">DIM blau AS IMAGE</w:t>
+      </w:r>
+      <w:r>
+        <w:rPr>
+          <w:rFonts w:ascii="Consolas" w:cs="Consolas" w:eastAsia="Consolas" w:hAnsi="Consolas"/>
+          <w:sz w:val="19"/>
+          <w:szCs w:val="19"/>
+        </w:rPr>
+        <w:br/>
+        <w:t xml:space="preserve">blau = IMAGE_TINT(held, RGB(120, 160, 255))</w:t>
+      </w:r>
+      <w:r>
+        <w:rPr>
+          <w:rFonts w:ascii="Consolas" w:cs="Consolas" w:eastAsia="Consolas" w:hAnsi="Consolas"/>
+          <w:sz w:val="19"/>
+          <w:szCs w:val="19"/>
+        </w:rPr>
+        <w:br/>
+        <w:t xml:space="preserve">DIM schraeg AS IMAGE</w:t>
+      </w:r>
+      <w:r>
+        <w:rPr>
+          <w:rFonts w:ascii="Consolas" w:cs="Consolas" w:eastAsia="Consolas" w:hAnsi="Consolas"/>
+          <w:sz w:val="19"/>
+          <w:szCs w:val="19"/>
+        </w:rPr>
+        <w:br/>
+        <w:t xml:space="preserve">schraeg = IMAGE_ROTATE(held, 30.0)</w:t>
+      </w:r>
+    </w:p>
+    <w:p>
+      <w:pPr>
+        <w:spacing w:before="60"/>
+      </w:pPr>
+    </w:p>
+    <w:tbl>
+      <w:tblPr>
+        <w:tblW w:type="dxa" w:w="9360"/>
+        <w:tblBorders>
+          <w:top w:val="single" w:color="auto" w:sz="4"/>
+          <w:left w:val="single" w:color="auto" w:sz="4"/>
+          <w:bottom w:val="single" w:color="auto" w:sz="4"/>
+          <w:right w:val="single" w:color="auto" w:sz="4"/>
+          <w:insideH w:val="single" w:color="auto" w:sz="4"/>
+          <w:insideV w:val="single" w:color="auto" w:sz="4"/>
+        </w:tblBorders>
+      </w:tblPr>
+      <w:tblGrid>
+        <w:gridCol w:w="9360"/>
+      </w:tblGrid>
+      <w:tr>
+        <w:trPr>
+          <w:cantSplit/>
+        </w:trPr>
+        <w:tc>
+          <w:tcPr>
+            <w:tcW w:type="dxa" w:w="9360"/>
+            <w:tcBorders>
+              <w:top w:val="single" w:color="9CC8E6" w:sz="6"/>
+              <w:left w:val="single" w:color="9CC8E6" w:sz="6"/>
+              <w:bottom w:val="single" w:color="9CC8E6" w:sz="6"/>
+              <w:right w:val="single" w:color="9CC8E6" w:sz="6"/>
+            </w:tcBorders>
+            <w:shd w:fill="E7F2FA" w:val="clear"/>
+            <w:tcMar>
+              <w:top w:type="dxa" w:w="140"/>
+              <w:left w:type="dxa" w:w="180"/>
+              <w:bottom w:type="dxa" w:w="140"/>
+              <w:right w:type="dxa" w:w="180"/>
+            </w:tcMar>
+          </w:tcPr>
+          <w:p>
+            <w:pPr>
+              <w:spacing w:after="40"/>
+            </w:pPr>
+            <w:r>
+              <w:rPr>
+                <w:b/>
+                <w:bCs/>
+                <w:color w:val="1B6CA8"/>
+                <w:sz w:val="22"/>
+                <w:szCs w:val="22"/>
+              </w:rPr>
+              <w:t xml:space="preserve">DRAWIMAGEROT vs. imgfx</w:t>
+            </w:r>
+          </w:p>
+          <w:p>
+            <w:pPr>
+              <w:spacing w:after="0" w:line="312" w:lineRule="auto"/>
+            </w:pPr>
+            <w:r>
+              <w:rPr>
+                <w:sz w:val="22"/>
+                <w:szCs w:val="22"/>
+              </w:rPr>
+              <w:t xml:space="preserve">Willst du ein Bild nur beim Zeichnen drehen/skalieren, nimm DRAWIMAGEROT – das ist schnell und braucht kein neues Bild. Brauchst du dagegen die veränderte Version mehrfach (z. B. eine gespiegelte Lauf-Animation), erzeuge sie einmal mit imgfx und zeichne sie dann normal.</w:t>
             </w:r>
           </w:p>
         </w:tc>

</xml_diff>

<commit_message>
docs(buch): Lehrbuch Kap 44 -- Farben (mit Screenshot)
RGB, Farbkonstanten (BLACK/WHITE/RED/...), RED/GREEN/BLUE-Kanalextraktion
(Konstante vs. Funktion), HSV (Regenbogen/Helligkeit), COLOR_LERP (Mischen).
Screenshot: Palette + HSV-Regenbogen + COLOR_LERP-Verlauf. Hinweis: gbrt-Hex
mit &H statt 0x. Je Beispiel, gegen gbrt verifiziert.

Co-Authored-By: Claude Opus 4.8 (1M context) <noreply@anthropic.com>
</commit_message>
<xml_diff>
--- a/buch-referenz/buch/GameBasic-Lehrbuch.docx
+++ b/buch-referenz/buch/GameBasic-Lehrbuch.docx
@@ -1110,6 +1110,33 @@
           <w:szCs w:val="22"/>
         </w:rPr>
         <w:t xml:space="preserve">	141</w:t>
+      </w:r>
+    </w:p>
+    <w:p>
+      <w:pPr>
+        <w:tabs>
+          <w:tab w:val="right" w:pos="9200" w:leader="dot"/>
+        </w:tabs>
+        <w:spacing w:after="20" w:before="0"/>
+        <w:ind w:left="280"/>
+      </w:pPr>
+      <w:r>
+        <w:rPr>
+          <w:b w:val="false"/>
+          <w:bCs w:val="false"/>
+          <w:color w:val="222222"/>
+          <w:sz w:val="22"/>
+          <w:szCs w:val="22"/>
+        </w:rPr>
+        <w:t xml:space="preserve">Farben</w:t>
+      </w:r>
+      <w:r>
+        <w:rPr>
+          <w:color w:val="555555"/>
+          <w:sz w:val="22"/>
+          <w:szCs w:val="22"/>
+        </w:rPr>
+        <w:t xml:space="preserve">	145</w:t>
       </w:r>
     </w:p>
     <w:p>
@@ -49180,6 +49207,1104 @@
                 <w:szCs w:val="22"/>
               </w:rPr>
               <w:t xml:space="preserve">Willst du ein Bild nur beim Zeichnen drehen/skalieren, nimm DRAWIMAGEROT – das ist schnell und braucht kein neues Bild. Brauchst du dagegen die veränderte Version mehrfach (z. B. eine gespiegelte Lauf-Animation), erzeuge sie einmal mit imgfx und zeichne sie dann normal.</w:t>
+            </w:r>
+          </w:p>
+        </w:tc>
+      </w:tr>
+    </w:tbl>
+    <w:p>
+      <w:pPr>
+        <w:spacing w:after="160"/>
+      </w:pPr>
+    </w:p>
+    <w:p>
+      <w:pPr>
+        <w:pStyle w:val="Heading1"/>
+        <w:keepNext/>
+        <w:keepLines/>
+        <w:pageBreakBefore/>
+        <w:pBdr>
+          <w:bottom w:val="single" w:color="1B6CA8" w:sz="12" w:space="4"/>
+        </w:pBdr>
+        <w:spacing w:after="160" w:before="0"/>
+      </w:pPr>
+      <w:r>
+        <w:t xml:space="preserve">Farben</w:t>
+      </w:r>
+    </w:p>
+    <w:p>
+      <w:pPr>
+        <w:spacing w:after="180" w:line="312" w:lineRule="auto"/>
+      </w:pPr>
+      <w:r>
+        <w:rPr>
+          <w:sz w:val="22"/>
+          <w:szCs w:val="22"/>
+        </w:rPr>
+        <w:t xml:space="preserve">Eine Farbe ist in GameBasic eine ganze Zahl, die Rot-, Grün- und Blauanteil zusammenfasst (das Format 0xRRGGBB). Du musst diese Zahl aber nie selbst ausrechnen: RGB(r, g, b) baut sie aus drei Werten von 0 bis 255, und für die gängigen Farben gibt es fertige Konstanten. Dieses Kapitel zeigt, wie du Farben erzeugst, mischst und zerlegst.</w:t>
+      </w:r>
+    </w:p>
+    <w:p>
+      <w:pPr>
+        <w:keepNext/>
+        <w:spacing w:after="40" w:before="160"/>
+        <w:jc w:val="center"/>
+      </w:pPr>
+      <w:r>
+        <w:drawing>
+          <wp:inline distT="0" distB="0" distL="0" distR="0">
+            <wp:extent cx="4572000" cy="3048000"/>
+            <wp:effectExtent t="0" r="0" b="0" l="0"/>
+            <wp:docPr id="1" name="44_farben.png" descr="Farbkonstanten, ein HSV-Regenbogen, ein COLOR_LERP-Verlauf und eine Helligkeitsreihe." title="Farbkonstanten, ein HSV-Regenbogen, ein COLOR_LERP-Verlauf und eine Helligkeitsreihe."/>
+            <wp:cNvGraphicFramePr>
+              <a:graphicFrameLocks xmlns:a="http://schemas.openxmlformats.org/drawingml/2006/main" noChangeAspect="1"/>
+            </wp:cNvGraphicFramePr>
+            <a:graphic xmlns:a="http://schemas.openxmlformats.org/drawingml/2006/main">
+              <a:graphicData uri="http://schemas.openxmlformats.org/drawingml/2006/picture">
+                <pic:pic xmlns:pic="http://schemas.openxmlformats.org/drawingml/2006/picture">
+                  <pic:nvPicPr>
+                    <pic:cNvPr id="0" name="" descr=""/>
+                    <pic:cNvPicPr>
+                      <a:picLocks noChangeAspect="1" noChangeArrowheads="1"/>
+                    </pic:cNvPicPr>
+                  </pic:nvPicPr>
+                  <pic:blipFill>
+                    <a:blip r:embed="rId13" cstate="none"/>
+                    <a:srcRect/>
+                    <a:stretch>
+                      <a:fillRect/>
+                    </a:stretch>
+                  </pic:blipFill>
+                  <pic:spPr bwMode="auto">
+                    <a:xfrm>
+                      <a:off x="0" y="0"/>
+                      <a:ext cx="4572000" cy="3048000"/>
+                    </a:xfrm>
+                    <a:prstGeom prst="rect">
+                      <a:avLst/>
+                    </a:prstGeom>
+                  </pic:spPr>
+                </pic:pic>
+              </a:graphicData>
+            </a:graphic>
+          </wp:inline>
+        </w:drawing>
+      </w:r>
+    </w:p>
+    <w:p>
+      <w:pPr>
+        <w:spacing w:after="200"/>
+        <w:jc w:val="center"/>
+      </w:pPr>
+      <w:r>
+        <w:rPr>
+          <w:i/>
+          <w:iCs/>
+          <w:color w:val="6A6A6A"/>
+          <w:sz w:val="18"/>
+          <w:szCs w:val="18"/>
+        </w:rPr>
+        <w:t xml:space="preserve">Farbkonstanten, ein HSV-Regenbogen, ein COLOR_LERP-Verlauf und eine Helligkeitsreihe.</w:t>
+      </w:r>
+    </w:p>
+    <w:p>
+      <w:pPr>
+        <w:pStyle w:val="Heading2"/>
+        <w:keepNext/>
+        <w:keepLines/>
+        <w:spacing w:after="120" w:before="280"/>
+      </w:pPr>
+      <w:r>
+        <w:t xml:space="preserve">Farben bauen: RGB</w:t>
+      </w:r>
+    </w:p>
+    <w:p>
+      <w:pPr>
+        <w:keepNext/>
+        <w:keepLines/>
+        <w:pBdr>
+          <w:bottom w:val="single" w:color="DDD0C0" w:sz="4" w:space="2"/>
+        </w:pBdr>
+        <w:spacing w:after="40" w:before="360"/>
+      </w:pPr>
+      <w:r>
+        <w:rPr>
+          <w:rFonts w:ascii="Consolas" w:cs="Consolas" w:eastAsia="Consolas" w:hAnsi="Consolas"/>
+          <w:b/>
+          <w:bCs/>
+          <w:color w:val="9A3412"/>
+          <w:sz w:val="24"/>
+          <w:szCs w:val="24"/>
+        </w:rPr>
+        <w:t xml:space="preserve">RGB</w:t>
+      </w:r>
+    </w:p>
+    <w:p>
+      <w:pPr>
+        <w:keepNext/>
+        <w:spacing w:after="120"/>
+      </w:pPr>
+      <w:r>
+        <w:rPr>
+          <w:b/>
+          <w:bCs/>
+          <w:color w:val="6A6A6A"/>
+          <w:sz w:val="18"/>
+          <w:szCs w:val="18"/>
+        </w:rPr>
+        <w:t xml:space="preserve">Syntax:  </w:t>
+      </w:r>
+      <w:r>
+        <w:rPr>
+          <w:rFonts w:ascii="Consolas" w:cs="Consolas" w:eastAsia="Consolas" w:hAnsi="Consolas"/>
+          <w:color w:val="335577"/>
+          <w:sz w:val="19"/>
+          <w:szCs w:val="19"/>
+        </w:rPr>
+        <w:t xml:space="preserve">RGB(rot, grün, blau)</w:t>
+      </w:r>
+    </w:p>
+    <w:p>
+      <w:pPr>
+        <w:spacing w:after="180" w:line="312" w:lineRule="auto"/>
+      </w:pPr>
+      <w:r>
+        <w:rPr>
+          <w:sz w:val="22"/>
+          <w:szCs w:val="22"/>
+        </w:rPr>
+        <w:t xml:space="preserve">Baut eine Farbe aus den drei Kanälen Rot, Grün und Blau (jeweils 0 bis 255). 0,0,0 ist Schwarz, 255,255,255 Weiß, 255,0,0 reines Rot.</w:t>
+      </w:r>
+    </w:p>
+    <w:p>
+      <w:pPr>
+        <w:keepNext/>
+        <w:spacing w:after="30" w:before="120"/>
+      </w:pPr>
+      <w:r>
+        <w:rPr>
+          <w:b/>
+          <w:bCs/>
+          <w:i/>
+          <w:iCs/>
+          <w:color w:val="6A6A6A"/>
+          <w:sz w:val="18"/>
+          <w:szCs w:val="18"/>
+        </w:rPr>
+        <w:t xml:space="preserve">Beispiel</w:t>
+      </w:r>
+    </w:p>
+    <w:p>
+      <w:pPr>
+        <w:keepLines/>
+        <w:pBdr>
+          <w:left w:val="single" w:color="1B6CA8" w:sz="18" w:space="6"/>
+        </w:pBdr>
+        <w:shd w:fill="F4F4F4" w:val="clear"/>
+        <w:spacing w:after="200" w:before="100" w:line="264" w:lineRule="auto"/>
+        <w:ind w:left="140"/>
+      </w:pPr>
+      <w:r>
+        <w:rPr>
+          <w:rFonts w:ascii="Consolas" w:cs="Consolas" w:eastAsia="Consolas" w:hAnsi="Consolas"/>
+          <w:sz w:val="19"/>
+          <w:szCs w:val="19"/>
+        </w:rPr>
+        <w:t xml:space="preserve">PRINT RGB(255, 128, 0)      ' ein Orange</w:t>
+      </w:r>
+      <w:r>
+        <w:rPr>
+          <w:rFonts w:ascii="Consolas" w:cs="Consolas" w:eastAsia="Consolas" w:hAnsi="Consolas"/>
+          <w:sz w:val="19"/>
+          <w:szCs w:val="19"/>
+        </w:rPr>
+        <w:br/>
+        <w:t xml:space="preserve">PRINT HEX$(RGB(255, 128, 0))</w:t>
+      </w:r>
+    </w:p>
+    <w:p>
+      <w:pPr>
+        <w:keepNext/>
+        <w:spacing w:after="30" w:before="120"/>
+      </w:pPr>
+      <w:r>
+        <w:rPr>
+          <w:b/>
+          <w:bCs/>
+          <w:i/>
+          <w:iCs/>
+          <w:color w:val="6A6A6A"/>
+          <w:sz w:val="18"/>
+          <w:szCs w:val="18"/>
+        </w:rPr>
+        <w:t xml:space="preserve">Ausgabe</w:t>
+      </w:r>
+    </w:p>
+    <w:p>
+      <w:pPr>
+        <w:keepLines/>
+        <w:pBdr>
+          <w:left w:val="single" w:color="9AC79A" w:sz="18" w:space="6"/>
+        </w:pBdr>
+        <w:shd w:fill="EAF4EA" w:val="clear"/>
+        <w:spacing w:after="200" w:before="100" w:line="264" w:lineRule="auto"/>
+        <w:ind w:left="140"/>
+      </w:pPr>
+      <w:r>
+        <w:rPr>
+          <w:rFonts w:ascii="Consolas" w:cs="Consolas" w:eastAsia="Consolas" w:hAnsi="Consolas"/>
+          <w:sz w:val="19"/>
+          <w:szCs w:val="19"/>
+        </w:rPr>
+        <w:t xml:space="preserve">16744448</w:t>
+      </w:r>
+      <w:r>
+        <w:rPr>
+          <w:rFonts w:ascii="Consolas" w:cs="Consolas" w:eastAsia="Consolas" w:hAnsi="Consolas"/>
+          <w:sz w:val="19"/>
+          <w:szCs w:val="19"/>
+        </w:rPr>
+        <w:br/>
+        <w:t xml:space="preserve">FF8000</w:t>
+      </w:r>
+    </w:p>
+    <w:p>
+      <w:pPr>
+        <w:spacing w:before="60"/>
+      </w:pPr>
+    </w:p>
+    <w:tbl>
+      <w:tblPr>
+        <w:tblW w:type="dxa" w:w="9360"/>
+        <w:tblBorders>
+          <w:top w:val="single" w:color="auto" w:sz="4"/>
+          <w:left w:val="single" w:color="auto" w:sz="4"/>
+          <w:bottom w:val="single" w:color="auto" w:sz="4"/>
+          <w:right w:val="single" w:color="auto" w:sz="4"/>
+          <w:insideH w:val="single" w:color="auto" w:sz="4"/>
+          <w:insideV w:val="single" w:color="auto" w:sz="4"/>
+        </w:tblBorders>
+      </w:tblPr>
+      <w:tblGrid>
+        <w:gridCol w:w="9360"/>
+      </w:tblGrid>
+      <w:tr>
+        <w:trPr>
+          <w:cantSplit/>
+        </w:trPr>
+        <w:tc>
+          <w:tcPr>
+            <w:tcW w:type="dxa" w:w="9360"/>
+            <w:tcBorders>
+              <w:top w:val="single" w:color="E0B96A" w:sz="6"/>
+              <w:left w:val="single" w:color="E0B96A" w:sz="6"/>
+              <w:bottom w:val="single" w:color="E0B96A" w:sz="6"/>
+              <w:right w:val="single" w:color="E0B96A" w:sz="6"/>
+            </w:tcBorders>
+            <w:shd w:fill="FDF3E0" w:val="clear"/>
+            <w:tcMar>
+              <w:top w:type="dxa" w:w="140"/>
+              <w:left w:type="dxa" w:w="180"/>
+              <w:bottom w:type="dxa" w:w="140"/>
+              <w:right w:type="dxa" w:w="180"/>
+            </w:tcMar>
+          </w:tcPr>
+          <w:p>
+            <w:pPr>
+              <w:spacing w:after="40"/>
+            </w:pPr>
+            <w:r>
+              <w:rPr>
+                <w:b/>
+                <w:bCs/>
+                <w:color w:val="9A6A1E"/>
+                <w:sz w:val="22"/>
+                <w:szCs w:val="22"/>
+              </w:rPr>
+              <w:t xml:space="preserve">Merke</w:t>
+            </w:r>
+          </w:p>
+          <w:p>
+            <w:pPr>
+              <w:spacing w:after="0" w:line="312" w:lineRule="auto"/>
+            </w:pPr>
+            <w:r>
+              <w:rPr>
+                <w:sz w:val="22"/>
+                <w:szCs w:val="22"/>
+              </w:rPr>
+              <w:t xml:space="preserve">Hexadezimale Farb-Literale schreibst du in GameBasic mit &amp;H statt 0x: &amp;HFF8000 ist dasselbe wie RGB(255, 128, 0). Am lesbarsten bleibt für Einsteiger aber RGB(...).</w:t>
+            </w:r>
+          </w:p>
+        </w:tc>
+      </w:tr>
+    </w:tbl>
+    <w:p>
+      <w:pPr>
+        <w:spacing w:after="160"/>
+      </w:pPr>
+    </w:p>
+    <w:p>
+      <w:pPr>
+        <w:pStyle w:val="Heading2"/>
+        <w:keepNext/>
+        <w:keepLines/>
+        <w:spacing w:after="120" w:before="280"/>
+      </w:pPr>
+      <w:r>
+        <w:t xml:space="preserve">Fertige Farbkonstanten</w:t>
+      </w:r>
+    </w:p>
+    <w:p>
+      <w:pPr>
+        <w:spacing w:after="180" w:line="312" w:lineRule="auto"/>
+      </w:pPr>
+      <w:r>
+        <w:rPr>
+          <w:sz w:val="22"/>
+          <w:szCs w:val="22"/>
+        </w:rPr>
+        <w:t xml:space="preserve">Für die häufigsten Farben gibt es Konstanten, die du direkt als Farbe einsetzt – kürzer als RGB(...). Verfügbar sind unter anderem: BLACK, WHITE, GRAY, LIGHTGRAY, DARKGRAY, RED, GREEN, BLUE, YELLOW, CYAN, MAGENTA, ORANGE, PURPLE, BROWN, PINK sowie DARKRED, DARKGREEN, DARKBLUE.</w:t>
+      </w:r>
+    </w:p>
+    <w:p>
+      <w:pPr>
+        <w:keepNext/>
+        <w:keepLines/>
+        <w:pBdr>
+          <w:bottom w:val="single" w:color="DDD0C0" w:sz="4" w:space="2"/>
+        </w:pBdr>
+        <w:spacing w:after="40" w:before="360"/>
+      </w:pPr>
+      <w:r>
+        <w:rPr>
+          <w:rFonts w:ascii="Consolas" w:cs="Consolas" w:eastAsia="Consolas" w:hAnsi="Consolas"/>
+          <w:b/>
+          <w:bCs/>
+          <w:color w:val="9A3412"/>
+          <w:sz w:val="24"/>
+          <w:szCs w:val="24"/>
+        </w:rPr>
+        <w:t xml:space="preserve">Farbkonstanten</w:t>
+      </w:r>
+    </w:p>
+    <w:p>
+      <w:pPr>
+        <w:keepNext/>
+        <w:spacing w:after="120"/>
+      </w:pPr>
+      <w:r>
+        <w:rPr>
+          <w:b/>
+          <w:bCs/>
+          <w:color w:val="6A6A6A"/>
+          <w:sz w:val="18"/>
+          <w:szCs w:val="18"/>
+        </w:rPr>
+        <w:t xml:space="preserve">Syntax:  </w:t>
+      </w:r>
+      <w:r>
+        <w:rPr>
+          <w:rFonts w:ascii="Consolas" w:cs="Consolas" w:eastAsia="Consolas" w:hAnsi="Consolas"/>
+          <w:color w:val="335577"/>
+          <w:sz w:val="19"/>
+          <w:szCs w:val="19"/>
+        </w:rPr>
+        <w:t xml:space="preserve">BLACK · WHITE · RED · GREEN · BLUE · YELLOW · …</w:t>
+      </w:r>
+    </w:p>
+    <w:p>
+      <w:pPr>
+        <w:spacing w:after="180" w:line="312" w:lineRule="auto"/>
+      </w:pPr>
+      <w:r>
+        <w:rPr>
+          <w:sz w:val="22"/>
+          <w:szCs w:val="22"/>
+        </w:rPr>
+        <w:t xml:space="preserve">Vordefinierte Farbwerte. Du kannst sie überall verwenden, wo eine Farbe erwartet wird.</w:t>
+      </w:r>
+    </w:p>
+    <w:p>
+      <w:pPr>
+        <w:keepNext/>
+        <w:spacing w:after="30" w:before="120"/>
+      </w:pPr>
+      <w:r>
+        <w:rPr>
+          <w:b/>
+          <w:bCs/>
+          <w:i/>
+          <w:iCs/>
+          <w:color w:val="6A6A6A"/>
+          <w:sz w:val="18"/>
+          <w:szCs w:val="18"/>
+        </w:rPr>
+        <w:t xml:space="preserve">Beispiel</w:t>
+      </w:r>
+    </w:p>
+    <w:p>
+      <w:pPr>
+        <w:keepLines/>
+        <w:pBdr>
+          <w:left w:val="single" w:color="1B6CA8" w:sz="18" w:space="6"/>
+        </w:pBdr>
+        <w:shd w:fill="F4F4F4" w:val="clear"/>
+        <w:spacing w:after="200" w:before="100" w:line="264" w:lineRule="auto"/>
+        <w:ind w:left="140"/>
+      </w:pPr>
+      <w:r>
+        <w:rPr>
+          <w:rFonts w:ascii="Consolas" w:cs="Consolas" w:eastAsia="Consolas" w:hAnsi="Consolas"/>
+          <w:sz w:val="19"/>
+          <w:szCs w:val="19"/>
+        </w:rPr>
+        <w:t xml:space="preserve">PRINT HEX$(RED)</w:t>
+      </w:r>
+      <w:r>
+        <w:rPr>
+          <w:rFonts w:ascii="Consolas" w:cs="Consolas" w:eastAsia="Consolas" w:hAnsi="Consolas"/>
+          <w:sz w:val="19"/>
+          <w:szCs w:val="19"/>
+        </w:rPr>
+        <w:br/>
+        <w:t xml:space="preserve">PRINT HEX$(WHITE)</w:t>
+      </w:r>
+      <w:r>
+        <w:rPr>
+          <w:rFonts w:ascii="Consolas" w:cs="Consolas" w:eastAsia="Consolas" w:hAnsi="Consolas"/>
+          <w:sz w:val="19"/>
+          <w:szCs w:val="19"/>
+        </w:rPr>
+        <w:br/>
+        <w:t xml:space="preserve">CLS(BLACK)</w:t>
+      </w:r>
+      <w:r>
+        <w:rPr>
+          <w:rFonts w:ascii="Consolas" w:cs="Consolas" w:eastAsia="Consolas" w:hAnsi="Consolas"/>
+          <w:sz w:val="19"/>
+          <w:szCs w:val="19"/>
+        </w:rPr>
+        <w:br/>
+        <w:t xml:space="preserve">CIRCLE(160, 120, 40, YELLOW)</w:t>
+      </w:r>
+      <w:r>
+        <w:rPr>
+          <w:rFonts w:ascii="Consolas" w:cs="Consolas" w:eastAsia="Consolas" w:hAnsi="Consolas"/>
+          <w:sz w:val="19"/>
+          <w:szCs w:val="19"/>
+        </w:rPr>
+        <w:br/>
+        <w:t xml:space="preserve">FLIP()</w:t>
+      </w:r>
+    </w:p>
+    <w:p>
+      <w:pPr>
+        <w:keepNext/>
+        <w:spacing w:after="30" w:before="120"/>
+      </w:pPr>
+      <w:r>
+        <w:rPr>
+          <w:b/>
+          <w:bCs/>
+          <w:i/>
+          <w:iCs/>
+          <w:color w:val="6A6A6A"/>
+          <w:sz w:val="18"/>
+          <w:szCs w:val="18"/>
+        </w:rPr>
+        <w:t xml:space="preserve">Ausgabe</w:t>
+      </w:r>
+    </w:p>
+    <w:p>
+      <w:pPr>
+        <w:keepLines/>
+        <w:pBdr>
+          <w:left w:val="single" w:color="9AC79A" w:sz="18" w:space="6"/>
+        </w:pBdr>
+        <w:shd w:fill="EAF4EA" w:val="clear"/>
+        <w:spacing w:after="200" w:before="100" w:line="264" w:lineRule="auto"/>
+        <w:ind w:left="140"/>
+      </w:pPr>
+      <w:r>
+        <w:rPr>
+          <w:rFonts w:ascii="Consolas" w:cs="Consolas" w:eastAsia="Consolas" w:hAnsi="Consolas"/>
+          <w:sz w:val="19"/>
+          <w:szCs w:val="19"/>
+        </w:rPr>
+        <w:t xml:space="preserve">FF0000</w:t>
+      </w:r>
+      <w:r>
+        <w:rPr>
+          <w:rFonts w:ascii="Consolas" w:cs="Consolas" w:eastAsia="Consolas" w:hAnsi="Consolas"/>
+          <w:sz w:val="19"/>
+          <w:szCs w:val="19"/>
+        </w:rPr>
+        <w:br/>
+        <w:t xml:space="preserve">FFFFFF</w:t>
+      </w:r>
+    </w:p>
+    <w:p>
+      <w:pPr>
+        <w:pStyle w:val="Heading2"/>
+        <w:keepNext/>
+        <w:keepLines/>
+        <w:spacing w:after="120" w:before="280"/>
+      </w:pPr>
+      <w:r>
+        <w:t xml:space="preserve">Farben zerlegen: RED, GREEN, BLUE</w:t>
+      </w:r>
+    </w:p>
+    <w:p>
+      <w:pPr>
+        <w:keepNext/>
+        <w:keepLines/>
+        <w:pBdr>
+          <w:bottom w:val="single" w:color="DDD0C0" w:sz="4" w:space="2"/>
+        </w:pBdr>
+        <w:spacing w:after="40" w:before="360"/>
+      </w:pPr>
+      <w:r>
+        <w:rPr>
+          <w:rFonts w:ascii="Consolas" w:cs="Consolas" w:eastAsia="Consolas" w:hAnsi="Consolas"/>
+          <w:b/>
+          <w:bCs/>
+          <w:color w:val="9A3412"/>
+          <w:sz w:val="24"/>
+          <w:szCs w:val="24"/>
+        </w:rPr>
+        <w:t xml:space="preserve">RED · GREEN · BLUE</w:t>
+      </w:r>
+    </w:p>
+    <w:p>
+      <w:pPr>
+        <w:keepNext/>
+        <w:spacing w:after="120"/>
+      </w:pPr>
+      <w:r>
+        <w:rPr>
+          <w:b/>
+          <w:bCs/>
+          <w:color w:val="6A6A6A"/>
+          <w:sz w:val="18"/>
+          <w:szCs w:val="18"/>
+        </w:rPr>
+        <w:t xml:space="preserve">Syntax:  </w:t>
+      </w:r>
+      <w:r>
+        <w:rPr>
+          <w:rFonts w:ascii="Consolas" w:cs="Consolas" w:eastAsia="Consolas" w:hAnsi="Consolas"/>
+          <w:color w:val="335577"/>
+          <w:sz w:val="19"/>
+          <w:szCs w:val="19"/>
+        </w:rPr>
+        <w:t xml:space="preserve">RED(farbe)   GREEN(farbe)   BLUE(farbe)</w:t>
+      </w:r>
+    </w:p>
+    <w:p>
+      <w:pPr>
+        <w:spacing w:after="180" w:line="312" w:lineRule="auto"/>
+      </w:pPr>
+      <w:r>
+        <w:rPr>
+          <w:sz w:val="22"/>
+          <w:szCs w:val="22"/>
+        </w:rPr>
+        <w:t xml:space="preserve">Holen den einzelnen Kanal (0 bis 255) aus einer Farbe heraus. Praktisch, um eine Farbe abzudunkeln oder zwei Farben zu vergleichen. (Mit Klammern sind es Funktionen; ohne Klammern ist RED dagegen die rote Farbkonstante – GameBasic unterscheidet das anhand der Klammern.)</w:t>
+      </w:r>
+    </w:p>
+    <w:p>
+      <w:pPr>
+        <w:keepNext/>
+        <w:spacing w:after="30" w:before="120"/>
+      </w:pPr>
+      <w:r>
+        <w:rPr>
+          <w:b/>
+          <w:bCs/>
+          <w:i/>
+          <w:iCs/>
+          <w:color w:val="6A6A6A"/>
+          <w:sz w:val="18"/>
+          <w:szCs w:val="18"/>
+        </w:rPr>
+        <w:t xml:space="preserve">Beispiel</w:t>
+      </w:r>
+    </w:p>
+    <w:p>
+      <w:pPr>
+        <w:keepLines/>
+        <w:pBdr>
+          <w:left w:val="single" w:color="1B6CA8" w:sz="18" w:space="6"/>
+        </w:pBdr>
+        <w:shd w:fill="F4F4F4" w:val="clear"/>
+        <w:spacing w:after="200" w:before="100" w:line="264" w:lineRule="auto"/>
+        <w:ind w:left="140"/>
+      </w:pPr>
+      <w:r>
+        <w:rPr>
+          <w:rFonts w:ascii="Consolas" w:cs="Consolas" w:eastAsia="Consolas" w:hAnsi="Consolas"/>
+          <w:sz w:val="19"/>
+          <w:szCs w:val="19"/>
+        </w:rPr>
+        <w:t xml:space="preserve">DIM c AS INTEGER</w:t>
+      </w:r>
+      <w:r>
+        <w:rPr>
+          <w:rFonts w:ascii="Consolas" w:cs="Consolas" w:eastAsia="Consolas" w:hAnsi="Consolas"/>
+          <w:sz w:val="19"/>
+          <w:szCs w:val="19"/>
+        </w:rPr>
+        <w:br/>
+        <w:t xml:space="preserve">c = RGB(255, 128, 0)</w:t>
+      </w:r>
+      <w:r>
+        <w:rPr>
+          <w:rFonts w:ascii="Consolas" w:cs="Consolas" w:eastAsia="Consolas" w:hAnsi="Consolas"/>
+          <w:sz w:val="19"/>
+          <w:szCs w:val="19"/>
+        </w:rPr>
+        <w:br/>
+        <w:t xml:space="preserve">PRINT RED(c); " "; GREEN(c); " "; BLUE(c)</w:t>
+      </w:r>
+    </w:p>
+    <w:p>
+      <w:pPr>
+        <w:keepNext/>
+        <w:spacing w:after="30" w:before="120"/>
+      </w:pPr>
+      <w:r>
+        <w:rPr>
+          <w:b/>
+          <w:bCs/>
+          <w:i/>
+          <w:iCs/>
+          <w:color w:val="6A6A6A"/>
+          <w:sz w:val="18"/>
+          <w:szCs w:val="18"/>
+        </w:rPr>
+        <w:t xml:space="preserve">Ausgabe</w:t>
+      </w:r>
+    </w:p>
+    <w:p>
+      <w:pPr>
+        <w:keepLines/>
+        <w:pBdr>
+          <w:left w:val="single" w:color="9AC79A" w:sz="18" w:space="6"/>
+        </w:pBdr>
+        <w:shd w:fill="EAF4EA" w:val="clear"/>
+        <w:spacing w:after="200" w:before="100" w:line="264" w:lineRule="auto"/>
+        <w:ind w:left="140"/>
+      </w:pPr>
+      <w:r>
+        <w:rPr>
+          <w:rFonts w:ascii="Consolas" w:cs="Consolas" w:eastAsia="Consolas" w:hAnsi="Consolas"/>
+          <w:sz w:val="19"/>
+          <w:szCs w:val="19"/>
+        </w:rPr>
+        <w:t xml:space="preserve">255 128 0</w:t>
+      </w:r>
+    </w:p>
+    <w:p>
+      <w:pPr>
+        <w:pStyle w:val="Heading2"/>
+        <w:keepNext/>
+        <w:keepLines/>
+        <w:spacing w:after="120" w:before="280"/>
+      </w:pPr>
+      <w:r>
+        <w:t xml:space="preserve">Farben über HSV: HSV</w:t>
+      </w:r>
+    </w:p>
+    <w:p>
+      <w:pPr>
+        <w:spacing w:after="180" w:line="312" w:lineRule="auto"/>
+      </w:pPr>
+      <w:r>
+        <w:rPr>
+          <w:sz w:val="22"/>
+          <w:szCs w:val="22"/>
+        </w:rPr>
+        <w:t xml:space="preserve">Manchmal denkt man Farben lieber als „Farbton, Sättigung, Helligkeit“ statt als Rot/Grün/Blau. Genau das ist HSV: Der Farbton (Hue, 0 bis 360 Grad) läuft einmal durch den Regenbogen, die Sättigung (0 bis 1) reicht von grau bis kräftig, der Wert (0 bis 1) von dunkel bis hell. HSV ist ideal, um Regenbogen-Effekte zu erzeugen oder eine Farbe nur heller/dunkler zu machen.</w:t>
+      </w:r>
+    </w:p>
+    <w:p>
+      <w:pPr>
+        <w:keepNext/>
+        <w:keepLines/>
+        <w:pBdr>
+          <w:bottom w:val="single" w:color="DDD0C0" w:sz="4" w:space="2"/>
+        </w:pBdr>
+        <w:spacing w:after="40" w:before="360"/>
+      </w:pPr>
+      <w:r>
+        <w:rPr>
+          <w:rFonts w:ascii="Consolas" w:cs="Consolas" w:eastAsia="Consolas" w:hAnsi="Consolas"/>
+          <w:b/>
+          <w:bCs/>
+          <w:color w:val="9A3412"/>
+          <w:sz w:val="24"/>
+          <w:szCs w:val="24"/>
+        </w:rPr>
+        <w:t xml:space="preserve">HSV</w:t>
+      </w:r>
+    </w:p>
+    <w:p>
+      <w:pPr>
+        <w:keepNext/>
+        <w:spacing w:after="120"/>
+      </w:pPr>
+      <w:r>
+        <w:rPr>
+          <w:b/>
+          <w:bCs/>
+          <w:color w:val="6A6A6A"/>
+          <w:sz w:val="18"/>
+          <w:szCs w:val="18"/>
+        </w:rPr>
+        <w:t xml:space="preserve">Syntax:  </w:t>
+      </w:r>
+      <w:r>
+        <w:rPr>
+          <w:rFonts w:ascii="Consolas" w:cs="Consolas" w:eastAsia="Consolas" w:hAnsi="Consolas"/>
+          <w:color w:val="335577"/>
+          <w:sz w:val="19"/>
+          <w:szCs w:val="19"/>
+        </w:rPr>
+        <w:t xml:space="preserve">HSV(farbton, sättigung, wert)</w:t>
+      </w:r>
+    </w:p>
+    <w:p>
+      <w:pPr>
+        <w:spacing w:after="180" w:line="312" w:lineRule="auto"/>
+      </w:pPr>
+      <w:r>
+        <w:rPr>
+          <w:sz w:val="22"/>
+          <w:szCs w:val="22"/>
+        </w:rPr>
+        <w:t xml:space="preserve">Erzeugt eine Farbe aus Farbton (0–360 Grad), Sättigung (0–1) und Wert/Helligkeit (0–1). HSV(120, 1, 1) ist sattes Grün.</w:t>
+      </w:r>
+    </w:p>
+    <w:p>
+      <w:pPr>
+        <w:keepNext/>
+        <w:spacing w:after="30" w:before="120"/>
+      </w:pPr>
+      <w:r>
+        <w:rPr>
+          <w:b/>
+          <w:bCs/>
+          <w:i/>
+          <w:iCs/>
+          <w:color w:val="6A6A6A"/>
+          <w:sz w:val="18"/>
+          <w:szCs w:val="18"/>
+        </w:rPr>
+        <w:t xml:space="preserve">Beispiel</w:t>
+      </w:r>
+    </w:p>
+    <w:p>
+      <w:pPr>
+        <w:keepLines/>
+        <w:pBdr>
+          <w:left w:val="single" w:color="1B6CA8" w:sz="18" w:space="6"/>
+        </w:pBdr>
+        <w:shd w:fill="F4F4F4" w:val="clear"/>
+        <w:spacing w:after="200" w:before="100" w:line="264" w:lineRule="auto"/>
+        <w:ind w:left="140"/>
+      </w:pPr>
+      <w:r>
+        <w:rPr>
+          <w:rFonts w:ascii="Consolas" w:cs="Consolas" w:eastAsia="Consolas" w:hAnsi="Consolas"/>
+          <w:sz w:val="19"/>
+          <w:szCs w:val="19"/>
+        </w:rPr>
+        <w:t xml:space="preserve">PRINT HSV(120.0, 1.0, 1.0)     ' Grün</w:t>
+      </w:r>
+      <w:r>
+        <w:rPr>
+          <w:rFonts w:ascii="Consolas" w:cs="Consolas" w:eastAsia="Consolas" w:hAnsi="Consolas"/>
+          <w:sz w:val="19"/>
+          <w:szCs w:val="19"/>
+        </w:rPr>
+        <w:br/>
+        <w:t xml:space="preserve">' Regenbogen: Farbton mit der Zeit durchlaufen lassen</w:t>
+      </w:r>
+      <w:r>
+        <w:rPr>
+          <w:rFonts w:ascii="Consolas" w:cs="Consolas" w:eastAsia="Consolas" w:hAnsi="Consolas"/>
+          <w:sz w:val="19"/>
+          <w:szCs w:val="19"/>
+        </w:rPr>
+        <w:br/>
+        <w:t xml:space="preserve">' farbe = HSV(WRAP(t, 0, 360), 1.0, 1.0)</w:t>
+      </w:r>
+    </w:p>
+    <w:p>
+      <w:pPr>
+        <w:keepNext/>
+        <w:spacing w:after="30" w:before="120"/>
+      </w:pPr>
+      <w:r>
+        <w:rPr>
+          <w:b/>
+          <w:bCs/>
+          <w:i/>
+          <w:iCs/>
+          <w:color w:val="6A6A6A"/>
+          <w:sz w:val="18"/>
+          <w:szCs w:val="18"/>
+        </w:rPr>
+        <w:t xml:space="preserve">Ausgabe</w:t>
+      </w:r>
+    </w:p>
+    <w:p>
+      <w:pPr>
+        <w:keepLines/>
+        <w:pBdr>
+          <w:left w:val="single" w:color="9AC79A" w:sz="18" w:space="6"/>
+        </w:pBdr>
+        <w:shd w:fill="EAF4EA" w:val="clear"/>
+        <w:spacing w:after="200" w:before="100" w:line="264" w:lineRule="auto"/>
+        <w:ind w:left="140"/>
+      </w:pPr>
+      <w:r>
+        <w:rPr>
+          <w:rFonts w:ascii="Consolas" w:cs="Consolas" w:eastAsia="Consolas" w:hAnsi="Consolas"/>
+          <w:sz w:val="19"/>
+          <w:szCs w:val="19"/>
+        </w:rPr>
+        <w:t xml:space="preserve">65280</w:t>
+      </w:r>
+    </w:p>
+    <w:p>
+      <w:pPr>
+        <w:pStyle w:val="Heading2"/>
+        <w:keepNext/>
+        <w:keepLines/>
+        <w:spacing w:after="120" w:before="280"/>
+      </w:pPr>
+      <w:r>
+        <w:t xml:space="preserve">Farben mischen: COLOR_LERP</w:t>
+      </w:r>
+    </w:p>
+    <w:p>
+      <w:pPr>
+        <w:keepNext/>
+        <w:keepLines/>
+        <w:pBdr>
+          <w:bottom w:val="single" w:color="DDD0C0" w:sz="4" w:space="2"/>
+        </w:pBdr>
+        <w:spacing w:after="40" w:before="360"/>
+      </w:pPr>
+      <w:r>
+        <w:rPr>
+          <w:rFonts w:ascii="Consolas" w:cs="Consolas" w:eastAsia="Consolas" w:hAnsi="Consolas"/>
+          <w:b/>
+          <w:bCs/>
+          <w:color w:val="9A3412"/>
+          <w:sz w:val="24"/>
+          <w:szCs w:val="24"/>
+        </w:rPr>
+        <w:t xml:space="preserve">COLOR_LERP</w:t>
+      </w:r>
+    </w:p>
+    <w:p>
+      <w:pPr>
+        <w:keepNext/>
+        <w:spacing w:after="120"/>
+      </w:pPr>
+      <w:r>
+        <w:rPr>
+          <w:b/>
+          <w:bCs/>
+          <w:color w:val="6A6A6A"/>
+          <w:sz w:val="18"/>
+          <w:szCs w:val="18"/>
+        </w:rPr>
+        <w:t xml:space="preserve">Syntax:  </w:t>
+      </w:r>
+      <w:r>
+        <w:rPr>
+          <w:rFonts w:ascii="Consolas" w:cs="Consolas" w:eastAsia="Consolas" w:hAnsi="Consolas"/>
+          <w:color w:val="335577"/>
+          <w:sz w:val="19"/>
+          <w:szCs w:val="19"/>
+        </w:rPr>
+        <w:t xml:space="preserve">COLOR_LERP(farbe1, farbe2, t)</w:t>
+      </w:r>
+    </w:p>
+    <w:p>
+      <w:pPr>
+        <w:spacing w:after="180" w:line="312" w:lineRule="auto"/>
+      </w:pPr>
+      <w:r>
+        <w:rPr>
+          <w:sz w:val="22"/>
+          <w:szCs w:val="22"/>
+        </w:rPr>
+        <w:t xml:space="preserve">Mischt zwei Farben kanalweise. t = 0 ergibt farbe1, t = 1 ergibt farbe2, t = 0.5 die Mitte. Perfekt für weiche Farbübergänge (Tag→Nacht, Energiebalken grün→rot).</w:t>
+      </w:r>
+    </w:p>
+    <w:p>
+      <w:pPr>
+        <w:keepNext/>
+        <w:spacing w:after="30" w:before="120"/>
+      </w:pPr>
+      <w:r>
+        <w:rPr>
+          <w:b/>
+          <w:bCs/>
+          <w:i/>
+          <w:iCs/>
+          <w:color w:val="6A6A6A"/>
+          <w:sz w:val="18"/>
+          <w:szCs w:val="18"/>
+        </w:rPr>
+        <w:t xml:space="preserve">Beispiel</w:t>
+      </w:r>
+    </w:p>
+    <w:p>
+      <w:pPr>
+        <w:keepLines/>
+        <w:pBdr>
+          <w:left w:val="single" w:color="1B6CA8" w:sz="18" w:space="6"/>
+        </w:pBdr>
+        <w:shd w:fill="F4F4F4" w:val="clear"/>
+        <w:spacing w:after="200" w:before="100" w:line="264" w:lineRule="auto"/>
+        <w:ind w:left="140"/>
+      </w:pPr>
+      <w:r>
+        <w:rPr>
+          <w:rFonts w:ascii="Consolas" w:cs="Consolas" w:eastAsia="Consolas" w:hAnsi="Consolas"/>
+          <w:sz w:val="19"/>
+          <w:szCs w:val="19"/>
+        </w:rPr>
+        <w:t xml:space="preserve">PRINT COLOR_LERP(BLACK, WHITE, 0.5)   ' mittleres Grau</w:t>
+      </w:r>
+      <w:r>
+        <w:rPr>
+          <w:rFonts w:ascii="Consolas" w:cs="Consolas" w:eastAsia="Consolas" w:hAnsi="Consolas"/>
+          <w:sz w:val="19"/>
+          <w:szCs w:val="19"/>
+        </w:rPr>
+        <w:br/>
+        <w:t xml:space="preserve">DIM gruenZuRot AS INTEGER</w:t>
+      </w:r>
+      <w:r>
+        <w:rPr>
+          <w:rFonts w:ascii="Consolas" w:cs="Consolas" w:eastAsia="Consolas" w:hAnsi="Consolas"/>
+          <w:sz w:val="19"/>
+          <w:szCs w:val="19"/>
+        </w:rPr>
+        <w:br/>
+        <w:t xml:space="preserve">gruenZuRot = COLOR_LERP(GREEN, RED, 0.5)</w:t>
+      </w:r>
+    </w:p>
+    <w:p>
+      <w:pPr>
+        <w:keepNext/>
+        <w:spacing w:after="30" w:before="120"/>
+      </w:pPr>
+      <w:r>
+        <w:rPr>
+          <w:b/>
+          <w:bCs/>
+          <w:i/>
+          <w:iCs/>
+          <w:color w:val="6A6A6A"/>
+          <w:sz w:val="18"/>
+          <w:szCs w:val="18"/>
+        </w:rPr>
+        <w:t xml:space="preserve">Ausgabe</w:t>
+      </w:r>
+    </w:p>
+    <w:p>
+      <w:pPr>
+        <w:keepLines/>
+        <w:pBdr>
+          <w:left w:val="single" w:color="9AC79A" w:sz="18" w:space="6"/>
+        </w:pBdr>
+        <w:shd w:fill="EAF4EA" w:val="clear"/>
+        <w:spacing w:after="200" w:before="100" w:line="264" w:lineRule="auto"/>
+        <w:ind w:left="140"/>
+      </w:pPr>
+      <w:r>
+        <w:rPr>
+          <w:rFonts w:ascii="Consolas" w:cs="Consolas" w:eastAsia="Consolas" w:hAnsi="Consolas"/>
+          <w:sz w:val="19"/>
+          <w:szCs w:val="19"/>
+        </w:rPr>
+        <w:t xml:space="preserve">8421504</w:t>
+      </w:r>
+    </w:p>
+    <w:p>
+      <w:pPr>
+        <w:spacing w:before="60"/>
+      </w:pPr>
+    </w:p>
+    <w:tbl>
+      <w:tblPr>
+        <w:tblW w:type="dxa" w:w="9360"/>
+        <w:tblBorders>
+          <w:top w:val="single" w:color="auto" w:sz="4"/>
+          <w:left w:val="single" w:color="auto" w:sz="4"/>
+          <w:bottom w:val="single" w:color="auto" w:sz="4"/>
+          <w:right w:val="single" w:color="auto" w:sz="4"/>
+          <w:insideH w:val="single" w:color="auto" w:sz="4"/>
+          <w:insideV w:val="single" w:color="auto" w:sz="4"/>
+        </w:tblBorders>
+      </w:tblPr>
+      <w:tblGrid>
+        <w:gridCol w:w="9360"/>
+      </w:tblGrid>
+      <w:tr>
+        <w:trPr>
+          <w:cantSplit/>
+        </w:trPr>
+        <w:tc>
+          <w:tcPr>
+            <w:tcW w:type="dxa" w:w="9360"/>
+            <w:tcBorders>
+              <w:top w:val="single" w:color="9CC8E6" w:sz="6"/>
+              <w:left w:val="single" w:color="9CC8E6" w:sz="6"/>
+              <w:bottom w:val="single" w:color="9CC8E6" w:sz="6"/>
+              <w:right w:val="single" w:color="9CC8E6" w:sz="6"/>
+            </w:tcBorders>
+            <w:shd w:fill="E7F2FA" w:val="clear"/>
+            <w:tcMar>
+              <w:top w:type="dxa" w:w="140"/>
+              <w:left w:type="dxa" w:w="180"/>
+              <w:bottom w:type="dxa" w:w="140"/>
+              <w:right w:type="dxa" w:w="180"/>
+            </w:tcMar>
+          </w:tcPr>
+          <w:p>
+            <w:pPr>
+              <w:spacing w:after="40"/>
+            </w:pPr>
+            <w:r>
+              <w:rPr>
+                <w:b/>
+                <w:bCs/>
+                <w:color w:val="1B6CA8"/>
+                <w:sz w:val="22"/>
+                <w:szCs w:val="22"/>
+              </w:rPr>
+              <w:t xml:space="preserve">Energiebalken einfärben</w:t>
+            </w:r>
+          </w:p>
+          <w:p>
+            <w:pPr>
+              <w:spacing w:after="0" w:line="312" w:lineRule="auto"/>
+            </w:pPr>
+            <w:r>
+              <w:rPr>
+                <w:sz w:val="22"/>
+                <w:szCs w:val="22"/>
+              </w:rPr>
+              <w:t xml:space="preserve">Ein hübsches Muster: Färbe einen Lebensbalken je nach Füllstand. anteil = hp / max_hp (0..1), dann farbe = COLOR_LERP(RED, GREEN, anteil) – voll ist grün, leer ist rot, dazwischen fließend.</w:t>
             </w:r>
           </w:p>
         </w:tc>

</xml_diff>

<commit_message>
docs(buch): Lehrbuch Kap 45 -- Eingabe (mit Steuerungs-Screenshot)
KEYPRESSED + KEY_*-Konstanten, MOUSEX/Y/MOUSEBUTTON/MOUSEWHEEL/MOUSE_VISIBLE/
LOCK, input-Modul (INPUT_BIND/UPDATE/HELD/PRESSED/RELEASED/AXIS), Gamepad-Tipp.
HELD vs. PRESSED erklaert. Steuerungs-Demo-Screenshot. Gegen gbrt verifiziert.

Co-Authored-By: Claude Opus 4.8 (1M context) <noreply@anthropic.com>
</commit_message>
<xml_diff>
--- a/buch-referenz/buch/GameBasic-Lehrbuch.docx
+++ b/buch-referenz/buch/GameBasic-Lehrbuch.docx
@@ -1137,6 +1137,33 @@
           <w:szCs w:val="22"/>
         </w:rPr>
         <w:t xml:space="preserve">	145</w:t>
+      </w:r>
+    </w:p>
+    <w:p>
+      <w:pPr>
+        <w:tabs>
+          <w:tab w:val="right" w:pos="9200" w:leader="dot"/>
+        </w:tabs>
+        <w:spacing w:after="20" w:before="0"/>
+        <w:ind w:left="280"/>
+      </w:pPr>
+      <w:r>
+        <w:rPr>
+          <w:b w:val="false"/>
+          <w:bCs w:val="false"/>
+          <w:color w:val="222222"/>
+          <w:sz w:val="22"/>
+          <w:szCs w:val="22"/>
+        </w:rPr>
+        <w:t xml:space="preserve">Eingabe</w:t>
+      </w:r>
+      <w:r>
+        <w:rPr>
+          <w:color w:val="555555"/>
+          <w:sz w:val="22"/>
+          <w:szCs w:val="22"/>
+        </w:rPr>
+        <w:t xml:space="preserve">	148</w:t>
       </w:r>
     </w:p>
     <w:p>
@@ -50305,6 +50332,1221 @@
                 <w:szCs w:val="22"/>
               </w:rPr>
               <w:t xml:space="preserve">Ein hübsches Muster: Färbe einen Lebensbalken je nach Füllstand. anteil = hp / max_hp (0..1), dann farbe = COLOR_LERP(RED, GREEN, anteil) – voll ist grün, leer ist rot, dazwischen fließend.</w:t>
+            </w:r>
+          </w:p>
+        </w:tc>
+      </w:tr>
+    </w:tbl>
+    <w:p>
+      <w:pPr>
+        <w:spacing w:after="160"/>
+      </w:pPr>
+    </w:p>
+    <w:p>
+      <w:pPr>
+        <w:pStyle w:val="Heading1"/>
+        <w:keepNext/>
+        <w:keepLines/>
+        <w:pageBreakBefore/>
+        <w:pBdr>
+          <w:bottom w:val="single" w:color="1B6CA8" w:sz="12" w:space="4"/>
+        </w:pBdr>
+        <w:spacing w:after="160" w:before="0"/>
+      </w:pPr>
+      <w:r>
+        <w:t xml:space="preserve">Eingabe</w:t>
+      </w:r>
+    </w:p>
+    <w:p>
+      <w:pPr>
+        <w:spacing w:after="180" w:line="312" w:lineRule="auto"/>
+      </w:pPr>
+      <w:r>
+        <w:rPr>
+          <w:sz w:val="22"/>
+          <w:szCs w:val="22"/>
+        </w:rPr>
+        <w:t xml:space="preserve">Ein Spiel wird erst lebendig, wenn der Spieler eingreifen kann. Im Grafikfenster fragst du Tastatur, Maus und Gamepad nicht mit INPUT ab (das ist nur für die Konsole), sondern Frame für Frame im Game-Loop. Dieses Kapitel zeigt die direkten Abfragen und das komfortable input-Modul, mit dem du Tasten an benannte Aktionen bindest.</w:t>
+      </w:r>
+    </w:p>
+    <w:p>
+      <w:pPr>
+        <w:keepNext/>
+        <w:spacing w:after="40" w:before="160"/>
+        <w:jc w:val="center"/>
+      </w:pPr>
+      <w:r>
+        <w:drawing>
+          <wp:inline distT="0" distB="0" distL="0" distR="0">
+            <wp:extent cx="4572000" cy="3048000"/>
+            <wp:effectExtent t="0" r="0" b="0" l="0"/>
+            <wp:docPr id="1" name="45_eingabe.png" descr="Eine kleine Steuerungs-Demo: ein per Tastatur bewegter Spieler und eine Steuerungs-Legende." title="Eine kleine Steuerungs-Demo: ein per Tastatur bewegter Spieler und eine Steuerungs-Legende."/>
+            <wp:cNvGraphicFramePr>
+              <a:graphicFrameLocks xmlns:a="http://schemas.openxmlformats.org/drawingml/2006/main" noChangeAspect="1"/>
+            </wp:cNvGraphicFramePr>
+            <a:graphic xmlns:a="http://schemas.openxmlformats.org/drawingml/2006/main">
+              <a:graphicData uri="http://schemas.openxmlformats.org/drawingml/2006/picture">
+                <pic:pic xmlns:pic="http://schemas.openxmlformats.org/drawingml/2006/picture">
+                  <pic:nvPicPr>
+                    <pic:cNvPr id="0" name="" descr=""/>
+                    <pic:cNvPicPr>
+                      <a:picLocks noChangeAspect="1" noChangeArrowheads="1"/>
+                    </pic:cNvPicPr>
+                  </pic:nvPicPr>
+                  <pic:blipFill>
+                    <a:blip r:embed="rId14" cstate="none"/>
+                    <a:srcRect/>
+                    <a:stretch>
+                      <a:fillRect/>
+                    </a:stretch>
+                  </pic:blipFill>
+                  <pic:spPr bwMode="auto">
+                    <a:xfrm>
+                      <a:off x="0" y="0"/>
+                      <a:ext cx="4572000" cy="3048000"/>
+                    </a:xfrm>
+                    <a:prstGeom prst="rect">
+                      <a:avLst/>
+                    </a:prstGeom>
+                  </pic:spPr>
+                </pic:pic>
+              </a:graphicData>
+            </a:graphic>
+          </wp:inline>
+        </w:drawing>
+      </w:r>
+    </w:p>
+    <w:p>
+      <w:pPr>
+        <w:spacing w:after="200"/>
+        <w:jc w:val="center"/>
+      </w:pPr>
+      <w:r>
+        <w:rPr>
+          <w:i/>
+          <w:iCs/>
+          <w:color w:val="6A6A6A"/>
+          <w:sz w:val="18"/>
+          <w:szCs w:val="18"/>
+        </w:rPr>
+        <w:t xml:space="preserve">Eine kleine Steuerungs-Demo: ein per Tastatur bewegter Spieler und eine Steuerungs-Legende.</w:t>
+      </w:r>
+    </w:p>
+    <w:p>
+      <w:pPr>
+        <w:pStyle w:val="Heading2"/>
+        <w:keepNext/>
+        <w:keepLines/>
+        <w:spacing w:after="120" w:before="280"/>
+      </w:pPr>
+      <w:r>
+        <w:t xml:space="preserve">Tastatur</w:t>
+      </w:r>
+    </w:p>
+    <w:p>
+      <w:pPr>
+        <w:keepNext/>
+        <w:keepLines/>
+        <w:pBdr>
+          <w:bottom w:val="single" w:color="DDD0C0" w:sz="4" w:space="2"/>
+        </w:pBdr>
+        <w:spacing w:after="40" w:before="360"/>
+      </w:pPr>
+      <w:r>
+        <w:rPr>
+          <w:rFonts w:ascii="Consolas" w:cs="Consolas" w:eastAsia="Consolas" w:hAnsi="Consolas"/>
+          <w:b/>
+          <w:bCs/>
+          <w:color w:val="9A3412"/>
+          <w:sz w:val="24"/>
+          <w:szCs w:val="24"/>
+        </w:rPr>
+        <w:t xml:space="preserve">KEYPRESSED</w:t>
+      </w:r>
+    </w:p>
+    <w:p>
+      <w:pPr>
+        <w:keepNext/>
+        <w:spacing w:after="120"/>
+      </w:pPr>
+      <w:r>
+        <w:rPr>
+          <w:b/>
+          <w:bCs/>
+          <w:color w:val="6A6A6A"/>
+          <w:sz w:val="18"/>
+          <w:szCs w:val="18"/>
+        </w:rPr>
+        <w:t xml:space="preserve">Syntax:  </w:t>
+      </w:r>
+      <w:r>
+        <w:rPr>
+          <w:rFonts w:ascii="Consolas" w:cs="Consolas" w:eastAsia="Consolas" w:hAnsi="Consolas"/>
+          <w:color w:val="335577"/>
+          <w:sz w:val="19"/>
+          <w:szCs w:val="19"/>
+        </w:rPr>
+        <w:t xml:space="preserve">KEYPRESSED(taste)</w:t>
+      </w:r>
+    </w:p>
+    <w:p>
+      <w:pPr>
+        <w:spacing w:after="180" w:line="312" w:lineRule="auto"/>
+      </w:pPr>
+      <w:r>
+        <w:rPr>
+          <w:sz w:val="22"/>
+          <w:szCs w:val="22"/>
+        </w:rPr>
+        <w:t xml:space="preserve">Liefert TRUE, solange die angegebene Taste gehalten wird. Die Taste gibst du als KEY_-Konstante an. Im Game-Loop abgefragt, ergibt das flüssige Bewegung.</w:t>
+      </w:r>
+    </w:p>
+    <w:p>
+      <w:pPr>
+        <w:keepNext/>
+        <w:spacing w:after="30" w:before="120"/>
+      </w:pPr>
+      <w:r>
+        <w:rPr>
+          <w:b/>
+          <w:bCs/>
+          <w:i/>
+          <w:iCs/>
+          <w:color w:val="6A6A6A"/>
+          <w:sz w:val="18"/>
+          <w:szCs w:val="18"/>
+        </w:rPr>
+        <w:t xml:space="preserve">Beispiel</w:t>
+      </w:r>
+    </w:p>
+    <w:p>
+      <w:pPr>
+        <w:keepLines/>
+        <w:pBdr>
+          <w:left w:val="single" w:color="1B6CA8" w:sz="18" w:space="6"/>
+        </w:pBdr>
+        <w:shd w:fill="F4F4F4" w:val="clear"/>
+        <w:spacing w:after="200" w:before="100" w:line="264" w:lineRule="auto"/>
+        <w:ind w:left="140"/>
+      </w:pPr>
+      <w:r>
+        <w:rPr>
+          <w:rFonts w:ascii="Consolas" w:cs="Consolas" w:eastAsia="Consolas" w:hAnsi="Consolas"/>
+          <w:sz w:val="19"/>
+          <w:szCs w:val="19"/>
+        </w:rPr>
+        <w:t xml:space="preserve">IF KEYPRESSED(KEY_LEFT)  THEN px = px - 2</w:t>
+      </w:r>
+      <w:r>
+        <w:rPr>
+          <w:rFonts w:ascii="Consolas" w:cs="Consolas" w:eastAsia="Consolas" w:hAnsi="Consolas"/>
+          <w:sz w:val="19"/>
+          <w:szCs w:val="19"/>
+        </w:rPr>
+        <w:br/>
+        <w:t xml:space="preserve">IF KEYPRESSED(KEY_RIGHT) THEN px = px + 2</w:t>
+      </w:r>
+      <w:r>
+        <w:rPr>
+          <w:rFonts w:ascii="Consolas" w:cs="Consolas" w:eastAsia="Consolas" w:hAnsi="Consolas"/>
+          <w:sz w:val="19"/>
+          <w:szCs w:val="19"/>
+        </w:rPr>
+        <w:br/>
+        <w:t xml:space="preserve">IF KEYPRESSED(KEY_SPACE) THEN ' springen</w:t>
+      </w:r>
+    </w:p>
+    <w:p>
+      <w:pPr>
+        <w:spacing w:after="180" w:line="312" w:lineRule="auto"/>
+      </w:pPr>
+      <w:r>
+        <w:rPr>
+          <w:sz w:val="22"/>
+          <w:szCs w:val="22"/>
+        </w:rPr>
+        <w:t xml:space="preserve">Eingebaute Tasten-Konstanten gibt es für alle wichtigen Tasten: KEY_LEFT, KEY_RIGHT, KEY_UP, KEY_DOWN, KEY_SPACE, KEY_RETURN (= KEY_ENTER), KEY_ESCAPE, KEY_TAB, KEY_BACKSPACE, die Buchstaben KEY_A bis KEY_Z und die Ziffern KEY_0 bis KEY_9.</w:t>
+      </w:r>
+    </w:p>
+    <w:p>
+      <w:pPr>
+        <w:spacing w:before="60"/>
+      </w:pPr>
+    </w:p>
+    <w:tbl>
+      <w:tblPr>
+        <w:tblW w:type="dxa" w:w="9360"/>
+        <w:tblBorders>
+          <w:top w:val="single" w:color="auto" w:sz="4"/>
+          <w:left w:val="single" w:color="auto" w:sz="4"/>
+          <w:bottom w:val="single" w:color="auto" w:sz="4"/>
+          <w:right w:val="single" w:color="auto" w:sz="4"/>
+          <w:insideH w:val="single" w:color="auto" w:sz="4"/>
+          <w:insideV w:val="single" w:color="auto" w:sz="4"/>
+        </w:tblBorders>
+      </w:tblPr>
+      <w:tblGrid>
+        <w:gridCol w:w="9360"/>
+      </w:tblGrid>
+      <w:tr>
+        <w:trPr>
+          <w:cantSplit/>
+        </w:trPr>
+        <w:tc>
+          <w:tcPr>
+            <w:tcW w:type="dxa" w:w="9360"/>
+            <w:tcBorders>
+              <w:top w:val="single" w:color="E0B96A" w:sz="6"/>
+              <w:left w:val="single" w:color="E0B96A" w:sz="6"/>
+              <w:bottom w:val="single" w:color="E0B96A" w:sz="6"/>
+              <w:right w:val="single" w:color="E0B96A" w:sz="6"/>
+            </w:tcBorders>
+            <w:shd w:fill="FDF3E0" w:val="clear"/>
+            <w:tcMar>
+              <w:top w:type="dxa" w:w="140"/>
+              <w:left w:type="dxa" w:w="180"/>
+              <w:bottom w:type="dxa" w:w="140"/>
+              <w:right w:type="dxa" w:w="180"/>
+            </w:tcMar>
+          </w:tcPr>
+          <w:p>
+            <w:pPr>
+              <w:spacing w:after="40"/>
+            </w:pPr>
+            <w:r>
+              <w:rPr>
+                <w:b/>
+                <w:bCs/>
+                <w:color w:val="9A6A1E"/>
+                <w:sz w:val="22"/>
+                <w:szCs w:val="22"/>
+              </w:rPr>
+              <w:t xml:space="preserve">Merke</w:t>
+            </w:r>
+          </w:p>
+          <w:p>
+            <w:pPr>
+              <w:spacing w:after="0" w:line="312" w:lineRule="auto"/>
+            </w:pPr>
+            <w:r>
+              <w:rPr>
+                <w:sz w:val="22"/>
+                <w:szCs w:val="22"/>
+              </w:rPr>
+              <w:t xml:space="preserve">KEYPRESSED ist „gehalten“ – es ist TRUE, solange die Taste unten ist. Für „genau einmal beim Drücken“ (z. B. Sprung, Menü-Auswahl) nimmst du die Edge-Erkennung des input-Moduls weiter unten (INPUT_PRESSED).</w:t>
+            </w:r>
+          </w:p>
+        </w:tc>
+      </w:tr>
+    </w:tbl>
+    <w:p>
+      <w:pPr>
+        <w:spacing w:after="160"/>
+      </w:pPr>
+    </w:p>
+    <w:p>
+      <w:pPr>
+        <w:pStyle w:val="Heading2"/>
+        <w:keepNext/>
+        <w:keepLines/>
+        <w:spacing w:after="120" w:before="280"/>
+      </w:pPr>
+      <w:r>
+        <w:t xml:space="preserve">Maus</w:t>
+      </w:r>
+    </w:p>
+    <w:p>
+      <w:pPr>
+        <w:keepNext/>
+        <w:keepLines/>
+        <w:pBdr>
+          <w:bottom w:val="single" w:color="DDD0C0" w:sz="4" w:space="2"/>
+        </w:pBdr>
+        <w:spacing w:after="40" w:before="360"/>
+      </w:pPr>
+      <w:r>
+        <w:rPr>
+          <w:rFonts w:ascii="Consolas" w:cs="Consolas" w:eastAsia="Consolas" w:hAnsi="Consolas"/>
+          <w:b/>
+          <w:bCs/>
+          <w:color w:val="9A3412"/>
+          <w:sz w:val="24"/>
+          <w:szCs w:val="24"/>
+        </w:rPr>
+        <w:t xml:space="preserve">MOUSEX · MOUSEY</w:t>
+      </w:r>
+    </w:p>
+    <w:p>
+      <w:pPr>
+        <w:keepNext/>
+        <w:spacing w:after="120"/>
+      </w:pPr>
+      <w:r>
+        <w:rPr>
+          <w:b/>
+          <w:bCs/>
+          <w:color w:val="6A6A6A"/>
+          <w:sz w:val="18"/>
+          <w:szCs w:val="18"/>
+        </w:rPr>
+        <w:t xml:space="preserve">Syntax:  </w:t>
+      </w:r>
+      <w:r>
+        <w:rPr>
+          <w:rFonts w:ascii="Consolas" w:cs="Consolas" w:eastAsia="Consolas" w:hAnsi="Consolas"/>
+          <w:color w:val="335577"/>
+          <w:sz w:val="19"/>
+          <w:szCs w:val="19"/>
+        </w:rPr>
+        <w:t xml:space="preserve">MOUSEX()   MOUSEY()</w:t>
+      </w:r>
+    </w:p>
+    <w:p>
+      <w:pPr>
+        <w:spacing w:after="180" w:line="312" w:lineRule="auto"/>
+      </w:pPr>
+      <w:r>
+        <w:rPr>
+          <w:sz w:val="22"/>
+          <w:szCs w:val="22"/>
+        </w:rPr>
+        <w:t xml:space="preserve">Liefern die aktuelle Mausposition im Fenster (in logischen Pixeln). Gut, um ein Fadenkreuz oder einen Cursor zu zeichnen oder zu prüfen, worüber die Maus steht.</w:t>
+      </w:r>
+    </w:p>
+    <w:p>
+      <w:pPr>
+        <w:keepNext/>
+        <w:spacing w:after="30" w:before="120"/>
+      </w:pPr>
+      <w:r>
+        <w:rPr>
+          <w:b/>
+          <w:bCs/>
+          <w:i/>
+          <w:iCs/>
+          <w:color w:val="6A6A6A"/>
+          <w:sz w:val="18"/>
+          <w:szCs w:val="18"/>
+        </w:rPr>
+        <w:t xml:space="preserve">Beispiel</w:t>
+      </w:r>
+    </w:p>
+    <w:p>
+      <w:pPr>
+        <w:keepLines/>
+        <w:pBdr>
+          <w:left w:val="single" w:color="1B6CA8" w:sz="18" w:space="6"/>
+        </w:pBdr>
+        <w:shd w:fill="F4F4F4" w:val="clear"/>
+        <w:spacing w:after="200" w:before="100" w:line="264" w:lineRule="auto"/>
+        <w:ind w:left="140"/>
+      </w:pPr>
+      <w:r>
+        <w:rPr>
+          <w:rFonts w:ascii="Consolas" w:cs="Consolas" w:eastAsia="Consolas" w:hAnsi="Consolas"/>
+          <w:sz w:val="19"/>
+          <w:szCs w:val="19"/>
+        </w:rPr>
+        <w:t xml:space="preserve">CLS()</w:t>
+      </w:r>
+      <w:r>
+        <w:rPr>
+          <w:rFonts w:ascii="Consolas" w:cs="Consolas" w:eastAsia="Consolas" w:hAnsi="Consolas"/>
+          <w:sz w:val="19"/>
+          <w:szCs w:val="19"/>
+        </w:rPr>
+        <w:br/>
+        <w:t xml:space="preserve">CIRCLE(MOUSEX(), MOUSEY(), 6, RGB(255, 255, 255))  ' Fadenkreuz</w:t>
+      </w:r>
+      <w:r>
+        <w:rPr>
+          <w:rFonts w:ascii="Consolas" w:cs="Consolas" w:eastAsia="Consolas" w:hAnsi="Consolas"/>
+          <w:sz w:val="19"/>
+          <w:szCs w:val="19"/>
+        </w:rPr>
+        <w:br/>
+        <w:t xml:space="preserve">FLIP()</w:t>
+      </w:r>
+    </w:p>
+    <w:p>
+      <w:pPr>
+        <w:keepNext/>
+        <w:keepLines/>
+        <w:pBdr>
+          <w:bottom w:val="single" w:color="DDD0C0" w:sz="4" w:space="2"/>
+        </w:pBdr>
+        <w:spacing w:after="40" w:before="360"/>
+      </w:pPr>
+      <w:r>
+        <w:rPr>
+          <w:rFonts w:ascii="Consolas" w:cs="Consolas" w:eastAsia="Consolas" w:hAnsi="Consolas"/>
+          <w:b/>
+          <w:bCs/>
+          <w:color w:val="9A3412"/>
+          <w:sz w:val="24"/>
+          <w:szCs w:val="24"/>
+        </w:rPr>
+        <w:t xml:space="preserve">MOUSEBUTTON</w:t>
+      </w:r>
+    </w:p>
+    <w:p>
+      <w:pPr>
+        <w:keepNext/>
+        <w:spacing w:after="120"/>
+      </w:pPr>
+      <w:r>
+        <w:rPr>
+          <w:b/>
+          <w:bCs/>
+          <w:color w:val="6A6A6A"/>
+          <w:sz w:val="18"/>
+          <w:szCs w:val="18"/>
+        </w:rPr>
+        <w:t xml:space="preserve">Syntax:  </w:t>
+      </w:r>
+      <w:r>
+        <w:rPr>
+          <w:rFonts w:ascii="Consolas" w:cs="Consolas" w:eastAsia="Consolas" w:hAnsi="Consolas"/>
+          <w:color w:val="335577"/>
+          <w:sz w:val="19"/>
+          <w:szCs w:val="19"/>
+        </w:rPr>
+        <w:t xml:space="preserve">MOUSEBUTTON(n)</w:t>
+      </w:r>
+    </w:p>
+    <w:p>
+      <w:pPr>
+        <w:spacing w:after="180" w:line="312" w:lineRule="auto"/>
+      </w:pPr>
+      <w:r>
+        <w:rPr>
+          <w:sz w:val="22"/>
+          <w:szCs w:val="22"/>
+        </w:rPr>
+        <w:t xml:space="preserve">Liefert TRUE, wenn die Maustaste n gedrückt ist: 0 = links, 1 = mitte, 2 = rechts.</w:t>
+      </w:r>
+    </w:p>
+    <w:p>
+      <w:pPr>
+        <w:keepNext/>
+        <w:spacing w:after="30" w:before="120"/>
+      </w:pPr>
+      <w:r>
+        <w:rPr>
+          <w:b/>
+          <w:bCs/>
+          <w:i/>
+          <w:iCs/>
+          <w:color w:val="6A6A6A"/>
+          <w:sz w:val="18"/>
+          <w:szCs w:val="18"/>
+        </w:rPr>
+        <w:t xml:space="preserve">Beispiel</w:t>
+      </w:r>
+    </w:p>
+    <w:p>
+      <w:pPr>
+        <w:keepLines/>
+        <w:pBdr>
+          <w:left w:val="single" w:color="1B6CA8" w:sz="18" w:space="6"/>
+        </w:pBdr>
+        <w:shd w:fill="F4F4F4" w:val="clear"/>
+        <w:spacing w:after="200" w:before="100" w:line="264" w:lineRule="auto"/>
+        <w:ind w:left="140"/>
+      </w:pPr>
+      <w:r>
+        <w:rPr>
+          <w:rFonts w:ascii="Consolas" w:cs="Consolas" w:eastAsia="Consolas" w:hAnsi="Consolas"/>
+          <w:sz w:val="19"/>
+          <w:szCs w:val="19"/>
+        </w:rPr>
+        <w:t xml:space="preserve">IF MOUSEBUTTON(0) THEN ' Linksklick: schiessen</w:t>
+      </w:r>
+    </w:p>
+    <w:p>
+      <w:pPr>
+        <w:keepNext/>
+        <w:keepLines/>
+        <w:pBdr>
+          <w:bottom w:val="single" w:color="DDD0C0" w:sz="4" w:space="2"/>
+        </w:pBdr>
+        <w:spacing w:after="40" w:before="360"/>
+      </w:pPr>
+      <w:r>
+        <w:rPr>
+          <w:rFonts w:ascii="Consolas" w:cs="Consolas" w:eastAsia="Consolas" w:hAnsi="Consolas"/>
+          <w:b/>
+          <w:bCs/>
+          <w:color w:val="9A3412"/>
+          <w:sz w:val="24"/>
+          <w:szCs w:val="24"/>
+        </w:rPr>
+        <w:t xml:space="preserve">MOUSEWHEEL</w:t>
+      </w:r>
+    </w:p>
+    <w:p>
+      <w:pPr>
+        <w:keepNext/>
+        <w:spacing w:after="120"/>
+      </w:pPr>
+      <w:r>
+        <w:rPr>
+          <w:b/>
+          <w:bCs/>
+          <w:color w:val="6A6A6A"/>
+          <w:sz w:val="18"/>
+          <w:szCs w:val="18"/>
+        </w:rPr>
+        <w:t xml:space="preserve">Syntax:  </w:t>
+      </w:r>
+      <w:r>
+        <w:rPr>
+          <w:rFonts w:ascii="Consolas" w:cs="Consolas" w:eastAsia="Consolas" w:hAnsi="Consolas"/>
+          <w:color w:val="335577"/>
+          <w:sz w:val="19"/>
+          <w:szCs w:val="19"/>
+        </w:rPr>
+        <w:t xml:space="preserve">MOUSEWHEEL()</w:t>
+      </w:r>
+    </w:p>
+    <w:p>
+      <w:pPr>
+        <w:spacing w:after="180" w:line="312" w:lineRule="auto"/>
+      </w:pPr>
+      <w:r>
+        <w:rPr>
+          <w:sz w:val="22"/>
+          <w:szCs w:val="22"/>
+        </w:rPr>
+        <w:t xml:space="preserve">Liefert die Drehung des Mausrads seit dem letzten Aufruf: positiv nach oben, negativ nach unten, 0 wenn nichts gedreht wurde. Gut zum Zoomen oder Blättern.</w:t>
+      </w:r>
+    </w:p>
+    <w:p>
+      <w:pPr>
+        <w:keepNext/>
+        <w:spacing w:after="30" w:before="120"/>
+      </w:pPr>
+      <w:r>
+        <w:rPr>
+          <w:b/>
+          <w:bCs/>
+          <w:i/>
+          <w:iCs/>
+          <w:color w:val="6A6A6A"/>
+          <w:sz w:val="18"/>
+          <w:szCs w:val="18"/>
+        </w:rPr>
+        <w:t xml:space="preserve">Beispiel</w:t>
+      </w:r>
+    </w:p>
+    <w:p>
+      <w:pPr>
+        <w:keepLines/>
+        <w:pBdr>
+          <w:left w:val="single" w:color="1B6CA8" w:sz="18" w:space="6"/>
+        </w:pBdr>
+        <w:shd w:fill="F4F4F4" w:val="clear"/>
+        <w:spacing w:after="200" w:before="100" w:line="264" w:lineRule="auto"/>
+        <w:ind w:left="140"/>
+      </w:pPr>
+      <w:r>
+        <w:rPr>
+          <w:rFonts w:ascii="Consolas" w:cs="Consolas" w:eastAsia="Consolas" w:hAnsi="Consolas"/>
+          <w:sz w:val="19"/>
+          <w:szCs w:val="19"/>
+        </w:rPr>
+        <w:t xml:space="preserve">DIM zoom AS FLOAT</w:t>
+      </w:r>
+      <w:r>
+        <w:rPr>
+          <w:rFonts w:ascii="Consolas" w:cs="Consolas" w:eastAsia="Consolas" w:hAnsi="Consolas"/>
+          <w:sz w:val="19"/>
+          <w:szCs w:val="19"/>
+        </w:rPr>
+        <w:br/>
+        <w:t xml:space="preserve">zoom = zoom + MOUSEWHEEL() * 0.1</w:t>
+      </w:r>
+    </w:p>
+    <w:p>
+      <w:pPr>
+        <w:keepNext/>
+        <w:keepLines/>
+        <w:pBdr>
+          <w:bottom w:val="single" w:color="DDD0C0" w:sz="4" w:space="2"/>
+        </w:pBdr>
+        <w:spacing w:after="40" w:before="360"/>
+      </w:pPr>
+      <w:r>
+        <w:rPr>
+          <w:rFonts w:ascii="Consolas" w:cs="Consolas" w:eastAsia="Consolas" w:hAnsi="Consolas"/>
+          <w:b/>
+          <w:bCs/>
+          <w:color w:val="9A3412"/>
+          <w:sz w:val="24"/>
+          <w:szCs w:val="24"/>
+        </w:rPr>
+        <w:t xml:space="preserve">MOUSE_VISIBLE · MOUSE_LOCK</w:t>
+      </w:r>
+    </w:p>
+    <w:p>
+      <w:pPr>
+        <w:keepNext/>
+        <w:spacing w:after="120"/>
+      </w:pPr>
+      <w:r>
+        <w:rPr>
+          <w:b/>
+          <w:bCs/>
+          <w:color w:val="6A6A6A"/>
+          <w:sz w:val="18"/>
+          <w:szCs w:val="18"/>
+        </w:rPr>
+        <w:t xml:space="preserve">Syntax:  </w:t>
+      </w:r>
+      <w:r>
+        <w:rPr>
+          <w:rFonts w:ascii="Consolas" w:cs="Consolas" w:eastAsia="Consolas" w:hAnsi="Consolas"/>
+          <w:color w:val="335577"/>
+          <w:sz w:val="19"/>
+          <w:szCs w:val="19"/>
+        </w:rPr>
+        <w:t xml:space="preserve">MOUSE_VISIBLE(an)   MOUSE_LOCK(an)</w:t>
+      </w:r>
+    </w:p>
+    <w:p>
+      <w:pPr>
+        <w:spacing w:after="180" w:line="312" w:lineRule="auto"/>
+      </w:pPr>
+      <w:r>
+        <w:rPr>
+          <w:sz w:val="22"/>
+          <w:szCs w:val="22"/>
+        </w:rPr>
+        <w:t xml:space="preserve">MOUSE_VISIBLE zeigt/versteckt den System-Cursor (verstecken, wenn du ein eigenes Cursor-Sprite zeichnest). MOUSE_LOCK fängt den Cursor im Fenster ein – für Maus-Kamerasteuerung in 3D/Ego-Perspektive.</w:t>
+      </w:r>
+    </w:p>
+    <w:p>
+      <w:pPr>
+        <w:keepNext/>
+        <w:spacing w:after="30" w:before="120"/>
+      </w:pPr>
+      <w:r>
+        <w:rPr>
+          <w:b/>
+          <w:bCs/>
+          <w:i/>
+          <w:iCs/>
+          <w:color w:val="6A6A6A"/>
+          <w:sz w:val="18"/>
+          <w:szCs w:val="18"/>
+        </w:rPr>
+        <w:t xml:space="preserve">Beispiel</w:t>
+      </w:r>
+    </w:p>
+    <w:p>
+      <w:pPr>
+        <w:keepLines/>
+        <w:pBdr>
+          <w:left w:val="single" w:color="1B6CA8" w:sz="18" w:space="6"/>
+        </w:pBdr>
+        <w:shd w:fill="F4F4F4" w:val="clear"/>
+        <w:spacing w:after="200" w:before="100" w:line="264" w:lineRule="auto"/>
+        <w:ind w:left="140"/>
+      </w:pPr>
+      <w:r>
+        <w:rPr>
+          <w:rFonts w:ascii="Consolas" w:cs="Consolas" w:eastAsia="Consolas" w:hAnsi="Consolas"/>
+          <w:sz w:val="19"/>
+          <w:szCs w:val="19"/>
+        </w:rPr>
+        <w:t xml:space="preserve">MOUSE_VISIBLE(FALSE)    ' eigenen Cursor zeichnen</w:t>
+      </w:r>
+    </w:p>
+    <w:p>
+      <w:pPr>
+        <w:pStyle w:val="Heading2"/>
+        <w:keepNext/>
+        <w:keepLines/>
+        <w:spacing w:after="120" w:before="280"/>
+      </w:pPr>
+      <w:r>
+        <w:t xml:space="preserve">Komfortabel: das input-Modul</w:t>
+      </w:r>
+    </w:p>
+    <w:p>
+      <w:pPr>
+        <w:spacing w:after="180" w:line="312" w:lineRule="auto"/>
+      </w:pPr>
+      <w:r>
+        <w:rPr>
+          <w:sz w:val="22"/>
+          <w:szCs w:val="22"/>
+        </w:rPr>
+        <w:t xml:space="preserve">Tasten direkt abzufragen funktioniert, hat aber zwei Schwächen: Die Steuerung ist fest verdrahtet (kein Umbelegen möglich), und „genau einmal beim Drücken“ musst du selbst basteln. Das Modul input löst beides: Du bindest Tasten an benannte Aktionen ("springen", "links") und fragst diese Aktionen ab. Mehrere Tasten pro Aktion sind erlaubt (Pfeiltaste UND WASD).</w:t>
+      </w:r>
+    </w:p>
+    <w:p>
+      <w:pPr>
+        <w:spacing w:after="180" w:line="312" w:lineRule="auto"/>
+      </w:pPr>
+      <w:r>
+        <w:rPr>
+          <w:sz w:val="22"/>
+          <w:szCs w:val="22"/>
+        </w:rPr>
+        <w:t xml:space="preserve">Wichtig: Einmal pro Frame ruft INPUT_UPDATE() auf – das macht die Edge-Erkennung (PRESSED/RELEASED) erst möglich.</w:t>
+      </w:r>
+    </w:p>
+    <w:p>
+      <w:pPr>
+        <w:keepNext/>
+        <w:keepLines/>
+        <w:pBdr>
+          <w:bottom w:val="single" w:color="DDD0C0" w:sz="4" w:space="2"/>
+        </w:pBdr>
+        <w:spacing w:after="40" w:before="360"/>
+      </w:pPr>
+      <w:r>
+        <w:rPr>
+          <w:rFonts w:ascii="Consolas" w:cs="Consolas" w:eastAsia="Consolas" w:hAnsi="Consolas"/>
+          <w:b/>
+          <w:bCs/>
+          <w:color w:val="9A3412"/>
+          <w:sz w:val="24"/>
+          <w:szCs w:val="24"/>
+        </w:rPr>
+        <w:t xml:space="preserve">INPUT_BIND · INPUT_UPDATE</w:t>
+      </w:r>
+    </w:p>
+    <w:p>
+      <w:pPr>
+        <w:keepNext/>
+        <w:spacing w:after="120"/>
+      </w:pPr>
+      <w:r>
+        <w:rPr>
+          <w:b/>
+          <w:bCs/>
+          <w:color w:val="6A6A6A"/>
+          <w:sz w:val="18"/>
+          <w:szCs w:val="18"/>
+        </w:rPr>
+        <w:t xml:space="preserve">Syntax:  </w:t>
+      </w:r>
+      <w:r>
+        <w:rPr>
+          <w:rFonts w:ascii="Consolas" w:cs="Consolas" w:eastAsia="Consolas" w:hAnsi="Consolas"/>
+          <w:color w:val="335577"/>
+          <w:sz w:val="19"/>
+          <w:szCs w:val="19"/>
+        </w:rPr>
+        <w:t xml:space="preserve">INPUT_BIND(aktion$, taste1[, taste2, ...])   INPUT_UPDATE()</w:t>
+      </w:r>
+    </w:p>
+    <w:p>
+      <w:pPr>
+        <w:spacing w:after="180" w:line="312" w:lineRule="auto"/>
+      </w:pPr>
+      <w:r>
+        <w:rPr>
+          <w:sz w:val="22"/>
+          <w:szCs w:val="22"/>
+        </w:rPr>
+        <w:t xml:space="preserve">INPUT_BIND verbindet eine Aktion mit einer oder mehreren Tasten (einmal beim Start). INPUT_UPDATE liest pro Frame den aktuellen Tastenzustand ein – Pflicht am Anfang des Game-Loops.</w:t>
+      </w:r>
+    </w:p>
+    <w:p>
+      <w:pPr>
+        <w:keepNext/>
+        <w:spacing w:after="30" w:before="120"/>
+      </w:pPr>
+      <w:r>
+        <w:rPr>
+          <w:b/>
+          <w:bCs/>
+          <w:i/>
+          <w:iCs/>
+          <w:color w:val="6A6A6A"/>
+          <w:sz w:val="18"/>
+          <w:szCs w:val="18"/>
+        </w:rPr>
+        <w:t xml:space="preserve">Beispiel</w:t>
+      </w:r>
+    </w:p>
+    <w:p>
+      <w:pPr>
+        <w:keepLines/>
+        <w:pBdr>
+          <w:left w:val="single" w:color="1B6CA8" w:sz="18" w:space="6"/>
+        </w:pBdr>
+        <w:shd w:fill="F4F4F4" w:val="clear"/>
+        <w:spacing w:after="200" w:before="100" w:line="264" w:lineRule="auto"/>
+        <w:ind w:left="140"/>
+      </w:pPr>
+      <w:r>
+        <w:rPr>
+          <w:rFonts w:ascii="Consolas" w:cs="Consolas" w:eastAsia="Consolas" w:hAnsi="Consolas"/>
+          <w:sz w:val="19"/>
+          <w:szCs w:val="19"/>
+        </w:rPr>
+        <w:t xml:space="preserve">IMPORT "input"</w:t>
+      </w:r>
+      <w:r>
+        <w:rPr>
+          <w:rFonts w:ascii="Consolas" w:cs="Consolas" w:eastAsia="Consolas" w:hAnsi="Consolas"/>
+          <w:sz w:val="19"/>
+          <w:szCs w:val="19"/>
+        </w:rPr>
+        <w:br/>
+        <w:t xml:space="preserve">INPUT_BIND("links",     KEY_LEFT,  KEY_A)</w:t>
+      </w:r>
+      <w:r>
+        <w:rPr>
+          <w:rFonts w:ascii="Consolas" w:cs="Consolas" w:eastAsia="Consolas" w:hAnsi="Consolas"/>
+          <w:sz w:val="19"/>
+          <w:szCs w:val="19"/>
+        </w:rPr>
+        <w:br/>
+        <w:t xml:space="preserve">INPUT_BIND("springen",  KEY_SPACE, KEY_W)</w:t>
+      </w:r>
+      <w:r>
+        <w:rPr>
+          <w:rFonts w:ascii="Consolas" w:cs="Consolas" w:eastAsia="Consolas" w:hAnsi="Consolas"/>
+          <w:sz w:val="19"/>
+          <w:szCs w:val="19"/>
+        </w:rPr>
+        <w:br/>
+        <w:t xml:space="preserve"/>
+      </w:r>
+      <w:r>
+        <w:rPr>
+          <w:rFonts w:ascii="Consolas" w:cs="Consolas" w:eastAsia="Consolas" w:hAnsi="Consolas"/>
+          <w:sz w:val="19"/>
+          <w:szCs w:val="19"/>
+        </w:rPr>
+        <w:br/>
+        <w:t xml:space="preserve">WHILE NOT QUITREQUESTED()</w:t>
+      </w:r>
+      <w:r>
+        <w:rPr>
+          <w:rFonts w:ascii="Consolas" w:cs="Consolas" w:eastAsia="Consolas" w:hAnsi="Consolas"/>
+          <w:sz w:val="19"/>
+          <w:szCs w:val="19"/>
+        </w:rPr>
+        <w:br/>
+        <w:t xml:space="preserve">    INPUT_UPDATE()       ' jeden Frame zuerst</w:t>
+      </w:r>
+      <w:r>
+        <w:rPr>
+          <w:rFonts w:ascii="Consolas" w:cs="Consolas" w:eastAsia="Consolas" w:hAnsi="Consolas"/>
+          <w:sz w:val="19"/>
+          <w:szCs w:val="19"/>
+        </w:rPr>
+        <w:br/>
+        <w:t xml:space="preserve">    ' ... abfragen ...</w:t>
+      </w:r>
+      <w:r>
+        <w:rPr>
+          <w:rFonts w:ascii="Consolas" w:cs="Consolas" w:eastAsia="Consolas" w:hAnsi="Consolas"/>
+          <w:sz w:val="19"/>
+          <w:szCs w:val="19"/>
+        </w:rPr>
+        <w:br/>
+        <w:t xml:space="preserve">    FLIP()</w:t>
+      </w:r>
+      <w:r>
+        <w:rPr>
+          <w:rFonts w:ascii="Consolas" w:cs="Consolas" w:eastAsia="Consolas" w:hAnsi="Consolas"/>
+          <w:sz w:val="19"/>
+          <w:szCs w:val="19"/>
+        </w:rPr>
+        <w:br/>
+        <w:t xml:space="preserve">WEND</w:t>
+      </w:r>
+    </w:p>
+    <w:p>
+      <w:pPr>
+        <w:keepNext/>
+        <w:keepLines/>
+        <w:pBdr>
+          <w:bottom w:val="single" w:color="DDD0C0" w:sz="4" w:space="2"/>
+        </w:pBdr>
+        <w:spacing w:after="40" w:before="360"/>
+      </w:pPr>
+      <w:r>
+        <w:rPr>
+          <w:rFonts w:ascii="Consolas" w:cs="Consolas" w:eastAsia="Consolas" w:hAnsi="Consolas"/>
+          <w:b/>
+          <w:bCs/>
+          <w:color w:val="9A3412"/>
+          <w:sz w:val="24"/>
+          <w:szCs w:val="24"/>
+        </w:rPr>
+        <w:t xml:space="preserve">INPUT_HELD · INPUT_PRESSED · INPUT_RELEASED</w:t>
+      </w:r>
+    </w:p>
+    <w:p>
+      <w:pPr>
+        <w:keepNext/>
+        <w:spacing w:after="120"/>
+      </w:pPr>
+      <w:r>
+        <w:rPr>
+          <w:b/>
+          <w:bCs/>
+          <w:color w:val="6A6A6A"/>
+          <w:sz w:val="18"/>
+          <w:szCs w:val="18"/>
+        </w:rPr>
+        <w:t xml:space="preserve">Syntax:  </w:t>
+      </w:r>
+      <w:r>
+        <w:rPr>
+          <w:rFonts w:ascii="Consolas" w:cs="Consolas" w:eastAsia="Consolas" w:hAnsi="Consolas"/>
+          <w:color w:val="335577"/>
+          <w:sz w:val="19"/>
+          <w:szCs w:val="19"/>
+        </w:rPr>
+        <w:t xml:space="preserve">INPUT_HELD(aktion$)   INPUT_PRESSED(aktion$)   INPUT_RELEASED(aktion$)</w:t>
+      </w:r>
+    </w:p>
+    <w:p>
+      <w:pPr>
+        <w:spacing w:after="180" w:line="312" w:lineRule="auto"/>
+      </w:pPr>
+      <w:r>
+        <w:rPr>
+          <w:sz w:val="22"/>
+          <w:szCs w:val="22"/>
+        </w:rPr>
+        <w:t xml:space="preserve">INPUT_HELD ist TRUE, solange eine gebundene Taste gehalten wird (für Bewegung). INPUT_PRESSED ist nur in dem einen Frame TRUE, in dem die Taste neu gedrückt wird (für Sprung, Menü). INPUT_RELEASED feuert beim Loslassen.</w:t>
+      </w:r>
+    </w:p>
+    <w:p>
+      <w:pPr>
+        <w:keepNext/>
+        <w:spacing w:after="30" w:before="120"/>
+      </w:pPr>
+      <w:r>
+        <w:rPr>
+          <w:b/>
+          <w:bCs/>
+          <w:i/>
+          <w:iCs/>
+          <w:color w:val="6A6A6A"/>
+          <w:sz w:val="18"/>
+          <w:szCs w:val="18"/>
+        </w:rPr>
+        <w:t xml:space="preserve">Beispiel</w:t>
+      </w:r>
+    </w:p>
+    <w:p>
+      <w:pPr>
+        <w:keepLines/>
+        <w:pBdr>
+          <w:left w:val="single" w:color="1B6CA8" w:sz="18" w:space="6"/>
+        </w:pBdr>
+        <w:shd w:fill="F4F4F4" w:val="clear"/>
+        <w:spacing w:after="200" w:before="100" w:line="264" w:lineRule="auto"/>
+        <w:ind w:left="140"/>
+      </w:pPr>
+      <w:r>
+        <w:rPr>
+          <w:rFonts w:ascii="Consolas" w:cs="Consolas" w:eastAsia="Consolas" w:hAnsi="Consolas"/>
+          <w:sz w:val="19"/>
+          <w:szCs w:val="19"/>
+        </w:rPr>
+        <w:t xml:space="preserve">IF INPUT_HELD("links") THEN px = px - 2</w:t>
+      </w:r>
+      <w:r>
+        <w:rPr>
+          <w:rFonts w:ascii="Consolas" w:cs="Consolas" w:eastAsia="Consolas" w:hAnsi="Consolas"/>
+          <w:sz w:val="19"/>
+          <w:szCs w:val="19"/>
+        </w:rPr>
+        <w:br/>
+        <w:t xml:space="preserve">IF INPUT_PRESSED("springen") THEN ' genau einmal</w:t>
+      </w:r>
+    </w:p>
+    <w:p>
+      <w:pPr>
+        <w:keepNext/>
+        <w:keepLines/>
+        <w:pBdr>
+          <w:bottom w:val="single" w:color="DDD0C0" w:sz="4" w:space="2"/>
+        </w:pBdr>
+        <w:spacing w:after="40" w:before="360"/>
+      </w:pPr>
+      <w:r>
+        <w:rPr>
+          <w:rFonts w:ascii="Consolas" w:cs="Consolas" w:eastAsia="Consolas" w:hAnsi="Consolas"/>
+          <w:b/>
+          <w:bCs/>
+          <w:color w:val="9A3412"/>
+          <w:sz w:val="24"/>
+          <w:szCs w:val="24"/>
+        </w:rPr>
+        <w:t xml:space="preserve">INPUT_AXIS</w:t>
+      </w:r>
+    </w:p>
+    <w:p>
+      <w:pPr>
+        <w:keepNext/>
+        <w:spacing w:after="120"/>
+      </w:pPr>
+      <w:r>
+        <w:rPr>
+          <w:b/>
+          <w:bCs/>
+          <w:color w:val="6A6A6A"/>
+          <w:sz w:val="18"/>
+          <w:szCs w:val="18"/>
+        </w:rPr>
+        <w:t xml:space="preserve">Syntax:  </w:t>
+      </w:r>
+      <w:r>
+        <w:rPr>
+          <w:rFonts w:ascii="Consolas" w:cs="Consolas" w:eastAsia="Consolas" w:hAnsi="Consolas"/>
+          <w:color w:val="335577"/>
+          <w:sz w:val="19"/>
+          <w:szCs w:val="19"/>
+        </w:rPr>
+        <w:t xml:space="preserve">INPUT_AXIS(negativ$, positiv$)</w:t>
+      </w:r>
+    </w:p>
+    <w:p>
+      <w:pPr>
+        <w:spacing w:after="180" w:line="312" w:lineRule="auto"/>
+      </w:pPr>
+      <w:r>
+        <w:rPr>
+          <w:sz w:val="22"/>
+          <w:szCs w:val="22"/>
+        </w:rPr>
+        <w:t xml:space="preserve">Fasst zwei gegensätzliche Aktionen zu einer Achse zusammen und liefert -1, 0 oder +1. Sehr praktisch für Links/Rechts- oder Hoch/Runter-Bewegung in einer Zeile.</w:t>
+      </w:r>
+    </w:p>
+    <w:p>
+      <w:pPr>
+        <w:keepNext/>
+        <w:spacing w:after="30" w:before="120"/>
+      </w:pPr>
+      <w:r>
+        <w:rPr>
+          <w:b/>
+          <w:bCs/>
+          <w:i/>
+          <w:iCs/>
+          <w:color w:val="6A6A6A"/>
+          <w:sz w:val="18"/>
+          <w:szCs w:val="18"/>
+        </w:rPr>
+        <w:t xml:space="preserve">Beispiel</w:t>
+      </w:r>
+    </w:p>
+    <w:p>
+      <w:pPr>
+        <w:keepLines/>
+        <w:pBdr>
+          <w:left w:val="single" w:color="1B6CA8" w:sz="18" w:space="6"/>
+        </w:pBdr>
+        <w:shd w:fill="F4F4F4" w:val="clear"/>
+        <w:spacing w:after="200" w:before="100" w:line="264" w:lineRule="auto"/>
+        <w:ind w:left="140"/>
+      </w:pPr>
+      <w:r>
+        <w:rPr>
+          <w:rFonts w:ascii="Consolas" w:cs="Consolas" w:eastAsia="Consolas" w:hAnsi="Consolas"/>
+          <w:sz w:val="19"/>
+          <w:szCs w:val="19"/>
+        </w:rPr>
+        <w:t xml:space="preserve">DIM dx AS INTEGER</w:t>
+      </w:r>
+      <w:r>
+        <w:rPr>
+          <w:rFonts w:ascii="Consolas" w:cs="Consolas" w:eastAsia="Consolas" w:hAnsi="Consolas"/>
+          <w:sz w:val="19"/>
+          <w:szCs w:val="19"/>
+        </w:rPr>
+        <w:br/>
+        <w:t xml:space="preserve">dx = INPUT_AXIS("links", "rechts")   ' -1, 0 oder +1</w:t>
+      </w:r>
+      <w:r>
+        <w:rPr>
+          <w:rFonts w:ascii="Consolas" w:cs="Consolas" w:eastAsia="Consolas" w:hAnsi="Consolas"/>
+          <w:sz w:val="19"/>
+          <w:szCs w:val="19"/>
+        </w:rPr>
+        <w:br/>
+        <w:t xml:space="preserve">px = px + dx * 2</w:t>
+      </w:r>
+    </w:p>
+    <w:p>
+      <w:pPr>
+        <w:spacing w:before="60"/>
+      </w:pPr>
+    </w:p>
+    <w:tbl>
+      <w:tblPr>
+        <w:tblW w:type="dxa" w:w="9360"/>
+        <w:tblBorders>
+          <w:top w:val="single" w:color="auto" w:sz="4"/>
+          <w:left w:val="single" w:color="auto" w:sz="4"/>
+          <w:bottom w:val="single" w:color="auto" w:sz="4"/>
+          <w:right w:val="single" w:color="auto" w:sz="4"/>
+          <w:insideH w:val="single" w:color="auto" w:sz="4"/>
+          <w:insideV w:val="single" w:color="auto" w:sz="4"/>
+        </w:tblBorders>
+      </w:tblPr>
+      <w:tblGrid>
+        <w:gridCol w:w="9360"/>
+      </w:tblGrid>
+      <w:tr>
+        <w:trPr>
+          <w:cantSplit/>
+        </w:trPr>
+        <w:tc>
+          <w:tcPr>
+            <w:tcW w:type="dxa" w:w="9360"/>
+            <w:tcBorders>
+              <w:top w:val="single" w:color="9CC8E6" w:sz="6"/>
+              <w:left w:val="single" w:color="9CC8E6" w:sz="6"/>
+              <w:bottom w:val="single" w:color="9CC8E6" w:sz="6"/>
+              <w:right w:val="single" w:color="9CC8E6" w:sz="6"/>
+            </w:tcBorders>
+            <w:shd w:fill="E7F2FA" w:val="clear"/>
+            <w:tcMar>
+              <w:top w:type="dxa" w:w="140"/>
+              <w:left w:type="dxa" w:w="180"/>
+              <w:bottom w:type="dxa" w:w="140"/>
+              <w:right w:type="dxa" w:w="180"/>
+            </w:tcMar>
+          </w:tcPr>
+          <w:p>
+            <w:pPr>
+              <w:spacing w:after="40"/>
+            </w:pPr>
+            <w:r>
+              <w:rPr>
+                <w:b/>
+                <w:bCs/>
+                <w:color w:val="1B6CA8"/>
+                <w:sz w:val="22"/>
+                <w:szCs w:val="22"/>
+              </w:rPr>
+              <w:t xml:space="preserve">Gamepad</w:t>
+            </w:r>
+          </w:p>
+          <w:p>
+            <w:pPr>
+              <w:spacing w:after="0" w:line="312" w:lineRule="auto"/>
+            </w:pPr>
+            <w:r>
+              <w:rPr>
+                <w:sz w:val="22"/>
+                <w:szCs w:val="22"/>
+              </w:rPr>
+              <w:t xml:space="preserve">Das input-Modul unterstützt auch Gamepads: Binde Aktionen an Knopf-Codes wie JOY_BUTTON_A oder JOY_DPAD_LEFT, oder lies einen Analogstick mit INPUT_JOY_AXIS(slot, "left_x"). So funktioniert dieselbe Spiellogik mit Tastatur UND Controller, ohne den Code zu ändern.</w:t>
             </w:r>
           </w:p>
         </w:tc>

</xml_diff>

<commit_message>
docs(buch): Kap 41 -- Wicklungs-Warnkasten entfernt (Engine-Fix 5271bb9)
Nach dem gbrt-Fix (TRIANGLE/POLYGON fuellen wicklungsunabhaengig) ist die
CCW-Warnung ueberholt. Ersetzt durch einen Hinweis, dass die Punkt-Reihenfolge
egal ist. Mit neu gebautem gbrt verifiziert (CW-Dreieck rendert jetzt).

Co-Authored-By: Claude Opus 4.8 (1M context) <noreply@anthropic.com>
</commit_message>
<xml_diff>
--- a/buch-referenz/buch/GameBasic-Lehrbuch.docx
+++ b/buch-referenz/buch/GameBasic-Lehrbuch.docx
@@ -1082,7 +1082,7 @@
           <w:sz w:val="22"/>
           <w:szCs w:val="22"/>
         </w:rPr>
-        <w:t xml:space="preserve">	136</w:t>
+        <w:t xml:space="preserve">	135</w:t>
       </w:r>
     </w:p>
     <w:p>
@@ -1109,7 +1109,7 @@
           <w:sz w:val="22"/>
           <w:szCs w:val="22"/>
         </w:rPr>
-        <w:t xml:space="preserve">	141</w:t>
+        <w:t xml:space="preserve">	140</w:t>
       </w:r>
     </w:p>
     <w:p>
@@ -1136,7 +1136,7 @@
           <w:sz w:val="22"/>
           <w:szCs w:val="22"/>
         </w:rPr>
-        <w:t xml:space="preserve">	145</w:t>
+        <w:t xml:space="preserve">	144</w:t>
       </w:r>
     </w:p>
     <w:p>
@@ -1163,7 +1163,7 @@
           <w:sz w:val="22"/>
           <w:szCs w:val="22"/>
         </w:rPr>
-        <w:t xml:space="preserve">	148</w:t>
+        <w:t xml:space="preserve">	147</w:t>
       </w:r>
     </w:p>
     <w:p>
@@ -45995,12 +45995,12 @@
           <w:tcPr>
             <w:tcW w:type="dxa" w:w="9360"/>
             <w:tcBorders>
-              <w:top w:val="single" w:color="E0A0A0" w:sz="6"/>
-              <w:left w:val="single" w:color="E0A0A0" w:sz="6"/>
-              <w:bottom w:val="single" w:color="E0A0A0" w:sz="6"/>
-              <w:right w:val="single" w:color="E0A0A0" w:sz="6"/>
+              <w:top w:val="single" w:color="E0B96A" w:sz="6"/>
+              <w:left w:val="single" w:color="E0B96A" w:sz="6"/>
+              <w:bottom w:val="single" w:color="E0B96A" w:sz="6"/>
+              <w:right w:val="single" w:color="E0B96A" w:sz="6"/>
             </w:tcBorders>
-            <w:shd w:fill="FBEAEA" w:val="clear"/>
+            <w:shd w:fill="FDF3E0" w:val="clear"/>
             <w:tcMar>
               <w:top w:type="dxa" w:w="140"/>
               <w:left w:type="dxa" w:w="180"/>
@@ -46016,11 +46016,11 @@
               <w:rPr>
                 <w:b/>
                 <w:bCs/>
-                <w:color w:val="B23030"/>
+                <w:color w:val="9A6A1E"/>
                 <w:sz w:val="22"/>
                 <w:szCs w:val="22"/>
               </w:rPr>
-              <w:t xml:space="preserve">Achtung</w:t>
+              <w:t xml:space="preserve">Merke</w:t>
             </w:r>
           </w:p>
           <w:p>
@@ -46032,7 +46032,7 @@
                 <w:sz w:val="22"/>
                 <w:szCs w:val="22"/>
               </w:rPr>
-              <w:t xml:space="preserve">Gefüllte Dreiecke und Polygone erscheinen nur, wenn du die Eckpunkte GEGEN den Uhrzeigersinn angibst (auf dem Bildschirm, wo y nach unten zeigt). Gibst du sie im Uhrzeigersinn an, bleibt die Fläche unsichtbar. Bei Bedarf einfach die Reihenfolge der Punkte umdrehen. (Die Outline-Varianten sind davon nicht betroffen.)</w:t>
+              <w:t xml:space="preserve">Die Reihenfolge der Eckpunkte spielt bei gefüllten Dreiecken und Polygonen keine Rolle – ob im oder gegen den Uhrzeigersinn, die Fläche wird immer gefüllt.</w:t>
             </w:r>
           </w:p>
         </w:tc>

</xml_diff>

<commit_message>
docs(buch): Lehrbuch Kap 46 -- Sound (grafisches Mini-Klavier-Demo)
LOADSOUND/PLAYSOUND/STOPSOUND, PLAYMUSIC (OGG/MP3/.mod/.xm), audio-Modul
AUDIO_TONE/NOISE/SFX, UNLOADSOUND, AUDIO_VOLUME/PAN/BUS_VOLUME (erwaehnt).
Sound nicht abdruckbar -> als grafisches Mini-Klavier (Tasten 1-8 = C-Dur)
gebaut, Screenshot zeigt die Klaviatur. Demo gegen gbrt verifiziert.

Co-Authored-By: Claude Opus 4.8 (1M context) <noreply@anthropic.com>
</commit_message>
<xml_diff>
--- a/buch-referenz/buch/GameBasic-Lehrbuch.docx
+++ b/buch-referenz/buch/GameBasic-Lehrbuch.docx
@@ -1164,6 +1164,33 @@
           <w:szCs w:val="22"/>
         </w:rPr>
         <w:t xml:space="preserve">	147</w:t>
+      </w:r>
+    </w:p>
+    <w:p>
+      <w:pPr>
+        <w:tabs>
+          <w:tab w:val="right" w:pos="9200" w:leader="dot"/>
+        </w:tabs>
+        <w:spacing w:after="20" w:before="0"/>
+        <w:ind w:left="280"/>
+      </w:pPr>
+      <w:r>
+        <w:rPr>
+          <w:b w:val="false"/>
+          <w:bCs w:val="false"/>
+          <w:color w:val="222222"/>
+          <w:sz w:val="22"/>
+          <w:szCs w:val="22"/>
+        </w:rPr>
+        <w:t xml:space="preserve">Sound</w:t>
+      </w:r>
+      <w:r>
+        <w:rPr>
+          <w:color w:val="555555"/>
+          <w:sz w:val="22"/>
+          <w:szCs w:val="22"/>
+        </w:rPr>
+        <w:t xml:space="preserve">	151</w:t>
       </w:r>
     </w:p>
     <w:p>
@@ -51547,6 +51574,982 @@
                 <w:szCs w:val="22"/>
               </w:rPr>
               <w:t xml:space="preserve">Das input-Modul unterstützt auch Gamepads: Binde Aktionen an Knopf-Codes wie JOY_BUTTON_A oder JOY_DPAD_LEFT, oder lies einen Analogstick mit INPUT_JOY_AXIS(slot, "left_x"). So funktioniert dieselbe Spiellogik mit Tastatur UND Controller, ohne den Code zu ändern.</w:t>
+            </w:r>
+          </w:p>
+        </w:tc>
+      </w:tr>
+    </w:tbl>
+    <w:p>
+      <w:pPr>
+        <w:spacing w:after="160"/>
+      </w:pPr>
+    </w:p>
+    <w:p>
+      <w:pPr>
+        <w:pStyle w:val="Heading1"/>
+        <w:keepNext/>
+        <w:keepLines/>
+        <w:pageBreakBefore/>
+        <w:pBdr>
+          <w:bottom w:val="single" w:color="1B6CA8" w:sz="12" w:space="4"/>
+        </w:pBdr>
+        <w:spacing w:after="160" w:before="0"/>
+      </w:pPr>
+      <w:r>
+        <w:t xml:space="preserve">Sound</w:t>
+      </w:r>
+    </w:p>
+    <w:p>
+      <w:pPr>
+        <w:spacing w:after="180" w:line="312" w:lineRule="auto"/>
+      </w:pPr>
+      <w:r>
+        <w:rPr>
+          <w:sz w:val="22"/>
+          <w:szCs w:val="22"/>
+        </w:rPr>
+        <w:t xml:space="preserve">Klang macht ein Spiel erst rund: ein Münz-Ploppen, ein Laser-Zischen, treibende Hintergrundmusik. GameBasic spielt kurze Soundeffekte und längere Musikstücke ab und kann Töne sogar selbst erzeugen, ohne dass du eine Audiodatei mitliefern musst. Klang kann man im Buch natürlich nicht abdrucken – aber man kann zeigen, was man dazu baut: Dieses Kapitel entwickelt ein kleines, anklickbares Klavier.</w:t>
+      </w:r>
+    </w:p>
+    <w:p>
+      <w:pPr>
+        <w:keepNext/>
+        <w:spacing w:after="40" w:before="160"/>
+        <w:jc w:val="center"/>
+      </w:pPr>
+      <w:r>
+        <w:drawing>
+          <wp:inline distT="0" distB="0" distL="0" distR="0">
+            <wp:extent cx="4572000" cy="3048000"/>
+            <wp:effectExtent t="0" r="0" b="0" l="0"/>
+            <wp:docPr id="1" name="46_sound.png" descr="Das Mini-Klavier aus diesem Kapitel: Acht Tasten (1 bis 8) spielen die Töne der C-Dur-Tonleiter." title="Das Mini-Klavier aus diesem Kapitel: Acht Tasten (1 bis 8) spielen die Töne der C-Dur-Tonleiter."/>
+            <wp:cNvGraphicFramePr>
+              <a:graphicFrameLocks xmlns:a="http://schemas.openxmlformats.org/drawingml/2006/main" noChangeAspect="1"/>
+            </wp:cNvGraphicFramePr>
+            <a:graphic xmlns:a="http://schemas.openxmlformats.org/drawingml/2006/main">
+              <a:graphicData uri="http://schemas.openxmlformats.org/drawingml/2006/picture">
+                <pic:pic xmlns:pic="http://schemas.openxmlformats.org/drawingml/2006/picture">
+                  <pic:nvPicPr>
+                    <pic:cNvPr id="0" name="" descr=""/>
+                    <pic:cNvPicPr>
+                      <a:picLocks noChangeAspect="1" noChangeArrowheads="1"/>
+                    </pic:cNvPicPr>
+                  </pic:nvPicPr>
+                  <pic:blipFill>
+                    <a:blip r:embed="rId15" cstate="none"/>
+                    <a:srcRect/>
+                    <a:stretch>
+                      <a:fillRect/>
+                    </a:stretch>
+                  </pic:blipFill>
+                  <pic:spPr bwMode="auto">
+                    <a:xfrm>
+                      <a:off x="0" y="0"/>
+                      <a:ext cx="4572000" cy="3048000"/>
+                    </a:xfrm>
+                    <a:prstGeom prst="rect">
+                      <a:avLst/>
+                    </a:prstGeom>
+                  </pic:spPr>
+                </pic:pic>
+              </a:graphicData>
+            </a:graphic>
+          </wp:inline>
+        </w:drawing>
+      </w:r>
+    </w:p>
+    <w:p>
+      <w:pPr>
+        <w:spacing w:after="200"/>
+        <w:jc w:val="center"/>
+      </w:pPr>
+      <w:r>
+        <w:rPr>
+          <w:i/>
+          <w:iCs/>
+          <w:color w:val="6A6A6A"/>
+          <w:sz w:val="18"/>
+          <w:szCs w:val="18"/>
+        </w:rPr>
+        <w:t xml:space="preserve">Das Mini-Klavier aus diesem Kapitel: Acht Tasten (1 bis 8) spielen die Töne der C-Dur-Tonleiter.</w:t>
+      </w:r>
+    </w:p>
+    <w:p>
+      <w:pPr>
+        <w:pStyle w:val="Heading2"/>
+        <w:keepNext/>
+        <w:keepLines/>
+        <w:spacing w:after="120" w:before="280"/>
+      </w:pPr>
+      <w:r>
+        <w:t xml:space="preserve">Sounddateien laden &amp; abspielen</w:t>
+      </w:r>
+    </w:p>
+    <w:p>
+      <w:pPr>
+        <w:keepNext/>
+        <w:keepLines/>
+        <w:pBdr>
+          <w:bottom w:val="single" w:color="DDD0C0" w:sz="4" w:space="2"/>
+        </w:pBdr>
+        <w:spacing w:after="40" w:before="360"/>
+      </w:pPr>
+      <w:r>
+        <w:rPr>
+          <w:rFonts w:ascii="Consolas" w:cs="Consolas" w:eastAsia="Consolas" w:hAnsi="Consolas"/>
+          <w:b/>
+          <w:bCs/>
+          <w:color w:val="9A3412"/>
+          <w:sz w:val="24"/>
+          <w:szCs w:val="24"/>
+        </w:rPr>
+        <w:t xml:space="preserve">LOADSOUND · PLAYSOUND · STOPSOUND</w:t>
+      </w:r>
+    </w:p>
+    <w:p>
+      <w:pPr>
+        <w:keepNext/>
+        <w:spacing w:after="120"/>
+      </w:pPr>
+      <w:r>
+        <w:rPr>
+          <w:b/>
+          <w:bCs/>
+          <w:color w:val="6A6A6A"/>
+          <w:sz w:val="18"/>
+          <w:szCs w:val="18"/>
+        </w:rPr>
+        <w:t xml:space="preserve">Syntax:  </w:t>
+      </w:r>
+      <w:r>
+        <w:rPr>
+          <w:rFonts w:ascii="Consolas" w:cs="Consolas" w:eastAsia="Consolas" w:hAnsi="Consolas"/>
+          <w:color w:val="335577"/>
+          <w:sz w:val="19"/>
+          <w:szCs w:val="19"/>
+        </w:rPr>
+        <w:t xml:space="preserve">LOADSOUND(pfad$)   PLAYSOUND(sound[, loops[, lautstärke]])   STOPSOUND(sound)</w:t>
+      </w:r>
+    </w:p>
+    <w:p>
+      <w:pPr>
+        <w:spacing w:after="180" w:line="312" w:lineRule="auto"/>
+      </w:pPr>
+      <w:r>
+        <w:rPr>
+          <w:sz w:val="22"/>
+          <w:szCs w:val="22"/>
+        </w:rPr>
+        <w:t xml:space="preserve">LOADSOUND lädt einen kurzen Effekt (WAV/OGG) und liefert ein SOUND. PLAYSOUND spielt ihn ab – mit optionaler Wiederholungszahl (loops, 0 = einmal) und Lautstärke (0.0–1.0). STOPSOUND hält ihn an. Lade Sounds einmalig vor dem Game-Loop.</w:t>
+      </w:r>
+    </w:p>
+    <w:p>
+      <w:pPr>
+        <w:keepNext/>
+        <w:spacing w:after="30" w:before="120"/>
+      </w:pPr>
+      <w:r>
+        <w:rPr>
+          <w:b/>
+          <w:bCs/>
+          <w:i/>
+          <w:iCs/>
+          <w:color w:val="6A6A6A"/>
+          <w:sz w:val="18"/>
+          <w:szCs w:val="18"/>
+        </w:rPr>
+        <w:t xml:space="preserve">Beispiel</w:t>
+      </w:r>
+    </w:p>
+    <w:p>
+      <w:pPr>
+        <w:keepLines/>
+        <w:pBdr>
+          <w:left w:val="single" w:color="1B6CA8" w:sz="18" w:space="6"/>
+        </w:pBdr>
+        <w:shd w:fill="F4F4F4" w:val="clear"/>
+        <w:spacing w:after="200" w:before="100" w:line="264" w:lineRule="auto"/>
+        <w:ind w:left="140"/>
+      </w:pPr>
+      <w:r>
+        <w:rPr>
+          <w:rFonts w:ascii="Consolas" w:cs="Consolas" w:eastAsia="Consolas" w:hAnsi="Consolas"/>
+          <w:sz w:val="19"/>
+          <w:szCs w:val="19"/>
+        </w:rPr>
+        <w:t xml:space="preserve">DIM muenze AS SOUND</w:t>
+      </w:r>
+      <w:r>
+        <w:rPr>
+          <w:rFonts w:ascii="Consolas" w:cs="Consolas" w:eastAsia="Consolas" w:hAnsi="Consolas"/>
+          <w:sz w:val="19"/>
+          <w:szCs w:val="19"/>
+        </w:rPr>
+        <w:br/>
+        <w:t xml:space="preserve">muenze = LOADSOUND("assets/coin.wav")</w:t>
+      </w:r>
+      <w:r>
+        <w:rPr>
+          <w:rFonts w:ascii="Consolas" w:cs="Consolas" w:eastAsia="Consolas" w:hAnsi="Consolas"/>
+          <w:sz w:val="19"/>
+          <w:szCs w:val="19"/>
+        </w:rPr>
+        <w:br/>
+        <w:t xml:space="preserve"/>
+      </w:r>
+      <w:r>
+        <w:rPr>
+          <w:rFonts w:ascii="Consolas" w:cs="Consolas" w:eastAsia="Consolas" w:hAnsi="Consolas"/>
+          <w:sz w:val="19"/>
+          <w:szCs w:val="19"/>
+        </w:rPr>
+        <w:br/>
+        <w:t xml:space="preserve">IF eingesammelt THEN PLAYSOUND(muenze)</w:t>
+      </w:r>
+    </w:p>
+    <w:p>
+      <w:pPr>
+        <w:keepNext/>
+        <w:keepLines/>
+        <w:pBdr>
+          <w:bottom w:val="single" w:color="DDD0C0" w:sz="4" w:space="2"/>
+        </w:pBdr>
+        <w:spacing w:after="40" w:before="360"/>
+      </w:pPr>
+      <w:r>
+        <w:rPr>
+          <w:rFonts w:ascii="Consolas" w:cs="Consolas" w:eastAsia="Consolas" w:hAnsi="Consolas"/>
+          <w:b/>
+          <w:bCs/>
+          <w:color w:val="9A3412"/>
+          <w:sz w:val="24"/>
+          <w:szCs w:val="24"/>
+        </w:rPr>
+        <w:t xml:space="preserve">PLAYMUSIC</w:t>
+      </w:r>
+    </w:p>
+    <w:p>
+      <w:pPr>
+        <w:keepNext/>
+        <w:spacing w:after="120"/>
+      </w:pPr>
+      <w:r>
+        <w:rPr>
+          <w:b/>
+          <w:bCs/>
+          <w:color w:val="6A6A6A"/>
+          <w:sz w:val="18"/>
+          <w:szCs w:val="18"/>
+        </w:rPr>
+        <w:t xml:space="preserve">Syntax:  </w:t>
+      </w:r>
+      <w:r>
+        <w:rPr>
+          <w:rFonts w:ascii="Consolas" w:cs="Consolas" w:eastAsia="Consolas" w:hAnsi="Consolas"/>
+          <w:color w:val="335577"/>
+          <w:sz w:val="19"/>
+          <w:szCs w:val="19"/>
+        </w:rPr>
+        <w:t xml:space="preserve">PLAYMUSIC(pfad$[, loops[, lautstärke]])</w:t>
+      </w:r>
+    </w:p>
+    <w:p>
+      <w:pPr>
+        <w:spacing w:after="180" w:line="312" w:lineRule="auto"/>
+      </w:pPr>
+      <w:r>
+        <w:rPr>
+          <w:sz w:val="22"/>
+          <w:szCs w:val="22"/>
+        </w:rPr>
+        <w:t xml:space="preserve">Spielt ein längeres Musikstück, das gestreamt statt komplett geladen wird (OGG/MP3 und sogar Tracker-Module .mod/.xm für echten Retro-Sound). loops = -1 bedeutet Endlosschleife (Standard).</w:t>
+      </w:r>
+    </w:p>
+    <w:p>
+      <w:pPr>
+        <w:keepNext/>
+        <w:spacing w:after="30" w:before="120"/>
+      </w:pPr>
+      <w:r>
+        <w:rPr>
+          <w:b/>
+          <w:bCs/>
+          <w:i/>
+          <w:iCs/>
+          <w:color w:val="6A6A6A"/>
+          <w:sz w:val="18"/>
+          <w:szCs w:val="18"/>
+        </w:rPr>
+        <w:t xml:space="preserve">Beispiel</w:t>
+      </w:r>
+    </w:p>
+    <w:p>
+      <w:pPr>
+        <w:keepLines/>
+        <w:pBdr>
+          <w:left w:val="single" w:color="1B6CA8" w:sz="18" w:space="6"/>
+        </w:pBdr>
+        <w:shd w:fill="F4F4F4" w:val="clear"/>
+        <w:spacing w:after="200" w:before="100" w:line="264" w:lineRule="auto"/>
+        <w:ind w:left="140"/>
+      </w:pPr>
+      <w:r>
+        <w:rPr>
+          <w:rFonts w:ascii="Consolas" w:cs="Consolas" w:eastAsia="Consolas" w:hAnsi="Consolas"/>
+          <w:sz w:val="19"/>
+          <w:szCs w:val="19"/>
+        </w:rPr>
+        <w:t xml:space="preserve">PLAYMUSIC("assets/level1.ogg", -1, 0.7)   ' endlos, 70% laut</w:t>
+      </w:r>
+    </w:p>
+    <w:p>
+      <w:pPr>
+        <w:pStyle w:val="Heading2"/>
+        <w:keepNext/>
+        <w:keepLines/>
+        <w:spacing w:after="120" w:before="280"/>
+      </w:pPr>
+      <w:r>
+        <w:t xml:space="preserve">Töne selbst erzeugen: das audio-Modul</w:t>
+      </w:r>
+    </w:p>
+    <w:p>
+      <w:pPr>
+        <w:spacing w:after="180" w:line="312" w:lineRule="auto"/>
+      </w:pPr>
+      <w:r>
+        <w:rPr>
+          <w:sz w:val="22"/>
+          <w:szCs w:val="22"/>
+        </w:rPr>
+        <w:t xml:space="preserve">Mit dem Modul audio synthetisiert GameBasic Klänge zur Laufzeit – kein einziges Sounddatei nötig. AUDIO_TONE erzeugt einen Ton einer bestimmten Frequenz; das Ergebnis ist ein SOUND, den du wie gewohnt mit PLAYSOUND abspielst. Die Frequenz (in Hertz) bestimmt die Tonhöhe: 440 Hz ist das Kammerton-A.</w:t>
+      </w:r>
+    </w:p>
+    <w:p>
+      <w:pPr>
+        <w:keepNext/>
+        <w:keepLines/>
+        <w:pBdr>
+          <w:bottom w:val="single" w:color="DDD0C0" w:sz="4" w:space="2"/>
+        </w:pBdr>
+        <w:spacing w:after="40" w:before="360"/>
+      </w:pPr>
+      <w:r>
+        <w:rPr>
+          <w:rFonts w:ascii="Consolas" w:cs="Consolas" w:eastAsia="Consolas" w:hAnsi="Consolas"/>
+          <w:b/>
+          <w:bCs/>
+          <w:color w:val="9A3412"/>
+          <w:sz w:val="24"/>
+          <w:szCs w:val="24"/>
+        </w:rPr>
+        <w:t xml:space="preserve">AUDIO_TONE</w:t>
+      </w:r>
+    </w:p>
+    <w:p>
+      <w:pPr>
+        <w:keepNext/>
+        <w:spacing w:after="120"/>
+      </w:pPr>
+      <w:r>
+        <w:rPr>
+          <w:b/>
+          <w:bCs/>
+          <w:color w:val="6A6A6A"/>
+          <w:sz w:val="18"/>
+          <w:szCs w:val="18"/>
+        </w:rPr>
+        <w:t xml:space="preserve">Syntax:  </w:t>
+      </w:r>
+      <w:r>
+        <w:rPr>
+          <w:rFonts w:ascii="Consolas" w:cs="Consolas" w:eastAsia="Consolas" w:hAnsi="Consolas"/>
+          <w:color w:val="335577"/>
+          <w:sz w:val="19"/>
+          <w:szCs w:val="19"/>
+        </w:rPr>
+        <w:t xml:space="preserve">AUDIO_TONE(frequenz, dauer_ms[, wellenform$[, lautstärke]])</w:t>
+      </w:r>
+    </w:p>
+    <w:p>
+      <w:pPr>
+        <w:spacing w:after="180" w:line="312" w:lineRule="auto"/>
+      </w:pPr>
+      <w:r>
+        <w:rPr>
+          <w:sz w:val="22"/>
+          <w:szCs w:val="22"/>
+        </w:rPr>
+        <w:t xml:space="preserve">Erzeugt einen Ton der angegebenen Frequenz (Hz) und Dauer (ms). Die Wellenform ("sine", "square", "saw", "triangle") prägt den Klangcharakter – "square" klingt nach Retro-Spielkonsole. Liefert ein SOUND.</w:t>
+      </w:r>
+    </w:p>
+    <w:p>
+      <w:pPr>
+        <w:keepNext/>
+        <w:spacing w:after="30" w:before="120"/>
+      </w:pPr>
+      <w:r>
+        <w:rPr>
+          <w:b/>
+          <w:bCs/>
+          <w:i/>
+          <w:iCs/>
+          <w:color w:val="6A6A6A"/>
+          <w:sz w:val="18"/>
+          <w:szCs w:val="18"/>
+        </w:rPr>
+        <w:t xml:space="preserve">Beispiel</w:t>
+      </w:r>
+    </w:p>
+    <w:p>
+      <w:pPr>
+        <w:keepLines/>
+        <w:pBdr>
+          <w:left w:val="single" w:color="1B6CA8" w:sz="18" w:space="6"/>
+        </w:pBdr>
+        <w:shd w:fill="F4F4F4" w:val="clear"/>
+        <w:spacing w:after="200" w:before="100" w:line="264" w:lineRule="auto"/>
+        <w:ind w:left="140"/>
+      </w:pPr>
+      <w:r>
+        <w:rPr>
+          <w:rFonts w:ascii="Consolas" w:cs="Consolas" w:eastAsia="Consolas" w:hAnsi="Consolas"/>
+          <w:sz w:val="19"/>
+          <w:szCs w:val="19"/>
+        </w:rPr>
+        <w:t xml:space="preserve">IMPORT "audio"</w:t>
+      </w:r>
+      <w:r>
+        <w:rPr>
+          <w:rFonts w:ascii="Consolas" w:cs="Consolas" w:eastAsia="Consolas" w:hAnsi="Consolas"/>
+          <w:sz w:val="19"/>
+          <w:szCs w:val="19"/>
+        </w:rPr>
+        <w:br/>
+        <w:t xml:space="preserve">PLAYSOUND(AUDIO_TONE(440, 300))            ' A, 0,3 s, Sinuston</w:t>
+      </w:r>
+      <w:r>
+        <w:rPr>
+          <w:rFonts w:ascii="Consolas" w:cs="Consolas" w:eastAsia="Consolas" w:hAnsi="Consolas"/>
+          <w:sz w:val="19"/>
+          <w:szCs w:val="19"/>
+        </w:rPr>
+        <w:br/>
+        <w:t xml:space="preserve">PLAYSOUND(AUDIO_TONE(800, 80, "square", 0.5))   ' kurzer Laser</w:t>
+      </w:r>
+    </w:p>
+    <w:p>
+      <w:pPr>
+        <w:keepNext/>
+        <w:keepLines/>
+        <w:pBdr>
+          <w:bottom w:val="single" w:color="DDD0C0" w:sz="4" w:space="2"/>
+        </w:pBdr>
+        <w:spacing w:after="40" w:before="360"/>
+      </w:pPr>
+      <w:r>
+        <w:rPr>
+          <w:rFonts w:ascii="Consolas" w:cs="Consolas" w:eastAsia="Consolas" w:hAnsi="Consolas"/>
+          <w:b/>
+          <w:bCs/>
+          <w:color w:val="9A3412"/>
+          <w:sz w:val="24"/>
+          <w:szCs w:val="24"/>
+        </w:rPr>
+        <w:t xml:space="preserve">AUDIO_NOISE · AUDIO_SFX</w:t>
+      </w:r>
+    </w:p>
+    <w:p>
+      <w:pPr>
+        <w:keepNext/>
+        <w:spacing w:after="120"/>
+      </w:pPr>
+      <w:r>
+        <w:rPr>
+          <w:b/>
+          <w:bCs/>
+          <w:color w:val="6A6A6A"/>
+          <w:sz w:val="18"/>
+          <w:szCs w:val="18"/>
+        </w:rPr>
+        <w:t xml:space="preserve">Syntax:  </w:t>
+      </w:r>
+      <w:r>
+        <w:rPr>
+          <w:rFonts w:ascii="Consolas" w:cs="Consolas" w:eastAsia="Consolas" w:hAnsi="Consolas"/>
+          <w:color w:val="335577"/>
+          <w:sz w:val="19"/>
+          <w:szCs w:val="19"/>
+        </w:rPr>
+        <w:t xml:space="preserve">AUDIO_NOISE(dauer_ms[, vol])   AUDIO_SFX(...)</w:t>
+      </w:r>
+    </w:p>
+    <w:p>
+      <w:pPr>
+        <w:spacing w:after="180" w:line="312" w:lineRule="auto"/>
+      </w:pPr>
+      <w:r>
+        <w:rPr>
+          <w:sz w:val="22"/>
+          <w:szCs w:val="22"/>
+        </w:rPr>
+        <w:t xml:space="preserve">AUDIO_NOISE erzeugt Rauschen (Explosionen, Schritte, Wind). AUDIO_SFX ist ein vollwertiger Retro-Soundeffekt-Synth (Tonhöhen-Slide, Hüllkurve, Vibrato) – am bequemsten mit dem Editor gbsfx erzeugt, der fertige AUDIO_SFX-Aufrufe ausgibt.</w:t>
+      </w:r>
+    </w:p>
+    <w:p>
+      <w:pPr>
+        <w:keepNext/>
+        <w:spacing w:after="30" w:before="120"/>
+      </w:pPr>
+      <w:r>
+        <w:rPr>
+          <w:b/>
+          <w:bCs/>
+          <w:i/>
+          <w:iCs/>
+          <w:color w:val="6A6A6A"/>
+          <w:sz w:val="18"/>
+          <w:szCs w:val="18"/>
+        </w:rPr>
+        <w:t xml:space="preserve">Beispiel</w:t>
+      </w:r>
+    </w:p>
+    <w:p>
+      <w:pPr>
+        <w:keepLines/>
+        <w:pBdr>
+          <w:left w:val="single" w:color="1B6CA8" w:sz="18" w:space="6"/>
+        </w:pBdr>
+        <w:shd w:fill="F4F4F4" w:val="clear"/>
+        <w:spacing w:after="200" w:before="100" w:line="264" w:lineRule="auto"/>
+        <w:ind w:left="140"/>
+      </w:pPr>
+      <w:r>
+        <w:rPr>
+          <w:rFonts w:ascii="Consolas" w:cs="Consolas" w:eastAsia="Consolas" w:hAnsi="Consolas"/>
+          <w:sz w:val="19"/>
+          <w:szCs w:val="19"/>
+        </w:rPr>
+        <w:t xml:space="preserve">IMPORT "audio"</w:t>
+      </w:r>
+      <w:r>
+        <w:rPr>
+          <w:rFonts w:ascii="Consolas" w:cs="Consolas" w:eastAsia="Consolas" w:hAnsi="Consolas"/>
+          <w:sz w:val="19"/>
+          <w:szCs w:val="19"/>
+        </w:rPr>
+        <w:br/>
+        <w:t xml:space="preserve">PLAYSOUND(AUDIO_NOISE(150))                ' kurzes Rauschen</w:t>
+      </w:r>
+    </w:p>
+    <w:p>
+      <w:pPr>
+        <w:pStyle w:val="Heading2"/>
+        <w:keepNext/>
+        <w:keepLines/>
+        <w:spacing w:after="120" w:before="280"/>
+      </w:pPr>
+      <w:r>
+        <w:t xml:space="preserve">Das Klavier zusammenbauen</w:t>
+      </w:r>
+    </w:p>
+    <w:p>
+      <w:pPr>
+        <w:spacing w:after="180" w:line="312" w:lineRule="auto"/>
+      </w:pPr>
+      <w:r>
+        <w:rPr>
+          <w:sz w:val="22"/>
+          <w:szCs w:val="22"/>
+        </w:rPr>
+        <w:t xml:space="preserve">Jetzt setzen wir die Teile zusammen. Wir legen die acht Frequenzen der C-Dur-Tonleiter in ein Array, zeichnen für jede eine Taste und spielen den passenden Ton, wenn die zugehörige Zifferntaste gedrückt wird. So sieht das ganze Programm aus:</w:t>
+      </w:r>
+    </w:p>
+    <w:p>
+      <w:pPr>
+        <w:keepLines/>
+        <w:pBdr>
+          <w:left w:val="single" w:color="1B6CA8" w:sz="18" w:space="6"/>
+        </w:pBdr>
+        <w:shd w:fill="F4F4F4" w:val="clear"/>
+        <w:spacing w:after="200" w:before="100" w:line="264" w:lineRule="auto"/>
+        <w:ind w:left="140"/>
+      </w:pPr>
+      <w:r>
+        <w:rPr>
+          <w:rFonts w:ascii="Consolas" w:cs="Consolas" w:eastAsia="Consolas" w:hAnsi="Consolas"/>
+          <w:sz w:val="19"/>
+          <w:szCs w:val="19"/>
+        </w:rPr>
+        <w:t xml:space="preserve">IMPORT "audio"</w:t>
+      </w:r>
+      <w:r>
+        <w:rPr>
+          <w:rFonts w:ascii="Consolas" w:cs="Consolas" w:eastAsia="Consolas" w:hAnsi="Consolas"/>
+          <w:sz w:val="19"/>
+          <w:szCs w:val="19"/>
+        </w:rPr>
+        <w:br/>
+        <w:t xml:space="preserve">SCREEN(480, 320, "Mini-Klavier")</w:t>
+      </w:r>
+      <w:r>
+        <w:rPr>
+          <w:rFonts w:ascii="Consolas" w:cs="Consolas" w:eastAsia="Consolas" w:hAnsi="Consolas"/>
+          <w:sz w:val="19"/>
+          <w:szCs w:val="19"/>
+        </w:rPr>
+        <w:br/>
+        <w:t xml:space="preserve"/>
+      </w:r>
+      <w:r>
+        <w:rPr>
+          <w:rFonts w:ascii="Consolas" w:cs="Consolas" w:eastAsia="Consolas" w:hAnsi="Consolas"/>
+          <w:sz w:val="19"/>
+          <w:szCs w:val="19"/>
+        </w:rPr>
+        <w:br/>
+        <w:t xml:space="preserve">DIM hz[8] AS INTEGER          ' C-Dur: C D E F G A H C</w:t>
+      </w:r>
+      <w:r>
+        <w:rPr>
+          <w:rFonts w:ascii="Consolas" w:cs="Consolas" w:eastAsia="Consolas" w:hAnsi="Consolas"/>
+          <w:sz w:val="19"/>
+          <w:szCs w:val="19"/>
+        </w:rPr>
+        <w:br/>
+        <w:t xml:space="preserve">hz[0]=262 : hz[1]=294 : hz[2]=330 : hz[3]=349</w:t>
+      </w:r>
+      <w:r>
+        <w:rPr>
+          <w:rFonts w:ascii="Consolas" w:cs="Consolas" w:eastAsia="Consolas" w:hAnsi="Consolas"/>
+          <w:sz w:val="19"/>
+          <w:szCs w:val="19"/>
+        </w:rPr>
+        <w:br/>
+        <w:t xml:space="preserve">hz[4]=392 : hz[5]=440 : hz[6]=494 : hz[7]=523</w:t>
+      </w:r>
+      <w:r>
+        <w:rPr>
+          <w:rFonts w:ascii="Consolas" w:cs="Consolas" w:eastAsia="Consolas" w:hAnsi="Consolas"/>
+          <w:sz w:val="19"/>
+          <w:szCs w:val="19"/>
+        </w:rPr>
+        <w:br/>
+        <w:t xml:space="preserve"/>
+      </w:r>
+      <w:r>
+        <w:rPr>
+          <w:rFonts w:ascii="Consolas" w:cs="Consolas" w:eastAsia="Consolas" w:hAnsi="Consolas"/>
+          <w:sz w:val="19"/>
+          <w:szCs w:val="19"/>
+        </w:rPr>
+        <w:br/>
+        <w:t xml:space="preserve">WHILE NOT QUITREQUESTED()</w:t>
+      </w:r>
+      <w:r>
+        <w:rPr>
+          <w:rFonts w:ascii="Consolas" w:cs="Consolas" w:eastAsia="Consolas" w:hAnsi="Consolas"/>
+          <w:sz w:val="19"/>
+          <w:szCs w:val="19"/>
+        </w:rPr>
+        <w:br/>
+        <w:t xml:space="preserve">    CLS(RGB(26, 28, 40))</w:t>
+      </w:r>
+      <w:r>
+        <w:rPr>
+          <w:rFonts w:ascii="Consolas" w:cs="Consolas" w:eastAsia="Consolas" w:hAnsi="Consolas"/>
+          <w:sz w:val="19"/>
+          <w:szCs w:val="19"/>
+        </w:rPr>
+        <w:br/>
+        <w:t xml:space="preserve">    DIM i AS INTEGER</w:t>
+      </w:r>
+      <w:r>
+        <w:rPr>
+          <w:rFonts w:ascii="Consolas" w:cs="Consolas" w:eastAsia="Consolas" w:hAnsi="Consolas"/>
+          <w:sz w:val="19"/>
+          <w:szCs w:val="19"/>
+        </w:rPr>
+        <w:br/>
+        <w:t xml:space="preserve">    FOR i = 0 TO 7</w:t>
+      </w:r>
+      <w:r>
+        <w:rPr>
+          <w:rFonts w:ascii="Consolas" w:cs="Consolas" w:eastAsia="Consolas" w:hAnsi="Consolas"/>
+          <w:sz w:val="19"/>
+          <w:szCs w:val="19"/>
+        </w:rPr>
+        <w:br/>
+        <w:t xml:space="preserve">        DIM x AS INTEGER</w:t>
+      </w:r>
+      <w:r>
+        <w:rPr>
+          <w:rFonts w:ascii="Consolas" w:cs="Consolas" w:eastAsia="Consolas" w:hAnsi="Consolas"/>
+          <w:sz w:val="19"/>
+          <w:szCs w:val="19"/>
+        </w:rPr>
+        <w:br/>
+        <w:t xml:space="preserve">        x = 30 + i * 53</w:t>
+      </w:r>
+      <w:r>
+        <w:rPr>
+          <w:rFonts w:ascii="Consolas" w:cs="Consolas" w:eastAsia="Consolas" w:hAnsi="Consolas"/>
+          <w:sz w:val="19"/>
+          <w:szCs w:val="19"/>
+        </w:rPr>
+        <w:br/>
+        <w:t xml:space="preserve">        BOX(x, 60, x + 46, 250, RGB(238, 240, 245))   ' Taste</w:t>
+      </w:r>
+      <w:r>
+        <w:rPr>
+          <w:rFonts w:ascii="Consolas" w:cs="Consolas" w:eastAsia="Consolas" w:hAnsi="Consolas"/>
+          <w:sz w:val="19"/>
+          <w:szCs w:val="19"/>
+        </w:rPr>
+        <w:br/>
+        <w:t xml:space="preserve">        ' Taste 1..8 gedrückt? -&gt; Ton spielen</w:t>
+      </w:r>
+      <w:r>
+        <w:rPr>
+          <w:rFonts w:ascii="Consolas" w:cs="Consolas" w:eastAsia="Consolas" w:hAnsi="Consolas"/>
+          <w:sz w:val="19"/>
+          <w:szCs w:val="19"/>
+        </w:rPr>
+        <w:br/>
+        <w:t xml:space="preserve">        IF KEYPRESSED(KEY_1 + i) THEN</w:t>
+      </w:r>
+      <w:r>
+        <w:rPr>
+          <w:rFonts w:ascii="Consolas" w:cs="Consolas" w:eastAsia="Consolas" w:hAnsi="Consolas"/>
+          <w:sz w:val="19"/>
+          <w:szCs w:val="19"/>
+        </w:rPr>
+        <w:br/>
+        <w:t xml:space="preserve">            BOX(x + 2, 62, x + 44, 248, RGB(120, 200, 255))</w:t>
+      </w:r>
+      <w:r>
+        <w:rPr>
+          <w:rFonts w:ascii="Consolas" w:cs="Consolas" w:eastAsia="Consolas" w:hAnsi="Consolas"/>
+          <w:sz w:val="19"/>
+          <w:szCs w:val="19"/>
+        </w:rPr>
+        <w:br/>
+        <w:t xml:space="preserve">            PLAYSOUND(AUDIO_TONE(hz[i], 200, "square", 0.4))</w:t>
+      </w:r>
+      <w:r>
+        <w:rPr>
+          <w:rFonts w:ascii="Consolas" w:cs="Consolas" w:eastAsia="Consolas" w:hAnsi="Consolas"/>
+          <w:sz w:val="19"/>
+          <w:szCs w:val="19"/>
+        </w:rPr>
+        <w:br/>
+        <w:t xml:space="preserve">        END IF</w:t>
+      </w:r>
+      <w:r>
+        <w:rPr>
+          <w:rFonts w:ascii="Consolas" w:cs="Consolas" w:eastAsia="Consolas" w:hAnsi="Consolas"/>
+          <w:sz w:val="19"/>
+          <w:szCs w:val="19"/>
+        </w:rPr>
+        <w:br/>
+        <w:t xml:space="preserve">    NEXT</w:t>
+      </w:r>
+      <w:r>
+        <w:rPr>
+          <w:rFonts w:ascii="Consolas" w:cs="Consolas" w:eastAsia="Consolas" w:hAnsi="Consolas"/>
+          <w:sz w:val="19"/>
+          <w:szCs w:val="19"/>
+        </w:rPr>
+        <w:br/>
+        <w:t xml:space="preserve">    FLIP()</w:t>
+      </w:r>
+      <w:r>
+        <w:rPr>
+          <w:rFonts w:ascii="Consolas" w:cs="Consolas" w:eastAsia="Consolas" w:hAnsi="Consolas"/>
+          <w:sz w:val="19"/>
+          <w:szCs w:val="19"/>
+        </w:rPr>
+        <w:br/>
+        <w:t xml:space="preserve">WEND</w:t>
+      </w:r>
+    </w:p>
+    <w:p>
+      <w:pPr>
+        <w:spacing w:after="180" w:line="312" w:lineRule="auto"/>
+      </w:pPr>
+      <w:r>
+        <w:rPr>
+          <w:sz w:val="22"/>
+          <w:szCs w:val="22"/>
+        </w:rPr>
+        <w:t xml:space="preserve">Der Trick mit KEY_1 + i nutzt aus, dass die Zifferntasten-Konstanten der Reihe nach liegen: KEY_1 + 0 ist Taste 1, KEY_1 + 1 ist Taste 2, und so weiter. So deckt eine einzige Schleife alle acht Tasten ab.</w:t>
+      </w:r>
+    </w:p>
+    <w:p>
+      <w:pPr>
+        <w:spacing w:before="60"/>
+      </w:pPr>
+    </w:p>
+    <w:tbl>
+      <w:tblPr>
+        <w:tblW w:type="dxa" w:w="9360"/>
+        <w:tblBorders>
+          <w:top w:val="single" w:color="auto" w:sz="4"/>
+          <w:left w:val="single" w:color="auto" w:sz="4"/>
+          <w:bottom w:val="single" w:color="auto" w:sz="4"/>
+          <w:right w:val="single" w:color="auto" w:sz="4"/>
+          <w:insideH w:val="single" w:color="auto" w:sz="4"/>
+          <w:insideV w:val="single" w:color="auto" w:sz="4"/>
+        </w:tblBorders>
+      </w:tblPr>
+      <w:tblGrid>
+        <w:gridCol w:w="9360"/>
+      </w:tblGrid>
+      <w:tr>
+        <w:trPr>
+          <w:cantSplit/>
+        </w:trPr>
+        <w:tc>
+          <w:tcPr>
+            <w:tcW w:type="dxa" w:w="9360"/>
+            <w:tcBorders>
+              <w:top w:val="single" w:color="E0A0A0" w:sz="6"/>
+              <w:left w:val="single" w:color="E0A0A0" w:sz="6"/>
+              <w:bottom w:val="single" w:color="E0A0A0" w:sz="6"/>
+              <w:right w:val="single" w:color="E0A0A0" w:sz="6"/>
+            </w:tcBorders>
+            <w:shd w:fill="FBEAEA" w:val="clear"/>
+            <w:tcMar>
+              <w:top w:type="dxa" w:w="140"/>
+              <w:left w:type="dxa" w:w="180"/>
+              <w:bottom w:type="dxa" w:w="140"/>
+              <w:right w:type="dxa" w:w="180"/>
+            </w:tcMar>
+          </w:tcPr>
+          <w:p>
+            <w:pPr>
+              <w:spacing w:after="40"/>
+            </w:pPr>
+            <w:r>
+              <w:rPr>
+                <w:b/>
+                <w:bCs/>
+                <w:color w:val="B23030"/>
+                <w:sz w:val="22"/>
+                <w:szCs w:val="22"/>
+              </w:rPr>
+              <w:t xml:space="preserve">Achtung</w:t>
+            </w:r>
+          </w:p>
+          <w:p>
+            <w:pPr>
+              <w:spacing w:after="0" w:line="312" w:lineRule="auto"/>
+            </w:pPr>
+            <w:r>
+              <w:rPr>
+                <w:sz w:val="22"/>
+                <w:szCs w:val="22"/>
+              </w:rPr>
+              <w:t xml:space="preserve">Erzeugst du sehr viele Töne (etwa in einer langen Melodie-Schleife), summieren sich die Klang-Puffer im Speicher. Gib nicht mehr benötigte Töne mit UNLOADSOUND wieder frei, um den Speicher schlank zu halten.</w:t>
+            </w:r>
+          </w:p>
+        </w:tc>
+      </w:tr>
+    </w:tbl>
+    <w:p>
+      <w:pPr>
+        <w:spacing w:after="160"/>
+      </w:pPr>
+    </w:p>
+    <w:p>
+      <w:pPr>
+        <w:pStyle w:val="Heading2"/>
+        <w:keepNext/>
+        <w:keepLines/>
+        <w:spacing w:after="120" w:before="280"/>
+      </w:pPr>
+      <w:r>
+        <w:t xml:space="preserve">Lautstärke, Stereo &amp; mehr</w:t>
+      </w:r>
+    </w:p>
+    <w:p>
+      <w:pPr>
+        <w:spacing w:after="180" w:line="312" w:lineRule="auto"/>
+      </w:pPr>
+      <w:r>
+        <w:rPr>
+          <w:sz w:val="22"/>
+          <w:szCs w:val="22"/>
+        </w:rPr>
+        <w:t xml:space="preserve">Das audio-Modul kann weit mehr, als hier gezeigt: einzelne Kanäle in der Lautstärke regeln (AUDIO_VOLUME) oder im Stereobild verschieben (AUDIO_PAN), getrennte Lautstärke-Busse für Effekte und Musik (AUDIO_BUS_VOLUME) sowie Echtzeit-Effekte wie Hall, Echo oder Filter pro Bus. Für die meisten Spiele reichen LOADSOUND/PLAYSOUND und PLAYMUSIC – die feineren Werkzeuge findest du in der Modul-Dokumentation.</w:t>
+      </w:r>
+    </w:p>
+    <w:p>
+      <w:pPr>
+        <w:spacing w:before="60"/>
+      </w:pPr>
+    </w:p>
+    <w:tbl>
+      <w:tblPr>
+        <w:tblW w:type="dxa" w:w="9360"/>
+        <w:tblBorders>
+          <w:top w:val="single" w:color="auto" w:sz="4"/>
+          <w:left w:val="single" w:color="auto" w:sz="4"/>
+          <w:bottom w:val="single" w:color="auto" w:sz="4"/>
+          <w:right w:val="single" w:color="auto" w:sz="4"/>
+          <w:insideH w:val="single" w:color="auto" w:sz="4"/>
+          <w:insideV w:val="single" w:color="auto" w:sz="4"/>
+        </w:tblBorders>
+      </w:tblPr>
+      <w:tblGrid>
+        <w:gridCol w:w="9360"/>
+      </w:tblGrid>
+      <w:tr>
+        <w:trPr>
+          <w:cantSplit/>
+        </w:trPr>
+        <w:tc>
+          <w:tcPr>
+            <w:tcW w:type="dxa" w:w="9360"/>
+            <w:tcBorders>
+              <w:top w:val="single" w:color="9CC8E6" w:sz="6"/>
+              <w:left w:val="single" w:color="9CC8E6" w:sz="6"/>
+              <w:bottom w:val="single" w:color="9CC8E6" w:sz="6"/>
+              <w:right w:val="single" w:color="9CC8E6" w:sz="6"/>
+            </w:tcBorders>
+            <w:shd w:fill="E7F2FA" w:val="clear"/>
+            <w:tcMar>
+              <w:top w:type="dxa" w:w="140"/>
+              <w:left w:type="dxa" w:w="180"/>
+              <w:bottom w:type="dxa" w:w="140"/>
+              <w:right w:type="dxa" w:w="180"/>
+            </w:tcMar>
+          </w:tcPr>
+          <w:p>
+            <w:pPr>
+              <w:spacing w:after="40"/>
+            </w:pPr>
+            <w:r>
+              <w:rPr>
+                <w:b/>
+                <w:bCs/>
+                <w:color w:val="1B6CA8"/>
+                <w:sz w:val="22"/>
+                <w:szCs w:val="22"/>
+              </w:rPr>
+              <w:t xml:space="preserve">Sound-Werkzeuge</w:t>
+            </w:r>
+          </w:p>
+          <w:p>
+            <w:pPr>
+              <w:spacing w:after="0" w:line="312" w:lineRule="auto"/>
+            </w:pPr>
+            <w:r>
+              <w:rPr>
+                <w:sz w:val="22"/>
+                <w:szCs w:val="22"/>
+              </w:rPr>
+              <w:t xml:space="preserve">Eigene Soundeffekte bastelst du am schnellsten im Editor gbsfx (er exportiert fertige AUDIO_SFX-Aufrufe), und ganze Musikstücke baust du im Tracker. Beide gehören zum GameBasic-Werkzeugkasten rund um den Sound.</w:t>
             </w:r>
           </w:p>
         </w:tc>

</xml_diff>

<commit_message>
docs(buch): Lehrbuch Kap 47 -- Layer, Sprite-Atlas, Bulk-Draws (Screenshot)
Layer (LAYER_DEFINE/LAYER/END/CLEAR, z-Order-Composite), Sprite-Atlas
(ATLAS_LOAD/DRAW/DRAW_FLIPPED, BATCH_DRAW/FLUSH) mit Manifest-JSON, Bulk-Draws
(PLOTS/CIRCLES/BOXES/LINES). Layer+Bulk-Screenshot (Sternenfeld+Planeten+HUD).
ATLAS_DRAW_FLIPPED-Flips als 1/0 (verifiziert: bool wird abgelehnt). Je Beispiel.

Co-Authored-By: Claude Opus 4.8 (1M context) <noreply@anthropic.com>
</commit_message>
<xml_diff>
--- a/buch-referenz/buch/GameBasic-Lehrbuch.docx
+++ b/buch-referenz/buch/GameBasic-Lehrbuch.docx
@@ -1191,6 +1191,33 @@
           <w:szCs w:val="22"/>
         </w:rPr>
         <w:t xml:space="preserve">	151</w:t>
+      </w:r>
+    </w:p>
+    <w:p>
+      <w:pPr>
+        <w:tabs>
+          <w:tab w:val="right" w:pos="9200" w:leader="dot"/>
+        </w:tabs>
+        <w:spacing w:after="20" w:before="0"/>
+        <w:ind w:left="280"/>
+      </w:pPr>
+      <w:r>
+        <w:rPr>
+          <w:b w:val="false"/>
+          <w:bCs w:val="false"/>
+          <w:color w:val="222222"/>
+          <w:sz w:val="22"/>
+          <w:szCs w:val="22"/>
+        </w:rPr>
+        <w:t xml:space="preserve">Layer, Sprite-Atlas &amp; Bulk-Draws</w:t>
+      </w:r>
+      <w:r>
+        <w:rPr>
+          <w:color w:val="555555"/>
+          <w:sz w:val="22"/>
+          <w:szCs w:val="22"/>
+        </w:rPr>
+        <w:t xml:space="preserve">	155</w:t>
       </w:r>
     </w:p>
     <w:p>
@@ -52550,6 +52577,1249 @@
                 <w:szCs w:val="22"/>
               </w:rPr>
               <w:t xml:space="preserve">Eigene Soundeffekte bastelst du am schnellsten im Editor gbsfx (er exportiert fertige AUDIO_SFX-Aufrufe), und ganze Musikstücke baust du im Tracker. Beide gehören zum GameBasic-Werkzeugkasten rund um den Sound.</w:t>
+            </w:r>
+          </w:p>
+        </w:tc>
+      </w:tr>
+    </w:tbl>
+    <w:p>
+      <w:pPr>
+        <w:spacing w:after="160"/>
+      </w:pPr>
+    </w:p>
+    <w:p>
+      <w:pPr>
+        <w:pStyle w:val="Heading1"/>
+        <w:keepNext/>
+        <w:keepLines/>
+        <w:pageBreakBefore/>
+        <w:pBdr>
+          <w:bottom w:val="single" w:color="1B6CA8" w:sz="12" w:space="4"/>
+        </w:pBdr>
+        <w:spacing w:after="160" w:before="0"/>
+      </w:pPr>
+      <w:r>
+        <w:t xml:space="preserve">Layer, Sprite-Atlas &amp; Bulk-Draws</w:t>
+      </w:r>
+    </w:p>
+    <w:p>
+      <w:pPr>
+        <w:spacing w:after="180" w:line="312" w:lineRule="auto"/>
+      </w:pPr>
+      <w:r>
+        <w:rPr>
+          <w:sz w:val="22"/>
+          <w:szCs w:val="22"/>
+        </w:rPr>
+        <w:t xml:space="preserve">Dieses Kapitel sammelt drei Techniken für aufgeräumte und schnelle Grafik: Layer ordnen das Gezeichnete in Ebenen (Hintergrund hinten, HUD vorne), ein Sprite-Atlas bündelt viele Bilder in einer Textur und zeichnet sie gebündelt, und die Bulk-Befehle zeichnen hunderte gleichartige Formen in einem einzigen Aufruf.</w:t>
+      </w:r>
+    </w:p>
+    <w:p>
+      <w:pPr>
+        <w:keepNext/>
+        <w:spacing w:after="40" w:before="160"/>
+        <w:jc w:val="center"/>
+      </w:pPr>
+      <w:r>
+        <w:drawing>
+          <wp:inline distT="0" distB="0" distL="0" distR="0">
+            <wp:extent cx="4572000" cy="3048000"/>
+            <wp:effectExtent t="0" r="0" b="0" l="0"/>
+            <wp:docPr id="1" name="47_layer.png" descr="Eine geschichtete Szene: Sternenfeld (PLOTS) und Planeten (CIRCLES) als Bulk-Draws, HUD-Leiste auf der obersten Ebene." title="Eine geschichtete Szene: Sternenfeld (PLOTS) und Planeten (CIRCLES) als Bulk-Draws, HUD-Leiste auf der obersten Ebene."/>
+            <wp:cNvGraphicFramePr>
+              <a:graphicFrameLocks xmlns:a="http://schemas.openxmlformats.org/drawingml/2006/main" noChangeAspect="1"/>
+            </wp:cNvGraphicFramePr>
+            <a:graphic xmlns:a="http://schemas.openxmlformats.org/drawingml/2006/main">
+              <a:graphicData uri="http://schemas.openxmlformats.org/drawingml/2006/picture">
+                <pic:pic xmlns:pic="http://schemas.openxmlformats.org/drawingml/2006/picture">
+                  <pic:nvPicPr>
+                    <pic:cNvPr id="0" name="" descr=""/>
+                    <pic:cNvPicPr>
+                      <a:picLocks noChangeAspect="1" noChangeArrowheads="1"/>
+                    </pic:cNvPicPr>
+                  </pic:nvPicPr>
+                  <pic:blipFill>
+                    <a:blip r:embed="rId16" cstate="none"/>
+                    <a:srcRect/>
+                    <a:stretch>
+                      <a:fillRect/>
+                    </a:stretch>
+                  </pic:blipFill>
+                  <pic:spPr bwMode="auto">
+                    <a:xfrm>
+                      <a:off x="0" y="0"/>
+                      <a:ext cx="4572000" cy="3048000"/>
+                    </a:xfrm>
+                    <a:prstGeom prst="rect">
+                      <a:avLst/>
+                    </a:prstGeom>
+                  </pic:spPr>
+                </pic:pic>
+              </a:graphicData>
+            </a:graphic>
+          </wp:inline>
+        </w:drawing>
+      </w:r>
+    </w:p>
+    <w:p>
+      <w:pPr>
+        <w:spacing w:after="200"/>
+        <w:jc w:val="center"/>
+      </w:pPr>
+      <w:r>
+        <w:rPr>
+          <w:i/>
+          <w:iCs/>
+          <w:color w:val="6A6A6A"/>
+          <w:sz w:val="18"/>
+          <w:szCs w:val="18"/>
+        </w:rPr>
+        <w:t xml:space="preserve">Eine geschichtete Szene: Sternenfeld (PLOTS) und Planeten (CIRCLES) als Bulk-Draws, HUD-Leiste auf der obersten Ebene.</w:t>
+      </w:r>
+    </w:p>
+    <w:p>
+      <w:pPr>
+        <w:pStyle w:val="Heading2"/>
+        <w:keepNext/>
+        <w:keepLines/>
+        <w:spacing w:after="120" w:before="280"/>
+      </w:pPr>
+      <w:r>
+        <w:t xml:space="preserve">Ebenen: Layer</w:t>
+      </w:r>
+    </w:p>
+    <w:p>
+      <w:pPr>
+        <w:spacing w:after="180" w:line="312" w:lineRule="auto"/>
+      </w:pPr>
+      <w:r>
+        <w:rPr>
+          <w:sz w:val="22"/>
+          <w:szCs w:val="22"/>
+        </w:rPr>
+        <w:t xml:space="preserve">Normalerweise überdeckt später Gezeichnetes das Frühere. Layer befreien dich von dieser strikten Reihenfolge: Du zeichnest auf benannte Ebenen mit einem z-Wert, und beim FLIP werden alle Ebenen von hinten (kleines z) nach vorne (großes z) übereinandergelegt. So bleibt dein HUD immer vorne, egal wann du es zeichnest.</w:t>
+      </w:r>
+    </w:p>
+    <w:p>
+      <w:pPr>
+        <w:keepNext/>
+        <w:keepLines/>
+        <w:pBdr>
+          <w:bottom w:val="single" w:color="DDD0C0" w:sz="4" w:space="2"/>
+        </w:pBdr>
+        <w:spacing w:after="40" w:before="360"/>
+      </w:pPr>
+      <w:r>
+        <w:rPr>
+          <w:rFonts w:ascii="Consolas" w:cs="Consolas" w:eastAsia="Consolas" w:hAnsi="Consolas"/>
+          <w:b/>
+          <w:bCs/>
+          <w:color w:val="9A3412"/>
+          <w:sz w:val="24"/>
+          <w:szCs w:val="24"/>
+        </w:rPr>
+        <w:t xml:space="preserve">LAYER_DEFINE · LAYER</w:t>
+      </w:r>
+    </w:p>
+    <w:p>
+      <w:pPr>
+        <w:keepNext/>
+        <w:spacing w:after="120"/>
+      </w:pPr>
+      <w:r>
+        <w:rPr>
+          <w:b/>
+          <w:bCs/>
+          <w:color w:val="6A6A6A"/>
+          <w:sz w:val="18"/>
+          <w:szCs w:val="18"/>
+        </w:rPr>
+        <w:t xml:space="preserve">Syntax:  </w:t>
+      </w:r>
+      <w:r>
+        <w:rPr>
+          <w:rFonts w:ascii="Consolas" w:cs="Consolas" w:eastAsia="Consolas" w:hAnsi="Consolas"/>
+          <w:color w:val="335577"/>
+          <w:sz w:val="19"/>
+          <w:szCs w:val="19"/>
+        </w:rPr>
+        <w:t xml:space="preserve">LAYER_DEFINE(name$, z)   LAYER(name$)</w:t>
+      </w:r>
+    </w:p>
+    <w:p>
+      <w:pPr>
+        <w:spacing w:after="180" w:line="312" w:lineRule="auto"/>
+      </w:pPr>
+      <w:r>
+        <w:rPr>
+          <w:sz w:val="22"/>
+          <w:szCs w:val="22"/>
+        </w:rPr>
+        <w:t xml:space="preserve">LAYER_DEFINE registriert eine Ebene mit ihrer Tiefe z (klein = hinten). LAYER schaltet das Zeichenziel auf diese Ebene um – alle folgenden Zeichenbefehle landen dort, bis du auf eine andere Ebene wechselst.</w:t>
+      </w:r>
+    </w:p>
+    <w:p>
+      <w:pPr>
+        <w:keepNext/>
+        <w:spacing w:after="30" w:before="120"/>
+      </w:pPr>
+      <w:r>
+        <w:rPr>
+          <w:b/>
+          <w:bCs/>
+          <w:i/>
+          <w:iCs/>
+          <w:color w:val="6A6A6A"/>
+          <w:sz w:val="18"/>
+          <w:szCs w:val="18"/>
+        </w:rPr>
+        <w:t xml:space="preserve">Beispiel</w:t>
+      </w:r>
+    </w:p>
+    <w:p>
+      <w:pPr>
+        <w:keepLines/>
+        <w:pBdr>
+          <w:left w:val="single" w:color="1B6CA8" w:sz="18" w:space="6"/>
+        </w:pBdr>
+        <w:shd w:fill="F4F4F4" w:val="clear"/>
+        <w:spacing w:after="200" w:before="100" w:line="264" w:lineRule="auto"/>
+        <w:ind w:left="140"/>
+      </w:pPr>
+      <w:r>
+        <w:rPr>
+          <w:rFonts w:ascii="Consolas" w:cs="Consolas" w:eastAsia="Consolas" w:hAnsi="Consolas"/>
+          <w:sz w:val="19"/>
+          <w:szCs w:val="19"/>
+        </w:rPr>
+        <w:t xml:space="preserve">LAYER_DEFINE("bg", 0)</w:t>
+      </w:r>
+      <w:r>
+        <w:rPr>
+          <w:rFonts w:ascii="Consolas" w:cs="Consolas" w:eastAsia="Consolas" w:hAnsi="Consolas"/>
+          <w:sz w:val="19"/>
+          <w:szCs w:val="19"/>
+        </w:rPr>
+        <w:br/>
+        <w:t xml:space="preserve">LAYER_DEFINE("hud", 100)</w:t>
+      </w:r>
+      <w:r>
+        <w:rPr>
+          <w:rFonts w:ascii="Consolas" w:cs="Consolas" w:eastAsia="Consolas" w:hAnsi="Consolas"/>
+          <w:sz w:val="19"/>
+          <w:szCs w:val="19"/>
+        </w:rPr>
+        <w:br/>
+        <w:t xml:space="preserve"/>
+      </w:r>
+      <w:r>
+        <w:rPr>
+          <w:rFonts w:ascii="Consolas" w:cs="Consolas" w:eastAsia="Consolas" w:hAnsi="Consolas"/>
+          <w:sz w:val="19"/>
+          <w:szCs w:val="19"/>
+        </w:rPr>
+        <w:br/>
+        <w:t xml:space="preserve">LAYER("bg")    : CLS(RGB(20, 24, 40))   ' hinten</w:t>
+      </w:r>
+      <w:r>
+        <w:rPr>
+          <w:rFonts w:ascii="Consolas" w:cs="Consolas" w:eastAsia="Consolas" w:hAnsi="Consolas"/>
+          <w:sz w:val="19"/>
+          <w:szCs w:val="19"/>
+        </w:rPr>
+        <w:br/>
+        <w:t xml:space="preserve">LAYER("hud")   : TEXT(10, 10, "Punkte: 0")  ' vorne</w:t>
+      </w:r>
+      <w:r>
+        <w:rPr>
+          <w:rFonts w:ascii="Consolas" w:cs="Consolas" w:eastAsia="Consolas" w:hAnsi="Consolas"/>
+          <w:sz w:val="19"/>
+          <w:szCs w:val="19"/>
+        </w:rPr>
+        <w:br/>
+        <w:t xml:space="preserve">FLIP()         ' legt bg und hud in z-Reihenfolge übereinander</w:t>
+      </w:r>
+    </w:p>
+    <w:p>
+      <w:pPr>
+        <w:keepNext/>
+        <w:keepLines/>
+        <w:pBdr>
+          <w:bottom w:val="single" w:color="DDD0C0" w:sz="4" w:space="2"/>
+        </w:pBdr>
+        <w:spacing w:after="40" w:before="360"/>
+      </w:pPr>
+      <w:r>
+        <w:rPr>
+          <w:rFonts w:ascii="Consolas" w:cs="Consolas" w:eastAsia="Consolas" w:hAnsi="Consolas"/>
+          <w:b/>
+          <w:bCs/>
+          <w:color w:val="9A3412"/>
+          <w:sz w:val="24"/>
+          <w:szCs w:val="24"/>
+        </w:rPr>
+        <w:t xml:space="preserve">LAYER_END · LAYER_CLEAR</w:t>
+      </w:r>
+    </w:p>
+    <w:p>
+      <w:pPr>
+        <w:keepNext/>
+        <w:spacing w:after="120"/>
+      </w:pPr>
+      <w:r>
+        <w:rPr>
+          <w:b/>
+          <w:bCs/>
+          <w:color w:val="6A6A6A"/>
+          <w:sz w:val="18"/>
+          <w:szCs w:val="18"/>
+        </w:rPr>
+        <w:t xml:space="preserve">Syntax:  </w:t>
+      </w:r>
+      <w:r>
+        <w:rPr>
+          <w:rFonts w:ascii="Consolas" w:cs="Consolas" w:eastAsia="Consolas" w:hAnsi="Consolas"/>
+          <w:color w:val="335577"/>
+          <w:sz w:val="19"/>
+          <w:szCs w:val="19"/>
+        </w:rPr>
+        <w:t xml:space="preserve">LAYER_END()   LAYER_CLEAR(name$)</w:t>
+      </w:r>
+    </w:p>
+    <w:p>
+      <w:pPr>
+        <w:spacing w:after="180" w:line="312" w:lineRule="auto"/>
+      </w:pPr>
+      <w:r>
+        <w:rPr>
+          <w:sz w:val="22"/>
+          <w:szCs w:val="22"/>
+        </w:rPr>
+        <w:t xml:space="preserve">LAYER_END schaltet zurück auf das Haupt-Bild (FLIP macht das ohnehin automatisch). LAYER_CLEAR leert eine einzelne Ebene von Hand – selten nötig, da FLIP nach dem Zusammenlegen alle Ebenen leert.</w:t>
+      </w:r>
+    </w:p>
+    <w:p>
+      <w:pPr>
+        <w:keepNext/>
+        <w:spacing w:after="30" w:before="120"/>
+      </w:pPr>
+      <w:r>
+        <w:rPr>
+          <w:b/>
+          <w:bCs/>
+          <w:i/>
+          <w:iCs/>
+          <w:color w:val="6A6A6A"/>
+          <w:sz w:val="18"/>
+          <w:szCs w:val="18"/>
+        </w:rPr>
+        <w:t xml:space="preserve">Beispiel</w:t>
+      </w:r>
+    </w:p>
+    <w:p>
+      <w:pPr>
+        <w:keepLines/>
+        <w:pBdr>
+          <w:left w:val="single" w:color="1B6CA8" w:sz="18" w:space="6"/>
+        </w:pBdr>
+        <w:shd w:fill="F4F4F4" w:val="clear"/>
+        <w:spacing w:after="200" w:before="100" w:line="264" w:lineRule="auto"/>
+        <w:ind w:left="140"/>
+      </w:pPr>
+      <w:r>
+        <w:rPr>
+          <w:rFonts w:ascii="Consolas" w:cs="Consolas" w:eastAsia="Consolas" w:hAnsi="Consolas"/>
+          <w:sz w:val="19"/>
+          <w:szCs w:val="19"/>
+        </w:rPr>
+        <w:t xml:space="preserve">LAYER("bg") : DRAWIMAGE(himmel, 0, 0)</w:t>
+      </w:r>
+      <w:r>
+        <w:rPr>
+          <w:rFonts w:ascii="Consolas" w:cs="Consolas" w:eastAsia="Consolas" w:hAnsi="Consolas"/>
+          <w:sz w:val="19"/>
+          <w:szCs w:val="19"/>
+        </w:rPr>
+        <w:br/>
+        <w:t xml:space="preserve">LAYER_END()                 ' zurück zum Hauptbild</w:t>
+      </w:r>
+    </w:p>
+    <w:p>
+      <w:pPr>
+        <w:pStyle w:val="Heading2"/>
+        <w:keepNext/>
+        <w:keepLines/>
+        <w:spacing w:after="120" w:before="280"/>
+      </w:pPr>
+      <w:r>
+        <w:t xml:space="preserve">Viele Sprites aus einer Textur: der Sprite-Atlas</w:t>
+      </w:r>
+    </w:p>
+    <w:p>
+      <w:pPr>
+        <w:spacing w:after="180" w:line="312" w:lineRule="auto"/>
+      </w:pPr>
+      <w:r>
+        <w:rPr>
+          <w:sz w:val="22"/>
+          <w:szCs w:val="22"/>
+        </w:rPr>
+        <w:t xml:space="preserve">Ein Sprite-Atlas ist ein großes Bild, in dem viele kleine Sprites liegen, plus eine Liste, welcher Name zu welchem Ausschnitt gehört. Das spart Speicher und macht das Zeichnen vieler Sprites schnell. Den Atlas beschreibst du in einer JSON-Datei:</w:t>
+      </w:r>
+    </w:p>
+    <w:p>
+      <w:pPr>
+        <w:keepLines/>
+        <w:pBdr>
+          <w:left w:val="single" w:color="1B6CA8" w:sz="18" w:space="6"/>
+        </w:pBdr>
+        <w:shd w:fill="F4F4F4" w:val="clear"/>
+        <w:spacing w:after="200" w:before="100" w:line="264" w:lineRule="auto"/>
+        <w:ind w:left="140"/>
+      </w:pPr>
+      <w:r>
+        <w:rPr>
+          <w:rFonts w:ascii="Consolas" w:cs="Consolas" w:eastAsia="Consolas" w:hAnsi="Consolas"/>
+          <w:sz w:val="19"/>
+          <w:szCs w:val="19"/>
+        </w:rPr>
+        <w:t xml:space="preserve">// hero_atlas.json</w:t>
+      </w:r>
+      <w:r>
+        <w:rPr>
+          <w:rFonts w:ascii="Consolas" w:cs="Consolas" w:eastAsia="Consolas" w:hAnsi="Consolas"/>
+          <w:sz w:val="19"/>
+          <w:szCs w:val="19"/>
+        </w:rPr>
+        <w:br/>
+        <w:t xml:space="preserve">{</w:t>
+      </w:r>
+      <w:r>
+        <w:rPr>
+          <w:rFonts w:ascii="Consolas" w:cs="Consolas" w:eastAsia="Consolas" w:hAnsi="Consolas"/>
+          <w:sz w:val="19"/>
+          <w:szCs w:val="19"/>
+        </w:rPr>
+        <w:br/>
+        <w:t xml:space="preserve">  "image": "hero.png",</w:t>
+      </w:r>
+      <w:r>
+        <w:rPr>
+          <w:rFonts w:ascii="Consolas" w:cs="Consolas" w:eastAsia="Consolas" w:hAnsi="Consolas"/>
+          <w:sz w:val="19"/>
+          <w:szCs w:val="19"/>
+        </w:rPr>
+        <w:br/>
+        <w:t xml:space="preserve">  "sprites": {</w:t>
+      </w:r>
+      <w:r>
+        <w:rPr>
+          <w:rFonts w:ascii="Consolas" w:cs="Consolas" w:eastAsia="Consolas" w:hAnsi="Consolas"/>
+          <w:sz w:val="19"/>
+          <w:szCs w:val="19"/>
+        </w:rPr>
+        <w:br/>
+        <w:t xml:space="preserve">    "stand":  [0,  0, 32, 32],</w:t>
+      </w:r>
+      <w:r>
+        <w:rPr>
+          <w:rFonts w:ascii="Consolas" w:cs="Consolas" w:eastAsia="Consolas" w:hAnsi="Consolas"/>
+          <w:sz w:val="19"/>
+          <w:szCs w:val="19"/>
+        </w:rPr>
+        <w:br/>
+        <w:t xml:space="preserve">    "walk_a": [32, 0, 32, 32],</w:t>
+      </w:r>
+      <w:r>
+        <w:rPr>
+          <w:rFonts w:ascii="Consolas" w:cs="Consolas" w:eastAsia="Consolas" w:hAnsi="Consolas"/>
+          <w:sz w:val="19"/>
+          <w:szCs w:val="19"/>
+        </w:rPr>
+        <w:br/>
+        <w:t xml:space="preserve">    "walk_b": [64, 0, 32, 32]</w:t>
+      </w:r>
+      <w:r>
+        <w:rPr>
+          <w:rFonts w:ascii="Consolas" w:cs="Consolas" w:eastAsia="Consolas" w:hAnsi="Consolas"/>
+          <w:sz w:val="19"/>
+          <w:szCs w:val="19"/>
+        </w:rPr>
+        <w:br/>
+        <w:t xml:space="preserve">  }</w:t>
+      </w:r>
+      <w:r>
+        <w:rPr>
+          <w:rFonts w:ascii="Consolas" w:cs="Consolas" w:eastAsia="Consolas" w:hAnsi="Consolas"/>
+          <w:sz w:val="19"/>
+          <w:szCs w:val="19"/>
+        </w:rPr>
+        <w:br/>
+        <w:t xml:space="preserve">}</w:t>
+      </w:r>
+    </w:p>
+    <w:p>
+      <w:pPr>
+        <w:keepNext/>
+        <w:keepLines/>
+        <w:pBdr>
+          <w:bottom w:val="single" w:color="DDD0C0" w:sz="4" w:space="2"/>
+        </w:pBdr>
+        <w:spacing w:after="40" w:before="360"/>
+      </w:pPr>
+      <w:r>
+        <w:rPr>
+          <w:rFonts w:ascii="Consolas" w:cs="Consolas" w:eastAsia="Consolas" w:hAnsi="Consolas"/>
+          <w:b/>
+          <w:bCs/>
+          <w:color w:val="9A3412"/>
+          <w:sz w:val="24"/>
+          <w:szCs w:val="24"/>
+        </w:rPr>
+        <w:t xml:space="preserve">ATLAS_LOAD · ATLAS_DRAW</w:t>
+      </w:r>
+    </w:p>
+    <w:p>
+      <w:pPr>
+        <w:keepNext/>
+        <w:spacing w:after="120"/>
+      </w:pPr>
+      <w:r>
+        <w:rPr>
+          <w:b/>
+          <w:bCs/>
+          <w:color w:val="6A6A6A"/>
+          <w:sz w:val="18"/>
+          <w:szCs w:val="18"/>
+        </w:rPr>
+        <w:t xml:space="preserve">Syntax:  </w:t>
+      </w:r>
+      <w:r>
+        <w:rPr>
+          <w:rFonts w:ascii="Consolas" w:cs="Consolas" w:eastAsia="Consolas" w:hAnsi="Consolas"/>
+          <w:color w:val="335577"/>
+          <w:sz w:val="19"/>
+          <w:szCs w:val="19"/>
+        </w:rPr>
+        <w:t xml:space="preserve">ATLAS_LOAD(manifest$)   ATLAS_DRAW(atlas, name$, x, y)</w:t>
+      </w:r>
+    </w:p>
+    <w:p>
+      <w:pPr>
+        <w:spacing w:after="180" w:line="312" w:lineRule="auto"/>
+      </w:pPr>
+      <w:r>
+        <w:rPr>
+          <w:sz w:val="22"/>
+          <w:szCs w:val="22"/>
+        </w:rPr>
+        <w:t xml:space="preserve">ATLAS_LOAD lädt das Manifest und liefert einen SPRITE_ATLAS. ATLAS_DRAW zeichnet das benannte Sub-Sprite bei (x, y).</w:t>
+      </w:r>
+    </w:p>
+    <w:p>
+      <w:pPr>
+        <w:keepNext/>
+        <w:spacing w:after="30" w:before="120"/>
+      </w:pPr>
+      <w:r>
+        <w:rPr>
+          <w:b/>
+          <w:bCs/>
+          <w:i/>
+          <w:iCs/>
+          <w:color w:val="6A6A6A"/>
+          <w:sz w:val="18"/>
+          <w:szCs w:val="18"/>
+        </w:rPr>
+        <w:t xml:space="preserve">Beispiel</w:t>
+      </w:r>
+    </w:p>
+    <w:p>
+      <w:pPr>
+        <w:keepLines/>
+        <w:pBdr>
+          <w:left w:val="single" w:color="1B6CA8" w:sz="18" w:space="6"/>
+        </w:pBdr>
+        <w:shd w:fill="F4F4F4" w:val="clear"/>
+        <w:spacing w:after="200" w:before="100" w:line="264" w:lineRule="auto"/>
+        <w:ind w:left="140"/>
+      </w:pPr>
+      <w:r>
+        <w:rPr>
+          <w:rFonts w:ascii="Consolas" w:cs="Consolas" w:eastAsia="Consolas" w:hAnsi="Consolas"/>
+          <w:sz w:val="19"/>
+          <w:szCs w:val="19"/>
+        </w:rPr>
+        <w:t xml:space="preserve">DIM atlas AS SPRITE_ATLAS</w:t>
+      </w:r>
+      <w:r>
+        <w:rPr>
+          <w:rFonts w:ascii="Consolas" w:cs="Consolas" w:eastAsia="Consolas" w:hAnsi="Consolas"/>
+          <w:sz w:val="19"/>
+          <w:szCs w:val="19"/>
+        </w:rPr>
+        <w:br/>
+        <w:t xml:space="preserve">atlas = ATLAS_LOAD("assets/hero_atlas.json")</w:t>
+      </w:r>
+      <w:r>
+        <w:rPr>
+          <w:rFonts w:ascii="Consolas" w:cs="Consolas" w:eastAsia="Consolas" w:hAnsi="Consolas"/>
+          <w:sz w:val="19"/>
+          <w:szCs w:val="19"/>
+        </w:rPr>
+        <w:br/>
+        <w:t xml:space="preserve">CLS()</w:t>
+      </w:r>
+      <w:r>
+        <w:rPr>
+          <w:rFonts w:ascii="Consolas" w:cs="Consolas" w:eastAsia="Consolas" w:hAnsi="Consolas"/>
+          <w:sz w:val="19"/>
+          <w:szCs w:val="19"/>
+        </w:rPr>
+        <w:br/>
+        <w:t xml:space="preserve">ATLAS_DRAW(atlas, "stand", 100, 80)</w:t>
+      </w:r>
+      <w:r>
+        <w:rPr>
+          <w:rFonts w:ascii="Consolas" w:cs="Consolas" w:eastAsia="Consolas" w:hAnsi="Consolas"/>
+          <w:sz w:val="19"/>
+          <w:szCs w:val="19"/>
+        </w:rPr>
+        <w:br/>
+        <w:t xml:space="preserve">FLIP()</w:t>
+      </w:r>
+    </w:p>
+    <w:p>
+      <w:pPr>
+        <w:keepNext/>
+        <w:keepLines/>
+        <w:pBdr>
+          <w:bottom w:val="single" w:color="DDD0C0" w:sz="4" w:space="2"/>
+        </w:pBdr>
+        <w:spacing w:after="40" w:before="360"/>
+      </w:pPr>
+      <w:r>
+        <w:rPr>
+          <w:rFonts w:ascii="Consolas" w:cs="Consolas" w:eastAsia="Consolas" w:hAnsi="Consolas"/>
+          <w:b/>
+          <w:bCs/>
+          <w:color w:val="9A3412"/>
+          <w:sz w:val="24"/>
+          <w:szCs w:val="24"/>
+        </w:rPr>
+        <w:t xml:space="preserve">ATLAS_DRAW_FLIPPED</w:t>
+      </w:r>
+    </w:p>
+    <w:p>
+      <w:pPr>
+        <w:keepNext/>
+        <w:spacing w:after="120"/>
+      </w:pPr>
+      <w:r>
+        <w:rPr>
+          <w:b/>
+          <w:bCs/>
+          <w:color w:val="6A6A6A"/>
+          <w:sz w:val="18"/>
+          <w:szCs w:val="18"/>
+        </w:rPr>
+        <w:t xml:space="preserve">Syntax:  </w:t>
+      </w:r>
+      <w:r>
+        <w:rPr>
+          <w:rFonts w:ascii="Consolas" w:cs="Consolas" w:eastAsia="Consolas" w:hAnsi="Consolas"/>
+          <w:color w:val="335577"/>
+          <w:sz w:val="19"/>
+          <w:szCs w:val="19"/>
+        </w:rPr>
+        <w:t xml:space="preserve">ATLAS_DRAW_FLIPPED(atlas, name$, x, y[, flipX[, flipY]])</w:t>
+      </w:r>
+    </w:p>
+    <w:p>
+      <w:pPr>
+        <w:spacing w:after="180" w:line="312" w:lineRule="auto"/>
+      </w:pPr>
+      <w:r>
+        <w:rPr>
+          <w:sz w:val="22"/>
+          <w:szCs w:val="22"/>
+        </w:rPr>
+        <w:t xml:space="preserve">Zeichnet ein Sub-Sprite gespiegelt. Klassisch für Lauf-Animationen: Nur die nach rechts blickende Variante liegt im Atlas, nach links wird per flipX abgeleitet. Die Flip-Schalter gibst du als 1 (spiegeln) oder 0 (nicht) an.</w:t>
+      </w:r>
+    </w:p>
+    <w:p>
+      <w:pPr>
+        <w:keepNext/>
+        <w:spacing w:after="30" w:before="120"/>
+      </w:pPr>
+      <w:r>
+        <w:rPr>
+          <w:b/>
+          <w:bCs/>
+          <w:i/>
+          <w:iCs/>
+          <w:color w:val="6A6A6A"/>
+          <w:sz w:val="18"/>
+          <w:szCs w:val="18"/>
+        </w:rPr>
+        <w:t xml:space="preserve">Beispiel</w:t>
+      </w:r>
+    </w:p>
+    <w:p>
+      <w:pPr>
+        <w:keepLines/>
+        <w:pBdr>
+          <w:left w:val="single" w:color="1B6CA8" w:sz="18" w:space="6"/>
+        </w:pBdr>
+        <w:shd w:fill="F4F4F4" w:val="clear"/>
+        <w:spacing w:after="200" w:before="100" w:line="264" w:lineRule="auto"/>
+        <w:ind w:left="140"/>
+      </w:pPr>
+      <w:r>
+        <w:rPr>
+          <w:rFonts w:ascii="Consolas" w:cs="Consolas" w:eastAsia="Consolas" w:hAnsi="Consolas"/>
+          <w:sz w:val="19"/>
+          <w:szCs w:val="19"/>
+        </w:rPr>
+        <w:t xml:space="preserve">DIM linksFlag AS INTEGER</w:t>
+      </w:r>
+      <w:r>
+        <w:rPr>
+          <w:rFonts w:ascii="Consolas" w:cs="Consolas" w:eastAsia="Consolas" w:hAnsi="Consolas"/>
+          <w:sz w:val="19"/>
+          <w:szCs w:val="19"/>
+        </w:rPr>
+        <w:br/>
+        <w:t xml:space="preserve">linksFlag = 1                  ' 1 = nach links spiegeln, 0 = nicht</w:t>
+      </w:r>
+      <w:r>
+        <w:rPr>
+          <w:rFonts w:ascii="Consolas" w:cs="Consolas" w:eastAsia="Consolas" w:hAnsi="Consolas"/>
+          <w:sz w:val="19"/>
+          <w:szCs w:val="19"/>
+        </w:rPr>
+        <w:br/>
+        <w:t xml:space="preserve">ATLAS_DRAW_FLIPPED(atlas, "walk_a", x, y, linksFlag, 0)</w:t>
+      </w:r>
+    </w:p>
+    <w:p>
+      <w:pPr>
+        <w:keepNext/>
+        <w:keepLines/>
+        <w:pBdr>
+          <w:bottom w:val="single" w:color="DDD0C0" w:sz="4" w:space="2"/>
+        </w:pBdr>
+        <w:spacing w:after="40" w:before="360"/>
+      </w:pPr>
+      <w:r>
+        <w:rPr>
+          <w:rFonts w:ascii="Consolas" w:cs="Consolas" w:eastAsia="Consolas" w:hAnsi="Consolas"/>
+          <w:b/>
+          <w:bCs/>
+          <w:color w:val="9A3412"/>
+          <w:sz w:val="24"/>
+          <w:szCs w:val="24"/>
+        </w:rPr>
+        <w:t xml:space="preserve">BATCH_DRAW · BATCH_FLUSH</w:t>
+      </w:r>
+    </w:p>
+    <w:p>
+      <w:pPr>
+        <w:keepNext/>
+        <w:spacing w:after="120"/>
+      </w:pPr>
+      <w:r>
+        <w:rPr>
+          <w:b/>
+          <w:bCs/>
+          <w:color w:val="6A6A6A"/>
+          <w:sz w:val="18"/>
+          <w:szCs w:val="18"/>
+        </w:rPr>
+        <w:t xml:space="preserve">Syntax:  </w:t>
+      </w:r>
+      <w:r>
+        <w:rPr>
+          <w:rFonts w:ascii="Consolas" w:cs="Consolas" w:eastAsia="Consolas" w:hAnsi="Consolas"/>
+          <w:color w:val="335577"/>
+          <w:sz w:val="19"/>
+          <w:szCs w:val="19"/>
+        </w:rPr>
+        <w:t xml:space="preserve">BATCH_DRAW(atlas, name$, x, y)   BATCH_FLUSH()</w:t>
+      </w:r>
+    </w:p>
+    <w:p>
+      <w:pPr>
+        <w:spacing w:after="180" w:line="312" w:lineRule="auto"/>
+      </w:pPr>
+      <w:r>
+        <w:rPr>
+          <w:sz w:val="22"/>
+          <w:szCs w:val="22"/>
+        </w:rPr>
+        <w:t xml:space="preserve">Für sehr viele Sprites aus demselben Atlas: BATCH_DRAW sammelt sie in einer Warteschlange, BATCH_FLUSH zeichnet sie alle in EINEM gebündelten Aufruf – deutlich schneller als hunderte Einzel-Draws. (FLIP und ein Layer-Wechsel lösen den Batch automatisch aus.)</w:t>
+      </w:r>
+    </w:p>
+    <w:p>
+      <w:pPr>
+        <w:keepNext/>
+        <w:spacing w:after="30" w:before="120"/>
+      </w:pPr>
+      <w:r>
+        <w:rPr>
+          <w:b/>
+          <w:bCs/>
+          <w:i/>
+          <w:iCs/>
+          <w:color w:val="6A6A6A"/>
+          <w:sz w:val="18"/>
+          <w:szCs w:val="18"/>
+        </w:rPr>
+        <w:t xml:space="preserve">Beispiel</w:t>
+      </w:r>
+    </w:p>
+    <w:p>
+      <w:pPr>
+        <w:keepLines/>
+        <w:pBdr>
+          <w:left w:val="single" w:color="1B6CA8" w:sz="18" w:space="6"/>
+        </w:pBdr>
+        <w:shd w:fill="F4F4F4" w:val="clear"/>
+        <w:spacing w:after="200" w:before="100" w:line="264" w:lineRule="auto"/>
+        <w:ind w:left="140"/>
+      </w:pPr>
+      <w:r>
+        <w:rPr>
+          <w:rFonts w:ascii="Consolas" w:cs="Consolas" w:eastAsia="Consolas" w:hAnsi="Consolas"/>
+          <w:sz w:val="19"/>
+          <w:szCs w:val="19"/>
+        </w:rPr>
+        <w:t xml:space="preserve">DIM r AS INTEGER</w:t>
+      </w:r>
+      <w:r>
+        <w:rPr>
+          <w:rFonts w:ascii="Consolas" w:cs="Consolas" w:eastAsia="Consolas" w:hAnsi="Consolas"/>
+          <w:sz w:val="19"/>
+          <w:szCs w:val="19"/>
+        </w:rPr>
+        <w:br/>
+        <w:t xml:space="preserve">DIM c AS INTEGER</w:t>
+      </w:r>
+      <w:r>
+        <w:rPr>
+          <w:rFonts w:ascii="Consolas" w:cs="Consolas" w:eastAsia="Consolas" w:hAnsi="Consolas"/>
+          <w:sz w:val="19"/>
+          <w:szCs w:val="19"/>
+        </w:rPr>
+        <w:br/>
+        <w:t xml:space="preserve">FOR r = 0 TO 19</w:t>
+      </w:r>
+      <w:r>
+        <w:rPr>
+          <w:rFonts w:ascii="Consolas" w:cs="Consolas" w:eastAsia="Consolas" w:hAnsi="Consolas"/>
+          <w:sz w:val="19"/>
+          <w:szCs w:val="19"/>
+        </w:rPr>
+        <w:br/>
+        <w:t xml:space="preserve">    FOR c = 0 TO 29</w:t>
+      </w:r>
+      <w:r>
+        <w:rPr>
+          <w:rFonts w:ascii="Consolas" w:cs="Consolas" w:eastAsia="Consolas" w:hAnsi="Consolas"/>
+          <w:sz w:val="19"/>
+          <w:szCs w:val="19"/>
+        </w:rPr>
+        <w:br/>
+        <w:t xml:space="preserve">        BATCH_DRAW(atlas, "stand", c * 16, r * 16)</w:t>
+      </w:r>
+      <w:r>
+        <w:rPr>
+          <w:rFonts w:ascii="Consolas" w:cs="Consolas" w:eastAsia="Consolas" w:hAnsi="Consolas"/>
+          <w:sz w:val="19"/>
+          <w:szCs w:val="19"/>
+        </w:rPr>
+        <w:br/>
+        <w:t xml:space="preserve">    NEXT</w:t>
+      </w:r>
+      <w:r>
+        <w:rPr>
+          <w:rFonts w:ascii="Consolas" w:cs="Consolas" w:eastAsia="Consolas" w:hAnsi="Consolas"/>
+          <w:sz w:val="19"/>
+          <w:szCs w:val="19"/>
+        </w:rPr>
+        <w:br/>
+        <w:t xml:space="preserve">NEXT</w:t>
+      </w:r>
+      <w:r>
+        <w:rPr>
+          <w:rFonts w:ascii="Consolas" w:cs="Consolas" w:eastAsia="Consolas" w:hAnsi="Consolas"/>
+          <w:sz w:val="19"/>
+          <w:szCs w:val="19"/>
+        </w:rPr>
+        <w:br/>
+        <w:t xml:space="preserve">BATCH_FLUSH()    ' alle 600 in einem Rutsch</w:t>
+      </w:r>
+    </w:p>
+    <w:p>
+      <w:pPr>
+        <w:pStyle w:val="Heading2"/>
+        <w:keepNext/>
+        <w:keepLines/>
+        <w:spacing w:after="120" w:before="280"/>
+      </w:pPr>
+      <w:r>
+        <w:t xml:space="preserve">Hunderte Formen auf einmal: Bulk-Draws</w:t>
+      </w:r>
+    </w:p>
+    <w:p>
+      <w:pPr>
+        <w:spacing w:after="180" w:line="312" w:lineRule="auto"/>
+      </w:pPr>
+      <w:r>
+        <w:rPr>
+          <w:sz w:val="22"/>
+          <w:szCs w:val="22"/>
+        </w:rPr>
+        <w:t xml:space="preserve">Willst du sehr viele gleichartige Formen zeichnen – ein Sternenfeld, eine Punktwolke, ein Partikelregen –, ist eine Schleife mit einzelnen PLOT-Aufrufen langsam. Die Bulk-Befehle nehmen stattdessen ganze Arrays an Koordinaten und zeichnen alles in einem einzigen Aufruf. Die Farbe ist entweder eine Zahl (alle gleich) oder ein Array (eine Farbe pro Form).</w:t>
+      </w:r>
+    </w:p>
+    <w:p>
+      <w:pPr>
+        <w:keepNext/>
+        <w:keepLines/>
+        <w:pBdr>
+          <w:bottom w:val="single" w:color="DDD0C0" w:sz="4" w:space="2"/>
+        </w:pBdr>
+        <w:spacing w:after="40" w:before="360"/>
+      </w:pPr>
+      <w:r>
+        <w:rPr>
+          <w:rFonts w:ascii="Consolas" w:cs="Consolas" w:eastAsia="Consolas" w:hAnsi="Consolas"/>
+          <w:b/>
+          <w:bCs/>
+          <w:color w:val="9A3412"/>
+          <w:sz w:val="24"/>
+          <w:szCs w:val="24"/>
+        </w:rPr>
+        <w:t xml:space="preserve">PLOTS</w:t>
+      </w:r>
+    </w:p>
+    <w:p>
+      <w:pPr>
+        <w:keepNext/>
+        <w:spacing w:after="120"/>
+      </w:pPr>
+      <w:r>
+        <w:rPr>
+          <w:b/>
+          <w:bCs/>
+          <w:color w:val="6A6A6A"/>
+          <w:sz w:val="18"/>
+          <w:szCs w:val="18"/>
+        </w:rPr>
+        <w:t xml:space="preserve">Syntax:  </w:t>
+      </w:r>
+      <w:r>
+        <w:rPr>
+          <w:rFonts w:ascii="Consolas" w:cs="Consolas" w:eastAsia="Consolas" w:hAnsi="Consolas"/>
+          <w:color w:val="335577"/>
+          <w:sz w:val="19"/>
+          <w:szCs w:val="19"/>
+        </w:rPr>
+        <w:t xml:space="preserve">PLOTS(xs, ys, farbe)</w:t>
+      </w:r>
+    </w:p>
+    <w:p>
+      <w:pPr>
+        <w:spacing w:after="180" w:line="312" w:lineRule="auto"/>
+      </w:pPr>
+      <w:r>
+        <w:rPr>
+          <w:sz w:val="22"/>
+          <w:szCs w:val="22"/>
+        </w:rPr>
+        <w:t xml:space="preserve">Zeichnet viele Pixel auf einmal. xs und ys sind gleich lange Arrays mit den Koordinaten. Ideal für Sternenfelder und Punktwolken.</w:t>
+      </w:r>
+    </w:p>
+    <w:p>
+      <w:pPr>
+        <w:keepNext/>
+        <w:spacing w:after="30" w:before="120"/>
+      </w:pPr>
+      <w:r>
+        <w:rPr>
+          <w:b/>
+          <w:bCs/>
+          <w:i/>
+          <w:iCs/>
+          <w:color w:val="6A6A6A"/>
+          <w:sz w:val="18"/>
+          <w:szCs w:val="18"/>
+        </w:rPr>
+        <w:t xml:space="preserve">Beispiel</w:t>
+      </w:r>
+    </w:p>
+    <w:p>
+      <w:pPr>
+        <w:keepLines/>
+        <w:pBdr>
+          <w:left w:val="single" w:color="1B6CA8" w:sz="18" w:space="6"/>
+        </w:pBdr>
+        <w:shd w:fill="F4F4F4" w:val="clear"/>
+        <w:spacing w:after="200" w:before="100" w:line="264" w:lineRule="auto"/>
+        <w:ind w:left="140"/>
+      </w:pPr>
+      <w:r>
+        <w:rPr>
+          <w:rFonts w:ascii="Consolas" w:cs="Consolas" w:eastAsia="Consolas" w:hAnsi="Consolas"/>
+          <w:sz w:val="19"/>
+          <w:szCs w:val="19"/>
+        </w:rPr>
+        <w:t xml:space="preserve">DIM xs[3] AS INTEGER</w:t>
+      </w:r>
+      <w:r>
+        <w:rPr>
+          <w:rFonts w:ascii="Consolas" w:cs="Consolas" w:eastAsia="Consolas" w:hAnsi="Consolas"/>
+          <w:sz w:val="19"/>
+          <w:szCs w:val="19"/>
+        </w:rPr>
+        <w:br/>
+        <w:t xml:space="preserve">DIM ys[3] AS INTEGER</w:t>
+      </w:r>
+      <w:r>
+        <w:rPr>
+          <w:rFonts w:ascii="Consolas" w:cs="Consolas" w:eastAsia="Consolas" w:hAnsi="Consolas"/>
+          <w:sz w:val="19"/>
+          <w:szCs w:val="19"/>
+        </w:rPr>
+        <w:br/>
+        <w:t xml:space="preserve">xs[0]=10 : xs[1]=50 : xs[2]=90</w:t>
+      </w:r>
+      <w:r>
+        <w:rPr>
+          <w:rFonts w:ascii="Consolas" w:cs="Consolas" w:eastAsia="Consolas" w:hAnsi="Consolas"/>
+          <w:sz w:val="19"/>
+          <w:szCs w:val="19"/>
+        </w:rPr>
+        <w:br/>
+        <w:t xml:space="preserve">ys[0]=20 : ys[1]=40 : ys[2]=60</w:t>
+      </w:r>
+      <w:r>
+        <w:rPr>
+          <w:rFonts w:ascii="Consolas" w:cs="Consolas" w:eastAsia="Consolas" w:hAnsi="Consolas"/>
+          <w:sz w:val="19"/>
+          <w:szCs w:val="19"/>
+        </w:rPr>
+        <w:br/>
+        <w:t xml:space="preserve">PLOTS(xs, ys, WHITE)</w:t>
+      </w:r>
+    </w:p>
+    <w:p>
+      <w:pPr>
+        <w:keepNext/>
+        <w:keepLines/>
+        <w:pBdr>
+          <w:bottom w:val="single" w:color="DDD0C0" w:sz="4" w:space="2"/>
+        </w:pBdr>
+        <w:spacing w:after="40" w:before="360"/>
+      </w:pPr>
+      <w:r>
+        <w:rPr>
+          <w:rFonts w:ascii="Consolas" w:cs="Consolas" w:eastAsia="Consolas" w:hAnsi="Consolas"/>
+          <w:b/>
+          <w:bCs/>
+          <w:color w:val="9A3412"/>
+          <w:sz w:val="24"/>
+          <w:szCs w:val="24"/>
+        </w:rPr>
+        <w:t xml:space="preserve">CIRCLES · BOXES · LINES</w:t>
+      </w:r>
+    </w:p>
+    <w:p>
+      <w:pPr>
+        <w:keepNext/>
+        <w:spacing w:after="120"/>
+      </w:pPr>
+      <w:r>
+        <w:rPr>
+          <w:b/>
+          <w:bCs/>
+          <w:color w:val="6A6A6A"/>
+          <w:sz w:val="18"/>
+          <w:szCs w:val="18"/>
+        </w:rPr>
+        <w:t xml:space="preserve">Syntax:  </w:t>
+      </w:r>
+      <w:r>
+        <w:rPr>
+          <w:rFonts w:ascii="Consolas" w:cs="Consolas" w:eastAsia="Consolas" w:hAnsi="Consolas"/>
+          <w:color w:val="335577"/>
+          <w:sz w:val="19"/>
+          <w:szCs w:val="19"/>
+        </w:rPr>
+        <w:t xml:space="preserve">CIRCLES(xs, ys, rs, farbe)   BOXES(x1s, y1s, x2s, y2s, farbe)   LINES(x1s, y1s, x2s, y2s, farbe)</w:t>
+      </w:r>
+    </w:p>
+    <w:p>
+      <w:pPr>
+        <w:spacing w:after="180" w:line="312" w:lineRule="auto"/>
+      </w:pPr>
+      <w:r>
+        <w:rPr>
+          <w:sz w:val="22"/>
+          <w:szCs w:val="22"/>
+        </w:rPr>
+        <w:t xml:space="preserve">Die Bulk-Varianten von CIRCLE, BOX und LINE: Jeder Parameter ist ein Array, und alle Formen werden in einem Aufruf gezeichnet. CIRCLES braucht zusätzlich ein Array der Radien.</w:t>
+      </w:r>
+    </w:p>
+    <w:p>
+      <w:pPr>
+        <w:keepNext/>
+        <w:spacing w:after="30" w:before="120"/>
+      </w:pPr>
+      <w:r>
+        <w:rPr>
+          <w:b/>
+          <w:bCs/>
+          <w:i/>
+          <w:iCs/>
+          <w:color w:val="6A6A6A"/>
+          <w:sz w:val="18"/>
+          <w:szCs w:val="18"/>
+        </w:rPr>
+        <w:t xml:space="preserve">Beispiel</w:t>
+      </w:r>
+    </w:p>
+    <w:p>
+      <w:pPr>
+        <w:keepLines/>
+        <w:pBdr>
+          <w:left w:val="single" w:color="1B6CA8" w:sz="18" w:space="6"/>
+        </w:pBdr>
+        <w:shd w:fill="F4F4F4" w:val="clear"/>
+        <w:spacing w:after="200" w:before="100" w:line="264" w:lineRule="auto"/>
+        <w:ind w:left="140"/>
+      </w:pPr>
+      <w:r>
+        <w:rPr>
+          <w:rFonts w:ascii="Consolas" w:cs="Consolas" w:eastAsia="Consolas" w:hAnsi="Consolas"/>
+          <w:sz w:val="19"/>
+          <w:szCs w:val="19"/>
+        </w:rPr>
+        <w:t xml:space="preserve">DIM cx[2] AS INTEGER</w:t>
+      </w:r>
+      <w:r>
+        <w:rPr>
+          <w:rFonts w:ascii="Consolas" w:cs="Consolas" w:eastAsia="Consolas" w:hAnsi="Consolas"/>
+          <w:sz w:val="19"/>
+          <w:szCs w:val="19"/>
+        </w:rPr>
+        <w:br/>
+        <w:t xml:space="preserve">DIM cy[2] AS INTEGER</w:t>
+      </w:r>
+      <w:r>
+        <w:rPr>
+          <w:rFonts w:ascii="Consolas" w:cs="Consolas" w:eastAsia="Consolas" w:hAnsi="Consolas"/>
+          <w:sz w:val="19"/>
+          <w:szCs w:val="19"/>
+        </w:rPr>
+        <w:br/>
+        <w:t xml:space="preserve">DIM cr[2] AS INTEGER</w:t>
+      </w:r>
+      <w:r>
+        <w:rPr>
+          <w:rFonts w:ascii="Consolas" w:cs="Consolas" w:eastAsia="Consolas" w:hAnsi="Consolas"/>
+          <w:sz w:val="19"/>
+          <w:szCs w:val="19"/>
+        </w:rPr>
+        <w:br/>
+        <w:t xml:space="preserve">cx[0]=80  : cy[0]=80  : cr[0]=20</w:t>
+      </w:r>
+      <w:r>
+        <w:rPr>
+          <w:rFonts w:ascii="Consolas" w:cs="Consolas" w:eastAsia="Consolas" w:hAnsi="Consolas"/>
+          <w:sz w:val="19"/>
+          <w:szCs w:val="19"/>
+        </w:rPr>
+        <w:br/>
+        <w:t xml:space="preserve">cx[1]=200 : cy[1]=120 : cr[1]=35</w:t>
+      </w:r>
+      <w:r>
+        <w:rPr>
+          <w:rFonts w:ascii="Consolas" w:cs="Consolas" w:eastAsia="Consolas" w:hAnsi="Consolas"/>
+          <w:sz w:val="19"/>
+          <w:szCs w:val="19"/>
+        </w:rPr>
+        <w:br/>
+        <w:t xml:space="preserve">CIRCLES(cx, cy, cr, RGB(90, 140, 220))</w:t>
+      </w:r>
+    </w:p>
+    <w:p>
+      <w:pPr>
+        <w:spacing w:before="60"/>
+      </w:pPr>
+    </w:p>
+    <w:tbl>
+      <w:tblPr>
+        <w:tblW w:type="dxa" w:w="9360"/>
+        <w:tblBorders>
+          <w:top w:val="single" w:color="auto" w:sz="4"/>
+          <w:left w:val="single" w:color="auto" w:sz="4"/>
+          <w:bottom w:val="single" w:color="auto" w:sz="4"/>
+          <w:right w:val="single" w:color="auto" w:sz="4"/>
+          <w:insideH w:val="single" w:color="auto" w:sz="4"/>
+          <w:insideV w:val="single" w:color="auto" w:sz="4"/>
+        </w:tblBorders>
+      </w:tblPr>
+      <w:tblGrid>
+        <w:gridCol w:w="9360"/>
+      </w:tblGrid>
+      <w:tr>
+        <w:trPr>
+          <w:cantSplit/>
+        </w:trPr>
+        <w:tc>
+          <w:tcPr>
+            <w:tcW w:type="dxa" w:w="9360"/>
+            <w:tcBorders>
+              <w:top w:val="single" w:color="9CC8E6" w:sz="6"/>
+              <w:left w:val="single" w:color="9CC8E6" w:sz="6"/>
+              <w:bottom w:val="single" w:color="9CC8E6" w:sz="6"/>
+              <w:right w:val="single" w:color="9CC8E6" w:sz="6"/>
+            </w:tcBorders>
+            <w:shd w:fill="E7F2FA" w:val="clear"/>
+            <w:tcMar>
+              <w:top w:type="dxa" w:w="140"/>
+              <w:left w:type="dxa" w:w="180"/>
+              <w:bottom w:type="dxa" w:w="140"/>
+              <w:right w:type="dxa" w:w="180"/>
+            </w:tcMar>
+          </w:tcPr>
+          <w:p>
+            <w:pPr>
+              <w:spacing w:after="40"/>
+            </w:pPr>
+            <w:r>
+              <w:rPr>
+                <w:b/>
+                <w:bCs/>
+                <w:color w:val="1B6CA8"/>
+                <w:sz w:val="22"/>
+                <w:szCs w:val="22"/>
+              </w:rPr>
+              <w:t xml:space="preserve">Wann Bulk?</w:t>
+            </w:r>
+          </w:p>
+          <w:p>
+            <w:pPr>
+              <w:spacing w:after="0" w:line="312" w:lineRule="auto"/>
+            </w:pPr>
+            <w:r>
+              <w:rPr>
+                <w:sz w:val="22"/>
+                <w:szCs w:val="22"/>
+              </w:rPr>
+              <w:t xml:space="preserve">Für eine Handvoll Formen sind die normalen Befehle (CIRCLE, BOX …) völlig in Ordnung und lesbarer. Die Bulk-Varianten lohnen sich erst bei vielen hundert oder tausend gleichartigen Formen pro Frame – dann sparen sie spürbar Zeit.</w:t>
             </w:r>
           </w:p>
         </w:tc>

</xml_diff>

<commit_message>
fix(gbrt): ATLAS_DRAW_FLIPPED -- flip_x/flip_y konsistent + echtes flip_y
Vorher: flip_x akzeptierte nur Bool(true) (1/0 schlug still fehl), Arg 5 wurde
als TINT (Zahl) statt flip_y interpretiert -> die dokumentierte Form
ATLAS_DRAW_FLIPPED(a, n, x, y, flip, FALSE) crashte ("erwartet Zahl, erhalten
BOOLEAN"), u.a. examples/77_tiled_platformer.gb.

Jetzt: ATLAS_DRAW_FLIPPED(atlas, name, x, y[, flip_x[, flip_y[, tint]]]).
flip_x/flip_y via gflag() (TRUE/FALSE ODER 1/0), flip_y spiegelt wirklich
vertikal (negative Source-Hoehe wie SpriteDraw), tint als optionaler 7. Arg.
Cmd::AtlasDraw + atlas_draw() um flip_v erweitert. docs + Lehrbuch Kap 47
angepasst. Verifiziert (alle Flip-Varianten headless), 9 atlas-Tests gruen,
Beispiel 77 laeuft wieder.

Co-Authored-By: Claude Opus 4.8 (1M context) <noreply@anthropic.com>
</commit_message>
<xml_diff>
--- a/buch-referenz/buch/GameBasic-Lehrbuch.docx
+++ b/buch-referenz/buch/GameBasic-Lehrbuch.docx
@@ -53244,7 +53244,7 @@
           <w:sz w:val="22"/>
           <w:szCs w:val="22"/>
         </w:rPr>
-        <w:t xml:space="preserve">Zeichnet ein Sub-Sprite gespiegelt. Klassisch für Lauf-Animationen: Nur die nach rechts blickende Variante liegt im Atlas, nach links wird per flipX abgeleitet. Die Flip-Schalter gibst du als 1 (spiegeln) oder 0 (nicht) an.</w:t>
+        <w:t xml:space="preserve">Zeichnet ein Sub-Sprite gespiegelt: flipX waagerecht, flipY senkrecht (jeweils TRUE/FALSE). Klassisch für Lauf-Animationen – nur die nach rechts blickende Variante liegt im Atlas, nach links wird per flipX abgeleitet.</w:t>
       </w:r>
     </w:p>
     <w:p>
@@ -53281,25 +53281,25 @@
           <w:sz w:val="19"/>
           <w:szCs w:val="19"/>
         </w:rPr>
-        <w:t xml:space="preserve">DIM linksFlag AS INTEGER</w:t>
-      </w:r>
-      <w:r>
-        <w:rPr>
-          <w:rFonts w:ascii="Consolas" w:cs="Consolas" w:eastAsia="Consolas" w:hAnsi="Consolas"/>
-          <w:sz w:val="19"/>
-          <w:szCs w:val="19"/>
-        </w:rPr>
-        <w:br/>
-        <w:t xml:space="preserve">linksFlag = 1                  ' 1 = nach links spiegeln, 0 = nicht</w:t>
-      </w:r>
-      <w:r>
-        <w:rPr>
-          <w:rFonts w:ascii="Consolas" w:cs="Consolas" w:eastAsia="Consolas" w:hAnsi="Consolas"/>
-          <w:sz w:val="19"/>
-          <w:szCs w:val="19"/>
-        </w:rPr>
-        <w:br/>
-        <w:t xml:space="preserve">ATLAS_DRAW_FLIPPED(atlas, "walk_a", x, y, linksFlag, 0)</w:t>
+        <w:t xml:space="preserve">DIM blicktLinks AS BOOLEAN</w:t>
+      </w:r>
+      <w:r>
+        <w:rPr>
+          <w:rFonts w:ascii="Consolas" w:cs="Consolas" w:eastAsia="Consolas" w:hAnsi="Consolas"/>
+          <w:sz w:val="19"/>
+          <w:szCs w:val="19"/>
+        </w:rPr>
+        <w:br/>
+        <w:t xml:space="preserve">blicktLinks = TRUE</w:t>
+      </w:r>
+      <w:r>
+        <w:rPr>
+          <w:rFonts w:ascii="Consolas" w:cs="Consolas" w:eastAsia="Consolas" w:hAnsi="Consolas"/>
+          <w:sz w:val="19"/>
+          <w:szCs w:val="19"/>
+        </w:rPr>
+        <w:br/>
+        <w:t xml:space="preserve">ATLAS_DRAW_FLIPPED(atlas, "walk_a", x, y, blicktLinks, FALSE)</w:t>
       </w:r>
     </w:p>
     <w:p>

</xml_diff>

<commit_message>
docs(buch): Lehrbuch Kap 48 -- 3D-Grafik (Screenshot) -- Teil IV komplett
g3d: CAMERA3D, GRID3D, CUBE/_WIRES, SPHERE/_WIRES, CYLINDER (+Kegel),
PLANE/LINE3D/POINT3D; Ausblick auf Modelle (LOADMODEL/MESH_*), Beleuchtung
(LIGHT_*/MODEL_LIT) und Kamera-Modi/Picking. 3D-Szenen-Screenshot.
Je Beispiel, gegen gbrt verifiziert. Abschluss Teil IV.

Co-Authored-By: Claude Opus 4.8 (1M context) <noreply@anthropic.com>
</commit_message>
<xml_diff>
--- a/buch-referenz/buch/GameBasic-Lehrbuch.docx
+++ b/buch-referenz/buch/GameBasic-Lehrbuch.docx
@@ -110,7 +110,7 @@
           <w:sz w:val="24"/>
           <w:szCs w:val="24"/>
         </w:rPr>
-        <w:t xml:space="preserve">	5</w:t>
+        <w:t xml:space="preserve">	6</w:t>
       </w:r>
     </w:p>
     <w:p>
@@ -137,7 +137,7 @@
           <w:sz w:val="22"/>
           <w:szCs w:val="22"/>
         </w:rPr>
-        <w:t xml:space="preserve">	6</w:t>
+        <w:t xml:space="preserve">	7</w:t>
       </w:r>
     </w:p>
     <w:p>
@@ -164,7 +164,7 @@
           <w:sz w:val="22"/>
           <w:szCs w:val="22"/>
         </w:rPr>
-        <w:t xml:space="preserve">	7</w:t>
+        <w:t xml:space="preserve">	8</w:t>
       </w:r>
     </w:p>
     <w:p>
@@ -191,7 +191,7 @@
           <w:sz w:val="22"/>
           <w:szCs w:val="22"/>
         </w:rPr>
-        <w:t xml:space="preserve">	8</w:t>
+        <w:t xml:space="preserve">	9</w:t>
       </w:r>
     </w:p>
     <w:p>
@@ -218,7 +218,7 @@
           <w:sz w:val="22"/>
           <w:szCs w:val="22"/>
         </w:rPr>
-        <w:t xml:space="preserve">	10</w:t>
+        <w:t xml:space="preserve">	11</w:t>
       </w:r>
     </w:p>
     <w:p>
@@ -245,7 +245,7 @@
           <w:sz w:val="24"/>
           <w:szCs w:val="24"/>
         </w:rPr>
-        <w:t xml:space="preserve">	12</w:t>
+        <w:t xml:space="preserve">	13</w:t>
       </w:r>
     </w:p>
     <w:p>
@@ -272,7 +272,7 @@
           <w:sz w:val="22"/>
           <w:szCs w:val="22"/>
         </w:rPr>
-        <w:t xml:space="preserve">	13</w:t>
+        <w:t xml:space="preserve">	14</w:t>
       </w:r>
     </w:p>
     <w:p>
@@ -299,7 +299,7 @@
           <w:sz w:val="22"/>
           <w:szCs w:val="22"/>
         </w:rPr>
-        <w:t xml:space="preserve">	16</w:t>
+        <w:t xml:space="preserve">	17</w:t>
       </w:r>
     </w:p>
     <w:p>
@@ -326,7 +326,7 @@
           <w:sz w:val="22"/>
           <w:szCs w:val="22"/>
         </w:rPr>
-        <w:t xml:space="preserve">	20</w:t>
+        <w:t xml:space="preserve">	21</w:t>
       </w:r>
     </w:p>
     <w:p>
@@ -353,7 +353,7 @@
           <w:sz w:val="22"/>
           <w:szCs w:val="22"/>
         </w:rPr>
-        <w:t xml:space="preserve">	24</w:t>
+        <w:t xml:space="preserve">	25</w:t>
       </w:r>
     </w:p>
     <w:p>
@@ -380,7 +380,7 @@
           <w:sz w:val="22"/>
           <w:szCs w:val="22"/>
         </w:rPr>
-        <w:t xml:space="preserve">	29</w:t>
+        <w:t xml:space="preserve">	30</w:t>
       </w:r>
     </w:p>
     <w:p>
@@ -407,7 +407,7 @@
           <w:sz w:val="22"/>
           <w:szCs w:val="22"/>
         </w:rPr>
-        <w:t xml:space="preserve">	34</w:t>
+        <w:t xml:space="preserve">	35</w:t>
       </w:r>
     </w:p>
     <w:p>
@@ -434,7 +434,7 @@
           <w:sz w:val="22"/>
           <w:szCs w:val="22"/>
         </w:rPr>
-        <w:t xml:space="preserve">	39</w:t>
+        <w:t xml:space="preserve">	40</w:t>
       </w:r>
     </w:p>
     <w:p>
@@ -461,7 +461,7 @@
           <w:sz w:val="22"/>
           <w:szCs w:val="22"/>
         </w:rPr>
-        <w:t xml:space="preserve">	45</w:t>
+        <w:t xml:space="preserve">	46</w:t>
       </w:r>
     </w:p>
     <w:p>
@@ -488,7 +488,7 @@
           <w:sz w:val="22"/>
           <w:szCs w:val="22"/>
         </w:rPr>
-        <w:t xml:space="preserve">	52</w:t>
+        <w:t xml:space="preserve">	53</w:t>
       </w:r>
     </w:p>
     <w:p>
@@ -515,7 +515,7 @@
           <w:sz w:val="22"/>
           <w:szCs w:val="22"/>
         </w:rPr>
-        <w:t xml:space="preserve">	57</w:t>
+        <w:t xml:space="preserve">	58</w:t>
       </w:r>
     </w:p>
     <w:p>
@@ -542,7 +542,7 @@
           <w:sz w:val="22"/>
           <w:szCs w:val="22"/>
         </w:rPr>
-        <w:t xml:space="preserve">	61</w:t>
+        <w:t xml:space="preserve">	62</w:t>
       </w:r>
     </w:p>
     <w:p>
@@ -569,7 +569,7 @@
           <w:sz w:val="22"/>
           <w:szCs w:val="22"/>
         </w:rPr>
-        <w:t xml:space="preserve">	66</w:t>
+        <w:t xml:space="preserve">	67</w:t>
       </w:r>
     </w:p>
     <w:p>
@@ -596,7 +596,7 @@
           <w:sz w:val="22"/>
           <w:szCs w:val="22"/>
         </w:rPr>
-        <w:t xml:space="preserve">	72</w:t>
+        <w:t xml:space="preserve">	73</w:t>
       </w:r>
     </w:p>
     <w:p>
@@ -623,7 +623,7 @@
           <w:sz w:val="22"/>
           <w:szCs w:val="22"/>
         </w:rPr>
-        <w:t xml:space="preserve">	75</w:t>
+        <w:t xml:space="preserve">	76</w:t>
       </w:r>
     </w:p>
     <w:p>
@@ -650,7 +650,7 @@
           <w:sz w:val="22"/>
           <w:szCs w:val="22"/>
         </w:rPr>
-        <w:t xml:space="preserve">	78</w:t>
+        <w:t xml:space="preserve">	79</w:t>
       </w:r>
     </w:p>
     <w:p>
@@ -677,7 +677,7 @@
           <w:sz w:val="22"/>
           <w:szCs w:val="22"/>
         </w:rPr>
-        <w:t xml:space="preserve">	81</w:t>
+        <w:t xml:space="preserve">	82</w:t>
       </w:r>
     </w:p>
     <w:p>
@@ -704,7 +704,7 @@
           <w:sz w:val="22"/>
           <w:szCs w:val="22"/>
         </w:rPr>
-        <w:t xml:space="preserve">	85</w:t>
+        <w:t xml:space="preserve">	86</w:t>
       </w:r>
     </w:p>
     <w:p>
@@ -731,7 +731,7 @@
           <w:sz w:val="24"/>
           <w:szCs w:val="24"/>
         </w:rPr>
-        <w:t xml:space="preserve">	88</w:t>
+        <w:t xml:space="preserve">	89</w:t>
       </w:r>
     </w:p>
     <w:p>
@@ -758,7 +758,7 @@
           <w:sz w:val="22"/>
           <w:szCs w:val="22"/>
         </w:rPr>
-        <w:t xml:space="preserve">	89</w:t>
+        <w:t xml:space="preserve">	90</w:t>
       </w:r>
     </w:p>
     <w:p>
@@ -785,7 +785,7 @@
           <w:sz w:val="22"/>
           <w:szCs w:val="22"/>
         </w:rPr>
-        <w:t xml:space="preserve">	92</w:t>
+        <w:t xml:space="preserve">	93</w:t>
       </w:r>
     </w:p>
     <w:p>
@@ -812,7 +812,7 @@
           <w:sz w:val="22"/>
           <w:szCs w:val="22"/>
         </w:rPr>
-        <w:t xml:space="preserve">	96</w:t>
+        <w:t xml:space="preserve">	97</w:t>
       </w:r>
     </w:p>
     <w:p>
@@ -839,7 +839,7 @@
           <w:sz w:val="22"/>
           <w:szCs w:val="22"/>
         </w:rPr>
-        <w:t xml:space="preserve">	99</w:t>
+        <w:t xml:space="preserve">	100</w:t>
       </w:r>
     </w:p>
     <w:p>
@@ -866,7 +866,7 @@
           <w:sz w:val="22"/>
           <w:szCs w:val="22"/>
         </w:rPr>
-        <w:t xml:space="preserve">	104</w:t>
+        <w:t xml:space="preserve">	105</w:t>
       </w:r>
     </w:p>
     <w:p>
@@ -893,7 +893,7 @@
           <w:sz w:val="22"/>
           <w:szCs w:val="22"/>
         </w:rPr>
-        <w:t xml:space="preserve">	108</w:t>
+        <w:t xml:space="preserve">	109</w:t>
       </w:r>
     </w:p>
     <w:p>
@@ -920,7 +920,7 @@
           <w:sz w:val="22"/>
           <w:szCs w:val="22"/>
         </w:rPr>
-        <w:t xml:space="preserve">	113</w:t>
+        <w:t xml:space="preserve">	114</w:t>
       </w:r>
     </w:p>
     <w:p>
@@ -947,7 +947,7 @@
           <w:sz w:val="22"/>
           <w:szCs w:val="22"/>
         </w:rPr>
-        <w:t xml:space="preserve">	117</w:t>
+        <w:t xml:space="preserve">	118</w:t>
       </w:r>
     </w:p>
     <w:p>
@@ -974,7 +974,7 @@
           <w:sz w:val="22"/>
           <w:szCs w:val="22"/>
         </w:rPr>
-        <w:t xml:space="preserve">	119</w:t>
+        <w:t xml:space="preserve">	120</w:t>
       </w:r>
     </w:p>
     <w:p>
@@ -1001,7 +1001,7 @@
           <w:sz w:val="24"/>
           <w:szCs w:val="24"/>
         </w:rPr>
-        <w:t xml:space="preserve">	125</w:t>
+        <w:t xml:space="preserve">	126</w:t>
       </w:r>
     </w:p>
     <w:p>
@@ -1028,7 +1028,7 @@
           <w:sz w:val="22"/>
           <w:szCs w:val="22"/>
         </w:rPr>
-        <w:t xml:space="preserve">	126</w:t>
+        <w:t xml:space="preserve">	127</w:t>
       </w:r>
     </w:p>
     <w:p>
@@ -1055,7 +1055,7 @@
           <w:sz w:val="22"/>
           <w:szCs w:val="22"/>
         </w:rPr>
-        <w:t xml:space="preserve">	131</w:t>
+        <w:t xml:space="preserve">	132</w:t>
       </w:r>
     </w:p>
     <w:p>
@@ -1082,7 +1082,7 @@
           <w:sz w:val="22"/>
           <w:szCs w:val="22"/>
         </w:rPr>
-        <w:t xml:space="preserve">	135</w:t>
+        <w:t xml:space="preserve">	136</w:t>
       </w:r>
     </w:p>
     <w:p>
@@ -1109,7 +1109,7 @@
           <w:sz w:val="22"/>
           <w:szCs w:val="22"/>
         </w:rPr>
-        <w:t xml:space="preserve">	140</w:t>
+        <w:t xml:space="preserve">	141</w:t>
       </w:r>
     </w:p>
     <w:p>
@@ -1136,7 +1136,7 @@
           <w:sz w:val="22"/>
           <w:szCs w:val="22"/>
         </w:rPr>
-        <w:t xml:space="preserve">	144</w:t>
+        <w:t xml:space="preserve">	145</w:t>
       </w:r>
     </w:p>
     <w:p>
@@ -1163,7 +1163,7 @@
           <w:sz w:val="22"/>
           <w:szCs w:val="22"/>
         </w:rPr>
-        <w:t xml:space="preserve">	147</w:t>
+        <w:t xml:space="preserve">	148</w:t>
       </w:r>
     </w:p>
     <w:p>
@@ -1190,7 +1190,7 @@
           <w:sz w:val="22"/>
           <w:szCs w:val="22"/>
         </w:rPr>
-        <w:t xml:space="preserve">	151</w:t>
+        <w:t xml:space="preserve">	152</w:t>
       </w:r>
     </w:p>
     <w:p>
@@ -1217,7 +1217,34 @@
           <w:sz w:val="22"/>
           <w:szCs w:val="22"/>
         </w:rPr>
-        <w:t xml:space="preserve">	155</w:t>
+        <w:t xml:space="preserve">	156</w:t>
+      </w:r>
+    </w:p>
+    <w:p>
+      <w:pPr>
+        <w:tabs>
+          <w:tab w:val="right" w:pos="9200" w:leader="dot"/>
+        </w:tabs>
+        <w:spacing w:after="20" w:before="0"/>
+        <w:ind w:left="280"/>
+      </w:pPr>
+      <w:r>
+        <w:rPr>
+          <w:b w:val="false"/>
+          <w:bCs w:val="false"/>
+          <w:color w:val="222222"/>
+          <w:sz w:val="22"/>
+          <w:szCs w:val="22"/>
+        </w:rPr>
+        <w:t xml:space="preserve">3D-Grafik</w:t>
+      </w:r>
+      <w:r>
+        <w:rPr>
+          <w:color w:val="555555"/>
+          <w:sz w:val="22"/>
+          <w:szCs w:val="22"/>
+        </w:rPr>
+        <w:t xml:space="preserve">	160</w:t>
       </w:r>
     </w:p>
     <w:p>
@@ -53820,6 +53847,1130 @@
                 <w:szCs w:val="22"/>
               </w:rPr>
               <w:t xml:space="preserve">Für eine Handvoll Formen sind die normalen Befehle (CIRCLE, BOX …) völlig in Ordnung und lesbarer. Die Bulk-Varianten lohnen sich erst bei vielen hundert oder tausend gleichartigen Formen pro Frame – dann sparen sie spürbar Zeit.</w:t>
+            </w:r>
+          </w:p>
+        </w:tc>
+      </w:tr>
+    </w:tbl>
+    <w:p>
+      <w:pPr>
+        <w:spacing w:after="160"/>
+      </w:pPr>
+    </w:p>
+    <w:p>
+      <w:pPr>
+        <w:pStyle w:val="Heading1"/>
+        <w:keepNext/>
+        <w:keepLines/>
+        <w:pageBreakBefore/>
+        <w:pBdr>
+          <w:bottom w:val="single" w:color="1B6CA8" w:sz="12" w:space="4"/>
+        </w:pBdr>
+        <w:spacing w:after="160" w:before="0"/>
+      </w:pPr>
+      <w:r>
+        <w:t xml:space="preserve">3D-Grafik</w:t>
+      </w:r>
+    </w:p>
+    <w:p>
+      <w:pPr>
+        <w:spacing w:after="180" w:line="312" w:lineRule="auto"/>
+      </w:pPr>
+      <w:r>
+        <w:rPr>
+          <w:sz w:val="22"/>
+          <w:szCs w:val="22"/>
+        </w:rPr>
+        <w:t xml:space="preserve">GameBasic kann nicht nur flache 2D-Bilder, sondern auch echte 3D-Welten zeichnen – mit dem Modul g3d. Dazu kommt eine dritte Koordinate hinzu: z (Tiefe). Eine virtuelle Kamera blickt von einem Punkt im Raum auf ein Ziel, und du platzierst Körper wie Würfel, Kugeln und Zylinder an beliebigen Stellen. Dieses Kapitel zeigt die Grundbausteine; 3D ist ein großes Thema, in das du hier nur den ersten Blick wirfst.</w:t>
+      </w:r>
+    </w:p>
+    <w:p>
+      <w:pPr>
+        <w:keepNext/>
+        <w:spacing w:after="40" w:before="160"/>
+        <w:jc w:val="center"/>
+      </w:pPr>
+      <w:r>
+        <w:drawing>
+          <wp:inline distT="0" distB="0" distL="0" distR="0">
+            <wp:extent cx="4572000" cy="3048000"/>
+            <wp:effectExtent t="0" r="0" b="0" l="0"/>
+            <wp:docPr id="1" name="48_3d.png" descr="Eine einfache 3D-Szene: Boden-Raster, Würfel (mit Drahtgitter), Kugel, Zylinder und Kegel." title="Eine einfache 3D-Szene: Boden-Raster, Würfel (mit Drahtgitter), Kugel, Zylinder und Kegel."/>
+            <wp:cNvGraphicFramePr>
+              <a:graphicFrameLocks xmlns:a="http://schemas.openxmlformats.org/drawingml/2006/main" noChangeAspect="1"/>
+            </wp:cNvGraphicFramePr>
+            <a:graphic xmlns:a="http://schemas.openxmlformats.org/drawingml/2006/main">
+              <a:graphicData uri="http://schemas.openxmlformats.org/drawingml/2006/picture">
+                <pic:pic xmlns:pic="http://schemas.openxmlformats.org/drawingml/2006/picture">
+                  <pic:nvPicPr>
+                    <pic:cNvPr id="0" name="" descr=""/>
+                    <pic:cNvPicPr>
+                      <a:picLocks noChangeAspect="1" noChangeArrowheads="1"/>
+                    </pic:cNvPicPr>
+                  </pic:nvPicPr>
+                  <pic:blipFill>
+                    <a:blip r:embed="rId17" cstate="none"/>
+                    <a:srcRect/>
+                    <a:stretch>
+                      <a:fillRect/>
+                    </a:stretch>
+                  </pic:blipFill>
+                  <pic:spPr bwMode="auto">
+                    <a:xfrm>
+                      <a:off x="0" y="0"/>
+                      <a:ext cx="4572000" cy="3048000"/>
+                    </a:xfrm>
+                    <a:prstGeom prst="rect">
+                      <a:avLst/>
+                    </a:prstGeom>
+                  </pic:spPr>
+                </pic:pic>
+              </a:graphicData>
+            </a:graphic>
+          </wp:inline>
+        </w:drawing>
+      </w:r>
+    </w:p>
+    <w:p>
+      <w:pPr>
+        <w:spacing w:after="200"/>
+        <w:jc w:val="center"/>
+      </w:pPr>
+      <w:r>
+        <w:rPr>
+          <w:i/>
+          <w:iCs/>
+          <w:color w:val="6A6A6A"/>
+          <w:sz w:val="18"/>
+          <w:szCs w:val="18"/>
+        </w:rPr>
+        <w:t xml:space="preserve">Eine einfache 3D-Szene: Boden-Raster, Würfel (mit Drahtgitter), Kugel, Zylinder und Kegel.</w:t>
+      </w:r>
+    </w:p>
+    <w:p>
+      <w:pPr>
+        <w:spacing w:before="60"/>
+      </w:pPr>
+    </w:p>
+    <w:tbl>
+      <w:tblPr>
+        <w:tblW w:type="dxa" w:w="9360"/>
+        <w:tblBorders>
+          <w:top w:val="single" w:color="auto" w:sz="4"/>
+          <w:left w:val="single" w:color="auto" w:sz="4"/>
+          <w:bottom w:val="single" w:color="auto" w:sz="4"/>
+          <w:right w:val="single" w:color="auto" w:sz="4"/>
+          <w:insideH w:val="single" w:color="auto" w:sz="4"/>
+          <w:insideV w:val="single" w:color="auto" w:sz="4"/>
+        </w:tblBorders>
+      </w:tblPr>
+      <w:tblGrid>
+        <w:gridCol w:w="9360"/>
+      </w:tblGrid>
+      <w:tr>
+        <w:trPr>
+          <w:cantSplit/>
+        </w:trPr>
+        <w:tc>
+          <w:tcPr>
+            <w:tcW w:type="dxa" w:w="9360"/>
+            <w:tcBorders>
+              <w:top w:val="single" w:color="E0B96A" w:sz="6"/>
+              <w:left w:val="single" w:color="E0B96A" w:sz="6"/>
+              <w:bottom w:val="single" w:color="E0B96A" w:sz="6"/>
+              <w:right w:val="single" w:color="E0B96A" w:sz="6"/>
+            </w:tcBorders>
+            <w:shd w:fill="FDF3E0" w:val="clear"/>
+            <w:tcMar>
+              <w:top w:type="dxa" w:w="140"/>
+              <w:left w:type="dxa" w:w="180"/>
+              <w:bottom w:type="dxa" w:w="140"/>
+              <w:right w:type="dxa" w:w="180"/>
+            </w:tcMar>
+          </w:tcPr>
+          <w:p>
+            <w:pPr>
+              <w:spacing w:after="40"/>
+            </w:pPr>
+            <w:r>
+              <w:rPr>
+                <w:b/>
+                <w:bCs/>
+                <w:color w:val="9A6A1E"/>
+                <w:sz w:val="22"/>
+                <w:szCs w:val="22"/>
+              </w:rPr>
+              <w:t xml:space="preserve">Merke</w:t>
+            </w:r>
+          </w:p>
+          <w:p>
+            <w:pPr>
+              <w:spacing w:after="0" w:line="312" w:lineRule="auto"/>
+            </w:pPr>
+            <w:r>
+              <w:rPr>
+                <w:sz w:val="22"/>
+                <w:szCs w:val="22"/>
+              </w:rPr>
+              <w:t xml:space="preserve">3D läuft – wie der ganze Teil IV – nur im gbrt-Fenster. Der Aufbau ist wie in 2D: im Game-Loop CLS, dann zeichnen, dann FLIP. Nur kommt am Anfang jedes Frames die Kamera dazu, und alle Befehle stammen aus dem Modul g3d (IMPORT "g3d").</w:t>
+            </w:r>
+          </w:p>
+        </w:tc>
+      </w:tr>
+    </w:tbl>
+    <w:p>
+      <w:pPr>
+        <w:spacing w:after="160"/>
+      </w:pPr>
+    </w:p>
+    <w:p>
+      <w:pPr>
+        <w:pStyle w:val="Heading2"/>
+        <w:keepNext/>
+        <w:keepLines/>
+        <w:spacing w:after="120" w:before="280"/>
+      </w:pPr>
+      <w:r>
+        <w:t xml:space="preserve">Die Kamera</w:t>
+      </w:r>
+    </w:p>
+    <w:p>
+      <w:pPr>
+        <w:keepNext/>
+        <w:keepLines/>
+        <w:pBdr>
+          <w:bottom w:val="single" w:color="DDD0C0" w:sz="4" w:space="2"/>
+        </w:pBdr>
+        <w:spacing w:after="40" w:before="360"/>
+      </w:pPr>
+      <w:r>
+        <w:rPr>
+          <w:rFonts w:ascii="Consolas" w:cs="Consolas" w:eastAsia="Consolas" w:hAnsi="Consolas"/>
+          <w:b/>
+          <w:bCs/>
+          <w:color w:val="9A3412"/>
+          <w:sz w:val="24"/>
+          <w:szCs w:val="24"/>
+        </w:rPr>
+        <w:t xml:space="preserve">CAMERA3D</w:t>
+      </w:r>
+    </w:p>
+    <w:p>
+      <w:pPr>
+        <w:keepNext/>
+        <w:spacing w:after="120"/>
+      </w:pPr>
+      <w:r>
+        <w:rPr>
+          <w:b/>
+          <w:bCs/>
+          <w:color w:val="6A6A6A"/>
+          <w:sz w:val="18"/>
+          <w:szCs w:val="18"/>
+        </w:rPr>
+        <w:t xml:space="preserve">Syntax:  </w:t>
+      </w:r>
+      <w:r>
+        <w:rPr>
+          <w:rFonts w:ascii="Consolas" w:cs="Consolas" w:eastAsia="Consolas" w:hAnsi="Consolas"/>
+          <w:color w:val="335577"/>
+          <w:sz w:val="19"/>
+          <w:szCs w:val="19"/>
+        </w:rPr>
+        <w:t xml:space="preserve">CAMERA3D(px, py, pz, tx, ty, tz, fov)</w:t>
+      </w:r>
+    </w:p>
+    <w:p>
+      <w:pPr>
+        <w:spacing w:after="180" w:line="312" w:lineRule="auto"/>
+      </w:pPr>
+      <w:r>
+        <w:rPr>
+          <w:sz w:val="22"/>
+          <w:szCs w:val="22"/>
+        </w:rPr>
+        <w:t xml:space="preserve">Setzt die Kamera für diesen Frame: Sie steht am Punkt (px, py, pz) und blickt auf das Ziel (tx, ty, tz). fov ist der Blickwinkel in Grad (z. B. 45). Diesen Aufruf machst du als Erstes im 3D-Teil jedes Frames – noch vor den Körpern.</w:t>
+      </w:r>
+    </w:p>
+    <w:p>
+      <w:pPr>
+        <w:keepNext/>
+        <w:spacing w:after="30" w:before="120"/>
+      </w:pPr>
+      <w:r>
+        <w:rPr>
+          <w:b/>
+          <w:bCs/>
+          <w:i/>
+          <w:iCs/>
+          <w:color w:val="6A6A6A"/>
+          <w:sz w:val="18"/>
+          <w:szCs w:val="18"/>
+        </w:rPr>
+        <w:t xml:space="preserve">Beispiel</w:t>
+      </w:r>
+    </w:p>
+    <w:p>
+      <w:pPr>
+        <w:keepLines/>
+        <w:pBdr>
+          <w:left w:val="single" w:color="1B6CA8" w:sz="18" w:space="6"/>
+        </w:pBdr>
+        <w:shd w:fill="F4F4F4" w:val="clear"/>
+        <w:spacing w:after="200" w:before="100" w:line="264" w:lineRule="auto"/>
+        <w:ind w:left="140"/>
+      </w:pPr>
+      <w:r>
+        <w:rPr>
+          <w:rFonts w:ascii="Consolas" w:cs="Consolas" w:eastAsia="Consolas" w:hAnsi="Consolas"/>
+          <w:sz w:val="19"/>
+          <w:szCs w:val="19"/>
+        </w:rPr>
+        <w:t xml:space="preserve">IMPORT "g3d"</w:t>
+      </w:r>
+      <w:r>
+        <w:rPr>
+          <w:rFonts w:ascii="Consolas" w:cs="Consolas" w:eastAsia="Consolas" w:hAnsi="Consolas"/>
+          <w:sz w:val="19"/>
+          <w:szCs w:val="19"/>
+        </w:rPr>
+        <w:br/>
+        <w:t xml:space="preserve">SCREEN(480, 320)</w:t>
+      </w:r>
+      <w:r>
+        <w:rPr>
+          <w:rFonts w:ascii="Consolas" w:cs="Consolas" w:eastAsia="Consolas" w:hAnsi="Consolas"/>
+          <w:sz w:val="19"/>
+          <w:szCs w:val="19"/>
+        </w:rPr>
+        <w:br/>
+        <w:t xml:space="preserve">WHILE NOT QUITREQUESTED()</w:t>
+      </w:r>
+      <w:r>
+        <w:rPr>
+          <w:rFonts w:ascii="Consolas" w:cs="Consolas" w:eastAsia="Consolas" w:hAnsi="Consolas"/>
+          <w:sz w:val="19"/>
+          <w:szCs w:val="19"/>
+        </w:rPr>
+        <w:br/>
+        <w:t xml:space="preserve">    CLS(RGB(16, 22, 34))</w:t>
+      </w:r>
+      <w:r>
+        <w:rPr>
+          <w:rFonts w:ascii="Consolas" w:cs="Consolas" w:eastAsia="Consolas" w:hAnsi="Consolas"/>
+          <w:sz w:val="19"/>
+          <w:szCs w:val="19"/>
+        </w:rPr>
+        <w:br/>
+        <w:t xml:space="preserve">    CAMERA3D(7.0, 5.5, 9.0,  0.0, 0.5, 0.0,  45.0)</w:t>
+      </w:r>
+      <w:r>
+        <w:rPr>
+          <w:rFonts w:ascii="Consolas" w:cs="Consolas" w:eastAsia="Consolas" w:hAnsi="Consolas"/>
+          <w:sz w:val="19"/>
+          <w:szCs w:val="19"/>
+        </w:rPr>
+        <w:br/>
+        <w:t xml:space="preserve">    ' ... 3D-Körper zeichnen ...</w:t>
+      </w:r>
+      <w:r>
+        <w:rPr>
+          <w:rFonts w:ascii="Consolas" w:cs="Consolas" w:eastAsia="Consolas" w:hAnsi="Consolas"/>
+          <w:sz w:val="19"/>
+          <w:szCs w:val="19"/>
+        </w:rPr>
+        <w:br/>
+        <w:t xml:space="preserve">    FLIP()</w:t>
+      </w:r>
+      <w:r>
+        <w:rPr>
+          <w:rFonts w:ascii="Consolas" w:cs="Consolas" w:eastAsia="Consolas" w:hAnsi="Consolas"/>
+          <w:sz w:val="19"/>
+          <w:szCs w:val="19"/>
+        </w:rPr>
+        <w:br/>
+        <w:t xml:space="preserve">WEND</w:t>
+      </w:r>
+    </w:p>
+    <w:p>
+      <w:pPr>
+        <w:spacing w:before="60"/>
+      </w:pPr>
+    </w:p>
+    <w:tbl>
+      <w:tblPr>
+        <w:tblW w:type="dxa" w:w="9360"/>
+        <w:tblBorders>
+          <w:top w:val="single" w:color="auto" w:sz="4"/>
+          <w:left w:val="single" w:color="auto" w:sz="4"/>
+          <w:bottom w:val="single" w:color="auto" w:sz="4"/>
+          <w:right w:val="single" w:color="auto" w:sz="4"/>
+          <w:insideH w:val="single" w:color="auto" w:sz="4"/>
+          <w:insideV w:val="single" w:color="auto" w:sz="4"/>
+        </w:tblBorders>
+      </w:tblPr>
+      <w:tblGrid>
+        <w:gridCol w:w="9360"/>
+      </w:tblGrid>
+      <w:tr>
+        <w:trPr>
+          <w:cantSplit/>
+        </w:trPr>
+        <w:tc>
+          <w:tcPr>
+            <w:tcW w:type="dxa" w:w="9360"/>
+            <w:tcBorders>
+              <w:top w:val="single" w:color="E0B96A" w:sz="6"/>
+              <w:left w:val="single" w:color="E0B96A" w:sz="6"/>
+              <w:bottom w:val="single" w:color="E0B96A" w:sz="6"/>
+              <w:right w:val="single" w:color="E0B96A" w:sz="6"/>
+            </w:tcBorders>
+            <w:shd w:fill="FDF3E0" w:val="clear"/>
+            <w:tcMar>
+              <w:top w:type="dxa" w:w="140"/>
+              <w:left w:type="dxa" w:w="180"/>
+              <w:bottom w:type="dxa" w:w="140"/>
+              <w:right w:type="dxa" w:w="180"/>
+            </w:tcMar>
+          </w:tcPr>
+          <w:p>
+            <w:pPr>
+              <w:spacing w:after="40"/>
+            </w:pPr>
+            <w:r>
+              <w:rPr>
+                <w:b/>
+                <w:bCs/>
+                <w:color w:val="9A6A1E"/>
+                <w:sz w:val="22"/>
+                <w:szCs w:val="22"/>
+              </w:rPr>
+              <w:t xml:space="preserve">Merke</w:t>
+            </w:r>
+          </w:p>
+          <w:p>
+            <w:pPr>
+              <w:spacing w:after="0" w:line="312" w:lineRule="auto"/>
+            </w:pPr>
+            <w:r>
+              <w:rPr>
+                <w:sz w:val="22"/>
+                <w:szCs w:val="22"/>
+              </w:rPr>
+              <w:t xml:space="preserve">Eine kreisende Kamera baust du, indem du ihre Position über die Zeit mit SIN/COS berechnest: cx = COS(t) * radius, cz = SIN(t) * radius, und t pro Frame erhöhst. So umrundet der Blick das Geschehen.</w:t>
+            </w:r>
+          </w:p>
+        </w:tc>
+      </w:tr>
+    </w:tbl>
+    <w:p>
+      <w:pPr>
+        <w:spacing w:after="160"/>
+      </w:pPr>
+    </w:p>
+    <w:p>
+      <w:pPr>
+        <w:pStyle w:val="Heading2"/>
+        <w:keepNext/>
+        <w:keepLines/>
+        <w:spacing w:after="120" w:before="280"/>
+      </w:pPr>
+      <w:r>
+        <w:t xml:space="preserve">Orientierung: das Boden-Raster</w:t>
+      </w:r>
+    </w:p>
+    <w:p>
+      <w:pPr>
+        <w:keepNext/>
+        <w:keepLines/>
+        <w:pBdr>
+          <w:bottom w:val="single" w:color="DDD0C0" w:sz="4" w:space="2"/>
+        </w:pBdr>
+        <w:spacing w:after="40" w:before="360"/>
+      </w:pPr>
+      <w:r>
+        <w:rPr>
+          <w:rFonts w:ascii="Consolas" w:cs="Consolas" w:eastAsia="Consolas" w:hAnsi="Consolas"/>
+          <w:b/>
+          <w:bCs/>
+          <w:color w:val="9A3412"/>
+          <w:sz w:val="24"/>
+          <w:szCs w:val="24"/>
+        </w:rPr>
+        <w:t xml:space="preserve">GRID3D</w:t>
+      </w:r>
+    </w:p>
+    <w:p>
+      <w:pPr>
+        <w:keepNext/>
+        <w:spacing w:after="120"/>
+      </w:pPr>
+      <w:r>
+        <w:rPr>
+          <w:b/>
+          <w:bCs/>
+          <w:color w:val="6A6A6A"/>
+          <w:sz w:val="18"/>
+          <w:szCs w:val="18"/>
+        </w:rPr>
+        <w:t xml:space="preserve">Syntax:  </w:t>
+      </w:r>
+      <w:r>
+        <w:rPr>
+          <w:rFonts w:ascii="Consolas" w:cs="Consolas" w:eastAsia="Consolas" w:hAnsi="Consolas"/>
+          <w:color w:val="335577"/>
+          <w:sz w:val="19"/>
+          <w:szCs w:val="19"/>
+        </w:rPr>
+        <w:t xml:space="preserve">GRID3D(linien, abstand)</w:t>
+      </w:r>
+    </w:p>
+    <w:p>
+      <w:pPr>
+        <w:spacing w:after="180" w:line="312" w:lineRule="auto"/>
+      </w:pPr>
+      <w:r>
+        <w:rPr>
+          <w:sz w:val="22"/>
+          <w:szCs w:val="22"/>
+        </w:rPr>
+        <w:t xml:space="preserve">Zeichnet ein Gitter in der Bodenebene – sehr hilfreich, um sich im Raum zu orientieren. linien ist die Anzahl der Linien pro Richtung, abstand ihr Abstand.</w:t>
+      </w:r>
+    </w:p>
+    <w:p>
+      <w:pPr>
+        <w:keepNext/>
+        <w:spacing w:after="30" w:before="120"/>
+      </w:pPr>
+      <w:r>
+        <w:rPr>
+          <w:b/>
+          <w:bCs/>
+          <w:i/>
+          <w:iCs/>
+          <w:color w:val="6A6A6A"/>
+          <w:sz w:val="18"/>
+          <w:szCs w:val="18"/>
+        </w:rPr>
+        <w:t xml:space="preserve">Beispiel</w:t>
+      </w:r>
+    </w:p>
+    <w:p>
+      <w:pPr>
+        <w:keepLines/>
+        <w:pBdr>
+          <w:left w:val="single" w:color="1B6CA8" w:sz="18" w:space="6"/>
+        </w:pBdr>
+        <w:shd w:fill="F4F4F4" w:val="clear"/>
+        <w:spacing w:after="200" w:before="100" w:line="264" w:lineRule="auto"/>
+        <w:ind w:left="140"/>
+      </w:pPr>
+      <w:r>
+        <w:rPr>
+          <w:rFonts w:ascii="Consolas" w:cs="Consolas" w:eastAsia="Consolas" w:hAnsi="Consolas"/>
+          <w:sz w:val="19"/>
+          <w:szCs w:val="19"/>
+        </w:rPr>
+        <w:t xml:space="preserve">GRID3D(16, 1.0)        ' 16x16 Raster, 1 Einheit Abstand</w:t>
+      </w:r>
+    </w:p>
+    <w:p>
+      <w:pPr>
+        <w:pStyle w:val="Heading2"/>
+        <w:keepNext/>
+        <w:keepLines/>
+        <w:spacing w:after="120" w:before="280"/>
+      </w:pPr>
+      <w:r>
+        <w:t xml:space="preserve">Körper zeichnen</w:t>
+      </w:r>
+    </w:p>
+    <w:p>
+      <w:pPr>
+        <w:spacing w:after="180" w:line="312" w:lineRule="auto"/>
+      </w:pPr>
+      <w:r>
+        <w:rPr>
+          <w:sz w:val="22"/>
+          <w:szCs w:val="22"/>
+        </w:rPr>
+        <w:t xml:space="preserve">Die Grundkörper bekommen ihre Position als (x, y, z) und ihre Maße, dann eine Farbe. Zu jedem gefüllten Körper gibt es meist eine Drahtgitter-Variante (…_WIRES), die nur die Kanten zeichnet – schön, um Konturen zu betonen.</w:t>
+      </w:r>
+    </w:p>
+    <w:p>
+      <w:pPr>
+        <w:keepNext/>
+        <w:keepLines/>
+        <w:pBdr>
+          <w:bottom w:val="single" w:color="DDD0C0" w:sz="4" w:space="2"/>
+        </w:pBdr>
+        <w:spacing w:after="40" w:before="360"/>
+      </w:pPr>
+      <w:r>
+        <w:rPr>
+          <w:rFonts w:ascii="Consolas" w:cs="Consolas" w:eastAsia="Consolas" w:hAnsi="Consolas"/>
+          <w:b/>
+          <w:bCs/>
+          <w:color w:val="9A3412"/>
+          <w:sz w:val="24"/>
+          <w:szCs w:val="24"/>
+        </w:rPr>
+        <w:t xml:space="preserve">CUBE · CUBE_WIRES</w:t>
+      </w:r>
+    </w:p>
+    <w:p>
+      <w:pPr>
+        <w:keepNext/>
+        <w:spacing w:after="120"/>
+      </w:pPr>
+      <w:r>
+        <w:rPr>
+          <w:b/>
+          <w:bCs/>
+          <w:color w:val="6A6A6A"/>
+          <w:sz w:val="18"/>
+          <w:szCs w:val="18"/>
+        </w:rPr>
+        <w:t xml:space="preserve">Syntax:  </w:t>
+      </w:r>
+      <w:r>
+        <w:rPr>
+          <w:rFonts w:ascii="Consolas" w:cs="Consolas" w:eastAsia="Consolas" w:hAnsi="Consolas"/>
+          <w:color w:val="335577"/>
+          <w:sz w:val="19"/>
+          <w:szCs w:val="19"/>
+        </w:rPr>
+        <w:t xml:space="preserve">CUBE(x, y, z, breite, höhe, tiefe, farbe)   CUBE_WIRES(...)</w:t>
+      </w:r>
+    </w:p>
+    <w:p>
+      <w:pPr>
+        <w:spacing w:after="180" w:line="312" w:lineRule="auto"/>
+      </w:pPr>
+      <w:r>
+        <w:rPr>
+          <w:sz w:val="22"/>
+          <w:szCs w:val="22"/>
+        </w:rPr>
+        <w:t xml:space="preserve">Zeichnet einen Quader am Mittelpunkt (x, y, z) mit den drei Kantenlängen. CUBE füllt, CUBE_WIRES zeichnet nur das Drahtgitter (gut kombinierbar: erst CUBE, dann CUBE_WIRES in dunkler Farbe).</w:t>
+      </w:r>
+    </w:p>
+    <w:p>
+      <w:pPr>
+        <w:keepNext/>
+        <w:spacing w:after="30" w:before="120"/>
+      </w:pPr>
+      <w:r>
+        <w:rPr>
+          <w:b/>
+          <w:bCs/>
+          <w:i/>
+          <w:iCs/>
+          <w:color w:val="6A6A6A"/>
+          <w:sz w:val="18"/>
+          <w:szCs w:val="18"/>
+        </w:rPr>
+        <w:t xml:space="preserve">Beispiel</w:t>
+      </w:r>
+    </w:p>
+    <w:p>
+      <w:pPr>
+        <w:keepLines/>
+        <w:pBdr>
+          <w:left w:val="single" w:color="1B6CA8" w:sz="18" w:space="6"/>
+        </w:pBdr>
+        <w:shd w:fill="F4F4F4" w:val="clear"/>
+        <w:spacing w:after="200" w:before="100" w:line="264" w:lineRule="auto"/>
+        <w:ind w:left="140"/>
+      </w:pPr>
+      <w:r>
+        <w:rPr>
+          <w:rFonts w:ascii="Consolas" w:cs="Consolas" w:eastAsia="Consolas" w:hAnsi="Consolas"/>
+          <w:sz w:val="19"/>
+          <w:szCs w:val="19"/>
+        </w:rPr>
+        <w:t xml:space="preserve">CUBE(0.0, 1.0, 0.0,  2.0, 2.0, 2.0,  RED)</w:t>
+      </w:r>
+      <w:r>
+        <w:rPr>
+          <w:rFonts w:ascii="Consolas" w:cs="Consolas" w:eastAsia="Consolas" w:hAnsi="Consolas"/>
+          <w:sz w:val="19"/>
+          <w:szCs w:val="19"/>
+        </w:rPr>
+        <w:br/>
+        <w:t xml:space="preserve">CUBE_WIRES(0.0, 1.0, 0.0,  2.0, 2.0, 2.0,  BLACK)</w:t>
+      </w:r>
+    </w:p>
+    <w:p>
+      <w:pPr>
+        <w:keepNext/>
+        <w:keepLines/>
+        <w:pBdr>
+          <w:bottom w:val="single" w:color="DDD0C0" w:sz="4" w:space="2"/>
+        </w:pBdr>
+        <w:spacing w:after="40" w:before="360"/>
+      </w:pPr>
+      <w:r>
+        <w:rPr>
+          <w:rFonts w:ascii="Consolas" w:cs="Consolas" w:eastAsia="Consolas" w:hAnsi="Consolas"/>
+          <w:b/>
+          <w:bCs/>
+          <w:color w:val="9A3412"/>
+          <w:sz w:val="24"/>
+          <w:szCs w:val="24"/>
+        </w:rPr>
+        <w:t xml:space="preserve">SPHERE · SPHERE_WIRES</w:t>
+      </w:r>
+    </w:p>
+    <w:p>
+      <w:pPr>
+        <w:keepNext/>
+        <w:spacing w:after="120"/>
+      </w:pPr>
+      <w:r>
+        <w:rPr>
+          <w:b/>
+          <w:bCs/>
+          <w:color w:val="6A6A6A"/>
+          <w:sz w:val="18"/>
+          <w:szCs w:val="18"/>
+        </w:rPr>
+        <w:t xml:space="preserve">Syntax:  </w:t>
+      </w:r>
+      <w:r>
+        <w:rPr>
+          <w:rFonts w:ascii="Consolas" w:cs="Consolas" w:eastAsia="Consolas" w:hAnsi="Consolas"/>
+          <w:color w:val="335577"/>
+          <w:sz w:val="19"/>
+          <w:szCs w:val="19"/>
+        </w:rPr>
+        <w:t xml:space="preserve">SPHERE(x, y, z, radius, farbe)   SPHERE_WIRES(...)</w:t>
+      </w:r>
+    </w:p>
+    <w:p>
+      <w:pPr>
+        <w:spacing w:after="180" w:line="312" w:lineRule="auto"/>
+      </w:pPr>
+      <w:r>
+        <w:rPr>
+          <w:sz w:val="22"/>
+          <w:szCs w:val="22"/>
+        </w:rPr>
+        <w:t xml:space="preserve">Zeichnet eine Kugel mit Mittelpunkt (x, y, z) und dem Radius.</w:t>
+      </w:r>
+    </w:p>
+    <w:p>
+      <w:pPr>
+        <w:keepNext/>
+        <w:spacing w:after="30" w:before="120"/>
+      </w:pPr>
+      <w:r>
+        <w:rPr>
+          <w:b/>
+          <w:bCs/>
+          <w:i/>
+          <w:iCs/>
+          <w:color w:val="6A6A6A"/>
+          <w:sz w:val="18"/>
+          <w:szCs w:val="18"/>
+        </w:rPr>
+        <w:t xml:space="preserve">Beispiel</w:t>
+      </w:r>
+    </w:p>
+    <w:p>
+      <w:pPr>
+        <w:keepLines/>
+        <w:pBdr>
+          <w:left w:val="single" w:color="1B6CA8" w:sz="18" w:space="6"/>
+        </w:pBdr>
+        <w:shd w:fill="F4F4F4" w:val="clear"/>
+        <w:spacing w:after="200" w:before="100" w:line="264" w:lineRule="auto"/>
+        <w:ind w:left="140"/>
+      </w:pPr>
+      <w:r>
+        <w:rPr>
+          <w:rFonts w:ascii="Consolas" w:cs="Consolas" w:eastAsia="Consolas" w:hAnsi="Consolas"/>
+          <w:sz w:val="19"/>
+          <w:szCs w:val="19"/>
+        </w:rPr>
+        <w:t xml:space="preserve">SPHERE(4.0, 1.0, 0.0,  1.0,  BLUE)</w:t>
+      </w:r>
+    </w:p>
+    <w:p>
+      <w:pPr>
+        <w:keepNext/>
+        <w:keepLines/>
+        <w:pBdr>
+          <w:bottom w:val="single" w:color="DDD0C0" w:sz="4" w:space="2"/>
+        </w:pBdr>
+        <w:spacing w:after="40" w:before="360"/>
+      </w:pPr>
+      <w:r>
+        <w:rPr>
+          <w:rFonts w:ascii="Consolas" w:cs="Consolas" w:eastAsia="Consolas" w:hAnsi="Consolas"/>
+          <w:b/>
+          <w:bCs/>
+          <w:color w:val="9A3412"/>
+          <w:sz w:val="24"/>
+          <w:szCs w:val="24"/>
+        </w:rPr>
+        <w:t xml:space="preserve">CYLINDER</w:t>
+      </w:r>
+    </w:p>
+    <w:p>
+      <w:pPr>
+        <w:keepNext/>
+        <w:spacing w:after="120"/>
+      </w:pPr>
+      <w:r>
+        <w:rPr>
+          <w:b/>
+          <w:bCs/>
+          <w:color w:val="6A6A6A"/>
+          <w:sz w:val="18"/>
+          <w:szCs w:val="18"/>
+        </w:rPr>
+        <w:t xml:space="preserve">Syntax:  </w:t>
+      </w:r>
+      <w:r>
+        <w:rPr>
+          <w:rFonts w:ascii="Consolas" w:cs="Consolas" w:eastAsia="Consolas" w:hAnsi="Consolas"/>
+          <w:color w:val="335577"/>
+          <w:sz w:val="19"/>
+          <w:szCs w:val="19"/>
+        </w:rPr>
+        <w:t xml:space="preserve">CYLINDER(x, y, z, radius_oben, radius_unten, höhe, farbe)</w:t>
+      </w:r>
+    </w:p>
+    <w:p>
+      <w:pPr>
+        <w:spacing w:after="180" w:line="312" w:lineRule="auto"/>
+      </w:pPr>
+      <w:r>
+        <w:rPr>
+          <w:sz w:val="22"/>
+          <w:szCs w:val="22"/>
+        </w:rPr>
+        <w:t xml:space="preserve">Zeichnet einen Zylinder. Mit unterschiedlichen Radien wird er ein Kegelstumpf; setzt du radius_oben auf 0, entsteht ein spitzer Kegel.</w:t>
+      </w:r>
+    </w:p>
+    <w:p>
+      <w:pPr>
+        <w:keepNext/>
+        <w:spacing w:after="30" w:before="120"/>
+      </w:pPr>
+      <w:r>
+        <w:rPr>
+          <w:b/>
+          <w:bCs/>
+          <w:i/>
+          <w:iCs/>
+          <w:color w:val="6A6A6A"/>
+          <w:sz w:val="18"/>
+          <w:szCs w:val="18"/>
+        </w:rPr>
+        <w:t xml:space="preserve">Beispiel</w:t>
+      </w:r>
+    </w:p>
+    <w:p>
+      <w:pPr>
+        <w:keepLines/>
+        <w:pBdr>
+          <w:left w:val="single" w:color="1B6CA8" w:sz="18" w:space="6"/>
+        </w:pBdr>
+        <w:shd w:fill="F4F4F4" w:val="clear"/>
+        <w:spacing w:after="200" w:before="100" w:line="264" w:lineRule="auto"/>
+        <w:ind w:left="140"/>
+      </w:pPr>
+      <w:r>
+        <w:rPr>
+          <w:rFonts w:ascii="Consolas" w:cs="Consolas" w:eastAsia="Consolas" w:hAnsi="Consolas"/>
+          <w:sz w:val="19"/>
+          <w:szCs w:val="19"/>
+        </w:rPr>
+        <w:t xml:space="preserve">CYLINDER(-4.0, 0.0, 0.0,  0.8, 0.8, 2.5,  GREEN)   ' Zylinder</w:t>
+      </w:r>
+      <w:r>
+        <w:rPr>
+          <w:rFonts w:ascii="Consolas" w:cs="Consolas" w:eastAsia="Consolas" w:hAnsi="Consolas"/>
+          <w:sz w:val="19"/>
+          <w:szCs w:val="19"/>
+        </w:rPr>
+        <w:br/>
+        <w:t xml:space="preserve">CYLINDER(0.0, 0.0, -4.0,  0.0, 1.2, 2.2,  YELLOW)  ' Kegel</w:t>
+      </w:r>
+    </w:p>
+    <w:p>
+      <w:pPr>
+        <w:keepNext/>
+        <w:keepLines/>
+        <w:pBdr>
+          <w:bottom w:val="single" w:color="DDD0C0" w:sz="4" w:space="2"/>
+        </w:pBdr>
+        <w:spacing w:after="40" w:before="360"/>
+      </w:pPr>
+      <w:r>
+        <w:rPr>
+          <w:rFonts w:ascii="Consolas" w:cs="Consolas" w:eastAsia="Consolas" w:hAnsi="Consolas"/>
+          <w:b/>
+          <w:bCs/>
+          <w:color w:val="9A3412"/>
+          <w:sz w:val="24"/>
+          <w:szCs w:val="24"/>
+        </w:rPr>
+        <w:t xml:space="preserve">PLANE · LINE3D · POINT3D</w:t>
+      </w:r>
+    </w:p>
+    <w:p>
+      <w:pPr>
+        <w:keepNext/>
+        <w:spacing w:after="120"/>
+      </w:pPr>
+      <w:r>
+        <w:rPr>
+          <w:b/>
+          <w:bCs/>
+          <w:color w:val="6A6A6A"/>
+          <w:sz w:val="18"/>
+          <w:szCs w:val="18"/>
+        </w:rPr>
+        <w:t xml:space="preserve">Syntax:  </w:t>
+      </w:r>
+      <w:r>
+        <w:rPr>
+          <w:rFonts w:ascii="Consolas" w:cs="Consolas" w:eastAsia="Consolas" w:hAnsi="Consolas"/>
+          <w:color w:val="335577"/>
+          <w:sz w:val="19"/>
+          <w:szCs w:val="19"/>
+        </w:rPr>
+        <w:t xml:space="preserve">PLANE(x, y, z, größe_x, größe_z, farbe)   LINE3D(x1,y1,z1, x2,y2,z2, farbe)   POINT3D(x, y, z, farbe)</w:t>
+      </w:r>
+    </w:p>
+    <w:p>
+      <w:pPr>
+        <w:spacing w:after="180" w:line="312" w:lineRule="auto"/>
+      </w:pPr>
+      <w:r>
+        <w:rPr>
+          <w:sz w:val="22"/>
+          <w:szCs w:val="22"/>
+        </w:rPr>
+        <w:t xml:space="preserve">PLANE zeichnet eine flache Fläche in der Bodenebene, LINE3D eine Linie zwischen zwei Raumpunkten, POINT3D einen einzelnen Punkt. Gut für Böden, Achsen und Markierungen.</w:t>
+      </w:r>
+    </w:p>
+    <w:p>
+      <w:pPr>
+        <w:keepNext/>
+        <w:spacing w:after="30" w:before="120"/>
+      </w:pPr>
+      <w:r>
+        <w:rPr>
+          <w:b/>
+          <w:bCs/>
+          <w:i/>
+          <w:iCs/>
+          <w:color w:val="6A6A6A"/>
+          <w:sz w:val="18"/>
+          <w:szCs w:val="18"/>
+        </w:rPr>
+        <w:t xml:space="preserve">Beispiel</w:t>
+      </w:r>
+    </w:p>
+    <w:p>
+      <w:pPr>
+        <w:keepLines/>
+        <w:pBdr>
+          <w:left w:val="single" w:color="1B6CA8" w:sz="18" w:space="6"/>
+        </w:pBdr>
+        <w:shd w:fill="F4F4F4" w:val="clear"/>
+        <w:spacing w:after="200" w:before="100" w:line="264" w:lineRule="auto"/>
+        <w:ind w:left="140"/>
+      </w:pPr>
+      <w:r>
+        <w:rPr>
+          <w:rFonts w:ascii="Consolas" w:cs="Consolas" w:eastAsia="Consolas" w:hAnsi="Consolas"/>
+          <w:sz w:val="19"/>
+          <w:szCs w:val="19"/>
+        </w:rPr>
+        <w:t xml:space="preserve">PLANE(0.0, 0.0, 0.0,  10.0, 10.0,  RGB(40, 60, 40))</w:t>
+      </w:r>
+      <w:r>
+        <w:rPr>
+          <w:rFonts w:ascii="Consolas" w:cs="Consolas" w:eastAsia="Consolas" w:hAnsi="Consolas"/>
+          <w:sz w:val="19"/>
+          <w:szCs w:val="19"/>
+        </w:rPr>
+        <w:br/>
+        <w:t xml:space="preserve">LINE3D(0.0, 0.0, 0.0,  0.0, 3.0, 0.0,  WHITE)   ' Y-Achse</w:t>
+      </w:r>
+    </w:p>
+    <w:p>
+      <w:pPr>
+        <w:pStyle w:val="Heading2"/>
+        <w:keepNext/>
+        <w:keepLines/>
+        <w:spacing w:after="120" w:before="280"/>
+      </w:pPr>
+      <w:r>
+        <w:t xml:space="preserve">Mehr als Grundkörper</w:t>
+      </w:r>
+    </w:p>
+    <w:p>
+      <w:pPr>
+        <w:spacing w:after="180" w:line="312" w:lineRule="auto"/>
+      </w:pPr>
+      <w:r>
+        <w:rPr>
+          <w:sz w:val="22"/>
+          <w:szCs w:val="22"/>
+        </w:rPr>
+        <w:t xml:space="preserve">Das g3d-Modul kann weit mehr, als hier gezeigt – das füllt eigene Bücher. Ein kurzer Ausblick, damit du weißt, was möglich ist:</w:t>
+      </w:r>
+    </w:p>
+    <w:p>
+      <w:pPr>
+        <w:pStyle w:val="ListParagraph"/>
+        <w:numPr>
+          <w:ilvl w:val="0"/>
+          <w:numId w:val="2"/>
+        </w:numPr>
+        <w:spacing w:after="100" w:line="312" w:lineRule="auto"/>
+      </w:pPr>
+      <w:r>
+        <w:rPr>
+          <w:b/>
+          <w:bCs/>
+          <w:sz w:val="22"/>
+          <w:szCs w:val="22"/>
+        </w:rPr>
+        <w:t xml:space="preserve">3D-Modelle:  </w:t>
+      </w:r>
+      <w:r>
+        <w:rPr>
+          <w:sz w:val="22"/>
+          <w:szCs w:val="22"/>
+        </w:rPr>
+        <w:t xml:space="preserve">LOADMODEL lädt fertige Modelle (OBJ/GLTF), MESH_CUBE/SPHERE/TORUS u. a. erzeugen welche prozedural; gezeichnet mit MODEL. Sogar Skelett-Animationen sind möglich.</w:t>
+      </w:r>
+    </w:p>
+    <w:p>
+      <w:pPr>
+        <w:pStyle w:val="ListParagraph"/>
+        <w:numPr>
+          <w:ilvl w:val="0"/>
+          <w:numId w:val="2"/>
+        </w:numPr>
+        <w:spacing w:after="100" w:line="312" w:lineRule="auto"/>
+      </w:pPr>
+      <w:r>
+        <w:rPr>
+          <w:b/>
+          <w:bCs/>
+          <w:sz w:val="22"/>
+          <w:szCs w:val="22"/>
+        </w:rPr>
+        <w:t xml:space="preserve">Beleuchtung:  </w:t>
+      </w:r>
+      <w:r>
+        <w:rPr>
+          <w:sz w:val="22"/>
+          <w:szCs w:val="22"/>
+        </w:rPr>
+        <w:t xml:space="preserve">LIGHT_ENABLE, LIGHT_DIRECTIONAL/POINT und MODEL_LIT geben Modellen echtes Licht und Schatten (bis hin zu PBR-Materialien und Nebel).</w:t>
+      </w:r>
+    </w:p>
+    <w:p>
+      <w:pPr>
+        <w:pStyle w:val="ListParagraph"/>
+        <w:numPr>
+          <w:ilvl w:val="0"/>
+          <w:numId w:val="2"/>
+        </w:numPr>
+        <w:spacing w:after="100" w:line="312" w:lineRule="auto"/>
+      </w:pPr>
+      <w:r>
+        <w:rPr>
+          <w:b/>
+          <w:bCs/>
+          <w:sz w:val="22"/>
+          <w:szCs w:val="22"/>
+        </w:rPr>
+        <w:t xml:space="preserve">Kamera-Modi &amp; Picking:  </w:t>
+      </w:r>
+      <w:r>
+        <w:rPr>
+          <w:sz w:val="22"/>
+          <w:szCs w:val="22"/>
+        </w:rPr>
+        <w:t xml:space="preserve">CAMERA3D_UPDATE bietet fertige Steuerungen (frei, orbital, Ego-Perspektive); mit PICK_BOX/PICK_SPHERE wählst du Objekte per Mausklick aus.</w:t>
+      </w:r>
+    </w:p>
+    <w:p>
+      <w:pPr>
+        <w:spacing w:before="60"/>
+      </w:pPr>
+    </w:p>
+    <w:tbl>
+      <w:tblPr>
+        <w:tblW w:type="dxa" w:w="9360"/>
+        <w:tblBorders>
+          <w:top w:val="single" w:color="auto" w:sz="4"/>
+          <w:left w:val="single" w:color="auto" w:sz="4"/>
+          <w:bottom w:val="single" w:color="auto" w:sz="4"/>
+          <w:right w:val="single" w:color="auto" w:sz="4"/>
+          <w:insideH w:val="single" w:color="auto" w:sz="4"/>
+          <w:insideV w:val="single" w:color="auto" w:sz="4"/>
+        </w:tblBorders>
+      </w:tblPr>
+      <w:tblGrid>
+        <w:gridCol w:w="9360"/>
+      </w:tblGrid>
+      <w:tr>
+        <w:trPr>
+          <w:cantSplit/>
+        </w:trPr>
+        <w:tc>
+          <w:tcPr>
+            <w:tcW w:type="dxa" w:w="9360"/>
+            <w:tcBorders>
+              <w:top w:val="single" w:color="9CC8E6" w:sz="6"/>
+              <w:left w:val="single" w:color="9CC8E6" w:sz="6"/>
+              <w:bottom w:val="single" w:color="9CC8E6" w:sz="6"/>
+              <w:right w:val="single" w:color="9CC8E6" w:sz="6"/>
+            </w:tcBorders>
+            <w:shd w:fill="E7F2FA" w:val="clear"/>
+            <w:tcMar>
+              <w:top w:type="dxa" w:w="140"/>
+              <w:left w:type="dxa" w:w="180"/>
+              <w:bottom w:type="dxa" w:w="140"/>
+              <w:right w:type="dxa" w:w="180"/>
+            </w:tcMar>
+          </w:tcPr>
+          <w:p>
+            <w:pPr>
+              <w:spacing w:after="40"/>
+            </w:pPr>
+            <w:r>
+              <w:rPr>
+                <w:b/>
+                <w:bCs/>
+                <w:color w:val="1B6CA8"/>
+                <w:sz w:val="22"/>
+                <w:szCs w:val="22"/>
+              </w:rPr>
+              <w:t xml:space="preserve">Klein anfangen</w:t>
+            </w:r>
+          </w:p>
+          <w:p>
+            <w:pPr>
+              <w:spacing w:after="0" w:line="312" w:lineRule="auto"/>
+            </w:pPr>
+            <w:r>
+              <w:rPr>
+                <w:sz w:val="22"/>
+                <w:szCs w:val="22"/>
+              </w:rPr>
+              <w:t xml:space="preserve">3D ist mächtig, aber der Einstieg ist anspruchsvoller als 2D. Fang mit einer festen Kamera und ein paar Grundkörpern auf einem Raster an (wie im Bild oben), bring dann Bewegung in die Kamera, und taste dich erst danach an Modelle und Beleuchtung heran. Für die meisten 2D-Spiele brauchst du 3D übrigens gar nicht.</w:t>
             </w:r>
           </w:p>
         </w:tc>

</xml_diff>

<commit_message>
docs(buch): Lehrbuch Kap 49 -- Abschlussprojekt "Muenzfang" (Grafik+Sound)
Komplettes spielbares Arcade-Spiel, in 5 Schritten aufgebaut: Fenster+Korb-
Steuerung, fallende Muenzen via Arrays + DELTA, Fang-Kollision + Score,
AUDIO_TONE beim Fangen, Punkte-HUD. Volles Listing + Erweiterungsideen.
Fuehrt Game-Loop/Eingabe/Zeichnen/Arrays/Kollision/Sound/HUD zusammen.
Screenshot des fertigen Spiels; gegen gbrt verifiziert.

Co-Authored-By: Claude Opus 4.8 (1M context) <noreply@anthropic.com>
</commit_message>
<xml_diff>
--- a/buch-referenz/buch/GameBasic-Lehrbuch.docx
+++ b/buch-referenz/buch/GameBasic-Lehrbuch.docx
@@ -1245,6 +1245,33 @@
           <w:szCs w:val="22"/>
         </w:rPr>
         <w:t xml:space="preserve">	160</w:t>
+      </w:r>
+    </w:p>
+    <w:p>
+      <w:pPr>
+        <w:tabs>
+          <w:tab w:val="right" w:pos="9200" w:leader="dot"/>
+        </w:tabs>
+        <w:spacing w:after="20" w:before="0"/>
+        <w:ind w:left="280"/>
+      </w:pPr>
+      <w:r>
+        <w:rPr>
+          <w:b w:val="false"/>
+          <w:bCs w:val="false"/>
+          <w:color w:val="222222"/>
+          <w:sz w:val="22"/>
+          <w:szCs w:val="22"/>
+        </w:rPr>
+        <w:t xml:space="preserve">Abschlussprojekt: Münzfang</w:t>
+      </w:r>
+      <w:r>
+        <w:rPr>
+          <w:color w:val="555555"/>
+          <w:sz w:val="22"/>
+          <w:szCs w:val="22"/>
+        </w:rPr>
+        <w:t xml:space="preserve">	164</w:t>
       </w:r>
     </w:p>
     <w:p>
@@ -54980,6 +55007,1354 @@
       <w:pPr>
         <w:spacing w:after="160"/>
       </w:pPr>
+    </w:p>
+    <w:p>
+      <w:pPr>
+        <w:pStyle w:val="Heading1"/>
+        <w:keepNext/>
+        <w:keepLines/>
+        <w:pageBreakBefore/>
+        <w:pBdr>
+          <w:bottom w:val="single" w:color="1B6CA8" w:sz="12" w:space="4"/>
+        </w:pBdr>
+        <w:spacing w:after="160" w:before="0"/>
+      </w:pPr>
+      <w:r>
+        <w:t xml:space="preserve">Abschlussprojekt: Münzfang</w:t>
+      </w:r>
+    </w:p>
+    <w:p>
+      <w:pPr>
+        <w:spacing w:after="180" w:line="312" w:lineRule="auto"/>
+      </w:pPr>
+      <w:r>
+        <w:rPr>
+          <w:sz w:val="22"/>
+          <w:szCs w:val="22"/>
+        </w:rPr>
+        <w:t xml:space="preserve">Zum Abschluss bauen wir ein vollständiges kleines Spiel und führen dabei fast alles aus diesem Buch zusammen: den Game-Loop, Variablen und Arrays, Eingabe, framerate-unabhängige Bewegung, Zeichnen, eine Kollisionsprüfung, Sound und ein Punkte-Display. Das Spiel heißt „Münzfang“: Von oben fallen Münzen, und du fängst sie mit einem Korb, den du nach links und rechts bewegst. So sieht das fertige Spiel aus:</w:t>
+      </w:r>
+    </w:p>
+    <w:p>
+      <w:pPr>
+        <w:keepNext/>
+        <w:spacing w:after="40" w:before="160"/>
+        <w:jc w:val="center"/>
+      </w:pPr>
+      <w:r>
+        <w:drawing>
+          <wp:inline distT="0" distB="0" distL="0" distR="0">
+            <wp:extent cx="4572000" cy="3048000"/>
+            <wp:effectExtent t="0" r="0" b="0" l="0"/>
+            <wp:docPr id="1" name="49_catch.png" descr="Das fertige Spiel „Münzfang“: fallende Münzen, ein steuerbarer Korb und die Punkteanzeige." title="Das fertige Spiel „Münzfang“: fallende Münzen, ein steuerbarer Korb und die Punkteanzeige."/>
+            <wp:cNvGraphicFramePr>
+              <a:graphicFrameLocks xmlns:a="http://schemas.openxmlformats.org/drawingml/2006/main" noChangeAspect="1"/>
+            </wp:cNvGraphicFramePr>
+            <a:graphic xmlns:a="http://schemas.openxmlformats.org/drawingml/2006/main">
+              <a:graphicData uri="http://schemas.openxmlformats.org/drawingml/2006/picture">
+                <pic:pic xmlns:pic="http://schemas.openxmlformats.org/drawingml/2006/picture">
+                  <pic:nvPicPr>
+                    <pic:cNvPr id="0" name="" descr=""/>
+                    <pic:cNvPicPr>
+                      <a:picLocks noChangeAspect="1" noChangeArrowheads="1"/>
+                    </pic:cNvPicPr>
+                  </pic:nvPicPr>
+                  <pic:blipFill>
+                    <a:blip r:embed="rId18" cstate="none"/>
+                    <a:srcRect/>
+                    <a:stretch>
+                      <a:fillRect/>
+                    </a:stretch>
+                  </pic:blipFill>
+                  <pic:spPr bwMode="auto">
+                    <a:xfrm>
+                      <a:off x="0" y="0"/>
+                      <a:ext cx="4572000" cy="3048000"/>
+                    </a:xfrm>
+                    <a:prstGeom prst="rect">
+                      <a:avLst/>
+                    </a:prstGeom>
+                  </pic:spPr>
+                </pic:pic>
+              </a:graphicData>
+            </a:graphic>
+          </wp:inline>
+        </w:drawing>
+      </w:r>
+    </w:p>
+    <w:p>
+      <w:pPr>
+        <w:spacing w:after="200"/>
+        <w:jc w:val="center"/>
+      </w:pPr>
+      <w:r>
+        <w:rPr>
+          <w:i/>
+          <w:iCs/>
+          <w:color w:val="6A6A6A"/>
+          <w:sz w:val="18"/>
+          <w:szCs w:val="18"/>
+        </w:rPr>
+        <w:t xml:space="preserve">Das fertige Spiel „Münzfang“: fallende Münzen, ein steuerbarer Korb und die Punkteanzeige.</w:t>
+      </w:r>
+    </w:p>
+    <w:p>
+      <w:pPr>
+        <w:spacing w:after="180" w:line="312" w:lineRule="auto"/>
+      </w:pPr>
+      <w:r>
+        <w:rPr>
+          <w:sz w:val="22"/>
+          <w:szCs w:val="22"/>
+        </w:rPr>
+        <w:t xml:space="preserve">Wir bauen es in fünf Schritten auf. Tippe ruhig mit und probiere nach jedem Schritt aus, was sich tut – so verstehst du jedes Teil.</w:t>
+      </w:r>
+    </w:p>
+    <w:p>
+      <w:pPr>
+        <w:pStyle w:val="Heading2"/>
+        <w:keepNext/>
+        <w:keepLines/>
+        <w:spacing w:after="120" w:before="280"/>
+      </w:pPr>
+      <w:r>
+        <w:t xml:space="preserve">Schritt 1: Fenster, Korb und Steuerung</w:t>
+      </w:r>
+    </w:p>
+    <w:p>
+      <w:pPr>
+        <w:spacing w:after="180" w:line="312" w:lineRule="auto"/>
+      </w:pPr>
+      <w:r>
+        <w:rPr>
+          <w:sz w:val="22"/>
+          <w:szCs w:val="22"/>
+        </w:rPr>
+        <w:t xml:space="preserve">Zuerst öffnen wir ein Fenster und zeichnen den Korb. Seine x-Position halten wir in einer FLOAT-Variablen (für weiche Bewegung), mit den Pfeiltasten verschieben wir ihn – mal DELTA() für überall gleiches Tempo – und klemmen ihn an den Bildschirmrändern fest.</w:t>
+      </w:r>
+    </w:p>
+    <w:p>
+      <w:pPr>
+        <w:keepLines/>
+        <w:pBdr>
+          <w:left w:val="single" w:color="1B6CA8" w:sz="18" w:space="6"/>
+        </w:pBdr>
+        <w:shd w:fill="F4F4F4" w:val="clear"/>
+        <w:spacing w:after="200" w:before="100" w:line="264" w:lineRule="auto"/>
+        <w:ind w:left="140"/>
+      </w:pPr>
+      <w:r>
+        <w:rPr>
+          <w:rFonts w:ascii="Consolas" w:cs="Consolas" w:eastAsia="Consolas" w:hAnsi="Consolas"/>
+          <w:sz w:val="19"/>
+          <w:szCs w:val="19"/>
+        </w:rPr>
+        <w:t xml:space="preserve">SCREEN(480, 320, "Münzfang")</w:t>
+      </w:r>
+      <w:r>
+        <w:rPr>
+          <w:rFonts w:ascii="Consolas" w:cs="Consolas" w:eastAsia="Consolas" w:hAnsi="Consolas"/>
+          <w:sz w:val="19"/>
+          <w:szCs w:val="19"/>
+        </w:rPr>
+        <w:br/>
+        <w:t xml:space="preserve"/>
+      </w:r>
+      <w:r>
+        <w:rPr>
+          <w:rFonts w:ascii="Consolas" w:cs="Consolas" w:eastAsia="Consolas" w:hAnsi="Consolas"/>
+          <w:sz w:val="19"/>
+          <w:szCs w:val="19"/>
+        </w:rPr>
+        <w:br/>
+        <w:t xml:space="preserve">DIM korbx AS FLOAT</w:t>
+      </w:r>
+      <w:r>
+        <w:rPr>
+          <w:rFonts w:ascii="Consolas" w:cs="Consolas" w:eastAsia="Consolas" w:hAnsi="Consolas"/>
+          <w:sz w:val="19"/>
+          <w:szCs w:val="19"/>
+        </w:rPr>
+        <w:br/>
+        <w:t xml:space="preserve">korbx = 210.0</w:t>
+      </w:r>
+      <w:r>
+        <w:rPr>
+          <w:rFonts w:ascii="Consolas" w:cs="Consolas" w:eastAsia="Consolas" w:hAnsi="Consolas"/>
+          <w:sz w:val="19"/>
+          <w:szCs w:val="19"/>
+        </w:rPr>
+        <w:br/>
+        <w:t xml:space="preserve"/>
+      </w:r>
+      <w:r>
+        <w:rPr>
+          <w:rFonts w:ascii="Consolas" w:cs="Consolas" w:eastAsia="Consolas" w:hAnsi="Consolas"/>
+          <w:sz w:val="19"/>
+          <w:szCs w:val="19"/>
+        </w:rPr>
+        <w:br/>
+        <w:t xml:space="preserve">WHILE NOT QUITREQUESTED()</w:t>
+      </w:r>
+      <w:r>
+        <w:rPr>
+          <w:rFonts w:ascii="Consolas" w:cs="Consolas" w:eastAsia="Consolas" w:hAnsi="Consolas"/>
+          <w:sz w:val="19"/>
+          <w:szCs w:val="19"/>
+        </w:rPr>
+        <w:br/>
+        <w:t xml:space="preserve">    IF KEYPRESSED(KEY_LEFT)  THEN korbx = korbx - 260.0 * DELTA()</w:t>
+      </w:r>
+      <w:r>
+        <w:rPr>
+          <w:rFonts w:ascii="Consolas" w:cs="Consolas" w:eastAsia="Consolas" w:hAnsi="Consolas"/>
+          <w:sz w:val="19"/>
+          <w:szCs w:val="19"/>
+        </w:rPr>
+        <w:br/>
+        <w:t xml:space="preserve">    IF KEYPRESSED(KEY_RIGHT) THEN korbx = korbx + 260.0 * DELTA()</w:t>
+      </w:r>
+      <w:r>
+        <w:rPr>
+          <w:rFonts w:ascii="Consolas" w:cs="Consolas" w:eastAsia="Consolas" w:hAnsi="Consolas"/>
+          <w:sz w:val="19"/>
+          <w:szCs w:val="19"/>
+        </w:rPr>
+        <w:br/>
+        <w:t xml:space="preserve">    IF korbx &lt; 0.0   THEN korbx = 0.0</w:t>
+      </w:r>
+      <w:r>
+        <w:rPr>
+          <w:rFonts w:ascii="Consolas" w:cs="Consolas" w:eastAsia="Consolas" w:hAnsi="Consolas"/>
+          <w:sz w:val="19"/>
+          <w:szCs w:val="19"/>
+        </w:rPr>
+        <w:br/>
+        <w:t xml:space="preserve">    IF korbx &gt; 420.0 THEN korbx = 420.0</w:t>
+      </w:r>
+      <w:r>
+        <w:rPr>
+          <w:rFonts w:ascii="Consolas" w:cs="Consolas" w:eastAsia="Consolas" w:hAnsi="Consolas"/>
+          <w:sz w:val="19"/>
+          <w:szCs w:val="19"/>
+        </w:rPr>
+        <w:br/>
+        <w:t xml:space="preserve"/>
+      </w:r>
+      <w:r>
+        <w:rPr>
+          <w:rFonts w:ascii="Consolas" w:cs="Consolas" w:eastAsia="Consolas" w:hAnsi="Consolas"/>
+          <w:sz w:val="19"/>
+          <w:szCs w:val="19"/>
+        </w:rPr>
+        <w:br/>
+        <w:t xml:space="preserve">    CLS(RGB(20, 24, 40))</w:t>
+      </w:r>
+      <w:r>
+        <w:rPr>
+          <w:rFonts w:ascii="Consolas" w:cs="Consolas" w:eastAsia="Consolas" w:hAnsi="Consolas"/>
+          <w:sz w:val="19"/>
+          <w:szCs w:val="19"/>
+        </w:rPr>
+        <w:br/>
+        <w:t xml:space="preserve">    BOXROUND(INT(korbx), 290, INT(korbx) + 60, 312, 8, RGB(180, 120, 60))</w:t>
+      </w:r>
+      <w:r>
+        <w:rPr>
+          <w:rFonts w:ascii="Consolas" w:cs="Consolas" w:eastAsia="Consolas" w:hAnsi="Consolas"/>
+          <w:sz w:val="19"/>
+          <w:szCs w:val="19"/>
+        </w:rPr>
+        <w:br/>
+        <w:t xml:space="preserve">    FLIP()</w:t>
+      </w:r>
+      <w:r>
+        <w:rPr>
+          <w:rFonts w:ascii="Consolas" w:cs="Consolas" w:eastAsia="Consolas" w:hAnsi="Consolas"/>
+          <w:sz w:val="19"/>
+          <w:szCs w:val="19"/>
+        </w:rPr>
+        <w:br/>
+        <w:t xml:space="preserve">WEND</w:t>
+      </w:r>
+    </w:p>
+    <w:p>
+      <w:pPr>
+        <w:spacing w:after="180" w:line="312" w:lineRule="auto"/>
+      </w:pPr>
+      <w:r>
+        <w:rPr>
+          <w:sz w:val="22"/>
+          <w:szCs w:val="22"/>
+        </w:rPr>
+        <w:t xml:space="preserve">Jetzt lässt sich schon ein Korb hin- und herschieben. Beachte INT(korbx): Gezeichnet wird mit ganzen Zahlen, gerechnet aber mit Kommazahlen.</w:t>
+      </w:r>
+    </w:p>
+    <w:p>
+      <w:pPr>
+        <w:pStyle w:val="Heading2"/>
+        <w:keepNext/>
+        <w:keepLines/>
+        <w:spacing w:after="120" w:before="280"/>
+      </w:pPr>
+      <w:r>
+        <w:t xml:space="preserve">Schritt 2: Fallende Münzen mit Arrays</w:t>
+      </w:r>
+    </w:p>
+    <w:p>
+      <w:pPr>
+        <w:spacing w:after="180" w:line="312" w:lineRule="auto"/>
+      </w:pPr>
+      <w:r>
+        <w:rPr>
+          <w:sz w:val="22"/>
+          <w:szCs w:val="22"/>
+        </w:rPr>
+        <w:t xml:space="preserve">Wir wollen mehrere Münzen gleichzeitig. Statt für jede eigene Variablen zu nehmen, halten wir ihre Werte in Arrays: mx und my für die Position, ms für die Fallgeschwindigkeit. Vor dem Game-Loop füllen wir sie mit Zufallswerten. Im Loop fällt jede Münze nach unten; wer unten herausfällt, taucht oben wieder auf.</w:t>
+      </w:r>
+    </w:p>
+    <w:p>
+      <w:pPr>
+        <w:keepLines/>
+        <w:pBdr>
+          <w:left w:val="single" w:color="1B6CA8" w:sz="18" w:space="6"/>
+        </w:pBdr>
+        <w:shd w:fill="F4F4F4" w:val="clear"/>
+        <w:spacing w:after="200" w:before="100" w:line="264" w:lineRule="auto"/>
+        <w:ind w:left="140"/>
+      </w:pPr>
+      <w:r>
+        <w:rPr>
+          <w:rFonts w:ascii="Consolas" w:cs="Consolas" w:eastAsia="Consolas" w:hAnsi="Consolas"/>
+          <w:sz w:val="19"/>
+          <w:szCs w:val="19"/>
+        </w:rPr>
+        <w:t xml:space="preserve">CONST ANZAHL AS INTEGER = 6</w:t>
+      </w:r>
+      <w:r>
+        <w:rPr>
+          <w:rFonts w:ascii="Consolas" w:cs="Consolas" w:eastAsia="Consolas" w:hAnsi="Consolas"/>
+          <w:sz w:val="19"/>
+          <w:szCs w:val="19"/>
+        </w:rPr>
+        <w:br/>
+        <w:t xml:space="preserve">DIM mx[ANZAHL] AS INTEGER</w:t>
+      </w:r>
+      <w:r>
+        <w:rPr>
+          <w:rFonts w:ascii="Consolas" w:cs="Consolas" w:eastAsia="Consolas" w:hAnsi="Consolas"/>
+          <w:sz w:val="19"/>
+          <w:szCs w:val="19"/>
+        </w:rPr>
+        <w:br/>
+        <w:t xml:space="preserve">DIM my[ANZAHL] AS INTEGER</w:t>
+      </w:r>
+      <w:r>
+        <w:rPr>
+          <w:rFonts w:ascii="Consolas" w:cs="Consolas" w:eastAsia="Consolas" w:hAnsi="Consolas"/>
+          <w:sz w:val="19"/>
+          <w:szCs w:val="19"/>
+        </w:rPr>
+        <w:br/>
+        <w:t xml:space="preserve">DIM ms[ANZAHL] AS INTEGER</w:t>
+      </w:r>
+      <w:r>
+        <w:rPr>
+          <w:rFonts w:ascii="Consolas" w:cs="Consolas" w:eastAsia="Consolas" w:hAnsi="Consolas"/>
+          <w:sz w:val="19"/>
+          <w:szCs w:val="19"/>
+        </w:rPr>
+        <w:br/>
+        <w:t xml:space="preserve"/>
+      </w:r>
+      <w:r>
+        <w:rPr>
+          <w:rFonts w:ascii="Consolas" w:cs="Consolas" w:eastAsia="Consolas" w:hAnsi="Consolas"/>
+          <w:sz w:val="19"/>
+          <w:szCs w:val="19"/>
+        </w:rPr>
+        <w:br/>
+        <w:t xml:space="preserve">RANDOMIZE(3)</w:t>
+      </w:r>
+      <w:r>
+        <w:rPr>
+          <w:rFonts w:ascii="Consolas" w:cs="Consolas" w:eastAsia="Consolas" w:hAnsi="Consolas"/>
+          <w:sz w:val="19"/>
+          <w:szCs w:val="19"/>
+        </w:rPr>
+        <w:br/>
+        <w:t xml:space="preserve">DIM i AS INTEGER</w:t>
+      </w:r>
+      <w:r>
+        <w:rPr>
+          <w:rFonts w:ascii="Consolas" w:cs="Consolas" w:eastAsia="Consolas" w:hAnsi="Consolas"/>
+          <w:sz w:val="19"/>
+          <w:szCs w:val="19"/>
+        </w:rPr>
+        <w:br/>
+        <w:t xml:space="preserve">FOR i = 0 TO ANZAHL - 1</w:t>
+      </w:r>
+      <w:r>
+        <w:rPr>
+          <w:rFonts w:ascii="Consolas" w:cs="Consolas" w:eastAsia="Consolas" w:hAnsi="Consolas"/>
+          <w:sz w:val="19"/>
+          <w:szCs w:val="19"/>
+        </w:rPr>
+        <w:br/>
+        <w:t xml:space="preserve">    mx[i] = RANDINT(20, 450)</w:t>
+      </w:r>
+      <w:r>
+        <w:rPr>
+          <w:rFonts w:ascii="Consolas" w:cs="Consolas" w:eastAsia="Consolas" w:hAnsi="Consolas"/>
+          <w:sz w:val="19"/>
+          <w:szCs w:val="19"/>
+        </w:rPr>
+        <w:br/>
+        <w:t xml:space="preserve">    my[i] = RANDINT(0, 240)</w:t>
+      </w:r>
+      <w:r>
+        <w:rPr>
+          <w:rFonts w:ascii="Consolas" w:cs="Consolas" w:eastAsia="Consolas" w:hAnsi="Consolas"/>
+          <w:sz w:val="19"/>
+          <w:szCs w:val="19"/>
+        </w:rPr>
+        <w:br/>
+        <w:t xml:space="preserve">    ms[i] = RANDINT(90, 170)     ' jede Münze fällt anders schnell</w:t>
+      </w:r>
+      <w:r>
+        <w:rPr>
+          <w:rFonts w:ascii="Consolas" w:cs="Consolas" w:eastAsia="Consolas" w:hAnsi="Consolas"/>
+          <w:sz w:val="19"/>
+          <w:szCs w:val="19"/>
+        </w:rPr>
+        <w:br/>
+        <w:t xml:space="preserve">NEXT</w:t>
+      </w:r>
+    </w:p>
+    <w:p>
+      <w:pPr>
+        <w:spacing w:after="180" w:line="312" w:lineRule="auto"/>
+      </w:pPr>
+      <w:r>
+        <w:rPr>
+          <w:sz w:val="22"/>
+          <w:szCs w:val="22"/>
+        </w:rPr>
+        <w:t xml:space="preserve">Im Game-Loop bewegen und zeichnen wir alle Münzen mit einer Schleife:</w:t>
+      </w:r>
+    </w:p>
+    <w:p>
+      <w:pPr>
+        <w:keepLines/>
+        <w:pBdr>
+          <w:left w:val="single" w:color="1B6CA8" w:sz="18" w:space="6"/>
+        </w:pBdr>
+        <w:shd w:fill="F4F4F4" w:val="clear"/>
+        <w:spacing w:after="200" w:before="100" w:line="264" w:lineRule="auto"/>
+        <w:ind w:left="140"/>
+      </w:pPr>
+      <w:r>
+        <w:rPr>
+          <w:rFonts w:ascii="Consolas" w:cs="Consolas" w:eastAsia="Consolas" w:hAnsi="Consolas"/>
+          <w:sz w:val="19"/>
+          <w:szCs w:val="19"/>
+        </w:rPr>
+        <w:t xml:space="preserve">FOR i = 0 TO ANZAHL - 1</w:t>
+      </w:r>
+      <w:r>
+        <w:rPr>
+          <w:rFonts w:ascii="Consolas" w:cs="Consolas" w:eastAsia="Consolas" w:hAnsi="Consolas"/>
+          <w:sz w:val="19"/>
+          <w:szCs w:val="19"/>
+        </w:rPr>
+        <w:br/>
+        <w:t xml:space="preserve">    my[i] = my[i] + INT(ms[i] * DELTA())</w:t>
+      </w:r>
+      <w:r>
+        <w:rPr>
+          <w:rFonts w:ascii="Consolas" w:cs="Consolas" w:eastAsia="Consolas" w:hAnsi="Consolas"/>
+          <w:sz w:val="19"/>
+          <w:szCs w:val="19"/>
+        </w:rPr>
+        <w:br/>
+        <w:t xml:space="preserve">    IF my[i] &gt; 330 THEN          ' unten raus -&gt; neu oben</w:t>
+      </w:r>
+      <w:r>
+        <w:rPr>
+          <w:rFonts w:ascii="Consolas" w:cs="Consolas" w:eastAsia="Consolas" w:hAnsi="Consolas"/>
+          <w:sz w:val="19"/>
+          <w:szCs w:val="19"/>
+        </w:rPr>
+        <w:br/>
+        <w:t xml:space="preserve">        my[i] = RANDINT(-90, -10)</w:t>
+      </w:r>
+      <w:r>
+        <w:rPr>
+          <w:rFonts w:ascii="Consolas" w:cs="Consolas" w:eastAsia="Consolas" w:hAnsi="Consolas"/>
+          <w:sz w:val="19"/>
+          <w:szCs w:val="19"/>
+        </w:rPr>
+        <w:br/>
+        <w:t xml:space="preserve">        mx[i] = RANDINT(20, 450)</w:t>
+      </w:r>
+      <w:r>
+        <w:rPr>
+          <w:rFonts w:ascii="Consolas" w:cs="Consolas" w:eastAsia="Consolas" w:hAnsi="Consolas"/>
+          <w:sz w:val="19"/>
+          <w:szCs w:val="19"/>
+        </w:rPr>
+        <w:br/>
+        <w:t xml:space="preserve">    END IF</w:t>
+      </w:r>
+      <w:r>
+        <w:rPr>
+          <w:rFonts w:ascii="Consolas" w:cs="Consolas" w:eastAsia="Consolas" w:hAnsi="Consolas"/>
+          <w:sz w:val="19"/>
+          <w:szCs w:val="19"/>
+        </w:rPr>
+        <w:br/>
+        <w:t xml:space="preserve">    CIRCLE(mx[i], my[i], 10, RGB(255, 205, 40))</w:t>
+      </w:r>
+      <w:r>
+        <w:rPr>
+          <w:rFonts w:ascii="Consolas" w:cs="Consolas" w:eastAsia="Consolas" w:hAnsi="Consolas"/>
+          <w:sz w:val="19"/>
+          <w:szCs w:val="19"/>
+        </w:rPr>
+        <w:br/>
+        <w:t xml:space="preserve">NEXT</w:t>
+      </w:r>
+    </w:p>
+    <w:p>
+      <w:pPr>
+        <w:pStyle w:val="Heading2"/>
+        <w:keepNext/>
+        <w:keepLines/>
+        <w:spacing w:after="120" w:before="280"/>
+      </w:pPr>
+      <w:r>
+        <w:t xml:space="preserve">Schritt 3: Münzen fangen</w:t>
+      </w:r>
+    </w:p>
+    <w:p>
+      <w:pPr>
+        <w:spacing w:after="180" w:line="312" w:lineRule="auto"/>
+      </w:pPr>
+      <w:r>
+        <w:rPr>
+          <w:sz w:val="22"/>
+          <w:szCs w:val="22"/>
+        </w:rPr>
+        <w:t xml:space="preserve">Jetzt die eigentliche Spiel-Idee: Berührt eine fallende Münze den Korb, ist sie gefangen. Wir prüfen das in derselben Schleife – ist die Münze auf Korbhöhe (y zwischen 280 und 310) UND liegt ihr x im Bereich des Korbs, dann zählen wir einen Punkt und schicken die Münze wieder nach oben.</w:t>
+      </w:r>
+    </w:p>
+    <w:p>
+      <w:pPr>
+        <w:keepLines/>
+        <w:pBdr>
+          <w:left w:val="single" w:color="1B6CA8" w:sz="18" w:space="6"/>
+        </w:pBdr>
+        <w:shd w:fill="F4F4F4" w:val="clear"/>
+        <w:spacing w:after="200" w:before="100" w:line="264" w:lineRule="auto"/>
+        <w:ind w:left="140"/>
+      </w:pPr>
+      <w:r>
+        <w:rPr>
+          <w:rFonts w:ascii="Consolas" w:cs="Consolas" w:eastAsia="Consolas" w:hAnsi="Consolas"/>
+          <w:sz w:val="19"/>
+          <w:szCs w:val="19"/>
+        </w:rPr>
+        <w:t xml:space="preserve">IF my[i] &gt; 280 AND my[i] &lt; 310 THEN</w:t>
+      </w:r>
+      <w:r>
+        <w:rPr>
+          <w:rFonts w:ascii="Consolas" w:cs="Consolas" w:eastAsia="Consolas" w:hAnsi="Consolas"/>
+          <w:sz w:val="19"/>
+          <w:szCs w:val="19"/>
+        </w:rPr>
+        <w:br/>
+        <w:t xml:space="preserve">    IF mx[i] &gt; INT(korbx) - 10 AND mx[i] &lt; INT(korbx) + 70 THEN</w:t>
+      </w:r>
+      <w:r>
+        <w:rPr>
+          <w:rFonts w:ascii="Consolas" w:cs="Consolas" w:eastAsia="Consolas" w:hAnsi="Consolas"/>
+          <w:sz w:val="19"/>
+          <w:szCs w:val="19"/>
+        </w:rPr>
+        <w:br/>
+        <w:t xml:space="preserve">        punkte = punkte + 1</w:t>
+      </w:r>
+      <w:r>
+        <w:rPr>
+          <w:rFonts w:ascii="Consolas" w:cs="Consolas" w:eastAsia="Consolas" w:hAnsi="Consolas"/>
+          <w:sz w:val="19"/>
+          <w:szCs w:val="19"/>
+        </w:rPr>
+        <w:br/>
+        <w:t xml:space="preserve">        my[i] = RANDINT(-90, -10)   ' wieder nach oben</w:t>
+      </w:r>
+      <w:r>
+        <w:rPr>
+          <w:rFonts w:ascii="Consolas" w:cs="Consolas" w:eastAsia="Consolas" w:hAnsi="Consolas"/>
+          <w:sz w:val="19"/>
+          <w:szCs w:val="19"/>
+        </w:rPr>
+        <w:br/>
+        <w:t xml:space="preserve">        mx[i] = RANDINT(20, 450)</w:t>
+      </w:r>
+      <w:r>
+        <w:rPr>
+          <w:rFonts w:ascii="Consolas" w:cs="Consolas" w:eastAsia="Consolas" w:hAnsi="Consolas"/>
+          <w:sz w:val="19"/>
+          <w:szCs w:val="19"/>
+        </w:rPr>
+        <w:br/>
+        <w:t xml:space="preserve">    END IF</w:t>
+      </w:r>
+      <w:r>
+        <w:rPr>
+          <w:rFonts w:ascii="Consolas" w:cs="Consolas" w:eastAsia="Consolas" w:hAnsi="Consolas"/>
+          <w:sz w:val="19"/>
+          <w:szCs w:val="19"/>
+        </w:rPr>
+        <w:br/>
+        <w:t xml:space="preserve">END IF</w:t>
+      </w:r>
+    </w:p>
+    <w:p>
+      <w:pPr>
+        <w:spacing w:after="180" w:line="312" w:lineRule="auto"/>
+      </w:pPr>
+      <w:r>
+        <w:rPr>
+          <w:sz w:val="22"/>
+          <w:szCs w:val="22"/>
+        </w:rPr>
+        <w:t xml:space="preserve">Dafür brauchen wir oben noch eine Punkte-Variable: DIM punkte AS INTEGER. Das ist im Kern eine Rechteck-Kollision (Kapitel „2D-Zeichnen“ hat die Koordinaten erklärt) – ein Muster, das in fast jedem Spiel vorkommt.</w:t>
+      </w:r>
+    </w:p>
+    <w:p>
+      <w:pPr>
+        <w:pStyle w:val="Heading2"/>
+        <w:keepNext/>
+        <w:keepLines/>
+        <w:spacing w:after="120" w:before="280"/>
+      </w:pPr>
+      <w:r>
+        <w:t xml:space="preserve">Schritt 4: Ein Ton beim Fangen</w:t>
+      </w:r>
+    </w:p>
+    <w:p>
+      <w:pPr>
+        <w:spacing w:after="180" w:line="312" w:lineRule="auto"/>
+      </w:pPr>
+      <w:r>
+        <w:rPr>
+          <w:sz w:val="22"/>
+          <w:szCs w:val="22"/>
+        </w:rPr>
+        <w:t xml:space="preserve">Ein Treffer soll sich auch hören lassen. Mit dem audio-Modul erzeugen wir beim Fangen einen kurzen Ton – eine Zeile direkt nach dem Punkte-Zählen:</w:t>
+      </w:r>
+    </w:p>
+    <w:p>
+      <w:pPr>
+        <w:keepLines/>
+        <w:pBdr>
+          <w:left w:val="single" w:color="1B6CA8" w:sz="18" w:space="6"/>
+        </w:pBdr>
+        <w:shd w:fill="F4F4F4" w:val="clear"/>
+        <w:spacing w:after="200" w:before="100" w:line="264" w:lineRule="auto"/>
+        <w:ind w:left="140"/>
+      </w:pPr>
+      <w:r>
+        <w:rPr>
+          <w:rFonts w:ascii="Consolas" w:cs="Consolas" w:eastAsia="Consolas" w:hAnsi="Consolas"/>
+          <w:sz w:val="19"/>
+          <w:szCs w:val="19"/>
+        </w:rPr>
+        <w:t xml:space="preserve">IMPORT "audio"        ' ganz oben im Programm</w:t>
+      </w:r>
+      <w:r>
+        <w:rPr>
+          <w:rFonts w:ascii="Consolas" w:cs="Consolas" w:eastAsia="Consolas" w:hAnsi="Consolas"/>
+          <w:sz w:val="19"/>
+          <w:szCs w:val="19"/>
+        </w:rPr>
+        <w:br/>
+        <w:t xml:space="preserve">' ... beim Fangen, direkt nach punkte = punkte + 1:</w:t>
+      </w:r>
+      <w:r>
+        <w:rPr>
+          <w:rFonts w:ascii="Consolas" w:cs="Consolas" w:eastAsia="Consolas" w:hAnsi="Consolas"/>
+          <w:sz w:val="19"/>
+          <w:szCs w:val="19"/>
+        </w:rPr>
+        <w:br/>
+        <w:t xml:space="preserve">PLAYSOUND(AUDIO_TONE(880, 90, "square", 0.4))</w:t>
+      </w:r>
+    </w:p>
+    <w:p>
+      <w:pPr>
+        <w:pStyle w:val="Heading2"/>
+        <w:keepNext/>
+        <w:keepLines/>
+        <w:spacing w:after="120" w:before="280"/>
+      </w:pPr>
+      <w:r>
+        <w:t xml:space="preserve">Schritt 5: Die Punkteanzeige</w:t>
+      </w:r>
+    </w:p>
+    <w:p>
+      <w:pPr>
+        <w:spacing w:after="180" w:line="312" w:lineRule="auto"/>
+      </w:pPr>
+      <w:r>
+        <w:rPr>
+          <w:sz w:val="22"/>
+          <w:szCs w:val="22"/>
+        </w:rPr>
+        <w:t xml:space="preserve">Zum Schluss zeigen wir den Punktestand an – mit TEXT, ganz oben ins Bild, nach dem Zeichnen der Münzen und des Korbs:</w:t>
+      </w:r>
+    </w:p>
+    <w:p>
+      <w:pPr>
+        <w:keepLines/>
+        <w:pBdr>
+          <w:left w:val="single" w:color="1B6CA8" w:sz="18" w:space="6"/>
+        </w:pBdr>
+        <w:shd w:fill="F4F4F4" w:val="clear"/>
+        <w:spacing w:after="200" w:before="100" w:line="264" w:lineRule="auto"/>
+        <w:ind w:left="140"/>
+      </w:pPr>
+      <w:r>
+        <w:rPr>
+          <w:rFonts w:ascii="Consolas" w:cs="Consolas" w:eastAsia="Consolas" w:hAnsi="Consolas"/>
+          <w:sz w:val="19"/>
+          <w:szCs w:val="19"/>
+        </w:rPr>
+        <w:t xml:space="preserve">TEXT(10, 8, "Punkte: " + STR$(punkte), WHITE)</w:t>
+      </w:r>
+      <w:r>
+        <w:rPr>
+          <w:rFonts w:ascii="Consolas" w:cs="Consolas" w:eastAsia="Consolas" w:hAnsi="Consolas"/>
+          <w:sz w:val="19"/>
+          <w:szCs w:val="19"/>
+        </w:rPr>
+        <w:br/>
+        <w:t xml:space="preserve">TEXT(270, 8, "Pfeiltasten: Korb", RGB(150, 160, 190))</w:t>
+      </w:r>
+    </w:p>
+    <w:p>
+      <w:pPr>
+        <w:pStyle w:val="Heading2"/>
+        <w:keepNext/>
+        <w:keepLines/>
+        <w:spacing w:after="120" w:before="280"/>
+      </w:pPr>
+      <w:r>
+        <w:t xml:space="preserve">Das ganze Spiel</w:t>
+      </w:r>
+    </w:p>
+    <w:p>
+      <w:pPr>
+        <w:spacing w:after="180" w:line="312" w:lineRule="auto"/>
+      </w:pPr>
+      <w:r>
+        <w:rPr>
+          <w:sz w:val="22"/>
+          <w:szCs w:val="22"/>
+        </w:rPr>
+        <w:t xml:space="preserve">Hier ist „Münzfang“ komplett – alle Schritte zusammengesetzt. Es ist erstaunlich wenig Code für ein richtiges, spielbares Spiel:</w:t>
+      </w:r>
+    </w:p>
+    <w:p>
+      <w:pPr>
+        <w:keepLines/>
+        <w:pBdr>
+          <w:left w:val="single" w:color="1B6CA8" w:sz="18" w:space="6"/>
+        </w:pBdr>
+        <w:shd w:fill="F4F4F4" w:val="clear"/>
+        <w:spacing w:after="200" w:before="100" w:line="264" w:lineRule="auto"/>
+        <w:ind w:left="140"/>
+      </w:pPr>
+      <w:r>
+        <w:rPr>
+          <w:rFonts w:ascii="Consolas" w:cs="Consolas" w:eastAsia="Consolas" w:hAnsi="Consolas"/>
+          <w:sz w:val="19"/>
+          <w:szCs w:val="19"/>
+        </w:rPr>
+        <w:t xml:space="preserve">IMPORT "audio"</w:t>
+      </w:r>
+      <w:r>
+        <w:rPr>
+          <w:rFonts w:ascii="Consolas" w:cs="Consolas" w:eastAsia="Consolas" w:hAnsi="Consolas"/>
+          <w:sz w:val="19"/>
+          <w:szCs w:val="19"/>
+        </w:rPr>
+        <w:br/>
+        <w:t xml:space="preserve">SCREEN(480, 320, "Münzfang")</w:t>
+      </w:r>
+      <w:r>
+        <w:rPr>
+          <w:rFonts w:ascii="Consolas" w:cs="Consolas" w:eastAsia="Consolas" w:hAnsi="Consolas"/>
+          <w:sz w:val="19"/>
+          <w:szCs w:val="19"/>
+        </w:rPr>
+        <w:br/>
+        <w:t xml:space="preserve"/>
+      </w:r>
+      <w:r>
+        <w:rPr>
+          <w:rFonts w:ascii="Consolas" w:cs="Consolas" w:eastAsia="Consolas" w:hAnsi="Consolas"/>
+          <w:sz w:val="19"/>
+          <w:szCs w:val="19"/>
+        </w:rPr>
+        <w:br/>
+        <w:t xml:space="preserve">CONST ANZAHL AS INTEGER = 6</w:t>
+      </w:r>
+      <w:r>
+        <w:rPr>
+          <w:rFonts w:ascii="Consolas" w:cs="Consolas" w:eastAsia="Consolas" w:hAnsi="Consolas"/>
+          <w:sz w:val="19"/>
+          <w:szCs w:val="19"/>
+        </w:rPr>
+        <w:br/>
+        <w:t xml:space="preserve">DIM mx[ANZAHL] AS INTEGER</w:t>
+      </w:r>
+      <w:r>
+        <w:rPr>
+          <w:rFonts w:ascii="Consolas" w:cs="Consolas" w:eastAsia="Consolas" w:hAnsi="Consolas"/>
+          <w:sz w:val="19"/>
+          <w:szCs w:val="19"/>
+        </w:rPr>
+        <w:br/>
+        <w:t xml:space="preserve">DIM my[ANZAHL] AS INTEGER</w:t>
+      </w:r>
+      <w:r>
+        <w:rPr>
+          <w:rFonts w:ascii="Consolas" w:cs="Consolas" w:eastAsia="Consolas" w:hAnsi="Consolas"/>
+          <w:sz w:val="19"/>
+          <w:szCs w:val="19"/>
+        </w:rPr>
+        <w:br/>
+        <w:t xml:space="preserve">DIM ms[ANZAHL] AS INTEGER</w:t>
+      </w:r>
+      <w:r>
+        <w:rPr>
+          <w:rFonts w:ascii="Consolas" w:cs="Consolas" w:eastAsia="Consolas" w:hAnsi="Consolas"/>
+          <w:sz w:val="19"/>
+          <w:szCs w:val="19"/>
+        </w:rPr>
+        <w:br/>
+        <w:t xml:space="preserve">RANDOMIZE(3)</w:t>
+      </w:r>
+      <w:r>
+        <w:rPr>
+          <w:rFonts w:ascii="Consolas" w:cs="Consolas" w:eastAsia="Consolas" w:hAnsi="Consolas"/>
+          <w:sz w:val="19"/>
+          <w:szCs w:val="19"/>
+        </w:rPr>
+        <w:br/>
+        <w:t xml:space="preserve">DIM i AS INTEGER</w:t>
+      </w:r>
+      <w:r>
+        <w:rPr>
+          <w:rFonts w:ascii="Consolas" w:cs="Consolas" w:eastAsia="Consolas" w:hAnsi="Consolas"/>
+          <w:sz w:val="19"/>
+          <w:szCs w:val="19"/>
+        </w:rPr>
+        <w:br/>
+        <w:t xml:space="preserve">FOR i = 0 TO ANZAHL - 1</w:t>
+      </w:r>
+      <w:r>
+        <w:rPr>
+          <w:rFonts w:ascii="Consolas" w:cs="Consolas" w:eastAsia="Consolas" w:hAnsi="Consolas"/>
+          <w:sz w:val="19"/>
+          <w:szCs w:val="19"/>
+        </w:rPr>
+        <w:br/>
+        <w:t xml:space="preserve">    mx[i] = RANDINT(20, 450)</w:t>
+      </w:r>
+      <w:r>
+        <w:rPr>
+          <w:rFonts w:ascii="Consolas" w:cs="Consolas" w:eastAsia="Consolas" w:hAnsi="Consolas"/>
+          <w:sz w:val="19"/>
+          <w:szCs w:val="19"/>
+        </w:rPr>
+        <w:br/>
+        <w:t xml:space="preserve">    my[i] = RANDINT(0, 240)</w:t>
+      </w:r>
+      <w:r>
+        <w:rPr>
+          <w:rFonts w:ascii="Consolas" w:cs="Consolas" w:eastAsia="Consolas" w:hAnsi="Consolas"/>
+          <w:sz w:val="19"/>
+          <w:szCs w:val="19"/>
+        </w:rPr>
+        <w:br/>
+        <w:t xml:space="preserve">    ms[i] = RANDINT(90, 170)</w:t>
+      </w:r>
+      <w:r>
+        <w:rPr>
+          <w:rFonts w:ascii="Consolas" w:cs="Consolas" w:eastAsia="Consolas" w:hAnsi="Consolas"/>
+          <w:sz w:val="19"/>
+          <w:szCs w:val="19"/>
+        </w:rPr>
+        <w:br/>
+        <w:t xml:space="preserve">NEXT</w:t>
+      </w:r>
+      <w:r>
+        <w:rPr>
+          <w:rFonts w:ascii="Consolas" w:cs="Consolas" w:eastAsia="Consolas" w:hAnsi="Consolas"/>
+          <w:sz w:val="19"/>
+          <w:szCs w:val="19"/>
+        </w:rPr>
+        <w:br/>
+        <w:t xml:space="preserve"/>
+      </w:r>
+      <w:r>
+        <w:rPr>
+          <w:rFonts w:ascii="Consolas" w:cs="Consolas" w:eastAsia="Consolas" w:hAnsi="Consolas"/>
+          <w:sz w:val="19"/>
+          <w:szCs w:val="19"/>
+        </w:rPr>
+        <w:br/>
+        <w:t xml:space="preserve">DIM korbx AS FLOAT</w:t>
+      </w:r>
+      <w:r>
+        <w:rPr>
+          <w:rFonts w:ascii="Consolas" w:cs="Consolas" w:eastAsia="Consolas" w:hAnsi="Consolas"/>
+          <w:sz w:val="19"/>
+          <w:szCs w:val="19"/>
+        </w:rPr>
+        <w:br/>
+        <w:t xml:space="preserve">korbx = 210.0</w:t>
+      </w:r>
+      <w:r>
+        <w:rPr>
+          <w:rFonts w:ascii="Consolas" w:cs="Consolas" w:eastAsia="Consolas" w:hAnsi="Consolas"/>
+          <w:sz w:val="19"/>
+          <w:szCs w:val="19"/>
+        </w:rPr>
+        <w:br/>
+        <w:t xml:space="preserve">DIM punkte AS INTEGER</w:t>
+      </w:r>
+      <w:r>
+        <w:rPr>
+          <w:rFonts w:ascii="Consolas" w:cs="Consolas" w:eastAsia="Consolas" w:hAnsi="Consolas"/>
+          <w:sz w:val="19"/>
+          <w:szCs w:val="19"/>
+        </w:rPr>
+        <w:br/>
+        <w:t xml:space="preserve">punkte = 0</w:t>
+      </w:r>
+      <w:r>
+        <w:rPr>
+          <w:rFonts w:ascii="Consolas" w:cs="Consolas" w:eastAsia="Consolas" w:hAnsi="Consolas"/>
+          <w:sz w:val="19"/>
+          <w:szCs w:val="19"/>
+        </w:rPr>
+        <w:br/>
+        <w:t xml:space="preserve"/>
+      </w:r>
+      <w:r>
+        <w:rPr>
+          <w:rFonts w:ascii="Consolas" w:cs="Consolas" w:eastAsia="Consolas" w:hAnsi="Consolas"/>
+          <w:sz w:val="19"/>
+          <w:szCs w:val="19"/>
+        </w:rPr>
+        <w:br/>
+        <w:t xml:space="preserve">WHILE NOT QUITREQUESTED()</w:t>
+      </w:r>
+      <w:r>
+        <w:rPr>
+          <w:rFonts w:ascii="Consolas" w:cs="Consolas" w:eastAsia="Consolas" w:hAnsi="Consolas"/>
+          <w:sz w:val="19"/>
+          <w:szCs w:val="19"/>
+        </w:rPr>
+        <w:br/>
+        <w:t xml:space="preserve">    IF KEYPRESSED(KEY_LEFT)  THEN korbx = korbx - 260.0 * DELTA()</w:t>
+      </w:r>
+      <w:r>
+        <w:rPr>
+          <w:rFonts w:ascii="Consolas" w:cs="Consolas" w:eastAsia="Consolas" w:hAnsi="Consolas"/>
+          <w:sz w:val="19"/>
+          <w:szCs w:val="19"/>
+        </w:rPr>
+        <w:br/>
+        <w:t xml:space="preserve">    IF KEYPRESSED(KEY_RIGHT) THEN korbx = korbx + 260.0 * DELTA()</w:t>
+      </w:r>
+      <w:r>
+        <w:rPr>
+          <w:rFonts w:ascii="Consolas" w:cs="Consolas" w:eastAsia="Consolas" w:hAnsi="Consolas"/>
+          <w:sz w:val="19"/>
+          <w:szCs w:val="19"/>
+        </w:rPr>
+        <w:br/>
+        <w:t xml:space="preserve">    IF korbx &lt; 0.0   THEN korbx = 0.0</w:t>
+      </w:r>
+      <w:r>
+        <w:rPr>
+          <w:rFonts w:ascii="Consolas" w:cs="Consolas" w:eastAsia="Consolas" w:hAnsi="Consolas"/>
+          <w:sz w:val="19"/>
+          <w:szCs w:val="19"/>
+        </w:rPr>
+        <w:br/>
+        <w:t xml:space="preserve">    IF korbx &gt; 420.0 THEN korbx = 420.0</w:t>
+      </w:r>
+      <w:r>
+        <w:rPr>
+          <w:rFonts w:ascii="Consolas" w:cs="Consolas" w:eastAsia="Consolas" w:hAnsi="Consolas"/>
+          <w:sz w:val="19"/>
+          <w:szCs w:val="19"/>
+        </w:rPr>
+        <w:br/>
+        <w:t xml:space="preserve"/>
+      </w:r>
+      <w:r>
+        <w:rPr>
+          <w:rFonts w:ascii="Consolas" w:cs="Consolas" w:eastAsia="Consolas" w:hAnsi="Consolas"/>
+          <w:sz w:val="19"/>
+          <w:szCs w:val="19"/>
+        </w:rPr>
+        <w:br/>
+        <w:t xml:space="preserve">    FOR i = 0 TO ANZAHL - 1</w:t>
+      </w:r>
+      <w:r>
+        <w:rPr>
+          <w:rFonts w:ascii="Consolas" w:cs="Consolas" w:eastAsia="Consolas" w:hAnsi="Consolas"/>
+          <w:sz w:val="19"/>
+          <w:szCs w:val="19"/>
+        </w:rPr>
+        <w:br/>
+        <w:t xml:space="preserve">        my[i] = my[i] + INT(ms[i] * DELTA())</w:t>
+      </w:r>
+      <w:r>
+        <w:rPr>
+          <w:rFonts w:ascii="Consolas" w:cs="Consolas" w:eastAsia="Consolas" w:hAnsi="Consolas"/>
+          <w:sz w:val="19"/>
+          <w:szCs w:val="19"/>
+        </w:rPr>
+        <w:br/>
+        <w:t xml:space="preserve">        IF my[i] &gt; 280 AND my[i] &lt; 310 THEN</w:t>
+      </w:r>
+      <w:r>
+        <w:rPr>
+          <w:rFonts w:ascii="Consolas" w:cs="Consolas" w:eastAsia="Consolas" w:hAnsi="Consolas"/>
+          <w:sz w:val="19"/>
+          <w:szCs w:val="19"/>
+        </w:rPr>
+        <w:br/>
+        <w:t xml:space="preserve">            IF mx[i] &gt; INT(korbx) - 10 AND mx[i] &lt; INT(korbx) + 70 THEN</w:t>
+      </w:r>
+      <w:r>
+        <w:rPr>
+          <w:rFonts w:ascii="Consolas" w:cs="Consolas" w:eastAsia="Consolas" w:hAnsi="Consolas"/>
+          <w:sz w:val="19"/>
+          <w:szCs w:val="19"/>
+        </w:rPr>
+        <w:br/>
+        <w:t xml:space="preserve">                punkte = punkte + 1</w:t>
+      </w:r>
+      <w:r>
+        <w:rPr>
+          <w:rFonts w:ascii="Consolas" w:cs="Consolas" w:eastAsia="Consolas" w:hAnsi="Consolas"/>
+          <w:sz w:val="19"/>
+          <w:szCs w:val="19"/>
+        </w:rPr>
+        <w:br/>
+        <w:t xml:space="preserve">                PLAYSOUND(AUDIO_TONE(880, 90, "square", 0.4))</w:t>
+      </w:r>
+      <w:r>
+        <w:rPr>
+          <w:rFonts w:ascii="Consolas" w:cs="Consolas" w:eastAsia="Consolas" w:hAnsi="Consolas"/>
+          <w:sz w:val="19"/>
+          <w:szCs w:val="19"/>
+        </w:rPr>
+        <w:br/>
+        <w:t xml:space="preserve">                my[i] = RANDINT(-90, -10)</w:t>
+      </w:r>
+      <w:r>
+        <w:rPr>
+          <w:rFonts w:ascii="Consolas" w:cs="Consolas" w:eastAsia="Consolas" w:hAnsi="Consolas"/>
+          <w:sz w:val="19"/>
+          <w:szCs w:val="19"/>
+        </w:rPr>
+        <w:br/>
+        <w:t xml:space="preserve">                mx[i] = RANDINT(20, 450)</w:t>
+      </w:r>
+      <w:r>
+        <w:rPr>
+          <w:rFonts w:ascii="Consolas" w:cs="Consolas" w:eastAsia="Consolas" w:hAnsi="Consolas"/>
+          <w:sz w:val="19"/>
+          <w:szCs w:val="19"/>
+        </w:rPr>
+        <w:br/>
+        <w:t xml:space="preserve">            END IF</w:t>
+      </w:r>
+      <w:r>
+        <w:rPr>
+          <w:rFonts w:ascii="Consolas" w:cs="Consolas" w:eastAsia="Consolas" w:hAnsi="Consolas"/>
+          <w:sz w:val="19"/>
+          <w:szCs w:val="19"/>
+        </w:rPr>
+        <w:br/>
+        <w:t xml:space="preserve">        END IF</w:t>
+      </w:r>
+      <w:r>
+        <w:rPr>
+          <w:rFonts w:ascii="Consolas" w:cs="Consolas" w:eastAsia="Consolas" w:hAnsi="Consolas"/>
+          <w:sz w:val="19"/>
+          <w:szCs w:val="19"/>
+        </w:rPr>
+        <w:br/>
+        <w:t xml:space="preserve">        IF my[i] &gt; 330 THEN</w:t>
+      </w:r>
+      <w:r>
+        <w:rPr>
+          <w:rFonts w:ascii="Consolas" w:cs="Consolas" w:eastAsia="Consolas" w:hAnsi="Consolas"/>
+          <w:sz w:val="19"/>
+          <w:szCs w:val="19"/>
+        </w:rPr>
+        <w:br/>
+        <w:t xml:space="preserve">            my[i] = RANDINT(-90, -10)</w:t>
+      </w:r>
+      <w:r>
+        <w:rPr>
+          <w:rFonts w:ascii="Consolas" w:cs="Consolas" w:eastAsia="Consolas" w:hAnsi="Consolas"/>
+          <w:sz w:val="19"/>
+          <w:szCs w:val="19"/>
+        </w:rPr>
+        <w:br/>
+        <w:t xml:space="preserve">            mx[i] = RANDINT(20, 450)</w:t>
+      </w:r>
+      <w:r>
+        <w:rPr>
+          <w:rFonts w:ascii="Consolas" w:cs="Consolas" w:eastAsia="Consolas" w:hAnsi="Consolas"/>
+          <w:sz w:val="19"/>
+          <w:szCs w:val="19"/>
+        </w:rPr>
+        <w:br/>
+        <w:t xml:space="preserve">        END IF</w:t>
+      </w:r>
+      <w:r>
+        <w:rPr>
+          <w:rFonts w:ascii="Consolas" w:cs="Consolas" w:eastAsia="Consolas" w:hAnsi="Consolas"/>
+          <w:sz w:val="19"/>
+          <w:szCs w:val="19"/>
+        </w:rPr>
+        <w:br/>
+        <w:t xml:space="preserve">    NEXT</w:t>
+      </w:r>
+      <w:r>
+        <w:rPr>
+          <w:rFonts w:ascii="Consolas" w:cs="Consolas" w:eastAsia="Consolas" w:hAnsi="Consolas"/>
+          <w:sz w:val="19"/>
+          <w:szCs w:val="19"/>
+        </w:rPr>
+        <w:br/>
+        <w:t xml:space="preserve"/>
+      </w:r>
+      <w:r>
+        <w:rPr>
+          <w:rFonts w:ascii="Consolas" w:cs="Consolas" w:eastAsia="Consolas" w:hAnsi="Consolas"/>
+          <w:sz w:val="19"/>
+          <w:szCs w:val="19"/>
+        </w:rPr>
+        <w:br/>
+        <w:t xml:space="preserve">    CLS(RGB(20, 24, 40))</w:t>
+      </w:r>
+      <w:r>
+        <w:rPr>
+          <w:rFonts w:ascii="Consolas" w:cs="Consolas" w:eastAsia="Consolas" w:hAnsi="Consolas"/>
+          <w:sz w:val="19"/>
+          <w:szCs w:val="19"/>
+        </w:rPr>
+        <w:br/>
+        <w:t xml:space="preserve">    FOR i = 0 TO ANZAHL - 1</w:t>
+      </w:r>
+      <w:r>
+        <w:rPr>
+          <w:rFonts w:ascii="Consolas" w:cs="Consolas" w:eastAsia="Consolas" w:hAnsi="Consolas"/>
+          <w:sz w:val="19"/>
+          <w:szCs w:val="19"/>
+        </w:rPr>
+        <w:br/>
+        <w:t xml:space="preserve">        CIRCLE(mx[i], my[i], 10, RGB(255, 205, 40))</w:t>
+      </w:r>
+      <w:r>
+        <w:rPr>
+          <w:rFonts w:ascii="Consolas" w:cs="Consolas" w:eastAsia="Consolas" w:hAnsi="Consolas"/>
+          <w:sz w:val="19"/>
+          <w:szCs w:val="19"/>
+        </w:rPr>
+        <w:br/>
+        <w:t xml:space="preserve">    NEXT</w:t>
+      </w:r>
+      <w:r>
+        <w:rPr>
+          <w:rFonts w:ascii="Consolas" w:cs="Consolas" w:eastAsia="Consolas" w:hAnsi="Consolas"/>
+          <w:sz w:val="19"/>
+          <w:szCs w:val="19"/>
+        </w:rPr>
+        <w:br/>
+        <w:t xml:space="preserve">    BOXROUND(INT(korbx), 290, INT(korbx) + 60, 312, 8, RGB(180, 120, 60))</w:t>
+      </w:r>
+      <w:r>
+        <w:rPr>
+          <w:rFonts w:ascii="Consolas" w:cs="Consolas" w:eastAsia="Consolas" w:hAnsi="Consolas"/>
+          <w:sz w:val="19"/>
+          <w:szCs w:val="19"/>
+        </w:rPr>
+        <w:br/>
+        <w:t xml:space="preserve">    TEXT(10, 8, "Punkte: " + STR$(punkte), WHITE)</w:t>
+      </w:r>
+      <w:r>
+        <w:rPr>
+          <w:rFonts w:ascii="Consolas" w:cs="Consolas" w:eastAsia="Consolas" w:hAnsi="Consolas"/>
+          <w:sz w:val="19"/>
+          <w:szCs w:val="19"/>
+        </w:rPr>
+        <w:br/>
+        <w:t xml:space="preserve">    TEXT(270, 8, "Pfeiltasten: Korb", RGB(150, 160, 190))</w:t>
+      </w:r>
+      <w:r>
+        <w:rPr>
+          <w:rFonts w:ascii="Consolas" w:cs="Consolas" w:eastAsia="Consolas" w:hAnsi="Consolas"/>
+          <w:sz w:val="19"/>
+          <w:szCs w:val="19"/>
+        </w:rPr>
+        <w:br/>
+        <w:t xml:space="preserve">    FLIP()</w:t>
+      </w:r>
+      <w:r>
+        <w:rPr>
+          <w:rFonts w:ascii="Consolas" w:cs="Consolas" w:eastAsia="Consolas" w:hAnsi="Consolas"/>
+          <w:sz w:val="19"/>
+          <w:szCs w:val="19"/>
+        </w:rPr>
+        <w:br/>
+        <w:t xml:space="preserve">WEND</w:t>
+      </w:r>
+    </w:p>
+    <w:p>
+      <w:pPr>
+        <w:pStyle w:val="Heading2"/>
+        <w:keepNext/>
+        <w:keepLines/>
+        <w:spacing w:after="120" w:before="280"/>
+      </w:pPr>
+      <w:r>
+        <w:t xml:space="preserve">Und jetzt: weiterbauen!</w:t>
+      </w:r>
+    </w:p>
+    <w:p>
+      <w:pPr>
+        <w:spacing w:after="180" w:line="312" w:lineRule="auto"/>
+      </w:pPr>
+      <w:r>
+        <w:rPr>
+          <w:sz w:val="22"/>
+          <w:szCs w:val="22"/>
+        </w:rPr>
+        <w:t xml:space="preserve">Dieses kleine Spiel ist erst der Anfang. Mit dem, was du in diesem Buch gelernt hast, kannst du es Stück für Stück zu deinem eigenen Spiel ausbauen. Ein paar Ideen:</w:t>
+      </w:r>
+    </w:p>
+    <w:p>
+      <w:pPr>
+        <w:pStyle w:val="ListParagraph"/>
+        <w:numPr>
+          <w:ilvl w:val="0"/>
+          <w:numId w:val="2"/>
+        </w:numPr>
+        <w:spacing w:after="100" w:line="312" w:lineRule="auto"/>
+      </w:pPr>
+      <w:r>
+        <w:rPr>
+          <w:sz w:val="22"/>
+          <w:szCs w:val="22"/>
+        </w:rPr>
+        <w:t xml:space="preserve">Leben statt Endlos-Spiel: Verpasste Münzen kosten ein Leben, bei 0 ist Schluss (Kapitel „Verzweigungen“).</w:t>
+      </w:r>
+    </w:p>
+    <w:p>
+      <w:pPr>
+        <w:pStyle w:val="ListParagraph"/>
+        <w:numPr>
+          <w:ilvl w:val="0"/>
+          <w:numId w:val="2"/>
+        </w:numPr>
+        <w:spacing w:after="100" w:line="312" w:lineRule="auto"/>
+      </w:pPr>
+      <w:r>
+        <w:rPr>
+          <w:sz w:val="22"/>
+          <w:szCs w:val="22"/>
+        </w:rPr>
+        <w:t xml:space="preserve">Schwieriger werden: Lass die Münzen mit steigendem Punktestand schneller fallen.</w:t>
+      </w:r>
+    </w:p>
+    <w:p>
+      <w:pPr>
+        <w:pStyle w:val="ListParagraph"/>
+        <w:numPr>
+          <w:ilvl w:val="0"/>
+          <w:numId w:val="2"/>
+        </w:numPr>
+        <w:spacing w:after="100" w:line="312" w:lineRule="auto"/>
+      </w:pPr>
+      <w:r>
+        <w:rPr>
+          <w:sz w:val="22"/>
+          <w:szCs w:val="22"/>
+        </w:rPr>
+        <w:t xml:space="preserve">Echte Bilder: Ersetze die Kreise und den Korb-Block durch Sprites (Kapitel „Bilder“).</w:t>
+      </w:r>
+    </w:p>
+    <w:p>
+      <w:pPr>
+        <w:pStyle w:val="ListParagraph"/>
+        <w:numPr>
+          <w:ilvl w:val="0"/>
+          <w:numId w:val="2"/>
+        </w:numPr>
+        <w:spacing w:after="100" w:line="312" w:lineRule="auto"/>
+      </w:pPr>
+      <w:r>
+        <w:rPr>
+          <w:sz w:val="22"/>
+          <w:szCs w:val="22"/>
+        </w:rPr>
+        <w:t xml:space="preserve">Hintergrundmusik: Spiele mit PLAYMUSIC einen Loop, dazu einen anderen Ton, wenn eine Münze danebengeht.</w:t>
+      </w:r>
+    </w:p>
+    <w:p>
+      <w:pPr>
+        <w:pStyle w:val="ListParagraph"/>
+        <w:numPr>
+          <w:ilvl w:val="0"/>
+          <w:numId w:val="2"/>
+        </w:numPr>
+        <w:spacing w:after="100" w:line="312" w:lineRule="auto"/>
+      </w:pPr>
+      <w:r>
+        <w:rPr>
+          <w:sz w:val="22"/>
+          <w:szCs w:val="22"/>
+        </w:rPr>
+        <w:t xml:space="preserve">Bonus-Objekte: Lass ab und zu etwas Besonderes fallen, das extra Punkte oder einen Effekt bringt.</w:t>
+      </w:r>
+    </w:p>
+    <w:p>
+      <w:pPr>
+        <w:spacing w:after="180" w:line="312" w:lineRule="auto"/>
+      </w:pPr>
+      <w:r>
+        <w:rPr>
+          <w:sz w:val="22"/>
+          <w:szCs w:val="22"/>
+        </w:rPr>
+        <w:t xml:space="preserve">Damit endet die Reise durch GameBasic. Du kennst jetzt die Sprache, die eingebauten Befehle und die Werkzeuge für Grafik, Sound und Spiele. Der beste nächste Schritt ist immer derselbe: eine eigene kleine Idee nehmen und sie ausprobieren. Viel Freude beim Programmieren!</w:t>
+      </w:r>
     </w:p>
     <w:sectPr>
       <w:footerReference w:type="default" r:id="rId7"/>

</xml_diff>

<commit_message>
docs(buch): Teil V + Kap 50 Modul sprite (animiertes Sprite-Screenshot)
Start Teil V (Die Module). sprite: SPRITE_NEW, SET_POS/VELOCITY, ADD_ANIM/
PLAY/PLAY_ONCE, SET_FLIP/SET_SCALE, UPDATE(dt_ms INT)/DRAW, COLLIDES (AABB).
Animierter Sprite-Screenshot (normal + gespiegelt, 3x). Vollstaendiges
Game-Loop-Beispiel. Je Befehl ein Beispiel; gegen gbrt verifiziert.

Co-Authored-By: Claude Opus 4.8 (1M context) <noreply@anthropic.com>
</commit_message>
<xml_diff>
--- a/buch-referenz/buch/GameBasic-Lehrbuch.docx
+++ b/buch-referenz/buch/GameBasic-Lehrbuch.docx
@@ -1272,6 +1272,60 @@
           <w:szCs w:val="22"/>
         </w:rPr>
         <w:t xml:space="preserve">	164</w:t>
+      </w:r>
+    </w:p>
+    <w:p>
+      <w:pPr>
+        <w:tabs>
+          <w:tab w:val="right" w:pos="9200" w:leader="dot"/>
+        </w:tabs>
+        <w:spacing w:after="40" w:before="120"/>
+        <w:ind/>
+      </w:pPr>
+      <w:r>
+        <w:rPr>
+          <w:b/>
+          <w:bCs/>
+          <w:color w:val="10507F"/>
+          <w:sz w:val="24"/>
+          <w:szCs w:val="24"/>
+        </w:rPr>
+        <w:t xml:space="preserve">Teil V — Die Module</w:t>
+      </w:r>
+      <w:r>
+        <w:rPr>
+          <w:color w:val="555555"/>
+          <w:sz w:val="24"/>
+          <w:szCs w:val="24"/>
+        </w:rPr>
+        <w:t xml:space="preserve">	169</w:t>
+      </w:r>
+    </w:p>
+    <w:p>
+      <w:pPr>
+        <w:tabs>
+          <w:tab w:val="right" w:pos="9200" w:leader="dot"/>
+        </w:tabs>
+        <w:spacing w:after="20" w:before="0"/>
+        <w:ind w:left="280"/>
+      </w:pPr>
+      <w:r>
+        <w:rPr>
+          <w:b w:val="false"/>
+          <w:bCs w:val="false"/>
+          <w:color w:val="222222"/>
+          <w:sz w:val="22"/>
+          <w:szCs w:val="22"/>
+        </w:rPr>
+        <w:t xml:space="preserve">Modul: sprite</w:t>
+      </w:r>
+      <w:r>
+        <w:rPr>
+          <w:color w:val="555555"/>
+          <w:sz w:val="22"/>
+          <w:szCs w:val="22"/>
+        </w:rPr>
+        <w:t xml:space="preserve">	170</w:t>
       </w:r>
     </w:p>
     <w:p>
@@ -56355,6 +56409,1413 @@
         </w:rPr>
         <w:t xml:space="preserve">Damit endet die Reise durch GameBasic. Du kennst jetzt die Sprache, die eingebauten Befehle und die Werkzeuge für Grafik, Sound und Spiele. Der beste nächste Schritt ist immer derselbe: eine eigene kleine Idee nehmen und sie ausprobieren. Viel Freude beim Programmieren!</w:t>
       </w:r>
+    </w:p>
+    <w:p>
+      <w:pPr>
+        <w:pageBreakBefore/>
+        <w:spacing w:after="200" w:before="2600"/>
+        <w:jc w:val="center"/>
+      </w:pPr>
+      <w:r>
+        <w:rPr>
+          <w:b/>
+          <w:bCs/>
+          <w:color w:val="10507F"/>
+          <w:sz w:val="52"/>
+          <w:szCs w:val="52"/>
+        </w:rPr>
+        <w:t xml:space="preserve">Teil V — Die Module</w:t>
+      </w:r>
+    </w:p>
+    <w:p>
+      <w:pPr>
+        <w:pStyle w:val="Heading1"/>
+        <w:keepNext/>
+        <w:keepLines/>
+        <w:pageBreakBefore/>
+        <w:pBdr>
+          <w:bottom w:val="single" w:color="1B6CA8" w:sz="12" w:space="4"/>
+        </w:pBdr>
+        <w:spacing w:after="160" w:before="0"/>
+      </w:pPr>
+      <w:r>
+        <w:t xml:space="preserve">Modul: sprite</w:t>
+      </w:r>
+    </w:p>
+    <w:p>
+      <w:pPr>
+        <w:spacing w:after="180" w:line="312" w:lineRule="auto"/>
+      </w:pPr>
+      <w:r>
+        <w:rPr>
+          <w:sz w:val="22"/>
+          <w:szCs w:val="22"/>
+        </w:rPr>
+        <w:t xml:space="preserve">Mit Teil V tauchst du in die mitgelieferten Module ein – fertige Werkzeugkästen für wiederkehrende Spiel-Aufgaben. Jedes holst du mit IMPORT herein (Kapitel „Module importieren“). Den Anfang macht sprite: Es verwandelt ein Spritesheet in eine animierte Spielfigur mit Position, Geschwindigkeit, benannten Animationen, Spiegelung und Kollision – Dinge, die du sonst alle von Hand bauen müsstest.</w:t>
+      </w:r>
+    </w:p>
+    <w:p>
+      <w:pPr>
+        <w:keepNext/>
+        <w:spacing w:after="40" w:before="160"/>
+        <w:jc w:val="center"/>
+      </w:pPr>
+      <w:r>
+        <w:drawing>
+          <wp:inline distT="0" distB="0" distL="0" distR="0">
+            <wp:extent cx="4572000" cy="3048000"/>
+            <wp:effectExtent t="0" r="0" b="0" l="0"/>
+            <wp:docPr id="1" name="50_sprite.png" descr="Dasselbe animierte Sprite zweimal: links normal, rechts horizontal gespiegelt – beide dreifach skaliert." title="Dasselbe animierte Sprite zweimal: links normal, rechts horizontal gespiegelt – beide dreifach skaliert."/>
+            <wp:cNvGraphicFramePr>
+              <a:graphicFrameLocks xmlns:a="http://schemas.openxmlformats.org/drawingml/2006/main" noChangeAspect="1"/>
+            </wp:cNvGraphicFramePr>
+            <a:graphic xmlns:a="http://schemas.openxmlformats.org/drawingml/2006/main">
+              <a:graphicData uri="http://schemas.openxmlformats.org/drawingml/2006/picture">
+                <pic:pic xmlns:pic="http://schemas.openxmlformats.org/drawingml/2006/picture">
+                  <pic:nvPicPr>
+                    <pic:cNvPr id="0" name="" descr=""/>
+                    <pic:cNvPicPr>
+                      <a:picLocks noChangeAspect="1" noChangeArrowheads="1"/>
+                    </pic:cNvPicPr>
+                  </pic:nvPicPr>
+                  <pic:blipFill>
+                    <a:blip r:embed="rId19" cstate="none"/>
+                    <a:srcRect/>
+                    <a:stretch>
+                      <a:fillRect/>
+                    </a:stretch>
+                  </pic:blipFill>
+                  <pic:spPr bwMode="auto">
+                    <a:xfrm>
+                      <a:off x="0" y="0"/>
+                      <a:ext cx="4572000" cy="3048000"/>
+                    </a:xfrm>
+                    <a:prstGeom prst="rect">
+                      <a:avLst/>
+                    </a:prstGeom>
+                  </pic:spPr>
+                </pic:pic>
+              </a:graphicData>
+            </a:graphic>
+          </wp:inline>
+        </w:drawing>
+      </w:r>
+    </w:p>
+    <w:p>
+      <w:pPr>
+        <w:spacing w:after="200"/>
+        <w:jc w:val="center"/>
+      </w:pPr>
+      <w:r>
+        <w:rPr>
+          <w:i/>
+          <w:iCs/>
+          <w:color w:val="6A6A6A"/>
+          <w:sz w:val="18"/>
+          <w:szCs w:val="18"/>
+        </w:rPr>
+        <w:t xml:space="preserve">Dasselbe animierte Sprite zweimal: links normal, rechts horizontal gespiegelt – beide dreifach skaliert.</w:t>
+      </w:r>
+    </w:p>
+    <w:p>
+      <w:pPr>
+        <w:spacing w:before="60"/>
+      </w:pPr>
+    </w:p>
+    <w:tbl>
+      <w:tblPr>
+        <w:tblW w:type="dxa" w:w="9360"/>
+        <w:tblBorders>
+          <w:top w:val="single" w:color="auto" w:sz="4"/>
+          <w:left w:val="single" w:color="auto" w:sz="4"/>
+          <w:bottom w:val="single" w:color="auto" w:sz="4"/>
+          <w:right w:val="single" w:color="auto" w:sz="4"/>
+          <w:insideH w:val="single" w:color="auto" w:sz="4"/>
+          <w:insideV w:val="single" w:color="auto" w:sz="4"/>
+        </w:tblBorders>
+      </w:tblPr>
+      <w:tblGrid>
+        <w:gridCol w:w="9360"/>
+      </w:tblGrid>
+      <w:tr>
+        <w:trPr>
+          <w:cantSplit/>
+        </w:trPr>
+        <w:tc>
+          <w:tcPr>
+            <w:tcW w:type="dxa" w:w="9360"/>
+            <w:tcBorders>
+              <w:top w:val="single" w:color="E0B96A" w:sz="6"/>
+              <w:left w:val="single" w:color="E0B96A" w:sz="6"/>
+              <w:bottom w:val="single" w:color="E0B96A" w:sz="6"/>
+              <w:right w:val="single" w:color="E0B96A" w:sz="6"/>
+            </w:tcBorders>
+            <w:shd w:fill="FDF3E0" w:val="clear"/>
+            <w:tcMar>
+              <w:top w:type="dxa" w:w="140"/>
+              <w:left w:type="dxa" w:w="180"/>
+              <w:bottom w:type="dxa" w:w="140"/>
+              <w:right w:type="dxa" w:w="180"/>
+            </w:tcMar>
+          </w:tcPr>
+          <w:p>
+            <w:pPr>
+              <w:spacing w:after="40"/>
+            </w:pPr>
+            <w:r>
+              <w:rPr>
+                <w:b/>
+                <w:bCs/>
+                <w:color w:val="9A6A1E"/>
+                <w:sz w:val="22"/>
+                <w:szCs w:val="22"/>
+              </w:rPr>
+              <w:t xml:space="preserve">Merke</w:t>
+            </w:r>
+          </w:p>
+          <w:p>
+            <w:pPr>
+              <w:spacing w:after="0" w:line="312" w:lineRule="auto"/>
+            </w:pPr>
+            <w:r>
+              <w:rPr>
+                <w:sz w:val="22"/>
+                <w:szCs w:val="22"/>
+              </w:rPr>
+              <w:t xml:space="preserve">Ein Spritesheet ist ein Bild mit mehreren gleich großen Einzelbildern (Frames) nebeneinander. Das Heldenbild hier ist 256×32 Pixel groß und enthält 8 Frames à 32×32 – eine ganze Lauf-Animation.</w:t>
+            </w:r>
+          </w:p>
+        </w:tc>
+      </w:tr>
+    </w:tbl>
+    <w:p>
+      <w:pPr>
+        <w:spacing w:after="160"/>
+      </w:pPr>
+    </w:p>
+    <w:p>
+      <w:pPr>
+        <w:pStyle w:val="Heading2"/>
+        <w:keepNext/>
+        <w:keepLines/>
+        <w:spacing w:after="120" w:before="280"/>
+      </w:pPr>
+      <w:r>
+        <w:t xml:space="preserve">Ein Sprite anlegen</w:t>
+      </w:r>
+    </w:p>
+    <w:p>
+      <w:pPr>
+        <w:keepNext/>
+        <w:keepLines/>
+        <w:pBdr>
+          <w:bottom w:val="single" w:color="DDD0C0" w:sz="4" w:space="2"/>
+        </w:pBdr>
+        <w:spacing w:after="40" w:before="360"/>
+      </w:pPr>
+      <w:r>
+        <w:rPr>
+          <w:rFonts w:ascii="Consolas" w:cs="Consolas" w:eastAsia="Consolas" w:hAnsi="Consolas"/>
+          <w:b/>
+          <w:bCs/>
+          <w:color w:val="9A3412"/>
+          <w:sz w:val="24"/>
+          <w:szCs w:val="24"/>
+        </w:rPr>
+        <w:t xml:space="preserve">SPRITE_NEW</w:t>
+      </w:r>
+    </w:p>
+    <w:p>
+      <w:pPr>
+        <w:keepNext/>
+        <w:spacing w:after="120"/>
+      </w:pPr>
+      <w:r>
+        <w:rPr>
+          <w:b/>
+          <w:bCs/>
+          <w:color w:val="6A6A6A"/>
+          <w:sz w:val="18"/>
+          <w:szCs w:val="18"/>
+        </w:rPr>
+        <w:t xml:space="preserve">Syntax:  </w:t>
+      </w:r>
+      <w:r>
+        <w:rPr>
+          <w:rFonts w:ascii="Consolas" w:cs="Consolas" w:eastAsia="Consolas" w:hAnsi="Consolas"/>
+          <w:color w:val="335577"/>
+          <w:sz w:val="19"/>
+          <w:szCs w:val="19"/>
+        </w:rPr>
+        <w:t xml:space="preserve">SPRITE_NEW(image, frame_breite, frame_höhe)</w:t>
+      </w:r>
+    </w:p>
+    <w:p>
+      <w:pPr>
+        <w:spacing w:after="180" w:line="312" w:lineRule="auto"/>
+      </w:pPr>
+      <w:r>
+        <w:rPr>
+          <w:sz w:val="22"/>
+          <w:szCs w:val="22"/>
+        </w:rPr>
+        <w:t xml:space="preserve">Erzeugt ein SPRITE aus einem Spritesheet. image ist das ganze Sheet (mit LOADIMAGE geladen), frame_breite × frame_höhe die Größe eines einzelnen Frames. GameBasic teilt das Sheet selbst in Frames auf.</w:t>
+      </w:r>
+    </w:p>
+    <w:p>
+      <w:pPr>
+        <w:keepNext/>
+        <w:spacing w:after="30" w:before="120"/>
+      </w:pPr>
+      <w:r>
+        <w:rPr>
+          <w:b/>
+          <w:bCs/>
+          <w:i/>
+          <w:iCs/>
+          <w:color w:val="6A6A6A"/>
+          <w:sz w:val="18"/>
+          <w:szCs w:val="18"/>
+        </w:rPr>
+        <w:t xml:space="preserve">Beispiel</w:t>
+      </w:r>
+    </w:p>
+    <w:p>
+      <w:pPr>
+        <w:keepLines/>
+        <w:pBdr>
+          <w:left w:val="single" w:color="1B6CA8" w:sz="18" w:space="6"/>
+        </w:pBdr>
+        <w:shd w:fill="F4F4F4" w:val="clear"/>
+        <w:spacing w:after="200" w:before="100" w:line="264" w:lineRule="auto"/>
+        <w:ind w:left="140"/>
+      </w:pPr>
+      <w:r>
+        <w:rPr>
+          <w:rFonts w:ascii="Consolas" w:cs="Consolas" w:eastAsia="Consolas" w:hAnsi="Consolas"/>
+          <w:sz w:val="19"/>
+          <w:szCs w:val="19"/>
+        </w:rPr>
+        <w:t xml:space="preserve">IMPORT "sprite"</w:t>
+      </w:r>
+      <w:r>
+        <w:rPr>
+          <w:rFonts w:ascii="Consolas" w:cs="Consolas" w:eastAsia="Consolas" w:hAnsi="Consolas"/>
+          <w:sz w:val="19"/>
+          <w:szCs w:val="19"/>
+        </w:rPr>
+        <w:br/>
+        <w:t xml:space="preserve">DIM sheet AS IMAGE</w:t>
+      </w:r>
+      <w:r>
+        <w:rPr>
+          <w:rFonts w:ascii="Consolas" w:cs="Consolas" w:eastAsia="Consolas" w:hAnsi="Consolas"/>
+          <w:sz w:val="19"/>
+          <w:szCs w:val="19"/>
+        </w:rPr>
+        <w:br/>
+        <w:t xml:space="preserve">sheet = LOADIMAGE("assets/hero.png")   ' 256x32</w:t>
+      </w:r>
+      <w:r>
+        <w:rPr>
+          <w:rFonts w:ascii="Consolas" w:cs="Consolas" w:eastAsia="Consolas" w:hAnsi="Consolas"/>
+          <w:sz w:val="19"/>
+          <w:szCs w:val="19"/>
+        </w:rPr>
+        <w:br/>
+        <w:t xml:space="preserve">DIM held AS SPRITE</w:t>
+      </w:r>
+      <w:r>
+        <w:rPr>
+          <w:rFonts w:ascii="Consolas" w:cs="Consolas" w:eastAsia="Consolas" w:hAnsi="Consolas"/>
+          <w:sz w:val="19"/>
+          <w:szCs w:val="19"/>
+        </w:rPr>
+        <w:br/>
+        <w:t xml:space="preserve">held = SPRITE_NEW(sheet, 32, 32)       ' 8 Frames a 32x32</w:t>
+      </w:r>
+    </w:p>
+    <w:p>
+      <w:pPr>
+        <w:pStyle w:val="Heading2"/>
+        <w:keepNext/>
+        <w:keepLines/>
+        <w:spacing w:after="120" w:before="280"/>
+      </w:pPr>
+      <w:r>
+        <w:t xml:space="preserve">Position &amp; Bewegung</w:t>
+      </w:r>
+    </w:p>
+    <w:p>
+      <w:pPr>
+        <w:keepNext/>
+        <w:keepLines/>
+        <w:pBdr>
+          <w:bottom w:val="single" w:color="DDD0C0" w:sz="4" w:space="2"/>
+        </w:pBdr>
+        <w:spacing w:after="40" w:before="360"/>
+      </w:pPr>
+      <w:r>
+        <w:rPr>
+          <w:rFonts w:ascii="Consolas" w:cs="Consolas" w:eastAsia="Consolas" w:hAnsi="Consolas"/>
+          <w:b/>
+          <w:bCs/>
+          <w:color w:val="9A3412"/>
+          <w:sz w:val="24"/>
+          <w:szCs w:val="24"/>
+        </w:rPr>
+        <w:t xml:space="preserve">SPRITE_SET_POS · SPRITE_SET_VELOCITY</w:t>
+      </w:r>
+    </w:p>
+    <w:p>
+      <w:pPr>
+        <w:keepNext/>
+        <w:spacing w:after="120"/>
+      </w:pPr>
+      <w:r>
+        <w:rPr>
+          <w:b/>
+          <w:bCs/>
+          <w:color w:val="6A6A6A"/>
+          <w:sz w:val="18"/>
+          <w:szCs w:val="18"/>
+        </w:rPr>
+        <w:t xml:space="preserve">Syntax:  </w:t>
+      </w:r>
+      <w:r>
+        <w:rPr>
+          <w:rFonts w:ascii="Consolas" w:cs="Consolas" w:eastAsia="Consolas" w:hAnsi="Consolas"/>
+          <w:color w:val="335577"/>
+          <w:sz w:val="19"/>
+          <w:szCs w:val="19"/>
+        </w:rPr>
+        <w:t xml:space="preserve">SPRITE_SET_POS(sp, x, y)   SPRITE_SET_VELOCITY(sp, vx, vy)</w:t>
+      </w:r>
+    </w:p>
+    <w:p>
+      <w:pPr>
+        <w:spacing w:after="180" w:line="312" w:lineRule="auto"/>
+      </w:pPr>
+      <w:r>
+        <w:rPr>
+          <w:sz w:val="22"/>
+          <w:szCs w:val="22"/>
+        </w:rPr>
+        <w:t xml:space="preserve">SPRITE_SET_POS setzt die Position. SPRITE_SET_VELOCITY gibt eine Geschwindigkeit in Pixeln pro Sekunde vor – das Sprite bewegt sich dann bei jedem SPRITE_UPDATE von selbst weiter (framerate-unabhängig).</w:t>
+      </w:r>
+    </w:p>
+    <w:p>
+      <w:pPr>
+        <w:keepNext/>
+        <w:spacing w:after="30" w:before="120"/>
+      </w:pPr>
+      <w:r>
+        <w:rPr>
+          <w:b/>
+          <w:bCs/>
+          <w:i/>
+          <w:iCs/>
+          <w:color w:val="6A6A6A"/>
+          <w:sz w:val="18"/>
+          <w:szCs w:val="18"/>
+        </w:rPr>
+        <w:t xml:space="preserve">Beispiel</w:t>
+      </w:r>
+    </w:p>
+    <w:p>
+      <w:pPr>
+        <w:keepLines/>
+        <w:pBdr>
+          <w:left w:val="single" w:color="1B6CA8" w:sz="18" w:space="6"/>
+        </w:pBdr>
+        <w:shd w:fill="F4F4F4" w:val="clear"/>
+        <w:spacing w:after="200" w:before="100" w:line="264" w:lineRule="auto"/>
+        <w:ind w:left="140"/>
+      </w:pPr>
+      <w:r>
+        <w:rPr>
+          <w:rFonts w:ascii="Consolas" w:cs="Consolas" w:eastAsia="Consolas" w:hAnsi="Consolas"/>
+          <w:sz w:val="19"/>
+          <w:szCs w:val="19"/>
+        </w:rPr>
+        <w:t xml:space="preserve">SPRITE_SET_POS(held, 100.0, 150.0)</w:t>
+      </w:r>
+      <w:r>
+        <w:rPr>
+          <w:rFonts w:ascii="Consolas" w:cs="Consolas" w:eastAsia="Consolas" w:hAnsi="Consolas"/>
+          <w:sz w:val="19"/>
+          <w:szCs w:val="19"/>
+        </w:rPr>
+        <w:br/>
+        <w:t xml:space="preserve">SPRITE_SET_VELOCITY(held, 60.0, 0.0)   ' 60 Pixel/Sek. nach rechts</w:t>
+      </w:r>
+    </w:p>
+    <w:p>
+      <w:pPr>
+        <w:pStyle w:val="Heading2"/>
+        <w:keepNext/>
+        <w:keepLines/>
+        <w:spacing w:after="120" w:before="280"/>
+      </w:pPr>
+      <w:r>
+        <w:t xml:space="preserve">Animationen</w:t>
+      </w:r>
+    </w:p>
+    <w:p>
+      <w:pPr>
+        <w:spacing w:after="180" w:line="312" w:lineRule="auto"/>
+      </w:pPr>
+      <w:r>
+        <w:rPr>
+          <w:sz w:val="22"/>
+          <w:szCs w:val="22"/>
+        </w:rPr>
+        <w:t xml:space="preserve">Eine Animation ist ein benannter Bereich von Frames mit einer Abspielgeschwindigkeit. Du registrierst sie einmal und startest sie dann über den Namen.</w:t>
+      </w:r>
+    </w:p>
+    <w:p>
+      <w:pPr>
+        <w:keepNext/>
+        <w:keepLines/>
+        <w:pBdr>
+          <w:bottom w:val="single" w:color="DDD0C0" w:sz="4" w:space="2"/>
+        </w:pBdr>
+        <w:spacing w:after="40" w:before="360"/>
+      </w:pPr>
+      <w:r>
+        <w:rPr>
+          <w:rFonts w:ascii="Consolas" w:cs="Consolas" w:eastAsia="Consolas" w:hAnsi="Consolas"/>
+          <w:b/>
+          <w:bCs/>
+          <w:color w:val="9A3412"/>
+          <w:sz w:val="24"/>
+          <w:szCs w:val="24"/>
+        </w:rPr>
+        <w:t xml:space="preserve">SPRITE_ADD_ANIM · SPRITE_PLAY</w:t>
+      </w:r>
+    </w:p>
+    <w:p>
+      <w:pPr>
+        <w:keepNext/>
+        <w:spacing w:after="120"/>
+      </w:pPr>
+      <w:r>
+        <w:rPr>
+          <w:b/>
+          <w:bCs/>
+          <w:color w:val="6A6A6A"/>
+          <w:sz w:val="18"/>
+          <w:szCs w:val="18"/>
+        </w:rPr>
+        <w:t xml:space="preserve">Syntax:  </w:t>
+      </w:r>
+      <w:r>
+        <w:rPr>
+          <w:rFonts w:ascii="Consolas" w:cs="Consolas" w:eastAsia="Consolas" w:hAnsi="Consolas"/>
+          <w:color w:val="335577"/>
+          <w:sz w:val="19"/>
+          <w:szCs w:val="19"/>
+        </w:rPr>
+        <w:t xml:space="preserve">SPRITE_ADD_ANIM(sp, name$, erster, letzter, fps)   SPRITE_PLAY(sp, name$)</w:t>
+      </w:r>
+    </w:p>
+    <w:p>
+      <w:pPr>
+        <w:spacing w:after="180" w:line="312" w:lineRule="auto"/>
+      </w:pPr>
+      <w:r>
+        <w:rPr>
+          <w:sz w:val="22"/>
+          <w:szCs w:val="22"/>
+        </w:rPr>
+        <w:t xml:space="preserve">SPRITE_ADD_ANIM registriert eine Animation von Frame erster bis letzter mit fps Bildern pro Sekunde. SPRITE_PLAY startet sie als Schleife. SPRITE_PLAY ist gefahrlos in jedem Frame aufrufbar – läuft die Animation schon, passiert nichts.</w:t>
+      </w:r>
+    </w:p>
+    <w:p>
+      <w:pPr>
+        <w:keepNext/>
+        <w:spacing w:after="30" w:before="120"/>
+      </w:pPr>
+      <w:r>
+        <w:rPr>
+          <w:b/>
+          <w:bCs/>
+          <w:i/>
+          <w:iCs/>
+          <w:color w:val="6A6A6A"/>
+          <w:sz w:val="18"/>
+          <w:szCs w:val="18"/>
+        </w:rPr>
+        <w:t xml:space="preserve">Beispiel</w:t>
+      </w:r>
+    </w:p>
+    <w:p>
+      <w:pPr>
+        <w:keepLines/>
+        <w:pBdr>
+          <w:left w:val="single" w:color="1B6CA8" w:sz="18" w:space="6"/>
+        </w:pBdr>
+        <w:shd w:fill="F4F4F4" w:val="clear"/>
+        <w:spacing w:after="200" w:before="100" w:line="264" w:lineRule="auto"/>
+        <w:ind w:left="140"/>
+      </w:pPr>
+      <w:r>
+        <w:rPr>
+          <w:rFonts w:ascii="Consolas" w:cs="Consolas" w:eastAsia="Consolas" w:hAnsi="Consolas"/>
+          <w:sz w:val="19"/>
+          <w:szCs w:val="19"/>
+        </w:rPr>
+        <w:t xml:space="preserve">SPRITE_ADD_ANIM(held, "idle", 0, 0, 1.0)    ' nur Frame 0</w:t>
+      </w:r>
+      <w:r>
+        <w:rPr>
+          <w:rFonts w:ascii="Consolas" w:cs="Consolas" w:eastAsia="Consolas" w:hAnsi="Consolas"/>
+          <w:sz w:val="19"/>
+          <w:szCs w:val="19"/>
+        </w:rPr>
+        <w:br/>
+        <w:t xml:space="preserve">SPRITE_ADD_ANIM(held, "walk", 0, 7, 10.0)   ' Frames 0-7, 10 fps</w:t>
+      </w:r>
+      <w:r>
+        <w:rPr>
+          <w:rFonts w:ascii="Consolas" w:cs="Consolas" w:eastAsia="Consolas" w:hAnsi="Consolas"/>
+          <w:sz w:val="19"/>
+          <w:szCs w:val="19"/>
+        </w:rPr>
+        <w:br/>
+        <w:t xml:space="preserve">SPRITE_PLAY(held, "walk")</w:t>
+      </w:r>
+    </w:p>
+    <w:p>
+      <w:pPr>
+        <w:keepNext/>
+        <w:keepLines/>
+        <w:pBdr>
+          <w:bottom w:val="single" w:color="DDD0C0" w:sz="4" w:space="2"/>
+        </w:pBdr>
+        <w:spacing w:after="40" w:before="360"/>
+      </w:pPr>
+      <w:r>
+        <w:rPr>
+          <w:rFonts w:ascii="Consolas" w:cs="Consolas" w:eastAsia="Consolas" w:hAnsi="Consolas"/>
+          <w:b/>
+          <w:bCs/>
+          <w:color w:val="9A3412"/>
+          <w:sz w:val="24"/>
+          <w:szCs w:val="24"/>
+        </w:rPr>
+        <w:t xml:space="preserve">SPRITE_PLAY_ONCE</w:t>
+      </w:r>
+    </w:p>
+    <w:p>
+      <w:pPr>
+        <w:keepNext/>
+        <w:spacing w:after="120"/>
+      </w:pPr>
+      <w:r>
+        <w:rPr>
+          <w:b/>
+          <w:bCs/>
+          <w:color w:val="6A6A6A"/>
+          <w:sz w:val="18"/>
+          <w:szCs w:val="18"/>
+        </w:rPr>
+        <w:t xml:space="preserve">Syntax:  </w:t>
+      </w:r>
+      <w:r>
+        <w:rPr>
+          <w:rFonts w:ascii="Consolas" w:cs="Consolas" w:eastAsia="Consolas" w:hAnsi="Consolas"/>
+          <w:color w:val="335577"/>
+          <w:sz w:val="19"/>
+          <w:szCs w:val="19"/>
+        </w:rPr>
+        <w:t xml:space="preserve">SPRITE_PLAY_ONCE(sp, name$)</w:t>
+      </w:r>
+    </w:p>
+    <w:p>
+      <w:pPr>
+        <w:spacing w:after="180" w:line="312" w:lineRule="auto"/>
+      </w:pPr>
+      <w:r>
+        <w:rPr>
+          <w:sz w:val="22"/>
+          <w:szCs w:val="22"/>
+        </w:rPr>
+        <w:t xml:space="preserve">Spielt eine Animation genau einmal ab und bleibt am letzten Frame stehen (für Aktionen wie Schlagen oder Springen, die nicht endlos wiederholen sollen).</w:t>
+      </w:r>
+    </w:p>
+    <w:p>
+      <w:pPr>
+        <w:keepNext/>
+        <w:spacing w:after="30" w:before="120"/>
+      </w:pPr>
+      <w:r>
+        <w:rPr>
+          <w:b/>
+          <w:bCs/>
+          <w:i/>
+          <w:iCs/>
+          <w:color w:val="6A6A6A"/>
+          <w:sz w:val="18"/>
+          <w:szCs w:val="18"/>
+        </w:rPr>
+        <w:t xml:space="preserve">Beispiel</w:t>
+      </w:r>
+    </w:p>
+    <w:p>
+      <w:pPr>
+        <w:keepLines/>
+        <w:pBdr>
+          <w:left w:val="single" w:color="1B6CA8" w:sz="18" w:space="6"/>
+        </w:pBdr>
+        <w:shd w:fill="F4F4F4" w:val="clear"/>
+        <w:spacing w:after="200" w:before="100" w:line="264" w:lineRule="auto"/>
+        <w:ind w:left="140"/>
+      </w:pPr>
+      <w:r>
+        <w:rPr>
+          <w:rFonts w:ascii="Consolas" w:cs="Consolas" w:eastAsia="Consolas" w:hAnsi="Consolas"/>
+          <w:sz w:val="19"/>
+          <w:szCs w:val="19"/>
+        </w:rPr>
+        <w:t xml:space="preserve">SPRITE_PLAY_ONCE(held, "punch")</w:t>
+      </w:r>
+    </w:p>
+    <w:p>
+      <w:pPr>
+        <w:pStyle w:val="Heading2"/>
+        <w:keepNext/>
+        <w:keepLines/>
+        <w:spacing w:after="120" w:before="280"/>
+      </w:pPr>
+      <w:r>
+        <w:t xml:space="preserve">Spiegeln &amp; Skalieren</w:t>
+      </w:r>
+    </w:p>
+    <w:p>
+      <w:pPr>
+        <w:keepNext/>
+        <w:keepLines/>
+        <w:pBdr>
+          <w:bottom w:val="single" w:color="DDD0C0" w:sz="4" w:space="2"/>
+        </w:pBdr>
+        <w:spacing w:after="40" w:before="360"/>
+      </w:pPr>
+      <w:r>
+        <w:rPr>
+          <w:rFonts w:ascii="Consolas" w:cs="Consolas" w:eastAsia="Consolas" w:hAnsi="Consolas"/>
+          <w:b/>
+          <w:bCs/>
+          <w:color w:val="9A3412"/>
+          <w:sz w:val="24"/>
+          <w:szCs w:val="24"/>
+        </w:rPr>
+        <w:t xml:space="preserve">SPRITE_SET_FLIP</w:t>
+      </w:r>
+    </w:p>
+    <w:p>
+      <w:pPr>
+        <w:keepNext/>
+        <w:spacing w:after="120"/>
+      </w:pPr>
+      <w:r>
+        <w:rPr>
+          <w:b/>
+          <w:bCs/>
+          <w:color w:val="6A6A6A"/>
+          <w:sz w:val="18"/>
+          <w:szCs w:val="18"/>
+        </w:rPr>
+        <w:t xml:space="preserve">Syntax:  </w:t>
+      </w:r>
+      <w:r>
+        <w:rPr>
+          <w:rFonts w:ascii="Consolas" w:cs="Consolas" w:eastAsia="Consolas" w:hAnsi="Consolas"/>
+          <w:color w:val="335577"/>
+          <w:sz w:val="19"/>
+          <w:szCs w:val="19"/>
+        </w:rPr>
+        <w:t xml:space="preserve">SPRITE_SET_FLIP(sp, flipX, flipY)</w:t>
+      </w:r>
+    </w:p>
+    <w:p>
+      <w:pPr>
+        <w:spacing w:after="180" w:line="312" w:lineRule="auto"/>
+      </w:pPr>
+      <w:r>
+        <w:rPr>
+          <w:sz w:val="22"/>
+          <w:szCs w:val="22"/>
+        </w:rPr>
+        <w:t xml:space="preserve">Spiegelt das Sprite waagerecht (flipX) und/oder senkrecht (flipY). Klassisch: dieselbe Lauf-Animation für beide Richtungen, links per flipX.</w:t>
+      </w:r>
+    </w:p>
+    <w:p>
+      <w:pPr>
+        <w:keepNext/>
+        <w:spacing w:after="30" w:before="120"/>
+      </w:pPr>
+      <w:r>
+        <w:rPr>
+          <w:b/>
+          <w:bCs/>
+          <w:i/>
+          <w:iCs/>
+          <w:color w:val="6A6A6A"/>
+          <w:sz w:val="18"/>
+          <w:szCs w:val="18"/>
+        </w:rPr>
+        <w:t xml:space="preserve">Beispiel</w:t>
+      </w:r>
+    </w:p>
+    <w:p>
+      <w:pPr>
+        <w:keepLines/>
+        <w:pBdr>
+          <w:left w:val="single" w:color="1B6CA8" w:sz="18" w:space="6"/>
+        </w:pBdr>
+        <w:shd w:fill="F4F4F4" w:val="clear"/>
+        <w:spacing w:after="200" w:before="100" w:line="264" w:lineRule="auto"/>
+        <w:ind w:left="140"/>
+      </w:pPr>
+      <w:r>
+        <w:rPr>
+          <w:rFonts w:ascii="Consolas" w:cs="Consolas" w:eastAsia="Consolas" w:hAnsi="Consolas"/>
+          <w:sz w:val="19"/>
+          <w:szCs w:val="19"/>
+        </w:rPr>
+        <w:t xml:space="preserve">SPRITE_SET_FLIP(held, TRUE, FALSE)    ' blickt nach links</w:t>
+      </w:r>
+      <w:r>
+        <w:rPr>
+          <w:rFonts w:ascii="Consolas" w:cs="Consolas" w:eastAsia="Consolas" w:hAnsi="Consolas"/>
+          <w:sz w:val="19"/>
+          <w:szCs w:val="19"/>
+        </w:rPr>
+        <w:br/>
+        <w:t xml:space="preserve">SPRITE_SET_FLIP(held, FALSE, FALSE)   ' wieder nach rechts</w:t>
+      </w:r>
+    </w:p>
+    <w:p>
+      <w:pPr>
+        <w:keepNext/>
+        <w:keepLines/>
+        <w:pBdr>
+          <w:bottom w:val="single" w:color="DDD0C0" w:sz="4" w:space="2"/>
+        </w:pBdr>
+        <w:spacing w:after="40" w:before="360"/>
+      </w:pPr>
+      <w:r>
+        <w:rPr>
+          <w:rFonts w:ascii="Consolas" w:cs="Consolas" w:eastAsia="Consolas" w:hAnsi="Consolas"/>
+          <w:b/>
+          <w:bCs/>
+          <w:color w:val="9A3412"/>
+          <w:sz w:val="24"/>
+          <w:szCs w:val="24"/>
+        </w:rPr>
+        <w:t xml:space="preserve">SPRITE_SET_SCALE</w:t>
+      </w:r>
+    </w:p>
+    <w:p>
+      <w:pPr>
+        <w:keepNext/>
+        <w:spacing w:after="120"/>
+      </w:pPr>
+      <w:r>
+        <w:rPr>
+          <w:b/>
+          <w:bCs/>
+          <w:color w:val="6A6A6A"/>
+          <w:sz w:val="18"/>
+          <w:szCs w:val="18"/>
+        </w:rPr>
+        <w:t xml:space="preserve">Syntax:  </w:t>
+      </w:r>
+      <w:r>
+        <w:rPr>
+          <w:rFonts w:ascii="Consolas" w:cs="Consolas" w:eastAsia="Consolas" w:hAnsi="Consolas"/>
+          <w:color w:val="335577"/>
+          <w:sz w:val="19"/>
+          <w:szCs w:val="19"/>
+        </w:rPr>
+        <w:t xml:space="preserve">SPRITE_SET_SCALE(sp, sx, sy)</w:t>
+      </w:r>
+    </w:p>
+    <w:p>
+      <w:pPr>
+        <w:spacing w:after="180" w:line="312" w:lineRule="auto"/>
+      </w:pPr>
+      <w:r>
+        <w:rPr>
+          <w:sz w:val="22"/>
+          <w:szCs w:val="22"/>
+        </w:rPr>
+        <w:t xml:space="preserve">Skaliert die Darstellung. Wichtig: rein visuell – die Kollisionsbox bleibt in Originalgröße (gewollt, z. B. für einen Pop-Effekt beim Einsammeln).</w:t>
+      </w:r>
+    </w:p>
+    <w:p>
+      <w:pPr>
+        <w:keepNext/>
+        <w:spacing w:after="30" w:before="120"/>
+      </w:pPr>
+      <w:r>
+        <w:rPr>
+          <w:b/>
+          <w:bCs/>
+          <w:i/>
+          <w:iCs/>
+          <w:color w:val="6A6A6A"/>
+          <w:sz w:val="18"/>
+          <w:szCs w:val="18"/>
+        </w:rPr>
+        <w:t xml:space="preserve">Beispiel</w:t>
+      </w:r>
+    </w:p>
+    <w:p>
+      <w:pPr>
+        <w:keepLines/>
+        <w:pBdr>
+          <w:left w:val="single" w:color="1B6CA8" w:sz="18" w:space="6"/>
+        </w:pBdr>
+        <w:shd w:fill="F4F4F4" w:val="clear"/>
+        <w:spacing w:after="200" w:before="100" w:line="264" w:lineRule="auto"/>
+        <w:ind w:left="140"/>
+      </w:pPr>
+      <w:r>
+        <w:rPr>
+          <w:rFonts w:ascii="Consolas" w:cs="Consolas" w:eastAsia="Consolas" w:hAnsi="Consolas"/>
+          <w:sz w:val="19"/>
+          <w:szCs w:val="19"/>
+        </w:rPr>
+        <w:t xml:space="preserve">SPRITE_SET_SCALE(held, 3.0, 3.0)   ' dreifach groß</w:t>
+      </w:r>
+    </w:p>
+    <w:p>
+      <w:pPr>
+        <w:pStyle w:val="Heading2"/>
+        <w:keepNext/>
+        <w:keepLines/>
+        <w:spacing w:after="120" w:before="280"/>
+      </w:pPr>
+      <w:r>
+        <w:t xml:space="preserve">Aktualisieren &amp; Zeichnen</w:t>
+      </w:r>
+    </w:p>
+    <w:p>
+      <w:pPr>
+        <w:keepNext/>
+        <w:keepLines/>
+        <w:pBdr>
+          <w:bottom w:val="single" w:color="DDD0C0" w:sz="4" w:space="2"/>
+        </w:pBdr>
+        <w:spacing w:after="40" w:before="360"/>
+      </w:pPr>
+      <w:r>
+        <w:rPr>
+          <w:rFonts w:ascii="Consolas" w:cs="Consolas" w:eastAsia="Consolas" w:hAnsi="Consolas"/>
+          <w:b/>
+          <w:bCs/>
+          <w:color w:val="9A3412"/>
+          <w:sz w:val="24"/>
+          <w:szCs w:val="24"/>
+        </w:rPr>
+        <w:t xml:space="preserve">SPRITE_UPDATE · SPRITE_DRAW</w:t>
+      </w:r>
+    </w:p>
+    <w:p>
+      <w:pPr>
+        <w:keepNext/>
+        <w:spacing w:after="120"/>
+      </w:pPr>
+      <w:r>
+        <w:rPr>
+          <w:b/>
+          <w:bCs/>
+          <w:color w:val="6A6A6A"/>
+          <w:sz w:val="18"/>
+          <w:szCs w:val="18"/>
+        </w:rPr>
+        <w:t xml:space="preserve">Syntax:  </w:t>
+      </w:r>
+      <w:r>
+        <w:rPr>
+          <w:rFonts w:ascii="Consolas" w:cs="Consolas" w:eastAsia="Consolas" w:hAnsi="Consolas"/>
+          <w:color w:val="335577"/>
+          <w:sz w:val="19"/>
+          <w:szCs w:val="19"/>
+        </w:rPr>
+        <w:t xml:space="preserve">SPRITE_UPDATE(sp, dt_ms)   SPRITE_DRAW(sp)</w:t>
+      </w:r>
+    </w:p>
+    <w:p>
+      <w:pPr>
+        <w:spacing w:after="180" w:line="312" w:lineRule="auto"/>
+      </w:pPr>
+      <w:r>
+        <w:rPr>
+          <w:sz w:val="22"/>
+          <w:szCs w:val="22"/>
+        </w:rPr>
+        <w:t xml:space="preserve">SPRITE_UPDATE schreibt Position und Animation fort – dt_ms ist die vergangene Zeit in Millisekunden (ganzzahlig), also INT(DELTA() * 1000). SPRITE_DRAW zeichnet das Sprite an seiner Position (camera-aware).</w:t>
+      </w:r>
+    </w:p>
+    <w:p>
+      <w:pPr>
+        <w:keepNext/>
+        <w:spacing w:after="30" w:before="120"/>
+      </w:pPr>
+      <w:r>
+        <w:rPr>
+          <w:b/>
+          <w:bCs/>
+          <w:i/>
+          <w:iCs/>
+          <w:color w:val="6A6A6A"/>
+          <w:sz w:val="18"/>
+          <w:szCs w:val="18"/>
+        </w:rPr>
+        <w:t xml:space="preserve">Beispiel</w:t>
+      </w:r>
+    </w:p>
+    <w:p>
+      <w:pPr>
+        <w:keepLines/>
+        <w:pBdr>
+          <w:left w:val="single" w:color="1B6CA8" w:sz="18" w:space="6"/>
+        </w:pBdr>
+        <w:shd w:fill="F4F4F4" w:val="clear"/>
+        <w:spacing w:after="200" w:before="100" w:line="264" w:lineRule="auto"/>
+        <w:ind w:left="140"/>
+      </w:pPr>
+      <w:r>
+        <w:rPr>
+          <w:rFonts w:ascii="Consolas" w:cs="Consolas" w:eastAsia="Consolas" w:hAnsi="Consolas"/>
+          <w:sz w:val="19"/>
+          <w:szCs w:val="19"/>
+        </w:rPr>
+        <w:t xml:space="preserve">DIM dt AS INTEGER</w:t>
+      </w:r>
+      <w:r>
+        <w:rPr>
+          <w:rFonts w:ascii="Consolas" w:cs="Consolas" w:eastAsia="Consolas" w:hAnsi="Consolas"/>
+          <w:sz w:val="19"/>
+          <w:szCs w:val="19"/>
+        </w:rPr>
+        <w:br/>
+        <w:t xml:space="preserve">dt = INT(DELTA() * 1000.0)</w:t>
+      </w:r>
+      <w:r>
+        <w:rPr>
+          <w:rFonts w:ascii="Consolas" w:cs="Consolas" w:eastAsia="Consolas" w:hAnsi="Consolas"/>
+          <w:sz w:val="19"/>
+          <w:szCs w:val="19"/>
+        </w:rPr>
+        <w:br/>
+        <w:t xml:space="preserve">SPRITE_UPDATE(held, dt)</w:t>
+      </w:r>
+      <w:r>
+        <w:rPr>
+          <w:rFonts w:ascii="Consolas" w:cs="Consolas" w:eastAsia="Consolas" w:hAnsi="Consolas"/>
+          <w:sz w:val="19"/>
+          <w:szCs w:val="19"/>
+        </w:rPr>
+        <w:br/>
+        <w:t xml:space="preserve">SPRITE_DRAW(held)</w:t>
+      </w:r>
+    </w:p>
+    <w:p>
+      <w:pPr>
+        <w:keepNext/>
+        <w:keepLines/>
+        <w:pBdr>
+          <w:bottom w:val="single" w:color="DDD0C0" w:sz="4" w:space="2"/>
+        </w:pBdr>
+        <w:spacing w:after="40" w:before="360"/>
+      </w:pPr>
+      <w:r>
+        <w:rPr>
+          <w:rFonts w:ascii="Consolas" w:cs="Consolas" w:eastAsia="Consolas" w:hAnsi="Consolas"/>
+          <w:b/>
+          <w:bCs/>
+          <w:color w:val="9A3412"/>
+          <w:sz w:val="24"/>
+          <w:szCs w:val="24"/>
+        </w:rPr>
+        <w:t xml:space="preserve">SPRITE_COLLIDES</w:t>
+      </w:r>
+    </w:p>
+    <w:p>
+      <w:pPr>
+        <w:keepNext/>
+        <w:spacing w:after="120"/>
+      </w:pPr>
+      <w:r>
+        <w:rPr>
+          <w:b/>
+          <w:bCs/>
+          <w:color w:val="6A6A6A"/>
+          <w:sz w:val="18"/>
+          <w:szCs w:val="18"/>
+        </w:rPr>
+        <w:t xml:space="preserve">Syntax:  </w:t>
+      </w:r>
+      <w:r>
+        <w:rPr>
+          <w:rFonts w:ascii="Consolas" w:cs="Consolas" w:eastAsia="Consolas" w:hAnsi="Consolas"/>
+          <w:color w:val="335577"/>
+          <w:sz w:val="19"/>
+          <w:szCs w:val="19"/>
+        </w:rPr>
+        <w:t xml:space="preserve">SPRITE_COLLIDES(sp1, sp2)</w:t>
+      </w:r>
+    </w:p>
+    <w:p>
+      <w:pPr>
+        <w:spacing w:after="180" w:line="312" w:lineRule="auto"/>
+      </w:pPr>
+      <w:r>
+        <w:rPr>
+          <w:sz w:val="22"/>
+          <w:szCs w:val="22"/>
+        </w:rPr>
+        <w:t xml:space="preserve">Liefert TRUE, wenn sich die Boxen zweier Sprites überlappen (AABB-Kollision). Damit prüfst du Treffer zwischen Spieler und Gegner, Geschoss und Ziel und so weiter.</w:t>
+      </w:r>
+    </w:p>
+    <w:p>
+      <w:pPr>
+        <w:keepNext/>
+        <w:spacing w:after="30" w:before="120"/>
+      </w:pPr>
+      <w:r>
+        <w:rPr>
+          <w:b/>
+          <w:bCs/>
+          <w:i/>
+          <w:iCs/>
+          <w:color w:val="6A6A6A"/>
+          <w:sz w:val="18"/>
+          <w:szCs w:val="18"/>
+        </w:rPr>
+        <w:t xml:space="preserve">Beispiel</w:t>
+      </w:r>
+    </w:p>
+    <w:p>
+      <w:pPr>
+        <w:keepLines/>
+        <w:pBdr>
+          <w:left w:val="single" w:color="1B6CA8" w:sz="18" w:space="6"/>
+        </w:pBdr>
+        <w:shd w:fill="F4F4F4" w:val="clear"/>
+        <w:spacing w:after="200" w:before="100" w:line="264" w:lineRule="auto"/>
+        <w:ind w:left="140"/>
+      </w:pPr>
+      <w:r>
+        <w:rPr>
+          <w:rFonts w:ascii="Consolas" w:cs="Consolas" w:eastAsia="Consolas" w:hAnsi="Consolas"/>
+          <w:sz w:val="19"/>
+          <w:szCs w:val="19"/>
+        </w:rPr>
+        <w:t xml:space="preserve">IF SPRITE_COLLIDES(held, gegner) THEN ' getroffen!</w:t>
+      </w:r>
+    </w:p>
+    <w:p>
+      <w:pPr>
+        <w:pStyle w:val="Heading2"/>
+        <w:keepNext/>
+        <w:keepLines/>
+        <w:spacing w:after="120" w:before="280"/>
+      </w:pPr>
+      <w:r>
+        <w:t xml:space="preserve">Alles zusammen</w:t>
+      </w:r>
+    </w:p>
+    <w:p>
+      <w:pPr>
+        <w:spacing w:after="180" w:line="312" w:lineRule="auto"/>
+      </w:pPr>
+      <w:r>
+        <w:rPr>
+          <w:sz w:val="22"/>
+          <w:szCs w:val="22"/>
+        </w:rPr>
+        <w:t xml:space="preserve">So sieht eine typische Sprite-Spielfigur im Game-Loop aus – Richtung per Eingabe, Animation passend dazu, dann aktualisieren und zeichnen:</w:t>
+      </w:r>
+    </w:p>
+    <w:p>
+      <w:pPr>
+        <w:keepLines/>
+        <w:pBdr>
+          <w:left w:val="single" w:color="1B6CA8" w:sz="18" w:space="6"/>
+        </w:pBdr>
+        <w:shd w:fill="F4F4F4" w:val="clear"/>
+        <w:spacing w:after="200" w:before="100" w:line="264" w:lineRule="auto"/>
+        <w:ind w:left="140"/>
+      </w:pPr>
+      <w:r>
+        <w:rPr>
+          <w:rFonts w:ascii="Consolas" w:cs="Consolas" w:eastAsia="Consolas" w:hAnsi="Consolas"/>
+          <w:sz w:val="19"/>
+          <w:szCs w:val="19"/>
+        </w:rPr>
+        <w:t xml:space="preserve">IMPORT "sprite"</w:t>
+      </w:r>
+      <w:r>
+        <w:rPr>
+          <w:rFonts w:ascii="Consolas" w:cs="Consolas" w:eastAsia="Consolas" w:hAnsi="Consolas"/>
+          <w:sz w:val="19"/>
+          <w:szCs w:val="19"/>
+        </w:rPr>
+        <w:br/>
+        <w:t xml:space="preserve">SCREEN(480, 320)</w:t>
+      </w:r>
+      <w:r>
+        <w:rPr>
+          <w:rFonts w:ascii="Consolas" w:cs="Consolas" w:eastAsia="Consolas" w:hAnsi="Consolas"/>
+          <w:sz w:val="19"/>
+          <w:szCs w:val="19"/>
+        </w:rPr>
+        <w:br/>
+        <w:t xml:space="preserve">DIM held AS SPRITE</w:t>
+      </w:r>
+      <w:r>
+        <w:rPr>
+          <w:rFonts w:ascii="Consolas" w:cs="Consolas" w:eastAsia="Consolas" w:hAnsi="Consolas"/>
+          <w:sz w:val="19"/>
+          <w:szCs w:val="19"/>
+        </w:rPr>
+        <w:br/>
+        <w:t xml:space="preserve">held = SPRITE_NEW(LOADIMAGE("assets/hero.png"), 32, 32)</w:t>
+      </w:r>
+      <w:r>
+        <w:rPr>
+          <w:rFonts w:ascii="Consolas" w:cs="Consolas" w:eastAsia="Consolas" w:hAnsi="Consolas"/>
+          <w:sz w:val="19"/>
+          <w:szCs w:val="19"/>
+        </w:rPr>
+        <w:br/>
+        <w:t xml:space="preserve">SPRITE_ADD_ANIM(held, "idle", 0, 0, 1.0)</w:t>
+      </w:r>
+      <w:r>
+        <w:rPr>
+          <w:rFonts w:ascii="Consolas" w:cs="Consolas" w:eastAsia="Consolas" w:hAnsi="Consolas"/>
+          <w:sz w:val="19"/>
+          <w:szCs w:val="19"/>
+        </w:rPr>
+        <w:br/>
+        <w:t xml:space="preserve">SPRITE_ADD_ANIM(held, "walk", 0, 7, 10.0)</w:t>
+      </w:r>
+      <w:r>
+        <w:rPr>
+          <w:rFonts w:ascii="Consolas" w:cs="Consolas" w:eastAsia="Consolas" w:hAnsi="Consolas"/>
+          <w:sz w:val="19"/>
+          <w:szCs w:val="19"/>
+        </w:rPr>
+        <w:br/>
+        <w:t xml:space="preserve">SPRITE_SET_POS(held, 220.0, 150.0)</w:t>
+      </w:r>
+      <w:r>
+        <w:rPr>
+          <w:rFonts w:ascii="Consolas" w:cs="Consolas" w:eastAsia="Consolas" w:hAnsi="Consolas"/>
+          <w:sz w:val="19"/>
+          <w:szCs w:val="19"/>
+        </w:rPr>
+        <w:br/>
+        <w:t xml:space="preserve"/>
+      </w:r>
+      <w:r>
+        <w:rPr>
+          <w:rFonts w:ascii="Consolas" w:cs="Consolas" w:eastAsia="Consolas" w:hAnsi="Consolas"/>
+          <w:sz w:val="19"/>
+          <w:szCs w:val="19"/>
+        </w:rPr>
+        <w:br/>
+        <w:t xml:space="preserve">WHILE NOT QUITREQUESTED()</w:t>
+      </w:r>
+      <w:r>
+        <w:rPr>
+          <w:rFonts w:ascii="Consolas" w:cs="Consolas" w:eastAsia="Consolas" w:hAnsi="Consolas"/>
+          <w:sz w:val="19"/>
+          <w:szCs w:val="19"/>
+        </w:rPr>
+        <w:br/>
+        <w:t xml:space="preserve">    DIM vx AS FLOAT</w:t>
+      </w:r>
+      <w:r>
+        <w:rPr>
+          <w:rFonts w:ascii="Consolas" w:cs="Consolas" w:eastAsia="Consolas" w:hAnsi="Consolas"/>
+          <w:sz w:val="19"/>
+          <w:szCs w:val="19"/>
+        </w:rPr>
+        <w:br/>
+        <w:t xml:space="preserve">    vx = 0.0</w:t>
+      </w:r>
+      <w:r>
+        <w:rPr>
+          <w:rFonts w:ascii="Consolas" w:cs="Consolas" w:eastAsia="Consolas" w:hAnsi="Consolas"/>
+          <w:sz w:val="19"/>
+          <w:szCs w:val="19"/>
+        </w:rPr>
+        <w:br/>
+        <w:t xml:space="preserve">    IF KEYPRESSED(KEY_LEFT)  THEN vx = -80.0 : SPRITE_SET_FLIP(held, TRUE, FALSE)</w:t>
+      </w:r>
+      <w:r>
+        <w:rPr>
+          <w:rFonts w:ascii="Consolas" w:cs="Consolas" w:eastAsia="Consolas" w:hAnsi="Consolas"/>
+          <w:sz w:val="19"/>
+          <w:szCs w:val="19"/>
+        </w:rPr>
+        <w:br/>
+        <w:t xml:space="preserve">    IF KEYPRESSED(KEY_RIGHT) THEN vx =  80.0 : SPRITE_SET_FLIP(held, FALSE, FALSE)</w:t>
+      </w:r>
+      <w:r>
+        <w:rPr>
+          <w:rFonts w:ascii="Consolas" w:cs="Consolas" w:eastAsia="Consolas" w:hAnsi="Consolas"/>
+          <w:sz w:val="19"/>
+          <w:szCs w:val="19"/>
+        </w:rPr>
+        <w:br/>
+        <w:t xml:space="preserve">    SPRITE_SET_VELOCITY(held, vx, 0.0)</w:t>
+      </w:r>
+      <w:r>
+        <w:rPr>
+          <w:rFonts w:ascii="Consolas" w:cs="Consolas" w:eastAsia="Consolas" w:hAnsi="Consolas"/>
+          <w:sz w:val="19"/>
+          <w:szCs w:val="19"/>
+        </w:rPr>
+        <w:br/>
+        <w:t xml:space="preserve">    IF vx &lt;&gt; 0.0 THEN SPRITE_PLAY(held, "walk") ELSE SPRITE_PLAY(held, "idle")</w:t>
+      </w:r>
+      <w:r>
+        <w:rPr>
+          <w:rFonts w:ascii="Consolas" w:cs="Consolas" w:eastAsia="Consolas" w:hAnsi="Consolas"/>
+          <w:sz w:val="19"/>
+          <w:szCs w:val="19"/>
+        </w:rPr>
+        <w:br/>
+        <w:t xml:space="preserve"/>
+      </w:r>
+      <w:r>
+        <w:rPr>
+          <w:rFonts w:ascii="Consolas" w:cs="Consolas" w:eastAsia="Consolas" w:hAnsi="Consolas"/>
+          <w:sz w:val="19"/>
+          <w:szCs w:val="19"/>
+        </w:rPr>
+        <w:br/>
+        <w:t xml:space="preserve">    SPRITE_UPDATE(held, INT(DELTA() * 1000.0))</w:t>
+      </w:r>
+      <w:r>
+        <w:rPr>
+          <w:rFonts w:ascii="Consolas" w:cs="Consolas" w:eastAsia="Consolas" w:hAnsi="Consolas"/>
+          <w:sz w:val="19"/>
+          <w:szCs w:val="19"/>
+        </w:rPr>
+        <w:br/>
+        <w:t xml:space="preserve">    CLS(RGB(28, 32, 50))</w:t>
+      </w:r>
+      <w:r>
+        <w:rPr>
+          <w:rFonts w:ascii="Consolas" w:cs="Consolas" w:eastAsia="Consolas" w:hAnsi="Consolas"/>
+          <w:sz w:val="19"/>
+          <w:szCs w:val="19"/>
+        </w:rPr>
+        <w:br/>
+        <w:t xml:space="preserve">    SPRITE_DRAW(held)</w:t>
+      </w:r>
+      <w:r>
+        <w:rPr>
+          <w:rFonts w:ascii="Consolas" w:cs="Consolas" w:eastAsia="Consolas" w:hAnsi="Consolas"/>
+          <w:sz w:val="19"/>
+          <w:szCs w:val="19"/>
+        </w:rPr>
+        <w:br/>
+        <w:t xml:space="preserve">    FLIP()</w:t>
+      </w:r>
+      <w:r>
+        <w:rPr>
+          <w:rFonts w:ascii="Consolas" w:cs="Consolas" w:eastAsia="Consolas" w:hAnsi="Consolas"/>
+          <w:sz w:val="19"/>
+          <w:szCs w:val="19"/>
+        </w:rPr>
+        <w:br/>
+        <w:t xml:space="preserve">WEND</w:t>
+      </w:r>
+    </w:p>
+    <w:p>
+      <w:pPr>
+        <w:spacing w:before="60"/>
+      </w:pPr>
+    </w:p>
+    <w:tbl>
+      <w:tblPr>
+        <w:tblW w:type="dxa" w:w="9360"/>
+        <w:tblBorders>
+          <w:top w:val="single" w:color="auto" w:sz="4"/>
+          <w:left w:val="single" w:color="auto" w:sz="4"/>
+          <w:bottom w:val="single" w:color="auto" w:sz="4"/>
+          <w:right w:val="single" w:color="auto" w:sz="4"/>
+          <w:insideH w:val="single" w:color="auto" w:sz="4"/>
+          <w:insideV w:val="single" w:color="auto" w:sz="4"/>
+        </w:tblBorders>
+      </w:tblPr>
+      <w:tblGrid>
+        <w:gridCol w:w="9360"/>
+      </w:tblGrid>
+      <w:tr>
+        <w:trPr>
+          <w:cantSplit/>
+        </w:trPr>
+        <w:tc>
+          <w:tcPr>
+            <w:tcW w:type="dxa" w:w="9360"/>
+            <w:tcBorders>
+              <w:top w:val="single" w:color="9CC8E6" w:sz="6"/>
+              <w:left w:val="single" w:color="9CC8E6" w:sz="6"/>
+              <w:bottom w:val="single" w:color="9CC8E6" w:sz="6"/>
+              <w:right w:val="single" w:color="9CC8E6" w:sz="6"/>
+            </w:tcBorders>
+            <w:shd w:fill="E7F2FA" w:val="clear"/>
+            <w:tcMar>
+              <w:top w:type="dxa" w:w="140"/>
+              <w:left w:type="dxa" w:w="180"/>
+              <w:bottom w:type="dxa" w:w="140"/>
+              <w:right w:type="dxa" w:w="180"/>
+            </w:tcMar>
+          </w:tcPr>
+          <w:p>
+            <w:pPr>
+              <w:spacing w:after="40"/>
+            </w:pPr>
+            <w:r>
+              <w:rPr>
+                <w:b/>
+                <w:bCs/>
+                <w:color w:val="1B6CA8"/>
+                <w:sz w:val="22"/>
+                <w:szCs w:val="22"/>
+              </w:rPr>
+              <w:t xml:space="preserve">Sprites selbst zeichnen</w:t>
+            </w:r>
+          </w:p>
+          <w:p>
+            <w:pPr>
+              <w:spacing w:after="0" w:line="312" w:lineRule="auto"/>
+            </w:pPr>
+            <w:r>
+              <w:rPr>
+                <w:sz w:val="22"/>
+                <w:szCs w:val="22"/>
+              </w:rPr>
+              <w:t xml:space="preserve">Spritesheets musst du nicht von Hand malen: Der mitgelieferte Pixel-Editor gbsprites zeichnet Frames, Animationen und exportiert fertige Sheets (und sogar Atlas-Manifeste). So schließt sich der Kreis von der Grafik bis ins Spiel.</w:t>
+            </w:r>
+          </w:p>
+        </w:tc>
+      </w:tr>
+    </w:tbl>
+    <w:p>
+      <w:pPr>
+        <w:spacing w:after="160"/>
+      </w:pPr>
     </w:p>
     <w:sectPr>
       <w:footerReference w:type="default" r:id="rId7"/>

</xml_diff>

<commit_message>
docs(buch): Lehrbuch Kap 51 -- Modul animfsm (Screenshot)
Datengetriebene Animations-Zustandsmaschine: .gbanim-Format (States/Params/
Transitions), ANIM_FSM_LOAD/SETUP, SET_FLOAT/BOOL/INT, TRIGGER, UPDATE(dt_ms),
STATE, FORCE. Screenshot zeigt aktuellen Zustand. figures/assets/held.gbanim.
Je Befehl ein Beispiel; gegen gbrt verifiziert.

Co-Authored-By: Claude Opus 4.8 (1M context) <noreply@anthropic.com>
</commit_message>
<xml_diff>
--- a/buch-referenz/buch/GameBasic-Lehrbuch.docx
+++ b/buch-referenz/buch/GameBasic-Lehrbuch.docx
@@ -1326,6 +1326,33 @@
           <w:szCs w:val="22"/>
         </w:rPr>
         <w:t xml:space="preserve">	170</w:t>
+      </w:r>
+    </w:p>
+    <w:p>
+      <w:pPr>
+        <w:tabs>
+          <w:tab w:val="right" w:pos="9200" w:leader="dot"/>
+        </w:tabs>
+        <w:spacing w:after="20" w:before="0"/>
+        <w:ind w:left="280"/>
+      </w:pPr>
+      <w:r>
+        <w:rPr>
+          <w:b w:val="false"/>
+          <w:bCs w:val="false"/>
+          <w:color w:val="222222"/>
+          <w:sz w:val="22"/>
+          <w:szCs w:val="22"/>
+        </w:rPr>
+        <w:t xml:space="preserve">Modul: animfsm</w:t>
+      </w:r>
+      <w:r>
+        <w:rPr>
+          <w:color w:val="555555"/>
+          <w:sz w:val="22"/>
+          <w:szCs w:val="22"/>
+        </w:rPr>
+        <w:t xml:space="preserve">	174</w:t>
       </w:r>
     </w:p>
     <w:p>
@@ -57807,6 +57834,1137 @@
                 <w:szCs w:val="22"/>
               </w:rPr>
               <w:t xml:space="preserve">Spritesheets musst du nicht von Hand malen: Der mitgelieferte Pixel-Editor gbsprites zeichnet Frames, Animationen und exportiert fertige Sheets (und sogar Atlas-Manifeste). So schließt sich der Kreis von der Grafik bis ins Spiel.</w:t>
+            </w:r>
+          </w:p>
+        </w:tc>
+      </w:tr>
+    </w:tbl>
+    <w:p>
+      <w:pPr>
+        <w:spacing w:after="160"/>
+      </w:pPr>
+    </w:p>
+    <w:p>
+      <w:pPr>
+        <w:pStyle w:val="Heading1"/>
+        <w:keepNext/>
+        <w:keepLines/>
+        <w:pageBreakBefore/>
+        <w:pBdr>
+          <w:bottom w:val="single" w:color="1B6CA8" w:sz="12" w:space="4"/>
+        </w:pBdr>
+        <w:spacing w:after="160" w:before="0"/>
+      </w:pPr>
+      <w:r>
+        <w:t xml:space="preserve">Modul: animfsm</w:t>
+      </w:r>
+    </w:p>
+    <w:p>
+      <w:pPr>
+        <w:spacing w:after="180" w:line="312" w:lineRule="auto"/>
+      </w:pPr>
+      <w:r>
+        <w:rPr>
+          <w:sz w:val="22"/>
+          <w:szCs w:val="22"/>
+        </w:rPr>
+        <w:t xml:space="preserve">Im sprite-Kapitel hast du Animationen von Hand umgeschaltet (IF vx &lt;&gt; 0 THEN "walk" ELSE "idle"). Bei vielen Zuständen – stehen, laufen, springen, fallen, angreifen – wird dieses Wenn-Dann schnell unübersichtlich. Das Modul animfsm nimmt dir das ab: Du beschreibst die Zustände und Übergänge einmal in einer Datei, setzt im Spiel nur noch ein paar Parameter (etwa „Tempo“), und die Zustandsmaschine wählt selbst die richtige Animation.</w:t>
+      </w:r>
+    </w:p>
+    <w:p>
+      <w:pPr>
+        <w:keepNext/>
+        <w:spacing w:after="40" w:before="160"/>
+        <w:jc w:val="center"/>
+      </w:pPr>
+      <w:r>
+        <w:drawing>
+          <wp:inline distT="0" distB="0" distL="0" distR="0">
+            <wp:extent cx="4572000" cy="3048000"/>
+            <wp:effectExtent t="0" r="0" b="0" l="0"/>
+            <wp:docPr id="1" name="51_animfsm.png" descr="Die Zustandsmaschine wählt den Zustand: Weil das Tempo hoch ist, läuft „run“ – ANIM_FSM_STATE zeigt den aktuellen Zustand an." title="Die Zustandsmaschine wählt den Zustand: Weil das Tempo hoch ist, läuft „run“ – ANIM_FSM_STATE zeigt den aktuellen Zustand an."/>
+            <wp:cNvGraphicFramePr>
+              <a:graphicFrameLocks xmlns:a="http://schemas.openxmlformats.org/drawingml/2006/main" noChangeAspect="1"/>
+            </wp:cNvGraphicFramePr>
+            <a:graphic xmlns:a="http://schemas.openxmlformats.org/drawingml/2006/main">
+              <a:graphicData uri="http://schemas.openxmlformats.org/drawingml/2006/picture">
+                <pic:pic xmlns:pic="http://schemas.openxmlformats.org/drawingml/2006/picture">
+                  <pic:nvPicPr>
+                    <pic:cNvPr id="0" name="" descr=""/>
+                    <pic:cNvPicPr>
+                      <a:picLocks noChangeAspect="1" noChangeArrowheads="1"/>
+                    </pic:cNvPicPr>
+                  </pic:nvPicPr>
+                  <pic:blipFill>
+                    <a:blip r:embed="rId20" cstate="none"/>
+                    <a:srcRect/>
+                    <a:stretch>
+                      <a:fillRect/>
+                    </a:stretch>
+                  </pic:blipFill>
+                  <pic:spPr bwMode="auto">
+                    <a:xfrm>
+                      <a:off x="0" y="0"/>
+                      <a:ext cx="4572000" cy="3048000"/>
+                    </a:xfrm>
+                    <a:prstGeom prst="rect">
+                      <a:avLst/>
+                    </a:prstGeom>
+                  </pic:spPr>
+                </pic:pic>
+              </a:graphicData>
+            </a:graphic>
+          </wp:inline>
+        </w:drawing>
+      </w:r>
+    </w:p>
+    <w:p>
+      <w:pPr>
+        <w:spacing w:after="200"/>
+        <w:jc w:val="center"/>
+      </w:pPr>
+      <w:r>
+        <w:rPr>
+          <w:i/>
+          <w:iCs/>
+          <w:color w:val="6A6A6A"/>
+          <w:sz w:val="18"/>
+          <w:szCs w:val="18"/>
+        </w:rPr>
+        <w:t xml:space="preserve">Die Zustandsmaschine wählt den Zustand: Weil das Tempo hoch ist, läuft „run“ – ANIM_FSM_STATE zeigt den aktuellen Zustand an.</w:t>
+      </w:r>
+    </w:p>
+    <w:p>
+      <w:pPr>
+        <w:pStyle w:val="Heading2"/>
+        <w:keepNext/>
+        <w:keepLines/>
+        <w:spacing w:after="120" w:before="280"/>
+      </w:pPr>
+      <w:r>
+        <w:t xml:space="preserve">Die .gbanim-Datei</w:t>
+      </w:r>
+    </w:p>
+    <w:p>
+      <w:pPr>
+        <w:spacing w:after="180" w:line="312" w:lineRule="auto"/>
+      </w:pPr>
+      <w:r>
+        <w:rPr>
+          <w:sz w:val="22"/>
+          <w:szCs w:val="22"/>
+        </w:rPr>
+        <w:t xml:space="preserve">Die Zustandsmaschine wird datengetrieben aus einer .gbanim-Datei geladen (am bequemsten im Editor gbanim gezeichnet). Sie beschreibt drei Dinge: Zustände (jeder an einen Frame-Bereich gebunden), Parameter (Werte, die du im Spiel setzt) und Übergänge (Bedingungen, wann von einem Zustand in einen anderen gewechselt wird). Eine einfache Variante mit zwei Zuständen:</w:t>
+      </w:r>
+    </w:p>
+    <w:p>
+      <w:pPr>
+        <w:keepLines/>
+        <w:pBdr>
+          <w:left w:val="single" w:color="1B6CA8" w:sz="18" w:space="6"/>
+        </w:pBdr>
+        <w:shd w:fill="F4F4F4" w:val="clear"/>
+        <w:spacing w:after="200" w:before="100" w:line="264" w:lineRule="auto"/>
+        <w:ind w:left="140"/>
+      </w:pPr>
+      <w:r>
+        <w:rPr>
+          <w:rFonts w:ascii="Consolas" w:cs="Consolas" w:eastAsia="Consolas" w:hAnsi="Consolas"/>
+          <w:sz w:val="19"/>
+          <w:szCs w:val="19"/>
+        </w:rPr>
+        <w:t xml:space="preserve">// held.gbanim</w:t>
+      </w:r>
+      <w:r>
+        <w:rPr>
+          <w:rFonts w:ascii="Consolas" w:cs="Consolas" w:eastAsia="Consolas" w:hAnsi="Consolas"/>
+          <w:sz w:val="19"/>
+          <w:szCs w:val="19"/>
+        </w:rPr>
+        <w:br/>
+        <w:t xml:space="preserve">{</w:t>
+      </w:r>
+      <w:r>
+        <w:rPr>
+          <w:rFonts w:ascii="Consolas" w:cs="Consolas" w:eastAsia="Consolas" w:hAnsi="Consolas"/>
+          <w:sz w:val="19"/>
+          <w:szCs w:val="19"/>
+        </w:rPr>
+        <w:br/>
+        <w:t xml:space="preserve">  "version": 1,</w:t>
+      </w:r>
+      <w:r>
+        <w:rPr>
+          <w:rFonts w:ascii="Consolas" w:cs="Consolas" w:eastAsia="Consolas" w:hAnsi="Consolas"/>
+          <w:sz w:val="19"/>
+          <w:szCs w:val="19"/>
+        </w:rPr>
+        <w:br/>
+        <w:t xml:space="preserve">  "default": "idle",</w:t>
+      </w:r>
+      <w:r>
+        <w:rPr>
+          <w:rFonts w:ascii="Consolas" w:cs="Consolas" w:eastAsia="Consolas" w:hAnsi="Consolas"/>
+          <w:sz w:val="19"/>
+          <w:szCs w:val="19"/>
+        </w:rPr>
+        <w:br/>
+        <w:t xml:space="preserve">  "params": [ { "name": "speed", "type": "float", "default": 0.0 } ],</w:t>
+      </w:r>
+      <w:r>
+        <w:rPr>
+          <w:rFonts w:ascii="Consolas" w:cs="Consolas" w:eastAsia="Consolas" w:hAnsi="Consolas"/>
+          <w:sz w:val="19"/>
+          <w:szCs w:val="19"/>
+        </w:rPr>
+        <w:br/>
+        <w:t xml:space="preserve">  "states": [</w:t>
+      </w:r>
+      <w:r>
+        <w:rPr>
+          <w:rFonts w:ascii="Consolas" w:cs="Consolas" w:eastAsia="Consolas" w:hAnsi="Consolas"/>
+          <w:sz w:val="19"/>
+          <w:szCs w:val="19"/>
+        </w:rPr>
+        <w:br/>
+        <w:t xml:space="preserve">    { "name": "idle", "loop": true, "first": 0, "last": 0, "fps": 2.0 },</w:t>
+      </w:r>
+      <w:r>
+        <w:rPr>
+          <w:rFonts w:ascii="Consolas" w:cs="Consolas" w:eastAsia="Consolas" w:hAnsi="Consolas"/>
+          <w:sz w:val="19"/>
+          <w:szCs w:val="19"/>
+        </w:rPr>
+        <w:br/>
+        <w:t xml:space="preserve">    { "name": "run",  "loop": true, "first": 0, "last": 7, "fps": 12.0 }</w:t>
+      </w:r>
+      <w:r>
+        <w:rPr>
+          <w:rFonts w:ascii="Consolas" w:cs="Consolas" w:eastAsia="Consolas" w:hAnsi="Consolas"/>
+          <w:sz w:val="19"/>
+          <w:szCs w:val="19"/>
+        </w:rPr>
+        <w:br/>
+        <w:t xml:space="preserve">  ],</w:t>
+      </w:r>
+      <w:r>
+        <w:rPr>
+          <w:rFonts w:ascii="Consolas" w:cs="Consolas" w:eastAsia="Consolas" w:hAnsi="Consolas"/>
+          <w:sz w:val="19"/>
+          <w:szCs w:val="19"/>
+        </w:rPr>
+        <w:br/>
+        <w:t xml:space="preserve">  "transitions": [</w:t>
+      </w:r>
+      <w:r>
+        <w:rPr>
+          <w:rFonts w:ascii="Consolas" w:cs="Consolas" w:eastAsia="Consolas" w:hAnsi="Consolas"/>
+          <w:sz w:val="19"/>
+          <w:szCs w:val="19"/>
+        </w:rPr>
+        <w:br/>
+        <w:t xml:space="preserve">    { "from": "idle", "to": "run",  "conditions": [{ "param":"speed","op":"gt","value":5.0 }] },</w:t>
+      </w:r>
+      <w:r>
+        <w:rPr>
+          <w:rFonts w:ascii="Consolas" w:cs="Consolas" w:eastAsia="Consolas" w:hAnsi="Consolas"/>
+          <w:sz w:val="19"/>
+          <w:szCs w:val="19"/>
+        </w:rPr>
+        <w:br/>
+        <w:t xml:space="preserve">    { "from": "run",  "to": "idle", "conditions": [{ "param":"speed","op":"lt","value":5.0 }] }</w:t>
+      </w:r>
+      <w:r>
+        <w:rPr>
+          <w:rFonts w:ascii="Consolas" w:cs="Consolas" w:eastAsia="Consolas" w:hAnsi="Consolas"/>
+          <w:sz w:val="19"/>
+          <w:szCs w:val="19"/>
+        </w:rPr>
+        <w:br/>
+        <w:t xml:space="preserve">  ]</w:t>
+      </w:r>
+      <w:r>
+        <w:rPr>
+          <w:rFonts w:ascii="Consolas" w:cs="Consolas" w:eastAsia="Consolas" w:hAnsi="Consolas"/>
+          <w:sz w:val="19"/>
+          <w:szCs w:val="19"/>
+        </w:rPr>
+        <w:br/>
+        <w:t xml:space="preserve">}</w:t>
+      </w:r>
+    </w:p>
+    <w:p>
+      <w:pPr>
+        <w:spacing w:before="60"/>
+      </w:pPr>
+    </w:p>
+    <w:tbl>
+      <w:tblPr>
+        <w:tblW w:type="dxa" w:w="9360"/>
+        <w:tblBorders>
+          <w:top w:val="single" w:color="auto" w:sz="4"/>
+          <w:left w:val="single" w:color="auto" w:sz="4"/>
+          <w:bottom w:val="single" w:color="auto" w:sz="4"/>
+          <w:right w:val="single" w:color="auto" w:sz="4"/>
+          <w:insideH w:val="single" w:color="auto" w:sz="4"/>
+          <w:insideV w:val="single" w:color="auto" w:sz="4"/>
+        </w:tblBorders>
+      </w:tblPr>
+      <w:tblGrid>
+        <w:gridCol w:w="9360"/>
+      </w:tblGrid>
+      <w:tr>
+        <w:trPr>
+          <w:cantSplit/>
+        </w:trPr>
+        <w:tc>
+          <w:tcPr>
+            <w:tcW w:type="dxa" w:w="9360"/>
+            <w:tcBorders>
+              <w:top w:val="single" w:color="E0B96A" w:sz="6"/>
+              <w:left w:val="single" w:color="E0B96A" w:sz="6"/>
+              <w:bottom w:val="single" w:color="E0B96A" w:sz="6"/>
+              <w:right w:val="single" w:color="E0B96A" w:sz="6"/>
+            </w:tcBorders>
+            <w:shd w:fill="FDF3E0" w:val="clear"/>
+            <w:tcMar>
+              <w:top w:type="dxa" w:w="140"/>
+              <w:left w:type="dxa" w:w="180"/>
+              <w:bottom w:type="dxa" w:w="140"/>
+              <w:right w:type="dxa" w:w="180"/>
+            </w:tcMar>
+          </w:tcPr>
+          <w:p>
+            <w:pPr>
+              <w:spacing w:after="40"/>
+            </w:pPr>
+            <w:r>
+              <w:rPr>
+                <w:b/>
+                <w:bCs/>
+                <w:color w:val="9A6A1E"/>
+                <w:sz w:val="22"/>
+                <w:szCs w:val="22"/>
+              </w:rPr>
+              <w:t xml:space="preserve">Merke</w:t>
+            </w:r>
+          </w:p>
+          <w:p>
+            <w:pPr>
+              <w:spacing w:after="0" w:line="312" w:lineRule="auto"/>
+            </w:pPr>
+            <w:r>
+              <w:rPr>
+                <w:sz w:val="22"/>
+                <w:szCs w:val="22"/>
+              </w:rPr>
+              <w:t xml:space="preserve">Übergänge prüfen Parameter mit Operatoren wie gt (größer), lt (kleiner), eq (gleich). Ein from von "*" gilt aus JEDEM Zustand (z. B. „springen geht immer“). Mit wait_finished wechselt ein einmaliger Zustand erst, wenn seine Animation durchgelaufen ist.</w:t>
+            </w:r>
+          </w:p>
+        </w:tc>
+      </w:tr>
+    </w:tbl>
+    <w:p>
+      <w:pPr>
+        <w:spacing w:after="160"/>
+      </w:pPr>
+    </w:p>
+    <w:p>
+      <w:pPr>
+        <w:pStyle w:val="Heading2"/>
+        <w:keepNext/>
+        <w:keepLines/>
+        <w:spacing w:after="120" w:before="280"/>
+      </w:pPr>
+      <w:r>
+        <w:t xml:space="preserve">Laden &amp; einrichten</w:t>
+      </w:r>
+    </w:p>
+    <w:p>
+      <w:pPr>
+        <w:keepNext/>
+        <w:keepLines/>
+        <w:pBdr>
+          <w:bottom w:val="single" w:color="DDD0C0" w:sz="4" w:space="2"/>
+        </w:pBdr>
+        <w:spacing w:after="40" w:before="360"/>
+      </w:pPr>
+      <w:r>
+        <w:rPr>
+          <w:rFonts w:ascii="Consolas" w:cs="Consolas" w:eastAsia="Consolas" w:hAnsi="Consolas"/>
+          <w:b/>
+          <w:bCs/>
+          <w:color w:val="9A3412"/>
+          <w:sz w:val="24"/>
+          <w:szCs w:val="24"/>
+        </w:rPr>
+        <w:t xml:space="preserve">ANIM_FSM_LOAD · ANIM_FSM_SETUP</w:t>
+      </w:r>
+    </w:p>
+    <w:p>
+      <w:pPr>
+        <w:keepNext/>
+        <w:spacing w:after="120"/>
+      </w:pPr>
+      <w:r>
+        <w:rPr>
+          <w:b/>
+          <w:bCs/>
+          <w:color w:val="6A6A6A"/>
+          <w:sz w:val="18"/>
+          <w:szCs w:val="18"/>
+        </w:rPr>
+        <w:t xml:space="preserve">Syntax:  </w:t>
+      </w:r>
+      <w:r>
+        <w:rPr>
+          <w:rFonts w:ascii="Consolas" w:cs="Consolas" w:eastAsia="Consolas" w:hAnsi="Consolas"/>
+          <w:color w:val="335577"/>
+          <w:sz w:val="19"/>
+          <w:szCs w:val="19"/>
+        </w:rPr>
+        <w:t xml:space="preserve">ANIM_FSM_LOAD(pfad$)   ANIM_FSM_SETUP(fsm, sprite)</w:t>
+      </w:r>
+    </w:p>
+    <w:p>
+      <w:pPr>
+        <w:spacing w:after="180" w:line="312" w:lineRule="auto"/>
+      </w:pPr>
+      <w:r>
+        <w:rPr>
+          <w:sz w:val="22"/>
+          <w:szCs w:val="22"/>
+        </w:rPr>
+        <w:t xml:space="preserve">ANIM_FSM_LOAD lädt und prüft die .gbanim-Datei und liefert eine ANIM_FSM (im Default-Zustand). ANIM_FSM_SETUP registriert die Frame-Bereiche aller Zustände als Animationen des Sprites und startet den Default-Zustand. Das Sprite legst du wie gewohnt mit dem sprite-Modul an.</w:t>
+      </w:r>
+    </w:p>
+    <w:p>
+      <w:pPr>
+        <w:keepNext/>
+        <w:spacing w:after="30" w:before="120"/>
+      </w:pPr>
+      <w:r>
+        <w:rPr>
+          <w:b/>
+          <w:bCs/>
+          <w:i/>
+          <w:iCs/>
+          <w:color w:val="6A6A6A"/>
+          <w:sz w:val="18"/>
+          <w:szCs w:val="18"/>
+        </w:rPr>
+        <w:t xml:space="preserve">Beispiel</w:t>
+      </w:r>
+    </w:p>
+    <w:p>
+      <w:pPr>
+        <w:keepLines/>
+        <w:pBdr>
+          <w:left w:val="single" w:color="1B6CA8" w:sz="18" w:space="6"/>
+        </w:pBdr>
+        <w:shd w:fill="F4F4F4" w:val="clear"/>
+        <w:spacing w:after="200" w:before="100" w:line="264" w:lineRule="auto"/>
+        <w:ind w:left="140"/>
+      </w:pPr>
+      <w:r>
+        <w:rPr>
+          <w:rFonts w:ascii="Consolas" w:cs="Consolas" w:eastAsia="Consolas" w:hAnsi="Consolas"/>
+          <w:sz w:val="19"/>
+          <w:szCs w:val="19"/>
+        </w:rPr>
+        <w:t xml:space="preserve">IMPORT "sprite"</w:t>
+      </w:r>
+      <w:r>
+        <w:rPr>
+          <w:rFonts w:ascii="Consolas" w:cs="Consolas" w:eastAsia="Consolas" w:hAnsi="Consolas"/>
+          <w:sz w:val="19"/>
+          <w:szCs w:val="19"/>
+        </w:rPr>
+        <w:br/>
+        <w:t xml:space="preserve">IMPORT "animfsm"</w:t>
+      </w:r>
+      <w:r>
+        <w:rPr>
+          <w:rFonts w:ascii="Consolas" w:cs="Consolas" w:eastAsia="Consolas" w:hAnsi="Consolas"/>
+          <w:sz w:val="19"/>
+          <w:szCs w:val="19"/>
+        </w:rPr>
+        <w:br/>
+        <w:t xml:space="preserve">DIM held AS SPRITE</w:t>
+      </w:r>
+      <w:r>
+        <w:rPr>
+          <w:rFonts w:ascii="Consolas" w:cs="Consolas" w:eastAsia="Consolas" w:hAnsi="Consolas"/>
+          <w:sz w:val="19"/>
+          <w:szCs w:val="19"/>
+        </w:rPr>
+        <w:br/>
+        <w:t xml:space="preserve">held = SPRITE_NEW(LOADIMAGE("assets/hero.png"), 32, 32)</w:t>
+      </w:r>
+      <w:r>
+        <w:rPr>
+          <w:rFonts w:ascii="Consolas" w:cs="Consolas" w:eastAsia="Consolas" w:hAnsi="Consolas"/>
+          <w:sz w:val="19"/>
+          <w:szCs w:val="19"/>
+        </w:rPr>
+        <w:br/>
+        <w:t xml:space="preserve">DIM fsm AS ANIM_FSM</w:t>
+      </w:r>
+      <w:r>
+        <w:rPr>
+          <w:rFonts w:ascii="Consolas" w:cs="Consolas" w:eastAsia="Consolas" w:hAnsi="Consolas"/>
+          <w:sz w:val="19"/>
+          <w:szCs w:val="19"/>
+        </w:rPr>
+        <w:br/>
+        <w:t xml:space="preserve">fsm = ANIM_FSM_LOAD("assets/held.gbanim")</w:t>
+      </w:r>
+      <w:r>
+        <w:rPr>
+          <w:rFonts w:ascii="Consolas" w:cs="Consolas" w:eastAsia="Consolas" w:hAnsi="Consolas"/>
+          <w:sz w:val="19"/>
+          <w:szCs w:val="19"/>
+        </w:rPr>
+        <w:br/>
+        <w:t xml:space="preserve">ANIM_FSM_SETUP(fsm, held)</w:t>
+      </w:r>
+    </w:p>
+    <w:p>
+      <w:pPr>
+        <w:pStyle w:val="Heading2"/>
+        <w:keepNext/>
+        <w:keepLines/>
+        <w:spacing w:after="120" w:before="280"/>
+      </w:pPr>
+      <w:r>
+        <w:t xml:space="preserve">Parameter setzen &amp; auslösen</w:t>
+      </w:r>
+    </w:p>
+    <w:p>
+      <w:pPr>
+        <w:keepNext/>
+        <w:keepLines/>
+        <w:pBdr>
+          <w:bottom w:val="single" w:color="DDD0C0" w:sz="4" w:space="2"/>
+        </w:pBdr>
+        <w:spacing w:after="40" w:before="360"/>
+      </w:pPr>
+      <w:r>
+        <w:rPr>
+          <w:rFonts w:ascii="Consolas" w:cs="Consolas" w:eastAsia="Consolas" w:hAnsi="Consolas"/>
+          <w:b/>
+          <w:bCs/>
+          <w:color w:val="9A3412"/>
+          <w:sz w:val="24"/>
+          <w:szCs w:val="24"/>
+        </w:rPr>
+        <w:t xml:space="preserve">ANIM_FSM_SET_FLOAT / _BOOL / _INT</w:t>
+      </w:r>
+    </w:p>
+    <w:p>
+      <w:pPr>
+        <w:keepNext/>
+        <w:spacing w:after="120"/>
+      </w:pPr>
+      <w:r>
+        <w:rPr>
+          <w:b/>
+          <w:bCs/>
+          <w:color w:val="6A6A6A"/>
+          <w:sz w:val="18"/>
+          <w:szCs w:val="18"/>
+        </w:rPr>
+        <w:t xml:space="preserve">Syntax:  </w:t>
+      </w:r>
+      <w:r>
+        <w:rPr>
+          <w:rFonts w:ascii="Consolas" w:cs="Consolas" w:eastAsia="Consolas" w:hAnsi="Consolas"/>
+          <w:color w:val="335577"/>
+          <w:sz w:val="19"/>
+          <w:szCs w:val="19"/>
+        </w:rPr>
+        <w:t xml:space="preserve">ANIM_FSM_SET_FLOAT(fsm, name$, wert)   (auch _BOOL, _INT)</w:t>
+      </w:r>
+    </w:p>
+    <w:p>
+      <w:pPr>
+        <w:spacing w:after="180" w:line="312" w:lineRule="auto"/>
+      </w:pPr>
+      <w:r>
+        <w:rPr>
+          <w:sz w:val="22"/>
+          <w:szCs w:val="22"/>
+        </w:rPr>
+        <w:t xml:space="preserve">Setzt einen Parameter der Zustandsmaschine. Beim nächsten ANIM_FSM_UPDATE entscheiden die Übergänge anhand dieser Werte über den Zustand.</w:t>
+      </w:r>
+    </w:p>
+    <w:p>
+      <w:pPr>
+        <w:keepNext/>
+        <w:spacing w:after="30" w:before="120"/>
+      </w:pPr>
+      <w:r>
+        <w:rPr>
+          <w:b/>
+          <w:bCs/>
+          <w:i/>
+          <w:iCs/>
+          <w:color w:val="6A6A6A"/>
+          <w:sz w:val="18"/>
+          <w:szCs w:val="18"/>
+        </w:rPr>
+        <w:t xml:space="preserve">Beispiel</w:t>
+      </w:r>
+    </w:p>
+    <w:p>
+      <w:pPr>
+        <w:keepLines/>
+        <w:pBdr>
+          <w:left w:val="single" w:color="1B6CA8" w:sz="18" w:space="6"/>
+        </w:pBdr>
+        <w:shd w:fill="F4F4F4" w:val="clear"/>
+        <w:spacing w:after="200" w:before="100" w:line="264" w:lineRule="auto"/>
+        <w:ind w:left="140"/>
+      </w:pPr>
+      <w:r>
+        <w:rPr>
+          <w:rFonts w:ascii="Consolas" w:cs="Consolas" w:eastAsia="Consolas" w:hAnsi="Consolas"/>
+          <w:sz w:val="19"/>
+          <w:szCs w:val="19"/>
+        </w:rPr>
+        <w:t xml:space="preserve">ANIM_FSM_SET_FLOAT(fsm, "speed", ABS(vx))   ' Tempo melden</w:t>
+      </w:r>
+    </w:p>
+    <w:p>
+      <w:pPr>
+        <w:keepNext/>
+        <w:keepLines/>
+        <w:pBdr>
+          <w:bottom w:val="single" w:color="DDD0C0" w:sz="4" w:space="2"/>
+        </w:pBdr>
+        <w:spacing w:after="40" w:before="360"/>
+      </w:pPr>
+      <w:r>
+        <w:rPr>
+          <w:rFonts w:ascii="Consolas" w:cs="Consolas" w:eastAsia="Consolas" w:hAnsi="Consolas"/>
+          <w:b/>
+          <w:bCs/>
+          <w:color w:val="9A3412"/>
+          <w:sz w:val="24"/>
+          <w:szCs w:val="24"/>
+        </w:rPr>
+        <w:t xml:space="preserve">ANIM_FSM_TRIGGER</w:t>
+      </w:r>
+    </w:p>
+    <w:p>
+      <w:pPr>
+        <w:keepNext/>
+        <w:spacing w:after="120"/>
+      </w:pPr>
+      <w:r>
+        <w:rPr>
+          <w:b/>
+          <w:bCs/>
+          <w:color w:val="6A6A6A"/>
+          <w:sz w:val="18"/>
+          <w:szCs w:val="18"/>
+        </w:rPr>
+        <w:t xml:space="preserve">Syntax:  </w:t>
+      </w:r>
+      <w:r>
+        <w:rPr>
+          <w:rFonts w:ascii="Consolas" w:cs="Consolas" w:eastAsia="Consolas" w:hAnsi="Consolas"/>
+          <w:color w:val="335577"/>
+          <w:sz w:val="19"/>
+          <w:szCs w:val="19"/>
+        </w:rPr>
+        <w:t xml:space="preserve">ANIM_FSM_TRIGGER(fsm, name$)</w:t>
+      </w:r>
+    </w:p>
+    <w:p>
+      <w:pPr>
+        <w:spacing w:after="180" w:line="312" w:lineRule="auto"/>
+      </w:pPr>
+      <w:r>
+        <w:rPr>
+          <w:sz w:val="22"/>
+          <w:szCs w:val="22"/>
+        </w:rPr>
+        <w:t xml:space="preserve">Feuert einen Trigger-Parameter (ein einmaliges Signal, etwa „springen“). Er wird beim nächsten UPDATE einmal ausgewertet und dann automatisch zurückgesetzt.</w:t>
+      </w:r>
+    </w:p>
+    <w:p>
+      <w:pPr>
+        <w:keepNext/>
+        <w:spacing w:after="30" w:before="120"/>
+      </w:pPr>
+      <w:r>
+        <w:rPr>
+          <w:b/>
+          <w:bCs/>
+          <w:i/>
+          <w:iCs/>
+          <w:color w:val="6A6A6A"/>
+          <w:sz w:val="18"/>
+          <w:szCs w:val="18"/>
+        </w:rPr>
+        <w:t xml:space="preserve">Beispiel</w:t>
+      </w:r>
+    </w:p>
+    <w:p>
+      <w:pPr>
+        <w:keepLines/>
+        <w:pBdr>
+          <w:left w:val="single" w:color="1B6CA8" w:sz="18" w:space="6"/>
+        </w:pBdr>
+        <w:shd w:fill="F4F4F4" w:val="clear"/>
+        <w:spacing w:after="200" w:before="100" w:line="264" w:lineRule="auto"/>
+        <w:ind w:left="140"/>
+      </w:pPr>
+      <w:r>
+        <w:rPr>
+          <w:rFonts w:ascii="Consolas" w:cs="Consolas" w:eastAsia="Consolas" w:hAnsi="Consolas"/>
+          <w:sz w:val="19"/>
+          <w:szCs w:val="19"/>
+        </w:rPr>
+        <w:t xml:space="preserve">IF INPUT_PRESSED("jump") THEN ANIM_FSM_TRIGGER(fsm, "jump")</w:t>
+      </w:r>
+    </w:p>
+    <w:p>
+      <w:pPr>
+        <w:pStyle w:val="Heading2"/>
+        <w:keepNext/>
+        <w:keepLines/>
+        <w:spacing w:after="120" w:before="280"/>
+      </w:pPr>
+      <w:r>
+        <w:t xml:space="preserve">Aktualisieren &amp; abfragen</w:t>
+      </w:r>
+    </w:p>
+    <w:p>
+      <w:pPr>
+        <w:keepNext/>
+        <w:keepLines/>
+        <w:pBdr>
+          <w:bottom w:val="single" w:color="DDD0C0" w:sz="4" w:space="2"/>
+        </w:pBdr>
+        <w:spacing w:after="40" w:before="360"/>
+      </w:pPr>
+      <w:r>
+        <w:rPr>
+          <w:rFonts w:ascii="Consolas" w:cs="Consolas" w:eastAsia="Consolas" w:hAnsi="Consolas"/>
+          <w:b/>
+          <w:bCs/>
+          <w:color w:val="9A3412"/>
+          <w:sz w:val="24"/>
+          <w:szCs w:val="24"/>
+        </w:rPr>
+        <w:t xml:space="preserve">ANIM_FSM_UPDATE</w:t>
+      </w:r>
+    </w:p>
+    <w:p>
+      <w:pPr>
+        <w:keepNext/>
+        <w:spacing w:after="120"/>
+      </w:pPr>
+      <w:r>
+        <w:rPr>
+          <w:b/>
+          <w:bCs/>
+          <w:color w:val="6A6A6A"/>
+          <w:sz w:val="18"/>
+          <w:szCs w:val="18"/>
+        </w:rPr>
+        <w:t xml:space="preserve">Syntax:  </w:t>
+      </w:r>
+      <w:r>
+        <w:rPr>
+          <w:rFonts w:ascii="Consolas" w:cs="Consolas" w:eastAsia="Consolas" w:hAnsi="Consolas"/>
+          <w:color w:val="335577"/>
+          <w:sz w:val="19"/>
+          <w:szCs w:val="19"/>
+        </w:rPr>
+        <w:t xml:space="preserve">ANIM_FSM_UPDATE(fsm, sprite, dt_ms)</w:t>
+      </w:r>
+    </w:p>
+    <w:p>
+      <w:pPr>
+        <w:spacing w:after="180" w:line="312" w:lineRule="auto"/>
+      </w:pPr>
+      <w:r>
+        <w:rPr>
+          <w:sz w:val="22"/>
+          <w:szCs w:val="22"/>
+        </w:rPr>
+        <w:t xml:space="preserve">Das Herzstück: schreibt die laufende Animation voran, prüft die Übergänge und schaltet bei Bedarf den Zustand (samt passender Animation). dt_ms ist die vergangene Zeit in Millisekunden. Liefert TRUE zurück, wenn in diesem Frame ein Zustandswechsel passiert ist.</w:t>
+      </w:r>
+    </w:p>
+    <w:p>
+      <w:pPr>
+        <w:keepNext/>
+        <w:spacing w:after="30" w:before="120"/>
+      </w:pPr>
+      <w:r>
+        <w:rPr>
+          <w:b/>
+          <w:bCs/>
+          <w:i/>
+          <w:iCs/>
+          <w:color w:val="6A6A6A"/>
+          <w:sz w:val="18"/>
+          <w:szCs w:val="18"/>
+        </w:rPr>
+        <w:t xml:space="preserve">Beispiel</w:t>
+      </w:r>
+    </w:p>
+    <w:p>
+      <w:pPr>
+        <w:keepLines/>
+        <w:pBdr>
+          <w:left w:val="single" w:color="1B6CA8" w:sz="18" w:space="6"/>
+        </w:pBdr>
+        <w:shd w:fill="F4F4F4" w:val="clear"/>
+        <w:spacing w:after="200" w:before="100" w:line="264" w:lineRule="auto"/>
+        <w:ind w:left="140"/>
+      </w:pPr>
+      <w:r>
+        <w:rPr>
+          <w:rFonts w:ascii="Consolas" w:cs="Consolas" w:eastAsia="Consolas" w:hAnsi="Consolas"/>
+          <w:sz w:val="19"/>
+          <w:szCs w:val="19"/>
+        </w:rPr>
+        <w:t xml:space="preserve">ANIM_FSM_UPDATE(fsm, held, INT(DELTA() * 1000.0))</w:t>
+      </w:r>
+    </w:p>
+    <w:p>
+      <w:pPr>
+        <w:keepNext/>
+        <w:keepLines/>
+        <w:pBdr>
+          <w:bottom w:val="single" w:color="DDD0C0" w:sz="4" w:space="2"/>
+        </w:pBdr>
+        <w:spacing w:after="40" w:before="360"/>
+      </w:pPr>
+      <w:r>
+        <w:rPr>
+          <w:rFonts w:ascii="Consolas" w:cs="Consolas" w:eastAsia="Consolas" w:hAnsi="Consolas"/>
+          <w:b/>
+          <w:bCs/>
+          <w:color w:val="9A3412"/>
+          <w:sz w:val="24"/>
+          <w:szCs w:val="24"/>
+        </w:rPr>
+        <w:t xml:space="preserve">ANIM_FSM_STATE · ANIM_FSM_FORCE</w:t>
+      </w:r>
+    </w:p>
+    <w:p>
+      <w:pPr>
+        <w:keepNext/>
+        <w:spacing w:after="120"/>
+      </w:pPr>
+      <w:r>
+        <w:rPr>
+          <w:b/>
+          <w:bCs/>
+          <w:color w:val="6A6A6A"/>
+          <w:sz w:val="18"/>
+          <w:szCs w:val="18"/>
+        </w:rPr>
+        <w:t xml:space="preserve">Syntax:  </w:t>
+      </w:r>
+      <w:r>
+        <w:rPr>
+          <w:rFonts w:ascii="Consolas" w:cs="Consolas" w:eastAsia="Consolas" w:hAnsi="Consolas"/>
+          <w:color w:val="335577"/>
+          <w:sz w:val="19"/>
+          <w:szCs w:val="19"/>
+        </w:rPr>
+        <w:t xml:space="preserve">ANIM_FSM_STATE(fsm)   ANIM_FSM_FORCE(fsm, sprite, state$)</w:t>
+      </w:r>
+    </w:p>
+    <w:p>
+      <w:pPr>
+        <w:spacing w:after="180" w:line="312" w:lineRule="auto"/>
+      </w:pPr>
+      <w:r>
+        <w:rPr>
+          <w:sz w:val="22"/>
+          <w:szCs w:val="22"/>
+        </w:rPr>
+        <w:t xml:space="preserve">ANIM_FSM_STATE liefert den Namen des aktuellen Zustands (gut zum Anzeigen oder für eigene Logik). ANIM_FSM_FORCE erzwingt einen Zustand ohne Bedingungen – praktisch für Reset oder Respawn.</w:t>
+      </w:r>
+    </w:p>
+    <w:p>
+      <w:pPr>
+        <w:keepNext/>
+        <w:spacing w:after="30" w:before="120"/>
+      </w:pPr>
+      <w:r>
+        <w:rPr>
+          <w:b/>
+          <w:bCs/>
+          <w:i/>
+          <w:iCs/>
+          <w:color w:val="6A6A6A"/>
+          <w:sz w:val="18"/>
+          <w:szCs w:val="18"/>
+        </w:rPr>
+        <w:t xml:space="preserve">Beispiel</w:t>
+      </w:r>
+    </w:p>
+    <w:p>
+      <w:pPr>
+        <w:keepLines/>
+        <w:pBdr>
+          <w:left w:val="single" w:color="1B6CA8" w:sz="18" w:space="6"/>
+        </w:pBdr>
+        <w:shd w:fill="F4F4F4" w:val="clear"/>
+        <w:spacing w:after="200" w:before="100" w:line="264" w:lineRule="auto"/>
+        <w:ind w:left="140"/>
+      </w:pPr>
+      <w:r>
+        <w:rPr>
+          <w:rFonts w:ascii="Consolas" w:cs="Consolas" w:eastAsia="Consolas" w:hAnsi="Consolas"/>
+          <w:sz w:val="19"/>
+          <w:szCs w:val="19"/>
+        </w:rPr>
+        <w:t xml:space="preserve">PRINT ANIM_FSM_STATE(fsm)               ' z. B. "run"</w:t>
+      </w:r>
+      <w:r>
+        <w:rPr>
+          <w:rFonts w:ascii="Consolas" w:cs="Consolas" w:eastAsia="Consolas" w:hAnsi="Consolas"/>
+          <w:sz w:val="19"/>
+          <w:szCs w:val="19"/>
+        </w:rPr>
+        <w:br/>
+        <w:t xml:space="preserve">ANIM_FSM_FORCE(fsm, held, "idle")       ' Reset</w:t>
+      </w:r>
+    </w:p>
+    <w:p>
+      <w:pPr>
+        <w:pStyle w:val="Heading2"/>
+        <w:keepNext/>
+        <w:keepLines/>
+        <w:spacing w:after="120" w:before="280"/>
+      </w:pPr>
+      <w:r>
+        <w:t xml:space="preserve">Im Game-Loop</w:t>
+      </w:r>
+    </w:p>
+    <w:p>
+      <w:pPr>
+        <w:spacing w:after="180" w:line="312" w:lineRule="auto"/>
+      </w:pPr>
+      <w:r>
+        <w:rPr>
+          <w:sz w:val="22"/>
+          <w:szCs w:val="22"/>
+        </w:rPr>
+        <w:t xml:space="preserve">Im Spiel meldest du nur noch die Parameter und rufst UPDATE – das ständige Animations-Umschalten von Hand entfällt:</w:t>
+      </w:r>
+    </w:p>
+    <w:p>
+      <w:pPr>
+        <w:keepLines/>
+        <w:pBdr>
+          <w:left w:val="single" w:color="1B6CA8" w:sz="18" w:space="6"/>
+        </w:pBdr>
+        <w:shd w:fill="F4F4F4" w:val="clear"/>
+        <w:spacing w:after="200" w:before="100" w:line="264" w:lineRule="auto"/>
+        <w:ind w:left="140"/>
+      </w:pPr>
+      <w:r>
+        <w:rPr>
+          <w:rFonts w:ascii="Consolas" w:cs="Consolas" w:eastAsia="Consolas" w:hAnsi="Consolas"/>
+          <w:sz w:val="19"/>
+          <w:szCs w:val="19"/>
+        </w:rPr>
+        <w:t xml:space="preserve">WHILE NOT QUITREQUESTED()</w:t>
+      </w:r>
+      <w:r>
+        <w:rPr>
+          <w:rFonts w:ascii="Consolas" w:cs="Consolas" w:eastAsia="Consolas" w:hAnsi="Consolas"/>
+          <w:sz w:val="19"/>
+          <w:szCs w:val="19"/>
+        </w:rPr>
+        <w:br/>
+        <w:t xml:space="preserve">    DIM vx AS FLOAT</w:t>
+      </w:r>
+      <w:r>
+        <w:rPr>
+          <w:rFonts w:ascii="Consolas" w:cs="Consolas" w:eastAsia="Consolas" w:hAnsi="Consolas"/>
+          <w:sz w:val="19"/>
+          <w:szCs w:val="19"/>
+        </w:rPr>
+        <w:br/>
+        <w:t xml:space="preserve">    vx = INPUT_AXIS("links", "rechts") * 80.0</w:t>
+      </w:r>
+      <w:r>
+        <w:rPr>
+          <w:rFonts w:ascii="Consolas" w:cs="Consolas" w:eastAsia="Consolas" w:hAnsi="Consolas"/>
+          <w:sz w:val="19"/>
+          <w:szCs w:val="19"/>
+        </w:rPr>
+        <w:br/>
+        <w:t xml:space="preserve">    ANIM_FSM_SET_FLOAT(fsm, "speed", ABS(vx))</w:t>
+      </w:r>
+      <w:r>
+        <w:rPr>
+          <w:rFonts w:ascii="Consolas" w:cs="Consolas" w:eastAsia="Consolas" w:hAnsi="Consolas"/>
+          <w:sz w:val="19"/>
+          <w:szCs w:val="19"/>
+        </w:rPr>
+        <w:br/>
+        <w:t xml:space="preserve">    SPRITE_SET_VELOCITY(held, vx, 0.0)</w:t>
+      </w:r>
+      <w:r>
+        <w:rPr>
+          <w:rFonts w:ascii="Consolas" w:cs="Consolas" w:eastAsia="Consolas" w:hAnsi="Consolas"/>
+          <w:sz w:val="19"/>
+          <w:szCs w:val="19"/>
+        </w:rPr>
+        <w:br/>
+        <w:t xml:space="preserve"/>
+      </w:r>
+      <w:r>
+        <w:rPr>
+          <w:rFonts w:ascii="Consolas" w:cs="Consolas" w:eastAsia="Consolas" w:hAnsi="Consolas"/>
+          <w:sz w:val="19"/>
+          <w:szCs w:val="19"/>
+        </w:rPr>
+        <w:br/>
+        <w:t xml:space="preserve">    DIM dt AS INTEGER</w:t>
+      </w:r>
+      <w:r>
+        <w:rPr>
+          <w:rFonts w:ascii="Consolas" w:cs="Consolas" w:eastAsia="Consolas" w:hAnsi="Consolas"/>
+          <w:sz w:val="19"/>
+          <w:szCs w:val="19"/>
+        </w:rPr>
+        <w:br/>
+        <w:t xml:space="preserve">    dt = INT(DELTA() * 1000.0)</w:t>
+      </w:r>
+      <w:r>
+        <w:rPr>
+          <w:rFonts w:ascii="Consolas" w:cs="Consolas" w:eastAsia="Consolas" w:hAnsi="Consolas"/>
+          <w:sz w:val="19"/>
+          <w:szCs w:val="19"/>
+        </w:rPr>
+        <w:br/>
+        <w:t xml:space="preserve">    ANIM_FSM_UPDATE(fsm, held, dt)    ' wählt idle/run automatisch</w:t>
+      </w:r>
+      <w:r>
+        <w:rPr>
+          <w:rFonts w:ascii="Consolas" w:cs="Consolas" w:eastAsia="Consolas" w:hAnsi="Consolas"/>
+          <w:sz w:val="19"/>
+          <w:szCs w:val="19"/>
+        </w:rPr>
+        <w:br/>
+        <w:t xml:space="preserve">    SPRITE_UPDATE(held, dt)</w:t>
+      </w:r>
+      <w:r>
+        <w:rPr>
+          <w:rFonts w:ascii="Consolas" w:cs="Consolas" w:eastAsia="Consolas" w:hAnsi="Consolas"/>
+          <w:sz w:val="19"/>
+          <w:szCs w:val="19"/>
+        </w:rPr>
+        <w:br/>
+        <w:t xml:space="preserve">    CLS(RGB(28, 32, 50))</w:t>
+      </w:r>
+      <w:r>
+        <w:rPr>
+          <w:rFonts w:ascii="Consolas" w:cs="Consolas" w:eastAsia="Consolas" w:hAnsi="Consolas"/>
+          <w:sz w:val="19"/>
+          <w:szCs w:val="19"/>
+        </w:rPr>
+        <w:br/>
+        <w:t xml:space="preserve">    SPRITE_DRAW(held)</w:t>
+      </w:r>
+      <w:r>
+        <w:rPr>
+          <w:rFonts w:ascii="Consolas" w:cs="Consolas" w:eastAsia="Consolas" w:hAnsi="Consolas"/>
+          <w:sz w:val="19"/>
+          <w:szCs w:val="19"/>
+        </w:rPr>
+        <w:br/>
+        <w:t xml:space="preserve">    FLIP()</w:t>
+      </w:r>
+      <w:r>
+        <w:rPr>
+          <w:rFonts w:ascii="Consolas" w:cs="Consolas" w:eastAsia="Consolas" w:hAnsi="Consolas"/>
+          <w:sz w:val="19"/>
+          <w:szCs w:val="19"/>
+        </w:rPr>
+        <w:br/>
+        <w:t xml:space="preserve">WEND</w:t>
+      </w:r>
+    </w:p>
+    <w:p>
+      <w:pPr>
+        <w:spacing w:before="60"/>
+      </w:pPr>
+    </w:p>
+    <w:tbl>
+      <w:tblPr>
+        <w:tblW w:type="dxa" w:w="9360"/>
+        <w:tblBorders>
+          <w:top w:val="single" w:color="auto" w:sz="4"/>
+          <w:left w:val="single" w:color="auto" w:sz="4"/>
+          <w:bottom w:val="single" w:color="auto" w:sz="4"/>
+          <w:right w:val="single" w:color="auto" w:sz="4"/>
+          <w:insideH w:val="single" w:color="auto" w:sz="4"/>
+          <w:insideV w:val="single" w:color="auto" w:sz="4"/>
+        </w:tblBorders>
+      </w:tblPr>
+      <w:tblGrid>
+        <w:gridCol w:w="9360"/>
+      </w:tblGrid>
+      <w:tr>
+        <w:trPr>
+          <w:cantSplit/>
+        </w:trPr>
+        <w:tc>
+          <w:tcPr>
+            <w:tcW w:type="dxa" w:w="9360"/>
+            <w:tcBorders>
+              <w:top w:val="single" w:color="9CC8E6" w:sz="6"/>
+              <w:left w:val="single" w:color="9CC8E6" w:sz="6"/>
+              <w:bottom w:val="single" w:color="9CC8E6" w:sz="6"/>
+              <w:right w:val="single" w:color="9CC8E6" w:sz="6"/>
+            </w:tcBorders>
+            <w:shd w:fill="E7F2FA" w:val="clear"/>
+            <w:tcMar>
+              <w:top w:type="dxa" w:w="140"/>
+              <w:left w:type="dxa" w:w="180"/>
+              <w:bottom w:type="dxa" w:w="140"/>
+              <w:right w:type="dxa" w:w="180"/>
+            </w:tcMar>
+          </w:tcPr>
+          <w:p>
+            <w:pPr>
+              <w:spacing w:after="40"/>
+            </w:pPr>
+            <w:r>
+              <w:rPr>
+                <w:b/>
+                <w:bCs/>
+                <w:color w:val="1B6CA8"/>
+                <w:sz w:val="22"/>
+                <w:szCs w:val="22"/>
+              </w:rPr>
+              <w:t xml:space="preserve">Wann lohnt sich animfsm?</w:t>
+            </w:r>
+          </w:p>
+          <w:p>
+            <w:pPr>
+              <w:spacing w:after="0" w:line="312" w:lineRule="auto"/>
+            </w:pPr>
+            <w:r>
+              <w:rPr>
+                <w:sz w:val="22"/>
+                <w:szCs w:val="22"/>
+              </w:rPr>
+              <w:t xml:space="preserve">Für eine Figur mit nur zwei Animationen reicht das einfache IF aus dem sprite-Kapitel. Sobald es viele Zustände mit Bedingungen werden (laufen, springen, fallen, landen, treffen …), hält animfsm den Code sauber – und der visuelle Editor gbanim macht das Entwerfen der Zustände zum Kinderspiel.</w:t>
             </w:r>
           </w:p>
         </w:tc>

</xml_diff>

<commit_message>
docs(buch): Lehrbuch Kap 52 -- Modul tween (Easing-Screenshot)
TWEEN_NEW/_LOOP/_PINGPONG, TWEEN_VALUE/DONE, PAUSE/RESUME/REVERSE, Easing-
Kurven (linear/out_quad/cubic/bounce/elastic/inout_sine). Screenshot: 6
Easings zum selben Zeitpunkt als Balken. Zeitbasiert (kein UPDATE). Je
Befehl ein Beispiel; gegen gbrt verifiziert.

Co-Authored-By: Claude Opus 4.8 (1M context) <noreply@anthropic.com>
</commit_message>
<xml_diff>
--- a/buch-referenz/buch/GameBasic-Lehrbuch.docx
+++ b/buch-referenz/buch/GameBasic-Lehrbuch.docx
@@ -1353,6 +1353,33 @@
           <w:szCs w:val="22"/>
         </w:rPr>
         <w:t xml:space="preserve">	174</w:t>
+      </w:r>
+    </w:p>
+    <w:p>
+      <w:pPr>
+        <w:tabs>
+          <w:tab w:val="right" w:pos="9200" w:leader="dot"/>
+        </w:tabs>
+        <w:spacing w:after="20" w:before="0"/>
+        <w:ind w:left="280"/>
+      </w:pPr>
+      <w:r>
+        <w:rPr>
+          <w:b w:val="false"/>
+          <w:bCs w:val="false"/>
+          <w:color w:val="222222"/>
+          <w:sz w:val="22"/>
+          <w:szCs w:val="22"/>
+        </w:rPr>
+        <w:t xml:space="preserve">Modul: tween</w:t>
+      </w:r>
+      <w:r>
+        <w:rPr>
+          <w:color w:val="555555"/>
+          <w:sz w:val="22"/>
+          <w:szCs w:val="22"/>
+        </w:rPr>
+        <w:t xml:space="preserve">	178</w:t>
       </w:r>
     </w:p>
     <w:p>
@@ -58965,6 +58992,951 @@
                 <w:szCs w:val="22"/>
               </w:rPr>
               <w:t xml:space="preserve">Für eine Figur mit nur zwei Animationen reicht das einfache IF aus dem sprite-Kapitel. Sobald es viele Zustände mit Bedingungen werden (laufen, springen, fallen, landen, treffen …), hält animfsm den Code sauber – und der visuelle Editor gbanim macht das Entwerfen der Zustände zum Kinderspiel.</w:t>
+            </w:r>
+          </w:p>
+        </w:tc>
+      </w:tr>
+    </w:tbl>
+    <w:p>
+      <w:pPr>
+        <w:spacing w:after="160"/>
+      </w:pPr>
+    </w:p>
+    <w:p>
+      <w:pPr>
+        <w:pStyle w:val="Heading1"/>
+        <w:keepNext/>
+        <w:keepLines/>
+        <w:pageBreakBefore/>
+        <w:pBdr>
+          <w:bottom w:val="single" w:color="1B6CA8" w:sz="12" w:space="4"/>
+        </w:pBdr>
+        <w:spacing w:after="160" w:before="0"/>
+      </w:pPr>
+      <w:r>
+        <w:t xml:space="preserve">Modul: tween</w:t>
+      </w:r>
+    </w:p>
+    <w:p>
+      <w:pPr>
+        <w:spacing w:after="180" w:line="312" w:lineRule="auto"/>
+      </w:pPr>
+      <w:r>
+        <w:rPr>
+          <w:sz w:val="22"/>
+          <w:szCs w:val="22"/>
+        </w:rPr>
+        <w:t xml:space="preserve">Ein Tween (von engl. „in-between“) ist ein Wert, der sich von selbst über eine bestimmte Zeit von einem Start- zu einem Endwert bewegt – sanft statt ruckartig. Damit animierst du mühelos ein Pop-up, das einfliegt, eine Zahl, die hochzählt, oder eine Figur, die elastisch aufpoppt. Du erstellst den Tween einmal und fragst ihn dann jeden Frame nach seinem aktuellen Wert; um die Zeit kümmert sich das Modul selbst.</w:t>
+      </w:r>
+    </w:p>
+    <w:p>
+      <w:pPr>
+        <w:keepNext/>
+        <w:spacing w:after="40" w:before="160"/>
+        <w:jc w:val="center"/>
+      </w:pPr>
+      <w:r>
+        <w:drawing>
+          <wp:inline distT="0" distB="0" distL="0" distR="0">
+            <wp:extent cx="4572000" cy="3048000"/>
+            <wp:effectExtent t="0" r="0" b="0" l="0"/>
+            <wp:docPr id="1" name="52_tween.png" descr="Sechs Tweens mit verschiedenen Easing-Kurven, zum selben Zeitpunkt abgefragt – jede ist unterschiedlich weit (out_elastic schießt sogar über das Ziel hinaus)." title="Sechs Tweens mit verschiedenen Easing-Kurven, zum selben Zeitpunkt abgefragt – jede ist unterschiedlich weit (out_elastic schießt sogar über das Ziel hinaus)."/>
+            <wp:cNvGraphicFramePr>
+              <a:graphicFrameLocks xmlns:a="http://schemas.openxmlformats.org/drawingml/2006/main" noChangeAspect="1"/>
+            </wp:cNvGraphicFramePr>
+            <a:graphic xmlns:a="http://schemas.openxmlformats.org/drawingml/2006/main">
+              <a:graphicData uri="http://schemas.openxmlformats.org/drawingml/2006/picture">
+                <pic:pic xmlns:pic="http://schemas.openxmlformats.org/drawingml/2006/picture">
+                  <pic:nvPicPr>
+                    <pic:cNvPr id="0" name="" descr=""/>
+                    <pic:cNvPicPr>
+                      <a:picLocks noChangeAspect="1" noChangeArrowheads="1"/>
+                    </pic:cNvPicPr>
+                  </pic:nvPicPr>
+                  <pic:blipFill>
+                    <a:blip r:embed="rId21" cstate="none"/>
+                    <a:srcRect/>
+                    <a:stretch>
+                      <a:fillRect/>
+                    </a:stretch>
+                  </pic:blipFill>
+                  <pic:spPr bwMode="auto">
+                    <a:xfrm>
+                      <a:off x="0" y="0"/>
+                      <a:ext cx="4572000" cy="3048000"/>
+                    </a:xfrm>
+                    <a:prstGeom prst="rect">
+                      <a:avLst/>
+                    </a:prstGeom>
+                  </pic:spPr>
+                </pic:pic>
+              </a:graphicData>
+            </a:graphic>
+          </wp:inline>
+        </w:drawing>
+      </w:r>
+    </w:p>
+    <w:p>
+      <w:pPr>
+        <w:spacing w:after="200"/>
+        <w:jc w:val="center"/>
+      </w:pPr>
+      <w:r>
+        <w:rPr>
+          <w:i/>
+          <w:iCs/>
+          <w:color w:val="6A6A6A"/>
+          <w:sz w:val="18"/>
+          <w:szCs w:val="18"/>
+        </w:rPr>
+        <w:t xml:space="preserve">Sechs Tweens mit verschiedenen Easing-Kurven, zum selben Zeitpunkt abgefragt – jede ist unterschiedlich weit (out_elastic schießt sogar über das Ziel hinaus).</w:t>
+      </w:r>
+    </w:p>
+    <w:p>
+      <w:pPr>
+        <w:pStyle w:val="Heading2"/>
+        <w:keepNext/>
+        <w:keepLines/>
+        <w:spacing w:after="120" w:before="280"/>
+      </w:pPr>
+      <w:r>
+        <w:t xml:space="preserve">Einen Tween erstellen</w:t>
+      </w:r>
+    </w:p>
+    <w:p>
+      <w:pPr>
+        <w:keepNext/>
+        <w:keepLines/>
+        <w:pBdr>
+          <w:bottom w:val="single" w:color="DDD0C0" w:sz="4" w:space="2"/>
+        </w:pBdr>
+        <w:spacing w:after="40" w:before="360"/>
+      </w:pPr>
+      <w:r>
+        <w:rPr>
+          <w:rFonts w:ascii="Consolas" w:cs="Consolas" w:eastAsia="Consolas" w:hAnsi="Consolas"/>
+          <w:b/>
+          <w:bCs/>
+          <w:color w:val="9A3412"/>
+          <w:sz w:val="24"/>
+          <w:szCs w:val="24"/>
+        </w:rPr>
+        <w:t xml:space="preserve">TWEEN_NEW</w:t>
+      </w:r>
+    </w:p>
+    <w:p>
+      <w:pPr>
+        <w:keepNext/>
+        <w:spacing w:after="120"/>
+      </w:pPr>
+      <w:r>
+        <w:rPr>
+          <w:b/>
+          <w:bCs/>
+          <w:color w:val="6A6A6A"/>
+          <w:sz w:val="18"/>
+          <w:szCs w:val="18"/>
+        </w:rPr>
+        <w:t xml:space="preserve">Syntax:  </w:t>
+      </w:r>
+      <w:r>
+        <w:rPr>
+          <w:rFonts w:ascii="Consolas" w:cs="Consolas" w:eastAsia="Consolas" w:hAnsi="Consolas"/>
+          <w:color w:val="335577"/>
+          <w:sz w:val="19"/>
+          <w:szCs w:val="19"/>
+        </w:rPr>
+        <w:t xml:space="preserve">TWEEN_NEW(start, ende, dauer_ms[, easing$])</w:t>
+      </w:r>
+    </w:p>
+    <w:p>
+      <w:pPr>
+        <w:spacing w:after="180" w:line="312" w:lineRule="auto"/>
+      </w:pPr>
+      <w:r>
+        <w:rPr>
+          <w:sz w:val="22"/>
+          <w:szCs w:val="22"/>
+        </w:rPr>
+        <w:t xml:space="preserve">Erstellt einen einmaligen Tween, der in dauer_ms Millisekunden von start nach ende läuft und dann am Endwert stehen bleibt. easing bestimmt den Bewegungsverlauf (siehe unten; Standard: linear).</w:t>
+      </w:r>
+    </w:p>
+    <w:p>
+      <w:pPr>
+        <w:keepNext/>
+        <w:spacing w:after="30" w:before="120"/>
+      </w:pPr>
+      <w:r>
+        <w:rPr>
+          <w:b/>
+          <w:bCs/>
+          <w:i/>
+          <w:iCs/>
+          <w:color w:val="6A6A6A"/>
+          <w:sz w:val="18"/>
+          <w:szCs w:val="18"/>
+        </w:rPr>
+        <w:t xml:space="preserve">Beispiel</w:t>
+      </w:r>
+    </w:p>
+    <w:p>
+      <w:pPr>
+        <w:keepLines/>
+        <w:pBdr>
+          <w:left w:val="single" w:color="1B6CA8" w:sz="18" w:space="6"/>
+        </w:pBdr>
+        <w:shd w:fill="F4F4F4" w:val="clear"/>
+        <w:spacing w:after="200" w:before="100" w:line="264" w:lineRule="auto"/>
+        <w:ind w:left="140"/>
+      </w:pPr>
+      <w:r>
+        <w:rPr>
+          <w:rFonts w:ascii="Consolas" w:cs="Consolas" w:eastAsia="Consolas" w:hAnsi="Consolas"/>
+          <w:sz w:val="19"/>
+          <w:szCs w:val="19"/>
+        </w:rPr>
+        <w:t xml:space="preserve">IMPORT "tween"</w:t>
+      </w:r>
+      <w:r>
+        <w:rPr>
+          <w:rFonts w:ascii="Consolas" w:cs="Consolas" w:eastAsia="Consolas" w:hAnsi="Consolas"/>
+          <w:sz w:val="19"/>
+          <w:szCs w:val="19"/>
+        </w:rPr>
+        <w:br/>
+        <w:t xml:space="preserve">DIM t AS TWEEN</w:t>
+      </w:r>
+      <w:r>
+        <w:rPr>
+          <w:rFonts w:ascii="Consolas" w:cs="Consolas" w:eastAsia="Consolas" w:hAnsi="Consolas"/>
+          <w:sz w:val="19"/>
+          <w:szCs w:val="19"/>
+        </w:rPr>
+        <w:br/>
+        <w:t xml:space="preserve">t = TWEEN_NEW(0.0, 100.0, 2000, "out_quad")   ' 0 -&gt; 100 in 2 s</w:t>
+      </w:r>
+    </w:p>
+    <w:p>
+      <w:pPr>
+        <w:keepNext/>
+        <w:keepLines/>
+        <w:pBdr>
+          <w:bottom w:val="single" w:color="DDD0C0" w:sz="4" w:space="2"/>
+        </w:pBdr>
+        <w:spacing w:after="40" w:before="360"/>
+      </w:pPr>
+      <w:r>
+        <w:rPr>
+          <w:rFonts w:ascii="Consolas" w:cs="Consolas" w:eastAsia="Consolas" w:hAnsi="Consolas"/>
+          <w:b/>
+          <w:bCs/>
+          <w:color w:val="9A3412"/>
+          <w:sz w:val="24"/>
+          <w:szCs w:val="24"/>
+        </w:rPr>
+        <w:t xml:space="preserve">TWEEN_NEW_LOOP · TWEEN_NEW_PINGPONG</w:t>
+      </w:r>
+    </w:p>
+    <w:p>
+      <w:pPr>
+        <w:keepNext/>
+        <w:spacing w:after="120"/>
+      </w:pPr>
+      <w:r>
+        <w:rPr>
+          <w:b/>
+          <w:bCs/>
+          <w:color w:val="6A6A6A"/>
+          <w:sz w:val="18"/>
+          <w:szCs w:val="18"/>
+        </w:rPr>
+        <w:t xml:space="preserve">Syntax:  </w:t>
+      </w:r>
+      <w:r>
+        <w:rPr>
+          <w:rFonts w:ascii="Consolas" w:cs="Consolas" w:eastAsia="Consolas" w:hAnsi="Consolas"/>
+          <w:color w:val="335577"/>
+          <w:sz w:val="19"/>
+          <w:szCs w:val="19"/>
+        </w:rPr>
+        <w:t xml:space="preserve">TWEEN_NEW_LOOP(start, ende, dauer_ms[, easing$])   TWEEN_NEW_PINGPONG(...)</w:t>
+      </w:r>
+    </w:p>
+    <w:p>
+      <w:pPr>
+        <w:spacing w:after="180" w:line="312" w:lineRule="auto"/>
+      </w:pPr>
+      <w:r>
+        <w:rPr>
+          <w:sz w:val="22"/>
+          <w:szCs w:val="22"/>
+        </w:rPr>
+        <w:t xml:space="preserve">Endlos laufende Tweens. LOOP springt am Ende zurück zum Start (start→ende, start→ende …) – gut für Spinner. PINGPONG pendelt hin und her (start→ende→start …) – gut für ein Auf-und-Ab-Wippen. Beide sind nie „fertig“.</w:t>
+      </w:r>
+    </w:p>
+    <w:p>
+      <w:pPr>
+        <w:keepNext/>
+        <w:spacing w:after="30" w:before="120"/>
+      </w:pPr>
+      <w:r>
+        <w:rPr>
+          <w:b/>
+          <w:bCs/>
+          <w:i/>
+          <w:iCs/>
+          <w:color w:val="6A6A6A"/>
+          <w:sz w:val="18"/>
+          <w:szCs w:val="18"/>
+        </w:rPr>
+        <w:t xml:space="preserve">Beispiel</w:t>
+      </w:r>
+    </w:p>
+    <w:p>
+      <w:pPr>
+        <w:keepLines/>
+        <w:pBdr>
+          <w:left w:val="single" w:color="1B6CA8" w:sz="18" w:space="6"/>
+        </w:pBdr>
+        <w:shd w:fill="F4F4F4" w:val="clear"/>
+        <w:spacing w:after="200" w:before="100" w:line="264" w:lineRule="auto"/>
+        <w:ind w:left="140"/>
+      </w:pPr>
+      <w:r>
+        <w:rPr>
+          <w:rFonts w:ascii="Consolas" w:cs="Consolas" w:eastAsia="Consolas" w:hAnsi="Consolas"/>
+          <w:sz w:val="19"/>
+          <w:szCs w:val="19"/>
+        </w:rPr>
+        <w:t xml:space="preserve">DIM bob AS TWEEN</w:t>
+      </w:r>
+      <w:r>
+        <w:rPr>
+          <w:rFonts w:ascii="Consolas" w:cs="Consolas" w:eastAsia="Consolas" w:hAnsi="Consolas"/>
+          <w:sz w:val="19"/>
+          <w:szCs w:val="19"/>
+        </w:rPr>
+        <w:br/>
+        <w:t xml:space="preserve">bob = TWEEN_NEW_PINGPONG(-4.0, 4.0, 800, "inout_sine")  ' sanftes Wippen</w:t>
+      </w:r>
+    </w:p>
+    <w:p>
+      <w:pPr>
+        <w:pStyle w:val="Heading2"/>
+        <w:keepNext/>
+        <w:keepLines/>
+        <w:spacing w:after="120" w:before="280"/>
+      </w:pPr>
+      <w:r>
+        <w:t xml:space="preserve">Den Wert abfragen</w:t>
+      </w:r>
+    </w:p>
+    <w:p>
+      <w:pPr>
+        <w:keepNext/>
+        <w:keepLines/>
+        <w:pBdr>
+          <w:bottom w:val="single" w:color="DDD0C0" w:sz="4" w:space="2"/>
+        </w:pBdr>
+        <w:spacing w:after="40" w:before="360"/>
+      </w:pPr>
+      <w:r>
+        <w:rPr>
+          <w:rFonts w:ascii="Consolas" w:cs="Consolas" w:eastAsia="Consolas" w:hAnsi="Consolas"/>
+          <w:b/>
+          <w:bCs/>
+          <w:color w:val="9A3412"/>
+          <w:sz w:val="24"/>
+          <w:szCs w:val="24"/>
+        </w:rPr>
+        <w:t xml:space="preserve">TWEEN_VALUE · TWEEN_DONE</w:t>
+      </w:r>
+    </w:p>
+    <w:p>
+      <w:pPr>
+        <w:keepNext/>
+        <w:spacing w:after="120"/>
+      </w:pPr>
+      <w:r>
+        <w:rPr>
+          <w:b/>
+          <w:bCs/>
+          <w:color w:val="6A6A6A"/>
+          <w:sz w:val="18"/>
+          <w:szCs w:val="18"/>
+        </w:rPr>
+        <w:t xml:space="preserve">Syntax:  </w:t>
+      </w:r>
+      <w:r>
+        <w:rPr>
+          <w:rFonts w:ascii="Consolas" w:cs="Consolas" w:eastAsia="Consolas" w:hAnsi="Consolas"/>
+          <w:color w:val="335577"/>
+          <w:sz w:val="19"/>
+          <w:szCs w:val="19"/>
+        </w:rPr>
+        <w:t xml:space="preserve">TWEEN_VALUE(t)   TWEEN_DONE(t)</w:t>
+      </w:r>
+    </w:p>
+    <w:p>
+      <w:pPr>
+        <w:spacing w:after="180" w:line="312" w:lineRule="auto"/>
+      </w:pPr>
+      <w:r>
+        <w:rPr>
+          <w:sz w:val="22"/>
+          <w:szCs w:val="22"/>
+        </w:rPr>
+        <w:t xml:space="preserve">TWEEN_VALUE liefert den aktuellen Wert (jeden Frame abfragen). TWEEN_DONE ist TRUE, sobald ein einmaliger Tween sein Ende erreicht hat (bei LOOP/PINGPONG immer FALSE).</w:t>
+      </w:r>
+    </w:p>
+    <w:p>
+      <w:pPr>
+        <w:keepNext/>
+        <w:spacing w:after="30" w:before="120"/>
+      </w:pPr>
+      <w:r>
+        <w:rPr>
+          <w:b/>
+          <w:bCs/>
+          <w:i/>
+          <w:iCs/>
+          <w:color w:val="6A6A6A"/>
+          <w:sz w:val="18"/>
+          <w:szCs w:val="18"/>
+        </w:rPr>
+        <w:t xml:space="preserve">Beispiel</w:t>
+      </w:r>
+    </w:p>
+    <w:p>
+      <w:pPr>
+        <w:keepLines/>
+        <w:pBdr>
+          <w:left w:val="single" w:color="1B6CA8" w:sz="18" w:space="6"/>
+        </w:pBdr>
+        <w:shd w:fill="F4F4F4" w:val="clear"/>
+        <w:spacing w:after="200" w:before="100" w:line="264" w:lineRule="auto"/>
+        <w:ind w:left="140"/>
+      </w:pPr>
+      <w:r>
+        <w:rPr>
+          <w:rFonts w:ascii="Consolas" w:cs="Consolas" w:eastAsia="Consolas" w:hAnsi="Consolas"/>
+          <w:sz w:val="19"/>
+          <w:szCs w:val="19"/>
+        </w:rPr>
+        <w:t xml:space="preserve">DIM y AS INTEGER</w:t>
+      </w:r>
+      <w:r>
+        <w:rPr>
+          <w:rFonts w:ascii="Consolas" w:cs="Consolas" w:eastAsia="Consolas" w:hAnsi="Consolas"/>
+          <w:sz w:val="19"/>
+          <w:szCs w:val="19"/>
+        </w:rPr>
+        <w:br/>
+        <w:t xml:space="preserve">y = INT(TWEEN_VALUE(banner))    ' aktuelle Position</w:t>
+      </w:r>
+      <w:r>
+        <w:rPr>
+          <w:rFonts w:ascii="Consolas" w:cs="Consolas" w:eastAsia="Consolas" w:hAnsi="Consolas"/>
+          <w:sz w:val="19"/>
+          <w:szCs w:val="19"/>
+        </w:rPr>
+        <w:br/>
+        <w:t xml:space="preserve">IF TWEEN_DONE(banner) THEN ' fertig eingeflogen</w:t>
+      </w:r>
+    </w:p>
+    <w:p>
+      <w:pPr>
+        <w:pStyle w:val="Heading2"/>
+        <w:keepNext/>
+        <w:keepLines/>
+        <w:spacing w:after="120" w:before="280"/>
+      </w:pPr>
+      <w:r>
+        <w:t xml:space="preserve">Steuern</w:t>
+      </w:r>
+    </w:p>
+    <w:p>
+      <w:pPr>
+        <w:keepNext/>
+        <w:keepLines/>
+        <w:pBdr>
+          <w:bottom w:val="single" w:color="DDD0C0" w:sz="4" w:space="2"/>
+        </w:pBdr>
+        <w:spacing w:after="40" w:before="360"/>
+      </w:pPr>
+      <w:r>
+        <w:rPr>
+          <w:rFonts w:ascii="Consolas" w:cs="Consolas" w:eastAsia="Consolas" w:hAnsi="Consolas"/>
+          <w:b/>
+          <w:bCs/>
+          <w:color w:val="9A3412"/>
+          <w:sz w:val="24"/>
+          <w:szCs w:val="24"/>
+        </w:rPr>
+        <w:t xml:space="preserve">TWEEN_PAUSE · TWEEN_RESUME · TWEEN_REVERSE</w:t>
+      </w:r>
+    </w:p>
+    <w:p>
+      <w:pPr>
+        <w:keepNext/>
+        <w:spacing w:after="120"/>
+      </w:pPr>
+      <w:r>
+        <w:rPr>
+          <w:b/>
+          <w:bCs/>
+          <w:color w:val="6A6A6A"/>
+          <w:sz w:val="18"/>
+          <w:szCs w:val="18"/>
+        </w:rPr>
+        <w:t xml:space="preserve">Syntax:  </w:t>
+      </w:r>
+      <w:r>
+        <w:rPr>
+          <w:rFonts w:ascii="Consolas" w:cs="Consolas" w:eastAsia="Consolas" w:hAnsi="Consolas"/>
+          <w:color w:val="335577"/>
+          <w:sz w:val="19"/>
+          <w:szCs w:val="19"/>
+        </w:rPr>
+        <w:t xml:space="preserve">TWEEN_PAUSE(t)   TWEEN_RESUME(t)   TWEEN_REVERSE(t)</w:t>
+      </w:r>
+    </w:p>
+    <w:p>
+      <w:pPr>
+        <w:spacing w:after="180" w:line="312" w:lineRule="auto"/>
+      </w:pPr>
+      <w:r>
+        <w:rPr>
+          <w:sz w:val="22"/>
+          <w:szCs w:val="22"/>
+        </w:rPr>
+        <w:t xml:space="preserve">Hält einen Tween an, setzt ihn fort oder kehrt seine Richtung um (z. B. ein Menü, das wieder hinausfährt).</w:t>
+      </w:r>
+    </w:p>
+    <w:p>
+      <w:pPr>
+        <w:keepNext/>
+        <w:spacing w:after="30" w:before="120"/>
+      </w:pPr>
+      <w:r>
+        <w:rPr>
+          <w:b/>
+          <w:bCs/>
+          <w:i/>
+          <w:iCs/>
+          <w:color w:val="6A6A6A"/>
+          <w:sz w:val="18"/>
+          <w:szCs w:val="18"/>
+        </w:rPr>
+        <w:t xml:space="preserve">Beispiel</w:t>
+      </w:r>
+    </w:p>
+    <w:p>
+      <w:pPr>
+        <w:keepLines/>
+        <w:pBdr>
+          <w:left w:val="single" w:color="1B6CA8" w:sz="18" w:space="6"/>
+        </w:pBdr>
+        <w:shd w:fill="F4F4F4" w:val="clear"/>
+        <w:spacing w:after="200" w:before="100" w:line="264" w:lineRule="auto"/>
+        <w:ind w:left="140"/>
+      </w:pPr>
+      <w:r>
+        <w:rPr>
+          <w:rFonts w:ascii="Consolas" w:cs="Consolas" w:eastAsia="Consolas" w:hAnsi="Consolas"/>
+          <w:sz w:val="19"/>
+          <w:szCs w:val="19"/>
+        </w:rPr>
+        <w:t xml:space="preserve">TWEEN_PAUSE(t)</w:t>
+      </w:r>
+      <w:r>
+        <w:rPr>
+          <w:rFonts w:ascii="Consolas" w:cs="Consolas" w:eastAsia="Consolas" w:hAnsi="Consolas"/>
+          <w:sz w:val="19"/>
+          <w:szCs w:val="19"/>
+        </w:rPr>
+        <w:br/>
+        <w:t xml:space="preserve">TWEEN_RESUME(t)</w:t>
+      </w:r>
+      <w:r>
+        <w:rPr>
+          <w:rFonts w:ascii="Consolas" w:cs="Consolas" w:eastAsia="Consolas" w:hAnsi="Consolas"/>
+          <w:sz w:val="19"/>
+          <w:szCs w:val="19"/>
+        </w:rPr>
+        <w:br/>
+        <w:t xml:space="preserve">TWEEN_REVERSE(banner)    ' fährt jetzt zurück</w:t>
+      </w:r>
+    </w:p>
+    <w:p>
+      <w:pPr>
+        <w:pStyle w:val="Heading2"/>
+        <w:keepNext/>
+        <w:keepLines/>
+        <w:spacing w:after="120" w:before="280"/>
+      </w:pPr>
+      <w:r>
+        <w:t xml:space="preserve">Easing-Kurven</w:t>
+      </w:r>
+    </w:p>
+    <w:p>
+      <w:pPr>
+        <w:spacing w:after="180" w:line="312" w:lineRule="auto"/>
+      </w:pPr>
+      <w:r>
+        <w:rPr>
+          <w:sz w:val="22"/>
+          <w:szCs w:val="22"/>
+        </w:rPr>
+        <w:t xml:space="preserve">Das Easing bestimmt, WIE sich der Wert zwischen Start und Ende bewegt. linear ist gleichmäßig; die out_-Varianten starten schnell und werden langsamer (gut für Einflüge); in_ ist umgekehrt; inout_ kombiniert beides. Spezialkurven sorgen für Charakter: out_bounce springt wie ein Ball aus, out_elastic schwingt federnd über das Ziel hinaus und zurück. Eine Auswahl:</w:t>
+      </w:r>
+    </w:p>
+    <w:p>
+      <w:pPr>
+        <w:pStyle w:val="ListParagraph"/>
+        <w:numPr>
+          <w:ilvl w:val="0"/>
+          <w:numId w:val="2"/>
+        </w:numPr>
+        <w:spacing w:after="100" w:line="312" w:lineRule="auto"/>
+      </w:pPr>
+      <w:r>
+        <w:rPr>
+          <w:b/>
+          <w:bCs/>
+          <w:sz w:val="22"/>
+          <w:szCs w:val="22"/>
+        </w:rPr>
+        <w:t xml:space="preserve">linear  </w:t>
+      </w:r>
+      <w:r>
+        <w:rPr>
+          <w:sz w:val="22"/>
+          <w:szCs w:val="22"/>
+        </w:rPr>
+        <w:t xml:space="preserve">– konstante Geschwindigkeit</w:t>
+      </w:r>
+    </w:p>
+    <w:p>
+      <w:pPr>
+        <w:pStyle w:val="ListParagraph"/>
+        <w:numPr>
+          <w:ilvl w:val="0"/>
+          <w:numId w:val="2"/>
+        </w:numPr>
+        <w:spacing w:after="100" w:line="312" w:lineRule="auto"/>
+      </w:pPr>
+      <w:r>
+        <w:rPr>
+          <w:b/>
+          <w:bCs/>
+          <w:sz w:val="22"/>
+          <w:szCs w:val="22"/>
+        </w:rPr>
+        <w:t xml:space="preserve">out_quad · out_cubic  </w:t>
+      </w:r>
+      <w:r>
+        <w:rPr>
+          <w:sz w:val="22"/>
+          <w:szCs w:val="22"/>
+        </w:rPr>
+        <w:t xml:space="preserve">– weiches Abbremsen am Ende</w:t>
+      </w:r>
+    </w:p>
+    <w:p>
+      <w:pPr>
+        <w:pStyle w:val="ListParagraph"/>
+        <w:numPr>
+          <w:ilvl w:val="0"/>
+          <w:numId w:val="2"/>
+        </w:numPr>
+        <w:spacing w:after="100" w:line="312" w:lineRule="auto"/>
+      </w:pPr>
+      <w:r>
+        <w:rPr>
+          <w:b/>
+          <w:bCs/>
+          <w:sz w:val="22"/>
+          <w:szCs w:val="22"/>
+        </w:rPr>
+        <w:t xml:space="preserve">inout_sine  </w:t>
+      </w:r>
+      <w:r>
+        <w:rPr>
+          <w:sz w:val="22"/>
+          <w:szCs w:val="22"/>
+        </w:rPr>
+        <w:t xml:space="preserve">– sanft an und ab (ideal für Wippen/Atmen)</w:t>
+      </w:r>
+    </w:p>
+    <w:p>
+      <w:pPr>
+        <w:pStyle w:val="ListParagraph"/>
+        <w:numPr>
+          <w:ilvl w:val="0"/>
+          <w:numId w:val="2"/>
+        </w:numPr>
+        <w:spacing w:after="100" w:line="312" w:lineRule="auto"/>
+      </w:pPr>
+      <w:r>
+        <w:rPr>
+          <w:b/>
+          <w:bCs/>
+          <w:sz w:val="22"/>
+          <w:szCs w:val="22"/>
+        </w:rPr>
+        <w:t xml:space="preserve">out_bounce  </w:t>
+      </w:r>
+      <w:r>
+        <w:rPr>
+          <w:sz w:val="22"/>
+          <w:szCs w:val="22"/>
+        </w:rPr>
+        <w:t xml:space="preserve">– hüpft am Ende aus wie ein Ball</w:t>
+      </w:r>
+    </w:p>
+    <w:p>
+      <w:pPr>
+        <w:pStyle w:val="ListParagraph"/>
+        <w:numPr>
+          <w:ilvl w:val="0"/>
+          <w:numId w:val="2"/>
+        </w:numPr>
+        <w:spacing w:after="100" w:line="312" w:lineRule="auto"/>
+      </w:pPr>
+      <w:r>
+        <w:rPr>
+          <w:b/>
+          <w:bCs/>
+          <w:sz w:val="22"/>
+          <w:szCs w:val="22"/>
+        </w:rPr>
+        <w:t xml:space="preserve">out_elastic  </w:t>
+      </w:r>
+      <w:r>
+        <w:rPr>
+          <w:sz w:val="22"/>
+          <w:szCs w:val="22"/>
+        </w:rPr>
+        <w:t xml:space="preserve">– federt über das Ziel hinaus und schwingt zurück</w:t>
+      </w:r>
+    </w:p>
+    <w:p>
+      <w:pPr>
+        <w:pStyle w:val="Heading2"/>
+        <w:keepNext/>
+        <w:keepLines/>
+        <w:spacing w:after="120" w:before="280"/>
+      </w:pPr>
+      <w:r>
+        <w:t xml:space="preserve">Im Game-Loop</w:t>
+      </w:r>
+    </w:p>
+    <w:p>
+      <w:pPr>
+        <w:spacing w:after="180" w:line="312" w:lineRule="auto"/>
+      </w:pPr>
+      <w:r>
+        <w:rPr>
+          <w:sz w:val="22"/>
+          <w:szCs w:val="22"/>
+        </w:rPr>
+        <w:t xml:space="preserve">Ein typisches Beispiel: ein Banner, das von oben hereinfliegt und am Ziel weich abbremst:</w:t>
+      </w:r>
+    </w:p>
+    <w:p>
+      <w:pPr>
+        <w:keepLines/>
+        <w:pBdr>
+          <w:left w:val="single" w:color="1B6CA8" w:sz="18" w:space="6"/>
+        </w:pBdr>
+        <w:shd w:fill="F4F4F4" w:val="clear"/>
+        <w:spacing w:after="200" w:before="100" w:line="264" w:lineRule="auto"/>
+        <w:ind w:left="140"/>
+      </w:pPr>
+      <w:r>
+        <w:rPr>
+          <w:rFonts w:ascii="Consolas" w:cs="Consolas" w:eastAsia="Consolas" w:hAnsi="Consolas"/>
+          <w:sz w:val="19"/>
+          <w:szCs w:val="19"/>
+        </w:rPr>
+        <w:t xml:space="preserve">IMPORT "tween"</w:t>
+      </w:r>
+      <w:r>
+        <w:rPr>
+          <w:rFonts w:ascii="Consolas" w:cs="Consolas" w:eastAsia="Consolas" w:hAnsi="Consolas"/>
+          <w:sz w:val="19"/>
+          <w:szCs w:val="19"/>
+        </w:rPr>
+        <w:br/>
+        <w:t xml:space="preserve">SCREEN(480, 320)</w:t>
+      </w:r>
+      <w:r>
+        <w:rPr>
+          <w:rFonts w:ascii="Consolas" w:cs="Consolas" w:eastAsia="Consolas" w:hAnsi="Consolas"/>
+          <w:sz w:val="19"/>
+          <w:szCs w:val="19"/>
+        </w:rPr>
+        <w:br/>
+        <w:t xml:space="preserve">DIM banner AS TWEEN</w:t>
+      </w:r>
+      <w:r>
+        <w:rPr>
+          <w:rFonts w:ascii="Consolas" w:cs="Consolas" w:eastAsia="Consolas" w:hAnsi="Consolas"/>
+          <w:sz w:val="19"/>
+          <w:szCs w:val="19"/>
+        </w:rPr>
+        <w:br/>
+        <w:t xml:space="preserve">banner = TWEEN_NEW(-40.0, 80.0, 700, "out_quad")   ' y: -40 -&gt; 80</w:t>
+      </w:r>
+      <w:r>
+        <w:rPr>
+          <w:rFonts w:ascii="Consolas" w:cs="Consolas" w:eastAsia="Consolas" w:hAnsi="Consolas"/>
+          <w:sz w:val="19"/>
+          <w:szCs w:val="19"/>
+        </w:rPr>
+        <w:br/>
+        <w:t xml:space="preserve"/>
+      </w:r>
+      <w:r>
+        <w:rPr>
+          <w:rFonts w:ascii="Consolas" w:cs="Consolas" w:eastAsia="Consolas" w:hAnsi="Consolas"/>
+          <w:sz w:val="19"/>
+          <w:szCs w:val="19"/>
+        </w:rPr>
+        <w:br/>
+        <w:t xml:space="preserve">WHILE NOT QUITREQUESTED()</w:t>
+      </w:r>
+      <w:r>
+        <w:rPr>
+          <w:rFonts w:ascii="Consolas" w:cs="Consolas" w:eastAsia="Consolas" w:hAnsi="Consolas"/>
+          <w:sz w:val="19"/>
+          <w:szCs w:val="19"/>
+        </w:rPr>
+        <w:br/>
+        <w:t xml:space="preserve">    DIM y AS INTEGER</w:t>
+      </w:r>
+      <w:r>
+        <w:rPr>
+          <w:rFonts w:ascii="Consolas" w:cs="Consolas" w:eastAsia="Consolas" w:hAnsi="Consolas"/>
+          <w:sz w:val="19"/>
+          <w:szCs w:val="19"/>
+        </w:rPr>
+        <w:br/>
+        <w:t xml:space="preserve">    y = INT(TWEEN_VALUE(banner))</w:t>
+      </w:r>
+      <w:r>
+        <w:rPr>
+          <w:rFonts w:ascii="Consolas" w:cs="Consolas" w:eastAsia="Consolas" w:hAnsi="Consolas"/>
+          <w:sz w:val="19"/>
+          <w:szCs w:val="19"/>
+        </w:rPr>
+        <w:br/>
+        <w:t xml:space="preserve">    CLS(RGB(24, 28, 44))</w:t>
+      </w:r>
+      <w:r>
+        <w:rPr>
+          <w:rFonts w:ascii="Consolas" w:cs="Consolas" w:eastAsia="Consolas" w:hAnsi="Consolas"/>
+          <w:sz w:val="19"/>
+          <w:szCs w:val="19"/>
+        </w:rPr>
+        <w:br/>
+        <w:t xml:space="preserve">    BOXROUND(140, y, 340, y + 40, 10, RGB(255, 180, 40))</w:t>
+      </w:r>
+      <w:r>
+        <w:rPr>
+          <w:rFonts w:ascii="Consolas" w:cs="Consolas" w:eastAsia="Consolas" w:hAnsi="Consolas"/>
+          <w:sz w:val="19"/>
+          <w:szCs w:val="19"/>
+        </w:rPr>
+        <w:br/>
+        <w:t xml:space="preserve">    TEXT(170, y + 14, "LEVEL 1", BLACK)</w:t>
+      </w:r>
+      <w:r>
+        <w:rPr>
+          <w:rFonts w:ascii="Consolas" w:cs="Consolas" w:eastAsia="Consolas" w:hAnsi="Consolas"/>
+          <w:sz w:val="19"/>
+          <w:szCs w:val="19"/>
+        </w:rPr>
+        <w:br/>
+        <w:t xml:space="preserve">    FLIP()</w:t>
+      </w:r>
+      <w:r>
+        <w:rPr>
+          <w:rFonts w:ascii="Consolas" w:cs="Consolas" w:eastAsia="Consolas" w:hAnsi="Consolas"/>
+          <w:sz w:val="19"/>
+          <w:szCs w:val="19"/>
+        </w:rPr>
+        <w:br/>
+        <w:t xml:space="preserve">WEND</w:t>
+      </w:r>
+    </w:p>
+    <w:p>
+      <w:pPr>
+        <w:spacing w:before="60"/>
+      </w:pPr>
+    </w:p>
+    <w:tbl>
+      <w:tblPr>
+        <w:tblW w:type="dxa" w:w="9360"/>
+        <w:tblBorders>
+          <w:top w:val="single" w:color="auto" w:sz="4"/>
+          <w:left w:val="single" w:color="auto" w:sz="4"/>
+          <w:bottom w:val="single" w:color="auto" w:sz="4"/>
+          <w:right w:val="single" w:color="auto" w:sz="4"/>
+          <w:insideH w:val="single" w:color="auto" w:sz="4"/>
+          <w:insideV w:val="single" w:color="auto" w:sz="4"/>
+        </w:tblBorders>
+      </w:tblPr>
+      <w:tblGrid>
+        <w:gridCol w:w="9360"/>
+      </w:tblGrid>
+      <w:tr>
+        <w:trPr>
+          <w:cantSplit/>
+        </w:trPr>
+        <w:tc>
+          <w:tcPr>
+            <w:tcW w:type="dxa" w:w="9360"/>
+            <w:tcBorders>
+              <w:top w:val="single" w:color="9CC8E6" w:sz="6"/>
+              <w:left w:val="single" w:color="9CC8E6" w:sz="6"/>
+              <w:bottom w:val="single" w:color="9CC8E6" w:sz="6"/>
+              <w:right w:val="single" w:color="9CC8E6" w:sz="6"/>
+            </w:tcBorders>
+            <w:shd w:fill="E7F2FA" w:val="clear"/>
+            <w:tcMar>
+              <w:top w:type="dxa" w:w="140"/>
+              <w:left w:type="dxa" w:w="180"/>
+              <w:bottom w:type="dxa" w:w="140"/>
+              <w:right w:type="dxa" w:w="180"/>
+            </w:tcMar>
+          </w:tcPr>
+          <w:p>
+            <w:pPr>
+              <w:spacing w:after="40"/>
+            </w:pPr>
+            <w:r>
+              <w:rPr>
+                <w:b/>
+                <w:bCs/>
+                <w:color w:val="1B6CA8"/>
+                <w:sz w:val="22"/>
+                <w:szCs w:val="22"/>
+              </w:rPr>
+              <w:t xml:space="preserve">tween oder curves?</w:t>
+            </w:r>
+          </w:p>
+          <w:p>
+            <w:pPr>
+              <w:spacing w:after="0" w:line="312" w:lineRule="auto"/>
+            </w:pPr>
+            <w:r>
+              <w:rPr>
+                <w:sz w:val="22"/>
+                <w:szCs w:val="22"/>
+              </w:rPr>
+              <w:t xml:space="preserve">tween ist zeitbasiert: „bewege diesen Wert in 700 ms“. Brauchst du stattdessen eine Kurve, die du selbst über einen Parameter steuerst (etwa eine Flugbahn entlang von Stützpunkten), schau dir das Modul curves an – es liefert die reinen Kurven-Funktionen ohne eigene Zeitsteuerung.</w:t>
             </w:r>
           </w:p>
         </w:tc>

</xml_diff>

<commit_message>
docs(buch): Lehrbuch Kap 53 -- Modul timer (Konsole)
TIMER_AFTER/EVERY (FUNCREF-Callbacks) + TIMER_UPDATE (pro Frame), TIMER_CANCEL/
ACTIVE/COUNT/CLEAR, COOLDOWN (String-ID-Ratenbegrenzer, kein UPDATE noetig).
Konsolentauglich -> kein Screenshot; Konsolen-Beispiele gegen gbrt verifiziert.

Co-Authored-By: Claude Opus 4.8 (1M context) <noreply@anthropic.com>
</commit_message>
<xml_diff>
--- a/buch-referenz/buch/GameBasic-Lehrbuch.docx
+++ b/buch-referenz/buch/GameBasic-Lehrbuch.docx
@@ -1380,6 +1380,33 @@
           <w:szCs w:val="22"/>
         </w:rPr>
         <w:t xml:space="preserve">	178</w:t>
+      </w:r>
+    </w:p>
+    <w:p>
+      <w:pPr>
+        <w:tabs>
+          <w:tab w:val="right" w:pos="9200" w:leader="dot"/>
+        </w:tabs>
+        <w:spacing w:after="20" w:before="0"/>
+        <w:ind w:left="280"/>
+      </w:pPr>
+      <w:r>
+        <w:rPr>
+          <w:b w:val="false"/>
+          <w:bCs w:val="false"/>
+          <w:color w:val="222222"/>
+          <w:sz w:val="22"/>
+          <w:szCs w:val="22"/>
+        </w:rPr>
+        <w:t xml:space="preserve">Modul: timer</w:t>
+      </w:r>
+      <w:r>
+        <w:rPr>
+          <w:color w:val="555555"/>
+          <w:sz w:val="22"/>
+          <w:szCs w:val="22"/>
+        </w:rPr>
+        <w:t xml:space="preserve">	181</w:t>
       </w:r>
     </w:p>
     <w:p>
@@ -59937,6 +59964,967 @@
                 <w:szCs w:val="22"/>
               </w:rPr>
               <w:t xml:space="preserve">tween ist zeitbasiert: „bewege diesen Wert in 700 ms“. Brauchst du stattdessen eine Kurve, die du selbst über einen Parameter steuerst (etwa eine Flugbahn entlang von Stützpunkten), schau dir das Modul curves an – es liefert die reinen Kurven-Funktionen ohne eigene Zeitsteuerung.</w:t>
+            </w:r>
+          </w:p>
+        </w:tc>
+      </w:tr>
+    </w:tbl>
+    <w:p>
+      <w:pPr>
+        <w:spacing w:after="160"/>
+      </w:pPr>
+    </w:p>
+    <w:p>
+      <w:pPr>
+        <w:pStyle w:val="Heading1"/>
+        <w:keepNext/>
+        <w:keepLines/>
+        <w:pageBreakBefore/>
+        <w:pBdr>
+          <w:bottom w:val="single" w:color="1B6CA8" w:sz="12" w:space="4"/>
+        </w:pBdr>
+        <w:spacing w:after="160" w:before="0"/>
+      </w:pPr>
+      <w:r>
+        <w:t xml:space="preserve">Modul: timer</w:t>
+      </w:r>
+    </w:p>
+    <w:p>
+      <w:pPr>
+        <w:spacing w:after="180" w:line="312" w:lineRule="auto"/>
+      </w:pPr>
+      <w:r>
+        <w:rPr>
+          <w:sz w:val="22"/>
+          <w:szCs w:val="22"/>
+        </w:rPr>
+        <w:t xml:space="preserve">Oft soll etwas nach einer Weile passieren („in 2 Sekunden explodieren“) oder regelmäßig („alle halbe Sekunde einen Gegner spawnen“). Das könntest du mit MILLIS und eigener Buchführung lösen – das timer-Modul nimmt dir das ab. Du gibst ihm eine Funktion und eine Zeit, und es ruft die Funktion zum richtigen Zeitpunkt auf. Dazu kommt COOLDOWN, ein einzeiliger Ratenbegrenzer. Das Modul ist rein logisch – es braucht kein Grafikfenster.</w:t>
+      </w:r>
+    </w:p>
+    <w:p>
+      <w:pPr>
+        <w:spacing w:after="180" w:line="312" w:lineRule="auto"/>
+      </w:pPr>
+      <w:r>
+        <w:rPr>
+          <w:sz w:val="22"/>
+          <w:szCs w:val="22"/>
+        </w:rPr>
+        <w:t xml:space="preserve">Die Funktionen, die ein Timer aufruft, übergibst du als FUNCREF (Kapitel „Funktionen &amp; SUBs“) – also einfach als Funktionsnamen ohne Klammern. Solche Callback-Funktionen haben keine Parameter.</w:t>
+      </w:r>
+    </w:p>
+    <w:p>
+      <w:pPr>
+        <w:pStyle w:val="Heading2"/>
+        <w:keepNext/>
+        <w:keepLines/>
+        <w:spacing w:after="120" w:before="280"/>
+      </w:pPr>
+      <w:r>
+        <w:t xml:space="preserve">Geplante Aufrufe</w:t>
+      </w:r>
+    </w:p>
+    <w:p>
+      <w:pPr>
+        <w:keepNext/>
+        <w:keepLines/>
+        <w:pBdr>
+          <w:bottom w:val="single" w:color="DDD0C0" w:sz="4" w:space="2"/>
+        </w:pBdr>
+        <w:spacing w:after="40" w:before="360"/>
+      </w:pPr>
+      <w:r>
+        <w:rPr>
+          <w:rFonts w:ascii="Consolas" w:cs="Consolas" w:eastAsia="Consolas" w:hAnsi="Consolas"/>
+          <w:b/>
+          <w:bCs/>
+          <w:color w:val="9A3412"/>
+          <w:sz w:val="24"/>
+          <w:szCs w:val="24"/>
+        </w:rPr>
+        <w:t xml:space="preserve">TIMER_AFTER · TIMER_EVERY</w:t>
+      </w:r>
+    </w:p>
+    <w:p>
+      <w:pPr>
+        <w:keepNext/>
+        <w:spacing w:after="120"/>
+      </w:pPr>
+      <w:r>
+        <w:rPr>
+          <w:b/>
+          <w:bCs/>
+          <w:color w:val="6A6A6A"/>
+          <w:sz w:val="18"/>
+          <w:szCs w:val="18"/>
+        </w:rPr>
+        <w:t xml:space="preserve">Syntax:  </w:t>
+      </w:r>
+      <w:r>
+        <w:rPr>
+          <w:rFonts w:ascii="Consolas" w:cs="Consolas" w:eastAsia="Consolas" w:hAnsi="Consolas"/>
+          <w:color w:val="335577"/>
+          <w:sz w:val="19"/>
+          <w:szCs w:val="19"/>
+        </w:rPr>
+        <w:t xml:space="preserve">TIMER_AFTER(ms, fn)   TIMER_EVERY(ms, fn)</w:t>
+      </w:r>
+    </w:p>
+    <w:p>
+      <w:pPr>
+        <w:spacing w:after="180" w:line="312" w:lineRule="auto"/>
+      </w:pPr>
+      <w:r>
+        <w:rPr>
+          <w:sz w:val="22"/>
+          <w:szCs w:val="22"/>
+        </w:rPr>
+        <w:t xml:space="preserve">TIMER_AFTER ruft die Funktion fn einmalig nach ms Millisekunden auf. TIMER_EVERY ruft sie immer wieder alle ms. Beide liefern eine Timer-ID zurück, mit der du den Timer später abfragen oder abbrechen kannst.</w:t>
+      </w:r>
+    </w:p>
+    <w:p>
+      <w:pPr>
+        <w:keepNext/>
+        <w:spacing w:after="30" w:before="120"/>
+      </w:pPr>
+      <w:r>
+        <w:rPr>
+          <w:b/>
+          <w:bCs/>
+          <w:i/>
+          <w:iCs/>
+          <w:color w:val="6A6A6A"/>
+          <w:sz w:val="18"/>
+          <w:szCs w:val="18"/>
+        </w:rPr>
+        <w:t xml:space="preserve">Beispiel</w:t>
+      </w:r>
+    </w:p>
+    <w:p>
+      <w:pPr>
+        <w:keepLines/>
+        <w:pBdr>
+          <w:left w:val="single" w:color="1B6CA8" w:sz="18" w:space="6"/>
+        </w:pBdr>
+        <w:shd w:fill="F4F4F4" w:val="clear"/>
+        <w:spacing w:after="200" w:before="100" w:line="264" w:lineRule="auto"/>
+        <w:ind w:left="140"/>
+      </w:pPr>
+      <w:r>
+        <w:rPr>
+          <w:rFonts w:ascii="Consolas" w:cs="Consolas" w:eastAsia="Consolas" w:hAnsi="Consolas"/>
+          <w:sz w:val="19"/>
+          <w:szCs w:val="19"/>
+        </w:rPr>
+        <w:t xml:space="preserve">IMPORT "timer"</w:t>
+      </w:r>
+      <w:r>
+        <w:rPr>
+          <w:rFonts w:ascii="Consolas" w:cs="Consolas" w:eastAsia="Consolas" w:hAnsi="Consolas"/>
+          <w:sz w:val="19"/>
+          <w:szCs w:val="19"/>
+        </w:rPr>
+        <w:br/>
+        <w:t xml:space="preserve">SUB explodiere()</w:t>
+      </w:r>
+      <w:r>
+        <w:rPr>
+          <w:rFonts w:ascii="Consolas" w:cs="Consolas" w:eastAsia="Consolas" w:hAnsi="Consolas"/>
+          <w:sz w:val="19"/>
+          <w:szCs w:val="19"/>
+        </w:rPr>
+        <w:br/>
+        <w:t xml:space="preserve">    PRINT "BOOM"</w:t>
+      </w:r>
+      <w:r>
+        <w:rPr>
+          <w:rFonts w:ascii="Consolas" w:cs="Consolas" w:eastAsia="Consolas" w:hAnsi="Consolas"/>
+          <w:sz w:val="19"/>
+          <w:szCs w:val="19"/>
+        </w:rPr>
+        <w:br/>
+        <w:t xml:space="preserve">END SUB</w:t>
+      </w:r>
+      <w:r>
+        <w:rPr>
+          <w:rFonts w:ascii="Consolas" w:cs="Consolas" w:eastAsia="Consolas" w:hAnsi="Consolas"/>
+          <w:sz w:val="19"/>
+          <w:szCs w:val="19"/>
+        </w:rPr>
+        <w:br/>
+        <w:t xml:space="preserve"/>
+      </w:r>
+      <w:r>
+        <w:rPr>
+          <w:rFonts w:ascii="Consolas" w:cs="Consolas" w:eastAsia="Consolas" w:hAnsi="Consolas"/>
+          <w:sz w:val="19"/>
+          <w:szCs w:val="19"/>
+        </w:rPr>
+        <w:br/>
+        <w:t xml:space="preserve">TIMER_AFTER(2000, explodiere)          ' einmal nach 2 s</w:t>
+      </w:r>
+      <w:r>
+        <w:rPr>
+          <w:rFonts w:ascii="Consolas" w:cs="Consolas" w:eastAsia="Consolas" w:hAnsi="Consolas"/>
+          <w:sz w:val="19"/>
+          <w:szCs w:val="19"/>
+        </w:rPr>
+        <w:br/>
+        <w:t xml:space="preserve">DIM spawner AS INTEGER</w:t>
+      </w:r>
+      <w:r>
+        <w:rPr>
+          <w:rFonts w:ascii="Consolas" w:cs="Consolas" w:eastAsia="Consolas" w:hAnsi="Consolas"/>
+          <w:sz w:val="19"/>
+          <w:szCs w:val="19"/>
+        </w:rPr>
+        <w:br/>
+        <w:t xml:space="preserve">spawner = TIMER_EVERY(500, spawne)     ' alle 0,5 s</w:t>
+      </w:r>
+    </w:p>
+    <w:p>
+      <w:pPr>
+        <w:pStyle w:val="Heading2"/>
+        <w:keepNext/>
+        <w:keepLines/>
+        <w:spacing w:after="120" w:before="280"/>
+      </w:pPr>
+      <w:r>
+        <w:t xml:space="preserve">Pro Frame fällige Timer feuern</w:t>
+      </w:r>
+    </w:p>
+    <w:p>
+      <w:pPr>
+        <w:keepNext/>
+        <w:keepLines/>
+        <w:pBdr>
+          <w:bottom w:val="single" w:color="DDD0C0" w:sz="4" w:space="2"/>
+        </w:pBdr>
+        <w:spacing w:after="40" w:before="360"/>
+      </w:pPr>
+      <w:r>
+        <w:rPr>
+          <w:rFonts w:ascii="Consolas" w:cs="Consolas" w:eastAsia="Consolas" w:hAnsi="Consolas"/>
+          <w:b/>
+          <w:bCs/>
+          <w:color w:val="9A3412"/>
+          <w:sz w:val="24"/>
+          <w:szCs w:val="24"/>
+        </w:rPr>
+        <w:t xml:space="preserve">TIMER_UPDATE</w:t>
+      </w:r>
+    </w:p>
+    <w:p>
+      <w:pPr>
+        <w:keepNext/>
+        <w:spacing w:after="120"/>
+      </w:pPr>
+      <w:r>
+        <w:rPr>
+          <w:b/>
+          <w:bCs/>
+          <w:color w:val="6A6A6A"/>
+          <w:sz w:val="18"/>
+          <w:szCs w:val="18"/>
+        </w:rPr>
+        <w:t xml:space="preserve">Syntax:  </w:t>
+      </w:r>
+      <w:r>
+        <w:rPr>
+          <w:rFonts w:ascii="Consolas" w:cs="Consolas" w:eastAsia="Consolas" w:hAnsi="Consolas"/>
+          <w:color w:val="335577"/>
+          <w:sz w:val="19"/>
+          <w:szCs w:val="19"/>
+        </w:rPr>
+        <w:t xml:space="preserve">TIMER_UPDATE()</w:t>
+      </w:r>
+    </w:p>
+    <w:p>
+      <w:pPr>
+        <w:spacing w:after="180" w:line="312" w:lineRule="auto"/>
+      </w:pPr>
+      <w:r>
+        <w:rPr>
+          <w:sz w:val="22"/>
+          <w:szCs w:val="22"/>
+        </w:rPr>
+        <w:t xml:space="preserve">Muss einmal pro Frame (im Game-Loop) aufgerufen werden – erst dann werden fällige Callbacks tatsächlich ausgeführt. Dasselbe Muster wie INPUT_UPDATE() oder GUI_UPDATE(). Ohne TIMER_UPDATE feuert kein Timer.</w:t>
+      </w:r>
+    </w:p>
+    <w:p>
+      <w:pPr>
+        <w:keepNext/>
+        <w:spacing w:after="30" w:before="120"/>
+      </w:pPr>
+      <w:r>
+        <w:rPr>
+          <w:b/>
+          <w:bCs/>
+          <w:i/>
+          <w:iCs/>
+          <w:color w:val="6A6A6A"/>
+          <w:sz w:val="18"/>
+          <w:szCs w:val="18"/>
+        </w:rPr>
+        <w:t xml:space="preserve">Beispiel</w:t>
+      </w:r>
+    </w:p>
+    <w:p>
+      <w:pPr>
+        <w:keepLines/>
+        <w:pBdr>
+          <w:left w:val="single" w:color="1B6CA8" w:sz="18" w:space="6"/>
+        </w:pBdr>
+        <w:shd w:fill="F4F4F4" w:val="clear"/>
+        <w:spacing w:after="200" w:before="100" w:line="264" w:lineRule="auto"/>
+        <w:ind w:left="140"/>
+      </w:pPr>
+      <w:r>
+        <w:rPr>
+          <w:rFonts w:ascii="Consolas" w:cs="Consolas" w:eastAsia="Consolas" w:hAnsi="Consolas"/>
+          <w:sz w:val="19"/>
+          <w:szCs w:val="19"/>
+        </w:rPr>
+        <w:t xml:space="preserve">WHILE NOT QUITREQUESTED()</w:t>
+      </w:r>
+      <w:r>
+        <w:rPr>
+          <w:rFonts w:ascii="Consolas" w:cs="Consolas" w:eastAsia="Consolas" w:hAnsi="Consolas"/>
+          <w:sz w:val="19"/>
+          <w:szCs w:val="19"/>
+        </w:rPr>
+        <w:br/>
+        <w:t xml:space="preserve">    TIMER_UPDATE()        ' fällige Timer jetzt feuern</w:t>
+      </w:r>
+      <w:r>
+        <w:rPr>
+          <w:rFonts w:ascii="Consolas" w:cs="Consolas" w:eastAsia="Consolas" w:hAnsi="Consolas"/>
+          <w:sz w:val="19"/>
+          <w:szCs w:val="19"/>
+        </w:rPr>
+        <w:br/>
+        <w:t xml:space="preserve">    ' ... Spiel ...</w:t>
+      </w:r>
+      <w:r>
+        <w:rPr>
+          <w:rFonts w:ascii="Consolas" w:cs="Consolas" w:eastAsia="Consolas" w:hAnsi="Consolas"/>
+          <w:sz w:val="19"/>
+          <w:szCs w:val="19"/>
+        </w:rPr>
+        <w:br/>
+        <w:t xml:space="preserve">    FLIP()</w:t>
+      </w:r>
+      <w:r>
+        <w:rPr>
+          <w:rFonts w:ascii="Consolas" w:cs="Consolas" w:eastAsia="Consolas" w:hAnsi="Consolas"/>
+          <w:sz w:val="19"/>
+          <w:szCs w:val="19"/>
+        </w:rPr>
+        <w:br/>
+        <w:t xml:space="preserve">WEND</w:t>
+      </w:r>
+    </w:p>
+    <w:p>
+      <w:pPr>
+        <w:spacing w:before="60"/>
+      </w:pPr>
+    </w:p>
+    <w:tbl>
+      <w:tblPr>
+        <w:tblW w:type="dxa" w:w="9360"/>
+        <w:tblBorders>
+          <w:top w:val="single" w:color="auto" w:sz="4"/>
+          <w:left w:val="single" w:color="auto" w:sz="4"/>
+          <w:bottom w:val="single" w:color="auto" w:sz="4"/>
+          <w:right w:val="single" w:color="auto" w:sz="4"/>
+          <w:insideH w:val="single" w:color="auto" w:sz="4"/>
+          <w:insideV w:val="single" w:color="auto" w:sz="4"/>
+        </w:tblBorders>
+      </w:tblPr>
+      <w:tblGrid>
+        <w:gridCol w:w="9360"/>
+      </w:tblGrid>
+      <w:tr>
+        <w:trPr>
+          <w:cantSplit/>
+        </w:trPr>
+        <w:tc>
+          <w:tcPr>
+            <w:tcW w:type="dxa" w:w="9360"/>
+            <w:tcBorders>
+              <w:top w:val="single" w:color="E0B96A" w:sz="6"/>
+              <w:left w:val="single" w:color="E0B96A" w:sz="6"/>
+              <w:bottom w:val="single" w:color="E0B96A" w:sz="6"/>
+              <w:right w:val="single" w:color="E0B96A" w:sz="6"/>
+            </w:tcBorders>
+            <w:shd w:fill="FDF3E0" w:val="clear"/>
+            <w:tcMar>
+              <w:top w:type="dxa" w:w="140"/>
+              <w:left w:type="dxa" w:w="180"/>
+              <w:bottom w:type="dxa" w:w="140"/>
+              <w:right w:type="dxa" w:w="180"/>
+            </w:tcMar>
+          </w:tcPr>
+          <w:p>
+            <w:pPr>
+              <w:spacing w:after="40"/>
+            </w:pPr>
+            <w:r>
+              <w:rPr>
+                <w:b/>
+                <w:bCs/>
+                <w:color w:val="9A6A1E"/>
+                <w:sz w:val="22"/>
+                <w:szCs w:val="22"/>
+              </w:rPr>
+              <w:t xml:space="preserve">Merke</w:t>
+            </w:r>
+          </w:p>
+          <w:p>
+            <w:pPr>
+              <w:spacing w:after="0" w:line="312" w:lineRule="auto"/>
+            </w:pPr>
+            <w:r>
+              <w:rPr>
+                <w:sz w:val="22"/>
+                <w:szCs w:val="22"/>
+              </w:rPr>
+              <w:t xml:space="preserve">Ein TIMER_EVERY feuert pro TIMER_UPDATE höchstens einmal – es gibt also keinen „Aufhol-Stau“, wenn das Spiel mal kurz ruckelt. Außerhalb eines Grafik-Loops kannst du TIMER_UPDATE auch in einer eigenen Schleife (mit SLEEP) aufrufen.</w:t>
+            </w:r>
+          </w:p>
+        </w:tc>
+      </w:tr>
+    </w:tbl>
+    <w:p>
+      <w:pPr>
+        <w:spacing w:after="160"/>
+      </w:pPr>
+    </w:p>
+    <w:p>
+      <w:pPr>
+        <w:pStyle w:val="Heading2"/>
+        <w:keepNext/>
+        <w:keepLines/>
+        <w:spacing w:after="120" w:before="280"/>
+      </w:pPr>
+      <w:r>
+        <w:t xml:space="preserve">Timer verwalten</w:t>
+      </w:r>
+    </w:p>
+    <w:p>
+      <w:pPr>
+        <w:keepNext/>
+        <w:keepLines/>
+        <w:pBdr>
+          <w:bottom w:val="single" w:color="DDD0C0" w:sz="4" w:space="2"/>
+        </w:pBdr>
+        <w:spacing w:after="40" w:before="360"/>
+      </w:pPr>
+      <w:r>
+        <w:rPr>
+          <w:rFonts w:ascii="Consolas" w:cs="Consolas" w:eastAsia="Consolas" w:hAnsi="Consolas"/>
+          <w:b/>
+          <w:bCs/>
+          <w:color w:val="9A3412"/>
+          <w:sz w:val="24"/>
+          <w:szCs w:val="24"/>
+        </w:rPr>
+        <w:t xml:space="preserve">TIMER_CANCEL · TIMER_ACTIVE</w:t>
+      </w:r>
+    </w:p>
+    <w:p>
+      <w:pPr>
+        <w:keepNext/>
+        <w:spacing w:after="120"/>
+      </w:pPr>
+      <w:r>
+        <w:rPr>
+          <w:b/>
+          <w:bCs/>
+          <w:color w:val="6A6A6A"/>
+          <w:sz w:val="18"/>
+          <w:szCs w:val="18"/>
+        </w:rPr>
+        <w:t xml:space="preserve">Syntax:  </w:t>
+      </w:r>
+      <w:r>
+        <w:rPr>
+          <w:rFonts w:ascii="Consolas" w:cs="Consolas" w:eastAsia="Consolas" w:hAnsi="Consolas"/>
+          <w:color w:val="335577"/>
+          <w:sz w:val="19"/>
+          <w:szCs w:val="19"/>
+        </w:rPr>
+        <w:t xml:space="preserve">TIMER_CANCEL(id)   TIMER_ACTIVE(id)</w:t>
+      </w:r>
+    </w:p>
+    <w:p>
+      <w:pPr>
+        <w:spacing w:after="180" w:line="312" w:lineRule="auto"/>
+      </w:pPr>
+      <w:r>
+        <w:rPr>
+          <w:sz w:val="22"/>
+          <w:szCs w:val="22"/>
+        </w:rPr>
+        <w:t xml:space="preserve">TIMER_CANCEL bricht einen Timer über seine ID ab (eine bereits gefeuerte oder unbekannte ID schadet nicht). TIMER_ACTIVE prüft, ob ein Timer noch läuft.</w:t>
+      </w:r>
+    </w:p>
+    <w:p>
+      <w:pPr>
+        <w:keepNext/>
+        <w:spacing w:after="30" w:before="120"/>
+      </w:pPr>
+      <w:r>
+        <w:rPr>
+          <w:b/>
+          <w:bCs/>
+          <w:i/>
+          <w:iCs/>
+          <w:color w:val="6A6A6A"/>
+          <w:sz w:val="18"/>
+          <w:szCs w:val="18"/>
+        </w:rPr>
+        <w:t xml:space="preserve">Beispiel</w:t>
+      </w:r>
+    </w:p>
+    <w:p>
+      <w:pPr>
+        <w:keepLines/>
+        <w:pBdr>
+          <w:left w:val="single" w:color="1B6CA8" w:sz="18" w:space="6"/>
+        </w:pBdr>
+        <w:shd w:fill="F4F4F4" w:val="clear"/>
+        <w:spacing w:after="200" w:before="100" w:line="264" w:lineRule="auto"/>
+        <w:ind w:left="140"/>
+      </w:pPr>
+      <w:r>
+        <w:rPr>
+          <w:rFonts w:ascii="Consolas" w:cs="Consolas" w:eastAsia="Consolas" w:hAnsi="Consolas"/>
+          <w:sz w:val="19"/>
+          <w:szCs w:val="19"/>
+        </w:rPr>
+        <w:t xml:space="preserve">IF TIMER_ACTIVE(spawner) THEN TIMER_CANCEL(spawner)</w:t>
+      </w:r>
+    </w:p>
+    <w:p>
+      <w:pPr>
+        <w:keepNext/>
+        <w:keepLines/>
+        <w:pBdr>
+          <w:bottom w:val="single" w:color="DDD0C0" w:sz="4" w:space="2"/>
+        </w:pBdr>
+        <w:spacing w:after="40" w:before="360"/>
+      </w:pPr>
+      <w:r>
+        <w:rPr>
+          <w:rFonts w:ascii="Consolas" w:cs="Consolas" w:eastAsia="Consolas" w:hAnsi="Consolas"/>
+          <w:b/>
+          <w:bCs/>
+          <w:color w:val="9A3412"/>
+          <w:sz w:val="24"/>
+          <w:szCs w:val="24"/>
+        </w:rPr>
+        <w:t xml:space="preserve">TIMER_COUNT · TIMER_CLEAR</w:t>
+      </w:r>
+    </w:p>
+    <w:p>
+      <w:pPr>
+        <w:keepNext/>
+        <w:spacing w:after="120"/>
+      </w:pPr>
+      <w:r>
+        <w:rPr>
+          <w:b/>
+          <w:bCs/>
+          <w:color w:val="6A6A6A"/>
+          <w:sz w:val="18"/>
+          <w:szCs w:val="18"/>
+        </w:rPr>
+        <w:t xml:space="preserve">Syntax:  </w:t>
+      </w:r>
+      <w:r>
+        <w:rPr>
+          <w:rFonts w:ascii="Consolas" w:cs="Consolas" w:eastAsia="Consolas" w:hAnsi="Consolas"/>
+          <w:color w:val="335577"/>
+          <w:sz w:val="19"/>
+          <w:szCs w:val="19"/>
+        </w:rPr>
+        <w:t xml:space="preserve">TIMER_COUNT()   TIMER_CLEAR()</w:t>
+      </w:r>
+    </w:p>
+    <w:p>
+      <w:pPr>
+        <w:spacing w:after="180" w:line="312" w:lineRule="auto"/>
+      </w:pPr>
+      <w:r>
+        <w:rPr>
+          <w:sz w:val="22"/>
+          <w:szCs w:val="22"/>
+        </w:rPr>
+        <w:t xml:space="preserve">TIMER_COUNT liefert die Anzahl gerade laufender Timer. TIMER_CLEAR verwirft alle Timer (und Cooldowns) auf einmal – praktisch beim Szenenwechsel, damit keine Timer aus der alten Szene nachfeuern.</w:t>
+      </w:r>
+    </w:p>
+    <w:p>
+      <w:pPr>
+        <w:keepNext/>
+        <w:spacing w:after="30" w:before="120"/>
+      </w:pPr>
+      <w:r>
+        <w:rPr>
+          <w:b/>
+          <w:bCs/>
+          <w:i/>
+          <w:iCs/>
+          <w:color w:val="6A6A6A"/>
+          <w:sz w:val="18"/>
+          <w:szCs w:val="18"/>
+        </w:rPr>
+        <w:t xml:space="preserve">Beispiel</w:t>
+      </w:r>
+    </w:p>
+    <w:p>
+      <w:pPr>
+        <w:keepLines/>
+        <w:pBdr>
+          <w:left w:val="single" w:color="1B6CA8" w:sz="18" w:space="6"/>
+        </w:pBdr>
+        <w:shd w:fill="F4F4F4" w:val="clear"/>
+        <w:spacing w:after="200" w:before="100" w:line="264" w:lineRule="auto"/>
+        <w:ind w:left="140"/>
+      </w:pPr>
+      <w:r>
+        <w:rPr>
+          <w:rFonts w:ascii="Consolas" w:cs="Consolas" w:eastAsia="Consolas" w:hAnsi="Consolas"/>
+          <w:sz w:val="19"/>
+          <w:szCs w:val="19"/>
+        </w:rPr>
+        <w:t xml:space="preserve">PRINT TIMER_COUNT()      ' z. B. 1</w:t>
+      </w:r>
+      <w:r>
+        <w:rPr>
+          <w:rFonts w:ascii="Consolas" w:cs="Consolas" w:eastAsia="Consolas" w:hAnsi="Consolas"/>
+          <w:sz w:val="19"/>
+          <w:szCs w:val="19"/>
+        </w:rPr>
+        <w:br/>
+        <w:t xml:space="preserve">TIMER_CLEAR()            ' alles zurücksetzen</w:t>
+      </w:r>
+    </w:p>
+    <w:p>
+      <w:pPr>
+        <w:pStyle w:val="Heading2"/>
+        <w:keepNext/>
+        <w:keepLines/>
+        <w:spacing w:after="120" w:before="280"/>
+      </w:pPr>
+      <w:r>
+        <w:t xml:space="preserve">Ratenbegrenzer: COOLDOWN</w:t>
+      </w:r>
+    </w:p>
+    <w:p>
+      <w:pPr>
+        <w:spacing w:after="180" w:line="312" w:lineRule="auto"/>
+      </w:pPr>
+      <w:r>
+        <w:rPr>
+          <w:sz w:val="22"/>
+          <w:szCs w:val="22"/>
+        </w:rPr>
+        <w:t xml:space="preserve">COOLDOWN ist ein eigenständiges Mini-Werkzeug für „nicht öfter als alle X Millisekunden“. Es gibt TRUE zurück, wenn die Aktion gerade erlaubt ist (und startet dann die Sperre), sonst FALSE. Identifiziert wird jede Sperre über eine frei wählbare Text-ID. Anders als die Timer braucht COOLDOWN kein TIMER_UPDATE – die Prüfung passiert beim Aufruf.</w:t>
+      </w:r>
+    </w:p>
+    <w:p>
+      <w:pPr>
+        <w:keepNext/>
+        <w:keepLines/>
+        <w:pBdr>
+          <w:bottom w:val="single" w:color="DDD0C0" w:sz="4" w:space="2"/>
+        </w:pBdr>
+        <w:spacing w:after="40" w:before="360"/>
+      </w:pPr>
+      <w:r>
+        <w:rPr>
+          <w:rFonts w:ascii="Consolas" w:cs="Consolas" w:eastAsia="Consolas" w:hAnsi="Consolas"/>
+          <w:b/>
+          <w:bCs/>
+          <w:color w:val="9A3412"/>
+          <w:sz w:val="24"/>
+          <w:szCs w:val="24"/>
+        </w:rPr>
+        <w:t xml:space="preserve">COOLDOWN</w:t>
+      </w:r>
+    </w:p>
+    <w:p>
+      <w:pPr>
+        <w:keepNext/>
+        <w:spacing w:after="120"/>
+      </w:pPr>
+      <w:r>
+        <w:rPr>
+          <w:b/>
+          <w:bCs/>
+          <w:color w:val="6A6A6A"/>
+          <w:sz w:val="18"/>
+          <w:szCs w:val="18"/>
+        </w:rPr>
+        <w:t xml:space="preserve">Syntax:  </w:t>
+      </w:r>
+      <w:r>
+        <w:rPr>
+          <w:rFonts w:ascii="Consolas" w:cs="Consolas" w:eastAsia="Consolas" w:hAnsi="Consolas"/>
+          <w:color w:val="335577"/>
+          <w:sz w:val="19"/>
+          <w:szCs w:val="19"/>
+        </w:rPr>
+        <w:t xml:space="preserve">COOLDOWN(id$, ms)</w:t>
+      </w:r>
+    </w:p>
+    <w:p>
+      <w:pPr>
+        <w:spacing w:after="180" w:line="312" w:lineRule="auto"/>
+      </w:pPr>
+      <w:r>
+        <w:rPr>
+          <w:sz w:val="22"/>
+          <w:szCs w:val="22"/>
+        </w:rPr>
+        <w:t xml:space="preserve">Liefert TRUE, wenn seit dem letzten erlaubten Aufruf mit dieser id mindestens ms vergangen sind (und merkt sich dann den neuen Zeitpunkt), sonst FALSE. Ideal für Schussfrequenz, Trefferton-Spam-Schutz und Ähnliches.</w:t>
+      </w:r>
+    </w:p>
+    <w:p>
+      <w:pPr>
+        <w:keepNext/>
+        <w:spacing w:after="30" w:before="120"/>
+      </w:pPr>
+      <w:r>
+        <w:rPr>
+          <w:b/>
+          <w:bCs/>
+          <w:i/>
+          <w:iCs/>
+          <w:color w:val="6A6A6A"/>
+          <w:sz w:val="18"/>
+          <w:szCs w:val="18"/>
+        </w:rPr>
+        <w:t xml:space="preserve">Beispiel</w:t>
+      </w:r>
+    </w:p>
+    <w:p>
+      <w:pPr>
+        <w:keepLines/>
+        <w:pBdr>
+          <w:left w:val="single" w:color="1B6CA8" w:sz="18" w:space="6"/>
+        </w:pBdr>
+        <w:shd w:fill="F4F4F4" w:val="clear"/>
+        <w:spacing w:after="200" w:before="100" w:line="264" w:lineRule="auto"/>
+        <w:ind w:left="140"/>
+      </w:pPr>
+      <w:r>
+        <w:rPr>
+          <w:rFonts w:ascii="Consolas" w:cs="Consolas" w:eastAsia="Consolas" w:hAnsi="Consolas"/>
+          <w:sz w:val="19"/>
+          <w:szCs w:val="19"/>
+        </w:rPr>
+        <w:t xml:space="preserve">IF INPUT_HELD("fire") AND COOLDOWN("schuss", 250) THEN</w:t>
+      </w:r>
+      <w:r>
+        <w:rPr>
+          <w:rFonts w:ascii="Consolas" w:cs="Consolas" w:eastAsia="Consolas" w:hAnsi="Consolas"/>
+          <w:sz w:val="19"/>
+          <w:szCs w:val="19"/>
+        </w:rPr>
+        <w:br/>
+        <w:t xml:space="preserve">    ' höchstens alle 250 ms ein Schuss</w:t>
+      </w:r>
+      <w:r>
+        <w:rPr>
+          <w:rFonts w:ascii="Consolas" w:cs="Consolas" w:eastAsia="Consolas" w:hAnsi="Consolas"/>
+          <w:sz w:val="19"/>
+          <w:szCs w:val="19"/>
+        </w:rPr>
+        <w:br/>
+        <w:t xml:space="preserve">END IF</w:t>
+      </w:r>
+    </w:p>
+    <w:p>
+      <w:pPr>
+        <w:spacing w:after="180" w:line="312" w:lineRule="auto"/>
+      </w:pPr>
+      <w:r>
+        <w:rPr>
+          <w:sz w:val="22"/>
+          <w:szCs w:val="22"/>
+        </w:rPr>
+        <w:t xml:space="preserve">Im Schnelltest unten zeigt sich die Wirkung: Sechs schnelle Versuche, aber bei 1000 ms Sperre kommt nur der erste durch.</w:t>
+      </w:r>
+    </w:p>
+    <w:p>
+      <w:pPr>
+        <w:keepLines/>
+        <w:pBdr>
+          <w:left w:val="single" w:color="1B6CA8" w:sz="18" w:space="6"/>
+        </w:pBdr>
+        <w:shd w:fill="F4F4F4" w:val="clear"/>
+        <w:spacing w:after="200" w:before="100" w:line="264" w:lineRule="auto"/>
+        <w:ind w:left="140"/>
+      </w:pPr>
+      <w:r>
+        <w:rPr>
+          <w:rFonts w:ascii="Consolas" w:cs="Consolas" w:eastAsia="Consolas" w:hAnsi="Consolas"/>
+          <w:sz w:val="19"/>
+          <w:szCs w:val="19"/>
+        </w:rPr>
+        <w:t xml:space="preserve">IMPORT "timer"</w:t>
+      </w:r>
+      <w:r>
+        <w:rPr>
+          <w:rFonts w:ascii="Consolas" w:cs="Consolas" w:eastAsia="Consolas" w:hAnsi="Consolas"/>
+          <w:sz w:val="19"/>
+          <w:szCs w:val="19"/>
+        </w:rPr>
+        <w:br/>
+        <w:t xml:space="preserve">DIM treffer AS INTEGER</w:t>
+      </w:r>
+      <w:r>
+        <w:rPr>
+          <w:rFonts w:ascii="Consolas" w:cs="Consolas" w:eastAsia="Consolas" w:hAnsi="Consolas"/>
+          <w:sz w:val="19"/>
+          <w:szCs w:val="19"/>
+        </w:rPr>
+        <w:br/>
+        <w:t xml:space="preserve">DIM j AS INTEGER</w:t>
+      </w:r>
+      <w:r>
+        <w:rPr>
+          <w:rFonts w:ascii="Consolas" w:cs="Consolas" w:eastAsia="Consolas" w:hAnsi="Consolas"/>
+          <w:sz w:val="19"/>
+          <w:szCs w:val="19"/>
+        </w:rPr>
+        <w:br/>
+        <w:t xml:space="preserve">treffer = 0</w:t>
+      </w:r>
+      <w:r>
+        <w:rPr>
+          <w:rFonts w:ascii="Consolas" w:cs="Consolas" w:eastAsia="Consolas" w:hAnsi="Consolas"/>
+          <w:sz w:val="19"/>
+          <w:szCs w:val="19"/>
+        </w:rPr>
+        <w:br/>
+        <w:t xml:space="preserve">FOR j = 0 TO 5</w:t>
+      </w:r>
+      <w:r>
+        <w:rPr>
+          <w:rFonts w:ascii="Consolas" w:cs="Consolas" w:eastAsia="Consolas" w:hAnsi="Consolas"/>
+          <w:sz w:val="19"/>
+          <w:szCs w:val="19"/>
+        </w:rPr>
+        <w:br/>
+        <w:t xml:space="preserve">    IF COOLDOWN("schuss", 1000) THEN treffer = treffer + 1</w:t>
+      </w:r>
+      <w:r>
+        <w:rPr>
+          <w:rFonts w:ascii="Consolas" w:cs="Consolas" w:eastAsia="Consolas" w:hAnsi="Consolas"/>
+          <w:sz w:val="19"/>
+          <w:szCs w:val="19"/>
+        </w:rPr>
+        <w:br/>
+        <w:t xml:space="preserve">NEXT</w:t>
+      </w:r>
+      <w:r>
+        <w:rPr>
+          <w:rFonts w:ascii="Consolas" w:cs="Consolas" w:eastAsia="Consolas" w:hAnsi="Consolas"/>
+          <w:sz w:val="19"/>
+          <w:szCs w:val="19"/>
+        </w:rPr>
+        <w:br/>
+        <w:t xml:space="preserve">PRINT "durchgekommen: "; treffer</w:t>
+      </w:r>
+    </w:p>
+    <w:p>
+      <w:pPr>
+        <w:keepLines/>
+        <w:pBdr>
+          <w:left w:val="single" w:color="9AC79A" w:sz="18" w:space="6"/>
+        </w:pBdr>
+        <w:shd w:fill="EAF4EA" w:val="clear"/>
+        <w:spacing w:after="200" w:before="100" w:line="264" w:lineRule="auto"/>
+        <w:ind w:left="140"/>
+      </w:pPr>
+      <w:r>
+        <w:rPr>
+          <w:rFonts w:ascii="Consolas" w:cs="Consolas" w:eastAsia="Consolas" w:hAnsi="Consolas"/>
+          <w:sz w:val="19"/>
+          <w:szCs w:val="19"/>
+        </w:rPr>
+        <w:t xml:space="preserve">durchgekommen: 1</w:t>
+      </w:r>
+    </w:p>
+    <w:p>
+      <w:pPr>
+        <w:spacing w:before="60"/>
+      </w:pPr>
+    </w:p>
+    <w:tbl>
+      <w:tblPr>
+        <w:tblW w:type="dxa" w:w="9360"/>
+        <w:tblBorders>
+          <w:top w:val="single" w:color="auto" w:sz="4"/>
+          <w:left w:val="single" w:color="auto" w:sz="4"/>
+          <w:bottom w:val="single" w:color="auto" w:sz="4"/>
+          <w:right w:val="single" w:color="auto" w:sz="4"/>
+          <w:insideH w:val="single" w:color="auto" w:sz="4"/>
+          <w:insideV w:val="single" w:color="auto" w:sz="4"/>
+        </w:tblBorders>
+      </w:tblPr>
+      <w:tblGrid>
+        <w:gridCol w:w="9360"/>
+      </w:tblGrid>
+      <w:tr>
+        <w:trPr>
+          <w:cantSplit/>
+        </w:trPr>
+        <w:tc>
+          <w:tcPr>
+            <w:tcW w:type="dxa" w:w="9360"/>
+            <w:tcBorders>
+              <w:top w:val="single" w:color="9CC8E6" w:sz="6"/>
+              <w:left w:val="single" w:color="9CC8E6" w:sz="6"/>
+              <w:bottom w:val="single" w:color="9CC8E6" w:sz="6"/>
+              <w:right w:val="single" w:color="9CC8E6" w:sz="6"/>
+            </w:tcBorders>
+            <w:shd w:fill="E7F2FA" w:val="clear"/>
+            <w:tcMar>
+              <w:top w:type="dxa" w:w="140"/>
+              <w:left w:type="dxa" w:w="180"/>
+              <w:bottom w:type="dxa" w:w="140"/>
+              <w:right w:type="dxa" w:w="180"/>
+            </w:tcMar>
+          </w:tcPr>
+          <w:p>
+            <w:pPr>
+              <w:spacing w:after="40"/>
+            </w:pPr>
+            <w:r>
+              <w:rPr>
+                <w:b/>
+                <w:bCs/>
+                <w:color w:val="1B6CA8"/>
+                <w:sz w:val="22"/>
+                <w:szCs w:val="22"/>
+              </w:rPr>
+              <w:t xml:space="preserve">timer oder COOLDOWN?</w:t>
+            </w:r>
+          </w:p>
+          <w:p>
+            <w:pPr>
+              <w:spacing w:after="0" w:line="312" w:lineRule="auto"/>
+            </w:pPr>
+            <w:r>
+              <w:rPr>
+                <w:sz w:val="22"/>
+                <w:szCs w:val="22"/>
+              </w:rPr>
+              <w:t xml:space="preserve">Nimm TIMER_AFTER/EVERY, wenn etwas zu einem Zeitpunkt von selbst passieren soll (Callback). Nimm COOLDOWN, wenn du eine Aktion, die du sowieso schon prüfst, nur seltener zulassen willst (Begrenzung). COOLDOWN ist die kürzere Lösung, wo sie passt.</w:t>
             </w:r>
           </w:p>
         </w:tc>

</xml_diff>

<commit_message>
docs(buch): Lehrbuch Kap 54 -- Modul particles (Fontaene-Screenshot)
PARTICLE_SYSTEM_NEW, SET_VELOCITY/GRAVITY/LIFETIME/SIZE/COLOR/COLOR_END/MODE
(circle/pixel/square/streak/glow)/FADE, EMIT/UPDATE/DRAW/COUNT. Glow-Fontaene
mit Gelb->Rot-Verlauf als Screenshot + Effekt-Rezepte. Je Befehl ein Beispiel;
gegen gbrt verifiziert.

Co-Authored-By: Claude Opus 4.8 (1M context) <noreply@anthropic.com>
</commit_message>
<xml_diff>
--- a/buch-referenz/buch/GameBasic-Lehrbuch.docx
+++ b/buch-referenz/buch/GameBasic-Lehrbuch.docx
@@ -1407,6 +1407,33 @@
           <w:szCs w:val="22"/>
         </w:rPr>
         <w:t xml:space="preserve">	181</w:t>
+      </w:r>
+    </w:p>
+    <w:p>
+      <w:pPr>
+        <w:tabs>
+          <w:tab w:val="right" w:pos="9200" w:leader="dot"/>
+        </w:tabs>
+        <w:spacing w:after="20" w:before="0"/>
+        <w:ind w:left="280"/>
+      </w:pPr>
+      <w:r>
+        <w:rPr>
+          <w:b w:val="false"/>
+          <w:bCs w:val="false"/>
+          <w:color w:val="222222"/>
+          <w:sz w:val="22"/>
+          <w:szCs w:val="22"/>
+        </w:rPr>
+        <w:t xml:space="preserve">Modul: particles</w:t>
+      </w:r>
+      <w:r>
+        <w:rPr>
+          <w:color w:val="555555"/>
+          <w:sz w:val="22"/>
+          <w:szCs w:val="22"/>
+        </w:rPr>
+        <w:t xml:space="preserve">	184</w:t>
       </w:r>
     </w:p>
     <w:p>
@@ -60925,6 +60952,1131 @@
                 <w:szCs w:val="22"/>
               </w:rPr>
               <w:t xml:space="preserve">Nimm TIMER_AFTER/EVERY, wenn etwas zu einem Zeitpunkt von selbst passieren soll (Callback). Nimm COOLDOWN, wenn du eine Aktion, die du sowieso schon prüfst, nur seltener zulassen willst (Begrenzung). COOLDOWN ist die kürzere Lösung, wo sie passt.</w:t>
+            </w:r>
+          </w:p>
+        </w:tc>
+      </w:tr>
+    </w:tbl>
+    <w:p>
+      <w:pPr>
+        <w:spacing w:after="160"/>
+      </w:pPr>
+    </w:p>
+    <w:p>
+      <w:pPr>
+        <w:pStyle w:val="Heading1"/>
+        <w:keepNext/>
+        <w:keepLines/>
+        <w:pageBreakBefore/>
+        <w:pBdr>
+          <w:bottom w:val="single" w:color="1B6CA8" w:sz="12" w:space="4"/>
+        </w:pBdr>
+        <w:spacing w:after="160" w:before="0"/>
+      </w:pPr>
+      <w:r>
+        <w:t xml:space="preserve">Modul: particles</w:t>
+      </w:r>
+    </w:p>
+    <w:p>
+      <w:pPr>
+        <w:spacing w:after="180" w:line="312" w:lineRule="auto"/>
+      </w:pPr>
+      <w:r>
+        <w:rPr>
+          <w:sz w:val="22"/>
+          <w:szCs w:val="22"/>
+        </w:rPr>
+        <w:t xml:space="preserve">Funken, Feuer, Rauch, Explosionen, Regen – all das sind viele kleine Pünktchen, die sich nach einfachen Regeln bewegen und vergehen. Das particles-Modul übernimmt diese Buchführung: Ein Partikelsystem (der Emitter) erzeugt auf Knopfdruck viele Teilchen mit zufällig gestreuten Geschwindigkeiten und Lebensdauern, bewegt sie und blendet sie aus. Du stellst nur die Regeln ein und sagst „stoße N Teilchen aus“.</w:t>
+      </w:r>
+    </w:p>
+    <w:p>
+      <w:pPr>
+        <w:keepNext/>
+        <w:spacing w:after="40" w:before="160"/>
+        <w:jc w:val="center"/>
+      </w:pPr>
+      <w:r>
+        <w:drawing>
+          <wp:inline distT="0" distB="0" distL="0" distR="0">
+            <wp:extent cx="4572000" cy="3048000"/>
+            <wp:effectExtent t="0" r="0" b="0" l="0"/>
+            <wp:docPr id="1" name="54_particles.png" descr="Eine Funken-Fontäne im Glow-Modus mit Farbverlauf von Gelb nach Rot – aus einem Emitter mit Schwerkraft." title="Eine Funken-Fontäne im Glow-Modus mit Farbverlauf von Gelb nach Rot – aus einem Emitter mit Schwerkraft."/>
+            <wp:cNvGraphicFramePr>
+              <a:graphicFrameLocks xmlns:a="http://schemas.openxmlformats.org/drawingml/2006/main" noChangeAspect="1"/>
+            </wp:cNvGraphicFramePr>
+            <a:graphic xmlns:a="http://schemas.openxmlformats.org/drawingml/2006/main">
+              <a:graphicData uri="http://schemas.openxmlformats.org/drawingml/2006/picture">
+                <pic:pic xmlns:pic="http://schemas.openxmlformats.org/drawingml/2006/picture">
+                  <pic:nvPicPr>
+                    <pic:cNvPr id="0" name="" descr=""/>
+                    <pic:cNvPicPr>
+                      <a:picLocks noChangeAspect="1" noChangeArrowheads="1"/>
+                    </pic:cNvPicPr>
+                  </pic:nvPicPr>
+                  <pic:blipFill>
+                    <a:blip r:embed="rId22" cstate="none"/>
+                    <a:srcRect/>
+                    <a:stretch>
+                      <a:fillRect/>
+                    </a:stretch>
+                  </pic:blipFill>
+                  <pic:spPr bwMode="auto">
+                    <a:xfrm>
+                      <a:off x="0" y="0"/>
+                      <a:ext cx="4572000" cy="3048000"/>
+                    </a:xfrm>
+                    <a:prstGeom prst="rect">
+                      <a:avLst/>
+                    </a:prstGeom>
+                  </pic:spPr>
+                </pic:pic>
+              </a:graphicData>
+            </a:graphic>
+          </wp:inline>
+        </w:drawing>
+      </w:r>
+    </w:p>
+    <w:p>
+      <w:pPr>
+        <w:spacing w:after="200"/>
+        <w:jc w:val="center"/>
+      </w:pPr>
+      <w:r>
+        <w:rPr>
+          <w:i/>
+          <w:iCs/>
+          <w:color w:val="6A6A6A"/>
+          <w:sz w:val="18"/>
+          <w:szCs w:val="18"/>
+        </w:rPr>
+        <w:t xml:space="preserve">Eine Funken-Fontäne im Glow-Modus mit Farbverlauf von Gelb nach Rot – aus einem Emitter mit Schwerkraft.</w:t>
+      </w:r>
+    </w:p>
+    <w:p>
+      <w:pPr>
+        <w:pStyle w:val="Heading2"/>
+        <w:keepNext/>
+        <w:keepLines/>
+        <w:spacing w:after="120" w:before="280"/>
+      </w:pPr>
+      <w:r>
+        <w:t xml:space="preserve">Ein Partikelsystem anlegen</w:t>
+      </w:r>
+    </w:p>
+    <w:p>
+      <w:pPr>
+        <w:keepNext/>
+        <w:keepLines/>
+        <w:pBdr>
+          <w:bottom w:val="single" w:color="DDD0C0" w:sz="4" w:space="2"/>
+        </w:pBdr>
+        <w:spacing w:after="40" w:before="360"/>
+      </w:pPr>
+      <w:r>
+        <w:rPr>
+          <w:rFonts w:ascii="Consolas" w:cs="Consolas" w:eastAsia="Consolas" w:hAnsi="Consolas"/>
+          <w:b/>
+          <w:bCs/>
+          <w:color w:val="9A3412"/>
+          <w:sz w:val="24"/>
+          <w:szCs w:val="24"/>
+        </w:rPr>
+        <w:t xml:space="preserve">PARTICLE_SYSTEM_NEW</w:t>
+      </w:r>
+    </w:p>
+    <w:p>
+      <w:pPr>
+        <w:keepNext/>
+        <w:spacing w:after="120"/>
+      </w:pPr>
+      <w:r>
+        <w:rPr>
+          <w:b/>
+          <w:bCs/>
+          <w:color w:val="6A6A6A"/>
+          <w:sz w:val="18"/>
+          <w:szCs w:val="18"/>
+        </w:rPr>
+        <w:t xml:space="preserve">Syntax:  </w:t>
+      </w:r>
+      <w:r>
+        <w:rPr>
+          <w:rFonts w:ascii="Consolas" w:cs="Consolas" w:eastAsia="Consolas" w:hAnsi="Consolas"/>
+          <w:color w:val="335577"/>
+          <w:sz w:val="19"/>
+          <w:szCs w:val="19"/>
+        </w:rPr>
+        <w:t xml:space="preserve">PARTICLE_SYSTEM_NEW(x, y)</w:t>
+      </w:r>
+    </w:p>
+    <w:p>
+      <w:pPr>
+        <w:spacing w:after="180" w:line="312" w:lineRule="auto"/>
+      </w:pPr>
+      <w:r>
+        <w:rPr>
+          <w:sz w:val="22"/>
+          <w:szCs w:val="22"/>
+        </w:rPr>
+        <w:t xml:space="preserve">Erzeugt einen Emitter an der Position (x, y) mit sinnvollen Voreinstellungen. Schon PARTICLE_SYSTEM_NEW + PARTICLE_EMIT reicht für sichtbare Funken; alle weiteren Einstellungen sind optional.</w:t>
+      </w:r>
+    </w:p>
+    <w:p>
+      <w:pPr>
+        <w:keepNext/>
+        <w:spacing w:after="30" w:before="120"/>
+      </w:pPr>
+      <w:r>
+        <w:rPr>
+          <w:b/>
+          <w:bCs/>
+          <w:i/>
+          <w:iCs/>
+          <w:color w:val="6A6A6A"/>
+          <w:sz w:val="18"/>
+          <w:szCs w:val="18"/>
+        </w:rPr>
+        <w:t xml:space="preserve">Beispiel</w:t>
+      </w:r>
+    </w:p>
+    <w:p>
+      <w:pPr>
+        <w:keepLines/>
+        <w:pBdr>
+          <w:left w:val="single" w:color="1B6CA8" w:sz="18" w:space="6"/>
+        </w:pBdr>
+        <w:shd w:fill="F4F4F4" w:val="clear"/>
+        <w:spacing w:after="200" w:before="100" w:line="264" w:lineRule="auto"/>
+        <w:ind w:left="140"/>
+      </w:pPr>
+      <w:r>
+        <w:rPr>
+          <w:rFonts w:ascii="Consolas" w:cs="Consolas" w:eastAsia="Consolas" w:hAnsi="Consolas"/>
+          <w:sz w:val="19"/>
+          <w:szCs w:val="19"/>
+        </w:rPr>
+        <w:t xml:space="preserve">IMPORT "particles"</w:t>
+      </w:r>
+      <w:r>
+        <w:rPr>
+          <w:rFonts w:ascii="Consolas" w:cs="Consolas" w:eastAsia="Consolas" w:hAnsi="Consolas"/>
+          <w:sz w:val="19"/>
+          <w:szCs w:val="19"/>
+        </w:rPr>
+        <w:br/>
+        <w:t xml:space="preserve">DIM funken AS PARTICLE_SYSTEM</w:t>
+      </w:r>
+      <w:r>
+        <w:rPr>
+          <w:rFonts w:ascii="Consolas" w:cs="Consolas" w:eastAsia="Consolas" w:hAnsi="Consolas"/>
+          <w:sz w:val="19"/>
+          <w:szCs w:val="19"/>
+        </w:rPr>
+        <w:br/>
+        <w:t xml:space="preserve">funken = PARTICLE_SYSTEM_NEW(240.0, 160.0)</w:t>
+      </w:r>
+    </w:p>
+    <w:p>
+      <w:pPr>
+        <w:pStyle w:val="Heading2"/>
+        <w:keepNext/>
+        <w:keepLines/>
+        <w:spacing w:after="120" w:before="280"/>
+      </w:pPr>
+      <w:r>
+        <w:t xml:space="preserve">Das Aussehen einstellen</w:t>
+      </w:r>
+    </w:p>
+    <w:p>
+      <w:pPr>
+        <w:spacing w:after="180" w:line="312" w:lineRule="auto"/>
+      </w:pPr>
+      <w:r>
+        <w:rPr>
+          <w:sz w:val="22"/>
+          <w:szCs w:val="22"/>
+        </w:rPr>
+        <w:t xml:space="preserve">Mit den SET-Befehlen formst du den Effekt. Geschwindigkeit und Lebensdauer werden als Bereiche (min/max) angegeben – daraus würfelt das System pro Teilchen einen Zufallswert, was den Effekt natürlich wirken lässt.</w:t>
+      </w:r>
+    </w:p>
+    <w:p>
+      <w:pPr>
+        <w:keepNext/>
+        <w:keepLines/>
+        <w:pBdr>
+          <w:bottom w:val="single" w:color="DDD0C0" w:sz="4" w:space="2"/>
+        </w:pBdr>
+        <w:spacing w:after="40" w:before="360"/>
+      </w:pPr>
+      <w:r>
+        <w:rPr>
+          <w:rFonts w:ascii="Consolas" w:cs="Consolas" w:eastAsia="Consolas" w:hAnsi="Consolas"/>
+          <w:b/>
+          <w:bCs/>
+          <w:color w:val="9A3412"/>
+          <w:sz w:val="24"/>
+          <w:szCs w:val="24"/>
+        </w:rPr>
+        <w:t xml:space="preserve">PARTICLE_SET_VELOCITY · PARTICLE_SET_GRAVITY</w:t>
+      </w:r>
+    </w:p>
+    <w:p>
+      <w:pPr>
+        <w:keepNext/>
+        <w:spacing w:after="120"/>
+      </w:pPr>
+      <w:r>
+        <w:rPr>
+          <w:b/>
+          <w:bCs/>
+          <w:color w:val="6A6A6A"/>
+          <w:sz w:val="18"/>
+          <w:szCs w:val="18"/>
+        </w:rPr>
+        <w:t xml:space="preserve">Syntax:  </w:t>
+      </w:r>
+      <w:r>
+        <w:rPr>
+          <w:rFonts w:ascii="Consolas" w:cs="Consolas" w:eastAsia="Consolas" w:hAnsi="Consolas"/>
+          <w:color w:val="335577"/>
+          <w:sz w:val="19"/>
+          <w:szCs w:val="19"/>
+        </w:rPr>
+        <w:t xml:space="preserve">PARTICLE_SET_VELOCITY(sys, vx_min, vx_max, vy_min, vy_max)   PARTICLE_SET_GRAVITY(sys, gx, gy)</w:t>
+      </w:r>
+    </w:p>
+    <w:p>
+      <w:pPr>
+        <w:spacing w:after="180" w:line="312" w:lineRule="auto"/>
+      </w:pPr>
+      <w:r>
+        <w:rPr>
+          <w:sz w:val="22"/>
+          <w:szCs w:val="22"/>
+        </w:rPr>
+        <w:t xml:space="preserve">VELOCITY legt die Streuung der Start-Geschwindigkeiten fest (Pixel/Sekunde; negatives vy = nach oben). GRAVITY ist eine konstante Beschleunigung – ein positives gy zieht die Teilchen nach unten, sodass eine Fontäne entsteht.</w:t>
+      </w:r>
+    </w:p>
+    <w:p>
+      <w:pPr>
+        <w:keepNext/>
+        <w:spacing w:after="30" w:before="120"/>
+      </w:pPr>
+      <w:r>
+        <w:rPr>
+          <w:b/>
+          <w:bCs/>
+          <w:i/>
+          <w:iCs/>
+          <w:color w:val="6A6A6A"/>
+          <w:sz w:val="18"/>
+          <w:szCs w:val="18"/>
+        </w:rPr>
+        <w:t xml:space="preserve">Beispiel</w:t>
+      </w:r>
+    </w:p>
+    <w:p>
+      <w:pPr>
+        <w:keepLines/>
+        <w:pBdr>
+          <w:left w:val="single" w:color="1B6CA8" w:sz="18" w:space="6"/>
+        </w:pBdr>
+        <w:shd w:fill="F4F4F4" w:val="clear"/>
+        <w:spacing w:after="200" w:before="100" w:line="264" w:lineRule="auto"/>
+        <w:ind w:left="140"/>
+      </w:pPr>
+      <w:r>
+        <w:rPr>
+          <w:rFonts w:ascii="Consolas" w:cs="Consolas" w:eastAsia="Consolas" w:hAnsi="Consolas"/>
+          <w:sz w:val="19"/>
+          <w:szCs w:val="19"/>
+        </w:rPr>
+        <w:t xml:space="preserve">PARTICLE_SET_VELOCITY(funken, -70.0, 70.0, -300.0, -200.0)  ' nach oben</w:t>
+      </w:r>
+      <w:r>
+        <w:rPr>
+          <w:rFonts w:ascii="Consolas" w:cs="Consolas" w:eastAsia="Consolas" w:hAnsi="Consolas"/>
+          <w:sz w:val="19"/>
+          <w:szCs w:val="19"/>
+        </w:rPr>
+        <w:br/>
+        <w:t xml:space="preserve">PARTICLE_SET_GRAVITY(funken, 0.0, 320.0)                    ' fällt zurück</w:t>
+      </w:r>
+    </w:p>
+    <w:p>
+      <w:pPr>
+        <w:keepNext/>
+        <w:keepLines/>
+        <w:pBdr>
+          <w:bottom w:val="single" w:color="DDD0C0" w:sz="4" w:space="2"/>
+        </w:pBdr>
+        <w:spacing w:after="40" w:before="360"/>
+      </w:pPr>
+      <w:r>
+        <w:rPr>
+          <w:rFonts w:ascii="Consolas" w:cs="Consolas" w:eastAsia="Consolas" w:hAnsi="Consolas"/>
+          <w:b/>
+          <w:bCs/>
+          <w:color w:val="9A3412"/>
+          <w:sz w:val="24"/>
+          <w:szCs w:val="24"/>
+        </w:rPr>
+        <w:t xml:space="preserve">PARTICLE_SET_LIFETIME · PARTICLE_SET_SIZE</w:t>
+      </w:r>
+    </w:p>
+    <w:p>
+      <w:pPr>
+        <w:keepNext/>
+        <w:spacing w:after="120"/>
+      </w:pPr>
+      <w:r>
+        <w:rPr>
+          <w:b/>
+          <w:bCs/>
+          <w:color w:val="6A6A6A"/>
+          <w:sz w:val="18"/>
+          <w:szCs w:val="18"/>
+        </w:rPr>
+        <w:t xml:space="preserve">Syntax:  </w:t>
+      </w:r>
+      <w:r>
+        <w:rPr>
+          <w:rFonts w:ascii="Consolas" w:cs="Consolas" w:eastAsia="Consolas" w:hAnsi="Consolas"/>
+          <w:color w:val="335577"/>
+          <w:sz w:val="19"/>
+          <w:szCs w:val="19"/>
+        </w:rPr>
+        <w:t xml:space="preserve">PARTICLE_SET_LIFETIME(sys, ms_min, ms_max)   PARTICLE_SET_SIZE(sys, px_min, px_max)</w:t>
+      </w:r>
+    </w:p>
+    <w:p>
+      <w:pPr>
+        <w:spacing w:after="180" w:line="312" w:lineRule="auto"/>
+      </w:pPr>
+      <w:r>
+        <w:rPr>
+          <w:sz w:val="22"/>
+          <w:szCs w:val="22"/>
+        </w:rPr>
+        <w:t xml:space="preserve">LIFETIME bestimmt, wie lange (in ms) ein Teilchen lebt, SIZE seine Pixelgröße – beide als Bereich.</w:t>
+      </w:r>
+    </w:p>
+    <w:p>
+      <w:pPr>
+        <w:keepNext/>
+        <w:spacing w:after="30" w:before="120"/>
+      </w:pPr>
+      <w:r>
+        <w:rPr>
+          <w:b/>
+          <w:bCs/>
+          <w:i/>
+          <w:iCs/>
+          <w:color w:val="6A6A6A"/>
+          <w:sz w:val="18"/>
+          <w:szCs w:val="18"/>
+        </w:rPr>
+        <w:t xml:space="preserve">Beispiel</w:t>
+      </w:r>
+    </w:p>
+    <w:p>
+      <w:pPr>
+        <w:keepLines/>
+        <w:pBdr>
+          <w:left w:val="single" w:color="1B6CA8" w:sz="18" w:space="6"/>
+        </w:pBdr>
+        <w:shd w:fill="F4F4F4" w:val="clear"/>
+        <w:spacing w:after="200" w:before="100" w:line="264" w:lineRule="auto"/>
+        <w:ind w:left="140"/>
+      </w:pPr>
+      <w:r>
+        <w:rPr>
+          <w:rFonts w:ascii="Consolas" w:cs="Consolas" w:eastAsia="Consolas" w:hAnsi="Consolas"/>
+          <w:sz w:val="19"/>
+          <w:szCs w:val="19"/>
+        </w:rPr>
+        <w:t xml:space="preserve">PARTICLE_SET_LIFETIME(funken, 700, 1300)</w:t>
+      </w:r>
+      <w:r>
+        <w:rPr>
+          <w:rFonts w:ascii="Consolas" w:cs="Consolas" w:eastAsia="Consolas" w:hAnsi="Consolas"/>
+          <w:sz w:val="19"/>
+          <w:szCs w:val="19"/>
+        </w:rPr>
+        <w:br/>
+        <w:t xml:space="preserve">PARTICLE_SET_SIZE(funken, 3, 6)</w:t>
+      </w:r>
+    </w:p>
+    <w:p>
+      <w:pPr>
+        <w:keepNext/>
+        <w:keepLines/>
+        <w:pBdr>
+          <w:bottom w:val="single" w:color="DDD0C0" w:sz="4" w:space="2"/>
+        </w:pBdr>
+        <w:spacing w:after="40" w:before="360"/>
+      </w:pPr>
+      <w:r>
+        <w:rPr>
+          <w:rFonts w:ascii="Consolas" w:cs="Consolas" w:eastAsia="Consolas" w:hAnsi="Consolas"/>
+          <w:b/>
+          <w:bCs/>
+          <w:color w:val="9A3412"/>
+          <w:sz w:val="24"/>
+          <w:szCs w:val="24"/>
+        </w:rPr>
+        <w:t xml:space="preserve">PARTICLE_SET_COLOR · PARTICLE_SET_COLOR_END</w:t>
+      </w:r>
+    </w:p>
+    <w:p>
+      <w:pPr>
+        <w:keepNext/>
+        <w:spacing w:after="120"/>
+      </w:pPr>
+      <w:r>
+        <w:rPr>
+          <w:b/>
+          <w:bCs/>
+          <w:color w:val="6A6A6A"/>
+          <w:sz w:val="18"/>
+          <w:szCs w:val="18"/>
+        </w:rPr>
+        <w:t xml:space="preserve">Syntax:  </w:t>
+      </w:r>
+      <w:r>
+        <w:rPr>
+          <w:rFonts w:ascii="Consolas" w:cs="Consolas" w:eastAsia="Consolas" w:hAnsi="Consolas"/>
+          <w:color w:val="335577"/>
+          <w:sz w:val="19"/>
+          <w:szCs w:val="19"/>
+        </w:rPr>
+        <w:t xml:space="preserve">PARTICLE_SET_COLOR(sys, farbe)   PARTICLE_SET_COLOR_END(sys, farbe)</w:t>
+      </w:r>
+    </w:p>
+    <w:p>
+      <w:pPr>
+        <w:spacing w:after="180" w:line="312" w:lineRule="auto"/>
+      </w:pPr>
+      <w:r>
+        <w:rPr>
+          <w:sz w:val="22"/>
+          <w:szCs w:val="22"/>
+        </w:rPr>
+        <w:t xml:space="preserve">COLOR ist die Startfarbe. Setzt du zusätzlich COLOR_END, wechselt jedes Teilchen über seine Lebenszeit von der Start- zur Endfarbe – etwa Feuer von Gelb nach Rot.</w:t>
+      </w:r>
+    </w:p>
+    <w:p>
+      <w:pPr>
+        <w:keepNext/>
+        <w:spacing w:after="30" w:before="120"/>
+      </w:pPr>
+      <w:r>
+        <w:rPr>
+          <w:b/>
+          <w:bCs/>
+          <w:i/>
+          <w:iCs/>
+          <w:color w:val="6A6A6A"/>
+          <w:sz w:val="18"/>
+          <w:szCs w:val="18"/>
+        </w:rPr>
+        <w:t xml:space="preserve">Beispiel</w:t>
+      </w:r>
+    </w:p>
+    <w:p>
+      <w:pPr>
+        <w:keepLines/>
+        <w:pBdr>
+          <w:left w:val="single" w:color="1B6CA8" w:sz="18" w:space="6"/>
+        </w:pBdr>
+        <w:shd w:fill="F4F4F4" w:val="clear"/>
+        <w:spacing w:after="200" w:before="100" w:line="264" w:lineRule="auto"/>
+        <w:ind w:left="140"/>
+      </w:pPr>
+      <w:r>
+        <w:rPr>
+          <w:rFonts w:ascii="Consolas" w:cs="Consolas" w:eastAsia="Consolas" w:hAnsi="Consolas"/>
+          <w:sz w:val="19"/>
+          <w:szCs w:val="19"/>
+        </w:rPr>
+        <w:t xml:space="preserve">PARTICLE_SET_COLOR(funken, RGB(255, 230, 120))     ' Start: gelb</w:t>
+      </w:r>
+      <w:r>
+        <w:rPr>
+          <w:rFonts w:ascii="Consolas" w:cs="Consolas" w:eastAsia="Consolas" w:hAnsi="Consolas"/>
+          <w:sz w:val="19"/>
+          <w:szCs w:val="19"/>
+        </w:rPr>
+        <w:br/>
+        <w:t xml:space="preserve">PARTICLE_SET_COLOR_END(funken, RGB(255, 60, 0))    ' Ende: rot</w:t>
+      </w:r>
+    </w:p>
+    <w:p>
+      <w:pPr>
+        <w:keepNext/>
+        <w:keepLines/>
+        <w:pBdr>
+          <w:bottom w:val="single" w:color="DDD0C0" w:sz="4" w:space="2"/>
+        </w:pBdr>
+        <w:spacing w:after="40" w:before="360"/>
+      </w:pPr>
+      <w:r>
+        <w:rPr>
+          <w:rFonts w:ascii="Consolas" w:cs="Consolas" w:eastAsia="Consolas" w:hAnsi="Consolas"/>
+          <w:b/>
+          <w:bCs/>
+          <w:color w:val="9A3412"/>
+          <w:sz w:val="24"/>
+          <w:szCs w:val="24"/>
+        </w:rPr>
+        <w:t xml:space="preserve">PARTICLE_SET_MODE · PARTICLE_SET_FADE</w:t>
+      </w:r>
+    </w:p>
+    <w:p>
+      <w:pPr>
+        <w:keepNext/>
+        <w:spacing w:after="120"/>
+      </w:pPr>
+      <w:r>
+        <w:rPr>
+          <w:b/>
+          <w:bCs/>
+          <w:color w:val="6A6A6A"/>
+          <w:sz w:val="18"/>
+          <w:szCs w:val="18"/>
+        </w:rPr>
+        <w:t xml:space="preserve">Syntax:  </w:t>
+      </w:r>
+      <w:r>
+        <w:rPr>
+          <w:rFonts w:ascii="Consolas" w:cs="Consolas" w:eastAsia="Consolas" w:hAnsi="Consolas"/>
+          <w:color w:val="335577"/>
+          <w:sz w:val="19"/>
+          <w:szCs w:val="19"/>
+        </w:rPr>
+        <w:t xml:space="preserve">PARTICLE_SET_MODE(sys, modus$)   PARTICLE_SET_FADE(sys, an)</w:t>
+      </w:r>
+    </w:p>
+    <w:p>
+      <w:pPr>
+        <w:spacing w:after="180" w:line="312" w:lineRule="auto"/>
+      </w:pPr>
+      <w:r>
+        <w:rPr>
+          <w:sz w:val="22"/>
+          <w:szCs w:val="22"/>
+        </w:rPr>
+        <w:t xml:space="preserve">MODE wählt die Darstellung: "circle", "pixel", "square", "streak" oder "glow" (additiv – überlappende Teilchen leuchten heller, perfekt für Feuer und Magie). FADE = TRUE lässt Teilchen mit dem Alter ausblenden.</w:t>
+      </w:r>
+    </w:p>
+    <w:p>
+      <w:pPr>
+        <w:keepNext/>
+        <w:spacing w:after="30" w:before="120"/>
+      </w:pPr>
+      <w:r>
+        <w:rPr>
+          <w:b/>
+          <w:bCs/>
+          <w:i/>
+          <w:iCs/>
+          <w:color w:val="6A6A6A"/>
+          <w:sz w:val="18"/>
+          <w:szCs w:val="18"/>
+        </w:rPr>
+        <w:t xml:space="preserve">Beispiel</w:t>
+      </w:r>
+    </w:p>
+    <w:p>
+      <w:pPr>
+        <w:keepLines/>
+        <w:pBdr>
+          <w:left w:val="single" w:color="1B6CA8" w:sz="18" w:space="6"/>
+        </w:pBdr>
+        <w:shd w:fill="F4F4F4" w:val="clear"/>
+        <w:spacing w:after="200" w:before="100" w:line="264" w:lineRule="auto"/>
+        <w:ind w:left="140"/>
+      </w:pPr>
+      <w:r>
+        <w:rPr>
+          <w:rFonts w:ascii="Consolas" w:cs="Consolas" w:eastAsia="Consolas" w:hAnsi="Consolas"/>
+          <w:sz w:val="19"/>
+          <w:szCs w:val="19"/>
+        </w:rPr>
+        <w:t xml:space="preserve">PARTICLE_SET_MODE(funken, "glow")</w:t>
+      </w:r>
+      <w:r>
+        <w:rPr>
+          <w:rFonts w:ascii="Consolas" w:cs="Consolas" w:eastAsia="Consolas" w:hAnsi="Consolas"/>
+          <w:sz w:val="19"/>
+          <w:szCs w:val="19"/>
+        </w:rPr>
+        <w:br/>
+        <w:t xml:space="preserve">PARTICLE_SET_FADE(funken, TRUE)</w:t>
+      </w:r>
+    </w:p>
+    <w:p>
+      <w:pPr>
+        <w:pStyle w:val="Heading2"/>
+        <w:keepNext/>
+        <w:keepLines/>
+        <w:spacing w:after="120" w:before="280"/>
+      </w:pPr>
+      <w:r>
+        <w:t xml:space="preserve">Ausstoßen, aktualisieren, zeichnen</w:t>
+      </w:r>
+    </w:p>
+    <w:p>
+      <w:pPr>
+        <w:keepNext/>
+        <w:keepLines/>
+        <w:pBdr>
+          <w:bottom w:val="single" w:color="DDD0C0" w:sz="4" w:space="2"/>
+        </w:pBdr>
+        <w:spacing w:after="40" w:before="360"/>
+      </w:pPr>
+      <w:r>
+        <w:rPr>
+          <w:rFonts w:ascii="Consolas" w:cs="Consolas" w:eastAsia="Consolas" w:hAnsi="Consolas"/>
+          <w:b/>
+          <w:bCs/>
+          <w:color w:val="9A3412"/>
+          <w:sz w:val="24"/>
+          <w:szCs w:val="24"/>
+        </w:rPr>
+        <w:t xml:space="preserve">PARTICLE_EMIT</w:t>
+      </w:r>
+    </w:p>
+    <w:p>
+      <w:pPr>
+        <w:keepNext/>
+        <w:spacing w:after="120"/>
+      </w:pPr>
+      <w:r>
+        <w:rPr>
+          <w:b/>
+          <w:bCs/>
+          <w:color w:val="6A6A6A"/>
+          <w:sz w:val="18"/>
+          <w:szCs w:val="18"/>
+        </w:rPr>
+        <w:t xml:space="preserve">Syntax:  </w:t>
+      </w:r>
+      <w:r>
+        <w:rPr>
+          <w:rFonts w:ascii="Consolas" w:cs="Consolas" w:eastAsia="Consolas" w:hAnsi="Consolas"/>
+          <w:color w:val="335577"/>
+          <w:sz w:val="19"/>
+          <w:szCs w:val="19"/>
+        </w:rPr>
+        <w:t xml:space="preserve">PARTICLE_EMIT(sys, anzahl)</w:t>
+      </w:r>
+    </w:p>
+    <w:p>
+      <w:pPr>
+        <w:spacing w:after="180" w:line="312" w:lineRule="auto"/>
+      </w:pPr>
+      <w:r>
+        <w:rPr>
+          <w:sz w:val="22"/>
+          <w:szCs w:val="22"/>
+        </w:rPr>
+        <w:t xml:space="preserve">Stößt sofort anzahl neue Teilchen aus. Einmalig aufgerufen ergibt das eine Explosion; jeden Frame ein paar ergibt einen Dauerstrom (Fontäne, Feuer).</w:t>
+      </w:r>
+    </w:p>
+    <w:p>
+      <w:pPr>
+        <w:keepNext/>
+        <w:spacing w:after="30" w:before="120"/>
+      </w:pPr>
+      <w:r>
+        <w:rPr>
+          <w:b/>
+          <w:bCs/>
+          <w:i/>
+          <w:iCs/>
+          <w:color w:val="6A6A6A"/>
+          <w:sz w:val="18"/>
+          <w:szCs w:val="18"/>
+        </w:rPr>
+        <w:t xml:space="preserve">Beispiel</w:t>
+      </w:r>
+    </w:p>
+    <w:p>
+      <w:pPr>
+        <w:keepLines/>
+        <w:pBdr>
+          <w:left w:val="single" w:color="1B6CA8" w:sz="18" w:space="6"/>
+        </w:pBdr>
+        <w:shd w:fill="F4F4F4" w:val="clear"/>
+        <w:spacing w:after="200" w:before="100" w:line="264" w:lineRule="auto"/>
+        <w:ind w:left="140"/>
+      </w:pPr>
+      <w:r>
+        <w:rPr>
+          <w:rFonts w:ascii="Consolas" w:cs="Consolas" w:eastAsia="Consolas" w:hAnsi="Consolas"/>
+          <w:sz w:val="19"/>
+          <w:szCs w:val="19"/>
+        </w:rPr>
+        <w:t xml:space="preserve">PARTICLE_EMIT(funken, 25)     ' Explosion: 25 auf einmal</w:t>
+      </w:r>
+    </w:p>
+    <w:p>
+      <w:pPr>
+        <w:keepNext/>
+        <w:keepLines/>
+        <w:pBdr>
+          <w:bottom w:val="single" w:color="DDD0C0" w:sz="4" w:space="2"/>
+        </w:pBdr>
+        <w:spacing w:after="40" w:before="360"/>
+      </w:pPr>
+      <w:r>
+        <w:rPr>
+          <w:rFonts w:ascii="Consolas" w:cs="Consolas" w:eastAsia="Consolas" w:hAnsi="Consolas"/>
+          <w:b/>
+          <w:bCs/>
+          <w:color w:val="9A3412"/>
+          <w:sz w:val="24"/>
+          <w:szCs w:val="24"/>
+        </w:rPr>
+        <w:t xml:space="preserve">PARTICLE_UPDATE · PARTICLE_DRAW · PARTICLE_COUNT</w:t>
+      </w:r>
+    </w:p>
+    <w:p>
+      <w:pPr>
+        <w:keepNext/>
+        <w:spacing w:after="120"/>
+      </w:pPr>
+      <w:r>
+        <w:rPr>
+          <w:b/>
+          <w:bCs/>
+          <w:color w:val="6A6A6A"/>
+          <w:sz w:val="18"/>
+          <w:szCs w:val="18"/>
+        </w:rPr>
+        <w:t xml:space="preserve">Syntax:  </w:t>
+      </w:r>
+      <w:r>
+        <w:rPr>
+          <w:rFonts w:ascii="Consolas" w:cs="Consolas" w:eastAsia="Consolas" w:hAnsi="Consolas"/>
+          <w:color w:val="335577"/>
+          <w:sz w:val="19"/>
+          <w:szCs w:val="19"/>
+        </w:rPr>
+        <w:t xml:space="preserve">PARTICLE_UPDATE(sys, dt_ms)   PARTICLE_DRAW(sys)   PARTICLE_COUNT(sys)</w:t>
+      </w:r>
+    </w:p>
+    <w:p>
+      <w:pPr>
+        <w:spacing w:after="180" w:line="312" w:lineRule="auto"/>
+      </w:pPr>
+      <w:r>
+        <w:rPr>
+          <w:sz w:val="22"/>
+          <w:szCs w:val="22"/>
+        </w:rPr>
+        <w:t xml:space="preserve">PARTICLE_UPDATE schreibt die Physik um dt_ms (Millisekunden) fort und entfernt tote Teilchen, PARTICLE_DRAW zeichnet alle lebenden (camera-aware), PARTICLE_COUNT liefert ihre Anzahl.</w:t>
+      </w:r>
+    </w:p>
+    <w:p>
+      <w:pPr>
+        <w:keepNext/>
+        <w:spacing w:after="30" w:before="120"/>
+      </w:pPr>
+      <w:r>
+        <w:rPr>
+          <w:b/>
+          <w:bCs/>
+          <w:i/>
+          <w:iCs/>
+          <w:color w:val="6A6A6A"/>
+          <w:sz w:val="18"/>
+          <w:szCs w:val="18"/>
+        </w:rPr>
+        <w:t xml:space="preserve">Beispiel</w:t>
+      </w:r>
+    </w:p>
+    <w:p>
+      <w:pPr>
+        <w:keepLines/>
+        <w:pBdr>
+          <w:left w:val="single" w:color="1B6CA8" w:sz="18" w:space="6"/>
+        </w:pBdr>
+        <w:shd w:fill="F4F4F4" w:val="clear"/>
+        <w:spacing w:after="200" w:before="100" w:line="264" w:lineRule="auto"/>
+        <w:ind w:left="140"/>
+      </w:pPr>
+      <w:r>
+        <w:rPr>
+          <w:rFonts w:ascii="Consolas" w:cs="Consolas" w:eastAsia="Consolas" w:hAnsi="Consolas"/>
+          <w:sz w:val="19"/>
+          <w:szCs w:val="19"/>
+        </w:rPr>
+        <w:t xml:space="preserve">PARTICLE_UPDATE(funken, INT(DELTA() * 1000.0))</w:t>
+      </w:r>
+      <w:r>
+        <w:rPr>
+          <w:rFonts w:ascii="Consolas" w:cs="Consolas" w:eastAsia="Consolas" w:hAnsi="Consolas"/>
+          <w:sz w:val="19"/>
+          <w:szCs w:val="19"/>
+        </w:rPr>
+        <w:br/>
+        <w:t xml:space="preserve">PARTICLE_DRAW(funken)</w:t>
+      </w:r>
+    </w:p>
+    <w:p>
+      <w:pPr>
+        <w:pStyle w:val="Heading2"/>
+        <w:keepNext/>
+        <w:keepLines/>
+        <w:spacing w:after="120" w:before="280"/>
+      </w:pPr>
+      <w:r>
+        <w:t xml:space="preserve">Eine Fontäne im Game-Loop</w:t>
+      </w:r>
+    </w:p>
+    <w:p>
+      <w:pPr>
+        <w:spacing w:after="180" w:line="312" w:lineRule="auto"/>
+      </w:pPr>
+      <w:r>
+        <w:rPr>
+          <w:sz w:val="22"/>
+          <w:szCs w:val="22"/>
+        </w:rPr>
+        <w:t xml:space="preserve">So entsteht der Dauer-Effekt aus dem Bild oben – jeden Frame ein paar neue Teilchen ausstoßen, dann aktualisieren und zeichnen:</w:t>
+      </w:r>
+    </w:p>
+    <w:p>
+      <w:pPr>
+        <w:keepLines/>
+        <w:pBdr>
+          <w:left w:val="single" w:color="1B6CA8" w:sz="18" w:space="6"/>
+        </w:pBdr>
+        <w:shd w:fill="F4F4F4" w:val="clear"/>
+        <w:spacing w:after="200" w:before="100" w:line="264" w:lineRule="auto"/>
+        <w:ind w:left="140"/>
+      </w:pPr>
+      <w:r>
+        <w:rPr>
+          <w:rFonts w:ascii="Consolas" w:cs="Consolas" w:eastAsia="Consolas" w:hAnsi="Consolas"/>
+          <w:sz w:val="19"/>
+          <w:szCs w:val="19"/>
+        </w:rPr>
+        <w:t xml:space="preserve">IMPORT "particles"</w:t>
+      </w:r>
+      <w:r>
+        <w:rPr>
+          <w:rFonts w:ascii="Consolas" w:cs="Consolas" w:eastAsia="Consolas" w:hAnsi="Consolas"/>
+          <w:sz w:val="19"/>
+          <w:szCs w:val="19"/>
+        </w:rPr>
+        <w:br/>
+        <w:t xml:space="preserve">SCREEN(480, 320)</w:t>
+      </w:r>
+      <w:r>
+        <w:rPr>
+          <w:rFonts w:ascii="Consolas" w:cs="Consolas" w:eastAsia="Consolas" w:hAnsi="Consolas"/>
+          <w:sz w:val="19"/>
+          <w:szCs w:val="19"/>
+        </w:rPr>
+        <w:br/>
+        <w:t xml:space="preserve">DIM f AS PARTICLE_SYSTEM</w:t>
+      </w:r>
+      <w:r>
+        <w:rPr>
+          <w:rFonts w:ascii="Consolas" w:cs="Consolas" w:eastAsia="Consolas" w:hAnsi="Consolas"/>
+          <w:sz w:val="19"/>
+          <w:szCs w:val="19"/>
+        </w:rPr>
+        <w:br/>
+        <w:t xml:space="preserve">f = PARTICLE_SYSTEM_NEW(240.0, 280.0)</w:t>
+      </w:r>
+      <w:r>
+        <w:rPr>
+          <w:rFonts w:ascii="Consolas" w:cs="Consolas" w:eastAsia="Consolas" w:hAnsi="Consolas"/>
+          <w:sz w:val="19"/>
+          <w:szCs w:val="19"/>
+        </w:rPr>
+        <w:br/>
+        <w:t xml:space="preserve">PARTICLE_SET_VELOCITY(f, -70.0, 70.0, -300.0, -200.0)</w:t>
+      </w:r>
+      <w:r>
+        <w:rPr>
+          <w:rFonts w:ascii="Consolas" w:cs="Consolas" w:eastAsia="Consolas" w:hAnsi="Consolas"/>
+          <w:sz w:val="19"/>
+          <w:szCs w:val="19"/>
+        </w:rPr>
+        <w:br/>
+        <w:t xml:space="preserve">PARTICLE_SET_GRAVITY(f, 0.0, 320.0)</w:t>
+      </w:r>
+      <w:r>
+        <w:rPr>
+          <w:rFonts w:ascii="Consolas" w:cs="Consolas" w:eastAsia="Consolas" w:hAnsi="Consolas"/>
+          <w:sz w:val="19"/>
+          <w:szCs w:val="19"/>
+        </w:rPr>
+        <w:br/>
+        <w:t xml:space="preserve">PARTICLE_SET_COLOR(f, RGB(255, 230, 120))</w:t>
+      </w:r>
+      <w:r>
+        <w:rPr>
+          <w:rFonts w:ascii="Consolas" w:cs="Consolas" w:eastAsia="Consolas" w:hAnsi="Consolas"/>
+          <w:sz w:val="19"/>
+          <w:szCs w:val="19"/>
+        </w:rPr>
+        <w:br/>
+        <w:t xml:space="preserve">PARTICLE_SET_COLOR_END(f, RGB(255, 60, 0))</w:t>
+      </w:r>
+      <w:r>
+        <w:rPr>
+          <w:rFonts w:ascii="Consolas" w:cs="Consolas" w:eastAsia="Consolas" w:hAnsi="Consolas"/>
+          <w:sz w:val="19"/>
+          <w:szCs w:val="19"/>
+        </w:rPr>
+        <w:br/>
+        <w:t xml:space="preserve">PARTICLE_SET_MODE(f, "glow")</w:t>
+      </w:r>
+      <w:r>
+        <w:rPr>
+          <w:rFonts w:ascii="Consolas" w:cs="Consolas" w:eastAsia="Consolas" w:hAnsi="Consolas"/>
+          <w:sz w:val="19"/>
+          <w:szCs w:val="19"/>
+        </w:rPr>
+        <w:br/>
+        <w:t xml:space="preserve"/>
+      </w:r>
+      <w:r>
+        <w:rPr>
+          <w:rFonts w:ascii="Consolas" w:cs="Consolas" w:eastAsia="Consolas" w:hAnsi="Consolas"/>
+          <w:sz w:val="19"/>
+          <w:szCs w:val="19"/>
+        </w:rPr>
+        <w:br/>
+        <w:t xml:space="preserve">WHILE NOT QUITREQUESTED()</w:t>
+      </w:r>
+      <w:r>
+        <w:rPr>
+          <w:rFonts w:ascii="Consolas" w:cs="Consolas" w:eastAsia="Consolas" w:hAnsi="Consolas"/>
+          <w:sz w:val="19"/>
+          <w:szCs w:val="19"/>
+        </w:rPr>
+        <w:br/>
+        <w:t xml:space="preserve">    PARTICLE_EMIT(f, 4)                       ' Dauerstrom</w:t>
+      </w:r>
+      <w:r>
+        <w:rPr>
+          <w:rFonts w:ascii="Consolas" w:cs="Consolas" w:eastAsia="Consolas" w:hAnsi="Consolas"/>
+          <w:sz w:val="19"/>
+          <w:szCs w:val="19"/>
+        </w:rPr>
+        <w:br/>
+        <w:t xml:space="preserve">    PARTICLE_UPDATE(f, INT(DELTA() * 1000.0))</w:t>
+      </w:r>
+      <w:r>
+        <w:rPr>
+          <w:rFonts w:ascii="Consolas" w:cs="Consolas" w:eastAsia="Consolas" w:hAnsi="Consolas"/>
+          <w:sz w:val="19"/>
+          <w:szCs w:val="19"/>
+        </w:rPr>
+        <w:br/>
+        <w:t xml:space="preserve">    CLS(RGB(12, 12, 20))</w:t>
+      </w:r>
+      <w:r>
+        <w:rPr>
+          <w:rFonts w:ascii="Consolas" w:cs="Consolas" w:eastAsia="Consolas" w:hAnsi="Consolas"/>
+          <w:sz w:val="19"/>
+          <w:szCs w:val="19"/>
+        </w:rPr>
+        <w:br/>
+        <w:t xml:space="preserve">    PARTICLE_DRAW(f)</w:t>
+      </w:r>
+      <w:r>
+        <w:rPr>
+          <w:rFonts w:ascii="Consolas" w:cs="Consolas" w:eastAsia="Consolas" w:hAnsi="Consolas"/>
+          <w:sz w:val="19"/>
+          <w:szCs w:val="19"/>
+        </w:rPr>
+        <w:br/>
+        <w:t xml:space="preserve">    FLIP()</w:t>
+      </w:r>
+      <w:r>
+        <w:rPr>
+          <w:rFonts w:ascii="Consolas" w:cs="Consolas" w:eastAsia="Consolas" w:hAnsi="Consolas"/>
+          <w:sz w:val="19"/>
+          <w:szCs w:val="19"/>
+        </w:rPr>
+        <w:br/>
+        <w:t xml:space="preserve">WEND</w:t>
+      </w:r>
+    </w:p>
+    <w:p>
+      <w:pPr>
+        <w:spacing w:before="60"/>
+      </w:pPr>
+    </w:p>
+    <w:tbl>
+      <w:tblPr>
+        <w:tblW w:type="dxa" w:w="9360"/>
+        <w:tblBorders>
+          <w:top w:val="single" w:color="auto" w:sz="4"/>
+          <w:left w:val="single" w:color="auto" w:sz="4"/>
+          <w:bottom w:val="single" w:color="auto" w:sz="4"/>
+          <w:right w:val="single" w:color="auto" w:sz="4"/>
+          <w:insideH w:val="single" w:color="auto" w:sz="4"/>
+          <w:insideV w:val="single" w:color="auto" w:sz="4"/>
+        </w:tblBorders>
+      </w:tblPr>
+      <w:tblGrid>
+        <w:gridCol w:w="9360"/>
+      </w:tblGrid>
+      <w:tr>
+        <w:trPr>
+          <w:cantSplit/>
+        </w:trPr>
+        <w:tc>
+          <w:tcPr>
+            <w:tcW w:type="dxa" w:w="9360"/>
+            <w:tcBorders>
+              <w:top w:val="single" w:color="9CC8E6" w:sz="6"/>
+              <w:left w:val="single" w:color="9CC8E6" w:sz="6"/>
+              <w:bottom w:val="single" w:color="9CC8E6" w:sz="6"/>
+              <w:right w:val="single" w:color="9CC8E6" w:sz="6"/>
+            </w:tcBorders>
+            <w:shd w:fill="E7F2FA" w:val="clear"/>
+            <w:tcMar>
+              <w:top w:type="dxa" w:w="140"/>
+              <w:left w:type="dxa" w:w="180"/>
+              <w:bottom w:type="dxa" w:w="140"/>
+              <w:right w:type="dxa" w:w="180"/>
+            </w:tcMar>
+          </w:tcPr>
+          <w:p>
+            <w:pPr>
+              <w:spacing w:after="40"/>
+            </w:pPr>
+            <w:r>
+              <w:rPr>
+                <w:b/>
+                <w:bCs/>
+                <w:color w:val="1B6CA8"/>
+                <w:sz w:val="22"/>
+                <w:szCs w:val="22"/>
+              </w:rPr>
+              <w:t xml:space="preserve">Effekt-Rezepte</w:t>
+            </w:r>
+          </w:p>
+          <w:p>
+            <w:pPr>
+              <w:spacing w:after="0" w:line="312" w:lineRule="auto"/>
+            </w:pPr>
+            <w:r>
+              <w:rPr>
+                <w:sz w:val="22"/>
+                <w:szCs w:val="22"/>
+              </w:rPr>
+              <w:t xml:space="preserve">Explosion: einmalig viele Teilchen mit Rundum-Streuung. Rauch: langsame, große, langlebige Teilchen ohne Schwerkraft mit FADE. Regen: schmaler x-Bereich, starkes positives gy, streak-Modus. Es gibt auch einen eigenen Partikel-Editor zum Ausprobieren der Werte.</w:t>
             </w:r>
           </w:p>
         </w:tc>

</xml_diff>

<commit_message>
docs(buch): Kap 55 physics/2d/3d (Screenshot) + gbrt-Fix PHYS3D-Flags
Lehrbuch Kap 55: physics (Kollisions-Mathe PHYSICS_BOX_BOX/CIRCLE/DISTANCE/
LENGTH/NORM/REFLECT/RAY), physics2d (PHYS2D_NEW/SET_GRAVITY/ADD_BOX/ADD_CIRCLE/
STEP/BODY_X-Y-ANGLE) mit Baelle-Stapel-Screenshot, physics3d (PHYS3D_NEW/ADD_BOX/
ADD_SPHERE/STEP/BODY_X-Y-Z+Quaternion).

fix(gbrt): PHYS3D_ADD_BOX/ADD_SPHERE dynamic-Flag via need_flag -> akzeptiert
TRUE/FALSE UND 1/0 (vorher need_num, bool abgelehnt; jetzt konsistent mit
physics2d). 11 physics-Tests gruen.

Co-Authored-By: Claude Opus 4.8 (1M context) <noreply@anthropic.com>
</commit_message>
<xml_diff>
--- a/buch-referenz/buch/GameBasic-Lehrbuch.docx
+++ b/buch-referenz/buch/GameBasic-Lehrbuch.docx
@@ -1434,6 +1434,33 @@
           <w:szCs w:val="22"/>
         </w:rPr>
         <w:t xml:space="preserve">	184</w:t>
+      </w:r>
+    </w:p>
+    <w:p>
+      <w:pPr>
+        <w:tabs>
+          <w:tab w:val="right" w:pos="9200" w:leader="dot"/>
+        </w:tabs>
+        <w:spacing w:after="20" w:before="0"/>
+        <w:ind w:left="280"/>
+      </w:pPr>
+      <w:r>
+        <w:rPr>
+          <w:b w:val="false"/>
+          <w:bCs w:val="false"/>
+          <w:color w:val="222222"/>
+          <w:sz w:val="22"/>
+          <w:szCs w:val="22"/>
+        </w:rPr>
+        <w:t xml:space="preserve">Module: physics, physics2d &amp; physics3d</w:t>
+      </w:r>
+      <w:r>
+        <w:rPr>
+          <w:color w:val="555555"/>
+          <w:sz w:val="22"/>
+          <w:szCs w:val="22"/>
+        </w:rPr>
+        <w:t xml:space="preserve">	188</w:t>
       </w:r>
     </w:p>
     <w:p>
@@ -62077,6 +62104,1642 @@
                 <w:szCs w:val="22"/>
               </w:rPr>
               <w:t xml:space="preserve">Explosion: einmalig viele Teilchen mit Rundum-Streuung. Rauch: langsame, große, langlebige Teilchen ohne Schwerkraft mit FADE. Regen: schmaler x-Bereich, starkes positives gy, streak-Modus. Es gibt auch einen eigenen Partikel-Editor zum Ausprobieren der Werte.</w:t>
+            </w:r>
+          </w:p>
+        </w:tc>
+      </w:tr>
+    </w:tbl>
+    <w:p>
+      <w:pPr>
+        <w:spacing w:after="160"/>
+      </w:pPr>
+    </w:p>
+    <w:p>
+      <w:pPr>
+        <w:pStyle w:val="Heading1"/>
+        <w:keepNext/>
+        <w:keepLines/>
+        <w:pageBreakBefore/>
+        <w:pBdr>
+          <w:bottom w:val="single" w:color="1B6CA8" w:sz="12" w:space="4"/>
+        </w:pBdr>
+        <w:spacing w:after="160" w:before="0"/>
+      </w:pPr>
+      <w:r>
+        <w:t xml:space="preserve">Module: physics, physics2d &amp; physics3d</w:t>
+      </w:r>
+    </w:p>
+    <w:p>
+      <w:pPr>
+        <w:spacing w:after="180" w:line="312" w:lineRule="auto"/>
+      </w:pPr>
+      <w:r>
+        <w:rPr>
+          <w:sz w:val="22"/>
+          <w:szCs w:val="22"/>
+        </w:rPr>
+        <w:t xml:space="preserve">GameBasic bringt drei Physik-Module mit – wähle nach Bedarf: physics ist reine Kollisions-Mathematik ohne eigenen Zustand (du behältst die volle Kontrolle), physics2d und physics3d sind dagegen vollwertige Physik-Engines, die Schwerkraft, Stöße und Reibung selbst berechnen. Dieses Kapitel stellt alle drei vor.</w:t>
+      </w:r>
+    </w:p>
+    <w:p>
+      <w:pPr>
+        <w:keepNext/>
+        <w:spacing w:after="40" w:before="160"/>
+        <w:jc w:val="center"/>
+      </w:pPr>
+      <w:r>
+        <w:drawing>
+          <wp:inline distT="0" distB="0" distL="0" distR="0">
+            <wp:extent cx="4572000" cy="3048000"/>
+            <wp:effectExtent t="0" r="0" b="0" l="0"/>
+            <wp:docPr id="1" name="55_physics2d.png" descr="physics2d in Aktion: zehn Bälle fallen unter Schwerkraft, prallen ab und sammeln sich – alles von der Engine berechnet." title="physics2d in Aktion: zehn Bälle fallen unter Schwerkraft, prallen ab und sammeln sich – alles von der Engine berechnet."/>
+            <wp:cNvGraphicFramePr>
+              <a:graphicFrameLocks xmlns:a="http://schemas.openxmlformats.org/drawingml/2006/main" noChangeAspect="1"/>
+            </wp:cNvGraphicFramePr>
+            <a:graphic xmlns:a="http://schemas.openxmlformats.org/drawingml/2006/main">
+              <a:graphicData uri="http://schemas.openxmlformats.org/drawingml/2006/picture">
+                <pic:pic xmlns:pic="http://schemas.openxmlformats.org/drawingml/2006/picture">
+                  <pic:nvPicPr>
+                    <pic:cNvPr id="0" name="" descr=""/>
+                    <pic:cNvPicPr>
+                      <a:picLocks noChangeAspect="1" noChangeArrowheads="1"/>
+                    </pic:cNvPicPr>
+                  </pic:nvPicPr>
+                  <pic:blipFill>
+                    <a:blip r:embed="rId23" cstate="none"/>
+                    <a:srcRect/>
+                    <a:stretch>
+                      <a:fillRect/>
+                    </a:stretch>
+                  </pic:blipFill>
+                  <pic:spPr bwMode="auto">
+                    <a:xfrm>
+                      <a:off x="0" y="0"/>
+                      <a:ext cx="4572000" cy="3048000"/>
+                    </a:xfrm>
+                    <a:prstGeom prst="rect">
+                      <a:avLst/>
+                    </a:prstGeom>
+                  </pic:spPr>
+                </pic:pic>
+              </a:graphicData>
+            </a:graphic>
+          </wp:inline>
+        </w:drawing>
+      </w:r>
+    </w:p>
+    <w:p>
+      <w:pPr>
+        <w:spacing w:after="200"/>
+        <w:jc w:val="center"/>
+      </w:pPr>
+      <w:r>
+        <w:rPr>
+          <w:i/>
+          <w:iCs/>
+          <w:color w:val="6A6A6A"/>
+          <w:sz w:val="18"/>
+          <w:szCs w:val="18"/>
+        </w:rPr>
+        <w:t xml:space="preserve">physics2d in Aktion: zehn Bälle fallen unter Schwerkraft, prallen ab und sammeln sich – alles von der Engine berechnet.</w:t>
+      </w:r>
+    </w:p>
+    <w:p>
+      <w:pPr>
+        <w:pStyle w:val="Heading2"/>
+        <w:keepNext/>
+        <w:keepLines/>
+        <w:spacing w:after="120" w:before="280"/>
+      </w:pPr>
+      <w:r>
+        <w:t xml:space="preserve">physics — Kollisions-Mathematik</w:t>
+      </w:r>
+    </w:p>
+    <w:p>
+      <w:pPr>
+        <w:spacing w:after="180" w:line="312" w:lineRule="auto"/>
+      </w:pPr>
+      <w:r>
+        <w:rPr>
+          <w:sz w:val="22"/>
+          <w:szCs w:val="22"/>
+        </w:rPr>
+        <w:t xml:space="preserve">Das Modul physics besteht nur aus reinen Funktionen: Sie rechnen etwas aus und geben ein Ergebnis zurück, ohne sich etwas zu merken. Damit prüfst du Überlappungen, misst Abstände oder lässt einen Ball an einer Wand abprallen – die Bewegung programmierst du selbst. Ideal, wenn du schlanke, vorhersehbare Kontrolle willst.</w:t>
+      </w:r>
+    </w:p>
+    <w:p>
+      <w:pPr>
+        <w:keepNext/>
+        <w:keepLines/>
+        <w:pBdr>
+          <w:bottom w:val="single" w:color="DDD0C0" w:sz="4" w:space="2"/>
+        </w:pBdr>
+        <w:spacing w:after="40" w:before="360"/>
+      </w:pPr>
+      <w:r>
+        <w:rPr>
+          <w:rFonts w:ascii="Consolas" w:cs="Consolas" w:eastAsia="Consolas" w:hAnsi="Consolas"/>
+          <w:b/>
+          <w:bCs/>
+          <w:color w:val="9A3412"/>
+          <w:sz w:val="24"/>
+          <w:szCs w:val="24"/>
+        </w:rPr>
+        <w:t xml:space="preserve">PHYSICS_BOX_BOX · PHYSICS_CIRCLE_CIRCLE</w:t>
+      </w:r>
+    </w:p>
+    <w:p>
+      <w:pPr>
+        <w:keepNext/>
+        <w:spacing w:after="120"/>
+      </w:pPr>
+      <w:r>
+        <w:rPr>
+          <w:b/>
+          <w:bCs/>
+          <w:color w:val="6A6A6A"/>
+          <w:sz w:val="18"/>
+          <w:szCs w:val="18"/>
+        </w:rPr>
+        <w:t xml:space="preserve">Syntax:  </w:t>
+      </w:r>
+      <w:r>
+        <w:rPr>
+          <w:rFonts w:ascii="Consolas" w:cs="Consolas" w:eastAsia="Consolas" w:hAnsi="Consolas"/>
+          <w:color w:val="335577"/>
+          <w:sz w:val="19"/>
+          <w:szCs w:val="19"/>
+        </w:rPr>
+        <w:t xml:space="preserve">PHYSICS_BOX_BOX(x1,y1,w1,h1, x2,y2,w2,h2)   PHYSICS_CIRCLE_CIRCLE(cx1,cy1,r1, cx2,cy2,r2)</w:t>
+      </w:r>
+    </w:p>
+    <w:p>
+      <w:pPr>
+        <w:spacing w:after="180" w:line="312" w:lineRule="auto"/>
+      </w:pPr>
+      <w:r>
+        <w:rPr>
+          <w:sz w:val="22"/>
+          <w:szCs w:val="22"/>
+        </w:rPr>
+        <w:t xml:space="preserve">Liefern TRUE, wenn sich zwei Rechtecke bzw. zwei Kreise überlappen. PHYSICS_BOX_BOX ist die schnellste Kollisionsprüfung überhaupt – ideal als Spieler-trifft-Gegner-Test.</w:t>
+      </w:r>
+    </w:p>
+    <w:p>
+      <w:pPr>
+        <w:keepNext/>
+        <w:spacing w:after="30" w:before="120"/>
+      </w:pPr>
+      <w:r>
+        <w:rPr>
+          <w:b/>
+          <w:bCs/>
+          <w:i/>
+          <w:iCs/>
+          <w:color w:val="6A6A6A"/>
+          <w:sz w:val="18"/>
+          <w:szCs w:val="18"/>
+        </w:rPr>
+        <w:t xml:space="preserve">Beispiel</w:t>
+      </w:r>
+    </w:p>
+    <w:p>
+      <w:pPr>
+        <w:keepLines/>
+        <w:pBdr>
+          <w:left w:val="single" w:color="1B6CA8" w:sz="18" w:space="6"/>
+        </w:pBdr>
+        <w:shd w:fill="F4F4F4" w:val="clear"/>
+        <w:spacing w:after="200" w:before="100" w:line="264" w:lineRule="auto"/>
+        <w:ind w:left="140"/>
+      </w:pPr>
+      <w:r>
+        <w:rPr>
+          <w:rFonts w:ascii="Consolas" w:cs="Consolas" w:eastAsia="Consolas" w:hAnsi="Consolas"/>
+          <w:sz w:val="19"/>
+          <w:szCs w:val="19"/>
+        </w:rPr>
+        <w:t xml:space="preserve">IMPORT "physics"</w:t>
+      </w:r>
+      <w:r>
+        <w:rPr>
+          <w:rFonts w:ascii="Consolas" w:cs="Consolas" w:eastAsia="Consolas" w:hAnsi="Consolas"/>
+          <w:sz w:val="19"/>
+          <w:szCs w:val="19"/>
+        </w:rPr>
+        <w:br/>
+        <w:t xml:space="preserve">PRINT PHYSICS_BOX_BOX(0,0,32,32, 20,20,32,32)</w:t>
+      </w:r>
+      <w:r>
+        <w:rPr>
+          <w:rFonts w:ascii="Consolas" w:cs="Consolas" w:eastAsia="Consolas" w:hAnsi="Consolas"/>
+          <w:sz w:val="19"/>
+          <w:szCs w:val="19"/>
+        </w:rPr>
+        <w:br/>
+        <w:t xml:space="preserve">PRINT PHYSICS_BOX_BOX(0,0,32,32, 50,50,32,32)</w:t>
+      </w:r>
+    </w:p>
+    <w:p>
+      <w:pPr>
+        <w:keepNext/>
+        <w:spacing w:after="30" w:before="120"/>
+      </w:pPr>
+      <w:r>
+        <w:rPr>
+          <w:b/>
+          <w:bCs/>
+          <w:i/>
+          <w:iCs/>
+          <w:color w:val="6A6A6A"/>
+          <w:sz w:val="18"/>
+          <w:szCs w:val="18"/>
+        </w:rPr>
+        <w:t xml:space="preserve">Ausgabe</w:t>
+      </w:r>
+    </w:p>
+    <w:p>
+      <w:pPr>
+        <w:keepLines/>
+        <w:pBdr>
+          <w:left w:val="single" w:color="9AC79A" w:sz="18" w:space="6"/>
+        </w:pBdr>
+        <w:shd w:fill="EAF4EA" w:val="clear"/>
+        <w:spacing w:after="200" w:before="100" w:line="264" w:lineRule="auto"/>
+        <w:ind w:left="140"/>
+      </w:pPr>
+      <w:r>
+        <w:rPr>
+          <w:rFonts w:ascii="Consolas" w:cs="Consolas" w:eastAsia="Consolas" w:hAnsi="Consolas"/>
+          <w:sz w:val="19"/>
+          <w:szCs w:val="19"/>
+        </w:rPr>
+        <w:t xml:space="preserve">TRUE</w:t>
+      </w:r>
+      <w:r>
+        <w:rPr>
+          <w:rFonts w:ascii="Consolas" w:cs="Consolas" w:eastAsia="Consolas" w:hAnsi="Consolas"/>
+          <w:sz w:val="19"/>
+          <w:szCs w:val="19"/>
+        </w:rPr>
+        <w:br/>
+        <w:t xml:space="preserve">FALSE</w:t>
+      </w:r>
+    </w:p>
+    <w:p>
+      <w:pPr>
+        <w:keepNext/>
+        <w:keepLines/>
+        <w:pBdr>
+          <w:bottom w:val="single" w:color="DDD0C0" w:sz="4" w:space="2"/>
+        </w:pBdr>
+        <w:spacing w:after="40" w:before="360"/>
+      </w:pPr>
+      <w:r>
+        <w:rPr>
+          <w:rFonts w:ascii="Consolas" w:cs="Consolas" w:eastAsia="Consolas" w:hAnsi="Consolas"/>
+          <w:b/>
+          <w:bCs/>
+          <w:color w:val="9A3412"/>
+          <w:sz w:val="24"/>
+          <w:szCs w:val="24"/>
+        </w:rPr>
+        <w:t xml:space="preserve">PHYSICS_DISTANCE · PHYSICS_LENGTH</w:t>
+      </w:r>
+    </w:p>
+    <w:p>
+      <w:pPr>
+        <w:keepNext/>
+        <w:spacing w:after="120"/>
+      </w:pPr>
+      <w:r>
+        <w:rPr>
+          <w:b/>
+          <w:bCs/>
+          <w:color w:val="6A6A6A"/>
+          <w:sz w:val="18"/>
+          <w:szCs w:val="18"/>
+        </w:rPr>
+        <w:t xml:space="preserve">Syntax:  </w:t>
+      </w:r>
+      <w:r>
+        <w:rPr>
+          <w:rFonts w:ascii="Consolas" w:cs="Consolas" w:eastAsia="Consolas" w:hAnsi="Consolas"/>
+          <w:color w:val="335577"/>
+          <w:sz w:val="19"/>
+          <w:szCs w:val="19"/>
+        </w:rPr>
+        <w:t xml:space="preserve">PHYSICS_DISTANCE(x1,y1, x2,y2)   PHYSICS_LENGTH(vx, vy)</w:t>
+      </w:r>
+    </w:p>
+    <w:p>
+      <w:pPr>
+        <w:spacing w:after="180" w:line="312" w:lineRule="auto"/>
+      </w:pPr>
+      <w:r>
+        <w:rPr>
+          <w:sz w:val="22"/>
+          <w:szCs w:val="22"/>
+        </w:rPr>
+        <w:t xml:space="preserve">PHYSICS_DISTANCE misst den Abstand zweier Punkte, PHYSICS_LENGTH die Länge eines Vektors. (Für reine Vergleiche „näher als“ gibt es PHYSICS_DISTANCE2 ohne Wurzel – schneller.)</w:t>
+      </w:r>
+    </w:p>
+    <w:p>
+      <w:pPr>
+        <w:keepNext/>
+        <w:spacing w:after="30" w:before="120"/>
+      </w:pPr>
+      <w:r>
+        <w:rPr>
+          <w:b/>
+          <w:bCs/>
+          <w:i/>
+          <w:iCs/>
+          <w:color w:val="6A6A6A"/>
+          <w:sz w:val="18"/>
+          <w:szCs w:val="18"/>
+        </w:rPr>
+        <w:t xml:space="preserve">Beispiel</w:t>
+      </w:r>
+    </w:p>
+    <w:p>
+      <w:pPr>
+        <w:keepLines/>
+        <w:pBdr>
+          <w:left w:val="single" w:color="1B6CA8" w:sz="18" w:space="6"/>
+        </w:pBdr>
+        <w:shd w:fill="F4F4F4" w:val="clear"/>
+        <w:spacing w:after="200" w:before="100" w:line="264" w:lineRule="auto"/>
+        <w:ind w:left="140"/>
+      </w:pPr>
+      <w:r>
+        <w:rPr>
+          <w:rFonts w:ascii="Consolas" w:cs="Consolas" w:eastAsia="Consolas" w:hAnsi="Consolas"/>
+          <w:sz w:val="19"/>
+          <w:szCs w:val="19"/>
+        </w:rPr>
+        <w:t xml:space="preserve">PRINT PHYSICS_DISTANCE(0,0, 3,4)</w:t>
+      </w:r>
+      <w:r>
+        <w:rPr>
+          <w:rFonts w:ascii="Consolas" w:cs="Consolas" w:eastAsia="Consolas" w:hAnsi="Consolas"/>
+          <w:sz w:val="19"/>
+          <w:szCs w:val="19"/>
+        </w:rPr>
+        <w:br/>
+        <w:t xml:space="preserve">PRINT PHYSICS_LENGTH(3.0, 4.0)</w:t>
+      </w:r>
+    </w:p>
+    <w:p>
+      <w:pPr>
+        <w:keepNext/>
+        <w:spacing w:after="30" w:before="120"/>
+      </w:pPr>
+      <w:r>
+        <w:rPr>
+          <w:b/>
+          <w:bCs/>
+          <w:i/>
+          <w:iCs/>
+          <w:color w:val="6A6A6A"/>
+          <w:sz w:val="18"/>
+          <w:szCs w:val="18"/>
+        </w:rPr>
+        <w:t xml:space="preserve">Ausgabe</w:t>
+      </w:r>
+    </w:p>
+    <w:p>
+      <w:pPr>
+        <w:keepLines/>
+        <w:pBdr>
+          <w:left w:val="single" w:color="9AC79A" w:sz="18" w:space="6"/>
+        </w:pBdr>
+        <w:shd w:fill="EAF4EA" w:val="clear"/>
+        <w:spacing w:after="200" w:before="100" w:line="264" w:lineRule="auto"/>
+        <w:ind w:left="140"/>
+      </w:pPr>
+      <w:r>
+        <w:rPr>
+          <w:rFonts w:ascii="Consolas" w:cs="Consolas" w:eastAsia="Consolas" w:hAnsi="Consolas"/>
+          <w:sz w:val="19"/>
+          <w:szCs w:val="19"/>
+        </w:rPr>
+        <w:t xml:space="preserve">5.0</w:t>
+      </w:r>
+      <w:r>
+        <w:rPr>
+          <w:rFonts w:ascii="Consolas" w:cs="Consolas" w:eastAsia="Consolas" w:hAnsi="Consolas"/>
+          <w:sz w:val="19"/>
+          <w:szCs w:val="19"/>
+        </w:rPr>
+        <w:br/>
+        <w:t xml:space="preserve">5.0</w:t>
+      </w:r>
+    </w:p>
+    <w:p>
+      <w:pPr>
+        <w:keepNext/>
+        <w:keepLines/>
+        <w:pBdr>
+          <w:bottom w:val="single" w:color="DDD0C0" w:sz="4" w:space="2"/>
+        </w:pBdr>
+        <w:spacing w:after="40" w:before="360"/>
+      </w:pPr>
+      <w:r>
+        <w:rPr>
+          <w:rFonts w:ascii="Consolas" w:cs="Consolas" w:eastAsia="Consolas" w:hAnsi="Consolas"/>
+          <w:b/>
+          <w:bCs/>
+          <w:color w:val="9A3412"/>
+          <w:sz w:val="24"/>
+          <w:szCs w:val="24"/>
+        </w:rPr>
+        <w:t xml:space="preserve">PHYSICS_NORM_X/Y · PHYSICS_REFLECT_X/Y</w:t>
+      </w:r>
+    </w:p>
+    <w:p>
+      <w:pPr>
+        <w:keepNext/>
+        <w:spacing w:after="120"/>
+      </w:pPr>
+      <w:r>
+        <w:rPr>
+          <w:b/>
+          <w:bCs/>
+          <w:color w:val="6A6A6A"/>
+          <w:sz w:val="18"/>
+          <w:szCs w:val="18"/>
+        </w:rPr>
+        <w:t xml:space="preserve">Syntax:  </w:t>
+      </w:r>
+      <w:r>
+        <w:rPr>
+          <w:rFonts w:ascii="Consolas" w:cs="Consolas" w:eastAsia="Consolas" w:hAnsi="Consolas"/>
+          <w:color w:val="335577"/>
+          <w:sz w:val="19"/>
+          <w:szCs w:val="19"/>
+        </w:rPr>
+        <w:t xml:space="preserve">PHYSICS_NORM_X(vx,vy) / _Y   PHYSICS_REFLECT_X(vx,vy, nx,ny) / _Y</w:t>
+      </w:r>
+    </w:p>
+    <w:p>
+      <w:pPr>
+        <w:spacing w:after="180" w:line="312" w:lineRule="auto"/>
+      </w:pPr>
+      <w:r>
+        <w:rPr>
+          <w:sz w:val="22"/>
+          <w:szCs w:val="22"/>
+        </w:rPr>
+        <w:t xml:space="preserve">NORM liefert die Anteile des auf Länge 1 gebrachten Vektors (Richtung ohne Tempo). REFLECT spiegelt einen Geschwindigkeitsvektor an einer Fläche mit Normale (nx, ny) – das klassische „Ball prallt von der Wand ab“.</w:t>
+      </w:r>
+    </w:p>
+    <w:p>
+      <w:pPr>
+        <w:keepNext/>
+        <w:spacing w:after="30" w:before="120"/>
+      </w:pPr>
+      <w:r>
+        <w:rPr>
+          <w:b/>
+          <w:bCs/>
+          <w:i/>
+          <w:iCs/>
+          <w:color w:val="6A6A6A"/>
+          <w:sz w:val="18"/>
+          <w:szCs w:val="18"/>
+        </w:rPr>
+        <w:t xml:space="preserve">Beispiel</w:t>
+      </w:r>
+    </w:p>
+    <w:p>
+      <w:pPr>
+        <w:keepLines/>
+        <w:pBdr>
+          <w:left w:val="single" w:color="1B6CA8" w:sz="18" w:space="6"/>
+        </w:pBdr>
+        <w:shd w:fill="F4F4F4" w:val="clear"/>
+        <w:spacing w:after="200" w:before="100" w:line="264" w:lineRule="auto"/>
+        <w:ind w:left="140"/>
+      </w:pPr>
+      <w:r>
+        <w:rPr>
+          <w:rFonts w:ascii="Consolas" w:cs="Consolas" w:eastAsia="Consolas" w:hAnsi="Consolas"/>
+          <w:sz w:val="19"/>
+          <w:szCs w:val="19"/>
+        </w:rPr>
+        <w:t xml:space="preserve">PRINT ROUND(PHYSICS_NORM_X(3.0, 4.0), 2); " "; ROUND(PHYSICS_NORM_Y(3.0, 4.0), 2)</w:t>
+      </w:r>
+      <w:r>
+        <w:rPr>
+          <w:rFonts w:ascii="Consolas" w:cs="Consolas" w:eastAsia="Consolas" w:hAnsi="Consolas"/>
+          <w:sz w:val="19"/>
+          <w:szCs w:val="19"/>
+        </w:rPr>
+        <w:br/>
+        <w:t xml:space="preserve">PRINT PHYSICS_REFLECT_Y(5.0, 5.0, 0.0, 1.0)   ' am Boden abprallen</w:t>
+      </w:r>
+    </w:p>
+    <w:p>
+      <w:pPr>
+        <w:keepNext/>
+        <w:spacing w:after="30" w:before="120"/>
+      </w:pPr>
+      <w:r>
+        <w:rPr>
+          <w:b/>
+          <w:bCs/>
+          <w:i/>
+          <w:iCs/>
+          <w:color w:val="6A6A6A"/>
+          <w:sz w:val="18"/>
+          <w:szCs w:val="18"/>
+        </w:rPr>
+        <w:t xml:space="preserve">Ausgabe</w:t>
+      </w:r>
+    </w:p>
+    <w:p>
+      <w:pPr>
+        <w:keepLines/>
+        <w:pBdr>
+          <w:left w:val="single" w:color="9AC79A" w:sz="18" w:space="6"/>
+        </w:pBdr>
+        <w:shd w:fill="EAF4EA" w:val="clear"/>
+        <w:spacing w:after="200" w:before="100" w:line="264" w:lineRule="auto"/>
+        <w:ind w:left="140"/>
+      </w:pPr>
+      <w:r>
+        <w:rPr>
+          <w:rFonts w:ascii="Consolas" w:cs="Consolas" w:eastAsia="Consolas" w:hAnsi="Consolas"/>
+          <w:sz w:val="19"/>
+          <w:szCs w:val="19"/>
+        </w:rPr>
+        <w:t xml:space="preserve">0.6 0.8</w:t>
+      </w:r>
+      <w:r>
+        <w:rPr>
+          <w:rFonts w:ascii="Consolas" w:cs="Consolas" w:eastAsia="Consolas" w:hAnsi="Consolas"/>
+          <w:sz w:val="19"/>
+          <w:szCs w:val="19"/>
+        </w:rPr>
+        <w:br/>
+        <w:t xml:space="preserve">-5.0</w:t>
+      </w:r>
+    </w:p>
+    <w:p>
+      <w:pPr>
+        <w:spacing w:before="60"/>
+      </w:pPr>
+    </w:p>
+    <w:tbl>
+      <w:tblPr>
+        <w:tblW w:type="dxa" w:w="9360"/>
+        <w:tblBorders>
+          <w:top w:val="single" w:color="auto" w:sz="4"/>
+          <w:left w:val="single" w:color="auto" w:sz="4"/>
+          <w:bottom w:val="single" w:color="auto" w:sz="4"/>
+          <w:right w:val="single" w:color="auto" w:sz="4"/>
+          <w:insideH w:val="single" w:color="auto" w:sz="4"/>
+          <w:insideV w:val="single" w:color="auto" w:sz="4"/>
+        </w:tblBorders>
+      </w:tblPr>
+      <w:tblGrid>
+        <w:gridCol w:w="9360"/>
+      </w:tblGrid>
+      <w:tr>
+        <w:trPr>
+          <w:cantSplit/>
+        </w:trPr>
+        <w:tc>
+          <w:tcPr>
+            <w:tcW w:type="dxa" w:w="9360"/>
+            <w:tcBorders>
+              <w:top w:val="single" w:color="E0B96A" w:sz="6"/>
+              <w:left w:val="single" w:color="E0B96A" w:sz="6"/>
+              <w:bottom w:val="single" w:color="E0B96A" w:sz="6"/>
+              <w:right w:val="single" w:color="E0B96A" w:sz="6"/>
+            </w:tcBorders>
+            <w:shd w:fill="FDF3E0" w:val="clear"/>
+            <w:tcMar>
+              <w:top w:type="dxa" w:w="140"/>
+              <w:left w:type="dxa" w:w="180"/>
+              <w:bottom w:type="dxa" w:w="140"/>
+              <w:right w:type="dxa" w:w="180"/>
+            </w:tcMar>
+          </w:tcPr>
+          <w:p>
+            <w:pPr>
+              <w:spacing w:after="40"/>
+            </w:pPr>
+            <w:r>
+              <w:rPr>
+                <w:b/>
+                <w:bCs/>
+                <w:color w:val="9A6A1E"/>
+                <w:sz w:val="22"/>
+                <w:szCs w:val="22"/>
+              </w:rPr>
+              <w:t xml:space="preserve">Merke</w:t>
+            </w:r>
+          </w:p>
+          <w:p>
+            <w:pPr>
+              <w:spacing w:after="0" w:line="312" w:lineRule="auto"/>
+            </w:pPr>
+            <w:r>
+              <w:rPr>
+                <w:sz w:val="22"/>
+                <w:szCs w:val="22"/>
+              </w:rPr>
+              <w:t xml:space="preserve">Es gibt außerdem PHYSICS_BOX_CIRCLE, PHYSICS_POINT_BOX/CIRCLE sowie Strahl-Tests PHYSICS_RAY_BOX/RAY_CIRCLE (für Schüsse und Sichtlinien). Alle sind reine Funktionen – kein Zustand, keine Überraschungen.</w:t>
+            </w:r>
+          </w:p>
+        </w:tc>
+      </w:tr>
+    </w:tbl>
+    <w:p>
+      <w:pPr>
+        <w:spacing w:after="160"/>
+      </w:pPr>
+    </w:p>
+    <w:p>
+      <w:pPr>
+        <w:pStyle w:val="Heading2"/>
+        <w:keepNext/>
+        <w:keepLines/>
+        <w:spacing w:after="120" w:before="280"/>
+      </w:pPr>
+      <w:r>
+        <w:t xml:space="preserve">physics2d — echte 2D-Physik</w:t>
+      </w:r>
+    </w:p>
+    <w:p>
+      <w:pPr>
+        <w:spacing w:after="180" w:line="312" w:lineRule="auto"/>
+      </w:pPr>
+      <w:r>
+        <w:rPr>
+          <w:sz w:val="22"/>
+          <w:szCs w:val="22"/>
+        </w:rPr>
+        <w:t xml:space="preserve">Während physics nur rechnet, simuliert physics2d eine ganze Welt: Du legst Körper an, gibst eine Schwerkraft vor und rufst pro Frame einen Simulationsschritt – die Engine kümmert sich um Fallen, Stoßen, Stapeln und Abprallen. Praktisch für Sandkästen, Stapel-Puzzles oder alles, was sich glaubwürdig bewegen soll. (Sie nutzt die bewährte Rapier-Physik-Engine.)</w:t>
+      </w:r>
+    </w:p>
+    <w:p>
+      <w:pPr>
+        <w:spacing w:before="60"/>
+      </w:pPr>
+    </w:p>
+    <w:tbl>
+      <w:tblPr>
+        <w:tblW w:type="dxa" w:w="9360"/>
+        <w:tblBorders>
+          <w:top w:val="single" w:color="auto" w:sz="4"/>
+          <w:left w:val="single" w:color="auto" w:sz="4"/>
+          <w:bottom w:val="single" w:color="auto" w:sz="4"/>
+          <w:right w:val="single" w:color="auto" w:sz="4"/>
+          <w:insideH w:val="single" w:color="auto" w:sz="4"/>
+          <w:insideV w:val="single" w:color="auto" w:sz="4"/>
+        </w:tblBorders>
+      </w:tblPr>
+      <w:tblGrid>
+        <w:gridCol w:w="9360"/>
+      </w:tblGrid>
+      <w:tr>
+        <w:trPr>
+          <w:cantSplit/>
+        </w:trPr>
+        <w:tc>
+          <w:tcPr>
+            <w:tcW w:type="dxa" w:w="9360"/>
+            <w:tcBorders>
+              <w:top w:val="single" w:color="E0B96A" w:sz="6"/>
+              <w:left w:val="single" w:color="E0B96A" w:sz="6"/>
+              <w:bottom w:val="single" w:color="E0B96A" w:sz="6"/>
+              <w:right w:val="single" w:color="E0B96A" w:sz="6"/>
+            </w:tcBorders>
+            <w:shd w:fill="FDF3E0" w:val="clear"/>
+            <w:tcMar>
+              <w:top w:type="dxa" w:w="140"/>
+              <w:left w:type="dxa" w:w="180"/>
+              <w:bottom w:type="dxa" w:w="140"/>
+              <w:right w:type="dxa" w:w="180"/>
+            </w:tcMar>
+          </w:tcPr>
+          <w:p>
+            <w:pPr>
+              <w:spacing w:after="40"/>
+            </w:pPr>
+            <w:r>
+              <w:rPr>
+                <w:b/>
+                <w:bCs/>
+                <w:color w:val="9A6A1E"/>
+                <w:sz w:val="22"/>
+                <w:szCs w:val="22"/>
+              </w:rPr>
+              <w:t xml:space="preserve">Wichtig</w:t>
+            </w:r>
+          </w:p>
+          <w:p>
+            <w:pPr>
+              <w:spacing w:after="0" w:line="312" w:lineRule="auto"/>
+            </w:pPr>
+            <w:r>
+              <w:rPr>
+                <w:sz w:val="22"/>
+                <w:szCs w:val="22"/>
+              </w:rPr>
+              <w:t xml:space="preserve">Bildschirm-Konvention: y zeigt nach UNTEN, die Default-Schwerkraft ist (0, 980) – Körper fallen also von selbst nach unten. Box-Maße sind Halb-Extents (die halbe Breite/Höhe).</w:t>
+            </w:r>
+          </w:p>
+        </w:tc>
+      </w:tr>
+    </w:tbl>
+    <w:p>
+      <w:pPr>
+        <w:spacing w:after="160"/>
+      </w:pPr>
+    </w:p>
+    <w:p>
+      <w:pPr>
+        <w:keepNext/>
+        <w:keepLines/>
+        <w:pBdr>
+          <w:bottom w:val="single" w:color="DDD0C0" w:sz="4" w:space="2"/>
+        </w:pBdr>
+        <w:spacing w:after="40" w:before="360"/>
+      </w:pPr>
+      <w:r>
+        <w:rPr>
+          <w:rFonts w:ascii="Consolas" w:cs="Consolas" w:eastAsia="Consolas" w:hAnsi="Consolas"/>
+          <w:b/>
+          <w:bCs/>
+          <w:color w:val="9A3412"/>
+          <w:sz w:val="24"/>
+          <w:szCs w:val="24"/>
+        </w:rPr>
+        <w:t xml:space="preserve">PHYS2D_NEW · PHYS2D_SET_GRAVITY</w:t>
+      </w:r>
+    </w:p>
+    <w:p>
+      <w:pPr>
+        <w:keepNext/>
+        <w:spacing w:after="120"/>
+      </w:pPr>
+      <w:r>
+        <w:rPr>
+          <w:b/>
+          <w:bCs/>
+          <w:color w:val="6A6A6A"/>
+          <w:sz w:val="18"/>
+          <w:szCs w:val="18"/>
+        </w:rPr>
+        <w:t xml:space="preserve">Syntax:  </w:t>
+      </w:r>
+      <w:r>
+        <w:rPr>
+          <w:rFonts w:ascii="Consolas" w:cs="Consolas" w:eastAsia="Consolas" w:hAnsi="Consolas"/>
+          <w:color w:val="335577"/>
+          <w:sz w:val="19"/>
+          <w:szCs w:val="19"/>
+        </w:rPr>
+        <w:t xml:space="preserve">PHYS2D_NEW()   PHYS2D_SET_GRAVITY(w, gx, gy)</w:t>
+      </w:r>
+    </w:p>
+    <w:p>
+      <w:pPr>
+        <w:spacing w:after="180" w:line="312" w:lineRule="auto"/>
+      </w:pPr>
+      <w:r>
+        <w:rPr>
+          <w:sz w:val="22"/>
+          <w:szCs w:val="22"/>
+        </w:rPr>
+        <w:t xml:space="preserve">PHYS2D_NEW erstellt eine Physik-Welt (mit Standard-Schwerkraft nach unten). PHYS2D_SET_GRAVITY ändert die Schwerkraft (gy = 0 für schwerelos, negativ für nach oben).</w:t>
+      </w:r>
+    </w:p>
+    <w:p>
+      <w:pPr>
+        <w:keepNext/>
+        <w:spacing w:after="30" w:before="120"/>
+      </w:pPr>
+      <w:r>
+        <w:rPr>
+          <w:b/>
+          <w:bCs/>
+          <w:i/>
+          <w:iCs/>
+          <w:color w:val="6A6A6A"/>
+          <w:sz w:val="18"/>
+          <w:szCs w:val="18"/>
+        </w:rPr>
+        <w:t xml:space="preserve">Beispiel</w:t>
+      </w:r>
+    </w:p>
+    <w:p>
+      <w:pPr>
+        <w:keepLines/>
+        <w:pBdr>
+          <w:left w:val="single" w:color="1B6CA8" w:sz="18" w:space="6"/>
+        </w:pBdr>
+        <w:shd w:fill="F4F4F4" w:val="clear"/>
+        <w:spacing w:after="200" w:before="100" w:line="264" w:lineRule="auto"/>
+        <w:ind w:left="140"/>
+      </w:pPr>
+      <w:r>
+        <w:rPr>
+          <w:rFonts w:ascii="Consolas" w:cs="Consolas" w:eastAsia="Consolas" w:hAnsi="Consolas"/>
+          <w:sz w:val="19"/>
+          <w:szCs w:val="19"/>
+        </w:rPr>
+        <w:t xml:space="preserve">IMPORT "physics2d"</w:t>
+      </w:r>
+      <w:r>
+        <w:rPr>
+          <w:rFonts w:ascii="Consolas" w:cs="Consolas" w:eastAsia="Consolas" w:hAnsi="Consolas"/>
+          <w:sz w:val="19"/>
+          <w:szCs w:val="19"/>
+        </w:rPr>
+        <w:br/>
+        <w:t xml:space="preserve">DIM welt AS PHYS2D_WORLD</w:t>
+      </w:r>
+      <w:r>
+        <w:rPr>
+          <w:rFonts w:ascii="Consolas" w:cs="Consolas" w:eastAsia="Consolas" w:hAnsi="Consolas"/>
+          <w:sz w:val="19"/>
+          <w:szCs w:val="19"/>
+        </w:rPr>
+        <w:br/>
+        <w:t xml:space="preserve">welt = PHYS2D_NEW()</w:t>
+      </w:r>
+    </w:p>
+    <w:p>
+      <w:pPr>
+        <w:keepNext/>
+        <w:keepLines/>
+        <w:pBdr>
+          <w:bottom w:val="single" w:color="DDD0C0" w:sz="4" w:space="2"/>
+        </w:pBdr>
+        <w:spacing w:after="40" w:before="360"/>
+      </w:pPr>
+      <w:r>
+        <w:rPr>
+          <w:rFonts w:ascii="Consolas" w:cs="Consolas" w:eastAsia="Consolas" w:hAnsi="Consolas"/>
+          <w:b/>
+          <w:bCs/>
+          <w:color w:val="9A3412"/>
+          <w:sz w:val="24"/>
+          <w:szCs w:val="24"/>
+        </w:rPr>
+        <w:t xml:space="preserve">PHYS2D_ADD_BOX · PHYS2D_ADD_CIRCLE</w:t>
+      </w:r>
+    </w:p>
+    <w:p>
+      <w:pPr>
+        <w:keepNext/>
+        <w:spacing w:after="120"/>
+      </w:pPr>
+      <w:r>
+        <w:rPr>
+          <w:b/>
+          <w:bCs/>
+          <w:color w:val="6A6A6A"/>
+          <w:sz w:val="18"/>
+          <w:szCs w:val="18"/>
+        </w:rPr>
+        <w:t xml:space="preserve">Syntax:  </w:t>
+      </w:r>
+      <w:r>
+        <w:rPr>
+          <w:rFonts w:ascii="Consolas" w:cs="Consolas" w:eastAsia="Consolas" w:hAnsi="Consolas"/>
+          <w:color w:val="335577"/>
+          <w:sz w:val="19"/>
+          <w:szCs w:val="19"/>
+        </w:rPr>
+        <w:t xml:space="preserve">PHYS2D_ADD_BOX(w, x, y, hw, hh, dynamisch, bounce)   PHYS2D_ADD_CIRCLE(w, x, y, r, dynamisch, bounce)</w:t>
+      </w:r>
+    </w:p>
+    <w:p>
+      <w:pPr>
+        <w:spacing w:after="180" w:line="312" w:lineRule="auto"/>
+      </w:pPr>
+      <w:r>
+        <w:rPr>
+          <w:sz w:val="22"/>
+          <w:szCs w:val="22"/>
+        </w:rPr>
+        <w:t xml:space="preserve">Fügen einen Körper hinzu und liefern seine ID. dynamisch = TRUE bewegt sich (fällt, stößt); FALSE ist ein unbeweglicher Körper (Boden, Wand). bounce (0..1) ist die Sprungkraft. Bei der Box sind hw/hh die HALBE Breite und Höhe.</w:t>
+      </w:r>
+    </w:p>
+    <w:p>
+      <w:pPr>
+        <w:keepNext/>
+        <w:spacing w:after="30" w:before="120"/>
+      </w:pPr>
+      <w:r>
+        <w:rPr>
+          <w:b/>
+          <w:bCs/>
+          <w:i/>
+          <w:iCs/>
+          <w:color w:val="6A6A6A"/>
+          <w:sz w:val="18"/>
+          <w:szCs w:val="18"/>
+        </w:rPr>
+        <w:t xml:space="preserve">Beispiel</w:t>
+      </w:r>
+    </w:p>
+    <w:p>
+      <w:pPr>
+        <w:keepLines/>
+        <w:pBdr>
+          <w:left w:val="single" w:color="1B6CA8" w:sz="18" w:space="6"/>
+        </w:pBdr>
+        <w:shd w:fill="F4F4F4" w:val="clear"/>
+        <w:spacing w:after="200" w:before="100" w:line="264" w:lineRule="auto"/>
+        <w:ind w:left="140"/>
+      </w:pPr>
+      <w:r>
+        <w:rPr>
+          <w:rFonts w:ascii="Consolas" w:cs="Consolas" w:eastAsia="Consolas" w:hAnsi="Consolas"/>
+          <w:sz w:val="19"/>
+          <w:szCs w:val="19"/>
+        </w:rPr>
+        <w:t xml:space="preserve">PHYS2D_ADD_BOX(welt, 240, 300, 220, 10, FALSE, 0.2)   ' Boden (statisch)</w:t>
+      </w:r>
+      <w:r>
+        <w:rPr>
+          <w:rFonts w:ascii="Consolas" w:cs="Consolas" w:eastAsia="Consolas" w:hAnsi="Consolas"/>
+          <w:sz w:val="19"/>
+          <w:szCs w:val="19"/>
+        </w:rPr>
+        <w:br/>
+        <w:t xml:space="preserve">DIM ball AS INTEGER</w:t>
+      </w:r>
+      <w:r>
+        <w:rPr>
+          <w:rFonts w:ascii="Consolas" w:cs="Consolas" w:eastAsia="Consolas" w:hAnsi="Consolas"/>
+          <w:sz w:val="19"/>
+          <w:szCs w:val="19"/>
+        </w:rPr>
+        <w:br/>
+        <w:t xml:space="preserve">ball = PHYS2D_ADD_CIRCLE(welt, 240, 40, 14, TRUE, 0.5) ' Ball (springt)</w:t>
+      </w:r>
+    </w:p>
+    <w:p>
+      <w:pPr>
+        <w:keepNext/>
+        <w:keepLines/>
+        <w:pBdr>
+          <w:bottom w:val="single" w:color="DDD0C0" w:sz="4" w:space="2"/>
+        </w:pBdr>
+        <w:spacing w:after="40" w:before="360"/>
+      </w:pPr>
+      <w:r>
+        <w:rPr>
+          <w:rFonts w:ascii="Consolas" w:cs="Consolas" w:eastAsia="Consolas" w:hAnsi="Consolas"/>
+          <w:b/>
+          <w:bCs/>
+          <w:color w:val="9A3412"/>
+          <w:sz w:val="24"/>
+          <w:szCs w:val="24"/>
+        </w:rPr>
+        <w:t xml:space="preserve">PHYS2D_STEP</w:t>
+      </w:r>
+    </w:p>
+    <w:p>
+      <w:pPr>
+        <w:keepNext/>
+        <w:spacing w:after="120"/>
+      </w:pPr>
+      <w:r>
+        <w:rPr>
+          <w:b/>
+          <w:bCs/>
+          <w:color w:val="6A6A6A"/>
+          <w:sz w:val="18"/>
+          <w:szCs w:val="18"/>
+        </w:rPr>
+        <w:t xml:space="preserve">Syntax:  </w:t>
+      </w:r>
+      <w:r>
+        <w:rPr>
+          <w:rFonts w:ascii="Consolas" w:cs="Consolas" w:eastAsia="Consolas" w:hAnsi="Consolas"/>
+          <w:color w:val="335577"/>
+          <w:sz w:val="19"/>
+          <w:szCs w:val="19"/>
+        </w:rPr>
+        <w:t xml:space="preserve">PHYS2D_STEP(w, dt)</w:t>
+      </w:r>
+    </w:p>
+    <w:p>
+      <w:pPr>
+        <w:spacing w:after="180" w:line="312" w:lineRule="auto"/>
+      </w:pPr>
+      <w:r>
+        <w:rPr>
+          <w:sz w:val="22"/>
+          <w:szCs w:val="22"/>
+        </w:rPr>
+        <w:t xml:space="preserve">Simuliert einen Zeitschritt von dt Sekunden – einmal pro Frame mit DELTA() aufrufen. Erst dadurch bewegt sich überhaupt etwas.</w:t>
+      </w:r>
+    </w:p>
+    <w:p>
+      <w:pPr>
+        <w:keepNext/>
+        <w:spacing w:after="30" w:before="120"/>
+      </w:pPr>
+      <w:r>
+        <w:rPr>
+          <w:b/>
+          <w:bCs/>
+          <w:i/>
+          <w:iCs/>
+          <w:color w:val="6A6A6A"/>
+          <w:sz w:val="18"/>
+          <w:szCs w:val="18"/>
+        </w:rPr>
+        <w:t xml:space="preserve">Beispiel</w:t>
+      </w:r>
+    </w:p>
+    <w:p>
+      <w:pPr>
+        <w:keepLines/>
+        <w:pBdr>
+          <w:left w:val="single" w:color="1B6CA8" w:sz="18" w:space="6"/>
+        </w:pBdr>
+        <w:shd w:fill="F4F4F4" w:val="clear"/>
+        <w:spacing w:after="200" w:before="100" w:line="264" w:lineRule="auto"/>
+        <w:ind w:left="140"/>
+      </w:pPr>
+      <w:r>
+        <w:rPr>
+          <w:rFonts w:ascii="Consolas" w:cs="Consolas" w:eastAsia="Consolas" w:hAnsi="Consolas"/>
+          <w:sz w:val="19"/>
+          <w:szCs w:val="19"/>
+        </w:rPr>
+        <w:t xml:space="preserve">PHYS2D_STEP(welt, DELTA())</w:t>
+      </w:r>
+    </w:p>
+    <w:p>
+      <w:pPr>
+        <w:keepNext/>
+        <w:keepLines/>
+        <w:pBdr>
+          <w:bottom w:val="single" w:color="DDD0C0" w:sz="4" w:space="2"/>
+        </w:pBdr>
+        <w:spacing w:after="40" w:before="360"/>
+      </w:pPr>
+      <w:r>
+        <w:rPr>
+          <w:rFonts w:ascii="Consolas" w:cs="Consolas" w:eastAsia="Consolas" w:hAnsi="Consolas"/>
+          <w:b/>
+          <w:bCs/>
+          <w:color w:val="9A3412"/>
+          <w:sz w:val="24"/>
+          <w:szCs w:val="24"/>
+        </w:rPr>
+        <w:t xml:space="preserve">PHYS2D_BODY_X / _Y / _ANGLE</w:t>
+      </w:r>
+    </w:p>
+    <w:p>
+      <w:pPr>
+        <w:keepNext/>
+        <w:spacing w:after="120"/>
+      </w:pPr>
+      <w:r>
+        <w:rPr>
+          <w:b/>
+          <w:bCs/>
+          <w:color w:val="6A6A6A"/>
+          <w:sz w:val="18"/>
+          <w:szCs w:val="18"/>
+        </w:rPr>
+        <w:t xml:space="preserve">Syntax:  </w:t>
+      </w:r>
+      <w:r>
+        <w:rPr>
+          <w:rFonts w:ascii="Consolas" w:cs="Consolas" w:eastAsia="Consolas" w:hAnsi="Consolas"/>
+          <w:color w:val="335577"/>
+          <w:sz w:val="19"/>
+          <w:szCs w:val="19"/>
+        </w:rPr>
+        <w:t xml:space="preserve">PHYS2D_BODY_X(w, id)   PHYS2D_BODY_Y(w, id)   PHYS2D_BODY_ANGLE(w, id)</w:t>
+      </w:r>
+    </w:p>
+    <w:p>
+      <w:pPr>
+        <w:spacing w:after="180" w:line="312" w:lineRule="auto"/>
+      </w:pPr>
+      <w:r>
+        <w:rPr>
+          <w:sz w:val="22"/>
+          <w:szCs w:val="22"/>
+        </w:rPr>
+        <w:t xml:space="preserve">Lesen Position und Drehwinkel (Radiant) eines Körpers aus – damit zeichnest du dein Sprite an die von der Engine berechnete Stelle (rotiert per DRAWIMAGEROT mit DEG(...)).</w:t>
+      </w:r>
+    </w:p>
+    <w:p>
+      <w:pPr>
+        <w:keepNext/>
+        <w:spacing w:after="30" w:before="120"/>
+      </w:pPr>
+      <w:r>
+        <w:rPr>
+          <w:b/>
+          <w:bCs/>
+          <w:i/>
+          <w:iCs/>
+          <w:color w:val="6A6A6A"/>
+          <w:sz w:val="18"/>
+          <w:szCs w:val="18"/>
+        </w:rPr>
+        <w:t xml:space="preserve">Beispiel</w:t>
+      </w:r>
+    </w:p>
+    <w:p>
+      <w:pPr>
+        <w:keepLines/>
+        <w:pBdr>
+          <w:left w:val="single" w:color="1B6CA8" w:sz="18" w:space="6"/>
+        </w:pBdr>
+        <w:shd w:fill="F4F4F4" w:val="clear"/>
+        <w:spacing w:after="200" w:before="100" w:line="264" w:lineRule="auto"/>
+        <w:ind w:left="140"/>
+      </w:pPr>
+      <w:r>
+        <w:rPr>
+          <w:rFonts w:ascii="Consolas" w:cs="Consolas" w:eastAsia="Consolas" w:hAnsi="Consolas"/>
+          <w:sz w:val="19"/>
+          <w:szCs w:val="19"/>
+        </w:rPr>
+        <w:t xml:space="preserve">DIM x AS INTEGER</w:t>
+      </w:r>
+      <w:r>
+        <w:rPr>
+          <w:rFonts w:ascii="Consolas" w:cs="Consolas" w:eastAsia="Consolas" w:hAnsi="Consolas"/>
+          <w:sz w:val="19"/>
+          <w:szCs w:val="19"/>
+        </w:rPr>
+        <w:br/>
+        <w:t xml:space="preserve">DIM y AS INTEGER</w:t>
+      </w:r>
+      <w:r>
+        <w:rPr>
+          <w:rFonts w:ascii="Consolas" w:cs="Consolas" w:eastAsia="Consolas" w:hAnsi="Consolas"/>
+          <w:sz w:val="19"/>
+          <w:szCs w:val="19"/>
+        </w:rPr>
+        <w:br/>
+        <w:t xml:space="preserve">x = INT(PHYS2D_BODY_X(welt, ball))</w:t>
+      </w:r>
+      <w:r>
+        <w:rPr>
+          <w:rFonts w:ascii="Consolas" w:cs="Consolas" w:eastAsia="Consolas" w:hAnsi="Consolas"/>
+          <w:sz w:val="19"/>
+          <w:szCs w:val="19"/>
+        </w:rPr>
+        <w:br/>
+        <w:t xml:space="preserve">y = INT(PHYS2D_BODY_Y(welt, ball))</w:t>
+      </w:r>
+      <w:r>
+        <w:rPr>
+          <w:rFonts w:ascii="Consolas" w:cs="Consolas" w:eastAsia="Consolas" w:hAnsi="Consolas"/>
+          <w:sz w:val="19"/>
+          <w:szCs w:val="19"/>
+        </w:rPr>
+        <w:br/>
+        <w:t xml:space="preserve">CIRCLE(x, y, 14, YELLOW)</w:t>
+      </w:r>
+    </w:p>
+    <w:p>
+      <w:pPr>
+        <w:spacing w:after="180" w:line="312" w:lineRule="auto"/>
+      </w:pPr>
+      <w:r>
+        <w:rPr>
+          <w:sz w:val="22"/>
+          <w:szCs w:val="22"/>
+        </w:rPr>
+        <w:t xml:space="preserve">Im Game-Loop ist das Muster immer gleich: einen Schritt simulieren, dann jeden Körper an seiner aktuellen Position zeichnen. Genau so entstand das Bild oben:</w:t>
+      </w:r>
+    </w:p>
+    <w:p>
+      <w:pPr>
+        <w:keepLines/>
+        <w:pBdr>
+          <w:left w:val="single" w:color="1B6CA8" w:sz="18" w:space="6"/>
+        </w:pBdr>
+        <w:shd w:fill="F4F4F4" w:val="clear"/>
+        <w:spacing w:after="200" w:before="100" w:line="264" w:lineRule="auto"/>
+        <w:ind w:left="140"/>
+      </w:pPr>
+      <w:r>
+        <w:rPr>
+          <w:rFonts w:ascii="Consolas" w:cs="Consolas" w:eastAsia="Consolas" w:hAnsi="Consolas"/>
+          <w:sz w:val="19"/>
+          <w:szCs w:val="19"/>
+        </w:rPr>
+        <w:t xml:space="preserve">WHILE NOT QUITREQUESTED()</w:t>
+      </w:r>
+      <w:r>
+        <w:rPr>
+          <w:rFonts w:ascii="Consolas" w:cs="Consolas" w:eastAsia="Consolas" w:hAnsi="Consolas"/>
+          <w:sz w:val="19"/>
+          <w:szCs w:val="19"/>
+        </w:rPr>
+        <w:br/>
+        <w:t xml:space="preserve">    PHYS2D_STEP(welt, DELTA())</w:t>
+      </w:r>
+      <w:r>
+        <w:rPr>
+          <w:rFonts w:ascii="Consolas" w:cs="Consolas" w:eastAsia="Consolas" w:hAnsi="Consolas"/>
+          <w:sz w:val="19"/>
+          <w:szCs w:val="19"/>
+        </w:rPr>
+        <w:br/>
+        <w:t xml:space="preserve">    CLS(RGB(20, 24, 38))</w:t>
+      </w:r>
+      <w:r>
+        <w:rPr>
+          <w:rFonts w:ascii="Consolas" w:cs="Consolas" w:eastAsia="Consolas" w:hAnsi="Consolas"/>
+          <w:sz w:val="19"/>
+          <w:szCs w:val="19"/>
+        </w:rPr>
+        <w:br/>
+        <w:t xml:space="preserve">    CIRCLE(INT(PHYS2D_BODY_X(welt, ball)), INT(PHYS2D_BODY_Y(welt, ball)), 14, YELLOW)</w:t>
+      </w:r>
+      <w:r>
+        <w:rPr>
+          <w:rFonts w:ascii="Consolas" w:cs="Consolas" w:eastAsia="Consolas" w:hAnsi="Consolas"/>
+          <w:sz w:val="19"/>
+          <w:szCs w:val="19"/>
+        </w:rPr>
+        <w:br/>
+        <w:t xml:space="preserve">    FLIP()</w:t>
+      </w:r>
+      <w:r>
+        <w:rPr>
+          <w:rFonts w:ascii="Consolas" w:cs="Consolas" w:eastAsia="Consolas" w:hAnsi="Consolas"/>
+          <w:sz w:val="19"/>
+          <w:szCs w:val="19"/>
+        </w:rPr>
+        <w:br/>
+        <w:t xml:space="preserve">WEND</w:t>
+      </w:r>
+    </w:p>
+    <w:p>
+      <w:pPr>
+        <w:pStyle w:val="Heading2"/>
+        <w:keepNext/>
+        <w:keepLines/>
+        <w:spacing w:after="120" w:before="280"/>
+      </w:pPr>
+      <w:r>
+        <w:t xml:space="preserve">physics3d — echte 3D-Physik</w:t>
+      </w:r>
+    </w:p>
+    <w:p>
+      <w:pPr>
+        <w:spacing w:after="180" w:line="312" w:lineRule="auto"/>
+      </w:pPr>
+      <w:r>
+        <w:rPr>
+          <w:sz w:val="22"/>
+          <w:szCs w:val="22"/>
+        </w:rPr>
+        <w:t xml:space="preserve">physics3d ist das Gegenstück in drei Dimensionen: dieselbe Idee, nur mit z-Achse und 3D-Körpern. Die Körper haben zusätzlich eine räumliche Drehung (als Quaternion), die du beim Zeichnen deines 3D-Modells verwendest. Zusammen mit dem g3d-Modul lassen sich so physikalisch fallende, rollende und stapelnde 3D-Objekte bauen.</w:t>
+      </w:r>
+    </w:p>
+    <w:p>
+      <w:pPr>
+        <w:keepNext/>
+        <w:keepLines/>
+        <w:pBdr>
+          <w:bottom w:val="single" w:color="DDD0C0" w:sz="4" w:space="2"/>
+        </w:pBdr>
+        <w:spacing w:after="40" w:before="360"/>
+      </w:pPr>
+      <w:r>
+        <w:rPr>
+          <w:rFonts w:ascii="Consolas" w:cs="Consolas" w:eastAsia="Consolas" w:hAnsi="Consolas"/>
+          <w:b/>
+          <w:bCs/>
+          <w:color w:val="9A3412"/>
+          <w:sz w:val="24"/>
+          <w:szCs w:val="24"/>
+        </w:rPr>
+        <w:t xml:space="preserve">PHYS3D_NEW · ADD_BOX · ADD_SPHERE · STEP</w:t>
+      </w:r>
+    </w:p>
+    <w:p>
+      <w:pPr>
+        <w:keepNext/>
+        <w:spacing w:after="120"/>
+      </w:pPr>
+      <w:r>
+        <w:rPr>
+          <w:b/>
+          <w:bCs/>
+          <w:color w:val="6A6A6A"/>
+          <w:sz w:val="18"/>
+          <w:szCs w:val="18"/>
+        </w:rPr>
+        <w:t xml:space="preserve">Syntax:  </w:t>
+      </w:r>
+      <w:r>
+        <w:rPr>
+          <w:rFonts w:ascii="Consolas" w:cs="Consolas" w:eastAsia="Consolas" w:hAnsi="Consolas"/>
+          <w:color w:val="335577"/>
+          <w:sz w:val="19"/>
+          <w:szCs w:val="19"/>
+        </w:rPr>
+        <w:t xml:space="preserve">PHYS3D_NEW()   PHYS3D_ADD_BOX(w, x,y,z, hw,hh,hd, dynamisch, bounce)   PHYS3D_ADD_SPHERE(w, x,y,z, r, dynamisch, bounce)   PHYS3D_STEP(w, dt)</w:t>
+      </w:r>
+    </w:p>
+    <w:p>
+      <w:pPr>
+        <w:spacing w:after="180" w:line="312" w:lineRule="auto"/>
+      </w:pPr>
+      <w:r>
+        <w:rPr>
+          <w:sz w:val="22"/>
+          <w:szCs w:val="22"/>
+        </w:rPr>
+        <w:t xml:space="preserve">Wie bei physics2d, nur mit drei Koordinaten. PHYS3D_NEW erstellt die 3D-Welt, ADD_BOX/ADD_SPHERE fügen Körper hinzu (dynamisch TRUE/FALSE), PHYS3D_STEP simuliert einen Schritt.</w:t>
+      </w:r>
+    </w:p>
+    <w:p>
+      <w:pPr>
+        <w:keepNext/>
+        <w:spacing w:after="30" w:before="120"/>
+      </w:pPr>
+      <w:r>
+        <w:rPr>
+          <w:b/>
+          <w:bCs/>
+          <w:i/>
+          <w:iCs/>
+          <w:color w:val="6A6A6A"/>
+          <w:sz w:val="18"/>
+          <w:szCs w:val="18"/>
+        </w:rPr>
+        <w:t xml:space="preserve">Beispiel</w:t>
+      </w:r>
+    </w:p>
+    <w:p>
+      <w:pPr>
+        <w:keepLines/>
+        <w:pBdr>
+          <w:left w:val="single" w:color="1B6CA8" w:sz="18" w:space="6"/>
+        </w:pBdr>
+        <w:shd w:fill="F4F4F4" w:val="clear"/>
+        <w:spacing w:after="200" w:before="100" w:line="264" w:lineRule="auto"/>
+        <w:ind w:left="140"/>
+      </w:pPr>
+      <w:r>
+        <w:rPr>
+          <w:rFonts w:ascii="Consolas" w:cs="Consolas" w:eastAsia="Consolas" w:hAnsi="Consolas"/>
+          <w:sz w:val="19"/>
+          <w:szCs w:val="19"/>
+        </w:rPr>
+        <w:t xml:space="preserve">IMPORT "physics3d"</w:t>
+      </w:r>
+      <w:r>
+        <w:rPr>
+          <w:rFonts w:ascii="Consolas" w:cs="Consolas" w:eastAsia="Consolas" w:hAnsi="Consolas"/>
+          <w:sz w:val="19"/>
+          <w:szCs w:val="19"/>
+        </w:rPr>
+        <w:br/>
+        <w:t xml:space="preserve">DIM w AS PHYS_WORLD</w:t>
+      </w:r>
+      <w:r>
+        <w:rPr>
+          <w:rFonts w:ascii="Consolas" w:cs="Consolas" w:eastAsia="Consolas" w:hAnsi="Consolas"/>
+          <w:sz w:val="19"/>
+          <w:szCs w:val="19"/>
+        </w:rPr>
+        <w:br/>
+        <w:t xml:space="preserve">w = PHYS3D_NEW()</w:t>
+      </w:r>
+      <w:r>
+        <w:rPr>
+          <w:rFonts w:ascii="Consolas" w:cs="Consolas" w:eastAsia="Consolas" w:hAnsi="Consolas"/>
+          <w:sz w:val="19"/>
+          <w:szCs w:val="19"/>
+        </w:rPr>
+        <w:br/>
+        <w:t xml:space="preserve">PHYS3D_ADD_BOX(w, 0.0, -1.0, 0.0, 10.0, 1.0, 10.0, FALSE, 0.0)  ' Boden</w:t>
+      </w:r>
+      <w:r>
+        <w:rPr>
+          <w:rFonts w:ascii="Consolas" w:cs="Consolas" w:eastAsia="Consolas" w:hAnsi="Consolas"/>
+          <w:sz w:val="19"/>
+          <w:szCs w:val="19"/>
+        </w:rPr>
+        <w:br/>
+        <w:t xml:space="preserve">DIM kugel AS INTEGER</w:t>
+      </w:r>
+      <w:r>
+        <w:rPr>
+          <w:rFonts w:ascii="Consolas" w:cs="Consolas" w:eastAsia="Consolas" w:hAnsi="Consolas"/>
+          <w:sz w:val="19"/>
+          <w:szCs w:val="19"/>
+        </w:rPr>
+        <w:br/>
+        <w:t xml:space="preserve">kugel = PHYS3D_ADD_SPHERE(w, 0.0, 8.0, 0.0, 1.0, TRUE, 0.5)     ' fällt</w:t>
+      </w:r>
+      <w:r>
+        <w:rPr>
+          <w:rFonts w:ascii="Consolas" w:cs="Consolas" w:eastAsia="Consolas" w:hAnsi="Consolas"/>
+          <w:sz w:val="19"/>
+          <w:szCs w:val="19"/>
+        </w:rPr>
+        <w:br/>
+        <w:t xml:space="preserve">PHYS3D_STEP(w, DELTA())</w:t>
+      </w:r>
+    </w:p>
+    <w:p>
+      <w:pPr>
+        <w:keepNext/>
+        <w:keepLines/>
+        <w:pBdr>
+          <w:bottom w:val="single" w:color="DDD0C0" w:sz="4" w:space="2"/>
+        </w:pBdr>
+        <w:spacing w:after="40" w:before="360"/>
+      </w:pPr>
+      <w:r>
+        <w:rPr>
+          <w:rFonts w:ascii="Consolas" w:cs="Consolas" w:eastAsia="Consolas" w:hAnsi="Consolas"/>
+          <w:b/>
+          <w:bCs/>
+          <w:color w:val="9A3412"/>
+          <w:sz w:val="24"/>
+          <w:szCs w:val="24"/>
+        </w:rPr>
+        <w:t xml:space="preserve">PHYS3D_BODY_X / _Y / _Z (+ Quaternion)</w:t>
+      </w:r>
+    </w:p>
+    <w:p>
+      <w:pPr>
+        <w:keepNext/>
+        <w:spacing w:after="120"/>
+      </w:pPr>
+      <w:r>
+        <w:rPr>
+          <w:b/>
+          <w:bCs/>
+          <w:color w:val="6A6A6A"/>
+          <w:sz w:val="18"/>
+          <w:szCs w:val="18"/>
+        </w:rPr>
+        <w:t xml:space="preserve">Syntax:  </w:t>
+      </w:r>
+      <w:r>
+        <w:rPr>
+          <w:rFonts w:ascii="Consolas" w:cs="Consolas" w:eastAsia="Consolas" w:hAnsi="Consolas"/>
+          <w:color w:val="335577"/>
+          <w:sz w:val="19"/>
+          <w:szCs w:val="19"/>
+        </w:rPr>
+        <w:t xml:space="preserve">PHYS3D_BODY_X / _Y / _Z(w, id)   PHYS3D_BODY_QX/_QY/_QZ/_QW(w, id)</w:t>
+      </w:r>
+    </w:p>
+    <w:p>
+      <w:pPr>
+        <w:spacing w:after="180" w:line="312" w:lineRule="auto"/>
+      </w:pPr>
+      <w:r>
+        <w:rPr>
+          <w:sz w:val="22"/>
+          <w:szCs w:val="22"/>
+        </w:rPr>
+        <w:t xml:space="preserve">Lesen die 3D-Position und die Drehung (als Quaternion QX/QY/QZ/QW) eines Körpers. Position und Drehung steckst du in eine Modell-Matrix (Modul m3d) und zeichnest damit dein 3D-Modell an die simulierte Stelle.</w:t>
+      </w:r>
+    </w:p>
+    <w:p>
+      <w:pPr>
+        <w:keepNext/>
+        <w:spacing w:after="30" w:before="120"/>
+      </w:pPr>
+      <w:r>
+        <w:rPr>
+          <w:b/>
+          <w:bCs/>
+          <w:i/>
+          <w:iCs/>
+          <w:color w:val="6A6A6A"/>
+          <w:sz w:val="18"/>
+          <w:szCs w:val="18"/>
+        </w:rPr>
+        <w:t xml:space="preserve">Beispiel</w:t>
+      </w:r>
+    </w:p>
+    <w:p>
+      <w:pPr>
+        <w:keepLines/>
+        <w:pBdr>
+          <w:left w:val="single" w:color="1B6CA8" w:sz="18" w:space="6"/>
+        </w:pBdr>
+        <w:shd w:fill="F4F4F4" w:val="clear"/>
+        <w:spacing w:after="200" w:before="100" w:line="264" w:lineRule="auto"/>
+        <w:ind w:left="140"/>
+      </w:pPr>
+      <w:r>
+        <w:rPr>
+          <w:rFonts w:ascii="Consolas" w:cs="Consolas" w:eastAsia="Consolas" w:hAnsi="Consolas"/>
+          <w:sz w:val="19"/>
+          <w:szCs w:val="19"/>
+        </w:rPr>
+        <w:t xml:space="preserve">DIM y AS FLOAT</w:t>
+      </w:r>
+      <w:r>
+        <w:rPr>
+          <w:rFonts w:ascii="Consolas" w:cs="Consolas" w:eastAsia="Consolas" w:hAnsi="Consolas"/>
+          <w:sz w:val="19"/>
+          <w:szCs w:val="19"/>
+        </w:rPr>
+        <w:br/>
+        <w:t xml:space="preserve">y = PHYS3D_BODY_Y(w, kugel)</w:t>
+      </w:r>
+      <w:r>
+        <w:rPr>
+          <w:rFonts w:ascii="Consolas" w:cs="Consolas" w:eastAsia="Consolas" w:hAnsi="Consolas"/>
+          <w:sz w:val="19"/>
+          <w:szCs w:val="19"/>
+        </w:rPr>
+        <w:br/>
+        <w:t xml:space="preserve">PRINT ROUND(y, 1)   ' sinkt mit der Zeit</w:t>
+      </w:r>
+    </w:p>
+    <w:p>
+      <w:pPr>
+        <w:spacing w:before="60"/>
+      </w:pPr>
+    </w:p>
+    <w:tbl>
+      <w:tblPr>
+        <w:tblW w:type="dxa" w:w="9360"/>
+        <w:tblBorders>
+          <w:top w:val="single" w:color="auto" w:sz="4"/>
+          <w:left w:val="single" w:color="auto" w:sz="4"/>
+          <w:bottom w:val="single" w:color="auto" w:sz="4"/>
+          <w:right w:val="single" w:color="auto" w:sz="4"/>
+          <w:insideH w:val="single" w:color="auto" w:sz="4"/>
+          <w:insideV w:val="single" w:color="auto" w:sz="4"/>
+        </w:tblBorders>
+      </w:tblPr>
+      <w:tblGrid>
+        <w:gridCol w:w="9360"/>
+      </w:tblGrid>
+      <w:tr>
+        <w:trPr>
+          <w:cantSplit/>
+        </w:trPr>
+        <w:tc>
+          <w:tcPr>
+            <w:tcW w:type="dxa" w:w="9360"/>
+            <w:tcBorders>
+              <w:top w:val="single" w:color="9CC8E6" w:sz="6"/>
+              <w:left w:val="single" w:color="9CC8E6" w:sz="6"/>
+              <w:bottom w:val="single" w:color="9CC8E6" w:sz="6"/>
+              <w:right w:val="single" w:color="9CC8E6" w:sz="6"/>
+            </w:tcBorders>
+            <w:shd w:fill="E7F2FA" w:val="clear"/>
+            <w:tcMar>
+              <w:top w:type="dxa" w:w="140"/>
+              <w:left w:type="dxa" w:w="180"/>
+              <w:bottom w:type="dxa" w:w="140"/>
+              <w:right w:type="dxa" w:w="180"/>
+            </w:tcMar>
+          </w:tcPr>
+          <w:p>
+            <w:pPr>
+              <w:spacing w:after="40"/>
+            </w:pPr>
+            <w:r>
+              <w:rPr>
+                <w:b/>
+                <w:bCs/>
+                <w:color w:val="1B6CA8"/>
+                <w:sz w:val="22"/>
+                <w:szCs w:val="22"/>
+              </w:rPr>
+              <w:t xml:space="preserve">Welches Physik-Modul?</w:t>
+            </w:r>
+          </w:p>
+          <w:p>
+            <w:pPr>
+              <w:spacing w:after="0" w:line="312" w:lineRule="auto"/>
+            </w:pPr>
+            <w:r>
+              <w:rPr>
+                <w:sz w:val="22"/>
+                <w:szCs w:val="22"/>
+              </w:rPr>
+              <w:t xml:space="preserve">Für simple Treffer-Abfragen und selbst gesteuerte Bewegung reicht physics (schnell, vorhersehbar). Soll sich etwas „echt“ anfühlen – fallen, stapeln, abprallen – nimm physics2d bzw. physics3d. Du kannst beides mischen: die Engine für die Welt, physics-Mathe für eigene Sonderfälle.</w:t>
             </w:r>
           </w:p>
         </w:tc>

</xml_diff>

<commit_message>
docs(buch): Lehrbuch Kap 56 -- Modul camera (Screenshot)
CAMERA_SET/FOLLOW/RESET (Welt- vs. Bildschirm-Koordinaten, HUD nach RESET),
CAMERA_S2W_X/Y (Maus -> Welt), CAMERA_SHAKE. Screenshot: Kamera folgt dem
Spieler in 800x600-Welt mit Welt-Koord-Raster + fester HUD-Leiste. Je Befehl
ein Beispiel; gegen gbrt verifiziert.

Co-Authored-By: Claude Opus 4.8 (1M context) <noreply@anthropic.com>
</commit_message>
<xml_diff>
--- a/buch-referenz/buch/GameBasic-Lehrbuch.docx
+++ b/buch-referenz/buch/GameBasic-Lehrbuch.docx
@@ -1461,6 +1461,33 @@
           <w:szCs w:val="22"/>
         </w:rPr>
         <w:t xml:space="preserve">	188</w:t>
+      </w:r>
+    </w:p>
+    <w:p>
+      <w:pPr>
+        <w:tabs>
+          <w:tab w:val="right" w:pos="9200" w:leader="dot"/>
+        </w:tabs>
+        <w:spacing w:after="20" w:before="0"/>
+        <w:ind w:left="280"/>
+      </w:pPr>
+      <w:r>
+        <w:rPr>
+          <w:b w:val="false"/>
+          <w:bCs w:val="false"/>
+          <w:color w:val="222222"/>
+          <w:sz w:val="22"/>
+          <w:szCs w:val="22"/>
+        </w:rPr>
+        <w:t xml:space="preserve">Modul: camera</w:t>
+      </w:r>
+      <w:r>
+        <w:rPr>
+          <w:color w:val="555555"/>
+          <w:sz w:val="22"/>
+          <w:szCs w:val="22"/>
+        </w:rPr>
+        <w:t xml:space="preserve">	193</w:t>
       </w:r>
     </w:p>
     <w:p>
@@ -63740,6 +63767,942 @@
                 <w:szCs w:val="22"/>
               </w:rPr>
               <w:t xml:space="preserve">Für simple Treffer-Abfragen und selbst gesteuerte Bewegung reicht physics (schnell, vorhersehbar). Soll sich etwas „echt“ anfühlen – fallen, stapeln, abprallen – nimm physics2d bzw. physics3d. Du kannst beides mischen: die Engine für die Welt, physics-Mathe für eigene Sonderfälle.</w:t>
+            </w:r>
+          </w:p>
+        </w:tc>
+      </w:tr>
+    </w:tbl>
+    <w:p>
+      <w:pPr>
+        <w:spacing w:after="160"/>
+      </w:pPr>
+    </w:p>
+    <w:p>
+      <w:pPr>
+        <w:pStyle w:val="Heading1"/>
+        <w:keepNext/>
+        <w:keepLines/>
+        <w:pageBreakBefore/>
+        <w:pBdr>
+          <w:bottom w:val="single" w:color="1B6CA8" w:sz="12" w:space="4"/>
+        </w:pBdr>
+        <w:spacing w:after="160" w:before="0"/>
+      </w:pPr>
+      <w:r>
+        <w:t xml:space="preserve">Modul: camera</w:t>
+      </w:r>
+    </w:p>
+    <w:p>
+      <w:pPr>
+        <w:spacing w:after="180" w:line="312" w:lineRule="auto"/>
+      </w:pPr>
+      <w:r>
+        <w:rPr>
+          <w:sz w:val="22"/>
+          <w:szCs w:val="22"/>
+        </w:rPr>
+        <w:t xml:space="preserve">Spielwelten sind oft größer als der Bildschirm. Damit du nur einen Ausschnitt zeigst – und ihn mitscrollen lässt, wenn die Figur läuft – gibt es das camera-Modul. Es verschiebt und zoomt die gesamte Zeichnung: Sobald eine Kamera gesetzt ist, gelten deine Koordinaten als Welt-Koordinaten, und die Kamera rechnet sie auf den Bildschirm um. Du zeichnest also weiter „an Weltpositionen“, und der sichtbare Ausschnitt folgt der Kamera.</w:t>
+      </w:r>
+    </w:p>
+    <w:p>
+      <w:pPr>
+        <w:keepNext/>
+        <w:spacing w:after="40" w:before="160"/>
+        <w:jc w:val="center"/>
+      </w:pPr>
+      <w:r>
+        <w:drawing>
+          <wp:inline distT="0" distB="0" distL="0" distR="0">
+            <wp:extent cx="4572000" cy="3048000"/>
+            <wp:effectExtent t="0" r="0" b="0" l="0"/>
+            <wp:docPr id="1" name="56_camera.png" descr="Eine 800×600-Welt, von der Kamera auf den Spieler (Weltposition 400, 300) zentriert – die HUD-Leiste oben steht fest (ohne Kamera)." title="Eine 800×600-Welt, von der Kamera auf den Spieler (Weltposition 400, 300) zentriert – die HUD-Leiste oben steht fest (ohne Kamera)."/>
+            <wp:cNvGraphicFramePr>
+              <a:graphicFrameLocks xmlns:a="http://schemas.openxmlformats.org/drawingml/2006/main" noChangeAspect="1"/>
+            </wp:cNvGraphicFramePr>
+            <a:graphic xmlns:a="http://schemas.openxmlformats.org/drawingml/2006/main">
+              <a:graphicData uri="http://schemas.openxmlformats.org/drawingml/2006/picture">
+                <pic:pic xmlns:pic="http://schemas.openxmlformats.org/drawingml/2006/picture">
+                  <pic:nvPicPr>
+                    <pic:cNvPr id="0" name="" descr=""/>
+                    <pic:cNvPicPr>
+                      <a:picLocks noChangeAspect="1" noChangeArrowheads="1"/>
+                    </pic:cNvPicPr>
+                  </pic:nvPicPr>
+                  <pic:blipFill>
+                    <a:blip r:embed="rId24" cstate="none"/>
+                    <a:srcRect/>
+                    <a:stretch>
+                      <a:fillRect/>
+                    </a:stretch>
+                  </pic:blipFill>
+                  <pic:spPr bwMode="auto">
+                    <a:xfrm>
+                      <a:off x="0" y="0"/>
+                      <a:ext cx="4572000" cy="3048000"/>
+                    </a:xfrm>
+                    <a:prstGeom prst="rect">
+                      <a:avLst/>
+                    </a:prstGeom>
+                  </pic:spPr>
+                </pic:pic>
+              </a:graphicData>
+            </a:graphic>
+          </wp:inline>
+        </w:drawing>
+      </w:r>
+    </w:p>
+    <w:p>
+      <w:pPr>
+        <w:spacing w:after="200"/>
+        <w:jc w:val="center"/>
+      </w:pPr>
+      <w:r>
+        <w:rPr>
+          <w:i/>
+          <w:iCs/>
+          <w:color w:val="6A6A6A"/>
+          <w:sz w:val="18"/>
+          <w:szCs w:val="18"/>
+        </w:rPr>
+        <w:t xml:space="preserve">Eine 800×600-Welt, von der Kamera auf den Spieler (Weltposition 400, 300) zentriert – die HUD-Leiste oben steht fest (ohne Kamera).</w:t>
+      </w:r>
+    </w:p>
+    <w:p>
+      <w:pPr>
+        <w:pStyle w:val="Heading2"/>
+        <w:keepNext/>
+        <w:keepLines/>
+        <w:spacing w:after="120" w:before="280"/>
+      </w:pPr>
+      <w:r>
+        <w:t xml:space="preserve">Die Kamera setzen</w:t>
+      </w:r>
+    </w:p>
+    <w:p>
+      <w:pPr>
+        <w:keepNext/>
+        <w:keepLines/>
+        <w:pBdr>
+          <w:bottom w:val="single" w:color="DDD0C0" w:sz="4" w:space="2"/>
+        </w:pBdr>
+        <w:spacing w:after="40" w:before="360"/>
+      </w:pPr>
+      <w:r>
+        <w:rPr>
+          <w:rFonts w:ascii="Consolas" w:cs="Consolas" w:eastAsia="Consolas" w:hAnsi="Consolas"/>
+          <w:b/>
+          <w:bCs/>
+          <w:color w:val="9A3412"/>
+          <w:sz w:val="24"/>
+          <w:szCs w:val="24"/>
+        </w:rPr>
+        <w:t xml:space="preserve">CAMERA_SET</w:t>
+      </w:r>
+    </w:p>
+    <w:p>
+      <w:pPr>
+        <w:keepNext/>
+        <w:spacing w:after="120"/>
+      </w:pPr>
+      <w:r>
+        <w:rPr>
+          <w:b/>
+          <w:bCs/>
+          <w:color w:val="6A6A6A"/>
+          <w:sz w:val="18"/>
+          <w:szCs w:val="18"/>
+        </w:rPr>
+        <w:t xml:space="preserve">Syntax:  </w:t>
+      </w:r>
+      <w:r>
+        <w:rPr>
+          <w:rFonts w:ascii="Consolas" w:cs="Consolas" w:eastAsia="Consolas" w:hAnsi="Consolas"/>
+          <w:color w:val="335577"/>
+          <w:sz w:val="19"/>
+          <w:szCs w:val="19"/>
+        </w:rPr>
+        <w:t xml:space="preserve">CAMERA_SET(x, y[, zoom])</w:t>
+      </w:r>
+    </w:p>
+    <w:p>
+      <w:pPr>
+        <w:spacing w:after="180" w:line="312" w:lineRule="auto"/>
+      </w:pPr>
+      <w:r>
+        <w:rPr>
+          <w:sz w:val="22"/>
+          <w:szCs w:val="22"/>
+        </w:rPr>
+        <w:t xml:space="preserve">Legt fest, welcher Welt-Punkt (x, y) oben links auf dem Bildschirm landet, und optional einen Zoom (1.0 = normal, 2.0 = doppelt so groß/näher, 0.5 = mehr Welt sichtbar). Ab jetzt sind alle Zeichen-Koordinaten Welt-Koordinaten.</w:t>
+      </w:r>
+    </w:p>
+    <w:p>
+      <w:pPr>
+        <w:keepNext/>
+        <w:spacing w:after="30" w:before="120"/>
+      </w:pPr>
+      <w:r>
+        <w:rPr>
+          <w:b/>
+          <w:bCs/>
+          <w:i/>
+          <w:iCs/>
+          <w:color w:val="6A6A6A"/>
+          <w:sz w:val="18"/>
+          <w:szCs w:val="18"/>
+        </w:rPr>
+        <w:t xml:space="preserve">Beispiel</w:t>
+      </w:r>
+    </w:p>
+    <w:p>
+      <w:pPr>
+        <w:keepLines/>
+        <w:pBdr>
+          <w:left w:val="single" w:color="1B6CA8" w:sz="18" w:space="6"/>
+        </w:pBdr>
+        <w:shd w:fill="F4F4F4" w:val="clear"/>
+        <w:spacing w:after="200" w:before="100" w:line="264" w:lineRule="auto"/>
+        <w:ind w:left="140"/>
+      </w:pPr>
+      <w:r>
+        <w:rPr>
+          <w:rFonts w:ascii="Consolas" w:cs="Consolas" w:eastAsia="Consolas" w:hAnsi="Consolas"/>
+          <w:sz w:val="19"/>
+          <w:szCs w:val="19"/>
+        </w:rPr>
+        <w:t xml:space="preserve">IMPORT "camera"</w:t>
+      </w:r>
+      <w:r>
+        <w:rPr>
+          <w:rFonts w:ascii="Consolas" w:cs="Consolas" w:eastAsia="Consolas" w:hAnsi="Consolas"/>
+          <w:sz w:val="19"/>
+          <w:szCs w:val="19"/>
+        </w:rPr>
+        <w:br/>
+        <w:t xml:space="preserve">CAMERA_SET(100.0, 50.0)        ' Welt-Punkt (100,50) -&gt; Bild oben links</w:t>
+      </w:r>
+      <w:r>
+        <w:rPr>
+          <w:rFonts w:ascii="Consolas" w:cs="Consolas" w:eastAsia="Consolas" w:hAnsi="Consolas"/>
+          <w:sz w:val="19"/>
+          <w:szCs w:val="19"/>
+        </w:rPr>
+        <w:br/>
+        <w:t xml:space="preserve">CAMERA_SET(0.0, 0.0, 2.0)      ' alles doppelt so groß</w:t>
+      </w:r>
+    </w:p>
+    <w:p>
+      <w:pPr>
+        <w:keepNext/>
+        <w:keepLines/>
+        <w:pBdr>
+          <w:bottom w:val="single" w:color="DDD0C0" w:sz="4" w:space="2"/>
+        </w:pBdr>
+        <w:spacing w:after="40" w:before="360"/>
+      </w:pPr>
+      <w:r>
+        <w:rPr>
+          <w:rFonts w:ascii="Consolas" w:cs="Consolas" w:eastAsia="Consolas" w:hAnsi="Consolas"/>
+          <w:b/>
+          <w:bCs/>
+          <w:color w:val="9A3412"/>
+          <w:sz w:val="24"/>
+          <w:szCs w:val="24"/>
+        </w:rPr>
+        <w:t xml:space="preserve">CAMERA_FOLLOW</w:t>
+      </w:r>
+    </w:p>
+    <w:p>
+      <w:pPr>
+        <w:keepNext/>
+        <w:spacing w:after="120"/>
+      </w:pPr>
+      <w:r>
+        <w:rPr>
+          <w:b/>
+          <w:bCs/>
+          <w:color w:val="6A6A6A"/>
+          <w:sz w:val="18"/>
+          <w:szCs w:val="18"/>
+        </w:rPr>
+        <w:t xml:space="preserve">Syntax:  </w:t>
+      </w:r>
+      <w:r>
+        <w:rPr>
+          <w:rFonts w:ascii="Consolas" w:cs="Consolas" w:eastAsia="Consolas" w:hAnsi="Consolas"/>
+          <w:color w:val="335577"/>
+          <w:sz w:val="19"/>
+          <w:szCs w:val="19"/>
+        </w:rPr>
+        <w:t xml:space="preserve">CAMERA_FOLLOW(ziel_x, ziel_y, bild_breite, bild_höhe)</w:t>
+      </w:r>
+    </w:p>
+    <w:p>
+      <w:pPr>
+        <w:spacing w:after="180" w:line="312" w:lineRule="auto"/>
+      </w:pPr>
+      <w:r>
+        <w:rPr>
+          <w:sz w:val="22"/>
+          <w:szCs w:val="22"/>
+        </w:rPr>
+        <w:t xml:space="preserve">Setzt die Kamera so, dass das Ziel (ziel_x, ziel_y) im Bildschirm-Zentrum landet – ideal, um der Spielfigur zu folgen. Die Bildbreite/-höhe gibst du meist als SCREENWIDTH()/SCREENHEIGHT() an.</w:t>
+      </w:r>
+    </w:p>
+    <w:p>
+      <w:pPr>
+        <w:keepNext/>
+        <w:spacing w:after="30" w:before="120"/>
+      </w:pPr>
+      <w:r>
+        <w:rPr>
+          <w:b/>
+          <w:bCs/>
+          <w:i/>
+          <w:iCs/>
+          <w:color w:val="6A6A6A"/>
+          <w:sz w:val="18"/>
+          <w:szCs w:val="18"/>
+        </w:rPr>
+        <w:t xml:space="preserve">Beispiel</w:t>
+      </w:r>
+    </w:p>
+    <w:p>
+      <w:pPr>
+        <w:keepLines/>
+        <w:pBdr>
+          <w:left w:val="single" w:color="1B6CA8" w:sz="18" w:space="6"/>
+        </w:pBdr>
+        <w:shd w:fill="F4F4F4" w:val="clear"/>
+        <w:spacing w:after="200" w:before="100" w:line="264" w:lineRule="auto"/>
+        <w:ind w:left="140"/>
+      </w:pPr>
+      <w:r>
+        <w:rPr>
+          <w:rFonts w:ascii="Consolas" w:cs="Consolas" w:eastAsia="Consolas" w:hAnsi="Consolas"/>
+          <w:sz w:val="19"/>
+          <w:szCs w:val="19"/>
+        </w:rPr>
+        <w:t xml:space="preserve">CAMERA_FOLLOW(spieler_x, spieler_y, 480.0, 320.0)</w:t>
+      </w:r>
+    </w:p>
+    <w:p>
+      <w:pPr>
+        <w:keepNext/>
+        <w:keepLines/>
+        <w:pBdr>
+          <w:bottom w:val="single" w:color="DDD0C0" w:sz="4" w:space="2"/>
+        </w:pBdr>
+        <w:spacing w:after="40" w:before="360"/>
+      </w:pPr>
+      <w:r>
+        <w:rPr>
+          <w:rFonts w:ascii="Consolas" w:cs="Consolas" w:eastAsia="Consolas" w:hAnsi="Consolas"/>
+          <w:b/>
+          <w:bCs/>
+          <w:color w:val="9A3412"/>
+          <w:sz w:val="24"/>
+          <w:szCs w:val="24"/>
+        </w:rPr>
+        <w:t xml:space="preserve">CAMERA_RESET</w:t>
+      </w:r>
+    </w:p>
+    <w:p>
+      <w:pPr>
+        <w:keepNext/>
+        <w:spacing w:after="120"/>
+      </w:pPr>
+      <w:r>
+        <w:rPr>
+          <w:b/>
+          <w:bCs/>
+          <w:color w:val="6A6A6A"/>
+          <w:sz w:val="18"/>
+          <w:szCs w:val="18"/>
+        </w:rPr>
+        <w:t xml:space="preserve">Syntax:  </w:t>
+      </w:r>
+      <w:r>
+        <w:rPr>
+          <w:rFonts w:ascii="Consolas" w:cs="Consolas" w:eastAsia="Consolas" w:hAnsi="Consolas"/>
+          <w:color w:val="335577"/>
+          <w:sz w:val="19"/>
+          <w:szCs w:val="19"/>
+        </w:rPr>
+        <w:t xml:space="preserve">CAMERA_RESET()</w:t>
+      </w:r>
+    </w:p>
+    <w:p>
+      <w:pPr>
+        <w:spacing w:after="180" w:line="312" w:lineRule="auto"/>
+      </w:pPr>
+      <w:r>
+        <w:rPr>
+          <w:sz w:val="22"/>
+          <w:szCs w:val="22"/>
+        </w:rPr>
+        <w:t xml:space="preserve">Schaltet die Kamera wieder aus (zurück zu 0,0 und Zoom 1). Wichtig vor dem Zeichnen des HUD: Punkte, Leben, Menüs sollen fest am Bildschirm kleben und nicht mitscrollen.</w:t>
+      </w:r>
+    </w:p>
+    <w:p>
+      <w:pPr>
+        <w:keepNext/>
+        <w:spacing w:after="30" w:before="120"/>
+      </w:pPr>
+      <w:r>
+        <w:rPr>
+          <w:b/>
+          <w:bCs/>
+          <w:i/>
+          <w:iCs/>
+          <w:color w:val="6A6A6A"/>
+          <w:sz w:val="18"/>
+          <w:szCs w:val="18"/>
+        </w:rPr>
+        <w:t xml:space="preserve">Beispiel</w:t>
+      </w:r>
+    </w:p>
+    <w:p>
+      <w:pPr>
+        <w:keepLines/>
+        <w:pBdr>
+          <w:left w:val="single" w:color="1B6CA8" w:sz="18" w:space="6"/>
+        </w:pBdr>
+        <w:shd w:fill="F4F4F4" w:val="clear"/>
+        <w:spacing w:after="200" w:before="100" w:line="264" w:lineRule="auto"/>
+        <w:ind w:left="140"/>
+      </w:pPr>
+      <w:r>
+        <w:rPr>
+          <w:rFonts w:ascii="Consolas" w:cs="Consolas" w:eastAsia="Consolas" w:hAnsi="Consolas"/>
+          <w:sz w:val="19"/>
+          <w:szCs w:val="19"/>
+        </w:rPr>
+        <w:t xml:space="preserve">CAMERA_RESET()</w:t>
+      </w:r>
+      <w:r>
+        <w:rPr>
+          <w:rFonts w:ascii="Consolas" w:cs="Consolas" w:eastAsia="Consolas" w:hAnsi="Consolas"/>
+          <w:sz w:val="19"/>
+          <w:szCs w:val="19"/>
+        </w:rPr>
+        <w:br/>
+        <w:t xml:space="preserve">TEXT(10, 10, "Punkte: 100")    ' fester HUD-Text</w:t>
+      </w:r>
+    </w:p>
+    <w:p>
+      <w:pPr>
+        <w:pStyle w:val="Heading2"/>
+        <w:keepNext/>
+        <w:keepLines/>
+        <w:spacing w:after="120" w:before="280"/>
+      </w:pPr>
+      <w:r>
+        <w:t xml:space="preserve">Bildschirm zurück in die Welt rechnen</w:t>
+      </w:r>
+    </w:p>
+    <w:p>
+      <w:pPr>
+        <w:keepNext/>
+        <w:keepLines/>
+        <w:pBdr>
+          <w:bottom w:val="single" w:color="DDD0C0" w:sz="4" w:space="2"/>
+        </w:pBdr>
+        <w:spacing w:after="40" w:before="360"/>
+      </w:pPr>
+      <w:r>
+        <w:rPr>
+          <w:rFonts w:ascii="Consolas" w:cs="Consolas" w:eastAsia="Consolas" w:hAnsi="Consolas"/>
+          <w:b/>
+          <w:bCs/>
+          <w:color w:val="9A3412"/>
+          <w:sz w:val="24"/>
+          <w:szCs w:val="24"/>
+        </w:rPr>
+        <w:t xml:space="preserve">CAMERA_S2W_X · CAMERA_S2W_Y</w:t>
+      </w:r>
+    </w:p>
+    <w:p>
+      <w:pPr>
+        <w:keepNext/>
+        <w:spacing w:after="120"/>
+      </w:pPr>
+      <w:r>
+        <w:rPr>
+          <w:b/>
+          <w:bCs/>
+          <w:color w:val="6A6A6A"/>
+          <w:sz w:val="18"/>
+          <w:szCs w:val="18"/>
+        </w:rPr>
+        <w:t xml:space="preserve">Syntax:  </w:t>
+      </w:r>
+      <w:r>
+        <w:rPr>
+          <w:rFonts w:ascii="Consolas" w:cs="Consolas" w:eastAsia="Consolas" w:hAnsi="Consolas"/>
+          <w:color w:val="335577"/>
+          <w:sz w:val="19"/>
+          <w:szCs w:val="19"/>
+        </w:rPr>
+        <w:t xml:space="preserve">CAMERA_S2W_X(sx)   CAMERA_S2W_Y(sy)</w:t>
+      </w:r>
+    </w:p>
+    <w:p>
+      <w:pPr>
+        <w:spacing w:after="180" w:line="312" w:lineRule="auto"/>
+      </w:pPr>
+      <w:r>
+        <w:rPr>
+          <w:sz w:val="22"/>
+          <w:szCs w:val="22"/>
+        </w:rPr>
+        <w:t xml:space="preserve">Rechnen einen Bildschirm-Pixel zurück in eine Welt-Koordinate – unentbehrlich, um herauszufinden, WO in der Welt der Mauszeiger steht (etwa zum Anklicken eines Objekts).</w:t>
+      </w:r>
+    </w:p>
+    <w:p>
+      <w:pPr>
+        <w:keepNext/>
+        <w:spacing w:after="30" w:before="120"/>
+      </w:pPr>
+      <w:r>
+        <w:rPr>
+          <w:b/>
+          <w:bCs/>
+          <w:i/>
+          <w:iCs/>
+          <w:color w:val="6A6A6A"/>
+          <w:sz w:val="18"/>
+          <w:szCs w:val="18"/>
+        </w:rPr>
+        <w:t xml:space="preserve">Beispiel</w:t>
+      </w:r>
+    </w:p>
+    <w:p>
+      <w:pPr>
+        <w:keepLines/>
+        <w:pBdr>
+          <w:left w:val="single" w:color="1B6CA8" w:sz="18" w:space="6"/>
+        </w:pBdr>
+        <w:shd w:fill="F4F4F4" w:val="clear"/>
+        <w:spacing w:after="200" w:before="100" w:line="264" w:lineRule="auto"/>
+        <w:ind w:left="140"/>
+      </w:pPr>
+      <w:r>
+        <w:rPr>
+          <w:rFonts w:ascii="Consolas" w:cs="Consolas" w:eastAsia="Consolas" w:hAnsi="Consolas"/>
+          <w:sz w:val="19"/>
+          <w:szCs w:val="19"/>
+        </w:rPr>
+        <w:t xml:space="preserve">DIM wx AS FLOAT</w:t>
+      </w:r>
+      <w:r>
+        <w:rPr>
+          <w:rFonts w:ascii="Consolas" w:cs="Consolas" w:eastAsia="Consolas" w:hAnsi="Consolas"/>
+          <w:sz w:val="19"/>
+          <w:szCs w:val="19"/>
+        </w:rPr>
+        <w:br/>
+        <w:t xml:space="preserve">DIM wy AS FLOAT</w:t>
+      </w:r>
+      <w:r>
+        <w:rPr>
+          <w:rFonts w:ascii="Consolas" w:cs="Consolas" w:eastAsia="Consolas" w:hAnsi="Consolas"/>
+          <w:sz w:val="19"/>
+          <w:szCs w:val="19"/>
+        </w:rPr>
+        <w:br/>
+        <w:t xml:space="preserve">wx = CAMERA_S2W_X(MOUSEX() * 1.0)   ' Maus -&gt; Weltposition</w:t>
+      </w:r>
+      <w:r>
+        <w:rPr>
+          <w:rFonts w:ascii="Consolas" w:cs="Consolas" w:eastAsia="Consolas" w:hAnsi="Consolas"/>
+          <w:sz w:val="19"/>
+          <w:szCs w:val="19"/>
+        </w:rPr>
+        <w:br/>
+        <w:t xml:space="preserve">wy = CAMERA_S2W_Y(MOUSEY() * 1.0)</w:t>
+      </w:r>
+    </w:p>
+    <w:p>
+      <w:pPr>
+        <w:pStyle w:val="Heading2"/>
+        <w:keepNext/>
+        <w:keepLines/>
+        <w:spacing w:after="120" w:before="280"/>
+      </w:pPr>
+      <w:r>
+        <w:t xml:space="preserve">Rütteln: CAMERA_SHAKE</w:t>
+      </w:r>
+    </w:p>
+    <w:p>
+      <w:pPr>
+        <w:keepNext/>
+        <w:keepLines/>
+        <w:pBdr>
+          <w:bottom w:val="single" w:color="DDD0C0" w:sz="4" w:space="2"/>
+        </w:pBdr>
+        <w:spacing w:after="40" w:before="360"/>
+      </w:pPr>
+      <w:r>
+        <w:rPr>
+          <w:rFonts w:ascii="Consolas" w:cs="Consolas" w:eastAsia="Consolas" w:hAnsi="Consolas"/>
+          <w:b/>
+          <w:bCs/>
+          <w:color w:val="9A3412"/>
+          <w:sz w:val="24"/>
+          <w:szCs w:val="24"/>
+        </w:rPr>
+        <w:t xml:space="preserve">CAMERA_SHAKE</w:t>
+      </w:r>
+    </w:p>
+    <w:p>
+      <w:pPr>
+        <w:keepNext/>
+        <w:spacing w:after="120"/>
+      </w:pPr>
+      <w:r>
+        <w:rPr>
+          <w:b/>
+          <w:bCs/>
+          <w:color w:val="6A6A6A"/>
+          <w:sz w:val="18"/>
+          <w:szCs w:val="18"/>
+        </w:rPr>
+        <w:t xml:space="preserve">Syntax:  </w:t>
+      </w:r>
+      <w:r>
+        <w:rPr>
+          <w:rFonts w:ascii="Consolas" w:cs="Consolas" w:eastAsia="Consolas" w:hAnsi="Consolas"/>
+          <w:color w:val="335577"/>
+          <w:sz w:val="19"/>
+          <w:szCs w:val="19"/>
+        </w:rPr>
+        <w:t xml:space="preserve">CAMERA_SHAKE(stärke[, dauer_ms])</w:t>
+      </w:r>
+    </w:p>
+    <w:p>
+      <w:pPr>
+        <w:spacing w:after="180" w:line="312" w:lineRule="auto"/>
+      </w:pPr>
+      <w:r>
+        <w:rPr>
+          <w:sz w:val="22"/>
+          <w:szCs w:val="22"/>
+        </w:rPr>
+        <w:t xml:space="preserve">Lässt die Kamera kurz wackeln – ein klassischer Wumms-Effekt bei Treffern oder Explosionen. Die Stärke ist in Welt-Pixeln, die Erschütterung klingt über dauer_ms (Standard 300) von selbst ab. Du rufst es einmalig auf; kein Pro-Frame-Code nötig.</w:t>
+      </w:r>
+    </w:p>
+    <w:p>
+      <w:pPr>
+        <w:keepNext/>
+        <w:spacing w:after="30" w:before="120"/>
+      </w:pPr>
+      <w:r>
+        <w:rPr>
+          <w:b/>
+          <w:bCs/>
+          <w:i/>
+          <w:iCs/>
+          <w:color w:val="6A6A6A"/>
+          <w:sz w:val="18"/>
+          <w:szCs w:val="18"/>
+        </w:rPr>
+        <w:t xml:space="preserve">Beispiel</w:t>
+      </w:r>
+    </w:p>
+    <w:p>
+      <w:pPr>
+        <w:keepLines/>
+        <w:pBdr>
+          <w:left w:val="single" w:color="1B6CA8" w:sz="18" w:space="6"/>
+        </w:pBdr>
+        <w:shd w:fill="F4F4F4" w:val="clear"/>
+        <w:spacing w:after="200" w:before="100" w:line="264" w:lineRule="auto"/>
+        <w:ind w:left="140"/>
+      </w:pPr>
+      <w:r>
+        <w:rPr>
+          <w:rFonts w:ascii="Consolas" w:cs="Consolas" w:eastAsia="Consolas" w:hAnsi="Consolas"/>
+          <w:sz w:val="19"/>
+          <w:szCs w:val="19"/>
+        </w:rPr>
+        <w:t xml:space="preserve">IF getroffen THEN CAMERA_SHAKE(6.0, 250)   ' kurzer Wumms</w:t>
+      </w:r>
+    </w:p>
+    <w:p>
+      <w:pPr>
+        <w:pStyle w:val="Heading2"/>
+        <w:keepNext/>
+        <w:keepLines/>
+        <w:spacing w:after="120" w:before="280"/>
+      </w:pPr>
+      <w:r>
+        <w:t xml:space="preserve">Im Game-Loop</w:t>
+      </w:r>
+    </w:p>
+    <w:p>
+      <w:pPr>
+        <w:spacing w:after="180" w:line="312" w:lineRule="auto"/>
+      </w:pPr>
+      <w:r>
+        <w:rPr>
+          <w:sz w:val="22"/>
+          <w:szCs w:val="22"/>
+        </w:rPr>
+        <w:t xml:space="preserve">Das übliche Muster: am Frame-Anfang der Figur folgen, die Welt in Welt-Koordinaten zeichnen, dann für das HUD die Kamera zurücksetzen:</w:t>
+      </w:r>
+    </w:p>
+    <w:p>
+      <w:pPr>
+        <w:keepLines/>
+        <w:pBdr>
+          <w:left w:val="single" w:color="1B6CA8" w:sz="18" w:space="6"/>
+        </w:pBdr>
+        <w:shd w:fill="F4F4F4" w:val="clear"/>
+        <w:spacing w:after="200" w:before="100" w:line="264" w:lineRule="auto"/>
+        <w:ind w:left="140"/>
+      </w:pPr>
+      <w:r>
+        <w:rPr>
+          <w:rFonts w:ascii="Consolas" w:cs="Consolas" w:eastAsia="Consolas" w:hAnsi="Consolas"/>
+          <w:sz w:val="19"/>
+          <w:szCs w:val="19"/>
+        </w:rPr>
+        <w:t xml:space="preserve">IMPORT "camera"</w:t>
+      </w:r>
+      <w:r>
+        <w:rPr>
+          <w:rFonts w:ascii="Consolas" w:cs="Consolas" w:eastAsia="Consolas" w:hAnsi="Consolas"/>
+          <w:sz w:val="19"/>
+          <w:szCs w:val="19"/>
+        </w:rPr>
+        <w:br/>
+        <w:t xml:space="preserve">WHILE NOT QUITREQUESTED()</w:t>
+      </w:r>
+      <w:r>
+        <w:rPr>
+          <w:rFonts w:ascii="Consolas" w:cs="Consolas" w:eastAsia="Consolas" w:hAnsi="Consolas"/>
+          <w:sz w:val="19"/>
+          <w:szCs w:val="19"/>
+        </w:rPr>
+        <w:br/>
+        <w:t xml:space="preserve">    CAMERA_FOLLOW(px, py, SCREENWIDTH() * 1.0, SCREENHEIGHT() * 1.0)</w:t>
+      </w:r>
+      <w:r>
+        <w:rPr>
+          <w:rFonts w:ascii="Consolas" w:cs="Consolas" w:eastAsia="Consolas" w:hAnsi="Consolas"/>
+          <w:sz w:val="19"/>
+          <w:szCs w:val="19"/>
+        </w:rPr>
+        <w:br/>
+        <w:t xml:space="preserve">    CLS(RGB(18, 22, 36))</w:t>
+      </w:r>
+      <w:r>
+        <w:rPr>
+          <w:rFonts w:ascii="Consolas" w:cs="Consolas" w:eastAsia="Consolas" w:hAnsi="Consolas"/>
+          <w:sz w:val="19"/>
+          <w:szCs w:val="19"/>
+        </w:rPr>
+        <w:br/>
+        <w:t xml:space="preserve">    ' ... Welt zeichnen (Welt-Koordinaten) ...</w:t>
+      </w:r>
+      <w:r>
+        <w:rPr>
+          <w:rFonts w:ascii="Consolas" w:cs="Consolas" w:eastAsia="Consolas" w:hAnsi="Consolas"/>
+          <w:sz w:val="19"/>
+          <w:szCs w:val="19"/>
+        </w:rPr>
+        <w:br/>
+        <w:t xml:space="preserve">    CIRCLE(INT(px), INT(py), 16, YELLOW)   ' Spieler in der Welt</w:t>
+      </w:r>
+      <w:r>
+        <w:rPr>
+          <w:rFonts w:ascii="Consolas" w:cs="Consolas" w:eastAsia="Consolas" w:hAnsi="Consolas"/>
+          <w:sz w:val="19"/>
+          <w:szCs w:val="19"/>
+        </w:rPr>
+        <w:br/>
+        <w:t xml:space="preserve"/>
+      </w:r>
+      <w:r>
+        <w:rPr>
+          <w:rFonts w:ascii="Consolas" w:cs="Consolas" w:eastAsia="Consolas" w:hAnsi="Consolas"/>
+          <w:sz w:val="19"/>
+          <w:szCs w:val="19"/>
+        </w:rPr>
+        <w:br/>
+        <w:t xml:space="preserve">    CAMERA_RESET()                          ' ab hier fester Bildschirm</w:t>
+      </w:r>
+      <w:r>
+        <w:rPr>
+          <w:rFonts w:ascii="Consolas" w:cs="Consolas" w:eastAsia="Consolas" w:hAnsi="Consolas"/>
+          <w:sz w:val="19"/>
+          <w:szCs w:val="19"/>
+        </w:rPr>
+        <w:br/>
+        <w:t xml:space="preserve">    TEXT(10, 10, "HUD")</w:t>
+      </w:r>
+      <w:r>
+        <w:rPr>
+          <w:rFonts w:ascii="Consolas" w:cs="Consolas" w:eastAsia="Consolas" w:hAnsi="Consolas"/>
+          <w:sz w:val="19"/>
+          <w:szCs w:val="19"/>
+        </w:rPr>
+        <w:br/>
+        <w:t xml:space="preserve">    FLIP()</w:t>
+      </w:r>
+      <w:r>
+        <w:rPr>
+          <w:rFonts w:ascii="Consolas" w:cs="Consolas" w:eastAsia="Consolas" w:hAnsi="Consolas"/>
+          <w:sz w:val="19"/>
+          <w:szCs w:val="19"/>
+        </w:rPr>
+        <w:br/>
+        <w:t xml:space="preserve">WEND</w:t>
+      </w:r>
+    </w:p>
+    <w:p>
+      <w:pPr>
+        <w:spacing w:before="60"/>
+      </w:pPr>
+    </w:p>
+    <w:tbl>
+      <w:tblPr>
+        <w:tblW w:type="dxa" w:w="9360"/>
+        <w:tblBorders>
+          <w:top w:val="single" w:color="auto" w:sz="4"/>
+          <w:left w:val="single" w:color="auto" w:sz="4"/>
+          <w:bottom w:val="single" w:color="auto" w:sz="4"/>
+          <w:right w:val="single" w:color="auto" w:sz="4"/>
+          <w:insideH w:val="single" w:color="auto" w:sz="4"/>
+          <w:insideV w:val="single" w:color="auto" w:sz="4"/>
+        </w:tblBorders>
+      </w:tblPr>
+      <w:tblGrid>
+        <w:gridCol w:w="9360"/>
+      </w:tblGrid>
+      <w:tr>
+        <w:trPr>
+          <w:cantSplit/>
+        </w:trPr>
+        <w:tc>
+          <w:tcPr>
+            <w:tcW w:type="dxa" w:w="9360"/>
+            <w:tcBorders>
+              <w:top w:val="single" w:color="E0B96A" w:sz="6"/>
+              <w:left w:val="single" w:color="E0B96A" w:sz="6"/>
+              <w:bottom w:val="single" w:color="E0B96A" w:sz="6"/>
+              <w:right w:val="single" w:color="E0B96A" w:sz="6"/>
+            </w:tcBorders>
+            <w:shd w:fill="FDF3E0" w:val="clear"/>
+            <w:tcMar>
+              <w:top w:type="dxa" w:w="140"/>
+              <w:left w:type="dxa" w:w="180"/>
+              <w:bottom w:type="dxa" w:w="140"/>
+              <w:right w:type="dxa" w:w="180"/>
+            </w:tcMar>
+          </w:tcPr>
+          <w:p>
+            <w:pPr>
+              <w:spacing w:after="40"/>
+            </w:pPr>
+            <w:r>
+              <w:rPr>
+                <w:b/>
+                <w:bCs/>
+                <w:color w:val="9A6A1E"/>
+                <w:sz w:val="22"/>
+                <w:szCs w:val="22"/>
+              </w:rPr>
+              <w:t xml:space="preserve">Merke</w:t>
+            </w:r>
+          </w:p>
+          <w:p>
+            <w:pPr>
+              <w:spacing w:after="0" w:line="312" w:lineRule="auto"/>
+            </w:pPr>
+            <w:r>
+              <w:rPr>
+                <w:sz w:val="22"/>
+                <w:szCs w:val="22"/>
+              </w:rPr>
+              <w:t xml:space="preserve">Die Kamera wirkt auf alle Welt-Zeichenbefehle – BOX, CIRCLE, LINE, TEXT, DRAWIMAGE, DRAWTILEMAP, SPRITE_DRAW und PARTICLE_DRAW. Den Text-HUD also bewusst NACH CAMERA_RESET() zeichnen, damit er nicht mitwandert.</w:t>
+            </w:r>
+          </w:p>
+        </w:tc>
+      </w:tr>
+    </w:tbl>
+    <w:p>
+      <w:pPr>
+        <w:spacing w:after="160"/>
+      </w:pPr>
+    </w:p>
+    <w:p>
+      <w:pPr>
+        <w:spacing w:before="60"/>
+      </w:pPr>
+    </w:p>
+    <w:tbl>
+      <w:tblPr>
+        <w:tblW w:type="dxa" w:w="9360"/>
+        <w:tblBorders>
+          <w:top w:val="single" w:color="auto" w:sz="4"/>
+          <w:left w:val="single" w:color="auto" w:sz="4"/>
+          <w:bottom w:val="single" w:color="auto" w:sz="4"/>
+          <w:right w:val="single" w:color="auto" w:sz="4"/>
+          <w:insideH w:val="single" w:color="auto" w:sz="4"/>
+          <w:insideV w:val="single" w:color="auto" w:sz="4"/>
+        </w:tblBorders>
+      </w:tblPr>
+      <w:tblGrid>
+        <w:gridCol w:w="9360"/>
+      </w:tblGrid>
+      <w:tr>
+        <w:trPr>
+          <w:cantSplit/>
+        </w:trPr>
+        <w:tc>
+          <w:tcPr>
+            <w:tcW w:type="dxa" w:w="9360"/>
+            <w:tcBorders>
+              <w:top w:val="single" w:color="9CC8E6" w:sz="6"/>
+              <w:left w:val="single" w:color="9CC8E6" w:sz="6"/>
+              <w:bottom w:val="single" w:color="9CC8E6" w:sz="6"/>
+              <w:right w:val="single" w:color="9CC8E6" w:sz="6"/>
+            </w:tcBorders>
+            <w:shd w:fill="E7F2FA" w:val="clear"/>
+            <w:tcMar>
+              <w:top w:type="dxa" w:w="140"/>
+              <w:left w:type="dxa" w:w="180"/>
+              <w:bottom w:type="dxa" w:w="140"/>
+              <w:right w:type="dxa" w:w="180"/>
+            </w:tcMar>
+          </w:tcPr>
+          <w:p>
+            <w:pPr>
+              <w:spacing w:after="40"/>
+            </w:pPr>
+            <w:r>
+              <w:rPr>
+                <w:b/>
+                <w:bCs/>
+                <w:color w:val="1B6CA8"/>
+                <w:sz w:val="22"/>
+                <w:szCs w:val="22"/>
+              </w:rPr>
+              <w:t xml:space="preserve">Kamera-Tempo</w:t>
+            </w:r>
+          </w:p>
+          <w:p>
+            <w:pPr>
+              <w:spacing w:after="0" w:line="312" w:lineRule="auto"/>
+            </w:pPr>
+            <w:r>
+              <w:rPr>
+                <w:sz w:val="22"/>
+                <w:szCs w:val="22"/>
+              </w:rPr>
+              <w:t xml:space="preserve">Statt die Kamera hart auf den Spieler zu setzen, kannst du ihr weich folgen lassen: die Kamera-Position pro Frame ein Stück Richtung Ziel bewegen (z. B. mit MOVETOWARD oder LERP). Das ergibt ein angenehmes, leicht nachziehendes Gefühl statt eines starren Klebens.</w:t>
             </w:r>
           </w:p>
         </w:tc>

</xml_diff>